<commit_message>
Adiciona status automático da Atividade na EAP — Fase 2 (fecha a proposta de detalhamento do cronograma)
Fecha a proposta de detalhamento do cronograma: a Atividade (nível 3
da EAP) ganha o mesmo status automático que a Entrega (nível 2) já
tinha, um nível mais fundo — casando pelo nome da atividade com uma
tarefa de QUALQUER marco do cronograma do Planejamento, em vez de
casar com o marco inteiro.

Como tarefa não tem data (só nome e concluída), os estados possíveis
são mais simples que os da Entrega: Concluída, Pendente ou Sem tarefa
vinculada — sem "Atrasada". Sem nenhum campo novo para preencher na
EAP, mesmo princípio das Fases anteriores.

Fecha a amarração pedida na proposta original: agora dá para ver
direto na EAP o que ficou pendente no detalhamento do cronograma.

Atualiza Central de Ajuda, Manual de Uso (v2.66) e cache-busting.

Co-Authored-By: Claude Sonnet 5 <noreply@anthropic.com>
</commit_message>
<xml_diff>
--- a/Manual de Uso - Ferramenta de Gestao de Projetos.docx
+++ b/Manual de Uso - Ferramenta de Gestao de Projetos.docx
@@ -229,7 +229,7 @@
         <w:rPr>
           <w:noProof/>
         </w:rPr>
-        <w:instrText xml:space="preserve"> PAGEREF _Toc240271765 \h </w:instrText>
+        <w:instrText xml:space="preserve"> PAGEREF _Toc240273001 \h </w:instrText>
       </w:r>
       <w:r>
         <w:rPr>
@@ -290,7 +290,7 @@
         <w:rPr>
           <w:noProof/>
         </w:rPr>
-        <w:instrText xml:space="preserve"> PAGEREF _Toc240271766 \h </w:instrText>
+        <w:instrText xml:space="preserve"> PAGEREF _Toc240273002 \h </w:instrText>
       </w:r>
       <w:r>
         <w:rPr>
@@ -351,7 +351,7 @@
         <w:rPr>
           <w:noProof/>
         </w:rPr>
-        <w:instrText xml:space="preserve"> PAGEREF _Toc240271767 \h </w:instrText>
+        <w:instrText xml:space="preserve"> PAGEREF _Toc240273003 \h </w:instrText>
       </w:r>
       <w:r>
         <w:rPr>
@@ -412,7 +412,7 @@
         <w:rPr>
           <w:noProof/>
         </w:rPr>
-        <w:instrText xml:space="preserve"> PAGEREF _Toc240271768 \h </w:instrText>
+        <w:instrText xml:space="preserve"> PAGEREF _Toc240273004 \h </w:instrText>
       </w:r>
       <w:r>
         <w:rPr>
@@ -473,7 +473,7 @@
         <w:rPr>
           <w:noProof/>
         </w:rPr>
-        <w:instrText xml:space="preserve"> PAGEREF _Toc240271769 \h </w:instrText>
+        <w:instrText xml:space="preserve"> PAGEREF _Toc240273005 \h </w:instrText>
       </w:r>
       <w:r>
         <w:rPr>
@@ -534,7 +534,7 @@
         <w:rPr>
           <w:noProof/>
         </w:rPr>
-        <w:instrText xml:space="preserve"> PAGEREF _Toc240271770 \h </w:instrText>
+        <w:instrText xml:space="preserve"> PAGEREF _Toc240273006 \h </w:instrText>
       </w:r>
       <w:r>
         <w:rPr>
@@ -595,7 +595,7 @@
         <w:rPr>
           <w:noProof/>
         </w:rPr>
-        <w:instrText xml:space="preserve"> PAGEREF _Toc240271771 \h </w:instrText>
+        <w:instrText xml:space="preserve"> PAGEREF _Toc240273007 \h </w:instrText>
       </w:r>
       <w:r>
         <w:rPr>
@@ -656,7 +656,7 @@
         <w:rPr>
           <w:noProof/>
         </w:rPr>
-        <w:instrText xml:space="preserve"> PAGEREF _Toc240271772 \h </w:instrText>
+        <w:instrText xml:space="preserve"> PAGEREF _Toc240273008 \h </w:instrText>
       </w:r>
       <w:r>
         <w:rPr>
@@ -717,7 +717,7 @@
         <w:rPr>
           <w:noProof/>
         </w:rPr>
-        <w:instrText xml:space="preserve"> PAGEREF _Toc240271773 \h </w:instrText>
+        <w:instrText xml:space="preserve"> PAGEREF _Toc240273009 \h </w:instrText>
       </w:r>
       <w:r>
         <w:rPr>
@@ -778,7 +778,7 @@
         <w:rPr>
           <w:noProof/>
         </w:rPr>
-        <w:instrText xml:space="preserve"> PAGEREF _Toc240271774 \h </w:instrText>
+        <w:instrText xml:space="preserve"> PAGEREF _Toc240273010 \h </w:instrText>
       </w:r>
       <w:r>
         <w:rPr>
@@ -839,7 +839,7 @@
         <w:rPr>
           <w:noProof/>
         </w:rPr>
-        <w:instrText xml:space="preserve"> PAGEREF _Toc240271775 \h </w:instrText>
+        <w:instrText xml:space="preserve"> PAGEREF _Toc240273011 \h </w:instrText>
       </w:r>
       <w:r>
         <w:rPr>
@@ -900,7 +900,7 @@
         <w:rPr>
           <w:noProof/>
         </w:rPr>
-        <w:instrText xml:space="preserve"> PAGEREF _Toc240271776 \h </w:instrText>
+        <w:instrText xml:space="preserve"> PAGEREF _Toc240273012 \h </w:instrText>
       </w:r>
       <w:r>
         <w:rPr>
@@ -961,7 +961,7 @@
         <w:rPr>
           <w:noProof/>
         </w:rPr>
-        <w:instrText xml:space="preserve"> PAGEREF _Toc240271777 \h </w:instrText>
+        <w:instrText xml:space="preserve"> PAGEREF _Toc240273013 \h </w:instrText>
       </w:r>
       <w:r>
         <w:rPr>
@@ -1022,7 +1022,7 @@
         <w:rPr>
           <w:noProof/>
         </w:rPr>
-        <w:instrText xml:space="preserve"> PAGEREF _Toc240271778 \h </w:instrText>
+        <w:instrText xml:space="preserve"> PAGEREF _Toc240273014 \h </w:instrText>
       </w:r>
       <w:r>
         <w:rPr>
@@ -1083,7 +1083,7 @@
         <w:rPr>
           <w:noProof/>
         </w:rPr>
-        <w:instrText xml:space="preserve"> PAGEREF _Toc240271779 \h </w:instrText>
+        <w:instrText xml:space="preserve"> PAGEREF _Toc240273015 \h </w:instrText>
       </w:r>
       <w:r>
         <w:rPr>
@@ -1144,7 +1144,7 @@
         <w:rPr>
           <w:noProof/>
         </w:rPr>
-        <w:instrText xml:space="preserve"> PAGEREF _Toc240271780 \h </w:instrText>
+        <w:instrText xml:space="preserve"> PAGEREF _Toc240273016 \h </w:instrText>
       </w:r>
       <w:r>
         <w:rPr>
@@ -1205,7 +1205,7 @@
         <w:rPr>
           <w:noProof/>
         </w:rPr>
-        <w:instrText xml:space="preserve"> PAGEREF _Toc240271781 \h </w:instrText>
+        <w:instrText xml:space="preserve"> PAGEREF _Toc240273017 \h </w:instrText>
       </w:r>
       <w:r>
         <w:rPr>
@@ -1266,7 +1266,7 @@
         <w:rPr>
           <w:noProof/>
         </w:rPr>
-        <w:instrText xml:space="preserve"> PAGEREF _Toc240271782 \h </w:instrText>
+        <w:instrText xml:space="preserve"> PAGEREF _Toc240273018 \h </w:instrText>
       </w:r>
       <w:r>
         <w:rPr>
@@ -1327,7 +1327,7 @@
         <w:rPr>
           <w:noProof/>
         </w:rPr>
-        <w:instrText xml:space="preserve"> PAGEREF _Toc240271783 \h </w:instrText>
+        <w:instrText xml:space="preserve"> PAGEREF _Toc240273019 \h </w:instrText>
       </w:r>
       <w:r>
         <w:rPr>
@@ -1388,7 +1388,7 @@
         <w:rPr>
           <w:noProof/>
         </w:rPr>
-        <w:instrText xml:space="preserve"> PAGEREF _Toc240271784 \h </w:instrText>
+        <w:instrText xml:space="preserve"> PAGEREF _Toc240273020 \h </w:instrText>
       </w:r>
       <w:r>
         <w:rPr>
@@ -1449,7 +1449,7 @@
         <w:rPr>
           <w:noProof/>
         </w:rPr>
-        <w:instrText xml:space="preserve"> PAGEREF _Toc240271785 \h </w:instrText>
+        <w:instrText xml:space="preserve"> PAGEREF _Toc240273021 \h </w:instrText>
       </w:r>
       <w:r>
         <w:rPr>
@@ -1510,7 +1510,7 @@
         <w:rPr>
           <w:noProof/>
         </w:rPr>
-        <w:instrText xml:space="preserve"> PAGEREF _Toc240271786 \h </w:instrText>
+        <w:instrText xml:space="preserve"> PAGEREF _Toc240273022 \h </w:instrText>
       </w:r>
       <w:r>
         <w:rPr>
@@ -1571,7 +1571,7 @@
         <w:rPr>
           <w:noProof/>
         </w:rPr>
-        <w:instrText xml:space="preserve"> PAGEREF _Toc240271787 \h </w:instrText>
+        <w:instrText xml:space="preserve"> PAGEREF _Toc240273023 \h </w:instrText>
       </w:r>
       <w:r>
         <w:rPr>
@@ -1632,7 +1632,7 @@
         <w:rPr>
           <w:noProof/>
         </w:rPr>
-        <w:instrText xml:space="preserve"> PAGEREF _Toc240271788 \h </w:instrText>
+        <w:instrText xml:space="preserve"> PAGEREF _Toc240273024 \h </w:instrText>
       </w:r>
       <w:r>
         <w:rPr>
@@ -1693,7 +1693,7 @@
         <w:rPr>
           <w:noProof/>
         </w:rPr>
-        <w:instrText xml:space="preserve"> PAGEREF _Toc240271789 \h </w:instrText>
+        <w:instrText xml:space="preserve"> PAGEREF _Toc240273025 \h </w:instrText>
       </w:r>
       <w:r>
         <w:rPr>
@@ -1755,7 +1755,7 @@
         <w:rPr>
           <w:noProof/>
         </w:rPr>
-        <w:instrText xml:space="preserve"> PAGEREF _Toc240271790 \h </w:instrText>
+        <w:instrText xml:space="preserve"> PAGEREF _Toc240273026 \h </w:instrText>
       </w:r>
       <w:r>
         <w:rPr>
@@ -1816,7 +1816,7 @@
         <w:rPr>
           <w:noProof/>
         </w:rPr>
-        <w:instrText xml:space="preserve"> PAGEREF _Toc240271791 \h </w:instrText>
+        <w:instrText xml:space="preserve"> PAGEREF _Toc240273027 \h </w:instrText>
       </w:r>
       <w:r>
         <w:rPr>
@@ -1877,7 +1877,7 @@
         <w:rPr>
           <w:noProof/>
         </w:rPr>
-        <w:instrText xml:space="preserve"> PAGEREF _Toc240271792 \h </w:instrText>
+        <w:instrText xml:space="preserve"> PAGEREF _Toc240273028 \h </w:instrText>
       </w:r>
       <w:r>
         <w:rPr>
@@ -1938,7 +1938,7 @@
         <w:rPr>
           <w:noProof/>
         </w:rPr>
-        <w:instrText xml:space="preserve"> PAGEREF _Toc240271793 \h </w:instrText>
+        <w:instrText xml:space="preserve"> PAGEREF _Toc240273029 \h </w:instrText>
       </w:r>
       <w:r>
         <w:rPr>
@@ -1999,7 +1999,7 @@
         <w:rPr>
           <w:noProof/>
         </w:rPr>
-        <w:instrText xml:space="preserve"> PAGEREF _Toc240271794 \h </w:instrText>
+        <w:instrText xml:space="preserve"> PAGEREF _Toc240273030 \h </w:instrText>
       </w:r>
       <w:r>
         <w:rPr>
@@ -2060,7 +2060,7 @@
         <w:rPr>
           <w:noProof/>
         </w:rPr>
-        <w:instrText xml:space="preserve"> PAGEREF _Toc240271795 \h </w:instrText>
+        <w:instrText xml:space="preserve"> PAGEREF _Toc240273031 \h </w:instrText>
       </w:r>
       <w:r>
         <w:rPr>
@@ -2121,7 +2121,7 @@
         <w:rPr>
           <w:noProof/>
         </w:rPr>
-        <w:instrText xml:space="preserve"> PAGEREF _Toc240271796 \h </w:instrText>
+        <w:instrText xml:space="preserve"> PAGEREF _Toc240273032 \h </w:instrText>
       </w:r>
       <w:r>
         <w:rPr>
@@ -2182,7 +2182,7 @@
         <w:rPr>
           <w:noProof/>
         </w:rPr>
-        <w:instrText xml:space="preserve"> PAGEREF _Toc240271797 \h </w:instrText>
+        <w:instrText xml:space="preserve"> PAGEREF _Toc240273033 \h </w:instrText>
       </w:r>
       <w:r>
         <w:rPr>
@@ -2243,7 +2243,7 @@
         <w:rPr>
           <w:noProof/>
         </w:rPr>
-        <w:instrText xml:space="preserve"> PAGEREF _Toc240271798 \h </w:instrText>
+        <w:instrText xml:space="preserve"> PAGEREF _Toc240273034 \h </w:instrText>
       </w:r>
       <w:r>
         <w:rPr>
@@ -2304,7 +2304,7 @@
         <w:rPr>
           <w:noProof/>
         </w:rPr>
-        <w:instrText xml:space="preserve"> PAGEREF _Toc240271799 \h </w:instrText>
+        <w:instrText xml:space="preserve"> PAGEREF _Toc240273035 \h </w:instrText>
       </w:r>
       <w:r>
         <w:rPr>
@@ -2365,7 +2365,7 @@
         <w:rPr>
           <w:noProof/>
         </w:rPr>
-        <w:instrText xml:space="preserve"> PAGEREF _Toc240271800 \h </w:instrText>
+        <w:instrText xml:space="preserve"> PAGEREF _Toc240273036 \h </w:instrText>
       </w:r>
       <w:r>
         <w:rPr>
@@ -2426,7 +2426,7 @@
         <w:rPr>
           <w:noProof/>
         </w:rPr>
-        <w:instrText xml:space="preserve"> PAGEREF _Toc240271801 \h </w:instrText>
+        <w:instrText xml:space="preserve"> PAGEREF _Toc240273037 \h </w:instrText>
       </w:r>
       <w:r>
         <w:rPr>
@@ -2487,7 +2487,7 @@
         <w:rPr>
           <w:noProof/>
         </w:rPr>
-        <w:instrText xml:space="preserve"> PAGEREF _Toc240271802 \h </w:instrText>
+        <w:instrText xml:space="preserve"> PAGEREF _Toc240273038 \h </w:instrText>
       </w:r>
       <w:r>
         <w:rPr>
@@ -2548,7 +2548,7 @@
         <w:rPr>
           <w:noProof/>
         </w:rPr>
-        <w:instrText xml:space="preserve"> PAGEREF _Toc240271803 \h </w:instrText>
+        <w:instrText xml:space="preserve"> PAGEREF _Toc240273039 \h </w:instrText>
       </w:r>
       <w:r>
         <w:rPr>
@@ -2609,7 +2609,7 @@
         <w:rPr>
           <w:noProof/>
         </w:rPr>
-        <w:instrText xml:space="preserve"> PAGEREF _Toc240271804 \h </w:instrText>
+        <w:instrText xml:space="preserve"> PAGEREF _Toc240273040 \h </w:instrText>
       </w:r>
       <w:r>
         <w:rPr>
@@ -2670,7 +2670,7 @@
         <w:rPr>
           <w:noProof/>
         </w:rPr>
-        <w:instrText xml:space="preserve"> PAGEREF _Toc240271805 \h </w:instrText>
+        <w:instrText xml:space="preserve"> PAGEREF _Toc240273041 \h </w:instrText>
       </w:r>
       <w:r>
         <w:rPr>
@@ -2731,7 +2731,7 @@
         <w:rPr>
           <w:noProof/>
         </w:rPr>
-        <w:instrText xml:space="preserve"> PAGEREF _Toc240271806 \h </w:instrText>
+        <w:instrText xml:space="preserve"> PAGEREF _Toc240273042 \h </w:instrText>
       </w:r>
       <w:r>
         <w:rPr>
@@ -2792,7 +2792,7 @@
         <w:rPr>
           <w:noProof/>
         </w:rPr>
-        <w:instrText xml:space="preserve"> PAGEREF _Toc240271807 \h </w:instrText>
+        <w:instrText xml:space="preserve"> PAGEREF _Toc240273043 \h </w:instrText>
       </w:r>
       <w:r>
         <w:rPr>
@@ -2853,7 +2853,7 @@
         <w:rPr>
           <w:noProof/>
         </w:rPr>
-        <w:instrText xml:space="preserve"> PAGEREF _Toc240271808 \h </w:instrText>
+        <w:instrText xml:space="preserve"> PAGEREF _Toc240273044 \h </w:instrText>
       </w:r>
       <w:r>
         <w:rPr>
@@ -2914,7 +2914,7 @@
         <w:rPr>
           <w:noProof/>
         </w:rPr>
-        <w:instrText xml:space="preserve"> PAGEREF _Toc240271809 \h </w:instrText>
+        <w:instrText xml:space="preserve"> PAGEREF _Toc240273045 \h </w:instrText>
       </w:r>
       <w:r>
         <w:rPr>
@@ -2975,7 +2975,7 @@
         <w:rPr>
           <w:noProof/>
         </w:rPr>
-        <w:instrText xml:space="preserve"> PAGEREF _Toc240271810 \h </w:instrText>
+        <w:instrText xml:space="preserve"> PAGEREF _Toc240273046 \h </w:instrText>
       </w:r>
       <w:r>
         <w:rPr>
@@ -3036,7 +3036,7 @@
         <w:rPr>
           <w:noProof/>
         </w:rPr>
-        <w:instrText xml:space="preserve"> PAGEREF _Toc240271811 \h </w:instrText>
+        <w:instrText xml:space="preserve"> PAGEREF _Toc240273047 \h </w:instrText>
       </w:r>
       <w:r>
         <w:rPr>
@@ -3097,7 +3097,7 @@
         <w:rPr>
           <w:noProof/>
         </w:rPr>
-        <w:instrText xml:space="preserve"> PAGEREF _Toc240271812 \h </w:instrText>
+        <w:instrText xml:space="preserve"> PAGEREF _Toc240273048 \h </w:instrText>
       </w:r>
       <w:r>
         <w:rPr>
@@ -3173,7 +3173,7 @@
           <w:sz w:val="34"/>
         </w:rPr>
       </w:pPr>
-      <w:bookmarkStart w:id="0" w:name="_Toc240271765"/>
+      <w:bookmarkStart w:id="0" w:name="_Toc240273001"/>
       <w:r>
         <w:rPr>
           <w:rFonts w:ascii="Montserrat" w:hAnsi="Montserrat"/>
@@ -3197,7 +3197,7 @@
           <w:sz w:val="27"/>
         </w:rPr>
       </w:pPr>
-      <w:bookmarkStart w:id="1" w:name="_Toc240271766"/>
+      <w:bookmarkStart w:id="1" w:name="_Toc240273002"/>
       <w:r>
         <w:rPr>
           <w:rFonts w:ascii="Montserrat" w:hAnsi="Montserrat"/>
@@ -4539,6 +4539,24 @@
           <w:color w:val="1A1A1A"/>
           <w:sz w:val="22"/>
         </w:rPr>
+        <w:t>Esta e a versao 2.66 do manual. Em relacao a versao 2.65 (14/09/2026), a Fase 2 fecha a proposta de detalhamento do cronograma: a Atividade (nivel 3) da EAP (Passo 5) ganhou o mesmo status automatico que a Entrega ja tinha, um nivel mais fundo - casando pelo nome da atividade com uma tarefa de qualquer marco do cronograma (Passo 4). Como tarefa nao tem data, os selos possiveis sao so Concluida, Pendente ou Sem tarefa vinculada - sem o estado Atrasada que a Entrega tem. Fecha a amarracao pedida: agora da para ver na EAP o que ficou pendente no detalhamento do cronograma.</w:t>
+      </w:r>
+    </w:p>
+    <w:p>
+      <w:pPr>
+        <w:spacing w:line="280" w:lineRule="auto"/>
+        <w:rPr>
+          <w:rFonts w:ascii="Montserrat" w:hAnsi="Montserrat"/>
+          <w:color w:val="1A1A1A"/>
+          <w:sz w:val="22"/>
+        </w:rPr>
+      </w:pPr>
+      <w:r>
+        <w:rPr>
+          <w:rFonts w:ascii="Montserrat" w:hAnsi="Montserrat"/>
+          <w:color w:val="1A1A1A"/>
+          <w:sz w:val="22"/>
+        </w:rPr>
         <w:t>O manual nao substitui as Diretrizes para a Gestao de Projetos da UNIALFA (documento institucional que define o framework D01 a D07) nem o documento Regras de Acesso e Permissoes (que detalha cada regra de controle de acesso); ele e o guia operacional de como usar cada ferramenta na pratica.</w:t>
       </w:r>
     </w:p>
@@ -4553,7 +4571,7 @@
           <w:sz w:val="27"/>
         </w:rPr>
       </w:pPr>
-      <w:bookmarkStart w:id="2" w:name="_Toc240271767"/>
+      <w:bookmarkStart w:id="2" w:name="_Toc240273003"/>
       <w:r>
         <w:rPr>
           <w:rFonts w:ascii="Montserrat" w:hAnsi="Montserrat"/>
@@ -4718,6 +4736,7 @@
           <w:color w:val="1A1A1A"/>
           <w:sz w:val="22"/>
         </w:rPr>
+        <w:lastRenderedPageBreak/>
         <w:t>Cada formulario de registro tem duas partes: uma tela de preenchimento (+Novo...) e uma tela de consulta (...cadastrados), onde ficam listados todos os registros ja salvos, com opcao de abrir, editar o status ou excluir cada um.</w:t>
       </w:r>
     </w:p>
@@ -4748,18 +4767,17 @@
         <w:rPr>
           <w:noProof/>
         </w:rPr>
-        <w:lastRenderedPageBreak/>
         <w:drawing>
-          <wp:inline distT="0" distB="0" distL="0" distR="0" wp14:anchorId="3B0B53B8" wp14:editId="0F770723">
+          <wp:inline distT="0" distB="0" distL="0" distR="0" wp14:anchorId="7E328FCC" wp14:editId="1886E558">
             <wp:extent cx="5303520" cy="4792851"/>
             <wp:effectExtent l="19050" t="19050" r="11430" b="27305"/>
-            <wp:docPr id="864351137" name="Imagem 1"/>
+            <wp:docPr id="1259996565" name="Imagem 1"/>
             <wp:cNvGraphicFramePr/>
             <a:graphic xmlns:a="http://schemas.openxmlformats.org/drawingml/2006/main">
               <a:graphicData uri="http://schemas.openxmlformats.org/drawingml/2006/picture">
                 <pic:pic xmlns:pic="http://schemas.openxmlformats.org/drawingml/2006/picture">
                   <pic:nvPicPr>
-                    <pic:cNvPr id="864351137" name=""/>
+                    <pic:cNvPr id="1259996565" name=""/>
                     <pic:cNvPicPr/>
                   </pic:nvPicPr>
                   <pic:blipFill>
@@ -4827,7 +4845,7 @@
           <w:sz w:val="27"/>
         </w:rPr>
       </w:pPr>
-      <w:bookmarkStart w:id="3" w:name="_Toc240271768"/>
+      <w:bookmarkStart w:id="3" w:name="_Toc240273004"/>
       <w:r>
         <w:rPr>
           <w:rFonts w:ascii="Montserrat" w:hAnsi="Montserrat"/>
@@ -4868,16 +4886,16 @@
         </w:rPr>
         <w:lastRenderedPageBreak/>
         <w:drawing>
-          <wp:inline distT="0" distB="0" distL="0" distR="0" wp14:anchorId="6D3C2800" wp14:editId="25CA602B">
+          <wp:inline distT="0" distB="0" distL="0" distR="0" wp14:anchorId="421E09B6" wp14:editId="77C5B73A">
             <wp:extent cx="4206240" cy="3801227"/>
             <wp:effectExtent l="19050" t="19050" r="22860" b="27940"/>
-            <wp:docPr id="2022227929" name="Imagem 2"/>
+            <wp:docPr id="250181409" name="Imagem 2"/>
             <wp:cNvGraphicFramePr/>
             <a:graphic xmlns:a="http://schemas.openxmlformats.org/drawingml/2006/main">
               <a:graphicData uri="http://schemas.openxmlformats.org/drawingml/2006/picture">
                 <pic:pic xmlns:pic="http://schemas.openxmlformats.org/drawingml/2006/picture">
                   <pic:nvPicPr>
-                    <pic:cNvPr id="2022227929" name=""/>
+                    <pic:cNvPr id="250181409" name=""/>
                     <pic:cNvPicPr/>
                   </pic:nvPicPr>
                   <pic:blipFill>
@@ -5050,7 +5068,7 @@
           <w:sz w:val="27"/>
         </w:rPr>
       </w:pPr>
-      <w:bookmarkStart w:id="4" w:name="_Toc240271769"/>
+      <w:bookmarkStart w:id="4" w:name="_Toc240273005"/>
       <w:r>
         <w:rPr>
           <w:rFonts w:ascii="Montserrat" w:hAnsi="Montserrat"/>
@@ -6289,7 +6307,7 @@
           <w:sz w:val="34"/>
         </w:rPr>
       </w:pPr>
-      <w:bookmarkStart w:id="5" w:name="_Toc240271770"/>
+      <w:bookmarkStart w:id="5" w:name="_Toc240273006"/>
       <w:r>
         <w:rPr>
           <w:rFonts w:ascii="Montserrat" w:hAnsi="Montserrat"/>
@@ -6313,7 +6331,7 @@
           <w:sz w:val="27"/>
         </w:rPr>
       </w:pPr>
-      <w:bookmarkStart w:id="6" w:name="_Toc240271771"/>
+      <w:bookmarkStart w:id="6" w:name="_Toc240273007"/>
       <w:r>
         <w:rPr>
           <w:rFonts w:ascii="Montserrat" w:hAnsi="Montserrat"/>
@@ -6354,7 +6372,7 @@
           <w:sz w:val="27"/>
         </w:rPr>
       </w:pPr>
-      <w:bookmarkStart w:id="7" w:name="_Toc240271772"/>
+      <w:bookmarkStart w:id="7" w:name="_Toc240273008"/>
       <w:r>
         <w:rPr>
           <w:rFonts w:ascii="Montserrat" w:hAnsi="Montserrat"/>
@@ -6473,7 +6491,7 @@
           <w:sz w:val="27"/>
         </w:rPr>
       </w:pPr>
-      <w:bookmarkStart w:id="8" w:name="_Toc240271773"/>
+      <w:bookmarkStart w:id="8" w:name="_Toc240273009"/>
       <w:r>
         <w:rPr>
           <w:rFonts w:ascii="Montserrat" w:hAnsi="Montserrat"/>
@@ -7086,7 +7104,7 @@
           <w:sz w:val="27"/>
         </w:rPr>
       </w:pPr>
-      <w:bookmarkStart w:id="9" w:name="_Toc240271774"/>
+      <w:bookmarkStart w:id="9" w:name="_Toc240273010"/>
       <w:r>
         <w:rPr>
           <w:rFonts w:ascii="Montserrat" w:hAnsi="Montserrat"/>
@@ -7175,16 +7193,16 @@
         </w:rPr>
         <w:lastRenderedPageBreak/>
         <w:drawing>
-          <wp:inline distT="0" distB="0" distL="0" distR="0" wp14:anchorId="39703DBE" wp14:editId="1FEC73FF">
+          <wp:inline distT="0" distB="0" distL="0" distR="0" wp14:anchorId="205DB4F4" wp14:editId="4DDE0005">
             <wp:extent cx="4937760" cy="4462310"/>
             <wp:effectExtent l="19050" t="19050" r="15240" b="14605"/>
-            <wp:docPr id="756738982" name="Imagem 3"/>
+            <wp:docPr id="3391484" name="Imagem 3"/>
             <wp:cNvGraphicFramePr/>
             <a:graphic xmlns:a="http://schemas.openxmlformats.org/drawingml/2006/main">
               <a:graphicData uri="http://schemas.openxmlformats.org/drawingml/2006/picture">
                 <pic:pic xmlns:pic="http://schemas.openxmlformats.org/drawingml/2006/picture">
                   <pic:nvPicPr>
-                    <pic:cNvPr id="756738982" name=""/>
+                    <pic:cNvPr id="3391484" name=""/>
                     <pic:cNvPicPr/>
                   </pic:nvPicPr>
                   <pic:blipFill>
@@ -7252,7 +7270,7 @@
           <w:sz w:val="27"/>
         </w:rPr>
       </w:pPr>
-      <w:bookmarkStart w:id="10" w:name="_Toc240271775"/>
+      <w:bookmarkStart w:id="10" w:name="_Toc240273011"/>
       <w:r>
         <w:rPr>
           <w:rFonts w:ascii="Montserrat" w:hAnsi="Montserrat"/>
@@ -7293,16 +7311,16 @@
         </w:rPr>
         <w:lastRenderedPageBreak/>
         <w:drawing>
-          <wp:inline distT="0" distB="0" distL="0" distR="0" wp14:anchorId="6AB92ABC" wp14:editId="502D82B9">
+          <wp:inline distT="0" distB="0" distL="0" distR="0" wp14:anchorId="384FD3B0" wp14:editId="356F31F0">
             <wp:extent cx="5120640" cy="4627581"/>
             <wp:effectExtent l="19050" t="19050" r="22860" b="20955"/>
-            <wp:docPr id="2038557052" name="Imagem 4"/>
+            <wp:docPr id="1588117104" name="Imagem 4"/>
             <wp:cNvGraphicFramePr/>
             <a:graphic xmlns:a="http://schemas.openxmlformats.org/drawingml/2006/main">
               <a:graphicData uri="http://schemas.openxmlformats.org/drawingml/2006/picture">
                 <pic:pic xmlns:pic="http://schemas.openxmlformats.org/drawingml/2006/picture">
                   <pic:nvPicPr>
-                    <pic:cNvPr id="2038557052" name=""/>
+                    <pic:cNvPr id="1588117104" name=""/>
                     <pic:cNvPicPr/>
                   </pic:nvPicPr>
                   <pic:blipFill>
@@ -7470,7 +7488,7 @@
           <w:sz w:val="27"/>
         </w:rPr>
       </w:pPr>
-      <w:bookmarkStart w:id="11" w:name="_Toc240271776"/>
+      <w:bookmarkStart w:id="11" w:name="_Toc240273012"/>
       <w:r>
         <w:rPr>
           <w:rFonts w:ascii="Montserrat" w:hAnsi="Montserrat"/>
@@ -7510,16 +7528,16 @@
           <w:noProof/>
         </w:rPr>
         <w:drawing>
-          <wp:inline distT="0" distB="0" distL="0" distR="0" wp14:anchorId="007DEB53" wp14:editId="5EBA2280">
+          <wp:inline distT="0" distB="0" distL="0" distR="0" wp14:anchorId="732322D7" wp14:editId="375FF84F">
             <wp:extent cx="4206240" cy="3801227"/>
             <wp:effectExtent l="19050" t="19050" r="22860" b="27940"/>
-            <wp:docPr id="300753498" name="Imagem 5"/>
+            <wp:docPr id="1941429040" name="Imagem 5"/>
             <wp:cNvGraphicFramePr/>
             <a:graphic xmlns:a="http://schemas.openxmlformats.org/drawingml/2006/main">
               <a:graphicData uri="http://schemas.openxmlformats.org/drawingml/2006/picture">
                 <pic:pic xmlns:pic="http://schemas.openxmlformats.org/drawingml/2006/picture">
                   <pic:nvPicPr>
-                    <pic:cNvPr id="300753498" name=""/>
+                    <pic:cNvPr id="1941429040" name=""/>
                     <pic:cNvPicPr/>
                   </pic:nvPicPr>
                   <pic:blipFill>
@@ -7587,16 +7605,16 @@
         </w:rPr>
         <w:lastRenderedPageBreak/>
         <w:drawing>
-          <wp:inline distT="0" distB="0" distL="0" distR="0" wp14:anchorId="7484DF33" wp14:editId="0134B96C">
+          <wp:inline distT="0" distB="0" distL="0" distR="0" wp14:anchorId="55AFEBDF" wp14:editId="4A54EEF5">
             <wp:extent cx="4206240" cy="3801227"/>
             <wp:effectExtent l="19050" t="19050" r="22860" b="27940"/>
-            <wp:docPr id="2003091386" name="Imagem 6"/>
+            <wp:docPr id="47580427" name="Imagem 6"/>
             <wp:cNvGraphicFramePr/>
             <a:graphic xmlns:a="http://schemas.openxmlformats.org/drawingml/2006/main">
               <a:graphicData uri="http://schemas.openxmlformats.org/drawingml/2006/picture">
                 <pic:pic xmlns:pic="http://schemas.openxmlformats.org/drawingml/2006/picture">
                   <pic:nvPicPr>
-                    <pic:cNvPr id="2003091386" name=""/>
+                    <pic:cNvPr id="47580427" name=""/>
                     <pic:cNvPicPr/>
                   </pic:nvPicPr>
                   <pic:blipFill>
@@ -7712,7 +7730,7 @@
           <w:sz w:val="27"/>
         </w:rPr>
       </w:pPr>
-      <w:bookmarkStart w:id="12" w:name="_Toc240271777"/>
+      <w:bookmarkStart w:id="12" w:name="_Toc240273013"/>
       <w:r>
         <w:rPr>
           <w:rFonts w:ascii="Montserrat" w:hAnsi="Montserrat"/>
@@ -7780,7 +7798,7 @@
           <w:sz w:val="27"/>
         </w:rPr>
       </w:pPr>
-      <w:bookmarkStart w:id="13" w:name="_Toc240271778"/>
+      <w:bookmarkStart w:id="13" w:name="_Toc240273014"/>
       <w:r>
         <w:rPr>
           <w:rFonts w:ascii="Montserrat" w:hAnsi="Montserrat"/>
@@ -8007,7 +8025,7 @@
           <w:sz w:val="27"/>
         </w:rPr>
       </w:pPr>
-      <w:bookmarkStart w:id="14" w:name="_Toc240271779"/>
+      <w:bookmarkStart w:id="14" w:name="_Toc240273015"/>
       <w:r>
         <w:rPr>
           <w:rFonts w:ascii="Montserrat" w:hAnsi="Montserrat"/>
@@ -8166,7 +8184,7 @@
           <w:sz w:val="27"/>
         </w:rPr>
       </w:pPr>
-      <w:bookmarkStart w:id="15" w:name="_Toc240271780"/>
+      <w:bookmarkStart w:id="15" w:name="_Toc240273016"/>
       <w:r>
         <w:rPr>
           <w:rFonts w:ascii="Montserrat" w:hAnsi="Montserrat"/>
@@ -8358,7 +8376,7 @@
           <w:sz w:val="27"/>
         </w:rPr>
       </w:pPr>
-      <w:bookmarkStart w:id="16" w:name="_Toc240271781"/>
+      <w:bookmarkStart w:id="16" w:name="_Toc240273017"/>
       <w:r>
         <w:rPr>
           <w:rFonts w:ascii="Montserrat" w:hAnsi="Montserrat"/>
@@ -8486,7 +8504,7 @@
           <w:sz w:val="27"/>
         </w:rPr>
       </w:pPr>
-      <w:bookmarkStart w:id="17" w:name="_Toc240271782"/>
+      <w:bookmarkStart w:id="17" w:name="_Toc240273018"/>
       <w:r>
         <w:rPr>
           <w:rFonts w:ascii="Montserrat" w:hAnsi="Montserrat"/>
@@ -8816,7 +8834,7 @@
           <w:sz w:val="27"/>
         </w:rPr>
       </w:pPr>
-      <w:bookmarkStart w:id="18" w:name="_Toc240271783"/>
+      <w:bookmarkStart w:id="18" w:name="_Toc240273019"/>
       <w:r>
         <w:rPr>
           <w:rFonts w:ascii="Montserrat" w:hAnsi="Montserrat"/>
@@ -8957,7 +8975,7 @@
           <w:sz w:val="34"/>
         </w:rPr>
       </w:pPr>
-      <w:bookmarkStart w:id="19" w:name="_Toc240271784"/>
+      <w:bookmarkStart w:id="19" w:name="_Toc240273020"/>
       <w:r>
         <w:rPr>
           <w:rFonts w:ascii="Montserrat" w:hAnsi="Montserrat"/>
@@ -8999,7 +9017,7 @@
           <w:sz w:val="27"/>
         </w:rPr>
       </w:pPr>
-      <w:bookmarkStart w:id="20" w:name="_Toc240271785"/>
+      <w:bookmarkStart w:id="20" w:name="_Toc240273021"/>
       <w:r>
         <w:rPr>
           <w:rFonts w:ascii="Montserrat" w:hAnsi="Montserrat"/>
@@ -10079,16 +10097,16 @@
         </w:rPr>
         <w:lastRenderedPageBreak/>
         <w:drawing>
-          <wp:inline distT="0" distB="0" distL="0" distR="0" wp14:anchorId="04119F65" wp14:editId="67D3CB11">
+          <wp:inline distT="0" distB="0" distL="0" distR="0" wp14:anchorId="38063904" wp14:editId="670D6EC0">
             <wp:extent cx="5120640" cy="4627581"/>
             <wp:effectExtent l="19050" t="19050" r="22860" b="20955"/>
-            <wp:docPr id="605153851" name="Imagem 7"/>
+            <wp:docPr id="1973627620" name="Imagem 7"/>
             <wp:cNvGraphicFramePr/>
             <a:graphic xmlns:a="http://schemas.openxmlformats.org/drawingml/2006/main">
               <a:graphicData uri="http://schemas.openxmlformats.org/drawingml/2006/picture">
                 <pic:pic xmlns:pic="http://schemas.openxmlformats.org/drawingml/2006/picture">
                   <pic:nvPicPr>
-                    <pic:cNvPr id="605153851" name=""/>
+                    <pic:cNvPr id="1973627620" name=""/>
                     <pic:cNvPicPr/>
                   </pic:nvPicPr>
                   <pic:blipFill>
@@ -10156,16 +10174,16 @@
         </w:rPr>
         <w:lastRenderedPageBreak/>
         <w:drawing>
-          <wp:inline distT="0" distB="0" distL="0" distR="0" wp14:anchorId="271298F2" wp14:editId="54388568">
+          <wp:inline distT="0" distB="0" distL="0" distR="0" wp14:anchorId="4C7BBC81" wp14:editId="5F134AEB">
             <wp:extent cx="5120640" cy="4627581"/>
             <wp:effectExtent l="19050" t="19050" r="22860" b="20955"/>
-            <wp:docPr id="86856867" name="Imagem 8"/>
+            <wp:docPr id="2119875759" name="Imagem 8"/>
             <wp:cNvGraphicFramePr/>
             <a:graphic xmlns:a="http://schemas.openxmlformats.org/drawingml/2006/main">
               <a:graphicData uri="http://schemas.openxmlformats.org/drawingml/2006/picture">
                 <pic:pic xmlns:pic="http://schemas.openxmlformats.org/drawingml/2006/picture">
                   <pic:nvPicPr>
-                    <pic:cNvPr id="86856867" name=""/>
+                    <pic:cNvPr id="2119875759" name=""/>
                     <pic:cNvPicPr/>
                   </pic:nvPicPr>
                   <pic:blipFill>
@@ -10373,7 +10391,7 @@
           <w:sz w:val="27"/>
         </w:rPr>
       </w:pPr>
-      <w:bookmarkStart w:id="21" w:name="_Toc240271786"/>
+      <w:bookmarkStart w:id="21" w:name="_Toc240273022"/>
       <w:r>
         <w:rPr>
           <w:rFonts w:ascii="Montserrat" w:hAnsi="Montserrat"/>
@@ -11298,16 +11316,16 @@
           <w:noProof/>
         </w:rPr>
         <w:drawing>
-          <wp:inline distT="0" distB="0" distL="0" distR="0" wp14:anchorId="399AF928" wp14:editId="7AE18CD0">
+          <wp:inline distT="0" distB="0" distL="0" distR="0" wp14:anchorId="73914A81" wp14:editId="54D07978">
             <wp:extent cx="5120640" cy="4627581"/>
             <wp:effectExtent l="19050" t="19050" r="22860" b="20955"/>
-            <wp:docPr id="807359041" name="Imagem 9"/>
+            <wp:docPr id="1426034607" name="Imagem 9"/>
             <wp:cNvGraphicFramePr/>
             <a:graphic xmlns:a="http://schemas.openxmlformats.org/drawingml/2006/main">
               <a:graphicData uri="http://schemas.openxmlformats.org/drawingml/2006/picture">
                 <pic:pic xmlns:pic="http://schemas.openxmlformats.org/drawingml/2006/picture">
                   <pic:nvPicPr>
-                    <pic:cNvPr id="807359041" name=""/>
+                    <pic:cNvPr id="1426034607" name=""/>
                     <pic:cNvPicPr/>
                   </pic:nvPicPr>
                   <pic:blipFill>
@@ -11375,16 +11393,16 @@
         </w:rPr>
         <w:lastRenderedPageBreak/>
         <w:drawing>
-          <wp:inline distT="0" distB="0" distL="0" distR="0" wp14:anchorId="2A7AF876" wp14:editId="5A122644">
+          <wp:inline distT="0" distB="0" distL="0" distR="0" wp14:anchorId="19BFF35C" wp14:editId="3CF4176D">
             <wp:extent cx="5120640" cy="4627581"/>
             <wp:effectExtent l="19050" t="19050" r="22860" b="20955"/>
-            <wp:docPr id="22871508" name="Imagem 10"/>
+            <wp:docPr id="264034636" name="Imagem 10"/>
             <wp:cNvGraphicFramePr/>
             <a:graphic xmlns:a="http://schemas.openxmlformats.org/drawingml/2006/main">
               <a:graphicData uri="http://schemas.openxmlformats.org/drawingml/2006/picture">
                 <pic:pic xmlns:pic="http://schemas.openxmlformats.org/drawingml/2006/picture">
                   <pic:nvPicPr>
-                    <pic:cNvPr id="22871508" name=""/>
+                    <pic:cNvPr id="264034636" name=""/>
                     <pic:cNvPicPr/>
                   </pic:nvPicPr>
                   <pic:blipFill>
@@ -11518,7 +11536,7 @@
           <w:sz w:val="27"/>
         </w:rPr>
       </w:pPr>
-      <w:bookmarkStart w:id="22" w:name="_Toc240271787"/>
+      <w:bookmarkStart w:id="22" w:name="_Toc240273023"/>
       <w:r>
         <w:rPr>
           <w:rFonts w:ascii="Montserrat" w:hAnsi="Montserrat"/>
@@ -12584,16 +12602,16 @@
           <w:noProof/>
         </w:rPr>
         <w:drawing>
-          <wp:inline distT="0" distB="0" distL="0" distR="0" wp14:anchorId="14B52547" wp14:editId="0F339612">
+          <wp:inline distT="0" distB="0" distL="0" distR="0" wp14:anchorId="5A6FB1EA" wp14:editId="0DF0E938">
             <wp:extent cx="5120640" cy="3338440"/>
             <wp:effectExtent l="19050" t="19050" r="22860" b="14605"/>
-            <wp:docPr id="1272294864" name="Imagem 11"/>
+            <wp:docPr id="2071947788" name="Imagem 11"/>
             <wp:cNvGraphicFramePr/>
             <a:graphic xmlns:a="http://schemas.openxmlformats.org/drawingml/2006/main">
               <a:graphicData uri="http://schemas.openxmlformats.org/drawingml/2006/picture">
                 <pic:pic xmlns:pic="http://schemas.openxmlformats.org/drawingml/2006/picture">
                   <pic:nvPicPr>
-                    <pic:cNvPr id="1272294864" name=""/>
+                    <pic:cNvPr id="2071947788" name=""/>
                     <pic:cNvPicPr/>
                   </pic:nvPicPr>
                   <pic:blipFill>
@@ -12661,16 +12679,16 @@
         </w:rPr>
         <w:lastRenderedPageBreak/>
         <w:drawing>
-          <wp:inline distT="0" distB="0" distL="0" distR="0" wp14:anchorId="73CAAB5A" wp14:editId="4A850370">
+          <wp:inline distT="0" distB="0" distL="0" distR="0" wp14:anchorId="469CAD8E" wp14:editId="509EB995">
             <wp:extent cx="5120640" cy="4627581"/>
             <wp:effectExtent l="19050" t="19050" r="22860" b="20955"/>
-            <wp:docPr id="826508146" name="Imagem 12"/>
+            <wp:docPr id="793886308" name="Imagem 12"/>
             <wp:cNvGraphicFramePr/>
             <a:graphic xmlns:a="http://schemas.openxmlformats.org/drawingml/2006/main">
               <a:graphicData uri="http://schemas.openxmlformats.org/drawingml/2006/picture">
                 <pic:pic xmlns:pic="http://schemas.openxmlformats.org/drawingml/2006/picture">
                   <pic:nvPicPr>
-                    <pic:cNvPr id="826508146" name=""/>
+                    <pic:cNvPr id="793886308" name=""/>
                     <pic:cNvPicPr/>
                   </pic:nvPicPr>
                   <pic:blipFill>
@@ -12874,7 +12892,7 @@
           <w:sz w:val="27"/>
         </w:rPr>
       </w:pPr>
-      <w:bookmarkStart w:id="23" w:name="_Toc240271788"/>
+      <w:bookmarkStart w:id="23" w:name="_Toc240273024"/>
       <w:r>
         <w:rPr>
           <w:rFonts w:ascii="Montserrat" w:hAnsi="Montserrat"/>
@@ -13435,16 +13453,16 @@
           <w:noProof/>
         </w:rPr>
         <w:drawing>
-          <wp:inline distT="0" distB="0" distL="0" distR="0" wp14:anchorId="0568D60D" wp14:editId="32E0A8D7">
+          <wp:inline distT="0" distB="0" distL="0" distR="0" wp14:anchorId="25104844" wp14:editId="78B2EAC1">
             <wp:extent cx="5120640" cy="4627581"/>
             <wp:effectExtent l="19050" t="19050" r="22860" b="20955"/>
-            <wp:docPr id="911430367" name="Imagem 13"/>
+            <wp:docPr id="1819239155" name="Imagem 13"/>
             <wp:cNvGraphicFramePr/>
             <a:graphic xmlns:a="http://schemas.openxmlformats.org/drawingml/2006/main">
               <a:graphicData uri="http://schemas.openxmlformats.org/drawingml/2006/picture">
                 <pic:pic xmlns:pic="http://schemas.openxmlformats.org/drawingml/2006/picture">
                   <pic:nvPicPr>
-                    <pic:cNvPr id="911430367" name=""/>
+                    <pic:cNvPr id="1819239155" name=""/>
                     <pic:cNvPicPr/>
                   </pic:nvPicPr>
                   <pic:blipFill>
@@ -13512,16 +13530,16 @@
         </w:rPr>
         <w:lastRenderedPageBreak/>
         <w:drawing>
-          <wp:inline distT="0" distB="0" distL="0" distR="0" wp14:anchorId="375CDAEC" wp14:editId="61327B31">
+          <wp:inline distT="0" distB="0" distL="0" distR="0" wp14:anchorId="39EDF35F" wp14:editId="7E068887">
             <wp:extent cx="5120640" cy="4627581"/>
             <wp:effectExtent l="19050" t="19050" r="22860" b="20955"/>
-            <wp:docPr id="1609640852" name="Imagem 14"/>
+            <wp:docPr id="502262728" name="Imagem 14"/>
             <wp:cNvGraphicFramePr/>
             <a:graphic xmlns:a="http://schemas.openxmlformats.org/drawingml/2006/main">
               <a:graphicData uri="http://schemas.openxmlformats.org/drawingml/2006/picture">
                 <pic:pic xmlns:pic="http://schemas.openxmlformats.org/drawingml/2006/picture">
                   <pic:nvPicPr>
-                    <pic:cNvPr id="1609640852" name=""/>
+                    <pic:cNvPr id="502262728" name=""/>
                     <pic:cNvPicPr/>
                   </pic:nvPicPr>
                   <pic:blipFill>
@@ -13781,7 +13799,7 @@
           <w:sz w:val="27"/>
         </w:rPr>
       </w:pPr>
-      <w:bookmarkStart w:id="24" w:name="_Toc240271789"/>
+      <w:bookmarkStart w:id="24" w:name="_Toc240273025"/>
       <w:r>
         <w:rPr>
           <w:rFonts w:ascii="Montserrat" w:hAnsi="Montserrat"/>
@@ -13821,16 +13839,16 @@
           <w:noProof/>
         </w:rPr>
         <w:drawing>
-          <wp:inline distT="0" distB="0" distL="0" distR="0" wp14:anchorId="3951FFD4" wp14:editId="53411A2C">
+          <wp:inline distT="0" distB="0" distL="0" distR="0" wp14:anchorId="6B73619A" wp14:editId="30151D36">
             <wp:extent cx="5120640" cy="4627581"/>
             <wp:effectExtent l="19050" t="19050" r="22860" b="20955"/>
-            <wp:docPr id="1385978473" name="Imagem 15"/>
+            <wp:docPr id="432038931" name="Imagem 15"/>
             <wp:cNvGraphicFramePr/>
             <a:graphic xmlns:a="http://schemas.openxmlformats.org/drawingml/2006/main">
               <a:graphicData uri="http://schemas.openxmlformats.org/drawingml/2006/picture">
                 <pic:pic xmlns:pic="http://schemas.openxmlformats.org/drawingml/2006/picture">
                   <pic:nvPicPr>
-                    <pic:cNvPr id="1385978473" name=""/>
+                    <pic:cNvPr id="432038931" name=""/>
                     <pic:cNvPicPr/>
                   </pic:nvPicPr>
                   <pic:blipFill>
@@ -13898,16 +13916,16 @@
         </w:rPr>
         <w:lastRenderedPageBreak/>
         <w:drawing>
-          <wp:inline distT="0" distB="0" distL="0" distR="0" wp14:anchorId="30D75338" wp14:editId="47CE71C5">
+          <wp:inline distT="0" distB="0" distL="0" distR="0" wp14:anchorId="01939227" wp14:editId="39AC6263">
             <wp:extent cx="5120640" cy="4627581"/>
             <wp:effectExtent l="19050" t="19050" r="22860" b="20955"/>
-            <wp:docPr id="1194232451" name="Imagem 16"/>
+            <wp:docPr id="56770420" name="Imagem 16"/>
             <wp:cNvGraphicFramePr/>
             <a:graphic xmlns:a="http://schemas.openxmlformats.org/drawingml/2006/main">
               <a:graphicData uri="http://schemas.openxmlformats.org/drawingml/2006/picture">
                 <pic:pic xmlns:pic="http://schemas.openxmlformats.org/drawingml/2006/picture">
                   <pic:nvPicPr>
-                    <pic:cNvPr id="1194232451" name=""/>
+                    <pic:cNvPr id="56770420" name=""/>
                     <pic:cNvPicPr/>
                   </pic:nvPicPr>
                   <pic:blipFill>
@@ -14071,16 +14089,16 @@
         </w:rPr>
         <w:lastRenderedPageBreak/>
         <w:drawing>
-          <wp:inline distT="0" distB="0" distL="0" distR="0" wp14:anchorId="4E4C4715" wp14:editId="5BC68E3B">
+          <wp:inline distT="0" distB="0" distL="0" distR="0" wp14:anchorId="7F4D3097" wp14:editId="007C72D3">
             <wp:extent cx="5120640" cy="3282818"/>
             <wp:effectExtent l="19050" t="19050" r="22860" b="13335"/>
-            <wp:docPr id="1536224730" name="Imagem 17"/>
+            <wp:docPr id="1462588455" name="Imagem 17"/>
             <wp:cNvGraphicFramePr/>
             <a:graphic xmlns:a="http://schemas.openxmlformats.org/drawingml/2006/main">
               <a:graphicData uri="http://schemas.openxmlformats.org/drawingml/2006/picture">
                 <pic:pic xmlns:pic="http://schemas.openxmlformats.org/drawingml/2006/picture">
                   <pic:nvPicPr>
-                    <pic:cNvPr id="1536224730" name=""/>
+                    <pic:cNvPr id="1462588455" name=""/>
                     <pic:cNvPicPr/>
                   </pic:nvPicPr>
                   <pic:blipFill>
@@ -14158,25 +14176,7 @@
           <w:color w:val="1A1A1A"/>
           <w:sz w:val="22"/>
         </w:rPr>
-        <w:t>Status automatico da entrega: ao clicar em Visualizar arvore (ou ao abrir uma EAP ja registrada), cada Entrega (nivel 2) ganha um selo - Concluida, Atrasada, No prazo ou Sem cronograma vinculado - calculado automaticamente a partir do cronograma do Planejamento (Passo 4), casando pelo nome da entrega com o nome do marco. Nao ha nenhum campo novo para preencher na EAP: uma entrega fica Concluida se o marco correspondente tiver Conclusao real preenchida no cronograma, Atrasada se nao tiver conclusao e o Termino previsto ja tiver passado, e Sem cronograma vinculado se nao houver marco com o mesmo nome. Um resumo no topo da arvore mostra o percentual de entregas concluidas do projeto. So o nivel 2 (Entrega) recebe esse status - o nivel 3 (Atividade) nao tem hoje nenhuma outra fonte de dado no sistema que permita calcular automaticamente.</w:t>
-      </w:r>
-    </w:p>
-    <w:p>
-      <w:pPr>
-        <w:spacing w:line="280" w:lineRule="auto"/>
-        <w:rPr>
-          <w:rFonts w:ascii="Montserrat" w:hAnsi="Montserrat"/>
-          <w:color w:val="1A1A1A"/>
-          <w:sz w:val="22"/>
-        </w:rPr>
-      </w:pPr>
-      <w:r>
-        <w:rPr>
-          <w:rFonts w:ascii="Montserrat" w:hAnsi="Montserrat"/>
-          <w:color w:val="1A1A1A"/>
-          <w:sz w:val="22"/>
-        </w:rPr>
-        <w:t>Clique em Registrar EAP para gerar o protocolo.</w:t>
+        <w:t>Status automatico da entrega: ao clicar em Visualizar arvore (ou ao abrir uma EAP ja registrada), cada Entrega (nivel 2) ganha um selo - Concluida, Atrasada, No prazo ou Sem cronograma vinculado - calculado automaticamente a partir do cronograma do Planejamento (Passo 4), casando pelo nome da entrega com o nome do marco. Nao ha nenhum campo novo para preencher na EAP: uma entrega fica Concluida se o marco correspondente tiver Conclusao real preenchida no cronograma, Atrasada se nao tiver conclusao e o Termino previsto ja tiver passado, e Sem cronograma vinculado se nao houver marco com o mesmo nome. Um resumo no topo da arvore mostra o percentual de entregas concluidas do projeto.</w:t>
       </w:r>
     </w:p>
     <w:p>
@@ -14200,7 +14200,25 @@
           <w:color w:val="1A1A1A"/>
           <w:sz w:val="22"/>
         </w:rPr>
-        <w:t>No rodape do painel de detalhes de uma EAP, os botoes Imprimir e Exportar Word geram um documento com a arvore hierarquica completa (pacotes, entregas e atividades, com a prioridade de cada uma), pronto para impressao ou para abrir no Word. Este artefato nao tem um FORALF oficial - o layout segue o padrao visual dos demais documentos gerados pelo sistema.</w:t>
+        <w:t>Status automatico da atividade: o mesmo casamento por nome desce mais um nivel - cada Atividade (nivel 3) ganha um selo Concluida, Pendente ou Sem tarefa vinculada, casando pelo nome da atividade com uma tarefa cadastrada dentro de qualquer marco do cronograma (botao + Tarefas de cada marco, Passo 4, secao 3). Como tarefa nao tem data - so nome e concluida - nao existe estado Atrasada aqui, so Concluida/Pendente. Tambem sem nenhum campo novo para preencher na EAP.</w:t>
+      </w:r>
+    </w:p>
+    <w:p>
+      <w:pPr>
+        <w:spacing w:line="280" w:lineRule="auto"/>
+        <w:rPr>
+          <w:rFonts w:ascii="Montserrat" w:hAnsi="Montserrat"/>
+          <w:color w:val="1A1A1A"/>
+          <w:sz w:val="22"/>
+        </w:rPr>
+      </w:pPr>
+      <w:r>
+        <w:rPr>
+          <w:rFonts w:ascii="Montserrat" w:hAnsi="Montserrat"/>
+          <w:color w:val="1A1A1A"/>
+          <w:sz w:val="22"/>
+        </w:rPr>
+        <w:t>Clique em Registrar EAP para gerar o protocolo.</w:t>
       </w:r>
     </w:p>
     <w:p>
@@ -14208,7 +14226,7 @@
         <w:pStyle w:val="PargrafodaLista"/>
         <w:numPr>
           <w:ilvl w:val="0"/>
-          <w:numId w:val="18"/>
+          <w:numId w:val="19"/>
         </w:numPr>
         <w:spacing w:after="80" w:line="260" w:lineRule="auto"/>
         <w:ind w:left="700"/>
@@ -14224,7 +14242,7 @@
           <w:color w:val="1A1A1A"/>
           <w:sz w:val="22"/>
         </w:rPr>
-        <w:t xml:space="preserve">Assistente de preenchimento por IA: apos selecionar o Projeto vinculado, o botao Sugerir com IA le o Planejamento e o TAP do projeto e sugere </w:t>
+        <w:t xml:space="preserve">No rodape do painel de detalhes de uma EAP, os botoes Imprimir e Exportar Word geram um documento com a arvore hierarquica completa </w:t>
       </w:r>
       <w:r>
         <w:rPr>
@@ -14233,7 +14251,31 @@
           <w:sz w:val="22"/>
         </w:rPr>
         <w:lastRenderedPageBreak/>
-        <w:t>pacotes de trabalho (nivel 1) e entregas (nivel 2) - nunca atividades (nivel 3). So funciona se a arvore estiver totalmente vazia; se ja houver qualquer pacote ou entrega digitado, a sugestao e recusada (secao 2.12).</w:t>
+        <w:t>(pacotes, entregas e atividades, com a prioridade de cada uma), pronto para impressao ou para abrir no Word. Este artefato nao tem um FORALF oficial - o layout segue o padrao visual dos demais documentos gerados pelo sistema.</w:t>
+      </w:r>
+    </w:p>
+    <w:p>
+      <w:pPr>
+        <w:pStyle w:val="PargrafodaLista"/>
+        <w:numPr>
+          <w:ilvl w:val="0"/>
+          <w:numId w:val="19"/>
+        </w:numPr>
+        <w:spacing w:after="80" w:line="260" w:lineRule="auto"/>
+        <w:ind w:left="700"/>
+        <w:rPr>
+          <w:rFonts w:ascii="Montserrat" w:hAnsi="Montserrat"/>
+          <w:color w:val="1A1A1A"/>
+          <w:sz w:val="22"/>
+        </w:rPr>
+      </w:pPr>
+      <w:r>
+        <w:rPr>
+          <w:rFonts w:ascii="Montserrat" w:hAnsi="Montserrat"/>
+          <w:color w:val="1A1A1A"/>
+          <w:sz w:val="22"/>
+        </w:rPr>
+        <w:t>Assistente de preenchimento por IA: apos selecionar o Projeto vinculado, o botao Sugerir com IA le o Planejamento e o TAP do projeto e sugere pacotes de trabalho (nivel 1) e entregas (nivel 2) - nunca atividades (nivel 3). So funciona se a arvore estiver totalmente vazia; se ja houver qualquer pacote ou entrega digitado, a sugestao e recusada (secao 2.12).</w:t>
       </w:r>
     </w:p>
     <w:p>
@@ -14247,7 +14289,7 @@
           <w:sz w:val="27"/>
         </w:rPr>
       </w:pPr>
-      <w:bookmarkStart w:id="25" w:name="_Toc240271790"/>
+      <w:bookmarkStart w:id="25" w:name="_Toc240273026"/>
       <w:r>
         <w:rPr>
           <w:rFonts w:ascii="Montserrat" w:hAnsi="Montserrat"/>
@@ -14287,16 +14329,16 @@
           <w:noProof/>
         </w:rPr>
         <w:drawing>
-          <wp:inline distT="0" distB="0" distL="0" distR="0" wp14:anchorId="6589BB81" wp14:editId="03AD860A">
+          <wp:inline distT="0" distB="0" distL="0" distR="0" wp14:anchorId="7EAEF0AE" wp14:editId="74DC94B3">
             <wp:extent cx="5120640" cy="4627581"/>
             <wp:effectExtent l="19050" t="19050" r="22860" b="20955"/>
-            <wp:docPr id="176872524" name="Imagem 18"/>
+            <wp:docPr id="1993849305" name="Imagem 18"/>
             <wp:cNvGraphicFramePr/>
             <a:graphic xmlns:a="http://schemas.openxmlformats.org/drawingml/2006/main">
               <a:graphicData uri="http://schemas.openxmlformats.org/drawingml/2006/picture">
                 <pic:pic xmlns:pic="http://schemas.openxmlformats.org/drawingml/2006/picture">
                   <pic:nvPicPr>
-                    <pic:cNvPr id="176872524" name=""/>
+                    <pic:cNvPr id="1993849305" name=""/>
                     <pic:cNvPicPr/>
                   </pic:nvPicPr>
                   <pic:blipFill>
@@ -14364,16 +14406,16 @@
         </w:rPr>
         <w:lastRenderedPageBreak/>
         <w:drawing>
-          <wp:inline distT="0" distB="0" distL="0" distR="0" wp14:anchorId="00950A3B" wp14:editId="7A2D176A">
+          <wp:inline distT="0" distB="0" distL="0" distR="0" wp14:anchorId="30EA343F" wp14:editId="35478DB9">
             <wp:extent cx="5120640" cy="4627581"/>
             <wp:effectExtent l="19050" t="19050" r="22860" b="20955"/>
-            <wp:docPr id="332157880" name="Imagem 19"/>
+            <wp:docPr id="493406443" name="Imagem 19"/>
             <wp:cNvGraphicFramePr/>
             <a:graphic xmlns:a="http://schemas.openxmlformats.org/drawingml/2006/main">
               <a:graphicData uri="http://schemas.openxmlformats.org/drawingml/2006/picture">
                 <pic:pic xmlns:pic="http://schemas.openxmlformats.org/drawingml/2006/picture">
                   <pic:nvPicPr>
-                    <pic:cNvPr id="332157880" name=""/>
+                    <pic:cNvPr id="493406443" name=""/>
                     <pic:cNvPicPr/>
                   </pic:nvPicPr>
                   <pic:blipFill>
@@ -14435,7 +14477,7 @@
         <w:pStyle w:val="PargrafodaLista"/>
         <w:numPr>
           <w:ilvl w:val="0"/>
-          <w:numId w:val="19"/>
+          <w:numId w:val="20"/>
         </w:numPr>
         <w:spacing w:after="80" w:line="260" w:lineRule="auto"/>
         <w:ind w:left="700"/>
@@ -14452,72 +14494,6 @@
           <w:sz w:val="22"/>
         </w:rPr>
         <w:t>Selecione a(s) unidade(s) envolvidas, preencha Pauta e Projeto (obrigatorios), participantes, resumo, encaminhamentos e entraves.</w:t>
-      </w:r>
-    </w:p>
-    <w:p>
-      <w:pPr>
-        <w:pStyle w:val="PargrafodaLista"/>
-        <w:numPr>
-          <w:ilvl w:val="0"/>
-          <w:numId w:val="19"/>
-        </w:numPr>
-        <w:spacing w:after="80" w:line="260" w:lineRule="auto"/>
-        <w:ind w:left="700"/>
-        <w:rPr>
-          <w:rFonts w:ascii="Montserrat" w:hAnsi="Montserrat"/>
-          <w:color w:val="1A1A1A"/>
-          <w:sz w:val="22"/>
-        </w:rPr>
-      </w:pPr>
-      <w:r>
-        <w:rPr>
-          <w:rFonts w:ascii="Montserrat" w:hAnsi="Montserrat"/>
-          <w:color w:val="1A1A1A"/>
-          <w:sz w:val="22"/>
-        </w:rPr>
-        <w:t>Nas tabelas de Encaminhamentos e Entraves, a coluna SEQ e preenchida automaticamente - numera em sequencia (01, 02...) assim que o Encaminhamento/Entrave da linha e digitado, sem precisar informar o numero manualmente. Uma linha ainda vazia nao entra na contagem; reordenar (â–²/â–¼) ou remover uma linha renumera as demais automaticamente.</w:t>
-      </w:r>
-    </w:p>
-    <w:p>
-      <w:pPr>
-        <w:pStyle w:val="PargrafodaLista"/>
-        <w:numPr>
-          <w:ilvl w:val="0"/>
-          <w:numId w:val="19"/>
-        </w:numPr>
-        <w:spacing w:after="80" w:line="260" w:lineRule="auto"/>
-        <w:ind w:left="700"/>
-        <w:rPr>
-          <w:rFonts w:ascii="Montserrat" w:hAnsi="Montserrat"/>
-          <w:color w:val="1A1A1A"/>
-          <w:sz w:val="22"/>
-        </w:rPr>
-      </w:pPr>
-      <w:r>
-        <w:rPr>
-          <w:rFonts w:ascii="Montserrat" w:hAnsi="Montserrat"/>
-          <w:color w:val="1A1A1A"/>
-          <w:sz w:val="22"/>
-        </w:rPr>
-        <w:t>Opcional, quando habilitado pelo Admin: em Importar transcricao da reuniao, cole o texto, anexe um arquivo .txt/.docx/.pdf, ou anexe o audio da gravacao (.mp3/.m4a/.aac/.wav/.ogg) para transcricao automatica (secao 2.11), depois clique em Analisar e preencher - a IA sugere pauta, data/horario (se mencionados), participantes, resumo, encaminhamentos e entraves. Revise sempre os dados sugeridos antes de registrar (secao 2.10).</w:t>
-      </w:r>
-    </w:p>
-    <w:p>
-      <w:pPr>
-        <w:spacing w:line="280" w:lineRule="auto"/>
-        <w:rPr>
-          <w:rFonts w:ascii="Montserrat" w:hAnsi="Montserrat"/>
-          <w:color w:val="1A1A1A"/>
-          <w:sz w:val="22"/>
-        </w:rPr>
-      </w:pPr>
-      <w:r>
-        <w:rPr>
-          <w:rFonts w:ascii="Montserrat" w:hAnsi="Montserrat"/>
-          <w:color w:val="1A1A1A"/>
-          <w:sz w:val="22"/>
-        </w:rPr>
-        <w:t>Clique em Registrar ata para gerar o protocolo.</w:t>
       </w:r>
     </w:p>
     <w:p>
@@ -14541,6 +14517,72 @@
           <w:color w:val="1A1A1A"/>
           <w:sz w:val="22"/>
         </w:rPr>
+        <w:t>Nas tabelas de Encaminhamentos e Entraves, a coluna SEQ e preenchida automaticamente - numera em sequencia (01, 02...) assim que o Encaminhamento/Entrave da linha e digitado, sem precisar informar o numero manualmente. Uma linha ainda vazia nao entra na contagem; reordenar (â–²/â–¼) ou remover uma linha renumera as demais automaticamente.</w:t>
+      </w:r>
+    </w:p>
+    <w:p>
+      <w:pPr>
+        <w:pStyle w:val="PargrafodaLista"/>
+        <w:numPr>
+          <w:ilvl w:val="0"/>
+          <w:numId w:val="20"/>
+        </w:numPr>
+        <w:spacing w:after="80" w:line="260" w:lineRule="auto"/>
+        <w:ind w:left="700"/>
+        <w:rPr>
+          <w:rFonts w:ascii="Montserrat" w:hAnsi="Montserrat"/>
+          <w:color w:val="1A1A1A"/>
+          <w:sz w:val="22"/>
+        </w:rPr>
+      </w:pPr>
+      <w:r>
+        <w:rPr>
+          <w:rFonts w:ascii="Montserrat" w:hAnsi="Montserrat"/>
+          <w:color w:val="1A1A1A"/>
+          <w:sz w:val="22"/>
+        </w:rPr>
+        <w:t>Opcional, quando habilitado pelo Admin: em Importar transcricao da reuniao, cole o texto, anexe um arquivo .txt/.docx/.pdf, ou anexe o audio da gravacao (.mp3/.m4a/.aac/.wav/.ogg) para transcricao automatica (secao 2.11), depois clique em Analisar e preencher - a IA sugere pauta, data/horario (se mencionados), participantes, resumo, encaminhamentos e entraves. Revise sempre os dados sugeridos antes de registrar (secao 2.10).</w:t>
+      </w:r>
+    </w:p>
+    <w:p>
+      <w:pPr>
+        <w:spacing w:line="280" w:lineRule="auto"/>
+        <w:rPr>
+          <w:rFonts w:ascii="Montserrat" w:hAnsi="Montserrat"/>
+          <w:color w:val="1A1A1A"/>
+          <w:sz w:val="22"/>
+        </w:rPr>
+      </w:pPr>
+      <w:r>
+        <w:rPr>
+          <w:rFonts w:ascii="Montserrat" w:hAnsi="Montserrat"/>
+          <w:color w:val="1A1A1A"/>
+          <w:sz w:val="22"/>
+        </w:rPr>
+        <w:t>Clique em Registrar ata para gerar o protocolo.</w:t>
+      </w:r>
+    </w:p>
+    <w:p>
+      <w:pPr>
+        <w:pStyle w:val="PargrafodaLista"/>
+        <w:numPr>
+          <w:ilvl w:val="0"/>
+          <w:numId w:val="21"/>
+        </w:numPr>
+        <w:spacing w:after="80" w:line="260" w:lineRule="auto"/>
+        <w:ind w:left="700"/>
+        <w:rPr>
+          <w:rFonts w:ascii="Montserrat" w:hAnsi="Montserrat"/>
+          <w:color w:val="1A1A1A"/>
+          <w:sz w:val="22"/>
+        </w:rPr>
+      </w:pPr>
+      <w:r>
+        <w:rPr>
+          <w:rFonts w:ascii="Montserrat" w:hAnsi="Montserrat"/>
+          <w:color w:val="1A1A1A"/>
+          <w:sz w:val="22"/>
+        </w:rPr>
         <w:lastRenderedPageBreak/>
         <w:t>Na lista Atas cadastradas, clique numa ata para abri-la e usar os botoes Imprimir e Exportar Word, no rodape do painel lateral: ambos geram o documento no formato oficial do FORALF00340 (cabecalho, unidade, pauta, participantes, descricao, saidas e entraves), pronto para impressao ou para abrir no Word.</w:t>
       </w:r>
@@ -14556,7 +14598,7 @@
           <w:sz w:val="27"/>
         </w:rPr>
       </w:pPr>
-      <w:bookmarkStart w:id="26" w:name="_Toc240271791"/>
+      <w:bookmarkStart w:id="26" w:name="_Toc240273027"/>
       <w:r>
         <w:rPr>
           <w:rFonts w:ascii="Montserrat" w:hAnsi="Montserrat"/>
@@ -14596,16 +14638,16 @@
           <w:noProof/>
         </w:rPr>
         <w:drawing>
-          <wp:inline distT="0" distB="0" distL="0" distR="0" wp14:anchorId="3A40D904" wp14:editId="639614C7">
+          <wp:inline distT="0" distB="0" distL="0" distR="0" wp14:anchorId="73B87808" wp14:editId="370C49CF">
             <wp:extent cx="5120640" cy="4627581"/>
             <wp:effectExtent l="19050" t="19050" r="22860" b="20955"/>
-            <wp:docPr id="1363550287" name="Imagem 20"/>
+            <wp:docPr id="768912268" name="Imagem 20"/>
             <wp:cNvGraphicFramePr/>
             <a:graphic xmlns:a="http://schemas.openxmlformats.org/drawingml/2006/main">
               <a:graphicData uri="http://schemas.openxmlformats.org/drawingml/2006/picture">
                 <pic:pic xmlns:pic="http://schemas.openxmlformats.org/drawingml/2006/picture">
                   <pic:nvPicPr>
-                    <pic:cNvPr id="1363550287" name=""/>
+                    <pic:cNvPr id="768912268" name=""/>
                     <pic:cNvPicPr/>
                   </pic:nvPicPr>
                   <pic:blipFill>
@@ -14673,16 +14715,16 @@
         </w:rPr>
         <w:lastRenderedPageBreak/>
         <w:drawing>
-          <wp:inline distT="0" distB="0" distL="0" distR="0" wp14:anchorId="621DF5A3" wp14:editId="78F54BA6">
+          <wp:inline distT="0" distB="0" distL="0" distR="0" wp14:anchorId="4C2FCA84" wp14:editId="7CBE1604">
             <wp:extent cx="5120640" cy="4627581"/>
             <wp:effectExtent l="19050" t="19050" r="22860" b="20955"/>
-            <wp:docPr id="713880905" name="Imagem 21"/>
+            <wp:docPr id="641264765" name="Imagem 21"/>
             <wp:cNvGraphicFramePr/>
             <a:graphic xmlns:a="http://schemas.openxmlformats.org/drawingml/2006/main">
               <a:graphicData uri="http://schemas.openxmlformats.org/drawingml/2006/picture">
                 <pic:pic xmlns:pic="http://schemas.openxmlformats.org/drawingml/2006/picture">
                   <pic:nvPicPr>
-                    <pic:cNvPr id="713880905" name=""/>
+                    <pic:cNvPr id="641264765" name=""/>
                     <pic:cNvPicPr/>
                   </pic:nvPicPr>
                   <pic:blipFill>
@@ -14744,7 +14786,7 @@
         <w:pStyle w:val="PargrafodaLista"/>
         <w:numPr>
           <w:ilvl w:val="0"/>
-          <w:numId w:val="20"/>
+          <w:numId w:val="21"/>
         </w:numPr>
         <w:spacing w:after="80" w:line="260" w:lineRule="auto"/>
         <w:ind w:left="700"/>
@@ -14761,96 +14803,6 @@
           <w:sz w:val="22"/>
         </w:rPr>
         <w:t>Identifique o projeto e a mudanca (titulo e solicitante sao obrigatorios); descreva a mudanca, os beneficios e o impacto de nao implementa-la.</w:t>
-      </w:r>
-    </w:p>
-    <w:p>
-      <w:pPr>
-        <w:pStyle w:val="PargrafodaLista"/>
-        <w:numPr>
-          <w:ilvl w:val="0"/>
-          <w:numId w:val="20"/>
-        </w:numPr>
-        <w:spacing w:after="80" w:line="260" w:lineRule="auto"/>
-        <w:ind w:left="700"/>
-        <w:rPr>
-          <w:rFonts w:ascii="Montserrat" w:hAnsi="Montserrat"/>
-          <w:color w:val="1A1A1A"/>
-          <w:sz w:val="22"/>
-        </w:rPr>
-      </w:pPr>
-      <w:r>
-        <w:rPr>
-          <w:rFonts w:ascii="Montserrat" w:hAnsi="Montserrat"/>
-          <w:color w:val="1A1A1A"/>
-          <w:sz w:val="22"/>
-        </w:rPr>
-        <w:t>Preencha a analise de impactos nas 8 dimensoes: objetivo, cronograma, escopo, custo, alinhamento estrategico, qualidade, riscos e outros impactos.</w:t>
-      </w:r>
-    </w:p>
-    <w:p>
-      <w:pPr>
-        <w:pStyle w:val="PargrafodaLista"/>
-        <w:numPr>
-          <w:ilvl w:val="0"/>
-          <w:numId w:val="20"/>
-        </w:numPr>
-        <w:spacing w:after="80" w:line="260" w:lineRule="auto"/>
-        <w:ind w:left="700"/>
-        <w:rPr>
-          <w:rFonts w:ascii="Montserrat" w:hAnsi="Montserrat"/>
-          <w:color w:val="1A1A1A"/>
-          <w:sz w:val="22"/>
-        </w:rPr>
-      </w:pPr>
-      <w:r>
-        <w:rPr>
-          <w:rFonts w:ascii="Montserrat" w:hAnsi="Montserrat"/>
-          <w:color w:val="1A1A1A"/>
-          <w:sz w:val="22"/>
-        </w:rPr>
-        <w:t>Marque a decisao: Aprovada, Nao aprovada ou Pendente de avaliacao, com justificativa.</w:t>
-      </w:r>
-    </w:p>
-    <w:p>
-      <w:pPr>
-        <w:pStyle w:val="PargrafodaLista"/>
-        <w:numPr>
-          <w:ilvl w:val="0"/>
-          <w:numId w:val="20"/>
-        </w:numPr>
-        <w:spacing w:after="80" w:line="260" w:lineRule="auto"/>
-        <w:ind w:left="700"/>
-        <w:rPr>
-          <w:rFonts w:ascii="Montserrat" w:hAnsi="Montserrat"/>
-          <w:color w:val="1A1A1A"/>
-          <w:sz w:val="22"/>
-        </w:rPr>
-      </w:pPr>
-      <w:r>
-        <w:rPr>
-          <w:rFonts w:ascii="Montserrat" w:hAnsi="Montserrat"/>
-          <w:color w:val="1A1A1A"/>
-          <w:sz w:val="22"/>
-        </w:rPr>
-        <w:t>Assistente de preenchimento por IA: apos selecionar o Projeto vinculado, o botao Sugerir com IA procura nas Atas de Reuniao mais recentes alguma mudanca sendo discutida em relacao ao combinado no TAP/Planejamento, e sugere a descricao da mudanca e a analise de impactos - se nao houver mudanca clara sendo discutida, nenhum campo e preenchido (secao 2.12).</w:t>
-      </w:r>
-    </w:p>
-    <w:p>
-      <w:pPr>
-        <w:spacing w:line="280" w:lineRule="auto"/>
-        <w:rPr>
-          <w:rFonts w:ascii="Montserrat" w:hAnsi="Montserrat"/>
-          <w:color w:val="1A1A1A"/>
-          <w:sz w:val="22"/>
-        </w:rPr>
-      </w:pPr>
-      <w:r>
-        <w:rPr>
-          <w:rFonts w:ascii="Montserrat" w:hAnsi="Montserrat"/>
-          <w:color w:val="1A1A1A"/>
-          <w:sz w:val="22"/>
-        </w:rPr>
-        <w:t>Clique em Registrar SMP - o status do registro acompanha automaticamente a decisao marcada.</w:t>
       </w:r>
     </w:p>
     <w:p>
@@ -14874,6 +14826,96 @@
           <w:color w:val="1A1A1A"/>
           <w:sz w:val="22"/>
         </w:rPr>
+        <w:t>Preencha a analise de impactos nas 8 dimensoes: objetivo, cronograma, escopo, custo, alinhamento estrategico, qualidade, riscos e outros impactos.</w:t>
+      </w:r>
+    </w:p>
+    <w:p>
+      <w:pPr>
+        <w:pStyle w:val="PargrafodaLista"/>
+        <w:numPr>
+          <w:ilvl w:val="0"/>
+          <w:numId w:val="21"/>
+        </w:numPr>
+        <w:spacing w:after="80" w:line="260" w:lineRule="auto"/>
+        <w:ind w:left="700"/>
+        <w:rPr>
+          <w:rFonts w:ascii="Montserrat" w:hAnsi="Montserrat"/>
+          <w:color w:val="1A1A1A"/>
+          <w:sz w:val="22"/>
+        </w:rPr>
+      </w:pPr>
+      <w:r>
+        <w:rPr>
+          <w:rFonts w:ascii="Montserrat" w:hAnsi="Montserrat"/>
+          <w:color w:val="1A1A1A"/>
+          <w:sz w:val="22"/>
+        </w:rPr>
+        <w:t>Marque a decisao: Aprovada, Nao aprovada ou Pendente de avaliacao, com justificativa.</w:t>
+      </w:r>
+    </w:p>
+    <w:p>
+      <w:pPr>
+        <w:pStyle w:val="PargrafodaLista"/>
+        <w:numPr>
+          <w:ilvl w:val="0"/>
+          <w:numId w:val="21"/>
+        </w:numPr>
+        <w:spacing w:after="80" w:line="260" w:lineRule="auto"/>
+        <w:ind w:left="700"/>
+        <w:rPr>
+          <w:rFonts w:ascii="Montserrat" w:hAnsi="Montserrat"/>
+          <w:color w:val="1A1A1A"/>
+          <w:sz w:val="22"/>
+        </w:rPr>
+      </w:pPr>
+      <w:r>
+        <w:rPr>
+          <w:rFonts w:ascii="Montserrat" w:hAnsi="Montserrat"/>
+          <w:color w:val="1A1A1A"/>
+          <w:sz w:val="22"/>
+        </w:rPr>
+        <w:t>Assistente de preenchimento por IA: apos selecionar o Projeto vinculado, o botao Sugerir com IA procura nas Atas de Reuniao mais recentes alguma mudanca sendo discutida em relacao ao combinado no TAP/Planejamento, e sugere a descricao da mudanca e a analise de impactos - se nao houver mudanca clara sendo discutida, nenhum campo e preenchido (secao 2.12).</w:t>
+      </w:r>
+    </w:p>
+    <w:p>
+      <w:pPr>
+        <w:spacing w:line="280" w:lineRule="auto"/>
+        <w:rPr>
+          <w:rFonts w:ascii="Montserrat" w:hAnsi="Montserrat"/>
+          <w:color w:val="1A1A1A"/>
+          <w:sz w:val="22"/>
+        </w:rPr>
+      </w:pPr>
+      <w:r>
+        <w:rPr>
+          <w:rFonts w:ascii="Montserrat" w:hAnsi="Montserrat"/>
+          <w:color w:val="1A1A1A"/>
+          <w:sz w:val="22"/>
+        </w:rPr>
+        <w:t>Clique em Registrar SMP - o status do registro acompanha automaticamente a decisao marcada.</w:t>
+      </w:r>
+    </w:p>
+    <w:p>
+      <w:pPr>
+        <w:pStyle w:val="PargrafodaLista"/>
+        <w:numPr>
+          <w:ilvl w:val="0"/>
+          <w:numId w:val="22"/>
+        </w:numPr>
+        <w:spacing w:after="80" w:line="260" w:lineRule="auto"/>
+        <w:ind w:left="700"/>
+        <w:rPr>
+          <w:rFonts w:ascii="Montserrat" w:hAnsi="Montserrat"/>
+          <w:color w:val="1A1A1A"/>
+          <w:sz w:val="22"/>
+        </w:rPr>
+      </w:pPr>
+      <w:r>
+        <w:rPr>
+          <w:rFonts w:ascii="Montserrat" w:hAnsi="Montserrat"/>
+          <w:color w:val="1A1A1A"/>
+          <w:sz w:val="22"/>
+        </w:rPr>
         <w:lastRenderedPageBreak/>
         <w:t>Anexos: mesmo recurso ja usado na Solicitacao de Demanda (Passo 1) - o botao Anexar arquivo, na secao Anexos, envia o arquivo direto para um repositorio proprio do sistema (ate 15 MB, .txt/.docx/.pdf), com opcoes Baixar e Remover tanto no formulario quanto no painel de detalhes do registro. O campo de texto Links de documentos continua disponivel a parte, para links que nao sao um arquivo enviado.</w:t>
       </w:r>
@@ -14888,16 +14930,16 @@
           <w:noProof/>
         </w:rPr>
         <w:drawing>
-          <wp:inline distT="0" distB="0" distL="0" distR="0" wp14:anchorId="35DF9EF2" wp14:editId="2C13AFC0">
+          <wp:inline distT="0" distB="0" distL="0" distR="0" wp14:anchorId="47F29C72" wp14:editId="17FD7333">
             <wp:extent cx="5120640" cy="1757287"/>
             <wp:effectExtent l="19050" t="19050" r="22860" b="14605"/>
-            <wp:docPr id="966086596" name="Imagem 22"/>
+            <wp:docPr id="1267043313" name="Imagem 22"/>
             <wp:cNvGraphicFramePr/>
             <a:graphic xmlns:a="http://schemas.openxmlformats.org/drawingml/2006/main">
               <a:graphicData uri="http://schemas.openxmlformats.org/drawingml/2006/picture">
                 <pic:pic xmlns:pic="http://schemas.openxmlformats.org/drawingml/2006/picture">
                   <pic:nvPicPr>
-                    <pic:cNvPr id="966086596" name=""/>
+                    <pic:cNvPr id="1267043313" name=""/>
                     <pic:cNvPicPr/>
                   </pic:nvPicPr>
                   <pic:blipFill>
@@ -14959,7 +15001,7 @@
         <w:pStyle w:val="PargrafodaLista"/>
         <w:numPr>
           <w:ilvl w:val="0"/>
-          <w:numId w:val="21"/>
+          <w:numId w:val="22"/>
         </w:numPr>
         <w:spacing w:after="80" w:line="260" w:lineRule="auto"/>
         <w:ind w:left="700"/>
@@ -15010,7 +15052,7 @@
           <w:sz w:val="27"/>
         </w:rPr>
       </w:pPr>
-      <w:bookmarkStart w:id="27" w:name="_Toc240271792"/>
+      <w:bookmarkStart w:id="27" w:name="_Toc240273028"/>
       <w:r>
         <w:rPr>
           <w:rFonts w:ascii="Montserrat" w:hAnsi="Montserrat"/>
@@ -15051,16 +15093,16 @@
         </w:rPr>
         <w:lastRenderedPageBreak/>
         <w:drawing>
-          <wp:inline distT="0" distB="0" distL="0" distR="0" wp14:anchorId="48C23574" wp14:editId="048134E2">
+          <wp:inline distT="0" distB="0" distL="0" distR="0" wp14:anchorId="103E5D97" wp14:editId="238B8C6C">
             <wp:extent cx="5120640" cy="4627581"/>
             <wp:effectExtent l="19050" t="19050" r="22860" b="20955"/>
-            <wp:docPr id="1447229964" name="Imagem 23"/>
+            <wp:docPr id="2014002192" name="Imagem 23"/>
             <wp:cNvGraphicFramePr/>
             <a:graphic xmlns:a="http://schemas.openxmlformats.org/drawingml/2006/main">
               <a:graphicData uri="http://schemas.openxmlformats.org/drawingml/2006/picture">
                 <pic:pic xmlns:pic="http://schemas.openxmlformats.org/drawingml/2006/picture">
                   <pic:nvPicPr>
-                    <pic:cNvPr id="1447229964" name=""/>
+                    <pic:cNvPr id="2014002192" name=""/>
                     <pic:cNvPicPr/>
                   </pic:nvPicPr>
                   <pic:blipFill>
@@ -15128,16 +15170,16 @@
         </w:rPr>
         <w:lastRenderedPageBreak/>
         <w:drawing>
-          <wp:inline distT="0" distB="0" distL="0" distR="0" wp14:anchorId="0EC9630B" wp14:editId="5B1D2F9D">
+          <wp:inline distT="0" distB="0" distL="0" distR="0" wp14:anchorId="380E062F" wp14:editId="672BA4BC">
             <wp:extent cx="5120640" cy="4627581"/>
             <wp:effectExtent l="19050" t="19050" r="22860" b="20955"/>
-            <wp:docPr id="668219511" name="Imagem 24"/>
+            <wp:docPr id="1660137531" name="Imagem 24"/>
             <wp:cNvGraphicFramePr/>
             <a:graphic xmlns:a="http://schemas.openxmlformats.org/drawingml/2006/main">
               <a:graphicData uri="http://schemas.openxmlformats.org/drawingml/2006/picture">
                 <pic:pic xmlns:pic="http://schemas.openxmlformats.org/drawingml/2006/picture">
                   <pic:nvPicPr>
-                    <pic:cNvPr id="668219511" name=""/>
+                    <pic:cNvPr id="1660137531" name=""/>
                     <pic:cNvPicPr/>
                   </pic:nvPicPr>
                   <pic:blipFill>
@@ -15199,7 +15241,7 @@
         <w:pStyle w:val="PargrafodaLista"/>
         <w:numPr>
           <w:ilvl w:val="0"/>
-          <w:numId w:val="21"/>
+          <w:numId w:val="22"/>
         </w:numPr>
         <w:spacing w:after="80" w:line="260" w:lineRule="auto"/>
         <w:ind w:left="700"/>
@@ -15216,127 +15258,6 @@
           <w:sz w:val="22"/>
         </w:rPr>
         <w:t>Preencha a identificacao e o programa vinculado, se houver; selecione o tipo de encerramento (Concluido, Paralisado ou Cancelado).</w:t>
-      </w:r>
-    </w:p>
-    <w:p>
-      <w:pPr>
-        <w:pStyle w:val="PargrafodaLista"/>
-        <w:numPr>
-          <w:ilvl w:val="0"/>
-          <w:numId w:val="21"/>
-        </w:numPr>
-        <w:spacing w:after="80" w:line="260" w:lineRule="auto"/>
-        <w:ind w:left="700"/>
-        <w:rPr>
-          <w:rFonts w:ascii="Montserrat" w:hAnsi="Montserrat"/>
-          <w:color w:val="1A1A1A"/>
-          <w:sz w:val="22"/>
-        </w:rPr>
-      </w:pPr>
-      <w:r>
-        <w:rPr>
-          <w:rFonts w:ascii="Montserrat" w:hAnsi="Montserrat"/>
-          <w:color w:val="1A1A1A"/>
-          <w:sz w:val="22"/>
-        </w:rPr>
-        <w:t>Se Paralisado ou Cancelado, o campo Justificativa aparece automaticamente.</w:t>
-      </w:r>
-    </w:p>
-    <w:p>
-      <w:pPr>
-        <w:pStyle w:val="PargrafodaLista"/>
-        <w:numPr>
-          <w:ilvl w:val="0"/>
-          <w:numId w:val="21"/>
-        </w:numPr>
-        <w:spacing w:after="80" w:line="260" w:lineRule="auto"/>
-        <w:ind w:left="700"/>
-        <w:rPr>
-          <w:rFonts w:ascii="Montserrat" w:hAnsi="Montserrat"/>
-          <w:color w:val="1A1A1A"/>
-          <w:sz w:val="22"/>
-        </w:rPr>
-      </w:pPr>
-      <w:r>
-        <w:rPr>
-          <w:rFonts w:ascii="Montserrat" w:hAnsi="Montserrat"/>
-          <w:color w:val="1A1A1A"/>
-          <w:sz w:val="22"/>
-        </w:rPr>
-        <w:t>Registre entregas de resultados, atividades encerradas, o link da pasta do projeto e a analise de efetividade.</w:t>
-      </w:r>
-    </w:p>
-    <w:p>
-      <w:pPr>
-        <w:pStyle w:val="PargrafodaLista"/>
-        <w:numPr>
-          <w:ilvl w:val="0"/>
-          <w:numId w:val="21"/>
-        </w:numPr>
-        <w:spacing w:after="80" w:line="260" w:lineRule="auto"/>
-        <w:ind w:left="700"/>
-        <w:rPr>
-          <w:rFonts w:ascii="Montserrat" w:hAnsi="Montserrat"/>
-          <w:color w:val="1A1A1A"/>
-          <w:sz w:val="22"/>
-        </w:rPr>
-      </w:pPr>
-      <w:r>
-        <w:rPr>
-          <w:rFonts w:ascii="Montserrat" w:hAnsi="Montserrat"/>
-          <w:color w:val="1A1A1A"/>
-          <w:sz w:val="22"/>
-        </w:rPr>
-        <w:t>Assistente de preenchimento por IA: apos selecionar o Projeto vinculado, o botao Sugerir com IA compara o TAP, o Planejamento e a EAP com o que as Atas mais recentes confirmam realizado, sugerindo a justificativa de encerramento, as atividades encerradas e as consideracoes finais (secao 2.12).</w:t>
-      </w:r>
-    </w:p>
-    <w:p>
-      <w:pPr>
-        <w:spacing w:line="280" w:lineRule="auto"/>
-        <w:rPr>
-          <w:rFonts w:ascii="Montserrat" w:hAnsi="Montserrat"/>
-          <w:color w:val="1A1A1A"/>
-          <w:sz w:val="22"/>
-        </w:rPr>
-      </w:pPr>
-      <w:r>
-        <w:rPr>
-          <w:rFonts w:ascii="Montserrat" w:hAnsi="Montserrat"/>
-          <w:color w:val="1A1A1A"/>
-          <w:sz w:val="22"/>
-        </w:rPr>
-        <w:t>Clique em Registrar TEP para gerar o protocolo. O registro de um novo TEP dispara um e-mail de notificacao (secao 2.8).</w:t>
-      </w:r>
-    </w:p>
-    <w:p>
-      <w:pPr>
-        <w:spacing w:before="160" w:after="200"/>
-        <w:ind w:left="283"/>
-        <w:rPr>
-          <w:rFonts w:ascii="Montserrat" w:hAnsi="Montserrat"/>
-          <w:i/>
-          <w:color w:val="6A6A70"/>
-          <w:sz w:val="21"/>
-        </w:rPr>
-      </w:pPr>
-      <w:r>
-        <w:rPr>
-          <w:rFonts w:ascii="Montserrat" w:hAnsi="Montserrat"/>
-          <w:i/>
-          <w:color w:val="6A6A70"/>
-          <w:sz w:val="21"/>
-        </w:rPr>
-        <w:t xml:space="preserve">Encerra o projeto no cadastro compartilhado: ao registrar o TEP, o projeto vinculado passa a refletir o tipo de encerramento escolhido </w:t>
-      </w:r>
-      <w:r>
-        <w:rPr>
-          <w:rFonts w:ascii="Montserrat" w:hAnsi="Montserrat"/>
-          <w:i/>
-          <w:color w:val="6A6A70"/>
-          <w:sz w:val="21"/>
-        </w:rPr>
-        <w:lastRenderedPageBreak/>
-        <w:t>(Concluido/Paralisado/Cancelado) e some da lista de Projeto vinculado para novos registros nos demais formularios (secao 2.5).</w:t>
       </w:r>
     </w:p>
     <w:p>
@@ -15360,6 +15281,127 @@
           <w:color w:val="1A1A1A"/>
           <w:sz w:val="22"/>
         </w:rPr>
+        <w:t>Se Paralisado ou Cancelado, o campo Justificativa aparece automaticamente.</w:t>
+      </w:r>
+    </w:p>
+    <w:p>
+      <w:pPr>
+        <w:pStyle w:val="PargrafodaLista"/>
+        <w:numPr>
+          <w:ilvl w:val="0"/>
+          <w:numId w:val="22"/>
+        </w:numPr>
+        <w:spacing w:after="80" w:line="260" w:lineRule="auto"/>
+        <w:ind w:left="700"/>
+        <w:rPr>
+          <w:rFonts w:ascii="Montserrat" w:hAnsi="Montserrat"/>
+          <w:color w:val="1A1A1A"/>
+          <w:sz w:val="22"/>
+        </w:rPr>
+      </w:pPr>
+      <w:r>
+        <w:rPr>
+          <w:rFonts w:ascii="Montserrat" w:hAnsi="Montserrat"/>
+          <w:color w:val="1A1A1A"/>
+          <w:sz w:val="22"/>
+        </w:rPr>
+        <w:t>Registre entregas de resultados, atividades encerradas, o link da pasta do projeto e a analise de efetividade.</w:t>
+      </w:r>
+    </w:p>
+    <w:p>
+      <w:pPr>
+        <w:pStyle w:val="PargrafodaLista"/>
+        <w:numPr>
+          <w:ilvl w:val="0"/>
+          <w:numId w:val="22"/>
+        </w:numPr>
+        <w:spacing w:after="80" w:line="260" w:lineRule="auto"/>
+        <w:ind w:left="700"/>
+        <w:rPr>
+          <w:rFonts w:ascii="Montserrat" w:hAnsi="Montserrat"/>
+          <w:color w:val="1A1A1A"/>
+          <w:sz w:val="22"/>
+        </w:rPr>
+      </w:pPr>
+      <w:r>
+        <w:rPr>
+          <w:rFonts w:ascii="Montserrat" w:hAnsi="Montserrat"/>
+          <w:color w:val="1A1A1A"/>
+          <w:sz w:val="22"/>
+        </w:rPr>
+        <w:t>Assistente de preenchimento por IA: apos selecionar o Projeto vinculado, o botao Sugerir com IA compara o TAP, o Planejamento e a EAP com o que as Atas mais recentes confirmam realizado, sugerindo a justificativa de encerramento, as atividades encerradas e as consideracoes finais (secao 2.12).</w:t>
+      </w:r>
+    </w:p>
+    <w:p>
+      <w:pPr>
+        <w:spacing w:line="280" w:lineRule="auto"/>
+        <w:rPr>
+          <w:rFonts w:ascii="Montserrat" w:hAnsi="Montserrat"/>
+          <w:color w:val="1A1A1A"/>
+          <w:sz w:val="22"/>
+        </w:rPr>
+      </w:pPr>
+      <w:r>
+        <w:rPr>
+          <w:rFonts w:ascii="Montserrat" w:hAnsi="Montserrat"/>
+          <w:color w:val="1A1A1A"/>
+          <w:sz w:val="22"/>
+        </w:rPr>
+        <w:t>Clique em Registrar TEP para gerar o protocolo. O registro de um novo TEP dispara um e-mail de notificacao (secao 2.8).</w:t>
+      </w:r>
+    </w:p>
+    <w:p>
+      <w:pPr>
+        <w:spacing w:before="160" w:after="200"/>
+        <w:ind w:left="283"/>
+        <w:rPr>
+          <w:rFonts w:ascii="Montserrat" w:hAnsi="Montserrat"/>
+          <w:i/>
+          <w:color w:val="6A6A70"/>
+          <w:sz w:val="21"/>
+        </w:rPr>
+      </w:pPr>
+      <w:r>
+        <w:rPr>
+          <w:rFonts w:ascii="Montserrat" w:hAnsi="Montserrat"/>
+          <w:i/>
+          <w:color w:val="6A6A70"/>
+          <w:sz w:val="21"/>
+        </w:rPr>
+        <w:t xml:space="preserve">Encerra o projeto no cadastro compartilhado: ao registrar o TEP, o projeto vinculado passa a refletir o tipo de encerramento escolhido </w:t>
+      </w:r>
+      <w:r>
+        <w:rPr>
+          <w:rFonts w:ascii="Montserrat" w:hAnsi="Montserrat"/>
+          <w:i/>
+          <w:color w:val="6A6A70"/>
+          <w:sz w:val="21"/>
+        </w:rPr>
+        <w:lastRenderedPageBreak/>
+        <w:t>(Concluido/Paralisado/Cancelado) e some da lista de Projeto vinculado para novos registros nos demais formularios (secao 2.5).</w:t>
+      </w:r>
+    </w:p>
+    <w:p>
+      <w:pPr>
+        <w:pStyle w:val="PargrafodaLista"/>
+        <w:numPr>
+          <w:ilvl w:val="0"/>
+          <w:numId w:val="23"/>
+        </w:numPr>
+        <w:spacing w:after="80" w:line="260" w:lineRule="auto"/>
+        <w:ind w:left="700"/>
+        <w:rPr>
+          <w:rFonts w:ascii="Montserrat" w:hAnsi="Montserrat"/>
+          <w:color w:val="1A1A1A"/>
+          <w:sz w:val="22"/>
+        </w:rPr>
+      </w:pPr>
+      <w:r>
+        <w:rPr>
+          <w:rFonts w:ascii="Montserrat" w:hAnsi="Montserrat"/>
+          <w:color w:val="1A1A1A"/>
+          <w:sz w:val="22"/>
+        </w:rPr>
         <w:t>No rodape do painel de detalhes de um TEP, os botoes Imprimir e Exportar Word geram o documento no formato oficial do FORALF00341, pronto para impressao ou para abrir no Word.</w:t>
       </w:r>
     </w:p>
@@ -15374,7 +15416,7 @@
           <w:sz w:val="27"/>
         </w:rPr>
       </w:pPr>
-      <w:bookmarkStart w:id="28" w:name="_Toc240271793"/>
+      <w:bookmarkStart w:id="28" w:name="_Toc240273029"/>
       <w:r>
         <w:rPr>
           <w:rFonts w:ascii="Montserrat" w:hAnsi="Montserrat"/>
@@ -15414,16 +15456,16 @@
           <w:noProof/>
         </w:rPr>
         <w:drawing>
-          <wp:inline distT="0" distB="0" distL="0" distR="0" wp14:anchorId="77C27D25" wp14:editId="0CF14584">
+          <wp:inline distT="0" distB="0" distL="0" distR="0" wp14:anchorId="678EAF5E" wp14:editId="7136BA8E">
             <wp:extent cx="5120640" cy="4627581"/>
             <wp:effectExtent l="19050" t="19050" r="22860" b="20955"/>
-            <wp:docPr id="1274196707" name="Imagem 25"/>
+            <wp:docPr id="949326298" name="Imagem 25"/>
             <wp:cNvGraphicFramePr/>
             <a:graphic xmlns:a="http://schemas.openxmlformats.org/drawingml/2006/main">
               <a:graphicData uri="http://schemas.openxmlformats.org/drawingml/2006/picture">
                 <pic:pic xmlns:pic="http://schemas.openxmlformats.org/drawingml/2006/picture">
                   <pic:nvPicPr>
-                    <pic:cNvPr id="1274196707" name=""/>
+                    <pic:cNvPr id="949326298" name=""/>
                     <pic:cNvPicPr/>
                   </pic:nvPicPr>
                   <pic:blipFill>
@@ -15491,16 +15533,16 @@
         </w:rPr>
         <w:lastRenderedPageBreak/>
         <w:drawing>
-          <wp:inline distT="0" distB="0" distL="0" distR="0" wp14:anchorId="7B1B97C7" wp14:editId="102117D2">
+          <wp:inline distT="0" distB="0" distL="0" distR="0" wp14:anchorId="7E8BB937" wp14:editId="358A002C">
             <wp:extent cx="5120640" cy="4627581"/>
             <wp:effectExtent l="19050" t="19050" r="22860" b="20955"/>
-            <wp:docPr id="74889192" name="Imagem 26"/>
+            <wp:docPr id="2071574274" name="Imagem 26"/>
             <wp:cNvGraphicFramePr/>
             <a:graphic xmlns:a="http://schemas.openxmlformats.org/drawingml/2006/main">
               <a:graphicData uri="http://schemas.openxmlformats.org/drawingml/2006/picture">
                 <pic:pic xmlns:pic="http://schemas.openxmlformats.org/drawingml/2006/picture">
                   <pic:nvPicPr>
-                    <pic:cNvPr id="74889192" name=""/>
+                    <pic:cNvPr id="2071574274" name=""/>
                     <pic:cNvPicPr/>
                   </pic:nvPicPr>
                   <pic:blipFill>
@@ -15562,7 +15604,7 @@
         <w:pStyle w:val="PargrafodaLista"/>
         <w:numPr>
           <w:ilvl w:val="0"/>
-          <w:numId w:val="22"/>
+          <w:numId w:val="23"/>
         </w:numPr>
         <w:spacing w:after="80" w:line="260" w:lineRule="auto"/>
         <w:ind w:left="700"/>
@@ -15579,72 +15621,6 @@
           <w:sz w:val="22"/>
         </w:rPr>
         <w:t>Responda as perguntas abertas dos blocos Visao geral, Destaques, Desafios e Pos-projeto.</w:t>
-      </w:r>
-    </w:p>
-    <w:p>
-      <w:pPr>
-        <w:pStyle w:val="PargrafodaLista"/>
-        <w:numPr>
-          <w:ilvl w:val="0"/>
-          <w:numId w:val="22"/>
-        </w:numPr>
-        <w:spacing w:after="80" w:line="260" w:lineRule="auto"/>
-        <w:ind w:left="700"/>
-        <w:rPr>
-          <w:rFonts w:ascii="Montserrat" w:hAnsi="Montserrat"/>
-          <w:color w:val="1A1A1A"/>
-          <w:sz w:val="22"/>
-        </w:rPr>
-      </w:pPr>
-      <w:r>
-        <w:rPr>
-          <w:rFonts w:ascii="Montserrat" w:hAnsi="Montserrat"/>
-          <w:color w:val="1A1A1A"/>
-          <w:sz w:val="22"/>
-        </w:rPr>
-        <w:t>Nos blocos de avaliacao estruturada, marque Sim/Nao/Parcial/N-A para cada afirmacao - cada bloco calcula automaticamente um placar percentual.</w:t>
-      </w:r>
-    </w:p>
-    <w:p>
-      <w:pPr>
-        <w:pStyle w:val="PargrafodaLista"/>
-        <w:numPr>
-          <w:ilvl w:val="0"/>
-          <w:numId w:val="22"/>
-        </w:numPr>
-        <w:spacing w:after="80" w:line="260" w:lineRule="auto"/>
-        <w:ind w:left="700"/>
-        <w:rPr>
-          <w:rFonts w:ascii="Montserrat" w:hAnsi="Montserrat"/>
-          <w:color w:val="1A1A1A"/>
-          <w:sz w:val="22"/>
-        </w:rPr>
-      </w:pPr>
-      <w:r>
-        <w:rPr>
-          <w:rFonts w:ascii="Montserrat" w:hAnsi="Montserrat"/>
-          <w:color w:val="1A1A1A"/>
-          <w:sz w:val="22"/>
-        </w:rPr>
-        <w:t>Assistente de preenchimento por IA: apos selecionar o Projeto vinculado, o botao Sugerir com IA le o TEP, as Atas e todas as SMPs do projeto para sugerir as respostas das 4 secoes de texto livre - Visao geral, Destaques, Desafios e Tarefas pos-projeto. Os blocos de avaliacao estruturada Sim/Nao/Parcial (secoes 6 a 9, com placar percentual) nao sao preenchidos pela IA - continuam sendo uma autoavaliacao manual da equipe (secao 2.12).</w:t>
-      </w:r>
-    </w:p>
-    <w:p>
-      <w:pPr>
-        <w:spacing w:line="280" w:lineRule="auto"/>
-        <w:rPr>
-          <w:rFonts w:ascii="Montserrat" w:hAnsi="Montserrat"/>
-          <w:color w:val="1A1A1A"/>
-          <w:sz w:val="22"/>
-        </w:rPr>
-      </w:pPr>
-      <w:r>
-        <w:rPr>
-          <w:rFonts w:ascii="Montserrat" w:hAnsi="Montserrat"/>
-          <w:color w:val="1A1A1A"/>
-          <w:sz w:val="22"/>
-        </w:rPr>
-        <w:t>Clique em Registrar RLA. O score global fica salvo junto com o registro.</w:t>
       </w:r>
     </w:p>
     <w:p>
@@ -15668,6 +15644,72 @@
           <w:color w:val="1A1A1A"/>
           <w:sz w:val="22"/>
         </w:rPr>
+        <w:t>Nos blocos de avaliacao estruturada, marque Sim/Nao/Parcial/N-A para cada afirmacao - cada bloco calcula automaticamente um placar percentual.</w:t>
+      </w:r>
+    </w:p>
+    <w:p>
+      <w:pPr>
+        <w:pStyle w:val="PargrafodaLista"/>
+        <w:numPr>
+          <w:ilvl w:val="0"/>
+          <w:numId w:val="23"/>
+        </w:numPr>
+        <w:spacing w:after="80" w:line="260" w:lineRule="auto"/>
+        <w:ind w:left="700"/>
+        <w:rPr>
+          <w:rFonts w:ascii="Montserrat" w:hAnsi="Montserrat"/>
+          <w:color w:val="1A1A1A"/>
+          <w:sz w:val="22"/>
+        </w:rPr>
+      </w:pPr>
+      <w:r>
+        <w:rPr>
+          <w:rFonts w:ascii="Montserrat" w:hAnsi="Montserrat"/>
+          <w:color w:val="1A1A1A"/>
+          <w:sz w:val="22"/>
+        </w:rPr>
+        <w:t>Assistente de preenchimento por IA: apos selecionar o Projeto vinculado, o botao Sugerir com IA le o TEP, as Atas e todas as SMPs do projeto para sugerir as respostas das 4 secoes de texto livre - Visao geral, Destaques, Desafios e Tarefas pos-projeto. Os blocos de avaliacao estruturada Sim/Nao/Parcial (secoes 6 a 9, com placar percentual) nao sao preenchidos pela IA - continuam sendo uma autoavaliacao manual da equipe (secao 2.12).</w:t>
+      </w:r>
+    </w:p>
+    <w:p>
+      <w:pPr>
+        <w:spacing w:line="280" w:lineRule="auto"/>
+        <w:rPr>
+          <w:rFonts w:ascii="Montserrat" w:hAnsi="Montserrat"/>
+          <w:color w:val="1A1A1A"/>
+          <w:sz w:val="22"/>
+        </w:rPr>
+      </w:pPr>
+      <w:r>
+        <w:rPr>
+          <w:rFonts w:ascii="Montserrat" w:hAnsi="Montserrat"/>
+          <w:color w:val="1A1A1A"/>
+          <w:sz w:val="22"/>
+        </w:rPr>
+        <w:t>Clique em Registrar RLA. O score global fica salvo junto com o registro.</w:t>
+      </w:r>
+    </w:p>
+    <w:p>
+      <w:pPr>
+        <w:pStyle w:val="PargrafodaLista"/>
+        <w:numPr>
+          <w:ilvl w:val="0"/>
+          <w:numId w:val="24"/>
+        </w:numPr>
+        <w:spacing w:after="80" w:line="260" w:lineRule="auto"/>
+        <w:ind w:left="700"/>
+        <w:rPr>
+          <w:rFonts w:ascii="Montserrat" w:hAnsi="Montserrat"/>
+          <w:color w:val="1A1A1A"/>
+          <w:sz w:val="22"/>
+        </w:rPr>
+      </w:pPr>
+      <w:r>
+        <w:rPr>
+          <w:rFonts w:ascii="Montserrat" w:hAnsi="Montserrat"/>
+          <w:color w:val="1A1A1A"/>
+          <w:sz w:val="22"/>
+        </w:rPr>
         <w:t xml:space="preserve">No rodape do painel de detalhes de um RLA, os botoes Imprimir e Exportar Word geram o documento no formato oficial do FORALF00342 </w:t>
       </w:r>
       <w:r>
@@ -15691,7 +15733,7 @@
           <w:sz w:val="27"/>
         </w:rPr>
       </w:pPr>
-      <w:bookmarkStart w:id="29" w:name="_Toc240271794"/>
+      <w:bookmarkStart w:id="29" w:name="_Toc240273030"/>
       <w:r>
         <w:rPr>
           <w:rFonts w:ascii="Montserrat" w:hAnsi="Montserrat"/>
@@ -15731,16 +15773,16 @@
           <w:noProof/>
         </w:rPr>
         <w:drawing>
-          <wp:inline distT="0" distB="0" distL="0" distR="0" wp14:anchorId="7352C2CC" wp14:editId="6DB2D8D1">
+          <wp:inline distT="0" distB="0" distL="0" distR="0" wp14:anchorId="276FE48F" wp14:editId="737E2B6D">
             <wp:extent cx="5120640" cy="4000682"/>
             <wp:effectExtent l="19050" t="19050" r="22860" b="19050"/>
-            <wp:docPr id="8542076" name="Imagem 27"/>
+            <wp:docPr id="1490569739" name="Imagem 27"/>
             <wp:cNvGraphicFramePr/>
             <a:graphic xmlns:a="http://schemas.openxmlformats.org/drawingml/2006/main">
               <a:graphicData uri="http://schemas.openxmlformats.org/drawingml/2006/picture">
                 <pic:pic xmlns:pic="http://schemas.openxmlformats.org/drawingml/2006/picture">
                   <pic:nvPicPr>
-                    <pic:cNvPr id="8542076" name=""/>
+                    <pic:cNvPr id="1490569739" name=""/>
                     <pic:cNvPicPr/>
                   </pic:nvPicPr>
                   <pic:blipFill>
@@ -16264,7 +16306,7 @@
           <w:sz w:val="34"/>
         </w:rPr>
       </w:pPr>
-      <w:bookmarkStart w:id="30" w:name="_Toc240271795"/>
+      <w:bookmarkStart w:id="30" w:name="_Toc240273031"/>
       <w:r>
         <w:rPr>
           <w:rFonts w:ascii="Montserrat" w:hAnsi="Montserrat"/>
@@ -16306,7 +16348,7 @@
           <w:sz w:val="27"/>
         </w:rPr>
       </w:pPr>
-      <w:bookmarkStart w:id="31" w:name="_Toc240271796"/>
+      <w:bookmarkStart w:id="31" w:name="_Toc240273032"/>
       <w:r>
         <w:rPr>
           <w:rFonts w:ascii="Montserrat" w:hAnsi="Montserrat"/>
@@ -16346,16 +16388,16 @@
           <w:noProof/>
         </w:rPr>
         <w:drawing>
-          <wp:inline distT="0" distB="0" distL="0" distR="0" wp14:anchorId="6E1A4807" wp14:editId="14E2261F">
+          <wp:inline distT="0" distB="0" distL="0" distR="0" wp14:anchorId="7498DE04" wp14:editId="03DB45A7">
             <wp:extent cx="5120640" cy="4627581"/>
             <wp:effectExtent l="19050" t="19050" r="22860" b="20955"/>
-            <wp:docPr id="678299912" name="Imagem 28"/>
+            <wp:docPr id="1866758044" name="Imagem 28"/>
             <wp:cNvGraphicFramePr/>
             <a:graphic xmlns:a="http://schemas.openxmlformats.org/drawingml/2006/main">
               <a:graphicData uri="http://schemas.openxmlformats.org/drawingml/2006/picture">
                 <pic:pic xmlns:pic="http://schemas.openxmlformats.org/drawingml/2006/picture">
                   <pic:nvPicPr>
-                    <pic:cNvPr id="678299912" name=""/>
+                    <pic:cNvPr id="1866758044" name=""/>
                     <pic:cNvPicPr/>
                   </pic:nvPicPr>
                   <pic:blipFill>
@@ -16423,16 +16465,16 @@
         </w:rPr>
         <w:lastRenderedPageBreak/>
         <w:drawing>
-          <wp:inline distT="0" distB="0" distL="0" distR="0" wp14:anchorId="394F44AE" wp14:editId="4705724B">
+          <wp:inline distT="0" distB="0" distL="0" distR="0" wp14:anchorId="3DBE1894" wp14:editId="6FA2F20D">
             <wp:extent cx="5120640" cy="4627581"/>
             <wp:effectExtent l="19050" t="19050" r="22860" b="20955"/>
-            <wp:docPr id="1585218433" name="Imagem 29"/>
+            <wp:docPr id="836383561" name="Imagem 29"/>
             <wp:cNvGraphicFramePr/>
             <a:graphic xmlns:a="http://schemas.openxmlformats.org/drawingml/2006/main">
               <a:graphicData uri="http://schemas.openxmlformats.org/drawingml/2006/picture">
                 <pic:pic xmlns:pic="http://schemas.openxmlformats.org/drawingml/2006/picture">
                   <pic:nvPicPr>
-                    <pic:cNvPr id="1585218433" name=""/>
+                    <pic:cNvPr id="836383561" name=""/>
                     <pic:cNvPicPr/>
                   </pic:nvPicPr>
                   <pic:blipFill>
@@ -16500,16 +16542,16 @@
         </w:rPr>
         <w:lastRenderedPageBreak/>
         <w:drawing>
-          <wp:inline distT="0" distB="0" distL="0" distR="0" wp14:anchorId="76DFF770" wp14:editId="3485A344">
+          <wp:inline distT="0" distB="0" distL="0" distR="0" wp14:anchorId="0A998001" wp14:editId="231E1A70">
             <wp:extent cx="5120640" cy="4627581"/>
             <wp:effectExtent l="19050" t="19050" r="22860" b="20955"/>
-            <wp:docPr id="865425936" name="Imagem 30"/>
+            <wp:docPr id="455794968" name="Imagem 30"/>
             <wp:cNvGraphicFramePr/>
             <a:graphic xmlns:a="http://schemas.openxmlformats.org/drawingml/2006/main">
               <a:graphicData uri="http://schemas.openxmlformats.org/drawingml/2006/picture">
                 <pic:pic xmlns:pic="http://schemas.openxmlformats.org/drawingml/2006/picture">
                   <pic:nvPicPr>
-                    <pic:cNvPr id="865425936" name=""/>
+                    <pic:cNvPr id="455794968" name=""/>
                     <pic:cNvPicPr/>
                   </pic:nvPicPr>
                   <pic:blipFill>
@@ -16571,7 +16613,7 @@
         <w:pStyle w:val="PargrafodaLista"/>
         <w:numPr>
           <w:ilvl w:val="0"/>
-          <w:numId w:val="23"/>
+          <w:numId w:val="24"/>
         </w:numPr>
         <w:spacing w:after="80" w:line="260" w:lineRule="auto"/>
         <w:ind w:left="700"/>
@@ -16588,61 +16630,6 @@
           <w:sz w:val="22"/>
         </w:rPr>
         <w:t>Preencha o cabecalho (mes/ano de referencia, responsavel, previsao financeira, entregas planejadas).</w:t>
-      </w:r>
-    </w:p>
-    <w:p>
-      <w:pPr>
-        <w:pStyle w:val="PargrafodaLista"/>
-        <w:numPr>
-          <w:ilvl w:val="0"/>
-          <w:numId w:val="23"/>
-        </w:numPr>
-        <w:spacing w:after="80" w:line="260" w:lineRule="auto"/>
-        <w:ind w:left="700"/>
-        <w:rPr>
-          <w:rFonts w:ascii="Montserrat" w:hAnsi="Montserrat"/>
-          <w:color w:val="1A1A1A"/>
-          <w:sz w:val="22"/>
-        </w:rPr>
-      </w:pPr>
-      <w:r>
-        <w:rPr>
-          <w:rFonts w:ascii="Montserrat" w:hAnsi="Montserrat"/>
-          <w:color w:val="1A1A1A"/>
-          <w:sz w:val="22"/>
-        </w:rPr>
-        <w:t>Adicione cada projeto do portfolio, com status, % execucao, datas e os campos Merece atencao e Merece destaque.</w:t>
-      </w:r>
-    </w:p>
-    <w:p>
-      <w:pPr>
-        <w:spacing w:before="160" w:after="200"/>
-        <w:ind w:left="283"/>
-        <w:rPr>
-          <w:rFonts w:ascii="Montserrat" w:hAnsi="Montserrat"/>
-          <w:i/>
-          <w:color w:val="6A6A70"/>
-          <w:sz w:val="21"/>
-        </w:rPr>
-      </w:pPr>
-      <w:r>
-        <w:rPr>
-          <w:rFonts w:ascii="Montserrat" w:hAnsi="Montserrat"/>
-          <w:i/>
-          <w:color w:val="6A6A70"/>
-          <w:sz w:val="21"/>
-        </w:rPr>
-        <w:t xml:space="preserve">Projeto vinculado (Gate 1) - opcional: cada linha de projeto pode, opcionalmente, ser associada a um Projeto ja Aprovado no Gate 1 (o mesmo cadastro compartilhado usado pelo Canvas, TAP, Planejamento, EAP, SMP, TEP e RLA - secao 2.5). Ao selecionar um projeto na lista, os campos Nome do projeto, Responsavel (a partir do gestor do projeto) e Inicio previsto/Termino previsto (a partir da menor e maior data do cronograma de entregas macro do Planejamento vinculado, se houver) sao preenchidos automaticamente - sempre so nos campos ainda vazios, sem sobrescrever o que ja foi digitado. Tambem aparece o botao Ver historico, que mostra as alteracoes desse projeto vindas de qualquer outro formulario vinculado a ele. Deixar em Nenhum mantem o comportamento anterior - o projeto do Relatorio de Situacao </w:t>
-      </w:r>
-      <w:r>
-        <w:rPr>
-          <w:rFonts w:ascii="Montserrat" w:hAnsi="Montserrat"/>
-          <w:i/>
-          <w:color w:val="6A6A70"/>
-          <w:sz w:val="21"/>
-        </w:rPr>
-        <w:lastRenderedPageBreak/>
-        <w:t>continua sendo texto livre, sem vinculo. Se o Planejamento nao tiver nenhuma data de cronograma preenchida, Inicio previsto e Termino previsto ficam em branco para preenchimento manual - o sistema nao tenta adivinhar a partir de outro documento.</w:t>
       </w:r>
     </w:p>
     <w:p>
@@ -16666,7 +16653,38 @@
           <w:color w:val="1A1A1A"/>
           <w:sz w:val="22"/>
         </w:rPr>
-        <w:t>Assistente de preenchimento por IA: com um Projeto vinculado selecionado, o botao Sugerir com IA le o TAP e as Atas daquele projeto, mais a situacao ja digitada na linha, para sugerir o que Merece atencao e o que Merece destaque (secao 2.12).</w:t>
+        <w:t>Adicione cada projeto do portfolio, com status, % execucao, datas e os campos Merece atencao e Merece destaque.</w:t>
+      </w:r>
+    </w:p>
+    <w:p>
+      <w:pPr>
+        <w:spacing w:before="160" w:after="200"/>
+        <w:ind w:left="283"/>
+        <w:rPr>
+          <w:rFonts w:ascii="Montserrat" w:hAnsi="Montserrat"/>
+          <w:i/>
+          <w:color w:val="6A6A70"/>
+          <w:sz w:val="21"/>
+        </w:rPr>
+      </w:pPr>
+      <w:r>
+        <w:rPr>
+          <w:rFonts w:ascii="Montserrat" w:hAnsi="Montserrat"/>
+          <w:i/>
+          <w:color w:val="6A6A70"/>
+          <w:sz w:val="21"/>
+        </w:rPr>
+        <w:t xml:space="preserve">Projeto vinculado (Gate 1) - opcional: cada linha de projeto pode, opcionalmente, ser associada a um Projeto ja Aprovado no Gate 1 (o mesmo cadastro compartilhado usado pelo Canvas, TAP, Planejamento, EAP, SMP, TEP e RLA - secao 2.5). Ao selecionar um projeto na lista, os campos Nome do projeto, Responsavel (a partir do gestor do projeto) e Inicio previsto/Termino previsto (a partir da menor e maior data do cronograma de entregas macro do Planejamento vinculado, se houver) sao preenchidos automaticamente - sempre so nos campos ainda vazios, sem sobrescrever o que ja foi digitado. Tambem aparece o botao Ver historico, que mostra as alteracoes desse projeto vindas de qualquer outro formulario vinculado a ele. Deixar em Nenhum mantem o comportamento anterior - o projeto do Relatorio de Situacao </w:t>
+      </w:r>
+      <w:r>
+        <w:rPr>
+          <w:rFonts w:ascii="Montserrat" w:hAnsi="Montserrat"/>
+          <w:i/>
+          <w:color w:val="6A6A70"/>
+          <w:sz w:val="21"/>
+        </w:rPr>
+        <w:lastRenderedPageBreak/>
+        <w:t>continua sendo texto livre, sem vinculo. Se o Planejamento nao tiver nenhuma data de cronograma preenchida, Inicio previsto e Termino previsto ficam em branco para preenchimento manual - o sistema nao tenta adivinhar a partir de outro documento.</w:t>
       </w:r>
     </w:p>
     <w:p>
@@ -16674,7 +16692,7 @@
         <w:pStyle w:val="PargrafodaLista"/>
         <w:numPr>
           <w:ilvl w:val="0"/>
-          <w:numId w:val="24"/>
+          <w:numId w:val="25"/>
         </w:numPr>
         <w:spacing w:after="80" w:line="260" w:lineRule="auto"/>
         <w:ind w:left="700"/>
@@ -16690,6 +16708,30 @@
           <w:color w:val="1A1A1A"/>
           <w:sz w:val="22"/>
         </w:rPr>
+        <w:t>Assistente de preenchimento por IA: com um Projeto vinculado selecionado, o botao Sugerir com IA le o TAP e as Atas daquele projeto, mais a situacao ja digitada na linha, para sugerir o que Merece atencao e o que Merece destaque (secao 2.12).</w:t>
+      </w:r>
+    </w:p>
+    <w:p>
+      <w:pPr>
+        <w:pStyle w:val="PargrafodaLista"/>
+        <w:numPr>
+          <w:ilvl w:val="0"/>
+          <w:numId w:val="25"/>
+        </w:numPr>
+        <w:spacing w:after="80" w:line="260" w:lineRule="auto"/>
+        <w:ind w:left="700"/>
+        <w:rPr>
+          <w:rFonts w:ascii="Montserrat" w:hAnsi="Montserrat"/>
+          <w:color w:val="1A1A1A"/>
+          <w:sz w:val="22"/>
+        </w:rPr>
+      </w:pPr>
+      <w:r>
+        <w:rPr>
+          <w:rFonts w:ascii="Montserrat" w:hAnsi="Montserrat"/>
+          <w:color w:val="1A1A1A"/>
+          <w:sz w:val="22"/>
+        </w:rPr>
         <w:t>Marcos vem do Planejamento: a secao Marcos de cada linha de projeto mostra, automaticamente (sem botao de importar), os marcos do cronograma de entregas macro do Planejamento e Desenvolvimento de Projeto daquele projeto - nome, Inicio/Termino previsto e Conclusao real vem sempre ao vivo do Planejamento (para mudar um marco, edite o Planejamento). O unico campo proprio aqui e o Status de cada marco (A iniciar, No prazo, Atrasado, Paralisado, Concluido ou Cancelado), que continua sendo ajustado manualmente. Um marco com dependencia bloqueada (</w:t>
       </w:r>
       <w:r>
@@ -16711,16 +16753,16 @@
           <w:noProof/>
         </w:rPr>
         <w:drawing>
-          <wp:inline distT="0" distB="0" distL="0" distR="0" wp14:anchorId="263AB19E" wp14:editId="0B376B71">
+          <wp:inline distT="0" distB="0" distL="0" distR="0" wp14:anchorId="1882B780" wp14:editId="16485963">
             <wp:extent cx="5120640" cy="1715571"/>
             <wp:effectExtent l="19050" t="19050" r="22860" b="18415"/>
-            <wp:docPr id="950185871" name="Imagem 31"/>
+            <wp:docPr id="1365738868" name="Imagem 31"/>
             <wp:cNvGraphicFramePr/>
             <a:graphic xmlns:a="http://schemas.openxmlformats.org/drawingml/2006/main">
               <a:graphicData uri="http://schemas.openxmlformats.org/drawingml/2006/picture">
                 <pic:pic xmlns:pic="http://schemas.openxmlformats.org/drawingml/2006/picture">
                   <pic:nvPicPr>
-                    <pic:cNvPr id="950185871" name=""/>
+                    <pic:cNvPr id="1365738868" name=""/>
                     <pic:cNvPicPr/>
                   </pic:nvPicPr>
                   <pic:blipFill>
@@ -16782,7 +16824,7 @@
         <w:pStyle w:val="PargrafodaLista"/>
         <w:numPr>
           <w:ilvl w:val="0"/>
-          <w:numId w:val="25"/>
+          <w:numId w:val="26"/>
         </w:numPr>
         <w:spacing w:after="80" w:line="260" w:lineRule="auto"/>
         <w:ind w:left="700"/>
@@ -16806,7 +16848,7 @@
         <w:pStyle w:val="PargrafodaLista"/>
         <w:numPr>
           <w:ilvl w:val="0"/>
-          <w:numId w:val="25"/>
+          <w:numId w:val="26"/>
         </w:numPr>
         <w:spacing w:after="80" w:line="260" w:lineRule="auto"/>
         <w:ind w:left="700"/>
@@ -16857,16 +16899,16 @@
           <w:noProof/>
         </w:rPr>
         <w:drawing>
-          <wp:inline distT="0" distB="0" distL="0" distR="0" wp14:anchorId="16BD4418" wp14:editId="5EF63DF2">
+          <wp:inline distT="0" distB="0" distL="0" distR="0" wp14:anchorId="3E9D55F9" wp14:editId="427E6621">
             <wp:extent cx="5120640" cy="3282818"/>
             <wp:effectExtent l="19050" t="19050" r="22860" b="13335"/>
-            <wp:docPr id="1141734422" name="Imagem 32"/>
+            <wp:docPr id="1561426651" name="Imagem 32"/>
             <wp:cNvGraphicFramePr/>
             <a:graphic xmlns:a="http://schemas.openxmlformats.org/drawingml/2006/main">
               <a:graphicData uri="http://schemas.openxmlformats.org/drawingml/2006/picture">
                 <pic:pic xmlns:pic="http://schemas.openxmlformats.org/drawingml/2006/picture">
                   <pic:nvPicPr>
-                    <pic:cNvPr id="1141734422" name=""/>
+                    <pic:cNvPr id="1561426651" name=""/>
                     <pic:cNvPicPr/>
                   </pic:nvPicPr>
                   <pic:blipFill>
@@ -16928,7 +16970,7 @@
         <w:pStyle w:val="PargrafodaLista"/>
         <w:numPr>
           <w:ilvl w:val="0"/>
-          <w:numId w:val="26"/>
+          <w:numId w:val="27"/>
         </w:numPr>
         <w:spacing w:after="80" w:line="260" w:lineRule="auto"/>
         <w:ind w:left="700"/>
@@ -17000,16 +17042,16 @@
           <w:noProof/>
         </w:rPr>
         <w:drawing>
-          <wp:inline distT="0" distB="0" distL="0" distR="0" wp14:anchorId="320F492E" wp14:editId="75792E2B">
+          <wp:inline distT="0" distB="0" distL="0" distR="0" wp14:anchorId="3F053971" wp14:editId="154FB8FA">
             <wp:extent cx="5120640" cy="951357"/>
             <wp:effectExtent l="19050" t="19050" r="22860" b="20320"/>
-            <wp:docPr id="1339836688" name="Imagem 33"/>
+            <wp:docPr id="827840657" name="Imagem 33"/>
             <wp:cNvGraphicFramePr/>
             <a:graphic xmlns:a="http://schemas.openxmlformats.org/drawingml/2006/main">
               <a:graphicData uri="http://schemas.openxmlformats.org/drawingml/2006/picture">
                 <pic:pic xmlns:pic="http://schemas.openxmlformats.org/drawingml/2006/picture">
                   <pic:nvPicPr>
-                    <pic:cNvPr id="1339836688" name=""/>
+                    <pic:cNvPr id="827840657" name=""/>
                     <pic:cNvPicPr/>
                   </pic:nvPicPr>
                   <pic:blipFill>
@@ -17071,7 +17113,7 @@
         <w:pStyle w:val="PargrafodaLista"/>
         <w:numPr>
           <w:ilvl w:val="0"/>
-          <w:numId w:val="26"/>
+          <w:numId w:val="27"/>
         </w:numPr>
         <w:spacing w:after="80" w:line="260" w:lineRule="auto"/>
         <w:ind w:left="700"/>
@@ -17121,16 +17163,16 @@
           <w:noProof/>
         </w:rPr>
         <w:drawing>
-          <wp:inline distT="0" distB="0" distL="0" distR="0" wp14:anchorId="72C06110" wp14:editId="65C947E1">
+          <wp:inline distT="0" distB="0" distL="0" distR="0" wp14:anchorId="385E678F" wp14:editId="096833DF">
             <wp:extent cx="5120640" cy="1515102"/>
             <wp:effectExtent l="19050" t="19050" r="22860" b="28575"/>
-            <wp:docPr id="653566059" name="Imagem 34"/>
+            <wp:docPr id="641833573" name="Imagem 34"/>
             <wp:cNvGraphicFramePr/>
             <a:graphic xmlns:a="http://schemas.openxmlformats.org/drawingml/2006/main">
               <a:graphicData uri="http://schemas.openxmlformats.org/drawingml/2006/picture">
                 <pic:pic xmlns:pic="http://schemas.openxmlformats.org/drawingml/2006/picture">
                   <pic:nvPicPr>
-                    <pic:cNvPr id="653566059" name=""/>
+                    <pic:cNvPr id="641833573" name=""/>
                     <pic:cNvPicPr/>
                   </pic:nvPicPr>
                   <pic:blipFill>
@@ -17192,7 +17234,7 @@
         <w:pStyle w:val="PargrafodaLista"/>
         <w:numPr>
           <w:ilvl w:val="0"/>
-          <w:numId w:val="26"/>
+          <w:numId w:val="27"/>
         </w:numPr>
         <w:spacing w:after="80" w:line="260" w:lineRule="auto"/>
         <w:ind w:left="700"/>
@@ -17243,16 +17285,16 @@
           <w:noProof/>
         </w:rPr>
         <w:drawing>
-          <wp:inline distT="0" distB="0" distL="0" distR="0" wp14:anchorId="37EC0D8D" wp14:editId="7BB4DA1A">
+          <wp:inline distT="0" distB="0" distL="0" distR="0" wp14:anchorId="5454B385" wp14:editId="17588E26">
             <wp:extent cx="5120640" cy="1391113"/>
             <wp:effectExtent l="19050" t="19050" r="22860" b="19050"/>
-            <wp:docPr id="651331923" name="Imagem 35"/>
+            <wp:docPr id="1873422028" name="Imagem 35"/>
             <wp:cNvGraphicFramePr/>
             <a:graphic xmlns:a="http://schemas.openxmlformats.org/drawingml/2006/main">
               <a:graphicData uri="http://schemas.openxmlformats.org/drawingml/2006/picture">
                 <pic:pic xmlns:pic="http://schemas.openxmlformats.org/drawingml/2006/picture">
                   <pic:nvPicPr>
-                    <pic:cNvPr id="651331923" name=""/>
+                    <pic:cNvPr id="1873422028" name=""/>
                     <pic:cNvPicPr/>
                   </pic:nvPicPr>
                   <pic:blipFill>
@@ -17314,7 +17356,7 @@
         <w:pStyle w:val="PargrafodaLista"/>
         <w:numPr>
           <w:ilvl w:val="0"/>
-          <w:numId w:val="26"/>
+          <w:numId w:val="27"/>
         </w:numPr>
         <w:spacing w:after="80" w:line="260" w:lineRule="auto"/>
         <w:ind w:left="700"/>
@@ -17364,16 +17406,16 @@
           <w:noProof/>
         </w:rPr>
         <w:drawing>
-          <wp:inline distT="0" distB="0" distL="0" distR="0" wp14:anchorId="3F6E3CC1" wp14:editId="403EFA16">
+          <wp:inline distT="0" distB="0" distL="0" distR="0" wp14:anchorId="050E6322" wp14:editId="07252776">
             <wp:extent cx="5120640" cy="1125174"/>
             <wp:effectExtent l="19050" t="19050" r="22860" b="18415"/>
-            <wp:docPr id="1232139232" name="Imagem 36"/>
+            <wp:docPr id="2092549791" name="Imagem 36"/>
             <wp:cNvGraphicFramePr/>
             <a:graphic xmlns:a="http://schemas.openxmlformats.org/drawingml/2006/main">
               <a:graphicData uri="http://schemas.openxmlformats.org/drawingml/2006/picture">
                 <pic:pic xmlns:pic="http://schemas.openxmlformats.org/drawingml/2006/picture">
                   <pic:nvPicPr>
-                    <pic:cNvPr id="1232139232" name=""/>
+                    <pic:cNvPr id="2092549791" name=""/>
                     <pic:cNvPicPr/>
                   </pic:nvPicPr>
                   <pic:blipFill>
@@ -17463,7 +17505,7 @@
           <w:sz w:val="27"/>
         </w:rPr>
       </w:pPr>
-      <w:bookmarkStart w:id="32" w:name="_Toc240271797"/>
+      <w:bookmarkStart w:id="32" w:name="_Toc240273033"/>
       <w:r>
         <w:rPr>
           <w:rFonts w:ascii="Montserrat" w:hAnsi="Montserrat"/>
@@ -17503,16 +17545,16 @@
           <w:noProof/>
         </w:rPr>
         <w:drawing>
-          <wp:inline distT="0" distB="0" distL="0" distR="0" wp14:anchorId="515A375E" wp14:editId="693C206D">
+          <wp:inline distT="0" distB="0" distL="0" distR="0" wp14:anchorId="2239D2D4" wp14:editId="41C78BEA">
             <wp:extent cx="5120640" cy="4627581"/>
             <wp:effectExtent l="19050" t="19050" r="22860" b="20955"/>
-            <wp:docPr id="980673893" name="Imagem 37"/>
+            <wp:docPr id="1301434274" name="Imagem 37"/>
             <wp:cNvGraphicFramePr/>
             <a:graphic xmlns:a="http://schemas.openxmlformats.org/drawingml/2006/main">
               <a:graphicData uri="http://schemas.openxmlformats.org/drawingml/2006/picture">
                 <pic:pic xmlns:pic="http://schemas.openxmlformats.org/drawingml/2006/picture">
                   <pic:nvPicPr>
-                    <pic:cNvPr id="980673893" name=""/>
+                    <pic:cNvPr id="1301434274" name=""/>
                     <pic:cNvPicPr/>
                   </pic:nvPicPr>
                   <pic:blipFill>
@@ -17580,16 +17622,16 @@
         </w:rPr>
         <w:lastRenderedPageBreak/>
         <w:drawing>
-          <wp:inline distT="0" distB="0" distL="0" distR="0" wp14:anchorId="7E0CD8FA" wp14:editId="6C48DA54">
+          <wp:inline distT="0" distB="0" distL="0" distR="0" wp14:anchorId="4892D95A" wp14:editId="1F3FC9C1">
             <wp:extent cx="5120640" cy="4627581"/>
             <wp:effectExtent l="19050" t="19050" r="22860" b="20955"/>
-            <wp:docPr id="308321103" name="Imagem 38"/>
+            <wp:docPr id="2017366057" name="Imagem 38"/>
             <wp:cNvGraphicFramePr/>
             <a:graphic xmlns:a="http://schemas.openxmlformats.org/drawingml/2006/main">
               <a:graphicData uri="http://schemas.openxmlformats.org/drawingml/2006/picture">
                 <pic:pic xmlns:pic="http://schemas.openxmlformats.org/drawingml/2006/picture">
                   <pic:nvPicPr>
-                    <pic:cNvPr id="308321103" name=""/>
+                    <pic:cNvPr id="2017366057" name=""/>
                     <pic:cNvPicPr/>
                   </pic:nvPicPr>
                   <pic:blipFill>
@@ -17651,7 +17693,7 @@
         <w:pStyle w:val="PargrafodaLista"/>
         <w:numPr>
           <w:ilvl w:val="0"/>
-          <w:numId w:val="26"/>
+          <w:numId w:val="27"/>
         </w:numPr>
         <w:spacing w:after="80" w:line="260" w:lineRule="auto"/>
         <w:ind w:left="700"/>
@@ -17668,51 +17710,6 @@
           <w:sz w:val="22"/>
         </w:rPr>
         <w:t>Preencha a Ficha do Programa (codigo, nome, unidade, responsavel, justificativa, objetivo, alinhamento estrategico).</w:t>
-      </w:r>
-    </w:p>
-    <w:p>
-      <w:pPr>
-        <w:pStyle w:val="PargrafodaLista"/>
-        <w:numPr>
-          <w:ilvl w:val="0"/>
-          <w:numId w:val="26"/>
-        </w:numPr>
-        <w:spacing w:after="80" w:line="260" w:lineRule="auto"/>
-        <w:ind w:left="700"/>
-        <w:rPr>
-          <w:rFonts w:ascii="Montserrat" w:hAnsi="Montserrat"/>
-          <w:color w:val="1A1A1A"/>
-          <w:sz w:val="22"/>
-        </w:rPr>
-      </w:pPr>
-      <w:r>
-        <w:rPr>
-          <w:rFonts w:ascii="Montserrat" w:hAnsi="Montserrat"/>
-          <w:color w:val="1A1A1A"/>
-          <w:sz w:val="22"/>
-        </w:rPr>
-        <w:t>Cadastre indicadores e valores estimados do programa, depois cada projeto vinculado (com suas proprias entregas, indicadores e valores).</w:t>
-      </w:r>
-    </w:p>
-    <w:p>
-      <w:pPr>
-        <w:spacing w:before="160" w:after="200"/>
-        <w:ind w:left="283"/>
-        <w:rPr>
-          <w:rFonts w:ascii="Montserrat" w:hAnsi="Montserrat"/>
-          <w:i/>
-          <w:color w:val="6A6A70"/>
-          <w:sz w:val="21"/>
-        </w:rPr>
-      </w:pPr>
-      <w:r>
-        <w:rPr>
-          <w:rFonts w:ascii="Montserrat" w:hAnsi="Montserrat"/>
-          <w:i/>
-          <w:color w:val="6A6A70"/>
-          <w:sz w:val="21"/>
-        </w:rPr>
-        <w:t>Projeto vinculado (Gate 1) - opcional: assim como no Relatorio de Situacao (secao 4.1), cada projeto cadastrado aqui pode ser associado a um Projeto ja Aprovado no Gate 1. A selecao preenche automaticamente o Nome do projeto, o Responsavel pelo projeto (a partir do gestor do projeto) e, a partir do TAP vinculado, o Objetivo, o Publico-alvo e um resumo dos Riscos em aberto (status Aberto ou Monitorando) - sempre so nos campos ainda vazios. Tambem libera o botao Ver historico, mostrando as alteracoes feitas nesse projeto em qualquer outro formulario vinculado a ele - incluindo decisoes de SMP (Passo 7).</w:t>
       </w:r>
     </w:p>
     <w:p>
@@ -17736,6 +17733,51 @@
           <w:color w:val="1A1A1A"/>
           <w:sz w:val="22"/>
         </w:rPr>
+        <w:t>Cadastre indicadores e valores estimados do programa, depois cada projeto vinculado (com suas proprias entregas, indicadores e valores).</w:t>
+      </w:r>
+    </w:p>
+    <w:p>
+      <w:pPr>
+        <w:spacing w:before="160" w:after="200"/>
+        <w:ind w:left="283"/>
+        <w:rPr>
+          <w:rFonts w:ascii="Montserrat" w:hAnsi="Montserrat"/>
+          <w:i/>
+          <w:color w:val="6A6A70"/>
+          <w:sz w:val="21"/>
+        </w:rPr>
+      </w:pPr>
+      <w:r>
+        <w:rPr>
+          <w:rFonts w:ascii="Montserrat" w:hAnsi="Montserrat"/>
+          <w:i/>
+          <w:color w:val="6A6A70"/>
+          <w:sz w:val="21"/>
+        </w:rPr>
+        <w:t>Projeto vinculado (Gate 1) - opcional: assim como no Relatorio de Situacao (secao 4.1), cada projeto cadastrado aqui pode ser associado a um Projeto ja Aprovado no Gate 1. A selecao preenche automaticamente o Nome do projeto, o Responsavel pelo projeto (a partir do gestor do projeto) e, a partir do TAP vinculado, o Objetivo, o Publico-alvo e um resumo dos Riscos em aberto (status Aberto ou Monitorando) - sempre so nos campos ainda vazios. Tambem libera o botao Ver historico, mostrando as alteracoes feitas nesse projeto em qualquer outro formulario vinculado a ele - incluindo decisoes de SMP (Passo 7).</w:t>
+      </w:r>
+    </w:p>
+    <w:p>
+      <w:pPr>
+        <w:pStyle w:val="PargrafodaLista"/>
+        <w:numPr>
+          <w:ilvl w:val="0"/>
+          <w:numId w:val="28"/>
+        </w:numPr>
+        <w:spacing w:after="80" w:line="260" w:lineRule="auto"/>
+        <w:ind w:left="700"/>
+        <w:rPr>
+          <w:rFonts w:ascii="Montserrat" w:hAnsi="Montserrat"/>
+          <w:color w:val="1A1A1A"/>
+          <w:sz w:val="22"/>
+        </w:rPr>
+      </w:pPr>
+      <w:r>
+        <w:rPr>
+          <w:rFonts w:ascii="Montserrat" w:hAnsi="Montserrat"/>
+          <w:color w:val="1A1A1A"/>
+          <w:sz w:val="22"/>
+        </w:rPr>
         <w:t xml:space="preserve">Assistente de preenchimento por IA: com um Projeto vinculado selecionado, o botao Sugerir com IA le o TAP e as Atas daquele projeto para sugerir o Impacto/Resultado do projeto - sempre redigido como </w:t>
       </w:r>
       <w:r>
@@ -17758,16 +17800,16 @@
           <w:noProof/>
         </w:rPr>
         <w:drawing>
-          <wp:inline distT="0" distB="0" distL="0" distR="0" wp14:anchorId="4EFBF513" wp14:editId="010FD91A">
+          <wp:inline distT="0" distB="0" distL="0" distR="0" wp14:anchorId="0E0D1202" wp14:editId="4D8161FF">
             <wp:extent cx="5120640" cy="2144319"/>
             <wp:effectExtent l="19050" t="19050" r="22860" b="27940"/>
-            <wp:docPr id="88830923" name="Imagem 39"/>
+            <wp:docPr id="652629132" name="Imagem 39"/>
             <wp:cNvGraphicFramePr/>
             <a:graphic xmlns:a="http://schemas.openxmlformats.org/drawingml/2006/main">
               <a:graphicData uri="http://schemas.openxmlformats.org/drawingml/2006/picture">
                 <pic:pic xmlns:pic="http://schemas.openxmlformats.org/drawingml/2006/picture">
                   <pic:nvPicPr>
-                    <pic:cNvPr id="88830923" name=""/>
+                    <pic:cNvPr id="652629132" name=""/>
                     <pic:cNvPicPr/>
                   </pic:nvPicPr>
                   <pic:blipFill>
@@ -17855,16 +17897,16 @@
           <w:noProof/>
         </w:rPr>
         <w:drawing>
-          <wp:inline distT="0" distB="0" distL="0" distR="0" wp14:anchorId="4DC45981" wp14:editId="424E43B6">
+          <wp:inline distT="0" distB="0" distL="0" distR="0" wp14:anchorId="1EABF42D" wp14:editId="36546960">
             <wp:extent cx="5120640" cy="1055647"/>
             <wp:effectExtent l="19050" t="19050" r="22860" b="11430"/>
-            <wp:docPr id="914810173" name="Imagem 40"/>
+            <wp:docPr id="1549145493" name="Imagem 40"/>
             <wp:cNvGraphicFramePr/>
             <a:graphic xmlns:a="http://schemas.openxmlformats.org/drawingml/2006/main">
               <a:graphicData uri="http://schemas.openxmlformats.org/drawingml/2006/picture">
                 <pic:pic xmlns:pic="http://schemas.openxmlformats.org/drawingml/2006/picture">
                   <pic:nvPicPr>
-                    <pic:cNvPr id="914810173" name=""/>
+                    <pic:cNvPr id="1549145493" name=""/>
                     <pic:cNvPicPr/>
                   </pic:nvPicPr>
                   <pic:blipFill>
@@ -17926,7 +17968,7 @@
         <w:pStyle w:val="PargrafodaLista"/>
         <w:numPr>
           <w:ilvl w:val="0"/>
-          <w:numId w:val="27"/>
+          <w:numId w:val="28"/>
         </w:numPr>
         <w:spacing w:after="80" w:line="260" w:lineRule="auto"/>
         <w:ind w:left="700"/>
@@ -17986,16 +18028,16 @@
           <w:noProof/>
         </w:rPr>
         <w:drawing>
-          <wp:inline distT="0" distB="0" distL="0" distR="0" wp14:anchorId="311FDEF9" wp14:editId="3B3F8900">
+          <wp:inline distT="0" distB="0" distL="0" distR="0" wp14:anchorId="14C0DCE5" wp14:editId="44E87A09">
             <wp:extent cx="5120640" cy="3282818"/>
             <wp:effectExtent l="19050" t="19050" r="22860" b="13335"/>
-            <wp:docPr id="1655174973" name="Imagem 41"/>
+            <wp:docPr id="890119134" name="Imagem 41"/>
             <wp:cNvGraphicFramePr/>
             <a:graphic xmlns:a="http://schemas.openxmlformats.org/drawingml/2006/main">
               <a:graphicData uri="http://schemas.openxmlformats.org/drawingml/2006/picture">
                 <pic:pic xmlns:pic="http://schemas.openxmlformats.org/drawingml/2006/picture">
                   <pic:nvPicPr>
-                    <pic:cNvPr id="1655174973" name=""/>
+                    <pic:cNvPr id="890119134" name=""/>
                     <pic:cNvPicPr/>
                   </pic:nvPicPr>
                   <pic:blipFill>
@@ -18078,7 +18120,7 @@
         <w:pStyle w:val="PargrafodaLista"/>
         <w:numPr>
           <w:ilvl w:val="0"/>
-          <w:numId w:val="27"/>
+          <w:numId w:val="28"/>
         </w:numPr>
         <w:spacing w:after="80" w:line="260" w:lineRule="auto"/>
         <w:ind w:left="700"/>
@@ -18129,16 +18171,16 @@
         </w:rPr>
         <w:lastRenderedPageBreak/>
         <w:drawing>
-          <wp:inline distT="0" distB="0" distL="0" distR="0" wp14:anchorId="7CC42D72" wp14:editId="275256E5">
+          <wp:inline distT="0" distB="0" distL="0" distR="0" wp14:anchorId="3315FFEF" wp14:editId="7F7CB038">
             <wp:extent cx="5120640" cy="1978034"/>
             <wp:effectExtent l="19050" t="19050" r="22860" b="22225"/>
-            <wp:docPr id="664606378" name="Imagem 42"/>
+            <wp:docPr id="1676298028" name="Imagem 42"/>
             <wp:cNvGraphicFramePr/>
             <a:graphic xmlns:a="http://schemas.openxmlformats.org/drawingml/2006/main">
               <a:graphicData uri="http://schemas.openxmlformats.org/drawingml/2006/picture">
                 <pic:pic xmlns:pic="http://schemas.openxmlformats.org/drawingml/2006/picture">
                   <pic:nvPicPr>
-                    <pic:cNvPr id="664606378" name=""/>
+                    <pic:cNvPr id="1676298028" name=""/>
                     <pic:cNvPicPr/>
                   </pic:nvPicPr>
                   <pic:blipFill>
@@ -18210,7 +18252,7 @@
           <w:sz w:val="34"/>
         </w:rPr>
       </w:pPr>
-      <w:bookmarkStart w:id="33" w:name="_Toc240271798"/>
+      <w:bookmarkStart w:id="33" w:name="_Toc240273034"/>
       <w:r>
         <w:rPr>
           <w:rFonts w:ascii="Montserrat" w:hAnsi="Montserrat"/>
@@ -18270,7 +18312,7 @@
           <w:sz w:val="27"/>
         </w:rPr>
       </w:pPr>
-      <w:bookmarkStart w:id="34" w:name="_Toc240271799"/>
+      <w:bookmarkStart w:id="34" w:name="_Toc240273035"/>
       <w:r>
         <w:rPr>
           <w:rFonts w:ascii="Montserrat" w:hAnsi="Montserrat"/>
@@ -18310,16 +18352,16 @@
           <w:noProof/>
         </w:rPr>
         <w:drawing>
-          <wp:inline distT="0" distB="0" distL="0" distR="0" wp14:anchorId="4E2B0DBE" wp14:editId="3B61485C">
+          <wp:inline distT="0" distB="0" distL="0" distR="0" wp14:anchorId="13ECBF96" wp14:editId="6081C447">
             <wp:extent cx="5303520" cy="4792851"/>
             <wp:effectExtent l="19050" t="19050" r="11430" b="27305"/>
-            <wp:docPr id="656519138" name="Imagem 43"/>
+            <wp:docPr id="1118470604" name="Imagem 43"/>
             <wp:cNvGraphicFramePr/>
             <a:graphic xmlns:a="http://schemas.openxmlformats.org/drawingml/2006/main">
               <a:graphicData uri="http://schemas.openxmlformats.org/drawingml/2006/picture">
                 <pic:pic xmlns:pic="http://schemas.openxmlformats.org/drawingml/2006/picture">
                   <pic:nvPicPr>
-                    <pic:cNvPr id="656519138" name=""/>
+                    <pic:cNvPr id="1118470604" name=""/>
                     <pic:cNvPicPr/>
                   </pic:nvPicPr>
                   <pic:blipFill>
@@ -18388,7 +18430,7 @@
           <w:sz w:val="27"/>
         </w:rPr>
       </w:pPr>
-      <w:bookmarkStart w:id="35" w:name="_Toc240271800"/>
+      <w:bookmarkStart w:id="35" w:name="_Toc240273036"/>
       <w:r>
         <w:rPr>
           <w:rFonts w:ascii="Montserrat" w:hAnsi="Montserrat"/>
@@ -18428,16 +18470,16 @@
           <w:noProof/>
         </w:rPr>
         <w:drawing>
-          <wp:inline distT="0" distB="0" distL="0" distR="0" wp14:anchorId="30A31846" wp14:editId="0BE9F049">
+          <wp:inline distT="0" distB="0" distL="0" distR="0" wp14:anchorId="035D5A9B" wp14:editId="16E1DD8E">
             <wp:extent cx="5303520" cy="4792851"/>
             <wp:effectExtent l="19050" t="19050" r="11430" b="27305"/>
-            <wp:docPr id="1736933434" name="Imagem 44"/>
+            <wp:docPr id="1871285996" name="Imagem 44"/>
             <wp:cNvGraphicFramePr/>
             <a:graphic xmlns:a="http://schemas.openxmlformats.org/drawingml/2006/main">
               <a:graphicData uri="http://schemas.openxmlformats.org/drawingml/2006/picture">
                 <pic:pic xmlns:pic="http://schemas.openxmlformats.org/drawingml/2006/picture">
                   <pic:nvPicPr>
-                    <pic:cNvPr id="1736933434" name=""/>
+                    <pic:cNvPr id="1871285996" name=""/>
                     <pic:cNvPicPr/>
                   </pic:nvPicPr>
                   <pic:blipFill>
@@ -18505,7 +18547,7 @@
           <w:sz w:val="27"/>
         </w:rPr>
       </w:pPr>
-      <w:bookmarkStart w:id="36" w:name="_Toc240271801"/>
+      <w:bookmarkStart w:id="36" w:name="_Toc240273037"/>
       <w:r>
         <w:rPr>
           <w:rFonts w:ascii="Montserrat" w:hAnsi="Montserrat"/>
@@ -18546,16 +18588,16 @@
         </w:rPr>
         <w:lastRenderedPageBreak/>
         <w:drawing>
-          <wp:inline distT="0" distB="0" distL="0" distR="0" wp14:anchorId="709E14BA" wp14:editId="14879EE4">
+          <wp:inline distT="0" distB="0" distL="0" distR="0" wp14:anchorId="7F8AD5D5" wp14:editId="1AB7B0E7">
             <wp:extent cx="5303520" cy="4792851"/>
             <wp:effectExtent l="19050" t="19050" r="11430" b="27305"/>
-            <wp:docPr id="453373921" name="Imagem 45"/>
+            <wp:docPr id="2002020555" name="Imagem 45"/>
             <wp:cNvGraphicFramePr/>
             <a:graphic xmlns:a="http://schemas.openxmlformats.org/drawingml/2006/main">
               <a:graphicData uri="http://schemas.openxmlformats.org/drawingml/2006/picture">
                 <pic:pic xmlns:pic="http://schemas.openxmlformats.org/drawingml/2006/picture">
                   <pic:nvPicPr>
-                    <pic:cNvPr id="453373921" name=""/>
+                    <pic:cNvPr id="2002020555" name=""/>
                     <pic:cNvPicPr/>
                   </pic:nvPicPr>
                   <pic:blipFill>
@@ -18623,16 +18665,16 @@
         </w:rPr>
         <w:lastRenderedPageBreak/>
         <w:drawing>
-          <wp:inline distT="0" distB="0" distL="0" distR="0" wp14:anchorId="40BE8B1E" wp14:editId="5D67E180">
+          <wp:inline distT="0" distB="0" distL="0" distR="0" wp14:anchorId="067EC50F" wp14:editId="1A53938B">
             <wp:extent cx="5303520" cy="4792851"/>
             <wp:effectExtent l="19050" t="19050" r="11430" b="27305"/>
-            <wp:docPr id="44632739" name="Imagem 46"/>
+            <wp:docPr id="317145968" name="Imagem 46"/>
             <wp:cNvGraphicFramePr/>
             <a:graphic xmlns:a="http://schemas.openxmlformats.org/drawingml/2006/main">
               <a:graphicData uri="http://schemas.openxmlformats.org/drawingml/2006/picture">
                 <pic:pic xmlns:pic="http://schemas.openxmlformats.org/drawingml/2006/picture">
                   <pic:nvPicPr>
-                    <pic:cNvPr id="44632739" name=""/>
+                    <pic:cNvPr id="317145968" name=""/>
                     <pic:cNvPicPr/>
                   </pic:nvPicPr>
                   <pic:blipFill>
@@ -18725,7 +18767,7 @@
           <w:sz w:val="34"/>
         </w:rPr>
       </w:pPr>
-      <w:bookmarkStart w:id="37" w:name="_Toc240271802"/>
+      <w:bookmarkStart w:id="37" w:name="_Toc240273038"/>
       <w:r>
         <w:rPr>
           <w:rFonts w:ascii="Montserrat" w:hAnsi="Montserrat"/>
@@ -18767,7 +18809,7 @@
           <w:sz w:val="27"/>
         </w:rPr>
       </w:pPr>
-      <w:bookmarkStart w:id="38" w:name="_Toc240271803"/>
+      <w:bookmarkStart w:id="38" w:name="_Toc240273039"/>
       <w:r>
         <w:rPr>
           <w:rFonts w:ascii="Montserrat" w:hAnsi="Montserrat"/>
@@ -18807,16 +18849,16 @@
           <w:noProof/>
         </w:rPr>
         <w:drawing>
-          <wp:inline distT="0" distB="0" distL="0" distR="0" wp14:anchorId="1FC21BA1" wp14:editId="2C4E8F73">
+          <wp:inline distT="0" distB="0" distL="0" distR="0" wp14:anchorId="4A0405B7" wp14:editId="65604817">
             <wp:extent cx="5303520" cy="4792851"/>
             <wp:effectExtent l="19050" t="19050" r="11430" b="27305"/>
-            <wp:docPr id="1098746300" name="Imagem 47"/>
+            <wp:docPr id="621077587" name="Imagem 47"/>
             <wp:cNvGraphicFramePr/>
             <a:graphic xmlns:a="http://schemas.openxmlformats.org/drawingml/2006/main">
               <a:graphicData uri="http://schemas.openxmlformats.org/drawingml/2006/picture">
                 <pic:pic xmlns:pic="http://schemas.openxmlformats.org/drawingml/2006/picture">
                   <pic:nvPicPr>
-                    <pic:cNvPr id="1098746300" name=""/>
+                    <pic:cNvPr id="621077587" name=""/>
                     <pic:cNvPicPr/>
                   </pic:nvPicPr>
                   <pic:blipFill>
@@ -19045,7 +19087,7 @@
           <w:sz w:val="27"/>
         </w:rPr>
       </w:pPr>
-      <w:bookmarkStart w:id="39" w:name="_Toc240271804"/>
+      <w:bookmarkStart w:id="39" w:name="_Toc240273040"/>
       <w:r>
         <w:rPr>
           <w:rFonts w:ascii="Montserrat" w:hAnsi="Montserrat"/>
@@ -19085,16 +19127,16 @@
           <w:noProof/>
         </w:rPr>
         <w:drawing>
-          <wp:inline distT="0" distB="0" distL="0" distR="0" wp14:anchorId="7D6E4188" wp14:editId="7E8A1405">
+          <wp:inline distT="0" distB="0" distL="0" distR="0" wp14:anchorId="4758F0C6" wp14:editId="3238DDE5">
             <wp:extent cx="5303520" cy="4792851"/>
             <wp:effectExtent l="19050" t="19050" r="11430" b="27305"/>
-            <wp:docPr id="1138777497" name="Imagem 48"/>
+            <wp:docPr id="1436300641" name="Imagem 48"/>
             <wp:cNvGraphicFramePr/>
             <a:graphic xmlns:a="http://schemas.openxmlformats.org/drawingml/2006/main">
               <a:graphicData uri="http://schemas.openxmlformats.org/drawingml/2006/picture">
                 <pic:pic xmlns:pic="http://schemas.openxmlformats.org/drawingml/2006/picture">
                   <pic:nvPicPr>
-                    <pic:cNvPr id="1138777497" name=""/>
+                    <pic:cNvPr id="1436300641" name=""/>
                     <pic:cNvPicPr/>
                   </pic:nvPicPr>
                   <pic:blipFill>
@@ -19162,7 +19204,7 @@
           <w:sz w:val="27"/>
         </w:rPr>
       </w:pPr>
-      <w:bookmarkStart w:id="40" w:name="_Toc240271805"/>
+      <w:bookmarkStart w:id="40" w:name="_Toc240273041"/>
       <w:r>
         <w:rPr>
           <w:rFonts w:ascii="Montserrat" w:hAnsi="Montserrat"/>
@@ -19203,16 +19245,16 @@
         </w:rPr>
         <w:lastRenderedPageBreak/>
         <w:drawing>
-          <wp:inline distT="0" distB="0" distL="0" distR="0" wp14:anchorId="7FB65C45" wp14:editId="138173F6">
+          <wp:inline distT="0" distB="0" distL="0" distR="0" wp14:anchorId="743DD1CD" wp14:editId="2CF3DC8F">
             <wp:extent cx="5303520" cy="4792851"/>
             <wp:effectExtent l="19050" t="19050" r="11430" b="27305"/>
-            <wp:docPr id="189159711" name="Imagem 49"/>
+            <wp:docPr id="741746170" name="Imagem 49"/>
             <wp:cNvGraphicFramePr/>
             <a:graphic xmlns:a="http://schemas.openxmlformats.org/drawingml/2006/main">
               <a:graphicData uri="http://schemas.openxmlformats.org/drawingml/2006/picture">
                 <pic:pic xmlns:pic="http://schemas.openxmlformats.org/drawingml/2006/picture">
                   <pic:nvPicPr>
-                    <pic:cNvPr id="189159711" name=""/>
+                    <pic:cNvPr id="741746170" name=""/>
                     <pic:cNvPicPr/>
                   </pic:nvPicPr>
                   <pic:blipFill>
@@ -19356,7 +19398,7 @@
           <w:sz w:val="27"/>
         </w:rPr>
       </w:pPr>
-      <w:bookmarkStart w:id="41" w:name="_Toc240271806"/>
+      <w:bookmarkStart w:id="41" w:name="_Toc240273042"/>
       <w:r>
         <w:rPr>
           <w:rFonts w:ascii="Montserrat" w:hAnsi="Montserrat"/>
@@ -19391,7 +19433,7 @@
         <w:pStyle w:val="PargrafodaLista"/>
         <w:numPr>
           <w:ilvl w:val="0"/>
-          <w:numId w:val="27"/>
+          <w:numId w:val="28"/>
         </w:numPr>
         <w:spacing w:after="80" w:line="260" w:lineRule="auto"/>
         <w:ind w:left="700"/>
@@ -19415,7 +19457,7 @@
         <w:pStyle w:val="PargrafodaLista"/>
         <w:numPr>
           <w:ilvl w:val="0"/>
-          <w:numId w:val="27"/>
+          <w:numId w:val="28"/>
         </w:numPr>
         <w:spacing w:after="80" w:line="260" w:lineRule="auto"/>
         <w:ind w:left="700"/>
@@ -19439,7 +19481,7 @@
         <w:pStyle w:val="PargrafodaLista"/>
         <w:numPr>
           <w:ilvl w:val="0"/>
-          <w:numId w:val="27"/>
+          <w:numId w:val="28"/>
         </w:numPr>
         <w:spacing w:after="80" w:line="260" w:lineRule="auto"/>
         <w:ind w:left="700"/>
@@ -19463,7 +19505,7 @@
         <w:pStyle w:val="PargrafodaLista"/>
         <w:numPr>
           <w:ilvl w:val="0"/>
-          <w:numId w:val="27"/>
+          <w:numId w:val="28"/>
         </w:numPr>
         <w:spacing w:after="80" w:line="260" w:lineRule="auto"/>
         <w:ind w:left="700"/>
@@ -19487,7 +19529,7 @@
         <w:pStyle w:val="PargrafodaLista"/>
         <w:numPr>
           <w:ilvl w:val="0"/>
-          <w:numId w:val="27"/>
+          <w:numId w:val="28"/>
         </w:numPr>
         <w:spacing w:after="80" w:line="260" w:lineRule="auto"/>
         <w:ind w:left="700"/>
@@ -19520,7 +19562,7 @@
         <w:pStyle w:val="PargrafodaLista"/>
         <w:numPr>
           <w:ilvl w:val="0"/>
-          <w:numId w:val="27"/>
+          <w:numId w:val="28"/>
         </w:numPr>
         <w:spacing w:after="80" w:line="260" w:lineRule="auto"/>
         <w:ind w:left="700"/>
@@ -19544,7 +19586,7 @@
         <w:pStyle w:val="PargrafodaLista"/>
         <w:numPr>
           <w:ilvl w:val="0"/>
-          <w:numId w:val="27"/>
+          <w:numId w:val="28"/>
         </w:numPr>
         <w:spacing w:after="80" w:line="260" w:lineRule="auto"/>
         <w:ind w:left="700"/>
@@ -19568,7 +19610,7 @@
         <w:pStyle w:val="PargrafodaLista"/>
         <w:numPr>
           <w:ilvl w:val="0"/>
-          <w:numId w:val="27"/>
+          <w:numId w:val="28"/>
         </w:numPr>
         <w:spacing w:after="80" w:line="260" w:lineRule="auto"/>
         <w:ind w:left="700"/>
@@ -19597,16 +19639,16 @@
           <w:noProof/>
         </w:rPr>
         <w:drawing>
-          <wp:inline distT="0" distB="0" distL="0" distR="0" wp14:anchorId="37BA94EE" wp14:editId="66BCFC96">
+          <wp:inline distT="0" distB="0" distL="0" distR="0" wp14:anchorId="5B2E48E2" wp14:editId="0EFD417B">
             <wp:extent cx="5303520" cy="4267180"/>
             <wp:effectExtent l="19050" t="19050" r="11430" b="19685"/>
-            <wp:docPr id="663499361" name="Imagem 50"/>
+            <wp:docPr id="496772326" name="Imagem 50"/>
             <wp:cNvGraphicFramePr/>
             <a:graphic xmlns:a="http://schemas.openxmlformats.org/drawingml/2006/main">
               <a:graphicData uri="http://schemas.openxmlformats.org/drawingml/2006/picture">
                 <pic:pic xmlns:pic="http://schemas.openxmlformats.org/drawingml/2006/picture">
                   <pic:nvPicPr>
-                    <pic:cNvPr id="663499361" name=""/>
+                    <pic:cNvPr id="496772326" name=""/>
                     <pic:cNvPicPr/>
                   </pic:nvPicPr>
                   <pic:blipFill>
@@ -19674,16 +19716,16 @@
         </w:rPr>
         <w:lastRenderedPageBreak/>
         <w:drawing>
-          <wp:inline distT="0" distB="0" distL="0" distR="0" wp14:anchorId="7217EA46" wp14:editId="182918DB">
+          <wp:inline distT="0" distB="0" distL="0" distR="0" wp14:anchorId="7A97084F" wp14:editId="66A75CCA">
             <wp:extent cx="5303520" cy="3382059"/>
             <wp:effectExtent l="19050" t="19050" r="11430" b="27940"/>
-            <wp:docPr id="728302586" name="Imagem 51"/>
+            <wp:docPr id="165676715" name="Imagem 51"/>
             <wp:cNvGraphicFramePr/>
             <a:graphic xmlns:a="http://schemas.openxmlformats.org/drawingml/2006/main">
               <a:graphicData uri="http://schemas.openxmlformats.org/drawingml/2006/picture">
                 <pic:pic xmlns:pic="http://schemas.openxmlformats.org/drawingml/2006/picture">
                   <pic:nvPicPr>
-                    <pic:cNvPr id="728302586" name=""/>
+                    <pic:cNvPr id="165676715" name=""/>
                     <pic:cNvPicPr/>
                   </pic:nvPicPr>
                   <pic:blipFill>
@@ -19751,16 +19793,16 @@
         </w:rPr>
         <w:lastRenderedPageBreak/>
         <w:drawing>
-          <wp:inline distT="0" distB="0" distL="0" distR="0" wp14:anchorId="41EDE741" wp14:editId="40A0AB34">
+          <wp:inline distT="0" distB="0" distL="0" distR="0" wp14:anchorId="3463532A" wp14:editId="5A9C468D">
             <wp:extent cx="5303520" cy="4417800"/>
             <wp:effectExtent l="19050" t="19050" r="11430" b="20955"/>
-            <wp:docPr id="364310822" name="Imagem 52"/>
+            <wp:docPr id="2037561575" name="Imagem 52"/>
             <wp:cNvGraphicFramePr/>
             <a:graphic xmlns:a="http://schemas.openxmlformats.org/drawingml/2006/main">
               <a:graphicData uri="http://schemas.openxmlformats.org/drawingml/2006/picture">
                 <pic:pic xmlns:pic="http://schemas.openxmlformats.org/drawingml/2006/picture">
                   <pic:nvPicPr>
-                    <pic:cNvPr id="364310822" name=""/>
+                    <pic:cNvPr id="2037561575" name=""/>
                     <pic:cNvPicPr/>
                   </pic:nvPicPr>
                   <pic:blipFill>
@@ -19870,7 +19912,7 @@
           <w:sz w:val="27"/>
         </w:rPr>
       </w:pPr>
-      <w:bookmarkStart w:id="42" w:name="_Toc240271807"/>
+      <w:bookmarkStart w:id="42" w:name="_Toc240273043"/>
       <w:r>
         <w:rPr>
           <w:rFonts w:ascii="Montserrat" w:hAnsi="Montserrat"/>
@@ -19914,7 +19956,7 @@
         <w:pStyle w:val="PargrafodaLista"/>
         <w:numPr>
           <w:ilvl w:val="0"/>
-          <w:numId w:val="28"/>
+          <w:numId w:val="29"/>
         </w:numPr>
         <w:spacing w:after="80" w:line="260" w:lineRule="auto"/>
         <w:ind w:left="700"/>
@@ -19938,7 +19980,7 @@
         <w:pStyle w:val="PargrafodaLista"/>
         <w:numPr>
           <w:ilvl w:val="0"/>
-          <w:numId w:val="28"/>
+          <w:numId w:val="29"/>
         </w:numPr>
         <w:spacing w:after="80" w:line="260" w:lineRule="auto"/>
         <w:ind w:left="700"/>
@@ -19962,7 +20004,7 @@
         <w:pStyle w:val="PargrafodaLista"/>
         <w:numPr>
           <w:ilvl w:val="0"/>
-          <w:numId w:val="28"/>
+          <w:numId w:val="29"/>
         </w:numPr>
         <w:spacing w:after="80" w:line="260" w:lineRule="auto"/>
         <w:ind w:left="700"/>
@@ -19986,7 +20028,7 @@
         <w:pStyle w:val="PargrafodaLista"/>
         <w:numPr>
           <w:ilvl w:val="0"/>
-          <w:numId w:val="28"/>
+          <w:numId w:val="29"/>
         </w:numPr>
         <w:spacing w:after="80" w:line="260" w:lineRule="auto"/>
         <w:ind w:left="700"/>
@@ -20010,7 +20052,7 @@
         <w:pStyle w:val="PargrafodaLista"/>
         <w:numPr>
           <w:ilvl w:val="0"/>
-          <w:numId w:val="28"/>
+          <w:numId w:val="29"/>
         </w:numPr>
         <w:spacing w:after="80" w:line="260" w:lineRule="auto"/>
         <w:ind w:left="700"/>
@@ -20034,7 +20076,7 @@
         <w:pStyle w:val="PargrafodaLista"/>
         <w:numPr>
           <w:ilvl w:val="0"/>
-          <w:numId w:val="28"/>
+          <w:numId w:val="29"/>
         </w:numPr>
         <w:spacing w:after="80" w:line="260" w:lineRule="auto"/>
         <w:ind w:left="700"/>
@@ -20058,7 +20100,7 @@
         <w:pStyle w:val="PargrafodaLista"/>
         <w:numPr>
           <w:ilvl w:val="0"/>
-          <w:numId w:val="28"/>
+          <w:numId w:val="29"/>
         </w:numPr>
         <w:spacing w:after="80" w:line="260" w:lineRule="auto"/>
         <w:ind w:left="700"/>
@@ -20082,7 +20124,7 @@
         <w:pStyle w:val="PargrafodaLista"/>
         <w:numPr>
           <w:ilvl w:val="0"/>
-          <w:numId w:val="28"/>
+          <w:numId w:val="29"/>
         </w:numPr>
         <w:spacing w:after="80" w:line="260" w:lineRule="auto"/>
         <w:ind w:left="700"/>
@@ -20106,7 +20148,7 @@
         <w:pStyle w:val="PargrafodaLista"/>
         <w:numPr>
           <w:ilvl w:val="0"/>
-          <w:numId w:val="28"/>
+          <w:numId w:val="29"/>
         </w:numPr>
         <w:spacing w:after="80" w:line="260" w:lineRule="auto"/>
         <w:ind w:left="700"/>
@@ -20136,16 +20178,16 @@
         </w:rPr>
         <w:lastRenderedPageBreak/>
         <w:drawing>
-          <wp:inline distT="0" distB="0" distL="0" distR="0" wp14:anchorId="532A647D" wp14:editId="4B55DF7E">
+          <wp:inline distT="0" distB="0" distL="0" distR="0" wp14:anchorId="1D0185E4" wp14:editId="472711B3">
             <wp:extent cx="5303520" cy="7628836"/>
             <wp:effectExtent l="19050" t="19050" r="11430" b="10795"/>
-            <wp:docPr id="12075880" name="Imagem 53"/>
+            <wp:docPr id="123502563" name="Imagem 53"/>
             <wp:cNvGraphicFramePr/>
             <a:graphic xmlns:a="http://schemas.openxmlformats.org/drawingml/2006/main">
               <a:graphicData uri="http://schemas.openxmlformats.org/drawingml/2006/picture">
                 <pic:pic xmlns:pic="http://schemas.openxmlformats.org/drawingml/2006/picture">
                   <pic:nvPicPr>
-                    <pic:cNvPr id="12075880" name=""/>
+                    <pic:cNvPr id="123502563" name=""/>
                     <pic:cNvPicPr/>
                   </pic:nvPicPr>
                   <pic:blipFill>
@@ -20277,7 +20319,7 @@
           <w:sz w:val="27"/>
         </w:rPr>
       </w:pPr>
-      <w:bookmarkStart w:id="43" w:name="_Toc240271808"/>
+      <w:bookmarkStart w:id="43" w:name="_Toc240273044"/>
       <w:r>
         <w:rPr>
           <w:rFonts w:ascii="Montserrat" w:hAnsi="Montserrat"/>
@@ -20323,141 +20365,6 @@
           <w:sz w:val="22"/>
         </w:rPr>
         <w:t>Quando a Administracao e acessada em producao, aparece uma quarta aba, Ambiente de Treino, com um unico botao: Resetar ambiente de treinamento. Ao clicar (e confirmar o aviso), o sistema apaga todos os projetos e registros de formulario atualmente no ambiente de treinamento e recria os 7 projetos de exemplo do zero - util para deixar o ambiente limpo antes de uma nova turma, sem precisar rodar nenhum comando manualmente.</w:t>
-      </w:r>
-    </w:p>
-    <w:p>
-      <w:pPr>
-        <w:pStyle w:val="PargrafodaLista"/>
-        <w:numPr>
-          <w:ilvl w:val="0"/>
-          <w:numId w:val="29"/>
-        </w:numPr>
-        <w:spacing w:after="80" w:line="260" w:lineRule="auto"/>
-        <w:ind w:left="700"/>
-        <w:rPr>
-          <w:rFonts w:ascii="Montserrat" w:hAnsi="Montserrat"/>
-          <w:color w:val="1A1A1A"/>
-          <w:sz w:val="22"/>
-        </w:rPr>
-      </w:pPr>
-      <w:r>
-        <w:rPr>
-          <w:rFonts w:ascii="Montserrat" w:hAnsi="Montserrat"/>
-          <w:color w:val="1A1A1A"/>
-          <w:sz w:val="22"/>
-        </w:rPr>
-        <w:t>A aba so aparece quando a Administracao e acessada pelo endereco de producao - quem acessa a Administracao pelo proprio ambiente de treinamento nao ve essa opcao.</w:t>
-      </w:r>
-    </w:p>
-    <w:p>
-      <w:pPr>
-        <w:pStyle w:val="PargrafodaLista"/>
-        <w:numPr>
-          <w:ilvl w:val="0"/>
-          <w:numId w:val="29"/>
-        </w:numPr>
-        <w:spacing w:after="80" w:line="260" w:lineRule="auto"/>
-        <w:ind w:left="700"/>
-        <w:rPr>
-          <w:rFonts w:ascii="Montserrat" w:hAnsi="Montserrat"/>
-          <w:color w:val="1A1A1A"/>
-          <w:sz w:val="22"/>
-        </w:rPr>
-      </w:pPr>
-      <w:r>
-        <w:rPr>
-          <w:rFonts w:ascii="Montserrat" w:hAnsi="Montserrat"/>
-          <w:color w:val="1A1A1A"/>
-          <w:sz w:val="22"/>
-        </w:rPr>
-        <w:lastRenderedPageBreak/>
-        <w:t>Nao afeta nenhum dado de producao em nenhuma hipotese - a acao roda numa Edge Function que so tem permissao de escrita no banco do ambiente de treinamento.</w:t>
-      </w:r>
-    </w:p>
-    <w:p>
-      <w:pPr>
-        <w:pStyle w:val="PargrafodaLista"/>
-        <w:numPr>
-          <w:ilvl w:val="0"/>
-          <w:numId w:val="29"/>
-        </w:numPr>
-        <w:spacing w:after="80" w:line="260" w:lineRule="auto"/>
-        <w:ind w:left="700"/>
-        <w:rPr>
-          <w:rFonts w:ascii="Montserrat" w:hAnsi="Montserrat"/>
-          <w:color w:val="1A1A1A"/>
-          <w:sz w:val="22"/>
-        </w:rPr>
-      </w:pPr>
-      <w:r>
-        <w:rPr>
-          <w:rFonts w:ascii="Montserrat" w:hAnsi="Montserrat"/>
-          <w:color w:val="1A1A1A"/>
-          <w:sz w:val="22"/>
-        </w:rPr>
-        <w:t>As 6 contas fixas de treinamento e as configuracoes do ambiente de treino nao sao apagadas pelo reset - so os projetos e os registros de formulario.</w:t>
-      </w:r>
-    </w:p>
-    <w:p>
-      <w:pPr>
-        <w:spacing w:before="160" w:after="200"/>
-        <w:ind w:left="283"/>
-        <w:rPr>
-          <w:rFonts w:ascii="Montserrat" w:hAnsi="Montserrat"/>
-          <w:i/>
-          <w:color w:val="6A6A70"/>
-          <w:sz w:val="21"/>
-        </w:rPr>
-      </w:pPr>
-      <w:r>
-        <w:rPr>
-          <w:rFonts w:ascii="Montserrat" w:hAnsi="Montserrat"/>
-          <w:i/>
-          <w:color w:val="6A6A70"/>
-          <w:sz w:val="21"/>
-        </w:rPr>
-        <w:t>Assim como as outras acoes exclusivas de Admin, a Edge Function confere o papel do usuario direto no banco de producao antes de fazer qualquer alteracao - nao basta ver o botao na tela.</w:t>
-      </w:r>
-    </w:p>
-    <w:p>
-      <w:pPr>
-        <w:pStyle w:val="Ttulo2"/>
-        <w:spacing w:before="320" w:after="120"/>
-        <w:rPr>
-          <w:rFonts w:ascii="Montserrat" w:hAnsi="Montserrat"/>
-          <w:b/>
-          <w:color w:val="B91D2E"/>
-          <w:sz w:val="27"/>
-        </w:rPr>
-      </w:pPr>
-      <w:bookmarkStart w:id="44" w:name="_Toc240271809"/>
-      <w:r>
-        <w:rPr>
-          <w:rFonts w:ascii="Montserrat" w:hAnsi="Montserrat"/>
-          <w:b/>
-          <w:color w:val="B91D2E"/>
-          <w:sz w:val="27"/>
-        </w:rPr>
-        <w:t>6.6 Backup automatizado</w:t>
-      </w:r>
-      <w:bookmarkEnd w:id="44"/>
-    </w:p>
-    <w:p>
-      <w:pPr>
-        <w:spacing w:line="280" w:lineRule="auto"/>
-        <w:rPr>
-          <w:rFonts w:ascii="Montserrat" w:hAnsi="Montserrat"/>
-          <w:color w:val="1A1A1A"/>
-          <w:sz w:val="22"/>
-        </w:rPr>
-      </w:pPr>
-      <w:r>
-        <w:rPr>
-          <w:rFonts w:ascii="Montserrat" w:hAnsi="Montserrat"/>
-          <w:color w:val="1A1A1A"/>
-          <w:sz w:val="22"/>
-        </w:rPr>
-        <w:t>No fim da aba Configuracoes (secao 6.3), um bloco separado deixa o Admin/PMO definir os parametros de uma rotina de backup periodico do sistema inteiro (banco de dados, arquivos anexados e codigo-fonte) para um destino fora do GitHub - complemento operacional a proposta Backup Automatizado entregue separadamente.</w:t>
       </w:r>
     </w:p>
     <w:p>
@@ -20481,7 +20388,7 @@
           <w:color w:val="1A1A1A"/>
           <w:sz w:val="22"/>
         </w:rPr>
-        <w:t>Habilitar backup automatizado: interruptor geral da rotina.</w:t>
+        <w:t>A aba so aparece quando a Administracao e acessada pelo endereco de producao - quem acessa a Administracao pelo proprio ambiente de treinamento nao ve essa opcao.</w:t>
       </w:r>
     </w:p>
     <w:p>
@@ -20505,7 +20412,8 @@
           <w:color w:val="1A1A1A"/>
           <w:sz w:val="22"/>
         </w:rPr>
-        <w:t>Destino: OneDrive/SharePoint institucional, outro armazenamento de nuvem ou servidor da instituicao, mais o caminho/pasta exato onde gravar.</w:t>
+        <w:lastRenderedPageBreak/>
+        <w:t>Nao afeta nenhum dado de producao em nenhuma hipotese - a acao roda numa Edge Function que so tem permissao de escrita no banco do ambiente de treinamento.</w:t>
       </w:r>
     </w:p>
     <w:p>
@@ -20529,7 +20437,69 @@
           <w:color w:val="1A1A1A"/>
           <w:sz w:val="22"/>
         </w:rPr>
-        <w:t>Frequencia: diaria ou semanal.</w:t>
+        <w:t>As 6 contas fixas de treinamento e as configuracoes do ambiente de treino nao sao apagadas pelo reset - so os projetos e os registros de formulario.</w:t>
+      </w:r>
+    </w:p>
+    <w:p>
+      <w:pPr>
+        <w:spacing w:before="160" w:after="200"/>
+        <w:ind w:left="283"/>
+        <w:rPr>
+          <w:rFonts w:ascii="Montserrat" w:hAnsi="Montserrat"/>
+          <w:i/>
+          <w:color w:val="6A6A70"/>
+          <w:sz w:val="21"/>
+        </w:rPr>
+      </w:pPr>
+      <w:r>
+        <w:rPr>
+          <w:rFonts w:ascii="Montserrat" w:hAnsi="Montserrat"/>
+          <w:i/>
+          <w:color w:val="6A6A70"/>
+          <w:sz w:val="21"/>
+        </w:rPr>
+        <w:t>Assim como as outras acoes exclusivas de Admin, a Edge Function confere o papel do usuario direto no banco de producao antes de fazer qualquer alteracao - nao basta ver o botao na tela.</w:t>
+      </w:r>
+    </w:p>
+    <w:p>
+      <w:pPr>
+        <w:pStyle w:val="Ttulo2"/>
+        <w:spacing w:before="320" w:after="120"/>
+        <w:rPr>
+          <w:rFonts w:ascii="Montserrat" w:hAnsi="Montserrat"/>
+          <w:b/>
+          <w:color w:val="B91D2E"/>
+          <w:sz w:val="27"/>
+        </w:rPr>
+      </w:pPr>
+      <w:bookmarkStart w:id="44" w:name="_Toc240273045"/>
+      <w:r>
+        <w:rPr>
+          <w:rFonts w:ascii="Montserrat" w:hAnsi="Montserrat"/>
+          <w:b/>
+          <w:color w:val="B91D2E"/>
+          <w:sz w:val="27"/>
+        </w:rPr>
+        <w:t>6.6 Backup automatizado</w:t>
+      </w:r>
+      <w:bookmarkEnd w:id="44"/>
+    </w:p>
+    <w:p>
+      <w:pPr>
+        <w:spacing w:line="280" w:lineRule="auto"/>
+        <w:rPr>
+          <w:rFonts w:ascii="Montserrat" w:hAnsi="Montserrat"/>
+          <w:color w:val="1A1A1A"/>
+          <w:sz w:val="22"/>
+        </w:rPr>
+      </w:pPr>
+      <w:r>
+        <w:rPr>
+          <w:rFonts w:ascii="Montserrat" w:hAnsi="Montserrat"/>
+          <w:color w:val="1A1A1A"/>
+          <w:sz w:val="22"/>
+        </w:rPr>
+        <w:t>No fim da aba Configuracoes (secao 6.3), um bloco separado deixa o Admin/PMO definir os parametros de uma rotina de backup periodico do sistema inteiro (banco de dados, arquivos anexados e codigo-fonte) para um destino fora do GitHub - complemento operacional a proposta Backup Automatizado entregue separadamente.</w:t>
       </w:r>
     </w:p>
     <w:p>
@@ -20537,7 +20507,7 @@
         <w:pStyle w:val="PargrafodaLista"/>
         <w:numPr>
           <w:ilvl w:val="0"/>
-          <w:numId w:val="30"/>
+          <w:numId w:val="31"/>
         </w:numPr>
         <w:spacing w:after="80" w:line="260" w:lineRule="auto"/>
         <w:ind w:left="700"/>
@@ -20553,7 +20523,7 @@
           <w:color w:val="1A1A1A"/>
           <w:sz w:val="22"/>
         </w:rPr>
-        <w:t>Retencao (dias, opcional): depois de quantos dias os backups antigos podem ser descartados; vazio mantem tudo indefinidamente.</w:t>
+        <w:t>Habilitar backup automatizado: interruptor geral da rotina.</w:t>
       </w:r>
     </w:p>
     <w:p>
@@ -20561,7 +20531,7 @@
         <w:pStyle w:val="PargrafodaLista"/>
         <w:numPr>
           <w:ilvl w:val="0"/>
-          <w:numId w:val="30"/>
+          <w:numId w:val="31"/>
         </w:numPr>
         <w:spacing w:after="80" w:line="260" w:lineRule="auto"/>
         <w:ind w:left="700"/>
@@ -20577,7 +20547,7 @@
           <w:color w:val="1A1A1A"/>
           <w:sz w:val="22"/>
         </w:rPr>
-        <w:t>E-mail de alerta: para onde avisar automaticamente se uma execucao falhar.</w:t>
+        <w:t>Destino: OneDrive/SharePoint institucional, outro armazenamento de nuvem ou servidor da instituicao, mais o caminho/pasta exato onde gravar.</w:t>
       </w:r>
     </w:p>
     <w:p>
@@ -20585,7 +20555,7 @@
         <w:pStyle w:val="PargrafodaLista"/>
         <w:numPr>
           <w:ilvl w:val="0"/>
-          <w:numId w:val="30"/>
+          <w:numId w:val="31"/>
         </w:numPr>
         <w:spacing w:after="80" w:line="260" w:lineRule="auto"/>
         <w:ind w:left="700"/>
@@ -20601,7 +20571,7 @@
           <w:color w:val="1A1A1A"/>
           <w:sz w:val="22"/>
         </w:rPr>
-        <w:t>E-mails com acesso ao destino externo: campo de registro/referencia de quem deveria ter permissao na pasta de destino - conceder esse acesso de fato continua sendo feito manualmente onde o destino estiver (OneDrive, repositorio etc.).</w:t>
+        <w:t>Frequencia: diaria ou semanal.</w:t>
       </w:r>
     </w:p>
     <w:p>
@@ -20609,7 +20579,7 @@
         <w:pStyle w:val="PargrafodaLista"/>
         <w:numPr>
           <w:ilvl w:val="0"/>
-          <w:numId w:val="30"/>
+          <w:numId w:val="31"/>
         </w:numPr>
         <w:spacing w:after="80" w:line="260" w:lineRule="auto"/>
         <w:ind w:left="700"/>
@@ -20625,7 +20595,7 @@
           <w:color w:val="1A1A1A"/>
           <w:sz w:val="22"/>
         </w:rPr>
-        <w:t>Quem pode gerenciar essas configuracoes: papeis liberados para alterar esta tela, alem do PMO/Admin, que sempre tem acesso.</w:t>
+        <w:t>Retencao (dias, opcional): depois de quantos dias os backups antigos podem ser descartados; vazio mantem tudo indefinidamente.</w:t>
       </w:r>
     </w:p>
     <w:p>
@@ -20633,7 +20603,7 @@
         <w:pStyle w:val="PargrafodaLista"/>
         <w:numPr>
           <w:ilvl w:val="0"/>
-          <w:numId w:val="30"/>
+          <w:numId w:val="31"/>
         </w:numPr>
         <w:spacing w:after="80" w:line="260" w:lineRule="auto"/>
         <w:ind w:left="700"/>
@@ -20649,6 +20619,78 @@
           <w:color w:val="1A1A1A"/>
           <w:sz w:val="22"/>
         </w:rPr>
+        <w:t>E-mail de alerta: para onde avisar automaticamente se uma execucao falhar.</w:t>
+      </w:r>
+    </w:p>
+    <w:p>
+      <w:pPr>
+        <w:pStyle w:val="PargrafodaLista"/>
+        <w:numPr>
+          <w:ilvl w:val="0"/>
+          <w:numId w:val="31"/>
+        </w:numPr>
+        <w:spacing w:after="80" w:line="260" w:lineRule="auto"/>
+        <w:ind w:left="700"/>
+        <w:rPr>
+          <w:rFonts w:ascii="Montserrat" w:hAnsi="Montserrat"/>
+          <w:color w:val="1A1A1A"/>
+          <w:sz w:val="22"/>
+        </w:rPr>
+      </w:pPr>
+      <w:r>
+        <w:rPr>
+          <w:rFonts w:ascii="Montserrat" w:hAnsi="Montserrat"/>
+          <w:color w:val="1A1A1A"/>
+          <w:sz w:val="22"/>
+        </w:rPr>
+        <w:t>E-mails com acesso ao destino externo: campo de registro/referencia de quem deveria ter permissao na pasta de destino - conceder esse acesso de fato continua sendo feito manualmente onde o destino estiver (OneDrive, repositorio etc.).</w:t>
+      </w:r>
+    </w:p>
+    <w:p>
+      <w:pPr>
+        <w:pStyle w:val="PargrafodaLista"/>
+        <w:numPr>
+          <w:ilvl w:val="0"/>
+          <w:numId w:val="31"/>
+        </w:numPr>
+        <w:spacing w:after="80" w:line="260" w:lineRule="auto"/>
+        <w:ind w:left="700"/>
+        <w:rPr>
+          <w:rFonts w:ascii="Montserrat" w:hAnsi="Montserrat"/>
+          <w:color w:val="1A1A1A"/>
+          <w:sz w:val="22"/>
+        </w:rPr>
+      </w:pPr>
+      <w:r>
+        <w:rPr>
+          <w:rFonts w:ascii="Montserrat" w:hAnsi="Montserrat"/>
+          <w:color w:val="1A1A1A"/>
+          <w:sz w:val="22"/>
+        </w:rPr>
+        <w:t>Quem pode gerenciar essas configuracoes: papeis liberados para alterar esta tela, alem do PMO/Admin, que sempre tem acesso.</w:t>
+      </w:r>
+    </w:p>
+    <w:p>
+      <w:pPr>
+        <w:pStyle w:val="PargrafodaLista"/>
+        <w:numPr>
+          <w:ilvl w:val="0"/>
+          <w:numId w:val="31"/>
+        </w:numPr>
+        <w:spacing w:after="80" w:line="260" w:lineRule="auto"/>
+        <w:ind w:left="700"/>
+        <w:rPr>
+          <w:rFonts w:ascii="Montserrat" w:hAnsi="Montserrat"/>
+          <w:color w:val="1A1A1A"/>
+          <w:sz w:val="22"/>
+        </w:rPr>
+      </w:pPr>
+      <w:r>
+        <w:rPr>
+          <w:rFonts w:ascii="Montserrat" w:hAnsi="Montserrat"/>
+          <w:color w:val="1A1A1A"/>
+          <w:sz w:val="22"/>
+        </w:rPr>
         <w:t>Ultima execucao: data/hora e status (sucesso ou falha) da ultima vez que a rotina automatizada rodou, preenchido por ela mesma.</w:t>
       </w:r>
     </w:p>
@@ -20723,16 +20765,16 @@
           <w:noProof/>
         </w:rPr>
         <w:drawing>
-          <wp:inline distT="0" distB="0" distL="0" distR="0" wp14:anchorId="261F8659" wp14:editId="08A43A62">
+          <wp:inline distT="0" distB="0" distL="0" distR="0" wp14:anchorId="26FAC842" wp14:editId="0FD51E7A">
             <wp:extent cx="5303520" cy="1351384"/>
             <wp:effectExtent l="19050" t="19050" r="11430" b="20320"/>
-            <wp:docPr id="171758088" name="Imagem 54"/>
+            <wp:docPr id="2002634895" name="Imagem 54"/>
             <wp:cNvGraphicFramePr/>
             <a:graphic xmlns:a="http://schemas.openxmlformats.org/drawingml/2006/main">
               <a:graphicData uri="http://schemas.openxmlformats.org/drawingml/2006/picture">
                 <pic:pic xmlns:pic="http://schemas.openxmlformats.org/drawingml/2006/picture">
                   <pic:nvPicPr>
-                    <pic:cNvPr id="171758088" name=""/>
+                    <pic:cNvPr id="2002634895" name=""/>
                     <pic:cNvPicPr/>
                   </pic:nvPicPr>
                   <pic:blipFill>
@@ -20800,7 +20842,7 @@
           <w:sz w:val="27"/>
         </w:rPr>
       </w:pPr>
-      <w:bookmarkStart w:id="45" w:name="_Toc240271810"/>
+      <w:bookmarkStart w:id="45" w:name="_Toc240273046"/>
       <w:r>
         <w:rPr>
           <w:rFonts w:ascii="Montserrat" w:hAnsi="Montserrat"/>
@@ -20835,7 +20877,7 @@
         <w:pStyle w:val="PargrafodaLista"/>
         <w:numPr>
           <w:ilvl w:val="0"/>
-          <w:numId w:val="31"/>
+          <w:numId w:val="32"/>
         </w:numPr>
         <w:spacing w:after="80" w:line="260" w:lineRule="auto"/>
         <w:ind w:left="700"/>
@@ -20859,7 +20901,7 @@
         <w:pStyle w:val="PargrafodaLista"/>
         <w:numPr>
           <w:ilvl w:val="0"/>
-          <w:numId w:val="31"/>
+          <w:numId w:val="32"/>
         </w:numPr>
         <w:spacing w:after="80" w:line="260" w:lineRule="auto"/>
         <w:ind w:left="700"/>
@@ -20883,7 +20925,7 @@
         <w:pStyle w:val="PargrafodaLista"/>
         <w:numPr>
           <w:ilvl w:val="0"/>
-          <w:numId w:val="31"/>
+          <w:numId w:val="32"/>
         </w:numPr>
         <w:spacing w:after="80" w:line="260" w:lineRule="auto"/>
         <w:ind w:left="700"/>
@@ -20907,7 +20949,7 @@
         <w:pStyle w:val="PargrafodaLista"/>
         <w:numPr>
           <w:ilvl w:val="0"/>
-          <w:numId w:val="31"/>
+          <w:numId w:val="32"/>
         </w:numPr>
         <w:spacing w:after="80" w:line="260" w:lineRule="auto"/>
         <w:ind w:left="700"/>
@@ -20945,16 +20987,16 @@
           <w:noProof/>
         </w:rPr>
         <w:drawing>
-          <wp:inline distT="0" distB="0" distL="0" distR="0" wp14:anchorId="43E2220F" wp14:editId="54DF9FFE">
+          <wp:inline distT="0" distB="0" distL="0" distR="0" wp14:anchorId="5197DB7D" wp14:editId="27D123C4">
             <wp:extent cx="5303520" cy="1422793"/>
             <wp:effectExtent l="19050" t="19050" r="11430" b="25400"/>
-            <wp:docPr id="2046298595" name="Imagem 55"/>
+            <wp:docPr id="1597859587" name="Imagem 55"/>
             <wp:cNvGraphicFramePr/>
             <a:graphic xmlns:a="http://schemas.openxmlformats.org/drawingml/2006/main">
               <a:graphicData uri="http://schemas.openxmlformats.org/drawingml/2006/picture">
                 <pic:pic xmlns:pic="http://schemas.openxmlformats.org/drawingml/2006/picture">
                   <pic:nvPicPr>
-                    <pic:cNvPr id="2046298595" name=""/>
+                    <pic:cNvPr id="1597859587" name=""/>
                     <pic:cNvPicPr/>
                   </pic:nvPicPr>
                   <pic:blipFill>
@@ -21079,7 +21121,7 @@
         <w:pStyle w:val="PargrafodaLista"/>
         <w:numPr>
           <w:ilvl w:val="0"/>
-          <w:numId w:val="32"/>
+          <w:numId w:val="33"/>
         </w:numPr>
         <w:spacing w:after="80" w:line="260" w:lineRule="auto"/>
         <w:ind w:left="700"/>
@@ -21109,16 +21151,16 @@
         </w:rPr>
         <w:lastRenderedPageBreak/>
         <w:drawing>
-          <wp:inline distT="0" distB="0" distL="0" distR="0" wp14:anchorId="5B6EB8DF" wp14:editId="3624364B">
+          <wp:inline distT="0" distB="0" distL="0" distR="0" wp14:anchorId="26AA93F7" wp14:editId="20669FAC">
             <wp:extent cx="5303520" cy="1841050"/>
             <wp:effectExtent l="19050" t="19050" r="11430" b="26035"/>
-            <wp:docPr id="219106208" name="Imagem 56"/>
+            <wp:docPr id="146544788" name="Imagem 56"/>
             <wp:cNvGraphicFramePr/>
             <a:graphic xmlns:a="http://schemas.openxmlformats.org/drawingml/2006/main">
               <a:graphicData uri="http://schemas.openxmlformats.org/drawingml/2006/picture">
                 <pic:pic xmlns:pic="http://schemas.openxmlformats.org/drawingml/2006/picture">
                   <pic:nvPicPr>
-                    <pic:cNvPr id="219106208" name=""/>
+                    <pic:cNvPr id="146544788" name=""/>
                     <pic:cNvPicPr/>
                   </pic:nvPicPr>
                   <pic:blipFill>
@@ -21219,7 +21261,7 @@
         <w:pStyle w:val="PargrafodaLista"/>
         <w:numPr>
           <w:ilvl w:val="0"/>
-          <w:numId w:val="32"/>
+          <w:numId w:val="33"/>
         </w:numPr>
         <w:spacing w:after="80" w:line="260" w:lineRule="auto"/>
         <w:ind w:left="700"/>
@@ -21243,7 +21285,7 @@
         <w:pStyle w:val="PargrafodaLista"/>
         <w:numPr>
           <w:ilvl w:val="0"/>
-          <w:numId w:val="32"/>
+          <w:numId w:val="33"/>
         </w:numPr>
         <w:spacing w:after="80" w:line="260" w:lineRule="auto"/>
         <w:ind w:left="700"/>
@@ -21272,16 +21314,16 @@
           <w:noProof/>
         </w:rPr>
         <w:drawing>
-          <wp:inline distT="0" distB="0" distL="0" distR="0" wp14:anchorId="78D739B1" wp14:editId="3149D49B">
+          <wp:inline distT="0" distB="0" distL="0" distR="0" wp14:anchorId="6A74B0DC" wp14:editId="4D2EC554">
             <wp:extent cx="5303520" cy="303041"/>
             <wp:effectExtent l="19050" t="19050" r="11430" b="20955"/>
-            <wp:docPr id="2107088426" name="Imagem 57"/>
+            <wp:docPr id="1436258506" name="Imagem 57"/>
             <wp:cNvGraphicFramePr/>
             <a:graphic xmlns:a="http://schemas.openxmlformats.org/drawingml/2006/main">
               <a:graphicData uri="http://schemas.openxmlformats.org/drawingml/2006/picture">
                 <pic:pic xmlns:pic="http://schemas.openxmlformats.org/drawingml/2006/picture">
                   <pic:nvPicPr>
-                    <pic:cNvPr id="2107088426" name=""/>
+                    <pic:cNvPr id="1436258506" name=""/>
                     <pic:cNvPicPr/>
                   </pic:nvPicPr>
                   <pic:blipFill>
@@ -21349,16 +21391,16 @@
         </w:rPr>
         <w:lastRenderedPageBreak/>
         <w:drawing>
-          <wp:inline distT="0" distB="0" distL="0" distR="0" wp14:anchorId="32BA5C5F" wp14:editId="38E96ACC">
+          <wp:inline distT="0" distB="0" distL="0" distR="0" wp14:anchorId="3B8E699C" wp14:editId="64AD9D73">
             <wp:extent cx="5303520" cy="2983005"/>
             <wp:effectExtent l="19050" t="19050" r="11430" b="27305"/>
-            <wp:docPr id="1257754771" name="Imagem 58"/>
+            <wp:docPr id="1320239481" name="Imagem 58"/>
             <wp:cNvGraphicFramePr/>
             <a:graphic xmlns:a="http://schemas.openxmlformats.org/drawingml/2006/main">
               <a:graphicData uri="http://schemas.openxmlformats.org/drawingml/2006/picture">
                 <pic:pic xmlns:pic="http://schemas.openxmlformats.org/drawingml/2006/picture">
                   <pic:nvPicPr>
-                    <pic:cNvPr id="1257754771" name=""/>
+                    <pic:cNvPr id="1320239481" name=""/>
                     <pic:cNvPicPr/>
                   </pic:nvPicPr>
                   <pic:blipFill>
@@ -21430,7 +21472,7 @@
           <w:sz w:val="34"/>
         </w:rPr>
       </w:pPr>
-      <w:bookmarkStart w:id="46" w:name="_Toc240271811"/>
+      <w:bookmarkStart w:id="46" w:name="_Toc240273047"/>
       <w:r>
         <w:rPr>
           <w:rFonts w:ascii="Montserrat" w:hAnsi="Montserrat"/>
@@ -21674,7 +21716,7 @@
           <w:sz w:val="34"/>
         </w:rPr>
       </w:pPr>
-      <w:bookmarkStart w:id="47" w:name="_Toc240271812"/>
+      <w:bookmarkStart w:id="47" w:name="_Toc240273048"/>
       <w:r>
         <w:rPr>
           <w:rFonts w:ascii="Montserrat" w:hAnsi="Montserrat"/>
@@ -23462,7 +23504,7 @@
 <file path=word/numbering.xml><?xml version="1.0" encoding="utf-8"?>
 <w:numbering xmlns:wpc="http://schemas.microsoft.com/office/word/2010/wordprocessingCanvas" xmlns:cx="http://schemas.microsoft.com/office/drawing/2014/chartex" xmlns:cx1="http://schemas.microsoft.com/office/drawing/2015/9/8/chartex" xmlns:cx2="http://schemas.microsoft.com/office/drawing/2015/10/21/chartex" xmlns:cx3="http://schemas.microsoft.com/office/drawing/2016/5/9/chartex" xmlns:cx4="http://schemas.microsoft.com/office/drawing/2016/5/10/chartex" xmlns:cx5="http://schemas.microsoft.com/office/drawing/2016/5/11/chartex" xmlns:cx6="http://schemas.microsoft.com/office/drawing/2016/5/12/chartex" xmlns:cx7="http://schemas.microsoft.com/office/drawing/2016/5/13/chartex" xmlns:cx8="http://schemas.microsoft.com/office/drawing/2016/5/14/chartex" xmlns:mc="http://schemas.openxmlformats.org/markup-compatibility/2006" xmlns:aink="http://schemas.microsoft.com/office/drawing/2016/ink" xmlns:am3d="http://schemas.microsoft.com/office/drawing/2017/model3d" xmlns:o="urn:schemas-microsoft-com:office:office" xmlns:oel="http://schemas.microsoft.com/office/2019/extlst" xmlns:r="http://schemas.openxmlformats.org/officeDocument/2006/relationships" xmlns:m="http://schemas.openxmlformats.org/officeDocument/2006/math" xmlns:v="urn:schemas-microsoft-com:vml" xmlns:wp14="http://schemas.microsoft.com/office/word/2010/wordprocessingDrawing" xmlns:wp="http://schemas.openxmlformats.org/drawingml/2006/wordprocessingDrawing" xmlns:w10="urn:schemas-microsoft-com:office:word" xmlns:w="http://schemas.openxmlformats.org/wordprocessingml/2006/main" xmlns:w14="http://schemas.microsoft.com/office/word/2010/wordml" xmlns:w15="http://schemas.microsoft.com/office/word/2012/wordml" xmlns:w16cex="http://schemas.microsoft.com/office/word/2018/wordml/cex" xmlns:w16cid="http://schemas.microsoft.com/office/word/2016/wordml/cid" xmlns:w16="http://schemas.microsoft.com/office/word/2018/wordml" xmlns:w16du="http://schemas.microsoft.com/office/word/2023/wordml/word16du" xmlns:w16sdtdh="http://schemas.microsoft.com/office/word/2020/wordml/sdtdatahash" xmlns:w16sdtfl="http://schemas.microsoft.com/office/word/2024/wordml/sdtformatlock" xmlns:w16se="http://schemas.microsoft.com/office/word/2015/wordml/symex" xmlns:wpg="http://schemas.microsoft.com/office/word/2010/wordprocessingGroup" xmlns:wpi="http://schemas.microsoft.com/office/word/2010/wordprocessingInk" xmlns:wne="http://schemas.microsoft.com/office/word/2006/wordml" xmlns:wps="http://schemas.microsoft.com/office/word/2010/wordprocessingShape" mc:Ignorable="w14 w15 w16se w16cid w16 w16cex w16sdtdh w16sdtfl w16du wp14">
   <w:abstractNum w:abstractNumId="0" w15:restartNumberingAfterBreak="0">
-    <w:nsid w:val="0A1C15EA"/>
+    <w:nsid w:val="00C53D2E"/>
     <w:multiLevelType w:val="singleLevel"/>
     <w:tmpl w:val="04160001"/>
     <w:lvl w:ilvl="0">
@@ -23479,7 +23521,7 @@
     </w:lvl>
   </w:abstractNum>
   <w:abstractNum w:abstractNumId="1" w15:restartNumberingAfterBreak="0">
-    <w:nsid w:val="0D27529F"/>
+    <w:nsid w:val="0740462F"/>
     <w:multiLevelType w:val="singleLevel"/>
     <w:tmpl w:val="04160001"/>
     <w:lvl w:ilvl="0">
@@ -23496,7 +23538,7 @@
     </w:lvl>
   </w:abstractNum>
   <w:abstractNum w:abstractNumId="2" w15:restartNumberingAfterBreak="0">
-    <w:nsid w:val="108F03EF"/>
+    <w:nsid w:val="09233D20"/>
     <w:multiLevelType w:val="singleLevel"/>
     <w:tmpl w:val="04160001"/>
     <w:lvl w:ilvl="0">
@@ -23513,7 +23555,7 @@
     </w:lvl>
   </w:abstractNum>
   <w:abstractNum w:abstractNumId="3" w15:restartNumberingAfterBreak="0">
-    <w:nsid w:val="13AA1450"/>
+    <w:nsid w:val="0AA33520"/>
     <w:multiLevelType w:val="singleLevel"/>
     <w:tmpl w:val="04160001"/>
     <w:lvl w:ilvl="0">
@@ -23530,7 +23572,7 @@
     </w:lvl>
   </w:abstractNum>
   <w:abstractNum w:abstractNumId="4" w15:restartNumberingAfterBreak="0">
-    <w:nsid w:val="13CD500F"/>
+    <w:nsid w:val="1C1171FD"/>
     <w:multiLevelType w:val="singleLevel"/>
     <w:tmpl w:val="04160001"/>
     <w:lvl w:ilvl="0">
@@ -23547,7 +23589,7 @@
     </w:lvl>
   </w:abstractNum>
   <w:abstractNum w:abstractNumId="5" w15:restartNumberingAfterBreak="0">
-    <w:nsid w:val="156B4F41"/>
+    <w:nsid w:val="1DDC44ED"/>
     <w:multiLevelType w:val="singleLevel"/>
     <w:tmpl w:val="04160001"/>
     <w:lvl w:ilvl="0">
@@ -23564,7 +23606,7 @@
     </w:lvl>
   </w:abstractNum>
   <w:abstractNum w:abstractNumId="6" w15:restartNumberingAfterBreak="0">
-    <w:nsid w:val="1F384D54"/>
+    <w:nsid w:val="1E5F5D55"/>
     <w:multiLevelType w:val="singleLevel"/>
     <w:tmpl w:val="04160001"/>
     <w:lvl w:ilvl="0">
@@ -23581,7 +23623,7 @@
     </w:lvl>
   </w:abstractNum>
   <w:abstractNum w:abstractNumId="7" w15:restartNumberingAfterBreak="0">
-    <w:nsid w:val="1FC7507B"/>
+    <w:nsid w:val="202A2755"/>
     <w:multiLevelType w:val="singleLevel"/>
     <w:tmpl w:val="04160001"/>
     <w:lvl w:ilvl="0">
@@ -23598,7 +23640,7 @@
     </w:lvl>
   </w:abstractNum>
   <w:abstractNum w:abstractNumId="8" w15:restartNumberingAfterBreak="0">
-    <w:nsid w:val="208D727B"/>
+    <w:nsid w:val="23FD5EE8"/>
     <w:multiLevelType w:val="singleLevel"/>
     <w:tmpl w:val="04160001"/>
     <w:lvl w:ilvl="0">
@@ -23615,7 +23657,7 @@
     </w:lvl>
   </w:abstractNum>
   <w:abstractNum w:abstractNumId="9" w15:restartNumberingAfterBreak="0">
-    <w:nsid w:val="22501D9A"/>
+    <w:nsid w:val="26013775"/>
     <w:multiLevelType w:val="singleLevel"/>
     <w:tmpl w:val="04160001"/>
     <w:lvl w:ilvl="0">
@@ -23632,7 +23674,7 @@
     </w:lvl>
   </w:abstractNum>
   <w:abstractNum w:abstractNumId="10" w15:restartNumberingAfterBreak="0">
-    <w:nsid w:val="269846A0"/>
+    <w:nsid w:val="34143182"/>
     <w:multiLevelType w:val="singleLevel"/>
     <w:tmpl w:val="04160001"/>
     <w:lvl w:ilvl="0">
@@ -23649,7 +23691,7 @@
     </w:lvl>
   </w:abstractNum>
   <w:abstractNum w:abstractNumId="11" w15:restartNumberingAfterBreak="0">
-    <w:nsid w:val="297A78D1"/>
+    <w:nsid w:val="34415215"/>
     <w:multiLevelType w:val="singleLevel"/>
     <w:tmpl w:val="04160001"/>
     <w:lvl w:ilvl="0">
@@ -23666,7 +23708,7 @@
     </w:lvl>
   </w:abstractNum>
   <w:abstractNum w:abstractNumId="12" w15:restartNumberingAfterBreak="0">
-    <w:nsid w:val="29ED1FF4"/>
+    <w:nsid w:val="344163CC"/>
     <w:multiLevelType w:val="singleLevel"/>
     <w:tmpl w:val="04160001"/>
     <w:lvl w:ilvl="0">
@@ -23683,7 +23725,7 @@
     </w:lvl>
   </w:abstractNum>
   <w:abstractNum w:abstractNumId="13" w15:restartNumberingAfterBreak="0">
-    <w:nsid w:val="2AB1127C"/>
+    <w:nsid w:val="34D03D22"/>
     <w:multiLevelType w:val="singleLevel"/>
     <w:tmpl w:val="04160001"/>
     <w:lvl w:ilvl="0">
@@ -23700,7 +23742,7 @@
     </w:lvl>
   </w:abstractNum>
   <w:abstractNum w:abstractNumId="14" w15:restartNumberingAfterBreak="0">
-    <w:nsid w:val="323E3D6C"/>
+    <w:nsid w:val="3FF96929"/>
     <w:multiLevelType w:val="singleLevel"/>
     <w:tmpl w:val="04160001"/>
     <w:lvl w:ilvl="0">
@@ -23717,7 +23759,7 @@
     </w:lvl>
   </w:abstractNum>
   <w:abstractNum w:abstractNumId="15" w15:restartNumberingAfterBreak="0">
-    <w:nsid w:val="3C6C3C20"/>
+    <w:nsid w:val="407E6EBC"/>
     <w:multiLevelType w:val="singleLevel"/>
     <w:tmpl w:val="04160001"/>
     <w:lvl w:ilvl="0">
@@ -23734,7 +23776,7 @@
     </w:lvl>
   </w:abstractNum>
   <w:abstractNum w:abstractNumId="16" w15:restartNumberingAfterBreak="0">
-    <w:nsid w:val="40EC597D"/>
+    <w:nsid w:val="411915A4"/>
     <w:multiLevelType w:val="singleLevel"/>
     <w:tmpl w:val="04160001"/>
     <w:lvl w:ilvl="0">
@@ -23751,7 +23793,7 @@
     </w:lvl>
   </w:abstractNum>
   <w:abstractNum w:abstractNumId="17" w15:restartNumberingAfterBreak="0">
-    <w:nsid w:val="46130AE6"/>
+    <w:nsid w:val="47427F1B"/>
     <w:multiLevelType w:val="singleLevel"/>
     <w:tmpl w:val="04160001"/>
     <w:lvl w:ilvl="0">
@@ -23768,7 +23810,7 @@
     </w:lvl>
   </w:abstractNum>
   <w:abstractNum w:abstractNumId="18" w15:restartNumberingAfterBreak="0">
-    <w:nsid w:val="46207C56"/>
+    <w:nsid w:val="48861249"/>
     <w:multiLevelType w:val="singleLevel"/>
     <w:tmpl w:val="04160001"/>
     <w:lvl w:ilvl="0">
@@ -23785,7 +23827,7 @@
     </w:lvl>
   </w:abstractNum>
   <w:abstractNum w:abstractNumId="19" w15:restartNumberingAfterBreak="0">
-    <w:nsid w:val="48733367"/>
+    <w:nsid w:val="493A6DC1"/>
     <w:multiLevelType w:val="singleLevel"/>
     <w:tmpl w:val="04160001"/>
     <w:lvl w:ilvl="0">
@@ -23802,7 +23844,7 @@
     </w:lvl>
   </w:abstractNum>
   <w:abstractNum w:abstractNumId="20" w15:restartNumberingAfterBreak="0">
-    <w:nsid w:val="52055699"/>
+    <w:nsid w:val="4DB72287"/>
     <w:multiLevelType w:val="singleLevel"/>
     <w:tmpl w:val="04160001"/>
     <w:lvl w:ilvl="0">
@@ -23819,7 +23861,7 @@
     </w:lvl>
   </w:abstractNum>
   <w:abstractNum w:abstractNumId="21" w15:restartNumberingAfterBreak="0">
-    <w:nsid w:val="54493B4F"/>
+    <w:nsid w:val="50EF1A86"/>
     <w:multiLevelType w:val="singleLevel"/>
     <w:tmpl w:val="04160001"/>
     <w:lvl w:ilvl="0">
@@ -23836,7 +23878,7 @@
     </w:lvl>
   </w:abstractNum>
   <w:abstractNum w:abstractNumId="22" w15:restartNumberingAfterBreak="0">
-    <w:nsid w:val="5FEA4E4E"/>
+    <w:nsid w:val="575765F3"/>
     <w:multiLevelType w:val="singleLevel"/>
     <w:tmpl w:val="04160001"/>
     <w:lvl w:ilvl="0">
@@ -23853,7 +23895,7 @@
     </w:lvl>
   </w:abstractNum>
   <w:abstractNum w:abstractNumId="23" w15:restartNumberingAfterBreak="0">
-    <w:nsid w:val="631F67F8"/>
+    <w:nsid w:val="585F7B7A"/>
     <w:multiLevelType w:val="singleLevel"/>
     <w:tmpl w:val="04160001"/>
     <w:lvl w:ilvl="0">
@@ -23870,7 +23912,7 @@
     </w:lvl>
   </w:abstractNum>
   <w:abstractNum w:abstractNumId="24" w15:restartNumberingAfterBreak="0">
-    <w:nsid w:val="63284FAD"/>
+    <w:nsid w:val="5B935A0C"/>
     <w:multiLevelType w:val="singleLevel"/>
     <w:tmpl w:val="04160001"/>
     <w:lvl w:ilvl="0">
@@ -23887,7 +23929,7 @@
     </w:lvl>
   </w:abstractNum>
   <w:abstractNum w:abstractNumId="25" w15:restartNumberingAfterBreak="0">
-    <w:nsid w:val="682942F7"/>
+    <w:nsid w:val="63A90C8E"/>
     <w:multiLevelType w:val="singleLevel"/>
     <w:tmpl w:val="04160001"/>
     <w:lvl w:ilvl="0">
@@ -23904,7 +23946,7 @@
     </w:lvl>
   </w:abstractNum>
   <w:abstractNum w:abstractNumId="26" w15:restartNumberingAfterBreak="0">
-    <w:nsid w:val="69FF29FF"/>
+    <w:nsid w:val="64D46D87"/>
     <w:multiLevelType w:val="singleLevel"/>
     <w:tmpl w:val="04160001"/>
     <w:lvl w:ilvl="0">
@@ -23921,7 +23963,7 @@
     </w:lvl>
   </w:abstractNum>
   <w:abstractNum w:abstractNumId="27" w15:restartNumberingAfterBreak="0">
-    <w:nsid w:val="6BF84F3C"/>
+    <w:nsid w:val="66800C37"/>
     <w:multiLevelType w:val="singleLevel"/>
     <w:tmpl w:val="04160001"/>
     <w:lvl w:ilvl="0">
@@ -23938,7 +23980,7 @@
     </w:lvl>
   </w:abstractNum>
   <w:abstractNum w:abstractNumId="28" w15:restartNumberingAfterBreak="0">
-    <w:nsid w:val="6D582959"/>
+    <w:nsid w:val="6AAB6551"/>
     <w:multiLevelType w:val="singleLevel"/>
     <w:tmpl w:val="04160001"/>
     <w:lvl w:ilvl="0">
@@ -23955,7 +23997,7 @@
     </w:lvl>
   </w:abstractNum>
   <w:abstractNum w:abstractNumId="29" w15:restartNumberingAfterBreak="0">
-    <w:nsid w:val="73C51742"/>
+    <w:nsid w:val="6DA80D08"/>
     <w:multiLevelType w:val="singleLevel"/>
     <w:tmpl w:val="04160001"/>
     <w:lvl w:ilvl="0">
@@ -23972,7 +24014,7 @@
     </w:lvl>
   </w:abstractNum>
   <w:abstractNum w:abstractNumId="30" w15:restartNumberingAfterBreak="0">
-    <w:nsid w:val="7FEA0E20"/>
+    <w:nsid w:val="6E063C53"/>
     <w:multiLevelType w:val="singleLevel"/>
     <w:tmpl w:val="04160001"/>
     <w:lvl w:ilvl="0">
@@ -23989,7 +24031,7 @@
     </w:lvl>
   </w:abstractNum>
   <w:abstractNum w:abstractNumId="31" w15:restartNumberingAfterBreak="0">
-    <w:nsid w:val="7FF94FFF"/>
+    <w:nsid w:val="6F931EBB"/>
     <w:multiLevelType w:val="singleLevel"/>
     <w:tmpl w:val="04160001"/>
     <w:lvl w:ilvl="0">
@@ -24005,101 +24047,121 @@
       </w:rPr>
     </w:lvl>
   </w:abstractNum>
-  <w:num w:numId="1" w16cid:durableId="1449347989">
+  <w:abstractNum w:abstractNumId="32" w15:restartNumberingAfterBreak="0">
+    <w:nsid w:val="6FC242D3"/>
+    <w:multiLevelType w:val="singleLevel"/>
+    <w:tmpl w:val="04160001"/>
+    <w:lvl w:ilvl="0">
+      <w:start w:val="1"/>
+      <w:numFmt w:val="bullet"/>
+      <w:lvlText w:val=""/>
+      <w:lvlJc w:val="left"/>
+      <w:pPr>
+        <w:ind w:left="720" w:hanging="360"/>
+      </w:pPr>
+      <w:rPr>
+        <w:rFonts w:ascii="Symbol" w:hAnsi="Symbol" w:hint="default"/>
+      </w:rPr>
+    </w:lvl>
+  </w:abstractNum>
+  <w:num w:numId="1" w16cid:durableId="1343974490">
+    <w:abstractNumId w:val="0"/>
+  </w:num>
+  <w:num w:numId="2" w16cid:durableId="388654472">
+    <w:abstractNumId w:val="25"/>
+  </w:num>
+  <w:num w:numId="3" w16cid:durableId="766852192">
+    <w:abstractNumId w:val="30"/>
+  </w:num>
+  <w:num w:numId="4" w16cid:durableId="2119250244">
+    <w:abstractNumId w:val="17"/>
+  </w:num>
+  <w:num w:numId="5" w16cid:durableId="582686002">
+    <w:abstractNumId w:val="24"/>
+  </w:num>
+  <w:num w:numId="6" w16cid:durableId="1120339832">
+    <w:abstractNumId w:val="19"/>
+  </w:num>
+  <w:num w:numId="7" w16cid:durableId="1496259072">
+    <w:abstractNumId w:val="7"/>
+  </w:num>
+  <w:num w:numId="8" w16cid:durableId="551886889">
+    <w:abstractNumId w:val="29"/>
+  </w:num>
+  <w:num w:numId="9" w16cid:durableId="1068193421">
+    <w:abstractNumId w:val="4"/>
+  </w:num>
+  <w:num w:numId="10" w16cid:durableId="1953122899">
+    <w:abstractNumId w:val="8"/>
+  </w:num>
+  <w:num w:numId="11" w16cid:durableId="1050573320">
+    <w:abstractNumId w:val="23"/>
+  </w:num>
+  <w:num w:numId="12" w16cid:durableId="1394229496">
+    <w:abstractNumId w:val="9"/>
+  </w:num>
+  <w:num w:numId="13" w16cid:durableId="1112283255">
+    <w:abstractNumId w:val="12"/>
+  </w:num>
+  <w:num w:numId="14" w16cid:durableId="2048993177">
+    <w:abstractNumId w:val="14"/>
+  </w:num>
+  <w:num w:numId="15" w16cid:durableId="449203869">
+    <w:abstractNumId w:val="6"/>
+  </w:num>
+  <w:num w:numId="16" w16cid:durableId="912472776">
     <w:abstractNumId w:val="20"/>
   </w:num>
-  <w:num w:numId="2" w16cid:durableId="528756796">
+  <w:num w:numId="17" w16cid:durableId="1225988727">
+    <w:abstractNumId w:val="28"/>
+  </w:num>
+  <w:num w:numId="18" w16cid:durableId="1514879610">
+    <w:abstractNumId w:val="3"/>
+  </w:num>
+  <w:num w:numId="19" w16cid:durableId="823088151">
     <w:abstractNumId w:val="11"/>
   </w:num>
-  <w:num w:numId="3" w16cid:durableId="413432067">
-    <w:abstractNumId w:val="17"/>
+  <w:num w:numId="20" w16cid:durableId="205306">
+    <w:abstractNumId w:val="10"/>
   </w:num>
-  <w:num w:numId="4" w16cid:durableId="1562714277">
-    <w:abstractNumId w:val="8"/>
+  <w:num w:numId="21" w16cid:durableId="598491278">
+    <w:abstractNumId w:val="16"/>
   </w:num>
-  <w:num w:numId="5" w16cid:durableId="1090391186">
-    <w:abstractNumId w:val="22"/>
+  <w:num w:numId="22" w16cid:durableId="289408449">
+    <w:abstractNumId w:val="32"/>
   </w:num>
-  <w:num w:numId="6" w16cid:durableId="1810975458">
-    <w:abstractNumId w:val="0"/>
+  <w:num w:numId="23" w16cid:durableId="475681569">
+    <w:abstractNumId w:val="27"/>
   </w:num>
-  <w:num w:numId="7" w16cid:durableId="212929096">
-    <w:abstractNumId w:val="7"/>
+  <w:num w:numId="24" w16cid:durableId="1942566873">
+    <w:abstractNumId w:val="21"/>
   </w:num>
-  <w:num w:numId="8" w16cid:durableId="496068637">
-    <w:abstractNumId w:val="28"/>
+  <w:num w:numId="25" w16cid:durableId="1213074668">
+    <w:abstractNumId w:val="31"/>
   </w:num>
-  <w:num w:numId="9" w16cid:durableId="198013406">
+  <w:num w:numId="26" w16cid:durableId="436371034">
+    <w:abstractNumId w:val="2"/>
+  </w:num>
+  <w:num w:numId="27" w16cid:durableId="1176189033">
+    <w:abstractNumId w:val="15"/>
+  </w:num>
+  <w:num w:numId="28" w16cid:durableId="1254053257">
     <w:abstractNumId w:val="5"/>
   </w:num>
-  <w:num w:numId="10" w16cid:durableId="1910261411">
-    <w:abstractNumId w:val="3"/>
-  </w:num>
-  <w:num w:numId="11" w16cid:durableId="1398895354">
-    <w:abstractNumId w:val="6"/>
-  </w:num>
-  <w:num w:numId="12" w16cid:durableId="1163080223">
-    <w:abstractNumId w:val="4"/>
-  </w:num>
-  <w:num w:numId="13" w16cid:durableId="427392440">
-    <w:abstractNumId w:val="19"/>
-  </w:num>
-  <w:num w:numId="14" w16cid:durableId="518662920">
+  <w:num w:numId="29" w16cid:durableId="2103409215">
     <w:abstractNumId w:val="1"/>
   </w:num>
-  <w:num w:numId="15" w16cid:durableId="32386285">
-    <w:abstractNumId w:val="14"/>
+  <w:num w:numId="30" w16cid:durableId="1930112258">
+    <w:abstractNumId w:val="26"/>
   </w:num>
-  <w:num w:numId="16" w16cid:durableId="1029062031">
+  <w:num w:numId="31" w16cid:durableId="467237013">
     <w:abstractNumId w:val="18"/>
   </w:num>
-  <w:num w:numId="17" w16cid:durableId="1032464006">
+  <w:num w:numId="32" w16cid:durableId="652611088">
     <w:abstractNumId w:val="13"/>
   </w:num>
-  <w:num w:numId="18" w16cid:durableId="960307581">
-    <w:abstractNumId w:val="27"/>
-  </w:num>
-  <w:num w:numId="19" w16cid:durableId="1957179724">
-    <w:abstractNumId w:val="24"/>
-  </w:num>
-  <w:num w:numId="20" w16cid:durableId="715275899">
-    <w:abstractNumId w:val="16"/>
-  </w:num>
-  <w:num w:numId="21" w16cid:durableId="804591211">
-    <w:abstractNumId w:val="12"/>
-  </w:num>
-  <w:num w:numId="22" w16cid:durableId="1700935549">
-    <w:abstractNumId w:val="26"/>
-  </w:num>
-  <w:num w:numId="23" w16cid:durableId="1284725356">
-    <w:abstractNumId w:val="10"/>
-  </w:num>
-  <w:num w:numId="24" w16cid:durableId="297802649">
-    <w:abstractNumId w:val="31"/>
-  </w:num>
-  <w:num w:numId="25" w16cid:durableId="1931353405">
-    <w:abstractNumId w:val="25"/>
-  </w:num>
-  <w:num w:numId="26" w16cid:durableId="1156264456">
-    <w:abstractNumId w:val="2"/>
-  </w:num>
-  <w:num w:numId="27" w16cid:durableId="1554461133">
-    <w:abstractNumId w:val="21"/>
-  </w:num>
-  <w:num w:numId="28" w16cid:durableId="1600873678">
-    <w:abstractNumId w:val="30"/>
-  </w:num>
-  <w:num w:numId="29" w16cid:durableId="814419211">
-    <w:abstractNumId w:val="9"/>
-  </w:num>
-  <w:num w:numId="30" w16cid:durableId="8989597">
-    <w:abstractNumId w:val="29"/>
-  </w:num>
-  <w:num w:numId="31" w16cid:durableId="1012495549">
-    <w:abstractNumId w:val="15"/>
-  </w:num>
-  <w:num w:numId="32" w16cid:durableId="1902710032">
-    <w:abstractNumId w:val="23"/>
+  <w:num w:numId="33" w16cid:durableId="1579712375">
+    <w:abstractNumId w:val="22"/>
   </w:num>
 </w:numbering>
 </file>
@@ -24512,7 +24574,7 @@
     <w:link w:val="Ttulo1Char"/>
     <w:uiPriority w:val="9"/>
     <w:qFormat/>
-    <w:rsid w:val="005C1A20"/>
+    <w:rsid w:val="00A30922"/>
     <w:pPr>
       <w:keepNext/>
       <w:keepLines/>
@@ -24534,7 +24596,7 @@
     <w:uiPriority w:val="9"/>
     <w:unhideWhenUsed/>
     <w:qFormat/>
-    <w:rsid w:val="005C1A20"/>
+    <w:rsid w:val="00A30922"/>
     <w:pPr>
       <w:keepNext/>
       <w:keepLines/>
@@ -24557,7 +24619,7 @@
     <w:semiHidden/>
     <w:unhideWhenUsed/>
     <w:qFormat/>
-    <w:rsid w:val="005C1A20"/>
+    <w:rsid w:val="00A30922"/>
     <w:pPr>
       <w:keepNext/>
       <w:keepLines/>
@@ -24580,7 +24642,7 @@
     <w:semiHidden/>
     <w:unhideWhenUsed/>
     <w:qFormat/>
-    <w:rsid w:val="005C1A20"/>
+    <w:rsid w:val="00A30922"/>
     <w:pPr>
       <w:keepNext/>
       <w:keepLines/>
@@ -24603,7 +24665,7 @@
     <w:semiHidden/>
     <w:unhideWhenUsed/>
     <w:qFormat/>
-    <w:rsid w:val="005C1A20"/>
+    <w:rsid w:val="00A30922"/>
     <w:pPr>
       <w:keepNext/>
       <w:keepLines/>
@@ -24624,7 +24686,7 @@
     <w:semiHidden/>
     <w:unhideWhenUsed/>
     <w:qFormat/>
-    <w:rsid w:val="005C1A20"/>
+    <w:rsid w:val="00A30922"/>
     <w:pPr>
       <w:keepNext/>
       <w:keepLines/>
@@ -24647,7 +24709,7 @@
     <w:semiHidden/>
     <w:unhideWhenUsed/>
     <w:qFormat/>
-    <w:rsid w:val="005C1A20"/>
+    <w:rsid w:val="00A30922"/>
     <w:pPr>
       <w:keepNext/>
       <w:keepLines/>
@@ -24668,7 +24730,7 @@
     <w:semiHidden/>
     <w:unhideWhenUsed/>
     <w:qFormat/>
-    <w:rsid w:val="005C1A20"/>
+    <w:rsid w:val="00A30922"/>
     <w:pPr>
       <w:keepNext/>
       <w:keepLines/>
@@ -24691,7 +24753,7 @@
     <w:semiHidden/>
     <w:unhideWhenUsed/>
     <w:qFormat/>
-    <w:rsid w:val="005C1A20"/>
+    <w:rsid w:val="00A30922"/>
     <w:pPr>
       <w:keepNext/>
       <w:keepLines/>
@@ -24735,7 +24797,7 @@
     <w:basedOn w:val="Fontepargpadro"/>
     <w:link w:val="Ttulo1"/>
     <w:uiPriority w:val="9"/>
-    <w:rsid w:val="005C1A20"/>
+    <w:rsid w:val="00A30922"/>
     <w:rPr>
       <w:rFonts w:asciiTheme="majorHAnsi" w:eastAsiaTheme="majorEastAsia" w:hAnsiTheme="majorHAnsi" w:cstheme="majorBidi"/>
       <w:color w:val="0F4761" w:themeColor="accent1" w:themeShade="BF"/>
@@ -24748,7 +24810,7 @@
     <w:basedOn w:val="Fontepargpadro"/>
     <w:link w:val="Ttulo2"/>
     <w:uiPriority w:val="9"/>
-    <w:rsid w:val="005C1A20"/>
+    <w:rsid w:val="00A30922"/>
     <w:rPr>
       <w:rFonts w:asciiTheme="majorHAnsi" w:eastAsiaTheme="majorEastAsia" w:hAnsiTheme="majorHAnsi" w:cstheme="majorBidi"/>
       <w:color w:val="0F4761" w:themeColor="accent1" w:themeShade="BF"/>
@@ -24762,7 +24824,7 @@
     <w:link w:val="Ttulo3"/>
     <w:uiPriority w:val="9"/>
     <w:semiHidden/>
-    <w:rsid w:val="005C1A20"/>
+    <w:rsid w:val="00A30922"/>
     <w:rPr>
       <w:rFonts w:eastAsiaTheme="majorEastAsia" w:cstheme="majorBidi"/>
       <w:color w:val="0F4761" w:themeColor="accent1" w:themeShade="BF"/>
@@ -24776,7 +24838,7 @@
     <w:link w:val="Ttulo4"/>
     <w:uiPriority w:val="9"/>
     <w:semiHidden/>
-    <w:rsid w:val="005C1A20"/>
+    <w:rsid w:val="00A30922"/>
     <w:rPr>
       <w:rFonts w:eastAsiaTheme="majorEastAsia" w:cstheme="majorBidi"/>
       <w:i/>
@@ -24790,7 +24852,7 @@
     <w:link w:val="Ttulo5"/>
     <w:uiPriority w:val="9"/>
     <w:semiHidden/>
-    <w:rsid w:val="005C1A20"/>
+    <w:rsid w:val="00A30922"/>
     <w:rPr>
       <w:rFonts w:eastAsiaTheme="majorEastAsia" w:cstheme="majorBidi"/>
       <w:color w:val="0F4761" w:themeColor="accent1" w:themeShade="BF"/>
@@ -24802,7 +24864,7 @@
     <w:link w:val="Ttulo6"/>
     <w:uiPriority w:val="9"/>
     <w:semiHidden/>
-    <w:rsid w:val="005C1A20"/>
+    <w:rsid w:val="00A30922"/>
     <w:rPr>
       <w:rFonts w:eastAsiaTheme="majorEastAsia" w:cstheme="majorBidi"/>
       <w:i/>
@@ -24816,7 +24878,7 @@
     <w:link w:val="Ttulo7"/>
     <w:uiPriority w:val="9"/>
     <w:semiHidden/>
-    <w:rsid w:val="005C1A20"/>
+    <w:rsid w:val="00A30922"/>
     <w:rPr>
       <w:rFonts w:eastAsiaTheme="majorEastAsia" w:cstheme="majorBidi"/>
       <w:color w:val="595959" w:themeColor="text1" w:themeTint="A6"/>
@@ -24828,7 +24890,7 @@
     <w:link w:val="Ttulo8"/>
     <w:uiPriority w:val="9"/>
     <w:semiHidden/>
-    <w:rsid w:val="005C1A20"/>
+    <w:rsid w:val="00A30922"/>
     <w:rPr>
       <w:rFonts w:eastAsiaTheme="majorEastAsia" w:cstheme="majorBidi"/>
       <w:i/>
@@ -24842,7 +24904,7 @@
     <w:link w:val="Ttulo9"/>
     <w:uiPriority w:val="9"/>
     <w:semiHidden/>
-    <w:rsid w:val="005C1A20"/>
+    <w:rsid w:val="00A30922"/>
     <w:rPr>
       <w:rFonts w:eastAsiaTheme="majorEastAsia" w:cstheme="majorBidi"/>
       <w:color w:val="272727" w:themeColor="text1" w:themeTint="D8"/>
@@ -24855,7 +24917,7 @@
     <w:link w:val="TtuloChar"/>
     <w:uiPriority w:val="10"/>
     <w:qFormat/>
-    <w:rsid w:val="005C1A20"/>
+    <w:rsid w:val="00A30922"/>
     <w:pPr>
       <w:spacing w:after="80" w:line="240" w:lineRule="auto"/>
       <w:contextualSpacing/>
@@ -24873,7 +24935,7 @@
     <w:basedOn w:val="Fontepargpadro"/>
     <w:link w:val="Ttulo"/>
     <w:uiPriority w:val="10"/>
-    <w:rsid w:val="005C1A20"/>
+    <w:rsid w:val="00A30922"/>
     <w:rPr>
       <w:rFonts w:asciiTheme="majorHAnsi" w:eastAsiaTheme="majorEastAsia" w:hAnsiTheme="majorHAnsi" w:cstheme="majorBidi"/>
       <w:spacing w:val="-10"/>
@@ -24889,7 +24951,7 @@
     <w:link w:val="SubttuloChar"/>
     <w:uiPriority w:val="11"/>
     <w:qFormat/>
-    <w:rsid w:val="005C1A20"/>
+    <w:rsid w:val="00A30922"/>
     <w:pPr>
       <w:numPr>
         <w:ilvl w:val="1"/>
@@ -24908,7 +24970,7 @@
     <w:basedOn w:val="Fontepargpadro"/>
     <w:link w:val="Subttulo"/>
     <w:uiPriority w:val="11"/>
-    <w:rsid w:val="005C1A20"/>
+    <w:rsid w:val="00A30922"/>
     <w:rPr>
       <w:rFonts w:eastAsiaTheme="majorEastAsia" w:cstheme="majorBidi"/>
       <w:color w:val="595959" w:themeColor="text1" w:themeTint="A6"/>
@@ -24924,7 +24986,7 @@
     <w:link w:val="CitaoChar"/>
     <w:uiPriority w:val="29"/>
     <w:qFormat/>
-    <w:rsid w:val="005C1A20"/>
+    <w:rsid w:val="00A30922"/>
     <w:pPr>
       <w:spacing w:before="160"/>
       <w:jc w:val="center"/>
@@ -24940,7 +25002,7 @@
     <w:basedOn w:val="Fontepargpadro"/>
     <w:link w:val="Citao"/>
     <w:uiPriority w:val="29"/>
-    <w:rsid w:val="005C1A20"/>
+    <w:rsid w:val="00A30922"/>
     <w:rPr>
       <w:i/>
       <w:iCs/>
@@ -24952,7 +25014,7 @@
     <w:basedOn w:val="Normal"/>
     <w:uiPriority w:val="34"/>
     <w:qFormat/>
-    <w:rsid w:val="005C1A20"/>
+    <w:rsid w:val="00A30922"/>
     <w:pPr>
       <w:ind w:left="720"/>
       <w:contextualSpacing/>
@@ -24963,7 +25025,7 @@
     <w:basedOn w:val="Fontepargpadro"/>
     <w:uiPriority w:val="21"/>
     <w:qFormat/>
-    <w:rsid w:val="005C1A20"/>
+    <w:rsid w:val="00A30922"/>
     <w:rPr>
       <w:i/>
       <w:iCs/>
@@ -24977,7 +25039,7 @@
     <w:link w:val="CitaoIntensaChar"/>
     <w:uiPriority w:val="30"/>
     <w:qFormat/>
-    <w:rsid w:val="005C1A20"/>
+    <w:rsid w:val="00A30922"/>
     <w:pPr>
       <w:pBdr>
         <w:top w:val="single" w:sz="4" w:space="10" w:color="0F4761" w:themeColor="accent1" w:themeShade="BF"/>
@@ -24998,7 +25060,7 @@
     <w:basedOn w:val="Fontepargpadro"/>
     <w:link w:val="CitaoIntensa"/>
     <w:uiPriority w:val="30"/>
-    <w:rsid w:val="005C1A20"/>
+    <w:rsid w:val="00A30922"/>
     <w:rPr>
       <w:i/>
       <w:iCs/>
@@ -25010,7 +25072,7 @@
     <w:basedOn w:val="Fontepargpadro"/>
     <w:uiPriority w:val="32"/>
     <w:qFormat/>
-    <w:rsid w:val="005C1A20"/>
+    <w:rsid w:val="00A30922"/>
     <w:rPr>
       <w:b/>
       <w:bCs/>
@@ -25025,7 +25087,7 @@
     <w:link w:val="CabealhoChar"/>
     <w:uiPriority w:val="99"/>
     <w:unhideWhenUsed/>
-    <w:rsid w:val="005C1A20"/>
+    <w:rsid w:val="00A30922"/>
     <w:pPr>
       <w:tabs>
         <w:tab w:val="center" w:pos="4252"/>
@@ -25039,7 +25101,7 @@
     <w:basedOn w:val="Fontepargpadro"/>
     <w:link w:val="Cabealho"/>
     <w:uiPriority w:val="99"/>
-    <w:rsid w:val="005C1A20"/>
+    <w:rsid w:val="00A30922"/>
   </w:style>
   <w:style w:type="paragraph" w:styleId="Rodap">
     <w:name w:val="footer"/>
@@ -25047,7 +25109,7 @@
     <w:link w:val="RodapChar"/>
     <w:uiPriority w:val="99"/>
     <w:unhideWhenUsed/>
-    <w:rsid w:val="005C1A20"/>
+    <w:rsid w:val="00A30922"/>
     <w:pPr>
       <w:tabs>
         <w:tab w:val="center" w:pos="4252"/>
@@ -25061,7 +25123,7 @@
     <w:basedOn w:val="Fontepargpadro"/>
     <w:link w:val="Rodap"/>
     <w:uiPriority w:val="99"/>
-    <w:rsid w:val="005C1A20"/>
+    <w:rsid w:val="00A30922"/>
   </w:style>
   <w:style w:type="paragraph" w:styleId="Sumrio1">
     <w:name w:val="toc 1"/>
@@ -25070,7 +25132,7 @@
     <w:autoRedefine/>
     <w:uiPriority w:val="39"/>
     <w:unhideWhenUsed/>
-    <w:rsid w:val="005C1A20"/>
+    <w:rsid w:val="00A30922"/>
     <w:pPr>
       <w:spacing w:after="100"/>
     </w:pPr>
@@ -25082,7 +25144,7 @@
     <w:autoRedefine/>
     <w:uiPriority w:val="39"/>
     <w:unhideWhenUsed/>
-    <w:rsid w:val="005C1A20"/>
+    <w:rsid w:val="00A30922"/>
     <w:pPr>
       <w:spacing w:after="100"/>
       <w:ind w:left="240"/>

</xml_diff>

<commit_message>
Adiciona resumo de tarefas e rollup de portfólio — Fase 3 (fecha a proposta de detalhamento do cronograma)
Fecha a proposta de detalhamento do cronograma com a fase opcional
que tinha ficado em aberto:

- Planejamento (Cronograma, aba 3): um resumo ao lado do botão
  "+ Adicionar linha" mostra o percentual de tarefas concluídas
  somando todos os marcos do cronograma — complementa o selo
  "Tarefas (n/m)" por marco (Fase 1) com uma leitura do projeto todo.
- Painel Executivo: nova seção "Tarefas do cronograma (portfólio)",
  com o mesmo percentual agregado de todos os projetos e em quantos
  deles existe pelo menos uma tarefa pendente — mesmo padrão de
  rollup já usado para Riscos, Custos e Entregas da EAP.

Corrigido no caminho: remover um marco com o painel de tarefas aberto
deixava a linha auxiliar (tarefas-row) órfã na tabela.

Atualiza Central de Ajuda, Manual de Uso (v2.67) e cache-busting.

Co-Authored-By: Claude Sonnet 5 <noreply@anthropic.com>
</commit_message>
<xml_diff>
--- a/Manual de Uso - Ferramenta de Gestao de Projetos.docx
+++ b/Manual de Uso - Ferramenta de Gestao de Projetos.docx
@@ -229,7 +229,7 @@
         <w:rPr>
           <w:noProof/>
         </w:rPr>
-        <w:instrText xml:space="preserve"> PAGEREF _Toc240273001 \h </w:instrText>
+        <w:instrText xml:space="preserve"> PAGEREF _Toc240274103 \h </w:instrText>
       </w:r>
       <w:r>
         <w:rPr>
@@ -290,7 +290,7 @@
         <w:rPr>
           <w:noProof/>
         </w:rPr>
-        <w:instrText xml:space="preserve"> PAGEREF _Toc240273002 \h </w:instrText>
+        <w:instrText xml:space="preserve"> PAGEREF _Toc240274104 \h </w:instrText>
       </w:r>
       <w:r>
         <w:rPr>
@@ -351,7 +351,7 @@
         <w:rPr>
           <w:noProof/>
         </w:rPr>
-        <w:instrText xml:space="preserve"> PAGEREF _Toc240273003 \h </w:instrText>
+        <w:instrText xml:space="preserve"> PAGEREF _Toc240274105 \h </w:instrText>
       </w:r>
       <w:r>
         <w:rPr>
@@ -412,7 +412,7 @@
         <w:rPr>
           <w:noProof/>
         </w:rPr>
-        <w:instrText xml:space="preserve"> PAGEREF _Toc240273004 \h </w:instrText>
+        <w:instrText xml:space="preserve"> PAGEREF _Toc240274106 \h </w:instrText>
       </w:r>
       <w:r>
         <w:rPr>
@@ -429,7 +429,7 @@
         <w:rPr>
           <w:noProof/>
         </w:rPr>
-        <w:t>18</w:t>
+        <w:t>19</w:t>
       </w:r>
       <w:r>
         <w:rPr>
@@ -473,7 +473,7 @@
         <w:rPr>
           <w:noProof/>
         </w:rPr>
-        <w:instrText xml:space="preserve"> PAGEREF _Toc240273005 \h </w:instrText>
+        <w:instrText xml:space="preserve"> PAGEREF _Toc240274107 \h </w:instrText>
       </w:r>
       <w:r>
         <w:rPr>
@@ -490,7 +490,7 @@
         <w:rPr>
           <w:noProof/>
         </w:rPr>
-        <w:t>19</w:t>
+        <w:t>20</w:t>
       </w:r>
       <w:r>
         <w:rPr>
@@ -534,7 +534,7 @@
         <w:rPr>
           <w:noProof/>
         </w:rPr>
-        <w:instrText xml:space="preserve"> PAGEREF _Toc240273006 \h </w:instrText>
+        <w:instrText xml:space="preserve"> PAGEREF _Toc240274108 \h </w:instrText>
       </w:r>
       <w:r>
         <w:rPr>
@@ -595,7 +595,7 @@
         <w:rPr>
           <w:noProof/>
         </w:rPr>
-        <w:instrText xml:space="preserve"> PAGEREF _Toc240273007 \h </w:instrText>
+        <w:instrText xml:space="preserve"> PAGEREF _Toc240274109 \h </w:instrText>
       </w:r>
       <w:r>
         <w:rPr>
@@ -656,7 +656,7 @@
         <w:rPr>
           <w:noProof/>
         </w:rPr>
-        <w:instrText xml:space="preserve"> PAGEREF _Toc240273008 \h </w:instrText>
+        <w:instrText xml:space="preserve"> PAGEREF _Toc240274110 \h </w:instrText>
       </w:r>
       <w:r>
         <w:rPr>
@@ -717,7 +717,7 @@
         <w:rPr>
           <w:noProof/>
         </w:rPr>
-        <w:instrText xml:space="preserve"> PAGEREF _Toc240273009 \h </w:instrText>
+        <w:instrText xml:space="preserve"> PAGEREF _Toc240274111 \h </w:instrText>
       </w:r>
       <w:r>
         <w:rPr>
@@ -778,7 +778,7 @@
         <w:rPr>
           <w:noProof/>
         </w:rPr>
-        <w:instrText xml:space="preserve"> PAGEREF _Toc240273010 \h </w:instrText>
+        <w:instrText xml:space="preserve"> PAGEREF _Toc240274112 \h </w:instrText>
       </w:r>
       <w:r>
         <w:rPr>
@@ -839,7 +839,7 @@
         <w:rPr>
           <w:noProof/>
         </w:rPr>
-        <w:instrText xml:space="preserve"> PAGEREF _Toc240273011 \h </w:instrText>
+        <w:instrText xml:space="preserve"> PAGEREF _Toc240274113 \h </w:instrText>
       </w:r>
       <w:r>
         <w:rPr>
@@ -900,7 +900,7 @@
         <w:rPr>
           <w:noProof/>
         </w:rPr>
-        <w:instrText xml:space="preserve"> PAGEREF _Toc240273012 \h </w:instrText>
+        <w:instrText xml:space="preserve"> PAGEREF _Toc240274114 \h </w:instrText>
       </w:r>
       <w:r>
         <w:rPr>
@@ -961,7 +961,7 @@
         <w:rPr>
           <w:noProof/>
         </w:rPr>
-        <w:instrText xml:space="preserve"> PAGEREF _Toc240273013 \h </w:instrText>
+        <w:instrText xml:space="preserve"> PAGEREF _Toc240274115 \h </w:instrText>
       </w:r>
       <w:r>
         <w:rPr>
@@ -1022,7 +1022,7 @@
         <w:rPr>
           <w:noProof/>
         </w:rPr>
-        <w:instrText xml:space="preserve"> PAGEREF _Toc240273014 \h </w:instrText>
+        <w:instrText xml:space="preserve"> PAGEREF _Toc240274116 \h </w:instrText>
       </w:r>
       <w:r>
         <w:rPr>
@@ -1083,7 +1083,7 @@
         <w:rPr>
           <w:noProof/>
         </w:rPr>
-        <w:instrText xml:space="preserve"> PAGEREF _Toc240273015 \h </w:instrText>
+        <w:instrText xml:space="preserve"> PAGEREF _Toc240274117 \h </w:instrText>
       </w:r>
       <w:r>
         <w:rPr>
@@ -1144,7 +1144,7 @@
         <w:rPr>
           <w:noProof/>
         </w:rPr>
-        <w:instrText xml:space="preserve"> PAGEREF _Toc240273016 \h </w:instrText>
+        <w:instrText xml:space="preserve"> PAGEREF _Toc240274118 \h </w:instrText>
       </w:r>
       <w:r>
         <w:rPr>
@@ -1205,7 +1205,7 @@
         <w:rPr>
           <w:noProof/>
         </w:rPr>
-        <w:instrText xml:space="preserve"> PAGEREF _Toc240273017 \h </w:instrText>
+        <w:instrText xml:space="preserve"> PAGEREF _Toc240274119 \h </w:instrText>
       </w:r>
       <w:r>
         <w:rPr>
@@ -1266,7 +1266,7 @@
         <w:rPr>
           <w:noProof/>
         </w:rPr>
-        <w:instrText xml:space="preserve"> PAGEREF _Toc240273018 \h </w:instrText>
+        <w:instrText xml:space="preserve"> PAGEREF _Toc240274120 \h </w:instrText>
       </w:r>
       <w:r>
         <w:rPr>
@@ -1327,7 +1327,7 @@
         <w:rPr>
           <w:noProof/>
         </w:rPr>
-        <w:instrText xml:space="preserve"> PAGEREF _Toc240273019 \h </w:instrText>
+        <w:instrText xml:space="preserve"> PAGEREF _Toc240274121 \h </w:instrText>
       </w:r>
       <w:r>
         <w:rPr>
@@ -1388,7 +1388,7 @@
         <w:rPr>
           <w:noProof/>
         </w:rPr>
-        <w:instrText xml:space="preserve"> PAGEREF _Toc240273020 \h </w:instrText>
+        <w:instrText xml:space="preserve"> PAGEREF _Toc240274122 \h </w:instrText>
       </w:r>
       <w:r>
         <w:rPr>
@@ -1449,7 +1449,7 @@
         <w:rPr>
           <w:noProof/>
         </w:rPr>
-        <w:instrText xml:space="preserve"> PAGEREF _Toc240273021 \h </w:instrText>
+        <w:instrText xml:space="preserve"> PAGEREF _Toc240274123 \h </w:instrText>
       </w:r>
       <w:r>
         <w:rPr>
@@ -1510,7 +1510,7 @@
         <w:rPr>
           <w:noProof/>
         </w:rPr>
-        <w:instrText xml:space="preserve"> PAGEREF _Toc240273022 \h </w:instrText>
+        <w:instrText xml:space="preserve"> PAGEREF _Toc240274124 \h </w:instrText>
       </w:r>
       <w:r>
         <w:rPr>
@@ -1571,7 +1571,7 @@
         <w:rPr>
           <w:noProof/>
         </w:rPr>
-        <w:instrText xml:space="preserve"> PAGEREF _Toc240273023 \h </w:instrText>
+        <w:instrText xml:space="preserve"> PAGEREF _Toc240274125 \h </w:instrText>
       </w:r>
       <w:r>
         <w:rPr>
@@ -1632,7 +1632,7 @@
         <w:rPr>
           <w:noProof/>
         </w:rPr>
-        <w:instrText xml:space="preserve"> PAGEREF _Toc240273024 \h </w:instrText>
+        <w:instrText xml:space="preserve"> PAGEREF _Toc240274126 \h </w:instrText>
       </w:r>
       <w:r>
         <w:rPr>
@@ -1693,7 +1693,7 @@
         <w:rPr>
           <w:noProof/>
         </w:rPr>
-        <w:instrText xml:space="preserve"> PAGEREF _Toc240273025 \h </w:instrText>
+        <w:instrText xml:space="preserve"> PAGEREF _Toc240274127 \h </w:instrText>
       </w:r>
       <w:r>
         <w:rPr>
@@ -1755,7 +1755,7 @@
         <w:rPr>
           <w:noProof/>
         </w:rPr>
-        <w:instrText xml:space="preserve"> PAGEREF _Toc240273026 \h </w:instrText>
+        <w:instrText xml:space="preserve"> PAGEREF _Toc240274128 \h </w:instrText>
       </w:r>
       <w:r>
         <w:rPr>
@@ -1816,7 +1816,7 @@
         <w:rPr>
           <w:noProof/>
         </w:rPr>
-        <w:instrText xml:space="preserve"> PAGEREF _Toc240273027 \h </w:instrText>
+        <w:instrText xml:space="preserve"> PAGEREF _Toc240274129 \h </w:instrText>
       </w:r>
       <w:r>
         <w:rPr>
@@ -1877,7 +1877,7 @@
         <w:rPr>
           <w:noProof/>
         </w:rPr>
-        <w:instrText xml:space="preserve"> PAGEREF _Toc240273028 \h </w:instrText>
+        <w:instrText xml:space="preserve"> PAGEREF _Toc240274130 \h </w:instrText>
       </w:r>
       <w:r>
         <w:rPr>
@@ -1938,7 +1938,7 @@
         <w:rPr>
           <w:noProof/>
         </w:rPr>
-        <w:instrText xml:space="preserve"> PAGEREF _Toc240273029 \h </w:instrText>
+        <w:instrText xml:space="preserve"> PAGEREF _Toc240274131 \h </w:instrText>
       </w:r>
       <w:r>
         <w:rPr>
@@ -1999,7 +1999,7 @@
         <w:rPr>
           <w:noProof/>
         </w:rPr>
-        <w:instrText xml:space="preserve"> PAGEREF _Toc240273030 \h </w:instrText>
+        <w:instrText xml:space="preserve"> PAGEREF _Toc240274132 \h </w:instrText>
       </w:r>
       <w:r>
         <w:rPr>
@@ -2060,7 +2060,7 @@
         <w:rPr>
           <w:noProof/>
         </w:rPr>
-        <w:instrText xml:space="preserve"> PAGEREF _Toc240273031 \h </w:instrText>
+        <w:instrText xml:space="preserve"> PAGEREF _Toc240274133 \h </w:instrText>
       </w:r>
       <w:r>
         <w:rPr>
@@ -2121,7 +2121,7 @@
         <w:rPr>
           <w:noProof/>
         </w:rPr>
-        <w:instrText xml:space="preserve"> PAGEREF _Toc240273032 \h </w:instrText>
+        <w:instrText xml:space="preserve"> PAGEREF _Toc240274134 \h </w:instrText>
       </w:r>
       <w:r>
         <w:rPr>
@@ -2182,7 +2182,7 @@
         <w:rPr>
           <w:noProof/>
         </w:rPr>
-        <w:instrText xml:space="preserve"> PAGEREF _Toc240273033 \h </w:instrText>
+        <w:instrText xml:space="preserve"> PAGEREF _Toc240274135 \h </w:instrText>
       </w:r>
       <w:r>
         <w:rPr>
@@ -2243,7 +2243,7 @@
         <w:rPr>
           <w:noProof/>
         </w:rPr>
-        <w:instrText xml:space="preserve"> PAGEREF _Toc240273034 \h </w:instrText>
+        <w:instrText xml:space="preserve"> PAGEREF _Toc240274136 \h </w:instrText>
       </w:r>
       <w:r>
         <w:rPr>
@@ -2304,7 +2304,7 @@
         <w:rPr>
           <w:noProof/>
         </w:rPr>
-        <w:instrText xml:space="preserve"> PAGEREF _Toc240273035 \h </w:instrText>
+        <w:instrText xml:space="preserve"> PAGEREF _Toc240274137 \h </w:instrText>
       </w:r>
       <w:r>
         <w:rPr>
@@ -2365,7 +2365,7 @@
         <w:rPr>
           <w:noProof/>
         </w:rPr>
-        <w:instrText xml:space="preserve"> PAGEREF _Toc240273036 \h </w:instrText>
+        <w:instrText xml:space="preserve"> PAGEREF _Toc240274138 \h </w:instrText>
       </w:r>
       <w:r>
         <w:rPr>
@@ -2426,7 +2426,7 @@
         <w:rPr>
           <w:noProof/>
         </w:rPr>
-        <w:instrText xml:space="preserve"> PAGEREF _Toc240273037 \h </w:instrText>
+        <w:instrText xml:space="preserve"> PAGEREF _Toc240274139 \h </w:instrText>
       </w:r>
       <w:r>
         <w:rPr>
@@ -2487,7 +2487,7 @@
         <w:rPr>
           <w:noProof/>
         </w:rPr>
-        <w:instrText xml:space="preserve"> PAGEREF _Toc240273038 \h </w:instrText>
+        <w:instrText xml:space="preserve"> PAGEREF _Toc240274140 \h </w:instrText>
       </w:r>
       <w:r>
         <w:rPr>
@@ -2548,7 +2548,7 @@
         <w:rPr>
           <w:noProof/>
         </w:rPr>
-        <w:instrText xml:space="preserve"> PAGEREF _Toc240273039 \h </w:instrText>
+        <w:instrText xml:space="preserve"> PAGEREF _Toc240274141 \h </w:instrText>
       </w:r>
       <w:r>
         <w:rPr>
@@ -2609,7 +2609,7 @@
         <w:rPr>
           <w:noProof/>
         </w:rPr>
-        <w:instrText xml:space="preserve"> PAGEREF _Toc240273040 \h </w:instrText>
+        <w:instrText xml:space="preserve"> PAGEREF _Toc240274142 \h </w:instrText>
       </w:r>
       <w:r>
         <w:rPr>
@@ -2670,7 +2670,7 @@
         <w:rPr>
           <w:noProof/>
         </w:rPr>
-        <w:instrText xml:space="preserve"> PAGEREF _Toc240273041 \h </w:instrText>
+        <w:instrText xml:space="preserve"> PAGEREF _Toc240274143 \h </w:instrText>
       </w:r>
       <w:r>
         <w:rPr>
@@ -2731,7 +2731,7 @@
         <w:rPr>
           <w:noProof/>
         </w:rPr>
-        <w:instrText xml:space="preserve"> PAGEREF _Toc240273042 \h </w:instrText>
+        <w:instrText xml:space="preserve"> PAGEREF _Toc240274144 \h </w:instrText>
       </w:r>
       <w:r>
         <w:rPr>
@@ -2792,7 +2792,7 @@
         <w:rPr>
           <w:noProof/>
         </w:rPr>
-        <w:instrText xml:space="preserve"> PAGEREF _Toc240273043 \h </w:instrText>
+        <w:instrText xml:space="preserve"> PAGEREF _Toc240274145 \h </w:instrText>
       </w:r>
       <w:r>
         <w:rPr>
@@ -2853,7 +2853,7 @@
         <w:rPr>
           <w:noProof/>
         </w:rPr>
-        <w:instrText xml:space="preserve"> PAGEREF _Toc240273044 \h </w:instrText>
+        <w:instrText xml:space="preserve"> PAGEREF _Toc240274146 \h </w:instrText>
       </w:r>
       <w:r>
         <w:rPr>
@@ -2914,7 +2914,7 @@
         <w:rPr>
           <w:noProof/>
         </w:rPr>
-        <w:instrText xml:space="preserve"> PAGEREF _Toc240273045 \h </w:instrText>
+        <w:instrText xml:space="preserve"> PAGEREF _Toc240274147 \h </w:instrText>
       </w:r>
       <w:r>
         <w:rPr>
@@ -2975,7 +2975,7 @@
         <w:rPr>
           <w:noProof/>
         </w:rPr>
-        <w:instrText xml:space="preserve"> PAGEREF _Toc240273046 \h </w:instrText>
+        <w:instrText xml:space="preserve"> PAGEREF _Toc240274148 \h </w:instrText>
       </w:r>
       <w:r>
         <w:rPr>
@@ -3036,7 +3036,7 @@
         <w:rPr>
           <w:noProof/>
         </w:rPr>
-        <w:instrText xml:space="preserve"> PAGEREF _Toc240273047 \h </w:instrText>
+        <w:instrText xml:space="preserve"> PAGEREF _Toc240274149 \h </w:instrText>
       </w:r>
       <w:r>
         <w:rPr>
@@ -3097,7 +3097,7 @@
         <w:rPr>
           <w:noProof/>
         </w:rPr>
-        <w:instrText xml:space="preserve"> PAGEREF _Toc240273048 \h </w:instrText>
+        <w:instrText xml:space="preserve"> PAGEREF _Toc240274150 \h </w:instrText>
       </w:r>
       <w:r>
         <w:rPr>
@@ -3173,7 +3173,7 @@
           <w:sz w:val="34"/>
         </w:rPr>
       </w:pPr>
-      <w:bookmarkStart w:id="0" w:name="_Toc240273001"/>
+      <w:bookmarkStart w:id="0" w:name="_Toc240274103"/>
       <w:r>
         <w:rPr>
           <w:rFonts w:ascii="Montserrat" w:hAnsi="Montserrat"/>
@@ -3197,7 +3197,7 @@
           <w:sz w:val="27"/>
         </w:rPr>
       </w:pPr>
-      <w:bookmarkStart w:id="1" w:name="_Toc240273002"/>
+      <w:bookmarkStart w:id="1" w:name="_Toc240274104"/>
       <w:r>
         <w:rPr>
           <w:rFonts w:ascii="Montserrat" w:hAnsi="Montserrat"/>
@@ -4557,6 +4557,24 @@
           <w:color w:val="1A1A1A"/>
           <w:sz w:val="22"/>
         </w:rPr>
+        <w:t>Esta e a versao 2.67 do manual. Em relacao a versao 2.66 (14/09/2026), a Fase 3 (opcional) fecha de vez a proposta de detalhamento do cronograma: a tabela de Cronograma do Planejamento (Passo 4, aba 3) ganhou um resumo do percentual de tarefas concluidas somando todos os marcos, ao lado do botao + Adicionar linha, e o Painel Executivo (secao 6.4) ganhou a secao Tarefas do cronograma (portfolio), com o mesmo percentual agregado de todos os projetos e em quantos deles existe pelo menos uma tarefa pendente.</w:t>
+      </w:r>
+    </w:p>
+    <w:p>
+      <w:pPr>
+        <w:spacing w:line="280" w:lineRule="auto"/>
+        <w:rPr>
+          <w:rFonts w:ascii="Montserrat" w:hAnsi="Montserrat"/>
+          <w:color w:val="1A1A1A"/>
+          <w:sz w:val="22"/>
+        </w:rPr>
+      </w:pPr>
+      <w:r>
+        <w:rPr>
+          <w:rFonts w:ascii="Montserrat" w:hAnsi="Montserrat"/>
+          <w:color w:val="1A1A1A"/>
+          <w:sz w:val="22"/>
+        </w:rPr>
         <w:t>O manual nao substitui as Diretrizes para a Gestao de Projetos da UNIALFA (documento institucional que define o framework D01 a D07) nem o documento Regras de Acesso e Permissoes (que detalha cada regra de controle de acesso); ele e o guia operacional de como usar cada ferramenta na pratica.</w:t>
       </w:r>
     </w:p>
@@ -4571,7 +4589,7 @@
           <w:sz w:val="27"/>
         </w:rPr>
       </w:pPr>
-      <w:bookmarkStart w:id="2" w:name="_Toc240273003"/>
+      <w:bookmarkStart w:id="2" w:name="_Toc240274105"/>
       <w:r>
         <w:rPr>
           <w:rFonts w:ascii="Montserrat" w:hAnsi="Montserrat"/>
@@ -4670,6 +4688,7 @@
           <w:color w:val="1A1A1A"/>
           <w:sz w:val="22"/>
         </w:rPr>
+        <w:lastRenderedPageBreak/>
         <w:t>1 pagina de Administracao, restrita a Admin, para gerenciar usuarios, equipes e configuracoes do sistema.</w:t>
       </w:r>
     </w:p>
@@ -4736,7 +4755,6 @@
           <w:color w:val="1A1A1A"/>
           <w:sz w:val="22"/>
         </w:rPr>
-        <w:lastRenderedPageBreak/>
         <w:t>Cada formulario de registro tem duas partes: uma tela de preenchimento (+Novo...) e uma tela de consulta (...cadastrados), onde ficam listados todos os registros ja salvos, com opcao de abrir, editar o status ou excluir cada um.</w:t>
       </w:r>
     </w:p>
@@ -4768,16 +4786,16 @@
           <w:noProof/>
         </w:rPr>
         <w:drawing>
-          <wp:inline distT="0" distB="0" distL="0" distR="0" wp14:anchorId="7E328FCC" wp14:editId="1886E558">
+          <wp:inline distT="0" distB="0" distL="0" distR="0" wp14:anchorId="36376B64" wp14:editId="280E5290">
             <wp:extent cx="5303520" cy="4792851"/>
             <wp:effectExtent l="19050" t="19050" r="11430" b="27305"/>
-            <wp:docPr id="1259996565" name="Imagem 1"/>
+            <wp:docPr id="1583428360" name="Imagem 1"/>
             <wp:cNvGraphicFramePr/>
             <a:graphic xmlns:a="http://schemas.openxmlformats.org/drawingml/2006/main">
               <a:graphicData uri="http://schemas.openxmlformats.org/drawingml/2006/picture">
                 <pic:pic xmlns:pic="http://schemas.openxmlformats.org/drawingml/2006/picture">
                   <pic:nvPicPr>
-                    <pic:cNvPr id="1259996565" name=""/>
+                    <pic:cNvPr id="1583428360" name=""/>
                     <pic:cNvPicPr/>
                   </pic:nvPicPr>
                   <pic:blipFill>
@@ -4845,7 +4863,7 @@
           <w:sz w:val="27"/>
         </w:rPr>
       </w:pPr>
-      <w:bookmarkStart w:id="3" w:name="_Toc240273004"/>
+      <w:bookmarkStart w:id="3" w:name="_Toc240274106"/>
       <w:r>
         <w:rPr>
           <w:rFonts w:ascii="Montserrat" w:hAnsi="Montserrat"/>
@@ -4853,6 +4871,7 @@
           <w:color w:val="B91D2E"/>
           <w:sz w:val="27"/>
         </w:rPr>
+        <w:lastRenderedPageBreak/>
         <w:t>1.3 Como acessar e fazer login</w:t>
       </w:r>
       <w:bookmarkEnd w:id="3"/>
@@ -4884,18 +4903,17 @@
         <w:rPr>
           <w:noProof/>
         </w:rPr>
-        <w:lastRenderedPageBreak/>
         <w:drawing>
-          <wp:inline distT="0" distB="0" distL="0" distR="0" wp14:anchorId="421E09B6" wp14:editId="77C5B73A">
+          <wp:inline distT="0" distB="0" distL="0" distR="0" wp14:anchorId="147F1A92" wp14:editId="09D8FEC8">
             <wp:extent cx="4206240" cy="3801227"/>
             <wp:effectExtent l="19050" t="19050" r="22860" b="27940"/>
-            <wp:docPr id="250181409" name="Imagem 2"/>
+            <wp:docPr id="621358444" name="Imagem 2"/>
             <wp:cNvGraphicFramePr/>
             <a:graphic xmlns:a="http://schemas.openxmlformats.org/drawingml/2006/main">
               <a:graphicData uri="http://schemas.openxmlformats.org/drawingml/2006/picture">
                 <pic:pic xmlns:pic="http://schemas.openxmlformats.org/drawingml/2006/picture">
                   <pic:nvPicPr>
-                    <pic:cNvPr id="250181409" name=""/>
+                    <pic:cNvPr id="621358444" name=""/>
                     <pic:cNvPicPr/>
                   </pic:nvPicPr>
                   <pic:blipFill>
@@ -5068,7 +5086,7 @@
           <w:sz w:val="27"/>
         </w:rPr>
       </w:pPr>
-      <w:bookmarkStart w:id="4" w:name="_Toc240273005"/>
+      <w:bookmarkStart w:id="4" w:name="_Toc240274107"/>
       <w:r>
         <w:rPr>
           <w:rFonts w:ascii="Montserrat" w:hAnsi="Montserrat"/>
@@ -5076,6 +5094,7 @@
           <w:color w:val="B91D2E"/>
           <w:sz w:val="27"/>
         </w:rPr>
+        <w:lastRenderedPageBreak/>
         <w:t>1.4 Como a ferramenta se relaciona com as Diretrizes (D01-D07)</w:t>
       </w:r>
       <w:bookmarkEnd w:id="4"/>
@@ -5150,7 +5169,6 @@
                 <w:color w:val="FFFFFF"/>
                 <w:sz w:val="19"/>
               </w:rPr>
-              <w:lastRenderedPageBreak/>
               <w:t>Passo</w:t>
             </w:r>
           </w:p>
@@ -6307,7 +6325,7 @@
           <w:sz w:val="34"/>
         </w:rPr>
       </w:pPr>
-      <w:bookmarkStart w:id="5" w:name="_Toc240273006"/>
+      <w:bookmarkStart w:id="5" w:name="_Toc240274108"/>
       <w:r>
         <w:rPr>
           <w:rFonts w:ascii="Montserrat" w:hAnsi="Montserrat"/>
@@ -6331,7 +6349,7 @@
           <w:sz w:val="27"/>
         </w:rPr>
       </w:pPr>
-      <w:bookmarkStart w:id="6" w:name="_Toc240273007"/>
+      <w:bookmarkStart w:id="6" w:name="_Toc240274109"/>
       <w:r>
         <w:rPr>
           <w:rFonts w:ascii="Montserrat" w:hAnsi="Montserrat"/>
@@ -6372,7 +6390,7 @@
           <w:sz w:val="27"/>
         </w:rPr>
       </w:pPr>
-      <w:bookmarkStart w:id="7" w:name="_Toc240273008"/>
+      <w:bookmarkStart w:id="7" w:name="_Toc240274110"/>
       <w:r>
         <w:rPr>
           <w:rFonts w:ascii="Montserrat" w:hAnsi="Montserrat"/>
@@ -6491,7 +6509,7 @@
           <w:sz w:val="27"/>
         </w:rPr>
       </w:pPr>
-      <w:bookmarkStart w:id="8" w:name="_Toc240273009"/>
+      <w:bookmarkStart w:id="8" w:name="_Toc240274111"/>
       <w:r>
         <w:rPr>
           <w:rFonts w:ascii="Montserrat" w:hAnsi="Montserrat"/>
@@ -7104,7 +7122,7 @@
           <w:sz w:val="27"/>
         </w:rPr>
       </w:pPr>
-      <w:bookmarkStart w:id="9" w:name="_Toc240273010"/>
+      <w:bookmarkStart w:id="9" w:name="_Toc240274112"/>
       <w:r>
         <w:rPr>
           <w:rFonts w:ascii="Montserrat" w:hAnsi="Montserrat"/>
@@ -7193,16 +7211,16 @@
         </w:rPr>
         <w:lastRenderedPageBreak/>
         <w:drawing>
-          <wp:inline distT="0" distB="0" distL="0" distR="0" wp14:anchorId="205DB4F4" wp14:editId="4DDE0005">
+          <wp:inline distT="0" distB="0" distL="0" distR="0" wp14:anchorId="18EFAF1C" wp14:editId="1EEDB83C">
             <wp:extent cx="4937760" cy="4462310"/>
             <wp:effectExtent l="19050" t="19050" r="15240" b="14605"/>
-            <wp:docPr id="3391484" name="Imagem 3"/>
+            <wp:docPr id="1383274013" name="Imagem 3"/>
             <wp:cNvGraphicFramePr/>
             <a:graphic xmlns:a="http://schemas.openxmlformats.org/drawingml/2006/main">
               <a:graphicData uri="http://schemas.openxmlformats.org/drawingml/2006/picture">
                 <pic:pic xmlns:pic="http://schemas.openxmlformats.org/drawingml/2006/picture">
                   <pic:nvPicPr>
-                    <pic:cNvPr id="3391484" name=""/>
+                    <pic:cNvPr id="1383274013" name=""/>
                     <pic:cNvPicPr/>
                   </pic:nvPicPr>
                   <pic:blipFill>
@@ -7270,7 +7288,7 @@
           <w:sz w:val="27"/>
         </w:rPr>
       </w:pPr>
-      <w:bookmarkStart w:id="10" w:name="_Toc240273011"/>
+      <w:bookmarkStart w:id="10" w:name="_Toc240274113"/>
       <w:r>
         <w:rPr>
           <w:rFonts w:ascii="Montserrat" w:hAnsi="Montserrat"/>
@@ -7311,16 +7329,16 @@
         </w:rPr>
         <w:lastRenderedPageBreak/>
         <w:drawing>
-          <wp:inline distT="0" distB="0" distL="0" distR="0" wp14:anchorId="384FD3B0" wp14:editId="356F31F0">
+          <wp:inline distT="0" distB="0" distL="0" distR="0" wp14:anchorId="5E800777" wp14:editId="7989DAD1">
             <wp:extent cx="5120640" cy="4627581"/>
             <wp:effectExtent l="19050" t="19050" r="22860" b="20955"/>
-            <wp:docPr id="1588117104" name="Imagem 4"/>
+            <wp:docPr id="1893630054" name="Imagem 4"/>
             <wp:cNvGraphicFramePr/>
             <a:graphic xmlns:a="http://schemas.openxmlformats.org/drawingml/2006/main">
               <a:graphicData uri="http://schemas.openxmlformats.org/drawingml/2006/picture">
                 <pic:pic xmlns:pic="http://schemas.openxmlformats.org/drawingml/2006/picture">
                   <pic:nvPicPr>
-                    <pic:cNvPr id="1588117104" name=""/>
+                    <pic:cNvPr id="1893630054" name=""/>
                     <pic:cNvPicPr/>
                   </pic:nvPicPr>
                   <pic:blipFill>
@@ -7488,7 +7506,7 @@
           <w:sz w:val="27"/>
         </w:rPr>
       </w:pPr>
-      <w:bookmarkStart w:id="11" w:name="_Toc240273012"/>
+      <w:bookmarkStart w:id="11" w:name="_Toc240274114"/>
       <w:r>
         <w:rPr>
           <w:rFonts w:ascii="Montserrat" w:hAnsi="Montserrat"/>
@@ -7528,16 +7546,16 @@
           <w:noProof/>
         </w:rPr>
         <w:drawing>
-          <wp:inline distT="0" distB="0" distL="0" distR="0" wp14:anchorId="732322D7" wp14:editId="375FF84F">
+          <wp:inline distT="0" distB="0" distL="0" distR="0" wp14:anchorId="4856ED94" wp14:editId="2AEE0F98">
             <wp:extent cx="4206240" cy="3801227"/>
             <wp:effectExtent l="19050" t="19050" r="22860" b="27940"/>
-            <wp:docPr id="1941429040" name="Imagem 5"/>
+            <wp:docPr id="1385831276" name="Imagem 5"/>
             <wp:cNvGraphicFramePr/>
             <a:graphic xmlns:a="http://schemas.openxmlformats.org/drawingml/2006/main">
               <a:graphicData uri="http://schemas.openxmlformats.org/drawingml/2006/picture">
                 <pic:pic xmlns:pic="http://schemas.openxmlformats.org/drawingml/2006/picture">
                   <pic:nvPicPr>
-                    <pic:cNvPr id="1941429040" name=""/>
+                    <pic:cNvPr id="1385831276" name=""/>
                     <pic:cNvPicPr/>
                   </pic:nvPicPr>
                   <pic:blipFill>
@@ -7605,16 +7623,16 @@
         </w:rPr>
         <w:lastRenderedPageBreak/>
         <w:drawing>
-          <wp:inline distT="0" distB="0" distL="0" distR="0" wp14:anchorId="55AFEBDF" wp14:editId="4A54EEF5">
+          <wp:inline distT="0" distB="0" distL="0" distR="0" wp14:anchorId="784E56CB" wp14:editId="3A996CC2">
             <wp:extent cx="4206240" cy="3801227"/>
             <wp:effectExtent l="19050" t="19050" r="22860" b="27940"/>
-            <wp:docPr id="47580427" name="Imagem 6"/>
+            <wp:docPr id="1922985015" name="Imagem 6"/>
             <wp:cNvGraphicFramePr/>
             <a:graphic xmlns:a="http://schemas.openxmlformats.org/drawingml/2006/main">
               <a:graphicData uri="http://schemas.openxmlformats.org/drawingml/2006/picture">
                 <pic:pic xmlns:pic="http://schemas.openxmlformats.org/drawingml/2006/picture">
                   <pic:nvPicPr>
-                    <pic:cNvPr id="47580427" name=""/>
+                    <pic:cNvPr id="1922985015" name=""/>
                     <pic:cNvPicPr/>
                   </pic:nvPicPr>
                   <pic:blipFill>
@@ -7730,7 +7748,7 @@
           <w:sz w:val="27"/>
         </w:rPr>
       </w:pPr>
-      <w:bookmarkStart w:id="12" w:name="_Toc240273013"/>
+      <w:bookmarkStart w:id="12" w:name="_Toc240274115"/>
       <w:r>
         <w:rPr>
           <w:rFonts w:ascii="Montserrat" w:hAnsi="Montserrat"/>
@@ -7798,7 +7816,7 @@
           <w:sz w:val="27"/>
         </w:rPr>
       </w:pPr>
-      <w:bookmarkStart w:id="13" w:name="_Toc240273014"/>
+      <w:bookmarkStart w:id="13" w:name="_Toc240274116"/>
       <w:r>
         <w:rPr>
           <w:rFonts w:ascii="Montserrat" w:hAnsi="Montserrat"/>
@@ -8025,7 +8043,7 @@
           <w:sz w:val="27"/>
         </w:rPr>
       </w:pPr>
-      <w:bookmarkStart w:id="14" w:name="_Toc240273015"/>
+      <w:bookmarkStart w:id="14" w:name="_Toc240274117"/>
       <w:r>
         <w:rPr>
           <w:rFonts w:ascii="Montserrat" w:hAnsi="Montserrat"/>
@@ -8184,7 +8202,7 @@
           <w:sz w:val="27"/>
         </w:rPr>
       </w:pPr>
-      <w:bookmarkStart w:id="15" w:name="_Toc240273016"/>
+      <w:bookmarkStart w:id="15" w:name="_Toc240274118"/>
       <w:r>
         <w:rPr>
           <w:rFonts w:ascii="Montserrat" w:hAnsi="Montserrat"/>
@@ -8376,7 +8394,7 @@
           <w:sz w:val="27"/>
         </w:rPr>
       </w:pPr>
-      <w:bookmarkStart w:id="16" w:name="_Toc240273017"/>
+      <w:bookmarkStart w:id="16" w:name="_Toc240274119"/>
       <w:r>
         <w:rPr>
           <w:rFonts w:ascii="Montserrat" w:hAnsi="Montserrat"/>
@@ -8504,7 +8522,7 @@
           <w:sz w:val="27"/>
         </w:rPr>
       </w:pPr>
-      <w:bookmarkStart w:id="17" w:name="_Toc240273018"/>
+      <w:bookmarkStart w:id="17" w:name="_Toc240274120"/>
       <w:r>
         <w:rPr>
           <w:rFonts w:ascii="Montserrat" w:hAnsi="Montserrat"/>
@@ -8834,7 +8852,7 @@
           <w:sz w:val="27"/>
         </w:rPr>
       </w:pPr>
-      <w:bookmarkStart w:id="18" w:name="_Toc240273019"/>
+      <w:bookmarkStart w:id="18" w:name="_Toc240274121"/>
       <w:r>
         <w:rPr>
           <w:rFonts w:ascii="Montserrat" w:hAnsi="Montserrat"/>
@@ -8975,7 +8993,7 @@
           <w:sz w:val="34"/>
         </w:rPr>
       </w:pPr>
-      <w:bookmarkStart w:id="19" w:name="_Toc240273020"/>
+      <w:bookmarkStart w:id="19" w:name="_Toc240274122"/>
       <w:r>
         <w:rPr>
           <w:rFonts w:ascii="Montserrat" w:hAnsi="Montserrat"/>
@@ -9017,7 +9035,7 @@
           <w:sz w:val="27"/>
         </w:rPr>
       </w:pPr>
-      <w:bookmarkStart w:id="20" w:name="_Toc240273021"/>
+      <w:bookmarkStart w:id="20" w:name="_Toc240274123"/>
       <w:r>
         <w:rPr>
           <w:rFonts w:ascii="Montserrat" w:hAnsi="Montserrat"/>
@@ -10097,16 +10115,16 @@
         </w:rPr>
         <w:lastRenderedPageBreak/>
         <w:drawing>
-          <wp:inline distT="0" distB="0" distL="0" distR="0" wp14:anchorId="38063904" wp14:editId="670D6EC0">
+          <wp:inline distT="0" distB="0" distL="0" distR="0" wp14:anchorId="0451861E" wp14:editId="3B8267B8">
             <wp:extent cx="5120640" cy="4627581"/>
             <wp:effectExtent l="19050" t="19050" r="22860" b="20955"/>
-            <wp:docPr id="1973627620" name="Imagem 7"/>
+            <wp:docPr id="1583043190" name="Imagem 7"/>
             <wp:cNvGraphicFramePr/>
             <a:graphic xmlns:a="http://schemas.openxmlformats.org/drawingml/2006/main">
               <a:graphicData uri="http://schemas.openxmlformats.org/drawingml/2006/picture">
                 <pic:pic xmlns:pic="http://schemas.openxmlformats.org/drawingml/2006/picture">
                   <pic:nvPicPr>
-                    <pic:cNvPr id="1973627620" name=""/>
+                    <pic:cNvPr id="1583043190" name=""/>
                     <pic:cNvPicPr/>
                   </pic:nvPicPr>
                   <pic:blipFill>
@@ -10174,16 +10192,16 @@
         </w:rPr>
         <w:lastRenderedPageBreak/>
         <w:drawing>
-          <wp:inline distT="0" distB="0" distL="0" distR="0" wp14:anchorId="4C7BBC81" wp14:editId="5F134AEB">
+          <wp:inline distT="0" distB="0" distL="0" distR="0" wp14:anchorId="6030AE88" wp14:editId="4FB28D69">
             <wp:extent cx="5120640" cy="4627581"/>
             <wp:effectExtent l="19050" t="19050" r="22860" b="20955"/>
-            <wp:docPr id="2119875759" name="Imagem 8"/>
+            <wp:docPr id="7938079" name="Imagem 8"/>
             <wp:cNvGraphicFramePr/>
             <a:graphic xmlns:a="http://schemas.openxmlformats.org/drawingml/2006/main">
               <a:graphicData uri="http://schemas.openxmlformats.org/drawingml/2006/picture">
                 <pic:pic xmlns:pic="http://schemas.openxmlformats.org/drawingml/2006/picture">
                   <pic:nvPicPr>
-                    <pic:cNvPr id="2119875759" name=""/>
+                    <pic:cNvPr id="7938079" name=""/>
                     <pic:cNvPicPr/>
                   </pic:nvPicPr>
                   <pic:blipFill>
@@ -10391,7 +10409,7 @@
           <w:sz w:val="27"/>
         </w:rPr>
       </w:pPr>
-      <w:bookmarkStart w:id="21" w:name="_Toc240273022"/>
+      <w:bookmarkStart w:id="21" w:name="_Toc240274124"/>
       <w:r>
         <w:rPr>
           <w:rFonts w:ascii="Montserrat" w:hAnsi="Montserrat"/>
@@ -11316,16 +11334,16 @@
           <w:noProof/>
         </w:rPr>
         <w:drawing>
-          <wp:inline distT="0" distB="0" distL="0" distR="0" wp14:anchorId="73914A81" wp14:editId="54D07978">
+          <wp:inline distT="0" distB="0" distL="0" distR="0" wp14:anchorId="64380455" wp14:editId="47544E5E">
             <wp:extent cx="5120640" cy="4627581"/>
             <wp:effectExtent l="19050" t="19050" r="22860" b="20955"/>
-            <wp:docPr id="1426034607" name="Imagem 9"/>
+            <wp:docPr id="1788256600" name="Imagem 9"/>
             <wp:cNvGraphicFramePr/>
             <a:graphic xmlns:a="http://schemas.openxmlformats.org/drawingml/2006/main">
               <a:graphicData uri="http://schemas.openxmlformats.org/drawingml/2006/picture">
                 <pic:pic xmlns:pic="http://schemas.openxmlformats.org/drawingml/2006/picture">
                   <pic:nvPicPr>
-                    <pic:cNvPr id="1426034607" name=""/>
+                    <pic:cNvPr id="1788256600" name=""/>
                     <pic:cNvPicPr/>
                   </pic:nvPicPr>
                   <pic:blipFill>
@@ -11393,16 +11411,16 @@
         </w:rPr>
         <w:lastRenderedPageBreak/>
         <w:drawing>
-          <wp:inline distT="0" distB="0" distL="0" distR="0" wp14:anchorId="19BFF35C" wp14:editId="3CF4176D">
+          <wp:inline distT="0" distB="0" distL="0" distR="0" wp14:anchorId="31E30CEF" wp14:editId="18E63944">
             <wp:extent cx="5120640" cy="4627581"/>
             <wp:effectExtent l="19050" t="19050" r="22860" b="20955"/>
-            <wp:docPr id="264034636" name="Imagem 10"/>
+            <wp:docPr id="997255079" name="Imagem 10"/>
             <wp:cNvGraphicFramePr/>
             <a:graphic xmlns:a="http://schemas.openxmlformats.org/drawingml/2006/main">
               <a:graphicData uri="http://schemas.openxmlformats.org/drawingml/2006/picture">
                 <pic:pic xmlns:pic="http://schemas.openxmlformats.org/drawingml/2006/picture">
                   <pic:nvPicPr>
-                    <pic:cNvPr id="264034636" name=""/>
+                    <pic:cNvPr id="997255079" name=""/>
                     <pic:cNvPicPr/>
                   </pic:nvPicPr>
                   <pic:blipFill>
@@ -11536,7 +11554,7 @@
           <w:sz w:val="27"/>
         </w:rPr>
       </w:pPr>
-      <w:bookmarkStart w:id="22" w:name="_Toc240273023"/>
+      <w:bookmarkStart w:id="22" w:name="_Toc240274125"/>
       <w:r>
         <w:rPr>
           <w:rFonts w:ascii="Montserrat" w:hAnsi="Montserrat"/>
@@ -12602,16 +12620,16 @@
           <w:noProof/>
         </w:rPr>
         <w:drawing>
-          <wp:inline distT="0" distB="0" distL="0" distR="0" wp14:anchorId="5A6FB1EA" wp14:editId="0DF0E938">
+          <wp:inline distT="0" distB="0" distL="0" distR="0" wp14:anchorId="75DC1DA1" wp14:editId="77F36441">
             <wp:extent cx="5120640" cy="3338440"/>
             <wp:effectExtent l="19050" t="19050" r="22860" b="14605"/>
-            <wp:docPr id="2071947788" name="Imagem 11"/>
+            <wp:docPr id="1497066616" name="Imagem 11"/>
             <wp:cNvGraphicFramePr/>
             <a:graphic xmlns:a="http://schemas.openxmlformats.org/drawingml/2006/main">
               <a:graphicData uri="http://schemas.openxmlformats.org/drawingml/2006/picture">
                 <pic:pic xmlns:pic="http://schemas.openxmlformats.org/drawingml/2006/picture">
                   <pic:nvPicPr>
-                    <pic:cNvPr id="2071947788" name=""/>
+                    <pic:cNvPr id="1497066616" name=""/>
                     <pic:cNvPicPr/>
                   </pic:nvPicPr>
                   <pic:blipFill>
@@ -12679,16 +12697,16 @@
         </w:rPr>
         <w:lastRenderedPageBreak/>
         <w:drawing>
-          <wp:inline distT="0" distB="0" distL="0" distR="0" wp14:anchorId="469CAD8E" wp14:editId="509EB995">
+          <wp:inline distT="0" distB="0" distL="0" distR="0" wp14:anchorId="7623D016" wp14:editId="75928151">
             <wp:extent cx="5120640" cy="4627581"/>
             <wp:effectExtent l="19050" t="19050" r="22860" b="20955"/>
-            <wp:docPr id="793886308" name="Imagem 12"/>
+            <wp:docPr id="1176866289" name="Imagem 12"/>
             <wp:cNvGraphicFramePr/>
             <a:graphic xmlns:a="http://schemas.openxmlformats.org/drawingml/2006/main">
               <a:graphicData uri="http://schemas.openxmlformats.org/drawingml/2006/picture">
                 <pic:pic xmlns:pic="http://schemas.openxmlformats.org/drawingml/2006/picture">
                   <pic:nvPicPr>
-                    <pic:cNvPr id="793886308" name=""/>
+                    <pic:cNvPr id="1176866289" name=""/>
                     <pic:cNvPicPr/>
                   </pic:nvPicPr>
                   <pic:blipFill>
@@ -12892,7 +12910,7 @@
           <w:sz w:val="27"/>
         </w:rPr>
       </w:pPr>
-      <w:bookmarkStart w:id="23" w:name="_Toc240273024"/>
+      <w:bookmarkStart w:id="23" w:name="_Toc240274126"/>
       <w:r>
         <w:rPr>
           <w:rFonts w:ascii="Montserrat" w:hAnsi="Montserrat"/>
@@ -13453,16 +13471,16 @@
           <w:noProof/>
         </w:rPr>
         <w:drawing>
-          <wp:inline distT="0" distB="0" distL="0" distR="0" wp14:anchorId="25104844" wp14:editId="78B2EAC1">
+          <wp:inline distT="0" distB="0" distL="0" distR="0" wp14:anchorId="5713F115" wp14:editId="2048A888">
             <wp:extent cx="5120640" cy="4627581"/>
             <wp:effectExtent l="19050" t="19050" r="22860" b="20955"/>
-            <wp:docPr id="1819239155" name="Imagem 13"/>
+            <wp:docPr id="160206885" name="Imagem 13"/>
             <wp:cNvGraphicFramePr/>
             <a:graphic xmlns:a="http://schemas.openxmlformats.org/drawingml/2006/main">
               <a:graphicData uri="http://schemas.openxmlformats.org/drawingml/2006/picture">
                 <pic:pic xmlns:pic="http://schemas.openxmlformats.org/drawingml/2006/picture">
                   <pic:nvPicPr>
-                    <pic:cNvPr id="1819239155" name=""/>
+                    <pic:cNvPr id="160206885" name=""/>
                     <pic:cNvPicPr/>
                   </pic:nvPicPr>
                   <pic:blipFill>
@@ -13530,16 +13548,16 @@
         </w:rPr>
         <w:lastRenderedPageBreak/>
         <w:drawing>
-          <wp:inline distT="0" distB="0" distL="0" distR="0" wp14:anchorId="39EDF35F" wp14:editId="7E068887">
+          <wp:inline distT="0" distB="0" distL="0" distR="0" wp14:anchorId="5E270B2D" wp14:editId="5108FA58">
             <wp:extent cx="5120640" cy="4627581"/>
             <wp:effectExtent l="19050" t="19050" r="22860" b="20955"/>
-            <wp:docPr id="502262728" name="Imagem 14"/>
+            <wp:docPr id="2043860408" name="Imagem 14"/>
             <wp:cNvGraphicFramePr/>
             <a:graphic xmlns:a="http://schemas.openxmlformats.org/drawingml/2006/main">
               <a:graphicData uri="http://schemas.openxmlformats.org/drawingml/2006/picture">
                 <pic:pic xmlns:pic="http://schemas.openxmlformats.org/drawingml/2006/picture">
                   <pic:nvPicPr>
-                    <pic:cNvPr id="502262728" name=""/>
+                    <pic:cNvPr id="2043860408" name=""/>
                     <pic:cNvPicPr/>
                   </pic:nvPicPr>
                   <pic:blipFill>
@@ -13752,7 +13770,7 @@
           <w:color w:val="1A1A1A"/>
           <w:sz w:val="22"/>
         </w:rPr>
-        <w:t>Tarefas dentro de um marco: quando um marco precisar de mais detalhe, o botao + Tarefas (ultima coluna da tabela) abre uma lista simples logo abaixo da linha - nome da tarefa e uma caixa de concluida, sem data ou responsavel proprios (quem tem isso e o marco). O botao muda para Tarefas (2/3), por exemplo, mostrando quantas ja foram concluidas, e fica com contorno laranja enquanto houver alguma pendente. E totalmente opcional - um marco sem nenhuma tarefa continua funcionando normalmente.</w:t>
+        <w:t>Tarefas dentro de um marco: quando um marco precisar de mais detalhe, o botao + Tarefas (ultima coluna da tabela) abre uma lista simples logo abaixo da linha - nome da tarefa e uma caixa de concluida, sem data ou responsavel proprios (quem tem isso e o marco). O botao muda para Tarefas (2/3), por exemplo, mostrando quantas ja foram concluidas, e fica com contorno laranja enquanto houver alguma pendente. E totalmente opcional - um marco sem nenhuma tarefa continua funcionando normalmente. Ao lado do botao + Adicionar linha, um resumo mostra o percentual de tarefas concluidas somando todos os marcos do cronograma.</w:t>
       </w:r>
     </w:p>
     <w:p>
@@ -13776,16 +13794,8 @@
           <w:color w:val="1A1A1A"/>
           <w:sz w:val="22"/>
         </w:rPr>
-        <w:t xml:space="preserve">Assistente de preenchimento por IA: apos selecionar o Projeto vinculado, o botao Sugerir com IA le a Solicitacao de Demanda, o TAP, o Canvas e as </w:t>
-      </w:r>
-      <w:r>
-        <w:rPr>
-          <w:rFonts w:ascii="Montserrat" w:hAnsi="Montserrat"/>
-          <w:color w:val="1A1A1A"/>
-          <w:sz w:val="22"/>
-        </w:rPr>
         <w:lastRenderedPageBreak/>
-        <w:t>Atas de Reuniao do projeto e sugere o Solicitante (capa), o preenchimento da aba Pre-projeto (incluindo Macro fases, resumidas dos entregaveis/escopo do TAP), um rascunho inicial do cronograma (aba 3, quando ainda vazio) e a Introducao/Situacao atual/Proposta de mudanca/Beneficios na aba Viabilidade. O campo Negocio (capa) fica de fora, por nao ter fonte confiavel nos documentos (secao 2.12).</w:t>
+        <w:t>Assistente de preenchimento por IA: apos selecionar o Projeto vinculado, o botao Sugerir com IA le a Solicitacao de Demanda, o TAP, o Canvas e as Atas de Reuniao do projeto e sugere o Solicitante (capa), o preenchimento da aba Pre-projeto (incluindo Macro fases, resumidas dos entregaveis/escopo do TAP), um rascunho inicial do cronograma (aba 3, quando ainda vazio) e a Introducao/Situacao atual/Proposta de mudanca/Beneficios na aba Viabilidade. O campo Negocio (capa) fica de fora, por nao ter fonte confiavel nos documentos (secao 2.12).</w:t>
       </w:r>
     </w:p>
     <w:p>
@@ -13799,7 +13809,7 @@
           <w:sz w:val="27"/>
         </w:rPr>
       </w:pPr>
-      <w:bookmarkStart w:id="24" w:name="_Toc240273025"/>
+      <w:bookmarkStart w:id="24" w:name="_Toc240274127"/>
       <w:r>
         <w:rPr>
           <w:rFonts w:ascii="Montserrat" w:hAnsi="Montserrat"/>
@@ -13839,16 +13849,16 @@
           <w:noProof/>
         </w:rPr>
         <w:drawing>
-          <wp:inline distT="0" distB="0" distL="0" distR="0" wp14:anchorId="6B73619A" wp14:editId="30151D36">
+          <wp:inline distT="0" distB="0" distL="0" distR="0" wp14:anchorId="29105E5F" wp14:editId="3C4E599A">
             <wp:extent cx="5120640" cy="4627581"/>
             <wp:effectExtent l="19050" t="19050" r="22860" b="20955"/>
-            <wp:docPr id="432038931" name="Imagem 15"/>
+            <wp:docPr id="1214562771" name="Imagem 15"/>
             <wp:cNvGraphicFramePr/>
             <a:graphic xmlns:a="http://schemas.openxmlformats.org/drawingml/2006/main">
               <a:graphicData uri="http://schemas.openxmlformats.org/drawingml/2006/picture">
                 <pic:pic xmlns:pic="http://schemas.openxmlformats.org/drawingml/2006/picture">
                   <pic:nvPicPr>
-                    <pic:cNvPr id="432038931" name=""/>
+                    <pic:cNvPr id="1214562771" name=""/>
                     <pic:cNvPicPr/>
                   </pic:nvPicPr>
                   <pic:blipFill>
@@ -13916,16 +13926,16 @@
         </w:rPr>
         <w:lastRenderedPageBreak/>
         <w:drawing>
-          <wp:inline distT="0" distB="0" distL="0" distR="0" wp14:anchorId="01939227" wp14:editId="39AC6263">
+          <wp:inline distT="0" distB="0" distL="0" distR="0" wp14:anchorId="49A9C470" wp14:editId="172E1BCF">
             <wp:extent cx="5120640" cy="4627581"/>
             <wp:effectExtent l="19050" t="19050" r="22860" b="20955"/>
-            <wp:docPr id="56770420" name="Imagem 16"/>
+            <wp:docPr id="54522264" name="Imagem 16"/>
             <wp:cNvGraphicFramePr/>
             <a:graphic xmlns:a="http://schemas.openxmlformats.org/drawingml/2006/main">
               <a:graphicData uri="http://schemas.openxmlformats.org/drawingml/2006/picture">
                 <pic:pic xmlns:pic="http://schemas.openxmlformats.org/drawingml/2006/picture">
                   <pic:nvPicPr>
-                    <pic:cNvPr id="56770420" name=""/>
+                    <pic:cNvPr id="54522264" name=""/>
                     <pic:cNvPicPr/>
                   </pic:nvPicPr>
                   <pic:blipFill>
@@ -14089,16 +14099,16 @@
         </w:rPr>
         <w:lastRenderedPageBreak/>
         <w:drawing>
-          <wp:inline distT="0" distB="0" distL="0" distR="0" wp14:anchorId="7F4D3097" wp14:editId="007C72D3">
+          <wp:inline distT="0" distB="0" distL="0" distR="0" wp14:anchorId="62A67B17" wp14:editId="7598DFBC">
             <wp:extent cx="5120640" cy="3282818"/>
             <wp:effectExtent l="19050" t="19050" r="22860" b="13335"/>
-            <wp:docPr id="1462588455" name="Imagem 17"/>
+            <wp:docPr id="1807411149" name="Imagem 17"/>
             <wp:cNvGraphicFramePr/>
             <a:graphic xmlns:a="http://schemas.openxmlformats.org/drawingml/2006/main">
               <a:graphicData uri="http://schemas.openxmlformats.org/drawingml/2006/picture">
                 <pic:pic xmlns:pic="http://schemas.openxmlformats.org/drawingml/2006/picture">
                   <pic:nvPicPr>
-                    <pic:cNvPr id="1462588455" name=""/>
+                    <pic:cNvPr id="1807411149" name=""/>
                     <pic:cNvPicPr/>
                   </pic:nvPicPr>
                   <pic:blipFill>
@@ -14289,7 +14299,7 @@
           <w:sz w:val="27"/>
         </w:rPr>
       </w:pPr>
-      <w:bookmarkStart w:id="25" w:name="_Toc240273026"/>
+      <w:bookmarkStart w:id="25" w:name="_Toc240274128"/>
       <w:r>
         <w:rPr>
           <w:rFonts w:ascii="Montserrat" w:hAnsi="Montserrat"/>
@@ -14329,16 +14339,16 @@
           <w:noProof/>
         </w:rPr>
         <w:drawing>
-          <wp:inline distT="0" distB="0" distL="0" distR="0" wp14:anchorId="7EAEF0AE" wp14:editId="74DC94B3">
+          <wp:inline distT="0" distB="0" distL="0" distR="0" wp14:anchorId="6F502C5B" wp14:editId="2D397EAA">
             <wp:extent cx="5120640" cy="4627581"/>
             <wp:effectExtent l="19050" t="19050" r="22860" b="20955"/>
-            <wp:docPr id="1993849305" name="Imagem 18"/>
+            <wp:docPr id="13754951" name="Imagem 18"/>
             <wp:cNvGraphicFramePr/>
             <a:graphic xmlns:a="http://schemas.openxmlformats.org/drawingml/2006/main">
               <a:graphicData uri="http://schemas.openxmlformats.org/drawingml/2006/picture">
                 <pic:pic xmlns:pic="http://schemas.openxmlformats.org/drawingml/2006/picture">
                   <pic:nvPicPr>
-                    <pic:cNvPr id="1993849305" name=""/>
+                    <pic:cNvPr id="13754951" name=""/>
                     <pic:cNvPicPr/>
                   </pic:nvPicPr>
                   <pic:blipFill>
@@ -14406,16 +14416,16 @@
         </w:rPr>
         <w:lastRenderedPageBreak/>
         <w:drawing>
-          <wp:inline distT="0" distB="0" distL="0" distR="0" wp14:anchorId="30EA343F" wp14:editId="35478DB9">
+          <wp:inline distT="0" distB="0" distL="0" distR="0" wp14:anchorId="46B9D86A" wp14:editId="7A7576F5">
             <wp:extent cx="5120640" cy="4627581"/>
             <wp:effectExtent l="19050" t="19050" r="22860" b="20955"/>
-            <wp:docPr id="493406443" name="Imagem 19"/>
+            <wp:docPr id="1244851144" name="Imagem 19"/>
             <wp:cNvGraphicFramePr/>
             <a:graphic xmlns:a="http://schemas.openxmlformats.org/drawingml/2006/main">
               <a:graphicData uri="http://schemas.openxmlformats.org/drawingml/2006/picture">
                 <pic:pic xmlns:pic="http://schemas.openxmlformats.org/drawingml/2006/picture">
                   <pic:nvPicPr>
-                    <pic:cNvPr id="493406443" name=""/>
+                    <pic:cNvPr id="1244851144" name=""/>
                     <pic:cNvPicPr/>
                   </pic:nvPicPr>
                   <pic:blipFill>
@@ -14598,7 +14608,7 @@
           <w:sz w:val="27"/>
         </w:rPr>
       </w:pPr>
-      <w:bookmarkStart w:id="26" w:name="_Toc240273027"/>
+      <w:bookmarkStart w:id="26" w:name="_Toc240274129"/>
       <w:r>
         <w:rPr>
           <w:rFonts w:ascii="Montserrat" w:hAnsi="Montserrat"/>
@@ -14638,16 +14648,16 @@
           <w:noProof/>
         </w:rPr>
         <w:drawing>
-          <wp:inline distT="0" distB="0" distL="0" distR="0" wp14:anchorId="73B87808" wp14:editId="370C49CF">
+          <wp:inline distT="0" distB="0" distL="0" distR="0" wp14:anchorId="5BA403AA" wp14:editId="4D8D8AF5">
             <wp:extent cx="5120640" cy="4627581"/>
             <wp:effectExtent l="19050" t="19050" r="22860" b="20955"/>
-            <wp:docPr id="768912268" name="Imagem 20"/>
+            <wp:docPr id="464430020" name="Imagem 20"/>
             <wp:cNvGraphicFramePr/>
             <a:graphic xmlns:a="http://schemas.openxmlformats.org/drawingml/2006/main">
               <a:graphicData uri="http://schemas.openxmlformats.org/drawingml/2006/picture">
                 <pic:pic xmlns:pic="http://schemas.openxmlformats.org/drawingml/2006/picture">
                   <pic:nvPicPr>
-                    <pic:cNvPr id="768912268" name=""/>
+                    <pic:cNvPr id="464430020" name=""/>
                     <pic:cNvPicPr/>
                   </pic:nvPicPr>
                   <pic:blipFill>
@@ -14715,16 +14725,16 @@
         </w:rPr>
         <w:lastRenderedPageBreak/>
         <w:drawing>
-          <wp:inline distT="0" distB="0" distL="0" distR="0" wp14:anchorId="4C2FCA84" wp14:editId="7CBE1604">
+          <wp:inline distT="0" distB="0" distL="0" distR="0" wp14:anchorId="6FD99EAB" wp14:editId="1397C59A">
             <wp:extent cx="5120640" cy="4627581"/>
             <wp:effectExtent l="19050" t="19050" r="22860" b="20955"/>
-            <wp:docPr id="641264765" name="Imagem 21"/>
+            <wp:docPr id="224077535" name="Imagem 21"/>
             <wp:cNvGraphicFramePr/>
             <a:graphic xmlns:a="http://schemas.openxmlformats.org/drawingml/2006/main">
               <a:graphicData uri="http://schemas.openxmlformats.org/drawingml/2006/picture">
                 <pic:pic xmlns:pic="http://schemas.openxmlformats.org/drawingml/2006/picture">
                   <pic:nvPicPr>
-                    <pic:cNvPr id="641264765" name=""/>
+                    <pic:cNvPr id="224077535" name=""/>
                     <pic:cNvPicPr/>
                   </pic:nvPicPr>
                   <pic:blipFill>
@@ -14930,16 +14940,16 @@
           <w:noProof/>
         </w:rPr>
         <w:drawing>
-          <wp:inline distT="0" distB="0" distL="0" distR="0" wp14:anchorId="47F29C72" wp14:editId="17FD7333">
+          <wp:inline distT="0" distB="0" distL="0" distR="0" wp14:anchorId="03AAD448" wp14:editId="53D52B48">
             <wp:extent cx="5120640" cy="1757287"/>
             <wp:effectExtent l="19050" t="19050" r="22860" b="14605"/>
-            <wp:docPr id="1267043313" name="Imagem 22"/>
+            <wp:docPr id="722778374" name="Imagem 22"/>
             <wp:cNvGraphicFramePr/>
             <a:graphic xmlns:a="http://schemas.openxmlformats.org/drawingml/2006/main">
               <a:graphicData uri="http://schemas.openxmlformats.org/drawingml/2006/picture">
                 <pic:pic xmlns:pic="http://schemas.openxmlformats.org/drawingml/2006/picture">
                   <pic:nvPicPr>
-                    <pic:cNvPr id="1267043313" name=""/>
+                    <pic:cNvPr id="722778374" name=""/>
                     <pic:cNvPicPr/>
                   </pic:nvPicPr>
                   <pic:blipFill>
@@ -15052,7 +15062,7 @@
           <w:sz w:val="27"/>
         </w:rPr>
       </w:pPr>
-      <w:bookmarkStart w:id="27" w:name="_Toc240273028"/>
+      <w:bookmarkStart w:id="27" w:name="_Toc240274130"/>
       <w:r>
         <w:rPr>
           <w:rFonts w:ascii="Montserrat" w:hAnsi="Montserrat"/>
@@ -15093,16 +15103,16 @@
         </w:rPr>
         <w:lastRenderedPageBreak/>
         <w:drawing>
-          <wp:inline distT="0" distB="0" distL="0" distR="0" wp14:anchorId="103E5D97" wp14:editId="238B8C6C">
+          <wp:inline distT="0" distB="0" distL="0" distR="0" wp14:anchorId="6FB20CDF" wp14:editId="3F5014EB">
             <wp:extent cx="5120640" cy="4627581"/>
             <wp:effectExtent l="19050" t="19050" r="22860" b="20955"/>
-            <wp:docPr id="2014002192" name="Imagem 23"/>
+            <wp:docPr id="474510234" name="Imagem 23"/>
             <wp:cNvGraphicFramePr/>
             <a:graphic xmlns:a="http://schemas.openxmlformats.org/drawingml/2006/main">
               <a:graphicData uri="http://schemas.openxmlformats.org/drawingml/2006/picture">
                 <pic:pic xmlns:pic="http://schemas.openxmlformats.org/drawingml/2006/picture">
                   <pic:nvPicPr>
-                    <pic:cNvPr id="2014002192" name=""/>
+                    <pic:cNvPr id="474510234" name=""/>
                     <pic:cNvPicPr/>
                   </pic:nvPicPr>
                   <pic:blipFill>
@@ -15170,16 +15180,16 @@
         </w:rPr>
         <w:lastRenderedPageBreak/>
         <w:drawing>
-          <wp:inline distT="0" distB="0" distL="0" distR="0" wp14:anchorId="380E062F" wp14:editId="672BA4BC">
+          <wp:inline distT="0" distB="0" distL="0" distR="0" wp14:anchorId="1CCECD48" wp14:editId="6AA47D49">
             <wp:extent cx="5120640" cy="4627581"/>
             <wp:effectExtent l="19050" t="19050" r="22860" b="20955"/>
-            <wp:docPr id="1660137531" name="Imagem 24"/>
+            <wp:docPr id="1259417313" name="Imagem 24"/>
             <wp:cNvGraphicFramePr/>
             <a:graphic xmlns:a="http://schemas.openxmlformats.org/drawingml/2006/main">
               <a:graphicData uri="http://schemas.openxmlformats.org/drawingml/2006/picture">
                 <pic:pic xmlns:pic="http://schemas.openxmlformats.org/drawingml/2006/picture">
                   <pic:nvPicPr>
-                    <pic:cNvPr id="1660137531" name=""/>
+                    <pic:cNvPr id="1259417313" name=""/>
                     <pic:cNvPicPr/>
                   </pic:nvPicPr>
                   <pic:blipFill>
@@ -15416,7 +15426,7 @@
           <w:sz w:val="27"/>
         </w:rPr>
       </w:pPr>
-      <w:bookmarkStart w:id="28" w:name="_Toc240273029"/>
+      <w:bookmarkStart w:id="28" w:name="_Toc240274131"/>
       <w:r>
         <w:rPr>
           <w:rFonts w:ascii="Montserrat" w:hAnsi="Montserrat"/>
@@ -15456,16 +15466,16 @@
           <w:noProof/>
         </w:rPr>
         <w:drawing>
-          <wp:inline distT="0" distB="0" distL="0" distR="0" wp14:anchorId="678EAF5E" wp14:editId="7136BA8E">
+          <wp:inline distT="0" distB="0" distL="0" distR="0" wp14:anchorId="22413437" wp14:editId="19E4C036">
             <wp:extent cx="5120640" cy="4627581"/>
             <wp:effectExtent l="19050" t="19050" r="22860" b="20955"/>
-            <wp:docPr id="949326298" name="Imagem 25"/>
+            <wp:docPr id="644890361" name="Imagem 25"/>
             <wp:cNvGraphicFramePr/>
             <a:graphic xmlns:a="http://schemas.openxmlformats.org/drawingml/2006/main">
               <a:graphicData uri="http://schemas.openxmlformats.org/drawingml/2006/picture">
                 <pic:pic xmlns:pic="http://schemas.openxmlformats.org/drawingml/2006/picture">
                   <pic:nvPicPr>
-                    <pic:cNvPr id="949326298" name=""/>
+                    <pic:cNvPr id="644890361" name=""/>
                     <pic:cNvPicPr/>
                   </pic:nvPicPr>
                   <pic:blipFill>
@@ -15533,16 +15543,16 @@
         </w:rPr>
         <w:lastRenderedPageBreak/>
         <w:drawing>
-          <wp:inline distT="0" distB="0" distL="0" distR="0" wp14:anchorId="7E8BB937" wp14:editId="358A002C">
+          <wp:inline distT="0" distB="0" distL="0" distR="0" wp14:anchorId="572E3438" wp14:editId="1EA06F33">
             <wp:extent cx="5120640" cy="4627581"/>
             <wp:effectExtent l="19050" t="19050" r="22860" b="20955"/>
-            <wp:docPr id="2071574274" name="Imagem 26"/>
+            <wp:docPr id="178377308" name="Imagem 26"/>
             <wp:cNvGraphicFramePr/>
             <a:graphic xmlns:a="http://schemas.openxmlformats.org/drawingml/2006/main">
               <a:graphicData uri="http://schemas.openxmlformats.org/drawingml/2006/picture">
                 <pic:pic xmlns:pic="http://schemas.openxmlformats.org/drawingml/2006/picture">
                   <pic:nvPicPr>
-                    <pic:cNvPr id="2071574274" name=""/>
+                    <pic:cNvPr id="178377308" name=""/>
                     <pic:cNvPicPr/>
                   </pic:nvPicPr>
                   <pic:blipFill>
@@ -15733,7 +15743,7 @@
           <w:sz w:val="27"/>
         </w:rPr>
       </w:pPr>
-      <w:bookmarkStart w:id="29" w:name="_Toc240273030"/>
+      <w:bookmarkStart w:id="29" w:name="_Toc240274132"/>
       <w:r>
         <w:rPr>
           <w:rFonts w:ascii="Montserrat" w:hAnsi="Montserrat"/>
@@ -15773,16 +15783,16 @@
           <w:noProof/>
         </w:rPr>
         <w:drawing>
-          <wp:inline distT="0" distB="0" distL="0" distR="0" wp14:anchorId="276FE48F" wp14:editId="737E2B6D">
+          <wp:inline distT="0" distB="0" distL="0" distR="0" wp14:anchorId="5821E253" wp14:editId="02B37B9A">
             <wp:extent cx="5120640" cy="4000682"/>
             <wp:effectExtent l="19050" t="19050" r="22860" b="19050"/>
-            <wp:docPr id="1490569739" name="Imagem 27"/>
+            <wp:docPr id="626713925" name="Imagem 27"/>
             <wp:cNvGraphicFramePr/>
             <a:graphic xmlns:a="http://schemas.openxmlformats.org/drawingml/2006/main">
               <a:graphicData uri="http://schemas.openxmlformats.org/drawingml/2006/picture">
                 <pic:pic xmlns:pic="http://schemas.openxmlformats.org/drawingml/2006/picture">
                   <pic:nvPicPr>
-                    <pic:cNvPr id="1490569739" name=""/>
+                    <pic:cNvPr id="626713925" name=""/>
                     <pic:cNvPicPr/>
                   </pic:nvPicPr>
                   <pic:blipFill>
@@ -16306,7 +16316,7 @@
           <w:sz w:val="34"/>
         </w:rPr>
       </w:pPr>
-      <w:bookmarkStart w:id="30" w:name="_Toc240273031"/>
+      <w:bookmarkStart w:id="30" w:name="_Toc240274133"/>
       <w:r>
         <w:rPr>
           <w:rFonts w:ascii="Montserrat" w:hAnsi="Montserrat"/>
@@ -16348,7 +16358,7 @@
           <w:sz w:val="27"/>
         </w:rPr>
       </w:pPr>
-      <w:bookmarkStart w:id="31" w:name="_Toc240273032"/>
+      <w:bookmarkStart w:id="31" w:name="_Toc240274134"/>
       <w:r>
         <w:rPr>
           <w:rFonts w:ascii="Montserrat" w:hAnsi="Montserrat"/>
@@ -16388,16 +16398,16 @@
           <w:noProof/>
         </w:rPr>
         <w:drawing>
-          <wp:inline distT="0" distB="0" distL="0" distR="0" wp14:anchorId="7498DE04" wp14:editId="03DB45A7">
+          <wp:inline distT="0" distB="0" distL="0" distR="0" wp14:anchorId="2E657728" wp14:editId="7C8E7B49">
             <wp:extent cx="5120640" cy="4627581"/>
             <wp:effectExtent l="19050" t="19050" r="22860" b="20955"/>
-            <wp:docPr id="1866758044" name="Imagem 28"/>
+            <wp:docPr id="693246389" name="Imagem 28"/>
             <wp:cNvGraphicFramePr/>
             <a:graphic xmlns:a="http://schemas.openxmlformats.org/drawingml/2006/main">
               <a:graphicData uri="http://schemas.openxmlformats.org/drawingml/2006/picture">
                 <pic:pic xmlns:pic="http://schemas.openxmlformats.org/drawingml/2006/picture">
                   <pic:nvPicPr>
-                    <pic:cNvPr id="1866758044" name=""/>
+                    <pic:cNvPr id="693246389" name=""/>
                     <pic:cNvPicPr/>
                   </pic:nvPicPr>
                   <pic:blipFill>
@@ -16465,16 +16475,16 @@
         </w:rPr>
         <w:lastRenderedPageBreak/>
         <w:drawing>
-          <wp:inline distT="0" distB="0" distL="0" distR="0" wp14:anchorId="3DBE1894" wp14:editId="6FA2F20D">
+          <wp:inline distT="0" distB="0" distL="0" distR="0" wp14:anchorId="4397799F" wp14:editId="34961003">
             <wp:extent cx="5120640" cy="4627581"/>
             <wp:effectExtent l="19050" t="19050" r="22860" b="20955"/>
-            <wp:docPr id="836383561" name="Imagem 29"/>
+            <wp:docPr id="2048938934" name="Imagem 29"/>
             <wp:cNvGraphicFramePr/>
             <a:graphic xmlns:a="http://schemas.openxmlformats.org/drawingml/2006/main">
               <a:graphicData uri="http://schemas.openxmlformats.org/drawingml/2006/picture">
                 <pic:pic xmlns:pic="http://schemas.openxmlformats.org/drawingml/2006/picture">
                   <pic:nvPicPr>
-                    <pic:cNvPr id="836383561" name=""/>
+                    <pic:cNvPr id="2048938934" name=""/>
                     <pic:cNvPicPr/>
                   </pic:nvPicPr>
                   <pic:blipFill>
@@ -16542,16 +16552,16 @@
         </w:rPr>
         <w:lastRenderedPageBreak/>
         <w:drawing>
-          <wp:inline distT="0" distB="0" distL="0" distR="0" wp14:anchorId="0A998001" wp14:editId="231E1A70">
+          <wp:inline distT="0" distB="0" distL="0" distR="0" wp14:anchorId="01FC8DAF" wp14:editId="21814AEB">
             <wp:extent cx="5120640" cy="4627581"/>
             <wp:effectExtent l="19050" t="19050" r="22860" b="20955"/>
-            <wp:docPr id="455794968" name="Imagem 30"/>
+            <wp:docPr id="1938740622" name="Imagem 30"/>
             <wp:cNvGraphicFramePr/>
             <a:graphic xmlns:a="http://schemas.openxmlformats.org/drawingml/2006/main">
               <a:graphicData uri="http://schemas.openxmlformats.org/drawingml/2006/picture">
                 <pic:pic xmlns:pic="http://schemas.openxmlformats.org/drawingml/2006/picture">
                   <pic:nvPicPr>
-                    <pic:cNvPr id="455794968" name=""/>
+                    <pic:cNvPr id="1938740622" name=""/>
                     <pic:cNvPicPr/>
                   </pic:nvPicPr>
                   <pic:blipFill>
@@ -16753,16 +16763,16 @@
           <w:noProof/>
         </w:rPr>
         <w:drawing>
-          <wp:inline distT="0" distB="0" distL="0" distR="0" wp14:anchorId="1882B780" wp14:editId="16485963">
+          <wp:inline distT="0" distB="0" distL="0" distR="0" wp14:anchorId="474AE071" wp14:editId="67191DBA">
             <wp:extent cx="5120640" cy="1715571"/>
             <wp:effectExtent l="19050" t="19050" r="22860" b="18415"/>
-            <wp:docPr id="1365738868" name="Imagem 31"/>
+            <wp:docPr id="934688444" name="Imagem 31"/>
             <wp:cNvGraphicFramePr/>
             <a:graphic xmlns:a="http://schemas.openxmlformats.org/drawingml/2006/main">
               <a:graphicData uri="http://schemas.openxmlformats.org/drawingml/2006/picture">
                 <pic:pic xmlns:pic="http://schemas.openxmlformats.org/drawingml/2006/picture">
                   <pic:nvPicPr>
-                    <pic:cNvPr id="1365738868" name=""/>
+                    <pic:cNvPr id="934688444" name=""/>
                     <pic:cNvPicPr/>
                   </pic:nvPicPr>
                   <pic:blipFill>
@@ -16899,16 +16909,16 @@
           <w:noProof/>
         </w:rPr>
         <w:drawing>
-          <wp:inline distT="0" distB="0" distL="0" distR="0" wp14:anchorId="3E9D55F9" wp14:editId="427E6621">
+          <wp:inline distT="0" distB="0" distL="0" distR="0" wp14:anchorId="346E724E" wp14:editId="068EFD47">
             <wp:extent cx="5120640" cy="3282818"/>
             <wp:effectExtent l="19050" t="19050" r="22860" b="13335"/>
-            <wp:docPr id="1561426651" name="Imagem 32"/>
+            <wp:docPr id="801260604" name="Imagem 32"/>
             <wp:cNvGraphicFramePr/>
             <a:graphic xmlns:a="http://schemas.openxmlformats.org/drawingml/2006/main">
               <a:graphicData uri="http://schemas.openxmlformats.org/drawingml/2006/picture">
                 <pic:pic xmlns:pic="http://schemas.openxmlformats.org/drawingml/2006/picture">
                   <pic:nvPicPr>
-                    <pic:cNvPr id="1561426651" name=""/>
+                    <pic:cNvPr id="801260604" name=""/>
                     <pic:cNvPicPr/>
                   </pic:nvPicPr>
                   <pic:blipFill>
@@ -17042,16 +17052,16 @@
           <w:noProof/>
         </w:rPr>
         <w:drawing>
-          <wp:inline distT="0" distB="0" distL="0" distR="0" wp14:anchorId="3F053971" wp14:editId="154FB8FA">
+          <wp:inline distT="0" distB="0" distL="0" distR="0" wp14:anchorId="7EF09BFE" wp14:editId="5034E962">
             <wp:extent cx="5120640" cy="951357"/>
             <wp:effectExtent l="19050" t="19050" r="22860" b="20320"/>
-            <wp:docPr id="827840657" name="Imagem 33"/>
+            <wp:docPr id="935809322" name="Imagem 33"/>
             <wp:cNvGraphicFramePr/>
             <a:graphic xmlns:a="http://schemas.openxmlformats.org/drawingml/2006/main">
               <a:graphicData uri="http://schemas.openxmlformats.org/drawingml/2006/picture">
                 <pic:pic xmlns:pic="http://schemas.openxmlformats.org/drawingml/2006/picture">
                   <pic:nvPicPr>
-                    <pic:cNvPr id="827840657" name=""/>
+                    <pic:cNvPr id="935809322" name=""/>
                     <pic:cNvPicPr/>
                   </pic:nvPicPr>
                   <pic:blipFill>
@@ -17163,16 +17173,16 @@
           <w:noProof/>
         </w:rPr>
         <w:drawing>
-          <wp:inline distT="0" distB="0" distL="0" distR="0" wp14:anchorId="385E678F" wp14:editId="096833DF">
+          <wp:inline distT="0" distB="0" distL="0" distR="0" wp14:anchorId="0514AD0B" wp14:editId="5A380017">
             <wp:extent cx="5120640" cy="1515102"/>
             <wp:effectExtent l="19050" t="19050" r="22860" b="28575"/>
-            <wp:docPr id="641833573" name="Imagem 34"/>
+            <wp:docPr id="1860177679" name="Imagem 34"/>
             <wp:cNvGraphicFramePr/>
             <a:graphic xmlns:a="http://schemas.openxmlformats.org/drawingml/2006/main">
               <a:graphicData uri="http://schemas.openxmlformats.org/drawingml/2006/picture">
                 <pic:pic xmlns:pic="http://schemas.openxmlformats.org/drawingml/2006/picture">
                   <pic:nvPicPr>
-                    <pic:cNvPr id="641833573" name=""/>
+                    <pic:cNvPr id="1860177679" name=""/>
                     <pic:cNvPicPr/>
                   </pic:nvPicPr>
                   <pic:blipFill>
@@ -17285,16 +17295,16 @@
           <w:noProof/>
         </w:rPr>
         <w:drawing>
-          <wp:inline distT="0" distB="0" distL="0" distR="0" wp14:anchorId="5454B385" wp14:editId="17588E26">
+          <wp:inline distT="0" distB="0" distL="0" distR="0" wp14:anchorId="5E566869" wp14:editId="596F24B8">
             <wp:extent cx="5120640" cy="1391113"/>
             <wp:effectExtent l="19050" t="19050" r="22860" b="19050"/>
-            <wp:docPr id="1873422028" name="Imagem 35"/>
+            <wp:docPr id="1398143445" name="Imagem 35"/>
             <wp:cNvGraphicFramePr/>
             <a:graphic xmlns:a="http://schemas.openxmlformats.org/drawingml/2006/main">
               <a:graphicData uri="http://schemas.openxmlformats.org/drawingml/2006/picture">
                 <pic:pic xmlns:pic="http://schemas.openxmlformats.org/drawingml/2006/picture">
                   <pic:nvPicPr>
-                    <pic:cNvPr id="1873422028" name=""/>
+                    <pic:cNvPr id="1398143445" name=""/>
                     <pic:cNvPicPr/>
                   </pic:nvPicPr>
                   <pic:blipFill>
@@ -17406,16 +17416,16 @@
           <w:noProof/>
         </w:rPr>
         <w:drawing>
-          <wp:inline distT="0" distB="0" distL="0" distR="0" wp14:anchorId="050E6322" wp14:editId="07252776">
+          <wp:inline distT="0" distB="0" distL="0" distR="0" wp14:anchorId="100E1E6F" wp14:editId="6C38DD3C">
             <wp:extent cx="5120640" cy="1125174"/>
             <wp:effectExtent l="19050" t="19050" r="22860" b="18415"/>
-            <wp:docPr id="2092549791" name="Imagem 36"/>
+            <wp:docPr id="1296784826" name="Imagem 36"/>
             <wp:cNvGraphicFramePr/>
             <a:graphic xmlns:a="http://schemas.openxmlformats.org/drawingml/2006/main">
               <a:graphicData uri="http://schemas.openxmlformats.org/drawingml/2006/picture">
                 <pic:pic xmlns:pic="http://schemas.openxmlformats.org/drawingml/2006/picture">
                   <pic:nvPicPr>
-                    <pic:cNvPr id="2092549791" name=""/>
+                    <pic:cNvPr id="1296784826" name=""/>
                     <pic:cNvPicPr/>
                   </pic:nvPicPr>
                   <pic:blipFill>
@@ -17505,7 +17515,7 @@
           <w:sz w:val="27"/>
         </w:rPr>
       </w:pPr>
-      <w:bookmarkStart w:id="32" w:name="_Toc240273033"/>
+      <w:bookmarkStart w:id="32" w:name="_Toc240274135"/>
       <w:r>
         <w:rPr>
           <w:rFonts w:ascii="Montserrat" w:hAnsi="Montserrat"/>
@@ -17545,16 +17555,16 @@
           <w:noProof/>
         </w:rPr>
         <w:drawing>
-          <wp:inline distT="0" distB="0" distL="0" distR="0" wp14:anchorId="2239D2D4" wp14:editId="41C78BEA">
+          <wp:inline distT="0" distB="0" distL="0" distR="0" wp14:anchorId="36B6CA51" wp14:editId="2EF45A5C">
             <wp:extent cx="5120640" cy="4627581"/>
             <wp:effectExtent l="19050" t="19050" r="22860" b="20955"/>
-            <wp:docPr id="1301434274" name="Imagem 37"/>
+            <wp:docPr id="729885765" name="Imagem 37"/>
             <wp:cNvGraphicFramePr/>
             <a:graphic xmlns:a="http://schemas.openxmlformats.org/drawingml/2006/main">
               <a:graphicData uri="http://schemas.openxmlformats.org/drawingml/2006/picture">
                 <pic:pic xmlns:pic="http://schemas.openxmlformats.org/drawingml/2006/picture">
                   <pic:nvPicPr>
-                    <pic:cNvPr id="1301434274" name=""/>
+                    <pic:cNvPr id="729885765" name=""/>
                     <pic:cNvPicPr/>
                   </pic:nvPicPr>
                   <pic:blipFill>
@@ -17622,16 +17632,16 @@
         </w:rPr>
         <w:lastRenderedPageBreak/>
         <w:drawing>
-          <wp:inline distT="0" distB="0" distL="0" distR="0" wp14:anchorId="4892D95A" wp14:editId="1F3FC9C1">
+          <wp:inline distT="0" distB="0" distL="0" distR="0" wp14:anchorId="6368F047" wp14:editId="24604EC6">
             <wp:extent cx="5120640" cy="4627581"/>
             <wp:effectExtent l="19050" t="19050" r="22860" b="20955"/>
-            <wp:docPr id="2017366057" name="Imagem 38"/>
+            <wp:docPr id="2058562116" name="Imagem 38"/>
             <wp:cNvGraphicFramePr/>
             <a:graphic xmlns:a="http://schemas.openxmlformats.org/drawingml/2006/main">
               <a:graphicData uri="http://schemas.openxmlformats.org/drawingml/2006/picture">
                 <pic:pic xmlns:pic="http://schemas.openxmlformats.org/drawingml/2006/picture">
                   <pic:nvPicPr>
-                    <pic:cNvPr id="2017366057" name=""/>
+                    <pic:cNvPr id="2058562116" name=""/>
                     <pic:cNvPicPr/>
                   </pic:nvPicPr>
                   <pic:blipFill>
@@ -17800,16 +17810,16 @@
           <w:noProof/>
         </w:rPr>
         <w:drawing>
-          <wp:inline distT="0" distB="0" distL="0" distR="0" wp14:anchorId="0E0D1202" wp14:editId="4D8161FF">
+          <wp:inline distT="0" distB="0" distL="0" distR="0" wp14:anchorId="00B64CFA" wp14:editId="5E9B6A79">
             <wp:extent cx="5120640" cy="2144319"/>
             <wp:effectExtent l="19050" t="19050" r="22860" b="27940"/>
-            <wp:docPr id="652629132" name="Imagem 39"/>
+            <wp:docPr id="1861929800" name="Imagem 39"/>
             <wp:cNvGraphicFramePr/>
             <a:graphic xmlns:a="http://schemas.openxmlformats.org/drawingml/2006/main">
               <a:graphicData uri="http://schemas.openxmlformats.org/drawingml/2006/picture">
                 <pic:pic xmlns:pic="http://schemas.openxmlformats.org/drawingml/2006/picture">
                   <pic:nvPicPr>
-                    <pic:cNvPr id="652629132" name=""/>
+                    <pic:cNvPr id="1861929800" name=""/>
                     <pic:cNvPicPr/>
                   </pic:nvPicPr>
                   <pic:blipFill>
@@ -17897,16 +17907,16 @@
           <w:noProof/>
         </w:rPr>
         <w:drawing>
-          <wp:inline distT="0" distB="0" distL="0" distR="0" wp14:anchorId="1EABF42D" wp14:editId="36546960">
+          <wp:inline distT="0" distB="0" distL="0" distR="0" wp14:anchorId="7068829C" wp14:editId="709027C3">
             <wp:extent cx="5120640" cy="1055647"/>
             <wp:effectExtent l="19050" t="19050" r="22860" b="11430"/>
-            <wp:docPr id="1549145493" name="Imagem 40"/>
+            <wp:docPr id="653141895" name="Imagem 40"/>
             <wp:cNvGraphicFramePr/>
             <a:graphic xmlns:a="http://schemas.openxmlformats.org/drawingml/2006/main">
               <a:graphicData uri="http://schemas.openxmlformats.org/drawingml/2006/picture">
                 <pic:pic xmlns:pic="http://schemas.openxmlformats.org/drawingml/2006/picture">
                   <pic:nvPicPr>
-                    <pic:cNvPr id="1549145493" name=""/>
+                    <pic:cNvPr id="653141895" name=""/>
                     <pic:cNvPicPr/>
                   </pic:nvPicPr>
                   <pic:blipFill>
@@ -18028,16 +18038,16 @@
           <w:noProof/>
         </w:rPr>
         <w:drawing>
-          <wp:inline distT="0" distB="0" distL="0" distR="0" wp14:anchorId="14C0DCE5" wp14:editId="44E87A09">
+          <wp:inline distT="0" distB="0" distL="0" distR="0" wp14:anchorId="4FD021C4" wp14:editId="6E0D986B">
             <wp:extent cx="5120640" cy="3282818"/>
             <wp:effectExtent l="19050" t="19050" r="22860" b="13335"/>
-            <wp:docPr id="890119134" name="Imagem 41"/>
+            <wp:docPr id="858749964" name="Imagem 41"/>
             <wp:cNvGraphicFramePr/>
             <a:graphic xmlns:a="http://schemas.openxmlformats.org/drawingml/2006/main">
               <a:graphicData uri="http://schemas.openxmlformats.org/drawingml/2006/picture">
                 <pic:pic xmlns:pic="http://schemas.openxmlformats.org/drawingml/2006/picture">
                   <pic:nvPicPr>
-                    <pic:cNvPr id="890119134" name=""/>
+                    <pic:cNvPr id="858749964" name=""/>
                     <pic:cNvPicPr/>
                   </pic:nvPicPr>
                   <pic:blipFill>
@@ -18171,16 +18181,16 @@
         </w:rPr>
         <w:lastRenderedPageBreak/>
         <w:drawing>
-          <wp:inline distT="0" distB="0" distL="0" distR="0" wp14:anchorId="3315FFEF" wp14:editId="7F7CB038">
+          <wp:inline distT="0" distB="0" distL="0" distR="0" wp14:anchorId="59F7F33B" wp14:editId="5640ADBF">
             <wp:extent cx="5120640" cy="1978034"/>
             <wp:effectExtent l="19050" t="19050" r="22860" b="22225"/>
-            <wp:docPr id="1676298028" name="Imagem 42"/>
+            <wp:docPr id="1720165883" name="Imagem 42"/>
             <wp:cNvGraphicFramePr/>
             <a:graphic xmlns:a="http://schemas.openxmlformats.org/drawingml/2006/main">
               <a:graphicData uri="http://schemas.openxmlformats.org/drawingml/2006/picture">
                 <pic:pic xmlns:pic="http://schemas.openxmlformats.org/drawingml/2006/picture">
                   <pic:nvPicPr>
-                    <pic:cNvPr id="1676298028" name=""/>
+                    <pic:cNvPr id="1720165883" name=""/>
                     <pic:cNvPicPr/>
                   </pic:nvPicPr>
                   <pic:blipFill>
@@ -18252,7 +18262,7 @@
           <w:sz w:val="34"/>
         </w:rPr>
       </w:pPr>
-      <w:bookmarkStart w:id="33" w:name="_Toc240273034"/>
+      <w:bookmarkStart w:id="33" w:name="_Toc240274136"/>
       <w:r>
         <w:rPr>
           <w:rFonts w:ascii="Montserrat" w:hAnsi="Montserrat"/>
@@ -18312,7 +18322,7 @@
           <w:sz w:val="27"/>
         </w:rPr>
       </w:pPr>
-      <w:bookmarkStart w:id="34" w:name="_Toc240273035"/>
+      <w:bookmarkStart w:id="34" w:name="_Toc240274137"/>
       <w:r>
         <w:rPr>
           <w:rFonts w:ascii="Montserrat" w:hAnsi="Montserrat"/>
@@ -18352,16 +18362,16 @@
           <w:noProof/>
         </w:rPr>
         <w:drawing>
-          <wp:inline distT="0" distB="0" distL="0" distR="0" wp14:anchorId="13ECBF96" wp14:editId="6081C447">
+          <wp:inline distT="0" distB="0" distL="0" distR="0" wp14:anchorId="2BF1EA3F" wp14:editId="1BBF911F">
             <wp:extent cx="5303520" cy="4792851"/>
             <wp:effectExtent l="19050" t="19050" r="11430" b="27305"/>
-            <wp:docPr id="1118470604" name="Imagem 43"/>
+            <wp:docPr id="272048358" name="Imagem 43"/>
             <wp:cNvGraphicFramePr/>
             <a:graphic xmlns:a="http://schemas.openxmlformats.org/drawingml/2006/main">
               <a:graphicData uri="http://schemas.openxmlformats.org/drawingml/2006/picture">
                 <pic:pic xmlns:pic="http://schemas.openxmlformats.org/drawingml/2006/picture">
                   <pic:nvPicPr>
-                    <pic:cNvPr id="1118470604" name=""/>
+                    <pic:cNvPr id="272048358" name=""/>
                     <pic:cNvPicPr/>
                   </pic:nvPicPr>
                   <pic:blipFill>
@@ -18430,7 +18440,7 @@
           <w:sz w:val="27"/>
         </w:rPr>
       </w:pPr>
-      <w:bookmarkStart w:id="35" w:name="_Toc240273036"/>
+      <w:bookmarkStart w:id="35" w:name="_Toc240274138"/>
       <w:r>
         <w:rPr>
           <w:rFonts w:ascii="Montserrat" w:hAnsi="Montserrat"/>
@@ -18470,16 +18480,16 @@
           <w:noProof/>
         </w:rPr>
         <w:drawing>
-          <wp:inline distT="0" distB="0" distL="0" distR="0" wp14:anchorId="035D5A9B" wp14:editId="16E1DD8E">
+          <wp:inline distT="0" distB="0" distL="0" distR="0" wp14:anchorId="392308A5" wp14:editId="4A1D5195">
             <wp:extent cx="5303520" cy="4792851"/>
             <wp:effectExtent l="19050" t="19050" r="11430" b="27305"/>
-            <wp:docPr id="1871285996" name="Imagem 44"/>
+            <wp:docPr id="1981185239" name="Imagem 44"/>
             <wp:cNvGraphicFramePr/>
             <a:graphic xmlns:a="http://schemas.openxmlformats.org/drawingml/2006/main">
               <a:graphicData uri="http://schemas.openxmlformats.org/drawingml/2006/picture">
                 <pic:pic xmlns:pic="http://schemas.openxmlformats.org/drawingml/2006/picture">
                   <pic:nvPicPr>
-                    <pic:cNvPr id="1871285996" name=""/>
+                    <pic:cNvPr id="1981185239" name=""/>
                     <pic:cNvPicPr/>
                   </pic:nvPicPr>
                   <pic:blipFill>
@@ -18547,7 +18557,7 @@
           <w:sz w:val="27"/>
         </w:rPr>
       </w:pPr>
-      <w:bookmarkStart w:id="36" w:name="_Toc240273037"/>
+      <w:bookmarkStart w:id="36" w:name="_Toc240274139"/>
       <w:r>
         <w:rPr>
           <w:rFonts w:ascii="Montserrat" w:hAnsi="Montserrat"/>
@@ -18588,16 +18598,16 @@
         </w:rPr>
         <w:lastRenderedPageBreak/>
         <w:drawing>
-          <wp:inline distT="0" distB="0" distL="0" distR="0" wp14:anchorId="7F8AD5D5" wp14:editId="1AB7B0E7">
+          <wp:inline distT="0" distB="0" distL="0" distR="0" wp14:anchorId="615FD74E" wp14:editId="6B71B070">
             <wp:extent cx="5303520" cy="4792851"/>
             <wp:effectExtent l="19050" t="19050" r="11430" b="27305"/>
-            <wp:docPr id="2002020555" name="Imagem 45"/>
+            <wp:docPr id="900075873" name="Imagem 45"/>
             <wp:cNvGraphicFramePr/>
             <a:graphic xmlns:a="http://schemas.openxmlformats.org/drawingml/2006/main">
               <a:graphicData uri="http://schemas.openxmlformats.org/drawingml/2006/picture">
                 <pic:pic xmlns:pic="http://schemas.openxmlformats.org/drawingml/2006/picture">
                   <pic:nvPicPr>
-                    <pic:cNvPr id="2002020555" name=""/>
+                    <pic:cNvPr id="900075873" name=""/>
                     <pic:cNvPicPr/>
                   </pic:nvPicPr>
                   <pic:blipFill>
@@ -18665,16 +18675,16 @@
         </w:rPr>
         <w:lastRenderedPageBreak/>
         <w:drawing>
-          <wp:inline distT="0" distB="0" distL="0" distR="0" wp14:anchorId="067EC50F" wp14:editId="1A53938B">
+          <wp:inline distT="0" distB="0" distL="0" distR="0" wp14:anchorId="0FE9AA61" wp14:editId="253F9C3A">
             <wp:extent cx="5303520" cy="4792851"/>
             <wp:effectExtent l="19050" t="19050" r="11430" b="27305"/>
-            <wp:docPr id="317145968" name="Imagem 46"/>
+            <wp:docPr id="2092546294" name="Imagem 46"/>
             <wp:cNvGraphicFramePr/>
             <a:graphic xmlns:a="http://schemas.openxmlformats.org/drawingml/2006/main">
               <a:graphicData uri="http://schemas.openxmlformats.org/drawingml/2006/picture">
                 <pic:pic xmlns:pic="http://schemas.openxmlformats.org/drawingml/2006/picture">
                   <pic:nvPicPr>
-                    <pic:cNvPr id="317145968" name=""/>
+                    <pic:cNvPr id="2092546294" name=""/>
                     <pic:cNvPicPr/>
                   </pic:nvPicPr>
                   <pic:blipFill>
@@ -18767,7 +18777,7 @@
           <w:sz w:val="34"/>
         </w:rPr>
       </w:pPr>
-      <w:bookmarkStart w:id="37" w:name="_Toc240273038"/>
+      <w:bookmarkStart w:id="37" w:name="_Toc240274140"/>
       <w:r>
         <w:rPr>
           <w:rFonts w:ascii="Montserrat" w:hAnsi="Montserrat"/>
@@ -18809,7 +18819,7 @@
           <w:sz w:val="27"/>
         </w:rPr>
       </w:pPr>
-      <w:bookmarkStart w:id="38" w:name="_Toc240273039"/>
+      <w:bookmarkStart w:id="38" w:name="_Toc240274141"/>
       <w:r>
         <w:rPr>
           <w:rFonts w:ascii="Montserrat" w:hAnsi="Montserrat"/>
@@ -18849,16 +18859,16 @@
           <w:noProof/>
         </w:rPr>
         <w:drawing>
-          <wp:inline distT="0" distB="0" distL="0" distR="0" wp14:anchorId="4A0405B7" wp14:editId="65604817">
+          <wp:inline distT="0" distB="0" distL="0" distR="0" wp14:anchorId="40444066" wp14:editId="276EBF19">
             <wp:extent cx="5303520" cy="4792851"/>
             <wp:effectExtent l="19050" t="19050" r="11430" b="27305"/>
-            <wp:docPr id="621077587" name="Imagem 47"/>
+            <wp:docPr id="393189363" name="Imagem 47"/>
             <wp:cNvGraphicFramePr/>
             <a:graphic xmlns:a="http://schemas.openxmlformats.org/drawingml/2006/main">
               <a:graphicData uri="http://schemas.openxmlformats.org/drawingml/2006/picture">
                 <pic:pic xmlns:pic="http://schemas.openxmlformats.org/drawingml/2006/picture">
                   <pic:nvPicPr>
-                    <pic:cNvPr id="621077587" name=""/>
+                    <pic:cNvPr id="393189363" name=""/>
                     <pic:cNvPicPr/>
                   </pic:nvPicPr>
                   <pic:blipFill>
@@ -19087,7 +19097,7 @@
           <w:sz w:val="27"/>
         </w:rPr>
       </w:pPr>
-      <w:bookmarkStart w:id="39" w:name="_Toc240273040"/>
+      <w:bookmarkStart w:id="39" w:name="_Toc240274142"/>
       <w:r>
         <w:rPr>
           <w:rFonts w:ascii="Montserrat" w:hAnsi="Montserrat"/>
@@ -19127,16 +19137,16 @@
           <w:noProof/>
         </w:rPr>
         <w:drawing>
-          <wp:inline distT="0" distB="0" distL="0" distR="0" wp14:anchorId="4758F0C6" wp14:editId="3238DDE5">
+          <wp:inline distT="0" distB="0" distL="0" distR="0" wp14:anchorId="163FE8E4" wp14:editId="21AB243E">
             <wp:extent cx="5303520" cy="4792851"/>
             <wp:effectExtent l="19050" t="19050" r="11430" b="27305"/>
-            <wp:docPr id="1436300641" name="Imagem 48"/>
+            <wp:docPr id="1379879903" name="Imagem 48"/>
             <wp:cNvGraphicFramePr/>
             <a:graphic xmlns:a="http://schemas.openxmlformats.org/drawingml/2006/main">
               <a:graphicData uri="http://schemas.openxmlformats.org/drawingml/2006/picture">
                 <pic:pic xmlns:pic="http://schemas.openxmlformats.org/drawingml/2006/picture">
                   <pic:nvPicPr>
-                    <pic:cNvPr id="1436300641" name=""/>
+                    <pic:cNvPr id="1379879903" name=""/>
                     <pic:cNvPicPr/>
                   </pic:nvPicPr>
                   <pic:blipFill>
@@ -19204,7 +19214,7 @@
           <w:sz w:val="27"/>
         </w:rPr>
       </w:pPr>
-      <w:bookmarkStart w:id="40" w:name="_Toc240273041"/>
+      <w:bookmarkStart w:id="40" w:name="_Toc240274143"/>
       <w:r>
         <w:rPr>
           <w:rFonts w:ascii="Montserrat" w:hAnsi="Montserrat"/>
@@ -19245,16 +19255,16 @@
         </w:rPr>
         <w:lastRenderedPageBreak/>
         <w:drawing>
-          <wp:inline distT="0" distB="0" distL="0" distR="0" wp14:anchorId="743DD1CD" wp14:editId="2CF3DC8F">
+          <wp:inline distT="0" distB="0" distL="0" distR="0" wp14:anchorId="161353B0" wp14:editId="5533F50E">
             <wp:extent cx="5303520" cy="4792851"/>
             <wp:effectExtent l="19050" t="19050" r="11430" b="27305"/>
-            <wp:docPr id="741746170" name="Imagem 49"/>
+            <wp:docPr id="702920757" name="Imagem 49"/>
             <wp:cNvGraphicFramePr/>
             <a:graphic xmlns:a="http://schemas.openxmlformats.org/drawingml/2006/main">
               <a:graphicData uri="http://schemas.openxmlformats.org/drawingml/2006/picture">
                 <pic:pic xmlns:pic="http://schemas.openxmlformats.org/drawingml/2006/picture">
                   <pic:nvPicPr>
-                    <pic:cNvPr id="741746170" name=""/>
+                    <pic:cNvPr id="702920757" name=""/>
                     <pic:cNvPicPr/>
                   </pic:nvPicPr>
                   <pic:blipFill>
@@ -19398,7 +19408,7 @@
           <w:sz w:val="27"/>
         </w:rPr>
       </w:pPr>
-      <w:bookmarkStart w:id="41" w:name="_Toc240273042"/>
+      <w:bookmarkStart w:id="41" w:name="_Toc240274144"/>
       <w:r>
         <w:rPr>
           <w:rFonts w:ascii="Montserrat" w:hAnsi="Montserrat"/>
@@ -19578,7 +19588,7 @@
           <w:color w:val="1A1A1A"/>
           <w:sz w:val="22"/>
         </w:rPr>
-        <w:t>Registros por formulario: uma linha por artefato (Canvas, TAP, Planejamento, EAP, SMP, Ata de Reuniao, TEP, RLA, alem da propria Solicitacao de Demanda), com o total e a contagem por status de cada um.</w:t>
+        <w:t>Tarefas do cronograma (portfolio): soma as tarefas cadastradas dentro dos marcos do cronograma do Planejamento (Passo 4, aba 3) de todos os projetos, mostrando o percentual concluido e em quantos projetos existe pelo menos uma tarefa pendente.</w:t>
       </w:r>
     </w:p>
     <w:p>
@@ -19602,7 +19612,7 @@
           <w:color w:val="1A1A1A"/>
           <w:sz w:val="22"/>
         </w:rPr>
-        <w:t>Portfolio de projetos: contagem de projetos Aprovados, Encerrados (Concluido/Paralisado/Cancelado, via TEP), Reprovados e em avaliacao no Gate 1, a partir do cadastro compartilhado (secao 2.5).</w:t>
+        <w:t>Registros por formulario: uma linha por artefato (Canvas, TAP, Planejamento, EAP, SMP, Ata de Reuniao, TEP, RLA, alem da propria Solicitacao de Demanda), com o total e a contagem por status de cada um.</w:t>
       </w:r>
     </w:p>
     <w:p>
@@ -19626,6 +19636,30 @@
           <w:color w:val="1A1A1A"/>
           <w:sz w:val="22"/>
         </w:rPr>
+        <w:t>Portfolio de projetos: contagem de projetos Aprovados, Encerrados (Concluido/Paralisado/Cancelado, via TEP), Reprovados e em avaliacao no Gate 1, a partir do cadastro compartilhado (secao 2.5).</w:t>
+      </w:r>
+    </w:p>
+    <w:p>
+      <w:pPr>
+        <w:pStyle w:val="PargrafodaLista"/>
+        <w:numPr>
+          <w:ilvl w:val="0"/>
+          <w:numId w:val="28"/>
+        </w:numPr>
+        <w:spacing w:after="80" w:line="260" w:lineRule="auto"/>
+        <w:ind w:left="700"/>
+        <w:rPr>
+          <w:rFonts w:ascii="Montserrat" w:hAnsi="Montserrat"/>
+          <w:color w:val="1A1A1A"/>
+          <w:sz w:val="22"/>
+        </w:rPr>
+      </w:pPr>
+      <w:r>
+        <w:rPr>
+          <w:rFonts w:ascii="Montserrat" w:hAnsi="Montserrat"/>
+          <w:color w:val="1A1A1A"/>
+          <w:sz w:val="22"/>
+        </w:rPr>
         <w:t>Visao atual por projeto: uma linha por projeto do cadastro compartilhado, com Status do cadastro, Situacao mais recente do Relatorio de Situacao (secao 4.1, com o percentual concluido quando ja reportado), Saude do projeto (secao 6.4.1) e Progresso do ciclo de vida - quantos dos 9 formularios (Demanda a RLA) ja tem registro vinculado aquele projeto, com a lista do que ainda falta.</w:t>
       </w:r>
     </w:p>
@@ -19639,16 +19673,16 @@
           <w:noProof/>
         </w:rPr>
         <w:drawing>
-          <wp:inline distT="0" distB="0" distL="0" distR="0" wp14:anchorId="5B2E48E2" wp14:editId="0EFD417B">
+          <wp:inline distT="0" distB="0" distL="0" distR="0" wp14:anchorId="24B38A8C" wp14:editId="46D52CD9">
             <wp:extent cx="5303520" cy="4267180"/>
             <wp:effectExtent l="19050" t="19050" r="11430" b="19685"/>
-            <wp:docPr id="496772326" name="Imagem 50"/>
+            <wp:docPr id="364071279" name="Imagem 50"/>
             <wp:cNvGraphicFramePr/>
             <a:graphic xmlns:a="http://schemas.openxmlformats.org/drawingml/2006/main">
               <a:graphicData uri="http://schemas.openxmlformats.org/drawingml/2006/picture">
                 <pic:pic xmlns:pic="http://schemas.openxmlformats.org/drawingml/2006/picture">
                   <pic:nvPicPr>
-                    <pic:cNvPr id="496772326" name=""/>
+                    <pic:cNvPr id="364071279" name=""/>
                     <pic:cNvPicPr/>
                   </pic:nvPicPr>
                   <pic:blipFill>
@@ -19702,6 +19736,7 @@
           <w:color w:val="6A6A70"/>
           <w:sz w:val="19"/>
         </w:rPr>
+        <w:lastRenderedPageBreak/>
         <w:t>Painel Executivo: Gates de aprovacao e indicadores de governanca do Relatorio de Situacao.</w:t>
       </w:r>
     </w:p>
@@ -19714,18 +19749,17 @@
         <w:rPr>
           <w:noProof/>
         </w:rPr>
-        <w:lastRenderedPageBreak/>
         <w:drawing>
-          <wp:inline distT="0" distB="0" distL="0" distR="0" wp14:anchorId="7A97084F" wp14:editId="66A75CCA">
+          <wp:inline distT="0" distB="0" distL="0" distR="0" wp14:anchorId="757E1043" wp14:editId="603AE18D">
             <wp:extent cx="5303520" cy="3382059"/>
             <wp:effectExtent l="19050" t="19050" r="11430" b="27940"/>
-            <wp:docPr id="165676715" name="Imagem 51"/>
+            <wp:docPr id="1358254188" name="Imagem 51"/>
             <wp:cNvGraphicFramePr/>
             <a:graphic xmlns:a="http://schemas.openxmlformats.org/drawingml/2006/main">
               <a:graphicData uri="http://schemas.openxmlformats.org/drawingml/2006/picture">
                 <pic:pic xmlns:pic="http://schemas.openxmlformats.org/drawingml/2006/picture">
                   <pic:nvPicPr>
-                    <pic:cNvPr id="165676715" name=""/>
+                    <pic:cNvPr id="1358254188" name=""/>
                     <pic:cNvPicPr/>
                   </pic:nvPicPr>
                   <pic:blipFill>
@@ -19793,16 +19827,16 @@
         </w:rPr>
         <w:lastRenderedPageBreak/>
         <w:drawing>
-          <wp:inline distT="0" distB="0" distL="0" distR="0" wp14:anchorId="3463532A" wp14:editId="5A9C468D">
+          <wp:inline distT="0" distB="0" distL="0" distR="0" wp14:anchorId="6F55C88B" wp14:editId="5CDBCF6C">
             <wp:extent cx="5303520" cy="4417800"/>
             <wp:effectExtent l="19050" t="19050" r="11430" b="20955"/>
-            <wp:docPr id="2037561575" name="Imagem 52"/>
+            <wp:docPr id="750444578" name="Imagem 52"/>
             <wp:cNvGraphicFramePr/>
             <a:graphic xmlns:a="http://schemas.openxmlformats.org/drawingml/2006/main">
               <a:graphicData uri="http://schemas.openxmlformats.org/drawingml/2006/picture">
                 <pic:pic xmlns:pic="http://schemas.openxmlformats.org/drawingml/2006/picture">
                   <pic:nvPicPr>
-                    <pic:cNvPr id="2037561575" name=""/>
+                    <pic:cNvPr id="750444578" name=""/>
                     <pic:cNvPicPr/>
                   </pic:nvPicPr>
                   <pic:blipFill>
@@ -19912,7 +19946,7 @@
           <w:sz w:val="27"/>
         </w:rPr>
       </w:pPr>
-      <w:bookmarkStart w:id="42" w:name="_Toc240273043"/>
+      <w:bookmarkStart w:id="42" w:name="_Toc240274145"/>
       <w:r>
         <w:rPr>
           <w:rFonts w:ascii="Montserrat" w:hAnsi="Montserrat"/>
@@ -20178,16 +20212,16 @@
         </w:rPr>
         <w:lastRenderedPageBreak/>
         <w:drawing>
-          <wp:inline distT="0" distB="0" distL="0" distR="0" wp14:anchorId="1D0185E4" wp14:editId="472711B3">
+          <wp:inline distT="0" distB="0" distL="0" distR="0" wp14:anchorId="10BB1EA7" wp14:editId="61B77960">
             <wp:extent cx="5303520" cy="7628836"/>
             <wp:effectExtent l="19050" t="19050" r="11430" b="10795"/>
-            <wp:docPr id="123502563" name="Imagem 53"/>
+            <wp:docPr id="544095145" name="Imagem 53"/>
             <wp:cNvGraphicFramePr/>
             <a:graphic xmlns:a="http://schemas.openxmlformats.org/drawingml/2006/main">
               <a:graphicData uri="http://schemas.openxmlformats.org/drawingml/2006/picture">
                 <pic:pic xmlns:pic="http://schemas.openxmlformats.org/drawingml/2006/picture">
                   <pic:nvPicPr>
-                    <pic:cNvPr id="123502563" name=""/>
+                    <pic:cNvPr id="544095145" name=""/>
                     <pic:cNvPicPr/>
                   </pic:nvPicPr>
                   <pic:blipFill>
@@ -20319,7 +20353,7 @@
           <w:sz w:val="27"/>
         </w:rPr>
       </w:pPr>
-      <w:bookmarkStart w:id="43" w:name="_Toc240273044"/>
+      <w:bookmarkStart w:id="43" w:name="_Toc240274146"/>
       <w:r>
         <w:rPr>
           <w:rFonts w:ascii="Montserrat" w:hAnsi="Montserrat"/>
@@ -20472,7 +20506,7 @@
           <w:sz w:val="27"/>
         </w:rPr>
       </w:pPr>
-      <w:bookmarkStart w:id="44" w:name="_Toc240273045"/>
+      <w:bookmarkStart w:id="44" w:name="_Toc240274147"/>
       <w:r>
         <w:rPr>
           <w:rFonts w:ascii="Montserrat" w:hAnsi="Montserrat"/>
@@ -20765,16 +20799,16 @@
           <w:noProof/>
         </w:rPr>
         <w:drawing>
-          <wp:inline distT="0" distB="0" distL="0" distR="0" wp14:anchorId="26FAC842" wp14:editId="0FD51E7A">
+          <wp:inline distT="0" distB="0" distL="0" distR="0" wp14:anchorId="788F819F" wp14:editId="0E743286">
             <wp:extent cx="5303520" cy="1351384"/>
             <wp:effectExtent l="19050" t="19050" r="11430" b="20320"/>
-            <wp:docPr id="2002634895" name="Imagem 54"/>
+            <wp:docPr id="242507938" name="Imagem 54"/>
             <wp:cNvGraphicFramePr/>
             <a:graphic xmlns:a="http://schemas.openxmlformats.org/drawingml/2006/main">
               <a:graphicData uri="http://schemas.openxmlformats.org/drawingml/2006/picture">
                 <pic:pic xmlns:pic="http://schemas.openxmlformats.org/drawingml/2006/picture">
                   <pic:nvPicPr>
-                    <pic:cNvPr id="2002634895" name=""/>
+                    <pic:cNvPr id="242507938" name=""/>
                     <pic:cNvPicPr/>
                   </pic:nvPicPr>
                   <pic:blipFill>
@@ -20842,7 +20876,7 @@
           <w:sz w:val="27"/>
         </w:rPr>
       </w:pPr>
-      <w:bookmarkStart w:id="45" w:name="_Toc240273046"/>
+      <w:bookmarkStart w:id="45" w:name="_Toc240274148"/>
       <w:r>
         <w:rPr>
           <w:rFonts w:ascii="Montserrat" w:hAnsi="Montserrat"/>
@@ -20987,16 +21021,16 @@
           <w:noProof/>
         </w:rPr>
         <w:drawing>
-          <wp:inline distT="0" distB="0" distL="0" distR="0" wp14:anchorId="5197DB7D" wp14:editId="27D123C4">
+          <wp:inline distT="0" distB="0" distL="0" distR="0" wp14:anchorId="7BCA21FD" wp14:editId="1129462C">
             <wp:extent cx="5303520" cy="1422793"/>
             <wp:effectExtent l="19050" t="19050" r="11430" b="25400"/>
-            <wp:docPr id="1597859587" name="Imagem 55"/>
+            <wp:docPr id="698161555" name="Imagem 55"/>
             <wp:cNvGraphicFramePr/>
             <a:graphic xmlns:a="http://schemas.openxmlformats.org/drawingml/2006/main">
               <a:graphicData uri="http://schemas.openxmlformats.org/drawingml/2006/picture">
                 <pic:pic xmlns:pic="http://schemas.openxmlformats.org/drawingml/2006/picture">
                   <pic:nvPicPr>
-                    <pic:cNvPr id="1597859587" name=""/>
+                    <pic:cNvPr id="698161555" name=""/>
                     <pic:cNvPicPr/>
                   </pic:nvPicPr>
                   <pic:blipFill>
@@ -21151,16 +21185,16 @@
         </w:rPr>
         <w:lastRenderedPageBreak/>
         <w:drawing>
-          <wp:inline distT="0" distB="0" distL="0" distR="0" wp14:anchorId="26AA93F7" wp14:editId="20669FAC">
+          <wp:inline distT="0" distB="0" distL="0" distR="0" wp14:anchorId="7FCE5F4B" wp14:editId="54573191">
             <wp:extent cx="5303520" cy="1841050"/>
             <wp:effectExtent l="19050" t="19050" r="11430" b="26035"/>
-            <wp:docPr id="146544788" name="Imagem 56"/>
+            <wp:docPr id="1512457001" name="Imagem 56"/>
             <wp:cNvGraphicFramePr/>
             <a:graphic xmlns:a="http://schemas.openxmlformats.org/drawingml/2006/main">
               <a:graphicData uri="http://schemas.openxmlformats.org/drawingml/2006/picture">
                 <pic:pic xmlns:pic="http://schemas.openxmlformats.org/drawingml/2006/picture">
                   <pic:nvPicPr>
-                    <pic:cNvPr id="146544788" name=""/>
+                    <pic:cNvPr id="1512457001" name=""/>
                     <pic:cNvPicPr/>
                   </pic:nvPicPr>
                   <pic:blipFill>
@@ -21314,16 +21348,16 @@
           <w:noProof/>
         </w:rPr>
         <w:drawing>
-          <wp:inline distT="0" distB="0" distL="0" distR="0" wp14:anchorId="6A74B0DC" wp14:editId="4D2EC554">
+          <wp:inline distT="0" distB="0" distL="0" distR="0" wp14:anchorId="6D60CC57" wp14:editId="0D97F8B2">
             <wp:extent cx="5303520" cy="303041"/>
             <wp:effectExtent l="19050" t="19050" r="11430" b="20955"/>
-            <wp:docPr id="1436258506" name="Imagem 57"/>
+            <wp:docPr id="910337274" name="Imagem 57"/>
             <wp:cNvGraphicFramePr/>
             <a:graphic xmlns:a="http://schemas.openxmlformats.org/drawingml/2006/main">
               <a:graphicData uri="http://schemas.openxmlformats.org/drawingml/2006/picture">
                 <pic:pic xmlns:pic="http://schemas.openxmlformats.org/drawingml/2006/picture">
                   <pic:nvPicPr>
-                    <pic:cNvPr id="1436258506" name=""/>
+                    <pic:cNvPr id="910337274" name=""/>
                     <pic:cNvPicPr/>
                   </pic:nvPicPr>
                   <pic:blipFill>
@@ -21391,16 +21425,16 @@
         </w:rPr>
         <w:lastRenderedPageBreak/>
         <w:drawing>
-          <wp:inline distT="0" distB="0" distL="0" distR="0" wp14:anchorId="3B8E699C" wp14:editId="64AD9D73">
+          <wp:inline distT="0" distB="0" distL="0" distR="0" wp14:anchorId="7482939E" wp14:editId="5E5875FE">
             <wp:extent cx="5303520" cy="2983005"/>
             <wp:effectExtent l="19050" t="19050" r="11430" b="27305"/>
-            <wp:docPr id="1320239481" name="Imagem 58"/>
+            <wp:docPr id="1998269807" name="Imagem 58"/>
             <wp:cNvGraphicFramePr/>
             <a:graphic xmlns:a="http://schemas.openxmlformats.org/drawingml/2006/main">
               <a:graphicData uri="http://schemas.openxmlformats.org/drawingml/2006/picture">
                 <pic:pic xmlns:pic="http://schemas.openxmlformats.org/drawingml/2006/picture">
                   <pic:nvPicPr>
-                    <pic:cNvPr id="1320239481" name=""/>
+                    <pic:cNvPr id="1998269807" name=""/>
                     <pic:cNvPicPr/>
                   </pic:nvPicPr>
                   <pic:blipFill>
@@ -21472,7 +21506,7 @@
           <w:sz w:val="34"/>
         </w:rPr>
       </w:pPr>
-      <w:bookmarkStart w:id="46" w:name="_Toc240273047"/>
+      <w:bookmarkStart w:id="46" w:name="_Toc240274149"/>
       <w:r>
         <w:rPr>
           <w:rFonts w:ascii="Montserrat" w:hAnsi="Montserrat"/>
@@ -21716,7 +21750,7 @@
           <w:sz w:val="34"/>
         </w:rPr>
       </w:pPr>
-      <w:bookmarkStart w:id="47" w:name="_Toc240273048"/>
+      <w:bookmarkStart w:id="47" w:name="_Toc240274150"/>
       <w:r>
         <w:rPr>
           <w:rFonts w:ascii="Montserrat" w:hAnsi="Montserrat"/>
@@ -23504,7 +23538,7 @@
 <file path=word/numbering.xml><?xml version="1.0" encoding="utf-8"?>
 <w:numbering xmlns:wpc="http://schemas.microsoft.com/office/word/2010/wordprocessingCanvas" xmlns:cx="http://schemas.microsoft.com/office/drawing/2014/chartex" xmlns:cx1="http://schemas.microsoft.com/office/drawing/2015/9/8/chartex" xmlns:cx2="http://schemas.microsoft.com/office/drawing/2015/10/21/chartex" xmlns:cx3="http://schemas.microsoft.com/office/drawing/2016/5/9/chartex" xmlns:cx4="http://schemas.microsoft.com/office/drawing/2016/5/10/chartex" xmlns:cx5="http://schemas.microsoft.com/office/drawing/2016/5/11/chartex" xmlns:cx6="http://schemas.microsoft.com/office/drawing/2016/5/12/chartex" xmlns:cx7="http://schemas.microsoft.com/office/drawing/2016/5/13/chartex" xmlns:cx8="http://schemas.microsoft.com/office/drawing/2016/5/14/chartex" xmlns:mc="http://schemas.openxmlformats.org/markup-compatibility/2006" xmlns:aink="http://schemas.microsoft.com/office/drawing/2016/ink" xmlns:am3d="http://schemas.microsoft.com/office/drawing/2017/model3d" xmlns:o="urn:schemas-microsoft-com:office:office" xmlns:oel="http://schemas.microsoft.com/office/2019/extlst" xmlns:r="http://schemas.openxmlformats.org/officeDocument/2006/relationships" xmlns:m="http://schemas.openxmlformats.org/officeDocument/2006/math" xmlns:v="urn:schemas-microsoft-com:vml" xmlns:wp14="http://schemas.microsoft.com/office/word/2010/wordprocessingDrawing" xmlns:wp="http://schemas.openxmlformats.org/drawingml/2006/wordprocessingDrawing" xmlns:w10="urn:schemas-microsoft-com:office:word" xmlns:w="http://schemas.openxmlformats.org/wordprocessingml/2006/main" xmlns:w14="http://schemas.microsoft.com/office/word/2010/wordml" xmlns:w15="http://schemas.microsoft.com/office/word/2012/wordml" xmlns:w16cex="http://schemas.microsoft.com/office/word/2018/wordml/cex" xmlns:w16cid="http://schemas.microsoft.com/office/word/2016/wordml/cid" xmlns:w16="http://schemas.microsoft.com/office/word/2018/wordml" xmlns:w16du="http://schemas.microsoft.com/office/word/2023/wordml/word16du" xmlns:w16sdtdh="http://schemas.microsoft.com/office/word/2020/wordml/sdtdatahash" xmlns:w16sdtfl="http://schemas.microsoft.com/office/word/2024/wordml/sdtformatlock" xmlns:w16se="http://schemas.microsoft.com/office/word/2015/wordml/symex" xmlns:wpg="http://schemas.microsoft.com/office/word/2010/wordprocessingGroup" xmlns:wpi="http://schemas.microsoft.com/office/word/2010/wordprocessingInk" xmlns:wne="http://schemas.microsoft.com/office/word/2006/wordml" xmlns:wps="http://schemas.microsoft.com/office/word/2010/wordprocessingShape" mc:Ignorable="w14 w15 w16se w16cid w16 w16cex w16sdtdh w16sdtfl w16du wp14">
   <w:abstractNum w:abstractNumId="0" w15:restartNumberingAfterBreak="0">
-    <w:nsid w:val="00C53D2E"/>
+    <w:nsid w:val="06494D01"/>
     <w:multiLevelType w:val="singleLevel"/>
     <w:tmpl w:val="04160001"/>
     <w:lvl w:ilvl="0">
@@ -23521,7 +23555,7 @@
     </w:lvl>
   </w:abstractNum>
   <w:abstractNum w:abstractNumId="1" w15:restartNumberingAfterBreak="0">
-    <w:nsid w:val="0740462F"/>
+    <w:nsid w:val="0B0D1312"/>
     <w:multiLevelType w:val="singleLevel"/>
     <w:tmpl w:val="04160001"/>
     <w:lvl w:ilvl="0">
@@ -23538,7 +23572,7 @@
     </w:lvl>
   </w:abstractNum>
   <w:abstractNum w:abstractNumId="2" w15:restartNumberingAfterBreak="0">
-    <w:nsid w:val="09233D20"/>
+    <w:nsid w:val="0DE835F4"/>
     <w:multiLevelType w:val="singleLevel"/>
     <w:tmpl w:val="04160001"/>
     <w:lvl w:ilvl="0">
@@ -23555,7 +23589,7 @@
     </w:lvl>
   </w:abstractNum>
   <w:abstractNum w:abstractNumId="3" w15:restartNumberingAfterBreak="0">
-    <w:nsid w:val="0AA33520"/>
+    <w:nsid w:val="0E161953"/>
     <w:multiLevelType w:val="singleLevel"/>
     <w:tmpl w:val="04160001"/>
     <w:lvl w:ilvl="0">
@@ -23572,7 +23606,7 @@
     </w:lvl>
   </w:abstractNum>
   <w:abstractNum w:abstractNumId="4" w15:restartNumberingAfterBreak="0">
-    <w:nsid w:val="1C1171FD"/>
+    <w:nsid w:val="11A10CB6"/>
     <w:multiLevelType w:val="singleLevel"/>
     <w:tmpl w:val="04160001"/>
     <w:lvl w:ilvl="0">
@@ -23589,7 +23623,7 @@
     </w:lvl>
   </w:abstractNum>
   <w:abstractNum w:abstractNumId="5" w15:restartNumberingAfterBreak="0">
-    <w:nsid w:val="1DDC44ED"/>
+    <w:nsid w:val="12A91E22"/>
     <w:multiLevelType w:val="singleLevel"/>
     <w:tmpl w:val="04160001"/>
     <w:lvl w:ilvl="0">
@@ -23606,7 +23640,7 @@
     </w:lvl>
   </w:abstractNum>
   <w:abstractNum w:abstractNumId="6" w15:restartNumberingAfterBreak="0">
-    <w:nsid w:val="1E5F5D55"/>
+    <w:nsid w:val="206D2913"/>
     <w:multiLevelType w:val="singleLevel"/>
     <w:tmpl w:val="04160001"/>
     <w:lvl w:ilvl="0">
@@ -23623,7 +23657,7 @@
     </w:lvl>
   </w:abstractNum>
   <w:abstractNum w:abstractNumId="7" w15:restartNumberingAfterBreak="0">
-    <w:nsid w:val="202A2755"/>
+    <w:nsid w:val="20A47789"/>
     <w:multiLevelType w:val="singleLevel"/>
     <w:tmpl w:val="04160001"/>
     <w:lvl w:ilvl="0">
@@ -23640,7 +23674,7 @@
     </w:lvl>
   </w:abstractNum>
   <w:abstractNum w:abstractNumId="8" w15:restartNumberingAfterBreak="0">
-    <w:nsid w:val="23FD5EE8"/>
+    <w:nsid w:val="25BC6128"/>
     <w:multiLevelType w:val="singleLevel"/>
     <w:tmpl w:val="04160001"/>
     <w:lvl w:ilvl="0">
@@ -23657,7 +23691,7 @@
     </w:lvl>
   </w:abstractNum>
   <w:abstractNum w:abstractNumId="9" w15:restartNumberingAfterBreak="0">
-    <w:nsid w:val="26013775"/>
+    <w:nsid w:val="27A654B8"/>
     <w:multiLevelType w:val="singleLevel"/>
     <w:tmpl w:val="04160001"/>
     <w:lvl w:ilvl="0">
@@ -23674,7 +23708,7 @@
     </w:lvl>
   </w:abstractNum>
   <w:abstractNum w:abstractNumId="10" w15:restartNumberingAfterBreak="0">
-    <w:nsid w:val="34143182"/>
+    <w:nsid w:val="300B4093"/>
     <w:multiLevelType w:val="singleLevel"/>
     <w:tmpl w:val="04160001"/>
     <w:lvl w:ilvl="0">
@@ -23691,7 +23725,7 @@
     </w:lvl>
   </w:abstractNum>
   <w:abstractNum w:abstractNumId="11" w15:restartNumberingAfterBreak="0">
-    <w:nsid w:val="34415215"/>
+    <w:nsid w:val="34EB6236"/>
     <w:multiLevelType w:val="singleLevel"/>
     <w:tmpl w:val="04160001"/>
     <w:lvl w:ilvl="0">
@@ -23708,7 +23742,7 @@
     </w:lvl>
   </w:abstractNum>
   <w:abstractNum w:abstractNumId="12" w15:restartNumberingAfterBreak="0">
-    <w:nsid w:val="344163CC"/>
+    <w:nsid w:val="38AB49C9"/>
     <w:multiLevelType w:val="singleLevel"/>
     <w:tmpl w:val="04160001"/>
     <w:lvl w:ilvl="0">
@@ -23725,7 +23759,7 @@
     </w:lvl>
   </w:abstractNum>
   <w:abstractNum w:abstractNumId="13" w15:restartNumberingAfterBreak="0">
-    <w:nsid w:val="34D03D22"/>
+    <w:nsid w:val="3C2A5902"/>
     <w:multiLevelType w:val="singleLevel"/>
     <w:tmpl w:val="04160001"/>
     <w:lvl w:ilvl="0">
@@ -23742,7 +23776,7 @@
     </w:lvl>
   </w:abstractNum>
   <w:abstractNum w:abstractNumId="14" w15:restartNumberingAfterBreak="0">
-    <w:nsid w:val="3FF96929"/>
+    <w:nsid w:val="45C0273E"/>
     <w:multiLevelType w:val="singleLevel"/>
     <w:tmpl w:val="04160001"/>
     <w:lvl w:ilvl="0">
@@ -23759,7 +23793,7 @@
     </w:lvl>
   </w:abstractNum>
   <w:abstractNum w:abstractNumId="15" w15:restartNumberingAfterBreak="0">
-    <w:nsid w:val="407E6EBC"/>
+    <w:nsid w:val="4775272B"/>
     <w:multiLevelType w:val="singleLevel"/>
     <w:tmpl w:val="04160001"/>
     <w:lvl w:ilvl="0">
@@ -23776,7 +23810,7 @@
     </w:lvl>
   </w:abstractNum>
   <w:abstractNum w:abstractNumId="16" w15:restartNumberingAfterBreak="0">
-    <w:nsid w:val="411915A4"/>
+    <w:nsid w:val="479C6FB6"/>
     <w:multiLevelType w:val="singleLevel"/>
     <w:tmpl w:val="04160001"/>
     <w:lvl w:ilvl="0">
@@ -23793,7 +23827,7 @@
     </w:lvl>
   </w:abstractNum>
   <w:abstractNum w:abstractNumId="17" w15:restartNumberingAfterBreak="0">
-    <w:nsid w:val="47427F1B"/>
+    <w:nsid w:val="4A863BFC"/>
     <w:multiLevelType w:val="singleLevel"/>
     <w:tmpl w:val="04160001"/>
     <w:lvl w:ilvl="0">
@@ -23810,7 +23844,7 @@
     </w:lvl>
   </w:abstractNum>
   <w:abstractNum w:abstractNumId="18" w15:restartNumberingAfterBreak="0">
-    <w:nsid w:val="48861249"/>
+    <w:nsid w:val="4D7B249D"/>
     <w:multiLevelType w:val="singleLevel"/>
     <w:tmpl w:val="04160001"/>
     <w:lvl w:ilvl="0">
@@ -23827,7 +23861,7 @@
     </w:lvl>
   </w:abstractNum>
   <w:abstractNum w:abstractNumId="19" w15:restartNumberingAfterBreak="0">
-    <w:nsid w:val="493A6DC1"/>
+    <w:nsid w:val="514B6F60"/>
     <w:multiLevelType w:val="singleLevel"/>
     <w:tmpl w:val="04160001"/>
     <w:lvl w:ilvl="0">
@@ -23844,7 +23878,7 @@
     </w:lvl>
   </w:abstractNum>
   <w:abstractNum w:abstractNumId="20" w15:restartNumberingAfterBreak="0">
-    <w:nsid w:val="4DB72287"/>
+    <w:nsid w:val="52AA02BB"/>
     <w:multiLevelType w:val="singleLevel"/>
     <w:tmpl w:val="04160001"/>
     <w:lvl w:ilvl="0">
@@ -23861,7 +23895,7 @@
     </w:lvl>
   </w:abstractNum>
   <w:abstractNum w:abstractNumId="21" w15:restartNumberingAfterBreak="0">
-    <w:nsid w:val="50EF1A86"/>
+    <w:nsid w:val="531227DB"/>
     <w:multiLevelType w:val="singleLevel"/>
     <w:tmpl w:val="04160001"/>
     <w:lvl w:ilvl="0">
@@ -23878,7 +23912,7 @@
     </w:lvl>
   </w:abstractNum>
   <w:abstractNum w:abstractNumId="22" w15:restartNumberingAfterBreak="0">
-    <w:nsid w:val="575765F3"/>
+    <w:nsid w:val="54551A0C"/>
     <w:multiLevelType w:val="singleLevel"/>
     <w:tmpl w:val="04160001"/>
     <w:lvl w:ilvl="0">
@@ -23895,7 +23929,7 @@
     </w:lvl>
   </w:abstractNum>
   <w:abstractNum w:abstractNumId="23" w15:restartNumberingAfterBreak="0">
-    <w:nsid w:val="585F7B7A"/>
+    <w:nsid w:val="5A8577A9"/>
     <w:multiLevelType w:val="singleLevel"/>
     <w:tmpl w:val="04160001"/>
     <w:lvl w:ilvl="0">
@@ -23912,7 +23946,7 @@
     </w:lvl>
   </w:abstractNum>
   <w:abstractNum w:abstractNumId="24" w15:restartNumberingAfterBreak="0">
-    <w:nsid w:val="5B935A0C"/>
+    <w:nsid w:val="61AB28B2"/>
     <w:multiLevelType w:val="singleLevel"/>
     <w:tmpl w:val="04160001"/>
     <w:lvl w:ilvl="0">
@@ -23929,7 +23963,7 @@
     </w:lvl>
   </w:abstractNum>
   <w:abstractNum w:abstractNumId="25" w15:restartNumberingAfterBreak="0">
-    <w:nsid w:val="63A90C8E"/>
+    <w:nsid w:val="662C7BA1"/>
     <w:multiLevelType w:val="singleLevel"/>
     <w:tmpl w:val="04160001"/>
     <w:lvl w:ilvl="0">
@@ -23946,7 +23980,7 @@
     </w:lvl>
   </w:abstractNum>
   <w:abstractNum w:abstractNumId="26" w15:restartNumberingAfterBreak="0">
-    <w:nsid w:val="64D46D87"/>
+    <w:nsid w:val="6A1F6DDC"/>
     <w:multiLevelType w:val="singleLevel"/>
     <w:tmpl w:val="04160001"/>
     <w:lvl w:ilvl="0">
@@ -23963,7 +23997,7 @@
     </w:lvl>
   </w:abstractNum>
   <w:abstractNum w:abstractNumId="27" w15:restartNumberingAfterBreak="0">
-    <w:nsid w:val="66800C37"/>
+    <w:nsid w:val="71D66DA1"/>
     <w:multiLevelType w:val="singleLevel"/>
     <w:tmpl w:val="04160001"/>
     <w:lvl w:ilvl="0">
@@ -23980,7 +24014,7 @@
     </w:lvl>
   </w:abstractNum>
   <w:abstractNum w:abstractNumId="28" w15:restartNumberingAfterBreak="0">
-    <w:nsid w:val="6AAB6551"/>
+    <w:nsid w:val="728F25A6"/>
     <w:multiLevelType w:val="singleLevel"/>
     <w:tmpl w:val="04160001"/>
     <w:lvl w:ilvl="0">
@@ -23997,7 +24031,7 @@
     </w:lvl>
   </w:abstractNum>
   <w:abstractNum w:abstractNumId="29" w15:restartNumberingAfterBreak="0">
-    <w:nsid w:val="6DA80D08"/>
+    <w:nsid w:val="74B10A13"/>
     <w:multiLevelType w:val="singleLevel"/>
     <w:tmpl w:val="04160001"/>
     <w:lvl w:ilvl="0">
@@ -24014,7 +24048,7 @@
     </w:lvl>
   </w:abstractNum>
   <w:abstractNum w:abstractNumId="30" w15:restartNumberingAfterBreak="0">
-    <w:nsid w:val="6E063C53"/>
+    <w:nsid w:val="769C1494"/>
     <w:multiLevelType w:val="singleLevel"/>
     <w:tmpl w:val="04160001"/>
     <w:lvl w:ilvl="0">
@@ -24031,7 +24065,7 @@
     </w:lvl>
   </w:abstractNum>
   <w:abstractNum w:abstractNumId="31" w15:restartNumberingAfterBreak="0">
-    <w:nsid w:val="6F931EBB"/>
+    <w:nsid w:val="77024EF7"/>
     <w:multiLevelType w:val="singleLevel"/>
     <w:tmpl w:val="04160001"/>
     <w:lvl w:ilvl="0">
@@ -24048,7 +24082,7 @@
     </w:lvl>
   </w:abstractNum>
   <w:abstractNum w:abstractNumId="32" w15:restartNumberingAfterBreak="0">
-    <w:nsid w:val="6FC242D3"/>
+    <w:nsid w:val="7F0D79AA"/>
     <w:multiLevelType w:val="singleLevel"/>
     <w:tmpl w:val="04160001"/>
     <w:lvl w:ilvl="0">
@@ -24064,104 +24098,104 @@
       </w:rPr>
     </w:lvl>
   </w:abstractNum>
-  <w:num w:numId="1" w16cid:durableId="1343974490">
+  <w:num w:numId="1" w16cid:durableId="1559631420">
+    <w:abstractNumId w:val="11"/>
+  </w:num>
+  <w:num w:numId="2" w16cid:durableId="706678550">
+    <w:abstractNumId w:val="24"/>
+  </w:num>
+  <w:num w:numId="3" w16cid:durableId="2319725">
+    <w:abstractNumId w:val="20"/>
+  </w:num>
+  <w:num w:numId="4" w16cid:durableId="20398541">
+    <w:abstractNumId w:val="9"/>
+  </w:num>
+  <w:num w:numId="5" w16cid:durableId="1502819912">
+    <w:abstractNumId w:val="12"/>
+  </w:num>
+  <w:num w:numId="6" w16cid:durableId="192690616">
+    <w:abstractNumId w:val="5"/>
+  </w:num>
+  <w:num w:numId="7" w16cid:durableId="971053456">
+    <w:abstractNumId w:val="26"/>
+  </w:num>
+  <w:num w:numId="8" w16cid:durableId="1786390570">
+    <w:abstractNumId w:val="2"/>
+  </w:num>
+  <w:num w:numId="9" w16cid:durableId="1310094715">
+    <w:abstractNumId w:val="16"/>
+  </w:num>
+  <w:num w:numId="10" w16cid:durableId="540289286">
     <w:abstractNumId w:val="0"/>
   </w:num>
-  <w:num w:numId="2" w16cid:durableId="388654472">
+  <w:num w:numId="11" w16cid:durableId="732124726">
+    <w:abstractNumId w:val="1"/>
+  </w:num>
+  <w:num w:numId="12" w16cid:durableId="1246957771">
+    <w:abstractNumId w:val="28"/>
+  </w:num>
+  <w:num w:numId="13" w16cid:durableId="526065510">
+    <w:abstractNumId w:val="19"/>
+  </w:num>
+  <w:num w:numId="14" w16cid:durableId="2108964369">
+    <w:abstractNumId w:val="14"/>
+  </w:num>
+  <w:num w:numId="15" w16cid:durableId="1167405948">
+    <w:abstractNumId w:val="18"/>
+  </w:num>
+  <w:num w:numId="16" w16cid:durableId="1422019659">
+    <w:abstractNumId w:val="10"/>
+  </w:num>
+  <w:num w:numId="17" w16cid:durableId="374231210">
+    <w:abstractNumId w:val="17"/>
+  </w:num>
+  <w:num w:numId="18" w16cid:durableId="1484590873">
+    <w:abstractNumId w:val="22"/>
+  </w:num>
+  <w:num w:numId="19" w16cid:durableId="310446907">
+    <w:abstractNumId w:val="31"/>
+  </w:num>
+  <w:num w:numId="20" w16cid:durableId="1070269279">
+    <w:abstractNumId w:val="30"/>
+  </w:num>
+  <w:num w:numId="21" w16cid:durableId="537744543">
+    <w:abstractNumId w:val="3"/>
+  </w:num>
+  <w:num w:numId="22" w16cid:durableId="2010330266">
+    <w:abstractNumId w:val="8"/>
+  </w:num>
+  <w:num w:numId="23" w16cid:durableId="1718624997">
+    <w:abstractNumId w:val="27"/>
+  </w:num>
+  <w:num w:numId="24" w16cid:durableId="1552692902">
+    <w:abstractNumId w:val="13"/>
+  </w:num>
+  <w:num w:numId="25" w16cid:durableId="1601841371">
+    <w:abstractNumId w:val="7"/>
+  </w:num>
+  <w:num w:numId="26" w16cid:durableId="1542014915">
+    <w:abstractNumId w:val="15"/>
+  </w:num>
+  <w:num w:numId="27" w16cid:durableId="211036958">
+    <w:abstractNumId w:val="23"/>
+  </w:num>
+  <w:num w:numId="28" w16cid:durableId="2128354859">
+    <w:abstractNumId w:val="32"/>
+  </w:num>
+  <w:num w:numId="29" w16cid:durableId="402340272">
+    <w:abstractNumId w:val="21"/>
+  </w:num>
+  <w:num w:numId="30" w16cid:durableId="42216567">
+    <w:abstractNumId w:val="4"/>
+  </w:num>
+  <w:num w:numId="31" w16cid:durableId="816915448">
+    <w:abstractNumId w:val="6"/>
+  </w:num>
+  <w:num w:numId="32" w16cid:durableId="467555936">
     <w:abstractNumId w:val="25"/>
   </w:num>
-  <w:num w:numId="3" w16cid:durableId="766852192">
-    <w:abstractNumId w:val="30"/>
-  </w:num>
-  <w:num w:numId="4" w16cid:durableId="2119250244">
-    <w:abstractNumId w:val="17"/>
-  </w:num>
-  <w:num w:numId="5" w16cid:durableId="582686002">
-    <w:abstractNumId w:val="24"/>
-  </w:num>
-  <w:num w:numId="6" w16cid:durableId="1120339832">
-    <w:abstractNumId w:val="19"/>
-  </w:num>
-  <w:num w:numId="7" w16cid:durableId="1496259072">
-    <w:abstractNumId w:val="7"/>
-  </w:num>
-  <w:num w:numId="8" w16cid:durableId="551886889">
+  <w:num w:numId="33" w16cid:durableId="534008096">
     <w:abstractNumId w:val="29"/>
-  </w:num>
-  <w:num w:numId="9" w16cid:durableId="1068193421">
-    <w:abstractNumId w:val="4"/>
-  </w:num>
-  <w:num w:numId="10" w16cid:durableId="1953122899">
-    <w:abstractNumId w:val="8"/>
-  </w:num>
-  <w:num w:numId="11" w16cid:durableId="1050573320">
-    <w:abstractNumId w:val="23"/>
-  </w:num>
-  <w:num w:numId="12" w16cid:durableId="1394229496">
-    <w:abstractNumId w:val="9"/>
-  </w:num>
-  <w:num w:numId="13" w16cid:durableId="1112283255">
-    <w:abstractNumId w:val="12"/>
-  </w:num>
-  <w:num w:numId="14" w16cid:durableId="2048993177">
-    <w:abstractNumId w:val="14"/>
-  </w:num>
-  <w:num w:numId="15" w16cid:durableId="449203869">
-    <w:abstractNumId w:val="6"/>
-  </w:num>
-  <w:num w:numId="16" w16cid:durableId="912472776">
-    <w:abstractNumId w:val="20"/>
-  </w:num>
-  <w:num w:numId="17" w16cid:durableId="1225988727">
-    <w:abstractNumId w:val="28"/>
-  </w:num>
-  <w:num w:numId="18" w16cid:durableId="1514879610">
-    <w:abstractNumId w:val="3"/>
-  </w:num>
-  <w:num w:numId="19" w16cid:durableId="823088151">
-    <w:abstractNumId w:val="11"/>
-  </w:num>
-  <w:num w:numId="20" w16cid:durableId="205306">
-    <w:abstractNumId w:val="10"/>
-  </w:num>
-  <w:num w:numId="21" w16cid:durableId="598491278">
-    <w:abstractNumId w:val="16"/>
-  </w:num>
-  <w:num w:numId="22" w16cid:durableId="289408449">
-    <w:abstractNumId w:val="32"/>
-  </w:num>
-  <w:num w:numId="23" w16cid:durableId="475681569">
-    <w:abstractNumId w:val="27"/>
-  </w:num>
-  <w:num w:numId="24" w16cid:durableId="1942566873">
-    <w:abstractNumId w:val="21"/>
-  </w:num>
-  <w:num w:numId="25" w16cid:durableId="1213074668">
-    <w:abstractNumId w:val="31"/>
-  </w:num>
-  <w:num w:numId="26" w16cid:durableId="436371034">
-    <w:abstractNumId w:val="2"/>
-  </w:num>
-  <w:num w:numId="27" w16cid:durableId="1176189033">
-    <w:abstractNumId w:val="15"/>
-  </w:num>
-  <w:num w:numId="28" w16cid:durableId="1254053257">
-    <w:abstractNumId w:val="5"/>
-  </w:num>
-  <w:num w:numId="29" w16cid:durableId="2103409215">
-    <w:abstractNumId w:val="1"/>
-  </w:num>
-  <w:num w:numId="30" w16cid:durableId="1930112258">
-    <w:abstractNumId w:val="26"/>
-  </w:num>
-  <w:num w:numId="31" w16cid:durableId="467237013">
-    <w:abstractNumId w:val="18"/>
-  </w:num>
-  <w:num w:numId="32" w16cid:durableId="652611088">
-    <w:abstractNumId w:val="13"/>
-  </w:num>
-  <w:num w:numId="33" w16cid:durableId="1579712375">
-    <w:abstractNumId w:val="22"/>
   </w:num>
 </w:numbering>
 </file>
@@ -24574,7 +24608,7 @@
     <w:link w:val="Ttulo1Char"/>
     <w:uiPriority w:val="9"/>
     <w:qFormat/>
-    <w:rsid w:val="00A30922"/>
+    <w:rsid w:val="005A7C0F"/>
     <w:pPr>
       <w:keepNext/>
       <w:keepLines/>
@@ -24596,7 +24630,7 @@
     <w:uiPriority w:val="9"/>
     <w:unhideWhenUsed/>
     <w:qFormat/>
-    <w:rsid w:val="00A30922"/>
+    <w:rsid w:val="005A7C0F"/>
     <w:pPr>
       <w:keepNext/>
       <w:keepLines/>
@@ -24619,7 +24653,7 @@
     <w:semiHidden/>
     <w:unhideWhenUsed/>
     <w:qFormat/>
-    <w:rsid w:val="00A30922"/>
+    <w:rsid w:val="005A7C0F"/>
     <w:pPr>
       <w:keepNext/>
       <w:keepLines/>
@@ -24642,7 +24676,7 @@
     <w:semiHidden/>
     <w:unhideWhenUsed/>
     <w:qFormat/>
-    <w:rsid w:val="00A30922"/>
+    <w:rsid w:val="005A7C0F"/>
     <w:pPr>
       <w:keepNext/>
       <w:keepLines/>
@@ -24665,7 +24699,7 @@
     <w:semiHidden/>
     <w:unhideWhenUsed/>
     <w:qFormat/>
-    <w:rsid w:val="00A30922"/>
+    <w:rsid w:val="005A7C0F"/>
     <w:pPr>
       <w:keepNext/>
       <w:keepLines/>
@@ -24686,7 +24720,7 @@
     <w:semiHidden/>
     <w:unhideWhenUsed/>
     <w:qFormat/>
-    <w:rsid w:val="00A30922"/>
+    <w:rsid w:val="005A7C0F"/>
     <w:pPr>
       <w:keepNext/>
       <w:keepLines/>
@@ -24709,7 +24743,7 @@
     <w:semiHidden/>
     <w:unhideWhenUsed/>
     <w:qFormat/>
-    <w:rsid w:val="00A30922"/>
+    <w:rsid w:val="005A7C0F"/>
     <w:pPr>
       <w:keepNext/>
       <w:keepLines/>
@@ -24730,7 +24764,7 @@
     <w:semiHidden/>
     <w:unhideWhenUsed/>
     <w:qFormat/>
-    <w:rsid w:val="00A30922"/>
+    <w:rsid w:val="005A7C0F"/>
     <w:pPr>
       <w:keepNext/>
       <w:keepLines/>
@@ -24753,7 +24787,7 @@
     <w:semiHidden/>
     <w:unhideWhenUsed/>
     <w:qFormat/>
-    <w:rsid w:val="00A30922"/>
+    <w:rsid w:val="005A7C0F"/>
     <w:pPr>
       <w:keepNext/>
       <w:keepLines/>
@@ -24797,7 +24831,7 @@
     <w:basedOn w:val="Fontepargpadro"/>
     <w:link w:val="Ttulo1"/>
     <w:uiPriority w:val="9"/>
-    <w:rsid w:val="00A30922"/>
+    <w:rsid w:val="005A7C0F"/>
     <w:rPr>
       <w:rFonts w:asciiTheme="majorHAnsi" w:eastAsiaTheme="majorEastAsia" w:hAnsiTheme="majorHAnsi" w:cstheme="majorBidi"/>
       <w:color w:val="0F4761" w:themeColor="accent1" w:themeShade="BF"/>
@@ -24810,7 +24844,7 @@
     <w:basedOn w:val="Fontepargpadro"/>
     <w:link w:val="Ttulo2"/>
     <w:uiPriority w:val="9"/>
-    <w:rsid w:val="00A30922"/>
+    <w:rsid w:val="005A7C0F"/>
     <w:rPr>
       <w:rFonts w:asciiTheme="majorHAnsi" w:eastAsiaTheme="majorEastAsia" w:hAnsiTheme="majorHAnsi" w:cstheme="majorBidi"/>
       <w:color w:val="0F4761" w:themeColor="accent1" w:themeShade="BF"/>
@@ -24824,7 +24858,7 @@
     <w:link w:val="Ttulo3"/>
     <w:uiPriority w:val="9"/>
     <w:semiHidden/>
-    <w:rsid w:val="00A30922"/>
+    <w:rsid w:val="005A7C0F"/>
     <w:rPr>
       <w:rFonts w:eastAsiaTheme="majorEastAsia" w:cstheme="majorBidi"/>
       <w:color w:val="0F4761" w:themeColor="accent1" w:themeShade="BF"/>
@@ -24838,7 +24872,7 @@
     <w:link w:val="Ttulo4"/>
     <w:uiPriority w:val="9"/>
     <w:semiHidden/>
-    <w:rsid w:val="00A30922"/>
+    <w:rsid w:val="005A7C0F"/>
     <w:rPr>
       <w:rFonts w:eastAsiaTheme="majorEastAsia" w:cstheme="majorBidi"/>
       <w:i/>
@@ -24852,7 +24886,7 @@
     <w:link w:val="Ttulo5"/>
     <w:uiPriority w:val="9"/>
     <w:semiHidden/>
-    <w:rsid w:val="00A30922"/>
+    <w:rsid w:val="005A7C0F"/>
     <w:rPr>
       <w:rFonts w:eastAsiaTheme="majorEastAsia" w:cstheme="majorBidi"/>
       <w:color w:val="0F4761" w:themeColor="accent1" w:themeShade="BF"/>
@@ -24864,7 +24898,7 @@
     <w:link w:val="Ttulo6"/>
     <w:uiPriority w:val="9"/>
     <w:semiHidden/>
-    <w:rsid w:val="00A30922"/>
+    <w:rsid w:val="005A7C0F"/>
     <w:rPr>
       <w:rFonts w:eastAsiaTheme="majorEastAsia" w:cstheme="majorBidi"/>
       <w:i/>
@@ -24878,7 +24912,7 @@
     <w:link w:val="Ttulo7"/>
     <w:uiPriority w:val="9"/>
     <w:semiHidden/>
-    <w:rsid w:val="00A30922"/>
+    <w:rsid w:val="005A7C0F"/>
     <w:rPr>
       <w:rFonts w:eastAsiaTheme="majorEastAsia" w:cstheme="majorBidi"/>
       <w:color w:val="595959" w:themeColor="text1" w:themeTint="A6"/>
@@ -24890,7 +24924,7 @@
     <w:link w:val="Ttulo8"/>
     <w:uiPriority w:val="9"/>
     <w:semiHidden/>
-    <w:rsid w:val="00A30922"/>
+    <w:rsid w:val="005A7C0F"/>
     <w:rPr>
       <w:rFonts w:eastAsiaTheme="majorEastAsia" w:cstheme="majorBidi"/>
       <w:i/>
@@ -24904,7 +24938,7 @@
     <w:link w:val="Ttulo9"/>
     <w:uiPriority w:val="9"/>
     <w:semiHidden/>
-    <w:rsid w:val="00A30922"/>
+    <w:rsid w:val="005A7C0F"/>
     <w:rPr>
       <w:rFonts w:eastAsiaTheme="majorEastAsia" w:cstheme="majorBidi"/>
       <w:color w:val="272727" w:themeColor="text1" w:themeTint="D8"/>
@@ -24917,7 +24951,7 @@
     <w:link w:val="TtuloChar"/>
     <w:uiPriority w:val="10"/>
     <w:qFormat/>
-    <w:rsid w:val="00A30922"/>
+    <w:rsid w:val="005A7C0F"/>
     <w:pPr>
       <w:spacing w:after="80" w:line="240" w:lineRule="auto"/>
       <w:contextualSpacing/>
@@ -24935,7 +24969,7 @@
     <w:basedOn w:val="Fontepargpadro"/>
     <w:link w:val="Ttulo"/>
     <w:uiPriority w:val="10"/>
-    <w:rsid w:val="00A30922"/>
+    <w:rsid w:val="005A7C0F"/>
     <w:rPr>
       <w:rFonts w:asciiTheme="majorHAnsi" w:eastAsiaTheme="majorEastAsia" w:hAnsiTheme="majorHAnsi" w:cstheme="majorBidi"/>
       <w:spacing w:val="-10"/>
@@ -24951,7 +24985,7 @@
     <w:link w:val="SubttuloChar"/>
     <w:uiPriority w:val="11"/>
     <w:qFormat/>
-    <w:rsid w:val="00A30922"/>
+    <w:rsid w:val="005A7C0F"/>
     <w:pPr>
       <w:numPr>
         <w:ilvl w:val="1"/>
@@ -24970,7 +25004,7 @@
     <w:basedOn w:val="Fontepargpadro"/>
     <w:link w:val="Subttulo"/>
     <w:uiPriority w:val="11"/>
-    <w:rsid w:val="00A30922"/>
+    <w:rsid w:val="005A7C0F"/>
     <w:rPr>
       <w:rFonts w:eastAsiaTheme="majorEastAsia" w:cstheme="majorBidi"/>
       <w:color w:val="595959" w:themeColor="text1" w:themeTint="A6"/>
@@ -24986,7 +25020,7 @@
     <w:link w:val="CitaoChar"/>
     <w:uiPriority w:val="29"/>
     <w:qFormat/>
-    <w:rsid w:val="00A30922"/>
+    <w:rsid w:val="005A7C0F"/>
     <w:pPr>
       <w:spacing w:before="160"/>
       <w:jc w:val="center"/>
@@ -25002,7 +25036,7 @@
     <w:basedOn w:val="Fontepargpadro"/>
     <w:link w:val="Citao"/>
     <w:uiPriority w:val="29"/>
-    <w:rsid w:val="00A30922"/>
+    <w:rsid w:val="005A7C0F"/>
     <w:rPr>
       <w:i/>
       <w:iCs/>
@@ -25014,7 +25048,7 @@
     <w:basedOn w:val="Normal"/>
     <w:uiPriority w:val="34"/>
     <w:qFormat/>
-    <w:rsid w:val="00A30922"/>
+    <w:rsid w:val="005A7C0F"/>
     <w:pPr>
       <w:ind w:left="720"/>
       <w:contextualSpacing/>
@@ -25025,7 +25059,7 @@
     <w:basedOn w:val="Fontepargpadro"/>
     <w:uiPriority w:val="21"/>
     <w:qFormat/>
-    <w:rsid w:val="00A30922"/>
+    <w:rsid w:val="005A7C0F"/>
     <w:rPr>
       <w:i/>
       <w:iCs/>
@@ -25039,7 +25073,7 @@
     <w:link w:val="CitaoIntensaChar"/>
     <w:uiPriority w:val="30"/>
     <w:qFormat/>
-    <w:rsid w:val="00A30922"/>
+    <w:rsid w:val="005A7C0F"/>
     <w:pPr>
       <w:pBdr>
         <w:top w:val="single" w:sz="4" w:space="10" w:color="0F4761" w:themeColor="accent1" w:themeShade="BF"/>
@@ -25060,7 +25094,7 @@
     <w:basedOn w:val="Fontepargpadro"/>
     <w:link w:val="CitaoIntensa"/>
     <w:uiPriority w:val="30"/>
-    <w:rsid w:val="00A30922"/>
+    <w:rsid w:val="005A7C0F"/>
     <w:rPr>
       <w:i/>
       <w:iCs/>
@@ -25072,7 +25106,7 @@
     <w:basedOn w:val="Fontepargpadro"/>
     <w:uiPriority w:val="32"/>
     <w:qFormat/>
-    <w:rsid w:val="00A30922"/>
+    <w:rsid w:val="005A7C0F"/>
     <w:rPr>
       <w:b/>
       <w:bCs/>
@@ -25087,7 +25121,7 @@
     <w:link w:val="CabealhoChar"/>
     <w:uiPriority w:val="99"/>
     <w:unhideWhenUsed/>
-    <w:rsid w:val="00A30922"/>
+    <w:rsid w:val="005A7C0F"/>
     <w:pPr>
       <w:tabs>
         <w:tab w:val="center" w:pos="4252"/>
@@ -25101,7 +25135,7 @@
     <w:basedOn w:val="Fontepargpadro"/>
     <w:link w:val="Cabealho"/>
     <w:uiPriority w:val="99"/>
-    <w:rsid w:val="00A30922"/>
+    <w:rsid w:val="005A7C0F"/>
   </w:style>
   <w:style w:type="paragraph" w:styleId="Rodap">
     <w:name w:val="footer"/>
@@ -25109,7 +25143,7 @@
     <w:link w:val="RodapChar"/>
     <w:uiPriority w:val="99"/>
     <w:unhideWhenUsed/>
-    <w:rsid w:val="00A30922"/>
+    <w:rsid w:val="005A7C0F"/>
     <w:pPr>
       <w:tabs>
         <w:tab w:val="center" w:pos="4252"/>
@@ -25123,7 +25157,7 @@
     <w:basedOn w:val="Fontepargpadro"/>
     <w:link w:val="Rodap"/>
     <w:uiPriority w:val="99"/>
-    <w:rsid w:val="00A30922"/>
+    <w:rsid w:val="005A7C0F"/>
   </w:style>
   <w:style w:type="paragraph" w:styleId="Sumrio1">
     <w:name w:val="toc 1"/>
@@ -25132,7 +25166,7 @@
     <w:autoRedefine/>
     <w:uiPriority w:val="39"/>
     <w:unhideWhenUsed/>
-    <w:rsid w:val="00A30922"/>
+    <w:rsid w:val="005A7C0F"/>
     <w:pPr>
       <w:spacing w:after="100"/>
     </w:pPr>
@@ -25144,7 +25178,7 @@
     <w:autoRedefine/>
     <w:uiPriority w:val="39"/>
     <w:unhideWhenUsed/>
-    <w:rsid w:val="00A30922"/>
+    <w:rsid w:val="005A7C0F"/>
     <w:pPr>
       <w:spacing w:after="100"/>
       <w:ind w:left="240"/>

</xml_diff>

<commit_message>
Corrige aperto de layout na tabela de Cronograma do Planejamento
A coluna Tarefas (Fase 1 da proposta de detalhamento do cronograma)
foi adicionada sem aumentar a largura mínima da tabela, apertando as
9 colunas na mesma largura antes usada por 8 — texto de Marco/Entrega,
Responsável e as datas ficava cortado/muito espremido em campos mais
longos (ex.: responsável com vários nomes).

Aumenta a largura mínima da tabela de Cronograma especificamente
(1180px, via seletor #tbl-cronograma — as demais 9 tabelas do arquivo
continuam com 760px) e redistribui a largura relativa das colunas,
dando mais espaço a Marco/Entrega, Responsável e às três datas, às
custas de Custo e Depende nº (conteúdo tipicamente mais curto). Sem
mudança de comportamento, só de layout.

Atualiza o Manual de Uso (v2.68).

Co-Authored-By: Claude Sonnet 5 <noreply@anthropic.com>
</commit_message>
<xml_diff>
--- a/Manual de Uso - Ferramenta de Gestao de Projetos.docx
+++ b/Manual de Uso - Ferramenta de Gestao de Projetos.docx
@@ -229,7 +229,7 @@
         <w:rPr>
           <w:noProof/>
         </w:rPr>
-        <w:instrText xml:space="preserve"> PAGEREF _Toc240274103 \h </w:instrText>
+        <w:instrText xml:space="preserve"> PAGEREF _Toc240275425 \h </w:instrText>
       </w:r>
       <w:r>
         <w:rPr>
@@ -290,7 +290,7 @@
         <w:rPr>
           <w:noProof/>
         </w:rPr>
-        <w:instrText xml:space="preserve"> PAGEREF _Toc240274104 \h </w:instrText>
+        <w:instrText xml:space="preserve"> PAGEREF _Toc240275426 \h </w:instrText>
       </w:r>
       <w:r>
         <w:rPr>
@@ -351,7 +351,7 @@
         <w:rPr>
           <w:noProof/>
         </w:rPr>
-        <w:instrText xml:space="preserve"> PAGEREF _Toc240274105 \h </w:instrText>
+        <w:instrText xml:space="preserve"> PAGEREF _Toc240275427 \h </w:instrText>
       </w:r>
       <w:r>
         <w:rPr>
@@ -368,7 +368,7 @@
         <w:rPr>
           <w:noProof/>
         </w:rPr>
-        <w:t>17</w:t>
+        <w:t>18</w:t>
       </w:r>
       <w:r>
         <w:rPr>
@@ -412,7 +412,7 @@
         <w:rPr>
           <w:noProof/>
         </w:rPr>
-        <w:instrText xml:space="preserve"> PAGEREF _Toc240274106 \h </w:instrText>
+        <w:instrText xml:space="preserve"> PAGEREF _Toc240275428 \h </w:instrText>
       </w:r>
       <w:r>
         <w:rPr>
@@ -473,7 +473,7 @@
         <w:rPr>
           <w:noProof/>
         </w:rPr>
-        <w:instrText xml:space="preserve"> PAGEREF _Toc240274107 \h </w:instrText>
+        <w:instrText xml:space="preserve"> PAGEREF _Toc240275429 \h </w:instrText>
       </w:r>
       <w:r>
         <w:rPr>
@@ -534,7 +534,7 @@
         <w:rPr>
           <w:noProof/>
         </w:rPr>
-        <w:instrText xml:space="preserve"> PAGEREF _Toc240274108 \h </w:instrText>
+        <w:instrText xml:space="preserve"> PAGEREF _Toc240275430 \h </w:instrText>
       </w:r>
       <w:r>
         <w:rPr>
@@ -551,7 +551,7 @@
         <w:rPr>
           <w:noProof/>
         </w:rPr>
-        <w:t>21</w:t>
+        <w:t>22</w:t>
       </w:r>
       <w:r>
         <w:rPr>
@@ -595,7 +595,7 @@
         <w:rPr>
           <w:noProof/>
         </w:rPr>
-        <w:instrText xml:space="preserve"> PAGEREF _Toc240274109 \h </w:instrText>
+        <w:instrText xml:space="preserve"> PAGEREF _Toc240275431 \h </w:instrText>
       </w:r>
       <w:r>
         <w:rPr>
@@ -612,7 +612,7 @@
         <w:rPr>
           <w:noProof/>
         </w:rPr>
-        <w:t>21</w:t>
+        <w:t>22</w:t>
       </w:r>
       <w:r>
         <w:rPr>
@@ -656,7 +656,7 @@
         <w:rPr>
           <w:noProof/>
         </w:rPr>
-        <w:instrText xml:space="preserve"> PAGEREF _Toc240274110 \h </w:instrText>
+        <w:instrText xml:space="preserve"> PAGEREF _Toc240275432 \h </w:instrText>
       </w:r>
       <w:r>
         <w:rPr>
@@ -673,7 +673,7 @@
         <w:rPr>
           <w:noProof/>
         </w:rPr>
-        <w:t>21</w:t>
+        <w:t>22</w:t>
       </w:r>
       <w:r>
         <w:rPr>
@@ -717,7 +717,7 @@
         <w:rPr>
           <w:noProof/>
         </w:rPr>
-        <w:instrText xml:space="preserve"> PAGEREF _Toc240274111 \h </w:instrText>
+        <w:instrText xml:space="preserve"> PAGEREF _Toc240275433 \h </w:instrText>
       </w:r>
       <w:r>
         <w:rPr>
@@ -734,7 +734,7 @@
         <w:rPr>
           <w:noProof/>
         </w:rPr>
-        <w:t>21</w:t>
+        <w:t>22</w:t>
       </w:r>
       <w:r>
         <w:rPr>
@@ -778,7 +778,7 @@
         <w:rPr>
           <w:noProof/>
         </w:rPr>
-        <w:instrText xml:space="preserve"> PAGEREF _Toc240274112 \h </w:instrText>
+        <w:instrText xml:space="preserve"> PAGEREF _Toc240275434 \h </w:instrText>
       </w:r>
       <w:r>
         <w:rPr>
@@ -795,7 +795,7 @@
         <w:rPr>
           <w:noProof/>
         </w:rPr>
-        <w:t>22</w:t>
+        <w:t>23</w:t>
       </w:r>
       <w:r>
         <w:rPr>
@@ -839,7 +839,7 @@
         <w:rPr>
           <w:noProof/>
         </w:rPr>
-        <w:instrText xml:space="preserve"> PAGEREF _Toc240274113 \h </w:instrText>
+        <w:instrText xml:space="preserve"> PAGEREF _Toc240275435 \h </w:instrText>
       </w:r>
       <w:r>
         <w:rPr>
@@ -856,7 +856,7 @@
         <w:rPr>
           <w:noProof/>
         </w:rPr>
-        <w:t>23</w:t>
+        <w:t>24</w:t>
       </w:r>
       <w:r>
         <w:rPr>
@@ -900,7 +900,7 @@
         <w:rPr>
           <w:noProof/>
         </w:rPr>
-        <w:instrText xml:space="preserve"> PAGEREF _Toc240274114 \h </w:instrText>
+        <w:instrText xml:space="preserve"> PAGEREF _Toc240275436 \h </w:instrText>
       </w:r>
       <w:r>
         <w:rPr>
@@ -917,7 +917,7 @@
         <w:rPr>
           <w:noProof/>
         </w:rPr>
-        <w:t>25</w:t>
+        <w:t>26</w:t>
       </w:r>
       <w:r>
         <w:rPr>
@@ -961,7 +961,7 @@
         <w:rPr>
           <w:noProof/>
         </w:rPr>
-        <w:instrText xml:space="preserve"> PAGEREF _Toc240274115 \h </w:instrText>
+        <w:instrText xml:space="preserve"> PAGEREF _Toc240275437 \h </w:instrText>
       </w:r>
       <w:r>
         <w:rPr>
@@ -978,7 +978,7 @@
         <w:rPr>
           <w:noProof/>
         </w:rPr>
-        <w:t>26</w:t>
+        <w:t>27</w:t>
       </w:r>
       <w:r>
         <w:rPr>
@@ -1022,7 +1022,7 @@
         <w:rPr>
           <w:noProof/>
         </w:rPr>
-        <w:instrText xml:space="preserve"> PAGEREF _Toc240274116 \h </w:instrText>
+        <w:instrText xml:space="preserve"> PAGEREF _Toc240275438 \h </w:instrText>
       </w:r>
       <w:r>
         <w:rPr>
@@ -1039,7 +1039,7 @@
         <w:rPr>
           <w:noProof/>
         </w:rPr>
-        <w:t>27</w:t>
+        <w:t>28</w:t>
       </w:r>
       <w:r>
         <w:rPr>
@@ -1083,7 +1083,7 @@
         <w:rPr>
           <w:noProof/>
         </w:rPr>
-        <w:instrText xml:space="preserve"> PAGEREF _Toc240274117 \h </w:instrText>
+        <w:instrText xml:space="preserve"> PAGEREF _Toc240275439 \h </w:instrText>
       </w:r>
       <w:r>
         <w:rPr>
@@ -1100,7 +1100,7 @@
         <w:rPr>
           <w:noProof/>
         </w:rPr>
-        <w:t>27</w:t>
+        <w:t>28</w:t>
       </w:r>
       <w:r>
         <w:rPr>
@@ -1144,7 +1144,7 @@
         <w:rPr>
           <w:noProof/>
         </w:rPr>
-        <w:instrText xml:space="preserve"> PAGEREF _Toc240274118 \h </w:instrText>
+        <w:instrText xml:space="preserve"> PAGEREF _Toc240275440 \h </w:instrText>
       </w:r>
       <w:r>
         <w:rPr>
@@ -1161,7 +1161,7 @@
         <w:rPr>
           <w:noProof/>
         </w:rPr>
-        <w:t>28</w:t>
+        <w:t>29</w:t>
       </w:r>
       <w:r>
         <w:rPr>
@@ -1205,7 +1205,7 @@
         <w:rPr>
           <w:noProof/>
         </w:rPr>
-        <w:instrText xml:space="preserve"> PAGEREF _Toc240274119 \h </w:instrText>
+        <w:instrText xml:space="preserve"> PAGEREF _Toc240275441 \h </w:instrText>
       </w:r>
       <w:r>
         <w:rPr>
@@ -1222,7 +1222,7 @@
         <w:rPr>
           <w:noProof/>
         </w:rPr>
-        <w:t>29</w:t>
+        <w:t>30</w:t>
       </w:r>
       <w:r>
         <w:rPr>
@@ -1266,7 +1266,7 @@
         <w:rPr>
           <w:noProof/>
         </w:rPr>
-        <w:instrText xml:space="preserve"> PAGEREF _Toc240274120 \h </w:instrText>
+        <w:instrText xml:space="preserve"> PAGEREF _Toc240275442 \h </w:instrText>
       </w:r>
       <w:r>
         <w:rPr>
@@ -1283,7 +1283,7 @@
         <w:rPr>
           <w:noProof/>
         </w:rPr>
-        <w:t>29</w:t>
+        <w:t>30</w:t>
       </w:r>
       <w:r>
         <w:rPr>
@@ -1327,7 +1327,7 @@
         <w:rPr>
           <w:noProof/>
         </w:rPr>
-        <w:instrText xml:space="preserve"> PAGEREF _Toc240274121 \h </w:instrText>
+        <w:instrText xml:space="preserve"> PAGEREF _Toc240275443 \h </w:instrText>
       </w:r>
       <w:r>
         <w:rPr>
@@ -1344,7 +1344,7 @@
         <w:rPr>
           <w:noProof/>
         </w:rPr>
-        <w:t>31</w:t>
+        <w:t>32</w:t>
       </w:r>
       <w:r>
         <w:rPr>
@@ -1388,7 +1388,7 @@
         <w:rPr>
           <w:noProof/>
         </w:rPr>
-        <w:instrText xml:space="preserve"> PAGEREF _Toc240274122 \h </w:instrText>
+        <w:instrText xml:space="preserve"> PAGEREF _Toc240275444 \h </w:instrText>
       </w:r>
       <w:r>
         <w:rPr>
@@ -1405,7 +1405,7 @@
         <w:rPr>
           <w:noProof/>
         </w:rPr>
-        <w:t>33</w:t>
+        <w:t>34</w:t>
       </w:r>
       <w:r>
         <w:rPr>
@@ -1449,7 +1449,7 @@
         <w:rPr>
           <w:noProof/>
         </w:rPr>
-        <w:instrText xml:space="preserve"> PAGEREF _Toc240274123 \h </w:instrText>
+        <w:instrText xml:space="preserve"> PAGEREF _Toc240275445 \h </w:instrText>
       </w:r>
       <w:r>
         <w:rPr>
@@ -1466,7 +1466,7 @@
         <w:rPr>
           <w:noProof/>
         </w:rPr>
-        <w:t>33</w:t>
+        <w:t>34</w:t>
       </w:r>
       <w:r>
         <w:rPr>
@@ -1510,7 +1510,7 @@
         <w:rPr>
           <w:noProof/>
         </w:rPr>
-        <w:instrText xml:space="preserve"> PAGEREF _Toc240274124 \h </w:instrText>
+        <w:instrText xml:space="preserve"> PAGEREF _Toc240275446 \h </w:instrText>
       </w:r>
       <w:r>
         <w:rPr>
@@ -1527,7 +1527,7 @@
         <w:rPr>
           <w:noProof/>
         </w:rPr>
-        <w:t>36</w:t>
+        <w:t>37</w:t>
       </w:r>
       <w:r>
         <w:rPr>
@@ -1571,7 +1571,7 @@
         <w:rPr>
           <w:noProof/>
         </w:rPr>
-        <w:instrText xml:space="preserve"> PAGEREF _Toc240274125 \h </w:instrText>
+        <w:instrText xml:space="preserve"> PAGEREF _Toc240275447 \h </w:instrText>
       </w:r>
       <w:r>
         <w:rPr>
@@ -1588,7 +1588,7 @@
         <w:rPr>
           <w:noProof/>
         </w:rPr>
-        <w:t>38</w:t>
+        <w:t>39</w:t>
       </w:r>
       <w:r>
         <w:rPr>
@@ -1632,7 +1632,7 @@
         <w:rPr>
           <w:noProof/>
         </w:rPr>
-        <w:instrText xml:space="preserve"> PAGEREF _Toc240274126 \h </w:instrText>
+        <w:instrText xml:space="preserve"> PAGEREF _Toc240275448 \h </w:instrText>
       </w:r>
       <w:r>
         <w:rPr>
@@ -1649,7 +1649,7 @@
         <w:rPr>
           <w:noProof/>
         </w:rPr>
-        <w:t>42</w:t>
+        <w:t>43</w:t>
       </w:r>
       <w:r>
         <w:rPr>
@@ -1693,7 +1693,7 @@
         <w:rPr>
           <w:noProof/>
         </w:rPr>
-        <w:instrText xml:space="preserve"> PAGEREF _Toc240274127 \h </w:instrText>
+        <w:instrText xml:space="preserve"> PAGEREF _Toc240275449 \h </w:instrText>
       </w:r>
       <w:r>
         <w:rPr>
@@ -1710,7 +1710,7 @@
         <w:rPr>
           <w:noProof/>
         </w:rPr>
-        <w:t>46</w:t>
+        <w:t>47</w:t>
       </w:r>
       <w:r>
         <w:rPr>
@@ -1755,7 +1755,7 @@
         <w:rPr>
           <w:noProof/>
         </w:rPr>
-        <w:instrText xml:space="preserve"> PAGEREF _Toc240274128 \h </w:instrText>
+        <w:instrText xml:space="preserve"> PAGEREF _Toc240275450 \h </w:instrText>
       </w:r>
       <w:r>
         <w:rPr>
@@ -1772,7 +1772,7 @@
         <w:rPr>
           <w:noProof/>
         </w:rPr>
-        <w:t>49</w:t>
+        <w:t>50</w:t>
       </w:r>
       <w:r>
         <w:rPr>
@@ -1816,7 +1816,7 @@
         <w:rPr>
           <w:noProof/>
         </w:rPr>
-        <w:instrText xml:space="preserve"> PAGEREF _Toc240274129 \h </w:instrText>
+        <w:instrText xml:space="preserve"> PAGEREF _Toc240275451 \h </w:instrText>
       </w:r>
       <w:r>
         <w:rPr>
@@ -1833,7 +1833,7 @@
         <w:rPr>
           <w:noProof/>
         </w:rPr>
-        <w:t>51</w:t>
+        <w:t>52</w:t>
       </w:r>
       <w:r>
         <w:rPr>
@@ -1877,7 +1877,7 @@
         <w:rPr>
           <w:noProof/>
         </w:rPr>
-        <w:instrText xml:space="preserve"> PAGEREF _Toc240274130 \h </w:instrText>
+        <w:instrText xml:space="preserve"> PAGEREF _Toc240275452 \h </w:instrText>
       </w:r>
       <w:r>
         <w:rPr>
@@ -1894,7 +1894,7 @@
         <w:rPr>
           <w:noProof/>
         </w:rPr>
-        <w:t>53</w:t>
+        <w:t>54</w:t>
       </w:r>
       <w:r>
         <w:rPr>
@@ -1938,7 +1938,7 @@
         <w:rPr>
           <w:noProof/>
         </w:rPr>
-        <w:instrText xml:space="preserve"> PAGEREF _Toc240274131 \h </w:instrText>
+        <w:instrText xml:space="preserve"> PAGEREF _Toc240275453 \h </w:instrText>
       </w:r>
       <w:r>
         <w:rPr>
@@ -1955,7 +1955,7 @@
         <w:rPr>
           <w:noProof/>
         </w:rPr>
-        <w:t>56</w:t>
+        <w:t>57</w:t>
       </w:r>
       <w:r>
         <w:rPr>
@@ -1999,7 +1999,7 @@
         <w:rPr>
           <w:noProof/>
         </w:rPr>
-        <w:instrText xml:space="preserve"> PAGEREF _Toc240274132 \h </w:instrText>
+        <w:instrText xml:space="preserve"> PAGEREF _Toc240275454 \h </w:instrText>
       </w:r>
       <w:r>
         <w:rPr>
@@ -2016,7 +2016,7 @@
         <w:rPr>
           <w:noProof/>
         </w:rPr>
-        <w:t>58</w:t>
+        <w:t>59</w:t>
       </w:r>
       <w:r>
         <w:rPr>
@@ -2060,7 +2060,7 @@
         <w:rPr>
           <w:noProof/>
         </w:rPr>
-        <w:instrText xml:space="preserve"> PAGEREF _Toc240274133 \h </w:instrText>
+        <w:instrText xml:space="preserve"> PAGEREF _Toc240275455 \h </w:instrText>
       </w:r>
       <w:r>
         <w:rPr>
@@ -2077,7 +2077,7 @@
         <w:rPr>
           <w:noProof/>
         </w:rPr>
-        <w:t>60</w:t>
+        <w:t>61</w:t>
       </w:r>
       <w:r>
         <w:rPr>
@@ -2121,7 +2121,7 @@
         <w:rPr>
           <w:noProof/>
         </w:rPr>
-        <w:instrText xml:space="preserve"> PAGEREF _Toc240274134 \h </w:instrText>
+        <w:instrText xml:space="preserve"> PAGEREF _Toc240275456 \h </w:instrText>
       </w:r>
       <w:r>
         <w:rPr>
@@ -2138,7 +2138,7 @@
         <w:rPr>
           <w:noProof/>
         </w:rPr>
-        <w:t>60</w:t>
+        <w:t>61</w:t>
       </w:r>
       <w:r>
         <w:rPr>
@@ -2182,7 +2182,7 @@
         <w:rPr>
           <w:noProof/>
         </w:rPr>
-        <w:instrText xml:space="preserve"> PAGEREF _Toc240274135 \h </w:instrText>
+        <w:instrText xml:space="preserve"> PAGEREF _Toc240275457 \h </w:instrText>
       </w:r>
       <w:r>
         <w:rPr>
@@ -2199,7 +2199,7 @@
         <w:rPr>
           <w:noProof/>
         </w:rPr>
-        <w:t>67</w:t>
+        <w:t>68</w:t>
       </w:r>
       <w:r>
         <w:rPr>
@@ -2243,7 +2243,7 @@
         <w:rPr>
           <w:noProof/>
         </w:rPr>
-        <w:instrText xml:space="preserve"> PAGEREF _Toc240274136 \h </w:instrText>
+        <w:instrText xml:space="preserve"> PAGEREF _Toc240275458 \h </w:instrText>
       </w:r>
       <w:r>
         <w:rPr>
@@ -2260,7 +2260,7 @@
         <w:rPr>
           <w:noProof/>
         </w:rPr>
-        <w:t>72</w:t>
+        <w:t>73</w:t>
       </w:r>
       <w:r>
         <w:rPr>
@@ -2304,7 +2304,7 @@
         <w:rPr>
           <w:noProof/>
         </w:rPr>
-        <w:instrText xml:space="preserve"> PAGEREF _Toc240274137 \h </w:instrText>
+        <w:instrText xml:space="preserve"> PAGEREF _Toc240275459 \h </w:instrText>
       </w:r>
       <w:r>
         <w:rPr>
@@ -2321,7 +2321,7 @@
         <w:rPr>
           <w:noProof/>
         </w:rPr>
-        <w:t>72</w:t>
+        <w:t>73</w:t>
       </w:r>
       <w:r>
         <w:rPr>
@@ -2365,7 +2365,7 @@
         <w:rPr>
           <w:noProof/>
         </w:rPr>
-        <w:instrText xml:space="preserve"> PAGEREF _Toc240274138 \h </w:instrText>
+        <w:instrText xml:space="preserve"> PAGEREF _Toc240275460 \h </w:instrText>
       </w:r>
       <w:r>
         <w:rPr>
@@ -2382,7 +2382,7 @@
         <w:rPr>
           <w:noProof/>
         </w:rPr>
-        <w:t>73</w:t>
+        <w:t>74</w:t>
       </w:r>
       <w:r>
         <w:rPr>
@@ -2426,7 +2426,7 @@
         <w:rPr>
           <w:noProof/>
         </w:rPr>
-        <w:instrText xml:space="preserve"> PAGEREF _Toc240274139 \h </w:instrText>
+        <w:instrText xml:space="preserve"> PAGEREF _Toc240275461 \h </w:instrText>
       </w:r>
       <w:r>
         <w:rPr>
@@ -2443,7 +2443,7 @@
         <w:rPr>
           <w:noProof/>
         </w:rPr>
-        <w:t>73</w:t>
+        <w:t>74</w:t>
       </w:r>
       <w:r>
         <w:rPr>
@@ -2487,7 +2487,7 @@
         <w:rPr>
           <w:noProof/>
         </w:rPr>
-        <w:instrText xml:space="preserve"> PAGEREF _Toc240274140 \h </w:instrText>
+        <w:instrText xml:space="preserve"> PAGEREF _Toc240275462 \h </w:instrText>
       </w:r>
       <w:r>
         <w:rPr>
@@ -2504,7 +2504,7 @@
         <w:rPr>
           <w:noProof/>
         </w:rPr>
-        <w:t>76</w:t>
+        <w:t>77</w:t>
       </w:r>
       <w:r>
         <w:rPr>
@@ -2548,7 +2548,7 @@
         <w:rPr>
           <w:noProof/>
         </w:rPr>
-        <w:instrText xml:space="preserve"> PAGEREF _Toc240274141 \h </w:instrText>
+        <w:instrText xml:space="preserve"> PAGEREF _Toc240275463 \h </w:instrText>
       </w:r>
       <w:r>
         <w:rPr>
@@ -2565,7 +2565,7 @@
         <w:rPr>
           <w:noProof/>
         </w:rPr>
-        <w:t>76</w:t>
+        <w:t>77</w:t>
       </w:r>
       <w:r>
         <w:rPr>
@@ -2609,7 +2609,7 @@
         <w:rPr>
           <w:noProof/>
         </w:rPr>
-        <w:instrText xml:space="preserve"> PAGEREF _Toc240274142 \h </w:instrText>
+        <w:instrText xml:space="preserve"> PAGEREF _Toc240275464 \h </w:instrText>
       </w:r>
       <w:r>
         <w:rPr>
@@ -2626,7 +2626,7 @@
         <w:rPr>
           <w:noProof/>
         </w:rPr>
-        <w:t>78</w:t>
+        <w:t>79</w:t>
       </w:r>
       <w:r>
         <w:rPr>
@@ -2670,7 +2670,7 @@
         <w:rPr>
           <w:noProof/>
         </w:rPr>
-        <w:instrText xml:space="preserve"> PAGEREF _Toc240274143 \h </w:instrText>
+        <w:instrText xml:space="preserve"> PAGEREF _Toc240275465 \h </w:instrText>
       </w:r>
       <w:r>
         <w:rPr>
@@ -2687,7 +2687,7 @@
         <w:rPr>
           <w:noProof/>
         </w:rPr>
-        <w:t>78</w:t>
+        <w:t>79</w:t>
       </w:r>
       <w:r>
         <w:rPr>
@@ -2731,7 +2731,7 @@
         <w:rPr>
           <w:noProof/>
         </w:rPr>
-        <w:instrText xml:space="preserve"> PAGEREF _Toc240274144 \h </w:instrText>
+        <w:instrText xml:space="preserve"> PAGEREF _Toc240275466 \h </w:instrText>
       </w:r>
       <w:r>
         <w:rPr>
@@ -2748,7 +2748,7 @@
         <w:rPr>
           <w:noProof/>
         </w:rPr>
-        <w:t>80</w:t>
+        <w:t>81</w:t>
       </w:r>
       <w:r>
         <w:rPr>
@@ -2792,7 +2792,7 @@
         <w:rPr>
           <w:noProof/>
         </w:rPr>
-        <w:instrText xml:space="preserve"> PAGEREF _Toc240274145 \h </w:instrText>
+        <w:instrText xml:space="preserve"> PAGEREF _Toc240275467 \h </w:instrText>
       </w:r>
       <w:r>
         <w:rPr>
@@ -2809,7 +2809,7 @@
         <w:rPr>
           <w:noProof/>
         </w:rPr>
-        <w:t>83</w:t>
+        <w:t>84</w:t>
       </w:r>
       <w:r>
         <w:rPr>
@@ -2853,7 +2853,7 @@
         <w:rPr>
           <w:noProof/>
         </w:rPr>
-        <w:instrText xml:space="preserve"> PAGEREF _Toc240274146 \h </w:instrText>
+        <w:instrText xml:space="preserve"> PAGEREF _Toc240275468 \h </w:instrText>
       </w:r>
       <w:r>
         <w:rPr>
@@ -2870,7 +2870,7 @@
         <w:rPr>
           <w:noProof/>
         </w:rPr>
-        <w:t>86</w:t>
+        <w:t>87</w:t>
       </w:r>
       <w:r>
         <w:rPr>
@@ -2914,7 +2914,7 @@
         <w:rPr>
           <w:noProof/>
         </w:rPr>
-        <w:instrText xml:space="preserve"> PAGEREF _Toc240274147 \h </w:instrText>
+        <w:instrText xml:space="preserve"> PAGEREF _Toc240275469 \h </w:instrText>
       </w:r>
       <w:r>
         <w:rPr>
@@ -2931,7 +2931,7 @@
         <w:rPr>
           <w:noProof/>
         </w:rPr>
-        <w:t>87</w:t>
+        <w:t>88</w:t>
       </w:r>
       <w:r>
         <w:rPr>
@@ -2975,7 +2975,7 @@
         <w:rPr>
           <w:noProof/>
         </w:rPr>
-        <w:instrText xml:space="preserve"> PAGEREF _Toc240274148 \h </w:instrText>
+        <w:instrText xml:space="preserve"> PAGEREF _Toc240275470 \h </w:instrText>
       </w:r>
       <w:r>
         <w:rPr>
@@ -2992,7 +2992,7 @@
         <w:rPr>
           <w:noProof/>
         </w:rPr>
-        <w:t>88</w:t>
+        <w:t>89</w:t>
       </w:r>
       <w:r>
         <w:rPr>
@@ -3036,7 +3036,7 @@
         <w:rPr>
           <w:noProof/>
         </w:rPr>
-        <w:instrText xml:space="preserve"> PAGEREF _Toc240274149 \h </w:instrText>
+        <w:instrText xml:space="preserve"> PAGEREF _Toc240275471 \h </w:instrText>
       </w:r>
       <w:r>
         <w:rPr>
@@ -3053,7 +3053,7 @@
         <w:rPr>
           <w:noProof/>
         </w:rPr>
-        <w:t>92</w:t>
+        <w:t>93</w:t>
       </w:r>
       <w:r>
         <w:rPr>
@@ -3097,7 +3097,7 @@
         <w:rPr>
           <w:noProof/>
         </w:rPr>
-        <w:instrText xml:space="preserve"> PAGEREF _Toc240274150 \h </w:instrText>
+        <w:instrText xml:space="preserve"> PAGEREF _Toc240275472 \h </w:instrText>
       </w:r>
       <w:r>
         <w:rPr>
@@ -3114,7 +3114,7 @@
         <w:rPr>
           <w:noProof/>
         </w:rPr>
-        <w:t>93</w:t>
+        <w:t>94</w:t>
       </w:r>
       <w:r>
         <w:rPr>
@@ -3173,7 +3173,7 @@
           <w:sz w:val="34"/>
         </w:rPr>
       </w:pPr>
-      <w:bookmarkStart w:id="0" w:name="_Toc240274103"/>
+      <w:bookmarkStart w:id="0" w:name="_Toc240275425"/>
       <w:r>
         <w:rPr>
           <w:rFonts w:ascii="Montserrat" w:hAnsi="Montserrat"/>
@@ -3197,7 +3197,7 @@
           <w:sz w:val="27"/>
         </w:rPr>
       </w:pPr>
-      <w:bookmarkStart w:id="1" w:name="_Toc240274104"/>
+      <w:bookmarkStart w:id="1" w:name="_Toc240275426"/>
       <w:r>
         <w:rPr>
           <w:rFonts w:ascii="Montserrat" w:hAnsi="Montserrat"/>
@@ -4575,6 +4575,24 @@
           <w:color w:val="1A1A1A"/>
           <w:sz w:val="22"/>
         </w:rPr>
+        <w:t>Esta e a versao 2.68 do manual. Em relacao a versao 2.67 (14/09/2026), foi corrigido um aperto de layout na tabela de Cronograma do Planejamento (Passo 4, aba 3): a largura minima da tabela aumentou (para acomodar as 9 colunas de forma legivel, apos a coluna Tarefas ter sido adicionada na Fase 1 do detalhamento do cronograma) e as colunas Marco/Entrega, Responsavel e as tres datas ganharam mais espaco relativo, as custas de Custo e Depende nÂº, que normalmente tem conteudo mais curto. Sem mudanca de comportamento - apenas ajuste de layout, corrigindo texto cortado/muito espremido em campos com nomes ou responsaveis mais longos.</w:t>
+      </w:r>
+    </w:p>
+    <w:p>
+      <w:pPr>
+        <w:spacing w:line="280" w:lineRule="auto"/>
+        <w:rPr>
+          <w:rFonts w:ascii="Montserrat" w:hAnsi="Montserrat"/>
+          <w:color w:val="1A1A1A"/>
+          <w:sz w:val="22"/>
+        </w:rPr>
+      </w:pPr>
+      <w:r>
+        <w:rPr>
+          <w:rFonts w:ascii="Montserrat" w:hAnsi="Montserrat"/>
+          <w:color w:val="1A1A1A"/>
+          <w:sz w:val="22"/>
+        </w:rPr>
         <w:t>O manual nao substitui as Diretrizes para a Gestao de Projetos da UNIALFA (documento institucional que define o framework D01 a D07) nem o documento Regras de Acesso e Permissoes (que detalha cada regra de controle de acesso); ele e o guia operacional de como usar cada ferramenta na pratica.</w:t>
       </w:r>
     </w:p>
@@ -4589,7 +4607,7 @@
           <w:sz w:val="27"/>
         </w:rPr>
       </w:pPr>
-      <w:bookmarkStart w:id="2" w:name="_Toc240274105"/>
+      <w:bookmarkStart w:id="2" w:name="_Toc240275427"/>
       <w:r>
         <w:rPr>
           <w:rFonts w:ascii="Montserrat" w:hAnsi="Montserrat"/>
@@ -4597,6 +4615,7 @@
           <w:color w:val="B91D2E"/>
           <w:sz w:val="27"/>
         </w:rPr>
+        <w:lastRenderedPageBreak/>
         <w:t>1.2 Visao geral da ferramenta</w:t>
       </w:r>
       <w:bookmarkEnd w:id="2"/>
@@ -4688,7 +4707,6 @@
           <w:color w:val="1A1A1A"/>
           <w:sz w:val="22"/>
         </w:rPr>
-        <w:lastRenderedPageBreak/>
         <w:t>1 pagina de Administracao, restrita a Admin, para gerenciar usuarios, equipes e configuracoes do sistema.</w:t>
       </w:r>
     </w:p>
@@ -4785,17 +4803,18 @@
         <w:rPr>
           <w:noProof/>
         </w:rPr>
+        <w:lastRenderedPageBreak/>
         <w:drawing>
-          <wp:inline distT="0" distB="0" distL="0" distR="0" wp14:anchorId="36376B64" wp14:editId="280E5290">
+          <wp:inline distT="0" distB="0" distL="0" distR="0" wp14:anchorId="1DC219B3" wp14:editId="45ED97BC">
             <wp:extent cx="5303520" cy="4792851"/>
             <wp:effectExtent l="19050" t="19050" r="11430" b="27305"/>
-            <wp:docPr id="1583428360" name="Imagem 1"/>
+            <wp:docPr id="2055485955" name="Imagem 1"/>
             <wp:cNvGraphicFramePr/>
             <a:graphic xmlns:a="http://schemas.openxmlformats.org/drawingml/2006/main">
               <a:graphicData uri="http://schemas.openxmlformats.org/drawingml/2006/picture">
                 <pic:pic xmlns:pic="http://schemas.openxmlformats.org/drawingml/2006/picture">
                   <pic:nvPicPr>
-                    <pic:cNvPr id="1583428360" name=""/>
+                    <pic:cNvPr id="2055485955" name=""/>
                     <pic:cNvPicPr/>
                   </pic:nvPicPr>
                   <pic:blipFill>
@@ -4863,7 +4882,7 @@
           <w:sz w:val="27"/>
         </w:rPr>
       </w:pPr>
-      <w:bookmarkStart w:id="3" w:name="_Toc240274106"/>
+      <w:bookmarkStart w:id="3" w:name="_Toc240275428"/>
       <w:r>
         <w:rPr>
           <w:rFonts w:ascii="Montserrat" w:hAnsi="Montserrat"/>
@@ -4871,7 +4890,6 @@
           <w:color w:val="B91D2E"/>
           <w:sz w:val="27"/>
         </w:rPr>
-        <w:lastRenderedPageBreak/>
         <w:t>1.3 Como acessar e fazer login</w:t>
       </w:r>
       <w:bookmarkEnd w:id="3"/>
@@ -4903,17 +4921,18 @@
         <w:rPr>
           <w:noProof/>
         </w:rPr>
+        <w:lastRenderedPageBreak/>
         <w:drawing>
-          <wp:inline distT="0" distB="0" distL="0" distR="0" wp14:anchorId="147F1A92" wp14:editId="09D8FEC8">
+          <wp:inline distT="0" distB="0" distL="0" distR="0" wp14:anchorId="314100B1" wp14:editId="059D44A6">
             <wp:extent cx="4206240" cy="3801227"/>
             <wp:effectExtent l="19050" t="19050" r="22860" b="27940"/>
-            <wp:docPr id="621358444" name="Imagem 2"/>
+            <wp:docPr id="1916909051" name="Imagem 2"/>
             <wp:cNvGraphicFramePr/>
             <a:graphic xmlns:a="http://schemas.openxmlformats.org/drawingml/2006/main">
               <a:graphicData uri="http://schemas.openxmlformats.org/drawingml/2006/picture">
                 <pic:pic xmlns:pic="http://schemas.openxmlformats.org/drawingml/2006/picture">
                   <pic:nvPicPr>
-                    <pic:cNvPr id="621358444" name=""/>
+                    <pic:cNvPr id="1916909051" name=""/>
                     <pic:cNvPicPr/>
                   </pic:nvPicPr>
                   <pic:blipFill>
@@ -5086,7 +5105,7 @@
           <w:sz w:val="27"/>
         </w:rPr>
       </w:pPr>
-      <w:bookmarkStart w:id="4" w:name="_Toc240274107"/>
+      <w:bookmarkStart w:id="4" w:name="_Toc240275429"/>
       <w:r>
         <w:rPr>
           <w:rFonts w:ascii="Montserrat" w:hAnsi="Montserrat"/>
@@ -5094,7 +5113,6 @@
           <w:color w:val="B91D2E"/>
           <w:sz w:val="27"/>
         </w:rPr>
-        <w:lastRenderedPageBreak/>
         <w:t>1.4 Como a ferramenta se relaciona com as Diretrizes (D01-D07)</w:t>
       </w:r>
       <w:bookmarkEnd w:id="4"/>
@@ -5169,6 +5187,7 @@
                 <w:color w:val="FFFFFF"/>
                 <w:sz w:val="19"/>
               </w:rPr>
+              <w:lastRenderedPageBreak/>
               <w:t>Passo</w:t>
             </w:r>
           </w:p>
@@ -6325,7 +6344,7 @@
           <w:sz w:val="34"/>
         </w:rPr>
       </w:pPr>
-      <w:bookmarkStart w:id="5" w:name="_Toc240274108"/>
+      <w:bookmarkStart w:id="5" w:name="_Toc240275430"/>
       <w:r>
         <w:rPr>
           <w:rFonts w:ascii="Montserrat" w:hAnsi="Montserrat"/>
@@ -6349,7 +6368,7 @@
           <w:sz w:val="27"/>
         </w:rPr>
       </w:pPr>
-      <w:bookmarkStart w:id="6" w:name="_Toc240274109"/>
+      <w:bookmarkStart w:id="6" w:name="_Toc240275431"/>
       <w:r>
         <w:rPr>
           <w:rFonts w:ascii="Montserrat" w:hAnsi="Montserrat"/>
@@ -6390,7 +6409,7 @@
           <w:sz w:val="27"/>
         </w:rPr>
       </w:pPr>
-      <w:bookmarkStart w:id="7" w:name="_Toc240274110"/>
+      <w:bookmarkStart w:id="7" w:name="_Toc240275432"/>
       <w:r>
         <w:rPr>
           <w:rFonts w:ascii="Montserrat" w:hAnsi="Montserrat"/>
@@ -6509,7 +6528,7 @@
           <w:sz w:val="27"/>
         </w:rPr>
       </w:pPr>
-      <w:bookmarkStart w:id="8" w:name="_Toc240274111"/>
+      <w:bookmarkStart w:id="8" w:name="_Toc240275433"/>
       <w:r>
         <w:rPr>
           <w:rFonts w:ascii="Montserrat" w:hAnsi="Montserrat"/>
@@ -7122,7 +7141,7 @@
           <w:sz w:val="27"/>
         </w:rPr>
       </w:pPr>
-      <w:bookmarkStart w:id="9" w:name="_Toc240274112"/>
+      <w:bookmarkStart w:id="9" w:name="_Toc240275434"/>
       <w:r>
         <w:rPr>
           <w:rFonts w:ascii="Montserrat" w:hAnsi="Montserrat"/>
@@ -7211,16 +7230,16 @@
         </w:rPr>
         <w:lastRenderedPageBreak/>
         <w:drawing>
-          <wp:inline distT="0" distB="0" distL="0" distR="0" wp14:anchorId="18EFAF1C" wp14:editId="1EEDB83C">
+          <wp:inline distT="0" distB="0" distL="0" distR="0" wp14:anchorId="5088DAD2" wp14:editId="24FFF1BC">
             <wp:extent cx="4937760" cy="4462310"/>
             <wp:effectExtent l="19050" t="19050" r="15240" b="14605"/>
-            <wp:docPr id="1383274013" name="Imagem 3"/>
+            <wp:docPr id="985358177" name="Imagem 3"/>
             <wp:cNvGraphicFramePr/>
             <a:graphic xmlns:a="http://schemas.openxmlformats.org/drawingml/2006/main">
               <a:graphicData uri="http://schemas.openxmlformats.org/drawingml/2006/picture">
                 <pic:pic xmlns:pic="http://schemas.openxmlformats.org/drawingml/2006/picture">
                   <pic:nvPicPr>
-                    <pic:cNvPr id="1383274013" name=""/>
+                    <pic:cNvPr id="985358177" name=""/>
                     <pic:cNvPicPr/>
                   </pic:nvPicPr>
                   <pic:blipFill>
@@ -7288,7 +7307,7 @@
           <w:sz w:val="27"/>
         </w:rPr>
       </w:pPr>
-      <w:bookmarkStart w:id="10" w:name="_Toc240274113"/>
+      <w:bookmarkStart w:id="10" w:name="_Toc240275435"/>
       <w:r>
         <w:rPr>
           <w:rFonts w:ascii="Montserrat" w:hAnsi="Montserrat"/>
@@ -7329,16 +7348,16 @@
         </w:rPr>
         <w:lastRenderedPageBreak/>
         <w:drawing>
-          <wp:inline distT="0" distB="0" distL="0" distR="0" wp14:anchorId="5E800777" wp14:editId="7989DAD1">
+          <wp:inline distT="0" distB="0" distL="0" distR="0" wp14:anchorId="6D80DF07" wp14:editId="2AEFEC4A">
             <wp:extent cx="5120640" cy="4627581"/>
             <wp:effectExtent l="19050" t="19050" r="22860" b="20955"/>
-            <wp:docPr id="1893630054" name="Imagem 4"/>
+            <wp:docPr id="210257309" name="Imagem 4"/>
             <wp:cNvGraphicFramePr/>
             <a:graphic xmlns:a="http://schemas.openxmlformats.org/drawingml/2006/main">
               <a:graphicData uri="http://schemas.openxmlformats.org/drawingml/2006/picture">
                 <pic:pic xmlns:pic="http://schemas.openxmlformats.org/drawingml/2006/picture">
                   <pic:nvPicPr>
-                    <pic:cNvPr id="1893630054" name=""/>
+                    <pic:cNvPr id="210257309" name=""/>
                     <pic:cNvPicPr/>
                   </pic:nvPicPr>
                   <pic:blipFill>
@@ -7506,7 +7525,7 @@
           <w:sz w:val="27"/>
         </w:rPr>
       </w:pPr>
-      <w:bookmarkStart w:id="11" w:name="_Toc240274114"/>
+      <w:bookmarkStart w:id="11" w:name="_Toc240275436"/>
       <w:r>
         <w:rPr>
           <w:rFonts w:ascii="Montserrat" w:hAnsi="Montserrat"/>
@@ -7546,16 +7565,16 @@
           <w:noProof/>
         </w:rPr>
         <w:drawing>
-          <wp:inline distT="0" distB="0" distL="0" distR="0" wp14:anchorId="4856ED94" wp14:editId="2AEE0F98">
+          <wp:inline distT="0" distB="0" distL="0" distR="0" wp14:anchorId="65FA5280" wp14:editId="06FBD168">
             <wp:extent cx="4206240" cy="3801227"/>
             <wp:effectExtent l="19050" t="19050" r="22860" b="27940"/>
-            <wp:docPr id="1385831276" name="Imagem 5"/>
+            <wp:docPr id="1995683262" name="Imagem 5"/>
             <wp:cNvGraphicFramePr/>
             <a:graphic xmlns:a="http://schemas.openxmlformats.org/drawingml/2006/main">
               <a:graphicData uri="http://schemas.openxmlformats.org/drawingml/2006/picture">
                 <pic:pic xmlns:pic="http://schemas.openxmlformats.org/drawingml/2006/picture">
                   <pic:nvPicPr>
-                    <pic:cNvPr id="1385831276" name=""/>
+                    <pic:cNvPr id="1995683262" name=""/>
                     <pic:cNvPicPr/>
                   </pic:nvPicPr>
                   <pic:blipFill>
@@ -7623,16 +7642,16 @@
         </w:rPr>
         <w:lastRenderedPageBreak/>
         <w:drawing>
-          <wp:inline distT="0" distB="0" distL="0" distR="0" wp14:anchorId="784E56CB" wp14:editId="3A996CC2">
+          <wp:inline distT="0" distB="0" distL="0" distR="0" wp14:anchorId="02757E9A" wp14:editId="6EF6A3EE">
             <wp:extent cx="4206240" cy="3801227"/>
             <wp:effectExtent l="19050" t="19050" r="22860" b="27940"/>
-            <wp:docPr id="1922985015" name="Imagem 6"/>
+            <wp:docPr id="1849133266" name="Imagem 6"/>
             <wp:cNvGraphicFramePr/>
             <a:graphic xmlns:a="http://schemas.openxmlformats.org/drawingml/2006/main">
               <a:graphicData uri="http://schemas.openxmlformats.org/drawingml/2006/picture">
                 <pic:pic xmlns:pic="http://schemas.openxmlformats.org/drawingml/2006/picture">
                   <pic:nvPicPr>
-                    <pic:cNvPr id="1922985015" name=""/>
+                    <pic:cNvPr id="1849133266" name=""/>
                     <pic:cNvPicPr/>
                   </pic:nvPicPr>
                   <pic:blipFill>
@@ -7748,7 +7767,7 @@
           <w:sz w:val="27"/>
         </w:rPr>
       </w:pPr>
-      <w:bookmarkStart w:id="12" w:name="_Toc240274115"/>
+      <w:bookmarkStart w:id="12" w:name="_Toc240275437"/>
       <w:r>
         <w:rPr>
           <w:rFonts w:ascii="Montserrat" w:hAnsi="Montserrat"/>
@@ -7816,7 +7835,7 @@
           <w:sz w:val="27"/>
         </w:rPr>
       </w:pPr>
-      <w:bookmarkStart w:id="13" w:name="_Toc240274116"/>
+      <w:bookmarkStart w:id="13" w:name="_Toc240275438"/>
       <w:r>
         <w:rPr>
           <w:rFonts w:ascii="Montserrat" w:hAnsi="Montserrat"/>
@@ -8043,7 +8062,7 @@
           <w:sz w:val="27"/>
         </w:rPr>
       </w:pPr>
-      <w:bookmarkStart w:id="14" w:name="_Toc240274117"/>
+      <w:bookmarkStart w:id="14" w:name="_Toc240275439"/>
       <w:r>
         <w:rPr>
           <w:rFonts w:ascii="Montserrat" w:hAnsi="Montserrat"/>
@@ -8202,7 +8221,7 @@
           <w:sz w:val="27"/>
         </w:rPr>
       </w:pPr>
-      <w:bookmarkStart w:id="15" w:name="_Toc240274118"/>
+      <w:bookmarkStart w:id="15" w:name="_Toc240275440"/>
       <w:r>
         <w:rPr>
           <w:rFonts w:ascii="Montserrat" w:hAnsi="Montserrat"/>
@@ -8394,7 +8413,7 @@
           <w:sz w:val="27"/>
         </w:rPr>
       </w:pPr>
-      <w:bookmarkStart w:id="16" w:name="_Toc240274119"/>
+      <w:bookmarkStart w:id="16" w:name="_Toc240275441"/>
       <w:r>
         <w:rPr>
           <w:rFonts w:ascii="Montserrat" w:hAnsi="Montserrat"/>
@@ -8522,7 +8541,7 @@
           <w:sz w:val="27"/>
         </w:rPr>
       </w:pPr>
-      <w:bookmarkStart w:id="17" w:name="_Toc240274120"/>
+      <w:bookmarkStart w:id="17" w:name="_Toc240275442"/>
       <w:r>
         <w:rPr>
           <w:rFonts w:ascii="Montserrat" w:hAnsi="Montserrat"/>
@@ -8852,7 +8871,7 @@
           <w:sz w:val="27"/>
         </w:rPr>
       </w:pPr>
-      <w:bookmarkStart w:id="18" w:name="_Toc240274121"/>
+      <w:bookmarkStart w:id="18" w:name="_Toc240275443"/>
       <w:r>
         <w:rPr>
           <w:rFonts w:ascii="Montserrat" w:hAnsi="Montserrat"/>
@@ -8993,7 +9012,7 @@
           <w:sz w:val="34"/>
         </w:rPr>
       </w:pPr>
-      <w:bookmarkStart w:id="19" w:name="_Toc240274122"/>
+      <w:bookmarkStart w:id="19" w:name="_Toc240275444"/>
       <w:r>
         <w:rPr>
           <w:rFonts w:ascii="Montserrat" w:hAnsi="Montserrat"/>
@@ -9035,7 +9054,7 @@
           <w:sz w:val="27"/>
         </w:rPr>
       </w:pPr>
-      <w:bookmarkStart w:id="20" w:name="_Toc240274123"/>
+      <w:bookmarkStart w:id="20" w:name="_Toc240275445"/>
       <w:r>
         <w:rPr>
           <w:rFonts w:ascii="Montserrat" w:hAnsi="Montserrat"/>
@@ -10115,16 +10134,16 @@
         </w:rPr>
         <w:lastRenderedPageBreak/>
         <w:drawing>
-          <wp:inline distT="0" distB="0" distL="0" distR="0" wp14:anchorId="0451861E" wp14:editId="3B8267B8">
+          <wp:inline distT="0" distB="0" distL="0" distR="0" wp14:anchorId="7D0172E7" wp14:editId="6DEDD271">
             <wp:extent cx="5120640" cy="4627581"/>
             <wp:effectExtent l="19050" t="19050" r="22860" b="20955"/>
-            <wp:docPr id="1583043190" name="Imagem 7"/>
+            <wp:docPr id="2111149256" name="Imagem 7"/>
             <wp:cNvGraphicFramePr/>
             <a:graphic xmlns:a="http://schemas.openxmlformats.org/drawingml/2006/main">
               <a:graphicData uri="http://schemas.openxmlformats.org/drawingml/2006/picture">
                 <pic:pic xmlns:pic="http://schemas.openxmlformats.org/drawingml/2006/picture">
                   <pic:nvPicPr>
-                    <pic:cNvPr id="1583043190" name=""/>
+                    <pic:cNvPr id="2111149256" name=""/>
                     <pic:cNvPicPr/>
                   </pic:nvPicPr>
                   <pic:blipFill>
@@ -10192,16 +10211,16 @@
         </w:rPr>
         <w:lastRenderedPageBreak/>
         <w:drawing>
-          <wp:inline distT="0" distB="0" distL="0" distR="0" wp14:anchorId="6030AE88" wp14:editId="4FB28D69">
+          <wp:inline distT="0" distB="0" distL="0" distR="0" wp14:anchorId="3B5D858E" wp14:editId="0FAE9637">
             <wp:extent cx="5120640" cy="4627581"/>
             <wp:effectExtent l="19050" t="19050" r="22860" b="20955"/>
-            <wp:docPr id="7938079" name="Imagem 8"/>
+            <wp:docPr id="1417423510" name="Imagem 8"/>
             <wp:cNvGraphicFramePr/>
             <a:graphic xmlns:a="http://schemas.openxmlformats.org/drawingml/2006/main">
               <a:graphicData uri="http://schemas.openxmlformats.org/drawingml/2006/picture">
                 <pic:pic xmlns:pic="http://schemas.openxmlformats.org/drawingml/2006/picture">
                   <pic:nvPicPr>
-                    <pic:cNvPr id="7938079" name=""/>
+                    <pic:cNvPr id="1417423510" name=""/>
                     <pic:cNvPicPr/>
                   </pic:nvPicPr>
                   <pic:blipFill>
@@ -10409,7 +10428,7 @@
           <w:sz w:val="27"/>
         </w:rPr>
       </w:pPr>
-      <w:bookmarkStart w:id="21" w:name="_Toc240274124"/>
+      <w:bookmarkStart w:id="21" w:name="_Toc240275446"/>
       <w:r>
         <w:rPr>
           <w:rFonts w:ascii="Montserrat" w:hAnsi="Montserrat"/>
@@ -11334,16 +11353,16 @@
           <w:noProof/>
         </w:rPr>
         <w:drawing>
-          <wp:inline distT="0" distB="0" distL="0" distR="0" wp14:anchorId="64380455" wp14:editId="47544E5E">
+          <wp:inline distT="0" distB="0" distL="0" distR="0" wp14:anchorId="5C8F8FF1" wp14:editId="12C9114D">
             <wp:extent cx="5120640" cy="4627581"/>
             <wp:effectExtent l="19050" t="19050" r="22860" b="20955"/>
-            <wp:docPr id="1788256600" name="Imagem 9"/>
+            <wp:docPr id="1483262122" name="Imagem 9"/>
             <wp:cNvGraphicFramePr/>
             <a:graphic xmlns:a="http://schemas.openxmlformats.org/drawingml/2006/main">
               <a:graphicData uri="http://schemas.openxmlformats.org/drawingml/2006/picture">
                 <pic:pic xmlns:pic="http://schemas.openxmlformats.org/drawingml/2006/picture">
                   <pic:nvPicPr>
-                    <pic:cNvPr id="1788256600" name=""/>
+                    <pic:cNvPr id="1483262122" name=""/>
                     <pic:cNvPicPr/>
                   </pic:nvPicPr>
                   <pic:blipFill>
@@ -11411,16 +11430,16 @@
         </w:rPr>
         <w:lastRenderedPageBreak/>
         <w:drawing>
-          <wp:inline distT="0" distB="0" distL="0" distR="0" wp14:anchorId="31E30CEF" wp14:editId="18E63944">
+          <wp:inline distT="0" distB="0" distL="0" distR="0" wp14:anchorId="61ADA6DB" wp14:editId="56155998">
             <wp:extent cx="5120640" cy="4627581"/>
             <wp:effectExtent l="19050" t="19050" r="22860" b="20955"/>
-            <wp:docPr id="997255079" name="Imagem 10"/>
+            <wp:docPr id="499925638" name="Imagem 10"/>
             <wp:cNvGraphicFramePr/>
             <a:graphic xmlns:a="http://schemas.openxmlformats.org/drawingml/2006/main">
               <a:graphicData uri="http://schemas.openxmlformats.org/drawingml/2006/picture">
                 <pic:pic xmlns:pic="http://schemas.openxmlformats.org/drawingml/2006/picture">
                   <pic:nvPicPr>
-                    <pic:cNvPr id="997255079" name=""/>
+                    <pic:cNvPr id="499925638" name=""/>
                     <pic:cNvPicPr/>
                   </pic:nvPicPr>
                   <pic:blipFill>
@@ -11554,7 +11573,7 @@
           <w:sz w:val="27"/>
         </w:rPr>
       </w:pPr>
-      <w:bookmarkStart w:id="22" w:name="_Toc240274125"/>
+      <w:bookmarkStart w:id="22" w:name="_Toc240275447"/>
       <w:r>
         <w:rPr>
           <w:rFonts w:ascii="Montserrat" w:hAnsi="Montserrat"/>
@@ -12620,16 +12639,16 @@
           <w:noProof/>
         </w:rPr>
         <w:drawing>
-          <wp:inline distT="0" distB="0" distL="0" distR="0" wp14:anchorId="75DC1DA1" wp14:editId="77F36441">
+          <wp:inline distT="0" distB="0" distL="0" distR="0" wp14:anchorId="2BAF624D" wp14:editId="3BB74F43">
             <wp:extent cx="5120640" cy="3338440"/>
             <wp:effectExtent l="19050" t="19050" r="22860" b="14605"/>
-            <wp:docPr id="1497066616" name="Imagem 11"/>
+            <wp:docPr id="1534108310" name="Imagem 11"/>
             <wp:cNvGraphicFramePr/>
             <a:graphic xmlns:a="http://schemas.openxmlformats.org/drawingml/2006/main">
               <a:graphicData uri="http://schemas.openxmlformats.org/drawingml/2006/picture">
                 <pic:pic xmlns:pic="http://schemas.openxmlformats.org/drawingml/2006/picture">
                   <pic:nvPicPr>
-                    <pic:cNvPr id="1497066616" name=""/>
+                    <pic:cNvPr id="1534108310" name=""/>
                     <pic:cNvPicPr/>
                   </pic:nvPicPr>
                   <pic:blipFill>
@@ -12697,16 +12716,16 @@
         </w:rPr>
         <w:lastRenderedPageBreak/>
         <w:drawing>
-          <wp:inline distT="0" distB="0" distL="0" distR="0" wp14:anchorId="7623D016" wp14:editId="75928151">
+          <wp:inline distT="0" distB="0" distL="0" distR="0" wp14:anchorId="5635F99A" wp14:editId="73F64567">
             <wp:extent cx="5120640" cy="4627581"/>
             <wp:effectExtent l="19050" t="19050" r="22860" b="20955"/>
-            <wp:docPr id="1176866289" name="Imagem 12"/>
+            <wp:docPr id="1862155335" name="Imagem 12"/>
             <wp:cNvGraphicFramePr/>
             <a:graphic xmlns:a="http://schemas.openxmlformats.org/drawingml/2006/main">
               <a:graphicData uri="http://schemas.openxmlformats.org/drawingml/2006/picture">
                 <pic:pic xmlns:pic="http://schemas.openxmlformats.org/drawingml/2006/picture">
                   <pic:nvPicPr>
-                    <pic:cNvPr id="1176866289" name=""/>
+                    <pic:cNvPr id="1862155335" name=""/>
                     <pic:cNvPicPr/>
                   </pic:nvPicPr>
                   <pic:blipFill>
@@ -12910,7 +12929,7 @@
           <w:sz w:val="27"/>
         </w:rPr>
       </w:pPr>
-      <w:bookmarkStart w:id="23" w:name="_Toc240274126"/>
+      <w:bookmarkStart w:id="23" w:name="_Toc240275448"/>
       <w:r>
         <w:rPr>
           <w:rFonts w:ascii="Montserrat" w:hAnsi="Montserrat"/>
@@ -13471,16 +13490,16 @@
           <w:noProof/>
         </w:rPr>
         <w:drawing>
-          <wp:inline distT="0" distB="0" distL="0" distR="0" wp14:anchorId="5713F115" wp14:editId="2048A888">
+          <wp:inline distT="0" distB="0" distL="0" distR="0" wp14:anchorId="05260B1E" wp14:editId="40BE77BC">
             <wp:extent cx="5120640" cy="4627581"/>
             <wp:effectExtent l="19050" t="19050" r="22860" b="20955"/>
-            <wp:docPr id="160206885" name="Imagem 13"/>
+            <wp:docPr id="1510387647" name="Imagem 13"/>
             <wp:cNvGraphicFramePr/>
             <a:graphic xmlns:a="http://schemas.openxmlformats.org/drawingml/2006/main">
               <a:graphicData uri="http://schemas.openxmlformats.org/drawingml/2006/picture">
                 <pic:pic xmlns:pic="http://schemas.openxmlformats.org/drawingml/2006/picture">
                   <pic:nvPicPr>
-                    <pic:cNvPr id="160206885" name=""/>
+                    <pic:cNvPr id="1510387647" name=""/>
                     <pic:cNvPicPr/>
                   </pic:nvPicPr>
                   <pic:blipFill>
@@ -13548,16 +13567,16 @@
         </w:rPr>
         <w:lastRenderedPageBreak/>
         <w:drawing>
-          <wp:inline distT="0" distB="0" distL="0" distR="0" wp14:anchorId="5E270B2D" wp14:editId="5108FA58">
+          <wp:inline distT="0" distB="0" distL="0" distR="0" wp14:anchorId="685B0A45" wp14:editId="567CA7B8">
             <wp:extent cx="5120640" cy="4627581"/>
             <wp:effectExtent l="19050" t="19050" r="22860" b="20955"/>
-            <wp:docPr id="2043860408" name="Imagem 14"/>
+            <wp:docPr id="607867935" name="Imagem 14"/>
             <wp:cNvGraphicFramePr/>
             <a:graphic xmlns:a="http://schemas.openxmlformats.org/drawingml/2006/main">
               <a:graphicData uri="http://schemas.openxmlformats.org/drawingml/2006/picture">
                 <pic:pic xmlns:pic="http://schemas.openxmlformats.org/drawingml/2006/picture">
                   <pic:nvPicPr>
-                    <pic:cNvPr id="2043860408" name=""/>
+                    <pic:cNvPr id="607867935" name=""/>
                     <pic:cNvPicPr/>
                   </pic:nvPicPr>
                   <pic:blipFill>
@@ -13809,7 +13828,7 @@
           <w:sz w:val="27"/>
         </w:rPr>
       </w:pPr>
-      <w:bookmarkStart w:id="24" w:name="_Toc240274127"/>
+      <w:bookmarkStart w:id="24" w:name="_Toc240275449"/>
       <w:r>
         <w:rPr>
           <w:rFonts w:ascii="Montserrat" w:hAnsi="Montserrat"/>
@@ -13849,16 +13868,16 @@
           <w:noProof/>
         </w:rPr>
         <w:drawing>
-          <wp:inline distT="0" distB="0" distL="0" distR="0" wp14:anchorId="29105E5F" wp14:editId="3C4E599A">
+          <wp:inline distT="0" distB="0" distL="0" distR="0" wp14:anchorId="4B45EF89" wp14:editId="75D21869">
             <wp:extent cx="5120640" cy="4627581"/>
             <wp:effectExtent l="19050" t="19050" r="22860" b="20955"/>
-            <wp:docPr id="1214562771" name="Imagem 15"/>
+            <wp:docPr id="2061609950" name="Imagem 15"/>
             <wp:cNvGraphicFramePr/>
             <a:graphic xmlns:a="http://schemas.openxmlformats.org/drawingml/2006/main">
               <a:graphicData uri="http://schemas.openxmlformats.org/drawingml/2006/picture">
                 <pic:pic xmlns:pic="http://schemas.openxmlformats.org/drawingml/2006/picture">
                   <pic:nvPicPr>
-                    <pic:cNvPr id="1214562771" name=""/>
+                    <pic:cNvPr id="2061609950" name=""/>
                     <pic:cNvPicPr/>
                   </pic:nvPicPr>
                   <pic:blipFill>
@@ -13926,16 +13945,16 @@
         </w:rPr>
         <w:lastRenderedPageBreak/>
         <w:drawing>
-          <wp:inline distT="0" distB="0" distL="0" distR="0" wp14:anchorId="49A9C470" wp14:editId="172E1BCF">
+          <wp:inline distT="0" distB="0" distL="0" distR="0" wp14:anchorId="4517D9B5" wp14:editId="67048F8E">
             <wp:extent cx="5120640" cy="4627581"/>
             <wp:effectExtent l="19050" t="19050" r="22860" b="20955"/>
-            <wp:docPr id="54522264" name="Imagem 16"/>
+            <wp:docPr id="1271182538" name="Imagem 16"/>
             <wp:cNvGraphicFramePr/>
             <a:graphic xmlns:a="http://schemas.openxmlformats.org/drawingml/2006/main">
               <a:graphicData uri="http://schemas.openxmlformats.org/drawingml/2006/picture">
                 <pic:pic xmlns:pic="http://schemas.openxmlformats.org/drawingml/2006/picture">
                   <pic:nvPicPr>
-                    <pic:cNvPr id="54522264" name=""/>
+                    <pic:cNvPr id="1271182538" name=""/>
                     <pic:cNvPicPr/>
                   </pic:nvPicPr>
                   <pic:blipFill>
@@ -14099,16 +14118,16 @@
         </w:rPr>
         <w:lastRenderedPageBreak/>
         <w:drawing>
-          <wp:inline distT="0" distB="0" distL="0" distR="0" wp14:anchorId="62A67B17" wp14:editId="7598DFBC">
+          <wp:inline distT="0" distB="0" distL="0" distR="0" wp14:anchorId="6A62B440" wp14:editId="46C9FB02">
             <wp:extent cx="5120640" cy="3282818"/>
             <wp:effectExtent l="19050" t="19050" r="22860" b="13335"/>
-            <wp:docPr id="1807411149" name="Imagem 17"/>
+            <wp:docPr id="1524474721" name="Imagem 17"/>
             <wp:cNvGraphicFramePr/>
             <a:graphic xmlns:a="http://schemas.openxmlformats.org/drawingml/2006/main">
               <a:graphicData uri="http://schemas.openxmlformats.org/drawingml/2006/picture">
                 <pic:pic xmlns:pic="http://schemas.openxmlformats.org/drawingml/2006/picture">
                   <pic:nvPicPr>
-                    <pic:cNvPr id="1807411149" name=""/>
+                    <pic:cNvPr id="1524474721" name=""/>
                     <pic:cNvPicPr/>
                   </pic:nvPicPr>
                   <pic:blipFill>
@@ -14299,7 +14318,7 @@
           <w:sz w:val="27"/>
         </w:rPr>
       </w:pPr>
-      <w:bookmarkStart w:id="25" w:name="_Toc240274128"/>
+      <w:bookmarkStart w:id="25" w:name="_Toc240275450"/>
       <w:r>
         <w:rPr>
           <w:rFonts w:ascii="Montserrat" w:hAnsi="Montserrat"/>
@@ -14339,16 +14358,16 @@
           <w:noProof/>
         </w:rPr>
         <w:drawing>
-          <wp:inline distT="0" distB="0" distL="0" distR="0" wp14:anchorId="6F502C5B" wp14:editId="2D397EAA">
+          <wp:inline distT="0" distB="0" distL="0" distR="0" wp14:anchorId="5BDACCBD" wp14:editId="68DC7C5D">
             <wp:extent cx="5120640" cy="4627581"/>
             <wp:effectExtent l="19050" t="19050" r="22860" b="20955"/>
-            <wp:docPr id="13754951" name="Imagem 18"/>
+            <wp:docPr id="883269976" name="Imagem 18"/>
             <wp:cNvGraphicFramePr/>
             <a:graphic xmlns:a="http://schemas.openxmlformats.org/drawingml/2006/main">
               <a:graphicData uri="http://schemas.openxmlformats.org/drawingml/2006/picture">
                 <pic:pic xmlns:pic="http://schemas.openxmlformats.org/drawingml/2006/picture">
                   <pic:nvPicPr>
-                    <pic:cNvPr id="13754951" name=""/>
+                    <pic:cNvPr id="883269976" name=""/>
                     <pic:cNvPicPr/>
                   </pic:nvPicPr>
                   <pic:blipFill>
@@ -14416,16 +14435,16 @@
         </w:rPr>
         <w:lastRenderedPageBreak/>
         <w:drawing>
-          <wp:inline distT="0" distB="0" distL="0" distR="0" wp14:anchorId="46B9D86A" wp14:editId="7A7576F5">
+          <wp:inline distT="0" distB="0" distL="0" distR="0" wp14:anchorId="3FBEF9AB" wp14:editId="73475451">
             <wp:extent cx="5120640" cy="4627581"/>
             <wp:effectExtent l="19050" t="19050" r="22860" b="20955"/>
-            <wp:docPr id="1244851144" name="Imagem 19"/>
+            <wp:docPr id="1179078365" name="Imagem 19"/>
             <wp:cNvGraphicFramePr/>
             <a:graphic xmlns:a="http://schemas.openxmlformats.org/drawingml/2006/main">
               <a:graphicData uri="http://schemas.openxmlformats.org/drawingml/2006/picture">
                 <pic:pic xmlns:pic="http://schemas.openxmlformats.org/drawingml/2006/picture">
                   <pic:nvPicPr>
-                    <pic:cNvPr id="1244851144" name=""/>
+                    <pic:cNvPr id="1179078365" name=""/>
                     <pic:cNvPicPr/>
                   </pic:nvPicPr>
                   <pic:blipFill>
@@ -14608,7 +14627,7 @@
           <w:sz w:val="27"/>
         </w:rPr>
       </w:pPr>
-      <w:bookmarkStart w:id="26" w:name="_Toc240274129"/>
+      <w:bookmarkStart w:id="26" w:name="_Toc240275451"/>
       <w:r>
         <w:rPr>
           <w:rFonts w:ascii="Montserrat" w:hAnsi="Montserrat"/>
@@ -14648,16 +14667,16 @@
           <w:noProof/>
         </w:rPr>
         <w:drawing>
-          <wp:inline distT="0" distB="0" distL="0" distR="0" wp14:anchorId="5BA403AA" wp14:editId="4D8D8AF5">
+          <wp:inline distT="0" distB="0" distL="0" distR="0" wp14:anchorId="136D1C22" wp14:editId="306C4F8C">
             <wp:extent cx="5120640" cy="4627581"/>
             <wp:effectExtent l="19050" t="19050" r="22860" b="20955"/>
-            <wp:docPr id="464430020" name="Imagem 20"/>
+            <wp:docPr id="553406053" name="Imagem 20"/>
             <wp:cNvGraphicFramePr/>
             <a:graphic xmlns:a="http://schemas.openxmlformats.org/drawingml/2006/main">
               <a:graphicData uri="http://schemas.openxmlformats.org/drawingml/2006/picture">
                 <pic:pic xmlns:pic="http://schemas.openxmlformats.org/drawingml/2006/picture">
                   <pic:nvPicPr>
-                    <pic:cNvPr id="464430020" name=""/>
+                    <pic:cNvPr id="553406053" name=""/>
                     <pic:cNvPicPr/>
                   </pic:nvPicPr>
                   <pic:blipFill>
@@ -14725,16 +14744,16 @@
         </w:rPr>
         <w:lastRenderedPageBreak/>
         <w:drawing>
-          <wp:inline distT="0" distB="0" distL="0" distR="0" wp14:anchorId="6FD99EAB" wp14:editId="1397C59A">
+          <wp:inline distT="0" distB="0" distL="0" distR="0" wp14:anchorId="6389718B" wp14:editId="4776062C">
             <wp:extent cx="5120640" cy="4627581"/>
             <wp:effectExtent l="19050" t="19050" r="22860" b="20955"/>
-            <wp:docPr id="224077535" name="Imagem 21"/>
+            <wp:docPr id="1359582470" name="Imagem 21"/>
             <wp:cNvGraphicFramePr/>
             <a:graphic xmlns:a="http://schemas.openxmlformats.org/drawingml/2006/main">
               <a:graphicData uri="http://schemas.openxmlformats.org/drawingml/2006/picture">
                 <pic:pic xmlns:pic="http://schemas.openxmlformats.org/drawingml/2006/picture">
                   <pic:nvPicPr>
-                    <pic:cNvPr id="224077535" name=""/>
+                    <pic:cNvPr id="1359582470" name=""/>
                     <pic:cNvPicPr/>
                   </pic:nvPicPr>
                   <pic:blipFill>
@@ -14940,16 +14959,16 @@
           <w:noProof/>
         </w:rPr>
         <w:drawing>
-          <wp:inline distT="0" distB="0" distL="0" distR="0" wp14:anchorId="03AAD448" wp14:editId="53D52B48">
+          <wp:inline distT="0" distB="0" distL="0" distR="0" wp14:anchorId="459EF739" wp14:editId="76D3167A">
             <wp:extent cx="5120640" cy="1757287"/>
             <wp:effectExtent l="19050" t="19050" r="22860" b="14605"/>
-            <wp:docPr id="722778374" name="Imagem 22"/>
+            <wp:docPr id="2057466218" name="Imagem 22"/>
             <wp:cNvGraphicFramePr/>
             <a:graphic xmlns:a="http://schemas.openxmlformats.org/drawingml/2006/main">
               <a:graphicData uri="http://schemas.openxmlformats.org/drawingml/2006/picture">
                 <pic:pic xmlns:pic="http://schemas.openxmlformats.org/drawingml/2006/picture">
                   <pic:nvPicPr>
-                    <pic:cNvPr id="722778374" name=""/>
+                    <pic:cNvPr id="2057466218" name=""/>
                     <pic:cNvPicPr/>
                   </pic:nvPicPr>
                   <pic:blipFill>
@@ -15062,7 +15081,7 @@
           <w:sz w:val="27"/>
         </w:rPr>
       </w:pPr>
-      <w:bookmarkStart w:id="27" w:name="_Toc240274130"/>
+      <w:bookmarkStart w:id="27" w:name="_Toc240275452"/>
       <w:r>
         <w:rPr>
           <w:rFonts w:ascii="Montserrat" w:hAnsi="Montserrat"/>
@@ -15103,16 +15122,16 @@
         </w:rPr>
         <w:lastRenderedPageBreak/>
         <w:drawing>
-          <wp:inline distT="0" distB="0" distL="0" distR="0" wp14:anchorId="6FB20CDF" wp14:editId="3F5014EB">
+          <wp:inline distT="0" distB="0" distL="0" distR="0" wp14:anchorId="6B66FD4F" wp14:editId="17CE1B0B">
             <wp:extent cx="5120640" cy="4627581"/>
             <wp:effectExtent l="19050" t="19050" r="22860" b="20955"/>
-            <wp:docPr id="474510234" name="Imagem 23"/>
+            <wp:docPr id="1114238631" name="Imagem 23"/>
             <wp:cNvGraphicFramePr/>
             <a:graphic xmlns:a="http://schemas.openxmlformats.org/drawingml/2006/main">
               <a:graphicData uri="http://schemas.openxmlformats.org/drawingml/2006/picture">
                 <pic:pic xmlns:pic="http://schemas.openxmlformats.org/drawingml/2006/picture">
                   <pic:nvPicPr>
-                    <pic:cNvPr id="474510234" name=""/>
+                    <pic:cNvPr id="1114238631" name=""/>
                     <pic:cNvPicPr/>
                   </pic:nvPicPr>
                   <pic:blipFill>
@@ -15180,16 +15199,16 @@
         </w:rPr>
         <w:lastRenderedPageBreak/>
         <w:drawing>
-          <wp:inline distT="0" distB="0" distL="0" distR="0" wp14:anchorId="1CCECD48" wp14:editId="6AA47D49">
+          <wp:inline distT="0" distB="0" distL="0" distR="0" wp14:anchorId="023E2EF6" wp14:editId="438D70F3">
             <wp:extent cx="5120640" cy="4627581"/>
             <wp:effectExtent l="19050" t="19050" r="22860" b="20955"/>
-            <wp:docPr id="1259417313" name="Imagem 24"/>
+            <wp:docPr id="736778441" name="Imagem 24"/>
             <wp:cNvGraphicFramePr/>
             <a:graphic xmlns:a="http://schemas.openxmlformats.org/drawingml/2006/main">
               <a:graphicData uri="http://schemas.openxmlformats.org/drawingml/2006/picture">
                 <pic:pic xmlns:pic="http://schemas.openxmlformats.org/drawingml/2006/picture">
                   <pic:nvPicPr>
-                    <pic:cNvPr id="1259417313" name=""/>
+                    <pic:cNvPr id="736778441" name=""/>
                     <pic:cNvPicPr/>
                   </pic:nvPicPr>
                   <pic:blipFill>
@@ -15426,7 +15445,7 @@
           <w:sz w:val="27"/>
         </w:rPr>
       </w:pPr>
-      <w:bookmarkStart w:id="28" w:name="_Toc240274131"/>
+      <w:bookmarkStart w:id="28" w:name="_Toc240275453"/>
       <w:r>
         <w:rPr>
           <w:rFonts w:ascii="Montserrat" w:hAnsi="Montserrat"/>
@@ -15466,16 +15485,16 @@
           <w:noProof/>
         </w:rPr>
         <w:drawing>
-          <wp:inline distT="0" distB="0" distL="0" distR="0" wp14:anchorId="22413437" wp14:editId="19E4C036">
+          <wp:inline distT="0" distB="0" distL="0" distR="0" wp14:anchorId="2C2F63F5" wp14:editId="452A3EDD">
             <wp:extent cx="5120640" cy="4627581"/>
             <wp:effectExtent l="19050" t="19050" r="22860" b="20955"/>
-            <wp:docPr id="644890361" name="Imagem 25"/>
+            <wp:docPr id="1357433894" name="Imagem 25"/>
             <wp:cNvGraphicFramePr/>
             <a:graphic xmlns:a="http://schemas.openxmlformats.org/drawingml/2006/main">
               <a:graphicData uri="http://schemas.openxmlformats.org/drawingml/2006/picture">
                 <pic:pic xmlns:pic="http://schemas.openxmlformats.org/drawingml/2006/picture">
                   <pic:nvPicPr>
-                    <pic:cNvPr id="644890361" name=""/>
+                    <pic:cNvPr id="1357433894" name=""/>
                     <pic:cNvPicPr/>
                   </pic:nvPicPr>
                   <pic:blipFill>
@@ -15543,16 +15562,16 @@
         </w:rPr>
         <w:lastRenderedPageBreak/>
         <w:drawing>
-          <wp:inline distT="0" distB="0" distL="0" distR="0" wp14:anchorId="572E3438" wp14:editId="1EA06F33">
+          <wp:inline distT="0" distB="0" distL="0" distR="0" wp14:anchorId="29DCA5FB" wp14:editId="4636DA68">
             <wp:extent cx="5120640" cy="4627581"/>
             <wp:effectExtent l="19050" t="19050" r="22860" b="20955"/>
-            <wp:docPr id="178377308" name="Imagem 26"/>
+            <wp:docPr id="1426194965" name="Imagem 26"/>
             <wp:cNvGraphicFramePr/>
             <a:graphic xmlns:a="http://schemas.openxmlformats.org/drawingml/2006/main">
               <a:graphicData uri="http://schemas.openxmlformats.org/drawingml/2006/picture">
                 <pic:pic xmlns:pic="http://schemas.openxmlformats.org/drawingml/2006/picture">
                   <pic:nvPicPr>
-                    <pic:cNvPr id="178377308" name=""/>
+                    <pic:cNvPr id="1426194965" name=""/>
                     <pic:cNvPicPr/>
                   </pic:nvPicPr>
                   <pic:blipFill>
@@ -15743,7 +15762,7 @@
           <w:sz w:val="27"/>
         </w:rPr>
       </w:pPr>
-      <w:bookmarkStart w:id="29" w:name="_Toc240274132"/>
+      <w:bookmarkStart w:id="29" w:name="_Toc240275454"/>
       <w:r>
         <w:rPr>
           <w:rFonts w:ascii="Montserrat" w:hAnsi="Montserrat"/>
@@ -15783,16 +15802,16 @@
           <w:noProof/>
         </w:rPr>
         <w:drawing>
-          <wp:inline distT="0" distB="0" distL="0" distR="0" wp14:anchorId="5821E253" wp14:editId="02B37B9A">
+          <wp:inline distT="0" distB="0" distL="0" distR="0" wp14:anchorId="18300800" wp14:editId="339B7C27">
             <wp:extent cx="5120640" cy="4000682"/>
             <wp:effectExtent l="19050" t="19050" r="22860" b="19050"/>
-            <wp:docPr id="626713925" name="Imagem 27"/>
+            <wp:docPr id="444219429" name="Imagem 27"/>
             <wp:cNvGraphicFramePr/>
             <a:graphic xmlns:a="http://schemas.openxmlformats.org/drawingml/2006/main">
               <a:graphicData uri="http://schemas.openxmlformats.org/drawingml/2006/picture">
                 <pic:pic xmlns:pic="http://schemas.openxmlformats.org/drawingml/2006/picture">
                   <pic:nvPicPr>
-                    <pic:cNvPr id="626713925" name=""/>
+                    <pic:cNvPr id="444219429" name=""/>
                     <pic:cNvPicPr/>
                   </pic:nvPicPr>
                   <pic:blipFill>
@@ -16316,7 +16335,7 @@
           <w:sz w:val="34"/>
         </w:rPr>
       </w:pPr>
-      <w:bookmarkStart w:id="30" w:name="_Toc240274133"/>
+      <w:bookmarkStart w:id="30" w:name="_Toc240275455"/>
       <w:r>
         <w:rPr>
           <w:rFonts w:ascii="Montserrat" w:hAnsi="Montserrat"/>
@@ -16358,7 +16377,7 @@
           <w:sz w:val="27"/>
         </w:rPr>
       </w:pPr>
-      <w:bookmarkStart w:id="31" w:name="_Toc240274134"/>
+      <w:bookmarkStart w:id="31" w:name="_Toc240275456"/>
       <w:r>
         <w:rPr>
           <w:rFonts w:ascii="Montserrat" w:hAnsi="Montserrat"/>
@@ -16398,16 +16417,16 @@
           <w:noProof/>
         </w:rPr>
         <w:drawing>
-          <wp:inline distT="0" distB="0" distL="0" distR="0" wp14:anchorId="2E657728" wp14:editId="7C8E7B49">
+          <wp:inline distT="0" distB="0" distL="0" distR="0" wp14:anchorId="1A33C6E2" wp14:editId="6F8E78BD">
             <wp:extent cx="5120640" cy="4627581"/>
             <wp:effectExtent l="19050" t="19050" r="22860" b="20955"/>
-            <wp:docPr id="693246389" name="Imagem 28"/>
+            <wp:docPr id="2021264087" name="Imagem 28"/>
             <wp:cNvGraphicFramePr/>
             <a:graphic xmlns:a="http://schemas.openxmlformats.org/drawingml/2006/main">
               <a:graphicData uri="http://schemas.openxmlformats.org/drawingml/2006/picture">
                 <pic:pic xmlns:pic="http://schemas.openxmlformats.org/drawingml/2006/picture">
                   <pic:nvPicPr>
-                    <pic:cNvPr id="693246389" name=""/>
+                    <pic:cNvPr id="2021264087" name=""/>
                     <pic:cNvPicPr/>
                   </pic:nvPicPr>
                   <pic:blipFill>
@@ -16475,16 +16494,16 @@
         </w:rPr>
         <w:lastRenderedPageBreak/>
         <w:drawing>
-          <wp:inline distT="0" distB="0" distL="0" distR="0" wp14:anchorId="4397799F" wp14:editId="34961003">
+          <wp:inline distT="0" distB="0" distL="0" distR="0" wp14:anchorId="6982B3E9" wp14:editId="36BDC196">
             <wp:extent cx="5120640" cy="4627581"/>
             <wp:effectExtent l="19050" t="19050" r="22860" b="20955"/>
-            <wp:docPr id="2048938934" name="Imagem 29"/>
+            <wp:docPr id="1705274251" name="Imagem 29"/>
             <wp:cNvGraphicFramePr/>
             <a:graphic xmlns:a="http://schemas.openxmlformats.org/drawingml/2006/main">
               <a:graphicData uri="http://schemas.openxmlformats.org/drawingml/2006/picture">
                 <pic:pic xmlns:pic="http://schemas.openxmlformats.org/drawingml/2006/picture">
                   <pic:nvPicPr>
-                    <pic:cNvPr id="2048938934" name=""/>
+                    <pic:cNvPr id="1705274251" name=""/>
                     <pic:cNvPicPr/>
                   </pic:nvPicPr>
                   <pic:blipFill>
@@ -16552,16 +16571,16 @@
         </w:rPr>
         <w:lastRenderedPageBreak/>
         <w:drawing>
-          <wp:inline distT="0" distB="0" distL="0" distR="0" wp14:anchorId="01FC8DAF" wp14:editId="21814AEB">
+          <wp:inline distT="0" distB="0" distL="0" distR="0" wp14:anchorId="121D2C62" wp14:editId="282BEDB7">
             <wp:extent cx="5120640" cy="4627581"/>
             <wp:effectExtent l="19050" t="19050" r="22860" b="20955"/>
-            <wp:docPr id="1938740622" name="Imagem 30"/>
+            <wp:docPr id="374789312" name="Imagem 30"/>
             <wp:cNvGraphicFramePr/>
             <a:graphic xmlns:a="http://schemas.openxmlformats.org/drawingml/2006/main">
               <a:graphicData uri="http://schemas.openxmlformats.org/drawingml/2006/picture">
                 <pic:pic xmlns:pic="http://schemas.openxmlformats.org/drawingml/2006/picture">
                   <pic:nvPicPr>
-                    <pic:cNvPr id="1938740622" name=""/>
+                    <pic:cNvPr id="374789312" name=""/>
                     <pic:cNvPicPr/>
                   </pic:nvPicPr>
                   <pic:blipFill>
@@ -16763,16 +16782,16 @@
           <w:noProof/>
         </w:rPr>
         <w:drawing>
-          <wp:inline distT="0" distB="0" distL="0" distR="0" wp14:anchorId="474AE071" wp14:editId="67191DBA">
+          <wp:inline distT="0" distB="0" distL="0" distR="0" wp14:anchorId="059CCED1" wp14:editId="636F3FAB">
             <wp:extent cx="5120640" cy="1715571"/>
             <wp:effectExtent l="19050" t="19050" r="22860" b="18415"/>
-            <wp:docPr id="934688444" name="Imagem 31"/>
+            <wp:docPr id="478676267" name="Imagem 31"/>
             <wp:cNvGraphicFramePr/>
             <a:graphic xmlns:a="http://schemas.openxmlformats.org/drawingml/2006/main">
               <a:graphicData uri="http://schemas.openxmlformats.org/drawingml/2006/picture">
                 <pic:pic xmlns:pic="http://schemas.openxmlformats.org/drawingml/2006/picture">
                   <pic:nvPicPr>
-                    <pic:cNvPr id="934688444" name=""/>
+                    <pic:cNvPr id="478676267" name=""/>
                     <pic:cNvPicPr/>
                   </pic:nvPicPr>
                   <pic:blipFill>
@@ -16909,16 +16928,16 @@
           <w:noProof/>
         </w:rPr>
         <w:drawing>
-          <wp:inline distT="0" distB="0" distL="0" distR="0" wp14:anchorId="346E724E" wp14:editId="068EFD47">
+          <wp:inline distT="0" distB="0" distL="0" distR="0" wp14:anchorId="4B3B8E3E" wp14:editId="336750E1">
             <wp:extent cx="5120640" cy="3282818"/>
             <wp:effectExtent l="19050" t="19050" r="22860" b="13335"/>
-            <wp:docPr id="801260604" name="Imagem 32"/>
+            <wp:docPr id="849753028" name="Imagem 32"/>
             <wp:cNvGraphicFramePr/>
             <a:graphic xmlns:a="http://schemas.openxmlformats.org/drawingml/2006/main">
               <a:graphicData uri="http://schemas.openxmlformats.org/drawingml/2006/picture">
                 <pic:pic xmlns:pic="http://schemas.openxmlformats.org/drawingml/2006/picture">
                   <pic:nvPicPr>
-                    <pic:cNvPr id="801260604" name=""/>
+                    <pic:cNvPr id="849753028" name=""/>
                     <pic:cNvPicPr/>
                   </pic:nvPicPr>
                   <pic:blipFill>
@@ -17052,16 +17071,16 @@
           <w:noProof/>
         </w:rPr>
         <w:drawing>
-          <wp:inline distT="0" distB="0" distL="0" distR="0" wp14:anchorId="7EF09BFE" wp14:editId="5034E962">
+          <wp:inline distT="0" distB="0" distL="0" distR="0" wp14:anchorId="1F56D8D8" wp14:editId="5BCF4488">
             <wp:extent cx="5120640" cy="951357"/>
             <wp:effectExtent l="19050" t="19050" r="22860" b="20320"/>
-            <wp:docPr id="935809322" name="Imagem 33"/>
+            <wp:docPr id="1469159744" name="Imagem 33"/>
             <wp:cNvGraphicFramePr/>
             <a:graphic xmlns:a="http://schemas.openxmlformats.org/drawingml/2006/main">
               <a:graphicData uri="http://schemas.openxmlformats.org/drawingml/2006/picture">
                 <pic:pic xmlns:pic="http://schemas.openxmlformats.org/drawingml/2006/picture">
                   <pic:nvPicPr>
-                    <pic:cNvPr id="935809322" name=""/>
+                    <pic:cNvPr id="1469159744" name=""/>
                     <pic:cNvPicPr/>
                   </pic:nvPicPr>
                   <pic:blipFill>
@@ -17173,16 +17192,16 @@
           <w:noProof/>
         </w:rPr>
         <w:drawing>
-          <wp:inline distT="0" distB="0" distL="0" distR="0" wp14:anchorId="0514AD0B" wp14:editId="5A380017">
+          <wp:inline distT="0" distB="0" distL="0" distR="0" wp14:anchorId="1DD18676" wp14:editId="27BFBD0A">
             <wp:extent cx="5120640" cy="1515102"/>
             <wp:effectExtent l="19050" t="19050" r="22860" b="28575"/>
-            <wp:docPr id="1860177679" name="Imagem 34"/>
+            <wp:docPr id="799237127" name="Imagem 34"/>
             <wp:cNvGraphicFramePr/>
             <a:graphic xmlns:a="http://schemas.openxmlformats.org/drawingml/2006/main">
               <a:graphicData uri="http://schemas.openxmlformats.org/drawingml/2006/picture">
                 <pic:pic xmlns:pic="http://schemas.openxmlformats.org/drawingml/2006/picture">
                   <pic:nvPicPr>
-                    <pic:cNvPr id="1860177679" name=""/>
+                    <pic:cNvPr id="799237127" name=""/>
                     <pic:cNvPicPr/>
                   </pic:nvPicPr>
                   <pic:blipFill>
@@ -17295,16 +17314,16 @@
           <w:noProof/>
         </w:rPr>
         <w:drawing>
-          <wp:inline distT="0" distB="0" distL="0" distR="0" wp14:anchorId="5E566869" wp14:editId="596F24B8">
+          <wp:inline distT="0" distB="0" distL="0" distR="0" wp14:anchorId="40BFDF1A" wp14:editId="592F5D0C">
             <wp:extent cx="5120640" cy="1391113"/>
             <wp:effectExtent l="19050" t="19050" r="22860" b="19050"/>
-            <wp:docPr id="1398143445" name="Imagem 35"/>
+            <wp:docPr id="1650777336" name="Imagem 35"/>
             <wp:cNvGraphicFramePr/>
             <a:graphic xmlns:a="http://schemas.openxmlformats.org/drawingml/2006/main">
               <a:graphicData uri="http://schemas.openxmlformats.org/drawingml/2006/picture">
                 <pic:pic xmlns:pic="http://schemas.openxmlformats.org/drawingml/2006/picture">
                   <pic:nvPicPr>
-                    <pic:cNvPr id="1398143445" name=""/>
+                    <pic:cNvPr id="1650777336" name=""/>
                     <pic:cNvPicPr/>
                   </pic:nvPicPr>
                   <pic:blipFill>
@@ -17416,16 +17435,16 @@
           <w:noProof/>
         </w:rPr>
         <w:drawing>
-          <wp:inline distT="0" distB="0" distL="0" distR="0" wp14:anchorId="100E1E6F" wp14:editId="6C38DD3C">
+          <wp:inline distT="0" distB="0" distL="0" distR="0" wp14:anchorId="66689284" wp14:editId="018FD679">
             <wp:extent cx="5120640" cy="1125174"/>
             <wp:effectExtent l="19050" t="19050" r="22860" b="18415"/>
-            <wp:docPr id="1296784826" name="Imagem 36"/>
+            <wp:docPr id="1806261792" name="Imagem 36"/>
             <wp:cNvGraphicFramePr/>
             <a:graphic xmlns:a="http://schemas.openxmlformats.org/drawingml/2006/main">
               <a:graphicData uri="http://schemas.openxmlformats.org/drawingml/2006/picture">
                 <pic:pic xmlns:pic="http://schemas.openxmlformats.org/drawingml/2006/picture">
                   <pic:nvPicPr>
-                    <pic:cNvPr id="1296784826" name=""/>
+                    <pic:cNvPr id="1806261792" name=""/>
                     <pic:cNvPicPr/>
                   </pic:nvPicPr>
                   <pic:blipFill>
@@ -17515,7 +17534,7 @@
           <w:sz w:val="27"/>
         </w:rPr>
       </w:pPr>
-      <w:bookmarkStart w:id="32" w:name="_Toc240274135"/>
+      <w:bookmarkStart w:id="32" w:name="_Toc240275457"/>
       <w:r>
         <w:rPr>
           <w:rFonts w:ascii="Montserrat" w:hAnsi="Montserrat"/>
@@ -17555,16 +17574,16 @@
           <w:noProof/>
         </w:rPr>
         <w:drawing>
-          <wp:inline distT="0" distB="0" distL="0" distR="0" wp14:anchorId="36B6CA51" wp14:editId="2EF45A5C">
+          <wp:inline distT="0" distB="0" distL="0" distR="0" wp14:anchorId="43E39686" wp14:editId="7FBA2012">
             <wp:extent cx="5120640" cy="4627581"/>
             <wp:effectExtent l="19050" t="19050" r="22860" b="20955"/>
-            <wp:docPr id="729885765" name="Imagem 37"/>
+            <wp:docPr id="763673534" name="Imagem 37"/>
             <wp:cNvGraphicFramePr/>
             <a:graphic xmlns:a="http://schemas.openxmlformats.org/drawingml/2006/main">
               <a:graphicData uri="http://schemas.openxmlformats.org/drawingml/2006/picture">
                 <pic:pic xmlns:pic="http://schemas.openxmlformats.org/drawingml/2006/picture">
                   <pic:nvPicPr>
-                    <pic:cNvPr id="729885765" name=""/>
+                    <pic:cNvPr id="763673534" name=""/>
                     <pic:cNvPicPr/>
                   </pic:nvPicPr>
                   <pic:blipFill>
@@ -17632,16 +17651,16 @@
         </w:rPr>
         <w:lastRenderedPageBreak/>
         <w:drawing>
-          <wp:inline distT="0" distB="0" distL="0" distR="0" wp14:anchorId="6368F047" wp14:editId="24604EC6">
+          <wp:inline distT="0" distB="0" distL="0" distR="0" wp14:anchorId="4C4C3B9D" wp14:editId="5B14054A">
             <wp:extent cx="5120640" cy="4627581"/>
             <wp:effectExtent l="19050" t="19050" r="22860" b="20955"/>
-            <wp:docPr id="2058562116" name="Imagem 38"/>
+            <wp:docPr id="721017978" name="Imagem 38"/>
             <wp:cNvGraphicFramePr/>
             <a:graphic xmlns:a="http://schemas.openxmlformats.org/drawingml/2006/main">
               <a:graphicData uri="http://schemas.openxmlformats.org/drawingml/2006/picture">
                 <pic:pic xmlns:pic="http://schemas.openxmlformats.org/drawingml/2006/picture">
                   <pic:nvPicPr>
-                    <pic:cNvPr id="2058562116" name=""/>
+                    <pic:cNvPr id="721017978" name=""/>
                     <pic:cNvPicPr/>
                   </pic:nvPicPr>
                   <pic:blipFill>
@@ -17810,16 +17829,16 @@
           <w:noProof/>
         </w:rPr>
         <w:drawing>
-          <wp:inline distT="0" distB="0" distL="0" distR="0" wp14:anchorId="00B64CFA" wp14:editId="5E9B6A79">
+          <wp:inline distT="0" distB="0" distL="0" distR="0" wp14:anchorId="691C95E6" wp14:editId="04A9BF0F">
             <wp:extent cx="5120640" cy="2144319"/>
             <wp:effectExtent l="19050" t="19050" r="22860" b="27940"/>
-            <wp:docPr id="1861929800" name="Imagem 39"/>
+            <wp:docPr id="1694611548" name="Imagem 39"/>
             <wp:cNvGraphicFramePr/>
             <a:graphic xmlns:a="http://schemas.openxmlformats.org/drawingml/2006/main">
               <a:graphicData uri="http://schemas.openxmlformats.org/drawingml/2006/picture">
                 <pic:pic xmlns:pic="http://schemas.openxmlformats.org/drawingml/2006/picture">
                   <pic:nvPicPr>
-                    <pic:cNvPr id="1861929800" name=""/>
+                    <pic:cNvPr id="1694611548" name=""/>
                     <pic:cNvPicPr/>
                   </pic:nvPicPr>
                   <pic:blipFill>
@@ -17907,16 +17926,16 @@
           <w:noProof/>
         </w:rPr>
         <w:drawing>
-          <wp:inline distT="0" distB="0" distL="0" distR="0" wp14:anchorId="7068829C" wp14:editId="709027C3">
+          <wp:inline distT="0" distB="0" distL="0" distR="0" wp14:anchorId="5DD6D9A2" wp14:editId="6BE81DAB">
             <wp:extent cx="5120640" cy="1055647"/>
             <wp:effectExtent l="19050" t="19050" r="22860" b="11430"/>
-            <wp:docPr id="653141895" name="Imagem 40"/>
+            <wp:docPr id="590843359" name="Imagem 40"/>
             <wp:cNvGraphicFramePr/>
             <a:graphic xmlns:a="http://schemas.openxmlformats.org/drawingml/2006/main">
               <a:graphicData uri="http://schemas.openxmlformats.org/drawingml/2006/picture">
                 <pic:pic xmlns:pic="http://schemas.openxmlformats.org/drawingml/2006/picture">
                   <pic:nvPicPr>
-                    <pic:cNvPr id="653141895" name=""/>
+                    <pic:cNvPr id="590843359" name=""/>
                     <pic:cNvPicPr/>
                   </pic:nvPicPr>
                   <pic:blipFill>
@@ -18038,16 +18057,16 @@
           <w:noProof/>
         </w:rPr>
         <w:drawing>
-          <wp:inline distT="0" distB="0" distL="0" distR="0" wp14:anchorId="4FD021C4" wp14:editId="6E0D986B">
+          <wp:inline distT="0" distB="0" distL="0" distR="0" wp14:anchorId="20F49807" wp14:editId="2F916E8A">
             <wp:extent cx="5120640" cy="3282818"/>
             <wp:effectExtent l="19050" t="19050" r="22860" b="13335"/>
-            <wp:docPr id="858749964" name="Imagem 41"/>
+            <wp:docPr id="755788070" name="Imagem 41"/>
             <wp:cNvGraphicFramePr/>
             <a:graphic xmlns:a="http://schemas.openxmlformats.org/drawingml/2006/main">
               <a:graphicData uri="http://schemas.openxmlformats.org/drawingml/2006/picture">
                 <pic:pic xmlns:pic="http://schemas.openxmlformats.org/drawingml/2006/picture">
                   <pic:nvPicPr>
-                    <pic:cNvPr id="858749964" name=""/>
+                    <pic:cNvPr id="755788070" name=""/>
                     <pic:cNvPicPr/>
                   </pic:nvPicPr>
                   <pic:blipFill>
@@ -18181,16 +18200,16 @@
         </w:rPr>
         <w:lastRenderedPageBreak/>
         <w:drawing>
-          <wp:inline distT="0" distB="0" distL="0" distR="0" wp14:anchorId="59F7F33B" wp14:editId="5640ADBF">
+          <wp:inline distT="0" distB="0" distL="0" distR="0" wp14:anchorId="77ECD8DB" wp14:editId="49DE9163">
             <wp:extent cx="5120640" cy="1978034"/>
             <wp:effectExtent l="19050" t="19050" r="22860" b="22225"/>
-            <wp:docPr id="1720165883" name="Imagem 42"/>
+            <wp:docPr id="1694494694" name="Imagem 42"/>
             <wp:cNvGraphicFramePr/>
             <a:graphic xmlns:a="http://schemas.openxmlformats.org/drawingml/2006/main">
               <a:graphicData uri="http://schemas.openxmlformats.org/drawingml/2006/picture">
                 <pic:pic xmlns:pic="http://schemas.openxmlformats.org/drawingml/2006/picture">
                   <pic:nvPicPr>
-                    <pic:cNvPr id="1720165883" name=""/>
+                    <pic:cNvPr id="1694494694" name=""/>
                     <pic:cNvPicPr/>
                   </pic:nvPicPr>
                   <pic:blipFill>
@@ -18262,7 +18281,7 @@
           <w:sz w:val="34"/>
         </w:rPr>
       </w:pPr>
-      <w:bookmarkStart w:id="33" w:name="_Toc240274136"/>
+      <w:bookmarkStart w:id="33" w:name="_Toc240275458"/>
       <w:r>
         <w:rPr>
           <w:rFonts w:ascii="Montserrat" w:hAnsi="Montserrat"/>
@@ -18322,7 +18341,7 @@
           <w:sz w:val="27"/>
         </w:rPr>
       </w:pPr>
-      <w:bookmarkStart w:id="34" w:name="_Toc240274137"/>
+      <w:bookmarkStart w:id="34" w:name="_Toc240275459"/>
       <w:r>
         <w:rPr>
           <w:rFonts w:ascii="Montserrat" w:hAnsi="Montserrat"/>
@@ -18362,16 +18381,16 @@
           <w:noProof/>
         </w:rPr>
         <w:drawing>
-          <wp:inline distT="0" distB="0" distL="0" distR="0" wp14:anchorId="2BF1EA3F" wp14:editId="1BBF911F">
+          <wp:inline distT="0" distB="0" distL="0" distR="0" wp14:anchorId="020FCD0D" wp14:editId="109CF082">
             <wp:extent cx="5303520" cy="4792851"/>
             <wp:effectExtent l="19050" t="19050" r="11430" b="27305"/>
-            <wp:docPr id="272048358" name="Imagem 43"/>
+            <wp:docPr id="304763050" name="Imagem 43"/>
             <wp:cNvGraphicFramePr/>
             <a:graphic xmlns:a="http://schemas.openxmlformats.org/drawingml/2006/main">
               <a:graphicData uri="http://schemas.openxmlformats.org/drawingml/2006/picture">
                 <pic:pic xmlns:pic="http://schemas.openxmlformats.org/drawingml/2006/picture">
                   <pic:nvPicPr>
-                    <pic:cNvPr id="272048358" name=""/>
+                    <pic:cNvPr id="304763050" name=""/>
                     <pic:cNvPicPr/>
                   </pic:nvPicPr>
                   <pic:blipFill>
@@ -18440,7 +18459,7 @@
           <w:sz w:val="27"/>
         </w:rPr>
       </w:pPr>
-      <w:bookmarkStart w:id="35" w:name="_Toc240274138"/>
+      <w:bookmarkStart w:id="35" w:name="_Toc240275460"/>
       <w:r>
         <w:rPr>
           <w:rFonts w:ascii="Montserrat" w:hAnsi="Montserrat"/>
@@ -18480,16 +18499,16 @@
           <w:noProof/>
         </w:rPr>
         <w:drawing>
-          <wp:inline distT="0" distB="0" distL="0" distR="0" wp14:anchorId="392308A5" wp14:editId="4A1D5195">
+          <wp:inline distT="0" distB="0" distL="0" distR="0" wp14:anchorId="1ADB0E54" wp14:editId="1AAC7F2C">
             <wp:extent cx="5303520" cy="4792851"/>
             <wp:effectExtent l="19050" t="19050" r="11430" b="27305"/>
-            <wp:docPr id="1981185239" name="Imagem 44"/>
+            <wp:docPr id="302334463" name="Imagem 44"/>
             <wp:cNvGraphicFramePr/>
             <a:graphic xmlns:a="http://schemas.openxmlformats.org/drawingml/2006/main">
               <a:graphicData uri="http://schemas.openxmlformats.org/drawingml/2006/picture">
                 <pic:pic xmlns:pic="http://schemas.openxmlformats.org/drawingml/2006/picture">
                   <pic:nvPicPr>
-                    <pic:cNvPr id="1981185239" name=""/>
+                    <pic:cNvPr id="302334463" name=""/>
                     <pic:cNvPicPr/>
                   </pic:nvPicPr>
                   <pic:blipFill>
@@ -18557,7 +18576,7 @@
           <w:sz w:val="27"/>
         </w:rPr>
       </w:pPr>
-      <w:bookmarkStart w:id="36" w:name="_Toc240274139"/>
+      <w:bookmarkStart w:id="36" w:name="_Toc240275461"/>
       <w:r>
         <w:rPr>
           <w:rFonts w:ascii="Montserrat" w:hAnsi="Montserrat"/>
@@ -18598,16 +18617,16 @@
         </w:rPr>
         <w:lastRenderedPageBreak/>
         <w:drawing>
-          <wp:inline distT="0" distB="0" distL="0" distR="0" wp14:anchorId="615FD74E" wp14:editId="6B71B070">
+          <wp:inline distT="0" distB="0" distL="0" distR="0" wp14:anchorId="00772F25" wp14:editId="25EC51C1">
             <wp:extent cx="5303520" cy="4792851"/>
             <wp:effectExtent l="19050" t="19050" r="11430" b="27305"/>
-            <wp:docPr id="900075873" name="Imagem 45"/>
+            <wp:docPr id="1019308751" name="Imagem 45"/>
             <wp:cNvGraphicFramePr/>
             <a:graphic xmlns:a="http://schemas.openxmlformats.org/drawingml/2006/main">
               <a:graphicData uri="http://schemas.openxmlformats.org/drawingml/2006/picture">
                 <pic:pic xmlns:pic="http://schemas.openxmlformats.org/drawingml/2006/picture">
                   <pic:nvPicPr>
-                    <pic:cNvPr id="900075873" name=""/>
+                    <pic:cNvPr id="1019308751" name=""/>
                     <pic:cNvPicPr/>
                   </pic:nvPicPr>
                   <pic:blipFill>
@@ -18675,16 +18694,16 @@
         </w:rPr>
         <w:lastRenderedPageBreak/>
         <w:drawing>
-          <wp:inline distT="0" distB="0" distL="0" distR="0" wp14:anchorId="0FE9AA61" wp14:editId="253F9C3A">
+          <wp:inline distT="0" distB="0" distL="0" distR="0" wp14:anchorId="35B8FBFE" wp14:editId="18CB7E70">
             <wp:extent cx="5303520" cy="4792851"/>
             <wp:effectExtent l="19050" t="19050" r="11430" b="27305"/>
-            <wp:docPr id="2092546294" name="Imagem 46"/>
+            <wp:docPr id="505046591" name="Imagem 46"/>
             <wp:cNvGraphicFramePr/>
             <a:graphic xmlns:a="http://schemas.openxmlformats.org/drawingml/2006/main">
               <a:graphicData uri="http://schemas.openxmlformats.org/drawingml/2006/picture">
                 <pic:pic xmlns:pic="http://schemas.openxmlformats.org/drawingml/2006/picture">
                   <pic:nvPicPr>
-                    <pic:cNvPr id="2092546294" name=""/>
+                    <pic:cNvPr id="505046591" name=""/>
                     <pic:cNvPicPr/>
                   </pic:nvPicPr>
                   <pic:blipFill>
@@ -18777,7 +18796,7 @@
           <w:sz w:val="34"/>
         </w:rPr>
       </w:pPr>
-      <w:bookmarkStart w:id="37" w:name="_Toc240274140"/>
+      <w:bookmarkStart w:id="37" w:name="_Toc240275462"/>
       <w:r>
         <w:rPr>
           <w:rFonts w:ascii="Montserrat" w:hAnsi="Montserrat"/>
@@ -18819,7 +18838,7 @@
           <w:sz w:val="27"/>
         </w:rPr>
       </w:pPr>
-      <w:bookmarkStart w:id="38" w:name="_Toc240274141"/>
+      <w:bookmarkStart w:id="38" w:name="_Toc240275463"/>
       <w:r>
         <w:rPr>
           <w:rFonts w:ascii="Montserrat" w:hAnsi="Montserrat"/>
@@ -18859,16 +18878,16 @@
           <w:noProof/>
         </w:rPr>
         <w:drawing>
-          <wp:inline distT="0" distB="0" distL="0" distR="0" wp14:anchorId="40444066" wp14:editId="276EBF19">
+          <wp:inline distT="0" distB="0" distL="0" distR="0" wp14:anchorId="2BD96623" wp14:editId="44DEE68A">
             <wp:extent cx="5303520" cy="4792851"/>
             <wp:effectExtent l="19050" t="19050" r="11430" b="27305"/>
-            <wp:docPr id="393189363" name="Imagem 47"/>
+            <wp:docPr id="1309063155" name="Imagem 47"/>
             <wp:cNvGraphicFramePr/>
             <a:graphic xmlns:a="http://schemas.openxmlformats.org/drawingml/2006/main">
               <a:graphicData uri="http://schemas.openxmlformats.org/drawingml/2006/picture">
                 <pic:pic xmlns:pic="http://schemas.openxmlformats.org/drawingml/2006/picture">
                   <pic:nvPicPr>
-                    <pic:cNvPr id="393189363" name=""/>
+                    <pic:cNvPr id="1309063155" name=""/>
                     <pic:cNvPicPr/>
                   </pic:nvPicPr>
                   <pic:blipFill>
@@ -19097,7 +19116,7 @@
           <w:sz w:val="27"/>
         </w:rPr>
       </w:pPr>
-      <w:bookmarkStart w:id="39" w:name="_Toc240274142"/>
+      <w:bookmarkStart w:id="39" w:name="_Toc240275464"/>
       <w:r>
         <w:rPr>
           <w:rFonts w:ascii="Montserrat" w:hAnsi="Montserrat"/>
@@ -19137,16 +19156,16 @@
           <w:noProof/>
         </w:rPr>
         <w:drawing>
-          <wp:inline distT="0" distB="0" distL="0" distR="0" wp14:anchorId="163FE8E4" wp14:editId="21AB243E">
+          <wp:inline distT="0" distB="0" distL="0" distR="0" wp14:anchorId="3690B784" wp14:editId="6DB80F7C">
             <wp:extent cx="5303520" cy="4792851"/>
             <wp:effectExtent l="19050" t="19050" r="11430" b="27305"/>
-            <wp:docPr id="1379879903" name="Imagem 48"/>
+            <wp:docPr id="1810224478" name="Imagem 48"/>
             <wp:cNvGraphicFramePr/>
             <a:graphic xmlns:a="http://schemas.openxmlformats.org/drawingml/2006/main">
               <a:graphicData uri="http://schemas.openxmlformats.org/drawingml/2006/picture">
                 <pic:pic xmlns:pic="http://schemas.openxmlformats.org/drawingml/2006/picture">
                   <pic:nvPicPr>
-                    <pic:cNvPr id="1379879903" name=""/>
+                    <pic:cNvPr id="1810224478" name=""/>
                     <pic:cNvPicPr/>
                   </pic:nvPicPr>
                   <pic:blipFill>
@@ -19214,7 +19233,7 @@
           <w:sz w:val="27"/>
         </w:rPr>
       </w:pPr>
-      <w:bookmarkStart w:id="40" w:name="_Toc240274143"/>
+      <w:bookmarkStart w:id="40" w:name="_Toc240275465"/>
       <w:r>
         <w:rPr>
           <w:rFonts w:ascii="Montserrat" w:hAnsi="Montserrat"/>
@@ -19255,16 +19274,16 @@
         </w:rPr>
         <w:lastRenderedPageBreak/>
         <w:drawing>
-          <wp:inline distT="0" distB="0" distL="0" distR="0" wp14:anchorId="161353B0" wp14:editId="5533F50E">
+          <wp:inline distT="0" distB="0" distL="0" distR="0" wp14:anchorId="1E8AA9EE" wp14:editId="7754CDBC">
             <wp:extent cx="5303520" cy="4792851"/>
             <wp:effectExtent l="19050" t="19050" r="11430" b="27305"/>
-            <wp:docPr id="702920757" name="Imagem 49"/>
+            <wp:docPr id="232444497" name="Imagem 49"/>
             <wp:cNvGraphicFramePr/>
             <a:graphic xmlns:a="http://schemas.openxmlformats.org/drawingml/2006/main">
               <a:graphicData uri="http://schemas.openxmlformats.org/drawingml/2006/picture">
                 <pic:pic xmlns:pic="http://schemas.openxmlformats.org/drawingml/2006/picture">
                   <pic:nvPicPr>
-                    <pic:cNvPr id="702920757" name=""/>
+                    <pic:cNvPr id="232444497" name=""/>
                     <pic:cNvPicPr/>
                   </pic:nvPicPr>
                   <pic:blipFill>
@@ -19408,7 +19427,7 @@
           <w:sz w:val="27"/>
         </w:rPr>
       </w:pPr>
-      <w:bookmarkStart w:id="41" w:name="_Toc240274144"/>
+      <w:bookmarkStart w:id="41" w:name="_Toc240275466"/>
       <w:r>
         <w:rPr>
           <w:rFonts w:ascii="Montserrat" w:hAnsi="Montserrat"/>
@@ -19673,16 +19692,16 @@
           <w:noProof/>
         </w:rPr>
         <w:drawing>
-          <wp:inline distT="0" distB="0" distL="0" distR="0" wp14:anchorId="24B38A8C" wp14:editId="46D52CD9">
+          <wp:inline distT="0" distB="0" distL="0" distR="0" wp14:anchorId="7673629A" wp14:editId="5597A727">
             <wp:extent cx="5303520" cy="4267180"/>
             <wp:effectExtent l="19050" t="19050" r="11430" b="19685"/>
-            <wp:docPr id="364071279" name="Imagem 50"/>
+            <wp:docPr id="1476041260" name="Imagem 50"/>
             <wp:cNvGraphicFramePr/>
             <a:graphic xmlns:a="http://schemas.openxmlformats.org/drawingml/2006/main">
               <a:graphicData uri="http://schemas.openxmlformats.org/drawingml/2006/picture">
                 <pic:pic xmlns:pic="http://schemas.openxmlformats.org/drawingml/2006/picture">
                   <pic:nvPicPr>
-                    <pic:cNvPr id="364071279" name=""/>
+                    <pic:cNvPr id="1476041260" name=""/>
                     <pic:cNvPicPr/>
                   </pic:nvPicPr>
                   <pic:blipFill>
@@ -19750,16 +19769,16 @@
           <w:noProof/>
         </w:rPr>
         <w:drawing>
-          <wp:inline distT="0" distB="0" distL="0" distR="0" wp14:anchorId="757E1043" wp14:editId="603AE18D">
+          <wp:inline distT="0" distB="0" distL="0" distR="0" wp14:anchorId="74BE17A1" wp14:editId="73B7AFF3">
             <wp:extent cx="5303520" cy="3382059"/>
             <wp:effectExtent l="19050" t="19050" r="11430" b="27940"/>
-            <wp:docPr id="1358254188" name="Imagem 51"/>
+            <wp:docPr id="99214307" name="Imagem 51"/>
             <wp:cNvGraphicFramePr/>
             <a:graphic xmlns:a="http://schemas.openxmlformats.org/drawingml/2006/main">
               <a:graphicData uri="http://schemas.openxmlformats.org/drawingml/2006/picture">
                 <pic:pic xmlns:pic="http://schemas.openxmlformats.org/drawingml/2006/picture">
                   <pic:nvPicPr>
-                    <pic:cNvPr id="1358254188" name=""/>
+                    <pic:cNvPr id="99214307" name=""/>
                     <pic:cNvPicPr/>
                   </pic:nvPicPr>
                   <pic:blipFill>
@@ -19827,16 +19846,16 @@
         </w:rPr>
         <w:lastRenderedPageBreak/>
         <w:drawing>
-          <wp:inline distT="0" distB="0" distL="0" distR="0" wp14:anchorId="6F55C88B" wp14:editId="5CDBCF6C">
+          <wp:inline distT="0" distB="0" distL="0" distR="0" wp14:anchorId="0023A61C" wp14:editId="4042414B">
             <wp:extent cx="5303520" cy="4417800"/>
             <wp:effectExtent l="19050" t="19050" r="11430" b="20955"/>
-            <wp:docPr id="750444578" name="Imagem 52"/>
+            <wp:docPr id="257937320" name="Imagem 52"/>
             <wp:cNvGraphicFramePr/>
             <a:graphic xmlns:a="http://schemas.openxmlformats.org/drawingml/2006/main">
               <a:graphicData uri="http://schemas.openxmlformats.org/drawingml/2006/picture">
                 <pic:pic xmlns:pic="http://schemas.openxmlformats.org/drawingml/2006/picture">
                   <pic:nvPicPr>
-                    <pic:cNvPr id="750444578" name=""/>
+                    <pic:cNvPr id="257937320" name=""/>
                     <pic:cNvPicPr/>
                   </pic:nvPicPr>
                   <pic:blipFill>
@@ -19946,7 +19965,7 @@
           <w:sz w:val="27"/>
         </w:rPr>
       </w:pPr>
-      <w:bookmarkStart w:id="42" w:name="_Toc240274145"/>
+      <w:bookmarkStart w:id="42" w:name="_Toc240275467"/>
       <w:r>
         <w:rPr>
           <w:rFonts w:ascii="Montserrat" w:hAnsi="Montserrat"/>
@@ -20212,16 +20231,16 @@
         </w:rPr>
         <w:lastRenderedPageBreak/>
         <w:drawing>
-          <wp:inline distT="0" distB="0" distL="0" distR="0" wp14:anchorId="10BB1EA7" wp14:editId="61B77960">
+          <wp:inline distT="0" distB="0" distL="0" distR="0" wp14:anchorId="398280F9" wp14:editId="5697681B">
             <wp:extent cx="5303520" cy="7628836"/>
             <wp:effectExtent l="19050" t="19050" r="11430" b="10795"/>
-            <wp:docPr id="544095145" name="Imagem 53"/>
+            <wp:docPr id="1249476107" name="Imagem 53"/>
             <wp:cNvGraphicFramePr/>
             <a:graphic xmlns:a="http://schemas.openxmlformats.org/drawingml/2006/main">
               <a:graphicData uri="http://schemas.openxmlformats.org/drawingml/2006/picture">
                 <pic:pic xmlns:pic="http://schemas.openxmlformats.org/drawingml/2006/picture">
                   <pic:nvPicPr>
-                    <pic:cNvPr id="544095145" name=""/>
+                    <pic:cNvPr id="1249476107" name=""/>
                     <pic:cNvPicPr/>
                   </pic:nvPicPr>
                   <pic:blipFill>
@@ -20353,7 +20372,7 @@
           <w:sz w:val="27"/>
         </w:rPr>
       </w:pPr>
-      <w:bookmarkStart w:id="43" w:name="_Toc240274146"/>
+      <w:bookmarkStart w:id="43" w:name="_Toc240275468"/>
       <w:r>
         <w:rPr>
           <w:rFonts w:ascii="Montserrat" w:hAnsi="Montserrat"/>
@@ -20506,7 +20525,7 @@
           <w:sz w:val="27"/>
         </w:rPr>
       </w:pPr>
-      <w:bookmarkStart w:id="44" w:name="_Toc240274147"/>
+      <w:bookmarkStart w:id="44" w:name="_Toc240275469"/>
       <w:r>
         <w:rPr>
           <w:rFonts w:ascii="Montserrat" w:hAnsi="Montserrat"/>
@@ -20799,16 +20818,16 @@
           <w:noProof/>
         </w:rPr>
         <w:drawing>
-          <wp:inline distT="0" distB="0" distL="0" distR="0" wp14:anchorId="788F819F" wp14:editId="0E743286">
+          <wp:inline distT="0" distB="0" distL="0" distR="0" wp14:anchorId="7B856E9A" wp14:editId="15575368">
             <wp:extent cx="5303520" cy="1351384"/>
             <wp:effectExtent l="19050" t="19050" r="11430" b="20320"/>
-            <wp:docPr id="242507938" name="Imagem 54"/>
+            <wp:docPr id="1826309163" name="Imagem 54"/>
             <wp:cNvGraphicFramePr/>
             <a:graphic xmlns:a="http://schemas.openxmlformats.org/drawingml/2006/main">
               <a:graphicData uri="http://schemas.openxmlformats.org/drawingml/2006/picture">
                 <pic:pic xmlns:pic="http://schemas.openxmlformats.org/drawingml/2006/picture">
                   <pic:nvPicPr>
-                    <pic:cNvPr id="242507938" name=""/>
+                    <pic:cNvPr id="1826309163" name=""/>
                     <pic:cNvPicPr/>
                   </pic:nvPicPr>
                   <pic:blipFill>
@@ -20876,7 +20895,7 @@
           <w:sz w:val="27"/>
         </w:rPr>
       </w:pPr>
-      <w:bookmarkStart w:id="45" w:name="_Toc240274148"/>
+      <w:bookmarkStart w:id="45" w:name="_Toc240275470"/>
       <w:r>
         <w:rPr>
           <w:rFonts w:ascii="Montserrat" w:hAnsi="Montserrat"/>
@@ -21021,16 +21040,16 @@
           <w:noProof/>
         </w:rPr>
         <w:drawing>
-          <wp:inline distT="0" distB="0" distL="0" distR="0" wp14:anchorId="7BCA21FD" wp14:editId="1129462C">
+          <wp:inline distT="0" distB="0" distL="0" distR="0" wp14:anchorId="483D261D" wp14:editId="583D4309">
             <wp:extent cx="5303520" cy="1422793"/>
             <wp:effectExtent l="19050" t="19050" r="11430" b="25400"/>
-            <wp:docPr id="698161555" name="Imagem 55"/>
+            <wp:docPr id="13401751" name="Imagem 55"/>
             <wp:cNvGraphicFramePr/>
             <a:graphic xmlns:a="http://schemas.openxmlformats.org/drawingml/2006/main">
               <a:graphicData uri="http://schemas.openxmlformats.org/drawingml/2006/picture">
                 <pic:pic xmlns:pic="http://schemas.openxmlformats.org/drawingml/2006/picture">
                   <pic:nvPicPr>
-                    <pic:cNvPr id="698161555" name=""/>
+                    <pic:cNvPr id="13401751" name=""/>
                     <pic:cNvPicPr/>
                   </pic:nvPicPr>
                   <pic:blipFill>
@@ -21185,16 +21204,16 @@
         </w:rPr>
         <w:lastRenderedPageBreak/>
         <w:drawing>
-          <wp:inline distT="0" distB="0" distL="0" distR="0" wp14:anchorId="7FCE5F4B" wp14:editId="54573191">
+          <wp:inline distT="0" distB="0" distL="0" distR="0" wp14:anchorId="71409F47" wp14:editId="6725E058">
             <wp:extent cx="5303520" cy="1841050"/>
             <wp:effectExtent l="19050" t="19050" r="11430" b="26035"/>
-            <wp:docPr id="1512457001" name="Imagem 56"/>
+            <wp:docPr id="94736405" name="Imagem 56"/>
             <wp:cNvGraphicFramePr/>
             <a:graphic xmlns:a="http://schemas.openxmlformats.org/drawingml/2006/main">
               <a:graphicData uri="http://schemas.openxmlformats.org/drawingml/2006/picture">
                 <pic:pic xmlns:pic="http://schemas.openxmlformats.org/drawingml/2006/picture">
                   <pic:nvPicPr>
-                    <pic:cNvPr id="1512457001" name=""/>
+                    <pic:cNvPr id="94736405" name=""/>
                     <pic:cNvPicPr/>
                   </pic:nvPicPr>
                   <pic:blipFill>
@@ -21348,16 +21367,16 @@
           <w:noProof/>
         </w:rPr>
         <w:drawing>
-          <wp:inline distT="0" distB="0" distL="0" distR="0" wp14:anchorId="6D60CC57" wp14:editId="0D97F8B2">
+          <wp:inline distT="0" distB="0" distL="0" distR="0" wp14:anchorId="218607DB" wp14:editId="32780F4C">
             <wp:extent cx="5303520" cy="303041"/>
             <wp:effectExtent l="19050" t="19050" r="11430" b="20955"/>
-            <wp:docPr id="910337274" name="Imagem 57"/>
+            <wp:docPr id="63078352" name="Imagem 57"/>
             <wp:cNvGraphicFramePr/>
             <a:graphic xmlns:a="http://schemas.openxmlformats.org/drawingml/2006/main">
               <a:graphicData uri="http://schemas.openxmlformats.org/drawingml/2006/picture">
                 <pic:pic xmlns:pic="http://schemas.openxmlformats.org/drawingml/2006/picture">
                   <pic:nvPicPr>
-                    <pic:cNvPr id="910337274" name=""/>
+                    <pic:cNvPr id="63078352" name=""/>
                     <pic:cNvPicPr/>
                   </pic:nvPicPr>
                   <pic:blipFill>
@@ -21425,16 +21444,16 @@
         </w:rPr>
         <w:lastRenderedPageBreak/>
         <w:drawing>
-          <wp:inline distT="0" distB="0" distL="0" distR="0" wp14:anchorId="7482939E" wp14:editId="5E5875FE">
+          <wp:inline distT="0" distB="0" distL="0" distR="0" wp14:anchorId="4AEFC2DD" wp14:editId="66C87774">
             <wp:extent cx="5303520" cy="2983005"/>
             <wp:effectExtent l="19050" t="19050" r="11430" b="27305"/>
-            <wp:docPr id="1998269807" name="Imagem 58"/>
+            <wp:docPr id="1628718773" name="Imagem 58"/>
             <wp:cNvGraphicFramePr/>
             <a:graphic xmlns:a="http://schemas.openxmlformats.org/drawingml/2006/main">
               <a:graphicData uri="http://schemas.openxmlformats.org/drawingml/2006/picture">
                 <pic:pic xmlns:pic="http://schemas.openxmlformats.org/drawingml/2006/picture">
                   <pic:nvPicPr>
-                    <pic:cNvPr id="1998269807" name=""/>
+                    <pic:cNvPr id="1628718773" name=""/>
                     <pic:cNvPicPr/>
                   </pic:nvPicPr>
                   <pic:blipFill>
@@ -21506,7 +21525,7 @@
           <w:sz w:val="34"/>
         </w:rPr>
       </w:pPr>
-      <w:bookmarkStart w:id="46" w:name="_Toc240274149"/>
+      <w:bookmarkStart w:id="46" w:name="_Toc240275471"/>
       <w:r>
         <w:rPr>
           <w:rFonts w:ascii="Montserrat" w:hAnsi="Montserrat"/>
@@ -21750,7 +21769,7 @@
           <w:sz w:val="34"/>
         </w:rPr>
       </w:pPr>
-      <w:bookmarkStart w:id="47" w:name="_Toc240274150"/>
+      <w:bookmarkStart w:id="47" w:name="_Toc240275472"/>
       <w:r>
         <w:rPr>
           <w:rFonts w:ascii="Montserrat" w:hAnsi="Montserrat"/>
@@ -23538,7 +23557,7 @@
 <file path=word/numbering.xml><?xml version="1.0" encoding="utf-8"?>
 <w:numbering xmlns:wpc="http://schemas.microsoft.com/office/word/2010/wordprocessingCanvas" xmlns:cx="http://schemas.microsoft.com/office/drawing/2014/chartex" xmlns:cx1="http://schemas.microsoft.com/office/drawing/2015/9/8/chartex" xmlns:cx2="http://schemas.microsoft.com/office/drawing/2015/10/21/chartex" xmlns:cx3="http://schemas.microsoft.com/office/drawing/2016/5/9/chartex" xmlns:cx4="http://schemas.microsoft.com/office/drawing/2016/5/10/chartex" xmlns:cx5="http://schemas.microsoft.com/office/drawing/2016/5/11/chartex" xmlns:cx6="http://schemas.microsoft.com/office/drawing/2016/5/12/chartex" xmlns:cx7="http://schemas.microsoft.com/office/drawing/2016/5/13/chartex" xmlns:cx8="http://schemas.microsoft.com/office/drawing/2016/5/14/chartex" xmlns:mc="http://schemas.openxmlformats.org/markup-compatibility/2006" xmlns:aink="http://schemas.microsoft.com/office/drawing/2016/ink" xmlns:am3d="http://schemas.microsoft.com/office/drawing/2017/model3d" xmlns:o="urn:schemas-microsoft-com:office:office" xmlns:oel="http://schemas.microsoft.com/office/2019/extlst" xmlns:r="http://schemas.openxmlformats.org/officeDocument/2006/relationships" xmlns:m="http://schemas.openxmlformats.org/officeDocument/2006/math" xmlns:v="urn:schemas-microsoft-com:vml" xmlns:wp14="http://schemas.microsoft.com/office/word/2010/wordprocessingDrawing" xmlns:wp="http://schemas.openxmlformats.org/drawingml/2006/wordprocessingDrawing" xmlns:w10="urn:schemas-microsoft-com:office:word" xmlns:w="http://schemas.openxmlformats.org/wordprocessingml/2006/main" xmlns:w14="http://schemas.microsoft.com/office/word/2010/wordml" xmlns:w15="http://schemas.microsoft.com/office/word/2012/wordml" xmlns:w16cex="http://schemas.microsoft.com/office/word/2018/wordml/cex" xmlns:w16cid="http://schemas.microsoft.com/office/word/2016/wordml/cid" xmlns:w16="http://schemas.microsoft.com/office/word/2018/wordml" xmlns:w16du="http://schemas.microsoft.com/office/word/2023/wordml/word16du" xmlns:w16sdtdh="http://schemas.microsoft.com/office/word/2020/wordml/sdtdatahash" xmlns:w16sdtfl="http://schemas.microsoft.com/office/word/2024/wordml/sdtformatlock" xmlns:w16se="http://schemas.microsoft.com/office/word/2015/wordml/symex" xmlns:wpg="http://schemas.microsoft.com/office/word/2010/wordprocessingGroup" xmlns:wpi="http://schemas.microsoft.com/office/word/2010/wordprocessingInk" xmlns:wne="http://schemas.microsoft.com/office/word/2006/wordml" xmlns:wps="http://schemas.microsoft.com/office/word/2010/wordprocessingShape" mc:Ignorable="w14 w15 w16se w16cid w16 w16cex w16sdtdh w16sdtfl w16du wp14">
   <w:abstractNum w:abstractNumId="0" w15:restartNumberingAfterBreak="0">
-    <w:nsid w:val="06494D01"/>
+    <w:nsid w:val="001A1AA2"/>
     <w:multiLevelType w:val="singleLevel"/>
     <w:tmpl w:val="04160001"/>
     <w:lvl w:ilvl="0">
@@ -23555,7 +23574,7 @@
     </w:lvl>
   </w:abstractNum>
   <w:abstractNum w:abstractNumId="1" w15:restartNumberingAfterBreak="0">
-    <w:nsid w:val="0B0D1312"/>
+    <w:nsid w:val="013B6708"/>
     <w:multiLevelType w:val="singleLevel"/>
     <w:tmpl w:val="04160001"/>
     <w:lvl w:ilvl="0">
@@ -23572,7 +23591,7 @@
     </w:lvl>
   </w:abstractNum>
   <w:abstractNum w:abstractNumId="2" w15:restartNumberingAfterBreak="0">
-    <w:nsid w:val="0DE835F4"/>
+    <w:nsid w:val="01443507"/>
     <w:multiLevelType w:val="singleLevel"/>
     <w:tmpl w:val="04160001"/>
     <w:lvl w:ilvl="0">
@@ -23589,7 +23608,7 @@
     </w:lvl>
   </w:abstractNum>
   <w:abstractNum w:abstractNumId="3" w15:restartNumberingAfterBreak="0">
-    <w:nsid w:val="0E161953"/>
+    <w:nsid w:val="043220D9"/>
     <w:multiLevelType w:val="singleLevel"/>
     <w:tmpl w:val="04160001"/>
     <w:lvl w:ilvl="0">
@@ -23606,7 +23625,7 @@
     </w:lvl>
   </w:abstractNum>
   <w:abstractNum w:abstractNumId="4" w15:restartNumberingAfterBreak="0">
-    <w:nsid w:val="11A10CB6"/>
+    <w:nsid w:val="08973A15"/>
     <w:multiLevelType w:val="singleLevel"/>
     <w:tmpl w:val="04160001"/>
     <w:lvl w:ilvl="0">
@@ -23623,7 +23642,7 @@
     </w:lvl>
   </w:abstractNum>
   <w:abstractNum w:abstractNumId="5" w15:restartNumberingAfterBreak="0">
-    <w:nsid w:val="12A91E22"/>
+    <w:nsid w:val="0C4F728A"/>
     <w:multiLevelType w:val="singleLevel"/>
     <w:tmpl w:val="04160001"/>
     <w:lvl w:ilvl="0">
@@ -23640,7 +23659,7 @@
     </w:lvl>
   </w:abstractNum>
   <w:abstractNum w:abstractNumId="6" w15:restartNumberingAfterBreak="0">
-    <w:nsid w:val="206D2913"/>
+    <w:nsid w:val="13C770C8"/>
     <w:multiLevelType w:val="singleLevel"/>
     <w:tmpl w:val="04160001"/>
     <w:lvl w:ilvl="0">
@@ -23657,7 +23676,7 @@
     </w:lvl>
   </w:abstractNum>
   <w:abstractNum w:abstractNumId="7" w15:restartNumberingAfterBreak="0">
-    <w:nsid w:val="20A47789"/>
+    <w:nsid w:val="13FC5AE9"/>
     <w:multiLevelType w:val="singleLevel"/>
     <w:tmpl w:val="04160001"/>
     <w:lvl w:ilvl="0">
@@ -23674,7 +23693,7 @@
     </w:lvl>
   </w:abstractNum>
   <w:abstractNum w:abstractNumId="8" w15:restartNumberingAfterBreak="0">
-    <w:nsid w:val="25BC6128"/>
+    <w:nsid w:val="149423E7"/>
     <w:multiLevelType w:val="singleLevel"/>
     <w:tmpl w:val="04160001"/>
     <w:lvl w:ilvl="0">
@@ -23691,7 +23710,7 @@
     </w:lvl>
   </w:abstractNum>
   <w:abstractNum w:abstractNumId="9" w15:restartNumberingAfterBreak="0">
-    <w:nsid w:val="27A654B8"/>
+    <w:nsid w:val="183D238F"/>
     <w:multiLevelType w:val="singleLevel"/>
     <w:tmpl w:val="04160001"/>
     <w:lvl w:ilvl="0">
@@ -23708,7 +23727,7 @@
     </w:lvl>
   </w:abstractNum>
   <w:abstractNum w:abstractNumId="10" w15:restartNumberingAfterBreak="0">
-    <w:nsid w:val="300B4093"/>
+    <w:nsid w:val="21B31A01"/>
     <w:multiLevelType w:val="singleLevel"/>
     <w:tmpl w:val="04160001"/>
     <w:lvl w:ilvl="0">
@@ -23725,7 +23744,7 @@
     </w:lvl>
   </w:abstractNum>
   <w:abstractNum w:abstractNumId="11" w15:restartNumberingAfterBreak="0">
-    <w:nsid w:val="34EB6236"/>
+    <w:nsid w:val="23FE7C4C"/>
     <w:multiLevelType w:val="singleLevel"/>
     <w:tmpl w:val="04160001"/>
     <w:lvl w:ilvl="0">
@@ -23742,7 +23761,7 @@
     </w:lvl>
   </w:abstractNum>
   <w:abstractNum w:abstractNumId="12" w15:restartNumberingAfterBreak="0">
-    <w:nsid w:val="38AB49C9"/>
+    <w:nsid w:val="2E0F21C6"/>
     <w:multiLevelType w:val="singleLevel"/>
     <w:tmpl w:val="04160001"/>
     <w:lvl w:ilvl="0">
@@ -23759,7 +23778,7 @@
     </w:lvl>
   </w:abstractNum>
   <w:abstractNum w:abstractNumId="13" w15:restartNumberingAfterBreak="0">
-    <w:nsid w:val="3C2A5902"/>
+    <w:nsid w:val="30C81457"/>
     <w:multiLevelType w:val="singleLevel"/>
     <w:tmpl w:val="04160001"/>
     <w:lvl w:ilvl="0">
@@ -23776,7 +23795,7 @@
     </w:lvl>
   </w:abstractNum>
   <w:abstractNum w:abstractNumId="14" w15:restartNumberingAfterBreak="0">
-    <w:nsid w:val="45C0273E"/>
+    <w:nsid w:val="32B80A4F"/>
     <w:multiLevelType w:val="singleLevel"/>
     <w:tmpl w:val="04160001"/>
     <w:lvl w:ilvl="0">
@@ -23793,7 +23812,7 @@
     </w:lvl>
   </w:abstractNum>
   <w:abstractNum w:abstractNumId="15" w15:restartNumberingAfterBreak="0">
-    <w:nsid w:val="4775272B"/>
+    <w:nsid w:val="34ED2739"/>
     <w:multiLevelType w:val="singleLevel"/>
     <w:tmpl w:val="04160001"/>
     <w:lvl w:ilvl="0">
@@ -23810,7 +23829,7 @@
     </w:lvl>
   </w:abstractNum>
   <w:abstractNum w:abstractNumId="16" w15:restartNumberingAfterBreak="0">
-    <w:nsid w:val="479C6FB6"/>
+    <w:nsid w:val="3A2E2DF6"/>
     <w:multiLevelType w:val="singleLevel"/>
     <w:tmpl w:val="04160001"/>
     <w:lvl w:ilvl="0">
@@ -23827,7 +23846,7 @@
     </w:lvl>
   </w:abstractNum>
   <w:abstractNum w:abstractNumId="17" w15:restartNumberingAfterBreak="0">
-    <w:nsid w:val="4A863BFC"/>
+    <w:nsid w:val="3FCC3041"/>
     <w:multiLevelType w:val="singleLevel"/>
     <w:tmpl w:val="04160001"/>
     <w:lvl w:ilvl="0">
@@ -23844,7 +23863,7 @@
     </w:lvl>
   </w:abstractNum>
   <w:abstractNum w:abstractNumId="18" w15:restartNumberingAfterBreak="0">
-    <w:nsid w:val="4D7B249D"/>
+    <w:nsid w:val="42B84E91"/>
     <w:multiLevelType w:val="singleLevel"/>
     <w:tmpl w:val="04160001"/>
     <w:lvl w:ilvl="0">
@@ -23861,7 +23880,7 @@
     </w:lvl>
   </w:abstractNum>
   <w:abstractNum w:abstractNumId="19" w15:restartNumberingAfterBreak="0">
-    <w:nsid w:val="514B6F60"/>
+    <w:nsid w:val="44F11B2D"/>
     <w:multiLevelType w:val="singleLevel"/>
     <w:tmpl w:val="04160001"/>
     <w:lvl w:ilvl="0">
@@ -23878,7 +23897,7 @@
     </w:lvl>
   </w:abstractNum>
   <w:abstractNum w:abstractNumId="20" w15:restartNumberingAfterBreak="0">
-    <w:nsid w:val="52AA02BB"/>
+    <w:nsid w:val="49C72BC6"/>
     <w:multiLevelType w:val="singleLevel"/>
     <w:tmpl w:val="04160001"/>
     <w:lvl w:ilvl="0">
@@ -23895,7 +23914,7 @@
     </w:lvl>
   </w:abstractNum>
   <w:abstractNum w:abstractNumId="21" w15:restartNumberingAfterBreak="0">
-    <w:nsid w:val="531227DB"/>
+    <w:nsid w:val="4AE624C2"/>
     <w:multiLevelType w:val="singleLevel"/>
     <w:tmpl w:val="04160001"/>
     <w:lvl w:ilvl="0">
@@ -23912,7 +23931,7 @@
     </w:lvl>
   </w:abstractNum>
   <w:abstractNum w:abstractNumId="22" w15:restartNumberingAfterBreak="0">
-    <w:nsid w:val="54551A0C"/>
+    <w:nsid w:val="4F8148A2"/>
     <w:multiLevelType w:val="singleLevel"/>
     <w:tmpl w:val="04160001"/>
     <w:lvl w:ilvl="0">
@@ -23929,7 +23948,7 @@
     </w:lvl>
   </w:abstractNum>
   <w:abstractNum w:abstractNumId="23" w15:restartNumberingAfterBreak="0">
-    <w:nsid w:val="5A8577A9"/>
+    <w:nsid w:val="5F9066B4"/>
     <w:multiLevelType w:val="singleLevel"/>
     <w:tmpl w:val="04160001"/>
     <w:lvl w:ilvl="0">
@@ -23946,7 +23965,7 @@
     </w:lvl>
   </w:abstractNum>
   <w:abstractNum w:abstractNumId="24" w15:restartNumberingAfterBreak="0">
-    <w:nsid w:val="61AB28B2"/>
+    <w:nsid w:val="5FCC6E8A"/>
     <w:multiLevelType w:val="singleLevel"/>
     <w:tmpl w:val="04160001"/>
     <w:lvl w:ilvl="0">
@@ -23963,7 +23982,7 @@
     </w:lvl>
   </w:abstractNum>
   <w:abstractNum w:abstractNumId="25" w15:restartNumberingAfterBreak="0">
-    <w:nsid w:val="662C7BA1"/>
+    <w:nsid w:val="5FFF723C"/>
     <w:multiLevelType w:val="singleLevel"/>
     <w:tmpl w:val="04160001"/>
     <w:lvl w:ilvl="0">
@@ -23980,7 +23999,7 @@
     </w:lvl>
   </w:abstractNum>
   <w:abstractNum w:abstractNumId="26" w15:restartNumberingAfterBreak="0">
-    <w:nsid w:val="6A1F6DDC"/>
+    <w:nsid w:val="68136ECF"/>
     <w:multiLevelType w:val="singleLevel"/>
     <w:tmpl w:val="04160001"/>
     <w:lvl w:ilvl="0">
@@ -23997,7 +24016,7 @@
     </w:lvl>
   </w:abstractNum>
   <w:abstractNum w:abstractNumId="27" w15:restartNumberingAfterBreak="0">
-    <w:nsid w:val="71D66DA1"/>
+    <w:nsid w:val="681717E0"/>
     <w:multiLevelType w:val="singleLevel"/>
     <w:tmpl w:val="04160001"/>
     <w:lvl w:ilvl="0">
@@ -24014,7 +24033,7 @@
     </w:lvl>
   </w:abstractNum>
   <w:abstractNum w:abstractNumId="28" w15:restartNumberingAfterBreak="0">
-    <w:nsid w:val="728F25A6"/>
+    <w:nsid w:val="6B70799E"/>
     <w:multiLevelType w:val="singleLevel"/>
     <w:tmpl w:val="04160001"/>
     <w:lvl w:ilvl="0">
@@ -24031,7 +24050,7 @@
     </w:lvl>
   </w:abstractNum>
   <w:abstractNum w:abstractNumId="29" w15:restartNumberingAfterBreak="0">
-    <w:nsid w:val="74B10A13"/>
+    <w:nsid w:val="6C4E465B"/>
     <w:multiLevelType w:val="singleLevel"/>
     <w:tmpl w:val="04160001"/>
     <w:lvl w:ilvl="0">
@@ -24048,7 +24067,7 @@
     </w:lvl>
   </w:abstractNum>
   <w:abstractNum w:abstractNumId="30" w15:restartNumberingAfterBreak="0">
-    <w:nsid w:val="769C1494"/>
+    <w:nsid w:val="733337D7"/>
     <w:multiLevelType w:val="singleLevel"/>
     <w:tmpl w:val="04160001"/>
     <w:lvl w:ilvl="0">
@@ -24065,7 +24084,7 @@
     </w:lvl>
   </w:abstractNum>
   <w:abstractNum w:abstractNumId="31" w15:restartNumberingAfterBreak="0">
-    <w:nsid w:val="77024EF7"/>
+    <w:nsid w:val="77CF0F2A"/>
     <w:multiLevelType w:val="singleLevel"/>
     <w:tmpl w:val="04160001"/>
     <w:lvl w:ilvl="0">
@@ -24082,7 +24101,7 @@
     </w:lvl>
   </w:abstractNum>
   <w:abstractNum w:abstractNumId="32" w15:restartNumberingAfterBreak="0">
-    <w:nsid w:val="7F0D79AA"/>
+    <w:nsid w:val="77E729B9"/>
     <w:multiLevelType w:val="singleLevel"/>
     <w:tmpl w:val="04160001"/>
     <w:lvl w:ilvl="0">
@@ -24098,104 +24117,104 @@
       </w:rPr>
     </w:lvl>
   </w:abstractNum>
-  <w:num w:numId="1" w16cid:durableId="1559631420">
+  <w:num w:numId="1" w16cid:durableId="1099981576">
+    <w:abstractNumId w:val="29"/>
+  </w:num>
+  <w:num w:numId="2" w16cid:durableId="928270619">
+    <w:abstractNumId w:val="25"/>
+  </w:num>
+  <w:num w:numId="3" w16cid:durableId="231543458">
+    <w:abstractNumId w:val="2"/>
+  </w:num>
+  <w:num w:numId="4" w16cid:durableId="1269510937">
+    <w:abstractNumId w:val="1"/>
+  </w:num>
+  <w:num w:numId="5" w16cid:durableId="1419983274">
+    <w:abstractNumId w:val="27"/>
+  </w:num>
+  <w:num w:numId="6" w16cid:durableId="77871286">
+    <w:abstractNumId w:val="26"/>
+  </w:num>
+  <w:num w:numId="7" w16cid:durableId="1249802842">
+    <w:abstractNumId w:val="12"/>
+  </w:num>
+  <w:num w:numId="8" w16cid:durableId="97872315">
+    <w:abstractNumId w:val="4"/>
+  </w:num>
+  <w:num w:numId="9" w16cid:durableId="634724899">
+    <w:abstractNumId w:val="18"/>
+  </w:num>
+  <w:num w:numId="10" w16cid:durableId="1586458435">
     <w:abstractNumId w:val="11"/>
   </w:num>
-  <w:num w:numId="2" w16cid:durableId="706678550">
+  <w:num w:numId="11" w16cid:durableId="1533684858">
+    <w:abstractNumId w:val="32"/>
+  </w:num>
+  <w:num w:numId="12" w16cid:durableId="544409961">
+    <w:abstractNumId w:val="15"/>
+  </w:num>
+  <w:num w:numId="13" w16cid:durableId="585457560">
+    <w:abstractNumId w:val="3"/>
+  </w:num>
+  <w:num w:numId="14" w16cid:durableId="2005936318">
+    <w:abstractNumId w:val="17"/>
+  </w:num>
+  <w:num w:numId="15" w16cid:durableId="3867077">
+    <w:abstractNumId w:val="0"/>
+  </w:num>
+  <w:num w:numId="16" w16cid:durableId="473176721">
+    <w:abstractNumId w:val="30"/>
+  </w:num>
+  <w:num w:numId="17" w16cid:durableId="2014137532">
+    <w:abstractNumId w:val="9"/>
+  </w:num>
+  <w:num w:numId="18" w16cid:durableId="966086922">
+    <w:abstractNumId w:val="13"/>
+  </w:num>
+  <w:num w:numId="19" w16cid:durableId="1741637486">
+    <w:abstractNumId w:val="7"/>
+  </w:num>
+  <w:num w:numId="20" w16cid:durableId="122165104">
+    <w:abstractNumId w:val="28"/>
+  </w:num>
+  <w:num w:numId="21" w16cid:durableId="605843531">
+    <w:abstractNumId w:val="14"/>
+  </w:num>
+  <w:num w:numId="22" w16cid:durableId="918056435">
+    <w:abstractNumId w:val="21"/>
+  </w:num>
+  <w:num w:numId="23" w16cid:durableId="130295740">
+    <w:abstractNumId w:val="5"/>
+  </w:num>
+  <w:num w:numId="24" w16cid:durableId="514808311">
+    <w:abstractNumId w:val="8"/>
+  </w:num>
+  <w:num w:numId="25" w16cid:durableId="1307199030">
+    <w:abstractNumId w:val="22"/>
+  </w:num>
+  <w:num w:numId="26" w16cid:durableId="244267971">
+    <w:abstractNumId w:val="31"/>
+  </w:num>
+  <w:num w:numId="27" w16cid:durableId="1617982120">
     <w:abstractNumId w:val="24"/>
   </w:num>
-  <w:num w:numId="3" w16cid:durableId="2319725">
+  <w:num w:numId="28" w16cid:durableId="896818771">
+    <w:abstractNumId w:val="23"/>
+  </w:num>
+  <w:num w:numId="29" w16cid:durableId="771973246">
+    <w:abstractNumId w:val="6"/>
+  </w:num>
+  <w:num w:numId="30" w16cid:durableId="598417370">
+    <w:abstractNumId w:val="10"/>
+  </w:num>
+  <w:num w:numId="31" w16cid:durableId="49693548">
+    <w:abstractNumId w:val="16"/>
+  </w:num>
+  <w:num w:numId="32" w16cid:durableId="282347336">
     <w:abstractNumId w:val="20"/>
   </w:num>
-  <w:num w:numId="4" w16cid:durableId="20398541">
-    <w:abstractNumId w:val="9"/>
-  </w:num>
-  <w:num w:numId="5" w16cid:durableId="1502819912">
-    <w:abstractNumId w:val="12"/>
-  </w:num>
-  <w:num w:numId="6" w16cid:durableId="192690616">
-    <w:abstractNumId w:val="5"/>
-  </w:num>
-  <w:num w:numId="7" w16cid:durableId="971053456">
-    <w:abstractNumId w:val="26"/>
-  </w:num>
-  <w:num w:numId="8" w16cid:durableId="1786390570">
-    <w:abstractNumId w:val="2"/>
-  </w:num>
-  <w:num w:numId="9" w16cid:durableId="1310094715">
-    <w:abstractNumId w:val="16"/>
-  </w:num>
-  <w:num w:numId="10" w16cid:durableId="540289286">
-    <w:abstractNumId w:val="0"/>
-  </w:num>
-  <w:num w:numId="11" w16cid:durableId="732124726">
-    <w:abstractNumId w:val="1"/>
-  </w:num>
-  <w:num w:numId="12" w16cid:durableId="1246957771">
-    <w:abstractNumId w:val="28"/>
-  </w:num>
-  <w:num w:numId="13" w16cid:durableId="526065510">
+  <w:num w:numId="33" w16cid:durableId="186599310">
     <w:abstractNumId w:val="19"/>
-  </w:num>
-  <w:num w:numId="14" w16cid:durableId="2108964369">
-    <w:abstractNumId w:val="14"/>
-  </w:num>
-  <w:num w:numId="15" w16cid:durableId="1167405948">
-    <w:abstractNumId w:val="18"/>
-  </w:num>
-  <w:num w:numId="16" w16cid:durableId="1422019659">
-    <w:abstractNumId w:val="10"/>
-  </w:num>
-  <w:num w:numId="17" w16cid:durableId="374231210">
-    <w:abstractNumId w:val="17"/>
-  </w:num>
-  <w:num w:numId="18" w16cid:durableId="1484590873">
-    <w:abstractNumId w:val="22"/>
-  </w:num>
-  <w:num w:numId="19" w16cid:durableId="310446907">
-    <w:abstractNumId w:val="31"/>
-  </w:num>
-  <w:num w:numId="20" w16cid:durableId="1070269279">
-    <w:abstractNumId w:val="30"/>
-  </w:num>
-  <w:num w:numId="21" w16cid:durableId="537744543">
-    <w:abstractNumId w:val="3"/>
-  </w:num>
-  <w:num w:numId="22" w16cid:durableId="2010330266">
-    <w:abstractNumId w:val="8"/>
-  </w:num>
-  <w:num w:numId="23" w16cid:durableId="1718624997">
-    <w:abstractNumId w:val="27"/>
-  </w:num>
-  <w:num w:numId="24" w16cid:durableId="1552692902">
-    <w:abstractNumId w:val="13"/>
-  </w:num>
-  <w:num w:numId="25" w16cid:durableId="1601841371">
-    <w:abstractNumId w:val="7"/>
-  </w:num>
-  <w:num w:numId="26" w16cid:durableId="1542014915">
-    <w:abstractNumId w:val="15"/>
-  </w:num>
-  <w:num w:numId="27" w16cid:durableId="211036958">
-    <w:abstractNumId w:val="23"/>
-  </w:num>
-  <w:num w:numId="28" w16cid:durableId="2128354859">
-    <w:abstractNumId w:val="32"/>
-  </w:num>
-  <w:num w:numId="29" w16cid:durableId="402340272">
-    <w:abstractNumId w:val="21"/>
-  </w:num>
-  <w:num w:numId="30" w16cid:durableId="42216567">
-    <w:abstractNumId w:val="4"/>
-  </w:num>
-  <w:num w:numId="31" w16cid:durableId="816915448">
-    <w:abstractNumId w:val="6"/>
-  </w:num>
-  <w:num w:numId="32" w16cid:durableId="467555936">
-    <w:abstractNumId w:val="25"/>
-  </w:num>
-  <w:num w:numId="33" w16cid:durableId="534008096">
-    <w:abstractNumId w:val="29"/>
   </w:num>
 </w:numbering>
 </file>
@@ -24608,7 +24627,7 @@
     <w:link w:val="Ttulo1Char"/>
     <w:uiPriority w:val="9"/>
     <w:qFormat/>
-    <w:rsid w:val="005A7C0F"/>
+    <w:rsid w:val="0047292B"/>
     <w:pPr>
       <w:keepNext/>
       <w:keepLines/>
@@ -24630,7 +24649,7 @@
     <w:uiPriority w:val="9"/>
     <w:unhideWhenUsed/>
     <w:qFormat/>
-    <w:rsid w:val="005A7C0F"/>
+    <w:rsid w:val="0047292B"/>
     <w:pPr>
       <w:keepNext/>
       <w:keepLines/>
@@ -24653,7 +24672,7 @@
     <w:semiHidden/>
     <w:unhideWhenUsed/>
     <w:qFormat/>
-    <w:rsid w:val="005A7C0F"/>
+    <w:rsid w:val="0047292B"/>
     <w:pPr>
       <w:keepNext/>
       <w:keepLines/>
@@ -24676,7 +24695,7 @@
     <w:semiHidden/>
     <w:unhideWhenUsed/>
     <w:qFormat/>
-    <w:rsid w:val="005A7C0F"/>
+    <w:rsid w:val="0047292B"/>
     <w:pPr>
       <w:keepNext/>
       <w:keepLines/>
@@ -24699,7 +24718,7 @@
     <w:semiHidden/>
     <w:unhideWhenUsed/>
     <w:qFormat/>
-    <w:rsid w:val="005A7C0F"/>
+    <w:rsid w:val="0047292B"/>
     <w:pPr>
       <w:keepNext/>
       <w:keepLines/>
@@ -24720,7 +24739,7 @@
     <w:semiHidden/>
     <w:unhideWhenUsed/>
     <w:qFormat/>
-    <w:rsid w:val="005A7C0F"/>
+    <w:rsid w:val="0047292B"/>
     <w:pPr>
       <w:keepNext/>
       <w:keepLines/>
@@ -24743,7 +24762,7 @@
     <w:semiHidden/>
     <w:unhideWhenUsed/>
     <w:qFormat/>
-    <w:rsid w:val="005A7C0F"/>
+    <w:rsid w:val="0047292B"/>
     <w:pPr>
       <w:keepNext/>
       <w:keepLines/>
@@ -24764,7 +24783,7 @@
     <w:semiHidden/>
     <w:unhideWhenUsed/>
     <w:qFormat/>
-    <w:rsid w:val="005A7C0F"/>
+    <w:rsid w:val="0047292B"/>
     <w:pPr>
       <w:keepNext/>
       <w:keepLines/>
@@ -24787,7 +24806,7 @@
     <w:semiHidden/>
     <w:unhideWhenUsed/>
     <w:qFormat/>
-    <w:rsid w:val="005A7C0F"/>
+    <w:rsid w:val="0047292B"/>
     <w:pPr>
       <w:keepNext/>
       <w:keepLines/>
@@ -24831,7 +24850,7 @@
     <w:basedOn w:val="Fontepargpadro"/>
     <w:link w:val="Ttulo1"/>
     <w:uiPriority w:val="9"/>
-    <w:rsid w:val="005A7C0F"/>
+    <w:rsid w:val="0047292B"/>
     <w:rPr>
       <w:rFonts w:asciiTheme="majorHAnsi" w:eastAsiaTheme="majorEastAsia" w:hAnsiTheme="majorHAnsi" w:cstheme="majorBidi"/>
       <w:color w:val="0F4761" w:themeColor="accent1" w:themeShade="BF"/>
@@ -24844,7 +24863,7 @@
     <w:basedOn w:val="Fontepargpadro"/>
     <w:link w:val="Ttulo2"/>
     <w:uiPriority w:val="9"/>
-    <w:rsid w:val="005A7C0F"/>
+    <w:rsid w:val="0047292B"/>
     <w:rPr>
       <w:rFonts w:asciiTheme="majorHAnsi" w:eastAsiaTheme="majorEastAsia" w:hAnsiTheme="majorHAnsi" w:cstheme="majorBidi"/>
       <w:color w:val="0F4761" w:themeColor="accent1" w:themeShade="BF"/>
@@ -24858,7 +24877,7 @@
     <w:link w:val="Ttulo3"/>
     <w:uiPriority w:val="9"/>
     <w:semiHidden/>
-    <w:rsid w:val="005A7C0F"/>
+    <w:rsid w:val="0047292B"/>
     <w:rPr>
       <w:rFonts w:eastAsiaTheme="majorEastAsia" w:cstheme="majorBidi"/>
       <w:color w:val="0F4761" w:themeColor="accent1" w:themeShade="BF"/>
@@ -24872,7 +24891,7 @@
     <w:link w:val="Ttulo4"/>
     <w:uiPriority w:val="9"/>
     <w:semiHidden/>
-    <w:rsid w:val="005A7C0F"/>
+    <w:rsid w:val="0047292B"/>
     <w:rPr>
       <w:rFonts w:eastAsiaTheme="majorEastAsia" w:cstheme="majorBidi"/>
       <w:i/>
@@ -24886,7 +24905,7 @@
     <w:link w:val="Ttulo5"/>
     <w:uiPriority w:val="9"/>
     <w:semiHidden/>
-    <w:rsid w:val="005A7C0F"/>
+    <w:rsid w:val="0047292B"/>
     <w:rPr>
       <w:rFonts w:eastAsiaTheme="majorEastAsia" w:cstheme="majorBidi"/>
       <w:color w:val="0F4761" w:themeColor="accent1" w:themeShade="BF"/>
@@ -24898,7 +24917,7 @@
     <w:link w:val="Ttulo6"/>
     <w:uiPriority w:val="9"/>
     <w:semiHidden/>
-    <w:rsid w:val="005A7C0F"/>
+    <w:rsid w:val="0047292B"/>
     <w:rPr>
       <w:rFonts w:eastAsiaTheme="majorEastAsia" w:cstheme="majorBidi"/>
       <w:i/>
@@ -24912,7 +24931,7 @@
     <w:link w:val="Ttulo7"/>
     <w:uiPriority w:val="9"/>
     <w:semiHidden/>
-    <w:rsid w:val="005A7C0F"/>
+    <w:rsid w:val="0047292B"/>
     <w:rPr>
       <w:rFonts w:eastAsiaTheme="majorEastAsia" w:cstheme="majorBidi"/>
       <w:color w:val="595959" w:themeColor="text1" w:themeTint="A6"/>
@@ -24924,7 +24943,7 @@
     <w:link w:val="Ttulo8"/>
     <w:uiPriority w:val="9"/>
     <w:semiHidden/>
-    <w:rsid w:val="005A7C0F"/>
+    <w:rsid w:val="0047292B"/>
     <w:rPr>
       <w:rFonts w:eastAsiaTheme="majorEastAsia" w:cstheme="majorBidi"/>
       <w:i/>
@@ -24938,7 +24957,7 @@
     <w:link w:val="Ttulo9"/>
     <w:uiPriority w:val="9"/>
     <w:semiHidden/>
-    <w:rsid w:val="005A7C0F"/>
+    <w:rsid w:val="0047292B"/>
     <w:rPr>
       <w:rFonts w:eastAsiaTheme="majorEastAsia" w:cstheme="majorBidi"/>
       <w:color w:val="272727" w:themeColor="text1" w:themeTint="D8"/>
@@ -24951,7 +24970,7 @@
     <w:link w:val="TtuloChar"/>
     <w:uiPriority w:val="10"/>
     <w:qFormat/>
-    <w:rsid w:val="005A7C0F"/>
+    <w:rsid w:val="0047292B"/>
     <w:pPr>
       <w:spacing w:after="80" w:line="240" w:lineRule="auto"/>
       <w:contextualSpacing/>
@@ -24969,7 +24988,7 @@
     <w:basedOn w:val="Fontepargpadro"/>
     <w:link w:val="Ttulo"/>
     <w:uiPriority w:val="10"/>
-    <w:rsid w:val="005A7C0F"/>
+    <w:rsid w:val="0047292B"/>
     <w:rPr>
       <w:rFonts w:asciiTheme="majorHAnsi" w:eastAsiaTheme="majorEastAsia" w:hAnsiTheme="majorHAnsi" w:cstheme="majorBidi"/>
       <w:spacing w:val="-10"/>
@@ -24985,7 +25004,7 @@
     <w:link w:val="SubttuloChar"/>
     <w:uiPriority w:val="11"/>
     <w:qFormat/>
-    <w:rsid w:val="005A7C0F"/>
+    <w:rsid w:val="0047292B"/>
     <w:pPr>
       <w:numPr>
         <w:ilvl w:val="1"/>
@@ -25004,7 +25023,7 @@
     <w:basedOn w:val="Fontepargpadro"/>
     <w:link w:val="Subttulo"/>
     <w:uiPriority w:val="11"/>
-    <w:rsid w:val="005A7C0F"/>
+    <w:rsid w:val="0047292B"/>
     <w:rPr>
       <w:rFonts w:eastAsiaTheme="majorEastAsia" w:cstheme="majorBidi"/>
       <w:color w:val="595959" w:themeColor="text1" w:themeTint="A6"/>
@@ -25020,7 +25039,7 @@
     <w:link w:val="CitaoChar"/>
     <w:uiPriority w:val="29"/>
     <w:qFormat/>
-    <w:rsid w:val="005A7C0F"/>
+    <w:rsid w:val="0047292B"/>
     <w:pPr>
       <w:spacing w:before="160"/>
       <w:jc w:val="center"/>
@@ -25036,7 +25055,7 @@
     <w:basedOn w:val="Fontepargpadro"/>
     <w:link w:val="Citao"/>
     <w:uiPriority w:val="29"/>
-    <w:rsid w:val="005A7C0F"/>
+    <w:rsid w:val="0047292B"/>
     <w:rPr>
       <w:i/>
       <w:iCs/>
@@ -25048,7 +25067,7 @@
     <w:basedOn w:val="Normal"/>
     <w:uiPriority w:val="34"/>
     <w:qFormat/>
-    <w:rsid w:val="005A7C0F"/>
+    <w:rsid w:val="0047292B"/>
     <w:pPr>
       <w:ind w:left="720"/>
       <w:contextualSpacing/>
@@ -25059,7 +25078,7 @@
     <w:basedOn w:val="Fontepargpadro"/>
     <w:uiPriority w:val="21"/>
     <w:qFormat/>
-    <w:rsid w:val="005A7C0F"/>
+    <w:rsid w:val="0047292B"/>
     <w:rPr>
       <w:i/>
       <w:iCs/>
@@ -25073,7 +25092,7 @@
     <w:link w:val="CitaoIntensaChar"/>
     <w:uiPriority w:val="30"/>
     <w:qFormat/>
-    <w:rsid w:val="005A7C0F"/>
+    <w:rsid w:val="0047292B"/>
     <w:pPr>
       <w:pBdr>
         <w:top w:val="single" w:sz="4" w:space="10" w:color="0F4761" w:themeColor="accent1" w:themeShade="BF"/>
@@ -25094,7 +25113,7 @@
     <w:basedOn w:val="Fontepargpadro"/>
     <w:link w:val="CitaoIntensa"/>
     <w:uiPriority w:val="30"/>
-    <w:rsid w:val="005A7C0F"/>
+    <w:rsid w:val="0047292B"/>
     <w:rPr>
       <w:i/>
       <w:iCs/>
@@ -25106,7 +25125,7 @@
     <w:basedOn w:val="Fontepargpadro"/>
     <w:uiPriority w:val="32"/>
     <w:qFormat/>
-    <w:rsid w:val="005A7C0F"/>
+    <w:rsid w:val="0047292B"/>
     <w:rPr>
       <w:b/>
       <w:bCs/>
@@ -25121,7 +25140,7 @@
     <w:link w:val="CabealhoChar"/>
     <w:uiPriority w:val="99"/>
     <w:unhideWhenUsed/>
-    <w:rsid w:val="005A7C0F"/>
+    <w:rsid w:val="0047292B"/>
     <w:pPr>
       <w:tabs>
         <w:tab w:val="center" w:pos="4252"/>
@@ -25135,7 +25154,7 @@
     <w:basedOn w:val="Fontepargpadro"/>
     <w:link w:val="Cabealho"/>
     <w:uiPriority w:val="99"/>
-    <w:rsid w:val="005A7C0F"/>
+    <w:rsid w:val="0047292B"/>
   </w:style>
   <w:style w:type="paragraph" w:styleId="Rodap">
     <w:name w:val="footer"/>
@@ -25143,7 +25162,7 @@
     <w:link w:val="RodapChar"/>
     <w:uiPriority w:val="99"/>
     <w:unhideWhenUsed/>
-    <w:rsid w:val="005A7C0F"/>
+    <w:rsid w:val="0047292B"/>
     <w:pPr>
       <w:tabs>
         <w:tab w:val="center" w:pos="4252"/>
@@ -25157,7 +25176,7 @@
     <w:basedOn w:val="Fontepargpadro"/>
     <w:link w:val="Rodap"/>
     <w:uiPriority w:val="99"/>
-    <w:rsid w:val="005A7C0F"/>
+    <w:rsid w:val="0047292B"/>
   </w:style>
   <w:style w:type="paragraph" w:styleId="Sumrio1">
     <w:name w:val="toc 1"/>
@@ -25166,7 +25185,7 @@
     <w:autoRedefine/>
     <w:uiPriority w:val="39"/>
     <w:unhideWhenUsed/>
-    <w:rsid w:val="005A7C0F"/>
+    <w:rsid w:val="0047292B"/>
     <w:pPr>
       <w:spacing w:after="100"/>
     </w:pPr>
@@ -25178,7 +25197,7 @@
     <w:autoRedefine/>
     <w:uiPriority w:val="39"/>
     <w:unhideWhenUsed/>
-    <w:rsid w:val="005A7C0F"/>
+    <w:rsid w:val="0047292B"/>
     <w:pPr>
       <w:spacing w:after="100"/>
       <w:ind w:left="240"/>

</xml_diff>

<commit_message>
Corrige aperto de layout nas tabelas de Verificação, Análise Crítica, Saídas e Validação
As mesmas duas tabelas mais afetadas (Verificação, Análise Crítica) tinham o
texto forçado para a largura mínima de 95px por campo, causando quebra de
linha excessiva - igual ao problema já corrigido no Cronograma. Saídas e
Validação receberam um ajuste menor, dando largura própria às colunas de
seleção. Sem mudança de comportamento - apenas ajuste de layout.

Co-Authored-By: Claude Sonnet 5 <noreply@anthropic.com>
</commit_message>
<xml_diff>
--- a/Manual de Uso - Ferramenta de Gestao de Projetos.docx
+++ b/Manual de Uso - Ferramenta de Gestao de Projetos.docx
@@ -229,7 +229,7 @@
         <w:rPr>
           <w:noProof/>
         </w:rPr>
-        <w:instrText xml:space="preserve"> PAGEREF _Toc240275425 \h </w:instrText>
+        <w:instrText xml:space="preserve"> PAGEREF _Toc240276707 \h </w:instrText>
       </w:r>
       <w:r>
         <w:rPr>
@@ -290,7 +290,7 @@
         <w:rPr>
           <w:noProof/>
         </w:rPr>
-        <w:instrText xml:space="preserve"> PAGEREF _Toc240275426 \h </w:instrText>
+        <w:instrText xml:space="preserve"> PAGEREF _Toc240276708 \h </w:instrText>
       </w:r>
       <w:r>
         <w:rPr>
@@ -351,7 +351,7 @@
         <w:rPr>
           <w:noProof/>
         </w:rPr>
-        <w:instrText xml:space="preserve"> PAGEREF _Toc240275427 \h </w:instrText>
+        <w:instrText xml:space="preserve"> PAGEREF _Toc240276709 \h </w:instrText>
       </w:r>
       <w:r>
         <w:rPr>
@@ -412,7 +412,7 @@
         <w:rPr>
           <w:noProof/>
         </w:rPr>
-        <w:instrText xml:space="preserve"> PAGEREF _Toc240275428 \h </w:instrText>
+        <w:instrText xml:space="preserve"> PAGEREF _Toc240276710 \h </w:instrText>
       </w:r>
       <w:r>
         <w:rPr>
@@ -473,7 +473,7 @@
         <w:rPr>
           <w:noProof/>
         </w:rPr>
-        <w:instrText xml:space="preserve"> PAGEREF _Toc240275429 \h </w:instrText>
+        <w:instrText xml:space="preserve"> PAGEREF _Toc240276711 \h </w:instrText>
       </w:r>
       <w:r>
         <w:rPr>
@@ -534,7 +534,7 @@
         <w:rPr>
           <w:noProof/>
         </w:rPr>
-        <w:instrText xml:space="preserve"> PAGEREF _Toc240275430 \h </w:instrText>
+        <w:instrText xml:space="preserve"> PAGEREF _Toc240276712 \h </w:instrText>
       </w:r>
       <w:r>
         <w:rPr>
@@ -595,7 +595,7 @@
         <w:rPr>
           <w:noProof/>
         </w:rPr>
-        <w:instrText xml:space="preserve"> PAGEREF _Toc240275431 \h </w:instrText>
+        <w:instrText xml:space="preserve"> PAGEREF _Toc240276713 \h </w:instrText>
       </w:r>
       <w:r>
         <w:rPr>
@@ -656,7 +656,7 @@
         <w:rPr>
           <w:noProof/>
         </w:rPr>
-        <w:instrText xml:space="preserve"> PAGEREF _Toc240275432 \h </w:instrText>
+        <w:instrText xml:space="preserve"> PAGEREF _Toc240276714 \h </w:instrText>
       </w:r>
       <w:r>
         <w:rPr>
@@ -717,7 +717,7 @@
         <w:rPr>
           <w:noProof/>
         </w:rPr>
-        <w:instrText xml:space="preserve"> PAGEREF _Toc240275433 \h </w:instrText>
+        <w:instrText xml:space="preserve"> PAGEREF _Toc240276715 \h </w:instrText>
       </w:r>
       <w:r>
         <w:rPr>
@@ -778,7 +778,7 @@
         <w:rPr>
           <w:noProof/>
         </w:rPr>
-        <w:instrText xml:space="preserve"> PAGEREF _Toc240275434 \h </w:instrText>
+        <w:instrText xml:space="preserve"> PAGEREF _Toc240276716 \h </w:instrText>
       </w:r>
       <w:r>
         <w:rPr>
@@ -839,7 +839,7 @@
         <w:rPr>
           <w:noProof/>
         </w:rPr>
-        <w:instrText xml:space="preserve"> PAGEREF _Toc240275435 \h </w:instrText>
+        <w:instrText xml:space="preserve"> PAGEREF _Toc240276717 \h </w:instrText>
       </w:r>
       <w:r>
         <w:rPr>
@@ -900,7 +900,7 @@
         <w:rPr>
           <w:noProof/>
         </w:rPr>
-        <w:instrText xml:space="preserve"> PAGEREF _Toc240275436 \h </w:instrText>
+        <w:instrText xml:space="preserve"> PAGEREF _Toc240276718 \h </w:instrText>
       </w:r>
       <w:r>
         <w:rPr>
@@ -961,7 +961,7 @@
         <w:rPr>
           <w:noProof/>
         </w:rPr>
-        <w:instrText xml:space="preserve"> PAGEREF _Toc240275437 \h </w:instrText>
+        <w:instrText xml:space="preserve"> PAGEREF _Toc240276719 \h </w:instrText>
       </w:r>
       <w:r>
         <w:rPr>
@@ -1022,7 +1022,7 @@
         <w:rPr>
           <w:noProof/>
         </w:rPr>
-        <w:instrText xml:space="preserve"> PAGEREF _Toc240275438 \h </w:instrText>
+        <w:instrText xml:space="preserve"> PAGEREF _Toc240276720 \h </w:instrText>
       </w:r>
       <w:r>
         <w:rPr>
@@ -1083,7 +1083,7 @@
         <w:rPr>
           <w:noProof/>
         </w:rPr>
-        <w:instrText xml:space="preserve"> PAGEREF _Toc240275439 \h </w:instrText>
+        <w:instrText xml:space="preserve"> PAGEREF _Toc240276721 \h </w:instrText>
       </w:r>
       <w:r>
         <w:rPr>
@@ -1144,7 +1144,7 @@
         <w:rPr>
           <w:noProof/>
         </w:rPr>
-        <w:instrText xml:space="preserve"> PAGEREF _Toc240275440 \h </w:instrText>
+        <w:instrText xml:space="preserve"> PAGEREF _Toc240276722 \h </w:instrText>
       </w:r>
       <w:r>
         <w:rPr>
@@ -1205,7 +1205,7 @@
         <w:rPr>
           <w:noProof/>
         </w:rPr>
-        <w:instrText xml:space="preserve"> PAGEREF _Toc240275441 \h </w:instrText>
+        <w:instrText xml:space="preserve"> PAGEREF _Toc240276723 \h </w:instrText>
       </w:r>
       <w:r>
         <w:rPr>
@@ -1266,7 +1266,7 @@
         <w:rPr>
           <w:noProof/>
         </w:rPr>
-        <w:instrText xml:space="preserve"> PAGEREF _Toc240275442 \h </w:instrText>
+        <w:instrText xml:space="preserve"> PAGEREF _Toc240276724 \h </w:instrText>
       </w:r>
       <w:r>
         <w:rPr>
@@ -1327,7 +1327,7 @@
         <w:rPr>
           <w:noProof/>
         </w:rPr>
-        <w:instrText xml:space="preserve"> PAGEREF _Toc240275443 \h </w:instrText>
+        <w:instrText xml:space="preserve"> PAGEREF _Toc240276725 \h </w:instrText>
       </w:r>
       <w:r>
         <w:rPr>
@@ -1388,7 +1388,7 @@
         <w:rPr>
           <w:noProof/>
         </w:rPr>
-        <w:instrText xml:space="preserve"> PAGEREF _Toc240275444 \h </w:instrText>
+        <w:instrText xml:space="preserve"> PAGEREF _Toc240276726 \h </w:instrText>
       </w:r>
       <w:r>
         <w:rPr>
@@ -1449,7 +1449,7 @@
         <w:rPr>
           <w:noProof/>
         </w:rPr>
-        <w:instrText xml:space="preserve"> PAGEREF _Toc240275445 \h </w:instrText>
+        <w:instrText xml:space="preserve"> PAGEREF _Toc240276727 \h </w:instrText>
       </w:r>
       <w:r>
         <w:rPr>
@@ -1510,7 +1510,7 @@
         <w:rPr>
           <w:noProof/>
         </w:rPr>
-        <w:instrText xml:space="preserve"> PAGEREF _Toc240275446 \h </w:instrText>
+        <w:instrText xml:space="preserve"> PAGEREF _Toc240276728 \h </w:instrText>
       </w:r>
       <w:r>
         <w:rPr>
@@ -1571,7 +1571,7 @@
         <w:rPr>
           <w:noProof/>
         </w:rPr>
-        <w:instrText xml:space="preserve"> PAGEREF _Toc240275447 \h </w:instrText>
+        <w:instrText xml:space="preserve"> PAGEREF _Toc240276729 \h </w:instrText>
       </w:r>
       <w:r>
         <w:rPr>
@@ -1632,7 +1632,7 @@
         <w:rPr>
           <w:noProof/>
         </w:rPr>
-        <w:instrText xml:space="preserve"> PAGEREF _Toc240275448 \h </w:instrText>
+        <w:instrText xml:space="preserve"> PAGEREF _Toc240276730 \h </w:instrText>
       </w:r>
       <w:r>
         <w:rPr>
@@ -1693,7 +1693,7 @@
         <w:rPr>
           <w:noProof/>
         </w:rPr>
-        <w:instrText xml:space="preserve"> PAGEREF _Toc240275449 \h </w:instrText>
+        <w:instrText xml:space="preserve"> PAGEREF _Toc240276731 \h </w:instrText>
       </w:r>
       <w:r>
         <w:rPr>
@@ -1755,7 +1755,7 @@
         <w:rPr>
           <w:noProof/>
         </w:rPr>
-        <w:instrText xml:space="preserve"> PAGEREF _Toc240275450 \h </w:instrText>
+        <w:instrText xml:space="preserve"> PAGEREF _Toc240276732 \h </w:instrText>
       </w:r>
       <w:r>
         <w:rPr>
@@ -1816,7 +1816,7 @@
         <w:rPr>
           <w:noProof/>
         </w:rPr>
-        <w:instrText xml:space="preserve"> PAGEREF _Toc240275451 \h </w:instrText>
+        <w:instrText xml:space="preserve"> PAGEREF _Toc240276733 \h </w:instrText>
       </w:r>
       <w:r>
         <w:rPr>
@@ -1877,7 +1877,7 @@
         <w:rPr>
           <w:noProof/>
         </w:rPr>
-        <w:instrText xml:space="preserve"> PAGEREF _Toc240275452 \h </w:instrText>
+        <w:instrText xml:space="preserve"> PAGEREF _Toc240276734 \h </w:instrText>
       </w:r>
       <w:r>
         <w:rPr>
@@ -1938,7 +1938,7 @@
         <w:rPr>
           <w:noProof/>
         </w:rPr>
-        <w:instrText xml:space="preserve"> PAGEREF _Toc240275453 \h </w:instrText>
+        <w:instrText xml:space="preserve"> PAGEREF _Toc240276735 \h </w:instrText>
       </w:r>
       <w:r>
         <w:rPr>
@@ -1999,7 +1999,7 @@
         <w:rPr>
           <w:noProof/>
         </w:rPr>
-        <w:instrText xml:space="preserve"> PAGEREF _Toc240275454 \h </w:instrText>
+        <w:instrText xml:space="preserve"> PAGEREF _Toc240276736 \h </w:instrText>
       </w:r>
       <w:r>
         <w:rPr>
@@ -2060,7 +2060,7 @@
         <w:rPr>
           <w:noProof/>
         </w:rPr>
-        <w:instrText xml:space="preserve"> PAGEREF _Toc240275455 \h </w:instrText>
+        <w:instrText xml:space="preserve"> PAGEREF _Toc240276737 \h </w:instrText>
       </w:r>
       <w:r>
         <w:rPr>
@@ -2121,7 +2121,7 @@
         <w:rPr>
           <w:noProof/>
         </w:rPr>
-        <w:instrText xml:space="preserve"> PAGEREF _Toc240275456 \h </w:instrText>
+        <w:instrText xml:space="preserve"> PAGEREF _Toc240276738 \h </w:instrText>
       </w:r>
       <w:r>
         <w:rPr>
@@ -2182,7 +2182,7 @@
         <w:rPr>
           <w:noProof/>
         </w:rPr>
-        <w:instrText xml:space="preserve"> PAGEREF _Toc240275457 \h </w:instrText>
+        <w:instrText xml:space="preserve"> PAGEREF _Toc240276739 \h </w:instrText>
       </w:r>
       <w:r>
         <w:rPr>
@@ -2243,7 +2243,7 @@
         <w:rPr>
           <w:noProof/>
         </w:rPr>
-        <w:instrText xml:space="preserve"> PAGEREF _Toc240275458 \h </w:instrText>
+        <w:instrText xml:space="preserve"> PAGEREF _Toc240276740 \h </w:instrText>
       </w:r>
       <w:r>
         <w:rPr>
@@ -2304,7 +2304,7 @@
         <w:rPr>
           <w:noProof/>
         </w:rPr>
-        <w:instrText xml:space="preserve"> PAGEREF _Toc240275459 \h </w:instrText>
+        <w:instrText xml:space="preserve"> PAGEREF _Toc240276741 \h </w:instrText>
       </w:r>
       <w:r>
         <w:rPr>
@@ -2365,7 +2365,7 @@
         <w:rPr>
           <w:noProof/>
         </w:rPr>
-        <w:instrText xml:space="preserve"> PAGEREF _Toc240275460 \h </w:instrText>
+        <w:instrText xml:space="preserve"> PAGEREF _Toc240276742 \h </w:instrText>
       </w:r>
       <w:r>
         <w:rPr>
@@ -2426,7 +2426,7 @@
         <w:rPr>
           <w:noProof/>
         </w:rPr>
-        <w:instrText xml:space="preserve"> PAGEREF _Toc240275461 \h </w:instrText>
+        <w:instrText xml:space="preserve"> PAGEREF _Toc240276743 \h </w:instrText>
       </w:r>
       <w:r>
         <w:rPr>
@@ -2487,7 +2487,7 @@
         <w:rPr>
           <w:noProof/>
         </w:rPr>
-        <w:instrText xml:space="preserve"> PAGEREF _Toc240275462 \h </w:instrText>
+        <w:instrText xml:space="preserve"> PAGEREF _Toc240276744 \h </w:instrText>
       </w:r>
       <w:r>
         <w:rPr>
@@ -2548,7 +2548,7 @@
         <w:rPr>
           <w:noProof/>
         </w:rPr>
-        <w:instrText xml:space="preserve"> PAGEREF _Toc240275463 \h </w:instrText>
+        <w:instrText xml:space="preserve"> PAGEREF _Toc240276745 \h </w:instrText>
       </w:r>
       <w:r>
         <w:rPr>
@@ -2609,7 +2609,7 @@
         <w:rPr>
           <w:noProof/>
         </w:rPr>
-        <w:instrText xml:space="preserve"> PAGEREF _Toc240275464 \h </w:instrText>
+        <w:instrText xml:space="preserve"> PAGEREF _Toc240276746 \h </w:instrText>
       </w:r>
       <w:r>
         <w:rPr>
@@ -2670,7 +2670,7 @@
         <w:rPr>
           <w:noProof/>
         </w:rPr>
-        <w:instrText xml:space="preserve"> PAGEREF _Toc240275465 \h </w:instrText>
+        <w:instrText xml:space="preserve"> PAGEREF _Toc240276747 \h </w:instrText>
       </w:r>
       <w:r>
         <w:rPr>
@@ -2731,7 +2731,7 @@
         <w:rPr>
           <w:noProof/>
         </w:rPr>
-        <w:instrText xml:space="preserve"> PAGEREF _Toc240275466 \h </w:instrText>
+        <w:instrText xml:space="preserve"> PAGEREF _Toc240276748 \h </w:instrText>
       </w:r>
       <w:r>
         <w:rPr>
@@ -2792,7 +2792,7 @@
         <w:rPr>
           <w:noProof/>
         </w:rPr>
-        <w:instrText xml:space="preserve"> PAGEREF _Toc240275467 \h </w:instrText>
+        <w:instrText xml:space="preserve"> PAGEREF _Toc240276749 \h </w:instrText>
       </w:r>
       <w:r>
         <w:rPr>
@@ -2853,7 +2853,7 @@
         <w:rPr>
           <w:noProof/>
         </w:rPr>
-        <w:instrText xml:space="preserve"> PAGEREF _Toc240275468 \h </w:instrText>
+        <w:instrText xml:space="preserve"> PAGEREF _Toc240276750 \h </w:instrText>
       </w:r>
       <w:r>
         <w:rPr>
@@ -2914,7 +2914,7 @@
         <w:rPr>
           <w:noProof/>
         </w:rPr>
-        <w:instrText xml:space="preserve"> PAGEREF _Toc240275469 \h </w:instrText>
+        <w:instrText xml:space="preserve"> PAGEREF _Toc240276751 \h </w:instrText>
       </w:r>
       <w:r>
         <w:rPr>
@@ -2975,7 +2975,7 @@
         <w:rPr>
           <w:noProof/>
         </w:rPr>
-        <w:instrText xml:space="preserve"> PAGEREF _Toc240275470 \h </w:instrText>
+        <w:instrText xml:space="preserve"> PAGEREF _Toc240276752 \h </w:instrText>
       </w:r>
       <w:r>
         <w:rPr>
@@ -3036,7 +3036,7 @@
         <w:rPr>
           <w:noProof/>
         </w:rPr>
-        <w:instrText xml:space="preserve"> PAGEREF _Toc240275471 \h </w:instrText>
+        <w:instrText xml:space="preserve"> PAGEREF _Toc240276753 \h </w:instrText>
       </w:r>
       <w:r>
         <w:rPr>
@@ -3097,7 +3097,7 @@
         <w:rPr>
           <w:noProof/>
         </w:rPr>
-        <w:instrText xml:space="preserve"> PAGEREF _Toc240275472 \h </w:instrText>
+        <w:instrText xml:space="preserve"> PAGEREF _Toc240276754 \h </w:instrText>
       </w:r>
       <w:r>
         <w:rPr>
@@ -3173,7 +3173,7 @@
           <w:sz w:val="34"/>
         </w:rPr>
       </w:pPr>
-      <w:bookmarkStart w:id="0" w:name="_Toc240275425"/>
+      <w:bookmarkStart w:id="0" w:name="_Toc240276707"/>
       <w:r>
         <w:rPr>
           <w:rFonts w:ascii="Montserrat" w:hAnsi="Montserrat"/>
@@ -3197,7 +3197,7 @@
           <w:sz w:val="27"/>
         </w:rPr>
       </w:pPr>
-      <w:bookmarkStart w:id="1" w:name="_Toc240275426"/>
+      <w:bookmarkStart w:id="1" w:name="_Toc240276708"/>
       <w:r>
         <w:rPr>
           <w:rFonts w:ascii="Montserrat" w:hAnsi="Montserrat"/>
@@ -4593,6 +4593,33 @@
           <w:color w:val="1A1A1A"/>
           <w:sz w:val="22"/>
         </w:rPr>
+        <w:t xml:space="preserve">Esta e a versao 2.69 do manual. Em relacao a versao 2.68 (14/09/2026), o mesmo ajuste de layout foi estendido as tabelas de Verificacao e Analise Critica do Planejamento (Passo 4, abas 6 e 8), que tinham o mesmo problema: a largura minima de ambas aumentou e suas colunas de texto mais longas ganharam </w:t>
+      </w:r>
+      <w:r>
+        <w:rPr>
+          <w:rFonts w:ascii="Montserrat" w:hAnsi="Montserrat"/>
+          <w:color w:val="1A1A1A"/>
+          <w:sz w:val="22"/>
+        </w:rPr>
+        <w:lastRenderedPageBreak/>
+        <w:t>mais espaco relativo. As tabelas de Saidas e Validacao (abas 5 e 7) tambem receberam um ajuste menor, dando largura propria as colunas de selecao (Status/Resultado/Aprovacao), que antes ficavam mais estreitas que o restante sem necessidade. Sem mudanca de comportamento - apenas ajuste de layout.</w:t>
+      </w:r>
+    </w:p>
+    <w:p>
+      <w:pPr>
+        <w:spacing w:line="280" w:lineRule="auto"/>
+        <w:rPr>
+          <w:rFonts w:ascii="Montserrat" w:hAnsi="Montserrat"/>
+          <w:color w:val="1A1A1A"/>
+          <w:sz w:val="22"/>
+        </w:rPr>
+      </w:pPr>
+      <w:r>
+        <w:rPr>
+          <w:rFonts w:ascii="Montserrat" w:hAnsi="Montserrat"/>
+          <w:color w:val="1A1A1A"/>
+          <w:sz w:val="22"/>
+        </w:rPr>
         <w:t>O manual nao substitui as Diretrizes para a Gestao de Projetos da UNIALFA (documento institucional que define o framework D01 a D07) nem o documento Regras de Acesso e Permissoes (que detalha cada regra de controle de acesso); ele e o guia operacional de como usar cada ferramenta na pratica.</w:t>
       </w:r>
     </w:p>
@@ -4607,7 +4634,7 @@
           <w:sz w:val="27"/>
         </w:rPr>
       </w:pPr>
-      <w:bookmarkStart w:id="2" w:name="_Toc240275427"/>
+      <w:bookmarkStart w:id="2" w:name="_Toc240276709"/>
       <w:r>
         <w:rPr>
           <w:rFonts w:ascii="Montserrat" w:hAnsi="Montserrat"/>
@@ -4615,7 +4642,6 @@
           <w:color w:val="B91D2E"/>
           <w:sz w:val="27"/>
         </w:rPr>
-        <w:lastRenderedPageBreak/>
         <w:t>1.2 Visao geral da ferramenta</w:t>
       </w:r>
       <w:bookmarkEnd w:id="2"/>
@@ -4805,16 +4831,16 @@
         </w:rPr>
         <w:lastRenderedPageBreak/>
         <w:drawing>
-          <wp:inline distT="0" distB="0" distL="0" distR="0" wp14:anchorId="1DC219B3" wp14:editId="45ED97BC">
+          <wp:inline distT="0" distB="0" distL="0" distR="0" wp14:anchorId="1664D1F7" wp14:editId="72734BC2">
             <wp:extent cx="5303520" cy="4792851"/>
             <wp:effectExtent l="19050" t="19050" r="11430" b="27305"/>
-            <wp:docPr id="2055485955" name="Imagem 1"/>
+            <wp:docPr id="2021969999" name="Imagem 1"/>
             <wp:cNvGraphicFramePr/>
             <a:graphic xmlns:a="http://schemas.openxmlformats.org/drawingml/2006/main">
               <a:graphicData uri="http://schemas.openxmlformats.org/drawingml/2006/picture">
                 <pic:pic xmlns:pic="http://schemas.openxmlformats.org/drawingml/2006/picture">
                   <pic:nvPicPr>
-                    <pic:cNvPr id="2055485955" name=""/>
+                    <pic:cNvPr id="2021969999" name=""/>
                     <pic:cNvPicPr/>
                   </pic:nvPicPr>
                   <pic:blipFill>
@@ -4882,7 +4908,7 @@
           <w:sz w:val="27"/>
         </w:rPr>
       </w:pPr>
-      <w:bookmarkStart w:id="3" w:name="_Toc240275428"/>
+      <w:bookmarkStart w:id="3" w:name="_Toc240276710"/>
       <w:r>
         <w:rPr>
           <w:rFonts w:ascii="Montserrat" w:hAnsi="Montserrat"/>
@@ -4923,16 +4949,16 @@
         </w:rPr>
         <w:lastRenderedPageBreak/>
         <w:drawing>
-          <wp:inline distT="0" distB="0" distL="0" distR="0" wp14:anchorId="314100B1" wp14:editId="059D44A6">
+          <wp:inline distT="0" distB="0" distL="0" distR="0" wp14:anchorId="20F18972" wp14:editId="0DA782D0">
             <wp:extent cx="4206240" cy="3801227"/>
             <wp:effectExtent l="19050" t="19050" r="22860" b="27940"/>
-            <wp:docPr id="1916909051" name="Imagem 2"/>
+            <wp:docPr id="703103711" name="Imagem 2"/>
             <wp:cNvGraphicFramePr/>
             <a:graphic xmlns:a="http://schemas.openxmlformats.org/drawingml/2006/main">
               <a:graphicData uri="http://schemas.openxmlformats.org/drawingml/2006/picture">
                 <pic:pic xmlns:pic="http://schemas.openxmlformats.org/drawingml/2006/picture">
                   <pic:nvPicPr>
-                    <pic:cNvPr id="1916909051" name=""/>
+                    <pic:cNvPr id="703103711" name=""/>
                     <pic:cNvPicPr/>
                   </pic:nvPicPr>
                   <pic:blipFill>
@@ -5105,7 +5131,7 @@
           <w:sz w:val="27"/>
         </w:rPr>
       </w:pPr>
-      <w:bookmarkStart w:id="4" w:name="_Toc240275429"/>
+      <w:bookmarkStart w:id="4" w:name="_Toc240276711"/>
       <w:r>
         <w:rPr>
           <w:rFonts w:ascii="Montserrat" w:hAnsi="Montserrat"/>
@@ -6344,7 +6370,7 @@
           <w:sz w:val="34"/>
         </w:rPr>
       </w:pPr>
-      <w:bookmarkStart w:id="5" w:name="_Toc240275430"/>
+      <w:bookmarkStart w:id="5" w:name="_Toc240276712"/>
       <w:r>
         <w:rPr>
           <w:rFonts w:ascii="Montserrat" w:hAnsi="Montserrat"/>
@@ -6368,7 +6394,7 @@
           <w:sz w:val="27"/>
         </w:rPr>
       </w:pPr>
-      <w:bookmarkStart w:id="6" w:name="_Toc240275431"/>
+      <w:bookmarkStart w:id="6" w:name="_Toc240276713"/>
       <w:r>
         <w:rPr>
           <w:rFonts w:ascii="Montserrat" w:hAnsi="Montserrat"/>
@@ -6409,7 +6435,7 @@
           <w:sz w:val="27"/>
         </w:rPr>
       </w:pPr>
-      <w:bookmarkStart w:id="7" w:name="_Toc240275432"/>
+      <w:bookmarkStart w:id="7" w:name="_Toc240276714"/>
       <w:r>
         <w:rPr>
           <w:rFonts w:ascii="Montserrat" w:hAnsi="Montserrat"/>
@@ -6528,7 +6554,7 @@
           <w:sz w:val="27"/>
         </w:rPr>
       </w:pPr>
-      <w:bookmarkStart w:id="8" w:name="_Toc240275433"/>
+      <w:bookmarkStart w:id="8" w:name="_Toc240276715"/>
       <w:r>
         <w:rPr>
           <w:rFonts w:ascii="Montserrat" w:hAnsi="Montserrat"/>
@@ -7141,7 +7167,7 @@
           <w:sz w:val="27"/>
         </w:rPr>
       </w:pPr>
-      <w:bookmarkStart w:id="9" w:name="_Toc240275434"/>
+      <w:bookmarkStart w:id="9" w:name="_Toc240276716"/>
       <w:r>
         <w:rPr>
           <w:rFonts w:ascii="Montserrat" w:hAnsi="Montserrat"/>
@@ -7230,16 +7256,16 @@
         </w:rPr>
         <w:lastRenderedPageBreak/>
         <w:drawing>
-          <wp:inline distT="0" distB="0" distL="0" distR="0" wp14:anchorId="5088DAD2" wp14:editId="24FFF1BC">
+          <wp:inline distT="0" distB="0" distL="0" distR="0" wp14:anchorId="44E0BE5C" wp14:editId="104B8D4F">
             <wp:extent cx="4937760" cy="4462310"/>
             <wp:effectExtent l="19050" t="19050" r="15240" b="14605"/>
-            <wp:docPr id="985358177" name="Imagem 3"/>
+            <wp:docPr id="761251167" name="Imagem 3"/>
             <wp:cNvGraphicFramePr/>
             <a:graphic xmlns:a="http://schemas.openxmlformats.org/drawingml/2006/main">
               <a:graphicData uri="http://schemas.openxmlformats.org/drawingml/2006/picture">
                 <pic:pic xmlns:pic="http://schemas.openxmlformats.org/drawingml/2006/picture">
                   <pic:nvPicPr>
-                    <pic:cNvPr id="985358177" name=""/>
+                    <pic:cNvPr id="761251167" name=""/>
                     <pic:cNvPicPr/>
                   </pic:nvPicPr>
                   <pic:blipFill>
@@ -7307,7 +7333,7 @@
           <w:sz w:val="27"/>
         </w:rPr>
       </w:pPr>
-      <w:bookmarkStart w:id="10" w:name="_Toc240275435"/>
+      <w:bookmarkStart w:id="10" w:name="_Toc240276717"/>
       <w:r>
         <w:rPr>
           <w:rFonts w:ascii="Montserrat" w:hAnsi="Montserrat"/>
@@ -7348,16 +7374,16 @@
         </w:rPr>
         <w:lastRenderedPageBreak/>
         <w:drawing>
-          <wp:inline distT="0" distB="0" distL="0" distR="0" wp14:anchorId="6D80DF07" wp14:editId="2AEFEC4A">
+          <wp:inline distT="0" distB="0" distL="0" distR="0" wp14:anchorId="583589D2" wp14:editId="1B6BACFC">
             <wp:extent cx="5120640" cy="4627581"/>
             <wp:effectExtent l="19050" t="19050" r="22860" b="20955"/>
-            <wp:docPr id="210257309" name="Imagem 4"/>
+            <wp:docPr id="975756007" name="Imagem 4"/>
             <wp:cNvGraphicFramePr/>
             <a:graphic xmlns:a="http://schemas.openxmlformats.org/drawingml/2006/main">
               <a:graphicData uri="http://schemas.openxmlformats.org/drawingml/2006/picture">
                 <pic:pic xmlns:pic="http://schemas.openxmlformats.org/drawingml/2006/picture">
                   <pic:nvPicPr>
-                    <pic:cNvPr id="210257309" name=""/>
+                    <pic:cNvPr id="975756007" name=""/>
                     <pic:cNvPicPr/>
                   </pic:nvPicPr>
                   <pic:blipFill>
@@ -7525,7 +7551,7 @@
           <w:sz w:val="27"/>
         </w:rPr>
       </w:pPr>
-      <w:bookmarkStart w:id="11" w:name="_Toc240275436"/>
+      <w:bookmarkStart w:id="11" w:name="_Toc240276718"/>
       <w:r>
         <w:rPr>
           <w:rFonts w:ascii="Montserrat" w:hAnsi="Montserrat"/>
@@ -7565,16 +7591,16 @@
           <w:noProof/>
         </w:rPr>
         <w:drawing>
-          <wp:inline distT="0" distB="0" distL="0" distR="0" wp14:anchorId="65FA5280" wp14:editId="06FBD168">
+          <wp:inline distT="0" distB="0" distL="0" distR="0" wp14:anchorId="09321B93" wp14:editId="17540744">
             <wp:extent cx="4206240" cy="3801227"/>
             <wp:effectExtent l="19050" t="19050" r="22860" b="27940"/>
-            <wp:docPr id="1995683262" name="Imagem 5"/>
+            <wp:docPr id="428314659" name="Imagem 5"/>
             <wp:cNvGraphicFramePr/>
             <a:graphic xmlns:a="http://schemas.openxmlformats.org/drawingml/2006/main">
               <a:graphicData uri="http://schemas.openxmlformats.org/drawingml/2006/picture">
                 <pic:pic xmlns:pic="http://schemas.openxmlformats.org/drawingml/2006/picture">
                   <pic:nvPicPr>
-                    <pic:cNvPr id="1995683262" name=""/>
+                    <pic:cNvPr id="428314659" name=""/>
                     <pic:cNvPicPr/>
                   </pic:nvPicPr>
                   <pic:blipFill>
@@ -7642,16 +7668,16 @@
         </w:rPr>
         <w:lastRenderedPageBreak/>
         <w:drawing>
-          <wp:inline distT="0" distB="0" distL="0" distR="0" wp14:anchorId="02757E9A" wp14:editId="6EF6A3EE">
+          <wp:inline distT="0" distB="0" distL="0" distR="0" wp14:anchorId="3E53FCF1" wp14:editId="4808DEB1">
             <wp:extent cx="4206240" cy="3801227"/>
             <wp:effectExtent l="19050" t="19050" r="22860" b="27940"/>
-            <wp:docPr id="1849133266" name="Imagem 6"/>
+            <wp:docPr id="1282379987" name="Imagem 6"/>
             <wp:cNvGraphicFramePr/>
             <a:graphic xmlns:a="http://schemas.openxmlformats.org/drawingml/2006/main">
               <a:graphicData uri="http://schemas.openxmlformats.org/drawingml/2006/picture">
                 <pic:pic xmlns:pic="http://schemas.openxmlformats.org/drawingml/2006/picture">
                   <pic:nvPicPr>
-                    <pic:cNvPr id="1849133266" name=""/>
+                    <pic:cNvPr id="1282379987" name=""/>
                     <pic:cNvPicPr/>
                   </pic:nvPicPr>
                   <pic:blipFill>
@@ -7767,7 +7793,7 @@
           <w:sz w:val="27"/>
         </w:rPr>
       </w:pPr>
-      <w:bookmarkStart w:id="12" w:name="_Toc240275437"/>
+      <w:bookmarkStart w:id="12" w:name="_Toc240276719"/>
       <w:r>
         <w:rPr>
           <w:rFonts w:ascii="Montserrat" w:hAnsi="Montserrat"/>
@@ -7835,7 +7861,7 @@
           <w:sz w:val="27"/>
         </w:rPr>
       </w:pPr>
-      <w:bookmarkStart w:id="13" w:name="_Toc240275438"/>
+      <w:bookmarkStart w:id="13" w:name="_Toc240276720"/>
       <w:r>
         <w:rPr>
           <w:rFonts w:ascii="Montserrat" w:hAnsi="Montserrat"/>
@@ -8062,7 +8088,7 @@
           <w:sz w:val="27"/>
         </w:rPr>
       </w:pPr>
-      <w:bookmarkStart w:id="14" w:name="_Toc240275439"/>
+      <w:bookmarkStart w:id="14" w:name="_Toc240276721"/>
       <w:r>
         <w:rPr>
           <w:rFonts w:ascii="Montserrat" w:hAnsi="Montserrat"/>
@@ -8221,7 +8247,7 @@
           <w:sz w:val="27"/>
         </w:rPr>
       </w:pPr>
-      <w:bookmarkStart w:id="15" w:name="_Toc240275440"/>
+      <w:bookmarkStart w:id="15" w:name="_Toc240276722"/>
       <w:r>
         <w:rPr>
           <w:rFonts w:ascii="Montserrat" w:hAnsi="Montserrat"/>
@@ -8413,7 +8439,7 @@
           <w:sz w:val="27"/>
         </w:rPr>
       </w:pPr>
-      <w:bookmarkStart w:id="16" w:name="_Toc240275441"/>
+      <w:bookmarkStart w:id="16" w:name="_Toc240276723"/>
       <w:r>
         <w:rPr>
           <w:rFonts w:ascii="Montserrat" w:hAnsi="Montserrat"/>
@@ -8541,7 +8567,7 @@
           <w:sz w:val="27"/>
         </w:rPr>
       </w:pPr>
-      <w:bookmarkStart w:id="17" w:name="_Toc240275442"/>
+      <w:bookmarkStart w:id="17" w:name="_Toc240276724"/>
       <w:r>
         <w:rPr>
           <w:rFonts w:ascii="Montserrat" w:hAnsi="Montserrat"/>
@@ -8871,7 +8897,7 @@
           <w:sz w:val="27"/>
         </w:rPr>
       </w:pPr>
-      <w:bookmarkStart w:id="18" w:name="_Toc240275443"/>
+      <w:bookmarkStart w:id="18" w:name="_Toc240276725"/>
       <w:r>
         <w:rPr>
           <w:rFonts w:ascii="Montserrat" w:hAnsi="Montserrat"/>
@@ -9012,7 +9038,7 @@
           <w:sz w:val="34"/>
         </w:rPr>
       </w:pPr>
-      <w:bookmarkStart w:id="19" w:name="_Toc240275444"/>
+      <w:bookmarkStart w:id="19" w:name="_Toc240276726"/>
       <w:r>
         <w:rPr>
           <w:rFonts w:ascii="Montserrat" w:hAnsi="Montserrat"/>
@@ -9054,7 +9080,7 @@
           <w:sz w:val="27"/>
         </w:rPr>
       </w:pPr>
-      <w:bookmarkStart w:id="20" w:name="_Toc240275445"/>
+      <w:bookmarkStart w:id="20" w:name="_Toc240276727"/>
       <w:r>
         <w:rPr>
           <w:rFonts w:ascii="Montserrat" w:hAnsi="Montserrat"/>
@@ -10134,16 +10160,16 @@
         </w:rPr>
         <w:lastRenderedPageBreak/>
         <w:drawing>
-          <wp:inline distT="0" distB="0" distL="0" distR="0" wp14:anchorId="7D0172E7" wp14:editId="6DEDD271">
+          <wp:inline distT="0" distB="0" distL="0" distR="0" wp14:anchorId="33AA3A30" wp14:editId="36C81F6F">
             <wp:extent cx="5120640" cy="4627581"/>
             <wp:effectExtent l="19050" t="19050" r="22860" b="20955"/>
-            <wp:docPr id="2111149256" name="Imagem 7"/>
+            <wp:docPr id="269794865" name="Imagem 7"/>
             <wp:cNvGraphicFramePr/>
             <a:graphic xmlns:a="http://schemas.openxmlformats.org/drawingml/2006/main">
               <a:graphicData uri="http://schemas.openxmlformats.org/drawingml/2006/picture">
                 <pic:pic xmlns:pic="http://schemas.openxmlformats.org/drawingml/2006/picture">
                   <pic:nvPicPr>
-                    <pic:cNvPr id="2111149256" name=""/>
+                    <pic:cNvPr id="269794865" name=""/>
                     <pic:cNvPicPr/>
                   </pic:nvPicPr>
                   <pic:blipFill>
@@ -10211,16 +10237,16 @@
         </w:rPr>
         <w:lastRenderedPageBreak/>
         <w:drawing>
-          <wp:inline distT="0" distB="0" distL="0" distR="0" wp14:anchorId="3B5D858E" wp14:editId="0FAE9637">
+          <wp:inline distT="0" distB="0" distL="0" distR="0" wp14:anchorId="1CA4F13C" wp14:editId="2084FBBA">
             <wp:extent cx="5120640" cy="4627581"/>
             <wp:effectExtent l="19050" t="19050" r="22860" b="20955"/>
-            <wp:docPr id="1417423510" name="Imagem 8"/>
+            <wp:docPr id="748110702" name="Imagem 8"/>
             <wp:cNvGraphicFramePr/>
             <a:graphic xmlns:a="http://schemas.openxmlformats.org/drawingml/2006/main">
               <a:graphicData uri="http://schemas.openxmlformats.org/drawingml/2006/picture">
                 <pic:pic xmlns:pic="http://schemas.openxmlformats.org/drawingml/2006/picture">
                   <pic:nvPicPr>
-                    <pic:cNvPr id="1417423510" name=""/>
+                    <pic:cNvPr id="748110702" name=""/>
                     <pic:cNvPicPr/>
                   </pic:nvPicPr>
                   <pic:blipFill>
@@ -10428,7 +10454,7 @@
           <w:sz w:val="27"/>
         </w:rPr>
       </w:pPr>
-      <w:bookmarkStart w:id="21" w:name="_Toc240275446"/>
+      <w:bookmarkStart w:id="21" w:name="_Toc240276728"/>
       <w:r>
         <w:rPr>
           <w:rFonts w:ascii="Montserrat" w:hAnsi="Montserrat"/>
@@ -11353,16 +11379,16 @@
           <w:noProof/>
         </w:rPr>
         <w:drawing>
-          <wp:inline distT="0" distB="0" distL="0" distR="0" wp14:anchorId="5C8F8FF1" wp14:editId="12C9114D">
+          <wp:inline distT="0" distB="0" distL="0" distR="0" wp14:anchorId="422CC7A4" wp14:editId="6BF6AC75">
             <wp:extent cx="5120640" cy="4627581"/>
             <wp:effectExtent l="19050" t="19050" r="22860" b="20955"/>
-            <wp:docPr id="1483262122" name="Imagem 9"/>
+            <wp:docPr id="639881493" name="Imagem 9"/>
             <wp:cNvGraphicFramePr/>
             <a:graphic xmlns:a="http://schemas.openxmlformats.org/drawingml/2006/main">
               <a:graphicData uri="http://schemas.openxmlformats.org/drawingml/2006/picture">
                 <pic:pic xmlns:pic="http://schemas.openxmlformats.org/drawingml/2006/picture">
                   <pic:nvPicPr>
-                    <pic:cNvPr id="1483262122" name=""/>
+                    <pic:cNvPr id="639881493" name=""/>
                     <pic:cNvPicPr/>
                   </pic:nvPicPr>
                   <pic:blipFill>
@@ -11430,16 +11456,16 @@
         </w:rPr>
         <w:lastRenderedPageBreak/>
         <w:drawing>
-          <wp:inline distT="0" distB="0" distL="0" distR="0" wp14:anchorId="61ADA6DB" wp14:editId="56155998">
+          <wp:inline distT="0" distB="0" distL="0" distR="0" wp14:anchorId="6607F83B" wp14:editId="2FE67132">
             <wp:extent cx="5120640" cy="4627581"/>
             <wp:effectExtent l="19050" t="19050" r="22860" b="20955"/>
-            <wp:docPr id="499925638" name="Imagem 10"/>
+            <wp:docPr id="2069276417" name="Imagem 10"/>
             <wp:cNvGraphicFramePr/>
             <a:graphic xmlns:a="http://schemas.openxmlformats.org/drawingml/2006/main">
               <a:graphicData uri="http://schemas.openxmlformats.org/drawingml/2006/picture">
                 <pic:pic xmlns:pic="http://schemas.openxmlformats.org/drawingml/2006/picture">
                   <pic:nvPicPr>
-                    <pic:cNvPr id="499925638" name=""/>
+                    <pic:cNvPr id="2069276417" name=""/>
                     <pic:cNvPicPr/>
                   </pic:nvPicPr>
                   <pic:blipFill>
@@ -11573,7 +11599,7 @@
           <w:sz w:val="27"/>
         </w:rPr>
       </w:pPr>
-      <w:bookmarkStart w:id="22" w:name="_Toc240275447"/>
+      <w:bookmarkStart w:id="22" w:name="_Toc240276729"/>
       <w:r>
         <w:rPr>
           <w:rFonts w:ascii="Montserrat" w:hAnsi="Montserrat"/>
@@ -12639,16 +12665,16 @@
           <w:noProof/>
         </w:rPr>
         <w:drawing>
-          <wp:inline distT="0" distB="0" distL="0" distR="0" wp14:anchorId="2BAF624D" wp14:editId="3BB74F43">
+          <wp:inline distT="0" distB="0" distL="0" distR="0" wp14:anchorId="26BA409B" wp14:editId="224DAFBB">
             <wp:extent cx="5120640" cy="3338440"/>
             <wp:effectExtent l="19050" t="19050" r="22860" b="14605"/>
-            <wp:docPr id="1534108310" name="Imagem 11"/>
+            <wp:docPr id="611077745" name="Imagem 11"/>
             <wp:cNvGraphicFramePr/>
             <a:graphic xmlns:a="http://schemas.openxmlformats.org/drawingml/2006/main">
               <a:graphicData uri="http://schemas.openxmlformats.org/drawingml/2006/picture">
                 <pic:pic xmlns:pic="http://schemas.openxmlformats.org/drawingml/2006/picture">
                   <pic:nvPicPr>
-                    <pic:cNvPr id="1534108310" name=""/>
+                    <pic:cNvPr id="611077745" name=""/>
                     <pic:cNvPicPr/>
                   </pic:nvPicPr>
                   <pic:blipFill>
@@ -12716,16 +12742,16 @@
         </w:rPr>
         <w:lastRenderedPageBreak/>
         <w:drawing>
-          <wp:inline distT="0" distB="0" distL="0" distR="0" wp14:anchorId="5635F99A" wp14:editId="73F64567">
+          <wp:inline distT="0" distB="0" distL="0" distR="0" wp14:anchorId="1D976B00" wp14:editId="1828C9C5">
             <wp:extent cx="5120640" cy="4627581"/>
             <wp:effectExtent l="19050" t="19050" r="22860" b="20955"/>
-            <wp:docPr id="1862155335" name="Imagem 12"/>
+            <wp:docPr id="1320902086" name="Imagem 12"/>
             <wp:cNvGraphicFramePr/>
             <a:graphic xmlns:a="http://schemas.openxmlformats.org/drawingml/2006/main">
               <a:graphicData uri="http://schemas.openxmlformats.org/drawingml/2006/picture">
                 <pic:pic xmlns:pic="http://schemas.openxmlformats.org/drawingml/2006/picture">
                   <pic:nvPicPr>
-                    <pic:cNvPr id="1862155335" name=""/>
+                    <pic:cNvPr id="1320902086" name=""/>
                     <pic:cNvPicPr/>
                   </pic:nvPicPr>
                   <pic:blipFill>
@@ -12929,7 +12955,7 @@
           <w:sz w:val="27"/>
         </w:rPr>
       </w:pPr>
-      <w:bookmarkStart w:id="23" w:name="_Toc240275448"/>
+      <w:bookmarkStart w:id="23" w:name="_Toc240276730"/>
       <w:r>
         <w:rPr>
           <w:rFonts w:ascii="Montserrat" w:hAnsi="Montserrat"/>
@@ -13490,16 +13516,16 @@
           <w:noProof/>
         </w:rPr>
         <w:drawing>
-          <wp:inline distT="0" distB="0" distL="0" distR="0" wp14:anchorId="05260B1E" wp14:editId="40BE77BC">
+          <wp:inline distT="0" distB="0" distL="0" distR="0" wp14:anchorId="4396F78F" wp14:editId="223FAB6A">
             <wp:extent cx="5120640" cy="4627581"/>
             <wp:effectExtent l="19050" t="19050" r="22860" b="20955"/>
-            <wp:docPr id="1510387647" name="Imagem 13"/>
+            <wp:docPr id="560462022" name="Imagem 13"/>
             <wp:cNvGraphicFramePr/>
             <a:graphic xmlns:a="http://schemas.openxmlformats.org/drawingml/2006/main">
               <a:graphicData uri="http://schemas.openxmlformats.org/drawingml/2006/picture">
                 <pic:pic xmlns:pic="http://schemas.openxmlformats.org/drawingml/2006/picture">
                   <pic:nvPicPr>
-                    <pic:cNvPr id="1510387647" name=""/>
+                    <pic:cNvPr id="560462022" name=""/>
                     <pic:cNvPicPr/>
                   </pic:nvPicPr>
                   <pic:blipFill>
@@ -13567,16 +13593,16 @@
         </w:rPr>
         <w:lastRenderedPageBreak/>
         <w:drawing>
-          <wp:inline distT="0" distB="0" distL="0" distR="0" wp14:anchorId="685B0A45" wp14:editId="567CA7B8">
+          <wp:inline distT="0" distB="0" distL="0" distR="0" wp14:anchorId="42B837D7" wp14:editId="73CD43DE">
             <wp:extent cx="5120640" cy="4627581"/>
             <wp:effectExtent l="19050" t="19050" r="22860" b="20955"/>
-            <wp:docPr id="607867935" name="Imagem 14"/>
+            <wp:docPr id="1025243832" name="Imagem 14"/>
             <wp:cNvGraphicFramePr/>
             <a:graphic xmlns:a="http://schemas.openxmlformats.org/drawingml/2006/main">
               <a:graphicData uri="http://schemas.openxmlformats.org/drawingml/2006/picture">
                 <pic:pic xmlns:pic="http://schemas.openxmlformats.org/drawingml/2006/picture">
                   <pic:nvPicPr>
-                    <pic:cNvPr id="607867935" name=""/>
+                    <pic:cNvPr id="1025243832" name=""/>
                     <pic:cNvPicPr/>
                   </pic:nvPicPr>
                   <pic:blipFill>
@@ -13828,7 +13854,7 @@
           <w:sz w:val="27"/>
         </w:rPr>
       </w:pPr>
-      <w:bookmarkStart w:id="24" w:name="_Toc240275449"/>
+      <w:bookmarkStart w:id="24" w:name="_Toc240276731"/>
       <w:r>
         <w:rPr>
           <w:rFonts w:ascii="Montserrat" w:hAnsi="Montserrat"/>
@@ -13868,16 +13894,16 @@
           <w:noProof/>
         </w:rPr>
         <w:drawing>
-          <wp:inline distT="0" distB="0" distL="0" distR="0" wp14:anchorId="4B45EF89" wp14:editId="75D21869">
+          <wp:inline distT="0" distB="0" distL="0" distR="0" wp14:anchorId="5207AB49" wp14:editId="586A333E">
             <wp:extent cx="5120640" cy="4627581"/>
             <wp:effectExtent l="19050" t="19050" r="22860" b="20955"/>
-            <wp:docPr id="2061609950" name="Imagem 15"/>
+            <wp:docPr id="274729445" name="Imagem 15"/>
             <wp:cNvGraphicFramePr/>
             <a:graphic xmlns:a="http://schemas.openxmlformats.org/drawingml/2006/main">
               <a:graphicData uri="http://schemas.openxmlformats.org/drawingml/2006/picture">
                 <pic:pic xmlns:pic="http://schemas.openxmlformats.org/drawingml/2006/picture">
                   <pic:nvPicPr>
-                    <pic:cNvPr id="2061609950" name=""/>
+                    <pic:cNvPr id="274729445" name=""/>
                     <pic:cNvPicPr/>
                   </pic:nvPicPr>
                   <pic:blipFill>
@@ -13945,16 +13971,16 @@
         </w:rPr>
         <w:lastRenderedPageBreak/>
         <w:drawing>
-          <wp:inline distT="0" distB="0" distL="0" distR="0" wp14:anchorId="4517D9B5" wp14:editId="67048F8E">
+          <wp:inline distT="0" distB="0" distL="0" distR="0" wp14:anchorId="336C1EEB" wp14:editId="2AF96C11">
             <wp:extent cx="5120640" cy="4627581"/>
             <wp:effectExtent l="19050" t="19050" r="22860" b="20955"/>
-            <wp:docPr id="1271182538" name="Imagem 16"/>
+            <wp:docPr id="1174302781" name="Imagem 16"/>
             <wp:cNvGraphicFramePr/>
             <a:graphic xmlns:a="http://schemas.openxmlformats.org/drawingml/2006/main">
               <a:graphicData uri="http://schemas.openxmlformats.org/drawingml/2006/picture">
                 <pic:pic xmlns:pic="http://schemas.openxmlformats.org/drawingml/2006/picture">
                   <pic:nvPicPr>
-                    <pic:cNvPr id="1271182538" name=""/>
+                    <pic:cNvPr id="1174302781" name=""/>
                     <pic:cNvPicPr/>
                   </pic:nvPicPr>
                   <pic:blipFill>
@@ -14118,16 +14144,16 @@
         </w:rPr>
         <w:lastRenderedPageBreak/>
         <w:drawing>
-          <wp:inline distT="0" distB="0" distL="0" distR="0" wp14:anchorId="6A62B440" wp14:editId="46C9FB02">
+          <wp:inline distT="0" distB="0" distL="0" distR="0" wp14:anchorId="19C3AEC9" wp14:editId="03F40A42">
             <wp:extent cx="5120640" cy="3282818"/>
             <wp:effectExtent l="19050" t="19050" r="22860" b="13335"/>
-            <wp:docPr id="1524474721" name="Imagem 17"/>
+            <wp:docPr id="257225244" name="Imagem 17"/>
             <wp:cNvGraphicFramePr/>
             <a:graphic xmlns:a="http://schemas.openxmlformats.org/drawingml/2006/main">
               <a:graphicData uri="http://schemas.openxmlformats.org/drawingml/2006/picture">
                 <pic:pic xmlns:pic="http://schemas.openxmlformats.org/drawingml/2006/picture">
                   <pic:nvPicPr>
-                    <pic:cNvPr id="1524474721" name=""/>
+                    <pic:cNvPr id="257225244" name=""/>
                     <pic:cNvPicPr/>
                   </pic:nvPicPr>
                   <pic:blipFill>
@@ -14318,7 +14344,7 @@
           <w:sz w:val="27"/>
         </w:rPr>
       </w:pPr>
-      <w:bookmarkStart w:id="25" w:name="_Toc240275450"/>
+      <w:bookmarkStart w:id="25" w:name="_Toc240276732"/>
       <w:r>
         <w:rPr>
           <w:rFonts w:ascii="Montserrat" w:hAnsi="Montserrat"/>
@@ -14358,16 +14384,16 @@
           <w:noProof/>
         </w:rPr>
         <w:drawing>
-          <wp:inline distT="0" distB="0" distL="0" distR="0" wp14:anchorId="5BDACCBD" wp14:editId="68DC7C5D">
+          <wp:inline distT="0" distB="0" distL="0" distR="0" wp14:anchorId="0212664C" wp14:editId="3CDA67AA">
             <wp:extent cx="5120640" cy="4627581"/>
             <wp:effectExtent l="19050" t="19050" r="22860" b="20955"/>
-            <wp:docPr id="883269976" name="Imagem 18"/>
+            <wp:docPr id="864114339" name="Imagem 18"/>
             <wp:cNvGraphicFramePr/>
             <a:graphic xmlns:a="http://schemas.openxmlformats.org/drawingml/2006/main">
               <a:graphicData uri="http://schemas.openxmlformats.org/drawingml/2006/picture">
                 <pic:pic xmlns:pic="http://schemas.openxmlformats.org/drawingml/2006/picture">
                   <pic:nvPicPr>
-                    <pic:cNvPr id="883269976" name=""/>
+                    <pic:cNvPr id="864114339" name=""/>
                     <pic:cNvPicPr/>
                   </pic:nvPicPr>
                   <pic:blipFill>
@@ -14435,16 +14461,16 @@
         </w:rPr>
         <w:lastRenderedPageBreak/>
         <w:drawing>
-          <wp:inline distT="0" distB="0" distL="0" distR="0" wp14:anchorId="3FBEF9AB" wp14:editId="73475451">
+          <wp:inline distT="0" distB="0" distL="0" distR="0" wp14:anchorId="35119A21" wp14:editId="4E08A899">
             <wp:extent cx="5120640" cy="4627581"/>
             <wp:effectExtent l="19050" t="19050" r="22860" b="20955"/>
-            <wp:docPr id="1179078365" name="Imagem 19"/>
+            <wp:docPr id="1113808096" name="Imagem 19"/>
             <wp:cNvGraphicFramePr/>
             <a:graphic xmlns:a="http://schemas.openxmlformats.org/drawingml/2006/main">
               <a:graphicData uri="http://schemas.openxmlformats.org/drawingml/2006/picture">
                 <pic:pic xmlns:pic="http://schemas.openxmlformats.org/drawingml/2006/picture">
                   <pic:nvPicPr>
-                    <pic:cNvPr id="1179078365" name=""/>
+                    <pic:cNvPr id="1113808096" name=""/>
                     <pic:cNvPicPr/>
                   </pic:nvPicPr>
                   <pic:blipFill>
@@ -14627,7 +14653,7 @@
           <w:sz w:val="27"/>
         </w:rPr>
       </w:pPr>
-      <w:bookmarkStart w:id="26" w:name="_Toc240275451"/>
+      <w:bookmarkStart w:id="26" w:name="_Toc240276733"/>
       <w:r>
         <w:rPr>
           <w:rFonts w:ascii="Montserrat" w:hAnsi="Montserrat"/>
@@ -14667,16 +14693,16 @@
           <w:noProof/>
         </w:rPr>
         <w:drawing>
-          <wp:inline distT="0" distB="0" distL="0" distR="0" wp14:anchorId="136D1C22" wp14:editId="306C4F8C">
+          <wp:inline distT="0" distB="0" distL="0" distR="0" wp14:anchorId="59458903" wp14:editId="204CB7C6">
             <wp:extent cx="5120640" cy="4627581"/>
             <wp:effectExtent l="19050" t="19050" r="22860" b="20955"/>
-            <wp:docPr id="553406053" name="Imagem 20"/>
+            <wp:docPr id="594904499" name="Imagem 20"/>
             <wp:cNvGraphicFramePr/>
             <a:graphic xmlns:a="http://schemas.openxmlformats.org/drawingml/2006/main">
               <a:graphicData uri="http://schemas.openxmlformats.org/drawingml/2006/picture">
                 <pic:pic xmlns:pic="http://schemas.openxmlformats.org/drawingml/2006/picture">
                   <pic:nvPicPr>
-                    <pic:cNvPr id="553406053" name=""/>
+                    <pic:cNvPr id="594904499" name=""/>
                     <pic:cNvPicPr/>
                   </pic:nvPicPr>
                   <pic:blipFill>
@@ -14744,16 +14770,16 @@
         </w:rPr>
         <w:lastRenderedPageBreak/>
         <w:drawing>
-          <wp:inline distT="0" distB="0" distL="0" distR="0" wp14:anchorId="6389718B" wp14:editId="4776062C">
+          <wp:inline distT="0" distB="0" distL="0" distR="0" wp14:anchorId="0E8811CC" wp14:editId="67EA263D">
             <wp:extent cx="5120640" cy="4627581"/>
             <wp:effectExtent l="19050" t="19050" r="22860" b="20955"/>
-            <wp:docPr id="1359582470" name="Imagem 21"/>
+            <wp:docPr id="1980619442" name="Imagem 21"/>
             <wp:cNvGraphicFramePr/>
             <a:graphic xmlns:a="http://schemas.openxmlformats.org/drawingml/2006/main">
               <a:graphicData uri="http://schemas.openxmlformats.org/drawingml/2006/picture">
                 <pic:pic xmlns:pic="http://schemas.openxmlformats.org/drawingml/2006/picture">
                   <pic:nvPicPr>
-                    <pic:cNvPr id="1359582470" name=""/>
+                    <pic:cNvPr id="1980619442" name=""/>
                     <pic:cNvPicPr/>
                   </pic:nvPicPr>
                   <pic:blipFill>
@@ -14959,16 +14985,16 @@
           <w:noProof/>
         </w:rPr>
         <w:drawing>
-          <wp:inline distT="0" distB="0" distL="0" distR="0" wp14:anchorId="459EF739" wp14:editId="76D3167A">
+          <wp:inline distT="0" distB="0" distL="0" distR="0" wp14:anchorId="454AA833" wp14:editId="0302EDBD">
             <wp:extent cx="5120640" cy="1757287"/>
             <wp:effectExtent l="19050" t="19050" r="22860" b="14605"/>
-            <wp:docPr id="2057466218" name="Imagem 22"/>
+            <wp:docPr id="1267536859" name="Imagem 22"/>
             <wp:cNvGraphicFramePr/>
             <a:graphic xmlns:a="http://schemas.openxmlformats.org/drawingml/2006/main">
               <a:graphicData uri="http://schemas.openxmlformats.org/drawingml/2006/picture">
                 <pic:pic xmlns:pic="http://schemas.openxmlformats.org/drawingml/2006/picture">
                   <pic:nvPicPr>
-                    <pic:cNvPr id="2057466218" name=""/>
+                    <pic:cNvPr id="1267536859" name=""/>
                     <pic:cNvPicPr/>
                   </pic:nvPicPr>
                   <pic:blipFill>
@@ -15081,7 +15107,7 @@
           <w:sz w:val="27"/>
         </w:rPr>
       </w:pPr>
-      <w:bookmarkStart w:id="27" w:name="_Toc240275452"/>
+      <w:bookmarkStart w:id="27" w:name="_Toc240276734"/>
       <w:r>
         <w:rPr>
           <w:rFonts w:ascii="Montserrat" w:hAnsi="Montserrat"/>
@@ -15122,16 +15148,16 @@
         </w:rPr>
         <w:lastRenderedPageBreak/>
         <w:drawing>
-          <wp:inline distT="0" distB="0" distL="0" distR="0" wp14:anchorId="6B66FD4F" wp14:editId="17CE1B0B">
+          <wp:inline distT="0" distB="0" distL="0" distR="0" wp14:anchorId="0F34BD6F" wp14:editId="19A44163">
             <wp:extent cx="5120640" cy="4627581"/>
             <wp:effectExtent l="19050" t="19050" r="22860" b="20955"/>
-            <wp:docPr id="1114238631" name="Imagem 23"/>
+            <wp:docPr id="1807829882" name="Imagem 23"/>
             <wp:cNvGraphicFramePr/>
             <a:graphic xmlns:a="http://schemas.openxmlformats.org/drawingml/2006/main">
               <a:graphicData uri="http://schemas.openxmlformats.org/drawingml/2006/picture">
                 <pic:pic xmlns:pic="http://schemas.openxmlformats.org/drawingml/2006/picture">
                   <pic:nvPicPr>
-                    <pic:cNvPr id="1114238631" name=""/>
+                    <pic:cNvPr id="1807829882" name=""/>
                     <pic:cNvPicPr/>
                   </pic:nvPicPr>
                   <pic:blipFill>
@@ -15199,16 +15225,16 @@
         </w:rPr>
         <w:lastRenderedPageBreak/>
         <w:drawing>
-          <wp:inline distT="0" distB="0" distL="0" distR="0" wp14:anchorId="023E2EF6" wp14:editId="438D70F3">
+          <wp:inline distT="0" distB="0" distL="0" distR="0" wp14:anchorId="403F2343" wp14:editId="54A94CE7">
             <wp:extent cx="5120640" cy="4627581"/>
             <wp:effectExtent l="19050" t="19050" r="22860" b="20955"/>
-            <wp:docPr id="736778441" name="Imagem 24"/>
+            <wp:docPr id="1672042865" name="Imagem 24"/>
             <wp:cNvGraphicFramePr/>
             <a:graphic xmlns:a="http://schemas.openxmlformats.org/drawingml/2006/main">
               <a:graphicData uri="http://schemas.openxmlformats.org/drawingml/2006/picture">
                 <pic:pic xmlns:pic="http://schemas.openxmlformats.org/drawingml/2006/picture">
                   <pic:nvPicPr>
-                    <pic:cNvPr id="736778441" name=""/>
+                    <pic:cNvPr id="1672042865" name=""/>
                     <pic:cNvPicPr/>
                   </pic:nvPicPr>
                   <pic:blipFill>
@@ -15445,7 +15471,7 @@
           <w:sz w:val="27"/>
         </w:rPr>
       </w:pPr>
-      <w:bookmarkStart w:id="28" w:name="_Toc240275453"/>
+      <w:bookmarkStart w:id="28" w:name="_Toc240276735"/>
       <w:r>
         <w:rPr>
           <w:rFonts w:ascii="Montserrat" w:hAnsi="Montserrat"/>
@@ -15485,16 +15511,16 @@
           <w:noProof/>
         </w:rPr>
         <w:drawing>
-          <wp:inline distT="0" distB="0" distL="0" distR="0" wp14:anchorId="2C2F63F5" wp14:editId="452A3EDD">
+          <wp:inline distT="0" distB="0" distL="0" distR="0" wp14:anchorId="78608A9E" wp14:editId="53EE9C6F">
             <wp:extent cx="5120640" cy="4627581"/>
             <wp:effectExtent l="19050" t="19050" r="22860" b="20955"/>
-            <wp:docPr id="1357433894" name="Imagem 25"/>
+            <wp:docPr id="1316326119" name="Imagem 25"/>
             <wp:cNvGraphicFramePr/>
             <a:graphic xmlns:a="http://schemas.openxmlformats.org/drawingml/2006/main">
               <a:graphicData uri="http://schemas.openxmlformats.org/drawingml/2006/picture">
                 <pic:pic xmlns:pic="http://schemas.openxmlformats.org/drawingml/2006/picture">
                   <pic:nvPicPr>
-                    <pic:cNvPr id="1357433894" name=""/>
+                    <pic:cNvPr id="1316326119" name=""/>
                     <pic:cNvPicPr/>
                   </pic:nvPicPr>
                   <pic:blipFill>
@@ -15562,16 +15588,16 @@
         </w:rPr>
         <w:lastRenderedPageBreak/>
         <w:drawing>
-          <wp:inline distT="0" distB="0" distL="0" distR="0" wp14:anchorId="29DCA5FB" wp14:editId="4636DA68">
+          <wp:inline distT="0" distB="0" distL="0" distR="0" wp14:anchorId="266768B5" wp14:editId="1AFEE6BB">
             <wp:extent cx="5120640" cy="4627581"/>
             <wp:effectExtent l="19050" t="19050" r="22860" b="20955"/>
-            <wp:docPr id="1426194965" name="Imagem 26"/>
+            <wp:docPr id="957654351" name="Imagem 26"/>
             <wp:cNvGraphicFramePr/>
             <a:graphic xmlns:a="http://schemas.openxmlformats.org/drawingml/2006/main">
               <a:graphicData uri="http://schemas.openxmlformats.org/drawingml/2006/picture">
                 <pic:pic xmlns:pic="http://schemas.openxmlformats.org/drawingml/2006/picture">
                   <pic:nvPicPr>
-                    <pic:cNvPr id="1426194965" name=""/>
+                    <pic:cNvPr id="957654351" name=""/>
                     <pic:cNvPicPr/>
                   </pic:nvPicPr>
                   <pic:blipFill>
@@ -15762,7 +15788,7 @@
           <w:sz w:val="27"/>
         </w:rPr>
       </w:pPr>
-      <w:bookmarkStart w:id="29" w:name="_Toc240275454"/>
+      <w:bookmarkStart w:id="29" w:name="_Toc240276736"/>
       <w:r>
         <w:rPr>
           <w:rFonts w:ascii="Montserrat" w:hAnsi="Montserrat"/>
@@ -15802,16 +15828,16 @@
           <w:noProof/>
         </w:rPr>
         <w:drawing>
-          <wp:inline distT="0" distB="0" distL="0" distR="0" wp14:anchorId="18300800" wp14:editId="339B7C27">
+          <wp:inline distT="0" distB="0" distL="0" distR="0" wp14:anchorId="2F13E4F1" wp14:editId="174B8A64">
             <wp:extent cx="5120640" cy="4000682"/>
             <wp:effectExtent l="19050" t="19050" r="22860" b="19050"/>
-            <wp:docPr id="444219429" name="Imagem 27"/>
+            <wp:docPr id="529421586" name="Imagem 27"/>
             <wp:cNvGraphicFramePr/>
             <a:graphic xmlns:a="http://schemas.openxmlformats.org/drawingml/2006/main">
               <a:graphicData uri="http://schemas.openxmlformats.org/drawingml/2006/picture">
                 <pic:pic xmlns:pic="http://schemas.openxmlformats.org/drawingml/2006/picture">
                   <pic:nvPicPr>
-                    <pic:cNvPr id="444219429" name=""/>
+                    <pic:cNvPr id="529421586" name=""/>
                     <pic:cNvPicPr/>
                   </pic:nvPicPr>
                   <pic:blipFill>
@@ -16335,7 +16361,7 @@
           <w:sz w:val="34"/>
         </w:rPr>
       </w:pPr>
-      <w:bookmarkStart w:id="30" w:name="_Toc240275455"/>
+      <w:bookmarkStart w:id="30" w:name="_Toc240276737"/>
       <w:r>
         <w:rPr>
           <w:rFonts w:ascii="Montserrat" w:hAnsi="Montserrat"/>
@@ -16377,7 +16403,7 @@
           <w:sz w:val="27"/>
         </w:rPr>
       </w:pPr>
-      <w:bookmarkStart w:id="31" w:name="_Toc240275456"/>
+      <w:bookmarkStart w:id="31" w:name="_Toc240276738"/>
       <w:r>
         <w:rPr>
           <w:rFonts w:ascii="Montserrat" w:hAnsi="Montserrat"/>
@@ -16417,16 +16443,16 @@
           <w:noProof/>
         </w:rPr>
         <w:drawing>
-          <wp:inline distT="0" distB="0" distL="0" distR="0" wp14:anchorId="1A33C6E2" wp14:editId="6F8E78BD">
+          <wp:inline distT="0" distB="0" distL="0" distR="0" wp14:anchorId="6BAEEC43" wp14:editId="7BDEE0D0">
             <wp:extent cx="5120640" cy="4627581"/>
             <wp:effectExtent l="19050" t="19050" r="22860" b="20955"/>
-            <wp:docPr id="2021264087" name="Imagem 28"/>
+            <wp:docPr id="1137471906" name="Imagem 28"/>
             <wp:cNvGraphicFramePr/>
             <a:graphic xmlns:a="http://schemas.openxmlformats.org/drawingml/2006/main">
               <a:graphicData uri="http://schemas.openxmlformats.org/drawingml/2006/picture">
                 <pic:pic xmlns:pic="http://schemas.openxmlformats.org/drawingml/2006/picture">
                   <pic:nvPicPr>
-                    <pic:cNvPr id="2021264087" name=""/>
+                    <pic:cNvPr id="1137471906" name=""/>
                     <pic:cNvPicPr/>
                   </pic:nvPicPr>
                   <pic:blipFill>
@@ -16494,16 +16520,16 @@
         </w:rPr>
         <w:lastRenderedPageBreak/>
         <w:drawing>
-          <wp:inline distT="0" distB="0" distL="0" distR="0" wp14:anchorId="6982B3E9" wp14:editId="36BDC196">
+          <wp:inline distT="0" distB="0" distL="0" distR="0" wp14:anchorId="2139E589" wp14:editId="5E855123">
             <wp:extent cx="5120640" cy="4627581"/>
             <wp:effectExtent l="19050" t="19050" r="22860" b="20955"/>
-            <wp:docPr id="1705274251" name="Imagem 29"/>
+            <wp:docPr id="985396927" name="Imagem 29"/>
             <wp:cNvGraphicFramePr/>
             <a:graphic xmlns:a="http://schemas.openxmlformats.org/drawingml/2006/main">
               <a:graphicData uri="http://schemas.openxmlformats.org/drawingml/2006/picture">
                 <pic:pic xmlns:pic="http://schemas.openxmlformats.org/drawingml/2006/picture">
                   <pic:nvPicPr>
-                    <pic:cNvPr id="1705274251" name=""/>
+                    <pic:cNvPr id="985396927" name=""/>
                     <pic:cNvPicPr/>
                   </pic:nvPicPr>
                   <pic:blipFill>
@@ -16571,16 +16597,16 @@
         </w:rPr>
         <w:lastRenderedPageBreak/>
         <w:drawing>
-          <wp:inline distT="0" distB="0" distL="0" distR="0" wp14:anchorId="121D2C62" wp14:editId="282BEDB7">
+          <wp:inline distT="0" distB="0" distL="0" distR="0" wp14:anchorId="15A2F36E" wp14:editId="0DE8E9E0">
             <wp:extent cx="5120640" cy="4627581"/>
             <wp:effectExtent l="19050" t="19050" r="22860" b="20955"/>
-            <wp:docPr id="374789312" name="Imagem 30"/>
+            <wp:docPr id="97604531" name="Imagem 30"/>
             <wp:cNvGraphicFramePr/>
             <a:graphic xmlns:a="http://schemas.openxmlformats.org/drawingml/2006/main">
               <a:graphicData uri="http://schemas.openxmlformats.org/drawingml/2006/picture">
                 <pic:pic xmlns:pic="http://schemas.openxmlformats.org/drawingml/2006/picture">
                   <pic:nvPicPr>
-                    <pic:cNvPr id="374789312" name=""/>
+                    <pic:cNvPr id="97604531" name=""/>
                     <pic:cNvPicPr/>
                   </pic:nvPicPr>
                   <pic:blipFill>
@@ -16782,16 +16808,16 @@
           <w:noProof/>
         </w:rPr>
         <w:drawing>
-          <wp:inline distT="0" distB="0" distL="0" distR="0" wp14:anchorId="059CCED1" wp14:editId="636F3FAB">
+          <wp:inline distT="0" distB="0" distL="0" distR="0" wp14:anchorId="3C0021B3" wp14:editId="35B604D7">
             <wp:extent cx="5120640" cy="1715571"/>
             <wp:effectExtent l="19050" t="19050" r="22860" b="18415"/>
-            <wp:docPr id="478676267" name="Imagem 31"/>
+            <wp:docPr id="125498442" name="Imagem 31"/>
             <wp:cNvGraphicFramePr/>
             <a:graphic xmlns:a="http://schemas.openxmlformats.org/drawingml/2006/main">
               <a:graphicData uri="http://schemas.openxmlformats.org/drawingml/2006/picture">
                 <pic:pic xmlns:pic="http://schemas.openxmlformats.org/drawingml/2006/picture">
                   <pic:nvPicPr>
-                    <pic:cNvPr id="478676267" name=""/>
+                    <pic:cNvPr id="125498442" name=""/>
                     <pic:cNvPicPr/>
                   </pic:nvPicPr>
                   <pic:blipFill>
@@ -16928,16 +16954,16 @@
           <w:noProof/>
         </w:rPr>
         <w:drawing>
-          <wp:inline distT="0" distB="0" distL="0" distR="0" wp14:anchorId="4B3B8E3E" wp14:editId="336750E1">
+          <wp:inline distT="0" distB="0" distL="0" distR="0" wp14:anchorId="3CE2E46C" wp14:editId="7A602BD7">
             <wp:extent cx="5120640" cy="3282818"/>
             <wp:effectExtent l="19050" t="19050" r="22860" b="13335"/>
-            <wp:docPr id="849753028" name="Imagem 32"/>
+            <wp:docPr id="655151944" name="Imagem 32"/>
             <wp:cNvGraphicFramePr/>
             <a:graphic xmlns:a="http://schemas.openxmlformats.org/drawingml/2006/main">
               <a:graphicData uri="http://schemas.openxmlformats.org/drawingml/2006/picture">
                 <pic:pic xmlns:pic="http://schemas.openxmlformats.org/drawingml/2006/picture">
                   <pic:nvPicPr>
-                    <pic:cNvPr id="849753028" name=""/>
+                    <pic:cNvPr id="655151944" name=""/>
                     <pic:cNvPicPr/>
                   </pic:nvPicPr>
                   <pic:blipFill>
@@ -17071,16 +17097,16 @@
           <w:noProof/>
         </w:rPr>
         <w:drawing>
-          <wp:inline distT="0" distB="0" distL="0" distR="0" wp14:anchorId="1F56D8D8" wp14:editId="5BCF4488">
+          <wp:inline distT="0" distB="0" distL="0" distR="0" wp14:anchorId="76695414" wp14:editId="61EF7739">
             <wp:extent cx="5120640" cy="951357"/>
             <wp:effectExtent l="19050" t="19050" r="22860" b="20320"/>
-            <wp:docPr id="1469159744" name="Imagem 33"/>
+            <wp:docPr id="1298191697" name="Imagem 33"/>
             <wp:cNvGraphicFramePr/>
             <a:graphic xmlns:a="http://schemas.openxmlformats.org/drawingml/2006/main">
               <a:graphicData uri="http://schemas.openxmlformats.org/drawingml/2006/picture">
                 <pic:pic xmlns:pic="http://schemas.openxmlformats.org/drawingml/2006/picture">
                   <pic:nvPicPr>
-                    <pic:cNvPr id="1469159744" name=""/>
+                    <pic:cNvPr id="1298191697" name=""/>
                     <pic:cNvPicPr/>
                   </pic:nvPicPr>
                   <pic:blipFill>
@@ -17192,16 +17218,16 @@
           <w:noProof/>
         </w:rPr>
         <w:drawing>
-          <wp:inline distT="0" distB="0" distL="0" distR="0" wp14:anchorId="1DD18676" wp14:editId="27BFBD0A">
+          <wp:inline distT="0" distB="0" distL="0" distR="0" wp14:anchorId="545F3A28" wp14:editId="317DC31E">
             <wp:extent cx="5120640" cy="1515102"/>
             <wp:effectExtent l="19050" t="19050" r="22860" b="28575"/>
-            <wp:docPr id="799237127" name="Imagem 34"/>
+            <wp:docPr id="432099923" name="Imagem 34"/>
             <wp:cNvGraphicFramePr/>
             <a:graphic xmlns:a="http://schemas.openxmlformats.org/drawingml/2006/main">
               <a:graphicData uri="http://schemas.openxmlformats.org/drawingml/2006/picture">
                 <pic:pic xmlns:pic="http://schemas.openxmlformats.org/drawingml/2006/picture">
                   <pic:nvPicPr>
-                    <pic:cNvPr id="799237127" name=""/>
+                    <pic:cNvPr id="432099923" name=""/>
                     <pic:cNvPicPr/>
                   </pic:nvPicPr>
                   <pic:blipFill>
@@ -17314,16 +17340,16 @@
           <w:noProof/>
         </w:rPr>
         <w:drawing>
-          <wp:inline distT="0" distB="0" distL="0" distR="0" wp14:anchorId="40BFDF1A" wp14:editId="592F5D0C">
+          <wp:inline distT="0" distB="0" distL="0" distR="0" wp14:anchorId="4354E4AB" wp14:editId="539AC53D">
             <wp:extent cx="5120640" cy="1391113"/>
             <wp:effectExtent l="19050" t="19050" r="22860" b="19050"/>
-            <wp:docPr id="1650777336" name="Imagem 35"/>
+            <wp:docPr id="1797352224" name="Imagem 35"/>
             <wp:cNvGraphicFramePr/>
             <a:graphic xmlns:a="http://schemas.openxmlformats.org/drawingml/2006/main">
               <a:graphicData uri="http://schemas.openxmlformats.org/drawingml/2006/picture">
                 <pic:pic xmlns:pic="http://schemas.openxmlformats.org/drawingml/2006/picture">
                   <pic:nvPicPr>
-                    <pic:cNvPr id="1650777336" name=""/>
+                    <pic:cNvPr id="1797352224" name=""/>
                     <pic:cNvPicPr/>
                   </pic:nvPicPr>
                   <pic:blipFill>
@@ -17435,16 +17461,16 @@
           <w:noProof/>
         </w:rPr>
         <w:drawing>
-          <wp:inline distT="0" distB="0" distL="0" distR="0" wp14:anchorId="66689284" wp14:editId="018FD679">
+          <wp:inline distT="0" distB="0" distL="0" distR="0" wp14:anchorId="5761D2C3" wp14:editId="2E6EBC0A">
             <wp:extent cx="5120640" cy="1125174"/>
             <wp:effectExtent l="19050" t="19050" r="22860" b="18415"/>
-            <wp:docPr id="1806261792" name="Imagem 36"/>
+            <wp:docPr id="1590816501" name="Imagem 36"/>
             <wp:cNvGraphicFramePr/>
             <a:graphic xmlns:a="http://schemas.openxmlformats.org/drawingml/2006/main">
               <a:graphicData uri="http://schemas.openxmlformats.org/drawingml/2006/picture">
                 <pic:pic xmlns:pic="http://schemas.openxmlformats.org/drawingml/2006/picture">
                   <pic:nvPicPr>
-                    <pic:cNvPr id="1806261792" name=""/>
+                    <pic:cNvPr id="1590816501" name=""/>
                     <pic:cNvPicPr/>
                   </pic:nvPicPr>
                   <pic:blipFill>
@@ -17534,7 +17560,7 @@
           <w:sz w:val="27"/>
         </w:rPr>
       </w:pPr>
-      <w:bookmarkStart w:id="32" w:name="_Toc240275457"/>
+      <w:bookmarkStart w:id="32" w:name="_Toc240276739"/>
       <w:r>
         <w:rPr>
           <w:rFonts w:ascii="Montserrat" w:hAnsi="Montserrat"/>
@@ -17574,16 +17600,16 @@
           <w:noProof/>
         </w:rPr>
         <w:drawing>
-          <wp:inline distT="0" distB="0" distL="0" distR="0" wp14:anchorId="43E39686" wp14:editId="7FBA2012">
+          <wp:inline distT="0" distB="0" distL="0" distR="0" wp14:anchorId="06A78DEF" wp14:editId="2F59AA04">
             <wp:extent cx="5120640" cy="4627581"/>
             <wp:effectExtent l="19050" t="19050" r="22860" b="20955"/>
-            <wp:docPr id="763673534" name="Imagem 37"/>
+            <wp:docPr id="1125713913" name="Imagem 37"/>
             <wp:cNvGraphicFramePr/>
             <a:graphic xmlns:a="http://schemas.openxmlformats.org/drawingml/2006/main">
               <a:graphicData uri="http://schemas.openxmlformats.org/drawingml/2006/picture">
                 <pic:pic xmlns:pic="http://schemas.openxmlformats.org/drawingml/2006/picture">
                   <pic:nvPicPr>
-                    <pic:cNvPr id="763673534" name=""/>
+                    <pic:cNvPr id="1125713913" name=""/>
                     <pic:cNvPicPr/>
                   </pic:nvPicPr>
                   <pic:blipFill>
@@ -17651,16 +17677,16 @@
         </w:rPr>
         <w:lastRenderedPageBreak/>
         <w:drawing>
-          <wp:inline distT="0" distB="0" distL="0" distR="0" wp14:anchorId="4C4C3B9D" wp14:editId="5B14054A">
+          <wp:inline distT="0" distB="0" distL="0" distR="0" wp14:anchorId="72D64610" wp14:editId="3D44ABA2">
             <wp:extent cx="5120640" cy="4627581"/>
             <wp:effectExtent l="19050" t="19050" r="22860" b="20955"/>
-            <wp:docPr id="721017978" name="Imagem 38"/>
+            <wp:docPr id="809764846" name="Imagem 38"/>
             <wp:cNvGraphicFramePr/>
             <a:graphic xmlns:a="http://schemas.openxmlformats.org/drawingml/2006/main">
               <a:graphicData uri="http://schemas.openxmlformats.org/drawingml/2006/picture">
                 <pic:pic xmlns:pic="http://schemas.openxmlformats.org/drawingml/2006/picture">
                   <pic:nvPicPr>
-                    <pic:cNvPr id="721017978" name=""/>
+                    <pic:cNvPr id="809764846" name=""/>
                     <pic:cNvPicPr/>
                   </pic:nvPicPr>
                   <pic:blipFill>
@@ -17829,16 +17855,16 @@
           <w:noProof/>
         </w:rPr>
         <w:drawing>
-          <wp:inline distT="0" distB="0" distL="0" distR="0" wp14:anchorId="691C95E6" wp14:editId="04A9BF0F">
+          <wp:inline distT="0" distB="0" distL="0" distR="0" wp14:anchorId="2E7F1C9A" wp14:editId="40AD41DF">
             <wp:extent cx="5120640" cy="2144319"/>
             <wp:effectExtent l="19050" t="19050" r="22860" b="27940"/>
-            <wp:docPr id="1694611548" name="Imagem 39"/>
+            <wp:docPr id="1721764758" name="Imagem 39"/>
             <wp:cNvGraphicFramePr/>
             <a:graphic xmlns:a="http://schemas.openxmlformats.org/drawingml/2006/main">
               <a:graphicData uri="http://schemas.openxmlformats.org/drawingml/2006/picture">
                 <pic:pic xmlns:pic="http://schemas.openxmlformats.org/drawingml/2006/picture">
                   <pic:nvPicPr>
-                    <pic:cNvPr id="1694611548" name=""/>
+                    <pic:cNvPr id="1721764758" name=""/>
                     <pic:cNvPicPr/>
                   </pic:nvPicPr>
                   <pic:blipFill>
@@ -17926,16 +17952,16 @@
           <w:noProof/>
         </w:rPr>
         <w:drawing>
-          <wp:inline distT="0" distB="0" distL="0" distR="0" wp14:anchorId="5DD6D9A2" wp14:editId="6BE81DAB">
+          <wp:inline distT="0" distB="0" distL="0" distR="0" wp14:anchorId="53E290B8" wp14:editId="5D20B458">
             <wp:extent cx="5120640" cy="1055647"/>
             <wp:effectExtent l="19050" t="19050" r="22860" b="11430"/>
-            <wp:docPr id="590843359" name="Imagem 40"/>
+            <wp:docPr id="745841791" name="Imagem 40"/>
             <wp:cNvGraphicFramePr/>
             <a:graphic xmlns:a="http://schemas.openxmlformats.org/drawingml/2006/main">
               <a:graphicData uri="http://schemas.openxmlformats.org/drawingml/2006/picture">
                 <pic:pic xmlns:pic="http://schemas.openxmlformats.org/drawingml/2006/picture">
                   <pic:nvPicPr>
-                    <pic:cNvPr id="590843359" name=""/>
+                    <pic:cNvPr id="745841791" name=""/>
                     <pic:cNvPicPr/>
                   </pic:nvPicPr>
                   <pic:blipFill>
@@ -18057,16 +18083,16 @@
           <w:noProof/>
         </w:rPr>
         <w:drawing>
-          <wp:inline distT="0" distB="0" distL="0" distR="0" wp14:anchorId="20F49807" wp14:editId="2F916E8A">
+          <wp:inline distT="0" distB="0" distL="0" distR="0" wp14:anchorId="4FDD2D0C" wp14:editId="2DE6E508">
             <wp:extent cx="5120640" cy="3282818"/>
             <wp:effectExtent l="19050" t="19050" r="22860" b="13335"/>
-            <wp:docPr id="755788070" name="Imagem 41"/>
+            <wp:docPr id="933288124" name="Imagem 41"/>
             <wp:cNvGraphicFramePr/>
             <a:graphic xmlns:a="http://schemas.openxmlformats.org/drawingml/2006/main">
               <a:graphicData uri="http://schemas.openxmlformats.org/drawingml/2006/picture">
                 <pic:pic xmlns:pic="http://schemas.openxmlformats.org/drawingml/2006/picture">
                   <pic:nvPicPr>
-                    <pic:cNvPr id="755788070" name=""/>
+                    <pic:cNvPr id="933288124" name=""/>
                     <pic:cNvPicPr/>
                   </pic:nvPicPr>
                   <pic:blipFill>
@@ -18200,16 +18226,16 @@
         </w:rPr>
         <w:lastRenderedPageBreak/>
         <w:drawing>
-          <wp:inline distT="0" distB="0" distL="0" distR="0" wp14:anchorId="77ECD8DB" wp14:editId="49DE9163">
+          <wp:inline distT="0" distB="0" distL="0" distR="0" wp14:anchorId="66BC38C3" wp14:editId="4B3E8CED">
             <wp:extent cx="5120640" cy="1978034"/>
             <wp:effectExtent l="19050" t="19050" r="22860" b="22225"/>
-            <wp:docPr id="1694494694" name="Imagem 42"/>
+            <wp:docPr id="279666101" name="Imagem 42"/>
             <wp:cNvGraphicFramePr/>
             <a:graphic xmlns:a="http://schemas.openxmlformats.org/drawingml/2006/main">
               <a:graphicData uri="http://schemas.openxmlformats.org/drawingml/2006/picture">
                 <pic:pic xmlns:pic="http://schemas.openxmlformats.org/drawingml/2006/picture">
                   <pic:nvPicPr>
-                    <pic:cNvPr id="1694494694" name=""/>
+                    <pic:cNvPr id="279666101" name=""/>
                     <pic:cNvPicPr/>
                   </pic:nvPicPr>
                   <pic:blipFill>
@@ -18281,7 +18307,7 @@
           <w:sz w:val="34"/>
         </w:rPr>
       </w:pPr>
-      <w:bookmarkStart w:id="33" w:name="_Toc240275458"/>
+      <w:bookmarkStart w:id="33" w:name="_Toc240276740"/>
       <w:r>
         <w:rPr>
           <w:rFonts w:ascii="Montserrat" w:hAnsi="Montserrat"/>
@@ -18341,7 +18367,7 @@
           <w:sz w:val="27"/>
         </w:rPr>
       </w:pPr>
-      <w:bookmarkStart w:id="34" w:name="_Toc240275459"/>
+      <w:bookmarkStart w:id="34" w:name="_Toc240276741"/>
       <w:r>
         <w:rPr>
           <w:rFonts w:ascii="Montserrat" w:hAnsi="Montserrat"/>
@@ -18381,16 +18407,16 @@
           <w:noProof/>
         </w:rPr>
         <w:drawing>
-          <wp:inline distT="0" distB="0" distL="0" distR="0" wp14:anchorId="020FCD0D" wp14:editId="109CF082">
+          <wp:inline distT="0" distB="0" distL="0" distR="0" wp14:anchorId="5AA69728" wp14:editId="5A1AA1F1">
             <wp:extent cx="5303520" cy="4792851"/>
             <wp:effectExtent l="19050" t="19050" r="11430" b="27305"/>
-            <wp:docPr id="304763050" name="Imagem 43"/>
+            <wp:docPr id="312166570" name="Imagem 43"/>
             <wp:cNvGraphicFramePr/>
             <a:graphic xmlns:a="http://schemas.openxmlformats.org/drawingml/2006/main">
               <a:graphicData uri="http://schemas.openxmlformats.org/drawingml/2006/picture">
                 <pic:pic xmlns:pic="http://schemas.openxmlformats.org/drawingml/2006/picture">
                   <pic:nvPicPr>
-                    <pic:cNvPr id="304763050" name=""/>
+                    <pic:cNvPr id="312166570" name=""/>
                     <pic:cNvPicPr/>
                   </pic:nvPicPr>
                   <pic:blipFill>
@@ -18459,7 +18485,7 @@
           <w:sz w:val="27"/>
         </w:rPr>
       </w:pPr>
-      <w:bookmarkStart w:id="35" w:name="_Toc240275460"/>
+      <w:bookmarkStart w:id="35" w:name="_Toc240276742"/>
       <w:r>
         <w:rPr>
           <w:rFonts w:ascii="Montserrat" w:hAnsi="Montserrat"/>
@@ -18499,16 +18525,16 @@
           <w:noProof/>
         </w:rPr>
         <w:drawing>
-          <wp:inline distT="0" distB="0" distL="0" distR="0" wp14:anchorId="1ADB0E54" wp14:editId="1AAC7F2C">
+          <wp:inline distT="0" distB="0" distL="0" distR="0" wp14:anchorId="0BBAC2C3" wp14:editId="01197315">
             <wp:extent cx="5303520" cy="4792851"/>
             <wp:effectExtent l="19050" t="19050" r="11430" b="27305"/>
-            <wp:docPr id="302334463" name="Imagem 44"/>
+            <wp:docPr id="46211123" name="Imagem 44"/>
             <wp:cNvGraphicFramePr/>
             <a:graphic xmlns:a="http://schemas.openxmlformats.org/drawingml/2006/main">
               <a:graphicData uri="http://schemas.openxmlformats.org/drawingml/2006/picture">
                 <pic:pic xmlns:pic="http://schemas.openxmlformats.org/drawingml/2006/picture">
                   <pic:nvPicPr>
-                    <pic:cNvPr id="302334463" name=""/>
+                    <pic:cNvPr id="46211123" name=""/>
                     <pic:cNvPicPr/>
                   </pic:nvPicPr>
                   <pic:blipFill>
@@ -18576,7 +18602,7 @@
           <w:sz w:val="27"/>
         </w:rPr>
       </w:pPr>
-      <w:bookmarkStart w:id="36" w:name="_Toc240275461"/>
+      <w:bookmarkStart w:id="36" w:name="_Toc240276743"/>
       <w:r>
         <w:rPr>
           <w:rFonts w:ascii="Montserrat" w:hAnsi="Montserrat"/>
@@ -18617,16 +18643,16 @@
         </w:rPr>
         <w:lastRenderedPageBreak/>
         <w:drawing>
-          <wp:inline distT="0" distB="0" distL="0" distR="0" wp14:anchorId="00772F25" wp14:editId="25EC51C1">
+          <wp:inline distT="0" distB="0" distL="0" distR="0" wp14:anchorId="7032612D" wp14:editId="4221D21A">
             <wp:extent cx="5303520" cy="4792851"/>
             <wp:effectExtent l="19050" t="19050" r="11430" b="27305"/>
-            <wp:docPr id="1019308751" name="Imagem 45"/>
+            <wp:docPr id="2046047921" name="Imagem 45"/>
             <wp:cNvGraphicFramePr/>
             <a:graphic xmlns:a="http://schemas.openxmlformats.org/drawingml/2006/main">
               <a:graphicData uri="http://schemas.openxmlformats.org/drawingml/2006/picture">
                 <pic:pic xmlns:pic="http://schemas.openxmlformats.org/drawingml/2006/picture">
                   <pic:nvPicPr>
-                    <pic:cNvPr id="1019308751" name=""/>
+                    <pic:cNvPr id="2046047921" name=""/>
                     <pic:cNvPicPr/>
                   </pic:nvPicPr>
                   <pic:blipFill>
@@ -18694,16 +18720,16 @@
         </w:rPr>
         <w:lastRenderedPageBreak/>
         <w:drawing>
-          <wp:inline distT="0" distB="0" distL="0" distR="0" wp14:anchorId="35B8FBFE" wp14:editId="18CB7E70">
+          <wp:inline distT="0" distB="0" distL="0" distR="0" wp14:anchorId="19F60D51" wp14:editId="0FD5B02B">
             <wp:extent cx="5303520" cy="4792851"/>
             <wp:effectExtent l="19050" t="19050" r="11430" b="27305"/>
-            <wp:docPr id="505046591" name="Imagem 46"/>
+            <wp:docPr id="1493895599" name="Imagem 46"/>
             <wp:cNvGraphicFramePr/>
             <a:graphic xmlns:a="http://schemas.openxmlformats.org/drawingml/2006/main">
               <a:graphicData uri="http://schemas.openxmlformats.org/drawingml/2006/picture">
                 <pic:pic xmlns:pic="http://schemas.openxmlformats.org/drawingml/2006/picture">
                   <pic:nvPicPr>
-                    <pic:cNvPr id="505046591" name=""/>
+                    <pic:cNvPr id="1493895599" name=""/>
                     <pic:cNvPicPr/>
                   </pic:nvPicPr>
                   <pic:blipFill>
@@ -18796,7 +18822,7 @@
           <w:sz w:val="34"/>
         </w:rPr>
       </w:pPr>
-      <w:bookmarkStart w:id="37" w:name="_Toc240275462"/>
+      <w:bookmarkStart w:id="37" w:name="_Toc240276744"/>
       <w:r>
         <w:rPr>
           <w:rFonts w:ascii="Montserrat" w:hAnsi="Montserrat"/>
@@ -18838,7 +18864,7 @@
           <w:sz w:val="27"/>
         </w:rPr>
       </w:pPr>
-      <w:bookmarkStart w:id="38" w:name="_Toc240275463"/>
+      <w:bookmarkStart w:id="38" w:name="_Toc240276745"/>
       <w:r>
         <w:rPr>
           <w:rFonts w:ascii="Montserrat" w:hAnsi="Montserrat"/>
@@ -18878,16 +18904,16 @@
           <w:noProof/>
         </w:rPr>
         <w:drawing>
-          <wp:inline distT="0" distB="0" distL="0" distR="0" wp14:anchorId="2BD96623" wp14:editId="44DEE68A">
+          <wp:inline distT="0" distB="0" distL="0" distR="0" wp14:anchorId="42F56F05" wp14:editId="033CF5D5">
             <wp:extent cx="5303520" cy="4792851"/>
             <wp:effectExtent l="19050" t="19050" r="11430" b="27305"/>
-            <wp:docPr id="1309063155" name="Imagem 47"/>
+            <wp:docPr id="635646713" name="Imagem 47"/>
             <wp:cNvGraphicFramePr/>
             <a:graphic xmlns:a="http://schemas.openxmlformats.org/drawingml/2006/main">
               <a:graphicData uri="http://schemas.openxmlformats.org/drawingml/2006/picture">
                 <pic:pic xmlns:pic="http://schemas.openxmlformats.org/drawingml/2006/picture">
                   <pic:nvPicPr>
-                    <pic:cNvPr id="1309063155" name=""/>
+                    <pic:cNvPr id="635646713" name=""/>
                     <pic:cNvPicPr/>
                   </pic:nvPicPr>
                   <pic:blipFill>
@@ -19116,7 +19142,7 @@
           <w:sz w:val="27"/>
         </w:rPr>
       </w:pPr>
-      <w:bookmarkStart w:id="39" w:name="_Toc240275464"/>
+      <w:bookmarkStart w:id="39" w:name="_Toc240276746"/>
       <w:r>
         <w:rPr>
           <w:rFonts w:ascii="Montserrat" w:hAnsi="Montserrat"/>
@@ -19156,16 +19182,16 @@
           <w:noProof/>
         </w:rPr>
         <w:drawing>
-          <wp:inline distT="0" distB="0" distL="0" distR="0" wp14:anchorId="3690B784" wp14:editId="6DB80F7C">
+          <wp:inline distT="0" distB="0" distL="0" distR="0" wp14:anchorId="7A97E0AC" wp14:editId="5973D859">
             <wp:extent cx="5303520" cy="4792851"/>
             <wp:effectExtent l="19050" t="19050" r="11430" b="27305"/>
-            <wp:docPr id="1810224478" name="Imagem 48"/>
+            <wp:docPr id="1651759948" name="Imagem 48"/>
             <wp:cNvGraphicFramePr/>
             <a:graphic xmlns:a="http://schemas.openxmlformats.org/drawingml/2006/main">
               <a:graphicData uri="http://schemas.openxmlformats.org/drawingml/2006/picture">
                 <pic:pic xmlns:pic="http://schemas.openxmlformats.org/drawingml/2006/picture">
                   <pic:nvPicPr>
-                    <pic:cNvPr id="1810224478" name=""/>
+                    <pic:cNvPr id="1651759948" name=""/>
                     <pic:cNvPicPr/>
                   </pic:nvPicPr>
                   <pic:blipFill>
@@ -19233,7 +19259,7 @@
           <w:sz w:val="27"/>
         </w:rPr>
       </w:pPr>
-      <w:bookmarkStart w:id="40" w:name="_Toc240275465"/>
+      <w:bookmarkStart w:id="40" w:name="_Toc240276747"/>
       <w:r>
         <w:rPr>
           <w:rFonts w:ascii="Montserrat" w:hAnsi="Montserrat"/>
@@ -19274,16 +19300,16 @@
         </w:rPr>
         <w:lastRenderedPageBreak/>
         <w:drawing>
-          <wp:inline distT="0" distB="0" distL="0" distR="0" wp14:anchorId="1E8AA9EE" wp14:editId="7754CDBC">
+          <wp:inline distT="0" distB="0" distL="0" distR="0" wp14:anchorId="717E23AE" wp14:editId="2E24E3BF">
             <wp:extent cx="5303520" cy="4792851"/>
             <wp:effectExtent l="19050" t="19050" r="11430" b="27305"/>
-            <wp:docPr id="232444497" name="Imagem 49"/>
+            <wp:docPr id="1236100670" name="Imagem 49"/>
             <wp:cNvGraphicFramePr/>
             <a:graphic xmlns:a="http://schemas.openxmlformats.org/drawingml/2006/main">
               <a:graphicData uri="http://schemas.openxmlformats.org/drawingml/2006/picture">
                 <pic:pic xmlns:pic="http://schemas.openxmlformats.org/drawingml/2006/picture">
                   <pic:nvPicPr>
-                    <pic:cNvPr id="232444497" name=""/>
+                    <pic:cNvPr id="1236100670" name=""/>
                     <pic:cNvPicPr/>
                   </pic:nvPicPr>
                   <pic:blipFill>
@@ -19427,7 +19453,7 @@
           <w:sz w:val="27"/>
         </w:rPr>
       </w:pPr>
-      <w:bookmarkStart w:id="41" w:name="_Toc240275466"/>
+      <w:bookmarkStart w:id="41" w:name="_Toc240276748"/>
       <w:r>
         <w:rPr>
           <w:rFonts w:ascii="Montserrat" w:hAnsi="Montserrat"/>
@@ -19692,16 +19718,16 @@
           <w:noProof/>
         </w:rPr>
         <w:drawing>
-          <wp:inline distT="0" distB="0" distL="0" distR="0" wp14:anchorId="7673629A" wp14:editId="5597A727">
+          <wp:inline distT="0" distB="0" distL="0" distR="0" wp14:anchorId="4EEA5A75" wp14:editId="601B75C4">
             <wp:extent cx="5303520" cy="4267180"/>
             <wp:effectExtent l="19050" t="19050" r="11430" b="19685"/>
-            <wp:docPr id="1476041260" name="Imagem 50"/>
+            <wp:docPr id="1008686196" name="Imagem 50"/>
             <wp:cNvGraphicFramePr/>
             <a:graphic xmlns:a="http://schemas.openxmlformats.org/drawingml/2006/main">
               <a:graphicData uri="http://schemas.openxmlformats.org/drawingml/2006/picture">
                 <pic:pic xmlns:pic="http://schemas.openxmlformats.org/drawingml/2006/picture">
                   <pic:nvPicPr>
-                    <pic:cNvPr id="1476041260" name=""/>
+                    <pic:cNvPr id="1008686196" name=""/>
                     <pic:cNvPicPr/>
                   </pic:nvPicPr>
                   <pic:blipFill>
@@ -19769,16 +19795,16 @@
           <w:noProof/>
         </w:rPr>
         <w:drawing>
-          <wp:inline distT="0" distB="0" distL="0" distR="0" wp14:anchorId="74BE17A1" wp14:editId="73B7AFF3">
+          <wp:inline distT="0" distB="0" distL="0" distR="0" wp14:anchorId="091597C7" wp14:editId="4826C076">
             <wp:extent cx="5303520" cy="3382059"/>
             <wp:effectExtent l="19050" t="19050" r="11430" b="27940"/>
-            <wp:docPr id="99214307" name="Imagem 51"/>
+            <wp:docPr id="210967118" name="Imagem 51"/>
             <wp:cNvGraphicFramePr/>
             <a:graphic xmlns:a="http://schemas.openxmlformats.org/drawingml/2006/main">
               <a:graphicData uri="http://schemas.openxmlformats.org/drawingml/2006/picture">
                 <pic:pic xmlns:pic="http://schemas.openxmlformats.org/drawingml/2006/picture">
                   <pic:nvPicPr>
-                    <pic:cNvPr id="99214307" name=""/>
+                    <pic:cNvPr id="210967118" name=""/>
                     <pic:cNvPicPr/>
                   </pic:nvPicPr>
                   <pic:blipFill>
@@ -19846,16 +19872,16 @@
         </w:rPr>
         <w:lastRenderedPageBreak/>
         <w:drawing>
-          <wp:inline distT="0" distB="0" distL="0" distR="0" wp14:anchorId="0023A61C" wp14:editId="4042414B">
+          <wp:inline distT="0" distB="0" distL="0" distR="0" wp14:anchorId="498C80AC" wp14:editId="670B2C25">
             <wp:extent cx="5303520" cy="4417800"/>
             <wp:effectExtent l="19050" t="19050" r="11430" b="20955"/>
-            <wp:docPr id="257937320" name="Imagem 52"/>
+            <wp:docPr id="1064224777" name="Imagem 52"/>
             <wp:cNvGraphicFramePr/>
             <a:graphic xmlns:a="http://schemas.openxmlformats.org/drawingml/2006/main">
               <a:graphicData uri="http://schemas.openxmlformats.org/drawingml/2006/picture">
                 <pic:pic xmlns:pic="http://schemas.openxmlformats.org/drawingml/2006/picture">
                   <pic:nvPicPr>
-                    <pic:cNvPr id="257937320" name=""/>
+                    <pic:cNvPr id="1064224777" name=""/>
                     <pic:cNvPicPr/>
                   </pic:nvPicPr>
                   <pic:blipFill>
@@ -19965,7 +19991,7 @@
           <w:sz w:val="27"/>
         </w:rPr>
       </w:pPr>
-      <w:bookmarkStart w:id="42" w:name="_Toc240275467"/>
+      <w:bookmarkStart w:id="42" w:name="_Toc240276749"/>
       <w:r>
         <w:rPr>
           <w:rFonts w:ascii="Montserrat" w:hAnsi="Montserrat"/>
@@ -20231,16 +20257,16 @@
         </w:rPr>
         <w:lastRenderedPageBreak/>
         <w:drawing>
-          <wp:inline distT="0" distB="0" distL="0" distR="0" wp14:anchorId="398280F9" wp14:editId="5697681B">
+          <wp:inline distT="0" distB="0" distL="0" distR="0" wp14:anchorId="250F1CC5" wp14:editId="3DACE48B">
             <wp:extent cx="5303520" cy="7628836"/>
             <wp:effectExtent l="19050" t="19050" r="11430" b="10795"/>
-            <wp:docPr id="1249476107" name="Imagem 53"/>
+            <wp:docPr id="1315728070" name="Imagem 53"/>
             <wp:cNvGraphicFramePr/>
             <a:graphic xmlns:a="http://schemas.openxmlformats.org/drawingml/2006/main">
               <a:graphicData uri="http://schemas.openxmlformats.org/drawingml/2006/picture">
                 <pic:pic xmlns:pic="http://schemas.openxmlformats.org/drawingml/2006/picture">
                   <pic:nvPicPr>
-                    <pic:cNvPr id="1249476107" name=""/>
+                    <pic:cNvPr id="1315728070" name=""/>
                     <pic:cNvPicPr/>
                   </pic:nvPicPr>
                   <pic:blipFill>
@@ -20372,7 +20398,7 @@
           <w:sz w:val="27"/>
         </w:rPr>
       </w:pPr>
-      <w:bookmarkStart w:id="43" w:name="_Toc240275468"/>
+      <w:bookmarkStart w:id="43" w:name="_Toc240276750"/>
       <w:r>
         <w:rPr>
           <w:rFonts w:ascii="Montserrat" w:hAnsi="Montserrat"/>
@@ -20525,7 +20551,7 @@
           <w:sz w:val="27"/>
         </w:rPr>
       </w:pPr>
-      <w:bookmarkStart w:id="44" w:name="_Toc240275469"/>
+      <w:bookmarkStart w:id="44" w:name="_Toc240276751"/>
       <w:r>
         <w:rPr>
           <w:rFonts w:ascii="Montserrat" w:hAnsi="Montserrat"/>
@@ -20818,16 +20844,16 @@
           <w:noProof/>
         </w:rPr>
         <w:drawing>
-          <wp:inline distT="0" distB="0" distL="0" distR="0" wp14:anchorId="7B856E9A" wp14:editId="15575368">
+          <wp:inline distT="0" distB="0" distL="0" distR="0" wp14:anchorId="720ADA24" wp14:editId="0D322D77">
             <wp:extent cx="5303520" cy="1351384"/>
             <wp:effectExtent l="19050" t="19050" r="11430" b="20320"/>
-            <wp:docPr id="1826309163" name="Imagem 54"/>
+            <wp:docPr id="1771898746" name="Imagem 54"/>
             <wp:cNvGraphicFramePr/>
             <a:graphic xmlns:a="http://schemas.openxmlformats.org/drawingml/2006/main">
               <a:graphicData uri="http://schemas.openxmlformats.org/drawingml/2006/picture">
                 <pic:pic xmlns:pic="http://schemas.openxmlformats.org/drawingml/2006/picture">
                   <pic:nvPicPr>
-                    <pic:cNvPr id="1826309163" name=""/>
+                    <pic:cNvPr id="1771898746" name=""/>
                     <pic:cNvPicPr/>
                   </pic:nvPicPr>
                   <pic:blipFill>
@@ -20895,7 +20921,7 @@
           <w:sz w:val="27"/>
         </w:rPr>
       </w:pPr>
-      <w:bookmarkStart w:id="45" w:name="_Toc240275470"/>
+      <w:bookmarkStart w:id="45" w:name="_Toc240276752"/>
       <w:r>
         <w:rPr>
           <w:rFonts w:ascii="Montserrat" w:hAnsi="Montserrat"/>
@@ -21040,16 +21066,16 @@
           <w:noProof/>
         </w:rPr>
         <w:drawing>
-          <wp:inline distT="0" distB="0" distL="0" distR="0" wp14:anchorId="483D261D" wp14:editId="583D4309">
+          <wp:inline distT="0" distB="0" distL="0" distR="0" wp14:anchorId="6E299AF8" wp14:editId="22F9B86F">
             <wp:extent cx="5303520" cy="1422793"/>
             <wp:effectExtent l="19050" t="19050" r="11430" b="25400"/>
-            <wp:docPr id="13401751" name="Imagem 55"/>
+            <wp:docPr id="649541990" name="Imagem 55"/>
             <wp:cNvGraphicFramePr/>
             <a:graphic xmlns:a="http://schemas.openxmlformats.org/drawingml/2006/main">
               <a:graphicData uri="http://schemas.openxmlformats.org/drawingml/2006/picture">
                 <pic:pic xmlns:pic="http://schemas.openxmlformats.org/drawingml/2006/picture">
                   <pic:nvPicPr>
-                    <pic:cNvPr id="13401751" name=""/>
+                    <pic:cNvPr id="649541990" name=""/>
                     <pic:cNvPicPr/>
                   </pic:nvPicPr>
                   <pic:blipFill>
@@ -21204,16 +21230,16 @@
         </w:rPr>
         <w:lastRenderedPageBreak/>
         <w:drawing>
-          <wp:inline distT="0" distB="0" distL="0" distR="0" wp14:anchorId="71409F47" wp14:editId="6725E058">
+          <wp:inline distT="0" distB="0" distL="0" distR="0" wp14:anchorId="3373D0C3" wp14:editId="5DDA16FA">
             <wp:extent cx="5303520" cy="1841050"/>
             <wp:effectExtent l="19050" t="19050" r="11430" b="26035"/>
-            <wp:docPr id="94736405" name="Imagem 56"/>
+            <wp:docPr id="1637372653" name="Imagem 56"/>
             <wp:cNvGraphicFramePr/>
             <a:graphic xmlns:a="http://schemas.openxmlformats.org/drawingml/2006/main">
               <a:graphicData uri="http://schemas.openxmlformats.org/drawingml/2006/picture">
                 <pic:pic xmlns:pic="http://schemas.openxmlformats.org/drawingml/2006/picture">
                   <pic:nvPicPr>
-                    <pic:cNvPr id="94736405" name=""/>
+                    <pic:cNvPr id="1637372653" name=""/>
                     <pic:cNvPicPr/>
                   </pic:nvPicPr>
                   <pic:blipFill>
@@ -21367,16 +21393,16 @@
           <w:noProof/>
         </w:rPr>
         <w:drawing>
-          <wp:inline distT="0" distB="0" distL="0" distR="0" wp14:anchorId="218607DB" wp14:editId="32780F4C">
+          <wp:inline distT="0" distB="0" distL="0" distR="0" wp14:anchorId="271D12C0" wp14:editId="222A011B">
             <wp:extent cx="5303520" cy="303041"/>
             <wp:effectExtent l="19050" t="19050" r="11430" b="20955"/>
-            <wp:docPr id="63078352" name="Imagem 57"/>
+            <wp:docPr id="1412848412" name="Imagem 57"/>
             <wp:cNvGraphicFramePr/>
             <a:graphic xmlns:a="http://schemas.openxmlformats.org/drawingml/2006/main">
               <a:graphicData uri="http://schemas.openxmlformats.org/drawingml/2006/picture">
                 <pic:pic xmlns:pic="http://schemas.openxmlformats.org/drawingml/2006/picture">
                   <pic:nvPicPr>
-                    <pic:cNvPr id="63078352" name=""/>
+                    <pic:cNvPr id="1412848412" name=""/>
                     <pic:cNvPicPr/>
                   </pic:nvPicPr>
                   <pic:blipFill>
@@ -21444,16 +21470,16 @@
         </w:rPr>
         <w:lastRenderedPageBreak/>
         <w:drawing>
-          <wp:inline distT="0" distB="0" distL="0" distR="0" wp14:anchorId="4AEFC2DD" wp14:editId="66C87774">
+          <wp:inline distT="0" distB="0" distL="0" distR="0" wp14:anchorId="6DFC5B69" wp14:editId="2E7D484D">
             <wp:extent cx="5303520" cy="2983005"/>
             <wp:effectExtent l="19050" t="19050" r="11430" b="27305"/>
-            <wp:docPr id="1628718773" name="Imagem 58"/>
+            <wp:docPr id="1823227822" name="Imagem 58"/>
             <wp:cNvGraphicFramePr/>
             <a:graphic xmlns:a="http://schemas.openxmlformats.org/drawingml/2006/main">
               <a:graphicData uri="http://schemas.openxmlformats.org/drawingml/2006/picture">
                 <pic:pic xmlns:pic="http://schemas.openxmlformats.org/drawingml/2006/picture">
                   <pic:nvPicPr>
-                    <pic:cNvPr id="1628718773" name=""/>
+                    <pic:cNvPr id="1823227822" name=""/>
                     <pic:cNvPicPr/>
                   </pic:nvPicPr>
                   <pic:blipFill>
@@ -21525,7 +21551,7 @@
           <w:sz w:val="34"/>
         </w:rPr>
       </w:pPr>
-      <w:bookmarkStart w:id="46" w:name="_Toc240275471"/>
+      <w:bookmarkStart w:id="46" w:name="_Toc240276753"/>
       <w:r>
         <w:rPr>
           <w:rFonts w:ascii="Montserrat" w:hAnsi="Montserrat"/>
@@ -21769,7 +21795,7 @@
           <w:sz w:val="34"/>
         </w:rPr>
       </w:pPr>
-      <w:bookmarkStart w:id="47" w:name="_Toc240275472"/>
+      <w:bookmarkStart w:id="47" w:name="_Toc240276754"/>
       <w:r>
         <w:rPr>
           <w:rFonts w:ascii="Montserrat" w:hAnsi="Montserrat"/>
@@ -23557,7 +23583,7 @@
 <file path=word/numbering.xml><?xml version="1.0" encoding="utf-8"?>
 <w:numbering xmlns:wpc="http://schemas.microsoft.com/office/word/2010/wordprocessingCanvas" xmlns:cx="http://schemas.microsoft.com/office/drawing/2014/chartex" xmlns:cx1="http://schemas.microsoft.com/office/drawing/2015/9/8/chartex" xmlns:cx2="http://schemas.microsoft.com/office/drawing/2015/10/21/chartex" xmlns:cx3="http://schemas.microsoft.com/office/drawing/2016/5/9/chartex" xmlns:cx4="http://schemas.microsoft.com/office/drawing/2016/5/10/chartex" xmlns:cx5="http://schemas.microsoft.com/office/drawing/2016/5/11/chartex" xmlns:cx6="http://schemas.microsoft.com/office/drawing/2016/5/12/chartex" xmlns:cx7="http://schemas.microsoft.com/office/drawing/2016/5/13/chartex" xmlns:cx8="http://schemas.microsoft.com/office/drawing/2016/5/14/chartex" xmlns:mc="http://schemas.openxmlformats.org/markup-compatibility/2006" xmlns:aink="http://schemas.microsoft.com/office/drawing/2016/ink" xmlns:am3d="http://schemas.microsoft.com/office/drawing/2017/model3d" xmlns:o="urn:schemas-microsoft-com:office:office" xmlns:oel="http://schemas.microsoft.com/office/2019/extlst" xmlns:r="http://schemas.openxmlformats.org/officeDocument/2006/relationships" xmlns:m="http://schemas.openxmlformats.org/officeDocument/2006/math" xmlns:v="urn:schemas-microsoft-com:vml" xmlns:wp14="http://schemas.microsoft.com/office/word/2010/wordprocessingDrawing" xmlns:wp="http://schemas.openxmlformats.org/drawingml/2006/wordprocessingDrawing" xmlns:w10="urn:schemas-microsoft-com:office:word" xmlns:w="http://schemas.openxmlformats.org/wordprocessingml/2006/main" xmlns:w14="http://schemas.microsoft.com/office/word/2010/wordml" xmlns:w15="http://schemas.microsoft.com/office/word/2012/wordml" xmlns:w16cex="http://schemas.microsoft.com/office/word/2018/wordml/cex" xmlns:w16cid="http://schemas.microsoft.com/office/word/2016/wordml/cid" xmlns:w16="http://schemas.microsoft.com/office/word/2018/wordml" xmlns:w16du="http://schemas.microsoft.com/office/word/2023/wordml/word16du" xmlns:w16sdtdh="http://schemas.microsoft.com/office/word/2020/wordml/sdtdatahash" xmlns:w16sdtfl="http://schemas.microsoft.com/office/word/2024/wordml/sdtformatlock" xmlns:w16se="http://schemas.microsoft.com/office/word/2015/wordml/symex" xmlns:wpg="http://schemas.microsoft.com/office/word/2010/wordprocessingGroup" xmlns:wpi="http://schemas.microsoft.com/office/word/2010/wordprocessingInk" xmlns:wne="http://schemas.microsoft.com/office/word/2006/wordml" xmlns:wps="http://schemas.microsoft.com/office/word/2010/wordprocessingShape" mc:Ignorable="w14 w15 w16se w16cid w16 w16cex w16sdtdh w16sdtfl w16du wp14">
   <w:abstractNum w:abstractNumId="0" w15:restartNumberingAfterBreak="0">
-    <w:nsid w:val="001A1AA2"/>
+    <w:nsid w:val="0B241419"/>
     <w:multiLevelType w:val="singleLevel"/>
     <w:tmpl w:val="04160001"/>
     <w:lvl w:ilvl="0">
@@ -23574,7 +23600,7 @@
     </w:lvl>
   </w:abstractNum>
   <w:abstractNum w:abstractNumId="1" w15:restartNumberingAfterBreak="0">
-    <w:nsid w:val="013B6708"/>
+    <w:nsid w:val="0C4E4E40"/>
     <w:multiLevelType w:val="singleLevel"/>
     <w:tmpl w:val="04160001"/>
     <w:lvl w:ilvl="0">
@@ -23591,7 +23617,7 @@
     </w:lvl>
   </w:abstractNum>
   <w:abstractNum w:abstractNumId="2" w15:restartNumberingAfterBreak="0">
-    <w:nsid w:val="01443507"/>
+    <w:nsid w:val="0CB22E0B"/>
     <w:multiLevelType w:val="singleLevel"/>
     <w:tmpl w:val="04160001"/>
     <w:lvl w:ilvl="0">
@@ -23608,7 +23634,7 @@
     </w:lvl>
   </w:abstractNum>
   <w:abstractNum w:abstractNumId="3" w15:restartNumberingAfterBreak="0">
-    <w:nsid w:val="043220D9"/>
+    <w:nsid w:val="12700FD3"/>
     <w:multiLevelType w:val="singleLevel"/>
     <w:tmpl w:val="04160001"/>
     <w:lvl w:ilvl="0">
@@ -23625,7 +23651,7 @@
     </w:lvl>
   </w:abstractNum>
   <w:abstractNum w:abstractNumId="4" w15:restartNumberingAfterBreak="0">
-    <w:nsid w:val="08973A15"/>
+    <w:nsid w:val="168F19DA"/>
     <w:multiLevelType w:val="singleLevel"/>
     <w:tmpl w:val="04160001"/>
     <w:lvl w:ilvl="0">
@@ -23642,7 +23668,7 @@
     </w:lvl>
   </w:abstractNum>
   <w:abstractNum w:abstractNumId="5" w15:restartNumberingAfterBreak="0">
-    <w:nsid w:val="0C4F728A"/>
+    <w:nsid w:val="180413AF"/>
     <w:multiLevelType w:val="singleLevel"/>
     <w:tmpl w:val="04160001"/>
     <w:lvl w:ilvl="0">
@@ -23659,7 +23685,7 @@
     </w:lvl>
   </w:abstractNum>
   <w:abstractNum w:abstractNumId="6" w15:restartNumberingAfterBreak="0">
-    <w:nsid w:val="13C770C8"/>
+    <w:nsid w:val="1BD85BBA"/>
     <w:multiLevelType w:val="singleLevel"/>
     <w:tmpl w:val="04160001"/>
     <w:lvl w:ilvl="0">
@@ -23676,7 +23702,7 @@
     </w:lvl>
   </w:abstractNum>
   <w:abstractNum w:abstractNumId="7" w15:restartNumberingAfterBreak="0">
-    <w:nsid w:val="13FC5AE9"/>
+    <w:nsid w:val="1F5C5365"/>
     <w:multiLevelType w:val="singleLevel"/>
     <w:tmpl w:val="04160001"/>
     <w:lvl w:ilvl="0">
@@ -23693,7 +23719,7 @@
     </w:lvl>
   </w:abstractNum>
   <w:abstractNum w:abstractNumId="8" w15:restartNumberingAfterBreak="0">
-    <w:nsid w:val="149423E7"/>
+    <w:nsid w:val="1FD01609"/>
     <w:multiLevelType w:val="singleLevel"/>
     <w:tmpl w:val="04160001"/>
     <w:lvl w:ilvl="0">
@@ -23710,7 +23736,7 @@
     </w:lvl>
   </w:abstractNum>
   <w:abstractNum w:abstractNumId="9" w15:restartNumberingAfterBreak="0">
-    <w:nsid w:val="183D238F"/>
+    <w:nsid w:val="20FE654A"/>
     <w:multiLevelType w:val="singleLevel"/>
     <w:tmpl w:val="04160001"/>
     <w:lvl w:ilvl="0">
@@ -23727,7 +23753,7 @@
     </w:lvl>
   </w:abstractNum>
   <w:abstractNum w:abstractNumId="10" w15:restartNumberingAfterBreak="0">
-    <w:nsid w:val="21B31A01"/>
+    <w:nsid w:val="26CC2662"/>
     <w:multiLevelType w:val="singleLevel"/>
     <w:tmpl w:val="04160001"/>
     <w:lvl w:ilvl="0">
@@ -23744,7 +23770,7 @@
     </w:lvl>
   </w:abstractNum>
   <w:abstractNum w:abstractNumId="11" w15:restartNumberingAfterBreak="0">
-    <w:nsid w:val="23FE7C4C"/>
+    <w:nsid w:val="2C311AB4"/>
     <w:multiLevelType w:val="singleLevel"/>
     <w:tmpl w:val="04160001"/>
     <w:lvl w:ilvl="0">
@@ -23761,7 +23787,7 @@
     </w:lvl>
   </w:abstractNum>
   <w:abstractNum w:abstractNumId="12" w15:restartNumberingAfterBreak="0">
-    <w:nsid w:val="2E0F21C6"/>
+    <w:nsid w:val="2D13686A"/>
     <w:multiLevelType w:val="singleLevel"/>
     <w:tmpl w:val="04160001"/>
     <w:lvl w:ilvl="0">
@@ -23778,7 +23804,7 @@
     </w:lvl>
   </w:abstractNum>
   <w:abstractNum w:abstractNumId="13" w15:restartNumberingAfterBreak="0">
-    <w:nsid w:val="30C81457"/>
+    <w:nsid w:val="31193F9C"/>
     <w:multiLevelType w:val="singleLevel"/>
     <w:tmpl w:val="04160001"/>
     <w:lvl w:ilvl="0">
@@ -23795,7 +23821,7 @@
     </w:lvl>
   </w:abstractNum>
   <w:abstractNum w:abstractNumId="14" w15:restartNumberingAfterBreak="0">
-    <w:nsid w:val="32B80A4F"/>
+    <w:nsid w:val="322F66B6"/>
     <w:multiLevelType w:val="singleLevel"/>
     <w:tmpl w:val="04160001"/>
     <w:lvl w:ilvl="0">
@@ -23812,7 +23838,7 @@
     </w:lvl>
   </w:abstractNum>
   <w:abstractNum w:abstractNumId="15" w15:restartNumberingAfterBreak="0">
-    <w:nsid w:val="34ED2739"/>
+    <w:nsid w:val="37F6100A"/>
     <w:multiLevelType w:val="singleLevel"/>
     <w:tmpl w:val="04160001"/>
     <w:lvl w:ilvl="0">
@@ -23829,7 +23855,7 @@
     </w:lvl>
   </w:abstractNum>
   <w:abstractNum w:abstractNumId="16" w15:restartNumberingAfterBreak="0">
-    <w:nsid w:val="3A2E2DF6"/>
+    <w:nsid w:val="3F4E427D"/>
     <w:multiLevelType w:val="singleLevel"/>
     <w:tmpl w:val="04160001"/>
     <w:lvl w:ilvl="0">
@@ -23846,7 +23872,7 @@
     </w:lvl>
   </w:abstractNum>
   <w:abstractNum w:abstractNumId="17" w15:restartNumberingAfterBreak="0">
-    <w:nsid w:val="3FCC3041"/>
+    <w:nsid w:val="40BE79BB"/>
     <w:multiLevelType w:val="singleLevel"/>
     <w:tmpl w:val="04160001"/>
     <w:lvl w:ilvl="0">
@@ -23863,7 +23889,7 @@
     </w:lvl>
   </w:abstractNum>
   <w:abstractNum w:abstractNumId="18" w15:restartNumberingAfterBreak="0">
-    <w:nsid w:val="42B84E91"/>
+    <w:nsid w:val="40D7459C"/>
     <w:multiLevelType w:val="singleLevel"/>
     <w:tmpl w:val="04160001"/>
     <w:lvl w:ilvl="0">
@@ -23880,7 +23906,7 @@
     </w:lvl>
   </w:abstractNum>
   <w:abstractNum w:abstractNumId="19" w15:restartNumberingAfterBreak="0">
-    <w:nsid w:val="44F11B2D"/>
+    <w:nsid w:val="423E0F20"/>
     <w:multiLevelType w:val="singleLevel"/>
     <w:tmpl w:val="04160001"/>
     <w:lvl w:ilvl="0">
@@ -23897,7 +23923,7 @@
     </w:lvl>
   </w:abstractNum>
   <w:abstractNum w:abstractNumId="20" w15:restartNumberingAfterBreak="0">
-    <w:nsid w:val="49C72BC6"/>
+    <w:nsid w:val="4E82222D"/>
     <w:multiLevelType w:val="singleLevel"/>
     <w:tmpl w:val="04160001"/>
     <w:lvl w:ilvl="0">
@@ -23914,7 +23940,7 @@
     </w:lvl>
   </w:abstractNum>
   <w:abstractNum w:abstractNumId="21" w15:restartNumberingAfterBreak="0">
-    <w:nsid w:val="4AE624C2"/>
+    <w:nsid w:val="4ECC1AF7"/>
     <w:multiLevelType w:val="singleLevel"/>
     <w:tmpl w:val="04160001"/>
     <w:lvl w:ilvl="0">
@@ -23931,7 +23957,7 @@
     </w:lvl>
   </w:abstractNum>
   <w:abstractNum w:abstractNumId="22" w15:restartNumberingAfterBreak="0">
-    <w:nsid w:val="4F8148A2"/>
+    <w:nsid w:val="50093327"/>
     <w:multiLevelType w:val="singleLevel"/>
     <w:tmpl w:val="04160001"/>
     <w:lvl w:ilvl="0">
@@ -23948,7 +23974,7 @@
     </w:lvl>
   </w:abstractNum>
   <w:abstractNum w:abstractNumId="23" w15:restartNumberingAfterBreak="0">
-    <w:nsid w:val="5F9066B4"/>
+    <w:nsid w:val="5C865592"/>
     <w:multiLevelType w:val="singleLevel"/>
     <w:tmpl w:val="04160001"/>
     <w:lvl w:ilvl="0">
@@ -23965,7 +23991,7 @@
     </w:lvl>
   </w:abstractNum>
   <w:abstractNum w:abstractNumId="24" w15:restartNumberingAfterBreak="0">
-    <w:nsid w:val="5FCC6E8A"/>
+    <w:nsid w:val="5F2B3CE3"/>
     <w:multiLevelType w:val="singleLevel"/>
     <w:tmpl w:val="04160001"/>
     <w:lvl w:ilvl="0">
@@ -23982,7 +24008,7 @@
     </w:lvl>
   </w:abstractNum>
   <w:abstractNum w:abstractNumId="25" w15:restartNumberingAfterBreak="0">
-    <w:nsid w:val="5FFF723C"/>
+    <w:nsid w:val="60393565"/>
     <w:multiLevelType w:val="singleLevel"/>
     <w:tmpl w:val="04160001"/>
     <w:lvl w:ilvl="0">
@@ -23999,7 +24025,7 @@
     </w:lvl>
   </w:abstractNum>
   <w:abstractNum w:abstractNumId="26" w15:restartNumberingAfterBreak="0">
-    <w:nsid w:val="68136ECF"/>
+    <w:nsid w:val="639358EE"/>
     <w:multiLevelType w:val="singleLevel"/>
     <w:tmpl w:val="04160001"/>
     <w:lvl w:ilvl="0">
@@ -24016,7 +24042,7 @@
     </w:lvl>
   </w:abstractNum>
   <w:abstractNum w:abstractNumId="27" w15:restartNumberingAfterBreak="0">
-    <w:nsid w:val="681717E0"/>
+    <w:nsid w:val="68C34238"/>
     <w:multiLevelType w:val="singleLevel"/>
     <w:tmpl w:val="04160001"/>
     <w:lvl w:ilvl="0">
@@ -24033,7 +24059,7 @@
     </w:lvl>
   </w:abstractNum>
   <w:abstractNum w:abstractNumId="28" w15:restartNumberingAfterBreak="0">
-    <w:nsid w:val="6B70799E"/>
+    <w:nsid w:val="6CDD376E"/>
     <w:multiLevelType w:val="singleLevel"/>
     <w:tmpl w:val="04160001"/>
     <w:lvl w:ilvl="0">
@@ -24050,7 +24076,7 @@
     </w:lvl>
   </w:abstractNum>
   <w:abstractNum w:abstractNumId="29" w15:restartNumberingAfterBreak="0">
-    <w:nsid w:val="6C4E465B"/>
+    <w:nsid w:val="705B131A"/>
     <w:multiLevelType w:val="singleLevel"/>
     <w:tmpl w:val="04160001"/>
     <w:lvl w:ilvl="0">
@@ -24067,7 +24093,7 @@
     </w:lvl>
   </w:abstractNum>
   <w:abstractNum w:abstractNumId="30" w15:restartNumberingAfterBreak="0">
-    <w:nsid w:val="733337D7"/>
+    <w:nsid w:val="744002CB"/>
     <w:multiLevelType w:val="singleLevel"/>
     <w:tmpl w:val="04160001"/>
     <w:lvl w:ilvl="0">
@@ -24084,7 +24110,7 @@
     </w:lvl>
   </w:abstractNum>
   <w:abstractNum w:abstractNumId="31" w15:restartNumberingAfterBreak="0">
-    <w:nsid w:val="77CF0F2A"/>
+    <w:nsid w:val="78D67F1E"/>
     <w:multiLevelType w:val="singleLevel"/>
     <w:tmpl w:val="04160001"/>
     <w:lvl w:ilvl="0">
@@ -24101,7 +24127,7 @@
     </w:lvl>
   </w:abstractNum>
   <w:abstractNum w:abstractNumId="32" w15:restartNumberingAfterBreak="0">
-    <w:nsid w:val="77E729B9"/>
+    <w:nsid w:val="7EDE7018"/>
     <w:multiLevelType w:val="singleLevel"/>
     <w:tmpl w:val="04160001"/>
     <w:lvl w:ilvl="0">
@@ -24117,104 +24143,104 @@
       </w:rPr>
     </w:lvl>
   </w:abstractNum>
-  <w:num w:numId="1" w16cid:durableId="1099981576">
+  <w:num w:numId="1" w16cid:durableId="1621495308">
+    <w:abstractNumId w:val="8"/>
+  </w:num>
+  <w:num w:numId="2" w16cid:durableId="846136817">
+    <w:abstractNumId w:val="11"/>
+  </w:num>
+  <w:num w:numId="3" w16cid:durableId="1972008877">
+    <w:abstractNumId w:val="0"/>
+  </w:num>
+  <w:num w:numId="4" w16cid:durableId="1538540893">
+    <w:abstractNumId w:val="22"/>
+  </w:num>
+  <w:num w:numId="5" w16cid:durableId="2134320671">
+    <w:abstractNumId w:val="10"/>
+  </w:num>
+  <w:num w:numId="6" w16cid:durableId="1912808065">
     <w:abstractNumId w:val="29"/>
   </w:num>
-  <w:num w:numId="2" w16cid:durableId="928270619">
+  <w:num w:numId="7" w16cid:durableId="1611469792">
+    <w:abstractNumId w:val="6"/>
+  </w:num>
+  <w:num w:numId="8" w16cid:durableId="1204489401">
+    <w:abstractNumId w:val="17"/>
+  </w:num>
+  <w:num w:numId="9" w16cid:durableId="113064946">
+    <w:abstractNumId w:val="31"/>
+  </w:num>
+  <w:num w:numId="10" w16cid:durableId="328602034">
+    <w:abstractNumId w:val="2"/>
+  </w:num>
+  <w:num w:numId="11" w16cid:durableId="240993826">
+    <w:abstractNumId w:val="20"/>
+  </w:num>
+  <w:num w:numId="12" w16cid:durableId="782581015">
+    <w:abstractNumId w:val="23"/>
+  </w:num>
+  <w:num w:numId="13" w16cid:durableId="2037580681">
+    <w:abstractNumId w:val="18"/>
+  </w:num>
+  <w:num w:numId="14" w16cid:durableId="315649108">
+    <w:abstractNumId w:val="14"/>
+  </w:num>
+  <w:num w:numId="15" w16cid:durableId="549342546">
+    <w:abstractNumId w:val="3"/>
+  </w:num>
+  <w:num w:numId="16" w16cid:durableId="784617897">
+    <w:abstractNumId w:val="30"/>
+  </w:num>
+  <w:num w:numId="17" w16cid:durableId="997465317">
+    <w:abstractNumId w:val="12"/>
+  </w:num>
+  <w:num w:numId="18" w16cid:durableId="1420560869">
+    <w:abstractNumId w:val="15"/>
+  </w:num>
+  <w:num w:numId="19" w16cid:durableId="222065461">
+    <w:abstractNumId w:val="5"/>
+  </w:num>
+  <w:num w:numId="20" w16cid:durableId="1156267541">
+    <w:abstractNumId w:val="24"/>
+  </w:num>
+  <w:num w:numId="21" w16cid:durableId="1430928528">
+    <w:abstractNumId w:val="13"/>
+  </w:num>
+  <w:num w:numId="22" w16cid:durableId="1864436302">
+    <w:abstractNumId w:val="4"/>
+  </w:num>
+  <w:num w:numId="23" w16cid:durableId="223954063">
+    <w:abstractNumId w:val="27"/>
+  </w:num>
+  <w:num w:numId="24" w16cid:durableId="654645480">
+    <w:abstractNumId w:val="9"/>
+  </w:num>
+  <w:num w:numId="25" w16cid:durableId="1242834808">
+    <w:abstractNumId w:val="28"/>
+  </w:num>
+  <w:num w:numId="26" w16cid:durableId="1679119759">
+    <w:abstractNumId w:val="1"/>
+  </w:num>
+  <w:num w:numId="27" w16cid:durableId="797145044">
+    <w:abstractNumId w:val="21"/>
+  </w:num>
+  <w:num w:numId="28" w16cid:durableId="1294170338">
+    <w:abstractNumId w:val="16"/>
+  </w:num>
+  <w:num w:numId="29" w16cid:durableId="10911030">
+    <w:abstractNumId w:val="26"/>
+  </w:num>
+  <w:num w:numId="30" w16cid:durableId="786124868">
+    <w:abstractNumId w:val="32"/>
+  </w:num>
+  <w:num w:numId="31" w16cid:durableId="1798911568">
     <w:abstractNumId w:val="25"/>
   </w:num>
-  <w:num w:numId="3" w16cid:durableId="231543458">
-    <w:abstractNumId w:val="2"/>
+  <w:num w:numId="32" w16cid:durableId="732968768">
+    <w:abstractNumId w:val="19"/>
   </w:num>
-  <w:num w:numId="4" w16cid:durableId="1269510937">
-    <w:abstractNumId w:val="1"/>
-  </w:num>
-  <w:num w:numId="5" w16cid:durableId="1419983274">
-    <w:abstractNumId w:val="27"/>
-  </w:num>
-  <w:num w:numId="6" w16cid:durableId="77871286">
-    <w:abstractNumId w:val="26"/>
-  </w:num>
-  <w:num w:numId="7" w16cid:durableId="1249802842">
-    <w:abstractNumId w:val="12"/>
-  </w:num>
-  <w:num w:numId="8" w16cid:durableId="97872315">
-    <w:abstractNumId w:val="4"/>
-  </w:num>
-  <w:num w:numId="9" w16cid:durableId="634724899">
-    <w:abstractNumId w:val="18"/>
-  </w:num>
-  <w:num w:numId="10" w16cid:durableId="1586458435">
-    <w:abstractNumId w:val="11"/>
-  </w:num>
-  <w:num w:numId="11" w16cid:durableId="1533684858">
-    <w:abstractNumId w:val="32"/>
-  </w:num>
-  <w:num w:numId="12" w16cid:durableId="544409961">
-    <w:abstractNumId w:val="15"/>
-  </w:num>
-  <w:num w:numId="13" w16cid:durableId="585457560">
-    <w:abstractNumId w:val="3"/>
-  </w:num>
-  <w:num w:numId="14" w16cid:durableId="2005936318">
-    <w:abstractNumId w:val="17"/>
-  </w:num>
-  <w:num w:numId="15" w16cid:durableId="3867077">
-    <w:abstractNumId w:val="0"/>
-  </w:num>
-  <w:num w:numId="16" w16cid:durableId="473176721">
-    <w:abstractNumId w:val="30"/>
-  </w:num>
-  <w:num w:numId="17" w16cid:durableId="2014137532">
-    <w:abstractNumId w:val="9"/>
-  </w:num>
-  <w:num w:numId="18" w16cid:durableId="966086922">
-    <w:abstractNumId w:val="13"/>
-  </w:num>
-  <w:num w:numId="19" w16cid:durableId="1741637486">
+  <w:num w:numId="33" w16cid:durableId="1191725588">
     <w:abstractNumId w:val="7"/>
-  </w:num>
-  <w:num w:numId="20" w16cid:durableId="122165104">
-    <w:abstractNumId w:val="28"/>
-  </w:num>
-  <w:num w:numId="21" w16cid:durableId="605843531">
-    <w:abstractNumId w:val="14"/>
-  </w:num>
-  <w:num w:numId="22" w16cid:durableId="918056435">
-    <w:abstractNumId w:val="21"/>
-  </w:num>
-  <w:num w:numId="23" w16cid:durableId="130295740">
-    <w:abstractNumId w:val="5"/>
-  </w:num>
-  <w:num w:numId="24" w16cid:durableId="514808311">
-    <w:abstractNumId w:val="8"/>
-  </w:num>
-  <w:num w:numId="25" w16cid:durableId="1307199030">
-    <w:abstractNumId w:val="22"/>
-  </w:num>
-  <w:num w:numId="26" w16cid:durableId="244267971">
-    <w:abstractNumId w:val="31"/>
-  </w:num>
-  <w:num w:numId="27" w16cid:durableId="1617982120">
-    <w:abstractNumId w:val="24"/>
-  </w:num>
-  <w:num w:numId="28" w16cid:durableId="896818771">
-    <w:abstractNumId w:val="23"/>
-  </w:num>
-  <w:num w:numId="29" w16cid:durableId="771973246">
-    <w:abstractNumId w:val="6"/>
-  </w:num>
-  <w:num w:numId="30" w16cid:durableId="598417370">
-    <w:abstractNumId w:val="10"/>
-  </w:num>
-  <w:num w:numId="31" w16cid:durableId="49693548">
-    <w:abstractNumId w:val="16"/>
-  </w:num>
-  <w:num w:numId="32" w16cid:durableId="282347336">
-    <w:abstractNumId w:val="20"/>
-  </w:num>
-  <w:num w:numId="33" w16cid:durableId="186599310">
-    <w:abstractNumId w:val="19"/>
   </w:num>
 </w:numbering>
 </file>
@@ -24627,7 +24653,7 @@
     <w:link w:val="Ttulo1Char"/>
     <w:uiPriority w:val="9"/>
     <w:qFormat/>
-    <w:rsid w:val="0047292B"/>
+    <w:rsid w:val="004F6F0F"/>
     <w:pPr>
       <w:keepNext/>
       <w:keepLines/>
@@ -24649,7 +24675,7 @@
     <w:uiPriority w:val="9"/>
     <w:unhideWhenUsed/>
     <w:qFormat/>
-    <w:rsid w:val="0047292B"/>
+    <w:rsid w:val="004F6F0F"/>
     <w:pPr>
       <w:keepNext/>
       <w:keepLines/>
@@ -24672,7 +24698,7 @@
     <w:semiHidden/>
     <w:unhideWhenUsed/>
     <w:qFormat/>
-    <w:rsid w:val="0047292B"/>
+    <w:rsid w:val="004F6F0F"/>
     <w:pPr>
       <w:keepNext/>
       <w:keepLines/>
@@ -24695,7 +24721,7 @@
     <w:semiHidden/>
     <w:unhideWhenUsed/>
     <w:qFormat/>
-    <w:rsid w:val="0047292B"/>
+    <w:rsid w:val="004F6F0F"/>
     <w:pPr>
       <w:keepNext/>
       <w:keepLines/>
@@ -24718,7 +24744,7 @@
     <w:semiHidden/>
     <w:unhideWhenUsed/>
     <w:qFormat/>
-    <w:rsid w:val="0047292B"/>
+    <w:rsid w:val="004F6F0F"/>
     <w:pPr>
       <w:keepNext/>
       <w:keepLines/>
@@ -24739,7 +24765,7 @@
     <w:semiHidden/>
     <w:unhideWhenUsed/>
     <w:qFormat/>
-    <w:rsid w:val="0047292B"/>
+    <w:rsid w:val="004F6F0F"/>
     <w:pPr>
       <w:keepNext/>
       <w:keepLines/>
@@ -24762,7 +24788,7 @@
     <w:semiHidden/>
     <w:unhideWhenUsed/>
     <w:qFormat/>
-    <w:rsid w:val="0047292B"/>
+    <w:rsid w:val="004F6F0F"/>
     <w:pPr>
       <w:keepNext/>
       <w:keepLines/>
@@ -24783,7 +24809,7 @@
     <w:semiHidden/>
     <w:unhideWhenUsed/>
     <w:qFormat/>
-    <w:rsid w:val="0047292B"/>
+    <w:rsid w:val="004F6F0F"/>
     <w:pPr>
       <w:keepNext/>
       <w:keepLines/>
@@ -24806,7 +24832,7 @@
     <w:semiHidden/>
     <w:unhideWhenUsed/>
     <w:qFormat/>
-    <w:rsid w:val="0047292B"/>
+    <w:rsid w:val="004F6F0F"/>
     <w:pPr>
       <w:keepNext/>
       <w:keepLines/>
@@ -24850,7 +24876,7 @@
     <w:basedOn w:val="Fontepargpadro"/>
     <w:link w:val="Ttulo1"/>
     <w:uiPriority w:val="9"/>
-    <w:rsid w:val="0047292B"/>
+    <w:rsid w:val="004F6F0F"/>
     <w:rPr>
       <w:rFonts w:asciiTheme="majorHAnsi" w:eastAsiaTheme="majorEastAsia" w:hAnsiTheme="majorHAnsi" w:cstheme="majorBidi"/>
       <w:color w:val="0F4761" w:themeColor="accent1" w:themeShade="BF"/>
@@ -24863,7 +24889,7 @@
     <w:basedOn w:val="Fontepargpadro"/>
     <w:link w:val="Ttulo2"/>
     <w:uiPriority w:val="9"/>
-    <w:rsid w:val="0047292B"/>
+    <w:rsid w:val="004F6F0F"/>
     <w:rPr>
       <w:rFonts w:asciiTheme="majorHAnsi" w:eastAsiaTheme="majorEastAsia" w:hAnsiTheme="majorHAnsi" w:cstheme="majorBidi"/>
       <w:color w:val="0F4761" w:themeColor="accent1" w:themeShade="BF"/>
@@ -24877,7 +24903,7 @@
     <w:link w:val="Ttulo3"/>
     <w:uiPriority w:val="9"/>
     <w:semiHidden/>
-    <w:rsid w:val="0047292B"/>
+    <w:rsid w:val="004F6F0F"/>
     <w:rPr>
       <w:rFonts w:eastAsiaTheme="majorEastAsia" w:cstheme="majorBidi"/>
       <w:color w:val="0F4761" w:themeColor="accent1" w:themeShade="BF"/>
@@ -24891,7 +24917,7 @@
     <w:link w:val="Ttulo4"/>
     <w:uiPriority w:val="9"/>
     <w:semiHidden/>
-    <w:rsid w:val="0047292B"/>
+    <w:rsid w:val="004F6F0F"/>
     <w:rPr>
       <w:rFonts w:eastAsiaTheme="majorEastAsia" w:cstheme="majorBidi"/>
       <w:i/>
@@ -24905,7 +24931,7 @@
     <w:link w:val="Ttulo5"/>
     <w:uiPriority w:val="9"/>
     <w:semiHidden/>
-    <w:rsid w:val="0047292B"/>
+    <w:rsid w:val="004F6F0F"/>
     <w:rPr>
       <w:rFonts w:eastAsiaTheme="majorEastAsia" w:cstheme="majorBidi"/>
       <w:color w:val="0F4761" w:themeColor="accent1" w:themeShade="BF"/>
@@ -24917,7 +24943,7 @@
     <w:link w:val="Ttulo6"/>
     <w:uiPriority w:val="9"/>
     <w:semiHidden/>
-    <w:rsid w:val="0047292B"/>
+    <w:rsid w:val="004F6F0F"/>
     <w:rPr>
       <w:rFonts w:eastAsiaTheme="majorEastAsia" w:cstheme="majorBidi"/>
       <w:i/>
@@ -24931,7 +24957,7 @@
     <w:link w:val="Ttulo7"/>
     <w:uiPriority w:val="9"/>
     <w:semiHidden/>
-    <w:rsid w:val="0047292B"/>
+    <w:rsid w:val="004F6F0F"/>
     <w:rPr>
       <w:rFonts w:eastAsiaTheme="majorEastAsia" w:cstheme="majorBidi"/>
       <w:color w:val="595959" w:themeColor="text1" w:themeTint="A6"/>
@@ -24943,7 +24969,7 @@
     <w:link w:val="Ttulo8"/>
     <w:uiPriority w:val="9"/>
     <w:semiHidden/>
-    <w:rsid w:val="0047292B"/>
+    <w:rsid w:val="004F6F0F"/>
     <w:rPr>
       <w:rFonts w:eastAsiaTheme="majorEastAsia" w:cstheme="majorBidi"/>
       <w:i/>
@@ -24957,7 +24983,7 @@
     <w:link w:val="Ttulo9"/>
     <w:uiPriority w:val="9"/>
     <w:semiHidden/>
-    <w:rsid w:val="0047292B"/>
+    <w:rsid w:val="004F6F0F"/>
     <w:rPr>
       <w:rFonts w:eastAsiaTheme="majorEastAsia" w:cstheme="majorBidi"/>
       <w:color w:val="272727" w:themeColor="text1" w:themeTint="D8"/>
@@ -24970,7 +24996,7 @@
     <w:link w:val="TtuloChar"/>
     <w:uiPriority w:val="10"/>
     <w:qFormat/>
-    <w:rsid w:val="0047292B"/>
+    <w:rsid w:val="004F6F0F"/>
     <w:pPr>
       <w:spacing w:after="80" w:line="240" w:lineRule="auto"/>
       <w:contextualSpacing/>
@@ -24988,7 +25014,7 @@
     <w:basedOn w:val="Fontepargpadro"/>
     <w:link w:val="Ttulo"/>
     <w:uiPriority w:val="10"/>
-    <w:rsid w:val="0047292B"/>
+    <w:rsid w:val="004F6F0F"/>
     <w:rPr>
       <w:rFonts w:asciiTheme="majorHAnsi" w:eastAsiaTheme="majorEastAsia" w:hAnsiTheme="majorHAnsi" w:cstheme="majorBidi"/>
       <w:spacing w:val="-10"/>
@@ -25004,7 +25030,7 @@
     <w:link w:val="SubttuloChar"/>
     <w:uiPriority w:val="11"/>
     <w:qFormat/>
-    <w:rsid w:val="0047292B"/>
+    <w:rsid w:val="004F6F0F"/>
     <w:pPr>
       <w:numPr>
         <w:ilvl w:val="1"/>
@@ -25023,7 +25049,7 @@
     <w:basedOn w:val="Fontepargpadro"/>
     <w:link w:val="Subttulo"/>
     <w:uiPriority w:val="11"/>
-    <w:rsid w:val="0047292B"/>
+    <w:rsid w:val="004F6F0F"/>
     <w:rPr>
       <w:rFonts w:eastAsiaTheme="majorEastAsia" w:cstheme="majorBidi"/>
       <w:color w:val="595959" w:themeColor="text1" w:themeTint="A6"/>
@@ -25039,7 +25065,7 @@
     <w:link w:val="CitaoChar"/>
     <w:uiPriority w:val="29"/>
     <w:qFormat/>
-    <w:rsid w:val="0047292B"/>
+    <w:rsid w:val="004F6F0F"/>
     <w:pPr>
       <w:spacing w:before="160"/>
       <w:jc w:val="center"/>
@@ -25055,7 +25081,7 @@
     <w:basedOn w:val="Fontepargpadro"/>
     <w:link w:val="Citao"/>
     <w:uiPriority w:val="29"/>
-    <w:rsid w:val="0047292B"/>
+    <w:rsid w:val="004F6F0F"/>
     <w:rPr>
       <w:i/>
       <w:iCs/>
@@ -25067,7 +25093,7 @@
     <w:basedOn w:val="Normal"/>
     <w:uiPriority w:val="34"/>
     <w:qFormat/>
-    <w:rsid w:val="0047292B"/>
+    <w:rsid w:val="004F6F0F"/>
     <w:pPr>
       <w:ind w:left="720"/>
       <w:contextualSpacing/>
@@ -25078,7 +25104,7 @@
     <w:basedOn w:val="Fontepargpadro"/>
     <w:uiPriority w:val="21"/>
     <w:qFormat/>
-    <w:rsid w:val="0047292B"/>
+    <w:rsid w:val="004F6F0F"/>
     <w:rPr>
       <w:i/>
       <w:iCs/>
@@ -25092,7 +25118,7 @@
     <w:link w:val="CitaoIntensaChar"/>
     <w:uiPriority w:val="30"/>
     <w:qFormat/>
-    <w:rsid w:val="0047292B"/>
+    <w:rsid w:val="004F6F0F"/>
     <w:pPr>
       <w:pBdr>
         <w:top w:val="single" w:sz="4" w:space="10" w:color="0F4761" w:themeColor="accent1" w:themeShade="BF"/>
@@ -25113,7 +25139,7 @@
     <w:basedOn w:val="Fontepargpadro"/>
     <w:link w:val="CitaoIntensa"/>
     <w:uiPriority w:val="30"/>
-    <w:rsid w:val="0047292B"/>
+    <w:rsid w:val="004F6F0F"/>
     <w:rPr>
       <w:i/>
       <w:iCs/>
@@ -25125,7 +25151,7 @@
     <w:basedOn w:val="Fontepargpadro"/>
     <w:uiPriority w:val="32"/>
     <w:qFormat/>
-    <w:rsid w:val="0047292B"/>
+    <w:rsid w:val="004F6F0F"/>
     <w:rPr>
       <w:b/>
       <w:bCs/>
@@ -25140,7 +25166,7 @@
     <w:link w:val="CabealhoChar"/>
     <w:uiPriority w:val="99"/>
     <w:unhideWhenUsed/>
-    <w:rsid w:val="0047292B"/>
+    <w:rsid w:val="004F6F0F"/>
     <w:pPr>
       <w:tabs>
         <w:tab w:val="center" w:pos="4252"/>
@@ -25154,7 +25180,7 @@
     <w:basedOn w:val="Fontepargpadro"/>
     <w:link w:val="Cabealho"/>
     <w:uiPriority w:val="99"/>
-    <w:rsid w:val="0047292B"/>
+    <w:rsid w:val="004F6F0F"/>
   </w:style>
   <w:style w:type="paragraph" w:styleId="Rodap">
     <w:name w:val="footer"/>
@@ -25162,7 +25188,7 @@
     <w:link w:val="RodapChar"/>
     <w:uiPriority w:val="99"/>
     <w:unhideWhenUsed/>
-    <w:rsid w:val="0047292B"/>
+    <w:rsid w:val="004F6F0F"/>
     <w:pPr>
       <w:tabs>
         <w:tab w:val="center" w:pos="4252"/>
@@ -25176,7 +25202,7 @@
     <w:basedOn w:val="Fontepargpadro"/>
     <w:link w:val="Rodap"/>
     <w:uiPriority w:val="99"/>
-    <w:rsid w:val="0047292B"/>
+    <w:rsid w:val="004F6F0F"/>
   </w:style>
   <w:style w:type="paragraph" w:styleId="Sumrio1">
     <w:name w:val="toc 1"/>
@@ -25185,7 +25211,7 @@
     <w:autoRedefine/>
     <w:uiPriority w:val="39"/>
     <w:unhideWhenUsed/>
-    <w:rsid w:val="0047292B"/>
+    <w:rsid w:val="004F6F0F"/>
     <w:pPr>
       <w:spacing w:after="100"/>
     </w:pPr>
@@ -25197,7 +25223,7 @@
     <w:autoRedefine/>
     <w:uiPriority w:val="39"/>
     <w:unhideWhenUsed/>
-    <w:rsid w:val="0047292B"/>
+    <w:rsid w:val="004F6F0F"/>
     <w:pPr>
       <w:spacing w:after="100"/>
       <w:ind w:left="240"/>

</xml_diff>

<commit_message>
Inclui link da Ficha do Projeto no e-mail de aviso de prazo
O e-mail automático de prazo (5 dias antes, 2 dias antes, no dia,
atrasado) passa a incluir um link direto para a Ficha do Projeto
correspondente, para abrir a saúde e o cronograma completo sem
precisar navegar manualmente até lá.

Testado em treino (link confirmado abrindo o projeto correto).
Manual de Uso atualizado (v2.79).

Co-Authored-By: Claude Sonnet 5 <noreply@anthropic.com>
</commit_message>
<xml_diff>
--- a/Manual de Uso - Ferramenta de Gestao de Projetos.docx
+++ b/Manual de Uso - Ferramenta de Gestao de Projetos.docx
@@ -229,7 +229,7 @@
         <w:rPr>
           <w:noProof/>
         </w:rPr>
-        <w:instrText xml:space="preserve"> PAGEREF _Toc240376161 \h </w:instrText>
+        <w:instrText xml:space="preserve"> PAGEREF _Toc240377136 \h </w:instrText>
       </w:r>
       <w:r>
         <w:rPr>
@@ -290,7 +290,7 @@
         <w:rPr>
           <w:noProof/>
         </w:rPr>
-        <w:instrText xml:space="preserve"> PAGEREF _Toc240376162 \h </w:instrText>
+        <w:instrText xml:space="preserve"> PAGEREF _Toc240377137 \h </w:instrText>
       </w:r>
       <w:r>
         <w:rPr>
@@ -351,7 +351,7 @@
         <w:rPr>
           <w:noProof/>
         </w:rPr>
-        <w:instrText xml:space="preserve"> PAGEREF _Toc240376163 \h </w:instrText>
+        <w:instrText xml:space="preserve"> PAGEREF _Toc240377138 \h </w:instrText>
       </w:r>
       <w:r>
         <w:rPr>
@@ -412,7 +412,7 @@
         <w:rPr>
           <w:noProof/>
         </w:rPr>
-        <w:instrText xml:space="preserve"> PAGEREF _Toc240376164 \h </w:instrText>
+        <w:instrText xml:space="preserve"> PAGEREF _Toc240377139 \h </w:instrText>
       </w:r>
       <w:r>
         <w:rPr>
@@ -473,7 +473,7 @@
         <w:rPr>
           <w:noProof/>
         </w:rPr>
-        <w:instrText xml:space="preserve"> PAGEREF _Toc240376165 \h </w:instrText>
+        <w:instrText xml:space="preserve"> PAGEREF _Toc240377140 \h </w:instrText>
       </w:r>
       <w:r>
         <w:rPr>
@@ -534,7 +534,7 @@
         <w:rPr>
           <w:noProof/>
         </w:rPr>
-        <w:instrText xml:space="preserve"> PAGEREF _Toc240376166 \h </w:instrText>
+        <w:instrText xml:space="preserve"> PAGEREF _Toc240377141 \h </w:instrText>
       </w:r>
       <w:r>
         <w:rPr>
@@ -551,7 +551,7 @@
         <w:rPr>
           <w:noProof/>
         </w:rPr>
-        <w:t>24</w:t>
+        <w:t>25</w:t>
       </w:r>
       <w:r>
         <w:rPr>
@@ -595,7 +595,7 @@
         <w:rPr>
           <w:noProof/>
         </w:rPr>
-        <w:instrText xml:space="preserve"> PAGEREF _Toc240376167 \h </w:instrText>
+        <w:instrText xml:space="preserve"> PAGEREF _Toc240377142 \h </w:instrText>
       </w:r>
       <w:r>
         <w:rPr>
@@ -612,7 +612,7 @@
         <w:rPr>
           <w:noProof/>
         </w:rPr>
-        <w:t>24</w:t>
+        <w:t>25</w:t>
       </w:r>
       <w:r>
         <w:rPr>
@@ -656,7 +656,7 @@
         <w:rPr>
           <w:noProof/>
         </w:rPr>
-        <w:instrText xml:space="preserve"> PAGEREF _Toc240376168 \h </w:instrText>
+        <w:instrText xml:space="preserve"> PAGEREF _Toc240377143 \h </w:instrText>
       </w:r>
       <w:r>
         <w:rPr>
@@ -673,7 +673,7 @@
         <w:rPr>
           <w:noProof/>
         </w:rPr>
-        <w:t>24</w:t>
+        <w:t>25</w:t>
       </w:r>
       <w:r>
         <w:rPr>
@@ -717,7 +717,7 @@
         <w:rPr>
           <w:noProof/>
         </w:rPr>
-        <w:instrText xml:space="preserve"> PAGEREF _Toc240376169 \h </w:instrText>
+        <w:instrText xml:space="preserve"> PAGEREF _Toc240377144 \h </w:instrText>
       </w:r>
       <w:r>
         <w:rPr>
@@ -734,7 +734,7 @@
         <w:rPr>
           <w:noProof/>
         </w:rPr>
-        <w:t>24</w:t>
+        <w:t>25</w:t>
       </w:r>
       <w:r>
         <w:rPr>
@@ -778,7 +778,7 @@
         <w:rPr>
           <w:noProof/>
         </w:rPr>
-        <w:instrText xml:space="preserve"> PAGEREF _Toc240376170 \h </w:instrText>
+        <w:instrText xml:space="preserve"> PAGEREF _Toc240377145 \h </w:instrText>
       </w:r>
       <w:r>
         <w:rPr>
@@ -795,7 +795,7 @@
         <w:rPr>
           <w:noProof/>
         </w:rPr>
-        <w:t>25</w:t>
+        <w:t>26</w:t>
       </w:r>
       <w:r>
         <w:rPr>
@@ -839,7 +839,7 @@
         <w:rPr>
           <w:noProof/>
         </w:rPr>
-        <w:instrText xml:space="preserve"> PAGEREF _Toc240376171 \h </w:instrText>
+        <w:instrText xml:space="preserve"> PAGEREF _Toc240377146 \h </w:instrText>
       </w:r>
       <w:r>
         <w:rPr>
@@ -856,7 +856,7 @@
         <w:rPr>
           <w:noProof/>
         </w:rPr>
-        <w:t>26</w:t>
+        <w:t>27</w:t>
       </w:r>
       <w:r>
         <w:rPr>
@@ -900,7 +900,7 @@
         <w:rPr>
           <w:noProof/>
         </w:rPr>
-        <w:instrText xml:space="preserve"> PAGEREF _Toc240376172 \h </w:instrText>
+        <w:instrText xml:space="preserve"> PAGEREF _Toc240377147 \h </w:instrText>
       </w:r>
       <w:r>
         <w:rPr>
@@ -917,7 +917,7 @@
         <w:rPr>
           <w:noProof/>
         </w:rPr>
-        <w:t>28</w:t>
+        <w:t>29</w:t>
       </w:r>
       <w:r>
         <w:rPr>
@@ -961,7 +961,7 @@
         <w:rPr>
           <w:noProof/>
         </w:rPr>
-        <w:instrText xml:space="preserve"> PAGEREF _Toc240376173 \h </w:instrText>
+        <w:instrText xml:space="preserve"> PAGEREF _Toc240377148 \h </w:instrText>
       </w:r>
       <w:r>
         <w:rPr>
@@ -978,7 +978,7 @@
         <w:rPr>
           <w:noProof/>
         </w:rPr>
-        <w:t>29</w:t>
+        <w:t>30</w:t>
       </w:r>
       <w:r>
         <w:rPr>
@@ -1022,7 +1022,7 @@
         <w:rPr>
           <w:noProof/>
         </w:rPr>
-        <w:instrText xml:space="preserve"> PAGEREF _Toc240376174 \h </w:instrText>
+        <w:instrText xml:space="preserve"> PAGEREF _Toc240377149 \h </w:instrText>
       </w:r>
       <w:r>
         <w:rPr>
@@ -1039,7 +1039,7 @@
         <w:rPr>
           <w:noProof/>
         </w:rPr>
-        <w:t>30</w:t>
+        <w:t>31</w:t>
       </w:r>
       <w:r>
         <w:rPr>
@@ -1083,7 +1083,7 @@
         <w:rPr>
           <w:noProof/>
         </w:rPr>
-        <w:instrText xml:space="preserve"> PAGEREF _Toc240376175 \h </w:instrText>
+        <w:instrText xml:space="preserve"> PAGEREF _Toc240377150 \h </w:instrText>
       </w:r>
       <w:r>
         <w:rPr>
@@ -1100,7 +1100,7 @@
         <w:rPr>
           <w:noProof/>
         </w:rPr>
-        <w:t>30</w:t>
+        <w:t>31</w:t>
       </w:r>
       <w:r>
         <w:rPr>
@@ -1144,7 +1144,7 @@
         <w:rPr>
           <w:noProof/>
         </w:rPr>
-        <w:instrText xml:space="preserve"> PAGEREF _Toc240376176 \h </w:instrText>
+        <w:instrText xml:space="preserve"> PAGEREF _Toc240377151 \h </w:instrText>
       </w:r>
       <w:r>
         <w:rPr>
@@ -1161,7 +1161,7 @@
         <w:rPr>
           <w:noProof/>
         </w:rPr>
-        <w:t>31</w:t>
+        <w:t>32</w:t>
       </w:r>
       <w:r>
         <w:rPr>
@@ -1205,7 +1205,7 @@
         <w:rPr>
           <w:noProof/>
         </w:rPr>
-        <w:instrText xml:space="preserve"> PAGEREF _Toc240376177 \h </w:instrText>
+        <w:instrText xml:space="preserve"> PAGEREF _Toc240377152 \h </w:instrText>
       </w:r>
       <w:r>
         <w:rPr>
@@ -1222,7 +1222,7 @@
         <w:rPr>
           <w:noProof/>
         </w:rPr>
-        <w:t>32</w:t>
+        <w:t>33</w:t>
       </w:r>
       <w:r>
         <w:rPr>
@@ -1266,7 +1266,7 @@
         <w:rPr>
           <w:noProof/>
         </w:rPr>
-        <w:instrText xml:space="preserve"> PAGEREF _Toc240376178 \h </w:instrText>
+        <w:instrText xml:space="preserve"> PAGEREF _Toc240377153 \h </w:instrText>
       </w:r>
       <w:r>
         <w:rPr>
@@ -1283,7 +1283,7 @@
         <w:rPr>
           <w:noProof/>
         </w:rPr>
-        <w:t>32</w:t>
+        <w:t>33</w:t>
       </w:r>
       <w:r>
         <w:rPr>
@@ -1327,7 +1327,7 @@
         <w:rPr>
           <w:noProof/>
         </w:rPr>
-        <w:instrText xml:space="preserve"> PAGEREF _Toc240376179 \h </w:instrText>
+        <w:instrText xml:space="preserve"> PAGEREF _Toc240377154 \h </w:instrText>
       </w:r>
       <w:r>
         <w:rPr>
@@ -1344,7 +1344,7 @@
         <w:rPr>
           <w:noProof/>
         </w:rPr>
-        <w:t>34</w:t>
+        <w:t>35</w:t>
       </w:r>
       <w:r>
         <w:rPr>
@@ -1388,7 +1388,7 @@
         <w:rPr>
           <w:noProof/>
         </w:rPr>
-        <w:instrText xml:space="preserve"> PAGEREF _Toc240376180 \h </w:instrText>
+        <w:instrText xml:space="preserve"> PAGEREF _Toc240377155 \h </w:instrText>
       </w:r>
       <w:r>
         <w:rPr>
@@ -1405,7 +1405,7 @@
         <w:rPr>
           <w:noProof/>
         </w:rPr>
-        <w:t>35</w:t>
+        <w:t>36</w:t>
       </w:r>
       <w:r>
         <w:rPr>
@@ -1449,7 +1449,7 @@
         <w:rPr>
           <w:noProof/>
         </w:rPr>
-        <w:instrText xml:space="preserve"> PAGEREF _Toc240376181 \h </w:instrText>
+        <w:instrText xml:space="preserve"> PAGEREF _Toc240377156 \h </w:instrText>
       </w:r>
       <w:r>
         <w:rPr>
@@ -1466,7 +1466,7 @@
         <w:rPr>
           <w:noProof/>
         </w:rPr>
-        <w:t>36</w:t>
+        <w:t>37</w:t>
       </w:r>
       <w:r>
         <w:rPr>
@@ -1510,7 +1510,7 @@
         <w:rPr>
           <w:noProof/>
         </w:rPr>
-        <w:instrText xml:space="preserve"> PAGEREF _Toc240376182 \h </w:instrText>
+        <w:instrText xml:space="preserve"> PAGEREF _Toc240377157 \h </w:instrText>
       </w:r>
       <w:r>
         <w:rPr>
@@ -1527,7 +1527,7 @@
         <w:rPr>
           <w:noProof/>
         </w:rPr>
-        <w:t>37</w:t>
+        <w:t>38</w:t>
       </w:r>
       <w:r>
         <w:rPr>
@@ -1571,7 +1571,7 @@
         <w:rPr>
           <w:noProof/>
         </w:rPr>
-        <w:instrText xml:space="preserve"> PAGEREF _Toc240376183 \h </w:instrText>
+        <w:instrText xml:space="preserve"> PAGEREF _Toc240377158 \h </w:instrText>
       </w:r>
       <w:r>
         <w:rPr>
@@ -1588,7 +1588,7 @@
         <w:rPr>
           <w:noProof/>
         </w:rPr>
-        <w:t>38</w:t>
+        <w:t>39</w:t>
       </w:r>
       <w:r>
         <w:rPr>
@@ -1632,7 +1632,7 @@
         <w:rPr>
           <w:noProof/>
         </w:rPr>
-        <w:instrText xml:space="preserve"> PAGEREF _Toc240376184 \h </w:instrText>
+        <w:instrText xml:space="preserve"> PAGEREF _Toc240377159 \h </w:instrText>
       </w:r>
       <w:r>
         <w:rPr>
@@ -1649,7 +1649,7 @@
         <w:rPr>
           <w:noProof/>
         </w:rPr>
-        <w:t>38</w:t>
+        <w:t>39</w:t>
       </w:r>
       <w:r>
         <w:rPr>
@@ -1693,7 +1693,7 @@
         <w:rPr>
           <w:noProof/>
         </w:rPr>
-        <w:instrText xml:space="preserve"> PAGEREF _Toc240376185 \h </w:instrText>
+        <w:instrText xml:space="preserve"> PAGEREF _Toc240377160 \h </w:instrText>
       </w:r>
       <w:r>
         <w:rPr>
@@ -1710,7 +1710,7 @@
         <w:rPr>
           <w:noProof/>
         </w:rPr>
-        <w:t>41</w:t>
+        <w:t>42</w:t>
       </w:r>
       <w:r>
         <w:rPr>
@@ -1754,7 +1754,7 @@
         <w:rPr>
           <w:noProof/>
         </w:rPr>
-        <w:instrText xml:space="preserve"> PAGEREF _Toc240376186 \h </w:instrText>
+        <w:instrText xml:space="preserve"> PAGEREF _Toc240377161 \h </w:instrText>
       </w:r>
       <w:r>
         <w:rPr>
@@ -1771,7 +1771,7 @@
         <w:rPr>
           <w:noProof/>
         </w:rPr>
-        <w:t>43</w:t>
+        <w:t>44</w:t>
       </w:r>
       <w:r>
         <w:rPr>
@@ -1816,7 +1816,7 @@
         <w:rPr>
           <w:noProof/>
         </w:rPr>
-        <w:instrText xml:space="preserve"> PAGEREF _Toc240376187 \h </w:instrText>
+        <w:instrText xml:space="preserve"> PAGEREF _Toc240377162 \h </w:instrText>
       </w:r>
       <w:r>
         <w:rPr>
@@ -1833,7 +1833,7 @@
         <w:rPr>
           <w:noProof/>
         </w:rPr>
-        <w:t>47</w:t>
+        <w:t>48</w:t>
       </w:r>
       <w:r>
         <w:rPr>
@@ -1877,7 +1877,7 @@
         <w:rPr>
           <w:noProof/>
         </w:rPr>
-        <w:instrText xml:space="preserve"> PAGEREF _Toc240376188 \h </w:instrText>
+        <w:instrText xml:space="preserve"> PAGEREF _Toc240377163 \h </w:instrText>
       </w:r>
       <w:r>
         <w:rPr>
@@ -1894,7 +1894,7 @@
         <w:rPr>
           <w:noProof/>
         </w:rPr>
-        <w:t>51</w:t>
+        <w:t>52</w:t>
       </w:r>
       <w:r>
         <w:rPr>
@@ -1938,7 +1938,7 @@
         <w:rPr>
           <w:noProof/>
         </w:rPr>
-        <w:instrText xml:space="preserve"> PAGEREF _Toc240376189 \h </w:instrText>
+        <w:instrText xml:space="preserve"> PAGEREF _Toc240377164 \h </w:instrText>
       </w:r>
       <w:r>
         <w:rPr>
@@ -1955,7 +1955,7 @@
         <w:rPr>
           <w:noProof/>
         </w:rPr>
-        <w:t>55</w:t>
+        <w:t>56</w:t>
       </w:r>
       <w:r>
         <w:rPr>
@@ -1999,7 +1999,7 @@
         <w:rPr>
           <w:noProof/>
         </w:rPr>
-        <w:instrText xml:space="preserve"> PAGEREF _Toc240376190 \h </w:instrText>
+        <w:instrText xml:space="preserve"> PAGEREF _Toc240377165 \h </w:instrText>
       </w:r>
       <w:r>
         <w:rPr>
@@ -2016,7 +2016,7 @@
         <w:rPr>
           <w:noProof/>
         </w:rPr>
-        <w:t>57</w:t>
+        <w:t>58</w:t>
       </w:r>
       <w:r>
         <w:rPr>
@@ -2060,7 +2060,7 @@
         <w:rPr>
           <w:noProof/>
         </w:rPr>
-        <w:instrText xml:space="preserve"> PAGEREF _Toc240376191 \h </w:instrText>
+        <w:instrText xml:space="preserve"> PAGEREF _Toc240377166 \h </w:instrText>
       </w:r>
       <w:r>
         <w:rPr>
@@ -2077,7 +2077,7 @@
         <w:rPr>
           <w:noProof/>
         </w:rPr>
-        <w:t>59</w:t>
+        <w:t>60</w:t>
       </w:r>
       <w:r>
         <w:rPr>
@@ -2121,7 +2121,7 @@
         <w:rPr>
           <w:noProof/>
         </w:rPr>
-        <w:instrText xml:space="preserve"> PAGEREF _Toc240376192 \h </w:instrText>
+        <w:instrText xml:space="preserve"> PAGEREF _Toc240377167 \h </w:instrText>
       </w:r>
       <w:r>
         <w:rPr>
@@ -2138,7 +2138,7 @@
         <w:rPr>
           <w:noProof/>
         </w:rPr>
-        <w:t>62</w:t>
+        <w:t>63</w:t>
       </w:r>
       <w:r>
         <w:rPr>
@@ -2182,7 +2182,7 @@
         <w:rPr>
           <w:noProof/>
         </w:rPr>
-        <w:instrText xml:space="preserve"> PAGEREF _Toc240376193 \h </w:instrText>
+        <w:instrText xml:space="preserve"> PAGEREF _Toc240377168 \h </w:instrText>
       </w:r>
       <w:r>
         <w:rPr>
@@ -2199,7 +2199,7 @@
         <w:rPr>
           <w:noProof/>
         </w:rPr>
-        <w:t>64</w:t>
+        <w:t>65</w:t>
       </w:r>
       <w:r>
         <w:rPr>
@@ -2243,7 +2243,7 @@
         <w:rPr>
           <w:noProof/>
         </w:rPr>
-        <w:instrText xml:space="preserve"> PAGEREF _Toc240376194 \h </w:instrText>
+        <w:instrText xml:space="preserve"> PAGEREF _Toc240377169 \h </w:instrText>
       </w:r>
       <w:r>
         <w:rPr>
@@ -2260,7 +2260,7 @@
         <w:rPr>
           <w:noProof/>
         </w:rPr>
-        <w:t>66</w:t>
+        <w:t>67</w:t>
       </w:r>
       <w:r>
         <w:rPr>
@@ -2304,7 +2304,7 @@
         <w:rPr>
           <w:noProof/>
         </w:rPr>
-        <w:instrText xml:space="preserve"> PAGEREF _Toc240376195 \h </w:instrText>
+        <w:instrText xml:space="preserve"> PAGEREF _Toc240377170 \h </w:instrText>
       </w:r>
       <w:r>
         <w:rPr>
@@ -2321,7 +2321,7 @@
         <w:rPr>
           <w:noProof/>
         </w:rPr>
-        <w:t>66</w:t>
+        <w:t>67</w:t>
       </w:r>
       <w:r>
         <w:rPr>
@@ -2365,7 +2365,7 @@
         <w:rPr>
           <w:noProof/>
         </w:rPr>
-        <w:instrText xml:space="preserve"> PAGEREF _Toc240376196 \h </w:instrText>
+        <w:instrText xml:space="preserve"> PAGEREF _Toc240377171 \h </w:instrText>
       </w:r>
       <w:r>
         <w:rPr>
@@ -2382,7 +2382,7 @@
         <w:rPr>
           <w:noProof/>
         </w:rPr>
-        <w:t>73</w:t>
+        <w:t>74</w:t>
       </w:r>
       <w:r>
         <w:rPr>
@@ -2426,7 +2426,7 @@
         <w:rPr>
           <w:noProof/>
         </w:rPr>
-        <w:instrText xml:space="preserve"> PAGEREF _Toc240376197 \h </w:instrText>
+        <w:instrText xml:space="preserve"> PAGEREF _Toc240377172 \h </w:instrText>
       </w:r>
       <w:r>
         <w:rPr>
@@ -2443,7 +2443,7 @@
         <w:rPr>
           <w:noProof/>
         </w:rPr>
-        <w:t>78</w:t>
+        <w:t>79</w:t>
       </w:r>
       <w:r>
         <w:rPr>
@@ -2487,7 +2487,7 @@
         <w:rPr>
           <w:noProof/>
         </w:rPr>
-        <w:instrText xml:space="preserve"> PAGEREF _Toc240376198 \h </w:instrText>
+        <w:instrText xml:space="preserve"> PAGEREF _Toc240377173 \h </w:instrText>
       </w:r>
       <w:r>
         <w:rPr>
@@ -2504,7 +2504,7 @@
         <w:rPr>
           <w:noProof/>
         </w:rPr>
-        <w:t>78</w:t>
+        <w:t>79</w:t>
       </w:r>
       <w:r>
         <w:rPr>
@@ -2548,7 +2548,7 @@
         <w:rPr>
           <w:noProof/>
         </w:rPr>
-        <w:instrText xml:space="preserve"> PAGEREF _Toc240376199 \h </w:instrText>
+        <w:instrText xml:space="preserve"> PAGEREF _Toc240377174 \h </w:instrText>
       </w:r>
       <w:r>
         <w:rPr>
@@ -2565,7 +2565,7 @@
         <w:rPr>
           <w:noProof/>
         </w:rPr>
-        <w:t>79</w:t>
+        <w:t>80</w:t>
       </w:r>
       <w:r>
         <w:rPr>
@@ -2609,7 +2609,7 @@
         <w:rPr>
           <w:noProof/>
         </w:rPr>
-        <w:instrText xml:space="preserve"> PAGEREF _Toc240376200 \h </w:instrText>
+        <w:instrText xml:space="preserve"> PAGEREF _Toc240377175 \h </w:instrText>
       </w:r>
       <w:r>
         <w:rPr>
@@ -2626,7 +2626,7 @@
         <w:rPr>
           <w:noProof/>
         </w:rPr>
-        <w:t>79</w:t>
+        <w:t>80</w:t>
       </w:r>
       <w:r>
         <w:rPr>
@@ -2670,7 +2670,7 @@
         <w:rPr>
           <w:noProof/>
         </w:rPr>
-        <w:instrText xml:space="preserve"> PAGEREF _Toc240376201 \h </w:instrText>
+        <w:instrText xml:space="preserve"> PAGEREF _Toc240377176 \h </w:instrText>
       </w:r>
       <w:r>
         <w:rPr>
@@ -2687,7 +2687,7 @@
         <w:rPr>
           <w:noProof/>
         </w:rPr>
-        <w:t>82</w:t>
+        <w:t>83</w:t>
       </w:r>
       <w:r>
         <w:rPr>
@@ -2731,7 +2731,7 @@
         <w:rPr>
           <w:noProof/>
         </w:rPr>
-        <w:instrText xml:space="preserve"> PAGEREF _Toc240376202 \h </w:instrText>
+        <w:instrText xml:space="preserve"> PAGEREF _Toc240377177 \h </w:instrText>
       </w:r>
       <w:r>
         <w:rPr>
@@ -2748,7 +2748,7 @@
         <w:rPr>
           <w:noProof/>
         </w:rPr>
-        <w:t>82</w:t>
+        <w:t>83</w:t>
       </w:r>
       <w:r>
         <w:rPr>
@@ -2792,7 +2792,7 @@
         <w:rPr>
           <w:noProof/>
         </w:rPr>
-        <w:instrText xml:space="preserve"> PAGEREF _Toc240376203 \h </w:instrText>
+        <w:instrText xml:space="preserve"> PAGEREF _Toc240377178 \h </w:instrText>
       </w:r>
       <w:r>
         <w:rPr>
@@ -2809,7 +2809,7 @@
         <w:rPr>
           <w:noProof/>
         </w:rPr>
-        <w:t>84</w:t>
+        <w:t>85</w:t>
       </w:r>
       <w:r>
         <w:rPr>
@@ -2853,7 +2853,7 @@
         <w:rPr>
           <w:noProof/>
         </w:rPr>
-        <w:instrText xml:space="preserve"> PAGEREF _Toc240376204 \h </w:instrText>
+        <w:instrText xml:space="preserve"> PAGEREF _Toc240377179 \h </w:instrText>
       </w:r>
       <w:r>
         <w:rPr>
@@ -2870,7 +2870,7 @@
         <w:rPr>
           <w:noProof/>
         </w:rPr>
-        <w:t>85</w:t>
+        <w:t>86</w:t>
       </w:r>
       <w:r>
         <w:rPr>
@@ -2914,7 +2914,7 @@
         <w:rPr>
           <w:noProof/>
         </w:rPr>
-        <w:instrText xml:space="preserve"> PAGEREF _Toc240376205 \h </w:instrText>
+        <w:instrText xml:space="preserve"> PAGEREF _Toc240377180 \h </w:instrText>
       </w:r>
       <w:r>
         <w:rPr>
@@ -2931,7 +2931,7 @@
         <w:rPr>
           <w:noProof/>
         </w:rPr>
-        <w:t>87</w:t>
+        <w:t>88</w:t>
       </w:r>
       <w:r>
         <w:rPr>
@@ -2975,7 +2975,7 @@
         <w:rPr>
           <w:noProof/>
         </w:rPr>
-        <w:instrText xml:space="preserve"> PAGEREF _Toc240376206 \h </w:instrText>
+        <w:instrText xml:space="preserve"> PAGEREF _Toc240377181 \h </w:instrText>
       </w:r>
       <w:r>
         <w:rPr>
@@ -2992,7 +2992,7 @@
         <w:rPr>
           <w:noProof/>
         </w:rPr>
-        <w:t>90</w:t>
+        <w:t>91</w:t>
       </w:r>
       <w:r>
         <w:rPr>
@@ -3036,7 +3036,7 @@
         <w:rPr>
           <w:noProof/>
         </w:rPr>
-        <w:instrText xml:space="preserve"> PAGEREF _Toc240376207 \h </w:instrText>
+        <w:instrText xml:space="preserve"> PAGEREF _Toc240377182 \h </w:instrText>
       </w:r>
       <w:r>
         <w:rPr>
@@ -3053,7 +3053,7 @@
         <w:rPr>
           <w:noProof/>
         </w:rPr>
-        <w:t>93</w:t>
+        <w:t>94</w:t>
       </w:r>
       <w:r>
         <w:rPr>
@@ -3097,7 +3097,7 @@
         <w:rPr>
           <w:noProof/>
         </w:rPr>
-        <w:instrText xml:space="preserve"> PAGEREF _Toc240376208 \h </w:instrText>
+        <w:instrText xml:space="preserve"> PAGEREF _Toc240377183 \h </w:instrText>
       </w:r>
       <w:r>
         <w:rPr>
@@ -3114,7 +3114,7 @@
         <w:rPr>
           <w:noProof/>
         </w:rPr>
-        <w:t>94</w:t>
+        <w:t>95</w:t>
       </w:r>
       <w:r>
         <w:rPr>
@@ -3158,7 +3158,7 @@
         <w:rPr>
           <w:noProof/>
         </w:rPr>
-        <w:instrText xml:space="preserve"> PAGEREF _Toc240376209 \h </w:instrText>
+        <w:instrText xml:space="preserve"> PAGEREF _Toc240377184 \h </w:instrText>
       </w:r>
       <w:r>
         <w:rPr>
@@ -3175,7 +3175,7 @@
         <w:rPr>
           <w:noProof/>
         </w:rPr>
-        <w:t>94</w:t>
+        <w:t>95</w:t>
       </w:r>
       <w:r>
         <w:rPr>
@@ -3219,7 +3219,7 @@
         <w:rPr>
           <w:noProof/>
         </w:rPr>
-        <w:instrText xml:space="preserve"> PAGEREF _Toc240376210 \h </w:instrText>
+        <w:instrText xml:space="preserve"> PAGEREF _Toc240377185 \h </w:instrText>
       </w:r>
       <w:r>
         <w:rPr>
@@ -3236,7 +3236,7 @@
         <w:rPr>
           <w:noProof/>
         </w:rPr>
-        <w:t>95</w:t>
+        <w:t>96</w:t>
       </w:r>
       <w:r>
         <w:rPr>
@@ -3280,7 +3280,7 @@
         <w:rPr>
           <w:noProof/>
         </w:rPr>
-        <w:instrText xml:space="preserve"> PAGEREF _Toc240376211 \h </w:instrText>
+        <w:instrText xml:space="preserve"> PAGEREF _Toc240377186 \h </w:instrText>
       </w:r>
       <w:r>
         <w:rPr>
@@ -3297,7 +3297,7 @@
         <w:rPr>
           <w:noProof/>
         </w:rPr>
-        <w:t>96</w:t>
+        <w:t>97</w:t>
       </w:r>
       <w:r>
         <w:rPr>
@@ -3341,7 +3341,7 @@
         <w:rPr>
           <w:noProof/>
         </w:rPr>
-        <w:instrText xml:space="preserve"> PAGEREF _Toc240376212 \h </w:instrText>
+        <w:instrText xml:space="preserve"> PAGEREF _Toc240377187 \h </w:instrText>
       </w:r>
       <w:r>
         <w:rPr>
@@ -3358,7 +3358,7 @@
         <w:rPr>
           <w:noProof/>
         </w:rPr>
-        <w:t>100</w:t>
+        <w:t>101</w:t>
       </w:r>
       <w:r>
         <w:rPr>
@@ -3402,7 +3402,7 @@
         <w:rPr>
           <w:noProof/>
         </w:rPr>
-        <w:instrText xml:space="preserve"> PAGEREF _Toc240376213 \h </w:instrText>
+        <w:instrText xml:space="preserve"> PAGEREF _Toc240377188 \h </w:instrText>
       </w:r>
       <w:r>
         <w:rPr>
@@ -3419,7 +3419,7 @@
         <w:rPr>
           <w:noProof/>
         </w:rPr>
-        <w:t>101</w:t>
+        <w:t>102</w:t>
       </w:r>
       <w:r>
         <w:rPr>
@@ -3479,7 +3479,7 @@
           <w:sz w:val="34"/>
         </w:rPr>
       </w:pPr>
-      <w:bookmarkStart w:id="0" w:name="_Toc240376161"/>
+      <w:bookmarkStart w:id="0" w:name="_Toc240377136"/>
       <w:r>
         <w:rPr>
           <w:rFonts w:ascii="Montserrat" w:hAnsi="Montserrat"/>
@@ -3503,7 +3503,7 @@
           <w:sz w:val="27"/>
         </w:rPr>
       </w:pPr>
-      <w:bookmarkStart w:id="1" w:name="_Toc240376162"/>
+      <w:bookmarkStart w:id="1" w:name="_Toc240377137"/>
       <w:r>
         <w:rPr>
           <w:rFonts w:ascii="Montserrat" w:hAnsi="Montserrat"/>
@@ -5079,6 +5079,24 @@
           <w:color w:val="1A1A1A"/>
           <w:sz w:val="22"/>
         </w:rPr>
+        <w:t>Esta e a versao 2.79 do manual. Em relacao a versao 2.78 (15/09/2026), o e-mail de aviso automatico de prazo (secao 6.4.3) passou a incluir um link direto para a Ficha do Projeto do projeto correspondente.</w:t>
+      </w:r>
+    </w:p>
+    <w:p>
+      <w:pPr>
+        <w:spacing w:line="280" w:lineRule="auto"/>
+        <w:rPr>
+          <w:rFonts w:ascii="Montserrat" w:hAnsi="Montserrat"/>
+          <w:color w:val="1A1A1A"/>
+          <w:sz w:val="22"/>
+        </w:rPr>
+      </w:pPr>
+      <w:r>
+        <w:rPr>
+          <w:rFonts w:ascii="Montserrat" w:hAnsi="Montserrat"/>
+          <w:color w:val="1A1A1A"/>
+          <w:sz w:val="22"/>
+        </w:rPr>
         <w:t>O manual nao substitui as Diretrizes para a Gestao de Projetos da UNIALFA (documento institucional que define o framework D01 a D07) nem o documento Regras de Acesso e Permissoes (que detalha cada regra de controle de acesso); ele e o guia operacional de como usar cada ferramenta na pratica.</w:t>
       </w:r>
     </w:p>
@@ -5093,7 +5111,7 @@
           <w:sz w:val="27"/>
         </w:rPr>
       </w:pPr>
-      <w:bookmarkStart w:id="2" w:name="_Toc240376163"/>
+      <w:bookmarkStart w:id="2" w:name="_Toc240377138"/>
       <w:r>
         <w:rPr>
           <w:rFonts w:ascii="Montserrat" w:hAnsi="Montserrat"/>
@@ -5144,6 +5162,7 @@
           <w:color w:val="1A1A1A"/>
           <w:sz w:val="22"/>
         </w:rPr>
+        <w:lastRenderedPageBreak/>
         <w:t>12 formularios de registro (codigo FORALF), cada um correspondendo a um artefato institucional - da Solicitacao de Demanda ao Relatorio de Entregas e Beneficios.</w:t>
       </w:r>
     </w:p>
@@ -5168,7 +5187,6 @@
           <w:color w:val="1A1A1A"/>
           <w:sz w:val="22"/>
         </w:rPr>
-        <w:lastRenderedPageBreak/>
         <w:t>1 ferramenta de apoio a decisao, o Validador de Projetos, que nao gera registros de artefato mas ajuda a avaliar projetos.</w:t>
       </w:r>
     </w:p>
@@ -5289,17 +5307,18 @@
         <w:rPr>
           <w:noProof/>
         </w:rPr>
+        <w:lastRenderedPageBreak/>
         <w:drawing>
-          <wp:inline distT="0" distB="0" distL="0" distR="0" wp14:anchorId="2381FEC7" wp14:editId="11E0BA83">
+          <wp:inline distT="0" distB="0" distL="0" distR="0" wp14:anchorId="62DE003D" wp14:editId="4E90910E">
             <wp:extent cx="5303520" cy="4792851"/>
             <wp:effectExtent l="19050" t="19050" r="11430" b="27305"/>
-            <wp:docPr id="1456791694" name="Imagem 1"/>
+            <wp:docPr id="356949655" name="Imagem 1"/>
             <wp:cNvGraphicFramePr/>
             <a:graphic xmlns:a="http://schemas.openxmlformats.org/drawingml/2006/main">
               <a:graphicData uri="http://schemas.openxmlformats.org/drawingml/2006/picture">
                 <pic:pic xmlns:pic="http://schemas.openxmlformats.org/drawingml/2006/picture">
                   <pic:nvPicPr>
-                    <pic:cNvPr id="1456791694" name=""/>
+                    <pic:cNvPr id="356949655" name=""/>
                     <pic:cNvPicPr/>
                   </pic:nvPicPr>
                   <pic:blipFill>
@@ -5353,7 +5372,6 @@
           <w:color w:val="6A6A70"/>
           <w:sz w:val="19"/>
         </w:rPr>
-        <w:lastRenderedPageBreak/>
         <w:t>Mapa de diretrizes - pagina inicial. Nao exige login.</w:t>
       </w:r>
     </w:p>
@@ -5368,7 +5386,7 @@
           <w:sz w:val="27"/>
         </w:rPr>
       </w:pPr>
-      <w:bookmarkStart w:id="3" w:name="_Toc240376164"/>
+      <w:bookmarkStart w:id="3" w:name="_Toc240377139"/>
       <w:r>
         <w:rPr>
           <w:rFonts w:ascii="Montserrat" w:hAnsi="Montserrat"/>
@@ -5407,17 +5425,18 @@
         <w:rPr>
           <w:noProof/>
         </w:rPr>
+        <w:lastRenderedPageBreak/>
         <w:drawing>
-          <wp:inline distT="0" distB="0" distL="0" distR="0" wp14:anchorId="1A5D93C8" wp14:editId="15844D9B">
+          <wp:inline distT="0" distB="0" distL="0" distR="0" wp14:anchorId="3DAB516A" wp14:editId="3BC79EF9">
             <wp:extent cx="4206240" cy="3801227"/>
             <wp:effectExtent l="19050" t="19050" r="22860" b="27940"/>
-            <wp:docPr id="1552752672" name="Imagem 2"/>
+            <wp:docPr id="1757678584" name="Imagem 2"/>
             <wp:cNvGraphicFramePr/>
             <a:graphic xmlns:a="http://schemas.openxmlformats.org/drawingml/2006/main">
               <a:graphicData uri="http://schemas.openxmlformats.org/drawingml/2006/picture">
                 <pic:pic xmlns:pic="http://schemas.openxmlformats.org/drawingml/2006/picture">
                   <pic:nvPicPr>
-                    <pic:cNvPr id="1552752672" name=""/>
+                    <pic:cNvPr id="1757678584" name=""/>
                     <pic:cNvPicPr/>
                   </pic:nvPicPr>
                   <pic:blipFill>
@@ -5590,7 +5609,7 @@
           <w:sz w:val="27"/>
         </w:rPr>
       </w:pPr>
-      <w:bookmarkStart w:id="4" w:name="_Toc240376165"/>
+      <w:bookmarkStart w:id="4" w:name="_Toc240377140"/>
       <w:r>
         <w:rPr>
           <w:rFonts w:ascii="Montserrat" w:hAnsi="Montserrat"/>
@@ -5598,7 +5617,6 @@
           <w:color w:val="B91D2E"/>
           <w:sz w:val="27"/>
         </w:rPr>
-        <w:lastRenderedPageBreak/>
         <w:t>1.4 Como a ferramenta se relaciona com as Diretrizes (D01-D07)</w:t>
       </w:r>
       <w:bookmarkEnd w:id="4"/>
@@ -5673,6 +5691,7 @@
                 <w:color w:val="FFFFFF"/>
                 <w:sz w:val="19"/>
               </w:rPr>
+              <w:lastRenderedPageBreak/>
               <w:t>Passo</w:t>
             </w:r>
           </w:p>
@@ -6829,7 +6848,7 @@
           <w:sz w:val="34"/>
         </w:rPr>
       </w:pPr>
-      <w:bookmarkStart w:id="5" w:name="_Toc240376166"/>
+      <w:bookmarkStart w:id="5" w:name="_Toc240377141"/>
       <w:r>
         <w:rPr>
           <w:rFonts w:ascii="Montserrat" w:hAnsi="Montserrat"/>
@@ -6853,7 +6872,7 @@
           <w:sz w:val="27"/>
         </w:rPr>
       </w:pPr>
-      <w:bookmarkStart w:id="6" w:name="_Toc240376167"/>
+      <w:bookmarkStart w:id="6" w:name="_Toc240377142"/>
       <w:r>
         <w:rPr>
           <w:rFonts w:ascii="Montserrat" w:hAnsi="Montserrat"/>
@@ -6894,7 +6913,7 @@
           <w:sz w:val="27"/>
         </w:rPr>
       </w:pPr>
-      <w:bookmarkStart w:id="7" w:name="_Toc240376168"/>
+      <w:bookmarkStart w:id="7" w:name="_Toc240377143"/>
       <w:r>
         <w:rPr>
           <w:rFonts w:ascii="Montserrat" w:hAnsi="Montserrat"/>
@@ -7013,7 +7032,7 @@
           <w:sz w:val="27"/>
         </w:rPr>
       </w:pPr>
-      <w:bookmarkStart w:id="8" w:name="_Toc240376169"/>
+      <w:bookmarkStart w:id="8" w:name="_Toc240377144"/>
       <w:r>
         <w:rPr>
           <w:rFonts w:ascii="Montserrat" w:hAnsi="Montserrat"/>
@@ -7626,7 +7645,7 @@
           <w:sz w:val="27"/>
         </w:rPr>
       </w:pPr>
-      <w:bookmarkStart w:id="9" w:name="_Toc240376170"/>
+      <w:bookmarkStart w:id="9" w:name="_Toc240377145"/>
       <w:r>
         <w:rPr>
           <w:rFonts w:ascii="Montserrat" w:hAnsi="Montserrat"/>
@@ -7715,16 +7734,16 @@
         </w:rPr>
         <w:lastRenderedPageBreak/>
         <w:drawing>
-          <wp:inline distT="0" distB="0" distL="0" distR="0" wp14:anchorId="00E2FFA6" wp14:editId="5F2AF763">
+          <wp:inline distT="0" distB="0" distL="0" distR="0" wp14:anchorId="670CB617" wp14:editId="112453A0">
             <wp:extent cx="4937760" cy="4462310"/>
             <wp:effectExtent l="19050" t="19050" r="15240" b="14605"/>
-            <wp:docPr id="164054137" name="Imagem 3"/>
+            <wp:docPr id="576097588" name="Imagem 3"/>
             <wp:cNvGraphicFramePr/>
             <a:graphic xmlns:a="http://schemas.openxmlformats.org/drawingml/2006/main">
               <a:graphicData uri="http://schemas.openxmlformats.org/drawingml/2006/picture">
                 <pic:pic xmlns:pic="http://schemas.openxmlformats.org/drawingml/2006/picture">
                   <pic:nvPicPr>
-                    <pic:cNvPr id="164054137" name=""/>
+                    <pic:cNvPr id="576097588" name=""/>
                     <pic:cNvPicPr/>
                   </pic:nvPicPr>
                   <pic:blipFill>
@@ -7792,7 +7811,7 @@
           <w:sz w:val="27"/>
         </w:rPr>
       </w:pPr>
-      <w:bookmarkStart w:id="10" w:name="_Toc240376171"/>
+      <w:bookmarkStart w:id="10" w:name="_Toc240377146"/>
       <w:r>
         <w:rPr>
           <w:rFonts w:ascii="Montserrat" w:hAnsi="Montserrat"/>
@@ -7833,16 +7852,16 @@
         </w:rPr>
         <w:lastRenderedPageBreak/>
         <w:drawing>
-          <wp:inline distT="0" distB="0" distL="0" distR="0" wp14:anchorId="798199D6" wp14:editId="4C3FA460">
+          <wp:inline distT="0" distB="0" distL="0" distR="0" wp14:anchorId="28950419" wp14:editId="5F7FE555">
             <wp:extent cx="5120640" cy="4627581"/>
             <wp:effectExtent l="19050" t="19050" r="22860" b="20955"/>
-            <wp:docPr id="553386357" name="Imagem 4"/>
+            <wp:docPr id="1057969520" name="Imagem 4"/>
             <wp:cNvGraphicFramePr/>
             <a:graphic xmlns:a="http://schemas.openxmlformats.org/drawingml/2006/main">
               <a:graphicData uri="http://schemas.openxmlformats.org/drawingml/2006/picture">
                 <pic:pic xmlns:pic="http://schemas.openxmlformats.org/drawingml/2006/picture">
                   <pic:nvPicPr>
-                    <pic:cNvPr id="553386357" name=""/>
+                    <pic:cNvPr id="1057969520" name=""/>
                     <pic:cNvPicPr/>
                   </pic:nvPicPr>
                   <pic:blipFill>
@@ -8025,7 +8044,7 @@
           <w:sz w:val="27"/>
         </w:rPr>
       </w:pPr>
-      <w:bookmarkStart w:id="11" w:name="_Toc240376172"/>
+      <w:bookmarkStart w:id="11" w:name="_Toc240377147"/>
       <w:r>
         <w:rPr>
           <w:rFonts w:ascii="Montserrat" w:hAnsi="Montserrat"/>
@@ -8065,16 +8084,16 @@
           <w:noProof/>
         </w:rPr>
         <w:drawing>
-          <wp:inline distT="0" distB="0" distL="0" distR="0" wp14:anchorId="408ED4B0" wp14:editId="62814D6E">
+          <wp:inline distT="0" distB="0" distL="0" distR="0" wp14:anchorId="0D12F631" wp14:editId="04D35DF1">
             <wp:extent cx="4206240" cy="3801227"/>
             <wp:effectExtent l="19050" t="19050" r="22860" b="27940"/>
-            <wp:docPr id="502162131" name="Imagem 5"/>
+            <wp:docPr id="1747421911" name="Imagem 5"/>
             <wp:cNvGraphicFramePr/>
             <a:graphic xmlns:a="http://schemas.openxmlformats.org/drawingml/2006/main">
               <a:graphicData uri="http://schemas.openxmlformats.org/drawingml/2006/picture">
                 <pic:pic xmlns:pic="http://schemas.openxmlformats.org/drawingml/2006/picture">
                   <pic:nvPicPr>
-                    <pic:cNvPr id="502162131" name=""/>
+                    <pic:cNvPr id="1747421911" name=""/>
                     <pic:cNvPicPr/>
                   </pic:nvPicPr>
                   <pic:blipFill>
@@ -8142,16 +8161,16 @@
         </w:rPr>
         <w:lastRenderedPageBreak/>
         <w:drawing>
-          <wp:inline distT="0" distB="0" distL="0" distR="0" wp14:anchorId="06318A0B" wp14:editId="76DB9F75">
+          <wp:inline distT="0" distB="0" distL="0" distR="0" wp14:anchorId="71438432" wp14:editId="59AAB44A">
             <wp:extent cx="4206240" cy="3801227"/>
             <wp:effectExtent l="19050" t="19050" r="22860" b="27940"/>
-            <wp:docPr id="452235340" name="Imagem 6"/>
+            <wp:docPr id="1142659049" name="Imagem 6"/>
             <wp:cNvGraphicFramePr/>
             <a:graphic xmlns:a="http://schemas.openxmlformats.org/drawingml/2006/main">
               <a:graphicData uri="http://schemas.openxmlformats.org/drawingml/2006/picture">
                 <pic:pic xmlns:pic="http://schemas.openxmlformats.org/drawingml/2006/picture">
                   <pic:nvPicPr>
-                    <pic:cNvPr id="452235340" name=""/>
+                    <pic:cNvPr id="1142659049" name=""/>
                     <pic:cNvPicPr/>
                   </pic:nvPicPr>
                   <pic:blipFill>
@@ -8267,7 +8286,7 @@
           <w:sz w:val="27"/>
         </w:rPr>
       </w:pPr>
-      <w:bookmarkStart w:id="12" w:name="_Toc240376173"/>
+      <w:bookmarkStart w:id="12" w:name="_Toc240377148"/>
       <w:r>
         <w:rPr>
           <w:rFonts w:ascii="Montserrat" w:hAnsi="Montserrat"/>
@@ -8335,7 +8354,7 @@
           <w:sz w:val="27"/>
         </w:rPr>
       </w:pPr>
-      <w:bookmarkStart w:id="13" w:name="_Toc240376174"/>
+      <w:bookmarkStart w:id="13" w:name="_Toc240377149"/>
       <w:r>
         <w:rPr>
           <w:rFonts w:ascii="Montserrat" w:hAnsi="Montserrat"/>
@@ -8562,7 +8581,7 @@
           <w:sz w:val="27"/>
         </w:rPr>
       </w:pPr>
-      <w:bookmarkStart w:id="14" w:name="_Toc240376175"/>
+      <w:bookmarkStart w:id="14" w:name="_Toc240377150"/>
       <w:r>
         <w:rPr>
           <w:rFonts w:ascii="Montserrat" w:hAnsi="Montserrat"/>
@@ -8721,7 +8740,7 @@
           <w:sz w:val="27"/>
         </w:rPr>
       </w:pPr>
-      <w:bookmarkStart w:id="15" w:name="_Toc240376176"/>
+      <w:bookmarkStart w:id="15" w:name="_Toc240377151"/>
       <w:r>
         <w:rPr>
           <w:rFonts w:ascii="Montserrat" w:hAnsi="Montserrat"/>
@@ -8913,7 +8932,7 @@
           <w:sz w:val="27"/>
         </w:rPr>
       </w:pPr>
-      <w:bookmarkStart w:id="16" w:name="_Toc240376177"/>
+      <w:bookmarkStart w:id="16" w:name="_Toc240377152"/>
       <w:r>
         <w:rPr>
           <w:rFonts w:ascii="Montserrat" w:hAnsi="Montserrat"/>
@@ -9041,7 +9060,7 @@
           <w:sz w:val="27"/>
         </w:rPr>
       </w:pPr>
-      <w:bookmarkStart w:id="17" w:name="_Toc240376178"/>
+      <w:bookmarkStart w:id="17" w:name="_Toc240377153"/>
       <w:r>
         <w:rPr>
           <w:rFonts w:ascii="Montserrat" w:hAnsi="Montserrat"/>
@@ -9371,7 +9390,7 @@
           <w:sz w:val="27"/>
         </w:rPr>
       </w:pPr>
-      <w:bookmarkStart w:id="18" w:name="_Toc240376179"/>
+      <w:bookmarkStart w:id="18" w:name="_Toc240377154"/>
       <w:r>
         <w:rPr>
           <w:rFonts w:ascii="Montserrat" w:hAnsi="Montserrat"/>
@@ -9508,7 +9527,7 @@
           <w:sz w:val="27"/>
         </w:rPr>
       </w:pPr>
-      <w:bookmarkStart w:id="19" w:name="_Toc240376180"/>
+      <w:bookmarkStart w:id="19" w:name="_Toc240377155"/>
       <w:r>
         <w:rPr>
           <w:rFonts w:ascii="Montserrat" w:hAnsi="Montserrat"/>
@@ -9787,7 +9806,7 @@
           <w:sz w:val="27"/>
         </w:rPr>
       </w:pPr>
-      <w:bookmarkStart w:id="20" w:name="_Toc240376181"/>
+      <w:bookmarkStart w:id="20" w:name="_Toc240377156"/>
       <w:r>
         <w:rPr>
           <w:rFonts w:ascii="Montserrat" w:hAnsi="Montserrat"/>
@@ -9964,7 +9983,7 @@
           <w:sz w:val="27"/>
         </w:rPr>
       </w:pPr>
-      <w:bookmarkStart w:id="21" w:name="_Toc240376182"/>
+      <w:bookmarkStart w:id="21" w:name="_Toc240377157"/>
       <w:r>
         <w:rPr>
           <w:rFonts w:ascii="Montserrat" w:hAnsi="Montserrat"/>
@@ -10078,7 +10097,7 @@
           <w:sz w:val="34"/>
         </w:rPr>
       </w:pPr>
-      <w:bookmarkStart w:id="22" w:name="_Toc240376183"/>
+      <w:bookmarkStart w:id="22" w:name="_Toc240377158"/>
       <w:r>
         <w:rPr>
           <w:rFonts w:ascii="Montserrat" w:hAnsi="Montserrat"/>
@@ -10120,7 +10139,7 @@
           <w:sz w:val="27"/>
         </w:rPr>
       </w:pPr>
-      <w:bookmarkStart w:id="23" w:name="_Toc240376184"/>
+      <w:bookmarkStart w:id="23" w:name="_Toc240377159"/>
       <w:r>
         <w:rPr>
           <w:rFonts w:ascii="Montserrat" w:hAnsi="Montserrat"/>
@@ -11200,16 +11219,16 @@
         </w:rPr>
         <w:lastRenderedPageBreak/>
         <w:drawing>
-          <wp:inline distT="0" distB="0" distL="0" distR="0" wp14:anchorId="600EFA12" wp14:editId="6B185A0A">
+          <wp:inline distT="0" distB="0" distL="0" distR="0" wp14:anchorId="2A2B6CBA" wp14:editId="09E0A330">
             <wp:extent cx="5120640" cy="4627581"/>
             <wp:effectExtent l="19050" t="19050" r="22860" b="20955"/>
-            <wp:docPr id="2097344205" name="Imagem 7"/>
+            <wp:docPr id="1202940125" name="Imagem 7"/>
             <wp:cNvGraphicFramePr/>
             <a:graphic xmlns:a="http://schemas.openxmlformats.org/drawingml/2006/main">
               <a:graphicData uri="http://schemas.openxmlformats.org/drawingml/2006/picture">
                 <pic:pic xmlns:pic="http://schemas.openxmlformats.org/drawingml/2006/picture">
                   <pic:nvPicPr>
-                    <pic:cNvPr id="2097344205" name=""/>
+                    <pic:cNvPr id="1202940125" name=""/>
                     <pic:cNvPicPr/>
                   </pic:nvPicPr>
                   <pic:blipFill>
@@ -11277,16 +11296,16 @@
         </w:rPr>
         <w:lastRenderedPageBreak/>
         <w:drawing>
-          <wp:inline distT="0" distB="0" distL="0" distR="0" wp14:anchorId="7E638212" wp14:editId="74CB3582">
+          <wp:inline distT="0" distB="0" distL="0" distR="0" wp14:anchorId="614910AF" wp14:editId="576AEFB6">
             <wp:extent cx="5120640" cy="4627581"/>
             <wp:effectExtent l="19050" t="19050" r="22860" b="20955"/>
-            <wp:docPr id="616215625" name="Imagem 8"/>
+            <wp:docPr id="214317729" name="Imagem 8"/>
             <wp:cNvGraphicFramePr/>
             <a:graphic xmlns:a="http://schemas.openxmlformats.org/drawingml/2006/main">
               <a:graphicData uri="http://schemas.openxmlformats.org/drawingml/2006/picture">
                 <pic:pic xmlns:pic="http://schemas.openxmlformats.org/drawingml/2006/picture">
                   <pic:nvPicPr>
-                    <pic:cNvPr id="616215625" name=""/>
+                    <pic:cNvPr id="214317729" name=""/>
                     <pic:cNvPicPr/>
                   </pic:nvPicPr>
                   <pic:blipFill>
@@ -11494,7 +11513,7 @@
           <w:sz w:val="27"/>
         </w:rPr>
       </w:pPr>
-      <w:bookmarkStart w:id="24" w:name="_Toc240376185"/>
+      <w:bookmarkStart w:id="24" w:name="_Toc240377160"/>
       <w:r>
         <w:rPr>
           <w:rFonts w:ascii="Montserrat" w:hAnsi="Montserrat"/>
@@ -12419,16 +12438,16 @@
           <w:noProof/>
         </w:rPr>
         <w:drawing>
-          <wp:inline distT="0" distB="0" distL="0" distR="0" wp14:anchorId="0608E8C3" wp14:editId="0D4CB6E1">
+          <wp:inline distT="0" distB="0" distL="0" distR="0" wp14:anchorId="09C8C950" wp14:editId="58FD1D84">
             <wp:extent cx="5120640" cy="4627581"/>
             <wp:effectExtent l="19050" t="19050" r="22860" b="20955"/>
-            <wp:docPr id="999960464" name="Imagem 9"/>
+            <wp:docPr id="1479270334" name="Imagem 9"/>
             <wp:cNvGraphicFramePr/>
             <a:graphic xmlns:a="http://schemas.openxmlformats.org/drawingml/2006/main">
               <a:graphicData uri="http://schemas.openxmlformats.org/drawingml/2006/picture">
                 <pic:pic xmlns:pic="http://schemas.openxmlformats.org/drawingml/2006/picture">
                   <pic:nvPicPr>
-                    <pic:cNvPr id="999960464" name=""/>
+                    <pic:cNvPr id="1479270334" name=""/>
                     <pic:cNvPicPr/>
                   </pic:nvPicPr>
                   <pic:blipFill>
@@ -12496,16 +12515,16 @@
         </w:rPr>
         <w:lastRenderedPageBreak/>
         <w:drawing>
-          <wp:inline distT="0" distB="0" distL="0" distR="0" wp14:anchorId="5518D311" wp14:editId="02BEA4FD">
+          <wp:inline distT="0" distB="0" distL="0" distR="0" wp14:anchorId="55AFE75C" wp14:editId="242B912E">
             <wp:extent cx="5120640" cy="4627581"/>
             <wp:effectExtent l="19050" t="19050" r="22860" b="20955"/>
-            <wp:docPr id="1740237615" name="Imagem 10"/>
+            <wp:docPr id="1831456546" name="Imagem 10"/>
             <wp:cNvGraphicFramePr/>
             <a:graphic xmlns:a="http://schemas.openxmlformats.org/drawingml/2006/main">
               <a:graphicData uri="http://schemas.openxmlformats.org/drawingml/2006/picture">
                 <pic:pic xmlns:pic="http://schemas.openxmlformats.org/drawingml/2006/picture">
                   <pic:nvPicPr>
-                    <pic:cNvPr id="1740237615" name=""/>
+                    <pic:cNvPr id="1831456546" name=""/>
                     <pic:cNvPicPr/>
                   </pic:nvPicPr>
                   <pic:blipFill>
@@ -12639,7 +12658,7 @@
           <w:sz w:val="27"/>
         </w:rPr>
       </w:pPr>
-      <w:bookmarkStart w:id="25" w:name="_Toc240376186"/>
+      <w:bookmarkStart w:id="25" w:name="_Toc240377161"/>
       <w:r>
         <w:rPr>
           <w:rFonts w:ascii="Montserrat" w:hAnsi="Montserrat"/>
@@ -13705,16 +13724,16 @@
           <w:noProof/>
         </w:rPr>
         <w:drawing>
-          <wp:inline distT="0" distB="0" distL="0" distR="0" wp14:anchorId="63F13E95" wp14:editId="39E13A9B">
+          <wp:inline distT="0" distB="0" distL="0" distR="0" wp14:anchorId="56CCD6E7" wp14:editId="096B413F">
             <wp:extent cx="5120640" cy="3338440"/>
             <wp:effectExtent l="19050" t="19050" r="22860" b="14605"/>
-            <wp:docPr id="1363421148" name="Imagem 11"/>
+            <wp:docPr id="818503837" name="Imagem 11"/>
             <wp:cNvGraphicFramePr/>
             <a:graphic xmlns:a="http://schemas.openxmlformats.org/drawingml/2006/main">
               <a:graphicData uri="http://schemas.openxmlformats.org/drawingml/2006/picture">
                 <pic:pic xmlns:pic="http://schemas.openxmlformats.org/drawingml/2006/picture">
                   <pic:nvPicPr>
-                    <pic:cNvPr id="1363421148" name=""/>
+                    <pic:cNvPr id="818503837" name=""/>
                     <pic:cNvPicPr/>
                   </pic:nvPicPr>
                   <pic:blipFill>
@@ -13782,16 +13801,16 @@
         </w:rPr>
         <w:lastRenderedPageBreak/>
         <w:drawing>
-          <wp:inline distT="0" distB="0" distL="0" distR="0" wp14:anchorId="311E9076" wp14:editId="2E40987A">
+          <wp:inline distT="0" distB="0" distL="0" distR="0" wp14:anchorId="589F8319" wp14:editId="56F0287D">
             <wp:extent cx="5120640" cy="4627581"/>
             <wp:effectExtent l="19050" t="19050" r="22860" b="20955"/>
-            <wp:docPr id="916338613" name="Imagem 12"/>
+            <wp:docPr id="1513270661" name="Imagem 12"/>
             <wp:cNvGraphicFramePr/>
             <a:graphic xmlns:a="http://schemas.openxmlformats.org/drawingml/2006/main">
               <a:graphicData uri="http://schemas.openxmlformats.org/drawingml/2006/picture">
                 <pic:pic xmlns:pic="http://schemas.openxmlformats.org/drawingml/2006/picture">
                   <pic:nvPicPr>
-                    <pic:cNvPr id="916338613" name=""/>
+                    <pic:cNvPr id="1513270661" name=""/>
                     <pic:cNvPicPr/>
                   </pic:nvPicPr>
                   <pic:blipFill>
@@ -13995,7 +14014,7 @@
           <w:sz w:val="27"/>
         </w:rPr>
       </w:pPr>
-      <w:bookmarkStart w:id="26" w:name="_Toc240376187"/>
+      <w:bookmarkStart w:id="26" w:name="_Toc240377162"/>
       <w:r>
         <w:rPr>
           <w:rFonts w:ascii="Montserrat" w:hAnsi="Montserrat"/>
@@ -14556,16 +14575,16 @@
           <w:noProof/>
         </w:rPr>
         <w:drawing>
-          <wp:inline distT="0" distB="0" distL="0" distR="0" wp14:anchorId="664E679D" wp14:editId="7CBC0F8F">
+          <wp:inline distT="0" distB="0" distL="0" distR="0" wp14:anchorId="39BBFBB6" wp14:editId="43086EE8">
             <wp:extent cx="5120640" cy="4627581"/>
             <wp:effectExtent l="19050" t="19050" r="22860" b="20955"/>
-            <wp:docPr id="511360943" name="Imagem 13"/>
+            <wp:docPr id="71051692" name="Imagem 13"/>
             <wp:cNvGraphicFramePr/>
             <a:graphic xmlns:a="http://schemas.openxmlformats.org/drawingml/2006/main">
               <a:graphicData uri="http://schemas.openxmlformats.org/drawingml/2006/picture">
                 <pic:pic xmlns:pic="http://schemas.openxmlformats.org/drawingml/2006/picture">
                   <pic:nvPicPr>
-                    <pic:cNvPr id="511360943" name=""/>
+                    <pic:cNvPr id="71051692" name=""/>
                     <pic:cNvPicPr/>
                   </pic:nvPicPr>
                   <pic:blipFill>
@@ -14633,16 +14652,16 @@
         </w:rPr>
         <w:lastRenderedPageBreak/>
         <w:drawing>
-          <wp:inline distT="0" distB="0" distL="0" distR="0" wp14:anchorId="27D840E2" wp14:editId="6EB2EDD1">
+          <wp:inline distT="0" distB="0" distL="0" distR="0" wp14:anchorId="79B10A23" wp14:editId="5228E18D">
             <wp:extent cx="5120640" cy="4627581"/>
             <wp:effectExtent l="19050" t="19050" r="22860" b="20955"/>
-            <wp:docPr id="358451200" name="Imagem 14"/>
+            <wp:docPr id="1557173689" name="Imagem 14"/>
             <wp:cNvGraphicFramePr/>
             <a:graphic xmlns:a="http://schemas.openxmlformats.org/drawingml/2006/main">
               <a:graphicData uri="http://schemas.openxmlformats.org/drawingml/2006/picture">
                 <pic:pic xmlns:pic="http://schemas.openxmlformats.org/drawingml/2006/picture">
                   <pic:nvPicPr>
-                    <pic:cNvPr id="358451200" name=""/>
+                    <pic:cNvPr id="1557173689" name=""/>
                     <pic:cNvPicPr/>
                   </pic:nvPicPr>
                   <pic:blipFill>
@@ -14912,7 +14931,7 @@
           <w:sz w:val="27"/>
         </w:rPr>
       </w:pPr>
-      <w:bookmarkStart w:id="27" w:name="_Toc240376188"/>
+      <w:bookmarkStart w:id="27" w:name="_Toc240377163"/>
       <w:r>
         <w:rPr>
           <w:rFonts w:ascii="Montserrat" w:hAnsi="Montserrat"/>
@@ -14953,16 +14972,16 @@
         </w:rPr>
         <w:lastRenderedPageBreak/>
         <w:drawing>
-          <wp:inline distT="0" distB="0" distL="0" distR="0" wp14:anchorId="6BB9EE72" wp14:editId="69B3AE41">
+          <wp:inline distT="0" distB="0" distL="0" distR="0" wp14:anchorId="6C50352B" wp14:editId="4D0D3AE0">
             <wp:extent cx="5120640" cy="4627581"/>
             <wp:effectExtent l="19050" t="19050" r="22860" b="20955"/>
-            <wp:docPr id="1760035522" name="Imagem 15"/>
+            <wp:docPr id="1318899153" name="Imagem 15"/>
             <wp:cNvGraphicFramePr/>
             <a:graphic xmlns:a="http://schemas.openxmlformats.org/drawingml/2006/main">
               <a:graphicData uri="http://schemas.openxmlformats.org/drawingml/2006/picture">
                 <pic:pic xmlns:pic="http://schemas.openxmlformats.org/drawingml/2006/picture">
                   <pic:nvPicPr>
-                    <pic:cNvPr id="1760035522" name=""/>
+                    <pic:cNvPr id="1318899153" name=""/>
                     <pic:cNvPicPr/>
                   </pic:nvPicPr>
                   <pic:blipFill>
@@ -15030,16 +15049,16 @@
         </w:rPr>
         <w:lastRenderedPageBreak/>
         <w:drawing>
-          <wp:inline distT="0" distB="0" distL="0" distR="0" wp14:anchorId="1933F979" wp14:editId="59C05DBA">
+          <wp:inline distT="0" distB="0" distL="0" distR="0" wp14:anchorId="61C526FD" wp14:editId="4AED7F19">
             <wp:extent cx="5120640" cy="4627581"/>
             <wp:effectExtent l="19050" t="19050" r="22860" b="20955"/>
-            <wp:docPr id="876533679" name="Imagem 16"/>
+            <wp:docPr id="346299741" name="Imagem 16"/>
             <wp:cNvGraphicFramePr/>
             <a:graphic xmlns:a="http://schemas.openxmlformats.org/drawingml/2006/main">
               <a:graphicData uri="http://schemas.openxmlformats.org/drawingml/2006/picture">
                 <pic:pic xmlns:pic="http://schemas.openxmlformats.org/drawingml/2006/picture">
                   <pic:nvPicPr>
-                    <pic:cNvPr id="876533679" name=""/>
+                    <pic:cNvPr id="346299741" name=""/>
                     <pic:cNvPicPr/>
                   </pic:nvPicPr>
                   <pic:blipFill>
@@ -15203,16 +15222,16 @@
         </w:rPr>
         <w:lastRenderedPageBreak/>
         <w:drawing>
-          <wp:inline distT="0" distB="0" distL="0" distR="0" wp14:anchorId="2328DA5A" wp14:editId="00824BDA">
+          <wp:inline distT="0" distB="0" distL="0" distR="0" wp14:anchorId="2E437279" wp14:editId="539C7849">
             <wp:extent cx="5120640" cy="3282818"/>
             <wp:effectExtent l="19050" t="19050" r="22860" b="13335"/>
-            <wp:docPr id="641383074" name="Imagem 17"/>
+            <wp:docPr id="327530915" name="Imagem 17"/>
             <wp:cNvGraphicFramePr/>
             <a:graphic xmlns:a="http://schemas.openxmlformats.org/drawingml/2006/main">
               <a:graphicData uri="http://schemas.openxmlformats.org/drawingml/2006/picture">
                 <pic:pic xmlns:pic="http://schemas.openxmlformats.org/drawingml/2006/picture">
                   <pic:nvPicPr>
-                    <pic:cNvPr id="641383074" name=""/>
+                    <pic:cNvPr id="327530915" name=""/>
                     <pic:cNvPicPr/>
                   </pic:nvPicPr>
                   <pic:blipFill>
@@ -15403,7 +15422,7 @@
           <w:sz w:val="27"/>
         </w:rPr>
       </w:pPr>
-      <w:bookmarkStart w:id="28" w:name="_Toc240376189"/>
+      <w:bookmarkStart w:id="28" w:name="_Toc240377164"/>
       <w:r>
         <w:rPr>
           <w:rFonts w:ascii="Montserrat" w:hAnsi="Montserrat"/>
@@ -15443,16 +15462,16 @@
           <w:noProof/>
         </w:rPr>
         <w:drawing>
-          <wp:inline distT="0" distB="0" distL="0" distR="0" wp14:anchorId="0C941F09" wp14:editId="6A6B4B95">
+          <wp:inline distT="0" distB="0" distL="0" distR="0" wp14:anchorId="476F26D4" wp14:editId="017FE41B">
             <wp:extent cx="5120640" cy="4627581"/>
             <wp:effectExtent l="19050" t="19050" r="22860" b="20955"/>
-            <wp:docPr id="306954282" name="Imagem 18"/>
+            <wp:docPr id="543520225" name="Imagem 18"/>
             <wp:cNvGraphicFramePr/>
             <a:graphic xmlns:a="http://schemas.openxmlformats.org/drawingml/2006/main">
               <a:graphicData uri="http://schemas.openxmlformats.org/drawingml/2006/picture">
                 <pic:pic xmlns:pic="http://schemas.openxmlformats.org/drawingml/2006/picture">
                   <pic:nvPicPr>
-                    <pic:cNvPr id="306954282" name=""/>
+                    <pic:cNvPr id="543520225" name=""/>
                     <pic:cNvPicPr/>
                   </pic:nvPicPr>
                   <pic:blipFill>
@@ -15520,16 +15539,16 @@
         </w:rPr>
         <w:lastRenderedPageBreak/>
         <w:drawing>
-          <wp:inline distT="0" distB="0" distL="0" distR="0" wp14:anchorId="03CAEC89" wp14:editId="44FF18DB">
+          <wp:inline distT="0" distB="0" distL="0" distR="0" wp14:anchorId="302AD3E0" wp14:editId="7AC49BF7">
             <wp:extent cx="5120640" cy="4627581"/>
             <wp:effectExtent l="19050" t="19050" r="22860" b="20955"/>
-            <wp:docPr id="1577220880" name="Imagem 19"/>
+            <wp:docPr id="630139773" name="Imagem 19"/>
             <wp:cNvGraphicFramePr/>
             <a:graphic xmlns:a="http://schemas.openxmlformats.org/drawingml/2006/main">
               <a:graphicData uri="http://schemas.openxmlformats.org/drawingml/2006/picture">
                 <pic:pic xmlns:pic="http://schemas.openxmlformats.org/drawingml/2006/picture">
                   <pic:nvPicPr>
-                    <pic:cNvPr id="1577220880" name=""/>
+                    <pic:cNvPr id="630139773" name=""/>
                     <pic:cNvPicPr/>
                   </pic:nvPicPr>
                   <pic:blipFill>
@@ -15712,7 +15731,7 @@
           <w:sz w:val="27"/>
         </w:rPr>
       </w:pPr>
-      <w:bookmarkStart w:id="29" w:name="_Toc240376190"/>
+      <w:bookmarkStart w:id="29" w:name="_Toc240377165"/>
       <w:r>
         <w:rPr>
           <w:rFonts w:ascii="Montserrat" w:hAnsi="Montserrat"/>
@@ -15752,16 +15771,16 @@
           <w:noProof/>
         </w:rPr>
         <w:drawing>
-          <wp:inline distT="0" distB="0" distL="0" distR="0" wp14:anchorId="08CF3D98" wp14:editId="3967C32B">
+          <wp:inline distT="0" distB="0" distL="0" distR="0" wp14:anchorId="5FD27159" wp14:editId="0C718DEC">
             <wp:extent cx="5120640" cy="4627581"/>
             <wp:effectExtent l="19050" t="19050" r="22860" b="20955"/>
-            <wp:docPr id="1186472509" name="Imagem 20"/>
+            <wp:docPr id="1520286166" name="Imagem 20"/>
             <wp:cNvGraphicFramePr/>
             <a:graphic xmlns:a="http://schemas.openxmlformats.org/drawingml/2006/main">
               <a:graphicData uri="http://schemas.openxmlformats.org/drawingml/2006/picture">
                 <pic:pic xmlns:pic="http://schemas.openxmlformats.org/drawingml/2006/picture">
                   <pic:nvPicPr>
-                    <pic:cNvPr id="1186472509" name=""/>
+                    <pic:cNvPr id="1520286166" name=""/>
                     <pic:cNvPicPr/>
                   </pic:nvPicPr>
                   <pic:blipFill>
@@ -15829,16 +15848,16 @@
         </w:rPr>
         <w:lastRenderedPageBreak/>
         <w:drawing>
-          <wp:inline distT="0" distB="0" distL="0" distR="0" wp14:anchorId="6C93209F" wp14:editId="5626C852">
+          <wp:inline distT="0" distB="0" distL="0" distR="0" wp14:anchorId="7F9D0136" wp14:editId="4698A461">
             <wp:extent cx="5120640" cy="4627581"/>
             <wp:effectExtent l="19050" t="19050" r="22860" b="20955"/>
-            <wp:docPr id="1693990840" name="Imagem 21"/>
+            <wp:docPr id="1341805907" name="Imagem 21"/>
             <wp:cNvGraphicFramePr/>
             <a:graphic xmlns:a="http://schemas.openxmlformats.org/drawingml/2006/main">
               <a:graphicData uri="http://schemas.openxmlformats.org/drawingml/2006/picture">
                 <pic:pic xmlns:pic="http://schemas.openxmlformats.org/drawingml/2006/picture">
                   <pic:nvPicPr>
-                    <pic:cNvPr id="1693990840" name=""/>
+                    <pic:cNvPr id="1341805907" name=""/>
                     <pic:cNvPicPr/>
                   </pic:nvPicPr>
                   <pic:blipFill>
@@ -16044,16 +16063,16 @@
           <w:noProof/>
         </w:rPr>
         <w:drawing>
-          <wp:inline distT="0" distB="0" distL="0" distR="0" wp14:anchorId="0282C628" wp14:editId="44CC7E6D">
+          <wp:inline distT="0" distB="0" distL="0" distR="0" wp14:anchorId="7E4AC97B" wp14:editId="2079C6F8">
             <wp:extent cx="5120640" cy="1757287"/>
             <wp:effectExtent l="19050" t="19050" r="22860" b="14605"/>
-            <wp:docPr id="257703565" name="Imagem 22"/>
+            <wp:docPr id="510871481" name="Imagem 22"/>
             <wp:cNvGraphicFramePr/>
             <a:graphic xmlns:a="http://schemas.openxmlformats.org/drawingml/2006/main">
               <a:graphicData uri="http://schemas.openxmlformats.org/drawingml/2006/picture">
                 <pic:pic xmlns:pic="http://schemas.openxmlformats.org/drawingml/2006/picture">
                   <pic:nvPicPr>
-                    <pic:cNvPr id="257703565" name=""/>
+                    <pic:cNvPr id="510871481" name=""/>
                     <pic:cNvPicPr/>
                   </pic:nvPicPr>
                   <pic:blipFill>
@@ -16166,7 +16185,7 @@
           <w:sz w:val="27"/>
         </w:rPr>
       </w:pPr>
-      <w:bookmarkStart w:id="30" w:name="_Toc240376191"/>
+      <w:bookmarkStart w:id="30" w:name="_Toc240377166"/>
       <w:r>
         <w:rPr>
           <w:rFonts w:ascii="Montserrat" w:hAnsi="Montserrat"/>
@@ -16207,16 +16226,16 @@
         </w:rPr>
         <w:lastRenderedPageBreak/>
         <w:drawing>
-          <wp:inline distT="0" distB="0" distL="0" distR="0" wp14:anchorId="6777BCFE" wp14:editId="228FFB48">
+          <wp:inline distT="0" distB="0" distL="0" distR="0" wp14:anchorId="3A81F66A" wp14:editId="3DC6EA01">
             <wp:extent cx="5120640" cy="4627581"/>
             <wp:effectExtent l="19050" t="19050" r="22860" b="20955"/>
-            <wp:docPr id="2075950210" name="Imagem 23"/>
+            <wp:docPr id="2048671477" name="Imagem 23"/>
             <wp:cNvGraphicFramePr/>
             <a:graphic xmlns:a="http://schemas.openxmlformats.org/drawingml/2006/main">
               <a:graphicData uri="http://schemas.openxmlformats.org/drawingml/2006/picture">
                 <pic:pic xmlns:pic="http://schemas.openxmlformats.org/drawingml/2006/picture">
                   <pic:nvPicPr>
-                    <pic:cNvPr id="2075950210" name=""/>
+                    <pic:cNvPr id="2048671477" name=""/>
                     <pic:cNvPicPr/>
                   </pic:nvPicPr>
                   <pic:blipFill>
@@ -16284,16 +16303,16 @@
         </w:rPr>
         <w:lastRenderedPageBreak/>
         <w:drawing>
-          <wp:inline distT="0" distB="0" distL="0" distR="0" wp14:anchorId="38655ADB" wp14:editId="13C97E9C">
+          <wp:inline distT="0" distB="0" distL="0" distR="0" wp14:anchorId="1E1238E6" wp14:editId="5E72C129">
             <wp:extent cx="5120640" cy="4627581"/>
             <wp:effectExtent l="19050" t="19050" r="22860" b="20955"/>
-            <wp:docPr id="223758141" name="Imagem 24"/>
+            <wp:docPr id="2028254673" name="Imagem 24"/>
             <wp:cNvGraphicFramePr/>
             <a:graphic xmlns:a="http://schemas.openxmlformats.org/drawingml/2006/main">
               <a:graphicData uri="http://schemas.openxmlformats.org/drawingml/2006/picture">
                 <pic:pic xmlns:pic="http://schemas.openxmlformats.org/drawingml/2006/picture">
                   <pic:nvPicPr>
-                    <pic:cNvPr id="223758141" name=""/>
+                    <pic:cNvPr id="2028254673" name=""/>
                     <pic:cNvPicPr/>
                   </pic:nvPicPr>
                   <pic:blipFill>
@@ -16530,7 +16549,7 @@
           <w:sz w:val="27"/>
         </w:rPr>
       </w:pPr>
-      <w:bookmarkStart w:id="31" w:name="_Toc240376192"/>
+      <w:bookmarkStart w:id="31" w:name="_Toc240377167"/>
       <w:r>
         <w:rPr>
           <w:rFonts w:ascii="Montserrat" w:hAnsi="Montserrat"/>
@@ -16570,16 +16589,16 @@
           <w:noProof/>
         </w:rPr>
         <w:drawing>
-          <wp:inline distT="0" distB="0" distL="0" distR="0" wp14:anchorId="0DF81504" wp14:editId="62D739DF">
+          <wp:inline distT="0" distB="0" distL="0" distR="0" wp14:anchorId="223C4859" wp14:editId="75DFE9A3">
             <wp:extent cx="5120640" cy="4627581"/>
             <wp:effectExtent l="19050" t="19050" r="22860" b="20955"/>
-            <wp:docPr id="1373314891" name="Imagem 25"/>
+            <wp:docPr id="874265753" name="Imagem 25"/>
             <wp:cNvGraphicFramePr/>
             <a:graphic xmlns:a="http://schemas.openxmlformats.org/drawingml/2006/main">
               <a:graphicData uri="http://schemas.openxmlformats.org/drawingml/2006/picture">
                 <pic:pic xmlns:pic="http://schemas.openxmlformats.org/drawingml/2006/picture">
                   <pic:nvPicPr>
-                    <pic:cNvPr id="1373314891" name=""/>
+                    <pic:cNvPr id="874265753" name=""/>
                     <pic:cNvPicPr/>
                   </pic:nvPicPr>
                   <pic:blipFill>
@@ -16647,16 +16666,16 @@
         </w:rPr>
         <w:lastRenderedPageBreak/>
         <w:drawing>
-          <wp:inline distT="0" distB="0" distL="0" distR="0" wp14:anchorId="734B7402" wp14:editId="6C6D43AF">
+          <wp:inline distT="0" distB="0" distL="0" distR="0" wp14:anchorId="2102412D" wp14:editId="767C69A0">
             <wp:extent cx="5120640" cy="4627581"/>
             <wp:effectExtent l="19050" t="19050" r="22860" b="20955"/>
-            <wp:docPr id="1106405769" name="Imagem 26"/>
+            <wp:docPr id="250228757" name="Imagem 26"/>
             <wp:cNvGraphicFramePr/>
             <a:graphic xmlns:a="http://schemas.openxmlformats.org/drawingml/2006/main">
               <a:graphicData uri="http://schemas.openxmlformats.org/drawingml/2006/picture">
                 <pic:pic xmlns:pic="http://schemas.openxmlformats.org/drawingml/2006/picture">
                   <pic:nvPicPr>
-                    <pic:cNvPr id="1106405769" name=""/>
+                    <pic:cNvPr id="250228757" name=""/>
                     <pic:cNvPicPr/>
                   </pic:nvPicPr>
                   <pic:blipFill>
@@ -16847,7 +16866,7 @@
           <w:sz w:val="27"/>
         </w:rPr>
       </w:pPr>
-      <w:bookmarkStart w:id="32" w:name="_Toc240376193"/>
+      <w:bookmarkStart w:id="32" w:name="_Toc240377168"/>
       <w:r>
         <w:rPr>
           <w:rFonts w:ascii="Montserrat" w:hAnsi="Montserrat"/>
@@ -16887,16 +16906,16 @@
           <w:noProof/>
         </w:rPr>
         <w:drawing>
-          <wp:inline distT="0" distB="0" distL="0" distR="0" wp14:anchorId="3874A290" wp14:editId="38CBA091">
+          <wp:inline distT="0" distB="0" distL="0" distR="0" wp14:anchorId="26426D6B" wp14:editId="58BCAFA2">
             <wp:extent cx="5120640" cy="4000682"/>
             <wp:effectExtent l="19050" t="19050" r="22860" b="19050"/>
-            <wp:docPr id="738415901" name="Imagem 27"/>
+            <wp:docPr id="275195415" name="Imagem 27"/>
             <wp:cNvGraphicFramePr/>
             <a:graphic xmlns:a="http://schemas.openxmlformats.org/drawingml/2006/main">
               <a:graphicData uri="http://schemas.openxmlformats.org/drawingml/2006/picture">
                 <pic:pic xmlns:pic="http://schemas.openxmlformats.org/drawingml/2006/picture">
                   <pic:nvPicPr>
-                    <pic:cNvPr id="738415901" name=""/>
+                    <pic:cNvPr id="275195415" name=""/>
                     <pic:cNvPicPr/>
                   </pic:nvPicPr>
                   <pic:blipFill>
@@ -17420,7 +17439,7 @@
           <w:sz w:val="34"/>
         </w:rPr>
       </w:pPr>
-      <w:bookmarkStart w:id="33" w:name="_Toc240376194"/>
+      <w:bookmarkStart w:id="33" w:name="_Toc240377169"/>
       <w:r>
         <w:rPr>
           <w:rFonts w:ascii="Montserrat" w:hAnsi="Montserrat"/>
@@ -17462,7 +17481,7 @@
           <w:sz w:val="27"/>
         </w:rPr>
       </w:pPr>
-      <w:bookmarkStart w:id="34" w:name="_Toc240376195"/>
+      <w:bookmarkStart w:id="34" w:name="_Toc240377170"/>
       <w:r>
         <w:rPr>
           <w:rFonts w:ascii="Montserrat" w:hAnsi="Montserrat"/>
@@ -17502,16 +17521,16 @@
           <w:noProof/>
         </w:rPr>
         <w:drawing>
-          <wp:inline distT="0" distB="0" distL="0" distR="0" wp14:anchorId="6EAAFF36" wp14:editId="7A5FAA9A">
+          <wp:inline distT="0" distB="0" distL="0" distR="0" wp14:anchorId="3808D6C4" wp14:editId="7A44561B">
             <wp:extent cx="5120640" cy="4627581"/>
             <wp:effectExtent l="19050" t="19050" r="22860" b="20955"/>
-            <wp:docPr id="1234084506" name="Imagem 28"/>
+            <wp:docPr id="451365298" name="Imagem 28"/>
             <wp:cNvGraphicFramePr/>
             <a:graphic xmlns:a="http://schemas.openxmlformats.org/drawingml/2006/main">
               <a:graphicData uri="http://schemas.openxmlformats.org/drawingml/2006/picture">
                 <pic:pic xmlns:pic="http://schemas.openxmlformats.org/drawingml/2006/picture">
                   <pic:nvPicPr>
-                    <pic:cNvPr id="1234084506" name=""/>
+                    <pic:cNvPr id="451365298" name=""/>
                     <pic:cNvPicPr/>
                   </pic:nvPicPr>
                   <pic:blipFill>
@@ -17579,16 +17598,16 @@
         </w:rPr>
         <w:lastRenderedPageBreak/>
         <w:drawing>
-          <wp:inline distT="0" distB="0" distL="0" distR="0" wp14:anchorId="3672F771" wp14:editId="7347154D">
+          <wp:inline distT="0" distB="0" distL="0" distR="0" wp14:anchorId="1AFDE8DC" wp14:editId="26EB05F6">
             <wp:extent cx="5120640" cy="4627581"/>
             <wp:effectExtent l="19050" t="19050" r="22860" b="20955"/>
-            <wp:docPr id="604170183" name="Imagem 29"/>
+            <wp:docPr id="1697499963" name="Imagem 29"/>
             <wp:cNvGraphicFramePr/>
             <a:graphic xmlns:a="http://schemas.openxmlformats.org/drawingml/2006/main">
               <a:graphicData uri="http://schemas.openxmlformats.org/drawingml/2006/picture">
                 <pic:pic xmlns:pic="http://schemas.openxmlformats.org/drawingml/2006/picture">
                   <pic:nvPicPr>
-                    <pic:cNvPr id="604170183" name=""/>
+                    <pic:cNvPr id="1697499963" name=""/>
                     <pic:cNvPicPr/>
                   </pic:nvPicPr>
                   <pic:blipFill>
@@ -17656,16 +17675,16 @@
         </w:rPr>
         <w:lastRenderedPageBreak/>
         <w:drawing>
-          <wp:inline distT="0" distB="0" distL="0" distR="0" wp14:anchorId="23977366" wp14:editId="7FF94715">
+          <wp:inline distT="0" distB="0" distL="0" distR="0" wp14:anchorId="04DD531D" wp14:editId="021DD386">
             <wp:extent cx="5120640" cy="4627581"/>
             <wp:effectExtent l="19050" t="19050" r="22860" b="20955"/>
-            <wp:docPr id="249593638" name="Imagem 30"/>
+            <wp:docPr id="1069038009" name="Imagem 30"/>
             <wp:cNvGraphicFramePr/>
             <a:graphic xmlns:a="http://schemas.openxmlformats.org/drawingml/2006/main">
               <a:graphicData uri="http://schemas.openxmlformats.org/drawingml/2006/picture">
                 <pic:pic xmlns:pic="http://schemas.openxmlformats.org/drawingml/2006/picture">
                   <pic:nvPicPr>
-                    <pic:cNvPr id="249593638" name=""/>
+                    <pic:cNvPr id="1069038009" name=""/>
                     <pic:cNvPicPr/>
                   </pic:nvPicPr>
                   <pic:blipFill>
@@ -17867,16 +17886,16 @@
           <w:noProof/>
         </w:rPr>
         <w:drawing>
-          <wp:inline distT="0" distB="0" distL="0" distR="0" wp14:anchorId="6AC0DD58" wp14:editId="3ABBAB16">
+          <wp:inline distT="0" distB="0" distL="0" distR="0" wp14:anchorId="494D4A65" wp14:editId="0D443B7E">
             <wp:extent cx="5120640" cy="1715571"/>
             <wp:effectExtent l="19050" t="19050" r="22860" b="18415"/>
-            <wp:docPr id="250526538" name="Imagem 31"/>
+            <wp:docPr id="1294278156" name="Imagem 31"/>
             <wp:cNvGraphicFramePr/>
             <a:graphic xmlns:a="http://schemas.openxmlformats.org/drawingml/2006/main">
               <a:graphicData uri="http://schemas.openxmlformats.org/drawingml/2006/picture">
                 <pic:pic xmlns:pic="http://schemas.openxmlformats.org/drawingml/2006/picture">
                   <pic:nvPicPr>
-                    <pic:cNvPr id="250526538" name=""/>
+                    <pic:cNvPr id="1294278156" name=""/>
                     <pic:cNvPicPr/>
                   </pic:nvPicPr>
                   <pic:blipFill>
@@ -18013,16 +18032,16 @@
           <w:noProof/>
         </w:rPr>
         <w:drawing>
-          <wp:inline distT="0" distB="0" distL="0" distR="0" wp14:anchorId="7C01F30D" wp14:editId="42E744D1">
+          <wp:inline distT="0" distB="0" distL="0" distR="0" wp14:anchorId="70F4CA42" wp14:editId="1CF71869">
             <wp:extent cx="5120640" cy="3282818"/>
             <wp:effectExtent l="19050" t="19050" r="22860" b="13335"/>
-            <wp:docPr id="879600404" name="Imagem 32"/>
+            <wp:docPr id="515687789" name="Imagem 32"/>
             <wp:cNvGraphicFramePr/>
             <a:graphic xmlns:a="http://schemas.openxmlformats.org/drawingml/2006/main">
               <a:graphicData uri="http://schemas.openxmlformats.org/drawingml/2006/picture">
                 <pic:pic xmlns:pic="http://schemas.openxmlformats.org/drawingml/2006/picture">
                   <pic:nvPicPr>
-                    <pic:cNvPr id="879600404" name=""/>
+                    <pic:cNvPr id="515687789" name=""/>
                     <pic:cNvPicPr/>
                   </pic:nvPicPr>
                   <pic:blipFill>
@@ -18156,16 +18175,16 @@
           <w:noProof/>
         </w:rPr>
         <w:drawing>
-          <wp:inline distT="0" distB="0" distL="0" distR="0" wp14:anchorId="24C4D685" wp14:editId="1F502144">
+          <wp:inline distT="0" distB="0" distL="0" distR="0" wp14:anchorId="1812E345" wp14:editId="29D8363D">
             <wp:extent cx="5120640" cy="951357"/>
             <wp:effectExtent l="19050" t="19050" r="22860" b="20320"/>
-            <wp:docPr id="673597386" name="Imagem 33"/>
+            <wp:docPr id="1567450208" name="Imagem 33"/>
             <wp:cNvGraphicFramePr/>
             <a:graphic xmlns:a="http://schemas.openxmlformats.org/drawingml/2006/main">
               <a:graphicData uri="http://schemas.openxmlformats.org/drawingml/2006/picture">
                 <pic:pic xmlns:pic="http://schemas.openxmlformats.org/drawingml/2006/picture">
                   <pic:nvPicPr>
-                    <pic:cNvPr id="673597386" name=""/>
+                    <pic:cNvPr id="1567450208" name=""/>
                     <pic:cNvPicPr/>
                   </pic:nvPicPr>
                   <pic:blipFill>
@@ -18277,16 +18296,16 @@
           <w:noProof/>
         </w:rPr>
         <w:drawing>
-          <wp:inline distT="0" distB="0" distL="0" distR="0" wp14:anchorId="7EA1440D" wp14:editId="604A9374">
+          <wp:inline distT="0" distB="0" distL="0" distR="0" wp14:anchorId="0A797278" wp14:editId="7A54E2C5">
             <wp:extent cx="5120640" cy="1515102"/>
             <wp:effectExtent l="19050" t="19050" r="22860" b="28575"/>
-            <wp:docPr id="1720041573" name="Imagem 34"/>
+            <wp:docPr id="952093009" name="Imagem 34"/>
             <wp:cNvGraphicFramePr/>
             <a:graphic xmlns:a="http://schemas.openxmlformats.org/drawingml/2006/main">
               <a:graphicData uri="http://schemas.openxmlformats.org/drawingml/2006/picture">
                 <pic:pic xmlns:pic="http://schemas.openxmlformats.org/drawingml/2006/picture">
                   <pic:nvPicPr>
-                    <pic:cNvPr id="1720041573" name=""/>
+                    <pic:cNvPr id="952093009" name=""/>
                     <pic:cNvPicPr/>
                   </pic:nvPicPr>
                   <pic:blipFill>
@@ -18399,16 +18418,16 @@
           <w:noProof/>
         </w:rPr>
         <w:drawing>
-          <wp:inline distT="0" distB="0" distL="0" distR="0" wp14:anchorId="38CF621C" wp14:editId="40F0E80A">
+          <wp:inline distT="0" distB="0" distL="0" distR="0" wp14:anchorId="231034A4" wp14:editId="52376D1B">
             <wp:extent cx="5120640" cy="1391113"/>
             <wp:effectExtent l="19050" t="19050" r="22860" b="19050"/>
-            <wp:docPr id="1354446959" name="Imagem 35"/>
+            <wp:docPr id="1688320902" name="Imagem 35"/>
             <wp:cNvGraphicFramePr/>
             <a:graphic xmlns:a="http://schemas.openxmlformats.org/drawingml/2006/main">
               <a:graphicData uri="http://schemas.openxmlformats.org/drawingml/2006/picture">
                 <pic:pic xmlns:pic="http://schemas.openxmlformats.org/drawingml/2006/picture">
                   <pic:nvPicPr>
-                    <pic:cNvPr id="1354446959" name=""/>
+                    <pic:cNvPr id="1688320902" name=""/>
                     <pic:cNvPicPr/>
                   </pic:nvPicPr>
                   <pic:blipFill>
@@ -18520,16 +18539,16 @@
           <w:noProof/>
         </w:rPr>
         <w:drawing>
-          <wp:inline distT="0" distB="0" distL="0" distR="0" wp14:anchorId="63596804" wp14:editId="4561F3DE">
+          <wp:inline distT="0" distB="0" distL="0" distR="0" wp14:anchorId="4E54F59C" wp14:editId="064DF26B">
             <wp:extent cx="5120640" cy="1125174"/>
             <wp:effectExtent l="19050" t="19050" r="22860" b="18415"/>
-            <wp:docPr id="1556265203" name="Imagem 36"/>
+            <wp:docPr id="1546664023" name="Imagem 36"/>
             <wp:cNvGraphicFramePr/>
             <a:graphic xmlns:a="http://schemas.openxmlformats.org/drawingml/2006/main">
               <a:graphicData uri="http://schemas.openxmlformats.org/drawingml/2006/picture">
                 <pic:pic xmlns:pic="http://schemas.openxmlformats.org/drawingml/2006/picture">
                   <pic:nvPicPr>
-                    <pic:cNvPr id="1556265203" name=""/>
+                    <pic:cNvPr id="1546664023" name=""/>
                     <pic:cNvPicPr/>
                   </pic:nvPicPr>
                   <pic:blipFill>
@@ -18619,7 +18638,7 @@
           <w:sz w:val="27"/>
         </w:rPr>
       </w:pPr>
-      <w:bookmarkStart w:id="35" w:name="_Toc240376196"/>
+      <w:bookmarkStart w:id="35" w:name="_Toc240377171"/>
       <w:r>
         <w:rPr>
           <w:rFonts w:ascii="Montserrat" w:hAnsi="Montserrat"/>
@@ -18659,16 +18678,16 @@
           <w:noProof/>
         </w:rPr>
         <w:drawing>
-          <wp:inline distT="0" distB="0" distL="0" distR="0" wp14:anchorId="0744E1B7" wp14:editId="0DA3291F">
+          <wp:inline distT="0" distB="0" distL="0" distR="0" wp14:anchorId="629DD23E" wp14:editId="781078F7">
             <wp:extent cx="5120640" cy="4627581"/>
             <wp:effectExtent l="19050" t="19050" r="22860" b="20955"/>
-            <wp:docPr id="478061357" name="Imagem 37"/>
+            <wp:docPr id="807922965" name="Imagem 37"/>
             <wp:cNvGraphicFramePr/>
             <a:graphic xmlns:a="http://schemas.openxmlformats.org/drawingml/2006/main">
               <a:graphicData uri="http://schemas.openxmlformats.org/drawingml/2006/picture">
                 <pic:pic xmlns:pic="http://schemas.openxmlformats.org/drawingml/2006/picture">
                   <pic:nvPicPr>
-                    <pic:cNvPr id="478061357" name=""/>
+                    <pic:cNvPr id="807922965" name=""/>
                     <pic:cNvPicPr/>
                   </pic:nvPicPr>
                   <pic:blipFill>
@@ -18736,16 +18755,16 @@
         </w:rPr>
         <w:lastRenderedPageBreak/>
         <w:drawing>
-          <wp:inline distT="0" distB="0" distL="0" distR="0" wp14:anchorId="4A989A25" wp14:editId="3B9436F0">
+          <wp:inline distT="0" distB="0" distL="0" distR="0" wp14:anchorId="1971ABA2" wp14:editId="7FD59293">
             <wp:extent cx="5120640" cy="4627581"/>
             <wp:effectExtent l="19050" t="19050" r="22860" b="20955"/>
-            <wp:docPr id="1296241275" name="Imagem 38"/>
+            <wp:docPr id="556238139" name="Imagem 38"/>
             <wp:cNvGraphicFramePr/>
             <a:graphic xmlns:a="http://schemas.openxmlformats.org/drawingml/2006/main">
               <a:graphicData uri="http://schemas.openxmlformats.org/drawingml/2006/picture">
                 <pic:pic xmlns:pic="http://schemas.openxmlformats.org/drawingml/2006/picture">
                   <pic:nvPicPr>
-                    <pic:cNvPr id="1296241275" name=""/>
+                    <pic:cNvPr id="556238139" name=""/>
                     <pic:cNvPicPr/>
                   </pic:nvPicPr>
                   <pic:blipFill>
@@ -18914,16 +18933,16 @@
           <w:noProof/>
         </w:rPr>
         <w:drawing>
-          <wp:inline distT="0" distB="0" distL="0" distR="0" wp14:anchorId="35239157" wp14:editId="16A5DFFF">
+          <wp:inline distT="0" distB="0" distL="0" distR="0" wp14:anchorId="6577519D" wp14:editId="05A37797">
             <wp:extent cx="5120640" cy="2144319"/>
             <wp:effectExtent l="19050" t="19050" r="22860" b="27940"/>
-            <wp:docPr id="1826636647" name="Imagem 39"/>
+            <wp:docPr id="84206799" name="Imagem 39"/>
             <wp:cNvGraphicFramePr/>
             <a:graphic xmlns:a="http://schemas.openxmlformats.org/drawingml/2006/main">
               <a:graphicData uri="http://schemas.openxmlformats.org/drawingml/2006/picture">
                 <pic:pic xmlns:pic="http://schemas.openxmlformats.org/drawingml/2006/picture">
                   <pic:nvPicPr>
-                    <pic:cNvPr id="1826636647" name=""/>
+                    <pic:cNvPr id="84206799" name=""/>
                     <pic:cNvPicPr/>
                   </pic:nvPicPr>
                   <pic:blipFill>
@@ -19011,16 +19030,16 @@
           <w:noProof/>
         </w:rPr>
         <w:drawing>
-          <wp:inline distT="0" distB="0" distL="0" distR="0" wp14:anchorId="507F366B" wp14:editId="5317D9D8">
+          <wp:inline distT="0" distB="0" distL="0" distR="0" wp14:anchorId="1B455512" wp14:editId="572C97BE">
             <wp:extent cx="5120640" cy="1055647"/>
             <wp:effectExtent l="19050" t="19050" r="22860" b="11430"/>
-            <wp:docPr id="1957385362" name="Imagem 40"/>
+            <wp:docPr id="1858196608" name="Imagem 40"/>
             <wp:cNvGraphicFramePr/>
             <a:graphic xmlns:a="http://schemas.openxmlformats.org/drawingml/2006/main">
               <a:graphicData uri="http://schemas.openxmlformats.org/drawingml/2006/picture">
                 <pic:pic xmlns:pic="http://schemas.openxmlformats.org/drawingml/2006/picture">
                   <pic:nvPicPr>
-                    <pic:cNvPr id="1957385362" name=""/>
+                    <pic:cNvPr id="1858196608" name=""/>
                     <pic:cNvPicPr/>
                   </pic:nvPicPr>
                   <pic:blipFill>
@@ -19142,16 +19161,16 @@
           <w:noProof/>
         </w:rPr>
         <w:drawing>
-          <wp:inline distT="0" distB="0" distL="0" distR="0" wp14:anchorId="50FD9069" wp14:editId="63D9F63D">
+          <wp:inline distT="0" distB="0" distL="0" distR="0" wp14:anchorId="6795960A" wp14:editId="78C5BEB9">
             <wp:extent cx="5120640" cy="3282818"/>
             <wp:effectExtent l="19050" t="19050" r="22860" b="13335"/>
-            <wp:docPr id="1044595642" name="Imagem 41"/>
+            <wp:docPr id="1456078425" name="Imagem 41"/>
             <wp:cNvGraphicFramePr/>
             <a:graphic xmlns:a="http://schemas.openxmlformats.org/drawingml/2006/main">
               <a:graphicData uri="http://schemas.openxmlformats.org/drawingml/2006/picture">
                 <pic:pic xmlns:pic="http://schemas.openxmlformats.org/drawingml/2006/picture">
                   <pic:nvPicPr>
-                    <pic:cNvPr id="1044595642" name=""/>
+                    <pic:cNvPr id="1456078425" name=""/>
                     <pic:cNvPicPr/>
                   </pic:nvPicPr>
                   <pic:blipFill>
@@ -19285,16 +19304,16 @@
         </w:rPr>
         <w:lastRenderedPageBreak/>
         <w:drawing>
-          <wp:inline distT="0" distB="0" distL="0" distR="0" wp14:anchorId="597359E2" wp14:editId="4B55CEFC">
+          <wp:inline distT="0" distB="0" distL="0" distR="0" wp14:anchorId="12E4C827" wp14:editId="02AA56C7">
             <wp:extent cx="5120640" cy="1978034"/>
             <wp:effectExtent l="19050" t="19050" r="22860" b="22225"/>
-            <wp:docPr id="1479435981" name="Imagem 42"/>
+            <wp:docPr id="1549285190" name="Imagem 42"/>
             <wp:cNvGraphicFramePr/>
             <a:graphic xmlns:a="http://schemas.openxmlformats.org/drawingml/2006/main">
               <a:graphicData uri="http://schemas.openxmlformats.org/drawingml/2006/picture">
                 <pic:pic xmlns:pic="http://schemas.openxmlformats.org/drawingml/2006/picture">
                   <pic:nvPicPr>
-                    <pic:cNvPr id="1479435981" name=""/>
+                    <pic:cNvPr id="1549285190" name=""/>
                     <pic:cNvPicPr/>
                   </pic:nvPicPr>
                   <pic:blipFill>
@@ -19366,7 +19385,7 @@
           <w:sz w:val="34"/>
         </w:rPr>
       </w:pPr>
-      <w:bookmarkStart w:id="36" w:name="_Toc240376197"/>
+      <w:bookmarkStart w:id="36" w:name="_Toc240377172"/>
       <w:r>
         <w:rPr>
           <w:rFonts w:ascii="Montserrat" w:hAnsi="Montserrat"/>
@@ -19426,7 +19445,7 @@
           <w:sz w:val="27"/>
         </w:rPr>
       </w:pPr>
-      <w:bookmarkStart w:id="37" w:name="_Toc240376198"/>
+      <w:bookmarkStart w:id="37" w:name="_Toc240377173"/>
       <w:r>
         <w:rPr>
           <w:rFonts w:ascii="Montserrat" w:hAnsi="Montserrat"/>
@@ -19466,16 +19485,16 @@
           <w:noProof/>
         </w:rPr>
         <w:drawing>
-          <wp:inline distT="0" distB="0" distL="0" distR="0" wp14:anchorId="050A6592" wp14:editId="07944115">
+          <wp:inline distT="0" distB="0" distL="0" distR="0" wp14:anchorId="26578842" wp14:editId="6CA08D9C">
             <wp:extent cx="5303520" cy="4792851"/>
             <wp:effectExtent l="19050" t="19050" r="11430" b="27305"/>
-            <wp:docPr id="1870792598" name="Imagem 43"/>
+            <wp:docPr id="536832231" name="Imagem 43"/>
             <wp:cNvGraphicFramePr/>
             <a:graphic xmlns:a="http://schemas.openxmlformats.org/drawingml/2006/main">
               <a:graphicData uri="http://schemas.openxmlformats.org/drawingml/2006/picture">
                 <pic:pic xmlns:pic="http://schemas.openxmlformats.org/drawingml/2006/picture">
                   <pic:nvPicPr>
-                    <pic:cNvPr id="1870792598" name=""/>
+                    <pic:cNvPr id="536832231" name=""/>
                     <pic:cNvPicPr/>
                   </pic:nvPicPr>
                   <pic:blipFill>
@@ -19544,7 +19563,7 @@
           <w:sz w:val="27"/>
         </w:rPr>
       </w:pPr>
-      <w:bookmarkStart w:id="38" w:name="_Toc240376199"/>
+      <w:bookmarkStart w:id="38" w:name="_Toc240377174"/>
       <w:r>
         <w:rPr>
           <w:rFonts w:ascii="Montserrat" w:hAnsi="Montserrat"/>
@@ -19584,16 +19603,16 @@
           <w:noProof/>
         </w:rPr>
         <w:drawing>
-          <wp:inline distT="0" distB="0" distL="0" distR="0" wp14:anchorId="5CB77B8D" wp14:editId="0BA8F9A8">
+          <wp:inline distT="0" distB="0" distL="0" distR="0" wp14:anchorId="307739F6" wp14:editId="1F177163">
             <wp:extent cx="5303520" cy="4792851"/>
             <wp:effectExtent l="19050" t="19050" r="11430" b="27305"/>
-            <wp:docPr id="2101072933" name="Imagem 44"/>
+            <wp:docPr id="1654501164" name="Imagem 44"/>
             <wp:cNvGraphicFramePr/>
             <a:graphic xmlns:a="http://schemas.openxmlformats.org/drawingml/2006/main">
               <a:graphicData uri="http://schemas.openxmlformats.org/drawingml/2006/picture">
                 <pic:pic xmlns:pic="http://schemas.openxmlformats.org/drawingml/2006/picture">
                   <pic:nvPicPr>
-                    <pic:cNvPr id="2101072933" name=""/>
+                    <pic:cNvPr id="1654501164" name=""/>
                     <pic:cNvPicPr/>
                   </pic:nvPicPr>
                   <pic:blipFill>
@@ -19661,7 +19680,7 @@
           <w:sz w:val="27"/>
         </w:rPr>
       </w:pPr>
-      <w:bookmarkStart w:id="39" w:name="_Toc240376200"/>
+      <w:bookmarkStart w:id="39" w:name="_Toc240377175"/>
       <w:r>
         <w:rPr>
           <w:rFonts w:ascii="Montserrat" w:hAnsi="Montserrat"/>
@@ -19702,16 +19721,16 @@
         </w:rPr>
         <w:lastRenderedPageBreak/>
         <w:drawing>
-          <wp:inline distT="0" distB="0" distL="0" distR="0" wp14:anchorId="28416A28" wp14:editId="348DD64E">
+          <wp:inline distT="0" distB="0" distL="0" distR="0" wp14:anchorId="33140F88" wp14:editId="4DC383B6">
             <wp:extent cx="5303520" cy="4792851"/>
             <wp:effectExtent l="19050" t="19050" r="11430" b="27305"/>
-            <wp:docPr id="1149052275" name="Imagem 45"/>
+            <wp:docPr id="668541330" name="Imagem 45"/>
             <wp:cNvGraphicFramePr/>
             <a:graphic xmlns:a="http://schemas.openxmlformats.org/drawingml/2006/main">
               <a:graphicData uri="http://schemas.openxmlformats.org/drawingml/2006/picture">
                 <pic:pic xmlns:pic="http://schemas.openxmlformats.org/drawingml/2006/picture">
                   <pic:nvPicPr>
-                    <pic:cNvPr id="1149052275" name=""/>
+                    <pic:cNvPr id="668541330" name=""/>
                     <pic:cNvPicPr/>
                   </pic:nvPicPr>
                   <pic:blipFill>
@@ -19779,16 +19798,16 @@
         </w:rPr>
         <w:lastRenderedPageBreak/>
         <w:drawing>
-          <wp:inline distT="0" distB="0" distL="0" distR="0" wp14:anchorId="2E3C2A74" wp14:editId="5434D2A6">
+          <wp:inline distT="0" distB="0" distL="0" distR="0" wp14:anchorId="6F7D9F81" wp14:editId="297943C3">
             <wp:extent cx="5303520" cy="4792851"/>
             <wp:effectExtent l="19050" t="19050" r="11430" b="27305"/>
-            <wp:docPr id="604152977" name="Imagem 46"/>
+            <wp:docPr id="1512177549" name="Imagem 46"/>
             <wp:cNvGraphicFramePr/>
             <a:graphic xmlns:a="http://schemas.openxmlformats.org/drawingml/2006/main">
               <a:graphicData uri="http://schemas.openxmlformats.org/drawingml/2006/picture">
                 <pic:pic xmlns:pic="http://schemas.openxmlformats.org/drawingml/2006/picture">
                   <pic:nvPicPr>
-                    <pic:cNvPr id="604152977" name=""/>
+                    <pic:cNvPr id="1512177549" name=""/>
                     <pic:cNvPicPr/>
                   </pic:nvPicPr>
                   <pic:blipFill>
@@ -19881,7 +19900,7 @@
           <w:sz w:val="34"/>
         </w:rPr>
       </w:pPr>
-      <w:bookmarkStart w:id="40" w:name="_Toc240376201"/>
+      <w:bookmarkStart w:id="40" w:name="_Toc240377176"/>
       <w:r>
         <w:rPr>
           <w:rFonts w:ascii="Montserrat" w:hAnsi="Montserrat"/>
@@ -19923,7 +19942,7 @@
           <w:sz w:val="27"/>
         </w:rPr>
       </w:pPr>
-      <w:bookmarkStart w:id="41" w:name="_Toc240376202"/>
+      <w:bookmarkStart w:id="41" w:name="_Toc240377177"/>
       <w:r>
         <w:rPr>
           <w:rFonts w:ascii="Montserrat" w:hAnsi="Montserrat"/>
@@ -19963,16 +19982,16 @@
           <w:noProof/>
         </w:rPr>
         <w:drawing>
-          <wp:inline distT="0" distB="0" distL="0" distR="0" wp14:anchorId="79BEEF8D" wp14:editId="47EB961A">
+          <wp:inline distT="0" distB="0" distL="0" distR="0" wp14:anchorId="3B55008A" wp14:editId="7B63176F">
             <wp:extent cx="5303520" cy="4792851"/>
             <wp:effectExtent l="19050" t="19050" r="11430" b="27305"/>
-            <wp:docPr id="782762280" name="Imagem 47"/>
+            <wp:docPr id="1338350077" name="Imagem 47"/>
             <wp:cNvGraphicFramePr/>
             <a:graphic xmlns:a="http://schemas.openxmlformats.org/drawingml/2006/main">
               <a:graphicData uri="http://schemas.openxmlformats.org/drawingml/2006/picture">
                 <pic:pic xmlns:pic="http://schemas.openxmlformats.org/drawingml/2006/picture">
                   <pic:nvPicPr>
-                    <pic:cNvPr id="782762280" name=""/>
+                    <pic:cNvPr id="1338350077" name=""/>
                     <pic:cNvPicPr/>
                   </pic:nvPicPr>
                   <pic:blipFill>
@@ -20227,7 +20246,7 @@
           <w:sz w:val="27"/>
         </w:rPr>
       </w:pPr>
-      <w:bookmarkStart w:id="42" w:name="_Toc240376203"/>
+      <w:bookmarkStart w:id="42" w:name="_Toc240377178"/>
       <w:r>
         <w:rPr>
           <w:rFonts w:ascii="Montserrat" w:hAnsi="Montserrat"/>
@@ -20268,16 +20287,16 @@
         </w:rPr>
         <w:lastRenderedPageBreak/>
         <w:drawing>
-          <wp:inline distT="0" distB="0" distL="0" distR="0" wp14:anchorId="3073A743" wp14:editId="1A8762D8">
+          <wp:inline distT="0" distB="0" distL="0" distR="0" wp14:anchorId="3B015013" wp14:editId="3FFEFEDD">
             <wp:extent cx="5303520" cy="4792851"/>
             <wp:effectExtent l="19050" t="19050" r="11430" b="27305"/>
-            <wp:docPr id="458632454" name="Imagem 48"/>
+            <wp:docPr id="385564444" name="Imagem 48"/>
             <wp:cNvGraphicFramePr/>
             <a:graphic xmlns:a="http://schemas.openxmlformats.org/drawingml/2006/main">
               <a:graphicData uri="http://schemas.openxmlformats.org/drawingml/2006/picture">
                 <pic:pic xmlns:pic="http://schemas.openxmlformats.org/drawingml/2006/picture">
                   <pic:nvPicPr>
-                    <pic:cNvPr id="458632454" name=""/>
+                    <pic:cNvPr id="385564444" name=""/>
                     <pic:cNvPicPr/>
                   </pic:nvPicPr>
                   <pic:blipFill>
@@ -20366,7 +20385,7 @@
           <w:sz w:val="27"/>
         </w:rPr>
       </w:pPr>
-      <w:bookmarkStart w:id="43" w:name="_Toc240376204"/>
+      <w:bookmarkStart w:id="43" w:name="_Toc240377179"/>
       <w:r>
         <w:rPr>
           <w:rFonts w:ascii="Montserrat" w:hAnsi="Montserrat"/>
@@ -20407,16 +20426,16 @@
         </w:rPr>
         <w:lastRenderedPageBreak/>
         <w:drawing>
-          <wp:inline distT="0" distB="0" distL="0" distR="0" wp14:anchorId="7E9EE408" wp14:editId="4A39F21E">
+          <wp:inline distT="0" distB="0" distL="0" distR="0" wp14:anchorId="2BDA2A2D" wp14:editId="1CCF8C85">
             <wp:extent cx="5303520" cy="4792851"/>
             <wp:effectExtent l="19050" t="19050" r="11430" b="27305"/>
-            <wp:docPr id="362120249" name="Imagem 49"/>
+            <wp:docPr id="1003288522" name="Imagem 49"/>
             <wp:cNvGraphicFramePr/>
             <a:graphic xmlns:a="http://schemas.openxmlformats.org/drawingml/2006/main">
               <a:graphicData uri="http://schemas.openxmlformats.org/drawingml/2006/picture">
                 <pic:pic xmlns:pic="http://schemas.openxmlformats.org/drawingml/2006/picture">
                   <pic:nvPicPr>
-                    <pic:cNvPr id="362120249" name=""/>
+                    <pic:cNvPr id="1003288522" name=""/>
                     <pic:cNvPicPr/>
                   </pic:nvPicPr>
                   <pic:blipFill>
@@ -20560,7 +20579,7 @@
           <w:sz w:val="27"/>
         </w:rPr>
       </w:pPr>
-      <w:bookmarkStart w:id="44" w:name="_Toc240376205"/>
+      <w:bookmarkStart w:id="44" w:name="_Toc240377180"/>
       <w:r>
         <w:rPr>
           <w:rFonts w:ascii="Montserrat" w:hAnsi="Montserrat"/>
@@ -20825,16 +20844,16 @@
           <w:noProof/>
         </w:rPr>
         <w:drawing>
-          <wp:inline distT="0" distB="0" distL="0" distR="0" wp14:anchorId="410BD6D8" wp14:editId="3F6C6674">
+          <wp:inline distT="0" distB="0" distL="0" distR="0" wp14:anchorId="07589760" wp14:editId="650E3BEF">
             <wp:extent cx="5303520" cy="4267180"/>
             <wp:effectExtent l="19050" t="19050" r="11430" b="19685"/>
-            <wp:docPr id="921670672" name="Imagem 50"/>
+            <wp:docPr id="1660322688" name="Imagem 50"/>
             <wp:cNvGraphicFramePr/>
             <a:graphic xmlns:a="http://schemas.openxmlformats.org/drawingml/2006/main">
               <a:graphicData uri="http://schemas.openxmlformats.org/drawingml/2006/picture">
                 <pic:pic xmlns:pic="http://schemas.openxmlformats.org/drawingml/2006/picture">
                   <pic:nvPicPr>
-                    <pic:cNvPr id="921670672" name=""/>
+                    <pic:cNvPr id="1660322688" name=""/>
                     <pic:cNvPicPr/>
                   </pic:nvPicPr>
                   <pic:blipFill>
@@ -20902,16 +20921,16 @@
           <w:noProof/>
         </w:rPr>
         <w:drawing>
-          <wp:inline distT="0" distB="0" distL="0" distR="0" wp14:anchorId="64A3EB5F" wp14:editId="4D26AB17">
+          <wp:inline distT="0" distB="0" distL="0" distR="0" wp14:anchorId="36DF6F6C" wp14:editId="7B6769A9">
             <wp:extent cx="5303520" cy="3382059"/>
             <wp:effectExtent l="19050" t="19050" r="11430" b="27940"/>
-            <wp:docPr id="45547024" name="Imagem 51"/>
+            <wp:docPr id="1534561889" name="Imagem 51"/>
             <wp:cNvGraphicFramePr/>
             <a:graphic xmlns:a="http://schemas.openxmlformats.org/drawingml/2006/main">
               <a:graphicData uri="http://schemas.openxmlformats.org/drawingml/2006/picture">
                 <pic:pic xmlns:pic="http://schemas.openxmlformats.org/drawingml/2006/picture">
                   <pic:nvPicPr>
-                    <pic:cNvPr id="45547024" name=""/>
+                    <pic:cNvPr id="1534561889" name=""/>
                     <pic:cNvPicPr/>
                   </pic:nvPicPr>
                   <pic:blipFill>
@@ -20979,16 +20998,16 @@
         </w:rPr>
         <w:lastRenderedPageBreak/>
         <w:drawing>
-          <wp:inline distT="0" distB="0" distL="0" distR="0" wp14:anchorId="7B6A0D11" wp14:editId="71DACD1F">
+          <wp:inline distT="0" distB="0" distL="0" distR="0" wp14:anchorId="3FF256BE" wp14:editId="0F92203F">
             <wp:extent cx="5303520" cy="4417800"/>
             <wp:effectExtent l="19050" t="19050" r="11430" b="20955"/>
-            <wp:docPr id="668687507" name="Imagem 52"/>
+            <wp:docPr id="320140157" name="Imagem 52"/>
             <wp:cNvGraphicFramePr/>
             <a:graphic xmlns:a="http://schemas.openxmlformats.org/drawingml/2006/main">
               <a:graphicData uri="http://schemas.openxmlformats.org/drawingml/2006/picture">
                 <pic:pic xmlns:pic="http://schemas.openxmlformats.org/drawingml/2006/picture">
                   <pic:nvPicPr>
-                    <pic:cNvPr id="668687507" name=""/>
+                    <pic:cNvPr id="320140157" name=""/>
                     <pic:cNvPicPr/>
                   </pic:nvPicPr>
                   <pic:blipFill>
@@ -21098,7 +21117,7 @@
           <w:sz w:val="27"/>
         </w:rPr>
       </w:pPr>
-      <w:bookmarkStart w:id="45" w:name="_Toc240376206"/>
+      <w:bookmarkStart w:id="45" w:name="_Toc240377181"/>
       <w:r>
         <w:rPr>
           <w:rFonts w:ascii="Montserrat" w:hAnsi="Montserrat"/>
@@ -21364,16 +21383,16 @@
         </w:rPr>
         <w:lastRenderedPageBreak/>
         <w:drawing>
-          <wp:inline distT="0" distB="0" distL="0" distR="0" wp14:anchorId="11126899" wp14:editId="296FAFAF">
+          <wp:inline distT="0" distB="0" distL="0" distR="0" wp14:anchorId="53B2B05B" wp14:editId="7DE79E09">
             <wp:extent cx="5303520" cy="7628836"/>
             <wp:effectExtent l="19050" t="19050" r="11430" b="10795"/>
-            <wp:docPr id="194882784" name="Imagem 53"/>
+            <wp:docPr id="529175908" name="Imagem 53"/>
             <wp:cNvGraphicFramePr/>
             <a:graphic xmlns:a="http://schemas.openxmlformats.org/drawingml/2006/main">
               <a:graphicData uri="http://schemas.openxmlformats.org/drawingml/2006/picture">
                 <pic:pic xmlns:pic="http://schemas.openxmlformats.org/drawingml/2006/picture">
                   <pic:nvPicPr>
-                    <pic:cNvPr id="194882784" name=""/>
+                    <pic:cNvPr id="529175908" name=""/>
                     <pic:cNvPicPr/>
                   </pic:nvPicPr>
                   <pic:blipFill>
@@ -21505,7 +21524,7 @@
           <w:sz w:val="27"/>
         </w:rPr>
       </w:pPr>
-      <w:bookmarkStart w:id="46" w:name="_Toc240376207"/>
+      <w:bookmarkStart w:id="46" w:name="_Toc240377182"/>
       <w:r>
         <w:rPr>
           <w:rFonts w:ascii="Montserrat" w:hAnsi="Montserrat"/>
@@ -21616,7 +21635,7 @@
           <w:sz w:val="27"/>
         </w:rPr>
       </w:pPr>
-      <w:bookmarkStart w:id="47" w:name="_Toc240376208"/>
+      <w:bookmarkStart w:id="47" w:name="_Toc240377183"/>
       <w:r>
         <w:rPr>
           <w:rFonts w:ascii="Montserrat" w:hAnsi="Montserrat"/>
@@ -21804,66 +21823,6 @@
     </w:p>
     <w:p>
       <w:pPr>
-        <w:pStyle w:val="Ttulo2"/>
-        <w:spacing w:before="320" w:after="120"/>
-        <w:rPr>
-          <w:rFonts w:ascii="Montserrat" w:hAnsi="Montserrat"/>
-          <w:b/>
-          <w:color w:val="B91D2E"/>
-          <w:sz w:val="27"/>
-        </w:rPr>
-      </w:pPr>
-      <w:bookmarkStart w:id="48" w:name="_Toc240376209"/>
-      <w:r>
-        <w:rPr>
-          <w:rFonts w:ascii="Montserrat" w:hAnsi="Montserrat"/>
-          <w:b/>
-          <w:color w:val="B91D2E"/>
-          <w:sz w:val="27"/>
-        </w:rPr>
-        <w:t>6.5 Ambiente de Treino</w:t>
-      </w:r>
-      <w:bookmarkEnd w:id="48"/>
-    </w:p>
-    <w:p>
-      <w:pPr>
-        <w:spacing w:line="280" w:lineRule="auto"/>
-        <w:rPr>
-          <w:rFonts w:ascii="Montserrat" w:hAnsi="Montserrat"/>
-          <w:color w:val="1A1A1A"/>
-          <w:sz w:val="22"/>
-        </w:rPr>
-      </w:pPr>
-      <w:r>
-        <w:rPr>
-          <w:rFonts w:ascii="Montserrat" w:hAnsi="Montserrat"/>
-          <w:color w:val="1A1A1A"/>
-          <w:sz w:val="22"/>
-        </w:rPr>
-        <w:t>O sistema tem um ambiente de treinamento/demonstracao totalmente separado da producao - mesma ferramenta, mesmo schema de dados, mas um banco proprio, populado com 7 projetos ficticios cobrindo o ciclo completo (de uma Solicitacao de Demanda ainda pendente ate um projeto totalmente encerrado com TEP e RLA). Serve para apresentacoes, estudo e capacitacao sem tocar em nenhum dado real. Veja o roteiro Como rodar o Ambiente de Treinamento para o endereco, as contas de acesso e o passo a passo completo.</w:t>
-      </w:r>
-    </w:p>
-    <w:p>
-      <w:pPr>
-        <w:spacing w:line="280" w:lineRule="auto"/>
-        <w:rPr>
-          <w:rFonts w:ascii="Montserrat" w:hAnsi="Montserrat"/>
-          <w:color w:val="1A1A1A"/>
-          <w:sz w:val="22"/>
-        </w:rPr>
-      </w:pPr>
-      <w:r>
-        <w:rPr>
-          <w:rFonts w:ascii="Montserrat" w:hAnsi="Montserrat"/>
-          <w:color w:val="1A1A1A"/>
-          <w:sz w:val="22"/>
-        </w:rPr>
-        <w:lastRenderedPageBreak/>
-        <w:t>Quando a Administracao e acessada em producao, aparece uma quarta aba, Ambiente de Treino, com um unico botao: Resetar ambiente de treinamento. Ao clicar (e confirmar o aviso), o sistema apaga todos os projetos e registros de formulario atualmente no ambiente de treinamento e recria os 7 projetos de exemplo do zero - util para deixar o ambiente limpo antes de uma nova turma, sem precisar rodar nenhum comando manualmente.</w:t>
-      </w:r>
-    </w:p>
-    <w:p>
-      <w:pPr>
         <w:pStyle w:val="PargrafodaLista"/>
         <w:numPr>
           <w:ilvl w:val="0"/>
@@ -21883,7 +21842,75 @@
           <w:color w:val="1A1A1A"/>
           <w:sz w:val="22"/>
         </w:rPr>
-        <w:t>A aba so aparece quando a Administracao e acessada pelo endereco de producao - quem acessa a Administracao pelo proprio ambiente de treinamento nao ve essa opcao.</w:t>
+        <w:t>O e-mail inclui um link direto para a Ficha do Projeto (secao 6.4.1) daquele projeto, para abrir a saude do projeto e o cronograma completo sem precisar navegar manualmente.</w:t>
+      </w:r>
+    </w:p>
+    <w:p>
+      <w:pPr>
+        <w:pStyle w:val="Ttulo2"/>
+        <w:spacing w:before="320" w:after="120"/>
+        <w:rPr>
+          <w:rFonts w:ascii="Montserrat" w:hAnsi="Montserrat"/>
+          <w:b/>
+          <w:color w:val="B91D2E"/>
+          <w:sz w:val="27"/>
+        </w:rPr>
+      </w:pPr>
+      <w:bookmarkStart w:id="48" w:name="_Toc240377184"/>
+      <w:r>
+        <w:rPr>
+          <w:rFonts w:ascii="Montserrat" w:hAnsi="Montserrat"/>
+          <w:b/>
+          <w:color w:val="B91D2E"/>
+          <w:sz w:val="27"/>
+        </w:rPr>
+        <w:t>6.5 Ambiente de Treino</w:t>
+      </w:r>
+      <w:bookmarkEnd w:id="48"/>
+    </w:p>
+    <w:p>
+      <w:pPr>
+        <w:spacing w:line="280" w:lineRule="auto"/>
+        <w:rPr>
+          <w:rFonts w:ascii="Montserrat" w:hAnsi="Montserrat"/>
+          <w:color w:val="1A1A1A"/>
+          <w:sz w:val="22"/>
+        </w:rPr>
+      </w:pPr>
+      <w:r>
+        <w:rPr>
+          <w:rFonts w:ascii="Montserrat" w:hAnsi="Montserrat"/>
+          <w:color w:val="1A1A1A"/>
+          <w:sz w:val="22"/>
+        </w:rPr>
+        <w:t xml:space="preserve">O sistema tem um ambiente de treinamento/demonstracao totalmente separado da producao - mesma ferramenta, mesmo schema de dados, mas um banco proprio, populado com 7 projetos ficticios cobrindo o ciclo completo (de uma Solicitacao de Demanda ainda pendente ate um projeto totalmente </w:t>
+      </w:r>
+      <w:r>
+        <w:rPr>
+          <w:rFonts w:ascii="Montserrat" w:hAnsi="Montserrat"/>
+          <w:color w:val="1A1A1A"/>
+          <w:sz w:val="22"/>
+        </w:rPr>
+        <w:lastRenderedPageBreak/>
+        <w:t>encerrado com TEP e RLA). Serve para apresentacoes, estudo e capacitacao sem tocar em nenhum dado real. Veja o roteiro Como rodar o Ambiente de Treinamento para o endereco, as contas de acesso e o passo a passo completo.</w:t>
+      </w:r>
+    </w:p>
+    <w:p>
+      <w:pPr>
+        <w:spacing w:line="280" w:lineRule="auto"/>
+        <w:rPr>
+          <w:rFonts w:ascii="Montserrat" w:hAnsi="Montserrat"/>
+          <w:color w:val="1A1A1A"/>
+          <w:sz w:val="22"/>
+        </w:rPr>
+      </w:pPr>
+      <w:r>
+        <w:rPr>
+          <w:rFonts w:ascii="Montserrat" w:hAnsi="Montserrat"/>
+          <w:color w:val="1A1A1A"/>
+          <w:sz w:val="22"/>
+        </w:rPr>
+        <w:t>Quando a Administracao e acessada em producao, aparece uma quarta aba, Ambiente de Treino, com um unico botao: Resetar ambiente de treinamento. Ao clicar (e confirmar o aviso), o sistema apaga todos os projetos e registros de formulario atualmente no ambiente de treinamento e recria os 7 projetos de exemplo do zero - util para deixar o ambiente limpo antes de uma nova turma, sem precisar rodar nenhum comando manualmente.</w:t>
       </w:r>
     </w:p>
     <w:p>
@@ -21907,7 +21934,7 @@
           <w:color w:val="1A1A1A"/>
           <w:sz w:val="22"/>
         </w:rPr>
-        <w:t>Nao afeta nenhum dado de producao em nenhuma hipotese - a acao roda numa Edge Function que so tem permissao de escrita no banco do ambiente de treinamento.</w:t>
+        <w:t>A aba so aparece quando a Administracao e acessada pelo endereco de producao - quem acessa a Administracao pelo proprio ambiente de treinamento nao ve essa opcao.</w:t>
       </w:r>
     </w:p>
     <w:p>
@@ -21931,6 +21958,30 @@
           <w:color w:val="1A1A1A"/>
           <w:sz w:val="22"/>
         </w:rPr>
+        <w:t>Nao afeta nenhum dado de producao em nenhuma hipotese - a acao roda numa Edge Function que so tem permissao de escrita no banco do ambiente de treinamento.</w:t>
+      </w:r>
+    </w:p>
+    <w:p>
+      <w:pPr>
+        <w:pStyle w:val="PargrafodaLista"/>
+        <w:numPr>
+          <w:ilvl w:val="0"/>
+          <w:numId w:val="36"/>
+        </w:numPr>
+        <w:spacing w:after="80" w:line="260" w:lineRule="auto"/>
+        <w:ind w:left="700"/>
+        <w:rPr>
+          <w:rFonts w:ascii="Montserrat" w:hAnsi="Montserrat"/>
+          <w:color w:val="1A1A1A"/>
+          <w:sz w:val="22"/>
+        </w:rPr>
+      </w:pPr>
+      <w:r>
+        <w:rPr>
+          <w:rFonts w:ascii="Montserrat" w:hAnsi="Montserrat"/>
+          <w:color w:val="1A1A1A"/>
+          <w:sz w:val="22"/>
+        </w:rPr>
         <w:t>As 6 contas fixas de treinamento e as configuracoes do ambiente de treino nao sao apagadas pelo reset - so os projetos e os registros de formulario.</w:t>
       </w:r>
     </w:p>
@@ -21966,7 +22017,7 @@
           <w:sz w:val="27"/>
         </w:rPr>
       </w:pPr>
-      <w:bookmarkStart w:id="49" w:name="_Toc240376210"/>
+      <w:bookmarkStart w:id="49" w:name="_Toc240377185"/>
       <w:r>
         <w:rPr>
           <w:rFonts w:ascii="Montserrat" w:hAnsi="Montserrat"/>
@@ -22137,7 +22188,16 @@
           <w:color w:val="1A1A1A"/>
           <w:sz w:val="22"/>
         </w:rPr>
-        <w:t>E-mails com acesso ao destino externo: campo de registro/referencia de quem deveria ter permissao na pasta de destino - conceder esse acesso de fato continua sendo feito manualmente onde o destino estiver (OneDrive, repositorio etc.).</w:t>
+        <w:t xml:space="preserve">E-mails com acesso ao destino externo: campo de registro/referencia de quem deveria ter permissao na pasta de destino - conceder esse acesso </w:t>
+      </w:r>
+      <w:r>
+        <w:rPr>
+          <w:rFonts w:ascii="Montserrat" w:hAnsi="Montserrat"/>
+          <w:color w:val="1A1A1A"/>
+          <w:sz w:val="22"/>
+        </w:rPr>
+        <w:lastRenderedPageBreak/>
+        <w:t>de fato continua sendo feito manualmente onde o destino estiver (OneDrive, repositorio etc.).</w:t>
       </w:r>
     </w:p>
     <w:p>
@@ -22185,7 +22245,6 @@
           <w:color w:val="1A1A1A"/>
           <w:sz w:val="22"/>
         </w:rPr>
-        <w:lastRenderedPageBreak/>
         <w:t>Ultima execucao: data/hora e status (sucesso ou falha) da ultima vez que a rotina automatizada rodou, preenchido por ela mesma.</w:t>
       </w:r>
     </w:p>
@@ -22259,16 +22318,16 @@
           <w:noProof/>
         </w:rPr>
         <w:drawing>
-          <wp:inline distT="0" distB="0" distL="0" distR="0" wp14:anchorId="37CE78DF" wp14:editId="78676F0C">
+          <wp:inline distT="0" distB="0" distL="0" distR="0" wp14:anchorId="19A9489F" wp14:editId="38F8EBA1">
             <wp:extent cx="5303520" cy="1351384"/>
             <wp:effectExtent l="19050" t="19050" r="11430" b="20320"/>
-            <wp:docPr id="257592931" name="Imagem 54"/>
+            <wp:docPr id="152124951" name="Imagem 54"/>
             <wp:cNvGraphicFramePr/>
             <a:graphic xmlns:a="http://schemas.openxmlformats.org/drawingml/2006/main">
               <a:graphicData uri="http://schemas.openxmlformats.org/drawingml/2006/picture">
                 <pic:pic xmlns:pic="http://schemas.openxmlformats.org/drawingml/2006/picture">
                   <pic:nvPicPr>
-                    <pic:cNvPr id="257592931" name=""/>
+                    <pic:cNvPr id="152124951" name=""/>
                     <pic:cNvPicPr/>
                   </pic:nvPicPr>
                   <pic:blipFill>
@@ -22336,7 +22395,7 @@
           <w:sz w:val="27"/>
         </w:rPr>
       </w:pPr>
-      <w:bookmarkStart w:id="50" w:name="_Toc240376211"/>
+      <w:bookmarkStart w:id="50" w:name="_Toc240377186"/>
       <w:r>
         <w:rPr>
           <w:rFonts w:ascii="Montserrat" w:hAnsi="Montserrat"/>
@@ -22387,16 +22446,8 @@
           <w:color w:val="1A1A1A"/>
           <w:sz w:val="22"/>
         </w:rPr>
-        <w:t xml:space="preserve">Marcos no prazo: % dos marcos de projetos ainda ativos no Relatorio de Situacao (secao 4.1) que NAO estao atrasados - a data-alvo (do cronograma do Planejamento) ainda nao passou, o marco ja tem </w:t>
-      </w:r>
-      <w:r>
-        <w:rPr>
-          <w:rFonts w:ascii="Montserrat" w:hAnsi="Montserrat"/>
-          <w:color w:val="1A1A1A"/>
-          <w:sz w:val="22"/>
-        </w:rPr>
         <w:lastRenderedPageBreak/>
-        <w:t>Conclusao real preenchida no Planejamento, ou o marco esta marcado como Concluido/Cancelado.</w:t>
+        <w:t>Marcos no prazo: % dos marcos de projetos ainda ativos no Relatorio de Situacao (secao 4.1) que NAO estao atrasados - a data-alvo (do cronograma do Planejamento) ainda nao passou, o marco ja tem Conclusao real preenchida no Planejamento, ou o marco esta marcado como Concluido/Cancelado.</w:t>
       </w:r>
     </w:p>
     <w:p>
@@ -22481,16 +22532,16 @@
           <w:noProof/>
         </w:rPr>
         <w:drawing>
-          <wp:inline distT="0" distB="0" distL="0" distR="0" wp14:anchorId="3D7BCD44" wp14:editId="49E9AF27">
+          <wp:inline distT="0" distB="0" distL="0" distR="0" wp14:anchorId="1269F37F" wp14:editId="5E4A767E">
             <wp:extent cx="5303520" cy="1422793"/>
             <wp:effectExtent l="19050" t="19050" r="11430" b="25400"/>
-            <wp:docPr id="341980309" name="Imagem 55"/>
+            <wp:docPr id="1218822052" name="Imagem 55"/>
             <wp:cNvGraphicFramePr/>
             <a:graphic xmlns:a="http://schemas.openxmlformats.org/drawingml/2006/main">
               <a:graphicData uri="http://schemas.openxmlformats.org/drawingml/2006/picture">
                 <pic:pic xmlns:pic="http://schemas.openxmlformats.org/drawingml/2006/picture">
                   <pic:nvPicPr>
-                    <pic:cNvPr id="341980309" name=""/>
+                    <pic:cNvPr id="1218822052" name=""/>
                     <pic:cNvPicPr/>
                   </pic:nvPicPr>
                   <pic:blipFill>
@@ -22607,7 +22658,7 @@
           <w:color w:val="6A6A70"/>
           <w:sz w:val="21"/>
         </w:rPr>
-        <w:t xml:space="preserve">O Planejamento guarda tanto a data-alvo (Termino previsto) quanto a Conclusao real de cada marco, entao o indicador ja distingue um marco que terminou no prazo de um que so ainda nao venceu. Projetos dentro do orcamento e Entraves resolvidos continuam aparecendo como travessao (-) </w:t>
+        <w:t xml:space="preserve">O Planejamento guarda tanto a data-alvo (Termino previsto) quanto a Conclusao real de cada marco, entao o indicador ja distingue um marco que </w:t>
       </w:r>
       <w:r>
         <w:rPr>
@@ -22617,7 +22668,7 @@
           <w:sz w:val="21"/>
         </w:rPr>
         <w:lastRenderedPageBreak/>
-        <w:t>quando nao ha dado suficiente para calcular, em vez de mostrar um numero sem base.</w:t>
+        <w:t>terminou no prazo de um que so ainda nao venceu. Projetos dentro do orcamento e Entraves resolvidos continuam aparecendo como travessao (-) quando nao ha dado suficiente para calcular, em vez de mostrar um numero sem base.</w:t>
       </w:r>
     </w:p>
     <w:p>
@@ -22654,16 +22705,16 @@
           <w:noProof/>
         </w:rPr>
         <w:drawing>
-          <wp:inline distT="0" distB="0" distL="0" distR="0" wp14:anchorId="5B386B25" wp14:editId="7573B720">
+          <wp:inline distT="0" distB="0" distL="0" distR="0" wp14:anchorId="3EFE5B0E" wp14:editId="352A44FD">
             <wp:extent cx="5303520" cy="1841050"/>
             <wp:effectExtent l="19050" t="19050" r="11430" b="26035"/>
-            <wp:docPr id="1752879795" name="Imagem 56"/>
+            <wp:docPr id="1095811320" name="Imagem 56"/>
             <wp:cNvGraphicFramePr/>
             <a:graphic xmlns:a="http://schemas.openxmlformats.org/drawingml/2006/main">
               <a:graphicData uri="http://schemas.openxmlformats.org/drawingml/2006/picture">
                 <pic:pic xmlns:pic="http://schemas.openxmlformats.org/drawingml/2006/picture">
                   <pic:nvPicPr>
-                    <pic:cNvPr id="1752879795" name=""/>
+                    <pic:cNvPr id="1095811320" name=""/>
                     <pic:cNvPicPr/>
                   </pic:nvPicPr>
                   <pic:blipFill>
@@ -22817,16 +22868,16 @@
           <w:noProof/>
         </w:rPr>
         <w:drawing>
-          <wp:inline distT="0" distB="0" distL="0" distR="0" wp14:anchorId="61F80C24" wp14:editId="562EC9E8">
+          <wp:inline distT="0" distB="0" distL="0" distR="0" wp14:anchorId="4D01602F" wp14:editId="176FAA6A">
             <wp:extent cx="5303520" cy="303041"/>
             <wp:effectExtent l="19050" t="19050" r="11430" b="20955"/>
-            <wp:docPr id="995131327" name="Imagem 57"/>
+            <wp:docPr id="180319416" name="Imagem 57"/>
             <wp:cNvGraphicFramePr/>
             <a:graphic xmlns:a="http://schemas.openxmlformats.org/drawingml/2006/main">
               <a:graphicData uri="http://schemas.openxmlformats.org/drawingml/2006/picture">
                 <pic:pic xmlns:pic="http://schemas.openxmlformats.org/drawingml/2006/picture">
                   <pic:nvPicPr>
-                    <pic:cNvPr id="995131327" name=""/>
+                    <pic:cNvPr id="180319416" name=""/>
                     <pic:cNvPicPr/>
                   </pic:nvPicPr>
                   <pic:blipFill>
@@ -22894,16 +22945,16 @@
         </w:rPr>
         <w:lastRenderedPageBreak/>
         <w:drawing>
-          <wp:inline distT="0" distB="0" distL="0" distR="0" wp14:anchorId="395A2E4E" wp14:editId="006EE173">
+          <wp:inline distT="0" distB="0" distL="0" distR="0" wp14:anchorId="41CECACB" wp14:editId="1F6DF780">
             <wp:extent cx="5303520" cy="2983005"/>
             <wp:effectExtent l="19050" t="19050" r="11430" b="27305"/>
-            <wp:docPr id="892602547" name="Imagem 58"/>
+            <wp:docPr id="499541414" name="Imagem 58"/>
             <wp:cNvGraphicFramePr/>
             <a:graphic xmlns:a="http://schemas.openxmlformats.org/drawingml/2006/main">
               <a:graphicData uri="http://schemas.openxmlformats.org/drawingml/2006/picture">
                 <pic:pic xmlns:pic="http://schemas.openxmlformats.org/drawingml/2006/picture">
                   <pic:nvPicPr>
-                    <pic:cNvPr id="892602547" name=""/>
+                    <pic:cNvPr id="499541414" name=""/>
                     <pic:cNvPicPr/>
                   </pic:nvPicPr>
                   <pic:blipFill>
@@ -22975,7 +23026,7 @@
           <w:sz w:val="34"/>
         </w:rPr>
       </w:pPr>
-      <w:bookmarkStart w:id="51" w:name="_Toc240376212"/>
+      <w:bookmarkStart w:id="51" w:name="_Toc240377187"/>
       <w:r>
         <w:rPr>
           <w:rFonts w:ascii="Montserrat" w:hAnsi="Montserrat"/>
@@ -23219,7 +23270,7 @@
           <w:sz w:val="34"/>
         </w:rPr>
       </w:pPr>
-      <w:bookmarkStart w:id="52" w:name="_Toc240376213"/>
+      <w:bookmarkStart w:id="52" w:name="_Toc240377188"/>
       <w:r>
         <w:rPr>
           <w:rFonts w:ascii="Montserrat" w:hAnsi="Montserrat"/>
@@ -25007,7 +25058,7 @@
 <file path=word/numbering.xml><?xml version="1.0" encoding="utf-8"?>
 <w:numbering xmlns:wpc="http://schemas.microsoft.com/office/word/2010/wordprocessingCanvas" xmlns:cx="http://schemas.microsoft.com/office/drawing/2014/chartex" xmlns:cx1="http://schemas.microsoft.com/office/drawing/2015/9/8/chartex" xmlns:cx2="http://schemas.microsoft.com/office/drawing/2015/10/21/chartex" xmlns:cx3="http://schemas.microsoft.com/office/drawing/2016/5/9/chartex" xmlns:cx4="http://schemas.microsoft.com/office/drawing/2016/5/10/chartex" xmlns:cx5="http://schemas.microsoft.com/office/drawing/2016/5/11/chartex" xmlns:cx6="http://schemas.microsoft.com/office/drawing/2016/5/12/chartex" xmlns:cx7="http://schemas.microsoft.com/office/drawing/2016/5/13/chartex" xmlns:cx8="http://schemas.microsoft.com/office/drawing/2016/5/14/chartex" xmlns:mc="http://schemas.openxmlformats.org/markup-compatibility/2006" xmlns:aink="http://schemas.microsoft.com/office/drawing/2016/ink" xmlns:am3d="http://schemas.microsoft.com/office/drawing/2017/model3d" xmlns:o="urn:schemas-microsoft-com:office:office" xmlns:oel="http://schemas.microsoft.com/office/2019/extlst" xmlns:r="http://schemas.openxmlformats.org/officeDocument/2006/relationships" xmlns:m="http://schemas.openxmlformats.org/officeDocument/2006/math" xmlns:v="urn:schemas-microsoft-com:vml" xmlns:wp14="http://schemas.microsoft.com/office/word/2010/wordprocessingDrawing" xmlns:wp="http://schemas.openxmlformats.org/drawingml/2006/wordprocessingDrawing" xmlns:w10="urn:schemas-microsoft-com:office:word" xmlns:w="http://schemas.openxmlformats.org/wordprocessingml/2006/main" xmlns:w14="http://schemas.microsoft.com/office/word/2010/wordml" xmlns:w15="http://schemas.microsoft.com/office/word/2012/wordml" xmlns:w16cex="http://schemas.microsoft.com/office/word/2018/wordml/cex" xmlns:w16cid="http://schemas.microsoft.com/office/word/2016/wordml/cid" xmlns:w16="http://schemas.microsoft.com/office/word/2018/wordml" xmlns:w16du="http://schemas.microsoft.com/office/word/2023/wordml/word16du" xmlns:w16sdtdh="http://schemas.microsoft.com/office/word/2020/wordml/sdtdatahash" xmlns:w16sdtfl="http://schemas.microsoft.com/office/word/2024/wordml/sdtformatlock" xmlns:w16se="http://schemas.microsoft.com/office/word/2015/wordml/symex" xmlns:wpg="http://schemas.microsoft.com/office/word/2010/wordprocessingGroup" xmlns:wpi="http://schemas.microsoft.com/office/word/2010/wordprocessingInk" xmlns:wne="http://schemas.microsoft.com/office/word/2006/wordml" xmlns:wps="http://schemas.microsoft.com/office/word/2010/wordprocessingShape" mc:Ignorable="w14 w15 w16se w16cid w16 w16cex w16sdtdh w16sdtfl w16du wp14">
   <w:abstractNum w:abstractNumId="0" w15:restartNumberingAfterBreak="0">
-    <w:nsid w:val="00E33A19"/>
+    <w:nsid w:val="04A445D3"/>
     <w:multiLevelType w:val="singleLevel"/>
     <w:tmpl w:val="04160001"/>
     <w:lvl w:ilvl="0">
@@ -25024,7 +25075,7 @@
     </w:lvl>
   </w:abstractNum>
   <w:abstractNum w:abstractNumId="1" w15:restartNumberingAfterBreak="0">
-    <w:nsid w:val="04387FD3"/>
+    <w:nsid w:val="05C4692B"/>
     <w:multiLevelType w:val="singleLevel"/>
     <w:tmpl w:val="04160001"/>
     <w:lvl w:ilvl="0">
@@ -25041,7 +25092,7 @@
     </w:lvl>
   </w:abstractNum>
   <w:abstractNum w:abstractNumId="2" w15:restartNumberingAfterBreak="0">
-    <w:nsid w:val="07602B20"/>
+    <w:nsid w:val="0B25328F"/>
     <w:multiLevelType w:val="singleLevel"/>
     <w:tmpl w:val="04160001"/>
     <w:lvl w:ilvl="0">
@@ -25058,7 +25109,7 @@
     </w:lvl>
   </w:abstractNum>
   <w:abstractNum w:abstractNumId="3" w15:restartNumberingAfterBreak="0">
-    <w:nsid w:val="08C40370"/>
+    <w:nsid w:val="0B3700E6"/>
     <w:multiLevelType w:val="singleLevel"/>
     <w:tmpl w:val="04160001"/>
     <w:lvl w:ilvl="0">
@@ -25075,7 +25126,7 @@
     </w:lvl>
   </w:abstractNum>
   <w:abstractNum w:abstractNumId="4" w15:restartNumberingAfterBreak="0">
-    <w:nsid w:val="0D051AEF"/>
+    <w:nsid w:val="0B404EDD"/>
     <w:multiLevelType w:val="singleLevel"/>
     <w:tmpl w:val="04160001"/>
     <w:lvl w:ilvl="0">
@@ -25092,7 +25143,7 @@
     </w:lvl>
   </w:abstractNum>
   <w:abstractNum w:abstractNumId="5" w15:restartNumberingAfterBreak="0">
-    <w:nsid w:val="11F16D66"/>
+    <w:nsid w:val="0D756567"/>
     <w:multiLevelType w:val="singleLevel"/>
     <w:tmpl w:val="04160001"/>
     <w:lvl w:ilvl="0">
@@ -25109,7 +25160,7 @@
     </w:lvl>
   </w:abstractNum>
   <w:abstractNum w:abstractNumId="6" w15:restartNumberingAfterBreak="0">
-    <w:nsid w:val="1409627B"/>
+    <w:nsid w:val="113E35CC"/>
     <w:multiLevelType w:val="singleLevel"/>
     <w:tmpl w:val="04160001"/>
     <w:lvl w:ilvl="0">
@@ -25126,7 +25177,7 @@
     </w:lvl>
   </w:abstractNum>
   <w:abstractNum w:abstractNumId="7" w15:restartNumberingAfterBreak="0">
-    <w:nsid w:val="155D397F"/>
+    <w:nsid w:val="14C8014D"/>
     <w:multiLevelType w:val="singleLevel"/>
     <w:tmpl w:val="04160001"/>
     <w:lvl w:ilvl="0">
@@ -25143,7 +25194,7 @@
     </w:lvl>
   </w:abstractNum>
   <w:abstractNum w:abstractNumId="8" w15:restartNumberingAfterBreak="0">
-    <w:nsid w:val="182452EB"/>
+    <w:nsid w:val="185D5A8B"/>
     <w:multiLevelType w:val="singleLevel"/>
     <w:tmpl w:val="04160001"/>
     <w:lvl w:ilvl="0">
@@ -25160,7 +25211,7 @@
     </w:lvl>
   </w:abstractNum>
   <w:abstractNum w:abstractNumId="9" w15:restartNumberingAfterBreak="0">
-    <w:nsid w:val="18ED7301"/>
+    <w:nsid w:val="237045B9"/>
     <w:multiLevelType w:val="singleLevel"/>
     <w:tmpl w:val="04160001"/>
     <w:lvl w:ilvl="0">
@@ -25177,7 +25228,7 @@
     </w:lvl>
   </w:abstractNum>
   <w:abstractNum w:abstractNumId="10" w15:restartNumberingAfterBreak="0">
-    <w:nsid w:val="1CF11208"/>
+    <w:nsid w:val="2A0250F4"/>
     <w:multiLevelType w:val="singleLevel"/>
     <w:tmpl w:val="04160001"/>
     <w:lvl w:ilvl="0">
@@ -25194,7 +25245,7 @@
     </w:lvl>
   </w:abstractNum>
   <w:abstractNum w:abstractNumId="11" w15:restartNumberingAfterBreak="0">
-    <w:nsid w:val="1FCF1044"/>
+    <w:nsid w:val="2CB00DC4"/>
     <w:multiLevelType w:val="singleLevel"/>
     <w:tmpl w:val="04160001"/>
     <w:lvl w:ilvl="0">
@@ -25211,7 +25262,7 @@
     </w:lvl>
   </w:abstractNum>
   <w:abstractNum w:abstractNumId="12" w15:restartNumberingAfterBreak="0">
-    <w:nsid w:val="220D7C5D"/>
+    <w:nsid w:val="2EC863FF"/>
     <w:multiLevelType w:val="singleLevel"/>
     <w:tmpl w:val="04160001"/>
     <w:lvl w:ilvl="0">
@@ -25228,7 +25279,7 @@
     </w:lvl>
   </w:abstractNum>
   <w:abstractNum w:abstractNumId="13" w15:restartNumberingAfterBreak="0">
-    <w:nsid w:val="24AD2B66"/>
+    <w:nsid w:val="332E1B27"/>
     <w:multiLevelType w:val="singleLevel"/>
     <w:tmpl w:val="04160001"/>
     <w:lvl w:ilvl="0">
@@ -25245,7 +25296,7 @@
     </w:lvl>
   </w:abstractNum>
   <w:abstractNum w:abstractNumId="14" w15:restartNumberingAfterBreak="0">
-    <w:nsid w:val="2516032D"/>
+    <w:nsid w:val="3ABA1F24"/>
     <w:multiLevelType w:val="singleLevel"/>
     <w:tmpl w:val="04160001"/>
     <w:lvl w:ilvl="0">
@@ -25262,7 +25313,7 @@
     </w:lvl>
   </w:abstractNum>
   <w:abstractNum w:abstractNumId="15" w15:restartNumberingAfterBreak="0">
-    <w:nsid w:val="297A798D"/>
+    <w:nsid w:val="3B3D5D8A"/>
     <w:multiLevelType w:val="singleLevel"/>
     <w:tmpl w:val="04160001"/>
     <w:lvl w:ilvl="0">
@@ -25279,7 +25330,7 @@
     </w:lvl>
   </w:abstractNum>
   <w:abstractNum w:abstractNumId="16" w15:restartNumberingAfterBreak="0">
-    <w:nsid w:val="2F854B97"/>
+    <w:nsid w:val="3DC037D4"/>
     <w:multiLevelType w:val="singleLevel"/>
     <w:tmpl w:val="04160001"/>
     <w:lvl w:ilvl="0">
@@ -25296,7 +25347,7 @@
     </w:lvl>
   </w:abstractNum>
   <w:abstractNum w:abstractNumId="17" w15:restartNumberingAfterBreak="0">
-    <w:nsid w:val="307E088B"/>
+    <w:nsid w:val="3EF041A4"/>
     <w:multiLevelType w:val="singleLevel"/>
     <w:tmpl w:val="04160001"/>
     <w:lvl w:ilvl="0">
@@ -25313,7 +25364,7 @@
     </w:lvl>
   </w:abstractNum>
   <w:abstractNum w:abstractNumId="18" w15:restartNumberingAfterBreak="0">
-    <w:nsid w:val="32005684"/>
+    <w:nsid w:val="4C051769"/>
     <w:multiLevelType w:val="singleLevel"/>
     <w:tmpl w:val="04160001"/>
     <w:lvl w:ilvl="0">
@@ -25330,7 +25381,7 @@
     </w:lvl>
   </w:abstractNum>
   <w:abstractNum w:abstractNumId="19" w15:restartNumberingAfterBreak="0">
-    <w:nsid w:val="362D1F90"/>
+    <w:nsid w:val="4E600A21"/>
     <w:multiLevelType w:val="singleLevel"/>
     <w:tmpl w:val="04160001"/>
     <w:lvl w:ilvl="0">
@@ -25347,7 +25398,7 @@
     </w:lvl>
   </w:abstractNum>
   <w:abstractNum w:abstractNumId="20" w15:restartNumberingAfterBreak="0">
-    <w:nsid w:val="3C1A78DA"/>
+    <w:nsid w:val="568F6282"/>
     <w:multiLevelType w:val="singleLevel"/>
     <w:tmpl w:val="04160001"/>
     <w:lvl w:ilvl="0">
@@ -25364,7 +25415,7 @@
     </w:lvl>
   </w:abstractNum>
   <w:abstractNum w:abstractNumId="21" w15:restartNumberingAfterBreak="0">
-    <w:nsid w:val="3C3279A3"/>
+    <w:nsid w:val="5D5559B8"/>
     <w:multiLevelType w:val="singleLevel"/>
     <w:tmpl w:val="04160001"/>
     <w:lvl w:ilvl="0">
@@ -25381,7 +25432,7 @@
     </w:lvl>
   </w:abstractNum>
   <w:abstractNum w:abstractNumId="22" w15:restartNumberingAfterBreak="0">
-    <w:nsid w:val="3D3B32B5"/>
+    <w:nsid w:val="61D20A1B"/>
     <w:multiLevelType w:val="singleLevel"/>
     <w:tmpl w:val="04160001"/>
     <w:lvl w:ilvl="0">
@@ -25398,7 +25449,7 @@
     </w:lvl>
   </w:abstractNum>
   <w:abstractNum w:abstractNumId="23" w15:restartNumberingAfterBreak="0">
-    <w:nsid w:val="42AF0447"/>
+    <w:nsid w:val="62900363"/>
     <w:multiLevelType w:val="singleLevel"/>
     <w:tmpl w:val="04160001"/>
     <w:lvl w:ilvl="0">
@@ -25415,7 +25466,7 @@
     </w:lvl>
   </w:abstractNum>
   <w:abstractNum w:abstractNumId="24" w15:restartNumberingAfterBreak="0">
-    <w:nsid w:val="473C0436"/>
+    <w:nsid w:val="63CA0D9B"/>
     <w:multiLevelType w:val="singleLevel"/>
     <w:tmpl w:val="04160001"/>
     <w:lvl w:ilvl="0">
@@ -25432,7 +25483,7 @@
     </w:lvl>
   </w:abstractNum>
   <w:abstractNum w:abstractNumId="25" w15:restartNumberingAfterBreak="0">
-    <w:nsid w:val="4D213104"/>
+    <w:nsid w:val="67D648FC"/>
     <w:multiLevelType w:val="singleLevel"/>
     <w:tmpl w:val="04160001"/>
     <w:lvl w:ilvl="0">
@@ -25449,7 +25500,7 @@
     </w:lvl>
   </w:abstractNum>
   <w:abstractNum w:abstractNumId="26" w15:restartNumberingAfterBreak="0">
-    <w:nsid w:val="4E0B5389"/>
+    <w:nsid w:val="67DE0E07"/>
     <w:multiLevelType w:val="singleLevel"/>
     <w:tmpl w:val="04160001"/>
     <w:lvl w:ilvl="0">
@@ -25466,7 +25517,7 @@
     </w:lvl>
   </w:abstractNum>
   <w:abstractNum w:abstractNumId="27" w15:restartNumberingAfterBreak="0">
-    <w:nsid w:val="5224765C"/>
+    <w:nsid w:val="68BE1697"/>
     <w:multiLevelType w:val="singleLevel"/>
     <w:tmpl w:val="04160001"/>
     <w:lvl w:ilvl="0">
@@ -25483,7 +25534,7 @@
     </w:lvl>
   </w:abstractNum>
   <w:abstractNum w:abstractNumId="28" w15:restartNumberingAfterBreak="0">
-    <w:nsid w:val="57860B50"/>
+    <w:nsid w:val="6D4E0740"/>
     <w:multiLevelType w:val="singleLevel"/>
     <w:tmpl w:val="04160001"/>
     <w:lvl w:ilvl="0">
@@ -25500,7 +25551,7 @@
     </w:lvl>
   </w:abstractNum>
   <w:abstractNum w:abstractNumId="29" w15:restartNumberingAfterBreak="0">
-    <w:nsid w:val="62465C36"/>
+    <w:nsid w:val="6FBC60E2"/>
     <w:multiLevelType w:val="singleLevel"/>
     <w:tmpl w:val="04160001"/>
     <w:lvl w:ilvl="0">
@@ -25517,7 +25568,7 @@
     </w:lvl>
   </w:abstractNum>
   <w:abstractNum w:abstractNumId="30" w15:restartNumberingAfterBreak="0">
-    <w:nsid w:val="63A86D16"/>
+    <w:nsid w:val="6FC52E78"/>
     <w:multiLevelType w:val="singleLevel"/>
     <w:tmpl w:val="04160001"/>
     <w:lvl w:ilvl="0">
@@ -25534,7 +25585,7 @@
     </w:lvl>
   </w:abstractNum>
   <w:abstractNum w:abstractNumId="31" w15:restartNumberingAfterBreak="0">
-    <w:nsid w:val="640024AA"/>
+    <w:nsid w:val="70B93F53"/>
     <w:multiLevelType w:val="singleLevel"/>
     <w:tmpl w:val="04160001"/>
     <w:lvl w:ilvl="0">
@@ -25551,7 +25602,7 @@
     </w:lvl>
   </w:abstractNum>
   <w:abstractNum w:abstractNumId="32" w15:restartNumberingAfterBreak="0">
-    <w:nsid w:val="6AA80F33"/>
+    <w:nsid w:val="73C52E92"/>
     <w:multiLevelType w:val="singleLevel"/>
     <w:tmpl w:val="04160001"/>
     <w:lvl w:ilvl="0">
@@ -25568,7 +25619,7 @@
     </w:lvl>
   </w:abstractNum>
   <w:abstractNum w:abstractNumId="33" w15:restartNumberingAfterBreak="0">
-    <w:nsid w:val="6D47099E"/>
+    <w:nsid w:val="74D55241"/>
     <w:multiLevelType w:val="singleLevel"/>
     <w:tmpl w:val="04160001"/>
     <w:lvl w:ilvl="0">
@@ -25585,7 +25636,7 @@
     </w:lvl>
   </w:abstractNum>
   <w:abstractNum w:abstractNumId="34" w15:restartNumberingAfterBreak="0">
-    <w:nsid w:val="6D5226F2"/>
+    <w:nsid w:val="76311830"/>
     <w:multiLevelType w:val="singleLevel"/>
     <w:tmpl w:val="04160001"/>
     <w:lvl w:ilvl="0">
@@ -25602,7 +25653,7 @@
     </w:lvl>
   </w:abstractNum>
   <w:abstractNum w:abstractNumId="35" w15:restartNumberingAfterBreak="0">
-    <w:nsid w:val="75BD1CB5"/>
+    <w:nsid w:val="77FA059E"/>
     <w:multiLevelType w:val="singleLevel"/>
     <w:tmpl w:val="04160001"/>
     <w:lvl w:ilvl="0">
@@ -25619,7 +25670,7 @@
     </w:lvl>
   </w:abstractNum>
   <w:abstractNum w:abstractNumId="36" w15:restartNumberingAfterBreak="0">
-    <w:nsid w:val="796B453F"/>
+    <w:nsid w:val="79FD3FC5"/>
     <w:multiLevelType w:val="singleLevel"/>
     <w:tmpl w:val="04160001"/>
     <w:lvl w:ilvl="0">
@@ -25636,7 +25687,7 @@
     </w:lvl>
   </w:abstractNum>
   <w:abstractNum w:abstractNumId="37" w15:restartNumberingAfterBreak="0">
-    <w:nsid w:val="79DE7E9F"/>
+    <w:nsid w:val="7C3851D4"/>
     <w:multiLevelType w:val="singleLevel"/>
     <w:tmpl w:val="04160001"/>
     <w:lvl w:ilvl="0">
@@ -25653,7 +25704,7 @@
     </w:lvl>
   </w:abstractNum>
   <w:abstractNum w:abstractNumId="38" w15:restartNumberingAfterBreak="0">
-    <w:nsid w:val="7F763630"/>
+    <w:nsid w:val="7C99569B"/>
     <w:multiLevelType w:val="singleLevel"/>
     <w:tmpl w:val="04160001"/>
     <w:lvl w:ilvl="0">
@@ -25669,122 +25720,122 @@
       </w:rPr>
     </w:lvl>
   </w:abstractNum>
-  <w:num w:numId="1" w16cid:durableId="1038699721">
+  <w:num w:numId="1" w16cid:durableId="1658611241">
+    <w:abstractNumId w:val="1"/>
+  </w:num>
+  <w:num w:numId="2" w16cid:durableId="307589627">
+    <w:abstractNumId w:val="27"/>
+  </w:num>
+  <w:num w:numId="3" w16cid:durableId="585575222">
+    <w:abstractNumId w:val="0"/>
+  </w:num>
+  <w:num w:numId="4" w16cid:durableId="594286256">
+    <w:abstractNumId w:val="6"/>
+  </w:num>
+  <w:num w:numId="5" w16cid:durableId="315692648">
+    <w:abstractNumId w:val="20"/>
+  </w:num>
+  <w:num w:numId="6" w16cid:durableId="59864818">
+    <w:abstractNumId w:val="24"/>
+  </w:num>
+  <w:num w:numId="7" w16cid:durableId="673991261">
     <w:abstractNumId w:val="3"/>
   </w:num>
-  <w:num w:numId="2" w16cid:durableId="2030788900">
+  <w:num w:numId="8" w16cid:durableId="1472749096">
+    <w:abstractNumId w:val="36"/>
+  </w:num>
+  <w:num w:numId="9" w16cid:durableId="1449738724">
+    <w:abstractNumId w:val="8"/>
+  </w:num>
+  <w:num w:numId="10" w16cid:durableId="2008287134">
+    <w:abstractNumId w:val="25"/>
+  </w:num>
+  <w:num w:numId="11" w16cid:durableId="1001202875">
+    <w:abstractNumId w:val="18"/>
+  </w:num>
+  <w:num w:numId="12" w16cid:durableId="1525559565">
+    <w:abstractNumId w:val="4"/>
+  </w:num>
+  <w:num w:numId="13" w16cid:durableId="1600144291">
+    <w:abstractNumId w:val="2"/>
+  </w:num>
+  <w:num w:numId="14" w16cid:durableId="658582261">
+    <w:abstractNumId w:val="16"/>
+  </w:num>
+  <w:num w:numId="15" w16cid:durableId="1740707239">
+    <w:abstractNumId w:val="23"/>
+  </w:num>
+  <w:num w:numId="16" w16cid:durableId="1723943796">
     <w:abstractNumId w:val="30"/>
   </w:num>
-  <w:num w:numId="3" w16cid:durableId="970331713">
+  <w:num w:numId="17" w16cid:durableId="438262958">
+    <w:abstractNumId w:val="15"/>
+  </w:num>
+  <w:num w:numId="18" w16cid:durableId="1619020521">
+    <w:abstractNumId w:val="7"/>
+  </w:num>
+  <w:num w:numId="19" w16cid:durableId="1331257513">
+    <w:abstractNumId w:val="32"/>
+  </w:num>
+  <w:num w:numId="20" w16cid:durableId="850677694">
+    <w:abstractNumId w:val="35"/>
+  </w:num>
+  <w:num w:numId="21" w16cid:durableId="1413233833">
+    <w:abstractNumId w:val="31"/>
+  </w:num>
+  <w:num w:numId="22" w16cid:durableId="599220374">
+    <w:abstractNumId w:val="12"/>
+  </w:num>
+  <w:num w:numId="23" w16cid:durableId="1326931259">
+    <w:abstractNumId w:val="33"/>
+  </w:num>
+  <w:num w:numId="24" w16cid:durableId="887760171">
+    <w:abstractNumId w:val="11"/>
+  </w:num>
+  <w:num w:numId="25" w16cid:durableId="430399079">
+    <w:abstractNumId w:val="22"/>
+  </w:num>
+  <w:num w:numId="26" w16cid:durableId="1228302964">
+    <w:abstractNumId w:val="10"/>
+  </w:num>
+  <w:num w:numId="27" w16cid:durableId="1973974714">
+    <w:abstractNumId w:val="5"/>
+  </w:num>
+  <w:num w:numId="28" w16cid:durableId="6257838">
+    <w:abstractNumId w:val="28"/>
+  </w:num>
+  <w:num w:numId="29" w16cid:durableId="340546553">
+    <w:abstractNumId w:val="13"/>
+  </w:num>
+  <w:num w:numId="30" w16cid:durableId="1774787516">
+    <w:abstractNumId w:val="17"/>
+  </w:num>
+  <w:num w:numId="31" w16cid:durableId="512694361">
+    <w:abstractNumId w:val="19"/>
+  </w:num>
+  <w:num w:numId="32" w16cid:durableId="197357074">
+    <w:abstractNumId w:val="26"/>
+  </w:num>
+  <w:num w:numId="33" w16cid:durableId="1749231400">
+    <w:abstractNumId w:val="21"/>
+  </w:num>
+  <w:num w:numId="34" w16cid:durableId="15813559">
+    <w:abstractNumId w:val="29"/>
+  </w:num>
+  <w:num w:numId="35" w16cid:durableId="527068625">
+    <w:abstractNumId w:val="14"/>
+  </w:num>
+  <w:num w:numId="36" w16cid:durableId="256639648">
+    <w:abstractNumId w:val="34"/>
+  </w:num>
+  <w:num w:numId="37" w16cid:durableId="292445816">
+    <w:abstractNumId w:val="37"/>
+  </w:num>
+  <w:num w:numId="38" w16cid:durableId="2044742710">
     <w:abstractNumId w:val="38"/>
   </w:num>
-  <w:num w:numId="4" w16cid:durableId="476844917">
-    <w:abstractNumId w:val="11"/>
-  </w:num>
-  <w:num w:numId="5" w16cid:durableId="1045761389">
-    <w:abstractNumId w:val="19"/>
-  </w:num>
-  <w:num w:numId="6" w16cid:durableId="936139484">
-    <w:abstractNumId w:val="1"/>
-  </w:num>
-  <w:num w:numId="7" w16cid:durableId="346173733">
-    <w:abstractNumId w:val="5"/>
-  </w:num>
-  <w:num w:numId="8" w16cid:durableId="1985160231">
-    <w:abstractNumId w:val="7"/>
-  </w:num>
-  <w:num w:numId="9" w16cid:durableId="933635911">
-    <w:abstractNumId w:val="6"/>
-  </w:num>
-  <w:num w:numId="10" w16cid:durableId="708722431">
-    <w:abstractNumId w:val="34"/>
-  </w:num>
-  <w:num w:numId="11" w16cid:durableId="1466318614">
-    <w:abstractNumId w:val="0"/>
-  </w:num>
-  <w:num w:numId="12" w16cid:durableId="949049514">
-    <w:abstractNumId w:val="24"/>
-  </w:num>
-  <w:num w:numId="13" w16cid:durableId="755640014">
-    <w:abstractNumId w:val="35"/>
-  </w:num>
-  <w:num w:numId="14" w16cid:durableId="132800337">
-    <w:abstractNumId w:val="37"/>
-  </w:num>
-  <w:num w:numId="15" w16cid:durableId="1829713347">
-    <w:abstractNumId w:val="16"/>
-  </w:num>
-  <w:num w:numId="16" w16cid:durableId="1521549609">
-    <w:abstractNumId w:val="14"/>
-  </w:num>
-  <w:num w:numId="17" w16cid:durableId="707490815">
-    <w:abstractNumId w:val="26"/>
-  </w:num>
-  <w:num w:numId="18" w16cid:durableId="2029790353">
-    <w:abstractNumId w:val="2"/>
-  </w:num>
-  <w:num w:numId="19" w16cid:durableId="1747070852">
-    <w:abstractNumId w:val="8"/>
-  </w:num>
-  <w:num w:numId="20" w16cid:durableId="1291394991">
-    <w:abstractNumId w:val="21"/>
-  </w:num>
-  <w:num w:numId="21" w16cid:durableId="1049959270">
-    <w:abstractNumId w:val="23"/>
-  </w:num>
-  <w:num w:numId="22" w16cid:durableId="956331763">
-    <w:abstractNumId w:val="10"/>
-  </w:num>
-  <w:num w:numId="23" w16cid:durableId="1778480623">
-    <w:abstractNumId w:val="18"/>
-  </w:num>
-  <w:num w:numId="24" w16cid:durableId="147333919">
-    <w:abstractNumId w:val="13"/>
-  </w:num>
-  <w:num w:numId="25" w16cid:durableId="2114545722">
-    <w:abstractNumId w:val="28"/>
-  </w:num>
-  <w:num w:numId="26" w16cid:durableId="1391003518">
+  <w:num w:numId="39" w16cid:durableId="1593977569">
     <w:abstractNumId w:val="9"/>
-  </w:num>
-  <w:num w:numId="27" w16cid:durableId="85424487">
-    <w:abstractNumId w:val="22"/>
-  </w:num>
-  <w:num w:numId="28" w16cid:durableId="620914176">
-    <w:abstractNumId w:val="25"/>
-  </w:num>
-  <w:num w:numId="29" w16cid:durableId="1588805874">
-    <w:abstractNumId w:val="27"/>
-  </w:num>
-  <w:num w:numId="30" w16cid:durableId="257955500">
-    <w:abstractNumId w:val="36"/>
-  </w:num>
-  <w:num w:numId="31" w16cid:durableId="1432119756">
-    <w:abstractNumId w:val="4"/>
-  </w:num>
-  <w:num w:numId="32" w16cid:durableId="1838880990">
-    <w:abstractNumId w:val="15"/>
-  </w:num>
-  <w:num w:numId="33" w16cid:durableId="1295018380">
-    <w:abstractNumId w:val="32"/>
-  </w:num>
-  <w:num w:numId="34" w16cid:durableId="1949383554">
-    <w:abstractNumId w:val="20"/>
-  </w:num>
-  <w:num w:numId="35" w16cid:durableId="2058048868">
-    <w:abstractNumId w:val="12"/>
-  </w:num>
-  <w:num w:numId="36" w16cid:durableId="1780376004">
-    <w:abstractNumId w:val="29"/>
-  </w:num>
-  <w:num w:numId="37" w16cid:durableId="877594279">
-    <w:abstractNumId w:val="33"/>
-  </w:num>
-  <w:num w:numId="38" w16cid:durableId="1550456962">
-    <w:abstractNumId w:val="31"/>
-  </w:num>
-  <w:num w:numId="39" w16cid:durableId="1837718821">
-    <w:abstractNumId w:val="17"/>
   </w:num>
 </w:numbering>
 </file>
@@ -26197,7 +26248,7 @@
     <w:link w:val="Ttulo1Char"/>
     <w:uiPriority w:val="9"/>
     <w:qFormat/>
-    <w:rsid w:val="005104B7"/>
+    <w:rsid w:val="00A977AC"/>
     <w:pPr>
       <w:keepNext/>
       <w:keepLines/>
@@ -26219,7 +26270,7 @@
     <w:uiPriority w:val="9"/>
     <w:unhideWhenUsed/>
     <w:qFormat/>
-    <w:rsid w:val="005104B7"/>
+    <w:rsid w:val="00A977AC"/>
     <w:pPr>
       <w:keepNext/>
       <w:keepLines/>
@@ -26242,7 +26293,7 @@
     <w:semiHidden/>
     <w:unhideWhenUsed/>
     <w:qFormat/>
-    <w:rsid w:val="005104B7"/>
+    <w:rsid w:val="00A977AC"/>
     <w:pPr>
       <w:keepNext/>
       <w:keepLines/>
@@ -26265,7 +26316,7 @@
     <w:semiHidden/>
     <w:unhideWhenUsed/>
     <w:qFormat/>
-    <w:rsid w:val="005104B7"/>
+    <w:rsid w:val="00A977AC"/>
     <w:pPr>
       <w:keepNext/>
       <w:keepLines/>
@@ -26288,7 +26339,7 @@
     <w:semiHidden/>
     <w:unhideWhenUsed/>
     <w:qFormat/>
-    <w:rsid w:val="005104B7"/>
+    <w:rsid w:val="00A977AC"/>
     <w:pPr>
       <w:keepNext/>
       <w:keepLines/>
@@ -26309,7 +26360,7 @@
     <w:semiHidden/>
     <w:unhideWhenUsed/>
     <w:qFormat/>
-    <w:rsid w:val="005104B7"/>
+    <w:rsid w:val="00A977AC"/>
     <w:pPr>
       <w:keepNext/>
       <w:keepLines/>
@@ -26332,7 +26383,7 @@
     <w:semiHidden/>
     <w:unhideWhenUsed/>
     <w:qFormat/>
-    <w:rsid w:val="005104B7"/>
+    <w:rsid w:val="00A977AC"/>
     <w:pPr>
       <w:keepNext/>
       <w:keepLines/>
@@ -26353,7 +26404,7 @@
     <w:semiHidden/>
     <w:unhideWhenUsed/>
     <w:qFormat/>
-    <w:rsid w:val="005104B7"/>
+    <w:rsid w:val="00A977AC"/>
     <w:pPr>
       <w:keepNext/>
       <w:keepLines/>
@@ -26376,7 +26427,7 @@
     <w:semiHidden/>
     <w:unhideWhenUsed/>
     <w:qFormat/>
-    <w:rsid w:val="005104B7"/>
+    <w:rsid w:val="00A977AC"/>
     <w:pPr>
       <w:keepNext/>
       <w:keepLines/>
@@ -26420,7 +26471,7 @@
     <w:basedOn w:val="Fontepargpadro"/>
     <w:link w:val="Ttulo1"/>
     <w:uiPriority w:val="9"/>
-    <w:rsid w:val="005104B7"/>
+    <w:rsid w:val="00A977AC"/>
     <w:rPr>
       <w:rFonts w:asciiTheme="majorHAnsi" w:eastAsiaTheme="majorEastAsia" w:hAnsiTheme="majorHAnsi" w:cstheme="majorBidi"/>
       <w:color w:val="0F4761" w:themeColor="accent1" w:themeShade="BF"/>
@@ -26433,7 +26484,7 @@
     <w:basedOn w:val="Fontepargpadro"/>
     <w:link w:val="Ttulo2"/>
     <w:uiPriority w:val="9"/>
-    <w:rsid w:val="005104B7"/>
+    <w:rsid w:val="00A977AC"/>
     <w:rPr>
       <w:rFonts w:asciiTheme="majorHAnsi" w:eastAsiaTheme="majorEastAsia" w:hAnsiTheme="majorHAnsi" w:cstheme="majorBidi"/>
       <w:color w:val="0F4761" w:themeColor="accent1" w:themeShade="BF"/>
@@ -26447,7 +26498,7 @@
     <w:link w:val="Ttulo3"/>
     <w:uiPriority w:val="9"/>
     <w:semiHidden/>
-    <w:rsid w:val="005104B7"/>
+    <w:rsid w:val="00A977AC"/>
     <w:rPr>
       <w:rFonts w:eastAsiaTheme="majorEastAsia" w:cstheme="majorBidi"/>
       <w:color w:val="0F4761" w:themeColor="accent1" w:themeShade="BF"/>
@@ -26461,7 +26512,7 @@
     <w:link w:val="Ttulo4"/>
     <w:uiPriority w:val="9"/>
     <w:semiHidden/>
-    <w:rsid w:val="005104B7"/>
+    <w:rsid w:val="00A977AC"/>
     <w:rPr>
       <w:rFonts w:eastAsiaTheme="majorEastAsia" w:cstheme="majorBidi"/>
       <w:i/>
@@ -26475,7 +26526,7 @@
     <w:link w:val="Ttulo5"/>
     <w:uiPriority w:val="9"/>
     <w:semiHidden/>
-    <w:rsid w:val="005104B7"/>
+    <w:rsid w:val="00A977AC"/>
     <w:rPr>
       <w:rFonts w:eastAsiaTheme="majorEastAsia" w:cstheme="majorBidi"/>
       <w:color w:val="0F4761" w:themeColor="accent1" w:themeShade="BF"/>
@@ -26487,7 +26538,7 @@
     <w:link w:val="Ttulo6"/>
     <w:uiPriority w:val="9"/>
     <w:semiHidden/>
-    <w:rsid w:val="005104B7"/>
+    <w:rsid w:val="00A977AC"/>
     <w:rPr>
       <w:rFonts w:eastAsiaTheme="majorEastAsia" w:cstheme="majorBidi"/>
       <w:i/>
@@ -26501,7 +26552,7 @@
     <w:link w:val="Ttulo7"/>
     <w:uiPriority w:val="9"/>
     <w:semiHidden/>
-    <w:rsid w:val="005104B7"/>
+    <w:rsid w:val="00A977AC"/>
     <w:rPr>
       <w:rFonts w:eastAsiaTheme="majorEastAsia" w:cstheme="majorBidi"/>
       <w:color w:val="595959" w:themeColor="text1" w:themeTint="A6"/>
@@ -26513,7 +26564,7 @@
     <w:link w:val="Ttulo8"/>
     <w:uiPriority w:val="9"/>
     <w:semiHidden/>
-    <w:rsid w:val="005104B7"/>
+    <w:rsid w:val="00A977AC"/>
     <w:rPr>
       <w:rFonts w:eastAsiaTheme="majorEastAsia" w:cstheme="majorBidi"/>
       <w:i/>
@@ -26527,7 +26578,7 @@
     <w:link w:val="Ttulo9"/>
     <w:uiPriority w:val="9"/>
     <w:semiHidden/>
-    <w:rsid w:val="005104B7"/>
+    <w:rsid w:val="00A977AC"/>
     <w:rPr>
       <w:rFonts w:eastAsiaTheme="majorEastAsia" w:cstheme="majorBidi"/>
       <w:color w:val="272727" w:themeColor="text1" w:themeTint="D8"/>
@@ -26540,7 +26591,7 @@
     <w:link w:val="TtuloChar"/>
     <w:uiPriority w:val="10"/>
     <w:qFormat/>
-    <w:rsid w:val="005104B7"/>
+    <w:rsid w:val="00A977AC"/>
     <w:pPr>
       <w:spacing w:after="80" w:line="240" w:lineRule="auto"/>
       <w:contextualSpacing/>
@@ -26558,7 +26609,7 @@
     <w:basedOn w:val="Fontepargpadro"/>
     <w:link w:val="Ttulo"/>
     <w:uiPriority w:val="10"/>
-    <w:rsid w:val="005104B7"/>
+    <w:rsid w:val="00A977AC"/>
     <w:rPr>
       <w:rFonts w:asciiTheme="majorHAnsi" w:eastAsiaTheme="majorEastAsia" w:hAnsiTheme="majorHAnsi" w:cstheme="majorBidi"/>
       <w:spacing w:val="-10"/>
@@ -26574,7 +26625,7 @@
     <w:link w:val="SubttuloChar"/>
     <w:uiPriority w:val="11"/>
     <w:qFormat/>
-    <w:rsid w:val="005104B7"/>
+    <w:rsid w:val="00A977AC"/>
     <w:pPr>
       <w:numPr>
         <w:ilvl w:val="1"/>
@@ -26593,7 +26644,7 @@
     <w:basedOn w:val="Fontepargpadro"/>
     <w:link w:val="Subttulo"/>
     <w:uiPriority w:val="11"/>
-    <w:rsid w:val="005104B7"/>
+    <w:rsid w:val="00A977AC"/>
     <w:rPr>
       <w:rFonts w:eastAsiaTheme="majorEastAsia" w:cstheme="majorBidi"/>
       <w:color w:val="595959" w:themeColor="text1" w:themeTint="A6"/>
@@ -26609,7 +26660,7 @@
     <w:link w:val="CitaoChar"/>
     <w:uiPriority w:val="29"/>
     <w:qFormat/>
-    <w:rsid w:val="005104B7"/>
+    <w:rsid w:val="00A977AC"/>
     <w:pPr>
       <w:spacing w:before="160"/>
       <w:jc w:val="center"/>
@@ -26625,7 +26676,7 @@
     <w:basedOn w:val="Fontepargpadro"/>
     <w:link w:val="Citao"/>
     <w:uiPriority w:val="29"/>
-    <w:rsid w:val="005104B7"/>
+    <w:rsid w:val="00A977AC"/>
     <w:rPr>
       <w:i/>
       <w:iCs/>
@@ -26637,7 +26688,7 @@
     <w:basedOn w:val="Normal"/>
     <w:uiPriority w:val="34"/>
     <w:qFormat/>
-    <w:rsid w:val="005104B7"/>
+    <w:rsid w:val="00A977AC"/>
     <w:pPr>
       <w:ind w:left="720"/>
       <w:contextualSpacing/>
@@ -26648,7 +26699,7 @@
     <w:basedOn w:val="Fontepargpadro"/>
     <w:uiPriority w:val="21"/>
     <w:qFormat/>
-    <w:rsid w:val="005104B7"/>
+    <w:rsid w:val="00A977AC"/>
     <w:rPr>
       <w:i/>
       <w:iCs/>
@@ -26662,7 +26713,7 @@
     <w:link w:val="CitaoIntensaChar"/>
     <w:uiPriority w:val="30"/>
     <w:qFormat/>
-    <w:rsid w:val="005104B7"/>
+    <w:rsid w:val="00A977AC"/>
     <w:pPr>
       <w:pBdr>
         <w:top w:val="single" w:sz="4" w:space="10" w:color="0F4761" w:themeColor="accent1" w:themeShade="BF"/>
@@ -26683,7 +26734,7 @@
     <w:basedOn w:val="Fontepargpadro"/>
     <w:link w:val="CitaoIntensa"/>
     <w:uiPriority w:val="30"/>
-    <w:rsid w:val="005104B7"/>
+    <w:rsid w:val="00A977AC"/>
     <w:rPr>
       <w:i/>
       <w:iCs/>
@@ -26695,7 +26746,7 @@
     <w:basedOn w:val="Fontepargpadro"/>
     <w:uiPriority w:val="32"/>
     <w:qFormat/>
-    <w:rsid w:val="005104B7"/>
+    <w:rsid w:val="00A977AC"/>
     <w:rPr>
       <w:b/>
       <w:bCs/>
@@ -26710,7 +26761,7 @@
     <w:link w:val="CabealhoChar"/>
     <w:uiPriority w:val="99"/>
     <w:unhideWhenUsed/>
-    <w:rsid w:val="005104B7"/>
+    <w:rsid w:val="00A977AC"/>
     <w:pPr>
       <w:tabs>
         <w:tab w:val="center" w:pos="4252"/>
@@ -26724,7 +26775,7 @@
     <w:basedOn w:val="Fontepargpadro"/>
     <w:link w:val="Cabealho"/>
     <w:uiPriority w:val="99"/>
-    <w:rsid w:val="005104B7"/>
+    <w:rsid w:val="00A977AC"/>
   </w:style>
   <w:style w:type="paragraph" w:styleId="Rodap">
     <w:name w:val="footer"/>
@@ -26732,7 +26783,7 @@
     <w:link w:val="RodapChar"/>
     <w:uiPriority w:val="99"/>
     <w:unhideWhenUsed/>
-    <w:rsid w:val="005104B7"/>
+    <w:rsid w:val="00A977AC"/>
     <w:pPr>
       <w:tabs>
         <w:tab w:val="center" w:pos="4252"/>
@@ -26746,7 +26797,7 @@
     <w:basedOn w:val="Fontepargpadro"/>
     <w:link w:val="Rodap"/>
     <w:uiPriority w:val="99"/>
-    <w:rsid w:val="005104B7"/>
+    <w:rsid w:val="00A977AC"/>
   </w:style>
   <w:style w:type="paragraph" w:styleId="Sumrio1">
     <w:name w:val="toc 1"/>
@@ -26755,7 +26806,7 @@
     <w:autoRedefine/>
     <w:uiPriority w:val="39"/>
     <w:unhideWhenUsed/>
-    <w:rsid w:val="005104B7"/>
+    <w:rsid w:val="00A977AC"/>
     <w:pPr>
       <w:spacing w:after="100"/>
     </w:pPr>
@@ -26767,7 +26818,7 @@
     <w:autoRedefine/>
     <w:uiPriority w:val="39"/>
     <w:unhideWhenUsed/>
-    <w:rsid w:val="005104B7"/>
+    <w:rsid w:val="00A977AC"/>
     <w:pPr>
       <w:spacing w:after="100"/>
       <w:ind w:left="240"/>

</xml_diff>

<commit_message>
Troca o link da Ficha do Projeto por contato da Gerência de Projetos
O e-mail de aviso de prazo deixa de incluir o link "Abrir a Ficha do
Projeto" e passa a terminar indicando a Gerência de Projetos como
alternativa de contato — o nome do Gerente vem do campo "Gerente do
projeto" do próprio Planejamento (rec.gestor), não é mais fixo; se o
campo estiver vazio, a frase aparece sem nome.

Testado com e-mails reais enviados para verificação, incluindo o caso
do nome dinâmico. Manual de Uso atualizado (v2.80).

Co-Authored-By: Claude Sonnet 5 <noreply@anthropic.com>
</commit_message>
<xml_diff>
--- a/Manual de Uso - Ferramenta de Gestao de Projetos.docx
+++ b/Manual de Uso - Ferramenta de Gestao de Projetos.docx
@@ -229,7 +229,7 @@
         <w:rPr>
           <w:noProof/>
         </w:rPr>
-        <w:instrText xml:space="preserve"> PAGEREF _Toc240377136 \h </w:instrText>
+        <w:instrText xml:space="preserve"> PAGEREF _Toc240380433 \h </w:instrText>
       </w:r>
       <w:r>
         <w:rPr>
@@ -290,7 +290,7 @@
         <w:rPr>
           <w:noProof/>
         </w:rPr>
-        <w:instrText xml:space="preserve"> PAGEREF _Toc240377137 \h </w:instrText>
+        <w:instrText xml:space="preserve"> PAGEREF _Toc240380434 \h </w:instrText>
       </w:r>
       <w:r>
         <w:rPr>
@@ -351,7 +351,7 @@
         <w:rPr>
           <w:noProof/>
         </w:rPr>
-        <w:instrText xml:space="preserve"> PAGEREF _Toc240377138 \h </w:instrText>
+        <w:instrText xml:space="preserve"> PAGEREF _Toc240380435 \h </w:instrText>
       </w:r>
       <w:r>
         <w:rPr>
@@ -368,7 +368,7 @@
         <w:rPr>
           <w:noProof/>
         </w:rPr>
-        <w:t>20</w:t>
+        <w:t>21</w:t>
       </w:r>
       <w:r>
         <w:rPr>
@@ -412,7 +412,7 @@
         <w:rPr>
           <w:noProof/>
         </w:rPr>
-        <w:instrText xml:space="preserve"> PAGEREF _Toc240377139 \h </w:instrText>
+        <w:instrText xml:space="preserve"> PAGEREF _Toc240380436 \h </w:instrText>
       </w:r>
       <w:r>
         <w:rPr>
@@ -473,7 +473,7 @@
         <w:rPr>
           <w:noProof/>
         </w:rPr>
-        <w:instrText xml:space="preserve"> PAGEREF _Toc240377140 \h </w:instrText>
+        <w:instrText xml:space="preserve"> PAGEREF _Toc240380437 \h </w:instrText>
       </w:r>
       <w:r>
         <w:rPr>
@@ -534,7 +534,7 @@
         <w:rPr>
           <w:noProof/>
         </w:rPr>
-        <w:instrText xml:space="preserve"> PAGEREF _Toc240377141 \h </w:instrText>
+        <w:instrText xml:space="preserve"> PAGEREF _Toc240380438 \h </w:instrText>
       </w:r>
       <w:r>
         <w:rPr>
@@ -595,7 +595,7 @@
         <w:rPr>
           <w:noProof/>
         </w:rPr>
-        <w:instrText xml:space="preserve"> PAGEREF _Toc240377142 \h </w:instrText>
+        <w:instrText xml:space="preserve"> PAGEREF _Toc240380439 \h </w:instrText>
       </w:r>
       <w:r>
         <w:rPr>
@@ -656,7 +656,7 @@
         <w:rPr>
           <w:noProof/>
         </w:rPr>
-        <w:instrText xml:space="preserve"> PAGEREF _Toc240377143 \h </w:instrText>
+        <w:instrText xml:space="preserve"> PAGEREF _Toc240380440 \h </w:instrText>
       </w:r>
       <w:r>
         <w:rPr>
@@ -717,7 +717,7 @@
         <w:rPr>
           <w:noProof/>
         </w:rPr>
-        <w:instrText xml:space="preserve"> PAGEREF _Toc240377144 \h </w:instrText>
+        <w:instrText xml:space="preserve"> PAGEREF _Toc240380441 \h </w:instrText>
       </w:r>
       <w:r>
         <w:rPr>
@@ -778,7 +778,7 @@
         <w:rPr>
           <w:noProof/>
         </w:rPr>
-        <w:instrText xml:space="preserve"> PAGEREF _Toc240377145 \h </w:instrText>
+        <w:instrText xml:space="preserve"> PAGEREF _Toc240380442 \h </w:instrText>
       </w:r>
       <w:r>
         <w:rPr>
@@ -839,7 +839,7 @@
         <w:rPr>
           <w:noProof/>
         </w:rPr>
-        <w:instrText xml:space="preserve"> PAGEREF _Toc240377146 \h </w:instrText>
+        <w:instrText xml:space="preserve"> PAGEREF _Toc240380443 \h </w:instrText>
       </w:r>
       <w:r>
         <w:rPr>
@@ -900,7 +900,7 @@
         <w:rPr>
           <w:noProof/>
         </w:rPr>
-        <w:instrText xml:space="preserve"> PAGEREF _Toc240377147 \h </w:instrText>
+        <w:instrText xml:space="preserve"> PAGEREF _Toc240380444 \h </w:instrText>
       </w:r>
       <w:r>
         <w:rPr>
@@ -961,7 +961,7 @@
         <w:rPr>
           <w:noProof/>
         </w:rPr>
-        <w:instrText xml:space="preserve"> PAGEREF _Toc240377148 \h </w:instrText>
+        <w:instrText xml:space="preserve"> PAGEREF _Toc240380445 \h </w:instrText>
       </w:r>
       <w:r>
         <w:rPr>
@@ -1022,7 +1022,7 @@
         <w:rPr>
           <w:noProof/>
         </w:rPr>
-        <w:instrText xml:space="preserve"> PAGEREF _Toc240377149 \h </w:instrText>
+        <w:instrText xml:space="preserve"> PAGEREF _Toc240380446 \h </w:instrText>
       </w:r>
       <w:r>
         <w:rPr>
@@ -1083,7 +1083,7 @@
         <w:rPr>
           <w:noProof/>
         </w:rPr>
-        <w:instrText xml:space="preserve"> PAGEREF _Toc240377150 \h </w:instrText>
+        <w:instrText xml:space="preserve"> PAGEREF _Toc240380447 \h </w:instrText>
       </w:r>
       <w:r>
         <w:rPr>
@@ -1144,7 +1144,7 @@
         <w:rPr>
           <w:noProof/>
         </w:rPr>
-        <w:instrText xml:space="preserve"> PAGEREF _Toc240377151 \h </w:instrText>
+        <w:instrText xml:space="preserve"> PAGEREF _Toc240380448 \h </w:instrText>
       </w:r>
       <w:r>
         <w:rPr>
@@ -1205,7 +1205,7 @@
         <w:rPr>
           <w:noProof/>
         </w:rPr>
-        <w:instrText xml:space="preserve"> PAGEREF _Toc240377152 \h </w:instrText>
+        <w:instrText xml:space="preserve"> PAGEREF _Toc240380449 \h </w:instrText>
       </w:r>
       <w:r>
         <w:rPr>
@@ -1266,7 +1266,7 @@
         <w:rPr>
           <w:noProof/>
         </w:rPr>
-        <w:instrText xml:space="preserve"> PAGEREF _Toc240377153 \h </w:instrText>
+        <w:instrText xml:space="preserve"> PAGEREF _Toc240380450 \h </w:instrText>
       </w:r>
       <w:r>
         <w:rPr>
@@ -1327,7 +1327,7 @@
         <w:rPr>
           <w:noProof/>
         </w:rPr>
-        <w:instrText xml:space="preserve"> PAGEREF _Toc240377154 \h </w:instrText>
+        <w:instrText xml:space="preserve"> PAGEREF _Toc240380451 \h </w:instrText>
       </w:r>
       <w:r>
         <w:rPr>
@@ -1388,7 +1388,7 @@
         <w:rPr>
           <w:noProof/>
         </w:rPr>
-        <w:instrText xml:space="preserve"> PAGEREF _Toc240377155 \h </w:instrText>
+        <w:instrText xml:space="preserve"> PAGEREF _Toc240380452 \h </w:instrText>
       </w:r>
       <w:r>
         <w:rPr>
@@ -1449,7 +1449,7 @@
         <w:rPr>
           <w:noProof/>
         </w:rPr>
-        <w:instrText xml:space="preserve"> PAGEREF _Toc240377156 \h </w:instrText>
+        <w:instrText xml:space="preserve"> PAGEREF _Toc240380453 \h </w:instrText>
       </w:r>
       <w:r>
         <w:rPr>
@@ -1510,7 +1510,7 @@
         <w:rPr>
           <w:noProof/>
         </w:rPr>
-        <w:instrText xml:space="preserve"> PAGEREF _Toc240377157 \h </w:instrText>
+        <w:instrText xml:space="preserve"> PAGEREF _Toc240380454 \h </w:instrText>
       </w:r>
       <w:r>
         <w:rPr>
@@ -1571,7 +1571,7 @@
         <w:rPr>
           <w:noProof/>
         </w:rPr>
-        <w:instrText xml:space="preserve"> PAGEREF _Toc240377158 \h </w:instrText>
+        <w:instrText xml:space="preserve"> PAGEREF _Toc240380455 \h </w:instrText>
       </w:r>
       <w:r>
         <w:rPr>
@@ -1632,7 +1632,7 @@
         <w:rPr>
           <w:noProof/>
         </w:rPr>
-        <w:instrText xml:space="preserve"> PAGEREF _Toc240377159 \h </w:instrText>
+        <w:instrText xml:space="preserve"> PAGEREF _Toc240380456 \h </w:instrText>
       </w:r>
       <w:r>
         <w:rPr>
@@ -1693,7 +1693,7 @@
         <w:rPr>
           <w:noProof/>
         </w:rPr>
-        <w:instrText xml:space="preserve"> PAGEREF _Toc240377160 \h </w:instrText>
+        <w:instrText xml:space="preserve"> PAGEREF _Toc240380457 \h </w:instrText>
       </w:r>
       <w:r>
         <w:rPr>
@@ -1754,7 +1754,7 @@
         <w:rPr>
           <w:noProof/>
         </w:rPr>
-        <w:instrText xml:space="preserve"> PAGEREF _Toc240377161 \h </w:instrText>
+        <w:instrText xml:space="preserve"> PAGEREF _Toc240380458 \h </w:instrText>
       </w:r>
       <w:r>
         <w:rPr>
@@ -1816,7 +1816,7 @@
         <w:rPr>
           <w:noProof/>
         </w:rPr>
-        <w:instrText xml:space="preserve"> PAGEREF _Toc240377162 \h </w:instrText>
+        <w:instrText xml:space="preserve"> PAGEREF _Toc240380459 \h </w:instrText>
       </w:r>
       <w:r>
         <w:rPr>
@@ -1877,7 +1877,7 @@
         <w:rPr>
           <w:noProof/>
         </w:rPr>
-        <w:instrText xml:space="preserve"> PAGEREF _Toc240377163 \h </w:instrText>
+        <w:instrText xml:space="preserve"> PAGEREF _Toc240380460 \h </w:instrText>
       </w:r>
       <w:r>
         <w:rPr>
@@ -1938,7 +1938,7 @@
         <w:rPr>
           <w:noProof/>
         </w:rPr>
-        <w:instrText xml:space="preserve"> PAGEREF _Toc240377164 \h </w:instrText>
+        <w:instrText xml:space="preserve"> PAGEREF _Toc240380461 \h </w:instrText>
       </w:r>
       <w:r>
         <w:rPr>
@@ -1999,7 +1999,7 @@
         <w:rPr>
           <w:noProof/>
         </w:rPr>
-        <w:instrText xml:space="preserve"> PAGEREF _Toc240377165 \h </w:instrText>
+        <w:instrText xml:space="preserve"> PAGEREF _Toc240380462 \h </w:instrText>
       </w:r>
       <w:r>
         <w:rPr>
@@ -2060,7 +2060,7 @@
         <w:rPr>
           <w:noProof/>
         </w:rPr>
-        <w:instrText xml:space="preserve"> PAGEREF _Toc240377166 \h </w:instrText>
+        <w:instrText xml:space="preserve"> PAGEREF _Toc240380463 \h </w:instrText>
       </w:r>
       <w:r>
         <w:rPr>
@@ -2121,7 +2121,7 @@
         <w:rPr>
           <w:noProof/>
         </w:rPr>
-        <w:instrText xml:space="preserve"> PAGEREF _Toc240377167 \h </w:instrText>
+        <w:instrText xml:space="preserve"> PAGEREF _Toc240380464 \h </w:instrText>
       </w:r>
       <w:r>
         <w:rPr>
@@ -2182,7 +2182,7 @@
         <w:rPr>
           <w:noProof/>
         </w:rPr>
-        <w:instrText xml:space="preserve"> PAGEREF _Toc240377168 \h </w:instrText>
+        <w:instrText xml:space="preserve"> PAGEREF _Toc240380465 \h </w:instrText>
       </w:r>
       <w:r>
         <w:rPr>
@@ -2243,7 +2243,7 @@
         <w:rPr>
           <w:noProof/>
         </w:rPr>
-        <w:instrText xml:space="preserve"> PAGEREF _Toc240377169 \h </w:instrText>
+        <w:instrText xml:space="preserve"> PAGEREF _Toc240380466 \h </w:instrText>
       </w:r>
       <w:r>
         <w:rPr>
@@ -2304,7 +2304,7 @@
         <w:rPr>
           <w:noProof/>
         </w:rPr>
-        <w:instrText xml:space="preserve"> PAGEREF _Toc240377170 \h </w:instrText>
+        <w:instrText xml:space="preserve"> PAGEREF _Toc240380467 \h </w:instrText>
       </w:r>
       <w:r>
         <w:rPr>
@@ -2365,7 +2365,7 @@
         <w:rPr>
           <w:noProof/>
         </w:rPr>
-        <w:instrText xml:space="preserve"> PAGEREF _Toc240377171 \h </w:instrText>
+        <w:instrText xml:space="preserve"> PAGEREF _Toc240380468 \h </w:instrText>
       </w:r>
       <w:r>
         <w:rPr>
@@ -2426,7 +2426,7 @@
         <w:rPr>
           <w:noProof/>
         </w:rPr>
-        <w:instrText xml:space="preserve"> PAGEREF _Toc240377172 \h </w:instrText>
+        <w:instrText xml:space="preserve"> PAGEREF _Toc240380469 \h </w:instrText>
       </w:r>
       <w:r>
         <w:rPr>
@@ -2487,7 +2487,7 @@
         <w:rPr>
           <w:noProof/>
         </w:rPr>
-        <w:instrText xml:space="preserve"> PAGEREF _Toc240377173 \h </w:instrText>
+        <w:instrText xml:space="preserve"> PAGEREF _Toc240380470 \h </w:instrText>
       </w:r>
       <w:r>
         <w:rPr>
@@ -2548,7 +2548,7 @@
         <w:rPr>
           <w:noProof/>
         </w:rPr>
-        <w:instrText xml:space="preserve"> PAGEREF _Toc240377174 \h </w:instrText>
+        <w:instrText xml:space="preserve"> PAGEREF _Toc240380471 \h </w:instrText>
       </w:r>
       <w:r>
         <w:rPr>
@@ -2609,7 +2609,7 @@
         <w:rPr>
           <w:noProof/>
         </w:rPr>
-        <w:instrText xml:space="preserve"> PAGEREF _Toc240377175 \h </w:instrText>
+        <w:instrText xml:space="preserve"> PAGEREF _Toc240380472 \h </w:instrText>
       </w:r>
       <w:r>
         <w:rPr>
@@ -2670,7 +2670,7 @@
         <w:rPr>
           <w:noProof/>
         </w:rPr>
-        <w:instrText xml:space="preserve"> PAGEREF _Toc240377176 \h </w:instrText>
+        <w:instrText xml:space="preserve"> PAGEREF _Toc240380473 \h </w:instrText>
       </w:r>
       <w:r>
         <w:rPr>
@@ -2731,7 +2731,7 @@
         <w:rPr>
           <w:noProof/>
         </w:rPr>
-        <w:instrText xml:space="preserve"> PAGEREF _Toc240377177 \h </w:instrText>
+        <w:instrText xml:space="preserve"> PAGEREF _Toc240380474 \h </w:instrText>
       </w:r>
       <w:r>
         <w:rPr>
@@ -2792,7 +2792,7 @@
         <w:rPr>
           <w:noProof/>
         </w:rPr>
-        <w:instrText xml:space="preserve"> PAGEREF _Toc240377178 \h </w:instrText>
+        <w:instrText xml:space="preserve"> PAGEREF _Toc240380475 \h </w:instrText>
       </w:r>
       <w:r>
         <w:rPr>
@@ -2853,7 +2853,7 @@
         <w:rPr>
           <w:noProof/>
         </w:rPr>
-        <w:instrText xml:space="preserve"> PAGEREF _Toc240377179 \h </w:instrText>
+        <w:instrText xml:space="preserve"> PAGEREF _Toc240380476 \h </w:instrText>
       </w:r>
       <w:r>
         <w:rPr>
@@ -2914,7 +2914,7 @@
         <w:rPr>
           <w:noProof/>
         </w:rPr>
-        <w:instrText xml:space="preserve"> PAGEREF _Toc240377180 \h </w:instrText>
+        <w:instrText xml:space="preserve"> PAGEREF _Toc240380477 \h </w:instrText>
       </w:r>
       <w:r>
         <w:rPr>
@@ -2975,7 +2975,7 @@
         <w:rPr>
           <w:noProof/>
         </w:rPr>
-        <w:instrText xml:space="preserve"> PAGEREF _Toc240377181 \h </w:instrText>
+        <w:instrText xml:space="preserve"> PAGEREF _Toc240380478 \h </w:instrText>
       </w:r>
       <w:r>
         <w:rPr>
@@ -3036,7 +3036,7 @@
         <w:rPr>
           <w:noProof/>
         </w:rPr>
-        <w:instrText xml:space="preserve"> PAGEREF _Toc240377182 \h </w:instrText>
+        <w:instrText xml:space="preserve"> PAGEREF _Toc240380479 \h </w:instrText>
       </w:r>
       <w:r>
         <w:rPr>
@@ -3097,7 +3097,7 @@
         <w:rPr>
           <w:noProof/>
         </w:rPr>
-        <w:instrText xml:space="preserve"> PAGEREF _Toc240377183 \h </w:instrText>
+        <w:instrText xml:space="preserve"> PAGEREF _Toc240380480 \h </w:instrText>
       </w:r>
       <w:r>
         <w:rPr>
@@ -3158,7 +3158,7 @@
         <w:rPr>
           <w:noProof/>
         </w:rPr>
-        <w:instrText xml:space="preserve"> PAGEREF _Toc240377184 \h </w:instrText>
+        <w:instrText xml:space="preserve"> PAGEREF _Toc240380481 \h </w:instrText>
       </w:r>
       <w:r>
         <w:rPr>
@@ -3219,7 +3219,7 @@
         <w:rPr>
           <w:noProof/>
         </w:rPr>
-        <w:instrText xml:space="preserve"> PAGEREF _Toc240377185 \h </w:instrText>
+        <w:instrText xml:space="preserve"> PAGEREF _Toc240380482 \h </w:instrText>
       </w:r>
       <w:r>
         <w:rPr>
@@ -3280,7 +3280,7 @@
         <w:rPr>
           <w:noProof/>
         </w:rPr>
-        <w:instrText xml:space="preserve"> PAGEREF _Toc240377186 \h </w:instrText>
+        <w:instrText xml:space="preserve"> PAGEREF _Toc240380483 \h </w:instrText>
       </w:r>
       <w:r>
         <w:rPr>
@@ -3341,7 +3341,7 @@
         <w:rPr>
           <w:noProof/>
         </w:rPr>
-        <w:instrText xml:space="preserve"> PAGEREF _Toc240377187 \h </w:instrText>
+        <w:instrText xml:space="preserve"> PAGEREF _Toc240380484 \h </w:instrText>
       </w:r>
       <w:r>
         <w:rPr>
@@ -3402,7 +3402,7 @@
         <w:rPr>
           <w:noProof/>
         </w:rPr>
-        <w:instrText xml:space="preserve"> PAGEREF _Toc240377188 \h </w:instrText>
+        <w:instrText xml:space="preserve"> PAGEREF _Toc240380485 \h </w:instrText>
       </w:r>
       <w:r>
         <w:rPr>
@@ -3479,7 +3479,7 @@
           <w:sz w:val="34"/>
         </w:rPr>
       </w:pPr>
-      <w:bookmarkStart w:id="0" w:name="_Toc240377136"/>
+      <w:bookmarkStart w:id="0" w:name="_Toc240380433"/>
       <w:r>
         <w:rPr>
           <w:rFonts w:ascii="Montserrat" w:hAnsi="Montserrat"/>
@@ -3503,7 +3503,7 @@
           <w:sz w:val="27"/>
         </w:rPr>
       </w:pPr>
-      <w:bookmarkStart w:id="1" w:name="_Toc240377137"/>
+      <w:bookmarkStart w:id="1" w:name="_Toc240380434"/>
       <w:r>
         <w:rPr>
           <w:rFonts w:ascii="Montserrat" w:hAnsi="Montserrat"/>
@@ -5097,7 +5097,34 @@
           <w:color w:val="1A1A1A"/>
           <w:sz w:val="22"/>
         </w:rPr>
-        <w:t>O manual nao substitui as Diretrizes para a Gestao de Projetos da UNIALFA (documento institucional que define o framework D01 a D07) nem o documento Regras de Acesso e Permissoes (que detalha cada regra de controle de acesso); ele e o guia operacional de como usar cada ferramenta na pratica.</w:t>
+        <w:t>Esta e a versao 2.80 do manual. Em relacao a versao 2.79 (15/09/2026), o link da Ficha do Projeto no e-mail de aviso automatico de prazo (secao 6.4.3) foi substituido por uma indicacao da Gerencia de Projetos como alternativa de contato, com o nome do Gerente puxado do proprio campo Gerente do projeto do Planejamento.</w:t>
+      </w:r>
+    </w:p>
+    <w:p>
+      <w:pPr>
+        <w:spacing w:line="280" w:lineRule="auto"/>
+        <w:rPr>
+          <w:rFonts w:ascii="Montserrat" w:hAnsi="Montserrat"/>
+          <w:color w:val="1A1A1A"/>
+          <w:sz w:val="22"/>
+        </w:rPr>
+      </w:pPr>
+      <w:r>
+        <w:rPr>
+          <w:rFonts w:ascii="Montserrat" w:hAnsi="Montserrat"/>
+          <w:color w:val="1A1A1A"/>
+          <w:sz w:val="22"/>
+        </w:rPr>
+        <w:t xml:space="preserve">O manual nao substitui as Diretrizes para a Gestao de Projetos da UNIALFA (documento institucional que define o framework D01 a D07) nem o </w:t>
+      </w:r>
+      <w:r>
+        <w:rPr>
+          <w:rFonts w:ascii="Montserrat" w:hAnsi="Montserrat"/>
+          <w:color w:val="1A1A1A"/>
+          <w:sz w:val="22"/>
+        </w:rPr>
+        <w:lastRenderedPageBreak/>
+        <w:t>documento Regras de Acesso e Permissoes (que detalha cada regra de controle de acesso); ele e o guia operacional de como usar cada ferramenta na pratica.</w:t>
       </w:r>
     </w:p>
     <w:p>
@@ -5111,7 +5138,7 @@
           <w:sz w:val="27"/>
         </w:rPr>
       </w:pPr>
-      <w:bookmarkStart w:id="2" w:name="_Toc240377138"/>
+      <w:bookmarkStart w:id="2" w:name="_Toc240380435"/>
       <w:r>
         <w:rPr>
           <w:rFonts w:ascii="Montserrat" w:hAnsi="Montserrat"/>
@@ -5162,7 +5189,6 @@
           <w:color w:val="1A1A1A"/>
           <w:sz w:val="22"/>
         </w:rPr>
-        <w:lastRenderedPageBreak/>
         <w:t>12 formularios de registro (codigo FORALF), cada um correspondendo a um artefato institucional - da Solicitacao de Demanda ao Relatorio de Entregas e Beneficios.</w:t>
       </w:r>
     </w:p>
@@ -5309,16 +5335,16 @@
         </w:rPr>
         <w:lastRenderedPageBreak/>
         <w:drawing>
-          <wp:inline distT="0" distB="0" distL="0" distR="0" wp14:anchorId="62DE003D" wp14:editId="4E90910E">
+          <wp:inline distT="0" distB="0" distL="0" distR="0" wp14:anchorId="12C65C24" wp14:editId="5F0D061C">
             <wp:extent cx="5303520" cy="4792851"/>
             <wp:effectExtent l="19050" t="19050" r="11430" b="27305"/>
-            <wp:docPr id="356949655" name="Imagem 1"/>
+            <wp:docPr id="2079907011" name="Imagem 1"/>
             <wp:cNvGraphicFramePr/>
             <a:graphic xmlns:a="http://schemas.openxmlformats.org/drawingml/2006/main">
               <a:graphicData uri="http://schemas.openxmlformats.org/drawingml/2006/picture">
                 <pic:pic xmlns:pic="http://schemas.openxmlformats.org/drawingml/2006/picture">
                   <pic:nvPicPr>
-                    <pic:cNvPr id="356949655" name=""/>
+                    <pic:cNvPr id="2079907011" name=""/>
                     <pic:cNvPicPr/>
                   </pic:nvPicPr>
                   <pic:blipFill>
@@ -5386,7 +5412,7 @@
           <w:sz w:val="27"/>
         </w:rPr>
       </w:pPr>
-      <w:bookmarkStart w:id="3" w:name="_Toc240377139"/>
+      <w:bookmarkStart w:id="3" w:name="_Toc240380436"/>
       <w:r>
         <w:rPr>
           <w:rFonts w:ascii="Montserrat" w:hAnsi="Montserrat"/>
@@ -5427,16 +5453,16 @@
         </w:rPr>
         <w:lastRenderedPageBreak/>
         <w:drawing>
-          <wp:inline distT="0" distB="0" distL="0" distR="0" wp14:anchorId="3DAB516A" wp14:editId="3BC79EF9">
+          <wp:inline distT="0" distB="0" distL="0" distR="0" wp14:anchorId="5120E8C1" wp14:editId="58F4DE1F">
             <wp:extent cx="4206240" cy="3801227"/>
             <wp:effectExtent l="19050" t="19050" r="22860" b="27940"/>
-            <wp:docPr id="1757678584" name="Imagem 2"/>
+            <wp:docPr id="1000811117" name="Imagem 2"/>
             <wp:cNvGraphicFramePr/>
             <a:graphic xmlns:a="http://schemas.openxmlformats.org/drawingml/2006/main">
               <a:graphicData uri="http://schemas.openxmlformats.org/drawingml/2006/picture">
                 <pic:pic xmlns:pic="http://schemas.openxmlformats.org/drawingml/2006/picture">
                   <pic:nvPicPr>
-                    <pic:cNvPr id="1757678584" name=""/>
+                    <pic:cNvPr id="1000811117" name=""/>
                     <pic:cNvPicPr/>
                   </pic:nvPicPr>
                   <pic:blipFill>
@@ -5609,7 +5635,7 @@
           <w:sz w:val="27"/>
         </w:rPr>
       </w:pPr>
-      <w:bookmarkStart w:id="4" w:name="_Toc240377140"/>
+      <w:bookmarkStart w:id="4" w:name="_Toc240380437"/>
       <w:r>
         <w:rPr>
           <w:rFonts w:ascii="Montserrat" w:hAnsi="Montserrat"/>
@@ -6848,7 +6874,7 @@
           <w:sz w:val="34"/>
         </w:rPr>
       </w:pPr>
-      <w:bookmarkStart w:id="5" w:name="_Toc240377141"/>
+      <w:bookmarkStart w:id="5" w:name="_Toc240380438"/>
       <w:r>
         <w:rPr>
           <w:rFonts w:ascii="Montserrat" w:hAnsi="Montserrat"/>
@@ -6872,7 +6898,7 @@
           <w:sz w:val="27"/>
         </w:rPr>
       </w:pPr>
-      <w:bookmarkStart w:id="6" w:name="_Toc240377142"/>
+      <w:bookmarkStart w:id="6" w:name="_Toc240380439"/>
       <w:r>
         <w:rPr>
           <w:rFonts w:ascii="Montserrat" w:hAnsi="Montserrat"/>
@@ -6913,7 +6939,7 @@
           <w:sz w:val="27"/>
         </w:rPr>
       </w:pPr>
-      <w:bookmarkStart w:id="7" w:name="_Toc240377143"/>
+      <w:bookmarkStart w:id="7" w:name="_Toc240380440"/>
       <w:r>
         <w:rPr>
           <w:rFonts w:ascii="Montserrat" w:hAnsi="Montserrat"/>
@@ -7032,7 +7058,7 @@
           <w:sz w:val="27"/>
         </w:rPr>
       </w:pPr>
-      <w:bookmarkStart w:id="8" w:name="_Toc240377144"/>
+      <w:bookmarkStart w:id="8" w:name="_Toc240380441"/>
       <w:r>
         <w:rPr>
           <w:rFonts w:ascii="Montserrat" w:hAnsi="Montserrat"/>
@@ -7645,7 +7671,7 @@
           <w:sz w:val="27"/>
         </w:rPr>
       </w:pPr>
-      <w:bookmarkStart w:id="9" w:name="_Toc240377145"/>
+      <w:bookmarkStart w:id="9" w:name="_Toc240380442"/>
       <w:r>
         <w:rPr>
           <w:rFonts w:ascii="Montserrat" w:hAnsi="Montserrat"/>
@@ -7734,16 +7760,16 @@
         </w:rPr>
         <w:lastRenderedPageBreak/>
         <w:drawing>
-          <wp:inline distT="0" distB="0" distL="0" distR="0" wp14:anchorId="670CB617" wp14:editId="112453A0">
+          <wp:inline distT="0" distB="0" distL="0" distR="0" wp14:anchorId="42092003" wp14:editId="6648FE95">
             <wp:extent cx="4937760" cy="4462310"/>
             <wp:effectExtent l="19050" t="19050" r="15240" b="14605"/>
-            <wp:docPr id="576097588" name="Imagem 3"/>
+            <wp:docPr id="686269141" name="Imagem 3"/>
             <wp:cNvGraphicFramePr/>
             <a:graphic xmlns:a="http://schemas.openxmlformats.org/drawingml/2006/main">
               <a:graphicData uri="http://schemas.openxmlformats.org/drawingml/2006/picture">
                 <pic:pic xmlns:pic="http://schemas.openxmlformats.org/drawingml/2006/picture">
                   <pic:nvPicPr>
-                    <pic:cNvPr id="576097588" name=""/>
+                    <pic:cNvPr id="686269141" name=""/>
                     <pic:cNvPicPr/>
                   </pic:nvPicPr>
                   <pic:blipFill>
@@ -7811,7 +7837,7 @@
           <w:sz w:val="27"/>
         </w:rPr>
       </w:pPr>
-      <w:bookmarkStart w:id="10" w:name="_Toc240377146"/>
+      <w:bookmarkStart w:id="10" w:name="_Toc240380443"/>
       <w:r>
         <w:rPr>
           <w:rFonts w:ascii="Montserrat" w:hAnsi="Montserrat"/>
@@ -7852,16 +7878,16 @@
         </w:rPr>
         <w:lastRenderedPageBreak/>
         <w:drawing>
-          <wp:inline distT="0" distB="0" distL="0" distR="0" wp14:anchorId="28950419" wp14:editId="5F7FE555">
+          <wp:inline distT="0" distB="0" distL="0" distR="0" wp14:anchorId="0F3158B4" wp14:editId="13A934BA">
             <wp:extent cx="5120640" cy="4627581"/>
             <wp:effectExtent l="19050" t="19050" r="22860" b="20955"/>
-            <wp:docPr id="1057969520" name="Imagem 4"/>
+            <wp:docPr id="218423966" name="Imagem 4"/>
             <wp:cNvGraphicFramePr/>
             <a:graphic xmlns:a="http://schemas.openxmlformats.org/drawingml/2006/main">
               <a:graphicData uri="http://schemas.openxmlformats.org/drawingml/2006/picture">
                 <pic:pic xmlns:pic="http://schemas.openxmlformats.org/drawingml/2006/picture">
                   <pic:nvPicPr>
-                    <pic:cNvPr id="1057969520" name=""/>
+                    <pic:cNvPr id="218423966" name=""/>
                     <pic:cNvPicPr/>
                   </pic:nvPicPr>
                   <pic:blipFill>
@@ -8044,7 +8070,7 @@
           <w:sz w:val="27"/>
         </w:rPr>
       </w:pPr>
-      <w:bookmarkStart w:id="11" w:name="_Toc240377147"/>
+      <w:bookmarkStart w:id="11" w:name="_Toc240380444"/>
       <w:r>
         <w:rPr>
           <w:rFonts w:ascii="Montserrat" w:hAnsi="Montserrat"/>
@@ -8084,16 +8110,16 @@
           <w:noProof/>
         </w:rPr>
         <w:drawing>
-          <wp:inline distT="0" distB="0" distL="0" distR="0" wp14:anchorId="0D12F631" wp14:editId="04D35DF1">
+          <wp:inline distT="0" distB="0" distL="0" distR="0" wp14:anchorId="5DE7C5FB" wp14:editId="23218B97">
             <wp:extent cx="4206240" cy="3801227"/>
             <wp:effectExtent l="19050" t="19050" r="22860" b="27940"/>
-            <wp:docPr id="1747421911" name="Imagem 5"/>
+            <wp:docPr id="1430500930" name="Imagem 5"/>
             <wp:cNvGraphicFramePr/>
             <a:graphic xmlns:a="http://schemas.openxmlformats.org/drawingml/2006/main">
               <a:graphicData uri="http://schemas.openxmlformats.org/drawingml/2006/picture">
                 <pic:pic xmlns:pic="http://schemas.openxmlformats.org/drawingml/2006/picture">
                   <pic:nvPicPr>
-                    <pic:cNvPr id="1747421911" name=""/>
+                    <pic:cNvPr id="1430500930" name=""/>
                     <pic:cNvPicPr/>
                   </pic:nvPicPr>
                   <pic:blipFill>
@@ -8161,16 +8187,16 @@
         </w:rPr>
         <w:lastRenderedPageBreak/>
         <w:drawing>
-          <wp:inline distT="0" distB="0" distL="0" distR="0" wp14:anchorId="71438432" wp14:editId="59AAB44A">
+          <wp:inline distT="0" distB="0" distL="0" distR="0" wp14:anchorId="6ED10A1A" wp14:editId="7F921AF8">
             <wp:extent cx="4206240" cy="3801227"/>
             <wp:effectExtent l="19050" t="19050" r="22860" b="27940"/>
-            <wp:docPr id="1142659049" name="Imagem 6"/>
+            <wp:docPr id="859272112" name="Imagem 6"/>
             <wp:cNvGraphicFramePr/>
             <a:graphic xmlns:a="http://schemas.openxmlformats.org/drawingml/2006/main">
               <a:graphicData uri="http://schemas.openxmlformats.org/drawingml/2006/picture">
                 <pic:pic xmlns:pic="http://schemas.openxmlformats.org/drawingml/2006/picture">
                   <pic:nvPicPr>
-                    <pic:cNvPr id="1142659049" name=""/>
+                    <pic:cNvPr id="859272112" name=""/>
                     <pic:cNvPicPr/>
                   </pic:nvPicPr>
                   <pic:blipFill>
@@ -8286,7 +8312,7 @@
           <w:sz w:val="27"/>
         </w:rPr>
       </w:pPr>
-      <w:bookmarkStart w:id="12" w:name="_Toc240377148"/>
+      <w:bookmarkStart w:id="12" w:name="_Toc240380445"/>
       <w:r>
         <w:rPr>
           <w:rFonts w:ascii="Montserrat" w:hAnsi="Montserrat"/>
@@ -8354,7 +8380,7 @@
           <w:sz w:val="27"/>
         </w:rPr>
       </w:pPr>
-      <w:bookmarkStart w:id="13" w:name="_Toc240377149"/>
+      <w:bookmarkStart w:id="13" w:name="_Toc240380446"/>
       <w:r>
         <w:rPr>
           <w:rFonts w:ascii="Montserrat" w:hAnsi="Montserrat"/>
@@ -8581,7 +8607,7 @@
           <w:sz w:val="27"/>
         </w:rPr>
       </w:pPr>
-      <w:bookmarkStart w:id="14" w:name="_Toc240377150"/>
+      <w:bookmarkStart w:id="14" w:name="_Toc240380447"/>
       <w:r>
         <w:rPr>
           <w:rFonts w:ascii="Montserrat" w:hAnsi="Montserrat"/>
@@ -8740,7 +8766,7 @@
           <w:sz w:val="27"/>
         </w:rPr>
       </w:pPr>
-      <w:bookmarkStart w:id="15" w:name="_Toc240377151"/>
+      <w:bookmarkStart w:id="15" w:name="_Toc240380448"/>
       <w:r>
         <w:rPr>
           <w:rFonts w:ascii="Montserrat" w:hAnsi="Montserrat"/>
@@ -8932,7 +8958,7 @@
           <w:sz w:val="27"/>
         </w:rPr>
       </w:pPr>
-      <w:bookmarkStart w:id="16" w:name="_Toc240377152"/>
+      <w:bookmarkStart w:id="16" w:name="_Toc240380449"/>
       <w:r>
         <w:rPr>
           <w:rFonts w:ascii="Montserrat" w:hAnsi="Montserrat"/>
@@ -9060,7 +9086,7 @@
           <w:sz w:val="27"/>
         </w:rPr>
       </w:pPr>
-      <w:bookmarkStart w:id="17" w:name="_Toc240377153"/>
+      <w:bookmarkStart w:id="17" w:name="_Toc240380450"/>
       <w:r>
         <w:rPr>
           <w:rFonts w:ascii="Montserrat" w:hAnsi="Montserrat"/>
@@ -9390,7 +9416,7 @@
           <w:sz w:val="27"/>
         </w:rPr>
       </w:pPr>
-      <w:bookmarkStart w:id="18" w:name="_Toc240377154"/>
+      <w:bookmarkStart w:id="18" w:name="_Toc240380451"/>
       <w:r>
         <w:rPr>
           <w:rFonts w:ascii="Montserrat" w:hAnsi="Montserrat"/>
@@ -9527,7 +9553,7 @@
           <w:sz w:val="27"/>
         </w:rPr>
       </w:pPr>
-      <w:bookmarkStart w:id="19" w:name="_Toc240377155"/>
+      <w:bookmarkStart w:id="19" w:name="_Toc240380452"/>
       <w:r>
         <w:rPr>
           <w:rFonts w:ascii="Montserrat" w:hAnsi="Montserrat"/>
@@ -9806,7 +9832,7 @@
           <w:sz w:val="27"/>
         </w:rPr>
       </w:pPr>
-      <w:bookmarkStart w:id="20" w:name="_Toc240377156"/>
+      <w:bookmarkStart w:id="20" w:name="_Toc240380453"/>
       <w:r>
         <w:rPr>
           <w:rFonts w:ascii="Montserrat" w:hAnsi="Montserrat"/>
@@ -9983,7 +10009,7 @@
           <w:sz w:val="27"/>
         </w:rPr>
       </w:pPr>
-      <w:bookmarkStart w:id="21" w:name="_Toc240377157"/>
+      <w:bookmarkStart w:id="21" w:name="_Toc240380454"/>
       <w:r>
         <w:rPr>
           <w:rFonts w:ascii="Montserrat" w:hAnsi="Montserrat"/>
@@ -10097,7 +10123,7 @@
           <w:sz w:val="34"/>
         </w:rPr>
       </w:pPr>
-      <w:bookmarkStart w:id="22" w:name="_Toc240377158"/>
+      <w:bookmarkStart w:id="22" w:name="_Toc240380455"/>
       <w:r>
         <w:rPr>
           <w:rFonts w:ascii="Montserrat" w:hAnsi="Montserrat"/>
@@ -10139,7 +10165,7 @@
           <w:sz w:val="27"/>
         </w:rPr>
       </w:pPr>
-      <w:bookmarkStart w:id="23" w:name="_Toc240377159"/>
+      <w:bookmarkStart w:id="23" w:name="_Toc240380456"/>
       <w:r>
         <w:rPr>
           <w:rFonts w:ascii="Montserrat" w:hAnsi="Montserrat"/>
@@ -11219,16 +11245,16 @@
         </w:rPr>
         <w:lastRenderedPageBreak/>
         <w:drawing>
-          <wp:inline distT="0" distB="0" distL="0" distR="0" wp14:anchorId="2A2B6CBA" wp14:editId="09E0A330">
+          <wp:inline distT="0" distB="0" distL="0" distR="0" wp14:anchorId="504EB201" wp14:editId="0B4BD9FB">
             <wp:extent cx="5120640" cy="4627581"/>
             <wp:effectExtent l="19050" t="19050" r="22860" b="20955"/>
-            <wp:docPr id="1202940125" name="Imagem 7"/>
+            <wp:docPr id="1860767040" name="Imagem 7"/>
             <wp:cNvGraphicFramePr/>
             <a:graphic xmlns:a="http://schemas.openxmlformats.org/drawingml/2006/main">
               <a:graphicData uri="http://schemas.openxmlformats.org/drawingml/2006/picture">
                 <pic:pic xmlns:pic="http://schemas.openxmlformats.org/drawingml/2006/picture">
                   <pic:nvPicPr>
-                    <pic:cNvPr id="1202940125" name=""/>
+                    <pic:cNvPr id="1860767040" name=""/>
                     <pic:cNvPicPr/>
                   </pic:nvPicPr>
                   <pic:blipFill>
@@ -11296,16 +11322,16 @@
         </w:rPr>
         <w:lastRenderedPageBreak/>
         <w:drawing>
-          <wp:inline distT="0" distB="0" distL="0" distR="0" wp14:anchorId="614910AF" wp14:editId="576AEFB6">
+          <wp:inline distT="0" distB="0" distL="0" distR="0" wp14:anchorId="6330A51D" wp14:editId="70AD165B">
             <wp:extent cx="5120640" cy="4627581"/>
             <wp:effectExtent l="19050" t="19050" r="22860" b="20955"/>
-            <wp:docPr id="214317729" name="Imagem 8"/>
+            <wp:docPr id="1255012756" name="Imagem 8"/>
             <wp:cNvGraphicFramePr/>
             <a:graphic xmlns:a="http://schemas.openxmlformats.org/drawingml/2006/main">
               <a:graphicData uri="http://schemas.openxmlformats.org/drawingml/2006/picture">
                 <pic:pic xmlns:pic="http://schemas.openxmlformats.org/drawingml/2006/picture">
                   <pic:nvPicPr>
-                    <pic:cNvPr id="214317729" name=""/>
+                    <pic:cNvPr id="1255012756" name=""/>
                     <pic:cNvPicPr/>
                   </pic:nvPicPr>
                   <pic:blipFill>
@@ -11513,7 +11539,7 @@
           <w:sz w:val="27"/>
         </w:rPr>
       </w:pPr>
-      <w:bookmarkStart w:id="24" w:name="_Toc240377160"/>
+      <w:bookmarkStart w:id="24" w:name="_Toc240380457"/>
       <w:r>
         <w:rPr>
           <w:rFonts w:ascii="Montserrat" w:hAnsi="Montserrat"/>
@@ -12438,16 +12464,16 @@
           <w:noProof/>
         </w:rPr>
         <w:drawing>
-          <wp:inline distT="0" distB="0" distL="0" distR="0" wp14:anchorId="09C8C950" wp14:editId="58FD1D84">
+          <wp:inline distT="0" distB="0" distL="0" distR="0" wp14:anchorId="4DCD734B" wp14:editId="42B23E45">
             <wp:extent cx="5120640" cy="4627581"/>
             <wp:effectExtent l="19050" t="19050" r="22860" b="20955"/>
-            <wp:docPr id="1479270334" name="Imagem 9"/>
+            <wp:docPr id="148266459" name="Imagem 9"/>
             <wp:cNvGraphicFramePr/>
             <a:graphic xmlns:a="http://schemas.openxmlformats.org/drawingml/2006/main">
               <a:graphicData uri="http://schemas.openxmlformats.org/drawingml/2006/picture">
                 <pic:pic xmlns:pic="http://schemas.openxmlformats.org/drawingml/2006/picture">
                   <pic:nvPicPr>
-                    <pic:cNvPr id="1479270334" name=""/>
+                    <pic:cNvPr id="148266459" name=""/>
                     <pic:cNvPicPr/>
                   </pic:nvPicPr>
                   <pic:blipFill>
@@ -12515,16 +12541,16 @@
         </w:rPr>
         <w:lastRenderedPageBreak/>
         <w:drawing>
-          <wp:inline distT="0" distB="0" distL="0" distR="0" wp14:anchorId="55AFE75C" wp14:editId="242B912E">
+          <wp:inline distT="0" distB="0" distL="0" distR="0" wp14:anchorId="3AC8E488" wp14:editId="3F85632A">
             <wp:extent cx="5120640" cy="4627581"/>
             <wp:effectExtent l="19050" t="19050" r="22860" b="20955"/>
-            <wp:docPr id="1831456546" name="Imagem 10"/>
+            <wp:docPr id="1074091812" name="Imagem 10"/>
             <wp:cNvGraphicFramePr/>
             <a:graphic xmlns:a="http://schemas.openxmlformats.org/drawingml/2006/main">
               <a:graphicData uri="http://schemas.openxmlformats.org/drawingml/2006/picture">
                 <pic:pic xmlns:pic="http://schemas.openxmlformats.org/drawingml/2006/picture">
                   <pic:nvPicPr>
-                    <pic:cNvPr id="1831456546" name=""/>
+                    <pic:cNvPr id="1074091812" name=""/>
                     <pic:cNvPicPr/>
                   </pic:nvPicPr>
                   <pic:blipFill>
@@ -12658,7 +12684,7 @@
           <w:sz w:val="27"/>
         </w:rPr>
       </w:pPr>
-      <w:bookmarkStart w:id="25" w:name="_Toc240377161"/>
+      <w:bookmarkStart w:id="25" w:name="_Toc240380458"/>
       <w:r>
         <w:rPr>
           <w:rFonts w:ascii="Montserrat" w:hAnsi="Montserrat"/>
@@ -13724,16 +13750,16 @@
           <w:noProof/>
         </w:rPr>
         <w:drawing>
-          <wp:inline distT="0" distB="0" distL="0" distR="0" wp14:anchorId="56CCD6E7" wp14:editId="096B413F">
+          <wp:inline distT="0" distB="0" distL="0" distR="0" wp14:anchorId="72B53390" wp14:editId="5E4BD895">
             <wp:extent cx="5120640" cy="3338440"/>
             <wp:effectExtent l="19050" t="19050" r="22860" b="14605"/>
-            <wp:docPr id="818503837" name="Imagem 11"/>
+            <wp:docPr id="1561503971" name="Imagem 11"/>
             <wp:cNvGraphicFramePr/>
             <a:graphic xmlns:a="http://schemas.openxmlformats.org/drawingml/2006/main">
               <a:graphicData uri="http://schemas.openxmlformats.org/drawingml/2006/picture">
                 <pic:pic xmlns:pic="http://schemas.openxmlformats.org/drawingml/2006/picture">
                   <pic:nvPicPr>
-                    <pic:cNvPr id="818503837" name=""/>
+                    <pic:cNvPr id="1561503971" name=""/>
                     <pic:cNvPicPr/>
                   </pic:nvPicPr>
                   <pic:blipFill>
@@ -13801,16 +13827,16 @@
         </w:rPr>
         <w:lastRenderedPageBreak/>
         <w:drawing>
-          <wp:inline distT="0" distB="0" distL="0" distR="0" wp14:anchorId="589F8319" wp14:editId="56F0287D">
+          <wp:inline distT="0" distB="0" distL="0" distR="0" wp14:anchorId="0EA863BD" wp14:editId="602E8630">
             <wp:extent cx="5120640" cy="4627581"/>
             <wp:effectExtent l="19050" t="19050" r="22860" b="20955"/>
-            <wp:docPr id="1513270661" name="Imagem 12"/>
+            <wp:docPr id="1445437605" name="Imagem 12"/>
             <wp:cNvGraphicFramePr/>
             <a:graphic xmlns:a="http://schemas.openxmlformats.org/drawingml/2006/main">
               <a:graphicData uri="http://schemas.openxmlformats.org/drawingml/2006/picture">
                 <pic:pic xmlns:pic="http://schemas.openxmlformats.org/drawingml/2006/picture">
                   <pic:nvPicPr>
-                    <pic:cNvPr id="1513270661" name=""/>
+                    <pic:cNvPr id="1445437605" name=""/>
                     <pic:cNvPicPr/>
                   </pic:nvPicPr>
                   <pic:blipFill>
@@ -14014,7 +14040,7 @@
           <w:sz w:val="27"/>
         </w:rPr>
       </w:pPr>
-      <w:bookmarkStart w:id="26" w:name="_Toc240377162"/>
+      <w:bookmarkStart w:id="26" w:name="_Toc240380459"/>
       <w:r>
         <w:rPr>
           <w:rFonts w:ascii="Montserrat" w:hAnsi="Montserrat"/>
@@ -14575,16 +14601,16 @@
           <w:noProof/>
         </w:rPr>
         <w:drawing>
-          <wp:inline distT="0" distB="0" distL="0" distR="0" wp14:anchorId="39BBFBB6" wp14:editId="43086EE8">
+          <wp:inline distT="0" distB="0" distL="0" distR="0" wp14:anchorId="5524EC36" wp14:editId="14823CEB">
             <wp:extent cx="5120640" cy="4627581"/>
             <wp:effectExtent l="19050" t="19050" r="22860" b="20955"/>
-            <wp:docPr id="71051692" name="Imagem 13"/>
+            <wp:docPr id="2026115166" name="Imagem 13"/>
             <wp:cNvGraphicFramePr/>
             <a:graphic xmlns:a="http://schemas.openxmlformats.org/drawingml/2006/main">
               <a:graphicData uri="http://schemas.openxmlformats.org/drawingml/2006/picture">
                 <pic:pic xmlns:pic="http://schemas.openxmlformats.org/drawingml/2006/picture">
                   <pic:nvPicPr>
-                    <pic:cNvPr id="71051692" name=""/>
+                    <pic:cNvPr id="2026115166" name=""/>
                     <pic:cNvPicPr/>
                   </pic:nvPicPr>
                   <pic:blipFill>
@@ -14652,16 +14678,16 @@
         </w:rPr>
         <w:lastRenderedPageBreak/>
         <w:drawing>
-          <wp:inline distT="0" distB="0" distL="0" distR="0" wp14:anchorId="79B10A23" wp14:editId="5228E18D">
+          <wp:inline distT="0" distB="0" distL="0" distR="0" wp14:anchorId="029342FA" wp14:editId="1E0D6A82">
             <wp:extent cx="5120640" cy="4627581"/>
             <wp:effectExtent l="19050" t="19050" r="22860" b="20955"/>
-            <wp:docPr id="1557173689" name="Imagem 14"/>
+            <wp:docPr id="1035913325" name="Imagem 14"/>
             <wp:cNvGraphicFramePr/>
             <a:graphic xmlns:a="http://schemas.openxmlformats.org/drawingml/2006/main">
               <a:graphicData uri="http://schemas.openxmlformats.org/drawingml/2006/picture">
                 <pic:pic xmlns:pic="http://schemas.openxmlformats.org/drawingml/2006/picture">
                   <pic:nvPicPr>
-                    <pic:cNvPr id="1557173689" name=""/>
+                    <pic:cNvPr id="1035913325" name=""/>
                     <pic:cNvPicPr/>
                   </pic:nvPicPr>
                   <pic:blipFill>
@@ -14931,7 +14957,7 @@
           <w:sz w:val="27"/>
         </w:rPr>
       </w:pPr>
-      <w:bookmarkStart w:id="27" w:name="_Toc240377163"/>
+      <w:bookmarkStart w:id="27" w:name="_Toc240380460"/>
       <w:r>
         <w:rPr>
           <w:rFonts w:ascii="Montserrat" w:hAnsi="Montserrat"/>
@@ -14972,16 +14998,16 @@
         </w:rPr>
         <w:lastRenderedPageBreak/>
         <w:drawing>
-          <wp:inline distT="0" distB="0" distL="0" distR="0" wp14:anchorId="6C50352B" wp14:editId="4D0D3AE0">
+          <wp:inline distT="0" distB="0" distL="0" distR="0" wp14:anchorId="42D940AF" wp14:editId="7E4CB01B">
             <wp:extent cx="5120640" cy="4627581"/>
             <wp:effectExtent l="19050" t="19050" r="22860" b="20955"/>
-            <wp:docPr id="1318899153" name="Imagem 15"/>
+            <wp:docPr id="1097857730" name="Imagem 15"/>
             <wp:cNvGraphicFramePr/>
             <a:graphic xmlns:a="http://schemas.openxmlformats.org/drawingml/2006/main">
               <a:graphicData uri="http://schemas.openxmlformats.org/drawingml/2006/picture">
                 <pic:pic xmlns:pic="http://schemas.openxmlformats.org/drawingml/2006/picture">
                   <pic:nvPicPr>
-                    <pic:cNvPr id="1318899153" name=""/>
+                    <pic:cNvPr id="1097857730" name=""/>
                     <pic:cNvPicPr/>
                   </pic:nvPicPr>
                   <pic:blipFill>
@@ -15049,16 +15075,16 @@
         </w:rPr>
         <w:lastRenderedPageBreak/>
         <w:drawing>
-          <wp:inline distT="0" distB="0" distL="0" distR="0" wp14:anchorId="61C526FD" wp14:editId="4AED7F19">
+          <wp:inline distT="0" distB="0" distL="0" distR="0" wp14:anchorId="02DD51E4" wp14:editId="596AABE0">
             <wp:extent cx="5120640" cy="4627581"/>
             <wp:effectExtent l="19050" t="19050" r="22860" b="20955"/>
-            <wp:docPr id="346299741" name="Imagem 16"/>
+            <wp:docPr id="887060187" name="Imagem 16"/>
             <wp:cNvGraphicFramePr/>
             <a:graphic xmlns:a="http://schemas.openxmlformats.org/drawingml/2006/main">
               <a:graphicData uri="http://schemas.openxmlformats.org/drawingml/2006/picture">
                 <pic:pic xmlns:pic="http://schemas.openxmlformats.org/drawingml/2006/picture">
                   <pic:nvPicPr>
-                    <pic:cNvPr id="346299741" name=""/>
+                    <pic:cNvPr id="887060187" name=""/>
                     <pic:cNvPicPr/>
                   </pic:nvPicPr>
                   <pic:blipFill>
@@ -15222,16 +15248,16 @@
         </w:rPr>
         <w:lastRenderedPageBreak/>
         <w:drawing>
-          <wp:inline distT="0" distB="0" distL="0" distR="0" wp14:anchorId="2E437279" wp14:editId="539C7849">
+          <wp:inline distT="0" distB="0" distL="0" distR="0" wp14:anchorId="1125ED91" wp14:editId="2D06DFD1">
             <wp:extent cx="5120640" cy="3282818"/>
             <wp:effectExtent l="19050" t="19050" r="22860" b="13335"/>
-            <wp:docPr id="327530915" name="Imagem 17"/>
+            <wp:docPr id="366344269" name="Imagem 17"/>
             <wp:cNvGraphicFramePr/>
             <a:graphic xmlns:a="http://schemas.openxmlformats.org/drawingml/2006/main">
               <a:graphicData uri="http://schemas.openxmlformats.org/drawingml/2006/picture">
                 <pic:pic xmlns:pic="http://schemas.openxmlformats.org/drawingml/2006/picture">
                   <pic:nvPicPr>
-                    <pic:cNvPr id="327530915" name=""/>
+                    <pic:cNvPr id="366344269" name=""/>
                     <pic:cNvPicPr/>
                   </pic:nvPicPr>
                   <pic:blipFill>
@@ -15422,7 +15448,7 @@
           <w:sz w:val="27"/>
         </w:rPr>
       </w:pPr>
-      <w:bookmarkStart w:id="28" w:name="_Toc240377164"/>
+      <w:bookmarkStart w:id="28" w:name="_Toc240380461"/>
       <w:r>
         <w:rPr>
           <w:rFonts w:ascii="Montserrat" w:hAnsi="Montserrat"/>
@@ -15462,16 +15488,16 @@
           <w:noProof/>
         </w:rPr>
         <w:drawing>
-          <wp:inline distT="0" distB="0" distL="0" distR="0" wp14:anchorId="476F26D4" wp14:editId="017FE41B">
+          <wp:inline distT="0" distB="0" distL="0" distR="0" wp14:anchorId="751B1257" wp14:editId="5B5FB233">
             <wp:extent cx="5120640" cy="4627581"/>
             <wp:effectExtent l="19050" t="19050" r="22860" b="20955"/>
-            <wp:docPr id="543520225" name="Imagem 18"/>
+            <wp:docPr id="1808520900" name="Imagem 18"/>
             <wp:cNvGraphicFramePr/>
             <a:graphic xmlns:a="http://schemas.openxmlformats.org/drawingml/2006/main">
               <a:graphicData uri="http://schemas.openxmlformats.org/drawingml/2006/picture">
                 <pic:pic xmlns:pic="http://schemas.openxmlformats.org/drawingml/2006/picture">
                   <pic:nvPicPr>
-                    <pic:cNvPr id="543520225" name=""/>
+                    <pic:cNvPr id="1808520900" name=""/>
                     <pic:cNvPicPr/>
                   </pic:nvPicPr>
                   <pic:blipFill>
@@ -15539,16 +15565,16 @@
         </w:rPr>
         <w:lastRenderedPageBreak/>
         <w:drawing>
-          <wp:inline distT="0" distB="0" distL="0" distR="0" wp14:anchorId="302AD3E0" wp14:editId="7AC49BF7">
+          <wp:inline distT="0" distB="0" distL="0" distR="0" wp14:anchorId="313AC064" wp14:editId="26711270">
             <wp:extent cx="5120640" cy="4627581"/>
             <wp:effectExtent l="19050" t="19050" r="22860" b="20955"/>
-            <wp:docPr id="630139773" name="Imagem 19"/>
+            <wp:docPr id="1541415792" name="Imagem 19"/>
             <wp:cNvGraphicFramePr/>
             <a:graphic xmlns:a="http://schemas.openxmlformats.org/drawingml/2006/main">
               <a:graphicData uri="http://schemas.openxmlformats.org/drawingml/2006/picture">
                 <pic:pic xmlns:pic="http://schemas.openxmlformats.org/drawingml/2006/picture">
                   <pic:nvPicPr>
-                    <pic:cNvPr id="630139773" name=""/>
+                    <pic:cNvPr id="1541415792" name=""/>
                     <pic:cNvPicPr/>
                   </pic:nvPicPr>
                   <pic:blipFill>
@@ -15731,7 +15757,7 @@
           <w:sz w:val="27"/>
         </w:rPr>
       </w:pPr>
-      <w:bookmarkStart w:id="29" w:name="_Toc240377165"/>
+      <w:bookmarkStart w:id="29" w:name="_Toc240380462"/>
       <w:r>
         <w:rPr>
           <w:rFonts w:ascii="Montserrat" w:hAnsi="Montserrat"/>
@@ -15771,16 +15797,16 @@
           <w:noProof/>
         </w:rPr>
         <w:drawing>
-          <wp:inline distT="0" distB="0" distL="0" distR="0" wp14:anchorId="5FD27159" wp14:editId="0C718DEC">
+          <wp:inline distT="0" distB="0" distL="0" distR="0" wp14:anchorId="23C46875" wp14:editId="79F19689">
             <wp:extent cx="5120640" cy="4627581"/>
             <wp:effectExtent l="19050" t="19050" r="22860" b="20955"/>
-            <wp:docPr id="1520286166" name="Imagem 20"/>
+            <wp:docPr id="2107203195" name="Imagem 20"/>
             <wp:cNvGraphicFramePr/>
             <a:graphic xmlns:a="http://schemas.openxmlformats.org/drawingml/2006/main">
               <a:graphicData uri="http://schemas.openxmlformats.org/drawingml/2006/picture">
                 <pic:pic xmlns:pic="http://schemas.openxmlformats.org/drawingml/2006/picture">
                   <pic:nvPicPr>
-                    <pic:cNvPr id="1520286166" name=""/>
+                    <pic:cNvPr id="2107203195" name=""/>
                     <pic:cNvPicPr/>
                   </pic:nvPicPr>
                   <pic:blipFill>
@@ -15848,16 +15874,16 @@
         </w:rPr>
         <w:lastRenderedPageBreak/>
         <w:drawing>
-          <wp:inline distT="0" distB="0" distL="0" distR="0" wp14:anchorId="7F9D0136" wp14:editId="4698A461">
+          <wp:inline distT="0" distB="0" distL="0" distR="0" wp14:anchorId="7025DF7E" wp14:editId="2054CEEF">
             <wp:extent cx="5120640" cy="4627581"/>
             <wp:effectExtent l="19050" t="19050" r="22860" b="20955"/>
-            <wp:docPr id="1341805907" name="Imagem 21"/>
+            <wp:docPr id="1113035097" name="Imagem 21"/>
             <wp:cNvGraphicFramePr/>
             <a:graphic xmlns:a="http://schemas.openxmlformats.org/drawingml/2006/main">
               <a:graphicData uri="http://schemas.openxmlformats.org/drawingml/2006/picture">
                 <pic:pic xmlns:pic="http://schemas.openxmlformats.org/drawingml/2006/picture">
                   <pic:nvPicPr>
-                    <pic:cNvPr id="1341805907" name=""/>
+                    <pic:cNvPr id="1113035097" name=""/>
                     <pic:cNvPicPr/>
                   </pic:nvPicPr>
                   <pic:blipFill>
@@ -16063,16 +16089,16 @@
           <w:noProof/>
         </w:rPr>
         <w:drawing>
-          <wp:inline distT="0" distB="0" distL="0" distR="0" wp14:anchorId="7E4AC97B" wp14:editId="2079C6F8">
+          <wp:inline distT="0" distB="0" distL="0" distR="0" wp14:anchorId="573630F5" wp14:editId="53972BF9">
             <wp:extent cx="5120640" cy="1757287"/>
             <wp:effectExtent l="19050" t="19050" r="22860" b="14605"/>
-            <wp:docPr id="510871481" name="Imagem 22"/>
+            <wp:docPr id="765248020" name="Imagem 22"/>
             <wp:cNvGraphicFramePr/>
             <a:graphic xmlns:a="http://schemas.openxmlformats.org/drawingml/2006/main">
               <a:graphicData uri="http://schemas.openxmlformats.org/drawingml/2006/picture">
                 <pic:pic xmlns:pic="http://schemas.openxmlformats.org/drawingml/2006/picture">
                   <pic:nvPicPr>
-                    <pic:cNvPr id="510871481" name=""/>
+                    <pic:cNvPr id="765248020" name=""/>
                     <pic:cNvPicPr/>
                   </pic:nvPicPr>
                   <pic:blipFill>
@@ -16185,7 +16211,7 @@
           <w:sz w:val="27"/>
         </w:rPr>
       </w:pPr>
-      <w:bookmarkStart w:id="30" w:name="_Toc240377166"/>
+      <w:bookmarkStart w:id="30" w:name="_Toc240380463"/>
       <w:r>
         <w:rPr>
           <w:rFonts w:ascii="Montserrat" w:hAnsi="Montserrat"/>
@@ -16226,16 +16252,16 @@
         </w:rPr>
         <w:lastRenderedPageBreak/>
         <w:drawing>
-          <wp:inline distT="0" distB="0" distL="0" distR="0" wp14:anchorId="3A81F66A" wp14:editId="3DC6EA01">
+          <wp:inline distT="0" distB="0" distL="0" distR="0" wp14:anchorId="2C5D60D6" wp14:editId="67DC15C2">
             <wp:extent cx="5120640" cy="4627581"/>
             <wp:effectExtent l="19050" t="19050" r="22860" b="20955"/>
-            <wp:docPr id="2048671477" name="Imagem 23"/>
+            <wp:docPr id="630139495" name="Imagem 23"/>
             <wp:cNvGraphicFramePr/>
             <a:graphic xmlns:a="http://schemas.openxmlformats.org/drawingml/2006/main">
               <a:graphicData uri="http://schemas.openxmlformats.org/drawingml/2006/picture">
                 <pic:pic xmlns:pic="http://schemas.openxmlformats.org/drawingml/2006/picture">
                   <pic:nvPicPr>
-                    <pic:cNvPr id="2048671477" name=""/>
+                    <pic:cNvPr id="630139495" name=""/>
                     <pic:cNvPicPr/>
                   </pic:nvPicPr>
                   <pic:blipFill>
@@ -16303,16 +16329,16 @@
         </w:rPr>
         <w:lastRenderedPageBreak/>
         <w:drawing>
-          <wp:inline distT="0" distB="0" distL="0" distR="0" wp14:anchorId="1E1238E6" wp14:editId="5E72C129">
+          <wp:inline distT="0" distB="0" distL="0" distR="0" wp14:anchorId="3888F0CC" wp14:editId="67EF3E6F">
             <wp:extent cx="5120640" cy="4627581"/>
             <wp:effectExtent l="19050" t="19050" r="22860" b="20955"/>
-            <wp:docPr id="2028254673" name="Imagem 24"/>
+            <wp:docPr id="74493123" name="Imagem 24"/>
             <wp:cNvGraphicFramePr/>
             <a:graphic xmlns:a="http://schemas.openxmlformats.org/drawingml/2006/main">
               <a:graphicData uri="http://schemas.openxmlformats.org/drawingml/2006/picture">
                 <pic:pic xmlns:pic="http://schemas.openxmlformats.org/drawingml/2006/picture">
                   <pic:nvPicPr>
-                    <pic:cNvPr id="2028254673" name=""/>
+                    <pic:cNvPr id="74493123" name=""/>
                     <pic:cNvPicPr/>
                   </pic:nvPicPr>
                   <pic:blipFill>
@@ -16549,7 +16575,7 @@
           <w:sz w:val="27"/>
         </w:rPr>
       </w:pPr>
-      <w:bookmarkStart w:id="31" w:name="_Toc240377167"/>
+      <w:bookmarkStart w:id="31" w:name="_Toc240380464"/>
       <w:r>
         <w:rPr>
           <w:rFonts w:ascii="Montserrat" w:hAnsi="Montserrat"/>
@@ -16589,16 +16615,16 @@
           <w:noProof/>
         </w:rPr>
         <w:drawing>
-          <wp:inline distT="0" distB="0" distL="0" distR="0" wp14:anchorId="223C4859" wp14:editId="75DFE9A3">
+          <wp:inline distT="0" distB="0" distL="0" distR="0" wp14:anchorId="4DC69448" wp14:editId="6A504D72">
             <wp:extent cx="5120640" cy="4627581"/>
             <wp:effectExtent l="19050" t="19050" r="22860" b="20955"/>
-            <wp:docPr id="874265753" name="Imagem 25"/>
+            <wp:docPr id="2129032014" name="Imagem 25"/>
             <wp:cNvGraphicFramePr/>
             <a:graphic xmlns:a="http://schemas.openxmlformats.org/drawingml/2006/main">
               <a:graphicData uri="http://schemas.openxmlformats.org/drawingml/2006/picture">
                 <pic:pic xmlns:pic="http://schemas.openxmlformats.org/drawingml/2006/picture">
                   <pic:nvPicPr>
-                    <pic:cNvPr id="874265753" name=""/>
+                    <pic:cNvPr id="2129032014" name=""/>
                     <pic:cNvPicPr/>
                   </pic:nvPicPr>
                   <pic:blipFill>
@@ -16666,16 +16692,16 @@
         </w:rPr>
         <w:lastRenderedPageBreak/>
         <w:drawing>
-          <wp:inline distT="0" distB="0" distL="0" distR="0" wp14:anchorId="2102412D" wp14:editId="767C69A0">
+          <wp:inline distT="0" distB="0" distL="0" distR="0" wp14:anchorId="7B23B25D" wp14:editId="45F24696">
             <wp:extent cx="5120640" cy="4627581"/>
             <wp:effectExtent l="19050" t="19050" r="22860" b="20955"/>
-            <wp:docPr id="250228757" name="Imagem 26"/>
+            <wp:docPr id="339226396" name="Imagem 26"/>
             <wp:cNvGraphicFramePr/>
             <a:graphic xmlns:a="http://schemas.openxmlformats.org/drawingml/2006/main">
               <a:graphicData uri="http://schemas.openxmlformats.org/drawingml/2006/picture">
                 <pic:pic xmlns:pic="http://schemas.openxmlformats.org/drawingml/2006/picture">
                   <pic:nvPicPr>
-                    <pic:cNvPr id="250228757" name=""/>
+                    <pic:cNvPr id="339226396" name=""/>
                     <pic:cNvPicPr/>
                   </pic:nvPicPr>
                   <pic:blipFill>
@@ -16866,7 +16892,7 @@
           <w:sz w:val="27"/>
         </w:rPr>
       </w:pPr>
-      <w:bookmarkStart w:id="32" w:name="_Toc240377168"/>
+      <w:bookmarkStart w:id="32" w:name="_Toc240380465"/>
       <w:r>
         <w:rPr>
           <w:rFonts w:ascii="Montserrat" w:hAnsi="Montserrat"/>
@@ -16906,16 +16932,16 @@
           <w:noProof/>
         </w:rPr>
         <w:drawing>
-          <wp:inline distT="0" distB="0" distL="0" distR="0" wp14:anchorId="26426D6B" wp14:editId="58BCAFA2">
+          <wp:inline distT="0" distB="0" distL="0" distR="0" wp14:anchorId="069DE373" wp14:editId="58F6651E">
             <wp:extent cx="5120640" cy="4000682"/>
             <wp:effectExtent l="19050" t="19050" r="22860" b="19050"/>
-            <wp:docPr id="275195415" name="Imagem 27"/>
+            <wp:docPr id="63825060" name="Imagem 27"/>
             <wp:cNvGraphicFramePr/>
             <a:graphic xmlns:a="http://schemas.openxmlformats.org/drawingml/2006/main">
               <a:graphicData uri="http://schemas.openxmlformats.org/drawingml/2006/picture">
                 <pic:pic xmlns:pic="http://schemas.openxmlformats.org/drawingml/2006/picture">
                   <pic:nvPicPr>
-                    <pic:cNvPr id="275195415" name=""/>
+                    <pic:cNvPr id="63825060" name=""/>
                     <pic:cNvPicPr/>
                   </pic:nvPicPr>
                   <pic:blipFill>
@@ -17439,7 +17465,7 @@
           <w:sz w:val="34"/>
         </w:rPr>
       </w:pPr>
-      <w:bookmarkStart w:id="33" w:name="_Toc240377169"/>
+      <w:bookmarkStart w:id="33" w:name="_Toc240380466"/>
       <w:r>
         <w:rPr>
           <w:rFonts w:ascii="Montserrat" w:hAnsi="Montserrat"/>
@@ -17481,7 +17507,7 @@
           <w:sz w:val="27"/>
         </w:rPr>
       </w:pPr>
-      <w:bookmarkStart w:id="34" w:name="_Toc240377170"/>
+      <w:bookmarkStart w:id="34" w:name="_Toc240380467"/>
       <w:r>
         <w:rPr>
           <w:rFonts w:ascii="Montserrat" w:hAnsi="Montserrat"/>
@@ -17521,16 +17547,16 @@
           <w:noProof/>
         </w:rPr>
         <w:drawing>
-          <wp:inline distT="0" distB="0" distL="0" distR="0" wp14:anchorId="3808D6C4" wp14:editId="7A44561B">
+          <wp:inline distT="0" distB="0" distL="0" distR="0" wp14:anchorId="100542C5" wp14:editId="1B23EA1D">
             <wp:extent cx="5120640" cy="4627581"/>
             <wp:effectExtent l="19050" t="19050" r="22860" b="20955"/>
-            <wp:docPr id="451365298" name="Imagem 28"/>
+            <wp:docPr id="315355636" name="Imagem 28"/>
             <wp:cNvGraphicFramePr/>
             <a:graphic xmlns:a="http://schemas.openxmlformats.org/drawingml/2006/main">
               <a:graphicData uri="http://schemas.openxmlformats.org/drawingml/2006/picture">
                 <pic:pic xmlns:pic="http://schemas.openxmlformats.org/drawingml/2006/picture">
                   <pic:nvPicPr>
-                    <pic:cNvPr id="451365298" name=""/>
+                    <pic:cNvPr id="315355636" name=""/>
                     <pic:cNvPicPr/>
                   </pic:nvPicPr>
                   <pic:blipFill>
@@ -17598,16 +17624,16 @@
         </w:rPr>
         <w:lastRenderedPageBreak/>
         <w:drawing>
-          <wp:inline distT="0" distB="0" distL="0" distR="0" wp14:anchorId="1AFDE8DC" wp14:editId="26EB05F6">
+          <wp:inline distT="0" distB="0" distL="0" distR="0" wp14:anchorId="1B0D36F1" wp14:editId="07391153">
             <wp:extent cx="5120640" cy="4627581"/>
             <wp:effectExtent l="19050" t="19050" r="22860" b="20955"/>
-            <wp:docPr id="1697499963" name="Imagem 29"/>
+            <wp:docPr id="967361927" name="Imagem 29"/>
             <wp:cNvGraphicFramePr/>
             <a:graphic xmlns:a="http://schemas.openxmlformats.org/drawingml/2006/main">
               <a:graphicData uri="http://schemas.openxmlformats.org/drawingml/2006/picture">
                 <pic:pic xmlns:pic="http://schemas.openxmlformats.org/drawingml/2006/picture">
                   <pic:nvPicPr>
-                    <pic:cNvPr id="1697499963" name=""/>
+                    <pic:cNvPr id="967361927" name=""/>
                     <pic:cNvPicPr/>
                   </pic:nvPicPr>
                   <pic:blipFill>
@@ -17675,16 +17701,16 @@
         </w:rPr>
         <w:lastRenderedPageBreak/>
         <w:drawing>
-          <wp:inline distT="0" distB="0" distL="0" distR="0" wp14:anchorId="04DD531D" wp14:editId="021DD386">
+          <wp:inline distT="0" distB="0" distL="0" distR="0" wp14:anchorId="65F3FC13" wp14:editId="5B536239">
             <wp:extent cx="5120640" cy="4627581"/>
             <wp:effectExtent l="19050" t="19050" r="22860" b="20955"/>
-            <wp:docPr id="1069038009" name="Imagem 30"/>
+            <wp:docPr id="461695157" name="Imagem 30"/>
             <wp:cNvGraphicFramePr/>
             <a:graphic xmlns:a="http://schemas.openxmlformats.org/drawingml/2006/main">
               <a:graphicData uri="http://schemas.openxmlformats.org/drawingml/2006/picture">
                 <pic:pic xmlns:pic="http://schemas.openxmlformats.org/drawingml/2006/picture">
                   <pic:nvPicPr>
-                    <pic:cNvPr id="1069038009" name=""/>
+                    <pic:cNvPr id="461695157" name=""/>
                     <pic:cNvPicPr/>
                   </pic:nvPicPr>
                   <pic:blipFill>
@@ -17886,16 +17912,16 @@
           <w:noProof/>
         </w:rPr>
         <w:drawing>
-          <wp:inline distT="0" distB="0" distL="0" distR="0" wp14:anchorId="494D4A65" wp14:editId="0D443B7E">
+          <wp:inline distT="0" distB="0" distL="0" distR="0" wp14:anchorId="1382332F" wp14:editId="2A3E9947">
             <wp:extent cx="5120640" cy="1715571"/>
             <wp:effectExtent l="19050" t="19050" r="22860" b="18415"/>
-            <wp:docPr id="1294278156" name="Imagem 31"/>
+            <wp:docPr id="935678755" name="Imagem 31"/>
             <wp:cNvGraphicFramePr/>
             <a:graphic xmlns:a="http://schemas.openxmlformats.org/drawingml/2006/main">
               <a:graphicData uri="http://schemas.openxmlformats.org/drawingml/2006/picture">
                 <pic:pic xmlns:pic="http://schemas.openxmlformats.org/drawingml/2006/picture">
                   <pic:nvPicPr>
-                    <pic:cNvPr id="1294278156" name=""/>
+                    <pic:cNvPr id="935678755" name=""/>
                     <pic:cNvPicPr/>
                   </pic:nvPicPr>
                   <pic:blipFill>
@@ -18032,16 +18058,16 @@
           <w:noProof/>
         </w:rPr>
         <w:drawing>
-          <wp:inline distT="0" distB="0" distL="0" distR="0" wp14:anchorId="70F4CA42" wp14:editId="1CF71869">
+          <wp:inline distT="0" distB="0" distL="0" distR="0" wp14:anchorId="1B963119" wp14:editId="56A3AEB8">
             <wp:extent cx="5120640" cy="3282818"/>
             <wp:effectExtent l="19050" t="19050" r="22860" b="13335"/>
-            <wp:docPr id="515687789" name="Imagem 32"/>
+            <wp:docPr id="73316443" name="Imagem 32"/>
             <wp:cNvGraphicFramePr/>
             <a:graphic xmlns:a="http://schemas.openxmlformats.org/drawingml/2006/main">
               <a:graphicData uri="http://schemas.openxmlformats.org/drawingml/2006/picture">
                 <pic:pic xmlns:pic="http://schemas.openxmlformats.org/drawingml/2006/picture">
                   <pic:nvPicPr>
-                    <pic:cNvPr id="515687789" name=""/>
+                    <pic:cNvPr id="73316443" name=""/>
                     <pic:cNvPicPr/>
                   </pic:nvPicPr>
                   <pic:blipFill>
@@ -18175,16 +18201,16 @@
           <w:noProof/>
         </w:rPr>
         <w:drawing>
-          <wp:inline distT="0" distB="0" distL="0" distR="0" wp14:anchorId="1812E345" wp14:editId="29D8363D">
+          <wp:inline distT="0" distB="0" distL="0" distR="0" wp14:anchorId="1B0A397F" wp14:editId="3B909629">
             <wp:extent cx="5120640" cy="951357"/>
             <wp:effectExtent l="19050" t="19050" r="22860" b="20320"/>
-            <wp:docPr id="1567450208" name="Imagem 33"/>
+            <wp:docPr id="1412880203" name="Imagem 33"/>
             <wp:cNvGraphicFramePr/>
             <a:graphic xmlns:a="http://schemas.openxmlformats.org/drawingml/2006/main">
               <a:graphicData uri="http://schemas.openxmlformats.org/drawingml/2006/picture">
                 <pic:pic xmlns:pic="http://schemas.openxmlformats.org/drawingml/2006/picture">
                   <pic:nvPicPr>
-                    <pic:cNvPr id="1567450208" name=""/>
+                    <pic:cNvPr id="1412880203" name=""/>
                     <pic:cNvPicPr/>
                   </pic:nvPicPr>
                   <pic:blipFill>
@@ -18296,16 +18322,16 @@
           <w:noProof/>
         </w:rPr>
         <w:drawing>
-          <wp:inline distT="0" distB="0" distL="0" distR="0" wp14:anchorId="0A797278" wp14:editId="7A54E2C5">
+          <wp:inline distT="0" distB="0" distL="0" distR="0" wp14:anchorId="693EB1F4" wp14:editId="073CC6C3">
             <wp:extent cx="5120640" cy="1515102"/>
             <wp:effectExtent l="19050" t="19050" r="22860" b="28575"/>
-            <wp:docPr id="952093009" name="Imagem 34"/>
+            <wp:docPr id="1189495919" name="Imagem 34"/>
             <wp:cNvGraphicFramePr/>
             <a:graphic xmlns:a="http://schemas.openxmlformats.org/drawingml/2006/main">
               <a:graphicData uri="http://schemas.openxmlformats.org/drawingml/2006/picture">
                 <pic:pic xmlns:pic="http://schemas.openxmlformats.org/drawingml/2006/picture">
                   <pic:nvPicPr>
-                    <pic:cNvPr id="952093009" name=""/>
+                    <pic:cNvPr id="1189495919" name=""/>
                     <pic:cNvPicPr/>
                   </pic:nvPicPr>
                   <pic:blipFill>
@@ -18418,16 +18444,16 @@
           <w:noProof/>
         </w:rPr>
         <w:drawing>
-          <wp:inline distT="0" distB="0" distL="0" distR="0" wp14:anchorId="231034A4" wp14:editId="52376D1B">
+          <wp:inline distT="0" distB="0" distL="0" distR="0" wp14:anchorId="7D1AF55F" wp14:editId="7FCB041A">
             <wp:extent cx="5120640" cy="1391113"/>
             <wp:effectExtent l="19050" t="19050" r="22860" b="19050"/>
-            <wp:docPr id="1688320902" name="Imagem 35"/>
+            <wp:docPr id="2070293654" name="Imagem 35"/>
             <wp:cNvGraphicFramePr/>
             <a:graphic xmlns:a="http://schemas.openxmlformats.org/drawingml/2006/main">
               <a:graphicData uri="http://schemas.openxmlformats.org/drawingml/2006/picture">
                 <pic:pic xmlns:pic="http://schemas.openxmlformats.org/drawingml/2006/picture">
                   <pic:nvPicPr>
-                    <pic:cNvPr id="1688320902" name=""/>
+                    <pic:cNvPr id="2070293654" name=""/>
                     <pic:cNvPicPr/>
                   </pic:nvPicPr>
                   <pic:blipFill>
@@ -18539,16 +18565,16 @@
           <w:noProof/>
         </w:rPr>
         <w:drawing>
-          <wp:inline distT="0" distB="0" distL="0" distR="0" wp14:anchorId="4E54F59C" wp14:editId="064DF26B">
+          <wp:inline distT="0" distB="0" distL="0" distR="0" wp14:anchorId="76483244" wp14:editId="77CAA78B">
             <wp:extent cx="5120640" cy="1125174"/>
             <wp:effectExtent l="19050" t="19050" r="22860" b="18415"/>
-            <wp:docPr id="1546664023" name="Imagem 36"/>
+            <wp:docPr id="2025746683" name="Imagem 36"/>
             <wp:cNvGraphicFramePr/>
             <a:graphic xmlns:a="http://schemas.openxmlformats.org/drawingml/2006/main">
               <a:graphicData uri="http://schemas.openxmlformats.org/drawingml/2006/picture">
                 <pic:pic xmlns:pic="http://schemas.openxmlformats.org/drawingml/2006/picture">
                   <pic:nvPicPr>
-                    <pic:cNvPr id="1546664023" name=""/>
+                    <pic:cNvPr id="2025746683" name=""/>
                     <pic:cNvPicPr/>
                   </pic:nvPicPr>
                   <pic:blipFill>
@@ -18638,7 +18664,7 @@
           <w:sz w:val="27"/>
         </w:rPr>
       </w:pPr>
-      <w:bookmarkStart w:id="35" w:name="_Toc240377171"/>
+      <w:bookmarkStart w:id="35" w:name="_Toc240380468"/>
       <w:r>
         <w:rPr>
           <w:rFonts w:ascii="Montserrat" w:hAnsi="Montserrat"/>
@@ -18678,16 +18704,16 @@
           <w:noProof/>
         </w:rPr>
         <w:drawing>
-          <wp:inline distT="0" distB="0" distL="0" distR="0" wp14:anchorId="629DD23E" wp14:editId="781078F7">
+          <wp:inline distT="0" distB="0" distL="0" distR="0" wp14:anchorId="61EE00AA" wp14:editId="585B8436">
             <wp:extent cx="5120640" cy="4627581"/>
             <wp:effectExtent l="19050" t="19050" r="22860" b="20955"/>
-            <wp:docPr id="807922965" name="Imagem 37"/>
+            <wp:docPr id="1563376353" name="Imagem 37"/>
             <wp:cNvGraphicFramePr/>
             <a:graphic xmlns:a="http://schemas.openxmlformats.org/drawingml/2006/main">
               <a:graphicData uri="http://schemas.openxmlformats.org/drawingml/2006/picture">
                 <pic:pic xmlns:pic="http://schemas.openxmlformats.org/drawingml/2006/picture">
                   <pic:nvPicPr>
-                    <pic:cNvPr id="807922965" name=""/>
+                    <pic:cNvPr id="1563376353" name=""/>
                     <pic:cNvPicPr/>
                   </pic:nvPicPr>
                   <pic:blipFill>
@@ -18755,16 +18781,16 @@
         </w:rPr>
         <w:lastRenderedPageBreak/>
         <w:drawing>
-          <wp:inline distT="0" distB="0" distL="0" distR="0" wp14:anchorId="1971ABA2" wp14:editId="7FD59293">
+          <wp:inline distT="0" distB="0" distL="0" distR="0" wp14:anchorId="2134F39C" wp14:editId="31749C93">
             <wp:extent cx="5120640" cy="4627581"/>
             <wp:effectExtent l="19050" t="19050" r="22860" b="20955"/>
-            <wp:docPr id="556238139" name="Imagem 38"/>
+            <wp:docPr id="667730684" name="Imagem 38"/>
             <wp:cNvGraphicFramePr/>
             <a:graphic xmlns:a="http://schemas.openxmlformats.org/drawingml/2006/main">
               <a:graphicData uri="http://schemas.openxmlformats.org/drawingml/2006/picture">
                 <pic:pic xmlns:pic="http://schemas.openxmlformats.org/drawingml/2006/picture">
                   <pic:nvPicPr>
-                    <pic:cNvPr id="556238139" name=""/>
+                    <pic:cNvPr id="667730684" name=""/>
                     <pic:cNvPicPr/>
                   </pic:nvPicPr>
                   <pic:blipFill>
@@ -18933,16 +18959,16 @@
           <w:noProof/>
         </w:rPr>
         <w:drawing>
-          <wp:inline distT="0" distB="0" distL="0" distR="0" wp14:anchorId="6577519D" wp14:editId="05A37797">
+          <wp:inline distT="0" distB="0" distL="0" distR="0" wp14:anchorId="3135B7A5" wp14:editId="6190EF98">
             <wp:extent cx="5120640" cy="2144319"/>
             <wp:effectExtent l="19050" t="19050" r="22860" b="27940"/>
-            <wp:docPr id="84206799" name="Imagem 39"/>
+            <wp:docPr id="921195969" name="Imagem 39"/>
             <wp:cNvGraphicFramePr/>
             <a:graphic xmlns:a="http://schemas.openxmlformats.org/drawingml/2006/main">
               <a:graphicData uri="http://schemas.openxmlformats.org/drawingml/2006/picture">
                 <pic:pic xmlns:pic="http://schemas.openxmlformats.org/drawingml/2006/picture">
                   <pic:nvPicPr>
-                    <pic:cNvPr id="84206799" name=""/>
+                    <pic:cNvPr id="921195969" name=""/>
                     <pic:cNvPicPr/>
                   </pic:nvPicPr>
                   <pic:blipFill>
@@ -19030,16 +19056,16 @@
           <w:noProof/>
         </w:rPr>
         <w:drawing>
-          <wp:inline distT="0" distB="0" distL="0" distR="0" wp14:anchorId="1B455512" wp14:editId="572C97BE">
+          <wp:inline distT="0" distB="0" distL="0" distR="0" wp14:anchorId="2A6F8780" wp14:editId="4C9FC5B3">
             <wp:extent cx="5120640" cy="1055647"/>
             <wp:effectExtent l="19050" t="19050" r="22860" b="11430"/>
-            <wp:docPr id="1858196608" name="Imagem 40"/>
+            <wp:docPr id="164032817" name="Imagem 40"/>
             <wp:cNvGraphicFramePr/>
             <a:graphic xmlns:a="http://schemas.openxmlformats.org/drawingml/2006/main">
               <a:graphicData uri="http://schemas.openxmlformats.org/drawingml/2006/picture">
                 <pic:pic xmlns:pic="http://schemas.openxmlformats.org/drawingml/2006/picture">
                   <pic:nvPicPr>
-                    <pic:cNvPr id="1858196608" name=""/>
+                    <pic:cNvPr id="164032817" name=""/>
                     <pic:cNvPicPr/>
                   </pic:nvPicPr>
                   <pic:blipFill>
@@ -19161,16 +19187,16 @@
           <w:noProof/>
         </w:rPr>
         <w:drawing>
-          <wp:inline distT="0" distB="0" distL="0" distR="0" wp14:anchorId="6795960A" wp14:editId="78C5BEB9">
+          <wp:inline distT="0" distB="0" distL="0" distR="0" wp14:anchorId="2A6F5A31" wp14:editId="7A5BDF15">
             <wp:extent cx="5120640" cy="3282818"/>
             <wp:effectExtent l="19050" t="19050" r="22860" b="13335"/>
-            <wp:docPr id="1456078425" name="Imagem 41"/>
+            <wp:docPr id="1974939294" name="Imagem 41"/>
             <wp:cNvGraphicFramePr/>
             <a:graphic xmlns:a="http://schemas.openxmlformats.org/drawingml/2006/main">
               <a:graphicData uri="http://schemas.openxmlformats.org/drawingml/2006/picture">
                 <pic:pic xmlns:pic="http://schemas.openxmlformats.org/drawingml/2006/picture">
                   <pic:nvPicPr>
-                    <pic:cNvPr id="1456078425" name=""/>
+                    <pic:cNvPr id="1974939294" name=""/>
                     <pic:cNvPicPr/>
                   </pic:nvPicPr>
                   <pic:blipFill>
@@ -19304,16 +19330,16 @@
         </w:rPr>
         <w:lastRenderedPageBreak/>
         <w:drawing>
-          <wp:inline distT="0" distB="0" distL="0" distR="0" wp14:anchorId="12E4C827" wp14:editId="02AA56C7">
+          <wp:inline distT="0" distB="0" distL="0" distR="0" wp14:anchorId="534D1121" wp14:editId="2A20F800">
             <wp:extent cx="5120640" cy="1978034"/>
             <wp:effectExtent l="19050" t="19050" r="22860" b="22225"/>
-            <wp:docPr id="1549285190" name="Imagem 42"/>
+            <wp:docPr id="1786304607" name="Imagem 42"/>
             <wp:cNvGraphicFramePr/>
             <a:graphic xmlns:a="http://schemas.openxmlformats.org/drawingml/2006/main">
               <a:graphicData uri="http://schemas.openxmlformats.org/drawingml/2006/picture">
                 <pic:pic xmlns:pic="http://schemas.openxmlformats.org/drawingml/2006/picture">
                   <pic:nvPicPr>
-                    <pic:cNvPr id="1549285190" name=""/>
+                    <pic:cNvPr id="1786304607" name=""/>
                     <pic:cNvPicPr/>
                   </pic:nvPicPr>
                   <pic:blipFill>
@@ -19385,7 +19411,7 @@
           <w:sz w:val="34"/>
         </w:rPr>
       </w:pPr>
-      <w:bookmarkStart w:id="36" w:name="_Toc240377172"/>
+      <w:bookmarkStart w:id="36" w:name="_Toc240380469"/>
       <w:r>
         <w:rPr>
           <w:rFonts w:ascii="Montserrat" w:hAnsi="Montserrat"/>
@@ -19445,7 +19471,7 @@
           <w:sz w:val="27"/>
         </w:rPr>
       </w:pPr>
-      <w:bookmarkStart w:id="37" w:name="_Toc240377173"/>
+      <w:bookmarkStart w:id="37" w:name="_Toc240380470"/>
       <w:r>
         <w:rPr>
           <w:rFonts w:ascii="Montserrat" w:hAnsi="Montserrat"/>
@@ -19485,16 +19511,16 @@
           <w:noProof/>
         </w:rPr>
         <w:drawing>
-          <wp:inline distT="0" distB="0" distL="0" distR="0" wp14:anchorId="26578842" wp14:editId="6CA08D9C">
+          <wp:inline distT="0" distB="0" distL="0" distR="0" wp14:anchorId="3ACFBE61" wp14:editId="08315B73">
             <wp:extent cx="5303520" cy="4792851"/>
             <wp:effectExtent l="19050" t="19050" r="11430" b="27305"/>
-            <wp:docPr id="536832231" name="Imagem 43"/>
+            <wp:docPr id="1696660740" name="Imagem 43"/>
             <wp:cNvGraphicFramePr/>
             <a:graphic xmlns:a="http://schemas.openxmlformats.org/drawingml/2006/main">
               <a:graphicData uri="http://schemas.openxmlformats.org/drawingml/2006/picture">
                 <pic:pic xmlns:pic="http://schemas.openxmlformats.org/drawingml/2006/picture">
                   <pic:nvPicPr>
-                    <pic:cNvPr id="536832231" name=""/>
+                    <pic:cNvPr id="1696660740" name=""/>
                     <pic:cNvPicPr/>
                   </pic:nvPicPr>
                   <pic:blipFill>
@@ -19563,7 +19589,7 @@
           <w:sz w:val="27"/>
         </w:rPr>
       </w:pPr>
-      <w:bookmarkStart w:id="38" w:name="_Toc240377174"/>
+      <w:bookmarkStart w:id="38" w:name="_Toc240380471"/>
       <w:r>
         <w:rPr>
           <w:rFonts w:ascii="Montserrat" w:hAnsi="Montserrat"/>
@@ -19603,16 +19629,16 @@
           <w:noProof/>
         </w:rPr>
         <w:drawing>
-          <wp:inline distT="0" distB="0" distL="0" distR="0" wp14:anchorId="307739F6" wp14:editId="1F177163">
+          <wp:inline distT="0" distB="0" distL="0" distR="0" wp14:anchorId="7E678724" wp14:editId="09E9C49F">
             <wp:extent cx="5303520" cy="4792851"/>
             <wp:effectExtent l="19050" t="19050" r="11430" b="27305"/>
-            <wp:docPr id="1654501164" name="Imagem 44"/>
+            <wp:docPr id="805658408" name="Imagem 44"/>
             <wp:cNvGraphicFramePr/>
             <a:graphic xmlns:a="http://schemas.openxmlformats.org/drawingml/2006/main">
               <a:graphicData uri="http://schemas.openxmlformats.org/drawingml/2006/picture">
                 <pic:pic xmlns:pic="http://schemas.openxmlformats.org/drawingml/2006/picture">
                   <pic:nvPicPr>
-                    <pic:cNvPr id="1654501164" name=""/>
+                    <pic:cNvPr id="805658408" name=""/>
                     <pic:cNvPicPr/>
                   </pic:nvPicPr>
                   <pic:blipFill>
@@ -19680,7 +19706,7 @@
           <w:sz w:val="27"/>
         </w:rPr>
       </w:pPr>
-      <w:bookmarkStart w:id="39" w:name="_Toc240377175"/>
+      <w:bookmarkStart w:id="39" w:name="_Toc240380472"/>
       <w:r>
         <w:rPr>
           <w:rFonts w:ascii="Montserrat" w:hAnsi="Montserrat"/>
@@ -19721,16 +19747,16 @@
         </w:rPr>
         <w:lastRenderedPageBreak/>
         <w:drawing>
-          <wp:inline distT="0" distB="0" distL="0" distR="0" wp14:anchorId="33140F88" wp14:editId="4DC383B6">
+          <wp:inline distT="0" distB="0" distL="0" distR="0" wp14:anchorId="35ACBFF0" wp14:editId="587F6A33">
             <wp:extent cx="5303520" cy="4792851"/>
             <wp:effectExtent l="19050" t="19050" r="11430" b="27305"/>
-            <wp:docPr id="668541330" name="Imagem 45"/>
+            <wp:docPr id="1904369266" name="Imagem 45"/>
             <wp:cNvGraphicFramePr/>
             <a:graphic xmlns:a="http://schemas.openxmlformats.org/drawingml/2006/main">
               <a:graphicData uri="http://schemas.openxmlformats.org/drawingml/2006/picture">
                 <pic:pic xmlns:pic="http://schemas.openxmlformats.org/drawingml/2006/picture">
                   <pic:nvPicPr>
-                    <pic:cNvPr id="668541330" name=""/>
+                    <pic:cNvPr id="1904369266" name=""/>
                     <pic:cNvPicPr/>
                   </pic:nvPicPr>
                   <pic:blipFill>
@@ -19798,16 +19824,16 @@
         </w:rPr>
         <w:lastRenderedPageBreak/>
         <w:drawing>
-          <wp:inline distT="0" distB="0" distL="0" distR="0" wp14:anchorId="6F7D9F81" wp14:editId="297943C3">
+          <wp:inline distT="0" distB="0" distL="0" distR="0" wp14:anchorId="7C4727AD" wp14:editId="22DC77F3">
             <wp:extent cx="5303520" cy="4792851"/>
             <wp:effectExtent l="19050" t="19050" r="11430" b="27305"/>
-            <wp:docPr id="1512177549" name="Imagem 46"/>
+            <wp:docPr id="1670834204" name="Imagem 46"/>
             <wp:cNvGraphicFramePr/>
             <a:graphic xmlns:a="http://schemas.openxmlformats.org/drawingml/2006/main">
               <a:graphicData uri="http://schemas.openxmlformats.org/drawingml/2006/picture">
                 <pic:pic xmlns:pic="http://schemas.openxmlformats.org/drawingml/2006/picture">
                   <pic:nvPicPr>
-                    <pic:cNvPr id="1512177549" name=""/>
+                    <pic:cNvPr id="1670834204" name=""/>
                     <pic:cNvPicPr/>
                   </pic:nvPicPr>
                   <pic:blipFill>
@@ -19900,7 +19926,7 @@
           <w:sz w:val="34"/>
         </w:rPr>
       </w:pPr>
-      <w:bookmarkStart w:id="40" w:name="_Toc240377176"/>
+      <w:bookmarkStart w:id="40" w:name="_Toc240380473"/>
       <w:r>
         <w:rPr>
           <w:rFonts w:ascii="Montserrat" w:hAnsi="Montserrat"/>
@@ -19942,7 +19968,7 @@
           <w:sz w:val="27"/>
         </w:rPr>
       </w:pPr>
-      <w:bookmarkStart w:id="41" w:name="_Toc240377177"/>
+      <w:bookmarkStart w:id="41" w:name="_Toc240380474"/>
       <w:r>
         <w:rPr>
           <w:rFonts w:ascii="Montserrat" w:hAnsi="Montserrat"/>
@@ -19982,16 +20008,16 @@
           <w:noProof/>
         </w:rPr>
         <w:drawing>
-          <wp:inline distT="0" distB="0" distL="0" distR="0" wp14:anchorId="3B55008A" wp14:editId="7B63176F">
+          <wp:inline distT="0" distB="0" distL="0" distR="0" wp14:anchorId="48D1B60E" wp14:editId="621C248B">
             <wp:extent cx="5303520" cy="4792851"/>
             <wp:effectExtent l="19050" t="19050" r="11430" b="27305"/>
-            <wp:docPr id="1338350077" name="Imagem 47"/>
+            <wp:docPr id="1905296836" name="Imagem 47"/>
             <wp:cNvGraphicFramePr/>
             <a:graphic xmlns:a="http://schemas.openxmlformats.org/drawingml/2006/main">
               <a:graphicData uri="http://schemas.openxmlformats.org/drawingml/2006/picture">
                 <pic:pic xmlns:pic="http://schemas.openxmlformats.org/drawingml/2006/picture">
                   <pic:nvPicPr>
-                    <pic:cNvPr id="1338350077" name=""/>
+                    <pic:cNvPr id="1905296836" name=""/>
                     <pic:cNvPicPr/>
                   </pic:nvPicPr>
                   <pic:blipFill>
@@ -20246,7 +20272,7 @@
           <w:sz w:val="27"/>
         </w:rPr>
       </w:pPr>
-      <w:bookmarkStart w:id="42" w:name="_Toc240377178"/>
+      <w:bookmarkStart w:id="42" w:name="_Toc240380475"/>
       <w:r>
         <w:rPr>
           <w:rFonts w:ascii="Montserrat" w:hAnsi="Montserrat"/>
@@ -20287,16 +20313,16 @@
         </w:rPr>
         <w:lastRenderedPageBreak/>
         <w:drawing>
-          <wp:inline distT="0" distB="0" distL="0" distR="0" wp14:anchorId="3B015013" wp14:editId="3FFEFEDD">
+          <wp:inline distT="0" distB="0" distL="0" distR="0" wp14:anchorId="1C9D7386" wp14:editId="77FD3C2D">
             <wp:extent cx="5303520" cy="4792851"/>
             <wp:effectExtent l="19050" t="19050" r="11430" b="27305"/>
-            <wp:docPr id="385564444" name="Imagem 48"/>
+            <wp:docPr id="673443617" name="Imagem 48"/>
             <wp:cNvGraphicFramePr/>
             <a:graphic xmlns:a="http://schemas.openxmlformats.org/drawingml/2006/main">
               <a:graphicData uri="http://schemas.openxmlformats.org/drawingml/2006/picture">
                 <pic:pic xmlns:pic="http://schemas.openxmlformats.org/drawingml/2006/picture">
                   <pic:nvPicPr>
-                    <pic:cNvPr id="385564444" name=""/>
+                    <pic:cNvPr id="673443617" name=""/>
                     <pic:cNvPicPr/>
                   </pic:nvPicPr>
                   <pic:blipFill>
@@ -20385,7 +20411,7 @@
           <w:sz w:val="27"/>
         </w:rPr>
       </w:pPr>
-      <w:bookmarkStart w:id="43" w:name="_Toc240377179"/>
+      <w:bookmarkStart w:id="43" w:name="_Toc240380476"/>
       <w:r>
         <w:rPr>
           <w:rFonts w:ascii="Montserrat" w:hAnsi="Montserrat"/>
@@ -20426,16 +20452,16 @@
         </w:rPr>
         <w:lastRenderedPageBreak/>
         <w:drawing>
-          <wp:inline distT="0" distB="0" distL="0" distR="0" wp14:anchorId="2BDA2A2D" wp14:editId="1CCF8C85">
+          <wp:inline distT="0" distB="0" distL="0" distR="0" wp14:anchorId="45979D6B" wp14:editId="7893EF9F">
             <wp:extent cx="5303520" cy="4792851"/>
             <wp:effectExtent l="19050" t="19050" r="11430" b="27305"/>
-            <wp:docPr id="1003288522" name="Imagem 49"/>
+            <wp:docPr id="970897584" name="Imagem 49"/>
             <wp:cNvGraphicFramePr/>
             <a:graphic xmlns:a="http://schemas.openxmlformats.org/drawingml/2006/main">
               <a:graphicData uri="http://schemas.openxmlformats.org/drawingml/2006/picture">
                 <pic:pic xmlns:pic="http://schemas.openxmlformats.org/drawingml/2006/picture">
                   <pic:nvPicPr>
-                    <pic:cNvPr id="1003288522" name=""/>
+                    <pic:cNvPr id="970897584" name=""/>
                     <pic:cNvPicPr/>
                   </pic:nvPicPr>
                   <pic:blipFill>
@@ -20579,7 +20605,7 @@
           <w:sz w:val="27"/>
         </w:rPr>
       </w:pPr>
-      <w:bookmarkStart w:id="44" w:name="_Toc240377180"/>
+      <w:bookmarkStart w:id="44" w:name="_Toc240380477"/>
       <w:r>
         <w:rPr>
           <w:rFonts w:ascii="Montserrat" w:hAnsi="Montserrat"/>
@@ -20844,16 +20870,16 @@
           <w:noProof/>
         </w:rPr>
         <w:drawing>
-          <wp:inline distT="0" distB="0" distL="0" distR="0" wp14:anchorId="07589760" wp14:editId="650E3BEF">
+          <wp:inline distT="0" distB="0" distL="0" distR="0" wp14:anchorId="69BCFC5E" wp14:editId="4C7B42B6">
             <wp:extent cx="5303520" cy="4267180"/>
             <wp:effectExtent l="19050" t="19050" r="11430" b="19685"/>
-            <wp:docPr id="1660322688" name="Imagem 50"/>
+            <wp:docPr id="207771003" name="Imagem 50"/>
             <wp:cNvGraphicFramePr/>
             <a:graphic xmlns:a="http://schemas.openxmlformats.org/drawingml/2006/main">
               <a:graphicData uri="http://schemas.openxmlformats.org/drawingml/2006/picture">
                 <pic:pic xmlns:pic="http://schemas.openxmlformats.org/drawingml/2006/picture">
                   <pic:nvPicPr>
-                    <pic:cNvPr id="1660322688" name=""/>
+                    <pic:cNvPr id="207771003" name=""/>
                     <pic:cNvPicPr/>
                   </pic:nvPicPr>
                   <pic:blipFill>
@@ -20921,16 +20947,16 @@
           <w:noProof/>
         </w:rPr>
         <w:drawing>
-          <wp:inline distT="0" distB="0" distL="0" distR="0" wp14:anchorId="36DF6F6C" wp14:editId="7B6769A9">
+          <wp:inline distT="0" distB="0" distL="0" distR="0" wp14:anchorId="36E864A0" wp14:editId="48C36E12">
             <wp:extent cx="5303520" cy="3382059"/>
             <wp:effectExtent l="19050" t="19050" r="11430" b="27940"/>
-            <wp:docPr id="1534561889" name="Imagem 51"/>
+            <wp:docPr id="2055609732" name="Imagem 51"/>
             <wp:cNvGraphicFramePr/>
             <a:graphic xmlns:a="http://schemas.openxmlformats.org/drawingml/2006/main">
               <a:graphicData uri="http://schemas.openxmlformats.org/drawingml/2006/picture">
                 <pic:pic xmlns:pic="http://schemas.openxmlformats.org/drawingml/2006/picture">
                   <pic:nvPicPr>
-                    <pic:cNvPr id="1534561889" name=""/>
+                    <pic:cNvPr id="2055609732" name=""/>
                     <pic:cNvPicPr/>
                   </pic:nvPicPr>
                   <pic:blipFill>
@@ -20998,16 +21024,16 @@
         </w:rPr>
         <w:lastRenderedPageBreak/>
         <w:drawing>
-          <wp:inline distT="0" distB="0" distL="0" distR="0" wp14:anchorId="3FF256BE" wp14:editId="0F92203F">
+          <wp:inline distT="0" distB="0" distL="0" distR="0" wp14:anchorId="10C5DB85" wp14:editId="77734B7D">
             <wp:extent cx="5303520" cy="4417800"/>
             <wp:effectExtent l="19050" t="19050" r="11430" b="20955"/>
-            <wp:docPr id="320140157" name="Imagem 52"/>
+            <wp:docPr id="1314371141" name="Imagem 52"/>
             <wp:cNvGraphicFramePr/>
             <a:graphic xmlns:a="http://schemas.openxmlformats.org/drawingml/2006/main">
               <a:graphicData uri="http://schemas.openxmlformats.org/drawingml/2006/picture">
                 <pic:pic xmlns:pic="http://schemas.openxmlformats.org/drawingml/2006/picture">
                   <pic:nvPicPr>
-                    <pic:cNvPr id="320140157" name=""/>
+                    <pic:cNvPr id="1314371141" name=""/>
                     <pic:cNvPicPr/>
                   </pic:nvPicPr>
                   <pic:blipFill>
@@ -21117,7 +21143,7 @@
           <w:sz w:val="27"/>
         </w:rPr>
       </w:pPr>
-      <w:bookmarkStart w:id="45" w:name="_Toc240377181"/>
+      <w:bookmarkStart w:id="45" w:name="_Toc240380478"/>
       <w:r>
         <w:rPr>
           <w:rFonts w:ascii="Montserrat" w:hAnsi="Montserrat"/>
@@ -21383,16 +21409,16 @@
         </w:rPr>
         <w:lastRenderedPageBreak/>
         <w:drawing>
-          <wp:inline distT="0" distB="0" distL="0" distR="0" wp14:anchorId="53B2B05B" wp14:editId="7DE79E09">
+          <wp:inline distT="0" distB="0" distL="0" distR="0" wp14:anchorId="029D2B47" wp14:editId="7D7D7D81">
             <wp:extent cx="5303520" cy="7628836"/>
             <wp:effectExtent l="19050" t="19050" r="11430" b="10795"/>
-            <wp:docPr id="529175908" name="Imagem 53"/>
+            <wp:docPr id="376275092" name="Imagem 53"/>
             <wp:cNvGraphicFramePr/>
             <a:graphic xmlns:a="http://schemas.openxmlformats.org/drawingml/2006/main">
               <a:graphicData uri="http://schemas.openxmlformats.org/drawingml/2006/picture">
                 <pic:pic xmlns:pic="http://schemas.openxmlformats.org/drawingml/2006/picture">
                   <pic:nvPicPr>
-                    <pic:cNvPr id="529175908" name=""/>
+                    <pic:cNvPr id="376275092" name=""/>
                     <pic:cNvPicPr/>
                   </pic:nvPicPr>
                   <pic:blipFill>
@@ -21524,7 +21550,7 @@
           <w:sz w:val="27"/>
         </w:rPr>
       </w:pPr>
-      <w:bookmarkStart w:id="46" w:name="_Toc240377182"/>
+      <w:bookmarkStart w:id="46" w:name="_Toc240380479"/>
       <w:r>
         <w:rPr>
           <w:rFonts w:ascii="Montserrat" w:hAnsi="Montserrat"/>
@@ -21635,7 +21661,7 @@
           <w:sz w:val="27"/>
         </w:rPr>
       </w:pPr>
-      <w:bookmarkStart w:id="47" w:name="_Toc240377183"/>
+      <w:bookmarkStart w:id="47" w:name="_Toc240380480"/>
       <w:r>
         <w:rPr>
           <w:rFonts w:ascii="Montserrat" w:hAnsi="Montserrat"/>
@@ -21842,7 +21868,7 @@
           <w:color w:val="1A1A1A"/>
           <w:sz w:val="22"/>
         </w:rPr>
-        <w:t>O e-mail inclui um link direto para a Ficha do Projeto (secao 6.4.1) daquele projeto, para abrir a saude do projeto e o cronograma completo sem precisar navegar manualmente.</w:t>
+        <w:t>O e-mail termina indicando a Gerencia de Projetos como alternativa de contato, caso a pessoa prefira ajustar o prazo diretamente em vez de seguir so pelo aviso automatico - o nome do Gerente vem do campo Gerente do projeto do proprio Planejamento (aba 1, capa), nao e fixo; se esse campo estiver vazio no projeto, a frase aparece sem nome.</w:t>
       </w:r>
     </w:p>
     <w:p>
@@ -21856,7 +21882,7 @@
           <w:sz w:val="27"/>
         </w:rPr>
       </w:pPr>
-      <w:bookmarkStart w:id="48" w:name="_Toc240377184"/>
+      <w:bookmarkStart w:id="48" w:name="_Toc240380481"/>
       <w:r>
         <w:rPr>
           <w:rFonts w:ascii="Montserrat" w:hAnsi="Montserrat"/>
@@ -21883,7 +21909,7 @@
           <w:color w:val="1A1A1A"/>
           <w:sz w:val="22"/>
         </w:rPr>
-        <w:t xml:space="preserve">O sistema tem um ambiente de treinamento/demonstracao totalmente separado da producao - mesma ferramenta, mesmo schema de dados, mas um banco proprio, populado com 7 projetos ficticios cobrindo o ciclo completo (de uma Solicitacao de Demanda ainda pendente ate um projeto totalmente </w:t>
+        <w:t xml:space="preserve">O sistema tem um ambiente de treinamento/demonstracao totalmente separado da producao - mesma ferramenta, mesmo schema de dados, mas um banco proprio, populado com 7 projetos ficticios cobrindo o ciclo completo (de </w:t>
       </w:r>
       <w:r>
         <w:rPr>
@@ -21892,7 +21918,7 @@
           <w:sz w:val="22"/>
         </w:rPr>
         <w:lastRenderedPageBreak/>
-        <w:t>encerrado com TEP e RLA). Serve para apresentacoes, estudo e capacitacao sem tocar em nenhum dado real. Veja o roteiro Como rodar o Ambiente de Treinamento para o endereco, as contas de acesso e o passo a passo completo.</w:t>
+        <w:t>uma Solicitacao de Demanda ainda pendente ate um projeto totalmente encerrado com TEP e RLA). Serve para apresentacoes, estudo e capacitacao sem tocar em nenhum dado real. Veja o roteiro Como rodar o Ambiente de Treinamento para o endereco, as contas de acesso e o passo a passo completo.</w:t>
       </w:r>
     </w:p>
     <w:p>
@@ -22017,7 +22043,7 @@
           <w:sz w:val="27"/>
         </w:rPr>
       </w:pPr>
-      <w:bookmarkStart w:id="49" w:name="_Toc240377185"/>
+      <w:bookmarkStart w:id="49" w:name="_Toc240380482"/>
       <w:r>
         <w:rPr>
           <w:rFonts w:ascii="Montserrat" w:hAnsi="Montserrat"/>
@@ -22318,16 +22344,16 @@
           <w:noProof/>
         </w:rPr>
         <w:drawing>
-          <wp:inline distT="0" distB="0" distL="0" distR="0" wp14:anchorId="19A9489F" wp14:editId="38F8EBA1">
+          <wp:inline distT="0" distB="0" distL="0" distR="0" wp14:anchorId="545A96DD" wp14:editId="5403143F">
             <wp:extent cx="5303520" cy="1351384"/>
             <wp:effectExtent l="19050" t="19050" r="11430" b="20320"/>
-            <wp:docPr id="152124951" name="Imagem 54"/>
+            <wp:docPr id="96952946" name="Imagem 54"/>
             <wp:cNvGraphicFramePr/>
             <a:graphic xmlns:a="http://schemas.openxmlformats.org/drawingml/2006/main">
               <a:graphicData uri="http://schemas.openxmlformats.org/drawingml/2006/picture">
                 <pic:pic xmlns:pic="http://schemas.openxmlformats.org/drawingml/2006/picture">
                   <pic:nvPicPr>
-                    <pic:cNvPr id="152124951" name=""/>
+                    <pic:cNvPr id="96952946" name=""/>
                     <pic:cNvPicPr/>
                   </pic:nvPicPr>
                   <pic:blipFill>
@@ -22395,7 +22421,7 @@
           <w:sz w:val="27"/>
         </w:rPr>
       </w:pPr>
-      <w:bookmarkStart w:id="50" w:name="_Toc240377186"/>
+      <w:bookmarkStart w:id="50" w:name="_Toc240380483"/>
       <w:r>
         <w:rPr>
           <w:rFonts w:ascii="Montserrat" w:hAnsi="Montserrat"/>
@@ -22532,16 +22558,16 @@
           <w:noProof/>
         </w:rPr>
         <w:drawing>
-          <wp:inline distT="0" distB="0" distL="0" distR="0" wp14:anchorId="1269F37F" wp14:editId="5E4A767E">
+          <wp:inline distT="0" distB="0" distL="0" distR="0" wp14:anchorId="5AE96467" wp14:editId="7C785BF1">
             <wp:extent cx="5303520" cy="1422793"/>
             <wp:effectExtent l="19050" t="19050" r="11430" b="25400"/>
-            <wp:docPr id="1218822052" name="Imagem 55"/>
+            <wp:docPr id="741149052" name="Imagem 55"/>
             <wp:cNvGraphicFramePr/>
             <a:graphic xmlns:a="http://schemas.openxmlformats.org/drawingml/2006/main">
               <a:graphicData uri="http://schemas.openxmlformats.org/drawingml/2006/picture">
                 <pic:pic xmlns:pic="http://schemas.openxmlformats.org/drawingml/2006/picture">
                   <pic:nvPicPr>
-                    <pic:cNvPr id="1218822052" name=""/>
+                    <pic:cNvPr id="741149052" name=""/>
                     <pic:cNvPicPr/>
                   </pic:nvPicPr>
                   <pic:blipFill>
@@ -22705,16 +22731,16 @@
           <w:noProof/>
         </w:rPr>
         <w:drawing>
-          <wp:inline distT="0" distB="0" distL="0" distR="0" wp14:anchorId="3EFE5B0E" wp14:editId="352A44FD">
+          <wp:inline distT="0" distB="0" distL="0" distR="0" wp14:anchorId="26409316" wp14:editId="545141B1">
             <wp:extent cx="5303520" cy="1841050"/>
             <wp:effectExtent l="19050" t="19050" r="11430" b="26035"/>
-            <wp:docPr id="1095811320" name="Imagem 56"/>
+            <wp:docPr id="572202021" name="Imagem 56"/>
             <wp:cNvGraphicFramePr/>
             <a:graphic xmlns:a="http://schemas.openxmlformats.org/drawingml/2006/main">
               <a:graphicData uri="http://schemas.openxmlformats.org/drawingml/2006/picture">
                 <pic:pic xmlns:pic="http://schemas.openxmlformats.org/drawingml/2006/picture">
                   <pic:nvPicPr>
-                    <pic:cNvPr id="1095811320" name=""/>
+                    <pic:cNvPr id="572202021" name=""/>
                     <pic:cNvPicPr/>
                   </pic:nvPicPr>
                   <pic:blipFill>
@@ -22868,16 +22894,16 @@
           <w:noProof/>
         </w:rPr>
         <w:drawing>
-          <wp:inline distT="0" distB="0" distL="0" distR="0" wp14:anchorId="4D01602F" wp14:editId="176FAA6A">
+          <wp:inline distT="0" distB="0" distL="0" distR="0" wp14:anchorId="1D517339" wp14:editId="571A720D">
             <wp:extent cx="5303520" cy="303041"/>
             <wp:effectExtent l="19050" t="19050" r="11430" b="20955"/>
-            <wp:docPr id="180319416" name="Imagem 57"/>
+            <wp:docPr id="556075123" name="Imagem 57"/>
             <wp:cNvGraphicFramePr/>
             <a:graphic xmlns:a="http://schemas.openxmlformats.org/drawingml/2006/main">
               <a:graphicData uri="http://schemas.openxmlformats.org/drawingml/2006/picture">
                 <pic:pic xmlns:pic="http://schemas.openxmlformats.org/drawingml/2006/picture">
                   <pic:nvPicPr>
-                    <pic:cNvPr id="180319416" name=""/>
+                    <pic:cNvPr id="556075123" name=""/>
                     <pic:cNvPicPr/>
                   </pic:nvPicPr>
                   <pic:blipFill>
@@ -22945,16 +22971,16 @@
         </w:rPr>
         <w:lastRenderedPageBreak/>
         <w:drawing>
-          <wp:inline distT="0" distB="0" distL="0" distR="0" wp14:anchorId="41CECACB" wp14:editId="1F6DF780">
+          <wp:inline distT="0" distB="0" distL="0" distR="0" wp14:anchorId="41ABA874" wp14:editId="5CAFA268">
             <wp:extent cx="5303520" cy="2983005"/>
             <wp:effectExtent l="19050" t="19050" r="11430" b="27305"/>
-            <wp:docPr id="499541414" name="Imagem 58"/>
+            <wp:docPr id="415459839" name="Imagem 58"/>
             <wp:cNvGraphicFramePr/>
             <a:graphic xmlns:a="http://schemas.openxmlformats.org/drawingml/2006/main">
               <a:graphicData uri="http://schemas.openxmlformats.org/drawingml/2006/picture">
                 <pic:pic xmlns:pic="http://schemas.openxmlformats.org/drawingml/2006/picture">
                   <pic:nvPicPr>
-                    <pic:cNvPr id="499541414" name=""/>
+                    <pic:cNvPr id="415459839" name=""/>
                     <pic:cNvPicPr/>
                   </pic:nvPicPr>
                   <pic:blipFill>
@@ -23026,7 +23052,7 @@
           <w:sz w:val="34"/>
         </w:rPr>
       </w:pPr>
-      <w:bookmarkStart w:id="51" w:name="_Toc240377187"/>
+      <w:bookmarkStart w:id="51" w:name="_Toc240380484"/>
       <w:r>
         <w:rPr>
           <w:rFonts w:ascii="Montserrat" w:hAnsi="Montserrat"/>
@@ -23270,7 +23296,7 @@
           <w:sz w:val="34"/>
         </w:rPr>
       </w:pPr>
-      <w:bookmarkStart w:id="52" w:name="_Toc240377188"/>
+      <w:bookmarkStart w:id="52" w:name="_Toc240380485"/>
       <w:r>
         <w:rPr>
           <w:rFonts w:ascii="Montserrat" w:hAnsi="Montserrat"/>
@@ -25058,7 +25084,7 @@
 <file path=word/numbering.xml><?xml version="1.0" encoding="utf-8"?>
 <w:numbering xmlns:wpc="http://schemas.microsoft.com/office/word/2010/wordprocessingCanvas" xmlns:cx="http://schemas.microsoft.com/office/drawing/2014/chartex" xmlns:cx1="http://schemas.microsoft.com/office/drawing/2015/9/8/chartex" xmlns:cx2="http://schemas.microsoft.com/office/drawing/2015/10/21/chartex" xmlns:cx3="http://schemas.microsoft.com/office/drawing/2016/5/9/chartex" xmlns:cx4="http://schemas.microsoft.com/office/drawing/2016/5/10/chartex" xmlns:cx5="http://schemas.microsoft.com/office/drawing/2016/5/11/chartex" xmlns:cx6="http://schemas.microsoft.com/office/drawing/2016/5/12/chartex" xmlns:cx7="http://schemas.microsoft.com/office/drawing/2016/5/13/chartex" xmlns:cx8="http://schemas.microsoft.com/office/drawing/2016/5/14/chartex" xmlns:mc="http://schemas.openxmlformats.org/markup-compatibility/2006" xmlns:aink="http://schemas.microsoft.com/office/drawing/2016/ink" xmlns:am3d="http://schemas.microsoft.com/office/drawing/2017/model3d" xmlns:o="urn:schemas-microsoft-com:office:office" xmlns:oel="http://schemas.microsoft.com/office/2019/extlst" xmlns:r="http://schemas.openxmlformats.org/officeDocument/2006/relationships" xmlns:m="http://schemas.openxmlformats.org/officeDocument/2006/math" xmlns:v="urn:schemas-microsoft-com:vml" xmlns:wp14="http://schemas.microsoft.com/office/word/2010/wordprocessingDrawing" xmlns:wp="http://schemas.openxmlformats.org/drawingml/2006/wordprocessingDrawing" xmlns:w10="urn:schemas-microsoft-com:office:word" xmlns:w="http://schemas.openxmlformats.org/wordprocessingml/2006/main" xmlns:w14="http://schemas.microsoft.com/office/word/2010/wordml" xmlns:w15="http://schemas.microsoft.com/office/word/2012/wordml" xmlns:w16cex="http://schemas.microsoft.com/office/word/2018/wordml/cex" xmlns:w16cid="http://schemas.microsoft.com/office/word/2016/wordml/cid" xmlns:w16="http://schemas.microsoft.com/office/word/2018/wordml" xmlns:w16du="http://schemas.microsoft.com/office/word/2023/wordml/word16du" xmlns:w16sdtdh="http://schemas.microsoft.com/office/word/2020/wordml/sdtdatahash" xmlns:w16sdtfl="http://schemas.microsoft.com/office/word/2024/wordml/sdtformatlock" xmlns:w16se="http://schemas.microsoft.com/office/word/2015/wordml/symex" xmlns:wpg="http://schemas.microsoft.com/office/word/2010/wordprocessingGroup" xmlns:wpi="http://schemas.microsoft.com/office/word/2010/wordprocessingInk" xmlns:wne="http://schemas.microsoft.com/office/word/2006/wordml" xmlns:wps="http://schemas.microsoft.com/office/word/2010/wordprocessingShape" mc:Ignorable="w14 w15 w16se w16cid w16 w16cex w16sdtdh w16sdtfl w16du wp14">
   <w:abstractNum w:abstractNumId="0" w15:restartNumberingAfterBreak="0">
-    <w:nsid w:val="04A445D3"/>
+    <w:nsid w:val="0D31452D"/>
     <w:multiLevelType w:val="singleLevel"/>
     <w:tmpl w:val="04160001"/>
     <w:lvl w:ilvl="0">
@@ -25075,7 +25101,7 @@
     </w:lvl>
   </w:abstractNum>
   <w:abstractNum w:abstractNumId="1" w15:restartNumberingAfterBreak="0">
-    <w:nsid w:val="05C4692B"/>
+    <w:nsid w:val="0F54377C"/>
     <w:multiLevelType w:val="singleLevel"/>
     <w:tmpl w:val="04160001"/>
     <w:lvl w:ilvl="0">
@@ -25092,7 +25118,7 @@
     </w:lvl>
   </w:abstractNum>
   <w:abstractNum w:abstractNumId="2" w15:restartNumberingAfterBreak="0">
-    <w:nsid w:val="0B25328F"/>
+    <w:nsid w:val="1218491D"/>
     <w:multiLevelType w:val="singleLevel"/>
     <w:tmpl w:val="04160001"/>
     <w:lvl w:ilvl="0">
@@ -25109,7 +25135,7 @@
     </w:lvl>
   </w:abstractNum>
   <w:abstractNum w:abstractNumId="3" w15:restartNumberingAfterBreak="0">
-    <w:nsid w:val="0B3700E6"/>
+    <w:nsid w:val="15D07B21"/>
     <w:multiLevelType w:val="singleLevel"/>
     <w:tmpl w:val="04160001"/>
     <w:lvl w:ilvl="0">
@@ -25126,7 +25152,7 @@
     </w:lvl>
   </w:abstractNum>
   <w:abstractNum w:abstractNumId="4" w15:restartNumberingAfterBreak="0">
-    <w:nsid w:val="0B404EDD"/>
+    <w:nsid w:val="16766F35"/>
     <w:multiLevelType w:val="singleLevel"/>
     <w:tmpl w:val="04160001"/>
     <w:lvl w:ilvl="0">
@@ -25143,7 +25169,7 @@
     </w:lvl>
   </w:abstractNum>
   <w:abstractNum w:abstractNumId="5" w15:restartNumberingAfterBreak="0">
-    <w:nsid w:val="0D756567"/>
+    <w:nsid w:val="1CF51F45"/>
     <w:multiLevelType w:val="singleLevel"/>
     <w:tmpl w:val="04160001"/>
     <w:lvl w:ilvl="0">
@@ -25160,7 +25186,7 @@
     </w:lvl>
   </w:abstractNum>
   <w:abstractNum w:abstractNumId="6" w15:restartNumberingAfterBreak="0">
-    <w:nsid w:val="113E35CC"/>
+    <w:nsid w:val="1EB23B9E"/>
     <w:multiLevelType w:val="singleLevel"/>
     <w:tmpl w:val="04160001"/>
     <w:lvl w:ilvl="0">
@@ -25177,7 +25203,7 @@
     </w:lvl>
   </w:abstractNum>
   <w:abstractNum w:abstractNumId="7" w15:restartNumberingAfterBreak="0">
-    <w:nsid w:val="14C8014D"/>
+    <w:nsid w:val="1F5404CE"/>
     <w:multiLevelType w:val="singleLevel"/>
     <w:tmpl w:val="04160001"/>
     <w:lvl w:ilvl="0">
@@ -25194,7 +25220,7 @@
     </w:lvl>
   </w:abstractNum>
   <w:abstractNum w:abstractNumId="8" w15:restartNumberingAfterBreak="0">
-    <w:nsid w:val="185D5A8B"/>
+    <w:nsid w:val="2B0E6F4C"/>
     <w:multiLevelType w:val="singleLevel"/>
     <w:tmpl w:val="04160001"/>
     <w:lvl w:ilvl="0">
@@ -25211,7 +25237,7 @@
     </w:lvl>
   </w:abstractNum>
   <w:abstractNum w:abstractNumId="9" w15:restartNumberingAfterBreak="0">
-    <w:nsid w:val="237045B9"/>
+    <w:nsid w:val="2BD701F7"/>
     <w:multiLevelType w:val="singleLevel"/>
     <w:tmpl w:val="04160001"/>
     <w:lvl w:ilvl="0">
@@ -25228,7 +25254,7 @@
     </w:lvl>
   </w:abstractNum>
   <w:abstractNum w:abstractNumId="10" w15:restartNumberingAfterBreak="0">
-    <w:nsid w:val="2A0250F4"/>
+    <w:nsid w:val="2CE75B6C"/>
     <w:multiLevelType w:val="singleLevel"/>
     <w:tmpl w:val="04160001"/>
     <w:lvl w:ilvl="0">
@@ -25245,7 +25271,7 @@
     </w:lvl>
   </w:abstractNum>
   <w:abstractNum w:abstractNumId="11" w15:restartNumberingAfterBreak="0">
-    <w:nsid w:val="2CB00DC4"/>
+    <w:nsid w:val="307C52C2"/>
     <w:multiLevelType w:val="singleLevel"/>
     <w:tmpl w:val="04160001"/>
     <w:lvl w:ilvl="0">
@@ -25262,7 +25288,7 @@
     </w:lvl>
   </w:abstractNum>
   <w:abstractNum w:abstractNumId="12" w15:restartNumberingAfterBreak="0">
-    <w:nsid w:val="2EC863FF"/>
+    <w:nsid w:val="313D1EF4"/>
     <w:multiLevelType w:val="singleLevel"/>
     <w:tmpl w:val="04160001"/>
     <w:lvl w:ilvl="0">
@@ -25279,7 +25305,7 @@
     </w:lvl>
   </w:abstractNum>
   <w:abstractNum w:abstractNumId="13" w15:restartNumberingAfterBreak="0">
-    <w:nsid w:val="332E1B27"/>
+    <w:nsid w:val="327F68AB"/>
     <w:multiLevelType w:val="singleLevel"/>
     <w:tmpl w:val="04160001"/>
     <w:lvl w:ilvl="0">
@@ -25296,7 +25322,7 @@
     </w:lvl>
   </w:abstractNum>
   <w:abstractNum w:abstractNumId="14" w15:restartNumberingAfterBreak="0">
-    <w:nsid w:val="3ABA1F24"/>
+    <w:nsid w:val="3C984ADD"/>
     <w:multiLevelType w:val="singleLevel"/>
     <w:tmpl w:val="04160001"/>
     <w:lvl w:ilvl="0">
@@ -25313,7 +25339,7 @@
     </w:lvl>
   </w:abstractNum>
   <w:abstractNum w:abstractNumId="15" w15:restartNumberingAfterBreak="0">
-    <w:nsid w:val="3B3D5D8A"/>
+    <w:nsid w:val="41AC235E"/>
     <w:multiLevelType w:val="singleLevel"/>
     <w:tmpl w:val="04160001"/>
     <w:lvl w:ilvl="0">
@@ -25330,7 +25356,7 @@
     </w:lvl>
   </w:abstractNum>
   <w:abstractNum w:abstractNumId="16" w15:restartNumberingAfterBreak="0">
-    <w:nsid w:val="3DC037D4"/>
+    <w:nsid w:val="42CD7B70"/>
     <w:multiLevelType w:val="singleLevel"/>
     <w:tmpl w:val="04160001"/>
     <w:lvl w:ilvl="0">
@@ -25347,7 +25373,7 @@
     </w:lvl>
   </w:abstractNum>
   <w:abstractNum w:abstractNumId="17" w15:restartNumberingAfterBreak="0">
-    <w:nsid w:val="3EF041A4"/>
+    <w:nsid w:val="47BF2FD4"/>
     <w:multiLevelType w:val="singleLevel"/>
     <w:tmpl w:val="04160001"/>
     <w:lvl w:ilvl="0">
@@ -25364,7 +25390,7 @@
     </w:lvl>
   </w:abstractNum>
   <w:abstractNum w:abstractNumId="18" w15:restartNumberingAfterBreak="0">
-    <w:nsid w:val="4C051769"/>
+    <w:nsid w:val="4AFD7F88"/>
     <w:multiLevelType w:val="singleLevel"/>
     <w:tmpl w:val="04160001"/>
     <w:lvl w:ilvl="0">
@@ -25381,7 +25407,7 @@
     </w:lvl>
   </w:abstractNum>
   <w:abstractNum w:abstractNumId="19" w15:restartNumberingAfterBreak="0">
-    <w:nsid w:val="4E600A21"/>
+    <w:nsid w:val="4B693B62"/>
     <w:multiLevelType w:val="singleLevel"/>
     <w:tmpl w:val="04160001"/>
     <w:lvl w:ilvl="0">
@@ -25398,7 +25424,7 @@
     </w:lvl>
   </w:abstractNum>
   <w:abstractNum w:abstractNumId="20" w15:restartNumberingAfterBreak="0">
-    <w:nsid w:val="568F6282"/>
+    <w:nsid w:val="4CBB78C0"/>
     <w:multiLevelType w:val="singleLevel"/>
     <w:tmpl w:val="04160001"/>
     <w:lvl w:ilvl="0">
@@ -25415,7 +25441,7 @@
     </w:lvl>
   </w:abstractNum>
   <w:abstractNum w:abstractNumId="21" w15:restartNumberingAfterBreak="0">
-    <w:nsid w:val="5D5559B8"/>
+    <w:nsid w:val="4EFA0322"/>
     <w:multiLevelType w:val="singleLevel"/>
     <w:tmpl w:val="04160001"/>
     <w:lvl w:ilvl="0">
@@ -25432,7 +25458,7 @@
     </w:lvl>
   </w:abstractNum>
   <w:abstractNum w:abstractNumId="22" w15:restartNumberingAfterBreak="0">
-    <w:nsid w:val="61D20A1B"/>
+    <w:nsid w:val="506910EC"/>
     <w:multiLevelType w:val="singleLevel"/>
     <w:tmpl w:val="04160001"/>
     <w:lvl w:ilvl="0">
@@ -25449,7 +25475,7 @@
     </w:lvl>
   </w:abstractNum>
   <w:abstractNum w:abstractNumId="23" w15:restartNumberingAfterBreak="0">
-    <w:nsid w:val="62900363"/>
+    <w:nsid w:val="50FC081D"/>
     <w:multiLevelType w:val="singleLevel"/>
     <w:tmpl w:val="04160001"/>
     <w:lvl w:ilvl="0">
@@ -25466,7 +25492,7 @@
     </w:lvl>
   </w:abstractNum>
   <w:abstractNum w:abstractNumId="24" w15:restartNumberingAfterBreak="0">
-    <w:nsid w:val="63CA0D9B"/>
+    <w:nsid w:val="53C2744F"/>
     <w:multiLevelType w:val="singleLevel"/>
     <w:tmpl w:val="04160001"/>
     <w:lvl w:ilvl="0">
@@ -25483,7 +25509,7 @@
     </w:lvl>
   </w:abstractNum>
   <w:abstractNum w:abstractNumId="25" w15:restartNumberingAfterBreak="0">
-    <w:nsid w:val="67D648FC"/>
+    <w:nsid w:val="5711618A"/>
     <w:multiLevelType w:val="singleLevel"/>
     <w:tmpl w:val="04160001"/>
     <w:lvl w:ilvl="0">
@@ -25500,7 +25526,7 @@
     </w:lvl>
   </w:abstractNum>
   <w:abstractNum w:abstractNumId="26" w15:restartNumberingAfterBreak="0">
-    <w:nsid w:val="67DE0E07"/>
+    <w:nsid w:val="588F3E26"/>
     <w:multiLevelType w:val="singleLevel"/>
     <w:tmpl w:val="04160001"/>
     <w:lvl w:ilvl="0">
@@ -25517,7 +25543,7 @@
     </w:lvl>
   </w:abstractNum>
   <w:abstractNum w:abstractNumId="27" w15:restartNumberingAfterBreak="0">
-    <w:nsid w:val="68BE1697"/>
+    <w:nsid w:val="5B1171D4"/>
     <w:multiLevelType w:val="singleLevel"/>
     <w:tmpl w:val="04160001"/>
     <w:lvl w:ilvl="0">
@@ -25534,7 +25560,7 @@
     </w:lvl>
   </w:abstractNum>
   <w:abstractNum w:abstractNumId="28" w15:restartNumberingAfterBreak="0">
-    <w:nsid w:val="6D4E0740"/>
+    <w:nsid w:val="5BFA3F9D"/>
     <w:multiLevelType w:val="singleLevel"/>
     <w:tmpl w:val="04160001"/>
     <w:lvl w:ilvl="0">
@@ -25551,7 +25577,7 @@
     </w:lvl>
   </w:abstractNum>
   <w:abstractNum w:abstractNumId="29" w15:restartNumberingAfterBreak="0">
-    <w:nsid w:val="6FBC60E2"/>
+    <w:nsid w:val="5F146028"/>
     <w:multiLevelType w:val="singleLevel"/>
     <w:tmpl w:val="04160001"/>
     <w:lvl w:ilvl="0">
@@ -25568,7 +25594,7 @@
     </w:lvl>
   </w:abstractNum>
   <w:abstractNum w:abstractNumId="30" w15:restartNumberingAfterBreak="0">
-    <w:nsid w:val="6FC52E78"/>
+    <w:nsid w:val="609F03A6"/>
     <w:multiLevelType w:val="singleLevel"/>
     <w:tmpl w:val="04160001"/>
     <w:lvl w:ilvl="0">
@@ -25585,7 +25611,7 @@
     </w:lvl>
   </w:abstractNum>
   <w:abstractNum w:abstractNumId="31" w15:restartNumberingAfterBreak="0">
-    <w:nsid w:val="70B93F53"/>
+    <w:nsid w:val="64B257E4"/>
     <w:multiLevelType w:val="singleLevel"/>
     <w:tmpl w:val="04160001"/>
     <w:lvl w:ilvl="0">
@@ -25602,7 +25628,7 @@
     </w:lvl>
   </w:abstractNum>
   <w:abstractNum w:abstractNumId="32" w15:restartNumberingAfterBreak="0">
-    <w:nsid w:val="73C52E92"/>
+    <w:nsid w:val="659E2DD0"/>
     <w:multiLevelType w:val="singleLevel"/>
     <w:tmpl w:val="04160001"/>
     <w:lvl w:ilvl="0">
@@ -25619,7 +25645,7 @@
     </w:lvl>
   </w:abstractNum>
   <w:abstractNum w:abstractNumId="33" w15:restartNumberingAfterBreak="0">
-    <w:nsid w:val="74D55241"/>
+    <w:nsid w:val="6E1B5D24"/>
     <w:multiLevelType w:val="singleLevel"/>
     <w:tmpl w:val="04160001"/>
     <w:lvl w:ilvl="0">
@@ -25636,7 +25662,7 @@
     </w:lvl>
   </w:abstractNum>
   <w:abstractNum w:abstractNumId="34" w15:restartNumberingAfterBreak="0">
-    <w:nsid w:val="76311830"/>
+    <w:nsid w:val="6EB61B87"/>
     <w:multiLevelType w:val="singleLevel"/>
     <w:tmpl w:val="04160001"/>
     <w:lvl w:ilvl="0">
@@ -25653,7 +25679,7 @@
     </w:lvl>
   </w:abstractNum>
   <w:abstractNum w:abstractNumId="35" w15:restartNumberingAfterBreak="0">
-    <w:nsid w:val="77FA059E"/>
+    <w:nsid w:val="77927C39"/>
     <w:multiLevelType w:val="singleLevel"/>
     <w:tmpl w:val="04160001"/>
     <w:lvl w:ilvl="0">
@@ -25670,7 +25696,7 @@
     </w:lvl>
   </w:abstractNum>
   <w:abstractNum w:abstractNumId="36" w15:restartNumberingAfterBreak="0">
-    <w:nsid w:val="79FD3FC5"/>
+    <w:nsid w:val="79450FD6"/>
     <w:multiLevelType w:val="singleLevel"/>
     <w:tmpl w:val="04160001"/>
     <w:lvl w:ilvl="0">
@@ -25687,7 +25713,7 @@
     </w:lvl>
   </w:abstractNum>
   <w:abstractNum w:abstractNumId="37" w15:restartNumberingAfterBreak="0">
-    <w:nsid w:val="7C3851D4"/>
+    <w:nsid w:val="7E8B66F5"/>
     <w:multiLevelType w:val="singleLevel"/>
     <w:tmpl w:val="04160001"/>
     <w:lvl w:ilvl="0">
@@ -25704,7 +25730,7 @@
     </w:lvl>
   </w:abstractNum>
   <w:abstractNum w:abstractNumId="38" w15:restartNumberingAfterBreak="0">
-    <w:nsid w:val="7C99569B"/>
+    <w:nsid w:val="7EBF3BDF"/>
     <w:multiLevelType w:val="singleLevel"/>
     <w:tmpl w:val="04160001"/>
     <w:lvl w:ilvl="0">
@@ -25720,122 +25746,122 @@
       </w:rPr>
     </w:lvl>
   </w:abstractNum>
-  <w:num w:numId="1" w16cid:durableId="1658611241">
+  <w:num w:numId="1" w16cid:durableId="1102266749">
+    <w:abstractNumId w:val="4"/>
+  </w:num>
+  <w:num w:numId="2" w16cid:durableId="2086798866">
     <w:abstractNumId w:val="1"/>
   </w:num>
-  <w:num w:numId="2" w16cid:durableId="307589627">
+  <w:num w:numId="3" w16cid:durableId="1327711452">
+    <w:abstractNumId w:val="34"/>
+  </w:num>
+  <w:num w:numId="4" w16cid:durableId="839348370">
+    <w:abstractNumId w:val="26"/>
+  </w:num>
+  <w:num w:numId="5" w16cid:durableId="489758190">
+    <w:abstractNumId w:val="32"/>
+  </w:num>
+  <w:num w:numId="6" w16cid:durableId="1308239552">
+    <w:abstractNumId w:val="15"/>
+  </w:num>
+  <w:num w:numId="7" w16cid:durableId="1105883858">
+    <w:abstractNumId w:val="11"/>
+  </w:num>
+  <w:num w:numId="8" w16cid:durableId="1015496884">
+    <w:abstractNumId w:val="0"/>
+  </w:num>
+  <w:num w:numId="9" w16cid:durableId="1406224081">
+    <w:abstractNumId w:val="38"/>
+  </w:num>
+  <w:num w:numId="10" w16cid:durableId="1764838427">
+    <w:abstractNumId w:val="37"/>
+  </w:num>
+  <w:num w:numId="11" w16cid:durableId="1523351524">
+    <w:abstractNumId w:val="7"/>
+  </w:num>
+  <w:num w:numId="12" w16cid:durableId="1686832286">
+    <w:abstractNumId w:val="16"/>
+  </w:num>
+  <w:num w:numId="13" w16cid:durableId="1129282114">
+    <w:abstractNumId w:val="2"/>
+  </w:num>
+  <w:num w:numId="14" w16cid:durableId="164712331">
+    <w:abstractNumId w:val="25"/>
+  </w:num>
+  <w:num w:numId="15" w16cid:durableId="1317732362">
+    <w:abstractNumId w:val="9"/>
+  </w:num>
+  <w:num w:numId="16" w16cid:durableId="2007827500">
+    <w:abstractNumId w:val="19"/>
+  </w:num>
+  <w:num w:numId="17" w16cid:durableId="1218664812">
+    <w:abstractNumId w:val="23"/>
+  </w:num>
+  <w:num w:numId="18" w16cid:durableId="1391001611">
+    <w:abstractNumId w:val="29"/>
+  </w:num>
+  <w:num w:numId="19" w16cid:durableId="412317928">
+    <w:abstractNumId w:val="13"/>
+  </w:num>
+  <w:num w:numId="20" w16cid:durableId="1725177439">
+    <w:abstractNumId w:val="30"/>
+  </w:num>
+  <w:num w:numId="21" w16cid:durableId="684332448">
+    <w:abstractNumId w:val="20"/>
+  </w:num>
+  <w:num w:numId="22" w16cid:durableId="464588343">
+    <w:abstractNumId w:val="3"/>
+  </w:num>
+  <w:num w:numId="23" w16cid:durableId="1189946721">
+    <w:abstractNumId w:val="14"/>
+  </w:num>
+  <w:num w:numId="24" w16cid:durableId="1398287554">
+    <w:abstractNumId w:val="28"/>
+  </w:num>
+  <w:num w:numId="25" w16cid:durableId="1840343350">
+    <w:abstractNumId w:val="36"/>
+  </w:num>
+  <w:num w:numId="26" w16cid:durableId="774715397">
     <w:abstractNumId w:val="27"/>
   </w:num>
-  <w:num w:numId="3" w16cid:durableId="585575222">
-    <w:abstractNumId w:val="0"/>
+  <w:num w:numId="27" w16cid:durableId="1399670532">
+    <w:abstractNumId w:val="8"/>
   </w:num>
-  <w:num w:numId="4" w16cid:durableId="594286256">
+  <w:num w:numId="28" w16cid:durableId="1453355257">
+    <w:abstractNumId w:val="17"/>
+  </w:num>
+  <w:num w:numId="29" w16cid:durableId="61369100">
+    <w:abstractNumId w:val="35"/>
+  </w:num>
+  <w:num w:numId="30" w16cid:durableId="1344939051">
+    <w:abstractNumId w:val="10"/>
+  </w:num>
+  <w:num w:numId="31" w16cid:durableId="363790796">
     <w:abstractNumId w:val="6"/>
   </w:num>
-  <w:num w:numId="5" w16cid:durableId="315692648">
-    <w:abstractNumId w:val="20"/>
+  <w:num w:numId="32" w16cid:durableId="634141975">
+    <w:abstractNumId w:val="33"/>
   </w:num>
-  <w:num w:numId="6" w16cid:durableId="59864818">
+  <w:num w:numId="33" w16cid:durableId="1393845321">
+    <w:abstractNumId w:val="5"/>
+  </w:num>
+  <w:num w:numId="34" w16cid:durableId="338852830">
+    <w:abstractNumId w:val="21"/>
+  </w:num>
+  <w:num w:numId="35" w16cid:durableId="1371153291">
+    <w:abstractNumId w:val="12"/>
+  </w:num>
+  <w:num w:numId="36" w16cid:durableId="524444540">
     <w:abstractNumId w:val="24"/>
   </w:num>
-  <w:num w:numId="7" w16cid:durableId="673991261">
-    <w:abstractNumId w:val="3"/>
+  <w:num w:numId="37" w16cid:durableId="1714379917">
+    <w:abstractNumId w:val="31"/>
   </w:num>
-  <w:num w:numId="8" w16cid:durableId="1472749096">
-    <w:abstractNumId w:val="36"/>
-  </w:num>
-  <w:num w:numId="9" w16cid:durableId="1449738724">
-    <w:abstractNumId w:val="8"/>
-  </w:num>
-  <w:num w:numId="10" w16cid:durableId="2008287134">
-    <w:abstractNumId w:val="25"/>
-  </w:num>
-  <w:num w:numId="11" w16cid:durableId="1001202875">
+  <w:num w:numId="38" w16cid:durableId="207840287">
     <w:abstractNumId w:val="18"/>
   </w:num>
-  <w:num w:numId="12" w16cid:durableId="1525559565">
-    <w:abstractNumId w:val="4"/>
-  </w:num>
-  <w:num w:numId="13" w16cid:durableId="1600144291">
-    <w:abstractNumId w:val="2"/>
-  </w:num>
-  <w:num w:numId="14" w16cid:durableId="658582261">
-    <w:abstractNumId w:val="16"/>
-  </w:num>
-  <w:num w:numId="15" w16cid:durableId="1740707239">
-    <w:abstractNumId w:val="23"/>
-  </w:num>
-  <w:num w:numId="16" w16cid:durableId="1723943796">
-    <w:abstractNumId w:val="30"/>
-  </w:num>
-  <w:num w:numId="17" w16cid:durableId="438262958">
-    <w:abstractNumId w:val="15"/>
-  </w:num>
-  <w:num w:numId="18" w16cid:durableId="1619020521">
-    <w:abstractNumId w:val="7"/>
-  </w:num>
-  <w:num w:numId="19" w16cid:durableId="1331257513">
-    <w:abstractNumId w:val="32"/>
-  </w:num>
-  <w:num w:numId="20" w16cid:durableId="850677694">
-    <w:abstractNumId w:val="35"/>
-  </w:num>
-  <w:num w:numId="21" w16cid:durableId="1413233833">
-    <w:abstractNumId w:val="31"/>
-  </w:num>
-  <w:num w:numId="22" w16cid:durableId="599220374">
-    <w:abstractNumId w:val="12"/>
-  </w:num>
-  <w:num w:numId="23" w16cid:durableId="1326931259">
-    <w:abstractNumId w:val="33"/>
-  </w:num>
-  <w:num w:numId="24" w16cid:durableId="887760171">
-    <w:abstractNumId w:val="11"/>
-  </w:num>
-  <w:num w:numId="25" w16cid:durableId="430399079">
+  <w:num w:numId="39" w16cid:durableId="837160625">
     <w:abstractNumId w:val="22"/>
-  </w:num>
-  <w:num w:numId="26" w16cid:durableId="1228302964">
-    <w:abstractNumId w:val="10"/>
-  </w:num>
-  <w:num w:numId="27" w16cid:durableId="1973974714">
-    <w:abstractNumId w:val="5"/>
-  </w:num>
-  <w:num w:numId="28" w16cid:durableId="6257838">
-    <w:abstractNumId w:val="28"/>
-  </w:num>
-  <w:num w:numId="29" w16cid:durableId="340546553">
-    <w:abstractNumId w:val="13"/>
-  </w:num>
-  <w:num w:numId="30" w16cid:durableId="1774787516">
-    <w:abstractNumId w:val="17"/>
-  </w:num>
-  <w:num w:numId="31" w16cid:durableId="512694361">
-    <w:abstractNumId w:val="19"/>
-  </w:num>
-  <w:num w:numId="32" w16cid:durableId="197357074">
-    <w:abstractNumId w:val="26"/>
-  </w:num>
-  <w:num w:numId="33" w16cid:durableId="1749231400">
-    <w:abstractNumId w:val="21"/>
-  </w:num>
-  <w:num w:numId="34" w16cid:durableId="15813559">
-    <w:abstractNumId w:val="29"/>
-  </w:num>
-  <w:num w:numId="35" w16cid:durableId="527068625">
-    <w:abstractNumId w:val="14"/>
-  </w:num>
-  <w:num w:numId="36" w16cid:durableId="256639648">
-    <w:abstractNumId w:val="34"/>
-  </w:num>
-  <w:num w:numId="37" w16cid:durableId="292445816">
-    <w:abstractNumId w:val="37"/>
-  </w:num>
-  <w:num w:numId="38" w16cid:durableId="2044742710">
-    <w:abstractNumId w:val="38"/>
-  </w:num>
-  <w:num w:numId="39" w16cid:durableId="1593977569">
-    <w:abstractNumId w:val="9"/>
   </w:num>
 </w:numbering>
 </file>
@@ -26248,7 +26274,7 @@
     <w:link w:val="Ttulo1Char"/>
     <w:uiPriority w:val="9"/>
     <w:qFormat/>
-    <w:rsid w:val="00A977AC"/>
+    <w:rsid w:val="00B101D3"/>
     <w:pPr>
       <w:keepNext/>
       <w:keepLines/>
@@ -26270,7 +26296,7 @@
     <w:uiPriority w:val="9"/>
     <w:unhideWhenUsed/>
     <w:qFormat/>
-    <w:rsid w:val="00A977AC"/>
+    <w:rsid w:val="00B101D3"/>
     <w:pPr>
       <w:keepNext/>
       <w:keepLines/>
@@ -26293,7 +26319,7 @@
     <w:semiHidden/>
     <w:unhideWhenUsed/>
     <w:qFormat/>
-    <w:rsid w:val="00A977AC"/>
+    <w:rsid w:val="00B101D3"/>
     <w:pPr>
       <w:keepNext/>
       <w:keepLines/>
@@ -26316,7 +26342,7 @@
     <w:semiHidden/>
     <w:unhideWhenUsed/>
     <w:qFormat/>
-    <w:rsid w:val="00A977AC"/>
+    <w:rsid w:val="00B101D3"/>
     <w:pPr>
       <w:keepNext/>
       <w:keepLines/>
@@ -26339,7 +26365,7 @@
     <w:semiHidden/>
     <w:unhideWhenUsed/>
     <w:qFormat/>
-    <w:rsid w:val="00A977AC"/>
+    <w:rsid w:val="00B101D3"/>
     <w:pPr>
       <w:keepNext/>
       <w:keepLines/>
@@ -26360,7 +26386,7 @@
     <w:semiHidden/>
     <w:unhideWhenUsed/>
     <w:qFormat/>
-    <w:rsid w:val="00A977AC"/>
+    <w:rsid w:val="00B101D3"/>
     <w:pPr>
       <w:keepNext/>
       <w:keepLines/>
@@ -26383,7 +26409,7 @@
     <w:semiHidden/>
     <w:unhideWhenUsed/>
     <w:qFormat/>
-    <w:rsid w:val="00A977AC"/>
+    <w:rsid w:val="00B101D3"/>
     <w:pPr>
       <w:keepNext/>
       <w:keepLines/>
@@ -26404,7 +26430,7 @@
     <w:semiHidden/>
     <w:unhideWhenUsed/>
     <w:qFormat/>
-    <w:rsid w:val="00A977AC"/>
+    <w:rsid w:val="00B101D3"/>
     <w:pPr>
       <w:keepNext/>
       <w:keepLines/>
@@ -26427,7 +26453,7 @@
     <w:semiHidden/>
     <w:unhideWhenUsed/>
     <w:qFormat/>
-    <w:rsid w:val="00A977AC"/>
+    <w:rsid w:val="00B101D3"/>
     <w:pPr>
       <w:keepNext/>
       <w:keepLines/>
@@ -26471,7 +26497,7 @@
     <w:basedOn w:val="Fontepargpadro"/>
     <w:link w:val="Ttulo1"/>
     <w:uiPriority w:val="9"/>
-    <w:rsid w:val="00A977AC"/>
+    <w:rsid w:val="00B101D3"/>
     <w:rPr>
       <w:rFonts w:asciiTheme="majorHAnsi" w:eastAsiaTheme="majorEastAsia" w:hAnsiTheme="majorHAnsi" w:cstheme="majorBidi"/>
       <w:color w:val="0F4761" w:themeColor="accent1" w:themeShade="BF"/>
@@ -26484,7 +26510,7 @@
     <w:basedOn w:val="Fontepargpadro"/>
     <w:link w:val="Ttulo2"/>
     <w:uiPriority w:val="9"/>
-    <w:rsid w:val="00A977AC"/>
+    <w:rsid w:val="00B101D3"/>
     <w:rPr>
       <w:rFonts w:asciiTheme="majorHAnsi" w:eastAsiaTheme="majorEastAsia" w:hAnsiTheme="majorHAnsi" w:cstheme="majorBidi"/>
       <w:color w:val="0F4761" w:themeColor="accent1" w:themeShade="BF"/>
@@ -26498,7 +26524,7 @@
     <w:link w:val="Ttulo3"/>
     <w:uiPriority w:val="9"/>
     <w:semiHidden/>
-    <w:rsid w:val="00A977AC"/>
+    <w:rsid w:val="00B101D3"/>
     <w:rPr>
       <w:rFonts w:eastAsiaTheme="majorEastAsia" w:cstheme="majorBidi"/>
       <w:color w:val="0F4761" w:themeColor="accent1" w:themeShade="BF"/>
@@ -26512,7 +26538,7 @@
     <w:link w:val="Ttulo4"/>
     <w:uiPriority w:val="9"/>
     <w:semiHidden/>
-    <w:rsid w:val="00A977AC"/>
+    <w:rsid w:val="00B101D3"/>
     <w:rPr>
       <w:rFonts w:eastAsiaTheme="majorEastAsia" w:cstheme="majorBidi"/>
       <w:i/>
@@ -26526,7 +26552,7 @@
     <w:link w:val="Ttulo5"/>
     <w:uiPriority w:val="9"/>
     <w:semiHidden/>
-    <w:rsid w:val="00A977AC"/>
+    <w:rsid w:val="00B101D3"/>
     <w:rPr>
       <w:rFonts w:eastAsiaTheme="majorEastAsia" w:cstheme="majorBidi"/>
       <w:color w:val="0F4761" w:themeColor="accent1" w:themeShade="BF"/>
@@ -26538,7 +26564,7 @@
     <w:link w:val="Ttulo6"/>
     <w:uiPriority w:val="9"/>
     <w:semiHidden/>
-    <w:rsid w:val="00A977AC"/>
+    <w:rsid w:val="00B101D3"/>
     <w:rPr>
       <w:rFonts w:eastAsiaTheme="majorEastAsia" w:cstheme="majorBidi"/>
       <w:i/>
@@ -26552,7 +26578,7 @@
     <w:link w:val="Ttulo7"/>
     <w:uiPriority w:val="9"/>
     <w:semiHidden/>
-    <w:rsid w:val="00A977AC"/>
+    <w:rsid w:val="00B101D3"/>
     <w:rPr>
       <w:rFonts w:eastAsiaTheme="majorEastAsia" w:cstheme="majorBidi"/>
       <w:color w:val="595959" w:themeColor="text1" w:themeTint="A6"/>
@@ -26564,7 +26590,7 @@
     <w:link w:val="Ttulo8"/>
     <w:uiPriority w:val="9"/>
     <w:semiHidden/>
-    <w:rsid w:val="00A977AC"/>
+    <w:rsid w:val="00B101D3"/>
     <w:rPr>
       <w:rFonts w:eastAsiaTheme="majorEastAsia" w:cstheme="majorBidi"/>
       <w:i/>
@@ -26578,7 +26604,7 @@
     <w:link w:val="Ttulo9"/>
     <w:uiPriority w:val="9"/>
     <w:semiHidden/>
-    <w:rsid w:val="00A977AC"/>
+    <w:rsid w:val="00B101D3"/>
     <w:rPr>
       <w:rFonts w:eastAsiaTheme="majorEastAsia" w:cstheme="majorBidi"/>
       <w:color w:val="272727" w:themeColor="text1" w:themeTint="D8"/>
@@ -26591,7 +26617,7 @@
     <w:link w:val="TtuloChar"/>
     <w:uiPriority w:val="10"/>
     <w:qFormat/>
-    <w:rsid w:val="00A977AC"/>
+    <w:rsid w:val="00B101D3"/>
     <w:pPr>
       <w:spacing w:after="80" w:line="240" w:lineRule="auto"/>
       <w:contextualSpacing/>
@@ -26609,7 +26635,7 @@
     <w:basedOn w:val="Fontepargpadro"/>
     <w:link w:val="Ttulo"/>
     <w:uiPriority w:val="10"/>
-    <w:rsid w:val="00A977AC"/>
+    <w:rsid w:val="00B101D3"/>
     <w:rPr>
       <w:rFonts w:asciiTheme="majorHAnsi" w:eastAsiaTheme="majorEastAsia" w:hAnsiTheme="majorHAnsi" w:cstheme="majorBidi"/>
       <w:spacing w:val="-10"/>
@@ -26625,7 +26651,7 @@
     <w:link w:val="SubttuloChar"/>
     <w:uiPriority w:val="11"/>
     <w:qFormat/>
-    <w:rsid w:val="00A977AC"/>
+    <w:rsid w:val="00B101D3"/>
     <w:pPr>
       <w:numPr>
         <w:ilvl w:val="1"/>
@@ -26644,7 +26670,7 @@
     <w:basedOn w:val="Fontepargpadro"/>
     <w:link w:val="Subttulo"/>
     <w:uiPriority w:val="11"/>
-    <w:rsid w:val="00A977AC"/>
+    <w:rsid w:val="00B101D3"/>
     <w:rPr>
       <w:rFonts w:eastAsiaTheme="majorEastAsia" w:cstheme="majorBidi"/>
       <w:color w:val="595959" w:themeColor="text1" w:themeTint="A6"/>
@@ -26660,7 +26686,7 @@
     <w:link w:val="CitaoChar"/>
     <w:uiPriority w:val="29"/>
     <w:qFormat/>
-    <w:rsid w:val="00A977AC"/>
+    <w:rsid w:val="00B101D3"/>
     <w:pPr>
       <w:spacing w:before="160"/>
       <w:jc w:val="center"/>
@@ -26676,7 +26702,7 @@
     <w:basedOn w:val="Fontepargpadro"/>
     <w:link w:val="Citao"/>
     <w:uiPriority w:val="29"/>
-    <w:rsid w:val="00A977AC"/>
+    <w:rsid w:val="00B101D3"/>
     <w:rPr>
       <w:i/>
       <w:iCs/>
@@ -26688,7 +26714,7 @@
     <w:basedOn w:val="Normal"/>
     <w:uiPriority w:val="34"/>
     <w:qFormat/>
-    <w:rsid w:val="00A977AC"/>
+    <w:rsid w:val="00B101D3"/>
     <w:pPr>
       <w:ind w:left="720"/>
       <w:contextualSpacing/>
@@ -26699,7 +26725,7 @@
     <w:basedOn w:val="Fontepargpadro"/>
     <w:uiPriority w:val="21"/>
     <w:qFormat/>
-    <w:rsid w:val="00A977AC"/>
+    <w:rsid w:val="00B101D3"/>
     <w:rPr>
       <w:i/>
       <w:iCs/>
@@ -26713,7 +26739,7 @@
     <w:link w:val="CitaoIntensaChar"/>
     <w:uiPriority w:val="30"/>
     <w:qFormat/>
-    <w:rsid w:val="00A977AC"/>
+    <w:rsid w:val="00B101D3"/>
     <w:pPr>
       <w:pBdr>
         <w:top w:val="single" w:sz="4" w:space="10" w:color="0F4761" w:themeColor="accent1" w:themeShade="BF"/>
@@ -26734,7 +26760,7 @@
     <w:basedOn w:val="Fontepargpadro"/>
     <w:link w:val="CitaoIntensa"/>
     <w:uiPriority w:val="30"/>
-    <w:rsid w:val="00A977AC"/>
+    <w:rsid w:val="00B101D3"/>
     <w:rPr>
       <w:i/>
       <w:iCs/>
@@ -26746,7 +26772,7 @@
     <w:basedOn w:val="Fontepargpadro"/>
     <w:uiPriority w:val="32"/>
     <w:qFormat/>
-    <w:rsid w:val="00A977AC"/>
+    <w:rsid w:val="00B101D3"/>
     <w:rPr>
       <w:b/>
       <w:bCs/>
@@ -26761,7 +26787,7 @@
     <w:link w:val="CabealhoChar"/>
     <w:uiPriority w:val="99"/>
     <w:unhideWhenUsed/>
-    <w:rsid w:val="00A977AC"/>
+    <w:rsid w:val="00B101D3"/>
     <w:pPr>
       <w:tabs>
         <w:tab w:val="center" w:pos="4252"/>
@@ -26775,7 +26801,7 @@
     <w:basedOn w:val="Fontepargpadro"/>
     <w:link w:val="Cabealho"/>
     <w:uiPriority w:val="99"/>
-    <w:rsid w:val="00A977AC"/>
+    <w:rsid w:val="00B101D3"/>
   </w:style>
   <w:style w:type="paragraph" w:styleId="Rodap">
     <w:name w:val="footer"/>
@@ -26783,7 +26809,7 @@
     <w:link w:val="RodapChar"/>
     <w:uiPriority w:val="99"/>
     <w:unhideWhenUsed/>
-    <w:rsid w:val="00A977AC"/>
+    <w:rsid w:val="00B101D3"/>
     <w:pPr>
       <w:tabs>
         <w:tab w:val="center" w:pos="4252"/>
@@ -26797,7 +26823,7 @@
     <w:basedOn w:val="Fontepargpadro"/>
     <w:link w:val="Rodap"/>
     <w:uiPriority w:val="99"/>
-    <w:rsid w:val="00A977AC"/>
+    <w:rsid w:val="00B101D3"/>
   </w:style>
   <w:style w:type="paragraph" w:styleId="Sumrio1">
     <w:name w:val="toc 1"/>
@@ -26806,7 +26832,7 @@
     <w:autoRedefine/>
     <w:uiPriority w:val="39"/>
     <w:unhideWhenUsed/>
-    <w:rsid w:val="00A977AC"/>
+    <w:rsid w:val="00B101D3"/>
     <w:pPr>
       <w:spacing w:after="100"/>
     </w:pPr>
@@ -26818,7 +26844,7 @@
     <w:autoRedefine/>
     <w:uiPriority w:val="39"/>
     <w:unhideWhenUsed/>
-    <w:rsid w:val="00A977AC"/>
+    <w:rsid w:val="00B101D3"/>
     <w:pPr>
       <w:spacing w:after="100"/>
       <w:ind w:left="240"/>

</xml_diff>

<commit_message>
Documenta a Gestão de Atividades na Central de Ajuda, no Manual de Uso e nas Regras de Acesso
- Central de Ajuda: nova seção "Gestão de Atividades" no menu Gestão,
referenciada a partir do Meu Painel e da lista de configurações da
Administração; cache-busting incrementado (?v=65 → ?v=66) em todos os
20 arquivos que referenciam a página.
- Manual de Uso: nova seção 6.4.5 (versão 2.82), com tabela das 5
categorias agregadas e print da tela com um cartão expandido.
- Regras de Acesso e Permissões: nova seção 3.13, explicando a
restrição por papel (mesmo padrão do Painel Executivo/Painel de
Prazos) e a função listar_perfis_gestao_atividades, que é a exceção
que libera nome/papel de todos os usuários para quem tem acesso à
página.

Co-Authored-By: Claude Sonnet 5 <noreply@anthropic.com>
</commit_message>
<xml_diff>
--- a/Manual de Uso - Ferramenta de Gestao de Projetos.docx
+++ b/Manual de Uso - Ferramenta de Gestao de Projetos.docx
@@ -129,7 +129,7 @@
           <w:color w:val="6A6A70"/>
           <w:sz w:val="22"/>
         </w:rPr>
-        <w:t>Versao 2.81 - 15 de setembro de 2026 (substitui a versao 2.80 de 15/09/2026)</w:t>
+        <w:t>Versao 2.82 - 16 de setembro de 2026 (substitui a versao 2.81 de 15/09/2026)</w:t>
       </w:r>
     </w:p>
     <w:p>
@@ -229,7 +229,7 @@
         <w:rPr>
           <w:noProof/>
         </w:rPr>
-        <w:instrText xml:space="preserve"> PAGEREF _Toc240387657 \h </w:instrText>
+        <w:instrText xml:space="preserve"> PAGEREF _Toc240442808 \h </w:instrText>
       </w:r>
       <w:r>
         <w:rPr>
@@ -290,7 +290,7 @@
         <w:rPr>
           <w:noProof/>
         </w:rPr>
-        <w:instrText xml:space="preserve"> PAGEREF _Toc240387658 \h </w:instrText>
+        <w:instrText xml:space="preserve"> PAGEREF _Toc240442809 \h </w:instrText>
       </w:r>
       <w:r>
         <w:rPr>
@@ -351,7 +351,7 @@
         <w:rPr>
           <w:noProof/>
         </w:rPr>
-        <w:instrText xml:space="preserve"> PAGEREF _Toc240387659 \h </w:instrText>
+        <w:instrText xml:space="preserve"> PAGEREF _Toc240442810 \h </w:instrText>
       </w:r>
       <w:r>
         <w:rPr>
@@ -412,7 +412,7 @@
         <w:rPr>
           <w:noProof/>
         </w:rPr>
-        <w:instrText xml:space="preserve"> PAGEREF _Toc240387660 \h </w:instrText>
+        <w:instrText xml:space="preserve"> PAGEREF _Toc240442811 \h </w:instrText>
       </w:r>
       <w:r>
         <w:rPr>
@@ -473,7 +473,7 @@
         <w:rPr>
           <w:noProof/>
         </w:rPr>
-        <w:instrText xml:space="preserve"> PAGEREF _Toc240387661 \h </w:instrText>
+        <w:instrText xml:space="preserve"> PAGEREF _Toc240442812 \h </w:instrText>
       </w:r>
       <w:r>
         <w:rPr>
@@ -534,7 +534,7 @@
         <w:rPr>
           <w:noProof/>
         </w:rPr>
-        <w:instrText xml:space="preserve"> PAGEREF _Toc240387662 \h </w:instrText>
+        <w:instrText xml:space="preserve"> PAGEREF _Toc240442813 \h </w:instrText>
       </w:r>
       <w:r>
         <w:rPr>
@@ -595,7 +595,7 @@
         <w:rPr>
           <w:noProof/>
         </w:rPr>
-        <w:instrText xml:space="preserve"> PAGEREF _Toc240387663 \h </w:instrText>
+        <w:instrText xml:space="preserve"> PAGEREF _Toc240442814 \h </w:instrText>
       </w:r>
       <w:r>
         <w:rPr>
@@ -656,7 +656,7 @@
         <w:rPr>
           <w:noProof/>
         </w:rPr>
-        <w:instrText xml:space="preserve"> PAGEREF _Toc240387664 \h </w:instrText>
+        <w:instrText xml:space="preserve"> PAGEREF _Toc240442815 \h </w:instrText>
       </w:r>
       <w:r>
         <w:rPr>
@@ -717,7 +717,7 @@
         <w:rPr>
           <w:noProof/>
         </w:rPr>
-        <w:instrText xml:space="preserve"> PAGEREF _Toc240387665 \h </w:instrText>
+        <w:instrText xml:space="preserve"> PAGEREF _Toc240442816 \h </w:instrText>
       </w:r>
       <w:r>
         <w:rPr>
@@ -778,7 +778,7 @@
         <w:rPr>
           <w:noProof/>
         </w:rPr>
-        <w:instrText xml:space="preserve"> PAGEREF _Toc240387666 \h </w:instrText>
+        <w:instrText xml:space="preserve"> PAGEREF _Toc240442817 \h </w:instrText>
       </w:r>
       <w:r>
         <w:rPr>
@@ -839,7 +839,7 @@
         <w:rPr>
           <w:noProof/>
         </w:rPr>
-        <w:instrText xml:space="preserve"> PAGEREF _Toc240387667 \h </w:instrText>
+        <w:instrText xml:space="preserve"> PAGEREF _Toc240442818 \h </w:instrText>
       </w:r>
       <w:r>
         <w:rPr>
@@ -900,7 +900,7 @@
         <w:rPr>
           <w:noProof/>
         </w:rPr>
-        <w:instrText xml:space="preserve"> PAGEREF _Toc240387668 \h </w:instrText>
+        <w:instrText xml:space="preserve"> PAGEREF _Toc240442819 \h </w:instrText>
       </w:r>
       <w:r>
         <w:rPr>
@@ -961,7 +961,7 @@
         <w:rPr>
           <w:noProof/>
         </w:rPr>
-        <w:instrText xml:space="preserve"> PAGEREF _Toc240387669 \h </w:instrText>
+        <w:instrText xml:space="preserve"> PAGEREF _Toc240442820 \h </w:instrText>
       </w:r>
       <w:r>
         <w:rPr>
@@ -1022,7 +1022,7 @@
         <w:rPr>
           <w:noProof/>
         </w:rPr>
-        <w:instrText xml:space="preserve"> PAGEREF _Toc240387670 \h </w:instrText>
+        <w:instrText xml:space="preserve"> PAGEREF _Toc240442821 \h </w:instrText>
       </w:r>
       <w:r>
         <w:rPr>
@@ -1083,7 +1083,7 @@
         <w:rPr>
           <w:noProof/>
         </w:rPr>
-        <w:instrText xml:space="preserve"> PAGEREF _Toc240387671 \h </w:instrText>
+        <w:instrText xml:space="preserve"> PAGEREF _Toc240442822 \h </w:instrText>
       </w:r>
       <w:r>
         <w:rPr>
@@ -1144,7 +1144,7 @@
         <w:rPr>
           <w:noProof/>
         </w:rPr>
-        <w:instrText xml:space="preserve"> PAGEREF _Toc240387672 \h </w:instrText>
+        <w:instrText xml:space="preserve"> PAGEREF _Toc240442823 \h </w:instrText>
       </w:r>
       <w:r>
         <w:rPr>
@@ -1205,7 +1205,7 @@
         <w:rPr>
           <w:noProof/>
         </w:rPr>
-        <w:instrText xml:space="preserve"> PAGEREF _Toc240387673 \h </w:instrText>
+        <w:instrText xml:space="preserve"> PAGEREF _Toc240442824 \h </w:instrText>
       </w:r>
       <w:r>
         <w:rPr>
@@ -1266,7 +1266,7 @@
         <w:rPr>
           <w:noProof/>
         </w:rPr>
-        <w:instrText xml:space="preserve"> PAGEREF _Toc240387674 \h </w:instrText>
+        <w:instrText xml:space="preserve"> PAGEREF _Toc240442825 \h </w:instrText>
       </w:r>
       <w:r>
         <w:rPr>
@@ -1327,7 +1327,7 @@
         <w:rPr>
           <w:noProof/>
         </w:rPr>
-        <w:instrText xml:space="preserve"> PAGEREF _Toc240387675 \h </w:instrText>
+        <w:instrText xml:space="preserve"> PAGEREF _Toc240442826 \h </w:instrText>
       </w:r>
       <w:r>
         <w:rPr>
@@ -1388,7 +1388,7 @@
         <w:rPr>
           <w:noProof/>
         </w:rPr>
-        <w:instrText xml:space="preserve"> PAGEREF _Toc240387676 \h </w:instrText>
+        <w:instrText xml:space="preserve"> PAGEREF _Toc240442827 \h </w:instrText>
       </w:r>
       <w:r>
         <w:rPr>
@@ -1449,7 +1449,7 @@
         <w:rPr>
           <w:noProof/>
         </w:rPr>
-        <w:instrText xml:space="preserve"> PAGEREF _Toc240387677 \h </w:instrText>
+        <w:instrText xml:space="preserve"> PAGEREF _Toc240442828 \h </w:instrText>
       </w:r>
       <w:r>
         <w:rPr>
@@ -1510,7 +1510,7 @@
         <w:rPr>
           <w:noProof/>
         </w:rPr>
-        <w:instrText xml:space="preserve"> PAGEREF _Toc240387678 \h </w:instrText>
+        <w:instrText xml:space="preserve"> PAGEREF _Toc240442829 \h </w:instrText>
       </w:r>
       <w:r>
         <w:rPr>
@@ -1571,7 +1571,7 @@
         <w:rPr>
           <w:noProof/>
         </w:rPr>
-        <w:instrText xml:space="preserve"> PAGEREF _Toc240387679 \h </w:instrText>
+        <w:instrText xml:space="preserve"> PAGEREF _Toc240442830 \h </w:instrText>
       </w:r>
       <w:r>
         <w:rPr>
@@ -1632,7 +1632,7 @@
         <w:rPr>
           <w:noProof/>
         </w:rPr>
-        <w:instrText xml:space="preserve"> PAGEREF _Toc240387680 \h </w:instrText>
+        <w:instrText xml:space="preserve"> PAGEREF _Toc240442831 \h </w:instrText>
       </w:r>
       <w:r>
         <w:rPr>
@@ -1693,7 +1693,7 @@
         <w:rPr>
           <w:noProof/>
         </w:rPr>
-        <w:instrText xml:space="preserve"> PAGEREF _Toc240387681 \h </w:instrText>
+        <w:instrText xml:space="preserve"> PAGEREF _Toc240442832 \h </w:instrText>
       </w:r>
       <w:r>
         <w:rPr>
@@ -1754,7 +1754,7 @@
         <w:rPr>
           <w:noProof/>
         </w:rPr>
-        <w:instrText xml:space="preserve"> PAGEREF _Toc240387682 \h </w:instrText>
+        <w:instrText xml:space="preserve"> PAGEREF _Toc240442833 \h </w:instrText>
       </w:r>
       <w:r>
         <w:rPr>
@@ -1816,7 +1816,7 @@
         <w:rPr>
           <w:noProof/>
         </w:rPr>
-        <w:instrText xml:space="preserve"> PAGEREF _Toc240387683 \h </w:instrText>
+        <w:instrText xml:space="preserve"> PAGEREF _Toc240442834 \h </w:instrText>
       </w:r>
       <w:r>
         <w:rPr>
@@ -1877,7 +1877,7 @@
         <w:rPr>
           <w:noProof/>
         </w:rPr>
-        <w:instrText xml:space="preserve"> PAGEREF _Toc240387684 \h </w:instrText>
+        <w:instrText xml:space="preserve"> PAGEREF _Toc240442835 \h </w:instrText>
       </w:r>
       <w:r>
         <w:rPr>
@@ -1938,7 +1938,7 @@
         <w:rPr>
           <w:noProof/>
         </w:rPr>
-        <w:instrText xml:space="preserve"> PAGEREF _Toc240387685 \h </w:instrText>
+        <w:instrText xml:space="preserve"> PAGEREF _Toc240442836 \h </w:instrText>
       </w:r>
       <w:r>
         <w:rPr>
@@ -1999,7 +1999,7 @@
         <w:rPr>
           <w:noProof/>
         </w:rPr>
-        <w:instrText xml:space="preserve"> PAGEREF _Toc240387686 \h </w:instrText>
+        <w:instrText xml:space="preserve"> PAGEREF _Toc240442837 \h </w:instrText>
       </w:r>
       <w:r>
         <w:rPr>
@@ -2060,7 +2060,7 @@
         <w:rPr>
           <w:noProof/>
         </w:rPr>
-        <w:instrText xml:space="preserve"> PAGEREF _Toc240387687 \h </w:instrText>
+        <w:instrText xml:space="preserve"> PAGEREF _Toc240442838 \h </w:instrText>
       </w:r>
       <w:r>
         <w:rPr>
@@ -2121,7 +2121,7 @@
         <w:rPr>
           <w:noProof/>
         </w:rPr>
-        <w:instrText xml:space="preserve"> PAGEREF _Toc240387688 \h </w:instrText>
+        <w:instrText xml:space="preserve"> PAGEREF _Toc240442839 \h </w:instrText>
       </w:r>
       <w:r>
         <w:rPr>
@@ -2182,7 +2182,7 @@
         <w:rPr>
           <w:noProof/>
         </w:rPr>
-        <w:instrText xml:space="preserve"> PAGEREF _Toc240387689 \h </w:instrText>
+        <w:instrText xml:space="preserve"> PAGEREF _Toc240442840 \h </w:instrText>
       </w:r>
       <w:r>
         <w:rPr>
@@ -2243,7 +2243,7 @@
         <w:rPr>
           <w:noProof/>
         </w:rPr>
-        <w:instrText xml:space="preserve"> PAGEREF _Toc240387690 \h </w:instrText>
+        <w:instrText xml:space="preserve"> PAGEREF _Toc240442841 \h </w:instrText>
       </w:r>
       <w:r>
         <w:rPr>
@@ -2304,7 +2304,7 @@
         <w:rPr>
           <w:noProof/>
         </w:rPr>
-        <w:instrText xml:space="preserve"> PAGEREF _Toc240387691 \h </w:instrText>
+        <w:instrText xml:space="preserve"> PAGEREF _Toc240442842 \h </w:instrText>
       </w:r>
       <w:r>
         <w:rPr>
@@ -2365,7 +2365,7 @@
         <w:rPr>
           <w:noProof/>
         </w:rPr>
-        <w:instrText xml:space="preserve"> PAGEREF _Toc240387692 \h </w:instrText>
+        <w:instrText xml:space="preserve"> PAGEREF _Toc240442843 \h </w:instrText>
       </w:r>
       <w:r>
         <w:rPr>
@@ -2426,7 +2426,7 @@
         <w:rPr>
           <w:noProof/>
         </w:rPr>
-        <w:instrText xml:space="preserve"> PAGEREF _Toc240387693 \h </w:instrText>
+        <w:instrText xml:space="preserve"> PAGEREF _Toc240442844 \h </w:instrText>
       </w:r>
       <w:r>
         <w:rPr>
@@ -2487,7 +2487,7 @@
         <w:rPr>
           <w:noProof/>
         </w:rPr>
-        <w:instrText xml:space="preserve"> PAGEREF _Toc240387694 \h </w:instrText>
+        <w:instrText xml:space="preserve"> PAGEREF _Toc240442845 \h </w:instrText>
       </w:r>
       <w:r>
         <w:rPr>
@@ -2548,7 +2548,7 @@
         <w:rPr>
           <w:noProof/>
         </w:rPr>
-        <w:instrText xml:space="preserve"> PAGEREF _Toc240387695 \h </w:instrText>
+        <w:instrText xml:space="preserve"> PAGEREF _Toc240442846 \h </w:instrText>
       </w:r>
       <w:r>
         <w:rPr>
@@ -2609,7 +2609,7 @@
         <w:rPr>
           <w:noProof/>
         </w:rPr>
-        <w:instrText xml:space="preserve"> PAGEREF _Toc240387696 \h </w:instrText>
+        <w:instrText xml:space="preserve"> PAGEREF _Toc240442847 \h </w:instrText>
       </w:r>
       <w:r>
         <w:rPr>
@@ -2670,7 +2670,7 @@
         <w:rPr>
           <w:noProof/>
         </w:rPr>
-        <w:instrText xml:space="preserve"> PAGEREF _Toc240387697 \h </w:instrText>
+        <w:instrText xml:space="preserve"> PAGEREF _Toc240442848 \h </w:instrText>
       </w:r>
       <w:r>
         <w:rPr>
@@ -2731,7 +2731,7 @@
         <w:rPr>
           <w:noProof/>
         </w:rPr>
-        <w:instrText xml:space="preserve"> PAGEREF _Toc240387698 \h </w:instrText>
+        <w:instrText xml:space="preserve"> PAGEREF _Toc240442849 \h </w:instrText>
       </w:r>
       <w:r>
         <w:rPr>
@@ -2792,7 +2792,7 @@
         <w:rPr>
           <w:noProof/>
         </w:rPr>
-        <w:instrText xml:space="preserve"> PAGEREF _Toc240387699 \h </w:instrText>
+        <w:instrText xml:space="preserve"> PAGEREF _Toc240442850 \h </w:instrText>
       </w:r>
       <w:r>
         <w:rPr>
@@ -2853,7 +2853,7 @@
         <w:rPr>
           <w:noProof/>
         </w:rPr>
-        <w:instrText xml:space="preserve"> PAGEREF _Toc240387700 \h </w:instrText>
+        <w:instrText xml:space="preserve"> PAGEREF _Toc240442851 \h </w:instrText>
       </w:r>
       <w:r>
         <w:rPr>
@@ -2914,7 +2914,7 @@
         <w:rPr>
           <w:noProof/>
         </w:rPr>
-        <w:instrText xml:space="preserve"> PAGEREF _Toc240387701 \h </w:instrText>
+        <w:instrText xml:space="preserve"> PAGEREF _Toc240442852 \h </w:instrText>
       </w:r>
       <w:r>
         <w:rPr>
@@ -2975,7 +2975,7 @@
         <w:rPr>
           <w:noProof/>
         </w:rPr>
-        <w:instrText xml:space="preserve"> PAGEREF _Toc240387702 \h </w:instrText>
+        <w:instrText xml:space="preserve"> PAGEREF _Toc240442853 \h </w:instrText>
       </w:r>
       <w:r>
         <w:rPr>
@@ -3036,7 +3036,7 @@
         <w:rPr>
           <w:noProof/>
         </w:rPr>
-        <w:instrText xml:space="preserve"> PAGEREF _Toc240387703 \h </w:instrText>
+        <w:instrText xml:space="preserve"> PAGEREF _Toc240442854 \h </w:instrText>
       </w:r>
       <w:r>
         <w:rPr>
@@ -3097,7 +3097,7 @@
         <w:rPr>
           <w:noProof/>
         </w:rPr>
-        <w:instrText xml:space="preserve"> PAGEREF _Toc240387704 \h </w:instrText>
+        <w:instrText xml:space="preserve"> PAGEREF _Toc240442855 \h </w:instrText>
       </w:r>
       <w:r>
         <w:rPr>
@@ -3158,7 +3158,7 @@
         <w:rPr>
           <w:noProof/>
         </w:rPr>
-        <w:instrText xml:space="preserve"> PAGEREF _Toc240387705 \h </w:instrText>
+        <w:instrText xml:space="preserve"> PAGEREF _Toc240442856 \h </w:instrText>
       </w:r>
       <w:r>
         <w:rPr>
@@ -3201,7 +3201,7 @@
           <w:noProof/>
           <w:color w:val="B91D2E"/>
         </w:rPr>
-        <w:t>6.5 Ambiente de Treino</w:t>
+        <w:t>6.4.5 Gestao de Atividades</w:t>
       </w:r>
       <w:r>
         <w:rPr>
@@ -3219,7 +3219,7 @@
         <w:rPr>
           <w:noProof/>
         </w:rPr>
-        <w:instrText xml:space="preserve"> PAGEREF _Toc240387706 \h </w:instrText>
+        <w:instrText xml:space="preserve"> PAGEREF _Toc240442857 \h </w:instrText>
       </w:r>
       <w:r>
         <w:rPr>
@@ -3262,7 +3262,7 @@
           <w:noProof/>
           <w:color w:val="B91D2E"/>
         </w:rPr>
-        <w:t>6.6 Backup automatizado</w:t>
+        <w:t>6.5 Ambiente de Treino</w:t>
       </w:r>
       <w:r>
         <w:rPr>
@@ -3280,7 +3280,7 @@
         <w:rPr>
           <w:noProof/>
         </w:rPr>
-        <w:instrText xml:space="preserve"> PAGEREF _Toc240387707 \h </w:instrText>
+        <w:instrText xml:space="preserve"> PAGEREF _Toc240442858 \h </w:instrText>
       </w:r>
       <w:r>
         <w:rPr>
@@ -3297,7 +3297,7 @@
         <w:rPr>
           <w:noProof/>
         </w:rPr>
-        <w:t>100</w:t>
+        <w:t>102</w:t>
       </w:r>
       <w:r>
         <w:rPr>
@@ -3323,6 +3323,67 @@
           <w:noProof/>
           <w:color w:val="B91D2E"/>
         </w:rPr>
+        <w:t>6.6 Backup automatizado</w:t>
+      </w:r>
+      <w:r>
+        <w:rPr>
+          <w:noProof/>
+        </w:rPr>
+        <w:tab/>
+      </w:r>
+      <w:r>
+        <w:rPr>
+          <w:noProof/>
+        </w:rPr>
+        <w:fldChar w:fldCharType="begin"/>
+      </w:r>
+      <w:r>
+        <w:rPr>
+          <w:noProof/>
+        </w:rPr>
+        <w:instrText xml:space="preserve"> PAGEREF _Toc240442859 \h </w:instrText>
+      </w:r>
+      <w:r>
+        <w:rPr>
+          <w:noProof/>
+        </w:rPr>
+      </w:r>
+      <w:r>
+        <w:rPr>
+          <w:noProof/>
+        </w:rPr>
+        <w:fldChar w:fldCharType="separate"/>
+      </w:r>
+      <w:r>
+        <w:rPr>
+          <w:noProof/>
+        </w:rPr>
+        <w:t>102</w:t>
+      </w:r>
+      <w:r>
+        <w:rPr>
+          <w:noProof/>
+        </w:rPr>
+        <w:fldChar w:fldCharType="end"/>
+      </w:r>
+    </w:p>
+    <w:p>
+      <w:pPr>
+        <w:pStyle w:val="Sumrio2"/>
+        <w:tabs>
+          <w:tab w:val="right" w:leader="dot" w:pos="8828"/>
+        </w:tabs>
+        <w:rPr>
+          <w:noProof/>
+        </w:rPr>
+      </w:pPr>
+      <w:r>
+        <w:rPr>
+          <w:rFonts w:ascii="Montserrat" w:hAnsi="Montserrat"/>
+          <w:b/>
+          <w:noProof/>
+          <w:color w:val="B91D2E"/>
+        </w:rPr>
         <w:t>6.7 Relatorio de Resultados</w:t>
       </w:r>
       <w:r>
@@ -3341,7 +3402,7 @@
         <w:rPr>
           <w:noProof/>
         </w:rPr>
-        <w:instrText xml:space="preserve"> PAGEREF _Toc240387708 \h </w:instrText>
+        <w:instrText xml:space="preserve"> PAGEREF _Toc240442860 \h </w:instrText>
       </w:r>
       <w:r>
         <w:rPr>
@@ -3358,7 +3419,7 @@
         <w:rPr>
           <w:noProof/>
         </w:rPr>
-        <w:t>102</w:t>
+        <w:t>104</w:t>
       </w:r>
       <w:r>
         <w:rPr>
@@ -3384,6 +3445,7 @@
           <w:noProof/>
           <w:color w:val="1A1A1A"/>
         </w:rPr>
+        <w:lastRenderedPageBreak/>
         <w:t>7. Perguntas frequentes</w:t>
       </w:r>
       <w:r>
@@ -3402,7 +3464,7 @@
         <w:rPr>
           <w:noProof/>
         </w:rPr>
-        <w:instrText xml:space="preserve"> PAGEREF _Toc240387709 \h </w:instrText>
+        <w:instrText xml:space="preserve"> PAGEREF _Toc240442861 \h </w:instrText>
       </w:r>
       <w:r>
         <w:rPr>
@@ -3419,7 +3481,7 @@
         <w:rPr>
           <w:noProof/>
         </w:rPr>
-        <w:t>105</w:t>
+        <w:t>107</w:t>
       </w:r>
       <w:r>
         <w:rPr>
@@ -3445,7 +3507,6 @@
           <w:noProof/>
           <w:color w:val="1A1A1A"/>
         </w:rPr>
-        <w:lastRenderedPageBreak/>
         <w:t>8. Anexo - Tabela de artefatos</w:t>
       </w:r>
       <w:r>
@@ -3464,7 +3525,7 @@
         <w:rPr>
           <w:noProof/>
         </w:rPr>
-        <w:instrText xml:space="preserve"> PAGEREF _Toc240387710 \h </w:instrText>
+        <w:instrText xml:space="preserve"> PAGEREF _Toc240442862 \h </w:instrText>
       </w:r>
       <w:r>
         <w:rPr>
@@ -3481,7 +3542,7 @@
         <w:rPr>
           <w:noProof/>
         </w:rPr>
-        <w:t>106</w:t>
+        <w:t>108</w:t>
       </w:r>
       <w:r>
         <w:rPr>
@@ -3540,7 +3601,7 @@
           <w:sz w:val="34"/>
         </w:rPr>
       </w:pPr>
-      <w:bookmarkStart w:id="0" w:name="_Toc240387657"/>
+      <w:bookmarkStart w:id="0" w:name="_Toc240442808"/>
       <w:r>
         <w:rPr>
           <w:rFonts w:ascii="Montserrat" w:hAnsi="Montserrat"/>
@@ -3564,7 +3625,7 @@
           <w:sz w:val="27"/>
         </w:rPr>
       </w:pPr>
-      <w:bookmarkStart w:id="1" w:name="_Toc240387658"/>
+      <w:bookmarkStart w:id="1" w:name="_Toc240442809"/>
       <w:r>
         <w:rPr>
           <w:rFonts w:ascii="Montserrat" w:hAnsi="Montserrat"/>
@@ -5203,6 +5264,24 @@
           <w:color w:val="1A1A1A"/>
           <w:sz w:val="22"/>
         </w:rPr>
+        <w:t>Esta e a versao 2.82 do manual. Em relacao a versao 2.81 (15/09/2026), foi adicionada a nova pagina Gestao de Atividades (secao 6.4.5) - uma 19a pagina em Gestao, com acesso configuravel por papel (padrao Admin), que agrega os mesmos itens do Meu Painel por conta responsavel, dando ao PMO uma visao da carga de trabalho de toda a equipe num cartao por pessoa, alem de um indicador dos itens em aberto ainda sem Responsavel (conta) atribuido. De passagem, foi corrigida uma lacuna encontrada na configuracao de acesso do Painel de Prazos (secao 6.4.2): a linha correspondente nunca tinha sido criada na tabela de configuracoes do sistema, entao o Admin nao conseguia de fato salvar pela tela quem mais podia ver aquela pagina, apesar dos campos aparecerem normalmente.</w:t>
+      </w:r>
+    </w:p>
+    <w:p>
+      <w:pPr>
+        <w:spacing w:line="280" w:lineRule="auto"/>
+        <w:rPr>
+          <w:rFonts w:ascii="Montserrat" w:hAnsi="Montserrat"/>
+          <w:color w:val="1A1A1A"/>
+          <w:sz w:val="22"/>
+        </w:rPr>
+      </w:pPr>
+      <w:r>
+        <w:rPr>
+          <w:rFonts w:ascii="Montserrat" w:hAnsi="Montserrat"/>
+          <w:color w:val="1A1A1A"/>
+          <w:sz w:val="22"/>
+        </w:rPr>
         <w:t>O manual nao substitui as Diretrizes para a Gestao de Projetos da UNIALFA (documento institucional que define o framework D01 a D07) nem o documento Regras de Acesso e Permissoes (que detalha cada regra de controle de acesso); ele e o guia operacional de como usar cada ferramenta na pratica.</w:t>
       </w:r>
     </w:p>
@@ -5217,7 +5296,7 @@
           <w:sz w:val="27"/>
         </w:rPr>
       </w:pPr>
-      <w:bookmarkStart w:id="2" w:name="_Toc240387659"/>
+      <w:bookmarkStart w:id="2" w:name="_Toc240442810"/>
       <w:r>
         <w:rPr>
           <w:rFonts w:ascii="Montserrat" w:hAnsi="Montserrat"/>
@@ -5382,6 +5461,7 @@
           <w:color w:val="1A1A1A"/>
           <w:sz w:val="22"/>
         </w:rPr>
+        <w:lastRenderedPageBreak/>
         <w:t>Cada formulario de registro tem duas partes: uma tela de preenchimento (+Novo...) e uma tela de consulta (...cadastrados), onde ficam listados todos os registros ja salvos, com opcao de abrir, editar o status ou excluir cada um.</w:t>
       </w:r>
     </w:p>
@@ -5412,18 +5492,17 @@
         <w:rPr>
           <w:noProof/>
         </w:rPr>
-        <w:lastRenderedPageBreak/>
         <w:drawing>
-          <wp:inline distT="0" distB="0" distL="0" distR="0" wp14:anchorId="0EDBF7C4" wp14:editId="26F1904D">
+          <wp:inline distT="0" distB="0" distL="0" distR="0" wp14:anchorId="2A31CA42" wp14:editId="03865799">
             <wp:extent cx="5303520" cy="4792851"/>
             <wp:effectExtent l="19050" t="19050" r="11430" b="27305"/>
-            <wp:docPr id="1764911317" name="Imagem 1"/>
+            <wp:docPr id="1668904310" name="Imagem 1"/>
             <wp:cNvGraphicFramePr/>
             <a:graphic xmlns:a="http://schemas.openxmlformats.org/drawingml/2006/main">
               <a:graphicData uri="http://schemas.openxmlformats.org/drawingml/2006/picture">
                 <pic:pic xmlns:pic="http://schemas.openxmlformats.org/drawingml/2006/picture">
                   <pic:nvPicPr>
-                    <pic:cNvPr id="1764911317" name=""/>
+                    <pic:cNvPr id="1668904310" name=""/>
                     <pic:cNvPicPr/>
                   </pic:nvPicPr>
                   <pic:blipFill>
@@ -5491,7 +5570,7 @@
           <w:sz w:val="27"/>
         </w:rPr>
       </w:pPr>
-      <w:bookmarkStart w:id="3" w:name="_Toc240387660"/>
+      <w:bookmarkStart w:id="3" w:name="_Toc240442811"/>
       <w:r>
         <w:rPr>
           <w:rFonts w:ascii="Montserrat" w:hAnsi="Montserrat"/>
@@ -5532,16 +5611,16 @@
         </w:rPr>
         <w:lastRenderedPageBreak/>
         <w:drawing>
-          <wp:inline distT="0" distB="0" distL="0" distR="0" wp14:anchorId="6120EE8D" wp14:editId="4BBB2D16">
+          <wp:inline distT="0" distB="0" distL="0" distR="0" wp14:anchorId="1C83CEC4" wp14:editId="077B13F1">
             <wp:extent cx="4206240" cy="3801227"/>
             <wp:effectExtent l="19050" t="19050" r="22860" b="27940"/>
-            <wp:docPr id="1630921827" name="Imagem 2"/>
+            <wp:docPr id="915964929" name="Imagem 2"/>
             <wp:cNvGraphicFramePr/>
             <a:graphic xmlns:a="http://schemas.openxmlformats.org/drawingml/2006/main">
               <a:graphicData uri="http://schemas.openxmlformats.org/drawingml/2006/picture">
                 <pic:pic xmlns:pic="http://schemas.openxmlformats.org/drawingml/2006/picture">
                   <pic:nvPicPr>
-                    <pic:cNvPr id="1630921827" name=""/>
+                    <pic:cNvPr id="915964929" name=""/>
                     <pic:cNvPicPr/>
                   </pic:nvPicPr>
                   <pic:blipFill>
@@ -5714,7 +5793,7 @@
           <w:sz w:val="27"/>
         </w:rPr>
       </w:pPr>
-      <w:bookmarkStart w:id="4" w:name="_Toc240387661"/>
+      <w:bookmarkStart w:id="4" w:name="_Toc240442812"/>
       <w:r>
         <w:rPr>
           <w:rFonts w:ascii="Montserrat" w:hAnsi="Montserrat"/>
@@ -6953,7 +7032,7 @@
           <w:sz w:val="34"/>
         </w:rPr>
       </w:pPr>
-      <w:bookmarkStart w:id="5" w:name="_Toc240387662"/>
+      <w:bookmarkStart w:id="5" w:name="_Toc240442813"/>
       <w:r>
         <w:rPr>
           <w:rFonts w:ascii="Montserrat" w:hAnsi="Montserrat"/>
@@ -6977,7 +7056,7 @@
           <w:sz w:val="27"/>
         </w:rPr>
       </w:pPr>
-      <w:bookmarkStart w:id="6" w:name="_Toc240387663"/>
+      <w:bookmarkStart w:id="6" w:name="_Toc240442814"/>
       <w:r>
         <w:rPr>
           <w:rFonts w:ascii="Montserrat" w:hAnsi="Montserrat"/>
@@ -7018,7 +7097,7 @@
           <w:sz w:val="27"/>
         </w:rPr>
       </w:pPr>
-      <w:bookmarkStart w:id="7" w:name="_Toc240387664"/>
+      <w:bookmarkStart w:id="7" w:name="_Toc240442815"/>
       <w:r>
         <w:rPr>
           <w:rFonts w:ascii="Montserrat" w:hAnsi="Montserrat"/>
@@ -7137,7 +7216,7 @@
           <w:sz w:val="27"/>
         </w:rPr>
       </w:pPr>
-      <w:bookmarkStart w:id="8" w:name="_Toc240387665"/>
+      <w:bookmarkStart w:id="8" w:name="_Toc240442816"/>
       <w:r>
         <w:rPr>
           <w:rFonts w:ascii="Montserrat" w:hAnsi="Montserrat"/>
@@ -7750,7 +7829,7 @@
           <w:sz w:val="27"/>
         </w:rPr>
       </w:pPr>
-      <w:bookmarkStart w:id="9" w:name="_Toc240387666"/>
+      <w:bookmarkStart w:id="9" w:name="_Toc240442817"/>
       <w:r>
         <w:rPr>
           <w:rFonts w:ascii="Montserrat" w:hAnsi="Montserrat"/>
@@ -7839,16 +7918,16 @@
         </w:rPr>
         <w:lastRenderedPageBreak/>
         <w:drawing>
-          <wp:inline distT="0" distB="0" distL="0" distR="0" wp14:anchorId="17842789" wp14:editId="53389994">
+          <wp:inline distT="0" distB="0" distL="0" distR="0" wp14:anchorId="5E865C46" wp14:editId="37918336">
             <wp:extent cx="4937760" cy="4462310"/>
             <wp:effectExtent l="19050" t="19050" r="15240" b="14605"/>
-            <wp:docPr id="711975628" name="Imagem 3"/>
+            <wp:docPr id="1004804239" name="Imagem 3"/>
             <wp:cNvGraphicFramePr/>
             <a:graphic xmlns:a="http://schemas.openxmlformats.org/drawingml/2006/main">
               <a:graphicData uri="http://schemas.openxmlformats.org/drawingml/2006/picture">
                 <pic:pic xmlns:pic="http://schemas.openxmlformats.org/drawingml/2006/picture">
                   <pic:nvPicPr>
-                    <pic:cNvPr id="711975628" name=""/>
+                    <pic:cNvPr id="1004804239" name=""/>
                     <pic:cNvPicPr/>
                   </pic:nvPicPr>
                   <pic:blipFill>
@@ -7916,7 +7995,7 @@
           <w:sz w:val="27"/>
         </w:rPr>
       </w:pPr>
-      <w:bookmarkStart w:id="10" w:name="_Toc240387667"/>
+      <w:bookmarkStart w:id="10" w:name="_Toc240442818"/>
       <w:r>
         <w:rPr>
           <w:rFonts w:ascii="Montserrat" w:hAnsi="Montserrat"/>
@@ -7957,16 +8036,16 @@
         </w:rPr>
         <w:lastRenderedPageBreak/>
         <w:drawing>
-          <wp:inline distT="0" distB="0" distL="0" distR="0" wp14:anchorId="6AB873B8" wp14:editId="27523910">
+          <wp:inline distT="0" distB="0" distL="0" distR="0" wp14:anchorId="5F5BC7A4" wp14:editId="48D182EA">
             <wp:extent cx="5120640" cy="4627581"/>
             <wp:effectExtent l="19050" t="19050" r="22860" b="20955"/>
-            <wp:docPr id="1672936135" name="Imagem 4"/>
+            <wp:docPr id="1592350065" name="Imagem 4"/>
             <wp:cNvGraphicFramePr/>
             <a:graphic xmlns:a="http://schemas.openxmlformats.org/drawingml/2006/main">
               <a:graphicData uri="http://schemas.openxmlformats.org/drawingml/2006/picture">
                 <pic:pic xmlns:pic="http://schemas.openxmlformats.org/drawingml/2006/picture">
                   <pic:nvPicPr>
-                    <pic:cNvPr id="1672936135" name=""/>
+                    <pic:cNvPr id="1592350065" name=""/>
                     <pic:cNvPicPr/>
                   </pic:nvPicPr>
                   <pic:blipFill>
@@ -8149,7 +8228,7 @@
           <w:sz w:val="27"/>
         </w:rPr>
       </w:pPr>
-      <w:bookmarkStart w:id="11" w:name="_Toc240387668"/>
+      <w:bookmarkStart w:id="11" w:name="_Toc240442819"/>
       <w:r>
         <w:rPr>
           <w:rFonts w:ascii="Montserrat" w:hAnsi="Montserrat"/>
@@ -8189,16 +8268,16 @@
           <w:noProof/>
         </w:rPr>
         <w:drawing>
-          <wp:inline distT="0" distB="0" distL="0" distR="0" wp14:anchorId="64E572FB" wp14:editId="32F06764">
+          <wp:inline distT="0" distB="0" distL="0" distR="0" wp14:anchorId="17B35354" wp14:editId="54BA3B20">
             <wp:extent cx="4206240" cy="3801227"/>
             <wp:effectExtent l="19050" t="19050" r="22860" b="27940"/>
-            <wp:docPr id="501467038" name="Imagem 5"/>
+            <wp:docPr id="1085191628" name="Imagem 5"/>
             <wp:cNvGraphicFramePr/>
             <a:graphic xmlns:a="http://schemas.openxmlformats.org/drawingml/2006/main">
               <a:graphicData uri="http://schemas.openxmlformats.org/drawingml/2006/picture">
                 <pic:pic xmlns:pic="http://schemas.openxmlformats.org/drawingml/2006/picture">
                   <pic:nvPicPr>
-                    <pic:cNvPr id="501467038" name=""/>
+                    <pic:cNvPr id="1085191628" name=""/>
                     <pic:cNvPicPr/>
                   </pic:nvPicPr>
                   <pic:blipFill>
@@ -8266,16 +8345,16 @@
         </w:rPr>
         <w:lastRenderedPageBreak/>
         <w:drawing>
-          <wp:inline distT="0" distB="0" distL="0" distR="0" wp14:anchorId="7C411B2F" wp14:editId="16D98C84">
+          <wp:inline distT="0" distB="0" distL="0" distR="0" wp14:anchorId="136B8D3B" wp14:editId="0EC91F16">
             <wp:extent cx="4206240" cy="3801227"/>
             <wp:effectExtent l="19050" t="19050" r="22860" b="27940"/>
-            <wp:docPr id="1333039249" name="Imagem 6"/>
+            <wp:docPr id="1305792715" name="Imagem 6"/>
             <wp:cNvGraphicFramePr/>
             <a:graphic xmlns:a="http://schemas.openxmlformats.org/drawingml/2006/main">
               <a:graphicData uri="http://schemas.openxmlformats.org/drawingml/2006/picture">
                 <pic:pic xmlns:pic="http://schemas.openxmlformats.org/drawingml/2006/picture">
                   <pic:nvPicPr>
-                    <pic:cNvPr id="1333039249" name=""/>
+                    <pic:cNvPr id="1305792715" name=""/>
                     <pic:cNvPicPr/>
                   </pic:nvPicPr>
                   <pic:blipFill>
@@ -8391,7 +8470,7 @@
           <w:sz w:val="27"/>
         </w:rPr>
       </w:pPr>
-      <w:bookmarkStart w:id="12" w:name="_Toc240387669"/>
+      <w:bookmarkStart w:id="12" w:name="_Toc240442820"/>
       <w:r>
         <w:rPr>
           <w:rFonts w:ascii="Montserrat" w:hAnsi="Montserrat"/>
@@ -8459,7 +8538,7 @@
           <w:sz w:val="27"/>
         </w:rPr>
       </w:pPr>
-      <w:bookmarkStart w:id="13" w:name="_Toc240387670"/>
+      <w:bookmarkStart w:id="13" w:name="_Toc240442821"/>
       <w:r>
         <w:rPr>
           <w:rFonts w:ascii="Montserrat" w:hAnsi="Montserrat"/>
@@ -8642,8 +8721,18 @@
         </w:numPr>
         <w:spacing w:after="80" w:line="260" w:lineRule="auto"/>
         <w:ind w:left="700"/>
-      </w:pPr>
-      <w:r>
+        <w:rPr>
+          <w:rFonts w:ascii="Montserrat" w:hAnsi="Montserrat"/>
+          <w:color w:val="1A1A1A"/>
+          <w:sz w:val="22"/>
+        </w:rPr>
+      </w:pPr>
+      <w:r>
+        <w:rPr>
+          <w:rFonts w:ascii="Montserrat" w:hAnsi="Montserrat"/>
+          <w:color w:val="1A1A1A"/>
+          <w:sz w:val="22"/>
+        </w:rPr>
         <w:t>Gate 2 - Relatorio de Entregas: quando o status muda para Pactuado.</w:t>
       </w:r>
     </w:p>
@@ -8676,7 +8765,7 @@
           <w:sz w:val="27"/>
         </w:rPr>
       </w:pPr>
-      <w:bookmarkStart w:id="14" w:name="_Toc240387671"/>
+      <w:bookmarkStart w:id="14" w:name="_Toc240442822"/>
       <w:r>
         <w:rPr>
           <w:rFonts w:ascii="Montserrat" w:hAnsi="Montserrat"/>
@@ -8835,7 +8924,7 @@
           <w:sz w:val="27"/>
         </w:rPr>
       </w:pPr>
-      <w:bookmarkStart w:id="15" w:name="_Toc240387672"/>
+      <w:bookmarkStart w:id="15" w:name="_Toc240442823"/>
       <w:r>
         <w:rPr>
           <w:rFonts w:ascii="Montserrat" w:hAnsi="Montserrat"/>
@@ -9027,7 +9116,7 @@
           <w:sz w:val="27"/>
         </w:rPr>
       </w:pPr>
-      <w:bookmarkStart w:id="16" w:name="_Toc240387673"/>
+      <w:bookmarkStart w:id="16" w:name="_Toc240442824"/>
       <w:r>
         <w:rPr>
           <w:rFonts w:ascii="Montserrat" w:hAnsi="Montserrat"/>
@@ -9155,7 +9244,7 @@
           <w:sz w:val="27"/>
         </w:rPr>
       </w:pPr>
-      <w:bookmarkStart w:id="17" w:name="_Toc240387674"/>
+      <w:bookmarkStart w:id="17" w:name="_Toc240442825"/>
       <w:r>
         <w:rPr>
           <w:rFonts w:ascii="Montserrat" w:hAnsi="Montserrat"/>
@@ -9485,7 +9574,7 @@
           <w:sz w:val="27"/>
         </w:rPr>
       </w:pPr>
-      <w:bookmarkStart w:id="18" w:name="_Toc240387675"/>
+      <w:bookmarkStart w:id="18" w:name="_Toc240442826"/>
       <w:r>
         <w:rPr>
           <w:rFonts w:ascii="Montserrat" w:hAnsi="Montserrat"/>
@@ -9622,7 +9711,7 @@
           <w:sz w:val="27"/>
         </w:rPr>
       </w:pPr>
-      <w:bookmarkStart w:id="19" w:name="_Toc240387676"/>
+      <w:bookmarkStart w:id="19" w:name="_Toc240442827"/>
       <w:r>
         <w:rPr>
           <w:rFonts w:ascii="Montserrat" w:hAnsi="Montserrat"/>
@@ -9901,7 +9990,7 @@
           <w:sz w:val="27"/>
         </w:rPr>
       </w:pPr>
-      <w:bookmarkStart w:id="20" w:name="_Toc240387677"/>
+      <w:bookmarkStart w:id="20" w:name="_Toc240442828"/>
       <w:r>
         <w:rPr>
           <w:rFonts w:ascii="Montserrat" w:hAnsi="Montserrat"/>
@@ -10078,7 +10167,7 @@
           <w:sz w:val="27"/>
         </w:rPr>
       </w:pPr>
-      <w:bookmarkStart w:id="21" w:name="_Toc240387678"/>
+      <w:bookmarkStart w:id="21" w:name="_Toc240442829"/>
       <w:r>
         <w:rPr>
           <w:rFonts w:ascii="Montserrat" w:hAnsi="Montserrat"/>
@@ -10192,7 +10281,7 @@
           <w:sz w:val="34"/>
         </w:rPr>
       </w:pPr>
-      <w:bookmarkStart w:id="22" w:name="_Toc240387679"/>
+      <w:bookmarkStart w:id="22" w:name="_Toc240442830"/>
       <w:r>
         <w:rPr>
           <w:rFonts w:ascii="Montserrat" w:hAnsi="Montserrat"/>
@@ -10234,7 +10323,7 @@
           <w:sz w:val="27"/>
         </w:rPr>
       </w:pPr>
-      <w:bookmarkStart w:id="23" w:name="_Toc240387680"/>
+      <w:bookmarkStart w:id="23" w:name="_Toc240442831"/>
       <w:r>
         <w:rPr>
           <w:rFonts w:ascii="Montserrat" w:hAnsi="Montserrat"/>
@@ -11314,16 +11403,16 @@
         </w:rPr>
         <w:lastRenderedPageBreak/>
         <w:drawing>
-          <wp:inline distT="0" distB="0" distL="0" distR="0" wp14:anchorId="05EF330D" wp14:editId="58A9040B">
+          <wp:inline distT="0" distB="0" distL="0" distR="0" wp14:anchorId="155059E7" wp14:editId="431965D2">
             <wp:extent cx="5120640" cy="4627581"/>
             <wp:effectExtent l="19050" t="19050" r="22860" b="20955"/>
-            <wp:docPr id="709998717" name="Imagem 7"/>
+            <wp:docPr id="999920178" name="Imagem 7"/>
             <wp:cNvGraphicFramePr/>
             <a:graphic xmlns:a="http://schemas.openxmlformats.org/drawingml/2006/main">
               <a:graphicData uri="http://schemas.openxmlformats.org/drawingml/2006/picture">
                 <pic:pic xmlns:pic="http://schemas.openxmlformats.org/drawingml/2006/picture">
                   <pic:nvPicPr>
-                    <pic:cNvPr id="709998717" name=""/>
+                    <pic:cNvPr id="999920178" name=""/>
                     <pic:cNvPicPr/>
                   </pic:nvPicPr>
                   <pic:blipFill>
@@ -11391,16 +11480,16 @@
         </w:rPr>
         <w:lastRenderedPageBreak/>
         <w:drawing>
-          <wp:inline distT="0" distB="0" distL="0" distR="0" wp14:anchorId="3B060132" wp14:editId="5025911B">
+          <wp:inline distT="0" distB="0" distL="0" distR="0" wp14:anchorId="62DA6B2F" wp14:editId="453DD564">
             <wp:extent cx="5120640" cy="4627581"/>
             <wp:effectExtent l="19050" t="19050" r="22860" b="20955"/>
-            <wp:docPr id="716146765" name="Imagem 8"/>
+            <wp:docPr id="1338051542" name="Imagem 8"/>
             <wp:cNvGraphicFramePr/>
             <a:graphic xmlns:a="http://schemas.openxmlformats.org/drawingml/2006/main">
               <a:graphicData uri="http://schemas.openxmlformats.org/drawingml/2006/picture">
                 <pic:pic xmlns:pic="http://schemas.openxmlformats.org/drawingml/2006/picture">
                   <pic:nvPicPr>
-                    <pic:cNvPr id="716146765" name=""/>
+                    <pic:cNvPr id="1338051542" name=""/>
                     <pic:cNvPicPr/>
                   </pic:nvPicPr>
                   <pic:blipFill>
@@ -11608,7 +11697,7 @@
           <w:sz w:val="27"/>
         </w:rPr>
       </w:pPr>
-      <w:bookmarkStart w:id="24" w:name="_Toc240387681"/>
+      <w:bookmarkStart w:id="24" w:name="_Toc240442832"/>
       <w:r>
         <w:rPr>
           <w:rFonts w:ascii="Montserrat" w:hAnsi="Montserrat"/>
@@ -12533,16 +12622,16 @@
           <w:noProof/>
         </w:rPr>
         <w:drawing>
-          <wp:inline distT="0" distB="0" distL="0" distR="0" wp14:anchorId="709C476D" wp14:editId="01AEF7AA">
+          <wp:inline distT="0" distB="0" distL="0" distR="0" wp14:anchorId="42F2E432" wp14:editId="2E31CE43">
             <wp:extent cx="5120640" cy="4627581"/>
             <wp:effectExtent l="19050" t="19050" r="22860" b="20955"/>
-            <wp:docPr id="1490930626" name="Imagem 9"/>
+            <wp:docPr id="2117757023" name="Imagem 9"/>
             <wp:cNvGraphicFramePr/>
             <a:graphic xmlns:a="http://schemas.openxmlformats.org/drawingml/2006/main">
               <a:graphicData uri="http://schemas.openxmlformats.org/drawingml/2006/picture">
                 <pic:pic xmlns:pic="http://schemas.openxmlformats.org/drawingml/2006/picture">
                   <pic:nvPicPr>
-                    <pic:cNvPr id="1490930626" name=""/>
+                    <pic:cNvPr id="2117757023" name=""/>
                     <pic:cNvPicPr/>
                   </pic:nvPicPr>
                   <pic:blipFill>
@@ -12610,16 +12699,16 @@
         </w:rPr>
         <w:lastRenderedPageBreak/>
         <w:drawing>
-          <wp:inline distT="0" distB="0" distL="0" distR="0" wp14:anchorId="3CBF6816" wp14:editId="4B81A3E2">
+          <wp:inline distT="0" distB="0" distL="0" distR="0" wp14:anchorId="6C38B52C" wp14:editId="7C89D7B6">
             <wp:extent cx="5120640" cy="4627581"/>
             <wp:effectExtent l="19050" t="19050" r="22860" b="20955"/>
-            <wp:docPr id="1345013552" name="Imagem 10"/>
+            <wp:docPr id="372251232" name="Imagem 10"/>
             <wp:cNvGraphicFramePr/>
             <a:graphic xmlns:a="http://schemas.openxmlformats.org/drawingml/2006/main">
               <a:graphicData uri="http://schemas.openxmlformats.org/drawingml/2006/picture">
                 <pic:pic xmlns:pic="http://schemas.openxmlformats.org/drawingml/2006/picture">
                   <pic:nvPicPr>
-                    <pic:cNvPr id="1345013552" name=""/>
+                    <pic:cNvPr id="372251232" name=""/>
                     <pic:cNvPicPr/>
                   </pic:nvPicPr>
                   <pic:blipFill>
@@ -12753,7 +12842,7 @@
           <w:sz w:val="27"/>
         </w:rPr>
       </w:pPr>
-      <w:bookmarkStart w:id="25" w:name="_Toc240387682"/>
+      <w:bookmarkStart w:id="25" w:name="_Toc240442833"/>
       <w:r>
         <w:rPr>
           <w:rFonts w:ascii="Montserrat" w:hAnsi="Montserrat"/>
@@ -13838,16 +13927,16 @@
         </w:rPr>
         <w:lastRenderedPageBreak/>
         <w:drawing>
-          <wp:inline distT="0" distB="0" distL="0" distR="0" wp14:anchorId="7E334FB9" wp14:editId="200ACE1A">
+          <wp:inline distT="0" distB="0" distL="0" distR="0" wp14:anchorId="669F5628" wp14:editId="6E718F46">
             <wp:extent cx="5120640" cy="3338440"/>
             <wp:effectExtent l="19050" t="19050" r="22860" b="14605"/>
-            <wp:docPr id="1216786208" name="Imagem 11"/>
+            <wp:docPr id="1859996490" name="Imagem 11"/>
             <wp:cNvGraphicFramePr/>
             <a:graphic xmlns:a="http://schemas.openxmlformats.org/drawingml/2006/main">
               <a:graphicData uri="http://schemas.openxmlformats.org/drawingml/2006/picture">
                 <pic:pic xmlns:pic="http://schemas.openxmlformats.org/drawingml/2006/picture">
                   <pic:nvPicPr>
-                    <pic:cNvPr id="1216786208" name=""/>
+                    <pic:cNvPr id="1859996490" name=""/>
                     <pic:cNvPicPr/>
                   </pic:nvPicPr>
                   <pic:blipFill>
@@ -13915,16 +14004,16 @@
         </w:rPr>
         <w:lastRenderedPageBreak/>
         <w:drawing>
-          <wp:inline distT="0" distB="0" distL="0" distR="0" wp14:anchorId="30EA4676" wp14:editId="43ECEC85">
+          <wp:inline distT="0" distB="0" distL="0" distR="0" wp14:anchorId="664A701A" wp14:editId="7DF621FE">
             <wp:extent cx="5120640" cy="4627581"/>
             <wp:effectExtent l="19050" t="19050" r="22860" b="20955"/>
-            <wp:docPr id="1398916465" name="Imagem 12"/>
+            <wp:docPr id="457432858" name="Imagem 12"/>
             <wp:cNvGraphicFramePr/>
             <a:graphic xmlns:a="http://schemas.openxmlformats.org/drawingml/2006/main">
               <a:graphicData uri="http://schemas.openxmlformats.org/drawingml/2006/picture">
                 <pic:pic xmlns:pic="http://schemas.openxmlformats.org/drawingml/2006/picture">
                   <pic:nvPicPr>
-                    <pic:cNvPr id="1398916465" name=""/>
+                    <pic:cNvPr id="457432858" name=""/>
                     <pic:cNvPicPr/>
                   </pic:nvPicPr>
                   <pic:blipFill>
@@ -14128,7 +14217,7 @@
           <w:sz w:val="27"/>
         </w:rPr>
       </w:pPr>
-      <w:bookmarkStart w:id="26" w:name="_Toc240387683"/>
+      <w:bookmarkStart w:id="26" w:name="_Toc240442834"/>
       <w:r>
         <w:rPr>
           <w:rFonts w:ascii="Montserrat" w:hAnsi="Montserrat"/>
@@ -14689,16 +14778,16 @@
           <w:noProof/>
         </w:rPr>
         <w:drawing>
-          <wp:inline distT="0" distB="0" distL="0" distR="0" wp14:anchorId="366AF798" wp14:editId="38D6B88D">
+          <wp:inline distT="0" distB="0" distL="0" distR="0" wp14:anchorId="199892E5" wp14:editId="5FC841FA">
             <wp:extent cx="5120640" cy="4627581"/>
             <wp:effectExtent l="19050" t="19050" r="22860" b="20955"/>
-            <wp:docPr id="969621970" name="Imagem 13"/>
+            <wp:docPr id="1162674384" name="Imagem 13"/>
             <wp:cNvGraphicFramePr/>
             <a:graphic xmlns:a="http://schemas.openxmlformats.org/drawingml/2006/main">
               <a:graphicData uri="http://schemas.openxmlformats.org/drawingml/2006/picture">
                 <pic:pic xmlns:pic="http://schemas.openxmlformats.org/drawingml/2006/picture">
                   <pic:nvPicPr>
-                    <pic:cNvPr id="969621970" name=""/>
+                    <pic:cNvPr id="1162674384" name=""/>
                     <pic:cNvPicPr/>
                   </pic:nvPicPr>
                   <pic:blipFill>
@@ -14766,16 +14855,16 @@
         </w:rPr>
         <w:lastRenderedPageBreak/>
         <w:drawing>
-          <wp:inline distT="0" distB="0" distL="0" distR="0" wp14:anchorId="28CACC7A" wp14:editId="3B80C32C">
+          <wp:inline distT="0" distB="0" distL="0" distR="0" wp14:anchorId="556C38D7" wp14:editId="29DE65C6">
             <wp:extent cx="5120640" cy="4627581"/>
             <wp:effectExtent l="19050" t="19050" r="22860" b="20955"/>
-            <wp:docPr id="330620166" name="Imagem 14"/>
+            <wp:docPr id="158468095" name="Imagem 14"/>
             <wp:cNvGraphicFramePr/>
             <a:graphic xmlns:a="http://schemas.openxmlformats.org/drawingml/2006/main">
               <a:graphicData uri="http://schemas.openxmlformats.org/drawingml/2006/picture">
                 <pic:pic xmlns:pic="http://schemas.openxmlformats.org/drawingml/2006/picture">
                   <pic:nvPicPr>
-                    <pic:cNvPr id="330620166" name=""/>
+                    <pic:cNvPr id="158468095" name=""/>
                     <pic:cNvPicPr/>
                   </pic:nvPicPr>
                   <pic:blipFill>
@@ -15071,7 +15160,7 @@
           <w:sz w:val="27"/>
         </w:rPr>
       </w:pPr>
-      <w:bookmarkStart w:id="27" w:name="_Toc240387684"/>
+      <w:bookmarkStart w:id="27" w:name="_Toc240442835"/>
       <w:r>
         <w:rPr>
           <w:rFonts w:ascii="Montserrat" w:hAnsi="Montserrat"/>
@@ -15112,16 +15201,16 @@
         </w:rPr>
         <w:lastRenderedPageBreak/>
         <w:drawing>
-          <wp:inline distT="0" distB="0" distL="0" distR="0" wp14:anchorId="245C7560" wp14:editId="20938DEF">
+          <wp:inline distT="0" distB="0" distL="0" distR="0" wp14:anchorId="3B87DEBA" wp14:editId="4E7699AD">
             <wp:extent cx="5120640" cy="4627581"/>
             <wp:effectExtent l="19050" t="19050" r="22860" b="20955"/>
-            <wp:docPr id="768783003" name="Imagem 15"/>
+            <wp:docPr id="1574983336" name="Imagem 15"/>
             <wp:cNvGraphicFramePr/>
             <a:graphic xmlns:a="http://schemas.openxmlformats.org/drawingml/2006/main">
               <a:graphicData uri="http://schemas.openxmlformats.org/drawingml/2006/picture">
                 <pic:pic xmlns:pic="http://schemas.openxmlformats.org/drawingml/2006/picture">
                   <pic:nvPicPr>
-                    <pic:cNvPr id="768783003" name=""/>
+                    <pic:cNvPr id="1574983336" name=""/>
                     <pic:cNvPicPr/>
                   </pic:nvPicPr>
                   <pic:blipFill>
@@ -15189,16 +15278,16 @@
         </w:rPr>
         <w:lastRenderedPageBreak/>
         <w:drawing>
-          <wp:inline distT="0" distB="0" distL="0" distR="0" wp14:anchorId="42D3BCA6" wp14:editId="54A2D7E7">
+          <wp:inline distT="0" distB="0" distL="0" distR="0" wp14:anchorId="616E75CB" wp14:editId="317436F8">
             <wp:extent cx="5120640" cy="4627581"/>
             <wp:effectExtent l="19050" t="19050" r="22860" b="20955"/>
-            <wp:docPr id="1092127961" name="Imagem 16"/>
+            <wp:docPr id="2051017739" name="Imagem 16"/>
             <wp:cNvGraphicFramePr/>
             <a:graphic xmlns:a="http://schemas.openxmlformats.org/drawingml/2006/main">
               <a:graphicData uri="http://schemas.openxmlformats.org/drawingml/2006/picture">
                 <pic:pic xmlns:pic="http://schemas.openxmlformats.org/drawingml/2006/picture">
                   <pic:nvPicPr>
-                    <pic:cNvPr id="1092127961" name=""/>
+                    <pic:cNvPr id="2051017739" name=""/>
                     <pic:cNvPicPr/>
                   </pic:nvPicPr>
                   <pic:blipFill>
@@ -15362,16 +15451,16 @@
         </w:rPr>
         <w:lastRenderedPageBreak/>
         <w:drawing>
-          <wp:inline distT="0" distB="0" distL="0" distR="0" wp14:anchorId="7D86EA9C" wp14:editId="1CC922AC">
+          <wp:inline distT="0" distB="0" distL="0" distR="0" wp14:anchorId="4AD05869" wp14:editId="2475F60E">
             <wp:extent cx="5120640" cy="3282818"/>
             <wp:effectExtent l="19050" t="19050" r="22860" b="13335"/>
-            <wp:docPr id="1657807709" name="Imagem 17"/>
+            <wp:docPr id="320253319" name="Imagem 17"/>
             <wp:cNvGraphicFramePr/>
             <a:graphic xmlns:a="http://schemas.openxmlformats.org/drawingml/2006/main">
               <a:graphicData uri="http://schemas.openxmlformats.org/drawingml/2006/picture">
                 <pic:pic xmlns:pic="http://schemas.openxmlformats.org/drawingml/2006/picture">
                   <pic:nvPicPr>
-                    <pic:cNvPr id="1657807709" name=""/>
+                    <pic:cNvPr id="320253319" name=""/>
                     <pic:cNvPicPr/>
                   </pic:nvPicPr>
                   <pic:blipFill>
@@ -15461,18 +15550,8 @@
         </w:numPr>
         <w:spacing w:after="80" w:line="260" w:lineRule="auto"/>
         <w:ind w:left="700"/>
-        <w:rPr>
-          <w:rFonts w:ascii="Montserrat" w:hAnsi="Montserrat"/>
-          <w:color w:val="1A1A1A"/>
-          <w:sz w:val="22"/>
-        </w:rPr>
-      </w:pPr>
-      <w:r>
-        <w:rPr>
-          <w:rFonts w:ascii="Montserrat" w:hAnsi="Montserrat"/>
-          <w:color w:val="1A1A1A"/>
-          <w:sz w:val="22"/>
-        </w:rPr>
+      </w:pPr>
+      <w:r>
         <w:t>Status automatico da atividade: o mesmo casamento por nome desce mais um nivel - cada Atividade (nivel 3) ganha um selo Concluida, Pendente ou Sem tarefa vinculada, casando pelo nome da atividade com uma tarefa cadastrada dentro de qualquer marco do cronograma (botao + Tarefas de cada marco, Passo 4, secao 3). Como tarefa nao tem data - so nome e concluida - nao existe estado Atrasada aqui, so Concluida/Pendente. Tambem sem nenhum campo novo para preencher na EAP.</w:t>
       </w:r>
     </w:p>
@@ -15503,13 +15582,28 @@
         </w:numPr>
         <w:spacing w:after="80" w:line="260" w:lineRule="auto"/>
         <w:ind w:left="700"/>
-      </w:pPr>
-      <w:r>
-        <w:t xml:space="preserve">No rodape do painel de detalhes de uma EAP, os botoes Imprimir e Exportar Word geram um documento com a arvore hierarquica completa (pacotes, </w:t>
-      </w:r>
-      <w:r>
+        <w:rPr>
+          <w:rFonts w:ascii="Montserrat" w:hAnsi="Montserrat"/>
+          <w:color w:val="1A1A1A"/>
+          <w:sz w:val="22"/>
+        </w:rPr>
+      </w:pPr>
+      <w:r>
+        <w:rPr>
+          <w:rFonts w:ascii="Montserrat" w:hAnsi="Montserrat"/>
+          <w:color w:val="1A1A1A"/>
+          <w:sz w:val="22"/>
+        </w:rPr>
+        <w:t xml:space="preserve">No rodape do painel de detalhes de uma EAP, os botoes Imprimir e Exportar Word geram um documento com a arvore hierarquica completa </w:t>
+      </w:r>
+      <w:r>
+        <w:rPr>
+          <w:rFonts w:ascii="Montserrat" w:hAnsi="Montserrat"/>
+          <w:color w:val="1A1A1A"/>
+          <w:sz w:val="22"/>
+        </w:rPr>
         <w:lastRenderedPageBreak/>
-        <w:t>entregas e atividades, com a prioridade de cada uma), pronto para impressao ou para abrir no Word. Este artefato nao tem um FORALF oficial - o layout segue o padrao visual dos demais documentos gerados pelo sistema.</w:t>
+        <w:t>(pacotes, entregas e atividades, com a prioridade de cada uma), pronto para impressao ou para abrir no Word. Este artefato nao tem um FORALF oficial - o layout segue o padrao visual dos demais documentos gerados pelo sistema.</w:t>
       </w:r>
     </w:p>
     <w:p>
@@ -15547,7 +15641,7 @@
           <w:sz w:val="27"/>
         </w:rPr>
       </w:pPr>
-      <w:bookmarkStart w:id="28" w:name="_Toc240387685"/>
+      <w:bookmarkStart w:id="28" w:name="_Toc240442836"/>
       <w:r>
         <w:rPr>
           <w:rFonts w:ascii="Montserrat" w:hAnsi="Montserrat"/>
@@ -15587,16 +15681,16 @@
           <w:noProof/>
         </w:rPr>
         <w:drawing>
-          <wp:inline distT="0" distB="0" distL="0" distR="0" wp14:anchorId="16CDCC99" wp14:editId="7CBC0A7F">
+          <wp:inline distT="0" distB="0" distL="0" distR="0" wp14:anchorId="2988F2BE" wp14:editId="71C2BD0D">
             <wp:extent cx="5120640" cy="4627581"/>
             <wp:effectExtent l="19050" t="19050" r="22860" b="20955"/>
-            <wp:docPr id="2072447548" name="Imagem 18"/>
+            <wp:docPr id="1927692412" name="Imagem 18"/>
             <wp:cNvGraphicFramePr/>
             <a:graphic xmlns:a="http://schemas.openxmlformats.org/drawingml/2006/main">
               <a:graphicData uri="http://schemas.openxmlformats.org/drawingml/2006/picture">
                 <pic:pic xmlns:pic="http://schemas.openxmlformats.org/drawingml/2006/picture">
                   <pic:nvPicPr>
-                    <pic:cNvPr id="2072447548" name=""/>
+                    <pic:cNvPr id="1927692412" name=""/>
                     <pic:cNvPicPr/>
                   </pic:nvPicPr>
                   <pic:blipFill>
@@ -15664,16 +15758,16 @@
         </w:rPr>
         <w:lastRenderedPageBreak/>
         <w:drawing>
-          <wp:inline distT="0" distB="0" distL="0" distR="0" wp14:anchorId="1A0FFDAB" wp14:editId="58514AF1">
+          <wp:inline distT="0" distB="0" distL="0" distR="0" wp14:anchorId="763939C5" wp14:editId="76D84BF5">
             <wp:extent cx="5120640" cy="4627581"/>
             <wp:effectExtent l="19050" t="19050" r="22860" b="20955"/>
-            <wp:docPr id="1606997577" name="Imagem 19"/>
+            <wp:docPr id="582694565" name="Imagem 19"/>
             <wp:cNvGraphicFramePr/>
             <a:graphic xmlns:a="http://schemas.openxmlformats.org/drawingml/2006/main">
               <a:graphicData uri="http://schemas.openxmlformats.org/drawingml/2006/picture">
                 <pic:pic xmlns:pic="http://schemas.openxmlformats.org/drawingml/2006/picture">
                   <pic:nvPicPr>
-                    <pic:cNvPr id="1606997577" name=""/>
+                    <pic:cNvPr id="582694565" name=""/>
                     <pic:cNvPicPr/>
                   </pic:nvPicPr>
                   <pic:blipFill>
@@ -15856,7 +15950,7 @@
           <w:sz w:val="27"/>
         </w:rPr>
       </w:pPr>
-      <w:bookmarkStart w:id="29" w:name="_Toc240387686"/>
+      <w:bookmarkStart w:id="29" w:name="_Toc240442837"/>
       <w:r>
         <w:rPr>
           <w:rFonts w:ascii="Montserrat" w:hAnsi="Montserrat"/>
@@ -15896,16 +15990,16 @@
           <w:noProof/>
         </w:rPr>
         <w:drawing>
-          <wp:inline distT="0" distB="0" distL="0" distR="0" wp14:anchorId="52F42220" wp14:editId="3FE6C9A2">
+          <wp:inline distT="0" distB="0" distL="0" distR="0" wp14:anchorId="44FB9829" wp14:editId="14C56802">
             <wp:extent cx="5120640" cy="4627581"/>
             <wp:effectExtent l="19050" t="19050" r="22860" b="20955"/>
-            <wp:docPr id="1323926072" name="Imagem 20"/>
+            <wp:docPr id="172624143" name="Imagem 20"/>
             <wp:cNvGraphicFramePr/>
             <a:graphic xmlns:a="http://schemas.openxmlformats.org/drawingml/2006/main">
               <a:graphicData uri="http://schemas.openxmlformats.org/drawingml/2006/picture">
                 <pic:pic xmlns:pic="http://schemas.openxmlformats.org/drawingml/2006/picture">
                   <pic:nvPicPr>
-                    <pic:cNvPr id="1323926072" name=""/>
+                    <pic:cNvPr id="172624143" name=""/>
                     <pic:cNvPicPr/>
                   </pic:nvPicPr>
                   <pic:blipFill>
@@ -15973,16 +16067,16 @@
         </w:rPr>
         <w:lastRenderedPageBreak/>
         <w:drawing>
-          <wp:inline distT="0" distB="0" distL="0" distR="0" wp14:anchorId="5AED867C" wp14:editId="2D71A9EE">
+          <wp:inline distT="0" distB="0" distL="0" distR="0" wp14:anchorId="51F2E9F0" wp14:editId="1B26FF91">
             <wp:extent cx="5120640" cy="4627581"/>
             <wp:effectExtent l="19050" t="19050" r="22860" b="20955"/>
-            <wp:docPr id="1903059475" name="Imagem 21"/>
+            <wp:docPr id="2070830138" name="Imagem 21"/>
             <wp:cNvGraphicFramePr/>
             <a:graphic xmlns:a="http://schemas.openxmlformats.org/drawingml/2006/main">
               <a:graphicData uri="http://schemas.openxmlformats.org/drawingml/2006/picture">
                 <pic:pic xmlns:pic="http://schemas.openxmlformats.org/drawingml/2006/picture">
                   <pic:nvPicPr>
-                    <pic:cNvPr id="1903059475" name=""/>
+                    <pic:cNvPr id="2070830138" name=""/>
                     <pic:cNvPicPr/>
                   </pic:nvPicPr>
                   <pic:blipFill>
@@ -16188,16 +16282,16 @@
           <w:noProof/>
         </w:rPr>
         <w:drawing>
-          <wp:inline distT="0" distB="0" distL="0" distR="0" wp14:anchorId="3D00D768" wp14:editId="60AECC39">
+          <wp:inline distT="0" distB="0" distL="0" distR="0" wp14:anchorId="5612119C" wp14:editId="0CD5CA7B">
             <wp:extent cx="5120640" cy="1757287"/>
             <wp:effectExtent l="19050" t="19050" r="22860" b="14605"/>
-            <wp:docPr id="1101041299" name="Imagem 22"/>
+            <wp:docPr id="853661260" name="Imagem 22"/>
             <wp:cNvGraphicFramePr/>
             <a:graphic xmlns:a="http://schemas.openxmlformats.org/drawingml/2006/main">
               <a:graphicData uri="http://schemas.openxmlformats.org/drawingml/2006/picture">
                 <pic:pic xmlns:pic="http://schemas.openxmlformats.org/drawingml/2006/picture">
                   <pic:nvPicPr>
-                    <pic:cNvPr id="1101041299" name=""/>
+                    <pic:cNvPr id="853661260" name=""/>
                     <pic:cNvPicPr/>
                   </pic:nvPicPr>
                   <pic:blipFill>
@@ -16310,7 +16404,7 @@
           <w:sz w:val="27"/>
         </w:rPr>
       </w:pPr>
-      <w:bookmarkStart w:id="30" w:name="_Toc240387687"/>
+      <w:bookmarkStart w:id="30" w:name="_Toc240442838"/>
       <w:r>
         <w:rPr>
           <w:rFonts w:ascii="Montserrat" w:hAnsi="Montserrat"/>
@@ -16351,16 +16445,16 @@
         </w:rPr>
         <w:lastRenderedPageBreak/>
         <w:drawing>
-          <wp:inline distT="0" distB="0" distL="0" distR="0" wp14:anchorId="7760B9A1" wp14:editId="05D9E048">
+          <wp:inline distT="0" distB="0" distL="0" distR="0" wp14:anchorId="3D7E1940" wp14:editId="6F238300">
             <wp:extent cx="5120640" cy="4627581"/>
             <wp:effectExtent l="19050" t="19050" r="22860" b="20955"/>
-            <wp:docPr id="1097152590" name="Imagem 23"/>
+            <wp:docPr id="1832341715" name="Imagem 23"/>
             <wp:cNvGraphicFramePr/>
             <a:graphic xmlns:a="http://schemas.openxmlformats.org/drawingml/2006/main">
               <a:graphicData uri="http://schemas.openxmlformats.org/drawingml/2006/picture">
                 <pic:pic xmlns:pic="http://schemas.openxmlformats.org/drawingml/2006/picture">
                   <pic:nvPicPr>
-                    <pic:cNvPr id="1097152590" name=""/>
+                    <pic:cNvPr id="1832341715" name=""/>
                     <pic:cNvPicPr/>
                   </pic:nvPicPr>
                   <pic:blipFill>
@@ -16428,16 +16522,16 @@
         </w:rPr>
         <w:lastRenderedPageBreak/>
         <w:drawing>
-          <wp:inline distT="0" distB="0" distL="0" distR="0" wp14:anchorId="630FF77C" wp14:editId="1FD61EDD">
+          <wp:inline distT="0" distB="0" distL="0" distR="0" wp14:anchorId="016C0371" wp14:editId="239E2A2B">
             <wp:extent cx="5120640" cy="4627581"/>
             <wp:effectExtent l="19050" t="19050" r="22860" b="20955"/>
-            <wp:docPr id="1033098906" name="Imagem 24"/>
+            <wp:docPr id="1944073868" name="Imagem 24"/>
             <wp:cNvGraphicFramePr/>
             <a:graphic xmlns:a="http://schemas.openxmlformats.org/drawingml/2006/main">
               <a:graphicData uri="http://schemas.openxmlformats.org/drawingml/2006/picture">
                 <pic:pic xmlns:pic="http://schemas.openxmlformats.org/drawingml/2006/picture">
                   <pic:nvPicPr>
-                    <pic:cNvPr id="1033098906" name=""/>
+                    <pic:cNvPr id="1944073868" name=""/>
                     <pic:cNvPicPr/>
                   </pic:nvPicPr>
                   <pic:blipFill>
@@ -16674,7 +16768,7 @@
           <w:sz w:val="27"/>
         </w:rPr>
       </w:pPr>
-      <w:bookmarkStart w:id="31" w:name="_Toc240387688"/>
+      <w:bookmarkStart w:id="31" w:name="_Toc240442839"/>
       <w:r>
         <w:rPr>
           <w:rFonts w:ascii="Montserrat" w:hAnsi="Montserrat"/>
@@ -16714,16 +16808,16 @@
           <w:noProof/>
         </w:rPr>
         <w:drawing>
-          <wp:inline distT="0" distB="0" distL="0" distR="0" wp14:anchorId="3DBBC1F1" wp14:editId="3DEAAE2D">
+          <wp:inline distT="0" distB="0" distL="0" distR="0" wp14:anchorId="7F653011" wp14:editId="2E2E8704">
             <wp:extent cx="5120640" cy="4627581"/>
             <wp:effectExtent l="19050" t="19050" r="22860" b="20955"/>
-            <wp:docPr id="560310371" name="Imagem 25"/>
+            <wp:docPr id="798333496" name="Imagem 25"/>
             <wp:cNvGraphicFramePr/>
             <a:graphic xmlns:a="http://schemas.openxmlformats.org/drawingml/2006/main">
               <a:graphicData uri="http://schemas.openxmlformats.org/drawingml/2006/picture">
                 <pic:pic xmlns:pic="http://schemas.openxmlformats.org/drawingml/2006/picture">
                   <pic:nvPicPr>
-                    <pic:cNvPr id="560310371" name=""/>
+                    <pic:cNvPr id="798333496" name=""/>
                     <pic:cNvPicPr/>
                   </pic:nvPicPr>
                   <pic:blipFill>
@@ -16791,16 +16885,16 @@
         </w:rPr>
         <w:lastRenderedPageBreak/>
         <w:drawing>
-          <wp:inline distT="0" distB="0" distL="0" distR="0" wp14:anchorId="27E58D29" wp14:editId="3A6E09FF">
+          <wp:inline distT="0" distB="0" distL="0" distR="0" wp14:anchorId="67A7572B" wp14:editId="466301F4">
             <wp:extent cx="5120640" cy="4627581"/>
             <wp:effectExtent l="19050" t="19050" r="22860" b="20955"/>
-            <wp:docPr id="430514801" name="Imagem 26"/>
+            <wp:docPr id="1270796831" name="Imagem 26"/>
             <wp:cNvGraphicFramePr/>
             <a:graphic xmlns:a="http://schemas.openxmlformats.org/drawingml/2006/main">
               <a:graphicData uri="http://schemas.openxmlformats.org/drawingml/2006/picture">
                 <pic:pic xmlns:pic="http://schemas.openxmlformats.org/drawingml/2006/picture">
                   <pic:nvPicPr>
-                    <pic:cNvPr id="430514801" name=""/>
+                    <pic:cNvPr id="1270796831" name=""/>
                     <pic:cNvPicPr/>
                   </pic:nvPicPr>
                   <pic:blipFill>
@@ -16991,7 +17085,7 @@
           <w:sz w:val="27"/>
         </w:rPr>
       </w:pPr>
-      <w:bookmarkStart w:id="32" w:name="_Toc240387689"/>
+      <w:bookmarkStart w:id="32" w:name="_Toc240442840"/>
       <w:r>
         <w:rPr>
           <w:rFonts w:ascii="Montserrat" w:hAnsi="Montserrat"/>
@@ -17031,16 +17125,16 @@
           <w:noProof/>
         </w:rPr>
         <w:drawing>
-          <wp:inline distT="0" distB="0" distL="0" distR="0" wp14:anchorId="0766A6D3" wp14:editId="39128733">
+          <wp:inline distT="0" distB="0" distL="0" distR="0" wp14:anchorId="53ED878E" wp14:editId="4340249B">
             <wp:extent cx="5120640" cy="4000682"/>
             <wp:effectExtent l="19050" t="19050" r="22860" b="19050"/>
-            <wp:docPr id="225948790" name="Imagem 27"/>
+            <wp:docPr id="375132894" name="Imagem 27"/>
             <wp:cNvGraphicFramePr/>
             <a:graphic xmlns:a="http://schemas.openxmlformats.org/drawingml/2006/main">
               <a:graphicData uri="http://schemas.openxmlformats.org/drawingml/2006/picture">
                 <pic:pic xmlns:pic="http://schemas.openxmlformats.org/drawingml/2006/picture">
                   <pic:nvPicPr>
-                    <pic:cNvPr id="225948790" name=""/>
+                    <pic:cNvPr id="375132894" name=""/>
                     <pic:cNvPicPr/>
                   </pic:nvPicPr>
                   <pic:blipFill>
@@ -17564,7 +17658,7 @@
           <w:sz w:val="34"/>
         </w:rPr>
       </w:pPr>
-      <w:bookmarkStart w:id="33" w:name="_Toc240387690"/>
+      <w:bookmarkStart w:id="33" w:name="_Toc240442841"/>
       <w:r>
         <w:rPr>
           <w:rFonts w:ascii="Montserrat" w:hAnsi="Montserrat"/>
@@ -17606,7 +17700,7 @@
           <w:sz w:val="27"/>
         </w:rPr>
       </w:pPr>
-      <w:bookmarkStart w:id="34" w:name="_Toc240387691"/>
+      <w:bookmarkStart w:id="34" w:name="_Toc240442842"/>
       <w:r>
         <w:rPr>
           <w:rFonts w:ascii="Montserrat" w:hAnsi="Montserrat"/>
@@ -17646,16 +17740,16 @@
           <w:noProof/>
         </w:rPr>
         <w:drawing>
-          <wp:inline distT="0" distB="0" distL="0" distR="0" wp14:anchorId="27E2C106" wp14:editId="6AE8F1AA">
+          <wp:inline distT="0" distB="0" distL="0" distR="0" wp14:anchorId="67181A09" wp14:editId="57E7A26C">
             <wp:extent cx="5120640" cy="4627581"/>
             <wp:effectExtent l="19050" t="19050" r="22860" b="20955"/>
-            <wp:docPr id="190356330" name="Imagem 28"/>
+            <wp:docPr id="1539216970" name="Imagem 28"/>
             <wp:cNvGraphicFramePr/>
             <a:graphic xmlns:a="http://schemas.openxmlformats.org/drawingml/2006/main">
               <a:graphicData uri="http://schemas.openxmlformats.org/drawingml/2006/picture">
                 <pic:pic xmlns:pic="http://schemas.openxmlformats.org/drawingml/2006/picture">
                   <pic:nvPicPr>
-                    <pic:cNvPr id="190356330" name=""/>
+                    <pic:cNvPr id="1539216970" name=""/>
                     <pic:cNvPicPr/>
                   </pic:nvPicPr>
                   <pic:blipFill>
@@ -17723,16 +17817,16 @@
         </w:rPr>
         <w:lastRenderedPageBreak/>
         <w:drawing>
-          <wp:inline distT="0" distB="0" distL="0" distR="0" wp14:anchorId="33EEA6B6" wp14:editId="5CDA03FB">
+          <wp:inline distT="0" distB="0" distL="0" distR="0" wp14:anchorId="77815FF0" wp14:editId="1C130DDD">
             <wp:extent cx="5120640" cy="4627581"/>
             <wp:effectExtent l="19050" t="19050" r="22860" b="20955"/>
-            <wp:docPr id="1833041795" name="Imagem 29"/>
+            <wp:docPr id="1008340118" name="Imagem 29"/>
             <wp:cNvGraphicFramePr/>
             <a:graphic xmlns:a="http://schemas.openxmlformats.org/drawingml/2006/main">
               <a:graphicData uri="http://schemas.openxmlformats.org/drawingml/2006/picture">
                 <pic:pic xmlns:pic="http://schemas.openxmlformats.org/drawingml/2006/picture">
                   <pic:nvPicPr>
-                    <pic:cNvPr id="1833041795" name=""/>
+                    <pic:cNvPr id="1008340118" name=""/>
                     <pic:cNvPicPr/>
                   </pic:nvPicPr>
                   <pic:blipFill>
@@ -17800,16 +17894,16 @@
         </w:rPr>
         <w:lastRenderedPageBreak/>
         <w:drawing>
-          <wp:inline distT="0" distB="0" distL="0" distR="0" wp14:anchorId="22E118FC" wp14:editId="7DCE8C53">
+          <wp:inline distT="0" distB="0" distL="0" distR="0" wp14:anchorId="75FB30B6" wp14:editId="29FB1D8A">
             <wp:extent cx="5120640" cy="4627581"/>
             <wp:effectExtent l="19050" t="19050" r="22860" b="20955"/>
-            <wp:docPr id="1982652657" name="Imagem 30"/>
+            <wp:docPr id="927183168" name="Imagem 30"/>
             <wp:cNvGraphicFramePr/>
             <a:graphic xmlns:a="http://schemas.openxmlformats.org/drawingml/2006/main">
               <a:graphicData uri="http://schemas.openxmlformats.org/drawingml/2006/picture">
                 <pic:pic xmlns:pic="http://schemas.openxmlformats.org/drawingml/2006/picture">
                   <pic:nvPicPr>
-                    <pic:cNvPr id="1982652657" name=""/>
+                    <pic:cNvPr id="927183168" name=""/>
                     <pic:cNvPicPr/>
                   </pic:nvPicPr>
                   <pic:blipFill>
@@ -18011,16 +18105,16 @@
           <w:noProof/>
         </w:rPr>
         <w:drawing>
-          <wp:inline distT="0" distB="0" distL="0" distR="0" wp14:anchorId="5C430ADB" wp14:editId="13DB2199">
+          <wp:inline distT="0" distB="0" distL="0" distR="0" wp14:anchorId="38B7BA1E" wp14:editId="20E501A8">
             <wp:extent cx="5120640" cy="1715571"/>
             <wp:effectExtent l="19050" t="19050" r="22860" b="18415"/>
-            <wp:docPr id="1340947686" name="Imagem 31"/>
+            <wp:docPr id="922076840" name="Imagem 31"/>
             <wp:cNvGraphicFramePr/>
             <a:graphic xmlns:a="http://schemas.openxmlformats.org/drawingml/2006/main">
               <a:graphicData uri="http://schemas.openxmlformats.org/drawingml/2006/picture">
                 <pic:pic xmlns:pic="http://schemas.openxmlformats.org/drawingml/2006/picture">
                   <pic:nvPicPr>
-                    <pic:cNvPr id="1340947686" name=""/>
+                    <pic:cNvPr id="922076840" name=""/>
                     <pic:cNvPicPr/>
                   </pic:nvPicPr>
                   <pic:blipFill>
@@ -18157,16 +18251,16 @@
           <w:noProof/>
         </w:rPr>
         <w:drawing>
-          <wp:inline distT="0" distB="0" distL="0" distR="0" wp14:anchorId="32897315" wp14:editId="2E22A3CF">
+          <wp:inline distT="0" distB="0" distL="0" distR="0" wp14:anchorId="1658EB64" wp14:editId="0AAF78C1">
             <wp:extent cx="5120640" cy="3282818"/>
             <wp:effectExtent l="19050" t="19050" r="22860" b="13335"/>
-            <wp:docPr id="1194402087" name="Imagem 32"/>
+            <wp:docPr id="434467712" name="Imagem 32"/>
             <wp:cNvGraphicFramePr/>
             <a:graphic xmlns:a="http://schemas.openxmlformats.org/drawingml/2006/main">
               <a:graphicData uri="http://schemas.openxmlformats.org/drawingml/2006/picture">
                 <pic:pic xmlns:pic="http://schemas.openxmlformats.org/drawingml/2006/picture">
                   <pic:nvPicPr>
-                    <pic:cNvPr id="1194402087" name=""/>
+                    <pic:cNvPr id="434467712" name=""/>
                     <pic:cNvPicPr/>
                   </pic:nvPicPr>
                   <pic:blipFill>
@@ -18300,16 +18394,16 @@
           <w:noProof/>
         </w:rPr>
         <w:drawing>
-          <wp:inline distT="0" distB="0" distL="0" distR="0" wp14:anchorId="1B656A95" wp14:editId="720EBE4D">
+          <wp:inline distT="0" distB="0" distL="0" distR="0" wp14:anchorId="36CA324C" wp14:editId="1DC7AF7C">
             <wp:extent cx="5120640" cy="951357"/>
             <wp:effectExtent l="19050" t="19050" r="22860" b="20320"/>
-            <wp:docPr id="291742130" name="Imagem 33"/>
+            <wp:docPr id="612033561" name="Imagem 33"/>
             <wp:cNvGraphicFramePr/>
             <a:graphic xmlns:a="http://schemas.openxmlformats.org/drawingml/2006/main">
               <a:graphicData uri="http://schemas.openxmlformats.org/drawingml/2006/picture">
                 <pic:pic xmlns:pic="http://schemas.openxmlformats.org/drawingml/2006/picture">
                   <pic:nvPicPr>
-                    <pic:cNvPr id="291742130" name=""/>
+                    <pic:cNvPr id="612033561" name=""/>
                     <pic:cNvPicPr/>
                   </pic:nvPicPr>
                   <pic:blipFill>
@@ -18443,16 +18537,16 @@
         </w:rPr>
         <w:lastRenderedPageBreak/>
         <w:drawing>
-          <wp:inline distT="0" distB="0" distL="0" distR="0" wp14:anchorId="4095784D" wp14:editId="67D8BE3A">
+          <wp:inline distT="0" distB="0" distL="0" distR="0" wp14:anchorId="24609EEB" wp14:editId="52FA5812">
             <wp:extent cx="5120640" cy="1515102"/>
             <wp:effectExtent l="19050" t="19050" r="22860" b="28575"/>
-            <wp:docPr id="394140199" name="Imagem 34"/>
+            <wp:docPr id="159608016" name="Imagem 34"/>
             <wp:cNvGraphicFramePr/>
             <a:graphic xmlns:a="http://schemas.openxmlformats.org/drawingml/2006/main">
               <a:graphicData uri="http://schemas.openxmlformats.org/drawingml/2006/picture">
                 <pic:pic xmlns:pic="http://schemas.openxmlformats.org/drawingml/2006/picture">
                   <pic:nvPicPr>
-                    <pic:cNvPr id="394140199" name=""/>
+                    <pic:cNvPr id="159608016" name=""/>
                     <pic:cNvPicPr/>
                   </pic:nvPicPr>
                   <pic:blipFill>
@@ -18564,16 +18658,16 @@
           <w:noProof/>
         </w:rPr>
         <w:drawing>
-          <wp:inline distT="0" distB="0" distL="0" distR="0" wp14:anchorId="525FBC4E" wp14:editId="46E80856">
+          <wp:inline distT="0" distB="0" distL="0" distR="0" wp14:anchorId="0F0CC700" wp14:editId="0DFB0857">
             <wp:extent cx="5120640" cy="1391113"/>
             <wp:effectExtent l="19050" t="19050" r="22860" b="19050"/>
-            <wp:docPr id="1049667678" name="Imagem 35"/>
+            <wp:docPr id="1667583178" name="Imagem 35"/>
             <wp:cNvGraphicFramePr/>
             <a:graphic xmlns:a="http://schemas.openxmlformats.org/drawingml/2006/main">
               <a:graphicData uri="http://schemas.openxmlformats.org/drawingml/2006/picture">
                 <pic:pic xmlns:pic="http://schemas.openxmlformats.org/drawingml/2006/picture">
                   <pic:nvPicPr>
-                    <pic:cNvPr id="1049667678" name=""/>
+                    <pic:cNvPr id="1667583178" name=""/>
                     <pic:cNvPicPr/>
                   </pic:nvPicPr>
                   <pic:blipFill>
@@ -18695,16 +18789,16 @@
           <w:noProof/>
         </w:rPr>
         <w:drawing>
-          <wp:inline distT="0" distB="0" distL="0" distR="0" wp14:anchorId="79D05E62" wp14:editId="2F319E44">
+          <wp:inline distT="0" distB="0" distL="0" distR="0" wp14:anchorId="4826B46F" wp14:editId="20676373">
             <wp:extent cx="5120640" cy="1125174"/>
             <wp:effectExtent l="19050" t="19050" r="22860" b="18415"/>
-            <wp:docPr id="773897673" name="Imagem 36"/>
+            <wp:docPr id="2134905770" name="Imagem 36"/>
             <wp:cNvGraphicFramePr/>
             <a:graphic xmlns:a="http://schemas.openxmlformats.org/drawingml/2006/main">
               <a:graphicData uri="http://schemas.openxmlformats.org/drawingml/2006/picture">
                 <pic:pic xmlns:pic="http://schemas.openxmlformats.org/drawingml/2006/picture">
                   <pic:nvPicPr>
-                    <pic:cNvPr id="773897673" name=""/>
+                    <pic:cNvPr id="2134905770" name=""/>
                     <pic:cNvPicPr/>
                   </pic:nvPicPr>
                   <pic:blipFill>
@@ -18793,7 +18887,7 @@
           <w:sz w:val="27"/>
         </w:rPr>
       </w:pPr>
-      <w:bookmarkStart w:id="35" w:name="_Toc240387692"/>
+      <w:bookmarkStart w:id="35" w:name="_Toc240442843"/>
       <w:r>
         <w:rPr>
           <w:rFonts w:ascii="Montserrat" w:hAnsi="Montserrat"/>
@@ -18834,16 +18928,16 @@
         </w:rPr>
         <w:lastRenderedPageBreak/>
         <w:drawing>
-          <wp:inline distT="0" distB="0" distL="0" distR="0" wp14:anchorId="2FDE18E3" wp14:editId="34BD571C">
+          <wp:inline distT="0" distB="0" distL="0" distR="0" wp14:anchorId="4E51A637" wp14:editId="60D8BB94">
             <wp:extent cx="5120640" cy="4627581"/>
             <wp:effectExtent l="19050" t="19050" r="22860" b="20955"/>
-            <wp:docPr id="348576463" name="Imagem 37"/>
+            <wp:docPr id="130122304" name="Imagem 37"/>
             <wp:cNvGraphicFramePr/>
             <a:graphic xmlns:a="http://schemas.openxmlformats.org/drawingml/2006/main">
               <a:graphicData uri="http://schemas.openxmlformats.org/drawingml/2006/picture">
                 <pic:pic xmlns:pic="http://schemas.openxmlformats.org/drawingml/2006/picture">
                   <pic:nvPicPr>
-                    <pic:cNvPr id="348576463" name=""/>
+                    <pic:cNvPr id="130122304" name=""/>
                     <pic:cNvPicPr/>
                   </pic:nvPicPr>
                   <pic:blipFill>
@@ -18911,16 +19005,16 @@
         </w:rPr>
         <w:lastRenderedPageBreak/>
         <w:drawing>
-          <wp:inline distT="0" distB="0" distL="0" distR="0" wp14:anchorId="51D6B211" wp14:editId="63CFFC21">
+          <wp:inline distT="0" distB="0" distL="0" distR="0" wp14:anchorId="687B943E" wp14:editId="5C858CD2">
             <wp:extent cx="5120640" cy="4627581"/>
             <wp:effectExtent l="19050" t="19050" r="22860" b="20955"/>
-            <wp:docPr id="2089893567" name="Imagem 38"/>
+            <wp:docPr id="1161266491" name="Imagem 38"/>
             <wp:cNvGraphicFramePr/>
             <a:graphic xmlns:a="http://schemas.openxmlformats.org/drawingml/2006/main">
               <a:graphicData uri="http://schemas.openxmlformats.org/drawingml/2006/picture">
                 <pic:pic xmlns:pic="http://schemas.openxmlformats.org/drawingml/2006/picture">
                   <pic:nvPicPr>
-                    <pic:cNvPr id="2089893567" name=""/>
+                    <pic:cNvPr id="1161266491" name=""/>
                     <pic:cNvPicPr/>
                   </pic:nvPicPr>
                   <pic:blipFill>
@@ -19089,16 +19183,16 @@
           <w:noProof/>
         </w:rPr>
         <w:drawing>
-          <wp:inline distT="0" distB="0" distL="0" distR="0" wp14:anchorId="6F0FB895" wp14:editId="51182157">
+          <wp:inline distT="0" distB="0" distL="0" distR="0" wp14:anchorId="699E4B24" wp14:editId="4CBE50C8">
             <wp:extent cx="5120640" cy="2144319"/>
             <wp:effectExtent l="19050" t="19050" r="22860" b="27940"/>
-            <wp:docPr id="1198030922" name="Imagem 39"/>
+            <wp:docPr id="1207840647" name="Imagem 39"/>
             <wp:cNvGraphicFramePr/>
             <a:graphic xmlns:a="http://schemas.openxmlformats.org/drawingml/2006/main">
               <a:graphicData uri="http://schemas.openxmlformats.org/drawingml/2006/picture">
                 <pic:pic xmlns:pic="http://schemas.openxmlformats.org/drawingml/2006/picture">
                   <pic:nvPicPr>
-                    <pic:cNvPr id="1198030922" name=""/>
+                    <pic:cNvPr id="1207840647" name=""/>
                     <pic:cNvPicPr/>
                   </pic:nvPicPr>
                   <pic:blipFill>
@@ -19186,16 +19280,16 @@
           <w:noProof/>
         </w:rPr>
         <w:drawing>
-          <wp:inline distT="0" distB="0" distL="0" distR="0" wp14:anchorId="37FB0987" wp14:editId="519E766E">
+          <wp:inline distT="0" distB="0" distL="0" distR="0" wp14:anchorId="76DA8ACD" wp14:editId="3D552FB5">
             <wp:extent cx="5120640" cy="1055647"/>
             <wp:effectExtent l="19050" t="19050" r="22860" b="11430"/>
-            <wp:docPr id="85766060" name="Imagem 40"/>
+            <wp:docPr id="1157850697" name="Imagem 40"/>
             <wp:cNvGraphicFramePr/>
             <a:graphic xmlns:a="http://schemas.openxmlformats.org/drawingml/2006/main">
               <a:graphicData uri="http://schemas.openxmlformats.org/drawingml/2006/picture">
                 <pic:pic xmlns:pic="http://schemas.openxmlformats.org/drawingml/2006/picture">
                   <pic:nvPicPr>
-                    <pic:cNvPr id="85766060" name=""/>
+                    <pic:cNvPr id="1157850697" name=""/>
                     <pic:cNvPicPr/>
                   </pic:nvPicPr>
                   <pic:blipFill>
@@ -19317,16 +19411,16 @@
           <w:noProof/>
         </w:rPr>
         <w:drawing>
-          <wp:inline distT="0" distB="0" distL="0" distR="0" wp14:anchorId="2EC32561" wp14:editId="6F0E3067">
+          <wp:inline distT="0" distB="0" distL="0" distR="0" wp14:anchorId="3EFE615E" wp14:editId="342A95E3">
             <wp:extent cx="5120640" cy="3282818"/>
             <wp:effectExtent l="19050" t="19050" r="22860" b="13335"/>
-            <wp:docPr id="820916756" name="Imagem 41"/>
+            <wp:docPr id="1785373154" name="Imagem 41"/>
             <wp:cNvGraphicFramePr/>
             <a:graphic xmlns:a="http://schemas.openxmlformats.org/drawingml/2006/main">
               <a:graphicData uri="http://schemas.openxmlformats.org/drawingml/2006/picture">
                 <pic:pic xmlns:pic="http://schemas.openxmlformats.org/drawingml/2006/picture">
                   <pic:nvPicPr>
-                    <pic:cNvPr id="820916756" name=""/>
+                    <pic:cNvPr id="1785373154" name=""/>
                     <pic:cNvPicPr/>
                   </pic:nvPicPr>
                   <pic:blipFill>
@@ -19460,16 +19554,16 @@
         </w:rPr>
         <w:lastRenderedPageBreak/>
         <w:drawing>
-          <wp:inline distT="0" distB="0" distL="0" distR="0" wp14:anchorId="2CEF0AEF" wp14:editId="0B20286A">
+          <wp:inline distT="0" distB="0" distL="0" distR="0" wp14:anchorId="30F255D7" wp14:editId="53965A7A">
             <wp:extent cx="5120640" cy="1978034"/>
             <wp:effectExtent l="19050" t="19050" r="22860" b="22225"/>
-            <wp:docPr id="1423032190" name="Imagem 42"/>
+            <wp:docPr id="1336170673" name="Imagem 42"/>
             <wp:cNvGraphicFramePr/>
             <a:graphic xmlns:a="http://schemas.openxmlformats.org/drawingml/2006/main">
               <a:graphicData uri="http://schemas.openxmlformats.org/drawingml/2006/picture">
                 <pic:pic xmlns:pic="http://schemas.openxmlformats.org/drawingml/2006/picture">
                   <pic:nvPicPr>
-                    <pic:cNvPr id="1423032190" name=""/>
+                    <pic:cNvPr id="1336170673" name=""/>
                     <pic:cNvPicPr/>
                   </pic:nvPicPr>
                   <pic:blipFill>
@@ -19541,7 +19635,7 @@
           <w:sz w:val="34"/>
         </w:rPr>
       </w:pPr>
-      <w:bookmarkStart w:id="36" w:name="_Toc240387693"/>
+      <w:bookmarkStart w:id="36" w:name="_Toc240442844"/>
       <w:r>
         <w:rPr>
           <w:rFonts w:ascii="Montserrat" w:hAnsi="Montserrat"/>
@@ -19601,7 +19695,7 @@
           <w:sz w:val="27"/>
         </w:rPr>
       </w:pPr>
-      <w:bookmarkStart w:id="37" w:name="_Toc240387694"/>
+      <w:bookmarkStart w:id="37" w:name="_Toc240442845"/>
       <w:r>
         <w:rPr>
           <w:rFonts w:ascii="Montserrat" w:hAnsi="Montserrat"/>
@@ -19641,16 +19735,16 @@
           <w:noProof/>
         </w:rPr>
         <w:drawing>
-          <wp:inline distT="0" distB="0" distL="0" distR="0" wp14:anchorId="7EEC3259" wp14:editId="4A312B2F">
+          <wp:inline distT="0" distB="0" distL="0" distR="0" wp14:anchorId="6DA8FE14" wp14:editId="34507BB2">
             <wp:extent cx="5303520" cy="4792851"/>
             <wp:effectExtent l="19050" t="19050" r="11430" b="27305"/>
-            <wp:docPr id="62572364" name="Imagem 43"/>
+            <wp:docPr id="441437614" name="Imagem 43"/>
             <wp:cNvGraphicFramePr/>
             <a:graphic xmlns:a="http://schemas.openxmlformats.org/drawingml/2006/main">
               <a:graphicData uri="http://schemas.openxmlformats.org/drawingml/2006/picture">
                 <pic:pic xmlns:pic="http://schemas.openxmlformats.org/drawingml/2006/picture">
                   <pic:nvPicPr>
-                    <pic:cNvPr id="62572364" name=""/>
+                    <pic:cNvPr id="441437614" name=""/>
                     <pic:cNvPicPr/>
                   </pic:nvPicPr>
                   <pic:blipFill>
@@ -19719,7 +19813,7 @@
           <w:sz w:val="27"/>
         </w:rPr>
       </w:pPr>
-      <w:bookmarkStart w:id="38" w:name="_Toc240387695"/>
+      <w:bookmarkStart w:id="38" w:name="_Toc240442846"/>
       <w:r>
         <w:rPr>
           <w:rFonts w:ascii="Montserrat" w:hAnsi="Montserrat"/>
@@ -19759,16 +19853,16 @@
           <w:noProof/>
         </w:rPr>
         <w:drawing>
-          <wp:inline distT="0" distB="0" distL="0" distR="0" wp14:anchorId="7EE41084" wp14:editId="75FEC231">
+          <wp:inline distT="0" distB="0" distL="0" distR="0" wp14:anchorId="4D43D1D3" wp14:editId="47B927A6">
             <wp:extent cx="5303520" cy="4792851"/>
             <wp:effectExtent l="19050" t="19050" r="11430" b="27305"/>
-            <wp:docPr id="960900074" name="Imagem 44"/>
+            <wp:docPr id="169162611" name="Imagem 44"/>
             <wp:cNvGraphicFramePr/>
             <a:graphic xmlns:a="http://schemas.openxmlformats.org/drawingml/2006/main">
               <a:graphicData uri="http://schemas.openxmlformats.org/drawingml/2006/picture">
                 <pic:pic xmlns:pic="http://schemas.openxmlformats.org/drawingml/2006/picture">
                   <pic:nvPicPr>
-                    <pic:cNvPr id="960900074" name=""/>
+                    <pic:cNvPr id="169162611" name=""/>
                     <pic:cNvPicPr/>
                   </pic:nvPicPr>
                   <pic:blipFill>
@@ -19836,7 +19930,7 @@
           <w:sz w:val="27"/>
         </w:rPr>
       </w:pPr>
-      <w:bookmarkStart w:id="39" w:name="_Toc240387696"/>
+      <w:bookmarkStart w:id="39" w:name="_Toc240442847"/>
       <w:r>
         <w:rPr>
           <w:rFonts w:ascii="Montserrat" w:hAnsi="Montserrat"/>
@@ -19877,16 +19971,16 @@
         </w:rPr>
         <w:lastRenderedPageBreak/>
         <w:drawing>
-          <wp:inline distT="0" distB="0" distL="0" distR="0" wp14:anchorId="08B9EF2A" wp14:editId="5E6FC2CB">
+          <wp:inline distT="0" distB="0" distL="0" distR="0" wp14:anchorId="4BDA55D1" wp14:editId="4F4A6580">
             <wp:extent cx="5303520" cy="4792851"/>
             <wp:effectExtent l="19050" t="19050" r="11430" b="27305"/>
-            <wp:docPr id="2106382693" name="Imagem 45"/>
+            <wp:docPr id="1863231422" name="Imagem 45"/>
             <wp:cNvGraphicFramePr/>
             <a:graphic xmlns:a="http://schemas.openxmlformats.org/drawingml/2006/main">
               <a:graphicData uri="http://schemas.openxmlformats.org/drawingml/2006/picture">
                 <pic:pic xmlns:pic="http://schemas.openxmlformats.org/drawingml/2006/picture">
                   <pic:nvPicPr>
-                    <pic:cNvPr id="2106382693" name=""/>
+                    <pic:cNvPr id="1863231422" name=""/>
                     <pic:cNvPicPr/>
                   </pic:nvPicPr>
                   <pic:blipFill>
@@ -19954,16 +20048,16 @@
         </w:rPr>
         <w:lastRenderedPageBreak/>
         <w:drawing>
-          <wp:inline distT="0" distB="0" distL="0" distR="0" wp14:anchorId="53F13CF2" wp14:editId="21A9B0DF">
+          <wp:inline distT="0" distB="0" distL="0" distR="0" wp14:anchorId="5A08DE3D" wp14:editId="0DBCED14">
             <wp:extent cx="5303520" cy="4792851"/>
             <wp:effectExtent l="19050" t="19050" r="11430" b="27305"/>
-            <wp:docPr id="539879755" name="Imagem 46"/>
+            <wp:docPr id="389229741" name="Imagem 46"/>
             <wp:cNvGraphicFramePr/>
             <a:graphic xmlns:a="http://schemas.openxmlformats.org/drawingml/2006/main">
               <a:graphicData uri="http://schemas.openxmlformats.org/drawingml/2006/picture">
                 <pic:pic xmlns:pic="http://schemas.openxmlformats.org/drawingml/2006/picture">
                   <pic:nvPicPr>
-                    <pic:cNvPr id="539879755" name=""/>
+                    <pic:cNvPr id="389229741" name=""/>
                     <pic:cNvPicPr/>
                   </pic:nvPicPr>
                   <pic:blipFill>
@@ -20056,7 +20150,7 @@
           <w:sz w:val="34"/>
         </w:rPr>
       </w:pPr>
-      <w:bookmarkStart w:id="40" w:name="_Toc240387697"/>
+      <w:bookmarkStart w:id="40" w:name="_Toc240442848"/>
       <w:r>
         <w:rPr>
           <w:rFonts w:ascii="Montserrat" w:hAnsi="Montserrat"/>
@@ -20098,7 +20192,7 @@
           <w:sz w:val="27"/>
         </w:rPr>
       </w:pPr>
-      <w:bookmarkStart w:id="41" w:name="_Toc240387698"/>
+      <w:bookmarkStart w:id="41" w:name="_Toc240442849"/>
       <w:r>
         <w:rPr>
           <w:rFonts w:ascii="Montserrat" w:hAnsi="Montserrat"/>
@@ -20138,16 +20232,16 @@
           <w:noProof/>
         </w:rPr>
         <w:drawing>
-          <wp:inline distT="0" distB="0" distL="0" distR="0" wp14:anchorId="77A7CB29" wp14:editId="4BE6667E">
+          <wp:inline distT="0" distB="0" distL="0" distR="0" wp14:anchorId="0F7DF2AC" wp14:editId="6A655AC6">
             <wp:extent cx="5303520" cy="4792851"/>
             <wp:effectExtent l="19050" t="19050" r="11430" b="27305"/>
-            <wp:docPr id="2125627440" name="Imagem 47"/>
+            <wp:docPr id="74166531" name="Imagem 47"/>
             <wp:cNvGraphicFramePr/>
             <a:graphic xmlns:a="http://schemas.openxmlformats.org/drawingml/2006/main">
               <a:graphicData uri="http://schemas.openxmlformats.org/drawingml/2006/picture">
                 <pic:pic xmlns:pic="http://schemas.openxmlformats.org/drawingml/2006/picture">
                   <pic:nvPicPr>
-                    <pic:cNvPr id="2125627440" name=""/>
+                    <pic:cNvPr id="74166531" name=""/>
                     <pic:cNvPicPr/>
                   </pic:nvPicPr>
                   <pic:blipFill>
@@ -20402,7 +20496,7 @@
           <w:sz w:val="27"/>
         </w:rPr>
       </w:pPr>
-      <w:bookmarkStart w:id="42" w:name="_Toc240387699"/>
+      <w:bookmarkStart w:id="42" w:name="_Toc240442850"/>
       <w:r>
         <w:rPr>
           <w:rFonts w:ascii="Montserrat" w:hAnsi="Montserrat"/>
@@ -20443,16 +20537,16 @@
         </w:rPr>
         <w:lastRenderedPageBreak/>
         <w:drawing>
-          <wp:inline distT="0" distB="0" distL="0" distR="0" wp14:anchorId="7028BED7" wp14:editId="55EFBABC">
+          <wp:inline distT="0" distB="0" distL="0" distR="0" wp14:anchorId="2A98BD07" wp14:editId="4746519B">
             <wp:extent cx="5303520" cy="4792851"/>
             <wp:effectExtent l="19050" t="19050" r="11430" b="27305"/>
-            <wp:docPr id="574837958" name="Imagem 48"/>
+            <wp:docPr id="1912731028" name="Imagem 48"/>
             <wp:cNvGraphicFramePr/>
             <a:graphic xmlns:a="http://schemas.openxmlformats.org/drawingml/2006/main">
               <a:graphicData uri="http://schemas.openxmlformats.org/drawingml/2006/picture">
                 <pic:pic xmlns:pic="http://schemas.openxmlformats.org/drawingml/2006/picture">
                   <pic:nvPicPr>
-                    <pic:cNvPr id="574837958" name=""/>
+                    <pic:cNvPr id="1912731028" name=""/>
                     <pic:cNvPicPr/>
                   </pic:nvPicPr>
                   <pic:blipFill>
@@ -20541,7 +20635,7 @@
           <w:sz w:val="27"/>
         </w:rPr>
       </w:pPr>
-      <w:bookmarkStart w:id="43" w:name="_Toc240387700"/>
+      <w:bookmarkStart w:id="43" w:name="_Toc240442851"/>
       <w:r>
         <w:rPr>
           <w:rFonts w:ascii="Montserrat" w:hAnsi="Montserrat"/>
@@ -20582,16 +20676,16 @@
         </w:rPr>
         <w:lastRenderedPageBreak/>
         <w:drawing>
-          <wp:inline distT="0" distB="0" distL="0" distR="0" wp14:anchorId="355A9D6F" wp14:editId="2582DE35">
+          <wp:inline distT="0" distB="0" distL="0" distR="0" wp14:anchorId="6C9F530C" wp14:editId="78A0600B">
             <wp:extent cx="5303520" cy="4792851"/>
             <wp:effectExtent l="19050" t="19050" r="11430" b="27305"/>
-            <wp:docPr id="37328181" name="Imagem 49"/>
+            <wp:docPr id="1584954303" name="Imagem 49"/>
             <wp:cNvGraphicFramePr/>
             <a:graphic xmlns:a="http://schemas.openxmlformats.org/drawingml/2006/main">
               <a:graphicData uri="http://schemas.openxmlformats.org/drawingml/2006/picture">
                 <pic:pic xmlns:pic="http://schemas.openxmlformats.org/drawingml/2006/picture">
                   <pic:nvPicPr>
-                    <pic:cNvPr id="37328181" name=""/>
+                    <pic:cNvPr id="1584954303" name=""/>
                     <pic:cNvPicPr/>
                   </pic:nvPicPr>
                   <pic:blipFill>
@@ -20735,7 +20829,7 @@
           <w:sz w:val="27"/>
         </w:rPr>
       </w:pPr>
-      <w:bookmarkStart w:id="44" w:name="_Toc240387701"/>
+      <w:bookmarkStart w:id="44" w:name="_Toc240442852"/>
       <w:r>
         <w:rPr>
           <w:rFonts w:ascii="Montserrat" w:hAnsi="Montserrat"/>
@@ -21000,16 +21094,16 @@
           <w:noProof/>
         </w:rPr>
         <w:drawing>
-          <wp:inline distT="0" distB="0" distL="0" distR="0" wp14:anchorId="01FBCF5E" wp14:editId="252C9FF1">
+          <wp:inline distT="0" distB="0" distL="0" distR="0" wp14:anchorId="19571DDC" wp14:editId="4B9C57F3">
             <wp:extent cx="5303520" cy="4267180"/>
             <wp:effectExtent l="19050" t="19050" r="11430" b="19685"/>
-            <wp:docPr id="1274485378" name="Imagem 50"/>
+            <wp:docPr id="1377404577" name="Imagem 50"/>
             <wp:cNvGraphicFramePr/>
             <a:graphic xmlns:a="http://schemas.openxmlformats.org/drawingml/2006/main">
               <a:graphicData uri="http://schemas.openxmlformats.org/drawingml/2006/picture">
                 <pic:pic xmlns:pic="http://schemas.openxmlformats.org/drawingml/2006/picture">
                   <pic:nvPicPr>
-                    <pic:cNvPr id="1274485378" name=""/>
+                    <pic:cNvPr id="1377404577" name=""/>
                     <pic:cNvPicPr/>
                   </pic:nvPicPr>
                   <pic:blipFill>
@@ -21077,16 +21171,16 @@
           <w:noProof/>
         </w:rPr>
         <w:drawing>
-          <wp:inline distT="0" distB="0" distL="0" distR="0" wp14:anchorId="395D7C93" wp14:editId="0A3D8EE4">
+          <wp:inline distT="0" distB="0" distL="0" distR="0" wp14:anchorId="0378EBBE" wp14:editId="535D47A9">
             <wp:extent cx="5303520" cy="3382059"/>
             <wp:effectExtent l="19050" t="19050" r="11430" b="27940"/>
-            <wp:docPr id="1494827000" name="Imagem 51"/>
+            <wp:docPr id="747766240" name="Imagem 51"/>
             <wp:cNvGraphicFramePr/>
             <a:graphic xmlns:a="http://schemas.openxmlformats.org/drawingml/2006/main">
               <a:graphicData uri="http://schemas.openxmlformats.org/drawingml/2006/picture">
                 <pic:pic xmlns:pic="http://schemas.openxmlformats.org/drawingml/2006/picture">
                   <pic:nvPicPr>
-                    <pic:cNvPr id="1494827000" name=""/>
+                    <pic:cNvPr id="747766240" name=""/>
                     <pic:cNvPicPr/>
                   </pic:nvPicPr>
                   <pic:blipFill>
@@ -21154,16 +21248,16 @@
         </w:rPr>
         <w:lastRenderedPageBreak/>
         <w:drawing>
-          <wp:inline distT="0" distB="0" distL="0" distR="0" wp14:anchorId="08691D3E" wp14:editId="55F85F15">
+          <wp:inline distT="0" distB="0" distL="0" distR="0" wp14:anchorId="2A610DE4" wp14:editId="5144774E">
             <wp:extent cx="5303520" cy="4417800"/>
             <wp:effectExtent l="19050" t="19050" r="11430" b="20955"/>
-            <wp:docPr id="664408361" name="Imagem 52"/>
+            <wp:docPr id="1857175213" name="Imagem 52"/>
             <wp:cNvGraphicFramePr/>
             <a:graphic xmlns:a="http://schemas.openxmlformats.org/drawingml/2006/main">
               <a:graphicData uri="http://schemas.openxmlformats.org/drawingml/2006/picture">
                 <pic:pic xmlns:pic="http://schemas.openxmlformats.org/drawingml/2006/picture">
                   <pic:nvPicPr>
-                    <pic:cNvPr id="664408361" name=""/>
+                    <pic:cNvPr id="1857175213" name=""/>
                     <pic:cNvPicPr/>
                   </pic:nvPicPr>
                   <pic:blipFill>
@@ -21273,7 +21367,7 @@
           <w:sz w:val="27"/>
         </w:rPr>
       </w:pPr>
-      <w:bookmarkStart w:id="45" w:name="_Toc240387702"/>
+      <w:bookmarkStart w:id="45" w:name="_Toc240442853"/>
       <w:r>
         <w:rPr>
           <w:rFonts w:ascii="Montserrat" w:hAnsi="Montserrat"/>
@@ -21539,16 +21633,16 @@
         </w:rPr>
         <w:lastRenderedPageBreak/>
         <w:drawing>
-          <wp:inline distT="0" distB="0" distL="0" distR="0" wp14:anchorId="7CA3FD42" wp14:editId="4C12D772">
+          <wp:inline distT="0" distB="0" distL="0" distR="0" wp14:anchorId="0D54F1E4" wp14:editId="3DAF8A3B">
             <wp:extent cx="5303520" cy="7628836"/>
             <wp:effectExtent l="19050" t="19050" r="11430" b="10795"/>
-            <wp:docPr id="1553976523" name="Imagem 53"/>
+            <wp:docPr id="104613115" name="Imagem 53"/>
             <wp:cNvGraphicFramePr/>
             <a:graphic xmlns:a="http://schemas.openxmlformats.org/drawingml/2006/main">
               <a:graphicData uri="http://schemas.openxmlformats.org/drawingml/2006/picture">
                 <pic:pic xmlns:pic="http://schemas.openxmlformats.org/drawingml/2006/picture">
                   <pic:nvPicPr>
-                    <pic:cNvPr id="1553976523" name=""/>
+                    <pic:cNvPr id="104613115" name=""/>
                     <pic:cNvPicPr/>
                   </pic:nvPicPr>
                   <pic:blipFill>
@@ -21680,7 +21774,7 @@
           <w:sz w:val="27"/>
         </w:rPr>
       </w:pPr>
-      <w:bookmarkStart w:id="46" w:name="_Toc240387703"/>
+      <w:bookmarkStart w:id="46" w:name="_Toc240442854"/>
       <w:r>
         <w:rPr>
           <w:rFonts w:ascii="Montserrat" w:hAnsi="Montserrat"/>
@@ -21791,7 +21885,7 @@
           <w:sz w:val="27"/>
         </w:rPr>
       </w:pPr>
-      <w:bookmarkStart w:id="47" w:name="_Toc240387704"/>
+      <w:bookmarkStart w:id="47" w:name="_Toc240442855"/>
       <w:r>
         <w:rPr>
           <w:rFonts w:ascii="Montserrat" w:hAnsi="Montserrat"/>
@@ -22012,7 +22106,7 @@
           <w:sz w:val="27"/>
         </w:rPr>
       </w:pPr>
-      <w:bookmarkStart w:id="48" w:name="_Toc240387705"/>
+      <w:bookmarkStart w:id="48" w:name="_Toc240442856"/>
       <w:r>
         <w:rPr>
           <w:rFonts w:ascii="Montserrat" w:hAnsi="Montserrat"/>
@@ -22639,16 +22733,16 @@
         </w:rPr>
         <w:lastRenderedPageBreak/>
         <w:drawing>
-          <wp:inline distT="0" distB="0" distL="0" distR="0" wp14:anchorId="4AEA6F3A" wp14:editId="68383E25">
+          <wp:inline distT="0" distB="0" distL="0" distR="0" wp14:anchorId="2A07A6FB" wp14:editId="37E41EDA">
             <wp:extent cx="5120640" cy="6240599"/>
             <wp:effectExtent l="19050" t="19050" r="22860" b="27305"/>
-            <wp:docPr id="172121933" name="Imagem 54"/>
+            <wp:docPr id="1235673178" name="Imagem 54"/>
             <wp:cNvGraphicFramePr/>
             <a:graphic xmlns:a="http://schemas.openxmlformats.org/drawingml/2006/main">
               <a:graphicData uri="http://schemas.openxmlformats.org/drawingml/2006/picture">
                 <pic:pic xmlns:pic="http://schemas.openxmlformats.org/drawingml/2006/picture">
                   <pic:nvPicPr>
-                    <pic:cNvPr id="172121933" name=""/>
+                    <pic:cNvPr id="1235673178" name=""/>
                     <pic:cNvPicPr/>
                   </pic:nvPicPr>
                   <pic:blipFill>
@@ -22786,7 +22880,7 @@
           <w:sz w:val="27"/>
         </w:rPr>
       </w:pPr>
-      <w:bookmarkStart w:id="49" w:name="_Toc240387706"/>
+      <w:bookmarkStart w:id="49" w:name="_Toc240442857"/>
       <w:r>
         <w:rPr>
           <w:rFonts w:ascii="Montserrat" w:hAnsi="Montserrat"/>
@@ -22794,7 +22888,7 @@
           <w:color w:val="B91D2E"/>
           <w:sz w:val="27"/>
         </w:rPr>
-        <w:t>6.5 Ambiente de Treino</w:t>
+        <w:t>6.4.5 Gestao de Atividades</w:t>
       </w:r>
       <w:bookmarkEnd w:id="49"/>
     </w:p>
@@ -22813,25 +22907,7 @@
           <w:color w:val="1A1A1A"/>
           <w:sz w:val="22"/>
         </w:rPr>
-        <w:t>O sistema tem um ambiente de treinamento/demonstracao totalmente separado da producao - mesma ferramenta, mesmo schema de dados, mas um banco proprio, populado com 7 projetos ficticios cobrindo o ciclo completo (de uma Solicitacao de Demanda ainda pendente ate um projeto totalmente encerrado com TEP e RLA). Serve para apresentacoes, estudo e capacitacao sem tocar em nenhum dado real. Veja o roteiro Como rodar o Ambiente de Treinamento para o endereco, as contas de acesso e o passo a passo completo.</w:t>
-      </w:r>
-    </w:p>
-    <w:p>
-      <w:pPr>
-        <w:spacing w:line="280" w:lineRule="auto"/>
-        <w:rPr>
-          <w:rFonts w:ascii="Montserrat" w:hAnsi="Montserrat"/>
-          <w:color w:val="1A1A1A"/>
-          <w:sz w:val="22"/>
-        </w:rPr>
-      </w:pPr>
-      <w:r>
-        <w:rPr>
-          <w:rFonts w:ascii="Montserrat" w:hAnsi="Montserrat"/>
-          <w:color w:val="1A1A1A"/>
-          <w:sz w:val="22"/>
-        </w:rPr>
-        <w:t>Quando a Administracao e acessada em producao, aparece uma quarta aba, Ambiente de Treino, com um unico botao: Resetar ambiente de treinamento. Ao clicar (e confirmar o aviso), o sistema apaga todos os projetos e registros de formulario atualmente no ambiente de treinamento e recria os 7 projetos de exemplo do zero - util para deixar o ambiente limpo antes de uma nova turma, sem precisar rodar nenhum comando manualmente.</w:t>
+        <w:t>Visao agregada, para Admin/PMO, da carga de trabalho de toda a equipe: agrupa os mesmos itens do Meu Painel (secao 6.4.4) - marcos e tarefas do cronograma, riscos do TAP, entradas do Planejamento, entraves/encaminhamentos do Relatorio de Situacao - mas por conta responsavel, nao por login individual. Por padrao so o Admin ve esta pagina, mas isso pode ser ampliado para outros papeis em Administracao &gt; Configuracoes (secao 6.3), da mesma forma que o Painel Executivo e o Painel de Prazos.</w:t>
       </w:r>
     </w:p>
     <w:p>
@@ -22855,7 +22931,7 @@
           <w:color w:val="1A1A1A"/>
           <w:sz w:val="22"/>
         </w:rPr>
-        <w:t>A aba so aparece quando a Administracao e acessada pelo endereco de producao - quem acessa a Administracao pelo proprio ambiente de treinamento nao ve essa opcao.</w:t>
+        <w:t>Quatro indicadores no topo: quantas pessoas tem pelo menos um item pendente, total de itens em aberto no portfolio, quantos estao atrasados (marcos vencidos sem Conclusao real e entraves/encaminhamentos com prazo vencido) e quantos itens em aberto ainda nao tem nenhuma conta responsavel atribuida.</w:t>
       </w:r>
     </w:p>
     <w:p>
@@ -22879,7 +22955,7 @@
           <w:color w:val="1A1A1A"/>
           <w:sz w:val="22"/>
         </w:rPr>
-        <w:t>Nao afeta nenhum dado de producao em nenhuma hipotese - a acao roda numa Edge Function que so tem permissao de escrita no banco do ambiente de treinamento.</w:t>
+        <w:t>Um cartao por pessoa, com nome, papel e a contagem de itens em cada uma das 5 categorias, mais quantos estao atrasados - clicar no cartao expande a lista detalhada de cada item, na mesma organizacao do Meu Painel. E somente visualizacao: nao ha botao para concluir um item em nome de outra pessoa.</w:t>
       </w:r>
     </w:p>
     <w:p>
@@ -22903,7 +22979,84 @@
           <w:color w:val="1A1A1A"/>
           <w:sz w:val="22"/>
         </w:rPr>
-        <w:t>As 6 contas fixas de treinamento e as configuracoes do ambiente de treino nao sao apagadas pelo reset - so os projetos e os registros de formulario.</w:t>
+        <w:t>Itens sem responsavel (conta) atribuido: contagem por categoria dos itens em aberto que so tem o campo de texto livre Responsavel preenchido, sem o seletor de conta - ajuda o PMO a encontrar pendencias sem dono definido antes que virem atraso.</w:t>
+      </w:r>
+    </w:p>
+    <w:p>
+      <w:pPr>
+        <w:spacing w:before="120" w:after="40"/>
+        <w:jc w:val="center"/>
+      </w:pPr>
+      <w:r>
+        <w:rPr>
+          <w:noProof/>
+        </w:rPr>
+        <w:lastRenderedPageBreak/>
+        <w:drawing>
+          <wp:inline distT="0" distB="0" distL="0" distR="0" wp14:anchorId="37A3E60F" wp14:editId="1EACEF30">
+            <wp:extent cx="5120640" cy="6187296"/>
+            <wp:effectExtent l="19050" t="19050" r="22860" b="23495"/>
+            <wp:docPr id="1379122612" name="Imagem 55"/>
+            <wp:cNvGraphicFramePr/>
+            <a:graphic xmlns:a="http://schemas.openxmlformats.org/drawingml/2006/main">
+              <a:graphicData uri="http://schemas.openxmlformats.org/drawingml/2006/picture">
+                <pic:pic xmlns:pic="http://schemas.openxmlformats.org/drawingml/2006/picture">
+                  <pic:nvPicPr>
+                    <pic:cNvPr id="1379122612" name=""/>
+                    <pic:cNvPicPr/>
+                  </pic:nvPicPr>
+                  <pic:blipFill>
+                    <a:blip r:embed="rId61">
+                      <a:extLst>
+                        <a:ext uri="{28A0092B-C50C-407E-A947-70E740481C1C}">
+                          <a14:useLocalDpi xmlns:a14="http://schemas.microsoft.com/office/drawing/2010/main" val="0"/>
+                        </a:ext>
+                      </a:extLst>
+                    </a:blip>
+                    <a:stretch>
+                      <a:fillRect/>
+                    </a:stretch>
+                  </pic:blipFill>
+                  <pic:spPr>
+                    <a:xfrm>
+                      <a:off x="0" y="0"/>
+                      <a:ext cx="5120640" cy="6187296"/>
+                    </a:xfrm>
+                    <a:prstGeom prst="rect">
+                      <a:avLst/>
+                    </a:prstGeom>
+                    <a:ln w="9525">
+                      <a:solidFill>
+                        <a:srgbClr val="D1D5DB"/>
+                      </a:solidFill>
+                    </a:ln>
+                  </pic:spPr>
+                </pic:pic>
+              </a:graphicData>
+            </a:graphic>
+          </wp:inline>
+        </w:drawing>
+      </w:r>
+    </w:p>
+    <w:p>
+      <w:pPr>
+        <w:spacing w:before="120" w:after="280"/>
+        <w:jc w:val="center"/>
+        <w:rPr>
+          <w:rFonts w:ascii="Montserrat" w:hAnsi="Montserrat"/>
+          <w:i/>
+          <w:color w:val="6A6A70"/>
+          <w:sz w:val="19"/>
+        </w:rPr>
+      </w:pPr>
+      <w:r>
+        <w:rPr>
+          <w:rFonts w:ascii="Montserrat" w:hAnsi="Montserrat"/>
+          <w:i/>
+          <w:color w:val="6A6A70"/>
+          <w:sz w:val="19"/>
+        </w:rPr>
+        <w:t>Gestao de Atividades: indicadores gerais e um cartao expandido mostrando o detalhamento por categoria de uma pessoa.</w:t>
       </w:r>
     </w:p>
     <w:p>
@@ -22924,7 +23077,7 @@
           <w:color w:val="6A6A70"/>
           <w:sz w:val="21"/>
         </w:rPr>
-        <w:t>Assim como as outras acoes exclusivas de Admin, a Edge Function confere o papel do usuario direto no banco de producao antes de fazer qualquer alteracao - nao basta ver o botao na tela.</w:t>
+        <w:t>Controle de acesso (Row Level Security no Supabase): diferente das demais listas de papeis da Administracao, a permissao desta pagina tambem libera enxergar nome e papel de todos os usuarios do sistema, nao so abrir a tela - e o dado que a pagina usa para agrupar as pendencias por pessoa. A funcao listar_perfis_gestao_atividades (SECURITY DEFINER) confere essa permissao direto no banco antes de devolver qualquer linha - mesmo alguem tentando contornar a tela nao consegue essa lista sem estar autorizado.</w:t>
       </w:r>
     </w:p>
     <w:p>
@@ -22938,7 +23091,7 @@
           <w:sz w:val="27"/>
         </w:rPr>
       </w:pPr>
-      <w:bookmarkStart w:id="50" w:name="_Toc240387707"/>
+      <w:bookmarkStart w:id="50" w:name="_Toc240442858"/>
       <w:r>
         <w:rPr>
           <w:rFonts w:ascii="Montserrat" w:hAnsi="Montserrat"/>
@@ -22946,7 +23099,8 @@
           <w:color w:val="B91D2E"/>
           <w:sz w:val="27"/>
         </w:rPr>
-        <w:t>6.6 Backup automatizado</w:t>
+        <w:lastRenderedPageBreak/>
+        <w:t>6.5 Ambiente de Treino</w:t>
       </w:r>
       <w:bookmarkEnd w:id="50"/>
     </w:p>
@@ -22965,7 +23119,25 @@
           <w:color w:val="1A1A1A"/>
           <w:sz w:val="22"/>
         </w:rPr>
-        <w:t>No fim da aba Configuracoes (secao 6.3), um bloco separado deixa o Admin/PMO definir os parametros de uma rotina de backup periodico do sistema inteiro (banco de dados, arquivos anexados e codigo-fonte) para um destino fora do GitHub - complemento operacional a proposta Backup Automatizado entregue separadamente.</w:t>
+        <w:t>O sistema tem um ambiente de treinamento/demonstracao totalmente separado da producao - mesma ferramenta, mesmo schema de dados, mas um banco proprio, populado com 7 projetos ficticios cobrindo o ciclo completo (de uma Solicitacao de Demanda ainda pendente ate um projeto totalmente encerrado com TEP e RLA). Serve para apresentacoes, estudo e capacitacao sem tocar em nenhum dado real. Veja o roteiro Como rodar o Ambiente de Treinamento para o endereco, as contas de acesso e o passo a passo completo.</w:t>
+      </w:r>
+    </w:p>
+    <w:p>
+      <w:pPr>
+        <w:spacing w:line="280" w:lineRule="auto"/>
+        <w:rPr>
+          <w:rFonts w:ascii="Montserrat" w:hAnsi="Montserrat"/>
+          <w:color w:val="1A1A1A"/>
+          <w:sz w:val="22"/>
+        </w:rPr>
+      </w:pPr>
+      <w:r>
+        <w:rPr>
+          <w:rFonts w:ascii="Montserrat" w:hAnsi="Montserrat"/>
+          <w:color w:val="1A1A1A"/>
+          <w:sz w:val="22"/>
+        </w:rPr>
+        <w:t>Quando a Administracao e acessada em producao, aparece uma quarta aba, Ambiente de Treino, com um unico botao: Resetar ambiente de treinamento. Ao clicar (e confirmar o aviso), o sistema apaga todos os projetos e registros de formulario atualmente no ambiente de treinamento e recria os 7 projetos de exemplo do zero - util para deixar o ambiente limpo antes de uma nova turma, sem precisar rodar nenhum comando manualmente.</w:t>
       </w:r>
     </w:p>
     <w:p>
@@ -22989,8 +23161,7 @@
           <w:color w:val="1A1A1A"/>
           <w:sz w:val="22"/>
         </w:rPr>
-        <w:lastRenderedPageBreak/>
-        <w:t>Habilitar backup automatizado: interruptor geral da rotina.</w:t>
+        <w:t>A aba so aparece quando a Administracao e acessada pelo endereco de producao - quem acessa a Administracao pelo proprio ambiente de treinamento nao ve essa opcao.</w:t>
       </w:r>
     </w:p>
     <w:p>
@@ -23014,7 +23185,7 @@
           <w:color w:val="1A1A1A"/>
           <w:sz w:val="22"/>
         </w:rPr>
-        <w:t>Destino: OneDrive/SharePoint institucional, outro armazenamento de nuvem ou servidor da instituicao, mais o caminho/pasta exato onde gravar.</w:t>
+        <w:t>Nao afeta nenhum dado de producao em nenhuma hipotese - a acao roda numa Edge Function que so tem permissao de escrita no banco do ambiente de treinamento.</w:t>
       </w:r>
     </w:p>
     <w:p>
@@ -23038,7 +23209,69 @@
           <w:color w:val="1A1A1A"/>
           <w:sz w:val="22"/>
         </w:rPr>
-        <w:t>Frequencia: diaria ou semanal.</w:t>
+        <w:t>As 6 contas fixas de treinamento e as configuracoes do ambiente de treino nao sao apagadas pelo reset - so os projetos e os registros de formulario.</w:t>
+      </w:r>
+    </w:p>
+    <w:p>
+      <w:pPr>
+        <w:spacing w:before="160" w:after="200"/>
+        <w:ind w:left="283"/>
+        <w:rPr>
+          <w:rFonts w:ascii="Montserrat" w:hAnsi="Montserrat"/>
+          <w:i/>
+          <w:color w:val="6A6A70"/>
+          <w:sz w:val="21"/>
+        </w:rPr>
+      </w:pPr>
+      <w:r>
+        <w:rPr>
+          <w:rFonts w:ascii="Montserrat" w:hAnsi="Montserrat"/>
+          <w:i/>
+          <w:color w:val="6A6A70"/>
+          <w:sz w:val="21"/>
+        </w:rPr>
+        <w:t>Assim como as outras acoes exclusivas de Admin, a Edge Function confere o papel do usuario direto no banco de producao antes de fazer qualquer alteracao - nao basta ver o botao na tela.</w:t>
+      </w:r>
+    </w:p>
+    <w:p>
+      <w:pPr>
+        <w:pStyle w:val="Ttulo2"/>
+        <w:spacing w:before="320" w:after="120"/>
+        <w:rPr>
+          <w:rFonts w:ascii="Montserrat" w:hAnsi="Montserrat"/>
+          <w:b/>
+          <w:color w:val="B91D2E"/>
+          <w:sz w:val="27"/>
+        </w:rPr>
+      </w:pPr>
+      <w:bookmarkStart w:id="51" w:name="_Toc240442859"/>
+      <w:r>
+        <w:rPr>
+          <w:rFonts w:ascii="Montserrat" w:hAnsi="Montserrat"/>
+          <w:b/>
+          <w:color w:val="B91D2E"/>
+          <w:sz w:val="27"/>
+        </w:rPr>
+        <w:t>6.6 Backup automatizado</w:t>
+      </w:r>
+      <w:bookmarkEnd w:id="51"/>
+    </w:p>
+    <w:p>
+      <w:pPr>
+        <w:spacing w:line="280" w:lineRule="auto"/>
+        <w:rPr>
+          <w:rFonts w:ascii="Montserrat" w:hAnsi="Montserrat"/>
+          <w:color w:val="1A1A1A"/>
+          <w:sz w:val="22"/>
+        </w:rPr>
+      </w:pPr>
+      <w:r>
+        <w:rPr>
+          <w:rFonts w:ascii="Montserrat" w:hAnsi="Montserrat"/>
+          <w:color w:val="1A1A1A"/>
+          <w:sz w:val="22"/>
+        </w:rPr>
+        <w:t>No fim da aba Configuracoes (secao 6.3), um bloco separado deixa o Admin/PMO definir os parametros de uma rotina de backup periodico do sistema inteiro (banco de dados, arquivos anexados e codigo-fonte) para um destino fora do GitHub - complemento operacional a proposta Backup Automatizado entregue separadamente.</w:t>
       </w:r>
     </w:p>
     <w:p>
@@ -23046,7 +23279,7 @@
         <w:pStyle w:val="PargrafodaLista"/>
         <w:numPr>
           <w:ilvl w:val="0"/>
-          <w:numId w:val="37"/>
+          <w:numId w:val="38"/>
         </w:numPr>
         <w:spacing w:after="80" w:line="260" w:lineRule="auto"/>
         <w:ind w:left="700"/>
@@ -23062,7 +23295,7 @@
           <w:color w:val="1A1A1A"/>
           <w:sz w:val="22"/>
         </w:rPr>
-        <w:t>Retencao (dias, opcional): depois de quantos dias os backups antigos podem ser descartados; vazio mantem tudo indefinidamente.</w:t>
+        <w:t>Habilitar backup automatizado: interruptor geral da rotina.</w:t>
       </w:r>
     </w:p>
     <w:p>
@@ -23070,7 +23303,7 @@
         <w:pStyle w:val="PargrafodaLista"/>
         <w:numPr>
           <w:ilvl w:val="0"/>
-          <w:numId w:val="37"/>
+          <w:numId w:val="38"/>
         </w:numPr>
         <w:spacing w:after="80" w:line="260" w:lineRule="auto"/>
         <w:ind w:left="700"/>
@@ -23086,7 +23319,7 @@
           <w:color w:val="1A1A1A"/>
           <w:sz w:val="22"/>
         </w:rPr>
-        <w:t>E-mail de alerta: para onde avisar automaticamente se uma execucao falhar.</w:t>
+        <w:t>Destino: OneDrive/SharePoint institucional, outro armazenamento de nuvem ou servidor da instituicao, mais o caminho/pasta exato onde gravar.</w:t>
       </w:r>
     </w:p>
     <w:p>
@@ -23094,7 +23327,7 @@
         <w:pStyle w:val="PargrafodaLista"/>
         <w:numPr>
           <w:ilvl w:val="0"/>
-          <w:numId w:val="37"/>
+          <w:numId w:val="38"/>
         </w:numPr>
         <w:spacing w:after="80" w:line="260" w:lineRule="auto"/>
         <w:ind w:left="700"/>
@@ -23110,7 +23343,7 @@
           <w:color w:val="1A1A1A"/>
           <w:sz w:val="22"/>
         </w:rPr>
-        <w:t>E-mails com acesso ao destino externo: campo de registro/referencia de quem deveria ter permissao na pasta de destino - conceder esse acesso de fato continua sendo feito manualmente onde o destino estiver (OneDrive, repositorio etc.).</w:t>
+        <w:t>Frequencia: diaria ou semanal.</w:t>
       </w:r>
     </w:p>
     <w:p>
@@ -23118,7 +23351,7 @@
         <w:pStyle w:val="PargrafodaLista"/>
         <w:numPr>
           <w:ilvl w:val="0"/>
-          <w:numId w:val="37"/>
+          <w:numId w:val="38"/>
         </w:numPr>
         <w:spacing w:after="80" w:line="260" w:lineRule="auto"/>
         <w:ind w:left="700"/>
@@ -23134,7 +23367,8 @@
           <w:color w:val="1A1A1A"/>
           <w:sz w:val="22"/>
         </w:rPr>
-        <w:t>Quem pode gerenciar essas configuracoes: papeis liberados para alterar esta tela, alem do PMO/Admin, que sempre tem acesso.</w:t>
+        <w:lastRenderedPageBreak/>
+        <w:t>Retencao (dias, opcional): depois de quantos dias os backups antigos podem ser descartados; vazio mantem tudo indefinidamente.</w:t>
       </w:r>
     </w:p>
     <w:p>
@@ -23142,7 +23376,7 @@
         <w:pStyle w:val="PargrafodaLista"/>
         <w:numPr>
           <w:ilvl w:val="0"/>
-          <w:numId w:val="37"/>
+          <w:numId w:val="38"/>
         </w:numPr>
         <w:spacing w:after="80" w:line="260" w:lineRule="auto"/>
         <w:ind w:left="700"/>
@@ -23158,6 +23392,78 @@
           <w:color w:val="1A1A1A"/>
           <w:sz w:val="22"/>
         </w:rPr>
+        <w:t>E-mail de alerta: para onde avisar automaticamente se uma execucao falhar.</w:t>
+      </w:r>
+    </w:p>
+    <w:p>
+      <w:pPr>
+        <w:pStyle w:val="PargrafodaLista"/>
+        <w:numPr>
+          <w:ilvl w:val="0"/>
+          <w:numId w:val="38"/>
+        </w:numPr>
+        <w:spacing w:after="80" w:line="260" w:lineRule="auto"/>
+        <w:ind w:left="700"/>
+        <w:rPr>
+          <w:rFonts w:ascii="Montserrat" w:hAnsi="Montserrat"/>
+          <w:color w:val="1A1A1A"/>
+          <w:sz w:val="22"/>
+        </w:rPr>
+      </w:pPr>
+      <w:r>
+        <w:rPr>
+          <w:rFonts w:ascii="Montserrat" w:hAnsi="Montserrat"/>
+          <w:color w:val="1A1A1A"/>
+          <w:sz w:val="22"/>
+        </w:rPr>
+        <w:t>E-mails com acesso ao destino externo: campo de registro/referencia de quem deveria ter permissao na pasta de destino - conceder esse acesso de fato continua sendo feito manualmente onde o destino estiver (OneDrive, repositorio etc.).</w:t>
+      </w:r>
+    </w:p>
+    <w:p>
+      <w:pPr>
+        <w:pStyle w:val="PargrafodaLista"/>
+        <w:numPr>
+          <w:ilvl w:val="0"/>
+          <w:numId w:val="38"/>
+        </w:numPr>
+        <w:spacing w:after="80" w:line="260" w:lineRule="auto"/>
+        <w:ind w:left="700"/>
+        <w:rPr>
+          <w:rFonts w:ascii="Montserrat" w:hAnsi="Montserrat"/>
+          <w:color w:val="1A1A1A"/>
+          <w:sz w:val="22"/>
+        </w:rPr>
+      </w:pPr>
+      <w:r>
+        <w:rPr>
+          <w:rFonts w:ascii="Montserrat" w:hAnsi="Montserrat"/>
+          <w:color w:val="1A1A1A"/>
+          <w:sz w:val="22"/>
+        </w:rPr>
+        <w:t>Quem pode gerenciar essas configuracoes: papeis liberados para alterar esta tela, alem do PMO/Admin, que sempre tem acesso.</w:t>
+      </w:r>
+    </w:p>
+    <w:p>
+      <w:pPr>
+        <w:pStyle w:val="PargrafodaLista"/>
+        <w:numPr>
+          <w:ilvl w:val="0"/>
+          <w:numId w:val="38"/>
+        </w:numPr>
+        <w:spacing w:after="80" w:line="260" w:lineRule="auto"/>
+        <w:ind w:left="700"/>
+        <w:rPr>
+          <w:rFonts w:ascii="Montserrat" w:hAnsi="Montserrat"/>
+          <w:color w:val="1A1A1A"/>
+          <w:sz w:val="22"/>
+        </w:rPr>
+      </w:pPr>
+      <w:r>
+        <w:rPr>
+          <w:rFonts w:ascii="Montserrat" w:hAnsi="Montserrat"/>
+          <w:color w:val="1A1A1A"/>
+          <w:sz w:val="22"/>
+        </w:rPr>
         <w:t>Ultima execucao: data/hora e status (sucesso ou falha) da ultima vez que a rotina automatizada rodou, preenchido por ela mesma.</w:t>
       </w:r>
     </w:p>
@@ -23230,22 +23536,21 @@
         <w:rPr>
           <w:noProof/>
         </w:rPr>
-        <w:lastRenderedPageBreak/>
         <w:drawing>
-          <wp:inline distT="0" distB="0" distL="0" distR="0" wp14:anchorId="41A45893" wp14:editId="503F632D">
+          <wp:inline distT="0" distB="0" distL="0" distR="0" wp14:anchorId="66F6DD3D" wp14:editId="014ADF01">
             <wp:extent cx="5303520" cy="1351384"/>
             <wp:effectExtent l="19050" t="19050" r="11430" b="20320"/>
-            <wp:docPr id="828470365" name="Imagem 55"/>
+            <wp:docPr id="398032274" name="Imagem 56"/>
             <wp:cNvGraphicFramePr/>
             <a:graphic xmlns:a="http://schemas.openxmlformats.org/drawingml/2006/main">
               <a:graphicData uri="http://schemas.openxmlformats.org/drawingml/2006/picture">
                 <pic:pic xmlns:pic="http://schemas.openxmlformats.org/drawingml/2006/picture">
                   <pic:nvPicPr>
-                    <pic:cNvPr id="828470365" name=""/>
+                    <pic:cNvPr id="398032274" name=""/>
                     <pic:cNvPicPr/>
                   </pic:nvPicPr>
                   <pic:blipFill>
-                    <a:blip r:embed="rId61">
+                    <a:blip r:embed="rId62">
                       <a:extLst>
                         <a:ext uri="{28A0092B-C50C-407E-A947-70E740481C1C}">
                           <a14:useLocalDpi xmlns:a14="http://schemas.microsoft.com/office/drawing/2010/main" val="0"/>
@@ -23309,7 +23614,7 @@
           <w:sz w:val="27"/>
         </w:rPr>
       </w:pPr>
-      <w:bookmarkStart w:id="51" w:name="_Toc240387708"/>
+      <w:bookmarkStart w:id="52" w:name="_Toc240442860"/>
       <w:r>
         <w:rPr>
           <w:rFonts w:ascii="Montserrat" w:hAnsi="Montserrat"/>
@@ -23317,9 +23622,10 @@
           <w:color w:val="B91D2E"/>
           <w:sz w:val="27"/>
         </w:rPr>
+        <w:lastRenderedPageBreak/>
         <w:t>6.7 Relatorio de Resultados</w:t>
       </w:r>
-      <w:bookmarkEnd w:id="51"/>
+      <w:bookmarkEnd w:id="52"/>
     </w:p>
     <w:p>
       <w:pPr>
@@ -23344,7 +23650,7 @@
         <w:pStyle w:val="PargrafodaLista"/>
         <w:numPr>
           <w:ilvl w:val="0"/>
-          <w:numId w:val="38"/>
+          <w:numId w:val="39"/>
         </w:numPr>
         <w:spacing w:after="80" w:line="260" w:lineRule="auto"/>
         <w:ind w:left="700"/>
@@ -23368,7 +23674,7 @@
         <w:pStyle w:val="PargrafodaLista"/>
         <w:numPr>
           <w:ilvl w:val="0"/>
-          <w:numId w:val="38"/>
+          <w:numId w:val="39"/>
         </w:numPr>
         <w:spacing w:after="80" w:line="260" w:lineRule="auto"/>
         <w:ind w:left="700"/>
@@ -23392,7 +23698,7 @@
         <w:pStyle w:val="PargrafodaLista"/>
         <w:numPr>
           <w:ilvl w:val="0"/>
-          <w:numId w:val="38"/>
+          <w:numId w:val="39"/>
         </w:numPr>
         <w:spacing w:after="80" w:line="260" w:lineRule="auto"/>
         <w:ind w:left="700"/>
@@ -23416,7 +23722,7 @@
         <w:pStyle w:val="PargrafodaLista"/>
         <w:numPr>
           <w:ilvl w:val="0"/>
-          <w:numId w:val="38"/>
+          <w:numId w:val="39"/>
         </w:numPr>
         <w:spacing w:after="80" w:line="260" w:lineRule="auto"/>
         <w:ind w:left="700"/>
@@ -23445,20 +23751,20 @@
           <w:noProof/>
         </w:rPr>
         <w:drawing>
-          <wp:inline distT="0" distB="0" distL="0" distR="0" wp14:anchorId="74118353" wp14:editId="054B5B6F">
+          <wp:inline distT="0" distB="0" distL="0" distR="0" wp14:anchorId="204EE3AE" wp14:editId="76A18E12">
             <wp:extent cx="5303520" cy="1422793"/>
             <wp:effectExtent l="19050" t="19050" r="11430" b="25400"/>
-            <wp:docPr id="63453978" name="Imagem 56"/>
+            <wp:docPr id="913357673" name="Imagem 57"/>
             <wp:cNvGraphicFramePr/>
             <a:graphic xmlns:a="http://schemas.openxmlformats.org/drawingml/2006/main">
               <a:graphicData uri="http://schemas.openxmlformats.org/drawingml/2006/picture">
                 <pic:pic xmlns:pic="http://schemas.openxmlformats.org/drawingml/2006/picture">
                   <pic:nvPicPr>
-                    <pic:cNvPr id="63453978" name=""/>
+                    <pic:cNvPr id="913357673" name=""/>
                     <pic:cNvPicPr/>
                   </pic:nvPicPr>
                   <pic:blipFill>
-                    <a:blip r:embed="rId62">
+                    <a:blip r:embed="rId63">
                       <a:extLst>
                         <a:ext uri="{28A0092B-C50C-407E-A947-70E740481C1C}">
                           <a14:useLocalDpi xmlns:a14="http://schemas.microsoft.com/office/drawing/2010/main" val="0"/>
@@ -23508,7 +23814,6 @@
           <w:color w:val="6A6A70"/>
           <w:sz w:val="19"/>
         </w:rPr>
-        <w:lastRenderedPageBreak/>
         <w:t>Os quatro indicadores estrategicos do Relatorio de Resultados, com meta, barra de progresso, selo de status e tendencia.</w:t>
       </w:r>
     </w:p>
@@ -23551,27 +23856,37 @@
           <w:color w:val="6A6A70"/>
           <w:sz w:val="21"/>
         </w:rPr>
-        <w:t>Tendencia: Marcos no prazo, Projetos dentro do orcamento e Projetos sem risco alto/critico mostram a evolucao dos ultimos salvamentos do Relatorio de Situacao (ex.: 81% -&gt; 85% -&gt; 87%), recalculada a partir do historico de versoes que esse relatorio ja mantinha (secao 4.1) - nao e um fechamento de calendario mes a mes, e sim uma tendencia de ultimos salvamentos. A tendencia de risco so existe a partir do primeiro salvamento feito depois que este indicador foi lancado - salvamentos anteriores nao tem esse numero registrado.</w:t>
-      </w:r>
-    </w:p>
-    <w:p>
-      <w:pPr>
-        <w:spacing w:before="160" w:after="200"/>
-        <w:ind w:left="283"/>
+        <w:t xml:space="preserve">Tendencia: Marcos no prazo, Projetos dentro do orcamento e Projetos sem risco alto/critico mostram a evolucao dos ultimos salvamentos do Relatorio de </w:t>
+      </w:r>
+      <w:r>
         <w:rPr>
           <w:rFonts w:ascii="Montserrat" w:hAnsi="Montserrat"/>
           <w:i/>
           <w:color w:val="6A6A70"/>
           <w:sz w:val="21"/>
         </w:rPr>
-      </w:pPr>
-      <w:r>
+        <w:lastRenderedPageBreak/>
+        <w:t>Situacao (ex.: 81% -&gt; 85% -&gt; 87%), recalculada a partir do historico de versoes que esse relatorio ja mantinha (secao 4.1) - nao e um fechamento de calendario mes a mes, e sim uma tendencia de ultimos salvamentos. A tendencia de risco so existe a partir do primeiro salvamento feito depois que este indicador foi lancado - salvamentos anteriores nao tem esse numero registrado.</w:t>
+      </w:r>
+    </w:p>
+    <w:p>
+      <w:pPr>
+        <w:spacing w:before="160" w:after="200"/>
+        <w:ind w:left="283"/>
         <w:rPr>
           <w:rFonts w:ascii="Montserrat" w:hAnsi="Montserrat"/>
           <w:i/>
           <w:color w:val="6A6A70"/>
           <w:sz w:val="21"/>
         </w:rPr>
+      </w:pPr>
+      <w:r>
+        <w:rPr>
+          <w:rFonts w:ascii="Montserrat" w:hAnsi="Montserrat"/>
+          <w:i/>
+          <w:color w:val="6A6A70"/>
+          <w:sz w:val="21"/>
+        </w:rPr>
         <w:t>O Planejamento guarda tanto a data-alvo (Termino previsto) quanto a Conclusao real de cada marco, entao o indicador ja distingue um marco que terminou no prazo de um que so ainda nao venceu. Projetos dentro do orcamento e Entraves resolvidos continuam aparecendo como travessao (-) quando nao ha dado suficiente para calcular, em vez de mostrar um numero sem base.</w:t>
       </w:r>
     </w:p>
@@ -23580,7 +23895,7 @@
         <w:pStyle w:val="PargrafodaLista"/>
         <w:numPr>
           <w:ilvl w:val="0"/>
-          <w:numId w:val="39"/>
+          <w:numId w:val="40"/>
         </w:numPr>
         <w:spacing w:after="80" w:line="260" w:lineRule="auto"/>
         <w:ind w:left="700"/>
@@ -23609,20 +23924,20 @@
           <w:noProof/>
         </w:rPr>
         <w:drawing>
-          <wp:inline distT="0" distB="0" distL="0" distR="0" wp14:anchorId="07266D03" wp14:editId="09FE257B">
+          <wp:inline distT="0" distB="0" distL="0" distR="0" wp14:anchorId="652981E6" wp14:editId="119822D7">
             <wp:extent cx="5303520" cy="1841050"/>
             <wp:effectExtent l="19050" t="19050" r="11430" b="26035"/>
-            <wp:docPr id="290680676" name="Imagem 57"/>
+            <wp:docPr id="201554790" name="Imagem 58"/>
             <wp:cNvGraphicFramePr/>
             <a:graphic xmlns:a="http://schemas.openxmlformats.org/drawingml/2006/main">
               <a:graphicData uri="http://schemas.openxmlformats.org/drawingml/2006/picture">
                 <pic:pic xmlns:pic="http://schemas.openxmlformats.org/drawingml/2006/picture">
                   <pic:nvPicPr>
-                    <pic:cNvPr id="290680676" name=""/>
+                    <pic:cNvPr id="201554790" name=""/>
                     <pic:cNvPicPr/>
                   </pic:nvPicPr>
                   <pic:blipFill>
-                    <a:blip r:embed="rId63">
+                    <a:blip r:embed="rId64">
                       <a:extLst>
                         <a:ext uri="{28A0092B-C50C-407E-A947-70E740481C1C}">
                           <a14:useLocalDpi xmlns:a14="http://schemas.microsoft.com/office/drawing/2010/main" val="0"/>
@@ -23711,7 +24026,6 @@
           <w:color w:val="1A1A1A"/>
           <w:sz w:val="22"/>
         </w:rPr>
-        <w:lastRenderedPageBreak/>
         <w:t>No topo da pagina, dois botoes exportam o conteudo para levar a reuniao de resultados, no mesmo modelo visual de um arquivo de referencia fornecido para essa reuniao:</w:t>
       </w:r>
     </w:p>
@@ -23720,7 +24034,7 @@
         <w:pStyle w:val="PargrafodaLista"/>
         <w:numPr>
           <w:ilvl w:val="0"/>
-          <w:numId w:val="39"/>
+          <w:numId w:val="40"/>
         </w:numPr>
         <w:spacing w:after="80" w:line="260" w:lineRule="auto"/>
         <w:ind w:left="700"/>
@@ -23744,7 +24058,7 @@
         <w:pStyle w:val="PargrafodaLista"/>
         <w:numPr>
           <w:ilvl w:val="0"/>
-          <w:numId w:val="39"/>
+          <w:numId w:val="40"/>
         </w:numPr>
         <w:spacing w:after="80" w:line="260" w:lineRule="auto"/>
         <w:ind w:left="700"/>
@@ -23760,7 +24074,16 @@
           <w:color w:val="1A1A1A"/>
           <w:sz w:val="22"/>
         </w:rPr>
-        <w:t>Gerar Apresentacao (PPTX): monta, inteiramente no navegador, uma apresentacao de 3 slides - capa, os indicadores estrategicos (com meta, barra de progresso, selo de status e tendencia) e o Plano de Acao - usando os mesmos numeros exibidos na tela naquele momento. Uma biblioteca de geracao e carregada sob demanda na primeira vez que o botao e usado (pode levar alguns segundos).</w:t>
+        <w:t xml:space="preserve">Gerar Apresentacao (PPTX): monta, inteiramente no navegador, uma apresentacao de 3 slides - capa, os indicadores estrategicos (com meta, barra de progresso, selo de status e tendencia) e o Plano de Acao - usando os mesmos numeros exibidos na tela naquele momento. Uma </w:t>
+      </w:r>
+      <w:r>
+        <w:rPr>
+          <w:rFonts w:ascii="Montserrat" w:hAnsi="Montserrat"/>
+          <w:color w:val="1A1A1A"/>
+          <w:sz w:val="22"/>
+        </w:rPr>
+        <w:lastRenderedPageBreak/>
+        <w:t>biblioteca de geracao e carregada sob demanda na primeira vez que o botao e usado (pode levar alguns segundos).</w:t>
       </w:r>
     </w:p>
     <w:p>
@@ -23773,20 +24096,20 @@
           <w:noProof/>
         </w:rPr>
         <w:drawing>
-          <wp:inline distT="0" distB="0" distL="0" distR="0" wp14:anchorId="670E204F" wp14:editId="0EDD01C9">
+          <wp:inline distT="0" distB="0" distL="0" distR="0" wp14:anchorId="4191CA98" wp14:editId="0A2F3E95">
             <wp:extent cx="5303520" cy="303041"/>
             <wp:effectExtent l="19050" t="19050" r="11430" b="20955"/>
-            <wp:docPr id="2102174542" name="Imagem 58"/>
+            <wp:docPr id="1229580629" name="Imagem 59"/>
             <wp:cNvGraphicFramePr/>
             <a:graphic xmlns:a="http://schemas.openxmlformats.org/drawingml/2006/main">
               <a:graphicData uri="http://schemas.openxmlformats.org/drawingml/2006/picture">
                 <pic:pic xmlns:pic="http://schemas.openxmlformats.org/drawingml/2006/picture">
                   <pic:nvPicPr>
-                    <pic:cNvPr id="2102174542" name=""/>
+                    <pic:cNvPr id="1229580629" name=""/>
                     <pic:cNvPicPr/>
                   </pic:nvPicPr>
                   <pic:blipFill>
-                    <a:blip r:embed="rId64">
+                    <a:blip r:embed="rId65">
                       <a:extLst>
                         <a:ext uri="{28A0092B-C50C-407E-A947-70E740481C1C}">
                           <a14:useLocalDpi xmlns:a14="http://schemas.microsoft.com/office/drawing/2010/main" val="0"/>
@@ -23849,20 +24172,20 @@
           <w:noProof/>
         </w:rPr>
         <w:drawing>
-          <wp:inline distT="0" distB="0" distL="0" distR="0" wp14:anchorId="1038FDDE" wp14:editId="6E868112">
+          <wp:inline distT="0" distB="0" distL="0" distR="0" wp14:anchorId="339A26E6" wp14:editId="5CEE7660">
             <wp:extent cx="5303520" cy="2983005"/>
             <wp:effectExtent l="19050" t="19050" r="11430" b="27305"/>
-            <wp:docPr id="1638041156" name="Imagem 59"/>
+            <wp:docPr id="566154670" name="Imagem 60"/>
             <wp:cNvGraphicFramePr/>
             <a:graphic xmlns:a="http://schemas.openxmlformats.org/drawingml/2006/main">
               <a:graphicData uri="http://schemas.openxmlformats.org/drawingml/2006/picture">
                 <pic:pic xmlns:pic="http://schemas.openxmlformats.org/drawingml/2006/picture">
                   <pic:nvPicPr>
-                    <pic:cNvPr id="1638041156" name=""/>
+                    <pic:cNvPr id="566154670" name=""/>
                     <pic:cNvPicPr/>
                   </pic:nvPicPr>
                   <pic:blipFill>
-                    <a:blip r:embed="rId65" cstate="print">
+                    <a:blip r:embed="rId66" cstate="print">
                       <a:extLst>
                         <a:ext uri="{28A0092B-C50C-407E-A947-70E740481C1C}">
                           <a14:useLocalDpi xmlns:a14="http://schemas.microsoft.com/office/drawing/2010/main" val="0"/>
@@ -23930,7 +24253,7 @@
           <w:sz w:val="34"/>
         </w:rPr>
       </w:pPr>
-      <w:bookmarkStart w:id="52" w:name="_Toc240387709"/>
+      <w:bookmarkStart w:id="53" w:name="_Toc240442861"/>
       <w:r>
         <w:rPr>
           <w:rFonts w:ascii="Montserrat" w:hAnsi="Montserrat"/>
@@ -23941,7 +24264,7 @@
         <w:lastRenderedPageBreak/>
         <w:t>7. Perguntas frequentes</w:t>
       </w:r>
-      <w:bookmarkEnd w:id="52"/>
+      <w:bookmarkEnd w:id="53"/>
     </w:p>
     <w:p>
       <w:pPr>
@@ -24174,7 +24497,7 @@
           <w:sz w:val="34"/>
         </w:rPr>
       </w:pPr>
-      <w:bookmarkStart w:id="53" w:name="_Toc240387710"/>
+      <w:bookmarkStart w:id="54" w:name="_Toc240442862"/>
       <w:r>
         <w:rPr>
           <w:rFonts w:ascii="Montserrat" w:hAnsi="Montserrat"/>
@@ -24185,7 +24508,7 @@
         <w:lastRenderedPageBreak/>
         <w:t>8. Anexo - Tabela de artefatos</w:t>
       </w:r>
-      <w:bookmarkEnd w:id="53"/>
+      <w:bookmarkEnd w:id="54"/>
     </w:p>
     <w:tbl>
       <w:tblPr>
@@ -25798,12 +26121,12 @@
       </w:pPr>
     </w:p>
     <w:sectPr>
-      <w:headerReference w:type="even" r:id="rId66"/>
-      <w:headerReference w:type="default" r:id="rId67"/>
-      <w:footerReference w:type="even" r:id="rId68"/>
-      <w:footerReference w:type="default" r:id="rId69"/>
-      <w:headerReference w:type="first" r:id="rId70"/>
-      <w:footerReference w:type="first" r:id="rId71"/>
+      <w:headerReference w:type="even" r:id="rId67"/>
+      <w:headerReference w:type="default" r:id="rId68"/>
+      <w:footerReference w:type="even" r:id="rId69"/>
+      <w:footerReference w:type="default" r:id="rId70"/>
+      <w:headerReference w:type="first" r:id="rId71"/>
+      <w:footerReference w:type="first" r:id="rId72"/>
       <w:pgSz w:w="12240" w:h="15840"/>
       <w:pgMar w:top="1417" w:right="1701" w:bottom="1417" w:left="1701" w:header="708" w:footer="708" w:gutter="0"/>
       <w:cols w:space="708"/>
@@ -25962,7 +26285,7 @@
 <file path=word/numbering.xml><?xml version="1.0" encoding="utf-8"?>
 <w:numbering xmlns:wpc="http://schemas.microsoft.com/office/word/2010/wordprocessingCanvas" xmlns:cx="http://schemas.microsoft.com/office/drawing/2014/chartex" xmlns:cx1="http://schemas.microsoft.com/office/drawing/2015/9/8/chartex" xmlns:cx2="http://schemas.microsoft.com/office/drawing/2015/10/21/chartex" xmlns:cx3="http://schemas.microsoft.com/office/drawing/2016/5/9/chartex" xmlns:cx4="http://schemas.microsoft.com/office/drawing/2016/5/10/chartex" xmlns:cx5="http://schemas.microsoft.com/office/drawing/2016/5/11/chartex" xmlns:cx6="http://schemas.microsoft.com/office/drawing/2016/5/12/chartex" xmlns:cx7="http://schemas.microsoft.com/office/drawing/2016/5/13/chartex" xmlns:cx8="http://schemas.microsoft.com/office/drawing/2016/5/14/chartex" xmlns:mc="http://schemas.openxmlformats.org/markup-compatibility/2006" xmlns:aink="http://schemas.microsoft.com/office/drawing/2016/ink" xmlns:am3d="http://schemas.microsoft.com/office/drawing/2017/model3d" xmlns:o="urn:schemas-microsoft-com:office:office" xmlns:oel="http://schemas.microsoft.com/office/2019/extlst" xmlns:r="http://schemas.openxmlformats.org/officeDocument/2006/relationships" xmlns:m="http://schemas.openxmlformats.org/officeDocument/2006/math" xmlns:v="urn:schemas-microsoft-com:vml" xmlns:wp14="http://schemas.microsoft.com/office/word/2010/wordprocessingDrawing" xmlns:wp="http://schemas.openxmlformats.org/drawingml/2006/wordprocessingDrawing" xmlns:w10="urn:schemas-microsoft-com:office:word" xmlns:w="http://schemas.openxmlformats.org/wordprocessingml/2006/main" xmlns:w14="http://schemas.microsoft.com/office/word/2010/wordml" xmlns:w15="http://schemas.microsoft.com/office/word/2012/wordml" xmlns:w16cex="http://schemas.microsoft.com/office/word/2018/wordml/cex" xmlns:w16cid="http://schemas.microsoft.com/office/word/2016/wordml/cid" xmlns:w16="http://schemas.microsoft.com/office/word/2018/wordml" xmlns:w16du="http://schemas.microsoft.com/office/word/2023/wordml/word16du" xmlns:w16sdtdh="http://schemas.microsoft.com/office/word/2020/wordml/sdtdatahash" xmlns:w16sdtfl="http://schemas.microsoft.com/office/word/2024/wordml/sdtformatlock" xmlns:w16se="http://schemas.microsoft.com/office/word/2015/wordml/symex" xmlns:wpg="http://schemas.microsoft.com/office/word/2010/wordprocessingGroup" xmlns:wpi="http://schemas.microsoft.com/office/word/2010/wordprocessingInk" xmlns:wne="http://schemas.microsoft.com/office/word/2006/wordml" xmlns:wps="http://schemas.microsoft.com/office/word/2010/wordprocessingShape" mc:Ignorable="w14 w15 w16se w16cid w16 w16cex w16sdtdh w16sdtfl w16du wp14">
   <w:abstractNum w:abstractNumId="0" w15:restartNumberingAfterBreak="0">
-    <w:nsid w:val="03AF7871"/>
+    <w:nsid w:val="027F75E2"/>
     <w:multiLevelType w:val="singleLevel"/>
     <w:tmpl w:val="04160001"/>
     <w:lvl w:ilvl="0">
@@ -25979,7 +26302,7 @@
     </w:lvl>
   </w:abstractNum>
   <w:abstractNum w:abstractNumId="1" w15:restartNumberingAfterBreak="0">
-    <w:nsid w:val="05966F34"/>
+    <w:nsid w:val="046F4AA0"/>
     <w:multiLevelType w:val="singleLevel"/>
     <w:tmpl w:val="04160001"/>
     <w:lvl w:ilvl="0">
@@ -25996,7 +26319,7 @@
     </w:lvl>
   </w:abstractNum>
   <w:abstractNum w:abstractNumId="2" w15:restartNumberingAfterBreak="0">
-    <w:nsid w:val="07573B1D"/>
+    <w:nsid w:val="04932AB7"/>
     <w:multiLevelType w:val="singleLevel"/>
     <w:tmpl w:val="04160001"/>
     <w:lvl w:ilvl="0">
@@ -26013,7 +26336,7 @@
     </w:lvl>
   </w:abstractNum>
   <w:abstractNum w:abstractNumId="3" w15:restartNumberingAfterBreak="0">
-    <w:nsid w:val="0C2473E3"/>
+    <w:nsid w:val="052D4B47"/>
     <w:multiLevelType w:val="singleLevel"/>
     <w:tmpl w:val="04160001"/>
     <w:lvl w:ilvl="0">
@@ -26030,7 +26353,7 @@
     </w:lvl>
   </w:abstractNum>
   <w:abstractNum w:abstractNumId="4" w15:restartNumberingAfterBreak="0">
-    <w:nsid w:val="0F975151"/>
+    <w:nsid w:val="065A4B5B"/>
     <w:multiLevelType w:val="singleLevel"/>
     <w:tmpl w:val="04160001"/>
     <w:lvl w:ilvl="0">
@@ -26047,7 +26370,7 @@
     </w:lvl>
   </w:abstractNum>
   <w:abstractNum w:abstractNumId="5" w15:restartNumberingAfterBreak="0">
-    <w:nsid w:val="100071A0"/>
+    <w:nsid w:val="0F80615E"/>
     <w:multiLevelType w:val="singleLevel"/>
     <w:tmpl w:val="04160001"/>
     <w:lvl w:ilvl="0">
@@ -26064,7 +26387,7 @@
     </w:lvl>
   </w:abstractNum>
   <w:abstractNum w:abstractNumId="6" w15:restartNumberingAfterBreak="0">
-    <w:nsid w:val="16CA7F9D"/>
+    <w:nsid w:val="15434F63"/>
     <w:multiLevelType w:val="singleLevel"/>
     <w:tmpl w:val="04160001"/>
     <w:lvl w:ilvl="0">
@@ -26081,7 +26404,7 @@
     </w:lvl>
   </w:abstractNum>
   <w:abstractNum w:abstractNumId="7" w15:restartNumberingAfterBreak="0">
-    <w:nsid w:val="1EFB430C"/>
+    <w:nsid w:val="15673A65"/>
     <w:multiLevelType w:val="singleLevel"/>
     <w:tmpl w:val="04160001"/>
     <w:lvl w:ilvl="0">
@@ -26098,7 +26421,7 @@
     </w:lvl>
   </w:abstractNum>
   <w:abstractNum w:abstractNumId="8" w15:restartNumberingAfterBreak="0">
-    <w:nsid w:val="1FA12C10"/>
+    <w:nsid w:val="15896310"/>
     <w:multiLevelType w:val="singleLevel"/>
     <w:tmpl w:val="04160001"/>
     <w:lvl w:ilvl="0">
@@ -26115,7 +26438,7 @@
     </w:lvl>
   </w:abstractNum>
   <w:abstractNum w:abstractNumId="9" w15:restartNumberingAfterBreak="0">
-    <w:nsid w:val="23F82006"/>
+    <w:nsid w:val="194D5066"/>
     <w:multiLevelType w:val="singleLevel"/>
     <w:tmpl w:val="04160001"/>
     <w:lvl w:ilvl="0">
@@ -26132,7 +26455,7 @@
     </w:lvl>
   </w:abstractNum>
   <w:abstractNum w:abstractNumId="10" w15:restartNumberingAfterBreak="0">
-    <w:nsid w:val="2432514C"/>
+    <w:nsid w:val="19B746C0"/>
     <w:multiLevelType w:val="singleLevel"/>
     <w:tmpl w:val="04160001"/>
     <w:lvl w:ilvl="0">
@@ -26149,7 +26472,7 @@
     </w:lvl>
   </w:abstractNum>
   <w:abstractNum w:abstractNumId="11" w15:restartNumberingAfterBreak="0">
-    <w:nsid w:val="2581753E"/>
+    <w:nsid w:val="19CB3EB1"/>
     <w:multiLevelType w:val="singleLevel"/>
     <w:tmpl w:val="04160001"/>
     <w:lvl w:ilvl="0">
@@ -26166,7 +26489,7 @@
     </w:lvl>
   </w:abstractNum>
   <w:abstractNum w:abstractNumId="12" w15:restartNumberingAfterBreak="0">
-    <w:nsid w:val="2D444A5C"/>
+    <w:nsid w:val="1CC315E4"/>
     <w:multiLevelType w:val="singleLevel"/>
     <w:tmpl w:val="04160001"/>
     <w:lvl w:ilvl="0">
@@ -26183,7 +26506,7 @@
     </w:lvl>
   </w:abstractNum>
   <w:abstractNum w:abstractNumId="13" w15:restartNumberingAfterBreak="0">
-    <w:nsid w:val="39040C8F"/>
+    <w:nsid w:val="1DF74471"/>
     <w:multiLevelType w:val="singleLevel"/>
     <w:tmpl w:val="04160001"/>
     <w:lvl w:ilvl="0">
@@ -26200,7 +26523,7 @@
     </w:lvl>
   </w:abstractNum>
   <w:abstractNum w:abstractNumId="14" w15:restartNumberingAfterBreak="0">
-    <w:nsid w:val="39984763"/>
+    <w:nsid w:val="271F0823"/>
     <w:multiLevelType w:val="singleLevel"/>
     <w:tmpl w:val="04160001"/>
     <w:lvl w:ilvl="0">
@@ -26217,7 +26540,7 @@
     </w:lvl>
   </w:abstractNum>
   <w:abstractNum w:abstractNumId="15" w15:restartNumberingAfterBreak="0">
-    <w:nsid w:val="3CF139F0"/>
+    <w:nsid w:val="2ABC302F"/>
     <w:multiLevelType w:val="singleLevel"/>
     <w:tmpl w:val="04160001"/>
     <w:lvl w:ilvl="0">
@@ -26234,7 +26557,7 @@
     </w:lvl>
   </w:abstractNum>
   <w:abstractNum w:abstractNumId="16" w15:restartNumberingAfterBreak="0">
-    <w:nsid w:val="3E5F7330"/>
+    <w:nsid w:val="35D56276"/>
     <w:multiLevelType w:val="singleLevel"/>
     <w:tmpl w:val="04160001"/>
     <w:lvl w:ilvl="0">
@@ -26251,7 +26574,7 @@
     </w:lvl>
   </w:abstractNum>
   <w:abstractNum w:abstractNumId="17" w15:restartNumberingAfterBreak="0">
-    <w:nsid w:val="3E7960E6"/>
+    <w:nsid w:val="395526B7"/>
     <w:multiLevelType w:val="singleLevel"/>
     <w:tmpl w:val="04160001"/>
     <w:lvl w:ilvl="0">
@@ -26268,7 +26591,7 @@
     </w:lvl>
   </w:abstractNum>
   <w:abstractNum w:abstractNumId="18" w15:restartNumberingAfterBreak="0">
-    <w:nsid w:val="400A0C27"/>
+    <w:nsid w:val="3C4D0EF7"/>
     <w:multiLevelType w:val="singleLevel"/>
     <w:tmpl w:val="04160001"/>
     <w:lvl w:ilvl="0">
@@ -26285,7 +26608,7 @@
     </w:lvl>
   </w:abstractNum>
   <w:abstractNum w:abstractNumId="19" w15:restartNumberingAfterBreak="0">
-    <w:nsid w:val="4C3A15D8"/>
+    <w:nsid w:val="3C815FBB"/>
     <w:multiLevelType w:val="singleLevel"/>
     <w:tmpl w:val="04160001"/>
     <w:lvl w:ilvl="0">
@@ -26302,7 +26625,7 @@
     </w:lvl>
   </w:abstractNum>
   <w:abstractNum w:abstractNumId="20" w15:restartNumberingAfterBreak="0">
-    <w:nsid w:val="4C495EC3"/>
+    <w:nsid w:val="3EC006EF"/>
     <w:multiLevelType w:val="singleLevel"/>
     <w:tmpl w:val="04160001"/>
     <w:lvl w:ilvl="0">
@@ -26319,7 +26642,7 @@
     </w:lvl>
   </w:abstractNum>
   <w:abstractNum w:abstractNumId="21" w15:restartNumberingAfterBreak="0">
-    <w:nsid w:val="4D7660E0"/>
+    <w:nsid w:val="435E37C6"/>
     <w:multiLevelType w:val="singleLevel"/>
     <w:tmpl w:val="04160001"/>
     <w:lvl w:ilvl="0">
@@ -26336,7 +26659,7 @@
     </w:lvl>
   </w:abstractNum>
   <w:abstractNum w:abstractNumId="22" w15:restartNumberingAfterBreak="0">
-    <w:nsid w:val="4E8059B0"/>
+    <w:nsid w:val="476649E9"/>
     <w:multiLevelType w:val="singleLevel"/>
     <w:tmpl w:val="04160001"/>
     <w:lvl w:ilvl="0">
@@ -26353,7 +26676,7 @@
     </w:lvl>
   </w:abstractNum>
   <w:abstractNum w:abstractNumId="23" w15:restartNumberingAfterBreak="0">
-    <w:nsid w:val="503556F5"/>
+    <w:nsid w:val="48F22810"/>
     <w:multiLevelType w:val="singleLevel"/>
     <w:tmpl w:val="04160001"/>
     <w:lvl w:ilvl="0">
@@ -26370,7 +26693,7 @@
     </w:lvl>
   </w:abstractNum>
   <w:abstractNum w:abstractNumId="24" w15:restartNumberingAfterBreak="0">
-    <w:nsid w:val="551A1AAE"/>
+    <w:nsid w:val="490D3E77"/>
     <w:multiLevelType w:val="singleLevel"/>
     <w:tmpl w:val="04160001"/>
     <w:lvl w:ilvl="0">
@@ -26387,7 +26710,7 @@
     </w:lvl>
   </w:abstractNum>
   <w:abstractNum w:abstractNumId="25" w15:restartNumberingAfterBreak="0">
-    <w:nsid w:val="5C8C3E51"/>
+    <w:nsid w:val="4ADA45D6"/>
     <w:multiLevelType w:val="singleLevel"/>
     <w:tmpl w:val="04160001"/>
     <w:lvl w:ilvl="0">
@@ -26404,7 +26727,7 @@
     </w:lvl>
   </w:abstractNum>
   <w:abstractNum w:abstractNumId="26" w15:restartNumberingAfterBreak="0">
-    <w:nsid w:val="607372B0"/>
+    <w:nsid w:val="4BCF78BE"/>
     <w:multiLevelType w:val="singleLevel"/>
     <w:tmpl w:val="04160001"/>
     <w:lvl w:ilvl="0">
@@ -26421,7 +26744,7 @@
     </w:lvl>
   </w:abstractNum>
   <w:abstractNum w:abstractNumId="27" w15:restartNumberingAfterBreak="0">
-    <w:nsid w:val="660A5734"/>
+    <w:nsid w:val="4C006ACD"/>
     <w:multiLevelType w:val="singleLevel"/>
     <w:tmpl w:val="04160001"/>
     <w:lvl w:ilvl="0">
@@ -26438,7 +26761,7 @@
     </w:lvl>
   </w:abstractNum>
   <w:abstractNum w:abstractNumId="28" w15:restartNumberingAfterBreak="0">
-    <w:nsid w:val="661337DC"/>
+    <w:nsid w:val="4F791C55"/>
     <w:multiLevelType w:val="singleLevel"/>
     <w:tmpl w:val="04160001"/>
     <w:lvl w:ilvl="0">
@@ -26455,7 +26778,7 @@
     </w:lvl>
   </w:abstractNum>
   <w:abstractNum w:abstractNumId="29" w15:restartNumberingAfterBreak="0">
-    <w:nsid w:val="66D83D5C"/>
+    <w:nsid w:val="530351A1"/>
     <w:multiLevelType w:val="singleLevel"/>
     <w:tmpl w:val="04160001"/>
     <w:lvl w:ilvl="0">
@@ -26472,7 +26795,7 @@
     </w:lvl>
   </w:abstractNum>
   <w:abstractNum w:abstractNumId="30" w15:restartNumberingAfterBreak="0">
-    <w:nsid w:val="67B26B1C"/>
+    <w:nsid w:val="55061CE1"/>
     <w:multiLevelType w:val="singleLevel"/>
     <w:tmpl w:val="04160001"/>
     <w:lvl w:ilvl="0">
@@ -26489,7 +26812,7 @@
     </w:lvl>
   </w:abstractNum>
   <w:abstractNum w:abstractNumId="31" w15:restartNumberingAfterBreak="0">
-    <w:nsid w:val="69623127"/>
+    <w:nsid w:val="59752FBE"/>
     <w:multiLevelType w:val="singleLevel"/>
     <w:tmpl w:val="04160001"/>
     <w:lvl w:ilvl="0">
@@ -26506,7 +26829,7 @@
     </w:lvl>
   </w:abstractNum>
   <w:abstractNum w:abstractNumId="32" w15:restartNumberingAfterBreak="0">
-    <w:nsid w:val="6B333F4F"/>
+    <w:nsid w:val="59EA2722"/>
     <w:multiLevelType w:val="singleLevel"/>
     <w:tmpl w:val="04160001"/>
     <w:lvl w:ilvl="0">
@@ -26523,7 +26846,7 @@
     </w:lvl>
   </w:abstractNum>
   <w:abstractNum w:abstractNumId="33" w15:restartNumberingAfterBreak="0">
-    <w:nsid w:val="6C1C2EE4"/>
+    <w:nsid w:val="5B2B489B"/>
     <w:multiLevelType w:val="singleLevel"/>
     <w:tmpl w:val="04160001"/>
     <w:lvl w:ilvl="0">
@@ -26540,7 +26863,7 @@
     </w:lvl>
   </w:abstractNum>
   <w:abstractNum w:abstractNumId="34" w15:restartNumberingAfterBreak="0">
-    <w:nsid w:val="6C3624EB"/>
+    <w:nsid w:val="5F65700B"/>
     <w:multiLevelType w:val="singleLevel"/>
     <w:tmpl w:val="04160001"/>
     <w:lvl w:ilvl="0">
@@ -26557,7 +26880,7 @@
     </w:lvl>
   </w:abstractNum>
   <w:abstractNum w:abstractNumId="35" w15:restartNumberingAfterBreak="0">
-    <w:nsid w:val="70937A44"/>
+    <w:nsid w:val="66645ACE"/>
     <w:multiLevelType w:val="singleLevel"/>
     <w:tmpl w:val="04160001"/>
     <w:lvl w:ilvl="0">
@@ -26574,7 +26897,7 @@
     </w:lvl>
   </w:abstractNum>
   <w:abstractNum w:abstractNumId="36" w15:restartNumberingAfterBreak="0">
-    <w:nsid w:val="749B1E04"/>
+    <w:nsid w:val="6A3E0B9B"/>
     <w:multiLevelType w:val="singleLevel"/>
     <w:tmpl w:val="04160001"/>
     <w:lvl w:ilvl="0">
@@ -26591,7 +26914,7 @@
     </w:lvl>
   </w:abstractNum>
   <w:abstractNum w:abstractNumId="37" w15:restartNumberingAfterBreak="0">
-    <w:nsid w:val="74D96E05"/>
+    <w:nsid w:val="6F3053C5"/>
     <w:multiLevelType w:val="singleLevel"/>
     <w:tmpl w:val="04160001"/>
     <w:lvl w:ilvl="0">
@@ -26608,7 +26931,7 @@
     </w:lvl>
   </w:abstractNum>
   <w:abstractNum w:abstractNumId="38" w15:restartNumberingAfterBreak="0">
-    <w:nsid w:val="758414B2"/>
+    <w:nsid w:val="7D3F3671"/>
     <w:multiLevelType w:val="singleLevel"/>
     <w:tmpl w:val="04160001"/>
     <w:lvl w:ilvl="0">
@@ -26624,122 +26947,142 @@
       </w:rPr>
     </w:lvl>
   </w:abstractNum>
-  <w:num w:numId="1" w16cid:durableId="1750275977">
+  <w:abstractNum w:abstractNumId="39" w15:restartNumberingAfterBreak="0">
+    <w:nsid w:val="7FB94002"/>
+    <w:multiLevelType w:val="singleLevel"/>
+    <w:tmpl w:val="04160001"/>
+    <w:lvl w:ilvl="0">
+      <w:start w:val="1"/>
+      <w:numFmt w:val="bullet"/>
+      <w:lvlText w:val=""/>
+      <w:lvlJc w:val="left"/>
+      <w:pPr>
+        <w:ind w:left="720" w:hanging="360"/>
+      </w:pPr>
+      <w:rPr>
+        <w:rFonts w:ascii="Symbol" w:hAnsi="Symbol" w:hint="default"/>
+      </w:rPr>
+    </w:lvl>
+  </w:abstractNum>
+  <w:num w:numId="1" w16cid:durableId="85615069">
+    <w:abstractNumId w:val="10"/>
+  </w:num>
+  <w:num w:numId="2" w16cid:durableId="692922062">
+    <w:abstractNumId w:val="31"/>
+  </w:num>
+  <w:num w:numId="3" w16cid:durableId="1199509541">
+    <w:abstractNumId w:val="1"/>
+  </w:num>
+  <w:num w:numId="4" w16cid:durableId="1419063821">
+    <w:abstractNumId w:val="29"/>
+  </w:num>
+  <w:num w:numId="5" w16cid:durableId="44836487">
+    <w:abstractNumId w:val="20"/>
+  </w:num>
+  <w:num w:numId="6" w16cid:durableId="39405312">
+    <w:abstractNumId w:val="8"/>
+  </w:num>
+  <w:num w:numId="7" w16cid:durableId="1441223656">
+    <w:abstractNumId w:val="15"/>
+  </w:num>
+  <w:num w:numId="8" w16cid:durableId="927540972">
+    <w:abstractNumId w:val="30"/>
+  </w:num>
+  <w:num w:numId="9" w16cid:durableId="948968316">
+    <w:abstractNumId w:val="13"/>
+  </w:num>
+  <w:num w:numId="10" w16cid:durableId="1798716124">
+    <w:abstractNumId w:val="19"/>
+  </w:num>
+  <w:num w:numId="11" w16cid:durableId="1525553677">
+    <w:abstractNumId w:val="7"/>
+  </w:num>
+  <w:num w:numId="12" w16cid:durableId="962617162">
+    <w:abstractNumId w:val="37"/>
+  </w:num>
+  <w:num w:numId="13" w16cid:durableId="959921383">
+    <w:abstractNumId w:val="18"/>
+  </w:num>
+  <w:num w:numId="14" w16cid:durableId="676273026">
+    <w:abstractNumId w:val="2"/>
+  </w:num>
+  <w:num w:numId="15" w16cid:durableId="12541907">
+    <w:abstractNumId w:val="38"/>
+  </w:num>
+  <w:num w:numId="16" w16cid:durableId="1060901722">
+    <w:abstractNumId w:val="12"/>
+  </w:num>
+  <w:num w:numId="17" w16cid:durableId="1720131132">
     <w:abstractNumId w:val="9"/>
   </w:num>
-  <w:num w:numId="2" w16cid:durableId="788859622">
-    <w:abstractNumId w:val="15"/>
+  <w:num w:numId="18" w16cid:durableId="181406006">
+    <w:abstractNumId w:val="4"/>
   </w:num>
-  <w:num w:numId="3" w16cid:durableId="241332708">
+  <w:num w:numId="19" w16cid:durableId="1676305300">
+    <w:abstractNumId w:val="36"/>
+  </w:num>
+  <w:num w:numId="20" w16cid:durableId="436487357">
+    <w:abstractNumId w:val="24"/>
+  </w:num>
+  <w:num w:numId="21" w16cid:durableId="1928223436">
+    <w:abstractNumId w:val="0"/>
+  </w:num>
+  <w:num w:numId="22" w16cid:durableId="635572225">
+    <w:abstractNumId w:val="17"/>
+  </w:num>
+  <w:num w:numId="23" w16cid:durableId="1520506505">
+    <w:abstractNumId w:val="27"/>
+  </w:num>
+  <w:num w:numId="24" w16cid:durableId="687757912">
+    <w:abstractNumId w:val="14"/>
+  </w:num>
+  <w:num w:numId="25" w16cid:durableId="501819696">
+    <w:abstractNumId w:val="25"/>
+  </w:num>
+  <w:num w:numId="26" w16cid:durableId="1422600342">
+    <w:abstractNumId w:val="16"/>
+  </w:num>
+  <w:num w:numId="27" w16cid:durableId="2017263997">
+    <w:abstractNumId w:val="28"/>
+  </w:num>
+  <w:num w:numId="28" w16cid:durableId="452596822">
+    <w:abstractNumId w:val="34"/>
+  </w:num>
+  <w:num w:numId="29" w16cid:durableId="658656203">
+    <w:abstractNumId w:val="35"/>
+  </w:num>
+  <w:num w:numId="30" w16cid:durableId="1411001518">
+    <w:abstractNumId w:val="26"/>
+  </w:num>
+  <w:num w:numId="31" w16cid:durableId="551768324">
+    <w:abstractNumId w:val="22"/>
+  </w:num>
+  <w:num w:numId="32" w16cid:durableId="807551250">
+    <w:abstractNumId w:val="3"/>
+  </w:num>
+  <w:num w:numId="33" w16cid:durableId="1463645765">
+    <w:abstractNumId w:val="39"/>
+  </w:num>
+  <w:num w:numId="34" w16cid:durableId="806818924">
     <w:abstractNumId w:val="6"/>
   </w:num>
-  <w:num w:numId="4" w16cid:durableId="1615749212">
+  <w:num w:numId="35" w16cid:durableId="427654137">
     <w:abstractNumId w:val="33"/>
   </w:num>
-  <w:num w:numId="5" w16cid:durableId="232736935">
-    <w:abstractNumId w:val="1"/>
+  <w:num w:numId="36" w16cid:durableId="851916448">
+    <w:abstractNumId w:val="23"/>
   </w:num>
-  <w:num w:numId="6" w16cid:durableId="1562252584">
-    <w:abstractNumId w:val="29"/>
+  <w:num w:numId="37" w16cid:durableId="274599504">
+    <w:abstractNumId w:val="21"/>
   </w:num>
-  <w:num w:numId="7" w16cid:durableId="742800669">
-    <w:abstractNumId w:val="14"/>
-  </w:num>
-  <w:num w:numId="8" w16cid:durableId="1192957302">
-    <w:abstractNumId w:val="36"/>
-  </w:num>
-  <w:num w:numId="9" w16cid:durableId="204415926">
+  <w:num w:numId="38" w16cid:durableId="760295420">
     <w:abstractNumId w:val="11"/>
   </w:num>
-  <w:num w:numId="10" w16cid:durableId="290869218">
-    <w:abstractNumId w:val="20"/>
-  </w:num>
-  <w:num w:numId="11" w16cid:durableId="1574925424">
-    <w:abstractNumId w:val="23"/>
-  </w:num>
-  <w:num w:numId="12" w16cid:durableId="734667074">
-    <w:abstractNumId w:val="3"/>
-  </w:num>
-  <w:num w:numId="13" w16cid:durableId="1452895244">
-    <w:abstractNumId w:val="28"/>
-  </w:num>
-  <w:num w:numId="14" w16cid:durableId="1803763723">
-    <w:abstractNumId w:val="8"/>
-  </w:num>
-  <w:num w:numId="15" w16cid:durableId="570430150">
-    <w:abstractNumId w:val="34"/>
-  </w:num>
-  <w:num w:numId="16" w16cid:durableId="1455977157">
-    <w:abstractNumId w:val="21"/>
-  </w:num>
-  <w:num w:numId="17" w16cid:durableId="1953630564">
-    <w:abstractNumId w:val="0"/>
-  </w:num>
-  <w:num w:numId="18" w16cid:durableId="2020807592">
-    <w:abstractNumId w:val="22"/>
-  </w:num>
-  <w:num w:numId="19" w16cid:durableId="628556660">
-    <w:abstractNumId w:val="13"/>
-  </w:num>
-  <w:num w:numId="20" w16cid:durableId="1187332663">
-    <w:abstractNumId w:val="32"/>
-  </w:num>
-  <w:num w:numId="21" w16cid:durableId="698552773">
-    <w:abstractNumId w:val="27"/>
-  </w:num>
-  <w:num w:numId="22" w16cid:durableId="1229144828">
-    <w:abstractNumId w:val="4"/>
-  </w:num>
-  <w:num w:numId="23" w16cid:durableId="999043932">
-    <w:abstractNumId w:val="2"/>
-  </w:num>
-  <w:num w:numId="24" w16cid:durableId="182789117">
-    <w:abstractNumId w:val="24"/>
-  </w:num>
-  <w:num w:numId="25" w16cid:durableId="1346052995">
+  <w:num w:numId="39" w16cid:durableId="297996095">
     <w:abstractNumId w:val="5"/>
   </w:num>
-  <w:num w:numId="26" w16cid:durableId="35467771">
-    <w:abstractNumId w:val="7"/>
-  </w:num>
-  <w:num w:numId="27" w16cid:durableId="68844447">
-    <w:abstractNumId w:val="25"/>
-  </w:num>
-  <w:num w:numId="28" w16cid:durableId="650017147">
-    <w:abstractNumId w:val="12"/>
-  </w:num>
-  <w:num w:numId="29" w16cid:durableId="1443644699">
-    <w:abstractNumId w:val="26"/>
-  </w:num>
-  <w:num w:numId="30" w16cid:durableId="1560894972">
-    <w:abstractNumId w:val="19"/>
-  </w:num>
-  <w:num w:numId="31" w16cid:durableId="1762725362">
-    <w:abstractNumId w:val="18"/>
-  </w:num>
-  <w:num w:numId="32" w16cid:durableId="512648309">
-    <w:abstractNumId w:val="10"/>
-  </w:num>
-  <w:num w:numId="33" w16cid:durableId="1138185777">
-    <w:abstractNumId w:val="35"/>
-  </w:num>
-  <w:num w:numId="34" w16cid:durableId="863788514">
-    <w:abstractNumId w:val="38"/>
-  </w:num>
-  <w:num w:numId="35" w16cid:durableId="1744177553">
-    <w:abstractNumId w:val="16"/>
-  </w:num>
-  <w:num w:numId="36" w16cid:durableId="851796974">
-    <w:abstractNumId w:val="30"/>
-  </w:num>
-  <w:num w:numId="37" w16cid:durableId="1948078941">
-    <w:abstractNumId w:val="31"/>
-  </w:num>
-  <w:num w:numId="38" w16cid:durableId="1808816465">
-    <w:abstractNumId w:val="17"/>
-  </w:num>
-  <w:num w:numId="39" w16cid:durableId="1041787280">
-    <w:abstractNumId w:val="37"/>
+  <w:num w:numId="40" w16cid:durableId="1975793539">
+    <w:abstractNumId w:val="32"/>
   </w:num>
 </w:numbering>
 </file>
@@ -27152,7 +27495,7 @@
     <w:link w:val="Ttulo1Char"/>
     <w:uiPriority w:val="9"/>
     <w:qFormat/>
-    <w:rsid w:val="00B530D4"/>
+    <w:rsid w:val="00042400"/>
     <w:pPr>
       <w:keepNext/>
       <w:keepLines/>
@@ -27174,7 +27517,7 @@
     <w:uiPriority w:val="9"/>
     <w:unhideWhenUsed/>
     <w:qFormat/>
-    <w:rsid w:val="00B530D4"/>
+    <w:rsid w:val="00042400"/>
     <w:pPr>
       <w:keepNext/>
       <w:keepLines/>
@@ -27197,7 +27540,7 @@
     <w:semiHidden/>
     <w:unhideWhenUsed/>
     <w:qFormat/>
-    <w:rsid w:val="00B530D4"/>
+    <w:rsid w:val="00042400"/>
     <w:pPr>
       <w:keepNext/>
       <w:keepLines/>
@@ -27220,7 +27563,7 @@
     <w:semiHidden/>
     <w:unhideWhenUsed/>
     <w:qFormat/>
-    <w:rsid w:val="00B530D4"/>
+    <w:rsid w:val="00042400"/>
     <w:pPr>
       <w:keepNext/>
       <w:keepLines/>
@@ -27243,7 +27586,7 @@
     <w:semiHidden/>
     <w:unhideWhenUsed/>
     <w:qFormat/>
-    <w:rsid w:val="00B530D4"/>
+    <w:rsid w:val="00042400"/>
     <w:pPr>
       <w:keepNext/>
       <w:keepLines/>
@@ -27264,7 +27607,7 @@
     <w:semiHidden/>
     <w:unhideWhenUsed/>
     <w:qFormat/>
-    <w:rsid w:val="00B530D4"/>
+    <w:rsid w:val="00042400"/>
     <w:pPr>
       <w:keepNext/>
       <w:keepLines/>
@@ -27287,7 +27630,7 @@
     <w:semiHidden/>
     <w:unhideWhenUsed/>
     <w:qFormat/>
-    <w:rsid w:val="00B530D4"/>
+    <w:rsid w:val="00042400"/>
     <w:pPr>
       <w:keepNext/>
       <w:keepLines/>
@@ -27308,7 +27651,7 @@
     <w:semiHidden/>
     <w:unhideWhenUsed/>
     <w:qFormat/>
-    <w:rsid w:val="00B530D4"/>
+    <w:rsid w:val="00042400"/>
     <w:pPr>
       <w:keepNext/>
       <w:keepLines/>
@@ -27331,7 +27674,7 @@
     <w:semiHidden/>
     <w:unhideWhenUsed/>
     <w:qFormat/>
-    <w:rsid w:val="00B530D4"/>
+    <w:rsid w:val="00042400"/>
     <w:pPr>
       <w:keepNext/>
       <w:keepLines/>
@@ -27375,7 +27718,7 @@
     <w:basedOn w:val="Fontepargpadro"/>
     <w:link w:val="Ttulo1"/>
     <w:uiPriority w:val="9"/>
-    <w:rsid w:val="00B530D4"/>
+    <w:rsid w:val="00042400"/>
     <w:rPr>
       <w:rFonts w:asciiTheme="majorHAnsi" w:eastAsiaTheme="majorEastAsia" w:hAnsiTheme="majorHAnsi" w:cstheme="majorBidi"/>
       <w:color w:val="0F4761" w:themeColor="accent1" w:themeShade="BF"/>
@@ -27388,7 +27731,7 @@
     <w:basedOn w:val="Fontepargpadro"/>
     <w:link w:val="Ttulo2"/>
     <w:uiPriority w:val="9"/>
-    <w:rsid w:val="00B530D4"/>
+    <w:rsid w:val="00042400"/>
     <w:rPr>
       <w:rFonts w:asciiTheme="majorHAnsi" w:eastAsiaTheme="majorEastAsia" w:hAnsiTheme="majorHAnsi" w:cstheme="majorBidi"/>
       <w:color w:val="0F4761" w:themeColor="accent1" w:themeShade="BF"/>
@@ -27402,7 +27745,7 @@
     <w:link w:val="Ttulo3"/>
     <w:uiPriority w:val="9"/>
     <w:semiHidden/>
-    <w:rsid w:val="00B530D4"/>
+    <w:rsid w:val="00042400"/>
     <w:rPr>
       <w:rFonts w:eastAsiaTheme="majorEastAsia" w:cstheme="majorBidi"/>
       <w:color w:val="0F4761" w:themeColor="accent1" w:themeShade="BF"/>
@@ -27416,7 +27759,7 @@
     <w:link w:val="Ttulo4"/>
     <w:uiPriority w:val="9"/>
     <w:semiHidden/>
-    <w:rsid w:val="00B530D4"/>
+    <w:rsid w:val="00042400"/>
     <w:rPr>
       <w:rFonts w:eastAsiaTheme="majorEastAsia" w:cstheme="majorBidi"/>
       <w:i/>
@@ -27430,7 +27773,7 @@
     <w:link w:val="Ttulo5"/>
     <w:uiPriority w:val="9"/>
     <w:semiHidden/>
-    <w:rsid w:val="00B530D4"/>
+    <w:rsid w:val="00042400"/>
     <w:rPr>
       <w:rFonts w:eastAsiaTheme="majorEastAsia" w:cstheme="majorBidi"/>
       <w:color w:val="0F4761" w:themeColor="accent1" w:themeShade="BF"/>
@@ -27442,7 +27785,7 @@
     <w:link w:val="Ttulo6"/>
     <w:uiPriority w:val="9"/>
     <w:semiHidden/>
-    <w:rsid w:val="00B530D4"/>
+    <w:rsid w:val="00042400"/>
     <w:rPr>
       <w:rFonts w:eastAsiaTheme="majorEastAsia" w:cstheme="majorBidi"/>
       <w:i/>
@@ -27456,7 +27799,7 @@
     <w:link w:val="Ttulo7"/>
     <w:uiPriority w:val="9"/>
     <w:semiHidden/>
-    <w:rsid w:val="00B530D4"/>
+    <w:rsid w:val="00042400"/>
     <w:rPr>
       <w:rFonts w:eastAsiaTheme="majorEastAsia" w:cstheme="majorBidi"/>
       <w:color w:val="595959" w:themeColor="text1" w:themeTint="A6"/>
@@ -27468,7 +27811,7 @@
     <w:link w:val="Ttulo8"/>
     <w:uiPriority w:val="9"/>
     <w:semiHidden/>
-    <w:rsid w:val="00B530D4"/>
+    <w:rsid w:val="00042400"/>
     <w:rPr>
       <w:rFonts w:eastAsiaTheme="majorEastAsia" w:cstheme="majorBidi"/>
       <w:i/>
@@ -27482,7 +27825,7 @@
     <w:link w:val="Ttulo9"/>
     <w:uiPriority w:val="9"/>
     <w:semiHidden/>
-    <w:rsid w:val="00B530D4"/>
+    <w:rsid w:val="00042400"/>
     <w:rPr>
       <w:rFonts w:eastAsiaTheme="majorEastAsia" w:cstheme="majorBidi"/>
       <w:color w:val="272727" w:themeColor="text1" w:themeTint="D8"/>
@@ -27495,7 +27838,7 @@
     <w:link w:val="TtuloChar"/>
     <w:uiPriority w:val="10"/>
     <w:qFormat/>
-    <w:rsid w:val="00B530D4"/>
+    <w:rsid w:val="00042400"/>
     <w:pPr>
       <w:spacing w:after="80" w:line="240" w:lineRule="auto"/>
       <w:contextualSpacing/>
@@ -27513,7 +27856,7 @@
     <w:basedOn w:val="Fontepargpadro"/>
     <w:link w:val="Ttulo"/>
     <w:uiPriority w:val="10"/>
-    <w:rsid w:val="00B530D4"/>
+    <w:rsid w:val="00042400"/>
     <w:rPr>
       <w:rFonts w:asciiTheme="majorHAnsi" w:eastAsiaTheme="majorEastAsia" w:hAnsiTheme="majorHAnsi" w:cstheme="majorBidi"/>
       <w:spacing w:val="-10"/>
@@ -27529,7 +27872,7 @@
     <w:link w:val="SubttuloChar"/>
     <w:uiPriority w:val="11"/>
     <w:qFormat/>
-    <w:rsid w:val="00B530D4"/>
+    <w:rsid w:val="00042400"/>
     <w:pPr>
       <w:numPr>
         <w:ilvl w:val="1"/>
@@ -27548,7 +27891,7 @@
     <w:basedOn w:val="Fontepargpadro"/>
     <w:link w:val="Subttulo"/>
     <w:uiPriority w:val="11"/>
-    <w:rsid w:val="00B530D4"/>
+    <w:rsid w:val="00042400"/>
     <w:rPr>
       <w:rFonts w:eastAsiaTheme="majorEastAsia" w:cstheme="majorBidi"/>
       <w:color w:val="595959" w:themeColor="text1" w:themeTint="A6"/>
@@ -27564,7 +27907,7 @@
     <w:link w:val="CitaoChar"/>
     <w:uiPriority w:val="29"/>
     <w:qFormat/>
-    <w:rsid w:val="00B530D4"/>
+    <w:rsid w:val="00042400"/>
     <w:pPr>
       <w:spacing w:before="160"/>
       <w:jc w:val="center"/>
@@ -27580,7 +27923,7 @@
     <w:basedOn w:val="Fontepargpadro"/>
     <w:link w:val="Citao"/>
     <w:uiPriority w:val="29"/>
-    <w:rsid w:val="00B530D4"/>
+    <w:rsid w:val="00042400"/>
     <w:rPr>
       <w:i/>
       <w:iCs/>
@@ -27592,7 +27935,7 @@
     <w:basedOn w:val="Normal"/>
     <w:uiPriority w:val="34"/>
     <w:qFormat/>
-    <w:rsid w:val="00B530D4"/>
+    <w:rsid w:val="00042400"/>
     <w:pPr>
       <w:ind w:left="720"/>
       <w:contextualSpacing/>
@@ -27603,7 +27946,7 @@
     <w:basedOn w:val="Fontepargpadro"/>
     <w:uiPriority w:val="21"/>
     <w:qFormat/>
-    <w:rsid w:val="00B530D4"/>
+    <w:rsid w:val="00042400"/>
     <w:rPr>
       <w:i/>
       <w:iCs/>
@@ -27617,7 +27960,7 @@
     <w:link w:val="CitaoIntensaChar"/>
     <w:uiPriority w:val="30"/>
     <w:qFormat/>
-    <w:rsid w:val="00B530D4"/>
+    <w:rsid w:val="00042400"/>
     <w:pPr>
       <w:pBdr>
         <w:top w:val="single" w:sz="4" w:space="10" w:color="0F4761" w:themeColor="accent1" w:themeShade="BF"/>
@@ -27638,7 +27981,7 @@
     <w:basedOn w:val="Fontepargpadro"/>
     <w:link w:val="CitaoIntensa"/>
     <w:uiPriority w:val="30"/>
-    <w:rsid w:val="00B530D4"/>
+    <w:rsid w:val="00042400"/>
     <w:rPr>
       <w:i/>
       <w:iCs/>
@@ -27650,7 +27993,7 @@
     <w:basedOn w:val="Fontepargpadro"/>
     <w:uiPriority w:val="32"/>
     <w:qFormat/>
-    <w:rsid w:val="00B530D4"/>
+    <w:rsid w:val="00042400"/>
     <w:rPr>
       <w:b/>
       <w:bCs/>
@@ -27665,7 +28008,7 @@
     <w:link w:val="CabealhoChar"/>
     <w:uiPriority w:val="99"/>
     <w:unhideWhenUsed/>
-    <w:rsid w:val="00B530D4"/>
+    <w:rsid w:val="00042400"/>
     <w:pPr>
       <w:tabs>
         <w:tab w:val="center" w:pos="4252"/>
@@ -27679,7 +28022,7 @@
     <w:basedOn w:val="Fontepargpadro"/>
     <w:link w:val="Cabealho"/>
     <w:uiPriority w:val="99"/>
-    <w:rsid w:val="00B530D4"/>
+    <w:rsid w:val="00042400"/>
   </w:style>
   <w:style w:type="paragraph" w:styleId="Rodap">
     <w:name w:val="footer"/>
@@ -27687,7 +28030,7 @@
     <w:link w:val="RodapChar"/>
     <w:uiPriority w:val="99"/>
     <w:unhideWhenUsed/>
-    <w:rsid w:val="00B530D4"/>
+    <w:rsid w:val="00042400"/>
     <w:pPr>
       <w:tabs>
         <w:tab w:val="center" w:pos="4252"/>
@@ -27701,7 +28044,7 @@
     <w:basedOn w:val="Fontepargpadro"/>
     <w:link w:val="Rodap"/>
     <w:uiPriority w:val="99"/>
-    <w:rsid w:val="00B530D4"/>
+    <w:rsid w:val="00042400"/>
   </w:style>
   <w:style w:type="paragraph" w:styleId="Sumrio1">
     <w:name w:val="toc 1"/>
@@ -27710,7 +28053,7 @@
     <w:autoRedefine/>
     <w:uiPriority w:val="39"/>
     <w:unhideWhenUsed/>
-    <w:rsid w:val="00B530D4"/>
+    <w:rsid w:val="00042400"/>
     <w:pPr>
       <w:spacing w:after="100"/>
     </w:pPr>
@@ -27722,7 +28065,7 @@
     <w:autoRedefine/>
     <w:uiPriority w:val="39"/>
     <w:unhideWhenUsed/>
-    <w:rsid w:val="00B530D4"/>
+    <w:rsid w:val="00042400"/>
     <w:pPr>
       <w:spacing w:after="100"/>
       <w:ind w:left="240"/>

</xml_diff>

<commit_message>
Atualiza Manual de Uso e Regras de Acesso para o Responsavel (conta) com multiplas pessoas e nome
Documenta, nos dois documentos oficiais, o que ja foi implementado e
publicado no codigo: o campo Responsavel (conta) (cronograma do
Planejamento, Riscos do TAP, Entradas do Planejamento e
Entraves/Encaminhamentos do Relatorio de Situacao) agora aceita
marcar mais de uma pessoa por item via um painel de caixas de
selecao, mostra o nome cadastrado de cada conta em vez do e-mail
(com fallback para e-mail) e teve corrigido o bug do checkbox
invisivel no painel.

Manual de Uso sobe para a versao 2.83, com entrada de cronologia e
os trechos correspondentes das secoes 6.4.3/6.4.4/passo 3/passo 4/
secao 4.1 atualizados. Regras de Acesso ganha detalhe na secao 3.12
sobre o seletor multi-pessoa e a extensao de listar_emails_usuarios
para tambem devolver nome (alem de e-mail), mantendo telefone/papel
de fora.

Co-Authored-By: Claude Sonnet 5 <noreply@anthropic.com>
</commit_message>
<xml_diff>
--- a/Manual de Uso - Ferramenta de Gestao de Projetos.docx
+++ b/Manual de Uso - Ferramenta de Gestao de Projetos.docx
@@ -129,7 +129,7 @@
           <w:color w:val="6A6A70"/>
           <w:sz w:val="22"/>
         </w:rPr>
-        <w:t>Versao 2.82 - 16 de setembro de 2026 (substitui a versao 2.81 de 15/09/2026)</w:t>
+        <w:t>Versao 2.83 - 16 de setembro de 2026 (substitui a versao 2.82 de 16/09/2026)</w:t>
       </w:r>
     </w:p>
     <w:p>
@@ -229,7 +229,7 @@
         <w:rPr>
           <w:noProof/>
         </w:rPr>
-        <w:instrText xml:space="preserve"> PAGEREF _Toc240442808 \h </w:instrText>
+        <w:instrText xml:space="preserve"> PAGEREF _Toc240463888 \h </w:instrText>
       </w:r>
       <w:r>
         <w:rPr>
@@ -290,7 +290,7 @@
         <w:rPr>
           <w:noProof/>
         </w:rPr>
-        <w:instrText xml:space="preserve"> PAGEREF _Toc240442809 \h </w:instrText>
+        <w:instrText xml:space="preserve"> PAGEREF _Toc240463889 \h </w:instrText>
       </w:r>
       <w:r>
         <w:rPr>
@@ -351,7 +351,7 @@
         <w:rPr>
           <w:noProof/>
         </w:rPr>
-        <w:instrText xml:space="preserve"> PAGEREF _Toc240442810 \h </w:instrText>
+        <w:instrText xml:space="preserve"> PAGEREF _Toc240463890 \h </w:instrText>
       </w:r>
       <w:r>
         <w:rPr>
@@ -412,7 +412,7 @@
         <w:rPr>
           <w:noProof/>
         </w:rPr>
-        <w:instrText xml:space="preserve"> PAGEREF _Toc240442811 \h </w:instrText>
+        <w:instrText xml:space="preserve"> PAGEREF _Toc240463891 \h </w:instrText>
       </w:r>
       <w:r>
         <w:rPr>
@@ -429,7 +429,7 @@
         <w:rPr>
           <w:noProof/>
         </w:rPr>
-        <w:t>22</w:t>
+        <w:t>23</w:t>
       </w:r>
       <w:r>
         <w:rPr>
@@ -473,7 +473,7 @@
         <w:rPr>
           <w:noProof/>
         </w:rPr>
-        <w:instrText xml:space="preserve"> PAGEREF _Toc240442812 \h </w:instrText>
+        <w:instrText xml:space="preserve"> PAGEREF _Toc240463892 \h </w:instrText>
       </w:r>
       <w:r>
         <w:rPr>
@@ -490,7 +490,7 @@
         <w:rPr>
           <w:noProof/>
         </w:rPr>
-        <w:t>23</w:t>
+        <w:t>24</w:t>
       </w:r>
       <w:r>
         <w:rPr>
@@ -534,7 +534,7 @@
         <w:rPr>
           <w:noProof/>
         </w:rPr>
-        <w:instrText xml:space="preserve"> PAGEREF _Toc240442813 \h </w:instrText>
+        <w:instrText xml:space="preserve"> PAGEREF _Toc240463893 \h </w:instrText>
       </w:r>
       <w:r>
         <w:rPr>
@@ -595,7 +595,7 @@
         <w:rPr>
           <w:noProof/>
         </w:rPr>
-        <w:instrText xml:space="preserve"> PAGEREF _Toc240442814 \h </w:instrText>
+        <w:instrText xml:space="preserve"> PAGEREF _Toc240463894 \h </w:instrText>
       </w:r>
       <w:r>
         <w:rPr>
@@ -656,7 +656,7 @@
         <w:rPr>
           <w:noProof/>
         </w:rPr>
-        <w:instrText xml:space="preserve"> PAGEREF _Toc240442815 \h </w:instrText>
+        <w:instrText xml:space="preserve"> PAGEREF _Toc240463895 \h </w:instrText>
       </w:r>
       <w:r>
         <w:rPr>
@@ -717,7 +717,7 @@
         <w:rPr>
           <w:noProof/>
         </w:rPr>
-        <w:instrText xml:space="preserve"> PAGEREF _Toc240442816 \h </w:instrText>
+        <w:instrText xml:space="preserve"> PAGEREF _Toc240463896 \h </w:instrText>
       </w:r>
       <w:r>
         <w:rPr>
@@ -778,7 +778,7 @@
         <w:rPr>
           <w:noProof/>
         </w:rPr>
-        <w:instrText xml:space="preserve"> PAGEREF _Toc240442817 \h </w:instrText>
+        <w:instrText xml:space="preserve"> PAGEREF _Toc240463897 \h </w:instrText>
       </w:r>
       <w:r>
         <w:rPr>
@@ -839,7 +839,7 @@
         <w:rPr>
           <w:noProof/>
         </w:rPr>
-        <w:instrText xml:space="preserve"> PAGEREF _Toc240442818 \h </w:instrText>
+        <w:instrText xml:space="preserve"> PAGEREF _Toc240463898 \h </w:instrText>
       </w:r>
       <w:r>
         <w:rPr>
@@ -900,7 +900,7 @@
         <w:rPr>
           <w:noProof/>
         </w:rPr>
-        <w:instrText xml:space="preserve"> PAGEREF _Toc240442819 \h </w:instrText>
+        <w:instrText xml:space="preserve"> PAGEREF _Toc240463899 \h </w:instrText>
       </w:r>
       <w:r>
         <w:rPr>
@@ -961,7 +961,7 @@
         <w:rPr>
           <w:noProof/>
         </w:rPr>
-        <w:instrText xml:space="preserve"> PAGEREF _Toc240442820 \h </w:instrText>
+        <w:instrText xml:space="preserve"> PAGEREF _Toc240463900 \h </w:instrText>
       </w:r>
       <w:r>
         <w:rPr>
@@ -1022,7 +1022,7 @@
         <w:rPr>
           <w:noProof/>
         </w:rPr>
-        <w:instrText xml:space="preserve"> PAGEREF _Toc240442821 \h </w:instrText>
+        <w:instrText xml:space="preserve"> PAGEREF _Toc240463901 \h </w:instrText>
       </w:r>
       <w:r>
         <w:rPr>
@@ -1083,7 +1083,7 @@
         <w:rPr>
           <w:noProof/>
         </w:rPr>
-        <w:instrText xml:space="preserve"> PAGEREF _Toc240442822 \h </w:instrText>
+        <w:instrText xml:space="preserve"> PAGEREF _Toc240463902 \h </w:instrText>
       </w:r>
       <w:r>
         <w:rPr>
@@ -1144,7 +1144,7 @@
         <w:rPr>
           <w:noProof/>
         </w:rPr>
-        <w:instrText xml:space="preserve"> PAGEREF _Toc240442823 \h </w:instrText>
+        <w:instrText xml:space="preserve"> PAGEREF _Toc240463903 \h </w:instrText>
       </w:r>
       <w:r>
         <w:rPr>
@@ -1205,7 +1205,7 @@
         <w:rPr>
           <w:noProof/>
         </w:rPr>
-        <w:instrText xml:space="preserve"> PAGEREF _Toc240442824 \h </w:instrText>
+        <w:instrText xml:space="preserve"> PAGEREF _Toc240463904 \h </w:instrText>
       </w:r>
       <w:r>
         <w:rPr>
@@ -1266,7 +1266,7 @@
         <w:rPr>
           <w:noProof/>
         </w:rPr>
-        <w:instrText xml:space="preserve"> PAGEREF _Toc240442825 \h </w:instrText>
+        <w:instrText xml:space="preserve"> PAGEREF _Toc240463905 \h </w:instrText>
       </w:r>
       <w:r>
         <w:rPr>
@@ -1327,7 +1327,7 @@
         <w:rPr>
           <w:noProof/>
         </w:rPr>
-        <w:instrText xml:space="preserve"> PAGEREF _Toc240442826 \h </w:instrText>
+        <w:instrText xml:space="preserve"> PAGEREF _Toc240463906 \h </w:instrText>
       </w:r>
       <w:r>
         <w:rPr>
@@ -1388,7 +1388,7 @@
         <w:rPr>
           <w:noProof/>
         </w:rPr>
-        <w:instrText xml:space="preserve"> PAGEREF _Toc240442827 \h </w:instrText>
+        <w:instrText xml:space="preserve"> PAGEREF _Toc240463907 \h </w:instrText>
       </w:r>
       <w:r>
         <w:rPr>
@@ -1449,7 +1449,7 @@
         <w:rPr>
           <w:noProof/>
         </w:rPr>
-        <w:instrText xml:space="preserve"> PAGEREF _Toc240442828 \h </w:instrText>
+        <w:instrText xml:space="preserve"> PAGEREF _Toc240463908 \h </w:instrText>
       </w:r>
       <w:r>
         <w:rPr>
@@ -1510,7 +1510,7 @@
         <w:rPr>
           <w:noProof/>
         </w:rPr>
-        <w:instrText xml:space="preserve"> PAGEREF _Toc240442829 \h </w:instrText>
+        <w:instrText xml:space="preserve"> PAGEREF _Toc240463909 \h </w:instrText>
       </w:r>
       <w:r>
         <w:rPr>
@@ -1571,7 +1571,7 @@
         <w:rPr>
           <w:noProof/>
         </w:rPr>
-        <w:instrText xml:space="preserve"> PAGEREF _Toc240442830 \h </w:instrText>
+        <w:instrText xml:space="preserve"> PAGEREF _Toc240463910 \h </w:instrText>
       </w:r>
       <w:r>
         <w:rPr>
@@ -1632,7 +1632,7 @@
         <w:rPr>
           <w:noProof/>
         </w:rPr>
-        <w:instrText xml:space="preserve"> PAGEREF _Toc240442831 \h </w:instrText>
+        <w:instrText xml:space="preserve"> PAGEREF _Toc240463911 \h </w:instrText>
       </w:r>
       <w:r>
         <w:rPr>
@@ -1693,7 +1693,7 @@
         <w:rPr>
           <w:noProof/>
         </w:rPr>
-        <w:instrText xml:space="preserve"> PAGEREF _Toc240442832 \h </w:instrText>
+        <w:instrText xml:space="preserve"> PAGEREF _Toc240463912 \h </w:instrText>
       </w:r>
       <w:r>
         <w:rPr>
@@ -1754,7 +1754,7 @@
         <w:rPr>
           <w:noProof/>
         </w:rPr>
-        <w:instrText xml:space="preserve"> PAGEREF _Toc240442833 \h </w:instrText>
+        <w:instrText xml:space="preserve"> PAGEREF _Toc240463913 \h </w:instrText>
       </w:r>
       <w:r>
         <w:rPr>
@@ -1816,7 +1816,7 @@
         <w:rPr>
           <w:noProof/>
         </w:rPr>
-        <w:instrText xml:space="preserve"> PAGEREF _Toc240442834 \h </w:instrText>
+        <w:instrText xml:space="preserve"> PAGEREF _Toc240463914 \h </w:instrText>
       </w:r>
       <w:r>
         <w:rPr>
@@ -1877,7 +1877,7 @@
         <w:rPr>
           <w:noProof/>
         </w:rPr>
-        <w:instrText xml:space="preserve"> PAGEREF _Toc240442835 \h </w:instrText>
+        <w:instrText xml:space="preserve"> PAGEREF _Toc240463915 \h </w:instrText>
       </w:r>
       <w:r>
         <w:rPr>
@@ -1938,7 +1938,7 @@
         <w:rPr>
           <w:noProof/>
         </w:rPr>
-        <w:instrText xml:space="preserve"> PAGEREF _Toc240442836 \h </w:instrText>
+        <w:instrText xml:space="preserve"> PAGEREF _Toc240463916 \h </w:instrText>
       </w:r>
       <w:r>
         <w:rPr>
@@ -1999,7 +1999,7 @@
         <w:rPr>
           <w:noProof/>
         </w:rPr>
-        <w:instrText xml:space="preserve"> PAGEREF _Toc240442837 \h </w:instrText>
+        <w:instrText xml:space="preserve"> PAGEREF _Toc240463917 \h </w:instrText>
       </w:r>
       <w:r>
         <w:rPr>
@@ -2060,7 +2060,7 @@
         <w:rPr>
           <w:noProof/>
         </w:rPr>
-        <w:instrText xml:space="preserve"> PAGEREF _Toc240442838 \h </w:instrText>
+        <w:instrText xml:space="preserve"> PAGEREF _Toc240463918 \h </w:instrText>
       </w:r>
       <w:r>
         <w:rPr>
@@ -2121,7 +2121,7 @@
         <w:rPr>
           <w:noProof/>
         </w:rPr>
-        <w:instrText xml:space="preserve"> PAGEREF _Toc240442839 \h </w:instrText>
+        <w:instrText xml:space="preserve"> PAGEREF _Toc240463919 \h </w:instrText>
       </w:r>
       <w:r>
         <w:rPr>
@@ -2182,7 +2182,7 @@
         <w:rPr>
           <w:noProof/>
         </w:rPr>
-        <w:instrText xml:space="preserve"> PAGEREF _Toc240442840 \h </w:instrText>
+        <w:instrText xml:space="preserve"> PAGEREF _Toc240463920 \h </w:instrText>
       </w:r>
       <w:r>
         <w:rPr>
@@ -2243,7 +2243,7 @@
         <w:rPr>
           <w:noProof/>
         </w:rPr>
-        <w:instrText xml:space="preserve"> PAGEREF _Toc240442841 \h </w:instrText>
+        <w:instrText xml:space="preserve"> PAGEREF _Toc240463921 \h </w:instrText>
       </w:r>
       <w:r>
         <w:rPr>
@@ -2304,7 +2304,7 @@
         <w:rPr>
           <w:noProof/>
         </w:rPr>
-        <w:instrText xml:space="preserve"> PAGEREF _Toc240442842 \h </w:instrText>
+        <w:instrText xml:space="preserve"> PAGEREF _Toc240463922 \h </w:instrText>
       </w:r>
       <w:r>
         <w:rPr>
@@ -2365,7 +2365,7 @@
         <w:rPr>
           <w:noProof/>
         </w:rPr>
-        <w:instrText xml:space="preserve"> PAGEREF _Toc240442843 \h </w:instrText>
+        <w:instrText xml:space="preserve"> PAGEREF _Toc240463923 \h </w:instrText>
       </w:r>
       <w:r>
         <w:rPr>
@@ -2426,7 +2426,7 @@
         <w:rPr>
           <w:noProof/>
         </w:rPr>
-        <w:instrText xml:space="preserve"> PAGEREF _Toc240442844 \h </w:instrText>
+        <w:instrText xml:space="preserve"> PAGEREF _Toc240463924 \h </w:instrText>
       </w:r>
       <w:r>
         <w:rPr>
@@ -2487,7 +2487,7 @@
         <w:rPr>
           <w:noProof/>
         </w:rPr>
-        <w:instrText xml:space="preserve"> PAGEREF _Toc240442845 \h </w:instrText>
+        <w:instrText xml:space="preserve"> PAGEREF _Toc240463925 \h </w:instrText>
       </w:r>
       <w:r>
         <w:rPr>
@@ -2548,7 +2548,7 @@
         <w:rPr>
           <w:noProof/>
         </w:rPr>
-        <w:instrText xml:space="preserve"> PAGEREF _Toc240442846 \h </w:instrText>
+        <w:instrText xml:space="preserve"> PAGEREF _Toc240463926 \h </w:instrText>
       </w:r>
       <w:r>
         <w:rPr>
@@ -2609,7 +2609,7 @@
         <w:rPr>
           <w:noProof/>
         </w:rPr>
-        <w:instrText xml:space="preserve"> PAGEREF _Toc240442847 \h </w:instrText>
+        <w:instrText xml:space="preserve"> PAGEREF _Toc240463927 \h </w:instrText>
       </w:r>
       <w:r>
         <w:rPr>
@@ -2670,7 +2670,7 @@
         <w:rPr>
           <w:noProof/>
         </w:rPr>
-        <w:instrText xml:space="preserve"> PAGEREF _Toc240442848 \h </w:instrText>
+        <w:instrText xml:space="preserve"> PAGEREF _Toc240463928 \h </w:instrText>
       </w:r>
       <w:r>
         <w:rPr>
@@ -2731,7 +2731,7 @@
         <w:rPr>
           <w:noProof/>
         </w:rPr>
-        <w:instrText xml:space="preserve"> PAGEREF _Toc240442849 \h </w:instrText>
+        <w:instrText xml:space="preserve"> PAGEREF _Toc240463929 \h </w:instrText>
       </w:r>
       <w:r>
         <w:rPr>
@@ -2792,7 +2792,7 @@
         <w:rPr>
           <w:noProof/>
         </w:rPr>
-        <w:instrText xml:space="preserve"> PAGEREF _Toc240442850 \h </w:instrText>
+        <w:instrText xml:space="preserve"> PAGEREF _Toc240463930 \h </w:instrText>
       </w:r>
       <w:r>
         <w:rPr>
@@ -2853,7 +2853,7 @@
         <w:rPr>
           <w:noProof/>
         </w:rPr>
-        <w:instrText xml:space="preserve"> PAGEREF _Toc240442851 \h </w:instrText>
+        <w:instrText xml:space="preserve"> PAGEREF _Toc240463931 \h </w:instrText>
       </w:r>
       <w:r>
         <w:rPr>
@@ -2914,7 +2914,7 @@
         <w:rPr>
           <w:noProof/>
         </w:rPr>
-        <w:instrText xml:space="preserve"> PAGEREF _Toc240442852 \h </w:instrText>
+        <w:instrText xml:space="preserve"> PAGEREF _Toc240463932 \h </w:instrText>
       </w:r>
       <w:r>
         <w:rPr>
@@ -2975,7 +2975,7 @@
         <w:rPr>
           <w:noProof/>
         </w:rPr>
-        <w:instrText xml:space="preserve"> PAGEREF _Toc240442853 \h </w:instrText>
+        <w:instrText xml:space="preserve"> PAGEREF _Toc240463933 \h </w:instrText>
       </w:r>
       <w:r>
         <w:rPr>
@@ -3036,7 +3036,7 @@
         <w:rPr>
           <w:noProof/>
         </w:rPr>
-        <w:instrText xml:space="preserve"> PAGEREF _Toc240442854 \h </w:instrText>
+        <w:instrText xml:space="preserve"> PAGEREF _Toc240463934 \h </w:instrText>
       </w:r>
       <w:r>
         <w:rPr>
@@ -3097,7 +3097,7 @@
         <w:rPr>
           <w:noProof/>
         </w:rPr>
-        <w:instrText xml:space="preserve"> PAGEREF _Toc240442855 \h </w:instrText>
+        <w:instrText xml:space="preserve"> PAGEREF _Toc240463935 \h </w:instrText>
       </w:r>
       <w:r>
         <w:rPr>
@@ -3158,7 +3158,7 @@
         <w:rPr>
           <w:noProof/>
         </w:rPr>
-        <w:instrText xml:space="preserve"> PAGEREF _Toc240442856 \h </w:instrText>
+        <w:instrText xml:space="preserve"> PAGEREF _Toc240463936 \h </w:instrText>
       </w:r>
       <w:r>
         <w:rPr>
@@ -3175,7 +3175,7 @@
         <w:rPr>
           <w:noProof/>
         </w:rPr>
-        <w:t>97</w:t>
+        <w:t>98</w:t>
       </w:r>
       <w:r>
         <w:rPr>
@@ -3219,7 +3219,7 @@
         <w:rPr>
           <w:noProof/>
         </w:rPr>
-        <w:instrText xml:space="preserve"> PAGEREF _Toc240442857 \h </w:instrText>
+        <w:instrText xml:space="preserve"> PAGEREF _Toc240463937 \h </w:instrText>
       </w:r>
       <w:r>
         <w:rPr>
@@ -3280,7 +3280,7 @@
         <w:rPr>
           <w:noProof/>
         </w:rPr>
-        <w:instrText xml:space="preserve"> PAGEREF _Toc240442858 \h </w:instrText>
+        <w:instrText xml:space="preserve"> PAGEREF _Toc240463938 \h </w:instrText>
       </w:r>
       <w:r>
         <w:rPr>
@@ -3341,7 +3341,7 @@
         <w:rPr>
           <w:noProof/>
         </w:rPr>
-        <w:instrText xml:space="preserve"> PAGEREF _Toc240442859 \h </w:instrText>
+        <w:instrText xml:space="preserve"> PAGEREF _Toc240463939 \h </w:instrText>
       </w:r>
       <w:r>
         <w:rPr>
@@ -3402,7 +3402,7 @@
         <w:rPr>
           <w:noProof/>
         </w:rPr>
-        <w:instrText xml:space="preserve"> PAGEREF _Toc240442860 \h </w:instrText>
+        <w:instrText xml:space="preserve"> PAGEREF _Toc240463940 \h </w:instrText>
       </w:r>
       <w:r>
         <w:rPr>
@@ -3464,7 +3464,7 @@
         <w:rPr>
           <w:noProof/>
         </w:rPr>
-        <w:instrText xml:space="preserve"> PAGEREF _Toc240442861 \h </w:instrText>
+        <w:instrText xml:space="preserve"> PAGEREF _Toc240463941 \h </w:instrText>
       </w:r>
       <w:r>
         <w:rPr>
@@ -3525,7 +3525,7 @@
         <w:rPr>
           <w:noProof/>
         </w:rPr>
-        <w:instrText xml:space="preserve"> PAGEREF _Toc240442862 \h </w:instrText>
+        <w:instrText xml:space="preserve"> PAGEREF _Toc240463942 \h </w:instrText>
       </w:r>
       <w:r>
         <w:rPr>
@@ -3601,7 +3601,7 @@
           <w:sz w:val="34"/>
         </w:rPr>
       </w:pPr>
-      <w:bookmarkStart w:id="0" w:name="_Toc240442808"/>
+      <w:bookmarkStart w:id="0" w:name="_Toc240463888"/>
       <w:r>
         <w:rPr>
           <w:rFonts w:ascii="Montserrat" w:hAnsi="Montserrat"/>
@@ -3625,7 +3625,7 @@
           <w:sz w:val="27"/>
         </w:rPr>
       </w:pPr>
-      <w:bookmarkStart w:id="1" w:name="_Toc240442809"/>
+      <w:bookmarkStart w:id="1" w:name="_Toc240463889"/>
       <w:r>
         <w:rPr>
           <w:rFonts w:ascii="Montserrat" w:hAnsi="Montserrat"/>
@@ -5282,6 +5282,24 @@
           <w:color w:val="1A1A1A"/>
           <w:sz w:val="22"/>
         </w:rPr>
+        <w:t>Esta e a versao 2.83 do manual. Em relacao a versao 2.82 (16/09/2026), o campo Responsavel (conta) (cronograma do Planejamento, Registro de riscos do TAP, Entradas do Planejamento e Entraves/Encaminhamentos do Relatorio de Situacao) passou a aceitar mais de uma pessoa por item - um painel com uma caixa de selecao por conta, em vez de um menu de escolha unica - e a mostrar o nome cadastrado de cada conta em vez do e-mail (caindo para o e-mail so quando a conta nao tem nome cadastrado). Foi tambem corrigido um bug que deixava o texto de cada opcao invisivel dentro desse painel (so o quadrado de selecao aparecia) em navegadores reais, causado por uma regra de estilo generica do formulario que forcava a largura do quadrado de selecao.</w:t>
+      </w:r>
+    </w:p>
+    <w:p>
+      <w:pPr>
+        <w:spacing w:line="280" w:lineRule="auto"/>
+        <w:rPr>
+          <w:rFonts w:ascii="Montserrat" w:hAnsi="Montserrat"/>
+          <w:color w:val="1A1A1A"/>
+          <w:sz w:val="22"/>
+        </w:rPr>
+      </w:pPr>
+      <w:r>
+        <w:rPr>
+          <w:rFonts w:ascii="Montserrat" w:hAnsi="Montserrat"/>
+          <w:color w:val="1A1A1A"/>
+          <w:sz w:val="22"/>
+        </w:rPr>
         <w:t>O manual nao substitui as Diretrizes para a Gestao de Projetos da UNIALFA (documento institucional que define o framework D01 a D07) nem o documento Regras de Acesso e Permissoes (que detalha cada regra de controle de acesso); ele e o guia operacional de como usar cada ferramenta na pratica.</w:t>
       </w:r>
     </w:p>
@@ -5296,7 +5314,7 @@
           <w:sz w:val="27"/>
         </w:rPr>
       </w:pPr>
-      <w:bookmarkStart w:id="2" w:name="_Toc240442810"/>
+      <w:bookmarkStart w:id="2" w:name="_Toc240463890"/>
       <w:r>
         <w:rPr>
           <w:rFonts w:ascii="Montserrat" w:hAnsi="Montserrat"/>
@@ -5371,6 +5389,7 @@
           <w:color w:val="1A1A1A"/>
           <w:sz w:val="22"/>
         </w:rPr>
+        <w:lastRenderedPageBreak/>
         <w:t>1 ferramenta de apoio a decisao, o Validador de Projetos, que nao gera registros de artefato mas ajuda a avaliar projetos.</w:t>
       </w:r>
     </w:p>
@@ -5461,7 +5480,6 @@
           <w:color w:val="1A1A1A"/>
           <w:sz w:val="22"/>
         </w:rPr>
-        <w:lastRenderedPageBreak/>
         <w:t>Cada formulario de registro tem duas partes: uma tela de preenchimento (+Novo...) e uma tela de consulta (...cadastrados), onde ficam listados todos os registros ja salvos, com opcao de abrir, editar o status ou excluir cada um.</w:t>
       </w:r>
     </w:p>
@@ -5493,16 +5511,16 @@
           <w:noProof/>
         </w:rPr>
         <w:drawing>
-          <wp:inline distT="0" distB="0" distL="0" distR="0" wp14:anchorId="2A31CA42" wp14:editId="03865799">
+          <wp:inline distT="0" distB="0" distL="0" distR="0" wp14:anchorId="0B18A505" wp14:editId="6BE7EDF3">
             <wp:extent cx="5303520" cy="4792851"/>
             <wp:effectExtent l="19050" t="19050" r="11430" b="27305"/>
-            <wp:docPr id="1668904310" name="Imagem 1"/>
+            <wp:docPr id="270745432" name="Imagem 1"/>
             <wp:cNvGraphicFramePr/>
             <a:graphic xmlns:a="http://schemas.openxmlformats.org/drawingml/2006/main">
               <a:graphicData uri="http://schemas.openxmlformats.org/drawingml/2006/picture">
                 <pic:pic xmlns:pic="http://schemas.openxmlformats.org/drawingml/2006/picture">
                   <pic:nvPicPr>
-                    <pic:cNvPr id="1668904310" name=""/>
+                    <pic:cNvPr id="270745432" name=""/>
                     <pic:cNvPicPr/>
                   </pic:nvPicPr>
                   <pic:blipFill>
@@ -5556,6 +5574,7 @@
           <w:color w:val="6A6A70"/>
           <w:sz w:val="19"/>
         </w:rPr>
+        <w:lastRenderedPageBreak/>
         <w:t>Mapa de diretrizes - pagina inicial. Nao exige login.</w:t>
       </w:r>
     </w:p>
@@ -5570,7 +5589,7 @@
           <w:sz w:val="27"/>
         </w:rPr>
       </w:pPr>
-      <w:bookmarkStart w:id="3" w:name="_Toc240442811"/>
+      <w:bookmarkStart w:id="3" w:name="_Toc240463891"/>
       <w:r>
         <w:rPr>
           <w:rFonts w:ascii="Montserrat" w:hAnsi="Montserrat"/>
@@ -5609,18 +5628,17 @@
         <w:rPr>
           <w:noProof/>
         </w:rPr>
-        <w:lastRenderedPageBreak/>
         <w:drawing>
-          <wp:inline distT="0" distB="0" distL="0" distR="0" wp14:anchorId="1C83CEC4" wp14:editId="077B13F1">
+          <wp:inline distT="0" distB="0" distL="0" distR="0" wp14:anchorId="64BB38BF" wp14:editId="654D9AA7">
             <wp:extent cx="4206240" cy="3801227"/>
             <wp:effectExtent l="19050" t="19050" r="22860" b="27940"/>
-            <wp:docPr id="915964929" name="Imagem 2"/>
+            <wp:docPr id="207486299" name="Imagem 2"/>
             <wp:cNvGraphicFramePr/>
             <a:graphic xmlns:a="http://schemas.openxmlformats.org/drawingml/2006/main">
               <a:graphicData uri="http://schemas.openxmlformats.org/drawingml/2006/picture">
                 <pic:pic xmlns:pic="http://schemas.openxmlformats.org/drawingml/2006/picture">
                   <pic:nvPicPr>
-                    <pic:cNvPr id="915964929" name=""/>
+                    <pic:cNvPr id="207486299" name=""/>
                     <pic:cNvPicPr/>
                   </pic:nvPicPr>
                   <pic:blipFill>
@@ -5793,7 +5811,7 @@
           <w:sz w:val="27"/>
         </w:rPr>
       </w:pPr>
-      <w:bookmarkStart w:id="4" w:name="_Toc240442812"/>
+      <w:bookmarkStart w:id="4" w:name="_Toc240463892"/>
       <w:r>
         <w:rPr>
           <w:rFonts w:ascii="Montserrat" w:hAnsi="Montserrat"/>
@@ -5801,6 +5819,7 @@
           <w:color w:val="B91D2E"/>
           <w:sz w:val="27"/>
         </w:rPr>
+        <w:lastRenderedPageBreak/>
         <w:t>1.4 Como a ferramenta se relaciona com as Diretrizes (D01-D07)</w:t>
       </w:r>
       <w:bookmarkEnd w:id="4"/>
@@ -5875,7 +5894,6 @@
                 <w:color w:val="FFFFFF"/>
                 <w:sz w:val="19"/>
               </w:rPr>
-              <w:lastRenderedPageBreak/>
               <w:t>Passo</w:t>
             </w:r>
           </w:p>
@@ -7032,7 +7050,7 @@
           <w:sz w:val="34"/>
         </w:rPr>
       </w:pPr>
-      <w:bookmarkStart w:id="5" w:name="_Toc240442813"/>
+      <w:bookmarkStart w:id="5" w:name="_Toc240463893"/>
       <w:r>
         <w:rPr>
           <w:rFonts w:ascii="Montserrat" w:hAnsi="Montserrat"/>
@@ -7056,7 +7074,7 @@
           <w:sz w:val="27"/>
         </w:rPr>
       </w:pPr>
-      <w:bookmarkStart w:id="6" w:name="_Toc240442814"/>
+      <w:bookmarkStart w:id="6" w:name="_Toc240463894"/>
       <w:r>
         <w:rPr>
           <w:rFonts w:ascii="Montserrat" w:hAnsi="Montserrat"/>
@@ -7097,7 +7115,7 @@
           <w:sz w:val="27"/>
         </w:rPr>
       </w:pPr>
-      <w:bookmarkStart w:id="7" w:name="_Toc240442815"/>
+      <w:bookmarkStart w:id="7" w:name="_Toc240463895"/>
       <w:r>
         <w:rPr>
           <w:rFonts w:ascii="Montserrat" w:hAnsi="Montserrat"/>
@@ -7216,7 +7234,7 @@
           <w:sz w:val="27"/>
         </w:rPr>
       </w:pPr>
-      <w:bookmarkStart w:id="8" w:name="_Toc240442816"/>
+      <w:bookmarkStart w:id="8" w:name="_Toc240463896"/>
       <w:r>
         <w:rPr>
           <w:rFonts w:ascii="Montserrat" w:hAnsi="Montserrat"/>
@@ -7829,7 +7847,7 @@
           <w:sz w:val="27"/>
         </w:rPr>
       </w:pPr>
-      <w:bookmarkStart w:id="9" w:name="_Toc240442817"/>
+      <w:bookmarkStart w:id="9" w:name="_Toc240463897"/>
       <w:r>
         <w:rPr>
           <w:rFonts w:ascii="Montserrat" w:hAnsi="Montserrat"/>
@@ -7918,16 +7936,16 @@
         </w:rPr>
         <w:lastRenderedPageBreak/>
         <w:drawing>
-          <wp:inline distT="0" distB="0" distL="0" distR="0" wp14:anchorId="5E865C46" wp14:editId="37918336">
+          <wp:inline distT="0" distB="0" distL="0" distR="0" wp14:anchorId="28987A16" wp14:editId="24790F42">
             <wp:extent cx="4937760" cy="4462310"/>
             <wp:effectExtent l="19050" t="19050" r="15240" b="14605"/>
-            <wp:docPr id="1004804239" name="Imagem 3"/>
+            <wp:docPr id="948832864" name="Imagem 3"/>
             <wp:cNvGraphicFramePr/>
             <a:graphic xmlns:a="http://schemas.openxmlformats.org/drawingml/2006/main">
               <a:graphicData uri="http://schemas.openxmlformats.org/drawingml/2006/picture">
                 <pic:pic xmlns:pic="http://schemas.openxmlformats.org/drawingml/2006/picture">
                   <pic:nvPicPr>
-                    <pic:cNvPr id="1004804239" name=""/>
+                    <pic:cNvPr id="948832864" name=""/>
                     <pic:cNvPicPr/>
                   </pic:nvPicPr>
                   <pic:blipFill>
@@ -7995,7 +8013,7 @@
           <w:sz w:val="27"/>
         </w:rPr>
       </w:pPr>
-      <w:bookmarkStart w:id="10" w:name="_Toc240442818"/>
+      <w:bookmarkStart w:id="10" w:name="_Toc240463898"/>
       <w:r>
         <w:rPr>
           <w:rFonts w:ascii="Montserrat" w:hAnsi="Montserrat"/>
@@ -8036,16 +8054,16 @@
         </w:rPr>
         <w:lastRenderedPageBreak/>
         <w:drawing>
-          <wp:inline distT="0" distB="0" distL="0" distR="0" wp14:anchorId="5F5BC7A4" wp14:editId="48D182EA">
+          <wp:inline distT="0" distB="0" distL="0" distR="0" wp14:anchorId="0C75702D" wp14:editId="71357D1F">
             <wp:extent cx="5120640" cy="4627581"/>
             <wp:effectExtent l="19050" t="19050" r="22860" b="20955"/>
-            <wp:docPr id="1592350065" name="Imagem 4"/>
+            <wp:docPr id="2045838952" name="Imagem 4"/>
             <wp:cNvGraphicFramePr/>
             <a:graphic xmlns:a="http://schemas.openxmlformats.org/drawingml/2006/main">
               <a:graphicData uri="http://schemas.openxmlformats.org/drawingml/2006/picture">
                 <pic:pic xmlns:pic="http://schemas.openxmlformats.org/drawingml/2006/picture">
                   <pic:nvPicPr>
-                    <pic:cNvPr id="1592350065" name=""/>
+                    <pic:cNvPr id="2045838952" name=""/>
                     <pic:cNvPicPr/>
                   </pic:nvPicPr>
                   <pic:blipFill>
@@ -8228,7 +8246,7 @@
           <w:sz w:val="27"/>
         </w:rPr>
       </w:pPr>
-      <w:bookmarkStart w:id="11" w:name="_Toc240442819"/>
+      <w:bookmarkStart w:id="11" w:name="_Toc240463899"/>
       <w:r>
         <w:rPr>
           <w:rFonts w:ascii="Montserrat" w:hAnsi="Montserrat"/>
@@ -8268,16 +8286,16 @@
           <w:noProof/>
         </w:rPr>
         <w:drawing>
-          <wp:inline distT="0" distB="0" distL="0" distR="0" wp14:anchorId="17B35354" wp14:editId="54BA3B20">
+          <wp:inline distT="0" distB="0" distL="0" distR="0" wp14:anchorId="03C97F6A" wp14:editId="7E7EE614">
             <wp:extent cx="4206240" cy="3801227"/>
             <wp:effectExtent l="19050" t="19050" r="22860" b="27940"/>
-            <wp:docPr id="1085191628" name="Imagem 5"/>
+            <wp:docPr id="892990237" name="Imagem 5"/>
             <wp:cNvGraphicFramePr/>
             <a:graphic xmlns:a="http://schemas.openxmlformats.org/drawingml/2006/main">
               <a:graphicData uri="http://schemas.openxmlformats.org/drawingml/2006/picture">
                 <pic:pic xmlns:pic="http://schemas.openxmlformats.org/drawingml/2006/picture">
                   <pic:nvPicPr>
-                    <pic:cNvPr id="1085191628" name=""/>
+                    <pic:cNvPr id="892990237" name=""/>
                     <pic:cNvPicPr/>
                   </pic:nvPicPr>
                   <pic:blipFill>
@@ -8345,16 +8363,16 @@
         </w:rPr>
         <w:lastRenderedPageBreak/>
         <w:drawing>
-          <wp:inline distT="0" distB="0" distL="0" distR="0" wp14:anchorId="136B8D3B" wp14:editId="0EC91F16">
+          <wp:inline distT="0" distB="0" distL="0" distR="0" wp14:anchorId="5F405BDD" wp14:editId="22E67763">
             <wp:extent cx="4206240" cy="3801227"/>
             <wp:effectExtent l="19050" t="19050" r="22860" b="27940"/>
-            <wp:docPr id="1305792715" name="Imagem 6"/>
+            <wp:docPr id="1867314960" name="Imagem 6"/>
             <wp:cNvGraphicFramePr/>
             <a:graphic xmlns:a="http://schemas.openxmlformats.org/drawingml/2006/main">
               <a:graphicData uri="http://schemas.openxmlformats.org/drawingml/2006/picture">
                 <pic:pic xmlns:pic="http://schemas.openxmlformats.org/drawingml/2006/picture">
                   <pic:nvPicPr>
-                    <pic:cNvPr id="1305792715" name=""/>
+                    <pic:cNvPr id="1867314960" name=""/>
                     <pic:cNvPicPr/>
                   </pic:nvPicPr>
                   <pic:blipFill>
@@ -8470,7 +8488,7 @@
           <w:sz w:val="27"/>
         </w:rPr>
       </w:pPr>
-      <w:bookmarkStart w:id="12" w:name="_Toc240442820"/>
+      <w:bookmarkStart w:id="12" w:name="_Toc240463900"/>
       <w:r>
         <w:rPr>
           <w:rFonts w:ascii="Montserrat" w:hAnsi="Montserrat"/>
@@ -8538,7 +8556,7 @@
           <w:sz w:val="27"/>
         </w:rPr>
       </w:pPr>
-      <w:bookmarkStart w:id="13" w:name="_Toc240442821"/>
+      <w:bookmarkStart w:id="13" w:name="_Toc240463901"/>
       <w:r>
         <w:rPr>
           <w:rFonts w:ascii="Montserrat" w:hAnsi="Montserrat"/>
@@ -8697,18 +8715,8 @@
         </w:numPr>
         <w:spacing w:after="80" w:line="260" w:lineRule="auto"/>
         <w:ind w:left="700"/>
-        <w:rPr>
-          <w:rFonts w:ascii="Montserrat" w:hAnsi="Montserrat"/>
-          <w:color w:val="1A1A1A"/>
-          <w:sz w:val="22"/>
-        </w:rPr>
-      </w:pPr>
-      <w:r>
-        <w:rPr>
-          <w:rFonts w:ascii="Montserrat" w:hAnsi="Montserrat"/>
-          <w:color w:val="1A1A1A"/>
-          <w:sz w:val="22"/>
-        </w:rPr>
+      </w:pPr>
+      <w:r>
         <w:t>TEP: ao registrar um novo Termo de Encerramento.</w:t>
       </w:r>
     </w:p>
@@ -8765,7 +8773,7 @@
           <w:sz w:val="27"/>
         </w:rPr>
       </w:pPr>
-      <w:bookmarkStart w:id="14" w:name="_Toc240442822"/>
+      <w:bookmarkStart w:id="14" w:name="_Toc240463902"/>
       <w:r>
         <w:rPr>
           <w:rFonts w:ascii="Montserrat" w:hAnsi="Montserrat"/>
@@ -8924,7 +8932,7 @@
           <w:sz w:val="27"/>
         </w:rPr>
       </w:pPr>
-      <w:bookmarkStart w:id="15" w:name="_Toc240442823"/>
+      <w:bookmarkStart w:id="15" w:name="_Toc240463903"/>
       <w:r>
         <w:rPr>
           <w:rFonts w:ascii="Montserrat" w:hAnsi="Montserrat"/>
@@ -9116,7 +9124,7 @@
           <w:sz w:val="27"/>
         </w:rPr>
       </w:pPr>
-      <w:bookmarkStart w:id="16" w:name="_Toc240442824"/>
+      <w:bookmarkStart w:id="16" w:name="_Toc240463904"/>
       <w:r>
         <w:rPr>
           <w:rFonts w:ascii="Montserrat" w:hAnsi="Montserrat"/>
@@ -9244,7 +9252,7 @@
           <w:sz w:val="27"/>
         </w:rPr>
       </w:pPr>
-      <w:bookmarkStart w:id="17" w:name="_Toc240442825"/>
+      <w:bookmarkStart w:id="17" w:name="_Toc240463905"/>
       <w:r>
         <w:rPr>
           <w:rFonts w:ascii="Montserrat" w:hAnsi="Montserrat"/>
@@ -9574,7 +9582,7 @@
           <w:sz w:val="27"/>
         </w:rPr>
       </w:pPr>
-      <w:bookmarkStart w:id="18" w:name="_Toc240442826"/>
+      <w:bookmarkStart w:id="18" w:name="_Toc240463906"/>
       <w:r>
         <w:rPr>
           <w:rFonts w:ascii="Montserrat" w:hAnsi="Montserrat"/>
@@ -9711,7 +9719,7 @@
           <w:sz w:val="27"/>
         </w:rPr>
       </w:pPr>
-      <w:bookmarkStart w:id="19" w:name="_Toc240442827"/>
+      <w:bookmarkStart w:id="19" w:name="_Toc240463907"/>
       <w:r>
         <w:rPr>
           <w:rFonts w:ascii="Montserrat" w:hAnsi="Montserrat"/>
@@ -9990,7 +9998,7 @@
           <w:sz w:val="27"/>
         </w:rPr>
       </w:pPr>
-      <w:bookmarkStart w:id="20" w:name="_Toc240442828"/>
+      <w:bookmarkStart w:id="20" w:name="_Toc240463908"/>
       <w:r>
         <w:rPr>
           <w:rFonts w:ascii="Montserrat" w:hAnsi="Montserrat"/>
@@ -10167,7 +10175,7 @@
           <w:sz w:val="27"/>
         </w:rPr>
       </w:pPr>
-      <w:bookmarkStart w:id="21" w:name="_Toc240442829"/>
+      <w:bookmarkStart w:id="21" w:name="_Toc240463909"/>
       <w:r>
         <w:rPr>
           <w:rFonts w:ascii="Montserrat" w:hAnsi="Montserrat"/>
@@ -10281,7 +10289,7 @@
           <w:sz w:val="34"/>
         </w:rPr>
       </w:pPr>
-      <w:bookmarkStart w:id="22" w:name="_Toc240442830"/>
+      <w:bookmarkStart w:id="22" w:name="_Toc240463910"/>
       <w:r>
         <w:rPr>
           <w:rFonts w:ascii="Montserrat" w:hAnsi="Montserrat"/>
@@ -10323,7 +10331,7 @@
           <w:sz w:val="27"/>
         </w:rPr>
       </w:pPr>
-      <w:bookmarkStart w:id="23" w:name="_Toc240442831"/>
+      <w:bookmarkStart w:id="23" w:name="_Toc240463911"/>
       <w:r>
         <w:rPr>
           <w:rFonts w:ascii="Montserrat" w:hAnsi="Montserrat"/>
@@ -11403,16 +11411,16 @@
         </w:rPr>
         <w:lastRenderedPageBreak/>
         <w:drawing>
-          <wp:inline distT="0" distB="0" distL="0" distR="0" wp14:anchorId="155059E7" wp14:editId="431965D2">
+          <wp:inline distT="0" distB="0" distL="0" distR="0" wp14:anchorId="1AD81AD8" wp14:editId="57467434">
             <wp:extent cx="5120640" cy="4627581"/>
             <wp:effectExtent l="19050" t="19050" r="22860" b="20955"/>
-            <wp:docPr id="999920178" name="Imagem 7"/>
+            <wp:docPr id="1869191400" name="Imagem 7"/>
             <wp:cNvGraphicFramePr/>
             <a:graphic xmlns:a="http://schemas.openxmlformats.org/drawingml/2006/main">
               <a:graphicData uri="http://schemas.openxmlformats.org/drawingml/2006/picture">
                 <pic:pic xmlns:pic="http://schemas.openxmlformats.org/drawingml/2006/picture">
                   <pic:nvPicPr>
-                    <pic:cNvPr id="999920178" name=""/>
+                    <pic:cNvPr id="1869191400" name=""/>
                     <pic:cNvPicPr/>
                   </pic:nvPicPr>
                   <pic:blipFill>
@@ -11480,16 +11488,16 @@
         </w:rPr>
         <w:lastRenderedPageBreak/>
         <w:drawing>
-          <wp:inline distT="0" distB="0" distL="0" distR="0" wp14:anchorId="62DA6B2F" wp14:editId="453DD564">
+          <wp:inline distT="0" distB="0" distL="0" distR="0" wp14:anchorId="1FED87E9" wp14:editId="4F39CF58">
             <wp:extent cx="5120640" cy="4627581"/>
             <wp:effectExtent l="19050" t="19050" r="22860" b="20955"/>
-            <wp:docPr id="1338051542" name="Imagem 8"/>
+            <wp:docPr id="948303947" name="Imagem 8"/>
             <wp:cNvGraphicFramePr/>
             <a:graphic xmlns:a="http://schemas.openxmlformats.org/drawingml/2006/main">
               <a:graphicData uri="http://schemas.openxmlformats.org/drawingml/2006/picture">
                 <pic:pic xmlns:pic="http://schemas.openxmlformats.org/drawingml/2006/picture">
                   <pic:nvPicPr>
-                    <pic:cNvPr id="1338051542" name=""/>
+                    <pic:cNvPr id="948303947" name=""/>
                     <pic:cNvPicPr/>
                   </pic:nvPicPr>
                   <pic:blipFill>
@@ -11697,7 +11705,7 @@
           <w:sz w:val="27"/>
         </w:rPr>
       </w:pPr>
-      <w:bookmarkStart w:id="24" w:name="_Toc240442832"/>
+      <w:bookmarkStart w:id="24" w:name="_Toc240463912"/>
       <w:r>
         <w:rPr>
           <w:rFonts w:ascii="Montserrat" w:hAnsi="Montserrat"/>
@@ -12622,16 +12630,16 @@
           <w:noProof/>
         </w:rPr>
         <w:drawing>
-          <wp:inline distT="0" distB="0" distL="0" distR="0" wp14:anchorId="42F2E432" wp14:editId="2E31CE43">
+          <wp:inline distT="0" distB="0" distL="0" distR="0" wp14:anchorId="30A621EE" wp14:editId="66F2103E">
             <wp:extent cx="5120640" cy="4627581"/>
             <wp:effectExtent l="19050" t="19050" r="22860" b="20955"/>
-            <wp:docPr id="2117757023" name="Imagem 9"/>
+            <wp:docPr id="1072344102" name="Imagem 9"/>
             <wp:cNvGraphicFramePr/>
             <a:graphic xmlns:a="http://schemas.openxmlformats.org/drawingml/2006/main">
               <a:graphicData uri="http://schemas.openxmlformats.org/drawingml/2006/picture">
                 <pic:pic xmlns:pic="http://schemas.openxmlformats.org/drawingml/2006/picture">
                   <pic:nvPicPr>
-                    <pic:cNvPr id="2117757023" name=""/>
+                    <pic:cNvPr id="1072344102" name=""/>
                     <pic:cNvPicPr/>
                   </pic:nvPicPr>
                   <pic:blipFill>
@@ -12699,16 +12707,16 @@
         </w:rPr>
         <w:lastRenderedPageBreak/>
         <w:drawing>
-          <wp:inline distT="0" distB="0" distL="0" distR="0" wp14:anchorId="6C38B52C" wp14:editId="7C89D7B6">
+          <wp:inline distT="0" distB="0" distL="0" distR="0" wp14:anchorId="4B92182D" wp14:editId="358A1611">
             <wp:extent cx="5120640" cy="4627581"/>
             <wp:effectExtent l="19050" t="19050" r="22860" b="20955"/>
-            <wp:docPr id="372251232" name="Imagem 10"/>
+            <wp:docPr id="1717937698" name="Imagem 10"/>
             <wp:cNvGraphicFramePr/>
             <a:graphic xmlns:a="http://schemas.openxmlformats.org/drawingml/2006/main">
               <a:graphicData uri="http://schemas.openxmlformats.org/drawingml/2006/picture">
                 <pic:pic xmlns:pic="http://schemas.openxmlformats.org/drawingml/2006/picture">
                   <pic:nvPicPr>
-                    <pic:cNvPr id="372251232" name=""/>
+                    <pic:cNvPr id="1717937698" name=""/>
                     <pic:cNvPicPr/>
                   </pic:nvPicPr>
                   <pic:blipFill>
@@ -12842,7 +12850,7 @@
           <w:sz w:val="27"/>
         </w:rPr>
       </w:pPr>
-      <w:bookmarkStart w:id="25" w:name="_Toc240442833"/>
+      <w:bookmarkStart w:id="25" w:name="_Toc240463913"/>
       <w:r>
         <w:rPr>
           <w:rFonts w:ascii="Montserrat" w:hAnsi="Montserrat"/>
@@ -13895,7 +13903,7 @@
           <w:color w:val="1A1A1A"/>
           <w:sz w:val="22"/>
         </w:rPr>
-        <w:t>Responsavel (conta) em cada risco: alem do campo de texto livre Responsavel, cada risco tem um segundo campo opcional, Responsavel (conta) - um seletor com as contas que fazem parte da equipe do projeto selecionado, mesmo padrao ja usado no cronograma do Planejamento (secao 6.4.4, Meu Painel). Quando preenchido, o risco passa a aparecer no Meu Painel (secao 6.4.4) daquela pessoa, com um botao para encerra-lo (muda o Status para Encerrado) direto de la.</w:t>
+        <w:t>Responsavel (conta) em cada risco: alem do campo de texto livre Responsavel, cada risco tem um segundo campo opcional, Responsavel (conta) - um botao que abre um painel com uma caixa de selecao para cada conta da equipe do projeto selecionado, permitindo marcar uma ou mais pessoas ao mesmo tempo (mesmo padrao ja usado no cronograma do Planejamento, secao 6.4.4, Meu Painel). A lista mostra o nome cadastrado de cada conta, caindo para o e-mail so quando a conta nao tem nome cadastrado, e o botao resume a escolha (nome de quem foi marcado ou, com mais de uma pessoa, o primeiro nome seguido de +N). Quando preenchido, o risco passa a aparecer no Meu Painel (secao 6.4.4) de cada pessoa marcada, com um botao para encerra-lo (muda o Status para Encerrado) direto de la.</w:t>
       </w:r>
     </w:p>
     <w:p>
@@ -13927,16 +13935,16 @@
         </w:rPr>
         <w:lastRenderedPageBreak/>
         <w:drawing>
-          <wp:inline distT="0" distB="0" distL="0" distR="0" wp14:anchorId="669F5628" wp14:editId="6E718F46">
+          <wp:inline distT="0" distB="0" distL="0" distR="0" wp14:anchorId="2EB905EB" wp14:editId="558B4C0E">
             <wp:extent cx="5120640" cy="3338440"/>
             <wp:effectExtent l="19050" t="19050" r="22860" b="14605"/>
-            <wp:docPr id="1859996490" name="Imagem 11"/>
+            <wp:docPr id="1099822171" name="Imagem 11"/>
             <wp:cNvGraphicFramePr/>
             <a:graphic xmlns:a="http://schemas.openxmlformats.org/drawingml/2006/main">
               <a:graphicData uri="http://schemas.openxmlformats.org/drawingml/2006/picture">
                 <pic:pic xmlns:pic="http://schemas.openxmlformats.org/drawingml/2006/picture">
                   <pic:nvPicPr>
-                    <pic:cNvPr id="1859996490" name=""/>
+                    <pic:cNvPr id="1099822171" name=""/>
                     <pic:cNvPicPr/>
                   </pic:nvPicPr>
                   <pic:blipFill>
@@ -14004,16 +14012,16 @@
         </w:rPr>
         <w:lastRenderedPageBreak/>
         <w:drawing>
-          <wp:inline distT="0" distB="0" distL="0" distR="0" wp14:anchorId="664A701A" wp14:editId="7DF621FE">
+          <wp:inline distT="0" distB="0" distL="0" distR="0" wp14:anchorId="5B615F7A" wp14:editId="134B82A8">
             <wp:extent cx="5120640" cy="4627581"/>
             <wp:effectExtent l="19050" t="19050" r="22860" b="20955"/>
-            <wp:docPr id="457432858" name="Imagem 12"/>
+            <wp:docPr id="1889547644" name="Imagem 12"/>
             <wp:cNvGraphicFramePr/>
             <a:graphic xmlns:a="http://schemas.openxmlformats.org/drawingml/2006/main">
               <a:graphicData uri="http://schemas.openxmlformats.org/drawingml/2006/picture">
                 <pic:pic xmlns:pic="http://schemas.openxmlformats.org/drawingml/2006/picture">
                   <pic:nvPicPr>
-                    <pic:cNvPr id="457432858" name=""/>
+                    <pic:cNvPr id="1889547644" name=""/>
                     <pic:cNvPicPr/>
                   </pic:nvPicPr>
                   <pic:blipFill>
@@ -14217,7 +14225,7 @@
           <w:sz w:val="27"/>
         </w:rPr>
       </w:pPr>
-      <w:bookmarkStart w:id="26" w:name="_Toc240442834"/>
+      <w:bookmarkStart w:id="26" w:name="_Toc240463914"/>
       <w:r>
         <w:rPr>
           <w:rFonts w:ascii="Montserrat" w:hAnsi="Montserrat"/>
@@ -14778,16 +14786,16 @@
           <w:noProof/>
         </w:rPr>
         <w:drawing>
-          <wp:inline distT="0" distB="0" distL="0" distR="0" wp14:anchorId="199892E5" wp14:editId="5FC841FA">
+          <wp:inline distT="0" distB="0" distL="0" distR="0" wp14:anchorId="5770C5CA" wp14:editId="682F6DB5">
             <wp:extent cx="5120640" cy="4627581"/>
             <wp:effectExtent l="19050" t="19050" r="22860" b="20955"/>
-            <wp:docPr id="1162674384" name="Imagem 13"/>
+            <wp:docPr id="2029527619" name="Imagem 13"/>
             <wp:cNvGraphicFramePr/>
             <a:graphic xmlns:a="http://schemas.openxmlformats.org/drawingml/2006/main">
               <a:graphicData uri="http://schemas.openxmlformats.org/drawingml/2006/picture">
                 <pic:pic xmlns:pic="http://schemas.openxmlformats.org/drawingml/2006/picture">
                   <pic:nvPicPr>
-                    <pic:cNvPr id="1162674384" name=""/>
+                    <pic:cNvPr id="2029527619" name=""/>
                     <pic:cNvPicPr/>
                   </pic:nvPicPr>
                   <pic:blipFill>
@@ -14855,16 +14863,16 @@
         </w:rPr>
         <w:lastRenderedPageBreak/>
         <w:drawing>
-          <wp:inline distT="0" distB="0" distL="0" distR="0" wp14:anchorId="556C38D7" wp14:editId="29DE65C6">
+          <wp:inline distT="0" distB="0" distL="0" distR="0" wp14:anchorId="459BDF93" wp14:editId="7A04BF50">
             <wp:extent cx="5120640" cy="4627581"/>
             <wp:effectExtent l="19050" t="19050" r="22860" b="20955"/>
-            <wp:docPr id="158468095" name="Imagem 14"/>
+            <wp:docPr id="1073407670" name="Imagem 14"/>
             <wp:cNvGraphicFramePr/>
             <a:graphic xmlns:a="http://schemas.openxmlformats.org/drawingml/2006/main">
               <a:graphicData uri="http://schemas.openxmlformats.org/drawingml/2006/picture">
                 <pic:pic xmlns:pic="http://schemas.openxmlformats.org/drawingml/2006/picture">
                   <pic:nvPicPr>
-                    <pic:cNvPr id="158468095" name=""/>
+                    <pic:cNvPr id="1073407670" name=""/>
                     <pic:cNvPicPr/>
                   </pic:nvPicPr>
                   <pic:blipFill>
@@ -15077,7 +15085,25 @@
           <w:color w:val="1A1A1A"/>
           <w:sz w:val="22"/>
         </w:rPr>
-        <w:t xml:space="preserve">Responsavel (conta): alem do campo de texto livre Responsavel, cada marco tem um segundo campo opcional, Responsavel (conta) - um seletor com as contas que fazem parte da equipe do projeto selecionado (secao 2.5). Diferente do texto livre, que e so uma anotacao, esse campo vincula o marco a uma conta de verdade: e a partir dele (mais o papel Gerente de Projetos da equipe do projeto) que o sistema sabe para quem mandar o aviso automatico de prazo (secao 6.4.3), para popular o Painel de Prazos (secao 6.4.2) e para popular o Meu Painel (secao 6.4.4) daquela conta. Preencher esse campo e opcional - um </w:t>
+        <w:t xml:space="preserve">Responsavel (conta): alem do campo de texto livre Responsavel, cada marco tem um segundo campo opcional, Responsavel (conta) - um botao que abre um painel com uma caixa de selecao para cada conta da equipe do projeto selecionado (secao 2.5), permitindo marcar uma ou mais pessoas para o mesmo marco. A lista mostra o nome cadastrado de cada conta (caindo para o e-mail quando nao houver nome), e o botao resume a escolha (nome, ou </w:t>
+      </w:r>
+    </w:p>
+    <w:p>
+      <w:pPr>
+        <w:spacing w:line="280" w:lineRule="auto"/>
+        <w:rPr>
+          <w:rFonts w:ascii="Montserrat" w:hAnsi="Montserrat"/>
+          <w:color w:val="1A1A1A"/>
+          <w:sz w:val="22"/>
+        </w:rPr>
+      </w:pPr>
+      <w:r>
+        <w:rPr>
+          <w:rFonts w:ascii="Montserrat" w:hAnsi="Montserrat"/>
+          <w:color w:val="1A1A1A"/>
+          <w:sz w:val="22"/>
+        </w:rPr>
+        <w:t xml:space="preserve">ome +N com mais de uma pessoa marcada). Diferente do texto livre, que e so uma anotacao, esse campo vincula o marco a contas de verdade: e a partir dele (mais o papel Gerente de Projetos da equipe do projeto) que o sistema sabe </w:t>
       </w:r>
       <w:r>
         <w:rPr>
@@ -15086,7 +15112,7 @@
           <w:sz w:val="22"/>
         </w:rPr>
         <w:lastRenderedPageBreak/>
-        <w:t>marco sem Responsavel (conta) continua funcionando normalmente, so nao gera aviso individual nem aparece no Meu Painel de ninguem.</w:t>
+        <w:t>para quem mandar o aviso automatico de prazo (secao 6.4.3), para popular o Painel de Prazos (secao 6.4.2) e para popular o Meu Painel (secao 6.4.4) de cada conta marcada. Preencher esse campo e opcional - um marco sem Responsavel (conta) continua funcionando normalmente, so nao gera aviso individual nem aparece no Meu Painel de ninguem.</w:t>
       </w:r>
     </w:p>
     <w:p>
@@ -15104,7 +15130,7 @@
           <w:color w:val="1A1A1A"/>
           <w:sz w:val="22"/>
         </w:rPr>
-        <w:t>Responsavel (conta) nas Entradas (aba 4): no mesmo padrao do cronograma acima, cada linha da aba Entradas tem um seletor opcional Responsavel (conta) com as contas da equipe do projeto. Quando preenchido, a entrada passa a aparecer no Meu Painel (secao 6.4.4) daquela pessoa, com um botao para conclui-la (muda o Status para OK) direto de la.</w:t>
+        <w:t>Responsavel (conta) nas Entradas (aba 4): no mesmo padrao do cronograma acima, cada linha da aba Entradas tem um botao Responsavel (conta) opcional que abre um painel com uma caixa de selecao por conta da equipe do projeto, permitindo marcar mais de uma pessoa. Quando preenchido, a entrada passa a aparecer no Meu Painel (secao 6.4.4) de cada pessoa marcada, com um botao para conclui-la (muda o Status para OK) direto de la.</w:t>
       </w:r>
     </w:p>
     <w:p>
@@ -15160,7 +15186,7 @@
           <w:sz w:val="27"/>
         </w:rPr>
       </w:pPr>
-      <w:bookmarkStart w:id="27" w:name="_Toc240442835"/>
+      <w:bookmarkStart w:id="27" w:name="_Toc240463915"/>
       <w:r>
         <w:rPr>
           <w:rFonts w:ascii="Montserrat" w:hAnsi="Montserrat"/>
@@ -15201,16 +15227,16 @@
         </w:rPr>
         <w:lastRenderedPageBreak/>
         <w:drawing>
-          <wp:inline distT="0" distB="0" distL="0" distR="0" wp14:anchorId="3B87DEBA" wp14:editId="4E7699AD">
+          <wp:inline distT="0" distB="0" distL="0" distR="0" wp14:anchorId="4EA56757" wp14:editId="2DA0ACF4">
             <wp:extent cx="5120640" cy="4627581"/>
             <wp:effectExtent l="19050" t="19050" r="22860" b="20955"/>
-            <wp:docPr id="1574983336" name="Imagem 15"/>
+            <wp:docPr id="124806892" name="Imagem 15"/>
             <wp:cNvGraphicFramePr/>
             <a:graphic xmlns:a="http://schemas.openxmlformats.org/drawingml/2006/main">
               <a:graphicData uri="http://schemas.openxmlformats.org/drawingml/2006/picture">
                 <pic:pic xmlns:pic="http://schemas.openxmlformats.org/drawingml/2006/picture">
                   <pic:nvPicPr>
-                    <pic:cNvPr id="1574983336" name=""/>
+                    <pic:cNvPr id="124806892" name=""/>
                     <pic:cNvPicPr/>
                   </pic:nvPicPr>
                   <pic:blipFill>
@@ -15278,16 +15304,16 @@
         </w:rPr>
         <w:lastRenderedPageBreak/>
         <w:drawing>
-          <wp:inline distT="0" distB="0" distL="0" distR="0" wp14:anchorId="616E75CB" wp14:editId="317436F8">
+          <wp:inline distT="0" distB="0" distL="0" distR="0" wp14:anchorId="5FCEE54D" wp14:editId="2D337D55">
             <wp:extent cx="5120640" cy="4627581"/>
             <wp:effectExtent l="19050" t="19050" r="22860" b="20955"/>
-            <wp:docPr id="2051017739" name="Imagem 16"/>
+            <wp:docPr id="1362002005" name="Imagem 16"/>
             <wp:cNvGraphicFramePr/>
             <a:graphic xmlns:a="http://schemas.openxmlformats.org/drawingml/2006/main">
               <a:graphicData uri="http://schemas.openxmlformats.org/drawingml/2006/picture">
                 <pic:pic xmlns:pic="http://schemas.openxmlformats.org/drawingml/2006/picture">
                   <pic:nvPicPr>
-                    <pic:cNvPr id="2051017739" name=""/>
+                    <pic:cNvPr id="1362002005" name=""/>
                     <pic:cNvPicPr/>
                   </pic:nvPicPr>
                   <pic:blipFill>
@@ -15451,16 +15477,16 @@
         </w:rPr>
         <w:lastRenderedPageBreak/>
         <w:drawing>
-          <wp:inline distT="0" distB="0" distL="0" distR="0" wp14:anchorId="4AD05869" wp14:editId="2475F60E">
+          <wp:inline distT="0" distB="0" distL="0" distR="0" wp14:anchorId="556EB69B" wp14:editId="5D947A93">
             <wp:extent cx="5120640" cy="3282818"/>
             <wp:effectExtent l="19050" t="19050" r="22860" b="13335"/>
-            <wp:docPr id="320253319" name="Imagem 17"/>
+            <wp:docPr id="557161798" name="Imagem 17"/>
             <wp:cNvGraphicFramePr/>
             <a:graphic xmlns:a="http://schemas.openxmlformats.org/drawingml/2006/main">
               <a:graphicData uri="http://schemas.openxmlformats.org/drawingml/2006/picture">
                 <pic:pic xmlns:pic="http://schemas.openxmlformats.org/drawingml/2006/picture">
                   <pic:nvPicPr>
-                    <pic:cNvPr id="320253319" name=""/>
+                    <pic:cNvPr id="557161798" name=""/>
                     <pic:cNvPicPr/>
                   </pic:nvPicPr>
                   <pic:blipFill>
@@ -15641,7 +15667,7 @@
           <w:sz w:val="27"/>
         </w:rPr>
       </w:pPr>
-      <w:bookmarkStart w:id="28" w:name="_Toc240442836"/>
+      <w:bookmarkStart w:id="28" w:name="_Toc240463916"/>
       <w:r>
         <w:rPr>
           <w:rFonts w:ascii="Montserrat" w:hAnsi="Montserrat"/>
@@ -15681,16 +15707,16 @@
           <w:noProof/>
         </w:rPr>
         <w:drawing>
-          <wp:inline distT="0" distB="0" distL="0" distR="0" wp14:anchorId="2988F2BE" wp14:editId="71C2BD0D">
+          <wp:inline distT="0" distB="0" distL="0" distR="0" wp14:anchorId="6DE38B22" wp14:editId="4C2162B2">
             <wp:extent cx="5120640" cy="4627581"/>
             <wp:effectExtent l="19050" t="19050" r="22860" b="20955"/>
-            <wp:docPr id="1927692412" name="Imagem 18"/>
+            <wp:docPr id="590237871" name="Imagem 18"/>
             <wp:cNvGraphicFramePr/>
             <a:graphic xmlns:a="http://schemas.openxmlformats.org/drawingml/2006/main">
               <a:graphicData uri="http://schemas.openxmlformats.org/drawingml/2006/picture">
                 <pic:pic xmlns:pic="http://schemas.openxmlformats.org/drawingml/2006/picture">
                   <pic:nvPicPr>
-                    <pic:cNvPr id="1927692412" name=""/>
+                    <pic:cNvPr id="590237871" name=""/>
                     <pic:cNvPicPr/>
                   </pic:nvPicPr>
                   <pic:blipFill>
@@ -15758,16 +15784,16 @@
         </w:rPr>
         <w:lastRenderedPageBreak/>
         <w:drawing>
-          <wp:inline distT="0" distB="0" distL="0" distR="0" wp14:anchorId="763939C5" wp14:editId="76D84BF5">
+          <wp:inline distT="0" distB="0" distL="0" distR="0" wp14:anchorId="28032401" wp14:editId="2530614E">
             <wp:extent cx="5120640" cy="4627581"/>
             <wp:effectExtent l="19050" t="19050" r="22860" b="20955"/>
-            <wp:docPr id="582694565" name="Imagem 19"/>
+            <wp:docPr id="1254217138" name="Imagem 19"/>
             <wp:cNvGraphicFramePr/>
             <a:graphic xmlns:a="http://schemas.openxmlformats.org/drawingml/2006/main">
               <a:graphicData uri="http://schemas.openxmlformats.org/drawingml/2006/picture">
                 <pic:pic xmlns:pic="http://schemas.openxmlformats.org/drawingml/2006/picture">
                   <pic:nvPicPr>
-                    <pic:cNvPr id="582694565" name=""/>
+                    <pic:cNvPr id="1254217138" name=""/>
                     <pic:cNvPicPr/>
                   </pic:nvPicPr>
                   <pic:blipFill>
@@ -15950,7 +15976,7 @@
           <w:sz w:val="27"/>
         </w:rPr>
       </w:pPr>
-      <w:bookmarkStart w:id="29" w:name="_Toc240442837"/>
+      <w:bookmarkStart w:id="29" w:name="_Toc240463917"/>
       <w:r>
         <w:rPr>
           <w:rFonts w:ascii="Montserrat" w:hAnsi="Montserrat"/>
@@ -15990,16 +16016,16 @@
           <w:noProof/>
         </w:rPr>
         <w:drawing>
-          <wp:inline distT="0" distB="0" distL="0" distR="0" wp14:anchorId="44FB9829" wp14:editId="14C56802">
+          <wp:inline distT="0" distB="0" distL="0" distR="0" wp14:anchorId="2FC04EEA" wp14:editId="2EA318A5">
             <wp:extent cx="5120640" cy="4627581"/>
             <wp:effectExtent l="19050" t="19050" r="22860" b="20955"/>
-            <wp:docPr id="172624143" name="Imagem 20"/>
+            <wp:docPr id="896875217" name="Imagem 20"/>
             <wp:cNvGraphicFramePr/>
             <a:graphic xmlns:a="http://schemas.openxmlformats.org/drawingml/2006/main">
               <a:graphicData uri="http://schemas.openxmlformats.org/drawingml/2006/picture">
                 <pic:pic xmlns:pic="http://schemas.openxmlformats.org/drawingml/2006/picture">
                   <pic:nvPicPr>
-                    <pic:cNvPr id="172624143" name=""/>
+                    <pic:cNvPr id="896875217" name=""/>
                     <pic:cNvPicPr/>
                   </pic:nvPicPr>
                   <pic:blipFill>
@@ -16067,16 +16093,16 @@
         </w:rPr>
         <w:lastRenderedPageBreak/>
         <w:drawing>
-          <wp:inline distT="0" distB="0" distL="0" distR="0" wp14:anchorId="51F2E9F0" wp14:editId="1B26FF91">
+          <wp:inline distT="0" distB="0" distL="0" distR="0" wp14:anchorId="40A4EE06" wp14:editId="23A57D97">
             <wp:extent cx="5120640" cy="4627581"/>
             <wp:effectExtent l="19050" t="19050" r="22860" b="20955"/>
-            <wp:docPr id="2070830138" name="Imagem 21"/>
+            <wp:docPr id="2131388768" name="Imagem 21"/>
             <wp:cNvGraphicFramePr/>
             <a:graphic xmlns:a="http://schemas.openxmlformats.org/drawingml/2006/main">
               <a:graphicData uri="http://schemas.openxmlformats.org/drawingml/2006/picture">
                 <pic:pic xmlns:pic="http://schemas.openxmlformats.org/drawingml/2006/picture">
                   <pic:nvPicPr>
-                    <pic:cNvPr id="2070830138" name=""/>
+                    <pic:cNvPr id="2131388768" name=""/>
                     <pic:cNvPicPr/>
                   </pic:nvPicPr>
                   <pic:blipFill>
@@ -16282,16 +16308,16 @@
           <w:noProof/>
         </w:rPr>
         <w:drawing>
-          <wp:inline distT="0" distB="0" distL="0" distR="0" wp14:anchorId="5612119C" wp14:editId="0CD5CA7B">
+          <wp:inline distT="0" distB="0" distL="0" distR="0" wp14:anchorId="33DBF520" wp14:editId="72A377DE">
             <wp:extent cx="5120640" cy="1757287"/>
             <wp:effectExtent l="19050" t="19050" r="22860" b="14605"/>
-            <wp:docPr id="853661260" name="Imagem 22"/>
+            <wp:docPr id="223625613" name="Imagem 22"/>
             <wp:cNvGraphicFramePr/>
             <a:graphic xmlns:a="http://schemas.openxmlformats.org/drawingml/2006/main">
               <a:graphicData uri="http://schemas.openxmlformats.org/drawingml/2006/picture">
                 <pic:pic xmlns:pic="http://schemas.openxmlformats.org/drawingml/2006/picture">
                   <pic:nvPicPr>
-                    <pic:cNvPr id="853661260" name=""/>
+                    <pic:cNvPr id="223625613" name=""/>
                     <pic:cNvPicPr/>
                   </pic:nvPicPr>
                   <pic:blipFill>
@@ -16404,7 +16430,7 @@
           <w:sz w:val="27"/>
         </w:rPr>
       </w:pPr>
-      <w:bookmarkStart w:id="30" w:name="_Toc240442838"/>
+      <w:bookmarkStart w:id="30" w:name="_Toc240463918"/>
       <w:r>
         <w:rPr>
           <w:rFonts w:ascii="Montserrat" w:hAnsi="Montserrat"/>
@@ -16445,16 +16471,16 @@
         </w:rPr>
         <w:lastRenderedPageBreak/>
         <w:drawing>
-          <wp:inline distT="0" distB="0" distL="0" distR="0" wp14:anchorId="3D7E1940" wp14:editId="6F238300">
+          <wp:inline distT="0" distB="0" distL="0" distR="0" wp14:anchorId="331C9E18" wp14:editId="0A7B0B82">
             <wp:extent cx="5120640" cy="4627581"/>
             <wp:effectExtent l="19050" t="19050" r="22860" b="20955"/>
-            <wp:docPr id="1832341715" name="Imagem 23"/>
+            <wp:docPr id="1178292878" name="Imagem 23"/>
             <wp:cNvGraphicFramePr/>
             <a:graphic xmlns:a="http://schemas.openxmlformats.org/drawingml/2006/main">
               <a:graphicData uri="http://schemas.openxmlformats.org/drawingml/2006/picture">
                 <pic:pic xmlns:pic="http://schemas.openxmlformats.org/drawingml/2006/picture">
                   <pic:nvPicPr>
-                    <pic:cNvPr id="1832341715" name=""/>
+                    <pic:cNvPr id="1178292878" name=""/>
                     <pic:cNvPicPr/>
                   </pic:nvPicPr>
                   <pic:blipFill>
@@ -16522,16 +16548,16 @@
         </w:rPr>
         <w:lastRenderedPageBreak/>
         <w:drawing>
-          <wp:inline distT="0" distB="0" distL="0" distR="0" wp14:anchorId="016C0371" wp14:editId="239E2A2B">
+          <wp:inline distT="0" distB="0" distL="0" distR="0" wp14:anchorId="16BDBA7F" wp14:editId="6F6AD097">
             <wp:extent cx="5120640" cy="4627581"/>
             <wp:effectExtent l="19050" t="19050" r="22860" b="20955"/>
-            <wp:docPr id="1944073868" name="Imagem 24"/>
+            <wp:docPr id="1125327364" name="Imagem 24"/>
             <wp:cNvGraphicFramePr/>
             <a:graphic xmlns:a="http://schemas.openxmlformats.org/drawingml/2006/main">
               <a:graphicData uri="http://schemas.openxmlformats.org/drawingml/2006/picture">
                 <pic:pic xmlns:pic="http://schemas.openxmlformats.org/drawingml/2006/picture">
                   <pic:nvPicPr>
-                    <pic:cNvPr id="1944073868" name=""/>
+                    <pic:cNvPr id="1125327364" name=""/>
                     <pic:cNvPicPr/>
                   </pic:nvPicPr>
                   <pic:blipFill>
@@ -16768,7 +16794,7 @@
           <w:sz w:val="27"/>
         </w:rPr>
       </w:pPr>
-      <w:bookmarkStart w:id="31" w:name="_Toc240442839"/>
+      <w:bookmarkStart w:id="31" w:name="_Toc240463919"/>
       <w:r>
         <w:rPr>
           <w:rFonts w:ascii="Montserrat" w:hAnsi="Montserrat"/>
@@ -16808,16 +16834,16 @@
           <w:noProof/>
         </w:rPr>
         <w:drawing>
-          <wp:inline distT="0" distB="0" distL="0" distR="0" wp14:anchorId="7F653011" wp14:editId="2E2E8704">
+          <wp:inline distT="0" distB="0" distL="0" distR="0" wp14:anchorId="697AF648" wp14:editId="7D457F50">
             <wp:extent cx="5120640" cy="4627581"/>
             <wp:effectExtent l="19050" t="19050" r="22860" b="20955"/>
-            <wp:docPr id="798333496" name="Imagem 25"/>
+            <wp:docPr id="166679897" name="Imagem 25"/>
             <wp:cNvGraphicFramePr/>
             <a:graphic xmlns:a="http://schemas.openxmlformats.org/drawingml/2006/main">
               <a:graphicData uri="http://schemas.openxmlformats.org/drawingml/2006/picture">
                 <pic:pic xmlns:pic="http://schemas.openxmlformats.org/drawingml/2006/picture">
                   <pic:nvPicPr>
-                    <pic:cNvPr id="798333496" name=""/>
+                    <pic:cNvPr id="166679897" name=""/>
                     <pic:cNvPicPr/>
                   </pic:nvPicPr>
                   <pic:blipFill>
@@ -16885,16 +16911,16 @@
         </w:rPr>
         <w:lastRenderedPageBreak/>
         <w:drawing>
-          <wp:inline distT="0" distB="0" distL="0" distR="0" wp14:anchorId="67A7572B" wp14:editId="466301F4">
+          <wp:inline distT="0" distB="0" distL="0" distR="0" wp14:anchorId="7EA63DF6" wp14:editId="44A45FD7">
             <wp:extent cx="5120640" cy="4627581"/>
             <wp:effectExtent l="19050" t="19050" r="22860" b="20955"/>
-            <wp:docPr id="1270796831" name="Imagem 26"/>
+            <wp:docPr id="69507270" name="Imagem 26"/>
             <wp:cNvGraphicFramePr/>
             <a:graphic xmlns:a="http://schemas.openxmlformats.org/drawingml/2006/main">
               <a:graphicData uri="http://schemas.openxmlformats.org/drawingml/2006/picture">
                 <pic:pic xmlns:pic="http://schemas.openxmlformats.org/drawingml/2006/picture">
                   <pic:nvPicPr>
-                    <pic:cNvPr id="1270796831" name=""/>
+                    <pic:cNvPr id="69507270" name=""/>
                     <pic:cNvPicPr/>
                   </pic:nvPicPr>
                   <pic:blipFill>
@@ -17085,7 +17111,7 @@
           <w:sz w:val="27"/>
         </w:rPr>
       </w:pPr>
-      <w:bookmarkStart w:id="32" w:name="_Toc240442840"/>
+      <w:bookmarkStart w:id="32" w:name="_Toc240463920"/>
       <w:r>
         <w:rPr>
           <w:rFonts w:ascii="Montserrat" w:hAnsi="Montserrat"/>
@@ -17125,16 +17151,16 @@
           <w:noProof/>
         </w:rPr>
         <w:drawing>
-          <wp:inline distT="0" distB="0" distL="0" distR="0" wp14:anchorId="53ED878E" wp14:editId="4340249B">
+          <wp:inline distT="0" distB="0" distL="0" distR="0" wp14:anchorId="2C9FF8DC" wp14:editId="0DDAEDEE">
             <wp:extent cx="5120640" cy="4000682"/>
             <wp:effectExtent l="19050" t="19050" r="22860" b="19050"/>
-            <wp:docPr id="375132894" name="Imagem 27"/>
+            <wp:docPr id="318700988" name="Imagem 27"/>
             <wp:cNvGraphicFramePr/>
             <a:graphic xmlns:a="http://schemas.openxmlformats.org/drawingml/2006/main">
               <a:graphicData uri="http://schemas.openxmlformats.org/drawingml/2006/picture">
                 <pic:pic xmlns:pic="http://schemas.openxmlformats.org/drawingml/2006/picture">
                   <pic:nvPicPr>
-                    <pic:cNvPr id="375132894" name=""/>
+                    <pic:cNvPr id="318700988" name=""/>
                     <pic:cNvPicPr/>
                   </pic:nvPicPr>
                   <pic:blipFill>
@@ -17658,7 +17684,7 @@
           <w:sz w:val="34"/>
         </w:rPr>
       </w:pPr>
-      <w:bookmarkStart w:id="33" w:name="_Toc240442841"/>
+      <w:bookmarkStart w:id="33" w:name="_Toc240463921"/>
       <w:r>
         <w:rPr>
           <w:rFonts w:ascii="Montserrat" w:hAnsi="Montserrat"/>
@@ -17700,7 +17726,7 @@
           <w:sz w:val="27"/>
         </w:rPr>
       </w:pPr>
-      <w:bookmarkStart w:id="34" w:name="_Toc240442842"/>
+      <w:bookmarkStart w:id="34" w:name="_Toc240463922"/>
       <w:r>
         <w:rPr>
           <w:rFonts w:ascii="Montserrat" w:hAnsi="Montserrat"/>
@@ -17740,16 +17766,16 @@
           <w:noProof/>
         </w:rPr>
         <w:drawing>
-          <wp:inline distT="0" distB="0" distL="0" distR="0" wp14:anchorId="67181A09" wp14:editId="57E7A26C">
+          <wp:inline distT="0" distB="0" distL="0" distR="0" wp14:anchorId="798CA4D5" wp14:editId="1BE40988">
             <wp:extent cx="5120640" cy="4627581"/>
             <wp:effectExtent l="19050" t="19050" r="22860" b="20955"/>
-            <wp:docPr id="1539216970" name="Imagem 28"/>
+            <wp:docPr id="21589703" name="Imagem 28"/>
             <wp:cNvGraphicFramePr/>
             <a:graphic xmlns:a="http://schemas.openxmlformats.org/drawingml/2006/main">
               <a:graphicData uri="http://schemas.openxmlformats.org/drawingml/2006/picture">
                 <pic:pic xmlns:pic="http://schemas.openxmlformats.org/drawingml/2006/picture">
                   <pic:nvPicPr>
-                    <pic:cNvPr id="1539216970" name=""/>
+                    <pic:cNvPr id="21589703" name=""/>
                     <pic:cNvPicPr/>
                   </pic:nvPicPr>
                   <pic:blipFill>
@@ -17817,16 +17843,16 @@
         </w:rPr>
         <w:lastRenderedPageBreak/>
         <w:drawing>
-          <wp:inline distT="0" distB="0" distL="0" distR="0" wp14:anchorId="77815FF0" wp14:editId="1C130DDD">
+          <wp:inline distT="0" distB="0" distL="0" distR="0" wp14:anchorId="4F982E43" wp14:editId="474F47F8">
             <wp:extent cx="5120640" cy="4627581"/>
             <wp:effectExtent l="19050" t="19050" r="22860" b="20955"/>
-            <wp:docPr id="1008340118" name="Imagem 29"/>
+            <wp:docPr id="2079078979" name="Imagem 29"/>
             <wp:cNvGraphicFramePr/>
             <a:graphic xmlns:a="http://schemas.openxmlformats.org/drawingml/2006/main">
               <a:graphicData uri="http://schemas.openxmlformats.org/drawingml/2006/picture">
                 <pic:pic xmlns:pic="http://schemas.openxmlformats.org/drawingml/2006/picture">
                   <pic:nvPicPr>
-                    <pic:cNvPr id="1008340118" name=""/>
+                    <pic:cNvPr id="2079078979" name=""/>
                     <pic:cNvPicPr/>
                   </pic:nvPicPr>
                   <pic:blipFill>
@@ -17894,16 +17920,16 @@
         </w:rPr>
         <w:lastRenderedPageBreak/>
         <w:drawing>
-          <wp:inline distT="0" distB="0" distL="0" distR="0" wp14:anchorId="75FB30B6" wp14:editId="29FB1D8A">
+          <wp:inline distT="0" distB="0" distL="0" distR="0" wp14:anchorId="28377FCA" wp14:editId="4F4FFFE1">
             <wp:extent cx="5120640" cy="4627581"/>
             <wp:effectExtent l="19050" t="19050" r="22860" b="20955"/>
-            <wp:docPr id="927183168" name="Imagem 30"/>
+            <wp:docPr id="448625807" name="Imagem 30"/>
             <wp:cNvGraphicFramePr/>
             <a:graphic xmlns:a="http://schemas.openxmlformats.org/drawingml/2006/main">
               <a:graphicData uri="http://schemas.openxmlformats.org/drawingml/2006/picture">
                 <pic:pic xmlns:pic="http://schemas.openxmlformats.org/drawingml/2006/picture">
                   <pic:nvPicPr>
-                    <pic:cNvPr id="927183168" name=""/>
+                    <pic:cNvPr id="448625807" name=""/>
                     <pic:cNvPicPr/>
                   </pic:nvPicPr>
                   <pic:blipFill>
@@ -18105,16 +18131,16 @@
           <w:noProof/>
         </w:rPr>
         <w:drawing>
-          <wp:inline distT="0" distB="0" distL="0" distR="0" wp14:anchorId="38B7BA1E" wp14:editId="20E501A8">
+          <wp:inline distT="0" distB="0" distL="0" distR="0" wp14:anchorId="54EC55BE" wp14:editId="3D0467E1">
             <wp:extent cx="5120640" cy="1715571"/>
             <wp:effectExtent l="19050" t="19050" r="22860" b="18415"/>
-            <wp:docPr id="922076840" name="Imagem 31"/>
+            <wp:docPr id="1428294245" name="Imagem 31"/>
             <wp:cNvGraphicFramePr/>
             <a:graphic xmlns:a="http://schemas.openxmlformats.org/drawingml/2006/main">
               <a:graphicData uri="http://schemas.openxmlformats.org/drawingml/2006/picture">
                 <pic:pic xmlns:pic="http://schemas.openxmlformats.org/drawingml/2006/picture">
                   <pic:nvPicPr>
-                    <pic:cNvPr id="922076840" name=""/>
+                    <pic:cNvPr id="1428294245" name=""/>
                     <pic:cNvPicPr/>
                   </pic:nvPicPr>
                   <pic:blipFill>
@@ -18251,16 +18277,16 @@
           <w:noProof/>
         </w:rPr>
         <w:drawing>
-          <wp:inline distT="0" distB="0" distL="0" distR="0" wp14:anchorId="1658EB64" wp14:editId="0AAF78C1">
+          <wp:inline distT="0" distB="0" distL="0" distR="0" wp14:anchorId="6C4B9C8A" wp14:editId="6086E07C">
             <wp:extent cx="5120640" cy="3282818"/>
             <wp:effectExtent l="19050" t="19050" r="22860" b="13335"/>
-            <wp:docPr id="434467712" name="Imagem 32"/>
+            <wp:docPr id="1779324711" name="Imagem 32"/>
             <wp:cNvGraphicFramePr/>
             <a:graphic xmlns:a="http://schemas.openxmlformats.org/drawingml/2006/main">
               <a:graphicData uri="http://schemas.openxmlformats.org/drawingml/2006/picture">
                 <pic:pic xmlns:pic="http://schemas.openxmlformats.org/drawingml/2006/picture">
                   <pic:nvPicPr>
-                    <pic:cNvPr id="434467712" name=""/>
+                    <pic:cNvPr id="1779324711" name=""/>
                     <pic:cNvPicPr/>
                   </pic:nvPicPr>
                   <pic:blipFill>
@@ -18394,16 +18420,16 @@
           <w:noProof/>
         </w:rPr>
         <w:drawing>
-          <wp:inline distT="0" distB="0" distL="0" distR="0" wp14:anchorId="36CA324C" wp14:editId="1DC7AF7C">
+          <wp:inline distT="0" distB="0" distL="0" distR="0" wp14:anchorId="7DAFC101" wp14:editId="7C4FF66D">
             <wp:extent cx="5120640" cy="951357"/>
             <wp:effectExtent l="19050" t="19050" r="22860" b="20320"/>
-            <wp:docPr id="612033561" name="Imagem 33"/>
+            <wp:docPr id="724678175" name="Imagem 33"/>
             <wp:cNvGraphicFramePr/>
             <a:graphic xmlns:a="http://schemas.openxmlformats.org/drawingml/2006/main">
               <a:graphicData uri="http://schemas.openxmlformats.org/drawingml/2006/picture">
                 <pic:pic xmlns:pic="http://schemas.openxmlformats.org/drawingml/2006/picture">
                   <pic:nvPicPr>
-                    <pic:cNvPr id="612033561" name=""/>
+                    <pic:cNvPr id="724678175" name=""/>
                     <pic:cNvPicPr/>
                   </pic:nvPicPr>
                   <pic:blipFill>
@@ -18502,7 +18528,7 @@
           <w:color w:val="6A6A70"/>
           <w:sz w:val="21"/>
         </w:rPr>
-        <w:t>Responsavel (conta): diferente do mesmo campo no cronograma do Planejamento e no Registro de riscos do TAP (que listam so a equipe do projeto), aqui o seletor Responsavel (conta) lista todas as contas do sistema - Entraves e Encaminhamentos nao tem um projeto vinculado unico, entao nao ha uma equipe para restringir a lista. Quando preenchido, o item passa a aparecer no Meu Painel (secao 6.4.4) da conta selecionada, com um botao Resolver que muda o Status para Resolvido direto de la. E opcional.</w:t>
+        <w:t xml:space="preserve">Responsavel (conta): diferente do mesmo campo no cronograma do Planejamento e no Registro de riscos do TAP (que listam so a equipe do projeto), aqui o botao Responsavel (conta) abre um painel com uma caixa de selecao para cada conta do sistema - Entraves e Encaminhamentos nao tem um projeto vinculado unico, entao nao ha uma equipe para restringir a lista - permitindo marcar uma ou mais pessoas. A lista mostra o nome cadastrado de cada conta (caindo para o e-mail quando nao houver nome), e o botao resume a escolha (nome, ou </w:t>
       </w:r>
     </w:p>
     <w:p>
@@ -18523,7 +18549,38 @@
           <w:color w:val="6A6A70"/>
           <w:sz w:val="21"/>
         </w:rPr>
-        <w:t>Gestao de Entraves e Encaminhamentos: entraves sao bloqueios que impedem o avanco do portfolio (ex.: dependencia externa, aprovacao pendente); encaminhamentos sao os proximos passos e decisoes acordadas para desbloquear ou avancar o trabalho. Os dois sao listas simples, independentes dos projetos cadastrados - continuam visiveis no Painel mesmo que nenhum projeto tenha sido informado ainda. No Painel, aparecem lado a lado na secao Entraves e encaminhamentos, com o Status de cada item destacado por selo colorido, e tambem saem no documento exportado. Os campos Por que? (causa do entrave/encaminhamento) e Resultado esperado sao opcionais e nao aparecem no documento exportado deste relatorio - servem de insumo para o Plano de Acao do Relatorio de Resultados (secao 6.7), preenchidos so quando ha algo relevante a registrar.</w:t>
+        <w:t>ome +N com mais de uma pessoa marcada). Quando preenchido, o item passa a aparecer no Meu Painel (secao 6.4.4) de cada conta marcada, com um botao Resolver que muda o Status para Resolvido direto de la. E opcional.</w:t>
+      </w:r>
+    </w:p>
+    <w:p>
+      <w:pPr>
+        <w:spacing w:before="160" w:after="200"/>
+        <w:ind w:left="283"/>
+        <w:rPr>
+          <w:rFonts w:ascii="Montserrat" w:hAnsi="Montserrat"/>
+          <w:i/>
+          <w:color w:val="6A6A70"/>
+          <w:sz w:val="21"/>
+        </w:rPr>
+      </w:pPr>
+      <w:r>
+        <w:rPr>
+          <w:rFonts w:ascii="Montserrat" w:hAnsi="Montserrat"/>
+          <w:i/>
+          <w:color w:val="6A6A70"/>
+          <w:sz w:val="21"/>
+        </w:rPr>
+        <w:t xml:space="preserve">Gestao de Entraves e Encaminhamentos: entraves sao bloqueios que impedem o avanco do portfolio (ex.: dependencia externa, aprovacao pendente); encaminhamentos sao os proximos passos e decisoes acordadas para desbloquear ou avancar o trabalho. Os dois sao listas simples, independentes dos projetos cadastrados - continuam visiveis no Painel mesmo que nenhum projeto tenha sido informado ainda. No Painel, aparecem lado a lado na secao Entraves e encaminhamentos, com o Status de cada item destacado por selo colorido, e tambem saem no documento exportado. Os campos Por que? (causa do entrave/encaminhamento) e Resultado esperado sao opcionais e nao aparecem no documento exportado deste relatorio - servem de insumo para o </w:t>
+      </w:r>
+      <w:r>
+        <w:rPr>
+          <w:rFonts w:ascii="Montserrat" w:hAnsi="Montserrat"/>
+          <w:i/>
+          <w:color w:val="6A6A70"/>
+          <w:sz w:val="21"/>
+        </w:rPr>
+        <w:lastRenderedPageBreak/>
+        <w:t>Plano de Acao do Relatorio de Resultados (secao 6.7), preenchidos so quando ha algo relevante a registrar.</w:t>
       </w:r>
     </w:p>
     <w:p>
@@ -18535,18 +18592,17 @@
         <w:rPr>
           <w:noProof/>
         </w:rPr>
-        <w:lastRenderedPageBreak/>
         <w:drawing>
-          <wp:inline distT="0" distB="0" distL="0" distR="0" wp14:anchorId="24609EEB" wp14:editId="52FA5812">
+          <wp:inline distT="0" distB="0" distL="0" distR="0" wp14:anchorId="7EA31379" wp14:editId="361AEE3C">
             <wp:extent cx="5120640" cy="1515102"/>
             <wp:effectExtent l="19050" t="19050" r="22860" b="28575"/>
-            <wp:docPr id="159608016" name="Imagem 34"/>
+            <wp:docPr id="658380706" name="Imagem 34"/>
             <wp:cNvGraphicFramePr/>
             <a:graphic xmlns:a="http://schemas.openxmlformats.org/drawingml/2006/main">
               <a:graphicData uri="http://schemas.openxmlformats.org/drawingml/2006/picture">
                 <pic:pic xmlns:pic="http://schemas.openxmlformats.org/drawingml/2006/picture">
                   <pic:nvPicPr>
-                    <pic:cNvPr id="159608016" name=""/>
+                    <pic:cNvPr id="658380706" name=""/>
                     <pic:cNvPicPr/>
                   </pic:nvPicPr>
                   <pic:blipFill>
@@ -18658,16 +18714,16 @@
           <w:noProof/>
         </w:rPr>
         <w:drawing>
-          <wp:inline distT="0" distB="0" distL="0" distR="0" wp14:anchorId="0F0CC700" wp14:editId="0DFB0857">
+          <wp:inline distT="0" distB="0" distL="0" distR="0" wp14:anchorId="3289DC42" wp14:editId="4D9F0CFA">
             <wp:extent cx="5120640" cy="1391113"/>
             <wp:effectExtent l="19050" t="19050" r="22860" b="19050"/>
-            <wp:docPr id="1667583178" name="Imagem 35"/>
+            <wp:docPr id="1518085406" name="Imagem 35"/>
             <wp:cNvGraphicFramePr/>
             <a:graphic xmlns:a="http://schemas.openxmlformats.org/drawingml/2006/main">
               <a:graphicData uri="http://schemas.openxmlformats.org/drawingml/2006/picture">
                 <pic:pic xmlns:pic="http://schemas.openxmlformats.org/drawingml/2006/picture">
                   <pic:nvPicPr>
-                    <pic:cNvPr id="1667583178" name=""/>
+                    <pic:cNvPr id="1518085406" name=""/>
                     <pic:cNvPicPr/>
                   </pic:nvPicPr>
                   <pic:blipFill>
@@ -18766,7 +18822,7 @@
           <w:color w:val="6A6A70"/>
           <w:sz w:val="21"/>
         </w:rPr>
-        <w:t xml:space="preserve">Versionamento: toda vez que o relatorio e salvo (Salvar e ver painel), o sistema arquiva uma copia completa dos dados daquele momento, alem de atualizar a versao atual. Isso preserva as referencias mensais anteriores, que antes eram sobrescritas a cada novo salvamento. Ao clicar em Visualizar numa versao antiga, o Painel passa a mostrar aquele instantaneo, com um aviso amarelo no </w:t>
+        <w:t xml:space="preserve">Versionamento: toda vez que o relatorio e salvo (Salvar e ver painel), o sistema arquiva uma copia completa dos dados daquele momento, alem de atualizar a versao atual. Isso preserva as referencias mensais anteriores, que antes eram </w:t>
       </w:r>
       <w:r>
         <w:rPr>
@@ -18776,7 +18832,7 @@
           <w:sz w:val="21"/>
         </w:rPr>
         <w:lastRenderedPageBreak/>
-        <w:t>topo (Visualizando versao... - somente leitura) e um botao Voltar a versao atual. Enquanto uma versao antiga esta sendo visualizada, as abas Editar dados e Importar Project ficam bloqueadas - e preciso voltar a versao atual antes de editar.</w:t>
+        <w:t>sobrescritas a cada novo salvamento. Ao clicar em Visualizar numa versao antiga, o Painel passa a mostrar aquele instantaneo, com um aviso amarelo no topo (Visualizando versao... - somente leitura) e um botao Voltar a versao atual. Enquanto uma versao antiga esta sendo visualizada, as abas Editar dados e Importar Project ficam bloqueadas - e preciso voltar a versao atual antes de editar.</w:t>
       </w:r>
     </w:p>
     <w:p>
@@ -18789,16 +18845,16 @@
           <w:noProof/>
         </w:rPr>
         <w:drawing>
-          <wp:inline distT="0" distB="0" distL="0" distR="0" wp14:anchorId="4826B46F" wp14:editId="20676373">
+          <wp:inline distT="0" distB="0" distL="0" distR="0" wp14:anchorId="25D2FB12" wp14:editId="61C92BE1">
             <wp:extent cx="5120640" cy="1125174"/>
             <wp:effectExtent l="19050" t="19050" r="22860" b="18415"/>
-            <wp:docPr id="2134905770" name="Imagem 36"/>
+            <wp:docPr id="541110870" name="Imagem 36"/>
             <wp:cNvGraphicFramePr/>
             <a:graphic xmlns:a="http://schemas.openxmlformats.org/drawingml/2006/main">
               <a:graphicData uri="http://schemas.openxmlformats.org/drawingml/2006/picture">
                 <pic:pic xmlns:pic="http://schemas.openxmlformats.org/drawingml/2006/picture">
                   <pic:nvPicPr>
-                    <pic:cNvPr id="2134905770" name=""/>
+                    <pic:cNvPr id="541110870" name=""/>
                     <pic:cNvPicPr/>
                   </pic:nvPicPr>
                   <pic:blipFill>
@@ -18887,7 +18943,7 @@
           <w:sz w:val="27"/>
         </w:rPr>
       </w:pPr>
-      <w:bookmarkStart w:id="35" w:name="_Toc240442843"/>
+      <w:bookmarkStart w:id="35" w:name="_Toc240463923"/>
       <w:r>
         <w:rPr>
           <w:rFonts w:ascii="Montserrat" w:hAnsi="Montserrat"/>
@@ -18928,16 +18984,16 @@
         </w:rPr>
         <w:lastRenderedPageBreak/>
         <w:drawing>
-          <wp:inline distT="0" distB="0" distL="0" distR="0" wp14:anchorId="4E51A637" wp14:editId="60D8BB94">
+          <wp:inline distT="0" distB="0" distL="0" distR="0" wp14:anchorId="309794A9" wp14:editId="776722F8">
             <wp:extent cx="5120640" cy="4627581"/>
             <wp:effectExtent l="19050" t="19050" r="22860" b="20955"/>
-            <wp:docPr id="130122304" name="Imagem 37"/>
+            <wp:docPr id="1524210749" name="Imagem 37"/>
             <wp:cNvGraphicFramePr/>
             <a:graphic xmlns:a="http://schemas.openxmlformats.org/drawingml/2006/main">
               <a:graphicData uri="http://schemas.openxmlformats.org/drawingml/2006/picture">
                 <pic:pic xmlns:pic="http://schemas.openxmlformats.org/drawingml/2006/picture">
                   <pic:nvPicPr>
-                    <pic:cNvPr id="130122304" name=""/>
+                    <pic:cNvPr id="1524210749" name=""/>
                     <pic:cNvPicPr/>
                   </pic:nvPicPr>
                   <pic:blipFill>
@@ -19005,16 +19061,16 @@
         </w:rPr>
         <w:lastRenderedPageBreak/>
         <w:drawing>
-          <wp:inline distT="0" distB="0" distL="0" distR="0" wp14:anchorId="687B943E" wp14:editId="5C858CD2">
+          <wp:inline distT="0" distB="0" distL="0" distR="0" wp14:anchorId="31EB14DE" wp14:editId="50BA540B">
             <wp:extent cx="5120640" cy="4627581"/>
             <wp:effectExtent l="19050" t="19050" r="22860" b="20955"/>
-            <wp:docPr id="1161266491" name="Imagem 38"/>
+            <wp:docPr id="2098188571" name="Imagem 38"/>
             <wp:cNvGraphicFramePr/>
             <a:graphic xmlns:a="http://schemas.openxmlformats.org/drawingml/2006/main">
               <a:graphicData uri="http://schemas.openxmlformats.org/drawingml/2006/picture">
                 <pic:pic xmlns:pic="http://schemas.openxmlformats.org/drawingml/2006/picture">
                   <pic:nvPicPr>
-                    <pic:cNvPr id="1161266491" name=""/>
+                    <pic:cNvPr id="2098188571" name=""/>
                     <pic:cNvPicPr/>
                   </pic:nvPicPr>
                   <pic:blipFill>
@@ -19183,16 +19239,16 @@
           <w:noProof/>
         </w:rPr>
         <w:drawing>
-          <wp:inline distT="0" distB="0" distL="0" distR="0" wp14:anchorId="699E4B24" wp14:editId="4CBE50C8">
+          <wp:inline distT="0" distB="0" distL="0" distR="0" wp14:anchorId="12E2E03D" wp14:editId="3E0B8DE7">
             <wp:extent cx="5120640" cy="2144319"/>
             <wp:effectExtent l="19050" t="19050" r="22860" b="27940"/>
-            <wp:docPr id="1207840647" name="Imagem 39"/>
+            <wp:docPr id="94212614" name="Imagem 39"/>
             <wp:cNvGraphicFramePr/>
             <a:graphic xmlns:a="http://schemas.openxmlformats.org/drawingml/2006/main">
               <a:graphicData uri="http://schemas.openxmlformats.org/drawingml/2006/picture">
                 <pic:pic xmlns:pic="http://schemas.openxmlformats.org/drawingml/2006/picture">
                   <pic:nvPicPr>
-                    <pic:cNvPr id="1207840647" name=""/>
+                    <pic:cNvPr id="94212614" name=""/>
                     <pic:cNvPicPr/>
                   </pic:nvPicPr>
                   <pic:blipFill>
@@ -19280,16 +19336,16 @@
           <w:noProof/>
         </w:rPr>
         <w:drawing>
-          <wp:inline distT="0" distB="0" distL="0" distR="0" wp14:anchorId="76DA8ACD" wp14:editId="3D552FB5">
+          <wp:inline distT="0" distB="0" distL="0" distR="0" wp14:anchorId="30341A82" wp14:editId="258AA819">
             <wp:extent cx="5120640" cy="1055647"/>
             <wp:effectExtent l="19050" t="19050" r="22860" b="11430"/>
-            <wp:docPr id="1157850697" name="Imagem 40"/>
+            <wp:docPr id="1400383694" name="Imagem 40"/>
             <wp:cNvGraphicFramePr/>
             <a:graphic xmlns:a="http://schemas.openxmlformats.org/drawingml/2006/main">
               <a:graphicData uri="http://schemas.openxmlformats.org/drawingml/2006/picture">
                 <pic:pic xmlns:pic="http://schemas.openxmlformats.org/drawingml/2006/picture">
                   <pic:nvPicPr>
-                    <pic:cNvPr id="1157850697" name=""/>
+                    <pic:cNvPr id="1400383694" name=""/>
                     <pic:cNvPicPr/>
                   </pic:nvPicPr>
                   <pic:blipFill>
@@ -19411,16 +19467,16 @@
           <w:noProof/>
         </w:rPr>
         <w:drawing>
-          <wp:inline distT="0" distB="0" distL="0" distR="0" wp14:anchorId="3EFE615E" wp14:editId="342A95E3">
+          <wp:inline distT="0" distB="0" distL="0" distR="0" wp14:anchorId="15130AFE" wp14:editId="24FC6FAA">
             <wp:extent cx="5120640" cy="3282818"/>
             <wp:effectExtent l="19050" t="19050" r="22860" b="13335"/>
-            <wp:docPr id="1785373154" name="Imagem 41"/>
+            <wp:docPr id="1419779745" name="Imagem 41"/>
             <wp:cNvGraphicFramePr/>
             <a:graphic xmlns:a="http://schemas.openxmlformats.org/drawingml/2006/main">
               <a:graphicData uri="http://schemas.openxmlformats.org/drawingml/2006/picture">
                 <pic:pic xmlns:pic="http://schemas.openxmlformats.org/drawingml/2006/picture">
                   <pic:nvPicPr>
-                    <pic:cNvPr id="1785373154" name=""/>
+                    <pic:cNvPr id="1419779745" name=""/>
                     <pic:cNvPicPr/>
                   </pic:nvPicPr>
                   <pic:blipFill>
@@ -19554,16 +19610,16 @@
         </w:rPr>
         <w:lastRenderedPageBreak/>
         <w:drawing>
-          <wp:inline distT="0" distB="0" distL="0" distR="0" wp14:anchorId="30F255D7" wp14:editId="53965A7A">
+          <wp:inline distT="0" distB="0" distL="0" distR="0" wp14:anchorId="313A4564" wp14:editId="5A8E6CAD">
             <wp:extent cx="5120640" cy="1978034"/>
             <wp:effectExtent l="19050" t="19050" r="22860" b="22225"/>
-            <wp:docPr id="1336170673" name="Imagem 42"/>
+            <wp:docPr id="1369499611" name="Imagem 42"/>
             <wp:cNvGraphicFramePr/>
             <a:graphic xmlns:a="http://schemas.openxmlformats.org/drawingml/2006/main">
               <a:graphicData uri="http://schemas.openxmlformats.org/drawingml/2006/picture">
                 <pic:pic xmlns:pic="http://schemas.openxmlformats.org/drawingml/2006/picture">
                   <pic:nvPicPr>
-                    <pic:cNvPr id="1336170673" name=""/>
+                    <pic:cNvPr id="1369499611" name=""/>
                     <pic:cNvPicPr/>
                   </pic:nvPicPr>
                   <pic:blipFill>
@@ -19635,7 +19691,7 @@
           <w:sz w:val="34"/>
         </w:rPr>
       </w:pPr>
-      <w:bookmarkStart w:id="36" w:name="_Toc240442844"/>
+      <w:bookmarkStart w:id="36" w:name="_Toc240463924"/>
       <w:r>
         <w:rPr>
           <w:rFonts w:ascii="Montserrat" w:hAnsi="Montserrat"/>
@@ -19695,7 +19751,7 @@
           <w:sz w:val="27"/>
         </w:rPr>
       </w:pPr>
-      <w:bookmarkStart w:id="37" w:name="_Toc240442845"/>
+      <w:bookmarkStart w:id="37" w:name="_Toc240463925"/>
       <w:r>
         <w:rPr>
           <w:rFonts w:ascii="Montserrat" w:hAnsi="Montserrat"/>
@@ -19735,16 +19791,16 @@
           <w:noProof/>
         </w:rPr>
         <w:drawing>
-          <wp:inline distT="0" distB="0" distL="0" distR="0" wp14:anchorId="6DA8FE14" wp14:editId="34507BB2">
+          <wp:inline distT="0" distB="0" distL="0" distR="0" wp14:anchorId="46E85DCC" wp14:editId="0931B28F">
             <wp:extent cx="5303520" cy="4792851"/>
             <wp:effectExtent l="19050" t="19050" r="11430" b="27305"/>
-            <wp:docPr id="441437614" name="Imagem 43"/>
+            <wp:docPr id="629451387" name="Imagem 43"/>
             <wp:cNvGraphicFramePr/>
             <a:graphic xmlns:a="http://schemas.openxmlformats.org/drawingml/2006/main">
               <a:graphicData uri="http://schemas.openxmlformats.org/drawingml/2006/picture">
                 <pic:pic xmlns:pic="http://schemas.openxmlformats.org/drawingml/2006/picture">
                   <pic:nvPicPr>
-                    <pic:cNvPr id="441437614" name=""/>
+                    <pic:cNvPr id="629451387" name=""/>
                     <pic:cNvPicPr/>
                   </pic:nvPicPr>
                   <pic:blipFill>
@@ -19813,7 +19869,7 @@
           <w:sz w:val="27"/>
         </w:rPr>
       </w:pPr>
-      <w:bookmarkStart w:id="38" w:name="_Toc240442846"/>
+      <w:bookmarkStart w:id="38" w:name="_Toc240463926"/>
       <w:r>
         <w:rPr>
           <w:rFonts w:ascii="Montserrat" w:hAnsi="Montserrat"/>
@@ -19853,16 +19909,16 @@
           <w:noProof/>
         </w:rPr>
         <w:drawing>
-          <wp:inline distT="0" distB="0" distL="0" distR="0" wp14:anchorId="4D43D1D3" wp14:editId="47B927A6">
+          <wp:inline distT="0" distB="0" distL="0" distR="0" wp14:anchorId="7423D3C2" wp14:editId="6B7B57EC">
             <wp:extent cx="5303520" cy="4792851"/>
             <wp:effectExtent l="19050" t="19050" r="11430" b="27305"/>
-            <wp:docPr id="169162611" name="Imagem 44"/>
+            <wp:docPr id="1335794163" name="Imagem 44"/>
             <wp:cNvGraphicFramePr/>
             <a:graphic xmlns:a="http://schemas.openxmlformats.org/drawingml/2006/main">
               <a:graphicData uri="http://schemas.openxmlformats.org/drawingml/2006/picture">
                 <pic:pic xmlns:pic="http://schemas.openxmlformats.org/drawingml/2006/picture">
                   <pic:nvPicPr>
-                    <pic:cNvPr id="169162611" name=""/>
+                    <pic:cNvPr id="1335794163" name=""/>
                     <pic:cNvPicPr/>
                   </pic:nvPicPr>
                   <pic:blipFill>
@@ -19930,7 +19986,7 @@
           <w:sz w:val="27"/>
         </w:rPr>
       </w:pPr>
-      <w:bookmarkStart w:id="39" w:name="_Toc240442847"/>
+      <w:bookmarkStart w:id="39" w:name="_Toc240463927"/>
       <w:r>
         <w:rPr>
           <w:rFonts w:ascii="Montserrat" w:hAnsi="Montserrat"/>
@@ -19971,16 +20027,16 @@
         </w:rPr>
         <w:lastRenderedPageBreak/>
         <w:drawing>
-          <wp:inline distT="0" distB="0" distL="0" distR="0" wp14:anchorId="4BDA55D1" wp14:editId="4F4A6580">
+          <wp:inline distT="0" distB="0" distL="0" distR="0" wp14:anchorId="66B14BCE" wp14:editId="5E0D9AC2">
             <wp:extent cx="5303520" cy="4792851"/>
             <wp:effectExtent l="19050" t="19050" r="11430" b="27305"/>
-            <wp:docPr id="1863231422" name="Imagem 45"/>
+            <wp:docPr id="1436314298" name="Imagem 45"/>
             <wp:cNvGraphicFramePr/>
             <a:graphic xmlns:a="http://schemas.openxmlformats.org/drawingml/2006/main">
               <a:graphicData uri="http://schemas.openxmlformats.org/drawingml/2006/picture">
                 <pic:pic xmlns:pic="http://schemas.openxmlformats.org/drawingml/2006/picture">
                   <pic:nvPicPr>
-                    <pic:cNvPr id="1863231422" name=""/>
+                    <pic:cNvPr id="1436314298" name=""/>
                     <pic:cNvPicPr/>
                   </pic:nvPicPr>
                   <pic:blipFill>
@@ -20048,16 +20104,16 @@
         </w:rPr>
         <w:lastRenderedPageBreak/>
         <w:drawing>
-          <wp:inline distT="0" distB="0" distL="0" distR="0" wp14:anchorId="5A08DE3D" wp14:editId="0DBCED14">
+          <wp:inline distT="0" distB="0" distL="0" distR="0" wp14:anchorId="4F1A7CEA" wp14:editId="00AE2F68">
             <wp:extent cx="5303520" cy="4792851"/>
             <wp:effectExtent l="19050" t="19050" r="11430" b="27305"/>
-            <wp:docPr id="389229741" name="Imagem 46"/>
+            <wp:docPr id="1594816281" name="Imagem 46"/>
             <wp:cNvGraphicFramePr/>
             <a:graphic xmlns:a="http://schemas.openxmlformats.org/drawingml/2006/main">
               <a:graphicData uri="http://schemas.openxmlformats.org/drawingml/2006/picture">
                 <pic:pic xmlns:pic="http://schemas.openxmlformats.org/drawingml/2006/picture">
                   <pic:nvPicPr>
-                    <pic:cNvPr id="389229741" name=""/>
+                    <pic:cNvPr id="1594816281" name=""/>
                     <pic:cNvPicPr/>
                   </pic:nvPicPr>
                   <pic:blipFill>
@@ -20150,7 +20206,7 @@
           <w:sz w:val="34"/>
         </w:rPr>
       </w:pPr>
-      <w:bookmarkStart w:id="40" w:name="_Toc240442848"/>
+      <w:bookmarkStart w:id="40" w:name="_Toc240463928"/>
       <w:r>
         <w:rPr>
           <w:rFonts w:ascii="Montserrat" w:hAnsi="Montserrat"/>
@@ -20192,7 +20248,7 @@
           <w:sz w:val="27"/>
         </w:rPr>
       </w:pPr>
-      <w:bookmarkStart w:id="41" w:name="_Toc240442849"/>
+      <w:bookmarkStart w:id="41" w:name="_Toc240463929"/>
       <w:r>
         <w:rPr>
           <w:rFonts w:ascii="Montserrat" w:hAnsi="Montserrat"/>
@@ -20232,16 +20288,16 @@
           <w:noProof/>
         </w:rPr>
         <w:drawing>
-          <wp:inline distT="0" distB="0" distL="0" distR="0" wp14:anchorId="0F7DF2AC" wp14:editId="6A655AC6">
+          <wp:inline distT="0" distB="0" distL="0" distR="0" wp14:anchorId="4AF4B4D2" wp14:editId="2752CABD">
             <wp:extent cx="5303520" cy="4792851"/>
             <wp:effectExtent l="19050" t="19050" r="11430" b="27305"/>
-            <wp:docPr id="74166531" name="Imagem 47"/>
+            <wp:docPr id="1588265773" name="Imagem 47"/>
             <wp:cNvGraphicFramePr/>
             <a:graphic xmlns:a="http://schemas.openxmlformats.org/drawingml/2006/main">
               <a:graphicData uri="http://schemas.openxmlformats.org/drawingml/2006/picture">
                 <pic:pic xmlns:pic="http://schemas.openxmlformats.org/drawingml/2006/picture">
                   <pic:nvPicPr>
-                    <pic:cNvPr id="74166531" name=""/>
+                    <pic:cNvPr id="1588265773" name=""/>
                     <pic:cNvPicPr/>
                   </pic:nvPicPr>
                   <pic:blipFill>
@@ -20496,7 +20552,7 @@
           <w:sz w:val="27"/>
         </w:rPr>
       </w:pPr>
-      <w:bookmarkStart w:id="42" w:name="_Toc240442850"/>
+      <w:bookmarkStart w:id="42" w:name="_Toc240463930"/>
       <w:r>
         <w:rPr>
           <w:rFonts w:ascii="Montserrat" w:hAnsi="Montserrat"/>
@@ -20537,16 +20593,16 @@
         </w:rPr>
         <w:lastRenderedPageBreak/>
         <w:drawing>
-          <wp:inline distT="0" distB="0" distL="0" distR="0" wp14:anchorId="2A98BD07" wp14:editId="4746519B">
+          <wp:inline distT="0" distB="0" distL="0" distR="0" wp14:anchorId="4051BE06" wp14:editId="04C2C4FD">
             <wp:extent cx="5303520" cy="4792851"/>
             <wp:effectExtent l="19050" t="19050" r="11430" b="27305"/>
-            <wp:docPr id="1912731028" name="Imagem 48"/>
+            <wp:docPr id="962474773" name="Imagem 48"/>
             <wp:cNvGraphicFramePr/>
             <a:graphic xmlns:a="http://schemas.openxmlformats.org/drawingml/2006/main">
               <a:graphicData uri="http://schemas.openxmlformats.org/drawingml/2006/picture">
                 <pic:pic xmlns:pic="http://schemas.openxmlformats.org/drawingml/2006/picture">
                   <pic:nvPicPr>
-                    <pic:cNvPr id="1912731028" name=""/>
+                    <pic:cNvPr id="962474773" name=""/>
                     <pic:cNvPicPr/>
                   </pic:nvPicPr>
                   <pic:blipFill>
@@ -20635,7 +20691,7 @@
           <w:sz w:val="27"/>
         </w:rPr>
       </w:pPr>
-      <w:bookmarkStart w:id="43" w:name="_Toc240442851"/>
+      <w:bookmarkStart w:id="43" w:name="_Toc240463931"/>
       <w:r>
         <w:rPr>
           <w:rFonts w:ascii="Montserrat" w:hAnsi="Montserrat"/>
@@ -20676,16 +20732,16 @@
         </w:rPr>
         <w:lastRenderedPageBreak/>
         <w:drawing>
-          <wp:inline distT="0" distB="0" distL="0" distR="0" wp14:anchorId="6C9F530C" wp14:editId="78A0600B">
+          <wp:inline distT="0" distB="0" distL="0" distR="0" wp14:anchorId="14B6F8C0" wp14:editId="590F4303">
             <wp:extent cx="5303520" cy="4792851"/>
             <wp:effectExtent l="19050" t="19050" r="11430" b="27305"/>
-            <wp:docPr id="1584954303" name="Imagem 49"/>
+            <wp:docPr id="1104783702" name="Imagem 49"/>
             <wp:cNvGraphicFramePr/>
             <a:graphic xmlns:a="http://schemas.openxmlformats.org/drawingml/2006/main">
               <a:graphicData uri="http://schemas.openxmlformats.org/drawingml/2006/picture">
                 <pic:pic xmlns:pic="http://schemas.openxmlformats.org/drawingml/2006/picture">
                   <pic:nvPicPr>
-                    <pic:cNvPr id="1584954303" name=""/>
+                    <pic:cNvPr id="1104783702" name=""/>
                     <pic:cNvPicPr/>
                   </pic:nvPicPr>
                   <pic:blipFill>
@@ -20829,7 +20885,7 @@
           <w:sz w:val="27"/>
         </w:rPr>
       </w:pPr>
-      <w:bookmarkStart w:id="44" w:name="_Toc240442852"/>
+      <w:bookmarkStart w:id="44" w:name="_Toc240463932"/>
       <w:r>
         <w:rPr>
           <w:rFonts w:ascii="Montserrat" w:hAnsi="Montserrat"/>
@@ -21094,16 +21150,16 @@
           <w:noProof/>
         </w:rPr>
         <w:drawing>
-          <wp:inline distT="0" distB="0" distL="0" distR="0" wp14:anchorId="19571DDC" wp14:editId="4B9C57F3">
+          <wp:inline distT="0" distB="0" distL="0" distR="0" wp14:anchorId="0E4B1E20" wp14:editId="2DB5D5DA">
             <wp:extent cx="5303520" cy="4267180"/>
             <wp:effectExtent l="19050" t="19050" r="11430" b="19685"/>
-            <wp:docPr id="1377404577" name="Imagem 50"/>
+            <wp:docPr id="163392596" name="Imagem 50"/>
             <wp:cNvGraphicFramePr/>
             <a:graphic xmlns:a="http://schemas.openxmlformats.org/drawingml/2006/main">
               <a:graphicData uri="http://schemas.openxmlformats.org/drawingml/2006/picture">
                 <pic:pic xmlns:pic="http://schemas.openxmlformats.org/drawingml/2006/picture">
                   <pic:nvPicPr>
-                    <pic:cNvPr id="1377404577" name=""/>
+                    <pic:cNvPr id="163392596" name=""/>
                     <pic:cNvPicPr/>
                   </pic:nvPicPr>
                   <pic:blipFill>
@@ -21171,16 +21227,16 @@
           <w:noProof/>
         </w:rPr>
         <w:drawing>
-          <wp:inline distT="0" distB="0" distL="0" distR="0" wp14:anchorId="0378EBBE" wp14:editId="535D47A9">
+          <wp:inline distT="0" distB="0" distL="0" distR="0" wp14:anchorId="5256E9E8" wp14:editId="632F2279">
             <wp:extent cx="5303520" cy="3382059"/>
             <wp:effectExtent l="19050" t="19050" r="11430" b="27940"/>
-            <wp:docPr id="747766240" name="Imagem 51"/>
+            <wp:docPr id="705708536" name="Imagem 51"/>
             <wp:cNvGraphicFramePr/>
             <a:graphic xmlns:a="http://schemas.openxmlformats.org/drawingml/2006/main">
               <a:graphicData uri="http://schemas.openxmlformats.org/drawingml/2006/picture">
                 <pic:pic xmlns:pic="http://schemas.openxmlformats.org/drawingml/2006/picture">
                   <pic:nvPicPr>
-                    <pic:cNvPr id="747766240" name=""/>
+                    <pic:cNvPr id="705708536" name=""/>
                     <pic:cNvPicPr/>
                   </pic:nvPicPr>
                   <pic:blipFill>
@@ -21248,16 +21304,16 @@
         </w:rPr>
         <w:lastRenderedPageBreak/>
         <w:drawing>
-          <wp:inline distT="0" distB="0" distL="0" distR="0" wp14:anchorId="2A610DE4" wp14:editId="5144774E">
+          <wp:inline distT="0" distB="0" distL="0" distR="0" wp14:anchorId="79D209EA" wp14:editId="0E5B38AA">
             <wp:extent cx="5303520" cy="4417800"/>
             <wp:effectExtent l="19050" t="19050" r="11430" b="20955"/>
-            <wp:docPr id="1857175213" name="Imagem 52"/>
+            <wp:docPr id="552973026" name="Imagem 52"/>
             <wp:cNvGraphicFramePr/>
             <a:graphic xmlns:a="http://schemas.openxmlformats.org/drawingml/2006/main">
               <a:graphicData uri="http://schemas.openxmlformats.org/drawingml/2006/picture">
                 <pic:pic xmlns:pic="http://schemas.openxmlformats.org/drawingml/2006/picture">
                   <pic:nvPicPr>
-                    <pic:cNvPr id="1857175213" name=""/>
+                    <pic:cNvPr id="552973026" name=""/>
                     <pic:cNvPicPr/>
                   </pic:nvPicPr>
                   <pic:blipFill>
@@ -21367,7 +21423,7 @@
           <w:sz w:val="27"/>
         </w:rPr>
       </w:pPr>
-      <w:bookmarkStart w:id="45" w:name="_Toc240442853"/>
+      <w:bookmarkStart w:id="45" w:name="_Toc240463933"/>
       <w:r>
         <w:rPr>
           <w:rFonts w:ascii="Montserrat" w:hAnsi="Montserrat"/>
@@ -21633,16 +21689,16 @@
         </w:rPr>
         <w:lastRenderedPageBreak/>
         <w:drawing>
-          <wp:inline distT="0" distB="0" distL="0" distR="0" wp14:anchorId="0D54F1E4" wp14:editId="3DAF8A3B">
+          <wp:inline distT="0" distB="0" distL="0" distR="0" wp14:anchorId="2F8DEC13" wp14:editId="5EE70FD0">
             <wp:extent cx="5303520" cy="7628836"/>
             <wp:effectExtent l="19050" t="19050" r="11430" b="10795"/>
-            <wp:docPr id="104613115" name="Imagem 53"/>
+            <wp:docPr id="958319035" name="Imagem 53"/>
             <wp:cNvGraphicFramePr/>
             <a:graphic xmlns:a="http://schemas.openxmlformats.org/drawingml/2006/main">
               <a:graphicData uri="http://schemas.openxmlformats.org/drawingml/2006/picture">
                 <pic:pic xmlns:pic="http://schemas.openxmlformats.org/drawingml/2006/picture">
                   <pic:nvPicPr>
-                    <pic:cNvPr id="104613115" name=""/>
+                    <pic:cNvPr id="958319035" name=""/>
                     <pic:cNvPicPr/>
                   </pic:nvPicPr>
                   <pic:blipFill>
@@ -21774,7 +21830,7 @@
           <w:sz w:val="27"/>
         </w:rPr>
       </w:pPr>
-      <w:bookmarkStart w:id="46" w:name="_Toc240442854"/>
+      <w:bookmarkStart w:id="46" w:name="_Toc240463934"/>
       <w:r>
         <w:rPr>
           <w:rFonts w:ascii="Montserrat" w:hAnsi="Montserrat"/>
@@ -21885,7 +21941,7 @@
           <w:sz w:val="27"/>
         </w:rPr>
       </w:pPr>
-      <w:bookmarkStart w:id="47" w:name="_Toc240442855"/>
+      <w:bookmarkStart w:id="47" w:name="_Toc240463935"/>
       <w:r>
         <w:rPr>
           <w:rFonts w:ascii="Montserrat" w:hAnsi="Montserrat"/>
@@ -22026,7 +22082,7 @@
           <w:color w:val="1A1A1A"/>
           <w:sz w:val="22"/>
         </w:rPr>
-        <w:t>Quem recebe cada aviso: a conta vinculada no novo campo Responsavel (conta) do cronograma (Passo 4, aba 3), quando preenchido, mais toda conta com papel Gerente de Projetos que estiver na equipe daquele projeto (secao 2.5) - nao o campo de texto livre Gerente do cadastro do projeto. Se nenhum dos dois existir para aquele marco, ninguem recebe o aviso automatico, mas o indicador visual no Painel de Prazos continua aparecendo normalmente.</w:t>
+        <w:t>Quem recebe cada aviso: toda conta vinculada no campo Responsavel (conta) do cronograma (Passo 4, aba 3), quando preenchido - pode ser uma ou mais de uma pessoa -, mais toda conta com papel Gerente de Projetos que estiver na equipe daquele projeto (secao 2.5) - nao o campo de texto livre Gerente do cadastro do projeto. Se nenhuma conta existir para aquele marco (nem Responsavel (conta), nem Gerente de Projetos na equipe), ninguem recebe o aviso automatico, mas o indicador visual no Painel de Prazos continua aparecendo normalmente.</w:t>
       </w:r>
     </w:p>
     <w:p>
@@ -22047,7 +22103,28 @@
           <w:color w:val="6A6A70"/>
           <w:sz w:val="21"/>
         </w:rPr>
-        <w:t>O campo Responsavel (conta) e nao a pessoa preenche o texto livre Responsavel ja existente: e um segundo campo, um seletor com as contas que fazem parte da equipe do projeto selecionado. O texto livre Responsavel continua existindo do lado, sem nenhuma mudanca - o campo novo serve so para o sistema saber para qual conta mandar o aviso automatico.</w:t>
+        <w:t xml:space="preserve">O campo Responsavel (conta) e nao a pessoa preenche o texto livre Responsavel ja existente: e um segundo campo, um botao que abre um painel com uma caixa de selecao por conta da equipe do projeto selecionado, podendo marcar mais de uma pessoa para o mesmo marco. A lista mostra o nome cadastrado de cada conta (caindo para o e-mail quando nao houver nome), e o botao resume a escolha (nome, ou </w:t>
+      </w:r>
+    </w:p>
+    <w:p>
+      <w:pPr>
+        <w:spacing w:before="160" w:after="200"/>
+        <w:ind w:left="283"/>
+        <w:rPr>
+          <w:rFonts w:ascii="Montserrat" w:hAnsi="Montserrat"/>
+          <w:i/>
+          <w:color w:val="6A6A70"/>
+          <w:sz w:val="21"/>
+        </w:rPr>
+      </w:pPr>
+      <w:r>
+        <w:rPr>
+          <w:rFonts w:ascii="Montserrat" w:hAnsi="Montserrat"/>
+          <w:i/>
+          <w:color w:val="6A6A70"/>
+          <w:sz w:val="21"/>
+        </w:rPr>
+        <w:t>ome +N com mais de uma pessoa marcada). O texto livre Responsavel continua existindo do lado, sem nenhuma mudanca - o campo novo serve so para o sistema saber para quais contas mandar o aviso automatico.</w:t>
       </w:r>
     </w:p>
     <w:p>
@@ -22092,7 +22169,16 @@
           <w:color w:val="1A1A1A"/>
           <w:sz w:val="22"/>
         </w:rPr>
-        <w:t>O e-mail termina indicando a Gerencia de Projetos como alternativa de contato, caso a pessoa prefira ajustar o prazo diretamente em vez de seguir so pelo aviso automatico - o nome do Gerente vem do campo Gerente do projeto do proprio Planejamento (aba 1, capa), nao e fixo; se esse campo estiver vazio no projeto, a frase aparece sem nome.</w:t>
+        <w:t xml:space="preserve">O e-mail termina indicando a Gerencia de Projetos como alternativa de contato, caso a pessoa prefira ajustar o prazo diretamente em vez de seguir so pelo aviso automatico - o nome do Gerente vem do campo </w:t>
+      </w:r>
+      <w:r>
+        <w:rPr>
+          <w:rFonts w:ascii="Montserrat" w:hAnsi="Montserrat"/>
+          <w:color w:val="1A1A1A"/>
+          <w:sz w:val="22"/>
+        </w:rPr>
+        <w:lastRenderedPageBreak/>
+        <w:t>Gerente do projeto do proprio Planejamento (aba 1, capa), nao e fixo; se esse campo estiver vazio no projeto, a frase aparece sem nome.</w:t>
       </w:r>
     </w:p>
     <w:p>
@@ -22106,7 +22192,7 @@
           <w:sz w:val="27"/>
         </w:rPr>
       </w:pPr>
-      <w:bookmarkStart w:id="48" w:name="_Toc240442856"/>
+      <w:bookmarkStart w:id="48" w:name="_Toc240463936"/>
       <w:r>
         <w:rPr>
           <w:rFonts w:ascii="Montserrat" w:hAnsi="Montserrat"/>
@@ -22133,16 +22219,7 @@
           <w:color w:val="1A1A1A"/>
           <w:sz w:val="22"/>
         </w:rPr>
-        <w:t xml:space="preserve">Visao pessoal, sem restricao de papel - qualquer usuario autenticado abre esta pagina e ve, reunido numa unica tela, tudo que esta atribuido a sua propria </w:t>
-      </w:r>
-      <w:r>
-        <w:rPr>
-          <w:rFonts w:ascii="Montserrat" w:hAnsi="Montserrat"/>
-          <w:color w:val="1A1A1A"/>
-          <w:sz w:val="22"/>
-        </w:rPr>
-        <w:lastRenderedPageBreak/>
-        <w:t>conta em qualquer projeto, com um botao para concluir cada item direto da lista, sem precisar abrir o formulario de origem.</w:t>
+        <w:t>Visao pessoal, sem restricao de papel - qualquer usuario autenticado abre esta pagina e ve, reunido numa unica tela, tudo que esta atribuido a sua propria conta em qualquer projeto, com um botao para concluir cada item direto da lista, sem precisar abrir o formulario de origem.</w:t>
       </w:r>
     </w:p>
     <w:tbl>
@@ -22733,16 +22810,16 @@
         </w:rPr>
         <w:lastRenderedPageBreak/>
         <w:drawing>
-          <wp:inline distT="0" distB="0" distL="0" distR="0" wp14:anchorId="2A07A6FB" wp14:editId="37E41EDA">
+          <wp:inline distT="0" distB="0" distL="0" distR="0" wp14:anchorId="4E77F9E5" wp14:editId="3FDC0DB9">
             <wp:extent cx="5120640" cy="6240599"/>
             <wp:effectExtent l="19050" t="19050" r="22860" b="27305"/>
-            <wp:docPr id="1235673178" name="Imagem 54"/>
+            <wp:docPr id="505503183" name="Imagem 54"/>
             <wp:cNvGraphicFramePr/>
             <a:graphic xmlns:a="http://schemas.openxmlformats.org/drawingml/2006/main">
               <a:graphicData uri="http://schemas.openxmlformats.org/drawingml/2006/picture">
                 <pic:pic xmlns:pic="http://schemas.openxmlformats.org/drawingml/2006/picture">
                   <pic:nvPicPr>
-                    <pic:cNvPr id="1235673178" name=""/>
+                    <pic:cNvPr id="505503183" name=""/>
                     <pic:cNvPicPr/>
                   </pic:nvPicPr>
                   <pic:blipFill>
@@ -22817,7 +22894,7 @@
           <w:color w:val="6A6A70"/>
           <w:sz w:val="21"/>
         </w:rPr>
-        <w:t>A aba Verificacao do Planejamento (aba 6) nao entra no Meu Painel nem tem campo Responsavel (conta) - ficou de fora deliberadamente.</w:t>
+        <w:t>Responsavel (conta) aceita mais de uma pessoa: nas quatro linhas de Marcos/Tarefas, Riscos, Entradas e Entraves/encaminhamentos acima, o campo Responsavel (conta) pode ter uma ou varias contas marcadas ao mesmo tempo - o item aparece no Meu Painel de cada pessoa marcada, nao so de uma, e concluir pelo botao de qualquer uma delas resolve o item para todas.</w:t>
       </w:r>
     </w:p>
     <w:p>
@@ -22838,17 +22915,29 @@
           <w:color w:val="6A6A70"/>
           <w:sz w:val="21"/>
         </w:rPr>
-        <w:t xml:space="preserve">Concluir um item aqui grava direto no mesmo registro compartilhado do formulario de origem (Planejamento, TAP ou Relatorio de Situacao) - nao e uma copia separada. Se duas pessoas mexerem no mesmo registro ao mesmo tempo (por exemplo, uma concluindo um item pelo Meu Painel enquanto outra </w:t>
-      </w:r>
-      <w:r>
+        <w:lastRenderedPageBreak/>
+        <w:t>A aba Verificacao do Planejamento (aba 6) nao entra no Meu Painel nem tem campo Responsavel (conta) - ficou de fora deliberadamente.</w:t>
+      </w:r>
+    </w:p>
+    <w:p>
+      <w:pPr>
+        <w:spacing w:before="160" w:after="200"/>
+        <w:ind w:left="283"/>
         <w:rPr>
           <w:rFonts w:ascii="Montserrat" w:hAnsi="Montserrat"/>
           <w:i/>
           <w:color w:val="6A6A70"/>
           <w:sz w:val="21"/>
         </w:rPr>
-        <w:lastRenderedPageBreak/>
-        <w:t>edita o formulario de origem), o sistema busca a versao mais recente do registro e tenta gravar de novo automaticamente antes de desistir - mesma logica de edicao simultanea ja usada nos demais formularios (secao 2.14).</w:t>
+      </w:pPr>
+      <w:r>
+        <w:rPr>
+          <w:rFonts w:ascii="Montserrat" w:hAnsi="Montserrat"/>
+          <w:i/>
+          <w:color w:val="6A6A70"/>
+          <w:sz w:val="21"/>
+        </w:rPr>
+        <w:t>Concluir um item aqui grava direto no mesmo registro compartilhado do formulario de origem (Planejamento, TAP ou Relatorio de Situacao) - nao e uma copia separada. Se duas pessoas mexerem no mesmo registro ao mesmo tempo (por exemplo, uma concluindo um item pelo Meu Painel enquanto outra edita o formulario de origem), o sistema busca a versao mais recente do registro e tenta gravar de novo automaticamente antes de desistir - mesma logica de edicao simultanea ja usada nos demais formularios (secao 2.14).</w:t>
       </w:r>
     </w:p>
     <w:p>
@@ -22880,7 +22969,7 @@
           <w:sz w:val="27"/>
         </w:rPr>
       </w:pPr>
-      <w:bookmarkStart w:id="49" w:name="_Toc240442857"/>
+      <w:bookmarkStart w:id="49" w:name="_Toc240463937"/>
       <w:r>
         <w:rPr>
           <w:rFonts w:ascii="Montserrat" w:hAnsi="Montserrat"/>
@@ -22993,16 +23082,16 @@
         </w:rPr>
         <w:lastRenderedPageBreak/>
         <w:drawing>
-          <wp:inline distT="0" distB="0" distL="0" distR="0" wp14:anchorId="37A3E60F" wp14:editId="1EACEF30">
+          <wp:inline distT="0" distB="0" distL="0" distR="0" wp14:anchorId="4CAFEBAC" wp14:editId="6FC96DC8">
             <wp:extent cx="5120640" cy="6187296"/>
             <wp:effectExtent l="19050" t="19050" r="22860" b="23495"/>
-            <wp:docPr id="1379122612" name="Imagem 55"/>
+            <wp:docPr id="2028751379" name="Imagem 55"/>
             <wp:cNvGraphicFramePr/>
             <a:graphic xmlns:a="http://schemas.openxmlformats.org/drawingml/2006/main">
               <a:graphicData uri="http://schemas.openxmlformats.org/drawingml/2006/picture">
                 <pic:pic xmlns:pic="http://schemas.openxmlformats.org/drawingml/2006/picture">
                   <pic:nvPicPr>
-                    <pic:cNvPr id="1379122612" name=""/>
+                    <pic:cNvPr id="2028751379" name=""/>
                     <pic:cNvPicPr/>
                   </pic:nvPicPr>
                   <pic:blipFill>
@@ -23091,7 +23180,7 @@
           <w:sz w:val="27"/>
         </w:rPr>
       </w:pPr>
-      <w:bookmarkStart w:id="50" w:name="_Toc240442858"/>
+      <w:bookmarkStart w:id="50" w:name="_Toc240463938"/>
       <w:r>
         <w:rPr>
           <w:rFonts w:ascii="Montserrat" w:hAnsi="Montserrat"/>
@@ -23244,7 +23333,7 @@
           <w:sz w:val="27"/>
         </w:rPr>
       </w:pPr>
-      <w:bookmarkStart w:id="51" w:name="_Toc240442859"/>
+      <w:bookmarkStart w:id="51" w:name="_Toc240463939"/>
       <w:r>
         <w:rPr>
           <w:rFonts w:ascii="Montserrat" w:hAnsi="Montserrat"/>
@@ -23537,16 +23626,16 @@
           <w:noProof/>
         </w:rPr>
         <w:drawing>
-          <wp:inline distT="0" distB="0" distL="0" distR="0" wp14:anchorId="66F6DD3D" wp14:editId="014ADF01">
+          <wp:inline distT="0" distB="0" distL="0" distR="0" wp14:anchorId="0D5045F0" wp14:editId="0CBD3A4A">
             <wp:extent cx="5303520" cy="1351384"/>
             <wp:effectExtent l="19050" t="19050" r="11430" b="20320"/>
-            <wp:docPr id="398032274" name="Imagem 56"/>
+            <wp:docPr id="789505750" name="Imagem 56"/>
             <wp:cNvGraphicFramePr/>
             <a:graphic xmlns:a="http://schemas.openxmlformats.org/drawingml/2006/main">
               <a:graphicData uri="http://schemas.openxmlformats.org/drawingml/2006/picture">
                 <pic:pic xmlns:pic="http://schemas.openxmlformats.org/drawingml/2006/picture">
                   <pic:nvPicPr>
-                    <pic:cNvPr id="398032274" name=""/>
+                    <pic:cNvPr id="789505750" name=""/>
                     <pic:cNvPicPr/>
                   </pic:nvPicPr>
                   <pic:blipFill>
@@ -23614,7 +23703,7 @@
           <w:sz w:val="27"/>
         </w:rPr>
       </w:pPr>
-      <w:bookmarkStart w:id="52" w:name="_Toc240442860"/>
+      <w:bookmarkStart w:id="52" w:name="_Toc240463940"/>
       <w:r>
         <w:rPr>
           <w:rFonts w:ascii="Montserrat" w:hAnsi="Montserrat"/>
@@ -23751,16 +23840,16 @@
           <w:noProof/>
         </w:rPr>
         <w:drawing>
-          <wp:inline distT="0" distB="0" distL="0" distR="0" wp14:anchorId="204EE3AE" wp14:editId="76A18E12">
+          <wp:inline distT="0" distB="0" distL="0" distR="0" wp14:anchorId="76E4D626" wp14:editId="4487E693">
             <wp:extent cx="5303520" cy="1422793"/>
             <wp:effectExtent l="19050" t="19050" r="11430" b="25400"/>
-            <wp:docPr id="913357673" name="Imagem 57"/>
+            <wp:docPr id="1931821066" name="Imagem 57"/>
             <wp:cNvGraphicFramePr/>
             <a:graphic xmlns:a="http://schemas.openxmlformats.org/drawingml/2006/main">
               <a:graphicData uri="http://schemas.openxmlformats.org/drawingml/2006/picture">
                 <pic:pic xmlns:pic="http://schemas.openxmlformats.org/drawingml/2006/picture">
                   <pic:nvPicPr>
-                    <pic:cNvPr id="913357673" name=""/>
+                    <pic:cNvPr id="1931821066" name=""/>
                     <pic:cNvPicPr/>
                   </pic:nvPicPr>
                   <pic:blipFill>
@@ -23924,16 +24013,16 @@
           <w:noProof/>
         </w:rPr>
         <w:drawing>
-          <wp:inline distT="0" distB="0" distL="0" distR="0" wp14:anchorId="652981E6" wp14:editId="119822D7">
+          <wp:inline distT="0" distB="0" distL="0" distR="0" wp14:anchorId="1DADD424" wp14:editId="31B400B3">
             <wp:extent cx="5303520" cy="1841050"/>
             <wp:effectExtent l="19050" t="19050" r="11430" b="26035"/>
-            <wp:docPr id="201554790" name="Imagem 58"/>
+            <wp:docPr id="1837310868" name="Imagem 58"/>
             <wp:cNvGraphicFramePr/>
             <a:graphic xmlns:a="http://schemas.openxmlformats.org/drawingml/2006/main">
               <a:graphicData uri="http://schemas.openxmlformats.org/drawingml/2006/picture">
                 <pic:pic xmlns:pic="http://schemas.openxmlformats.org/drawingml/2006/picture">
                   <pic:nvPicPr>
-                    <pic:cNvPr id="201554790" name=""/>
+                    <pic:cNvPr id="1837310868" name=""/>
                     <pic:cNvPicPr/>
                   </pic:nvPicPr>
                   <pic:blipFill>
@@ -24096,16 +24185,16 @@
           <w:noProof/>
         </w:rPr>
         <w:drawing>
-          <wp:inline distT="0" distB="0" distL="0" distR="0" wp14:anchorId="4191CA98" wp14:editId="0A2F3E95">
+          <wp:inline distT="0" distB="0" distL="0" distR="0" wp14:anchorId="13F057EB" wp14:editId="3688432E">
             <wp:extent cx="5303520" cy="303041"/>
             <wp:effectExtent l="19050" t="19050" r="11430" b="20955"/>
-            <wp:docPr id="1229580629" name="Imagem 59"/>
+            <wp:docPr id="1562015630" name="Imagem 59"/>
             <wp:cNvGraphicFramePr/>
             <a:graphic xmlns:a="http://schemas.openxmlformats.org/drawingml/2006/main">
               <a:graphicData uri="http://schemas.openxmlformats.org/drawingml/2006/picture">
                 <pic:pic xmlns:pic="http://schemas.openxmlformats.org/drawingml/2006/picture">
                   <pic:nvPicPr>
-                    <pic:cNvPr id="1229580629" name=""/>
+                    <pic:cNvPr id="1562015630" name=""/>
                     <pic:cNvPicPr/>
                   </pic:nvPicPr>
                   <pic:blipFill>
@@ -24172,16 +24261,16 @@
           <w:noProof/>
         </w:rPr>
         <w:drawing>
-          <wp:inline distT="0" distB="0" distL="0" distR="0" wp14:anchorId="339A26E6" wp14:editId="5CEE7660">
+          <wp:inline distT="0" distB="0" distL="0" distR="0" wp14:anchorId="59CB26B1" wp14:editId="5BBD7268">
             <wp:extent cx="5303520" cy="2983005"/>
             <wp:effectExtent l="19050" t="19050" r="11430" b="27305"/>
-            <wp:docPr id="566154670" name="Imagem 60"/>
+            <wp:docPr id="1302134349" name="Imagem 60"/>
             <wp:cNvGraphicFramePr/>
             <a:graphic xmlns:a="http://schemas.openxmlformats.org/drawingml/2006/main">
               <a:graphicData uri="http://schemas.openxmlformats.org/drawingml/2006/picture">
                 <pic:pic xmlns:pic="http://schemas.openxmlformats.org/drawingml/2006/picture">
                   <pic:nvPicPr>
-                    <pic:cNvPr id="566154670" name=""/>
+                    <pic:cNvPr id="1302134349" name=""/>
                     <pic:cNvPicPr/>
                   </pic:nvPicPr>
                   <pic:blipFill>
@@ -24253,7 +24342,7 @@
           <w:sz w:val="34"/>
         </w:rPr>
       </w:pPr>
-      <w:bookmarkStart w:id="53" w:name="_Toc240442861"/>
+      <w:bookmarkStart w:id="53" w:name="_Toc240463941"/>
       <w:r>
         <w:rPr>
           <w:rFonts w:ascii="Montserrat" w:hAnsi="Montserrat"/>
@@ -24497,7 +24586,7 @@
           <w:sz w:val="34"/>
         </w:rPr>
       </w:pPr>
-      <w:bookmarkStart w:id="54" w:name="_Toc240442862"/>
+      <w:bookmarkStart w:id="54" w:name="_Toc240463942"/>
       <w:r>
         <w:rPr>
           <w:rFonts w:ascii="Montserrat" w:hAnsi="Montserrat"/>
@@ -26285,7 +26374,7 @@
 <file path=word/numbering.xml><?xml version="1.0" encoding="utf-8"?>
 <w:numbering xmlns:wpc="http://schemas.microsoft.com/office/word/2010/wordprocessingCanvas" xmlns:cx="http://schemas.microsoft.com/office/drawing/2014/chartex" xmlns:cx1="http://schemas.microsoft.com/office/drawing/2015/9/8/chartex" xmlns:cx2="http://schemas.microsoft.com/office/drawing/2015/10/21/chartex" xmlns:cx3="http://schemas.microsoft.com/office/drawing/2016/5/9/chartex" xmlns:cx4="http://schemas.microsoft.com/office/drawing/2016/5/10/chartex" xmlns:cx5="http://schemas.microsoft.com/office/drawing/2016/5/11/chartex" xmlns:cx6="http://schemas.microsoft.com/office/drawing/2016/5/12/chartex" xmlns:cx7="http://schemas.microsoft.com/office/drawing/2016/5/13/chartex" xmlns:cx8="http://schemas.microsoft.com/office/drawing/2016/5/14/chartex" xmlns:mc="http://schemas.openxmlformats.org/markup-compatibility/2006" xmlns:aink="http://schemas.microsoft.com/office/drawing/2016/ink" xmlns:am3d="http://schemas.microsoft.com/office/drawing/2017/model3d" xmlns:o="urn:schemas-microsoft-com:office:office" xmlns:oel="http://schemas.microsoft.com/office/2019/extlst" xmlns:r="http://schemas.openxmlformats.org/officeDocument/2006/relationships" xmlns:m="http://schemas.openxmlformats.org/officeDocument/2006/math" xmlns:v="urn:schemas-microsoft-com:vml" xmlns:wp14="http://schemas.microsoft.com/office/word/2010/wordprocessingDrawing" xmlns:wp="http://schemas.openxmlformats.org/drawingml/2006/wordprocessingDrawing" xmlns:w10="urn:schemas-microsoft-com:office:word" xmlns:w="http://schemas.openxmlformats.org/wordprocessingml/2006/main" xmlns:w14="http://schemas.microsoft.com/office/word/2010/wordml" xmlns:w15="http://schemas.microsoft.com/office/word/2012/wordml" xmlns:w16cex="http://schemas.microsoft.com/office/word/2018/wordml/cex" xmlns:w16cid="http://schemas.microsoft.com/office/word/2016/wordml/cid" xmlns:w16="http://schemas.microsoft.com/office/word/2018/wordml" xmlns:w16du="http://schemas.microsoft.com/office/word/2023/wordml/word16du" xmlns:w16sdtdh="http://schemas.microsoft.com/office/word/2020/wordml/sdtdatahash" xmlns:w16sdtfl="http://schemas.microsoft.com/office/word/2024/wordml/sdtformatlock" xmlns:w16se="http://schemas.microsoft.com/office/word/2015/wordml/symex" xmlns:wpg="http://schemas.microsoft.com/office/word/2010/wordprocessingGroup" xmlns:wpi="http://schemas.microsoft.com/office/word/2010/wordprocessingInk" xmlns:wne="http://schemas.microsoft.com/office/word/2006/wordml" xmlns:wps="http://schemas.microsoft.com/office/word/2010/wordprocessingShape" mc:Ignorable="w14 w15 w16se w16cid w16 w16cex w16sdtdh w16sdtfl w16du wp14">
   <w:abstractNum w:abstractNumId="0" w15:restartNumberingAfterBreak="0">
-    <w:nsid w:val="027F75E2"/>
+    <w:nsid w:val="00C52AC6"/>
     <w:multiLevelType w:val="singleLevel"/>
     <w:tmpl w:val="04160001"/>
     <w:lvl w:ilvl="0">
@@ -26302,7 +26391,7 @@
     </w:lvl>
   </w:abstractNum>
   <w:abstractNum w:abstractNumId="1" w15:restartNumberingAfterBreak="0">
-    <w:nsid w:val="046F4AA0"/>
+    <w:nsid w:val="01D8582D"/>
     <w:multiLevelType w:val="singleLevel"/>
     <w:tmpl w:val="04160001"/>
     <w:lvl w:ilvl="0">
@@ -26319,7 +26408,7 @@
     </w:lvl>
   </w:abstractNum>
   <w:abstractNum w:abstractNumId="2" w15:restartNumberingAfterBreak="0">
-    <w:nsid w:val="04932AB7"/>
+    <w:nsid w:val="03D47C17"/>
     <w:multiLevelType w:val="singleLevel"/>
     <w:tmpl w:val="04160001"/>
     <w:lvl w:ilvl="0">
@@ -26336,7 +26425,7 @@
     </w:lvl>
   </w:abstractNum>
   <w:abstractNum w:abstractNumId="3" w15:restartNumberingAfterBreak="0">
-    <w:nsid w:val="052D4B47"/>
+    <w:nsid w:val="06CA1A92"/>
     <w:multiLevelType w:val="singleLevel"/>
     <w:tmpl w:val="04160001"/>
     <w:lvl w:ilvl="0">
@@ -26353,7 +26442,7 @@
     </w:lvl>
   </w:abstractNum>
   <w:abstractNum w:abstractNumId="4" w15:restartNumberingAfterBreak="0">
-    <w:nsid w:val="065A4B5B"/>
+    <w:nsid w:val="0F9A3742"/>
     <w:multiLevelType w:val="singleLevel"/>
     <w:tmpl w:val="04160001"/>
     <w:lvl w:ilvl="0">
@@ -26370,7 +26459,7 @@
     </w:lvl>
   </w:abstractNum>
   <w:abstractNum w:abstractNumId="5" w15:restartNumberingAfterBreak="0">
-    <w:nsid w:val="0F80615E"/>
+    <w:nsid w:val="18B918E0"/>
     <w:multiLevelType w:val="singleLevel"/>
     <w:tmpl w:val="04160001"/>
     <w:lvl w:ilvl="0">
@@ -26387,7 +26476,7 @@
     </w:lvl>
   </w:abstractNum>
   <w:abstractNum w:abstractNumId="6" w15:restartNumberingAfterBreak="0">
-    <w:nsid w:val="15434F63"/>
+    <w:nsid w:val="19452D61"/>
     <w:multiLevelType w:val="singleLevel"/>
     <w:tmpl w:val="04160001"/>
     <w:lvl w:ilvl="0">
@@ -26404,7 +26493,7 @@
     </w:lvl>
   </w:abstractNum>
   <w:abstractNum w:abstractNumId="7" w15:restartNumberingAfterBreak="0">
-    <w:nsid w:val="15673A65"/>
+    <w:nsid w:val="1CE82FDB"/>
     <w:multiLevelType w:val="singleLevel"/>
     <w:tmpl w:val="04160001"/>
     <w:lvl w:ilvl="0">
@@ -26421,7 +26510,7 @@
     </w:lvl>
   </w:abstractNum>
   <w:abstractNum w:abstractNumId="8" w15:restartNumberingAfterBreak="0">
-    <w:nsid w:val="15896310"/>
+    <w:nsid w:val="1D1B3E93"/>
     <w:multiLevelType w:val="singleLevel"/>
     <w:tmpl w:val="04160001"/>
     <w:lvl w:ilvl="0">
@@ -26438,7 +26527,7 @@
     </w:lvl>
   </w:abstractNum>
   <w:abstractNum w:abstractNumId="9" w15:restartNumberingAfterBreak="0">
-    <w:nsid w:val="194D5066"/>
+    <w:nsid w:val="234951BC"/>
     <w:multiLevelType w:val="singleLevel"/>
     <w:tmpl w:val="04160001"/>
     <w:lvl w:ilvl="0">
@@ -26455,7 +26544,7 @@
     </w:lvl>
   </w:abstractNum>
   <w:abstractNum w:abstractNumId="10" w15:restartNumberingAfterBreak="0">
-    <w:nsid w:val="19B746C0"/>
+    <w:nsid w:val="27DB4678"/>
     <w:multiLevelType w:val="singleLevel"/>
     <w:tmpl w:val="04160001"/>
     <w:lvl w:ilvl="0">
@@ -26472,7 +26561,7 @@
     </w:lvl>
   </w:abstractNum>
   <w:abstractNum w:abstractNumId="11" w15:restartNumberingAfterBreak="0">
-    <w:nsid w:val="19CB3EB1"/>
+    <w:nsid w:val="284E71BD"/>
     <w:multiLevelType w:val="singleLevel"/>
     <w:tmpl w:val="04160001"/>
     <w:lvl w:ilvl="0">
@@ -26489,7 +26578,7 @@
     </w:lvl>
   </w:abstractNum>
   <w:abstractNum w:abstractNumId="12" w15:restartNumberingAfterBreak="0">
-    <w:nsid w:val="1CC315E4"/>
+    <w:nsid w:val="28C54449"/>
     <w:multiLevelType w:val="singleLevel"/>
     <w:tmpl w:val="04160001"/>
     <w:lvl w:ilvl="0">
@@ -26506,7 +26595,7 @@
     </w:lvl>
   </w:abstractNum>
   <w:abstractNum w:abstractNumId="13" w15:restartNumberingAfterBreak="0">
-    <w:nsid w:val="1DF74471"/>
+    <w:nsid w:val="29030331"/>
     <w:multiLevelType w:val="singleLevel"/>
     <w:tmpl w:val="04160001"/>
     <w:lvl w:ilvl="0">
@@ -26523,7 +26612,7 @@
     </w:lvl>
   </w:abstractNum>
   <w:abstractNum w:abstractNumId="14" w15:restartNumberingAfterBreak="0">
-    <w:nsid w:val="271F0823"/>
+    <w:nsid w:val="2F9D6706"/>
     <w:multiLevelType w:val="singleLevel"/>
     <w:tmpl w:val="04160001"/>
     <w:lvl w:ilvl="0">
@@ -26540,7 +26629,7 @@
     </w:lvl>
   </w:abstractNum>
   <w:abstractNum w:abstractNumId="15" w15:restartNumberingAfterBreak="0">
-    <w:nsid w:val="2ABC302F"/>
+    <w:nsid w:val="33016F3D"/>
     <w:multiLevelType w:val="singleLevel"/>
     <w:tmpl w:val="04160001"/>
     <w:lvl w:ilvl="0">
@@ -26557,7 +26646,7 @@
     </w:lvl>
   </w:abstractNum>
   <w:abstractNum w:abstractNumId="16" w15:restartNumberingAfterBreak="0">
-    <w:nsid w:val="35D56276"/>
+    <w:nsid w:val="383172AA"/>
     <w:multiLevelType w:val="singleLevel"/>
     <w:tmpl w:val="04160001"/>
     <w:lvl w:ilvl="0">
@@ -26574,7 +26663,7 @@
     </w:lvl>
   </w:abstractNum>
   <w:abstractNum w:abstractNumId="17" w15:restartNumberingAfterBreak="0">
-    <w:nsid w:val="395526B7"/>
+    <w:nsid w:val="39BF031D"/>
     <w:multiLevelType w:val="singleLevel"/>
     <w:tmpl w:val="04160001"/>
     <w:lvl w:ilvl="0">
@@ -26591,7 +26680,7 @@
     </w:lvl>
   </w:abstractNum>
   <w:abstractNum w:abstractNumId="18" w15:restartNumberingAfterBreak="0">
-    <w:nsid w:val="3C4D0EF7"/>
+    <w:nsid w:val="3AC966A6"/>
     <w:multiLevelType w:val="singleLevel"/>
     <w:tmpl w:val="04160001"/>
     <w:lvl w:ilvl="0">
@@ -26608,7 +26697,7 @@
     </w:lvl>
   </w:abstractNum>
   <w:abstractNum w:abstractNumId="19" w15:restartNumberingAfterBreak="0">
-    <w:nsid w:val="3C815FBB"/>
+    <w:nsid w:val="41BA3235"/>
     <w:multiLevelType w:val="singleLevel"/>
     <w:tmpl w:val="04160001"/>
     <w:lvl w:ilvl="0">
@@ -26625,7 +26714,7 @@
     </w:lvl>
   </w:abstractNum>
   <w:abstractNum w:abstractNumId="20" w15:restartNumberingAfterBreak="0">
-    <w:nsid w:val="3EC006EF"/>
+    <w:nsid w:val="4CEE7B0F"/>
     <w:multiLevelType w:val="singleLevel"/>
     <w:tmpl w:val="04160001"/>
     <w:lvl w:ilvl="0">
@@ -26642,7 +26731,7 @@
     </w:lvl>
   </w:abstractNum>
   <w:abstractNum w:abstractNumId="21" w15:restartNumberingAfterBreak="0">
-    <w:nsid w:val="435E37C6"/>
+    <w:nsid w:val="51D40B2F"/>
     <w:multiLevelType w:val="singleLevel"/>
     <w:tmpl w:val="04160001"/>
     <w:lvl w:ilvl="0">
@@ -26659,7 +26748,7 @@
     </w:lvl>
   </w:abstractNum>
   <w:abstractNum w:abstractNumId="22" w15:restartNumberingAfterBreak="0">
-    <w:nsid w:val="476649E9"/>
+    <w:nsid w:val="535369A4"/>
     <w:multiLevelType w:val="singleLevel"/>
     <w:tmpl w:val="04160001"/>
     <w:lvl w:ilvl="0">
@@ -26676,7 +26765,7 @@
     </w:lvl>
   </w:abstractNum>
   <w:abstractNum w:abstractNumId="23" w15:restartNumberingAfterBreak="0">
-    <w:nsid w:val="48F22810"/>
+    <w:nsid w:val="56147642"/>
     <w:multiLevelType w:val="singleLevel"/>
     <w:tmpl w:val="04160001"/>
     <w:lvl w:ilvl="0">
@@ -26693,7 +26782,7 @@
     </w:lvl>
   </w:abstractNum>
   <w:abstractNum w:abstractNumId="24" w15:restartNumberingAfterBreak="0">
-    <w:nsid w:val="490D3E77"/>
+    <w:nsid w:val="56454CB5"/>
     <w:multiLevelType w:val="singleLevel"/>
     <w:tmpl w:val="04160001"/>
     <w:lvl w:ilvl="0">
@@ -26710,7 +26799,7 @@
     </w:lvl>
   </w:abstractNum>
   <w:abstractNum w:abstractNumId="25" w15:restartNumberingAfterBreak="0">
-    <w:nsid w:val="4ADA45D6"/>
+    <w:nsid w:val="59BF4CB2"/>
     <w:multiLevelType w:val="singleLevel"/>
     <w:tmpl w:val="04160001"/>
     <w:lvl w:ilvl="0">
@@ -26727,7 +26816,7 @@
     </w:lvl>
   </w:abstractNum>
   <w:abstractNum w:abstractNumId="26" w15:restartNumberingAfterBreak="0">
-    <w:nsid w:val="4BCF78BE"/>
+    <w:nsid w:val="5B895553"/>
     <w:multiLevelType w:val="singleLevel"/>
     <w:tmpl w:val="04160001"/>
     <w:lvl w:ilvl="0">
@@ -26744,7 +26833,7 @@
     </w:lvl>
   </w:abstractNum>
   <w:abstractNum w:abstractNumId="27" w15:restartNumberingAfterBreak="0">
-    <w:nsid w:val="4C006ACD"/>
+    <w:nsid w:val="5D6C3318"/>
     <w:multiLevelType w:val="singleLevel"/>
     <w:tmpl w:val="04160001"/>
     <w:lvl w:ilvl="0">
@@ -26761,7 +26850,7 @@
     </w:lvl>
   </w:abstractNum>
   <w:abstractNum w:abstractNumId="28" w15:restartNumberingAfterBreak="0">
-    <w:nsid w:val="4F791C55"/>
+    <w:nsid w:val="5EA76F2A"/>
     <w:multiLevelType w:val="singleLevel"/>
     <w:tmpl w:val="04160001"/>
     <w:lvl w:ilvl="0">
@@ -26778,7 +26867,7 @@
     </w:lvl>
   </w:abstractNum>
   <w:abstractNum w:abstractNumId="29" w15:restartNumberingAfterBreak="0">
-    <w:nsid w:val="530351A1"/>
+    <w:nsid w:val="630C1684"/>
     <w:multiLevelType w:val="singleLevel"/>
     <w:tmpl w:val="04160001"/>
     <w:lvl w:ilvl="0">
@@ -26795,7 +26884,7 @@
     </w:lvl>
   </w:abstractNum>
   <w:abstractNum w:abstractNumId="30" w15:restartNumberingAfterBreak="0">
-    <w:nsid w:val="55061CE1"/>
+    <w:nsid w:val="64E43924"/>
     <w:multiLevelType w:val="singleLevel"/>
     <w:tmpl w:val="04160001"/>
     <w:lvl w:ilvl="0">
@@ -26812,7 +26901,7 @@
     </w:lvl>
   </w:abstractNum>
   <w:abstractNum w:abstractNumId="31" w15:restartNumberingAfterBreak="0">
-    <w:nsid w:val="59752FBE"/>
+    <w:nsid w:val="66256248"/>
     <w:multiLevelType w:val="singleLevel"/>
     <w:tmpl w:val="04160001"/>
     <w:lvl w:ilvl="0">
@@ -26829,7 +26918,7 @@
     </w:lvl>
   </w:abstractNum>
   <w:abstractNum w:abstractNumId="32" w15:restartNumberingAfterBreak="0">
-    <w:nsid w:val="59EA2722"/>
+    <w:nsid w:val="6ABE4DD5"/>
     <w:multiLevelType w:val="singleLevel"/>
     <w:tmpl w:val="04160001"/>
     <w:lvl w:ilvl="0">
@@ -26846,7 +26935,7 @@
     </w:lvl>
   </w:abstractNum>
   <w:abstractNum w:abstractNumId="33" w15:restartNumberingAfterBreak="0">
-    <w:nsid w:val="5B2B489B"/>
+    <w:nsid w:val="6EDE7DE1"/>
     <w:multiLevelType w:val="singleLevel"/>
     <w:tmpl w:val="04160001"/>
     <w:lvl w:ilvl="0">
@@ -26863,7 +26952,7 @@
     </w:lvl>
   </w:abstractNum>
   <w:abstractNum w:abstractNumId="34" w15:restartNumberingAfterBreak="0">
-    <w:nsid w:val="5F65700B"/>
+    <w:nsid w:val="6F974EEB"/>
     <w:multiLevelType w:val="singleLevel"/>
     <w:tmpl w:val="04160001"/>
     <w:lvl w:ilvl="0">
@@ -26880,7 +26969,7 @@
     </w:lvl>
   </w:abstractNum>
   <w:abstractNum w:abstractNumId="35" w15:restartNumberingAfterBreak="0">
-    <w:nsid w:val="66645ACE"/>
+    <w:nsid w:val="77DF67AE"/>
     <w:multiLevelType w:val="singleLevel"/>
     <w:tmpl w:val="04160001"/>
     <w:lvl w:ilvl="0">
@@ -26897,7 +26986,7 @@
     </w:lvl>
   </w:abstractNum>
   <w:abstractNum w:abstractNumId="36" w15:restartNumberingAfterBreak="0">
-    <w:nsid w:val="6A3E0B9B"/>
+    <w:nsid w:val="7835695B"/>
     <w:multiLevelType w:val="singleLevel"/>
     <w:tmpl w:val="04160001"/>
     <w:lvl w:ilvl="0">
@@ -26914,7 +27003,7 @@
     </w:lvl>
   </w:abstractNum>
   <w:abstractNum w:abstractNumId="37" w15:restartNumberingAfterBreak="0">
-    <w:nsid w:val="6F3053C5"/>
+    <w:nsid w:val="79767364"/>
     <w:multiLevelType w:val="singleLevel"/>
     <w:tmpl w:val="04160001"/>
     <w:lvl w:ilvl="0">
@@ -26931,7 +27020,7 @@
     </w:lvl>
   </w:abstractNum>
   <w:abstractNum w:abstractNumId="38" w15:restartNumberingAfterBreak="0">
-    <w:nsid w:val="7D3F3671"/>
+    <w:nsid w:val="79B61C8F"/>
     <w:multiLevelType w:val="singleLevel"/>
     <w:tmpl w:val="04160001"/>
     <w:lvl w:ilvl="0">
@@ -26948,7 +27037,7 @@
     </w:lvl>
   </w:abstractNum>
   <w:abstractNum w:abstractNumId="39" w15:restartNumberingAfterBreak="0">
-    <w:nsid w:val="7FB94002"/>
+    <w:nsid w:val="7BA53BAD"/>
     <w:multiLevelType w:val="singleLevel"/>
     <w:tmpl w:val="04160001"/>
     <w:lvl w:ilvl="0">
@@ -26964,125 +27053,125 @@
       </w:rPr>
     </w:lvl>
   </w:abstractNum>
-  <w:num w:numId="1" w16cid:durableId="85615069">
+  <w:num w:numId="1" w16cid:durableId="1693914094">
+    <w:abstractNumId w:val="22"/>
+  </w:num>
+  <w:num w:numId="2" w16cid:durableId="804738408">
+    <w:abstractNumId w:val="18"/>
+  </w:num>
+  <w:num w:numId="3" w16cid:durableId="1627002437">
+    <w:abstractNumId w:val="37"/>
+  </w:num>
+  <w:num w:numId="4" w16cid:durableId="595558262">
+    <w:abstractNumId w:val="15"/>
+  </w:num>
+  <w:num w:numId="5" w16cid:durableId="936251589">
+    <w:abstractNumId w:val="35"/>
+  </w:num>
+  <w:num w:numId="6" w16cid:durableId="1083911437">
+    <w:abstractNumId w:val="5"/>
+  </w:num>
+  <w:num w:numId="7" w16cid:durableId="69472619">
+    <w:abstractNumId w:val="33"/>
+  </w:num>
+  <w:num w:numId="8" w16cid:durableId="580064286">
+    <w:abstractNumId w:val="1"/>
+  </w:num>
+  <w:num w:numId="9" w16cid:durableId="395394549">
+    <w:abstractNumId w:val="14"/>
+  </w:num>
+  <w:num w:numId="10" w16cid:durableId="1842622992">
+    <w:abstractNumId w:val="26"/>
+  </w:num>
+  <w:num w:numId="11" w16cid:durableId="870335973">
+    <w:abstractNumId w:val="9"/>
+  </w:num>
+  <w:num w:numId="12" w16cid:durableId="1253200365">
+    <w:abstractNumId w:val="13"/>
+  </w:num>
+  <w:num w:numId="13" w16cid:durableId="1975066222">
+    <w:abstractNumId w:val="6"/>
+  </w:num>
+  <w:num w:numId="14" w16cid:durableId="1045326114">
+    <w:abstractNumId w:val="39"/>
+  </w:num>
+  <w:num w:numId="15" w16cid:durableId="200748080">
+    <w:abstractNumId w:val="23"/>
+  </w:num>
+  <w:num w:numId="16" w16cid:durableId="264071480">
+    <w:abstractNumId w:val="27"/>
+  </w:num>
+  <w:num w:numId="17" w16cid:durableId="1111902979">
+    <w:abstractNumId w:val="30"/>
+  </w:num>
+  <w:num w:numId="18" w16cid:durableId="1135492026">
+    <w:abstractNumId w:val="2"/>
+  </w:num>
+  <w:num w:numId="19" w16cid:durableId="1380667207">
     <w:abstractNumId w:val="10"/>
   </w:num>
-  <w:num w:numId="2" w16cid:durableId="692922062">
+  <w:num w:numId="20" w16cid:durableId="1546795667">
+    <w:abstractNumId w:val="24"/>
+  </w:num>
+  <w:num w:numId="21" w16cid:durableId="253784740">
+    <w:abstractNumId w:val="25"/>
+  </w:num>
+  <w:num w:numId="22" w16cid:durableId="537739729">
+    <w:abstractNumId w:val="11"/>
+  </w:num>
+  <w:num w:numId="23" w16cid:durableId="1833369718">
     <w:abstractNumId w:val="31"/>
   </w:num>
-  <w:num w:numId="3" w16cid:durableId="1199509541">
-    <w:abstractNumId w:val="1"/>
+  <w:num w:numId="24" w16cid:durableId="765156624">
+    <w:abstractNumId w:val="38"/>
   </w:num>
-  <w:num w:numId="4" w16cid:durableId="1419063821">
+  <w:num w:numId="25" w16cid:durableId="29110608">
+    <w:abstractNumId w:val="36"/>
+  </w:num>
+  <w:num w:numId="26" w16cid:durableId="704328778">
+    <w:abstractNumId w:val="19"/>
+  </w:num>
+  <w:num w:numId="27" w16cid:durableId="459762414">
+    <w:abstractNumId w:val="32"/>
+  </w:num>
+  <w:num w:numId="28" w16cid:durableId="1096947344">
+    <w:abstractNumId w:val="21"/>
+  </w:num>
+  <w:num w:numId="29" w16cid:durableId="544945904">
     <w:abstractNumId w:val="29"/>
   </w:num>
-  <w:num w:numId="5" w16cid:durableId="44836487">
+  <w:num w:numId="30" w16cid:durableId="1847591869">
+    <w:abstractNumId w:val="3"/>
+  </w:num>
+  <w:num w:numId="31" w16cid:durableId="370038269">
+    <w:abstractNumId w:val="4"/>
+  </w:num>
+  <w:num w:numId="32" w16cid:durableId="1941837418">
+    <w:abstractNumId w:val="8"/>
+  </w:num>
+  <w:num w:numId="33" w16cid:durableId="908685618">
     <w:abstractNumId w:val="20"/>
   </w:num>
-  <w:num w:numId="6" w16cid:durableId="39405312">
-    <w:abstractNumId w:val="8"/>
+  <w:num w:numId="34" w16cid:durableId="1667048065">
+    <w:abstractNumId w:val="34"/>
   </w:num>
-  <w:num w:numId="7" w16cid:durableId="1441223656">
-    <w:abstractNumId w:val="15"/>
-  </w:num>
-  <w:num w:numId="8" w16cid:durableId="927540972">
-    <w:abstractNumId w:val="30"/>
-  </w:num>
-  <w:num w:numId="9" w16cid:durableId="948968316">
-    <w:abstractNumId w:val="13"/>
-  </w:num>
-  <w:num w:numId="10" w16cid:durableId="1798716124">
-    <w:abstractNumId w:val="19"/>
-  </w:num>
-  <w:num w:numId="11" w16cid:durableId="1525553677">
+  <w:num w:numId="35" w16cid:durableId="913516079">
     <w:abstractNumId w:val="7"/>
   </w:num>
-  <w:num w:numId="12" w16cid:durableId="962617162">
-    <w:abstractNumId w:val="37"/>
-  </w:num>
-  <w:num w:numId="13" w16cid:durableId="959921383">
-    <w:abstractNumId w:val="18"/>
-  </w:num>
-  <w:num w:numId="14" w16cid:durableId="676273026">
-    <w:abstractNumId w:val="2"/>
-  </w:num>
-  <w:num w:numId="15" w16cid:durableId="12541907">
-    <w:abstractNumId w:val="38"/>
-  </w:num>
-  <w:num w:numId="16" w16cid:durableId="1060901722">
+  <w:num w:numId="36" w16cid:durableId="1505701995">
     <w:abstractNumId w:val="12"/>
   </w:num>
-  <w:num w:numId="17" w16cid:durableId="1720131132">
-    <w:abstractNumId w:val="9"/>
+  <w:num w:numId="37" w16cid:durableId="793451018">
+    <w:abstractNumId w:val="17"/>
   </w:num>
-  <w:num w:numId="18" w16cid:durableId="181406006">
-    <w:abstractNumId w:val="4"/>
-  </w:num>
-  <w:num w:numId="19" w16cid:durableId="1676305300">
-    <w:abstractNumId w:val="36"/>
-  </w:num>
-  <w:num w:numId="20" w16cid:durableId="436487357">
-    <w:abstractNumId w:val="24"/>
-  </w:num>
-  <w:num w:numId="21" w16cid:durableId="1928223436">
+  <w:num w:numId="38" w16cid:durableId="1198203942">
     <w:abstractNumId w:val="0"/>
   </w:num>
-  <w:num w:numId="22" w16cid:durableId="635572225">
-    <w:abstractNumId w:val="17"/>
-  </w:num>
-  <w:num w:numId="23" w16cid:durableId="1520506505">
-    <w:abstractNumId w:val="27"/>
-  </w:num>
-  <w:num w:numId="24" w16cid:durableId="687757912">
-    <w:abstractNumId w:val="14"/>
-  </w:num>
-  <w:num w:numId="25" w16cid:durableId="501819696">
-    <w:abstractNumId w:val="25"/>
-  </w:num>
-  <w:num w:numId="26" w16cid:durableId="1422600342">
-    <w:abstractNumId w:val="16"/>
-  </w:num>
-  <w:num w:numId="27" w16cid:durableId="2017263997">
+  <w:num w:numId="39" w16cid:durableId="912742267">
     <w:abstractNumId w:val="28"/>
   </w:num>
-  <w:num w:numId="28" w16cid:durableId="452596822">
-    <w:abstractNumId w:val="34"/>
-  </w:num>
-  <w:num w:numId="29" w16cid:durableId="658656203">
-    <w:abstractNumId w:val="35"/>
-  </w:num>
-  <w:num w:numId="30" w16cid:durableId="1411001518">
-    <w:abstractNumId w:val="26"/>
-  </w:num>
-  <w:num w:numId="31" w16cid:durableId="551768324">
-    <w:abstractNumId w:val="22"/>
-  </w:num>
-  <w:num w:numId="32" w16cid:durableId="807551250">
-    <w:abstractNumId w:val="3"/>
-  </w:num>
-  <w:num w:numId="33" w16cid:durableId="1463645765">
-    <w:abstractNumId w:val="39"/>
-  </w:num>
-  <w:num w:numId="34" w16cid:durableId="806818924">
-    <w:abstractNumId w:val="6"/>
-  </w:num>
-  <w:num w:numId="35" w16cid:durableId="427654137">
-    <w:abstractNumId w:val="33"/>
-  </w:num>
-  <w:num w:numId="36" w16cid:durableId="851916448">
-    <w:abstractNumId w:val="23"/>
-  </w:num>
-  <w:num w:numId="37" w16cid:durableId="274599504">
-    <w:abstractNumId w:val="21"/>
-  </w:num>
-  <w:num w:numId="38" w16cid:durableId="760295420">
-    <w:abstractNumId w:val="11"/>
-  </w:num>
-  <w:num w:numId="39" w16cid:durableId="297996095">
-    <w:abstractNumId w:val="5"/>
-  </w:num>
-  <w:num w:numId="40" w16cid:durableId="1975793539">
-    <w:abstractNumId w:val="32"/>
+  <w:num w:numId="40" w16cid:durableId="1992979241">
+    <w:abstractNumId w:val="16"/>
   </w:num>
 </w:numbering>
 </file>
@@ -27495,7 +27584,7 @@
     <w:link w:val="Ttulo1Char"/>
     <w:uiPriority w:val="9"/>
     <w:qFormat/>
-    <w:rsid w:val="00042400"/>
+    <w:rsid w:val="00410908"/>
     <w:pPr>
       <w:keepNext/>
       <w:keepLines/>
@@ -27517,7 +27606,7 @@
     <w:uiPriority w:val="9"/>
     <w:unhideWhenUsed/>
     <w:qFormat/>
-    <w:rsid w:val="00042400"/>
+    <w:rsid w:val="00410908"/>
     <w:pPr>
       <w:keepNext/>
       <w:keepLines/>
@@ -27540,7 +27629,7 @@
     <w:semiHidden/>
     <w:unhideWhenUsed/>
     <w:qFormat/>
-    <w:rsid w:val="00042400"/>
+    <w:rsid w:val="00410908"/>
     <w:pPr>
       <w:keepNext/>
       <w:keepLines/>
@@ -27563,7 +27652,7 @@
     <w:semiHidden/>
     <w:unhideWhenUsed/>
     <w:qFormat/>
-    <w:rsid w:val="00042400"/>
+    <w:rsid w:val="00410908"/>
     <w:pPr>
       <w:keepNext/>
       <w:keepLines/>
@@ -27586,7 +27675,7 @@
     <w:semiHidden/>
     <w:unhideWhenUsed/>
     <w:qFormat/>
-    <w:rsid w:val="00042400"/>
+    <w:rsid w:val="00410908"/>
     <w:pPr>
       <w:keepNext/>
       <w:keepLines/>
@@ -27607,7 +27696,7 @@
     <w:semiHidden/>
     <w:unhideWhenUsed/>
     <w:qFormat/>
-    <w:rsid w:val="00042400"/>
+    <w:rsid w:val="00410908"/>
     <w:pPr>
       <w:keepNext/>
       <w:keepLines/>
@@ -27630,7 +27719,7 @@
     <w:semiHidden/>
     <w:unhideWhenUsed/>
     <w:qFormat/>
-    <w:rsid w:val="00042400"/>
+    <w:rsid w:val="00410908"/>
     <w:pPr>
       <w:keepNext/>
       <w:keepLines/>
@@ -27651,7 +27740,7 @@
     <w:semiHidden/>
     <w:unhideWhenUsed/>
     <w:qFormat/>
-    <w:rsid w:val="00042400"/>
+    <w:rsid w:val="00410908"/>
     <w:pPr>
       <w:keepNext/>
       <w:keepLines/>
@@ -27674,7 +27763,7 @@
     <w:semiHidden/>
     <w:unhideWhenUsed/>
     <w:qFormat/>
-    <w:rsid w:val="00042400"/>
+    <w:rsid w:val="00410908"/>
     <w:pPr>
       <w:keepNext/>
       <w:keepLines/>
@@ -27718,7 +27807,7 @@
     <w:basedOn w:val="Fontepargpadro"/>
     <w:link w:val="Ttulo1"/>
     <w:uiPriority w:val="9"/>
-    <w:rsid w:val="00042400"/>
+    <w:rsid w:val="00410908"/>
     <w:rPr>
       <w:rFonts w:asciiTheme="majorHAnsi" w:eastAsiaTheme="majorEastAsia" w:hAnsiTheme="majorHAnsi" w:cstheme="majorBidi"/>
       <w:color w:val="0F4761" w:themeColor="accent1" w:themeShade="BF"/>
@@ -27731,7 +27820,7 @@
     <w:basedOn w:val="Fontepargpadro"/>
     <w:link w:val="Ttulo2"/>
     <w:uiPriority w:val="9"/>
-    <w:rsid w:val="00042400"/>
+    <w:rsid w:val="00410908"/>
     <w:rPr>
       <w:rFonts w:asciiTheme="majorHAnsi" w:eastAsiaTheme="majorEastAsia" w:hAnsiTheme="majorHAnsi" w:cstheme="majorBidi"/>
       <w:color w:val="0F4761" w:themeColor="accent1" w:themeShade="BF"/>
@@ -27745,7 +27834,7 @@
     <w:link w:val="Ttulo3"/>
     <w:uiPriority w:val="9"/>
     <w:semiHidden/>
-    <w:rsid w:val="00042400"/>
+    <w:rsid w:val="00410908"/>
     <w:rPr>
       <w:rFonts w:eastAsiaTheme="majorEastAsia" w:cstheme="majorBidi"/>
       <w:color w:val="0F4761" w:themeColor="accent1" w:themeShade="BF"/>
@@ -27759,7 +27848,7 @@
     <w:link w:val="Ttulo4"/>
     <w:uiPriority w:val="9"/>
     <w:semiHidden/>
-    <w:rsid w:val="00042400"/>
+    <w:rsid w:val="00410908"/>
     <w:rPr>
       <w:rFonts w:eastAsiaTheme="majorEastAsia" w:cstheme="majorBidi"/>
       <w:i/>
@@ -27773,7 +27862,7 @@
     <w:link w:val="Ttulo5"/>
     <w:uiPriority w:val="9"/>
     <w:semiHidden/>
-    <w:rsid w:val="00042400"/>
+    <w:rsid w:val="00410908"/>
     <w:rPr>
       <w:rFonts w:eastAsiaTheme="majorEastAsia" w:cstheme="majorBidi"/>
       <w:color w:val="0F4761" w:themeColor="accent1" w:themeShade="BF"/>
@@ -27785,7 +27874,7 @@
     <w:link w:val="Ttulo6"/>
     <w:uiPriority w:val="9"/>
     <w:semiHidden/>
-    <w:rsid w:val="00042400"/>
+    <w:rsid w:val="00410908"/>
     <w:rPr>
       <w:rFonts w:eastAsiaTheme="majorEastAsia" w:cstheme="majorBidi"/>
       <w:i/>
@@ -27799,7 +27888,7 @@
     <w:link w:val="Ttulo7"/>
     <w:uiPriority w:val="9"/>
     <w:semiHidden/>
-    <w:rsid w:val="00042400"/>
+    <w:rsid w:val="00410908"/>
     <w:rPr>
       <w:rFonts w:eastAsiaTheme="majorEastAsia" w:cstheme="majorBidi"/>
       <w:color w:val="595959" w:themeColor="text1" w:themeTint="A6"/>
@@ -27811,7 +27900,7 @@
     <w:link w:val="Ttulo8"/>
     <w:uiPriority w:val="9"/>
     <w:semiHidden/>
-    <w:rsid w:val="00042400"/>
+    <w:rsid w:val="00410908"/>
     <w:rPr>
       <w:rFonts w:eastAsiaTheme="majorEastAsia" w:cstheme="majorBidi"/>
       <w:i/>
@@ -27825,7 +27914,7 @@
     <w:link w:val="Ttulo9"/>
     <w:uiPriority w:val="9"/>
     <w:semiHidden/>
-    <w:rsid w:val="00042400"/>
+    <w:rsid w:val="00410908"/>
     <w:rPr>
       <w:rFonts w:eastAsiaTheme="majorEastAsia" w:cstheme="majorBidi"/>
       <w:color w:val="272727" w:themeColor="text1" w:themeTint="D8"/>
@@ -27838,7 +27927,7 @@
     <w:link w:val="TtuloChar"/>
     <w:uiPriority w:val="10"/>
     <w:qFormat/>
-    <w:rsid w:val="00042400"/>
+    <w:rsid w:val="00410908"/>
     <w:pPr>
       <w:spacing w:after="80" w:line="240" w:lineRule="auto"/>
       <w:contextualSpacing/>
@@ -27856,7 +27945,7 @@
     <w:basedOn w:val="Fontepargpadro"/>
     <w:link w:val="Ttulo"/>
     <w:uiPriority w:val="10"/>
-    <w:rsid w:val="00042400"/>
+    <w:rsid w:val="00410908"/>
     <w:rPr>
       <w:rFonts w:asciiTheme="majorHAnsi" w:eastAsiaTheme="majorEastAsia" w:hAnsiTheme="majorHAnsi" w:cstheme="majorBidi"/>
       <w:spacing w:val="-10"/>
@@ -27872,7 +27961,7 @@
     <w:link w:val="SubttuloChar"/>
     <w:uiPriority w:val="11"/>
     <w:qFormat/>
-    <w:rsid w:val="00042400"/>
+    <w:rsid w:val="00410908"/>
     <w:pPr>
       <w:numPr>
         <w:ilvl w:val="1"/>
@@ -27891,7 +27980,7 @@
     <w:basedOn w:val="Fontepargpadro"/>
     <w:link w:val="Subttulo"/>
     <w:uiPriority w:val="11"/>
-    <w:rsid w:val="00042400"/>
+    <w:rsid w:val="00410908"/>
     <w:rPr>
       <w:rFonts w:eastAsiaTheme="majorEastAsia" w:cstheme="majorBidi"/>
       <w:color w:val="595959" w:themeColor="text1" w:themeTint="A6"/>
@@ -27907,7 +27996,7 @@
     <w:link w:val="CitaoChar"/>
     <w:uiPriority w:val="29"/>
     <w:qFormat/>
-    <w:rsid w:val="00042400"/>
+    <w:rsid w:val="00410908"/>
     <w:pPr>
       <w:spacing w:before="160"/>
       <w:jc w:val="center"/>
@@ -27923,7 +28012,7 @@
     <w:basedOn w:val="Fontepargpadro"/>
     <w:link w:val="Citao"/>
     <w:uiPriority w:val="29"/>
-    <w:rsid w:val="00042400"/>
+    <w:rsid w:val="00410908"/>
     <w:rPr>
       <w:i/>
       <w:iCs/>
@@ -27935,7 +28024,7 @@
     <w:basedOn w:val="Normal"/>
     <w:uiPriority w:val="34"/>
     <w:qFormat/>
-    <w:rsid w:val="00042400"/>
+    <w:rsid w:val="00410908"/>
     <w:pPr>
       <w:ind w:left="720"/>
       <w:contextualSpacing/>
@@ -27946,7 +28035,7 @@
     <w:basedOn w:val="Fontepargpadro"/>
     <w:uiPriority w:val="21"/>
     <w:qFormat/>
-    <w:rsid w:val="00042400"/>
+    <w:rsid w:val="00410908"/>
     <w:rPr>
       <w:i/>
       <w:iCs/>
@@ -27960,7 +28049,7 @@
     <w:link w:val="CitaoIntensaChar"/>
     <w:uiPriority w:val="30"/>
     <w:qFormat/>
-    <w:rsid w:val="00042400"/>
+    <w:rsid w:val="00410908"/>
     <w:pPr>
       <w:pBdr>
         <w:top w:val="single" w:sz="4" w:space="10" w:color="0F4761" w:themeColor="accent1" w:themeShade="BF"/>
@@ -27981,7 +28070,7 @@
     <w:basedOn w:val="Fontepargpadro"/>
     <w:link w:val="CitaoIntensa"/>
     <w:uiPriority w:val="30"/>
-    <w:rsid w:val="00042400"/>
+    <w:rsid w:val="00410908"/>
     <w:rPr>
       <w:i/>
       <w:iCs/>
@@ -27993,7 +28082,7 @@
     <w:basedOn w:val="Fontepargpadro"/>
     <w:uiPriority w:val="32"/>
     <w:qFormat/>
-    <w:rsid w:val="00042400"/>
+    <w:rsid w:val="00410908"/>
     <w:rPr>
       <w:b/>
       <w:bCs/>
@@ -28008,7 +28097,7 @@
     <w:link w:val="CabealhoChar"/>
     <w:uiPriority w:val="99"/>
     <w:unhideWhenUsed/>
-    <w:rsid w:val="00042400"/>
+    <w:rsid w:val="00410908"/>
     <w:pPr>
       <w:tabs>
         <w:tab w:val="center" w:pos="4252"/>
@@ -28022,7 +28111,7 @@
     <w:basedOn w:val="Fontepargpadro"/>
     <w:link w:val="Cabealho"/>
     <w:uiPriority w:val="99"/>
-    <w:rsid w:val="00042400"/>
+    <w:rsid w:val="00410908"/>
   </w:style>
   <w:style w:type="paragraph" w:styleId="Rodap">
     <w:name w:val="footer"/>
@@ -28030,7 +28119,7 @@
     <w:link w:val="RodapChar"/>
     <w:uiPriority w:val="99"/>
     <w:unhideWhenUsed/>
-    <w:rsid w:val="00042400"/>
+    <w:rsid w:val="00410908"/>
     <w:pPr>
       <w:tabs>
         <w:tab w:val="center" w:pos="4252"/>
@@ -28044,7 +28133,7 @@
     <w:basedOn w:val="Fontepargpadro"/>
     <w:link w:val="Rodap"/>
     <w:uiPriority w:val="99"/>
-    <w:rsid w:val="00042400"/>
+    <w:rsid w:val="00410908"/>
   </w:style>
   <w:style w:type="paragraph" w:styleId="Sumrio1">
     <w:name w:val="toc 1"/>
@@ -28053,7 +28142,7 @@
     <w:autoRedefine/>
     <w:uiPriority w:val="39"/>
     <w:unhideWhenUsed/>
-    <w:rsid w:val="00042400"/>
+    <w:rsid w:val="00410908"/>
     <w:pPr>
       <w:spacing w:after="100"/>
     </w:pPr>
@@ -28065,7 +28154,7 @@
     <w:autoRedefine/>
     <w:uiPriority w:val="39"/>
     <w:unhideWhenUsed/>
-    <w:rsid w:val="00042400"/>
+    <w:rsid w:val="00410908"/>
     <w:pPr>
       <w:spacing w:after="100"/>
       <w:ind w:left="240"/>

</xml_diff>

<commit_message>
Atualiza Manual de Uso para o link do Meu Painel no aviso automatico de prazo
Documenta, na versao 2.84 do manual, o link "Abrir o Meu Painel"
adicionado ao e-mail de aviso automatico de prazo (secao 6.4.3) -
ja implantado e publicado no codigo.

Co-Authored-By: Claude Sonnet 5 <noreply@anthropic.com>
</commit_message>
<xml_diff>
--- a/Manual de Uso - Ferramenta de Gestao de Projetos.docx
+++ b/Manual de Uso - Ferramenta de Gestao de Projetos.docx
@@ -129,7 +129,7 @@
           <w:color w:val="6A6A70"/>
           <w:sz w:val="22"/>
         </w:rPr>
-        <w:t>Versao 2.83 - 16 de setembro de 2026 (substitui a versao 2.82 de 16/09/2026)</w:t>
+        <w:t>Versao 2.84 - 16 de setembro de 2026 (substitui a versao 2.83 de 16/09/2026)</w:t>
       </w:r>
     </w:p>
     <w:p>
@@ -229,7 +229,7 @@
         <w:rPr>
           <w:noProof/>
         </w:rPr>
-        <w:instrText xml:space="preserve"> PAGEREF _Toc240463888 \h </w:instrText>
+        <w:instrText xml:space="preserve"> PAGEREF _Toc240465752 \h </w:instrText>
       </w:r>
       <w:r>
         <w:rPr>
@@ -290,7 +290,7 @@
         <w:rPr>
           <w:noProof/>
         </w:rPr>
-        <w:instrText xml:space="preserve"> PAGEREF _Toc240463889 \h </w:instrText>
+        <w:instrText xml:space="preserve"> PAGEREF _Toc240465753 \h </w:instrText>
       </w:r>
       <w:r>
         <w:rPr>
@@ -351,7 +351,7 @@
         <w:rPr>
           <w:noProof/>
         </w:rPr>
-        <w:instrText xml:space="preserve"> PAGEREF _Toc240463890 \h </w:instrText>
+        <w:instrText xml:space="preserve"> PAGEREF _Toc240465754 \h </w:instrText>
       </w:r>
       <w:r>
         <w:rPr>
@@ -368,7 +368,7 @@
         <w:rPr>
           <w:noProof/>
         </w:rPr>
-        <w:t>21</w:t>
+        <w:t>22</w:t>
       </w:r>
       <w:r>
         <w:rPr>
@@ -412,7 +412,7 @@
         <w:rPr>
           <w:noProof/>
         </w:rPr>
-        <w:instrText xml:space="preserve"> PAGEREF _Toc240463891 \h </w:instrText>
+        <w:instrText xml:space="preserve"> PAGEREF _Toc240465755 \h </w:instrText>
       </w:r>
       <w:r>
         <w:rPr>
@@ -473,7 +473,7 @@
         <w:rPr>
           <w:noProof/>
         </w:rPr>
-        <w:instrText xml:space="preserve"> PAGEREF _Toc240463892 \h </w:instrText>
+        <w:instrText xml:space="preserve"> PAGEREF _Toc240465756 \h </w:instrText>
       </w:r>
       <w:r>
         <w:rPr>
@@ -534,7 +534,7 @@
         <w:rPr>
           <w:noProof/>
         </w:rPr>
-        <w:instrText xml:space="preserve"> PAGEREF _Toc240463893 \h </w:instrText>
+        <w:instrText xml:space="preserve"> PAGEREF _Toc240465757 \h </w:instrText>
       </w:r>
       <w:r>
         <w:rPr>
@@ -551,7 +551,7 @@
         <w:rPr>
           <w:noProof/>
         </w:rPr>
-        <w:t>25</w:t>
+        <w:t>26</w:t>
       </w:r>
       <w:r>
         <w:rPr>
@@ -595,7 +595,7 @@
         <w:rPr>
           <w:noProof/>
         </w:rPr>
-        <w:instrText xml:space="preserve"> PAGEREF _Toc240463894 \h </w:instrText>
+        <w:instrText xml:space="preserve"> PAGEREF _Toc240465758 \h </w:instrText>
       </w:r>
       <w:r>
         <w:rPr>
@@ -612,7 +612,7 @@
         <w:rPr>
           <w:noProof/>
         </w:rPr>
-        <w:t>25</w:t>
+        <w:t>26</w:t>
       </w:r>
       <w:r>
         <w:rPr>
@@ -656,7 +656,7 @@
         <w:rPr>
           <w:noProof/>
         </w:rPr>
-        <w:instrText xml:space="preserve"> PAGEREF _Toc240463895 \h </w:instrText>
+        <w:instrText xml:space="preserve"> PAGEREF _Toc240465759 \h </w:instrText>
       </w:r>
       <w:r>
         <w:rPr>
@@ -673,7 +673,7 @@
         <w:rPr>
           <w:noProof/>
         </w:rPr>
-        <w:t>25</w:t>
+        <w:t>26</w:t>
       </w:r>
       <w:r>
         <w:rPr>
@@ -717,7 +717,7 @@
         <w:rPr>
           <w:noProof/>
         </w:rPr>
-        <w:instrText xml:space="preserve"> PAGEREF _Toc240463896 \h </w:instrText>
+        <w:instrText xml:space="preserve"> PAGEREF _Toc240465760 \h </w:instrText>
       </w:r>
       <w:r>
         <w:rPr>
@@ -734,7 +734,7 @@
         <w:rPr>
           <w:noProof/>
         </w:rPr>
-        <w:t>25</w:t>
+        <w:t>26</w:t>
       </w:r>
       <w:r>
         <w:rPr>
@@ -778,7 +778,7 @@
         <w:rPr>
           <w:noProof/>
         </w:rPr>
-        <w:instrText xml:space="preserve"> PAGEREF _Toc240463897 \h </w:instrText>
+        <w:instrText xml:space="preserve"> PAGEREF _Toc240465761 \h </w:instrText>
       </w:r>
       <w:r>
         <w:rPr>
@@ -795,7 +795,7 @@
         <w:rPr>
           <w:noProof/>
         </w:rPr>
-        <w:t>26</w:t>
+        <w:t>27</w:t>
       </w:r>
       <w:r>
         <w:rPr>
@@ -839,7 +839,7 @@
         <w:rPr>
           <w:noProof/>
         </w:rPr>
-        <w:instrText xml:space="preserve"> PAGEREF _Toc240463898 \h </w:instrText>
+        <w:instrText xml:space="preserve"> PAGEREF _Toc240465762 \h </w:instrText>
       </w:r>
       <w:r>
         <w:rPr>
@@ -856,7 +856,7 @@
         <w:rPr>
           <w:noProof/>
         </w:rPr>
-        <w:t>27</w:t>
+        <w:t>28</w:t>
       </w:r>
       <w:r>
         <w:rPr>
@@ -900,7 +900,7 @@
         <w:rPr>
           <w:noProof/>
         </w:rPr>
-        <w:instrText xml:space="preserve"> PAGEREF _Toc240463899 \h </w:instrText>
+        <w:instrText xml:space="preserve"> PAGEREF _Toc240465763 \h </w:instrText>
       </w:r>
       <w:r>
         <w:rPr>
@@ -917,7 +917,7 @@
         <w:rPr>
           <w:noProof/>
         </w:rPr>
-        <w:t>29</w:t>
+        <w:t>30</w:t>
       </w:r>
       <w:r>
         <w:rPr>
@@ -961,7 +961,7 @@
         <w:rPr>
           <w:noProof/>
         </w:rPr>
-        <w:instrText xml:space="preserve"> PAGEREF _Toc240463900 \h </w:instrText>
+        <w:instrText xml:space="preserve"> PAGEREF _Toc240465764 \h </w:instrText>
       </w:r>
       <w:r>
         <w:rPr>
@@ -978,7 +978,7 @@
         <w:rPr>
           <w:noProof/>
         </w:rPr>
-        <w:t>30</w:t>
+        <w:t>31</w:t>
       </w:r>
       <w:r>
         <w:rPr>
@@ -1022,7 +1022,7 @@
         <w:rPr>
           <w:noProof/>
         </w:rPr>
-        <w:instrText xml:space="preserve"> PAGEREF _Toc240463901 \h </w:instrText>
+        <w:instrText xml:space="preserve"> PAGEREF _Toc240465765 \h </w:instrText>
       </w:r>
       <w:r>
         <w:rPr>
@@ -1039,7 +1039,7 @@
         <w:rPr>
           <w:noProof/>
         </w:rPr>
-        <w:t>31</w:t>
+        <w:t>32</w:t>
       </w:r>
       <w:r>
         <w:rPr>
@@ -1083,7 +1083,7 @@
         <w:rPr>
           <w:noProof/>
         </w:rPr>
-        <w:instrText xml:space="preserve"> PAGEREF _Toc240463902 \h </w:instrText>
+        <w:instrText xml:space="preserve"> PAGEREF _Toc240465766 \h </w:instrText>
       </w:r>
       <w:r>
         <w:rPr>
@@ -1100,7 +1100,7 @@
         <w:rPr>
           <w:noProof/>
         </w:rPr>
-        <w:t>31</w:t>
+        <w:t>32</w:t>
       </w:r>
       <w:r>
         <w:rPr>
@@ -1144,7 +1144,7 @@
         <w:rPr>
           <w:noProof/>
         </w:rPr>
-        <w:instrText xml:space="preserve"> PAGEREF _Toc240463903 \h </w:instrText>
+        <w:instrText xml:space="preserve"> PAGEREF _Toc240465767 \h </w:instrText>
       </w:r>
       <w:r>
         <w:rPr>
@@ -1161,7 +1161,7 @@
         <w:rPr>
           <w:noProof/>
         </w:rPr>
-        <w:t>32</w:t>
+        <w:t>33</w:t>
       </w:r>
       <w:r>
         <w:rPr>
@@ -1205,7 +1205,7 @@
         <w:rPr>
           <w:noProof/>
         </w:rPr>
-        <w:instrText xml:space="preserve"> PAGEREF _Toc240463904 \h </w:instrText>
+        <w:instrText xml:space="preserve"> PAGEREF _Toc240465768 \h </w:instrText>
       </w:r>
       <w:r>
         <w:rPr>
@@ -1222,7 +1222,7 @@
         <w:rPr>
           <w:noProof/>
         </w:rPr>
-        <w:t>33</w:t>
+        <w:t>34</w:t>
       </w:r>
       <w:r>
         <w:rPr>
@@ -1266,7 +1266,7 @@
         <w:rPr>
           <w:noProof/>
         </w:rPr>
-        <w:instrText xml:space="preserve"> PAGEREF _Toc240463905 \h </w:instrText>
+        <w:instrText xml:space="preserve"> PAGEREF _Toc240465769 \h </w:instrText>
       </w:r>
       <w:r>
         <w:rPr>
@@ -1283,7 +1283,7 @@
         <w:rPr>
           <w:noProof/>
         </w:rPr>
-        <w:t>33</w:t>
+        <w:t>34</w:t>
       </w:r>
       <w:r>
         <w:rPr>
@@ -1327,7 +1327,7 @@
         <w:rPr>
           <w:noProof/>
         </w:rPr>
-        <w:instrText xml:space="preserve"> PAGEREF _Toc240463906 \h </w:instrText>
+        <w:instrText xml:space="preserve"> PAGEREF _Toc240465770 \h </w:instrText>
       </w:r>
       <w:r>
         <w:rPr>
@@ -1344,7 +1344,7 @@
         <w:rPr>
           <w:noProof/>
         </w:rPr>
-        <w:t>35</w:t>
+        <w:t>36</w:t>
       </w:r>
       <w:r>
         <w:rPr>
@@ -1388,7 +1388,7 @@
         <w:rPr>
           <w:noProof/>
         </w:rPr>
-        <w:instrText xml:space="preserve"> PAGEREF _Toc240463907 \h </w:instrText>
+        <w:instrText xml:space="preserve"> PAGEREF _Toc240465771 \h </w:instrText>
       </w:r>
       <w:r>
         <w:rPr>
@@ -1405,7 +1405,7 @@
         <w:rPr>
           <w:noProof/>
         </w:rPr>
-        <w:t>36</w:t>
+        <w:t>37</w:t>
       </w:r>
       <w:r>
         <w:rPr>
@@ -1449,7 +1449,7 @@
         <w:rPr>
           <w:noProof/>
         </w:rPr>
-        <w:instrText xml:space="preserve"> PAGEREF _Toc240463908 \h </w:instrText>
+        <w:instrText xml:space="preserve"> PAGEREF _Toc240465772 \h </w:instrText>
       </w:r>
       <w:r>
         <w:rPr>
@@ -1466,7 +1466,7 @@
         <w:rPr>
           <w:noProof/>
         </w:rPr>
-        <w:t>37</w:t>
+        <w:t>38</w:t>
       </w:r>
       <w:r>
         <w:rPr>
@@ -1510,7 +1510,7 @@
         <w:rPr>
           <w:noProof/>
         </w:rPr>
-        <w:instrText xml:space="preserve"> PAGEREF _Toc240463909 \h </w:instrText>
+        <w:instrText xml:space="preserve"> PAGEREF _Toc240465773 \h </w:instrText>
       </w:r>
       <w:r>
         <w:rPr>
@@ -1527,7 +1527,7 @@
         <w:rPr>
           <w:noProof/>
         </w:rPr>
-        <w:t>38</w:t>
+        <w:t>39</w:t>
       </w:r>
       <w:r>
         <w:rPr>
@@ -1571,7 +1571,7 @@
         <w:rPr>
           <w:noProof/>
         </w:rPr>
-        <w:instrText xml:space="preserve"> PAGEREF _Toc240463910 \h </w:instrText>
+        <w:instrText xml:space="preserve"> PAGEREF _Toc240465774 \h </w:instrText>
       </w:r>
       <w:r>
         <w:rPr>
@@ -1588,7 +1588,7 @@
         <w:rPr>
           <w:noProof/>
         </w:rPr>
-        <w:t>39</w:t>
+        <w:t>40</w:t>
       </w:r>
       <w:r>
         <w:rPr>
@@ -1632,7 +1632,7 @@
         <w:rPr>
           <w:noProof/>
         </w:rPr>
-        <w:instrText xml:space="preserve"> PAGEREF _Toc240463911 \h </w:instrText>
+        <w:instrText xml:space="preserve"> PAGEREF _Toc240465775 \h </w:instrText>
       </w:r>
       <w:r>
         <w:rPr>
@@ -1649,7 +1649,7 @@
         <w:rPr>
           <w:noProof/>
         </w:rPr>
-        <w:t>39</w:t>
+        <w:t>40</w:t>
       </w:r>
       <w:r>
         <w:rPr>
@@ -1693,7 +1693,7 @@
         <w:rPr>
           <w:noProof/>
         </w:rPr>
-        <w:instrText xml:space="preserve"> PAGEREF _Toc240463912 \h </w:instrText>
+        <w:instrText xml:space="preserve"> PAGEREF _Toc240465776 \h </w:instrText>
       </w:r>
       <w:r>
         <w:rPr>
@@ -1710,7 +1710,7 @@
         <w:rPr>
           <w:noProof/>
         </w:rPr>
-        <w:t>42</w:t>
+        <w:t>43</w:t>
       </w:r>
       <w:r>
         <w:rPr>
@@ -1754,7 +1754,7 @@
         <w:rPr>
           <w:noProof/>
         </w:rPr>
-        <w:instrText xml:space="preserve"> PAGEREF _Toc240463913 \h </w:instrText>
+        <w:instrText xml:space="preserve"> PAGEREF _Toc240465777 \h </w:instrText>
       </w:r>
       <w:r>
         <w:rPr>
@@ -1771,7 +1771,7 @@
         <w:rPr>
           <w:noProof/>
         </w:rPr>
-        <w:t>44</w:t>
+        <w:t>45</w:t>
       </w:r>
       <w:r>
         <w:rPr>
@@ -1816,7 +1816,7 @@
         <w:rPr>
           <w:noProof/>
         </w:rPr>
-        <w:instrText xml:space="preserve"> PAGEREF _Toc240463914 \h </w:instrText>
+        <w:instrText xml:space="preserve"> PAGEREF _Toc240465778 \h </w:instrText>
       </w:r>
       <w:r>
         <w:rPr>
@@ -1833,7 +1833,7 @@
         <w:rPr>
           <w:noProof/>
         </w:rPr>
-        <w:t>49</w:t>
+        <w:t>50</w:t>
       </w:r>
       <w:r>
         <w:rPr>
@@ -1877,7 +1877,7 @@
         <w:rPr>
           <w:noProof/>
         </w:rPr>
-        <w:instrText xml:space="preserve"> PAGEREF _Toc240463915 \h </w:instrText>
+        <w:instrText xml:space="preserve"> PAGEREF _Toc240465779 \h </w:instrText>
       </w:r>
       <w:r>
         <w:rPr>
@@ -1894,7 +1894,7 @@
         <w:rPr>
           <w:noProof/>
         </w:rPr>
-        <w:t>53</w:t>
+        <w:t>54</w:t>
       </w:r>
       <w:r>
         <w:rPr>
@@ -1938,7 +1938,7 @@
         <w:rPr>
           <w:noProof/>
         </w:rPr>
-        <w:instrText xml:space="preserve"> PAGEREF _Toc240463916 \h </w:instrText>
+        <w:instrText xml:space="preserve"> PAGEREF _Toc240465780 \h </w:instrText>
       </w:r>
       <w:r>
         <w:rPr>
@@ -1955,7 +1955,7 @@
         <w:rPr>
           <w:noProof/>
         </w:rPr>
-        <w:t>57</w:t>
+        <w:t>58</w:t>
       </w:r>
       <w:r>
         <w:rPr>
@@ -1999,7 +1999,7 @@
         <w:rPr>
           <w:noProof/>
         </w:rPr>
-        <w:instrText xml:space="preserve"> PAGEREF _Toc240463917 \h </w:instrText>
+        <w:instrText xml:space="preserve"> PAGEREF _Toc240465781 \h </w:instrText>
       </w:r>
       <w:r>
         <w:rPr>
@@ -2016,7 +2016,7 @@
         <w:rPr>
           <w:noProof/>
         </w:rPr>
-        <w:t>59</w:t>
+        <w:t>60</w:t>
       </w:r>
       <w:r>
         <w:rPr>
@@ -2060,7 +2060,7 @@
         <w:rPr>
           <w:noProof/>
         </w:rPr>
-        <w:instrText xml:space="preserve"> PAGEREF _Toc240463918 \h </w:instrText>
+        <w:instrText xml:space="preserve"> PAGEREF _Toc240465782 \h </w:instrText>
       </w:r>
       <w:r>
         <w:rPr>
@@ -2077,7 +2077,7 @@
         <w:rPr>
           <w:noProof/>
         </w:rPr>
-        <w:t>61</w:t>
+        <w:t>62</w:t>
       </w:r>
       <w:r>
         <w:rPr>
@@ -2121,7 +2121,7 @@
         <w:rPr>
           <w:noProof/>
         </w:rPr>
-        <w:instrText xml:space="preserve"> PAGEREF _Toc240463919 \h </w:instrText>
+        <w:instrText xml:space="preserve"> PAGEREF _Toc240465783 \h </w:instrText>
       </w:r>
       <w:r>
         <w:rPr>
@@ -2138,7 +2138,7 @@
         <w:rPr>
           <w:noProof/>
         </w:rPr>
-        <w:t>64</w:t>
+        <w:t>65</w:t>
       </w:r>
       <w:r>
         <w:rPr>
@@ -2182,7 +2182,7 @@
         <w:rPr>
           <w:noProof/>
         </w:rPr>
-        <w:instrText xml:space="preserve"> PAGEREF _Toc240463920 \h </w:instrText>
+        <w:instrText xml:space="preserve"> PAGEREF _Toc240465784 \h </w:instrText>
       </w:r>
       <w:r>
         <w:rPr>
@@ -2199,7 +2199,7 @@
         <w:rPr>
           <w:noProof/>
         </w:rPr>
-        <w:t>66</w:t>
+        <w:t>67</w:t>
       </w:r>
       <w:r>
         <w:rPr>
@@ -2243,7 +2243,7 @@
         <w:rPr>
           <w:noProof/>
         </w:rPr>
-        <w:instrText xml:space="preserve"> PAGEREF _Toc240463921 \h </w:instrText>
+        <w:instrText xml:space="preserve"> PAGEREF _Toc240465785 \h </w:instrText>
       </w:r>
       <w:r>
         <w:rPr>
@@ -2260,7 +2260,7 @@
         <w:rPr>
           <w:noProof/>
         </w:rPr>
-        <w:t>68</w:t>
+        <w:t>69</w:t>
       </w:r>
       <w:r>
         <w:rPr>
@@ -2304,7 +2304,7 @@
         <w:rPr>
           <w:noProof/>
         </w:rPr>
-        <w:instrText xml:space="preserve"> PAGEREF _Toc240463922 \h </w:instrText>
+        <w:instrText xml:space="preserve"> PAGEREF _Toc240465786 \h </w:instrText>
       </w:r>
       <w:r>
         <w:rPr>
@@ -2321,7 +2321,7 @@
         <w:rPr>
           <w:noProof/>
         </w:rPr>
-        <w:t>68</w:t>
+        <w:t>69</w:t>
       </w:r>
       <w:r>
         <w:rPr>
@@ -2365,7 +2365,7 @@
         <w:rPr>
           <w:noProof/>
         </w:rPr>
-        <w:instrText xml:space="preserve"> PAGEREF _Toc240463923 \h </w:instrText>
+        <w:instrText xml:space="preserve"> PAGEREF _Toc240465787 \h </w:instrText>
       </w:r>
       <w:r>
         <w:rPr>
@@ -2382,7 +2382,7 @@
         <w:rPr>
           <w:noProof/>
         </w:rPr>
-        <w:t>75</w:t>
+        <w:t>76</w:t>
       </w:r>
       <w:r>
         <w:rPr>
@@ -2426,7 +2426,7 @@
         <w:rPr>
           <w:noProof/>
         </w:rPr>
-        <w:instrText xml:space="preserve"> PAGEREF _Toc240463924 \h </w:instrText>
+        <w:instrText xml:space="preserve"> PAGEREF _Toc240465788 \h </w:instrText>
       </w:r>
       <w:r>
         <w:rPr>
@@ -2443,7 +2443,7 @@
         <w:rPr>
           <w:noProof/>
         </w:rPr>
-        <w:t>81</w:t>
+        <w:t>82</w:t>
       </w:r>
       <w:r>
         <w:rPr>
@@ -2487,7 +2487,7 @@
         <w:rPr>
           <w:noProof/>
         </w:rPr>
-        <w:instrText xml:space="preserve"> PAGEREF _Toc240463925 \h </w:instrText>
+        <w:instrText xml:space="preserve"> PAGEREF _Toc240465789 \h </w:instrText>
       </w:r>
       <w:r>
         <w:rPr>
@@ -2504,7 +2504,7 @@
         <w:rPr>
           <w:noProof/>
         </w:rPr>
-        <w:t>81</w:t>
+        <w:t>82</w:t>
       </w:r>
       <w:r>
         <w:rPr>
@@ -2548,7 +2548,7 @@
         <w:rPr>
           <w:noProof/>
         </w:rPr>
-        <w:instrText xml:space="preserve"> PAGEREF _Toc240463926 \h </w:instrText>
+        <w:instrText xml:space="preserve"> PAGEREF _Toc240465790 \h </w:instrText>
       </w:r>
       <w:r>
         <w:rPr>
@@ -2565,7 +2565,7 @@
         <w:rPr>
           <w:noProof/>
         </w:rPr>
-        <w:t>82</w:t>
+        <w:t>83</w:t>
       </w:r>
       <w:r>
         <w:rPr>
@@ -2609,7 +2609,7 @@
         <w:rPr>
           <w:noProof/>
         </w:rPr>
-        <w:instrText xml:space="preserve"> PAGEREF _Toc240463927 \h </w:instrText>
+        <w:instrText xml:space="preserve"> PAGEREF _Toc240465791 \h </w:instrText>
       </w:r>
       <w:r>
         <w:rPr>
@@ -2626,7 +2626,7 @@
         <w:rPr>
           <w:noProof/>
         </w:rPr>
-        <w:t>82</w:t>
+        <w:t>83</w:t>
       </w:r>
       <w:r>
         <w:rPr>
@@ -2670,7 +2670,7 @@
         <w:rPr>
           <w:noProof/>
         </w:rPr>
-        <w:instrText xml:space="preserve"> PAGEREF _Toc240463928 \h </w:instrText>
+        <w:instrText xml:space="preserve"> PAGEREF _Toc240465792 \h </w:instrText>
       </w:r>
       <w:r>
         <w:rPr>
@@ -2687,7 +2687,7 @@
         <w:rPr>
           <w:noProof/>
         </w:rPr>
-        <w:t>85</w:t>
+        <w:t>86</w:t>
       </w:r>
       <w:r>
         <w:rPr>
@@ -2731,7 +2731,7 @@
         <w:rPr>
           <w:noProof/>
         </w:rPr>
-        <w:instrText xml:space="preserve"> PAGEREF _Toc240463929 \h </w:instrText>
+        <w:instrText xml:space="preserve"> PAGEREF _Toc240465793 \h </w:instrText>
       </w:r>
       <w:r>
         <w:rPr>
@@ -2748,7 +2748,7 @@
         <w:rPr>
           <w:noProof/>
         </w:rPr>
-        <w:t>85</w:t>
+        <w:t>86</w:t>
       </w:r>
       <w:r>
         <w:rPr>
@@ -2792,7 +2792,7 @@
         <w:rPr>
           <w:noProof/>
         </w:rPr>
-        <w:instrText xml:space="preserve"> PAGEREF _Toc240463930 \h </w:instrText>
+        <w:instrText xml:space="preserve"> PAGEREF _Toc240465794 \h </w:instrText>
       </w:r>
       <w:r>
         <w:rPr>
@@ -2809,7 +2809,7 @@
         <w:rPr>
           <w:noProof/>
         </w:rPr>
-        <w:t>87</w:t>
+        <w:t>88</w:t>
       </w:r>
       <w:r>
         <w:rPr>
@@ -2853,7 +2853,7 @@
         <w:rPr>
           <w:noProof/>
         </w:rPr>
-        <w:instrText xml:space="preserve"> PAGEREF _Toc240463931 \h </w:instrText>
+        <w:instrText xml:space="preserve"> PAGEREF _Toc240465795 \h </w:instrText>
       </w:r>
       <w:r>
         <w:rPr>
@@ -2870,7 +2870,7 @@
         <w:rPr>
           <w:noProof/>
         </w:rPr>
-        <w:t>88</w:t>
+        <w:t>89</w:t>
       </w:r>
       <w:r>
         <w:rPr>
@@ -2914,7 +2914,7 @@
         <w:rPr>
           <w:noProof/>
         </w:rPr>
-        <w:instrText xml:space="preserve"> PAGEREF _Toc240463932 \h </w:instrText>
+        <w:instrText xml:space="preserve"> PAGEREF _Toc240465796 \h </w:instrText>
       </w:r>
       <w:r>
         <w:rPr>
@@ -2931,7 +2931,7 @@
         <w:rPr>
           <w:noProof/>
         </w:rPr>
-        <w:t>90</w:t>
+        <w:t>91</w:t>
       </w:r>
       <w:r>
         <w:rPr>
@@ -2975,7 +2975,7 @@
         <w:rPr>
           <w:noProof/>
         </w:rPr>
-        <w:instrText xml:space="preserve"> PAGEREF _Toc240463933 \h </w:instrText>
+        <w:instrText xml:space="preserve"> PAGEREF _Toc240465797 \h </w:instrText>
       </w:r>
       <w:r>
         <w:rPr>
@@ -2992,7 +2992,7 @@
         <w:rPr>
           <w:noProof/>
         </w:rPr>
-        <w:t>93</w:t>
+        <w:t>94</w:t>
       </w:r>
       <w:r>
         <w:rPr>
@@ -3036,7 +3036,7 @@
         <w:rPr>
           <w:noProof/>
         </w:rPr>
-        <w:instrText xml:space="preserve"> PAGEREF _Toc240463934 \h </w:instrText>
+        <w:instrText xml:space="preserve"> PAGEREF _Toc240465798 \h </w:instrText>
       </w:r>
       <w:r>
         <w:rPr>
@@ -3053,7 +3053,7 @@
         <w:rPr>
           <w:noProof/>
         </w:rPr>
-        <w:t>96</w:t>
+        <w:t>97</w:t>
       </w:r>
       <w:r>
         <w:rPr>
@@ -3097,7 +3097,7 @@
         <w:rPr>
           <w:noProof/>
         </w:rPr>
-        <w:instrText xml:space="preserve"> PAGEREF _Toc240463935 \h </w:instrText>
+        <w:instrText xml:space="preserve"> PAGEREF _Toc240465799 \h </w:instrText>
       </w:r>
       <w:r>
         <w:rPr>
@@ -3114,7 +3114,7 @@
         <w:rPr>
           <w:noProof/>
         </w:rPr>
-        <w:t>97</w:t>
+        <w:t>98</w:t>
       </w:r>
       <w:r>
         <w:rPr>
@@ -3158,7 +3158,7 @@
         <w:rPr>
           <w:noProof/>
         </w:rPr>
-        <w:instrText xml:space="preserve"> PAGEREF _Toc240463936 \h </w:instrText>
+        <w:instrText xml:space="preserve"> PAGEREF _Toc240465800 \h </w:instrText>
       </w:r>
       <w:r>
         <w:rPr>
@@ -3175,7 +3175,7 @@
         <w:rPr>
           <w:noProof/>
         </w:rPr>
-        <w:t>98</w:t>
+        <w:t>99</w:t>
       </w:r>
       <w:r>
         <w:rPr>
@@ -3219,7 +3219,7 @@
         <w:rPr>
           <w:noProof/>
         </w:rPr>
-        <w:instrText xml:space="preserve"> PAGEREF _Toc240463937 \h </w:instrText>
+        <w:instrText xml:space="preserve"> PAGEREF _Toc240465801 \h </w:instrText>
       </w:r>
       <w:r>
         <w:rPr>
@@ -3236,7 +3236,7 @@
         <w:rPr>
           <w:noProof/>
         </w:rPr>
-        <w:t>100</w:t>
+        <w:t>101</w:t>
       </w:r>
       <w:r>
         <w:rPr>
@@ -3280,7 +3280,7 @@
         <w:rPr>
           <w:noProof/>
         </w:rPr>
-        <w:instrText xml:space="preserve"> PAGEREF _Toc240463938 \h </w:instrText>
+        <w:instrText xml:space="preserve"> PAGEREF _Toc240465802 \h </w:instrText>
       </w:r>
       <w:r>
         <w:rPr>
@@ -3297,7 +3297,7 @@
         <w:rPr>
           <w:noProof/>
         </w:rPr>
-        <w:t>102</w:t>
+        <w:t>103</w:t>
       </w:r>
       <w:r>
         <w:rPr>
@@ -3341,7 +3341,7 @@
         <w:rPr>
           <w:noProof/>
         </w:rPr>
-        <w:instrText xml:space="preserve"> PAGEREF _Toc240463939 \h </w:instrText>
+        <w:instrText xml:space="preserve"> PAGEREF _Toc240465803 \h </w:instrText>
       </w:r>
       <w:r>
         <w:rPr>
@@ -3358,7 +3358,7 @@
         <w:rPr>
           <w:noProof/>
         </w:rPr>
-        <w:t>102</w:t>
+        <w:t>103</w:t>
       </w:r>
       <w:r>
         <w:rPr>
@@ -3402,7 +3402,7 @@
         <w:rPr>
           <w:noProof/>
         </w:rPr>
-        <w:instrText xml:space="preserve"> PAGEREF _Toc240463940 \h </w:instrText>
+        <w:instrText xml:space="preserve"> PAGEREF _Toc240465804 \h </w:instrText>
       </w:r>
       <w:r>
         <w:rPr>
@@ -3419,7 +3419,7 @@
         <w:rPr>
           <w:noProof/>
         </w:rPr>
-        <w:t>104</w:t>
+        <w:t>105</w:t>
       </w:r>
       <w:r>
         <w:rPr>
@@ -3464,7 +3464,7 @@
         <w:rPr>
           <w:noProof/>
         </w:rPr>
-        <w:instrText xml:space="preserve"> PAGEREF _Toc240463941 \h </w:instrText>
+        <w:instrText xml:space="preserve"> PAGEREF _Toc240465805 \h </w:instrText>
       </w:r>
       <w:r>
         <w:rPr>
@@ -3481,7 +3481,7 @@
         <w:rPr>
           <w:noProof/>
         </w:rPr>
-        <w:t>107</w:t>
+        <w:t>108</w:t>
       </w:r>
       <w:r>
         <w:rPr>
@@ -3525,7 +3525,7 @@
         <w:rPr>
           <w:noProof/>
         </w:rPr>
-        <w:instrText xml:space="preserve"> PAGEREF _Toc240463942 \h </w:instrText>
+        <w:instrText xml:space="preserve"> PAGEREF _Toc240465806 \h </w:instrText>
       </w:r>
       <w:r>
         <w:rPr>
@@ -3542,7 +3542,7 @@
         <w:rPr>
           <w:noProof/>
         </w:rPr>
-        <w:t>108</w:t>
+        <w:t>109</w:t>
       </w:r>
       <w:r>
         <w:rPr>
@@ -3601,7 +3601,7 @@
           <w:sz w:val="34"/>
         </w:rPr>
       </w:pPr>
-      <w:bookmarkStart w:id="0" w:name="_Toc240463888"/>
+      <w:bookmarkStart w:id="0" w:name="_Toc240465752"/>
       <w:r>
         <w:rPr>
           <w:rFonts w:ascii="Montserrat" w:hAnsi="Montserrat"/>
@@ -3625,7 +3625,7 @@
           <w:sz w:val="27"/>
         </w:rPr>
       </w:pPr>
-      <w:bookmarkStart w:id="1" w:name="_Toc240463889"/>
+      <w:bookmarkStart w:id="1" w:name="_Toc240465753"/>
       <w:r>
         <w:rPr>
           <w:rFonts w:ascii="Montserrat" w:hAnsi="Montserrat"/>
@@ -5300,6 +5300,24 @@
           <w:color w:val="1A1A1A"/>
           <w:sz w:val="22"/>
         </w:rPr>
+        <w:t>Esta e a versao 2.84 do manual. Em relacao a versao 2.83 (16/09/2026), o e-mail de aviso automatico de prazo (secao 6.4.3) passou a trazer um link Abrir o Meu Painel, para quem recebe o aviso ja ir direto tratar o item, em vez de precisar abrir o sistema e navegar ate a tela por conta propria.</w:t>
+      </w:r>
+    </w:p>
+    <w:p>
+      <w:pPr>
+        <w:spacing w:line="280" w:lineRule="auto"/>
+        <w:rPr>
+          <w:rFonts w:ascii="Montserrat" w:hAnsi="Montserrat"/>
+          <w:color w:val="1A1A1A"/>
+          <w:sz w:val="22"/>
+        </w:rPr>
+      </w:pPr>
+      <w:r>
+        <w:rPr>
+          <w:rFonts w:ascii="Montserrat" w:hAnsi="Montserrat"/>
+          <w:color w:val="1A1A1A"/>
+          <w:sz w:val="22"/>
+        </w:rPr>
         <w:t>O manual nao substitui as Diretrizes para a Gestao de Projetos da UNIALFA (documento institucional que define o framework D01 a D07) nem o documento Regras de Acesso e Permissoes (que detalha cada regra de controle de acesso); ele e o guia operacional de como usar cada ferramenta na pratica.</w:t>
       </w:r>
     </w:p>
@@ -5314,7 +5332,7 @@
           <w:sz w:val="27"/>
         </w:rPr>
       </w:pPr>
-      <w:bookmarkStart w:id="2" w:name="_Toc240463890"/>
+      <w:bookmarkStart w:id="2" w:name="_Toc240465754"/>
       <w:r>
         <w:rPr>
           <w:rFonts w:ascii="Montserrat" w:hAnsi="Montserrat"/>
@@ -5322,6 +5340,7 @@
           <w:color w:val="B91D2E"/>
           <w:sz w:val="27"/>
         </w:rPr>
+        <w:lastRenderedPageBreak/>
         <w:t>1.2 Visao geral da ferramenta</w:t>
       </w:r>
       <w:bookmarkEnd w:id="2"/>
@@ -5389,7 +5408,6 @@
           <w:color w:val="1A1A1A"/>
           <w:sz w:val="22"/>
         </w:rPr>
-        <w:lastRenderedPageBreak/>
         <w:t>1 ferramenta de apoio a decisao, o Validador de Projetos, que nao gera registros de artefato mas ajuda a avaliar projetos.</w:t>
       </w:r>
     </w:p>
@@ -5510,17 +5528,18 @@
         <w:rPr>
           <w:noProof/>
         </w:rPr>
+        <w:lastRenderedPageBreak/>
         <w:drawing>
-          <wp:inline distT="0" distB="0" distL="0" distR="0" wp14:anchorId="0B18A505" wp14:editId="6BE7EDF3">
+          <wp:inline distT="0" distB="0" distL="0" distR="0" wp14:anchorId="3B2F0A61" wp14:editId="2CC42831">
             <wp:extent cx="5303520" cy="4792851"/>
             <wp:effectExtent l="19050" t="19050" r="11430" b="27305"/>
-            <wp:docPr id="270745432" name="Imagem 1"/>
+            <wp:docPr id="1609186178" name="Imagem 1"/>
             <wp:cNvGraphicFramePr/>
             <a:graphic xmlns:a="http://schemas.openxmlformats.org/drawingml/2006/main">
               <a:graphicData uri="http://schemas.openxmlformats.org/drawingml/2006/picture">
                 <pic:pic xmlns:pic="http://schemas.openxmlformats.org/drawingml/2006/picture">
                   <pic:nvPicPr>
-                    <pic:cNvPr id="270745432" name=""/>
+                    <pic:cNvPr id="1609186178" name=""/>
                     <pic:cNvPicPr/>
                   </pic:nvPicPr>
                   <pic:blipFill>
@@ -5574,7 +5593,6 @@
           <w:color w:val="6A6A70"/>
           <w:sz w:val="19"/>
         </w:rPr>
-        <w:lastRenderedPageBreak/>
         <w:t>Mapa de diretrizes - pagina inicial. Nao exige login.</w:t>
       </w:r>
     </w:p>
@@ -5589,7 +5607,7 @@
           <w:sz w:val="27"/>
         </w:rPr>
       </w:pPr>
-      <w:bookmarkStart w:id="3" w:name="_Toc240463891"/>
+      <w:bookmarkStart w:id="3" w:name="_Toc240465755"/>
       <w:r>
         <w:rPr>
           <w:rFonts w:ascii="Montserrat" w:hAnsi="Montserrat"/>
@@ -5628,17 +5646,18 @@
         <w:rPr>
           <w:noProof/>
         </w:rPr>
+        <w:lastRenderedPageBreak/>
         <w:drawing>
-          <wp:inline distT="0" distB="0" distL="0" distR="0" wp14:anchorId="64BB38BF" wp14:editId="654D9AA7">
+          <wp:inline distT="0" distB="0" distL="0" distR="0" wp14:anchorId="591C9949" wp14:editId="3FC571C1">
             <wp:extent cx="4206240" cy="3801227"/>
             <wp:effectExtent l="19050" t="19050" r="22860" b="27940"/>
-            <wp:docPr id="207486299" name="Imagem 2"/>
+            <wp:docPr id="1619580238" name="Imagem 2"/>
             <wp:cNvGraphicFramePr/>
             <a:graphic xmlns:a="http://schemas.openxmlformats.org/drawingml/2006/main">
               <a:graphicData uri="http://schemas.openxmlformats.org/drawingml/2006/picture">
                 <pic:pic xmlns:pic="http://schemas.openxmlformats.org/drawingml/2006/picture">
                   <pic:nvPicPr>
-                    <pic:cNvPr id="207486299" name=""/>
+                    <pic:cNvPr id="1619580238" name=""/>
                     <pic:cNvPicPr/>
                   </pic:nvPicPr>
                   <pic:blipFill>
@@ -5811,7 +5830,7 @@
           <w:sz w:val="27"/>
         </w:rPr>
       </w:pPr>
-      <w:bookmarkStart w:id="4" w:name="_Toc240463892"/>
+      <w:bookmarkStart w:id="4" w:name="_Toc240465756"/>
       <w:r>
         <w:rPr>
           <w:rFonts w:ascii="Montserrat" w:hAnsi="Montserrat"/>
@@ -5819,7 +5838,6 @@
           <w:color w:val="B91D2E"/>
           <w:sz w:val="27"/>
         </w:rPr>
-        <w:lastRenderedPageBreak/>
         <w:t>1.4 Como a ferramenta se relaciona com as Diretrizes (D01-D07)</w:t>
       </w:r>
       <w:bookmarkEnd w:id="4"/>
@@ -5894,6 +5912,7 @@
                 <w:color w:val="FFFFFF"/>
                 <w:sz w:val="19"/>
               </w:rPr>
+              <w:lastRenderedPageBreak/>
               <w:t>Passo</w:t>
             </w:r>
           </w:p>
@@ -7050,7 +7069,7 @@
           <w:sz w:val="34"/>
         </w:rPr>
       </w:pPr>
-      <w:bookmarkStart w:id="5" w:name="_Toc240463893"/>
+      <w:bookmarkStart w:id="5" w:name="_Toc240465757"/>
       <w:r>
         <w:rPr>
           <w:rFonts w:ascii="Montserrat" w:hAnsi="Montserrat"/>
@@ -7074,7 +7093,7 @@
           <w:sz w:val="27"/>
         </w:rPr>
       </w:pPr>
-      <w:bookmarkStart w:id="6" w:name="_Toc240463894"/>
+      <w:bookmarkStart w:id="6" w:name="_Toc240465758"/>
       <w:r>
         <w:rPr>
           <w:rFonts w:ascii="Montserrat" w:hAnsi="Montserrat"/>
@@ -7115,7 +7134,7 @@
           <w:sz w:val="27"/>
         </w:rPr>
       </w:pPr>
-      <w:bookmarkStart w:id="7" w:name="_Toc240463895"/>
+      <w:bookmarkStart w:id="7" w:name="_Toc240465759"/>
       <w:r>
         <w:rPr>
           <w:rFonts w:ascii="Montserrat" w:hAnsi="Montserrat"/>
@@ -7234,7 +7253,7 @@
           <w:sz w:val="27"/>
         </w:rPr>
       </w:pPr>
-      <w:bookmarkStart w:id="8" w:name="_Toc240463896"/>
+      <w:bookmarkStart w:id="8" w:name="_Toc240465760"/>
       <w:r>
         <w:rPr>
           <w:rFonts w:ascii="Montserrat" w:hAnsi="Montserrat"/>
@@ -7847,7 +7866,7 @@
           <w:sz w:val="27"/>
         </w:rPr>
       </w:pPr>
-      <w:bookmarkStart w:id="9" w:name="_Toc240463897"/>
+      <w:bookmarkStart w:id="9" w:name="_Toc240465761"/>
       <w:r>
         <w:rPr>
           <w:rFonts w:ascii="Montserrat" w:hAnsi="Montserrat"/>
@@ -7936,16 +7955,16 @@
         </w:rPr>
         <w:lastRenderedPageBreak/>
         <w:drawing>
-          <wp:inline distT="0" distB="0" distL="0" distR="0" wp14:anchorId="28987A16" wp14:editId="24790F42">
+          <wp:inline distT="0" distB="0" distL="0" distR="0" wp14:anchorId="598C6453" wp14:editId="3340DC4B">
             <wp:extent cx="4937760" cy="4462310"/>
             <wp:effectExtent l="19050" t="19050" r="15240" b="14605"/>
-            <wp:docPr id="948832864" name="Imagem 3"/>
+            <wp:docPr id="805402880" name="Imagem 3"/>
             <wp:cNvGraphicFramePr/>
             <a:graphic xmlns:a="http://schemas.openxmlformats.org/drawingml/2006/main">
               <a:graphicData uri="http://schemas.openxmlformats.org/drawingml/2006/picture">
                 <pic:pic xmlns:pic="http://schemas.openxmlformats.org/drawingml/2006/picture">
                   <pic:nvPicPr>
-                    <pic:cNvPr id="948832864" name=""/>
+                    <pic:cNvPr id="805402880" name=""/>
                     <pic:cNvPicPr/>
                   </pic:nvPicPr>
                   <pic:blipFill>
@@ -8013,7 +8032,7 @@
           <w:sz w:val="27"/>
         </w:rPr>
       </w:pPr>
-      <w:bookmarkStart w:id="10" w:name="_Toc240463898"/>
+      <w:bookmarkStart w:id="10" w:name="_Toc240465762"/>
       <w:r>
         <w:rPr>
           <w:rFonts w:ascii="Montserrat" w:hAnsi="Montserrat"/>
@@ -8054,16 +8073,16 @@
         </w:rPr>
         <w:lastRenderedPageBreak/>
         <w:drawing>
-          <wp:inline distT="0" distB="0" distL="0" distR="0" wp14:anchorId="0C75702D" wp14:editId="71357D1F">
+          <wp:inline distT="0" distB="0" distL="0" distR="0" wp14:anchorId="11480311" wp14:editId="7C72DB60">
             <wp:extent cx="5120640" cy="4627581"/>
             <wp:effectExtent l="19050" t="19050" r="22860" b="20955"/>
-            <wp:docPr id="2045838952" name="Imagem 4"/>
+            <wp:docPr id="2067372196" name="Imagem 4"/>
             <wp:cNvGraphicFramePr/>
             <a:graphic xmlns:a="http://schemas.openxmlformats.org/drawingml/2006/main">
               <a:graphicData uri="http://schemas.openxmlformats.org/drawingml/2006/picture">
                 <pic:pic xmlns:pic="http://schemas.openxmlformats.org/drawingml/2006/picture">
                   <pic:nvPicPr>
-                    <pic:cNvPr id="2045838952" name=""/>
+                    <pic:cNvPr id="2067372196" name=""/>
                     <pic:cNvPicPr/>
                   </pic:nvPicPr>
                   <pic:blipFill>
@@ -8246,7 +8265,7 @@
           <w:sz w:val="27"/>
         </w:rPr>
       </w:pPr>
-      <w:bookmarkStart w:id="11" w:name="_Toc240463899"/>
+      <w:bookmarkStart w:id="11" w:name="_Toc240465763"/>
       <w:r>
         <w:rPr>
           <w:rFonts w:ascii="Montserrat" w:hAnsi="Montserrat"/>
@@ -8286,16 +8305,16 @@
           <w:noProof/>
         </w:rPr>
         <w:drawing>
-          <wp:inline distT="0" distB="0" distL="0" distR="0" wp14:anchorId="03C97F6A" wp14:editId="7E7EE614">
+          <wp:inline distT="0" distB="0" distL="0" distR="0" wp14:anchorId="3628E8C8" wp14:editId="3C8119BE">
             <wp:extent cx="4206240" cy="3801227"/>
             <wp:effectExtent l="19050" t="19050" r="22860" b="27940"/>
-            <wp:docPr id="892990237" name="Imagem 5"/>
+            <wp:docPr id="1033434288" name="Imagem 5"/>
             <wp:cNvGraphicFramePr/>
             <a:graphic xmlns:a="http://schemas.openxmlformats.org/drawingml/2006/main">
               <a:graphicData uri="http://schemas.openxmlformats.org/drawingml/2006/picture">
                 <pic:pic xmlns:pic="http://schemas.openxmlformats.org/drawingml/2006/picture">
                   <pic:nvPicPr>
-                    <pic:cNvPr id="892990237" name=""/>
+                    <pic:cNvPr id="1033434288" name=""/>
                     <pic:cNvPicPr/>
                   </pic:nvPicPr>
                   <pic:blipFill>
@@ -8363,16 +8382,16 @@
         </w:rPr>
         <w:lastRenderedPageBreak/>
         <w:drawing>
-          <wp:inline distT="0" distB="0" distL="0" distR="0" wp14:anchorId="5F405BDD" wp14:editId="22E67763">
+          <wp:inline distT="0" distB="0" distL="0" distR="0" wp14:anchorId="5FFDE452" wp14:editId="08EE640E">
             <wp:extent cx="4206240" cy="3801227"/>
             <wp:effectExtent l="19050" t="19050" r="22860" b="27940"/>
-            <wp:docPr id="1867314960" name="Imagem 6"/>
+            <wp:docPr id="1916076851" name="Imagem 6"/>
             <wp:cNvGraphicFramePr/>
             <a:graphic xmlns:a="http://schemas.openxmlformats.org/drawingml/2006/main">
               <a:graphicData uri="http://schemas.openxmlformats.org/drawingml/2006/picture">
                 <pic:pic xmlns:pic="http://schemas.openxmlformats.org/drawingml/2006/picture">
                   <pic:nvPicPr>
-                    <pic:cNvPr id="1867314960" name=""/>
+                    <pic:cNvPr id="1916076851" name=""/>
                     <pic:cNvPicPr/>
                   </pic:nvPicPr>
                   <pic:blipFill>
@@ -8488,7 +8507,7 @@
           <w:sz w:val="27"/>
         </w:rPr>
       </w:pPr>
-      <w:bookmarkStart w:id="12" w:name="_Toc240463900"/>
+      <w:bookmarkStart w:id="12" w:name="_Toc240465764"/>
       <w:r>
         <w:rPr>
           <w:rFonts w:ascii="Montserrat" w:hAnsi="Montserrat"/>
@@ -8556,7 +8575,7 @@
           <w:sz w:val="27"/>
         </w:rPr>
       </w:pPr>
-      <w:bookmarkStart w:id="13" w:name="_Toc240463901"/>
+      <w:bookmarkStart w:id="13" w:name="_Toc240465765"/>
       <w:r>
         <w:rPr>
           <w:rFonts w:ascii="Montserrat" w:hAnsi="Montserrat"/>
@@ -8715,8 +8734,14 @@
         </w:numPr>
         <w:spacing w:after="80" w:line="260" w:lineRule="auto"/>
         <w:ind w:left="700"/>
-      </w:pPr>
-      <w:r>
+        <w:rPr>
+          <w:color w:val="1A1A1A"/>
+        </w:rPr>
+      </w:pPr>
+      <w:r>
+        <w:rPr>
+          <w:color w:val="1A1A1A"/>
+        </w:rPr>
         <w:t>TEP: ao registrar um novo Termo de Encerramento.</w:t>
       </w:r>
     </w:p>
@@ -8773,7 +8798,7 @@
           <w:sz w:val="27"/>
         </w:rPr>
       </w:pPr>
-      <w:bookmarkStart w:id="14" w:name="_Toc240463902"/>
+      <w:bookmarkStart w:id="14" w:name="_Toc240465766"/>
       <w:r>
         <w:rPr>
           <w:rFonts w:ascii="Montserrat" w:hAnsi="Montserrat"/>
@@ -8932,7 +8957,7 @@
           <w:sz w:val="27"/>
         </w:rPr>
       </w:pPr>
-      <w:bookmarkStart w:id="15" w:name="_Toc240463903"/>
+      <w:bookmarkStart w:id="15" w:name="_Toc240465767"/>
       <w:r>
         <w:rPr>
           <w:rFonts w:ascii="Montserrat" w:hAnsi="Montserrat"/>
@@ -9124,7 +9149,7 @@
           <w:sz w:val="27"/>
         </w:rPr>
       </w:pPr>
-      <w:bookmarkStart w:id="16" w:name="_Toc240463904"/>
+      <w:bookmarkStart w:id="16" w:name="_Toc240465768"/>
       <w:r>
         <w:rPr>
           <w:rFonts w:ascii="Montserrat" w:hAnsi="Montserrat"/>
@@ -9252,7 +9277,7 @@
           <w:sz w:val="27"/>
         </w:rPr>
       </w:pPr>
-      <w:bookmarkStart w:id="17" w:name="_Toc240463905"/>
+      <w:bookmarkStart w:id="17" w:name="_Toc240465769"/>
       <w:r>
         <w:rPr>
           <w:rFonts w:ascii="Montserrat" w:hAnsi="Montserrat"/>
@@ -9582,7 +9607,7 @@
           <w:sz w:val="27"/>
         </w:rPr>
       </w:pPr>
-      <w:bookmarkStart w:id="18" w:name="_Toc240463906"/>
+      <w:bookmarkStart w:id="18" w:name="_Toc240465770"/>
       <w:r>
         <w:rPr>
           <w:rFonts w:ascii="Montserrat" w:hAnsi="Montserrat"/>
@@ -9719,7 +9744,7 @@
           <w:sz w:val="27"/>
         </w:rPr>
       </w:pPr>
-      <w:bookmarkStart w:id="19" w:name="_Toc240463907"/>
+      <w:bookmarkStart w:id="19" w:name="_Toc240465771"/>
       <w:r>
         <w:rPr>
           <w:rFonts w:ascii="Montserrat" w:hAnsi="Montserrat"/>
@@ -9998,7 +10023,7 @@
           <w:sz w:val="27"/>
         </w:rPr>
       </w:pPr>
-      <w:bookmarkStart w:id="20" w:name="_Toc240463908"/>
+      <w:bookmarkStart w:id="20" w:name="_Toc240465772"/>
       <w:r>
         <w:rPr>
           <w:rFonts w:ascii="Montserrat" w:hAnsi="Montserrat"/>
@@ -10175,7 +10200,7 @@
           <w:sz w:val="27"/>
         </w:rPr>
       </w:pPr>
-      <w:bookmarkStart w:id="21" w:name="_Toc240463909"/>
+      <w:bookmarkStart w:id="21" w:name="_Toc240465773"/>
       <w:r>
         <w:rPr>
           <w:rFonts w:ascii="Montserrat" w:hAnsi="Montserrat"/>
@@ -10289,7 +10314,7 @@
           <w:sz w:val="34"/>
         </w:rPr>
       </w:pPr>
-      <w:bookmarkStart w:id="22" w:name="_Toc240463910"/>
+      <w:bookmarkStart w:id="22" w:name="_Toc240465774"/>
       <w:r>
         <w:rPr>
           <w:rFonts w:ascii="Montserrat" w:hAnsi="Montserrat"/>
@@ -10331,7 +10356,7 @@
           <w:sz w:val="27"/>
         </w:rPr>
       </w:pPr>
-      <w:bookmarkStart w:id="23" w:name="_Toc240463911"/>
+      <w:bookmarkStart w:id="23" w:name="_Toc240465775"/>
       <w:r>
         <w:rPr>
           <w:rFonts w:ascii="Montserrat" w:hAnsi="Montserrat"/>
@@ -11411,16 +11436,16 @@
         </w:rPr>
         <w:lastRenderedPageBreak/>
         <w:drawing>
-          <wp:inline distT="0" distB="0" distL="0" distR="0" wp14:anchorId="1AD81AD8" wp14:editId="57467434">
+          <wp:inline distT="0" distB="0" distL="0" distR="0" wp14:anchorId="6F2E45A9" wp14:editId="4F4FEE6F">
             <wp:extent cx="5120640" cy="4627581"/>
             <wp:effectExtent l="19050" t="19050" r="22860" b="20955"/>
-            <wp:docPr id="1869191400" name="Imagem 7"/>
+            <wp:docPr id="1707357492" name="Imagem 7"/>
             <wp:cNvGraphicFramePr/>
             <a:graphic xmlns:a="http://schemas.openxmlformats.org/drawingml/2006/main">
               <a:graphicData uri="http://schemas.openxmlformats.org/drawingml/2006/picture">
                 <pic:pic xmlns:pic="http://schemas.openxmlformats.org/drawingml/2006/picture">
                   <pic:nvPicPr>
-                    <pic:cNvPr id="1869191400" name=""/>
+                    <pic:cNvPr id="1707357492" name=""/>
                     <pic:cNvPicPr/>
                   </pic:nvPicPr>
                   <pic:blipFill>
@@ -11488,16 +11513,16 @@
         </w:rPr>
         <w:lastRenderedPageBreak/>
         <w:drawing>
-          <wp:inline distT="0" distB="0" distL="0" distR="0" wp14:anchorId="1FED87E9" wp14:editId="4F39CF58">
+          <wp:inline distT="0" distB="0" distL="0" distR="0" wp14:anchorId="04B40157" wp14:editId="0C37CA5C">
             <wp:extent cx="5120640" cy="4627581"/>
             <wp:effectExtent l="19050" t="19050" r="22860" b="20955"/>
-            <wp:docPr id="948303947" name="Imagem 8"/>
+            <wp:docPr id="1219630775" name="Imagem 8"/>
             <wp:cNvGraphicFramePr/>
             <a:graphic xmlns:a="http://schemas.openxmlformats.org/drawingml/2006/main">
               <a:graphicData uri="http://schemas.openxmlformats.org/drawingml/2006/picture">
                 <pic:pic xmlns:pic="http://schemas.openxmlformats.org/drawingml/2006/picture">
                   <pic:nvPicPr>
-                    <pic:cNvPr id="948303947" name=""/>
+                    <pic:cNvPr id="1219630775" name=""/>
                     <pic:cNvPicPr/>
                   </pic:nvPicPr>
                   <pic:blipFill>
@@ -11705,7 +11730,7 @@
           <w:sz w:val="27"/>
         </w:rPr>
       </w:pPr>
-      <w:bookmarkStart w:id="24" w:name="_Toc240463912"/>
+      <w:bookmarkStart w:id="24" w:name="_Toc240465776"/>
       <w:r>
         <w:rPr>
           <w:rFonts w:ascii="Montserrat" w:hAnsi="Montserrat"/>
@@ -12630,16 +12655,16 @@
           <w:noProof/>
         </w:rPr>
         <w:drawing>
-          <wp:inline distT="0" distB="0" distL="0" distR="0" wp14:anchorId="30A621EE" wp14:editId="66F2103E">
+          <wp:inline distT="0" distB="0" distL="0" distR="0" wp14:anchorId="24030871" wp14:editId="3F6CB173">
             <wp:extent cx="5120640" cy="4627581"/>
             <wp:effectExtent l="19050" t="19050" r="22860" b="20955"/>
-            <wp:docPr id="1072344102" name="Imagem 9"/>
+            <wp:docPr id="1842527425" name="Imagem 9"/>
             <wp:cNvGraphicFramePr/>
             <a:graphic xmlns:a="http://schemas.openxmlformats.org/drawingml/2006/main">
               <a:graphicData uri="http://schemas.openxmlformats.org/drawingml/2006/picture">
                 <pic:pic xmlns:pic="http://schemas.openxmlformats.org/drawingml/2006/picture">
                   <pic:nvPicPr>
-                    <pic:cNvPr id="1072344102" name=""/>
+                    <pic:cNvPr id="1842527425" name=""/>
                     <pic:cNvPicPr/>
                   </pic:nvPicPr>
                   <pic:blipFill>
@@ -12707,16 +12732,16 @@
         </w:rPr>
         <w:lastRenderedPageBreak/>
         <w:drawing>
-          <wp:inline distT="0" distB="0" distL="0" distR="0" wp14:anchorId="4B92182D" wp14:editId="358A1611">
+          <wp:inline distT="0" distB="0" distL="0" distR="0" wp14:anchorId="5F8D6AAC" wp14:editId="13C00648">
             <wp:extent cx="5120640" cy="4627581"/>
             <wp:effectExtent l="19050" t="19050" r="22860" b="20955"/>
-            <wp:docPr id="1717937698" name="Imagem 10"/>
+            <wp:docPr id="731322030" name="Imagem 10"/>
             <wp:cNvGraphicFramePr/>
             <a:graphic xmlns:a="http://schemas.openxmlformats.org/drawingml/2006/main">
               <a:graphicData uri="http://schemas.openxmlformats.org/drawingml/2006/picture">
                 <pic:pic xmlns:pic="http://schemas.openxmlformats.org/drawingml/2006/picture">
                   <pic:nvPicPr>
-                    <pic:cNvPr id="1717937698" name=""/>
+                    <pic:cNvPr id="731322030" name=""/>
                     <pic:cNvPicPr/>
                   </pic:nvPicPr>
                   <pic:blipFill>
@@ -12850,7 +12875,7 @@
           <w:sz w:val="27"/>
         </w:rPr>
       </w:pPr>
-      <w:bookmarkStart w:id="25" w:name="_Toc240463913"/>
+      <w:bookmarkStart w:id="25" w:name="_Toc240465777"/>
       <w:r>
         <w:rPr>
           <w:rFonts w:ascii="Montserrat" w:hAnsi="Montserrat"/>
@@ -13935,16 +13960,16 @@
         </w:rPr>
         <w:lastRenderedPageBreak/>
         <w:drawing>
-          <wp:inline distT="0" distB="0" distL="0" distR="0" wp14:anchorId="2EB905EB" wp14:editId="558B4C0E">
+          <wp:inline distT="0" distB="0" distL="0" distR="0" wp14:anchorId="6A83A180" wp14:editId="315FF08A">
             <wp:extent cx="5120640" cy="3338440"/>
             <wp:effectExtent l="19050" t="19050" r="22860" b="14605"/>
-            <wp:docPr id="1099822171" name="Imagem 11"/>
+            <wp:docPr id="1235063267" name="Imagem 11"/>
             <wp:cNvGraphicFramePr/>
             <a:graphic xmlns:a="http://schemas.openxmlformats.org/drawingml/2006/main">
               <a:graphicData uri="http://schemas.openxmlformats.org/drawingml/2006/picture">
                 <pic:pic xmlns:pic="http://schemas.openxmlformats.org/drawingml/2006/picture">
                   <pic:nvPicPr>
-                    <pic:cNvPr id="1099822171" name=""/>
+                    <pic:cNvPr id="1235063267" name=""/>
                     <pic:cNvPicPr/>
                   </pic:nvPicPr>
                   <pic:blipFill>
@@ -14012,16 +14037,16 @@
         </w:rPr>
         <w:lastRenderedPageBreak/>
         <w:drawing>
-          <wp:inline distT="0" distB="0" distL="0" distR="0" wp14:anchorId="5B615F7A" wp14:editId="134B82A8">
+          <wp:inline distT="0" distB="0" distL="0" distR="0" wp14:anchorId="567950C0" wp14:editId="54B1B155">
             <wp:extent cx="5120640" cy="4627581"/>
             <wp:effectExtent l="19050" t="19050" r="22860" b="20955"/>
-            <wp:docPr id="1889547644" name="Imagem 12"/>
+            <wp:docPr id="1607854673" name="Imagem 12"/>
             <wp:cNvGraphicFramePr/>
             <a:graphic xmlns:a="http://schemas.openxmlformats.org/drawingml/2006/main">
               <a:graphicData uri="http://schemas.openxmlformats.org/drawingml/2006/picture">
                 <pic:pic xmlns:pic="http://schemas.openxmlformats.org/drawingml/2006/picture">
                   <pic:nvPicPr>
-                    <pic:cNvPr id="1889547644" name=""/>
+                    <pic:cNvPr id="1607854673" name=""/>
                     <pic:cNvPicPr/>
                   </pic:nvPicPr>
                   <pic:blipFill>
@@ -14225,7 +14250,7 @@
           <w:sz w:val="27"/>
         </w:rPr>
       </w:pPr>
-      <w:bookmarkStart w:id="26" w:name="_Toc240463914"/>
+      <w:bookmarkStart w:id="26" w:name="_Toc240465778"/>
       <w:r>
         <w:rPr>
           <w:rFonts w:ascii="Montserrat" w:hAnsi="Montserrat"/>
@@ -14786,16 +14811,16 @@
           <w:noProof/>
         </w:rPr>
         <w:drawing>
-          <wp:inline distT="0" distB="0" distL="0" distR="0" wp14:anchorId="5770C5CA" wp14:editId="682F6DB5">
+          <wp:inline distT="0" distB="0" distL="0" distR="0" wp14:anchorId="74A1E8D5" wp14:editId="2771648B">
             <wp:extent cx="5120640" cy="4627581"/>
             <wp:effectExtent l="19050" t="19050" r="22860" b="20955"/>
-            <wp:docPr id="2029527619" name="Imagem 13"/>
+            <wp:docPr id="1933777724" name="Imagem 13"/>
             <wp:cNvGraphicFramePr/>
             <a:graphic xmlns:a="http://schemas.openxmlformats.org/drawingml/2006/main">
               <a:graphicData uri="http://schemas.openxmlformats.org/drawingml/2006/picture">
                 <pic:pic xmlns:pic="http://schemas.openxmlformats.org/drawingml/2006/picture">
                   <pic:nvPicPr>
-                    <pic:cNvPr id="2029527619" name=""/>
+                    <pic:cNvPr id="1933777724" name=""/>
                     <pic:cNvPicPr/>
                   </pic:nvPicPr>
                   <pic:blipFill>
@@ -14863,16 +14888,16 @@
         </w:rPr>
         <w:lastRenderedPageBreak/>
         <w:drawing>
-          <wp:inline distT="0" distB="0" distL="0" distR="0" wp14:anchorId="459BDF93" wp14:editId="7A04BF50">
+          <wp:inline distT="0" distB="0" distL="0" distR="0" wp14:anchorId="19FB973B" wp14:editId="0D4AAB34">
             <wp:extent cx="5120640" cy="4627581"/>
             <wp:effectExtent l="19050" t="19050" r="22860" b="20955"/>
-            <wp:docPr id="1073407670" name="Imagem 14"/>
+            <wp:docPr id="1561180549" name="Imagem 14"/>
             <wp:cNvGraphicFramePr/>
             <a:graphic xmlns:a="http://schemas.openxmlformats.org/drawingml/2006/main">
               <a:graphicData uri="http://schemas.openxmlformats.org/drawingml/2006/picture">
                 <pic:pic xmlns:pic="http://schemas.openxmlformats.org/drawingml/2006/picture">
                   <pic:nvPicPr>
-                    <pic:cNvPr id="1073407670" name=""/>
+                    <pic:cNvPr id="1561180549" name=""/>
                     <pic:cNvPicPr/>
                   </pic:nvPicPr>
                   <pic:blipFill>
@@ -15186,7 +15211,7 @@
           <w:sz w:val="27"/>
         </w:rPr>
       </w:pPr>
-      <w:bookmarkStart w:id="27" w:name="_Toc240463915"/>
+      <w:bookmarkStart w:id="27" w:name="_Toc240465779"/>
       <w:r>
         <w:rPr>
           <w:rFonts w:ascii="Montserrat" w:hAnsi="Montserrat"/>
@@ -15227,16 +15252,16 @@
         </w:rPr>
         <w:lastRenderedPageBreak/>
         <w:drawing>
-          <wp:inline distT="0" distB="0" distL="0" distR="0" wp14:anchorId="4EA56757" wp14:editId="2DA0ACF4">
+          <wp:inline distT="0" distB="0" distL="0" distR="0" wp14:anchorId="007B154A" wp14:editId="222A0E0B">
             <wp:extent cx="5120640" cy="4627581"/>
             <wp:effectExtent l="19050" t="19050" r="22860" b="20955"/>
-            <wp:docPr id="124806892" name="Imagem 15"/>
+            <wp:docPr id="328953750" name="Imagem 15"/>
             <wp:cNvGraphicFramePr/>
             <a:graphic xmlns:a="http://schemas.openxmlformats.org/drawingml/2006/main">
               <a:graphicData uri="http://schemas.openxmlformats.org/drawingml/2006/picture">
                 <pic:pic xmlns:pic="http://schemas.openxmlformats.org/drawingml/2006/picture">
                   <pic:nvPicPr>
-                    <pic:cNvPr id="124806892" name=""/>
+                    <pic:cNvPr id="328953750" name=""/>
                     <pic:cNvPicPr/>
                   </pic:nvPicPr>
                   <pic:blipFill>
@@ -15304,16 +15329,16 @@
         </w:rPr>
         <w:lastRenderedPageBreak/>
         <w:drawing>
-          <wp:inline distT="0" distB="0" distL="0" distR="0" wp14:anchorId="5FCEE54D" wp14:editId="2D337D55">
+          <wp:inline distT="0" distB="0" distL="0" distR="0" wp14:anchorId="0D2F6DE6" wp14:editId="394A0F3D">
             <wp:extent cx="5120640" cy="4627581"/>
             <wp:effectExtent l="19050" t="19050" r="22860" b="20955"/>
-            <wp:docPr id="1362002005" name="Imagem 16"/>
+            <wp:docPr id="560247088" name="Imagem 16"/>
             <wp:cNvGraphicFramePr/>
             <a:graphic xmlns:a="http://schemas.openxmlformats.org/drawingml/2006/main">
               <a:graphicData uri="http://schemas.openxmlformats.org/drawingml/2006/picture">
                 <pic:pic xmlns:pic="http://schemas.openxmlformats.org/drawingml/2006/picture">
                   <pic:nvPicPr>
-                    <pic:cNvPr id="1362002005" name=""/>
+                    <pic:cNvPr id="560247088" name=""/>
                     <pic:cNvPicPr/>
                   </pic:nvPicPr>
                   <pic:blipFill>
@@ -15477,16 +15502,16 @@
         </w:rPr>
         <w:lastRenderedPageBreak/>
         <w:drawing>
-          <wp:inline distT="0" distB="0" distL="0" distR="0" wp14:anchorId="556EB69B" wp14:editId="5D947A93">
+          <wp:inline distT="0" distB="0" distL="0" distR="0" wp14:anchorId="185017F8" wp14:editId="65EC11BB">
             <wp:extent cx="5120640" cy="3282818"/>
             <wp:effectExtent l="19050" t="19050" r="22860" b="13335"/>
-            <wp:docPr id="557161798" name="Imagem 17"/>
+            <wp:docPr id="1140910285" name="Imagem 17"/>
             <wp:cNvGraphicFramePr/>
             <a:graphic xmlns:a="http://schemas.openxmlformats.org/drawingml/2006/main">
               <a:graphicData uri="http://schemas.openxmlformats.org/drawingml/2006/picture">
                 <pic:pic xmlns:pic="http://schemas.openxmlformats.org/drawingml/2006/picture">
                   <pic:nvPicPr>
-                    <pic:cNvPr id="557161798" name=""/>
+                    <pic:cNvPr id="1140910285" name=""/>
                     <pic:cNvPicPr/>
                   </pic:nvPicPr>
                   <pic:blipFill>
@@ -15576,8 +15601,18 @@
         </w:numPr>
         <w:spacing w:after="80" w:line="260" w:lineRule="auto"/>
         <w:ind w:left="700"/>
-      </w:pPr>
-      <w:r>
+        <w:rPr>
+          <w:rFonts w:ascii="Montserrat" w:hAnsi="Montserrat"/>
+          <w:color w:val="1A1A1A"/>
+          <w:sz w:val="22"/>
+        </w:rPr>
+      </w:pPr>
+      <w:r>
+        <w:rPr>
+          <w:rFonts w:ascii="Montserrat" w:hAnsi="Montserrat"/>
+          <w:color w:val="1A1A1A"/>
+          <w:sz w:val="22"/>
+        </w:rPr>
         <w:t>Status automatico da atividade: o mesmo casamento por nome desce mais um nivel - cada Atividade (nivel 3) ganha um selo Concluida, Pendente ou Sem tarefa vinculada, casando pelo nome da atividade com uma tarefa cadastrada dentro de qualquer marco do cronograma (botao + Tarefas de cada marco, Passo 4, secao 3). Como tarefa nao tem data - so nome e concluida - nao existe estado Atrasada aqui, so Concluida/Pendente. Tambem sem nenhum campo novo para preencher na EAP.</w:t>
       </w:r>
     </w:p>
@@ -15667,7 +15702,7 @@
           <w:sz w:val="27"/>
         </w:rPr>
       </w:pPr>
-      <w:bookmarkStart w:id="28" w:name="_Toc240463916"/>
+      <w:bookmarkStart w:id="28" w:name="_Toc240465780"/>
       <w:r>
         <w:rPr>
           <w:rFonts w:ascii="Montserrat" w:hAnsi="Montserrat"/>
@@ -15707,16 +15742,16 @@
           <w:noProof/>
         </w:rPr>
         <w:drawing>
-          <wp:inline distT="0" distB="0" distL="0" distR="0" wp14:anchorId="6DE38B22" wp14:editId="4C2162B2">
+          <wp:inline distT="0" distB="0" distL="0" distR="0" wp14:anchorId="1F69D7C7" wp14:editId="1D762D12">
             <wp:extent cx="5120640" cy="4627581"/>
             <wp:effectExtent l="19050" t="19050" r="22860" b="20955"/>
-            <wp:docPr id="590237871" name="Imagem 18"/>
+            <wp:docPr id="112040627" name="Imagem 18"/>
             <wp:cNvGraphicFramePr/>
             <a:graphic xmlns:a="http://schemas.openxmlformats.org/drawingml/2006/main">
               <a:graphicData uri="http://schemas.openxmlformats.org/drawingml/2006/picture">
                 <pic:pic xmlns:pic="http://schemas.openxmlformats.org/drawingml/2006/picture">
                   <pic:nvPicPr>
-                    <pic:cNvPr id="590237871" name=""/>
+                    <pic:cNvPr id="112040627" name=""/>
                     <pic:cNvPicPr/>
                   </pic:nvPicPr>
                   <pic:blipFill>
@@ -15784,16 +15819,16 @@
         </w:rPr>
         <w:lastRenderedPageBreak/>
         <w:drawing>
-          <wp:inline distT="0" distB="0" distL="0" distR="0" wp14:anchorId="28032401" wp14:editId="2530614E">
+          <wp:inline distT="0" distB="0" distL="0" distR="0" wp14:anchorId="3F4B46CB" wp14:editId="37C2EC94">
             <wp:extent cx="5120640" cy="4627581"/>
             <wp:effectExtent l="19050" t="19050" r="22860" b="20955"/>
-            <wp:docPr id="1254217138" name="Imagem 19"/>
+            <wp:docPr id="1616113259" name="Imagem 19"/>
             <wp:cNvGraphicFramePr/>
             <a:graphic xmlns:a="http://schemas.openxmlformats.org/drawingml/2006/main">
               <a:graphicData uri="http://schemas.openxmlformats.org/drawingml/2006/picture">
                 <pic:pic xmlns:pic="http://schemas.openxmlformats.org/drawingml/2006/picture">
                   <pic:nvPicPr>
-                    <pic:cNvPr id="1254217138" name=""/>
+                    <pic:cNvPr id="1616113259" name=""/>
                     <pic:cNvPicPr/>
                   </pic:nvPicPr>
                   <pic:blipFill>
@@ -15976,7 +16011,7 @@
           <w:sz w:val="27"/>
         </w:rPr>
       </w:pPr>
-      <w:bookmarkStart w:id="29" w:name="_Toc240463917"/>
+      <w:bookmarkStart w:id="29" w:name="_Toc240465781"/>
       <w:r>
         <w:rPr>
           <w:rFonts w:ascii="Montserrat" w:hAnsi="Montserrat"/>
@@ -16016,16 +16051,16 @@
           <w:noProof/>
         </w:rPr>
         <w:drawing>
-          <wp:inline distT="0" distB="0" distL="0" distR="0" wp14:anchorId="2FC04EEA" wp14:editId="2EA318A5">
+          <wp:inline distT="0" distB="0" distL="0" distR="0" wp14:anchorId="0EF5F0DD" wp14:editId="4B29245B">
             <wp:extent cx="5120640" cy="4627581"/>
             <wp:effectExtent l="19050" t="19050" r="22860" b="20955"/>
-            <wp:docPr id="896875217" name="Imagem 20"/>
+            <wp:docPr id="336690628" name="Imagem 20"/>
             <wp:cNvGraphicFramePr/>
             <a:graphic xmlns:a="http://schemas.openxmlformats.org/drawingml/2006/main">
               <a:graphicData uri="http://schemas.openxmlformats.org/drawingml/2006/picture">
                 <pic:pic xmlns:pic="http://schemas.openxmlformats.org/drawingml/2006/picture">
                   <pic:nvPicPr>
-                    <pic:cNvPr id="896875217" name=""/>
+                    <pic:cNvPr id="336690628" name=""/>
                     <pic:cNvPicPr/>
                   </pic:nvPicPr>
                   <pic:blipFill>
@@ -16093,16 +16128,16 @@
         </w:rPr>
         <w:lastRenderedPageBreak/>
         <w:drawing>
-          <wp:inline distT="0" distB="0" distL="0" distR="0" wp14:anchorId="40A4EE06" wp14:editId="23A57D97">
+          <wp:inline distT="0" distB="0" distL="0" distR="0" wp14:anchorId="18F3F1B5" wp14:editId="193903B3">
             <wp:extent cx="5120640" cy="4627581"/>
             <wp:effectExtent l="19050" t="19050" r="22860" b="20955"/>
-            <wp:docPr id="2131388768" name="Imagem 21"/>
+            <wp:docPr id="1410194895" name="Imagem 21"/>
             <wp:cNvGraphicFramePr/>
             <a:graphic xmlns:a="http://schemas.openxmlformats.org/drawingml/2006/main">
               <a:graphicData uri="http://schemas.openxmlformats.org/drawingml/2006/picture">
                 <pic:pic xmlns:pic="http://schemas.openxmlformats.org/drawingml/2006/picture">
                   <pic:nvPicPr>
-                    <pic:cNvPr id="2131388768" name=""/>
+                    <pic:cNvPr id="1410194895" name=""/>
                     <pic:cNvPicPr/>
                   </pic:nvPicPr>
                   <pic:blipFill>
@@ -16308,16 +16343,16 @@
           <w:noProof/>
         </w:rPr>
         <w:drawing>
-          <wp:inline distT="0" distB="0" distL="0" distR="0" wp14:anchorId="33DBF520" wp14:editId="72A377DE">
+          <wp:inline distT="0" distB="0" distL="0" distR="0" wp14:anchorId="10925CE9" wp14:editId="57233E1A">
             <wp:extent cx="5120640" cy="1757287"/>
             <wp:effectExtent l="19050" t="19050" r="22860" b="14605"/>
-            <wp:docPr id="223625613" name="Imagem 22"/>
+            <wp:docPr id="188821688" name="Imagem 22"/>
             <wp:cNvGraphicFramePr/>
             <a:graphic xmlns:a="http://schemas.openxmlformats.org/drawingml/2006/main">
               <a:graphicData uri="http://schemas.openxmlformats.org/drawingml/2006/picture">
                 <pic:pic xmlns:pic="http://schemas.openxmlformats.org/drawingml/2006/picture">
                   <pic:nvPicPr>
-                    <pic:cNvPr id="223625613" name=""/>
+                    <pic:cNvPr id="188821688" name=""/>
                     <pic:cNvPicPr/>
                   </pic:nvPicPr>
                   <pic:blipFill>
@@ -16430,7 +16465,7 @@
           <w:sz w:val="27"/>
         </w:rPr>
       </w:pPr>
-      <w:bookmarkStart w:id="30" w:name="_Toc240463918"/>
+      <w:bookmarkStart w:id="30" w:name="_Toc240465782"/>
       <w:r>
         <w:rPr>
           <w:rFonts w:ascii="Montserrat" w:hAnsi="Montserrat"/>
@@ -16471,16 +16506,16 @@
         </w:rPr>
         <w:lastRenderedPageBreak/>
         <w:drawing>
-          <wp:inline distT="0" distB="0" distL="0" distR="0" wp14:anchorId="331C9E18" wp14:editId="0A7B0B82">
+          <wp:inline distT="0" distB="0" distL="0" distR="0" wp14:anchorId="7DA59EAD" wp14:editId="539A1C7D">
             <wp:extent cx="5120640" cy="4627581"/>
             <wp:effectExtent l="19050" t="19050" r="22860" b="20955"/>
-            <wp:docPr id="1178292878" name="Imagem 23"/>
+            <wp:docPr id="196092187" name="Imagem 23"/>
             <wp:cNvGraphicFramePr/>
             <a:graphic xmlns:a="http://schemas.openxmlformats.org/drawingml/2006/main">
               <a:graphicData uri="http://schemas.openxmlformats.org/drawingml/2006/picture">
                 <pic:pic xmlns:pic="http://schemas.openxmlformats.org/drawingml/2006/picture">
                   <pic:nvPicPr>
-                    <pic:cNvPr id="1178292878" name=""/>
+                    <pic:cNvPr id="196092187" name=""/>
                     <pic:cNvPicPr/>
                   </pic:nvPicPr>
                   <pic:blipFill>
@@ -16548,16 +16583,16 @@
         </w:rPr>
         <w:lastRenderedPageBreak/>
         <w:drawing>
-          <wp:inline distT="0" distB="0" distL="0" distR="0" wp14:anchorId="16BDBA7F" wp14:editId="6F6AD097">
+          <wp:inline distT="0" distB="0" distL="0" distR="0" wp14:anchorId="09490D42" wp14:editId="47981B0A">
             <wp:extent cx="5120640" cy="4627581"/>
             <wp:effectExtent l="19050" t="19050" r="22860" b="20955"/>
-            <wp:docPr id="1125327364" name="Imagem 24"/>
+            <wp:docPr id="2018862260" name="Imagem 24"/>
             <wp:cNvGraphicFramePr/>
             <a:graphic xmlns:a="http://schemas.openxmlformats.org/drawingml/2006/main">
               <a:graphicData uri="http://schemas.openxmlformats.org/drawingml/2006/picture">
                 <pic:pic xmlns:pic="http://schemas.openxmlformats.org/drawingml/2006/picture">
                   <pic:nvPicPr>
-                    <pic:cNvPr id="1125327364" name=""/>
+                    <pic:cNvPr id="2018862260" name=""/>
                     <pic:cNvPicPr/>
                   </pic:nvPicPr>
                   <pic:blipFill>
@@ -16794,7 +16829,7 @@
           <w:sz w:val="27"/>
         </w:rPr>
       </w:pPr>
-      <w:bookmarkStart w:id="31" w:name="_Toc240463919"/>
+      <w:bookmarkStart w:id="31" w:name="_Toc240465783"/>
       <w:r>
         <w:rPr>
           <w:rFonts w:ascii="Montserrat" w:hAnsi="Montserrat"/>
@@ -16834,16 +16869,16 @@
           <w:noProof/>
         </w:rPr>
         <w:drawing>
-          <wp:inline distT="0" distB="0" distL="0" distR="0" wp14:anchorId="697AF648" wp14:editId="7D457F50">
+          <wp:inline distT="0" distB="0" distL="0" distR="0" wp14:anchorId="40464485" wp14:editId="45A44976">
             <wp:extent cx="5120640" cy="4627581"/>
             <wp:effectExtent l="19050" t="19050" r="22860" b="20955"/>
-            <wp:docPr id="166679897" name="Imagem 25"/>
+            <wp:docPr id="1920206086" name="Imagem 25"/>
             <wp:cNvGraphicFramePr/>
             <a:graphic xmlns:a="http://schemas.openxmlformats.org/drawingml/2006/main">
               <a:graphicData uri="http://schemas.openxmlformats.org/drawingml/2006/picture">
                 <pic:pic xmlns:pic="http://schemas.openxmlformats.org/drawingml/2006/picture">
                   <pic:nvPicPr>
-                    <pic:cNvPr id="166679897" name=""/>
+                    <pic:cNvPr id="1920206086" name=""/>
                     <pic:cNvPicPr/>
                   </pic:nvPicPr>
                   <pic:blipFill>
@@ -16911,16 +16946,16 @@
         </w:rPr>
         <w:lastRenderedPageBreak/>
         <w:drawing>
-          <wp:inline distT="0" distB="0" distL="0" distR="0" wp14:anchorId="7EA63DF6" wp14:editId="44A45FD7">
+          <wp:inline distT="0" distB="0" distL="0" distR="0" wp14:anchorId="64AC3216" wp14:editId="23D2FF3B">
             <wp:extent cx="5120640" cy="4627581"/>
             <wp:effectExtent l="19050" t="19050" r="22860" b="20955"/>
-            <wp:docPr id="69507270" name="Imagem 26"/>
+            <wp:docPr id="1513316072" name="Imagem 26"/>
             <wp:cNvGraphicFramePr/>
             <a:graphic xmlns:a="http://schemas.openxmlformats.org/drawingml/2006/main">
               <a:graphicData uri="http://schemas.openxmlformats.org/drawingml/2006/picture">
                 <pic:pic xmlns:pic="http://schemas.openxmlformats.org/drawingml/2006/picture">
                   <pic:nvPicPr>
-                    <pic:cNvPr id="69507270" name=""/>
+                    <pic:cNvPr id="1513316072" name=""/>
                     <pic:cNvPicPr/>
                   </pic:nvPicPr>
                   <pic:blipFill>
@@ -17111,7 +17146,7 @@
           <w:sz w:val="27"/>
         </w:rPr>
       </w:pPr>
-      <w:bookmarkStart w:id="32" w:name="_Toc240463920"/>
+      <w:bookmarkStart w:id="32" w:name="_Toc240465784"/>
       <w:r>
         <w:rPr>
           <w:rFonts w:ascii="Montserrat" w:hAnsi="Montserrat"/>
@@ -17151,16 +17186,16 @@
           <w:noProof/>
         </w:rPr>
         <w:drawing>
-          <wp:inline distT="0" distB="0" distL="0" distR="0" wp14:anchorId="2C9FF8DC" wp14:editId="0DDAEDEE">
+          <wp:inline distT="0" distB="0" distL="0" distR="0" wp14:anchorId="658C60B5" wp14:editId="5192D47B">
             <wp:extent cx="5120640" cy="4000682"/>
             <wp:effectExtent l="19050" t="19050" r="22860" b="19050"/>
-            <wp:docPr id="318700988" name="Imagem 27"/>
+            <wp:docPr id="1109050576" name="Imagem 27"/>
             <wp:cNvGraphicFramePr/>
             <a:graphic xmlns:a="http://schemas.openxmlformats.org/drawingml/2006/main">
               <a:graphicData uri="http://schemas.openxmlformats.org/drawingml/2006/picture">
                 <pic:pic xmlns:pic="http://schemas.openxmlformats.org/drawingml/2006/picture">
                   <pic:nvPicPr>
-                    <pic:cNvPr id="318700988" name=""/>
+                    <pic:cNvPr id="1109050576" name=""/>
                     <pic:cNvPicPr/>
                   </pic:nvPicPr>
                   <pic:blipFill>
@@ -17684,7 +17719,7 @@
           <w:sz w:val="34"/>
         </w:rPr>
       </w:pPr>
-      <w:bookmarkStart w:id="33" w:name="_Toc240463921"/>
+      <w:bookmarkStart w:id="33" w:name="_Toc240465785"/>
       <w:r>
         <w:rPr>
           <w:rFonts w:ascii="Montserrat" w:hAnsi="Montserrat"/>
@@ -17726,7 +17761,7 @@
           <w:sz w:val="27"/>
         </w:rPr>
       </w:pPr>
-      <w:bookmarkStart w:id="34" w:name="_Toc240463922"/>
+      <w:bookmarkStart w:id="34" w:name="_Toc240465786"/>
       <w:r>
         <w:rPr>
           <w:rFonts w:ascii="Montserrat" w:hAnsi="Montserrat"/>
@@ -17766,16 +17801,16 @@
           <w:noProof/>
         </w:rPr>
         <w:drawing>
-          <wp:inline distT="0" distB="0" distL="0" distR="0" wp14:anchorId="798CA4D5" wp14:editId="1BE40988">
+          <wp:inline distT="0" distB="0" distL="0" distR="0" wp14:anchorId="2F8B01DF" wp14:editId="2090901C">
             <wp:extent cx="5120640" cy="4627581"/>
             <wp:effectExtent l="19050" t="19050" r="22860" b="20955"/>
-            <wp:docPr id="21589703" name="Imagem 28"/>
+            <wp:docPr id="904793937" name="Imagem 28"/>
             <wp:cNvGraphicFramePr/>
             <a:graphic xmlns:a="http://schemas.openxmlformats.org/drawingml/2006/main">
               <a:graphicData uri="http://schemas.openxmlformats.org/drawingml/2006/picture">
                 <pic:pic xmlns:pic="http://schemas.openxmlformats.org/drawingml/2006/picture">
                   <pic:nvPicPr>
-                    <pic:cNvPr id="21589703" name=""/>
+                    <pic:cNvPr id="904793937" name=""/>
                     <pic:cNvPicPr/>
                   </pic:nvPicPr>
                   <pic:blipFill>
@@ -17843,16 +17878,16 @@
         </w:rPr>
         <w:lastRenderedPageBreak/>
         <w:drawing>
-          <wp:inline distT="0" distB="0" distL="0" distR="0" wp14:anchorId="4F982E43" wp14:editId="474F47F8">
+          <wp:inline distT="0" distB="0" distL="0" distR="0" wp14:anchorId="058C6CCD" wp14:editId="2096DCDF">
             <wp:extent cx="5120640" cy="4627581"/>
             <wp:effectExtent l="19050" t="19050" r="22860" b="20955"/>
-            <wp:docPr id="2079078979" name="Imagem 29"/>
+            <wp:docPr id="434445378" name="Imagem 29"/>
             <wp:cNvGraphicFramePr/>
             <a:graphic xmlns:a="http://schemas.openxmlformats.org/drawingml/2006/main">
               <a:graphicData uri="http://schemas.openxmlformats.org/drawingml/2006/picture">
                 <pic:pic xmlns:pic="http://schemas.openxmlformats.org/drawingml/2006/picture">
                   <pic:nvPicPr>
-                    <pic:cNvPr id="2079078979" name=""/>
+                    <pic:cNvPr id="434445378" name=""/>
                     <pic:cNvPicPr/>
                   </pic:nvPicPr>
                   <pic:blipFill>
@@ -17920,16 +17955,16 @@
         </w:rPr>
         <w:lastRenderedPageBreak/>
         <w:drawing>
-          <wp:inline distT="0" distB="0" distL="0" distR="0" wp14:anchorId="28377FCA" wp14:editId="4F4FFFE1">
+          <wp:inline distT="0" distB="0" distL="0" distR="0" wp14:anchorId="2F2BADE3" wp14:editId="6C30F95B">
             <wp:extent cx="5120640" cy="4627581"/>
             <wp:effectExtent l="19050" t="19050" r="22860" b="20955"/>
-            <wp:docPr id="448625807" name="Imagem 30"/>
+            <wp:docPr id="1587189240" name="Imagem 30"/>
             <wp:cNvGraphicFramePr/>
             <a:graphic xmlns:a="http://schemas.openxmlformats.org/drawingml/2006/main">
               <a:graphicData uri="http://schemas.openxmlformats.org/drawingml/2006/picture">
                 <pic:pic xmlns:pic="http://schemas.openxmlformats.org/drawingml/2006/picture">
                   <pic:nvPicPr>
-                    <pic:cNvPr id="448625807" name=""/>
+                    <pic:cNvPr id="1587189240" name=""/>
                     <pic:cNvPicPr/>
                   </pic:nvPicPr>
                   <pic:blipFill>
@@ -18131,16 +18166,16 @@
           <w:noProof/>
         </w:rPr>
         <w:drawing>
-          <wp:inline distT="0" distB="0" distL="0" distR="0" wp14:anchorId="54EC55BE" wp14:editId="3D0467E1">
+          <wp:inline distT="0" distB="0" distL="0" distR="0" wp14:anchorId="7BA82354" wp14:editId="28C0C4C4">
             <wp:extent cx="5120640" cy="1715571"/>
             <wp:effectExtent l="19050" t="19050" r="22860" b="18415"/>
-            <wp:docPr id="1428294245" name="Imagem 31"/>
+            <wp:docPr id="1144066898" name="Imagem 31"/>
             <wp:cNvGraphicFramePr/>
             <a:graphic xmlns:a="http://schemas.openxmlformats.org/drawingml/2006/main">
               <a:graphicData uri="http://schemas.openxmlformats.org/drawingml/2006/picture">
                 <pic:pic xmlns:pic="http://schemas.openxmlformats.org/drawingml/2006/picture">
                   <pic:nvPicPr>
-                    <pic:cNvPr id="1428294245" name=""/>
+                    <pic:cNvPr id="1144066898" name=""/>
                     <pic:cNvPicPr/>
                   </pic:nvPicPr>
                   <pic:blipFill>
@@ -18277,16 +18312,16 @@
           <w:noProof/>
         </w:rPr>
         <w:drawing>
-          <wp:inline distT="0" distB="0" distL="0" distR="0" wp14:anchorId="6C4B9C8A" wp14:editId="6086E07C">
+          <wp:inline distT="0" distB="0" distL="0" distR="0" wp14:anchorId="510A5267" wp14:editId="7A2F3E6A">
             <wp:extent cx="5120640" cy="3282818"/>
             <wp:effectExtent l="19050" t="19050" r="22860" b="13335"/>
-            <wp:docPr id="1779324711" name="Imagem 32"/>
+            <wp:docPr id="1981213004" name="Imagem 32"/>
             <wp:cNvGraphicFramePr/>
             <a:graphic xmlns:a="http://schemas.openxmlformats.org/drawingml/2006/main">
               <a:graphicData uri="http://schemas.openxmlformats.org/drawingml/2006/picture">
                 <pic:pic xmlns:pic="http://schemas.openxmlformats.org/drawingml/2006/picture">
                   <pic:nvPicPr>
-                    <pic:cNvPr id="1779324711" name=""/>
+                    <pic:cNvPr id="1981213004" name=""/>
                     <pic:cNvPicPr/>
                   </pic:nvPicPr>
                   <pic:blipFill>
@@ -18420,16 +18455,16 @@
           <w:noProof/>
         </w:rPr>
         <w:drawing>
-          <wp:inline distT="0" distB="0" distL="0" distR="0" wp14:anchorId="7DAFC101" wp14:editId="7C4FF66D">
+          <wp:inline distT="0" distB="0" distL="0" distR="0" wp14:anchorId="3E63025C" wp14:editId="207C5FC2">
             <wp:extent cx="5120640" cy="951357"/>
             <wp:effectExtent l="19050" t="19050" r="22860" b="20320"/>
-            <wp:docPr id="724678175" name="Imagem 33"/>
+            <wp:docPr id="1791392202" name="Imagem 33"/>
             <wp:cNvGraphicFramePr/>
             <a:graphic xmlns:a="http://schemas.openxmlformats.org/drawingml/2006/main">
               <a:graphicData uri="http://schemas.openxmlformats.org/drawingml/2006/picture">
                 <pic:pic xmlns:pic="http://schemas.openxmlformats.org/drawingml/2006/picture">
                   <pic:nvPicPr>
-                    <pic:cNvPr id="724678175" name=""/>
+                    <pic:cNvPr id="1791392202" name=""/>
                     <pic:cNvPicPr/>
                   </pic:nvPicPr>
                   <pic:blipFill>
@@ -18593,16 +18628,16 @@
           <w:noProof/>
         </w:rPr>
         <w:drawing>
-          <wp:inline distT="0" distB="0" distL="0" distR="0" wp14:anchorId="7EA31379" wp14:editId="361AEE3C">
+          <wp:inline distT="0" distB="0" distL="0" distR="0" wp14:anchorId="79C83634" wp14:editId="741C85D8">
             <wp:extent cx="5120640" cy="1515102"/>
             <wp:effectExtent l="19050" t="19050" r="22860" b="28575"/>
-            <wp:docPr id="658380706" name="Imagem 34"/>
+            <wp:docPr id="1967993906" name="Imagem 34"/>
             <wp:cNvGraphicFramePr/>
             <a:graphic xmlns:a="http://schemas.openxmlformats.org/drawingml/2006/main">
               <a:graphicData uri="http://schemas.openxmlformats.org/drawingml/2006/picture">
                 <pic:pic xmlns:pic="http://schemas.openxmlformats.org/drawingml/2006/picture">
                   <pic:nvPicPr>
-                    <pic:cNvPr id="658380706" name=""/>
+                    <pic:cNvPr id="1967993906" name=""/>
                     <pic:cNvPicPr/>
                   </pic:nvPicPr>
                   <pic:blipFill>
@@ -18714,16 +18749,16 @@
           <w:noProof/>
         </w:rPr>
         <w:drawing>
-          <wp:inline distT="0" distB="0" distL="0" distR="0" wp14:anchorId="3289DC42" wp14:editId="4D9F0CFA">
+          <wp:inline distT="0" distB="0" distL="0" distR="0" wp14:anchorId="5FDD5537" wp14:editId="0F4966D9">
             <wp:extent cx="5120640" cy="1391113"/>
             <wp:effectExtent l="19050" t="19050" r="22860" b="19050"/>
-            <wp:docPr id="1518085406" name="Imagem 35"/>
+            <wp:docPr id="823542101" name="Imagem 35"/>
             <wp:cNvGraphicFramePr/>
             <a:graphic xmlns:a="http://schemas.openxmlformats.org/drawingml/2006/main">
               <a:graphicData uri="http://schemas.openxmlformats.org/drawingml/2006/picture">
                 <pic:pic xmlns:pic="http://schemas.openxmlformats.org/drawingml/2006/picture">
                   <pic:nvPicPr>
-                    <pic:cNvPr id="1518085406" name=""/>
+                    <pic:cNvPr id="823542101" name=""/>
                     <pic:cNvPicPr/>
                   </pic:nvPicPr>
                   <pic:blipFill>
@@ -18845,16 +18880,16 @@
           <w:noProof/>
         </w:rPr>
         <w:drawing>
-          <wp:inline distT="0" distB="0" distL="0" distR="0" wp14:anchorId="25D2FB12" wp14:editId="61C92BE1">
+          <wp:inline distT="0" distB="0" distL="0" distR="0" wp14:anchorId="01DEBB01" wp14:editId="59DB14E2">
             <wp:extent cx="5120640" cy="1125174"/>
             <wp:effectExtent l="19050" t="19050" r="22860" b="18415"/>
-            <wp:docPr id="541110870" name="Imagem 36"/>
+            <wp:docPr id="1817827628" name="Imagem 36"/>
             <wp:cNvGraphicFramePr/>
             <a:graphic xmlns:a="http://schemas.openxmlformats.org/drawingml/2006/main">
               <a:graphicData uri="http://schemas.openxmlformats.org/drawingml/2006/picture">
                 <pic:pic xmlns:pic="http://schemas.openxmlformats.org/drawingml/2006/picture">
                   <pic:nvPicPr>
-                    <pic:cNvPr id="541110870" name=""/>
+                    <pic:cNvPr id="1817827628" name=""/>
                     <pic:cNvPicPr/>
                   </pic:nvPicPr>
                   <pic:blipFill>
@@ -18943,7 +18978,7 @@
           <w:sz w:val="27"/>
         </w:rPr>
       </w:pPr>
-      <w:bookmarkStart w:id="35" w:name="_Toc240463923"/>
+      <w:bookmarkStart w:id="35" w:name="_Toc240465787"/>
       <w:r>
         <w:rPr>
           <w:rFonts w:ascii="Montserrat" w:hAnsi="Montserrat"/>
@@ -18984,16 +19019,16 @@
         </w:rPr>
         <w:lastRenderedPageBreak/>
         <w:drawing>
-          <wp:inline distT="0" distB="0" distL="0" distR="0" wp14:anchorId="309794A9" wp14:editId="776722F8">
+          <wp:inline distT="0" distB="0" distL="0" distR="0" wp14:anchorId="75E73447" wp14:editId="41F7F609">
             <wp:extent cx="5120640" cy="4627581"/>
             <wp:effectExtent l="19050" t="19050" r="22860" b="20955"/>
-            <wp:docPr id="1524210749" name="Imagem 37"/>
+            <wp:docPr id="1743500959" name="Imagem 37"/>
             <wp:cNvGraphicFramePr/>
             <a:graphic xmlns:a="http://schemas.openxmlformats.org/drawingml/2006/main">
               <a:graphicData uri="http://schemas.openxmlformats.org/drawingml/2006/picture">
                 <pic:pic xmlns:pic="http://schemas.openxmlformats.org/drawingml/2006/picture">
                   <pic:nvPicPr>
-                    <pic:cNvPr id="1524210749" name=""/>
+                    <pic:cNvPr id="1743500959" name=""/>
                     <pic:cNvPicPr/>
                   </pic:nvPicPr>
                   <pic:blipFill>
@@ -19061,16 +19096,16 @@
         </w:rPr>
         <w:lastRenderedPageBreak/>
         <w:drawing>
-          <wp:inline distT="0" distB="0" distL="0" distR="0" wp14:anchorId="31EB14DE" wp14:editId="50BA540B">
+          <wp:inline distT="0" distB="0" distL="0" distR="0" wp14:anchorId="669C9B03" wp14:editId="2D2C2B4D">
             <wp:extent cx="5120640" cy="4627581"/>
             <wp:effectExtent l="19050" t="19050" r="22860" b="20955"/>
-            <wp:docPr id="2098188571" name="Imagem 38"/>
+            <wp:docPr id="611885013" name="Imagem 38"/>
             <wp:cNvGraphicFramePr/>
             <a:graphic xmlns:a="http://schemas.openxmlformats.org/drawingml/2006/main">
               <a:graphicData uri="http://schemas.openxmlformats.org/drawingml/2006/picture">
                 <pic:pic xmlns:pic="http://schemas.openxmlformats.org/drawingml/2006/picture">
                   <pic:nvPicPr>
-                    <pic:cNvPr id="2098188571" name=""/>
+                    <pic:cNvPr id="611885013" name=""/>
                     <pic:cNvPicPr/>
                   </pic:nvPicPr>
                   <pic:blipFill>
@@ -19239,16 +19274,16 @@
           <w:noProof/>
         </w:rPr>
         <w:drawing>
-          <wp:inline distT="0" distB="0" distL="0" distR="0" wp14:anchorId="12E2E03D" wp14:editId="3E0B8DE7">
+          <wp:inline distT="0" distB="0" distL="0" distR="0" wp14:anchorId="33549D30" wp14:editId="29F610B0">
             <wp:extent cx="5120640" cy="2144319"/>
             <wp:effectExtent l="19050" t="19050" r="22860" b="27940"/>
-            <wp:docPr id="94212614" name="Imagem 39"/>
+            <wp:docPr id="1906157275" name="Imagem 39"/>
             <wp:cNvGraphicFramePr/>
             <a:graphic xmlns:a="http://schemas.openxmlformats.org/drawingml/2006/main">
               <a:graphicData uri="http://schemas.openxmlformats.org/drawingml/2006/picture">
                 <pic:pic xmlns:pic="http://schemas.openxmlformats.org/drawingml/2006/picture">
                   <pic:nvPicPr>
-                    <pic:cNvPr id="94212614" name=""/>
+                    <pic:cNvPr id="1906157275" name=""/>
                     <pic:cNvPicPr/>
                   </pic:nvPicPr>
                   <pic:blipFill>
@@ -19336,16 +19371,16 @@
           <w:noProof/>
         </w:rPr>
         <w:drawing>
-          <wp:inline distT="0" distB="0" distL="0" distR="0" wp14:anchorId="30341A82" wp14:editId="258AA819">
+          <wp:inline distT="0" distB="0" distL="0" distR="0" wp14:anchorId="506F8A4F" wp14:editId="3ABB3D96">
             <wp:extent cx="5120640" cy="1055647"/>
             <wp:effectExtent l="19050" t="19050" r="22860" b="11430"/>
-            <wp:docPr id="1400383694" name="Imagem 40"/>
+            <wp:docPr id="755475751" name="Imagem 40"/>
             <wp:cNvGraphicFramePr/>
             <a:graphic xmlns:a="http://schemas.openxmlformats.org/drawingml/2006/main">
               <a:graphicData uri="http://schemas.openxmlformats.org/drawingml/2006/picture">
                 <pic:pic xmlns:pic="http://schemas.openxmlformats.org/drawingml/2006/picture">
                   <pic:nvPicPr>
-                    <pic:cNvPr id="1400383694" name=""/>
+                    <pic:cNvPr id="755475751" name=""/>
                     <pic:cNvPicPr/>
                   </pic:nvPicPr>
                   <pic:blipFill>
@@ -19467,16 +19502,16 @@
           <w:noProof/>
         </w:rPr>
         <w:drawing>
-          <wp:inline distT="0" distB="0" distL="0" distR="0" wp14:anchorId="15130AFE" wp14:editId="24FC6FAA">
+          <wp:inline distT="0" distB="0" distL="0" distR="0" wp14:anchorId="1E5923FD" wp14:editId="0EAF4CC1">
             <wp:extent cx="5120640" cy="3282818"/>
             <wp:effectExtent l="19050" t="19050" r="22860" b="13335"/>
-            <wp:docPr id="1419779745" name="Imagem 41"/>
+            <wp:docPr id="832668684" name="Imagem 41"/>
             <wp:cNvGraphicFramePr/>
             <a:graphic xmlns:a="http://schemas.openxmlformats.org/drawingml/2006/main">
               <a:graphicData uri="http://schemas.openxmlformats.org/drawingml/2006/picture">
                 <pic:pic xmlns:pic="http://schemas.openxmlformats.org/drawingml/2006/picture">
                   <pic:nvPicPr>
-                    <pic:cNvPr id="1419779745" name=""/>
+                    <pic:cNvPr id="832668684" name=""/>
                     <pic:cNvPicPr/>
                   </pic:nvPicPr>
                   <pic:blipFill>
@@ -19610,16 +19645,16 @@
         </w:rPr>
         <w:lastRenderedPageBreak/>
         <w:drawing>
-          <wp:inline distT="0" distB="0" distL="0" distR="0" wp14:anchorId="313A4564" wp14:editId="5A8E6CAD">
+          <wp:inline distT="0" distB="0" distL="0" distR="0" wp14:anchorId="191506A3" wp14:editId="662943F8">
             <wp:extent cx="5120640" cy="1978034"/>
             <wp:effectExtent l="19050" t="19050" r="22860" b="22225"/>
-            <wp:docPr id="1369499611" name="Imagem 42"/>
+            <wp:docPr id="2102454165" name="Imagem 42"/>
             <wp:cNvGraphicFramePr/>
             <a:graphic xmlns:a="http://schemas.openxmlformats.org/drawingml/2006/main">
               <a:graphicData uri="http://schemas.openxmlformats.org/drawingml/2006/picture">
                 <pic:pic xmlns:pic="http://schemas.openxmlformats.org/drawingml/2006/picture">
                   <pic:nvPicPr>
-                    <pic:cNvPr id="1369499611" name=""/>
+                    <pic:cNvPr id="2102454165" name=""/>
                     <pic:cNvPicPr/>
                   </pic:nvPicPr>
                   <pic:blipFill>
@@ -19691,7 +19726,7 @@
           <w:sz w:val="34"/>
         </w:rPr>
       </w:pPr>
-      <w:bookmarkStart w:id="36" w:name="_Toc240463924"/>
+      <w:bookmarkStart w:id="36" w:name="_Toc240465788"/>
       <w:r>
         <w:rPr>
           <w:rFonts w:ascii="Montserrat" w:hAnsi="Montserrat"/>
@@ -19751,7 +19786,7 @@
           <w:sz w:val="27"/>
         </w:rPr>
       </w:pPr>
-      <w:bookmarkStart w:id="37" w:name="_Toc240463925"/>
+      <w:bookmarkStart w:id="37" w:name="_Toc240465789"/>
       <w:r>
         <w:rPr>
           <w:rFonts w:ascii="Montserrat" w:hAnsi="Montserrat"/>
@@ -19791,16 +19826,16 @@
           <w:noProof/>
         </w:rPr>
         <w:drawing>
-          <wp:inline distT="0" distB="0" distL="0" distR="0" wp14:anchorId="46E85DCC" wp14:editId="0931B28F">
+          <wp:inline distT="0" distB="0" distL="0" distR="0" wp14:anchorId="391C0649" wp14:editId="7E12592B">
             <wp:extent cx="5303520" cy="4792851"/>
             <wp:effectExtent l="19050" t="19050" r="11430" b="27305"/>
-            <wp:docPr id="629451387" name="Imagem 43"/>
+            <wp:docPr id="1644984954" name="Imagem 43"/>
             <wp:cNvGraphicFramePr/>
             <a:graphic xmlns:a="http://schemas.openxmlformats.org/drawingml/2006/main">
               <a:graphicData uri="http://schemas.openxmlformats.org/drawingml/2006/picture">
                 <pic:pic xmlns:pic="http://schemas.openxmlformats.org/drawingml/2006/picture">
                   <pic:nvPicPr>
-                    <pic:cNvPr id="629451387" name=""/>
+                    <pic:cNvPr id="1644984954" name=""/>
                     <pic:cNvPicPr/>
                   </pic:nvPicPr>
                   <pic:blipFill>
@@ -19869,7 +19904,7 @@
           <w:sz w:val="27"/>
         </w:rPr>
       </w:pPr>
-      <w:bookmarkStart w:id="38" w:name="_Toc240463926"/>
+      <w:bookmarkStart w:id="38" w:name="_Toc240465790"/>
       <w:r>
         <w:rPr>
           <w:rFonts w:ascii="Montserrat" w:hAnsi="Montserrat"/>
@@ -19909,16 +19944,16 @@
           <w:noProof/>
         </w:rPr>
         <w:drawing>
-          <wp:inline distT="0" distB="0" distL="0" distR="0" wp14:anchorId="7423D3C2" wp14:editId="6B7B57EC">
+          <wp:inline distT="0" distB="0" distL="0" distR="0" wp14:anchorId="3E3D3D5E" wp14:editId="4D913422">
             <wp:extent cx="5303520" cy="4792851"/>
             <wp:effectExtent l="19050" t="19050" r="11430" b="27305"/>
-            <wp:docPr id="1335794163" name="Imagem 44"/>
+            <wp:docPr id="1540163130" name="Imagem 44"/>
             <wp:cNvGraphicFramePr/>
             <a:graphic xmlns:a="http://schemas.openxmlformats.org/drawingml/2006/main">
               <a:graphicData uri="http://schemas.openxmlformats.org/drawingml/2006/picture">
                 <pic:pic xmlns:pic="http://schemas.openxmlformats.org/drawingml/2006/picture">
                   <pic:nvPicPr>
-                    <pic:cNvPr id="1335794163" name=""/>
+                    <pic:cNvPr id="1540163130" name=""/>
                     <pic:cNvPicPr/>
                   </pic:nvPicPr>
                   <pic:blipFill>
@@ -19986,7 +20021,7 @@
           <w:sz w:val="27"/>
         </w:rPr>
       </w:pPr>
-      <w:bookmarkStart w:id="39" w:name="_Toc240463927"/>
+      <w:bookmarkStart w:id="39" w:name="_Toc240465791"/>
       <w:r>
         <w:rPr>
           <w:rFonts w:ascii="Montserrat" w:hAnsi="Montserrat"/>
@@ -20027,16 +20062,16 @@
         </w:rPr>
         <w:lastRenderedPageBreak/>
         <w:drawing>
-          <wp:inline distT="0" distB="0" distL="0" distR="0" wp14:anchorId="66B14BCE" wp14:editId="5E0D9AC2">
+          <wp:inline distT="0" distB="0" distL="0" distR="0" wp14:anchorId="66EF30F2" wp14:editId="378055A8">
             <wp:extent cx="5303520" cy="4792851"/>
             <wp:effectExtent l="19050" t="19050" r="11430" b="27305"/>
-            <wp:docPr id="1436314298" name="Imagem 45"/>
+            <wp:docPr id="1934327371" name="Imagem 45"/>
             <wp:cNvGraphicFramePr/>
             <a:graphic xmlns:a="http://schemas.openxmlformats.org/drawingml/2006/main">
               <a:graphicData uri="http://schemas.openxmlformats.org/drawingml/2006/picture">
                 <pic:pic xmlns:pic="http://schemas.openxmlformats.org/drawingml/2006/picture">
                   <pic:nvPicPr>
-                    <pic:cNvPr id="1436314298" name=""/>
+                    <pic:cNvPr id="1934327371" name=""/>
                     <pic:cNvPicPr/>
                   </pic:nvPicPr>
                   <pic:blipFill>
@@ -20104,16 +20139,16 @@
         </w:rPr>
         <w:lastRenderedPageBreak/>
         <w:drawing>
-          <wp:inline distT="0" distB="0" distL="0" distR="0" wp14:anchorId="4F1A7CEA" wp14:editId="00AE2F68">
+          <wp:inline distT="0" distB="0" distL="0" distR="0" wp14:anchorId="2A95691A" wp14:editId="4711D3D4">
             <wp:extent cx="5303520" cy="4792851"/>
             <wp:effectExtent l="19050" t="19050" r="11430" b="27305"/>
-            <wp:docPr id="1594816281" name="Imagem 46"/>
+            <wp:docPr id="508852150" name="Imagem 46"/>
             <wp:cNvGraphicFramePr/>
             <a:graphic xmlns:a="http://schemas.openxmlformats.org/drawingml/2006/main">
               <a:graphicData uri="http://schemas.openxmlformats.org/drawingml/2006/picture">
                 <pic:pic xmlns:pic="http://schemas.openxmlformats.org/drawingml/2006/picture">
                   <pic:nvPicPr>
-                    <pic:cNvPr id="1594816281" name=""/>
+                    <pic:cNvPr id="508852150" name=""/>
                     <pic:cNvPicPr/>
                   </pic:nvPicPr>
                   <pic:blipFill>
@@ -20206,7 +20241,7 @@
           <w:sz w:val="34"/>
         </w:rPr>
       </w:pPr>
-      <w:bookmarkStart w:id="40" w:name="_Toc240463928"/>
+      <w:bookmarkStart w:id="40" w:name="_Toc240465792"/>
       <w:r>
         <w:rPr>
           <w:rFonts w:ascii="Montserrat" w:hAnsi="Montserrat"/>
@@ -20248,7 +20283,7 @@
           <w:sz w:val="27"/>
         </w:rPr>
       </w:pPr>
-      <w:bookmarkStart w:id="41" w:name="_Toc240463929"/>
+      <w:bookmarkStart w:id="41" w:name="_Toc240465793"/>
       <w:r>
         <w:rPr>
           <w:rFonts w:ascii="Montserrat" w:hAnsi="Montserrat"/>
@@ -20288,16 +20323,16 @@
           <w:noProof/>
         </w:rPr>
         <w:drawing>
-          <wp:inline distT="0" distB="0" distL="0" distR="0" wp14:anchorId="4AF4B4D2" wp14:editId="2752CABD">
+          <wp:inline distT="0" distB="0" distL="0" distR="0" wp14:anchorId="5228F560" wp14:editId="173F03CA">
             <wp:extent cx="5303520" cy="4792851"/>
             <wp:effectExtent l="19050" t="19050" r="11430" b="27305"/>
-            <wp:docPr id="1588265773" name="Imagem 47"/>
+            <wp:docPr id="367410380" name="Imagem 47"/>
             <wp:cNvGraphicFramePr/>
             <a:graphic xmlns:a="http://schemas.openxmlformats.org/drawingml/2006/main">
               <a:graphicData uri="http://schemas.openxmlformats.org/drawingml/2006/picture">
                 <pic:pic xmlns:pic="http://schemas.openxmlformats.org/drawingml/2006/picture">
                   <pic:nvPicPr>
-                    <pic:cNvPr id="1588265773" name=""/>
+                    <pic:cNvPr id="367410380" name=""/>
                     <pic:cNvPicPr/>
                   </pic:nvPicPr>
                   <pic:blipFill>
@@ -20552,7 +20587,7 @@
           <w:sz w:val="27"/>
         </w:rPr>
       </w:pPr>
-      <w:bookmarkStart w:id="42" w:name="_Toc240463930"/>
+      <w:bookmarkStart w:id="42" w:name="_Toc240465794"/>
       <w:r>
         <w:rPr>
           <w:rFonts w:ascii="Montserrat" w:hAnsi="Montserrat"/>
@@ -20593,16 +20628,16 @@
         </w:rPr>
         <w:lastRenderedPageBreak/>
         <w:drawing>
-          <wp:inline distT="0" distB="0" distL="0" distR="0" wp14:anchorId="4051BE06" wp14:editId="04C2C4FD">
+          <wp:inline distT="0" distB="0" distL="0" distR="0" wp14:anchorId="4DFF7DFD" wp14:editId="7B3F4FDD">
             <wp:extent cx="5303520" cy="4792851"/>
             <wp:effectExtent l="19050" t="19050" r="11430" b="27305"/>
-            <wp:docPr id="962474773" name="Imagem 48"/>
+            <wp:docPr id="215460714" name="Imagem 48"/>
             <wp:cNvGraphicFramePr/>
             <a:graphic xmlns:a="http://schemas.openxmlformats.org/drawingml/2006/main">
               <a:graphicData uri="http://schemas.openxmlformats.org/drawingml/2006/picture">
                 <pic:pic xmlns:pic="http://schemas.openxmlformats.org/drawingml/2006/picture">
                   <pic:nvPicPr>
-                    <pic:cNvPr id="962474773" name=""/>
+                    <pic:cNvPr id="215460714" name=""/>
                     <pic:cNvPicPr/>
                   </pic:nvPicPr>
                   <pic:blipFill>
@@ -20691,7 +20726,7 @@
           <w:sz w:val="27"/>
         </w:rPr>
       </w:pPr>
-      <w:bookmarkStart w:id="43" w:name="_Toc240463931"/>
+      <w:bookmarkStart w:id="43" w:name="_Toc240465795"/>
       <w:r>
         <w:rPr>
           <w:rFonts w:ascii="Montserrat" w:hAnsi="Montserrat"/>
@@ -20732,16 +20767,16 @@
         </w:rPr>
         <w:lastRenderedPageBreak/>
         <w:drawing>
-          <wp:inline distT="0" distB="0" distL="0" distR="0" wp14:anchorId="14B6F8C0" wp14:editId="590F4303">
+          <wp:inline distT="0" distB="0" distL="0" distR="0" wp14:anchorId="310B2DA1" wp14:editId="1DC2B9BE">
             <wp:extent cx="5303520" cy="4792851"/>
             <wp:effectExtent l="19050" t="19050" r="11430" b="27305"/>
-            <wp:docPr id="1104783702" name="Imagem 49"/>
+            <wp:docPr id="809193196" name="Imagem 49"/>
             <wp:cNvGraphicFramePr/>
             <a:graphic xmlns:a="http://schemas.openxmlformats.org/drawingml/2006/main">
               <a:graphicData uri="http://schemas.openxmlformats.org/drawingml/2006/picture">
                 <pic:pic xmlns:pic="http://schemas.openxmlformats.org/drawingml/2006/picture">
                   <pic:nvPicPr>
-                    <pic:cNvPr id="1104783702" name=""/>
+                    <pic:cNvPr id="809193196" name=""/>
                     <pic:cNvPicPr/>
                   </pic:nvPicPr>
                   <pic:blipFill>
@@ -20885,7 +20920,7 @@
           <w:sz w:val="27"/>
         </w:rPr>
       </w:pPr>
-      <w:bookmarkStart w:id="44" w:name="_Toc240463932"/>
+      <w:bookmarkStart w:id="44" w:name="_Toc240465796"/>
       <w:r>
         <w:rPr>
           <w:rFonts w:ascii="Montserrat" w:hAnsi="Montserrat"/>
@@ -21150,16 +21185,16 @@
           <w:noProof/>
         </w:rPr>
         <w:drawing>
-          <wp:inline distT="0" distB="0" distL="0" distR="0" wp14:anchorId="0E4B1E20" wp14:editId="2DB5D5DA">
+          <wp:inline distT="0" distB="0" distL="0" distR="0" wp14:anchorId="282ADB2C" wp14:editId="057FA4D1">
             <wp:extent cx="5303520" cy="4267180"/>
             <wp:effectExtent l="19050" t="19050" r="11430" b="19685"/>
-            <wp:docPr id="163392596" name="Imagem 50"/>
+            <wp:docPr id="829163220" name="Imagem 50"/>
             <wp:cNvGraphicFramePr/>
             <a:graphic xmlns:a="http://schemas.openxmlformats.org/drawingml/2006/main">
               <a:graphicData uri="http://schemas.openxmlformats.org/drawingml/2006/picture">
                 <pic:pic xmlns:pic="http://schemas.openxmlformats.org/drawingml/2006/picture">
                   <pic:nvPicPr>
-                    <pic:cNvPr id="163392596" name=""/>
+                    <pic:cNvPr id="829163220" name=""/>
                     <pic:cNvPicPr/>
                   </pic:nvPicPr>
                   <pic:blipFill>
@@ -21227,16 +21262,16 @@
           <w:noProof/>
         </w:rPr>
         <w:drawing>
-          <wp:inline distT="0" distB="0" distL="0" distR="0" wp14:anchorId="5256E9E8" wp14:editId="632F2279">
+          <wp:inline distT="0" distB="0" distL="0" distR="0" wp14:anchorId="108B90C4" wp14:editId="0B5AA0AD">
             <wp:extent cx="5303520" cy="3382059"/>
             <wp:effectExtent l="19050" t="19050" r="11430" b="27940"/>
-            <wp:docPr id="705708536" name="Imagem 51"/>
+            <wp:docPr id="1665335608" name="Imagem 51"/>
             <wp:cNvGraphicFramePr/>
             <a:graphic xmlns:a="http://schemas.openxmlformats.org/drawingml/2006/main">
               <a:graphicData uri="http://schemas.openxmlformats.org/drawingml/2006/picture">
                 <pic:pic xmlns:pic="http://schemas.openxmlformats.org/drawingml/2006/picture">
                   <pic:nvPicPr>
-                    <pic:cNvPr id="705708536" name=""/>
+                    <pic:cNvPr id="1665335608" name=""/>
                     <pic:cNvPicPr/>
                   </pic:nvPicPr>
                   <pic:blipFill>
@@ -21304,16 +21339,16 @@
         </w:rPr>
         <w:lastRenderedPageBreak/>
         <w:drawing>
-          <wp:inline distT="0" distB="0" distL="0" distR="0" wp14:anchorId="79D209EA" wp14:editId="0E5B38AA">
+          <wp:inline distT="0" distB="0" distL="0" distR="0" wp14:anchorId="60E98936" wp14:editId="3297A3B9">
             <wp:extent cx="5303520" cy="4417800"/>
             <wp:effectExtent l="19050" t="19050" r="11430" b="20955"/>
-            <wp:docPr id="552973026" name="Imagem 52"/>
+            <wp:docPr id="1496254096" name="Imagem 52"/>
             <wp:cNvGraphicFramePr/>
             <a:graphic xmlns:a="http://schemas.openxmlformats.org/drawingml/2006/main">
               <a:graphicData uri="http://schemas.openxmlformats.org/drawingml/2006/picture">
                 <pic:pic xmlns:pic="http://schemas.openxmlformats.org/drawingml/2006/picture">
                   <pic:nvPicPr>
-                    <pic:cNvPr id="552973026" name=""/>
+                    <pic:cNvPr id="1496254096" name=""/>
                     <pic:cNvPicPr/>
                   </pic:nvPicPr>
                   <pic:blipFill>
@@ -21423,7 +21458,7 @@
           <w:sz w:val="27"/>
         </w:rPr>
       </w:pPr>
-      <w:bookmarkStart w:id="45" w:name="_Toc240463933"/>
+      <w:bookmarkStart w:id="45" w:name="_Toc240465797"/>
       <w:r>
         <w:rPr>
           <w:rFonts w:ascii="Montserrat" w:hAnsi="Montserrat"/>
@@ -21689,16 +21724,16 @@
         </w:rPr>
         <w:lastRenderedPageBreak/>
         <w:drawing>
-          <wp:inline distT="0" distB="0" distL="0" distR="0" wp14:anchorId="2F8DEC13" wp14:editId="5EE70FD0">
+          <wp:inline distT="0" distB="0" distL="0" distR="0" wp14:anchorId="5272A135" wp14:editId="2389E20D">
             <wp:extent cx="5303520" cy="7628836"/>
             <wp:effectExtent l="19050" t="19050" r="11430" b="10795"/>
-            <wp:docPr id="958319035" name="Imagem 53"/>
+            <wp:docPr id="2031078954" name="Imagem 53"/>
             <wp:cNvGraphicFramePr/>
             <a:graphic xmlns:a="http://schemas.openxmlformats.org/drawingml/2006/main">
               <a:graphicData uri="http://schemas.openxmlformats.org/drawingml/2006/picture">
                 <pic:pic xmlns:pic="http://schemas.openxmlformats.org/drawingml/2006/picture">
                   <pic:nvPicPr>
-                    <pic:cNvPr id="958319035" name=""/>
+                    <pic:cNvPr id="2031078954" name=""/>
                     <pic:cNvPicPr/>
                   </pic:nvPicPr>
                   <pic:blipFill>
@@ -21830,7 +21865,7 @@
           <w:sz w:val="27"/>
         </w:rPr>
       </w:pPr>
-      <w:bookmarkStart w:id="46" w:name="_Toc240463934"/>
+      <w:bookmarkStart w:id="46" w:name="_Toc240465798"/>
       <w:r>
         <w:rPr>
           <w:rFonts w:ascii="Montserrat" w:hAnsi="Montserrat"/>
@@ -21941,7 +21976,7 @@
           <w:sz w:val="27"/>
         </w:rPr>
       </w:pPr>
-      <w:bookmarkStart w:id="47" w:name="_Toc240463935"/>
+      <w:bookmarkStart w:id="47" w:name="_Toc240465799"/>
       <w:r>
         <w:rPr>
           <w:rFonts w:ascii="Montserrat" w:hAnsi="Montserrat"/>
@@ -22169,8 +22204,24 @@
           <w:color w:val="1A1A1A"/>
           <w:sz w:val="22"/>
         </w:rPr>
-        <w:t xml:space="preserve">O e-mail termina indicando a Gerencia de Projetos como alternativa de contato, caso a pessoa prefira ajustar o prazo diretamente em vez de seguir so pelo aviso automatico - o nome do Gerente vem do campo </w:t>
-      </w:r>
+        <w:t>O e-mail traz um link Abrir o Meu Painel, para quem recebeu o aviso ja ir direto tratar o item (secao 6.4.4) - e um link generico, sem nada especifico da pessoa; quem clicar precisa estar logado com a propria conta para ver o que esta atribuido a ela.</w:t>
+      </w:r>
+    </w:p>
+    <w:p>
+      <w:pPr>
+        <w:pStyle w:val="PargrafodaLista"/>
+        <w:numPr>
+          <w:ilvl w:val="0"/>
+          <w:numId w:val="36"/>
+        </w:numPr>
+        <w:spacing w:after="80" w:line="260" w:lineRule="auto"/>
+        <w:ind w:left="700"/>
+        <w:rPr>
+          <w:rFonts w:ascii="Montserrat" w:hAnsi="Montserrat"/>
+          <w:color w:val="1A1A1A"/>
+          <w:sz w:val="22"/>
+        </w:rPr>
+      </w:pPr>
       <w:r>
         <w:rPr>
           <w:rFonts w:ascii="Montserrat" w:hAnsi="Montserrat"/>
@@ -22178,7 +22229,7 @@
           <w:sz w:val="22"/>
         </w:rPr>
         <w:lastRenderedPageBreak/>
-        <w:t>Gerente do projeto do proprio Planejamento (aba 1, capa), nao e fixo; se esse campo estiver vazio no projeto, a frase aparece sem nome.</w:t>
+        <w:t>O e-mail termina indicando a Gerencia de Projetos como alternativa de contato, caso a pessoa prefira ajustar o prazo diretamente em vez de seguir so pelo aviso automatico - o nome do Gerente vem do campo Gerente do projeto do proprio Planejamento (aba 1, capa), nao e fixo; se esse campo estiver vazio no projeto, a frase aparece sem nome.</w:t>
       </w:r>
     </w:p>
     <w:p>
@@ -22192,7 +22243,7 @@
           <w:sz w:val="27"/>
         </w:rPr>
       </w:pPr>
-      <w:bookmarkStart w:id="48" w:name="_Toc240463936"/>
+      <w:bookmarkStart w:id="48" w:name="_Toc240465800"/>
       <w:r>
         <w:rPr>
           <w:rFonts w:ascii="Montserrat" w:hAnsi="Montserrat"/>
@@ -22810,16 +22861,16 @@
         </w:rPr>
         <w:lastRenderedPageBreak/>
         <w:drawing>
-          <wp:inline distT="0" distB="0" distL="0" distR="0" wp14:anchorId="4E77F9E5" wp14:editId="3FDC0DB9">
+          <wp:inline distT="0" distB="0" distL="0" distR="0" wp14:anchorId="157C5506" wp14:editId="19D78C73">
             <wp:extent cx="5120640" cy="6240599"/>
             <wp:effectExtent l="19050" t="19050" r="22860" b="27305"/>
-            <wp:docPr id="505503183" name="Imagem 54"/>
+            <wp:docPr id="627213485" name="Imagem 54"/>
             <wp:cNvGraphicFramePr/>
             <a:graphic xmlns:a="http://schemas.openxmlformats.org/drawingml/2006/main">
               <a:graphicData uri="http://schemas.openxmlformats.org/drawingml/2006/picture">
                 <pic:pic xmlns:pic="http://schemas.openxmlformats.org/drawingml/2006/picture">
                   <pic:nvPicPr>
-                    <pic:cNvPr id="505503183" name=""/>
+                    <pic:cNvPr id="627213485" name=""/>
                     <pic:cNvPicPr/>
                   </pic:nvPicPr>
                   <pic:blipFill>
@@ -22969,7 +23020,7 @@
           <w:sz w:val="27"/>
         </w:rPr>
       </w:pPr>
-      <w:bookmarkStart w:id="49" w:name="_Toc240463937"/>
+      <w:bookmarkStart w:id="49" w:name="_Toc240465801"/>
       <w:r>
         <w:rPr>
           <w:rFonts w:ascii="Montserrat" w:hAnsi="Montserrat"/>
@@ -23004,7 +23055,7 @@
         <w:pStyle w:val="PargrafodaLista"/>
         <w:numPr>
           <w:ilvl w:val="0"/>
-          <w:numId w:val="36"/>
+          <w:numId w:val="37"/>
         </w:numPr>
         <w:spacing w:after="80" w:line="260" w:lineRule="auto"/>
         <w:ind w:left="700"/>
@@ -23028,7 +23079,7 @@
         <w:pStyle w:val="PargrafodaLista"/>
         <w:numPr>
           <w:ilvl w:val="0"/>
-          <w:numId w:val="36"/>
+          <w:numId w:val="37"/>
         </w:numPr>
         <w:spacing w:after="80" w:line="260" w:lineRule="auto"/>
         <w:ind w:left="700"/>
@@ -23052,7 +23103,7 @@
         <w:pStyle w:val="PargrafodaLista"/>
         <w:numPr>
           <w:ilvl w:val="0"/>
-          <w:numId w:val="36"/>
+          <w:numId w:val="37"/>
         </w:numPr>
         <w:spacing w:after="80" w:line="260" w:lineRule="auto"/>
         <w:ind w:left="700"/>
@@ -23082,16 +23133,16 @@
         </w:rPr>
         <w:lastRenderedPageBreak/>
         <w:drawing>
-          <wp:inline distT="0" distB="0" distL="0" distR="0" wp14:anchorId="4CAFEBAC" wp14:editId="6FC96DC8">
+          <wp:inline distT="0" distB="0" distL="0" distR="0" wp14:anchorId="1B9C0AFE" wp14:editId="47C2EE71">
             <wp:extent cx="5120640" cy="6187296"/>
             <wp:effectExtent l="19050" t="19050" r="22860" b="23495"/>
-            <wp:docPr id="2028751379" name="Imagem 55"/>
+            <wp:docPr id="657531858" name="Imagem 55"/>
             <wp:cNvGraphicFramePr/>
             <a:graphic xmlns:a="http://schemas.openxmlformats.org/drawingml/2006/main">
               <a:graphicData uri="http://schemas.openxmlformats.org/drawingml/2006/picture">
                 <pic:pic xmlns:pic="http://schemas.openxmlformats.org/drawingml/2006/picture">
                   <pic:nvPicPr>
-                    <pic:cNvPr id="2028751379" name=""/>
+                    <pic:cNvPr id="657531858" name=""/>
                     <pic:cNvPicPr/>
                   </pic:nvPicPr>
                   <pic:blipFill>
@@ -23180,7 +23231,7 @@
           <w:sz w:val="27"/>
         </w:rPr>
       </w:pPr>
-      <w:bookmarkStart w:id="50" w:name="_Toc240463938"/>
+      <w:bookmarkStart w:id="50" w:name="_Toc240465802"/>
       <w:r>
         <w:rPr>
           <w:rFonts w:ascii="Montserrat" w:hAnsi="Montserrat"/>
@@ -23227,140 +23278,6 @@
           <w:sz w:val="22"/>
         </w:rPr>
         <w:t>Quando a Administracao e acessada em producao, aparece uma quarta aba, Ambiente de Treino, com um unico botao: Resetar ambiente de treinamento. Ao clicar (e confirmar o aviso), o sistema apaga todos os projetos e registros de formulario atualmente no ambiente de treinamento e recria os 7 projetos de exemplo do zero - util para deixar o ambiente limpo antes de uma nova turma, sem precisar rodar nenhum comando manualmente.</w:t>
-      </w:r>
-    </w:p>
-    <w:p>
-      <w:pPr>
-        <w:pStyle w:val="PargrafodaLista"/>
-        <w:numPr>
-          <w:ilvl w:val="0"/>
-          <w:numId w:val="37"/>
-        </w:numPr>
-        <w:spacing w:after="80" w:line="260" w:lineRule="auto"/>
-        <w:ind w:left="700"/>
-        <w:rPr>
-          <w:rFonts w:ascii="Montserrat" w:hAnsi="Montserrat"/>
-          <w:color w:val="1A1A1A"/>
-          <w:sz w:val="22"/>
-        </w:rPr>
-      </w:pPr>
-      <w:r>
-        <w:rPr>
-          <w:rFonts w:ascii="Montserrat" w:hAnsi="Montserrat"/>
-          <w:color w:val="1A1A1A"/>
-          <w:sz w:val="22"/>
-        </w:rPr>
-        <w:t>A aba so aparece quando a Administracao e acessada pelo endereco de producao - quem acessa a Administracao pelo proprio ambiente de treinamento nao ve essa opcao.</w:t>
-      </w:r>
-    </w:p>
-    <w:p>
-      <w:pPr>
-        <w:pStyle w:val="PargrafodaLista"/>
-        <w:numPr>
-          <w:ilvl w:val="0"/>
-          <w:numId w:val="37"/>
-        </w:numPr>
-        <w:spacing w:after="80" w:line="260" w:lineRule="auto"/>
-        <w:ind w:left="700"/>
-        <w:rPr>
-          <w:rFonts w:ascii="Montserrat" w:hAnsi="Montserrat"/>
-          <w:color w:val="1A1A1A"/>
-          <w:sz w:val="22"/>
-        </w:rPr>
-      </w:pPr>
-      <w:r>
-        <w:rPr>
-          <w:rFonts w:ascii="Montserrat" w:hAnsi="Montserrat"/>
-          <w:color w:val="1A1A1A"/>
-          <w:sz w:val="22"/>
-        </w:rPr>
-        <w:t>Nao afeta nenhum dado de producao em nenhuma hipotese - a acao roda numa Edge Function que so tem permissao de escrita no banco do ambiente de treinamento.</w:t>
-      </w:r>
-    </w:p>
-    <w:p>
-      <w:pPr>
-        <w:pStyle w:val="PargrafodaLista"/>
-        <w:numPr>
-          <w:ilvl w:val="0"/>
-          <w:numId w:val="37"/>
-        </w:numPr>
-        <w:spacing w:after="80" w:line="260" w:lineRule="auto"/>
-        <w:ind w:left="700"/>
-        <w:rPr>
-          <w:rFonts w:ascii="Montserrat" w:hAnsi="Montserrat"/>
-          <w:color w:val="1A1A1A"/>
-          <w:sz w:val="22"/>
-        </w:rPr>
-      </w:pPr>
-      <w:r>
-        <w:rPr>
-          <w:rFonts w:ascii="Montserrat" w:hAnsi="Montserrat"/>
-          <w:color w:val="1A1A1A"/>
-          <w:sz w:val="22"/>
-        </w:rPr>
-        <w:t>As 6 contas fixas de treinamento e as configuracoes do ambiente de treino nao sao apagadas pelo reset - so os projetos e os registros de formulario.</w:t>
-      </w:r>
-    </w:p>
-    <w:p>
-      <w:pPr>
-        <w:spacing w:before="160" w:after="200"/>
-        <w:ind w:left="283"/>
-        <w:rPr>
-          <w:rFonts w:ascii="Montserrat" w:hAnsi="Montserrat"/>
-          <w:i/>
-          <w:color w:val="6A6A70"/>
-          <w:sz w:val="21"/>
-        </w:rPr>
-      </w:pPr>
-      <w:r>
-        <w:rPr>
-          <w:rFonts w:ascii="Montserrat" w:hAnsi="Montserrat"/>
-          <w:i/>
-          <w:color w:val="6A6A70"/>
-          <w:sz w:val="21"/>
-        </w:rPr>
-        <w:t>Assim como as outras acoes exclusivas de Admin, a Edge Function confere o papel do usuario direto no banco de producao antes de fazer qualquer alteracao - nao basta ver o botao na tela.</w:t>
-      </w:r>
-    </w:p>
-    <w:p>
-      <w:pPr>
-        <w:pStyle w:val="Ttulo2"/>
-        <w:spacing w:before="320" w:after="120"/>
-        <w:rPr>
-          <w:rFonts w:ascii="Montserrat" w:hAnsi="Montserrat"/>
-          <w:b/>
-          <w:color w:val="B91D2E"/>
-          <w:sz w:val="27"/>
-        </w:rPr>
-      </w:pPr>
-      <w:bookmarkStart w:id="51" w:name="_Toc240463939"/>
-      <w:r>
-        <w:rPr>
-          <w:rFonts w:ascii="Montserrat" w:hAnsi="Montserrat"/>
-          <w:b/>
-          <w:color w:val="B91D2E"/>
-          <w:sz w:val="27"/>
-        </w:rPr>
-        <w:t>6.6 Backup automatizado</w:t>
-      </w:r>
-      <w:bookmarkEnd w:id="51"/>
-    </w:p>
-    <w:p>
-      <w:pPr>
-        <w:spacing w:line="280" w:lineRule="auto"/>
-        <w:rPr>
-          <w:rFonts w:ascii="Montserrat" w:hAnsi="Montserrat"/>
-          <w:color w:val="1A1A1A"/>
-          <w:sz w:val="22"/>
-        </w:rPr>
-      </w:pPr>
-      <w:r>
-        <w:rPr>
-          <w:rFonts w:ascii="Montserrat" w:hAnsi="Montserrat"/>
-          <w:color w:val="1A1A1A"/>
-          <w:sz w:val="22"/>
-        </w:rPr>
-        <w:t>No fim da aba Configuracoes (secao 6.3), um bloco separado deixa o Admin/PMO definir os parametros de uma rotina de backup periodico do sistema inteiro (banco de dados, arquivos anexados e codigo-fonte) para um destino fora do GitHub - complemento operacional a proposta Backup Automatizado entregue separadamente.</w:t>
       </w:r>
     </w:p>
     <w:p>
@@ -23384,7 +23301,7 @@
           <w:color w:val="1A1A1A"/>
           <w:sz w:val="22"/>
         </w:rPr>
-        <w:t>Habilitar backup automatizado: interruptor geral da rotina.</w:t>
+        <w:t>A aba so aparece quando a Administracao e acessada pelo endereco de producao - quem acessa a Administracao pelo proprio ambiente de treinamento nao ve essa opcao.</w:t>
       </w:r>
     </w:p>
     <w:p>
@@ -23408,7 +23325,7 @@
           <w:color w:val="1A1A1A"/>
           <w:sz w:val="22"/>
         </w:rPr>
-        <w:t>Destino: OneDrive/SharePoint institucional, outro armazenamento de nuvem ou servidor da instituicao, mais o caminho/pasta exato onde gravar.</w:t>
+        <w:t>Nao afeta nenhum dado de producao em nenhuma hipotese - a acao roda numa Edge Function que so tem permissao de escrita no banco do ambiente de treinamento.</w:t>
       </w:r>
     </w:p>
     <w:p>
@@ -23432,7 +23349,69 @@
           <w:color w:val="1A1A1A"/>
           <w:sz w:val="22"/>
         </w:rPr>
-        <w:t>Frequencia: diaria ou semanal.</w:t>
+        <w:t>As 6 contas fixas de treinamento e as configuracoes do ambiente de treino nao sao apagadas pelo reset - so os projetos e os registros de formulario.</w:t>
+      </w:r>
+    </w:p>
+    <w:p>
+      <w:pPr>
+        <w:spacing w:before="160" w:after="200"/>
+        <w:ind w:left="283"/>
+        <w:rPr>
+          <w:rFonts w:ascii="Montserrat" w:hAnsi="Montserrat"/>
+          <w:i/>
+          <w:color w:val="6A6A70"/>
+          <w:sz w:val="21"/>
+        </w:rPr>
+      </w:pPr>
+      <w:r>
+        <w:rPr>
+          <w:rFonts w:ascii="Montserrat" w:hAnsi="Montserrat"/>
+          <w:i/>
+          <w:color w:val="6A6A70"/>
+          <w:sz w:val="21"/>
+        </w:rPr>
+        <w:t>Assim como as outras acoes exclusivas de Admin, a Edge Function confere o papel do usuario direto no banco de producao antes de fazer qualquer alteracao - nao basta ver o botao na tela.</w:t>
+      </w:r>
+    </w:p>
+    <w:p>
+      <w:pPr>
+        <w:pStyle w:val="Ttulo2"/>
+        <w:spacing w:before="320" w:after="120"/>
+        <w:rPr>
+          <w:rFonts w:ascii="Montserrat" w:hAnsi="Montserrat"/>
+          <w:b/>
+          <w:color w:val="B91D2E"/>
+          <w:sz w:val="27"/>
+        </w:rPr>
+      </w:pPr>
+      <w:bookmarkStart w:id="51" w:name="_Toc240465803"/>
+      <w:r>
+        <w:rPr>
+          <w:rFonts w:ascii="Montserrat" w:hAnsi="Montserrat"/>
+          <w:b/>
+          <w:color w:val="B91D2E"/>
+          <w:sz w:val="27"/>
+        </w:rPr>
+        <w:t>6.6 Backup automatizado</w:t>
+      </w:r>
+      <w:bookmarkEnd w:id="51"/>
+    </w:p>
+    <w:p>
+      <w:pPr>
+        <w:spacing w:line="280" w:lineRule="auto"/>
+        <w:rPr>
+          <w:rFonts w:ascii="Montserrat" w:hAnsi="Montserrat"/>
+          <w:color w:val="1A1A1A"/>
+          <w:sz w:val="22"/>
+        </w:rPr>
+      </w:pPr>
+      <w:r>
+        <w:rPr>
+          <w:rFonts w:ascii="Montserrat" w:hAnsi="Montserrat"/>
+          <w:color w:val="1A1A1A"/>
+          <w:sz w:val="22"/>
+        </w:rPr>
+        <w:t>No fim da aba Configuracoes (secao 6.3), um bloco separado deixa o Admin/PMO definir os parametros de uma rotina de backup periodico do sistema inteiro (banco de dados, arquivos anexados e codigo-fonte) para um destino fora do GitHub - complemento operacional a proposta Backup Automatizado entregue separadamente.</w:t>
       </w:r>
     </w:p>
     <w:p>
@@ -23440,7 +23419,7 @@
         <w:pStyle w:val="PargrafodaLista"/>
         <w:numPr>
           <w:ilvl w:val="0"/>
-          <w:numId w:val="38"/>
+          <w:numId w:val="39"/>
         </w:numPr>
         <w:spacing w:after="80" w:line="260" w:lineRule="auto"/>
         <w:ind w:left="700"/>
@@ -23456,8 +23435,7 @@
           <w:color w:val="1A1A1A"/>
           <w:sz w:val="22"/>
         </w:rPr>
-        <w:lastRenderedPageBreak/>
-        <w:t>Retencao (dias, opcional): depois de quantos dias os backups antigos podem ser descartados; vazio mantem tudo indefinidamente.</w:t>
+        <w:t>Habilitar backup automatizado: interruptor geral da rotina.</w:t>
       </w:r>
     </w:p>
     <w:p>
@@ -23465,7 +23443,7 @@
         <w:pStyle w:val="PargrafodaLista"/>
         <w:numPr>
           <w:ilvl w:val="0"/>
-          <w:numId w:val="38"/>
+          <w:numId w:val="39"/>
         </w:numPr>
         <w:spacing w:after="80" w:line="260" w:lineRule="auto"/>
         <w:ind w:left="700"/>
@@ -23481,7 +23459,7 @@
           <w:color w:val="1A1A1A"/>
           <w:sz w:val="22"/>
         </w:rPr>
-        <w:t>E-mail de alerta: para onde avisar automaticamente se uma execucao falhar.</w:t>
+        <w:t>Destino: OneDrive/SharePoint institucional, outro armazenamento de nuvem ou servidor da instituicao, mais o caminho/pasta exato onde gravar.</w:t>
       </w:r>
     </w:p>
     <w:p>
@@ -23489,7 +23467,7 @@
         <w:pStyle w:val="PargrafodaLista"/>
         <w:numPr>
           <w:ilvl w:val="0"/>
-          <w:numId w:val="38"/>
+          <w:numId w:val="39"/>
         </w:numPr>
         <w:spacing w:after="80" w:line="260" w:lineRule="auto"/>
         <w:ind w:left="700"/>
@@ -23505,7 +23483,7 @@
           <w:color w:val="1A1A1A"/>
           <w:sz w:val="22"/>
         </w:rPr>
-        <w:t>E-mails com acesso ao destino externo: campo de registro/referencia de quem deveria ter permissao na pasta de destino - conceder esse acesso de fato continua sendo feito manualmente onde o destino estiver (OneDrive, repositorio etc.).</w:t>
+        <w:t>Frequencia: diaria ou semanal.</w:t>
       </w:r>
     </w:p>
     <w:p>
@@ -23513,7 +23491,7 @@
         <w:pStyle w:val="PargrafodaLista"/>
         <w:numPr>
           <w:ilvl w:val="0"/>
-          <w:numId w:val="38"/>
+          <w:numId w:val="39"/>
         </w:numPr>
         <w:spacing w:after="80" w:line="260" w:lineRule="auto"/>
         <w:ind w:left="700"/>
@@ -23529,7 +23507,8 @@
           <w:color w:val="1A1A1A"/>
           <w:sz w:val="22"/>
         </w:rPr>
-        <w:t>Quem pode gerenciar essas configuracoes: papeis liberados para alterar esta tela, alem do PMO/Admin, que sempre tem acesso.</w:t>
+        <w:lastRenderedPageBreak/>
+        <w:t>Retencao (dias, opcional): depois de quantos dias os backups antigos podem ser descartados; vazio mantem tudo indefinidamente.</w:t>
       </w:r>
     </w:p>
     <w:p>
@@ -23537,7 +23516,7 @@
         <w:pStyle w:val="PargrafodaLista"/>
         <w:numPr>
           <w:ilvl w:val="0"/>
-          <w:numId w:val="38"/>
+          <w:numId w:val="39"/>
         </w:numPr>
         <w:spacing w:after="80" w:line="260" w:lineRule="auto"/>
         <w:ind w:left="700"/>
@@ -23553,6 +23532,78 @@
           <w:color w:val="1A1A1A"/>
           <w:sz w:val="22"/>
         </w:rPr>
+        <w:t>E-mail de alerta: para onde avisar automaticamente se uma execucao falhar.</w:t>
+      </w:r>
+    </w:p>
+    <w:p>
+      <w:pPr>
+        <w:pStyle w:val="PargrafodaLista"/>
+        <w:numPr>
+          <w:ilvl w:val="0"/>
+          <w:numId w:val="39"/>
+        </w:numPr>
+        <w:spacing w:after="80" w:line="260" w:lineRule="auto"/>
+        <w:ind w:left="700"/>
+        <w:rPr>
+          <w:rFonts w:ascii="Montserrat" w:hAnsi="Montserrat"/>
+          <w:color w:val="1A1A1A"/>
+          <w:sz w:val="22"/>
+        </w:rPr>
+      </w:pPr>
+      <w:r>
+        <w:rPr>
+          <w:rFonts w:ascii="Montserrat" w:hAnsi="Montserrat"/>
+          <w:color w:val="1A1A1A"/>
+          <w:sz w:val="22"/>
+        </w:rPr>
+        <w:t>E-mails com acesso ao destino externo: campo de registro/referencia de quem deveria ter permissao na pasta de destino - conceder esse acesso de fato continua sendo feito manualmente onde o destino estiver (OneDrive, repositorio etc.).</w:t>
+      </w:r>
+    </w:p>
+    <w:p>
+      <w:pPr>
+        <w:pStyle w:val="PargrafodaLista"/>
+        <w:numPr>
+          <w:ilvl w:val="0"/>
+          <w:numId w:val="39"/>
+        </w:numPr>
+        <w:spacing w:after="80" w:line="260" w:lineRule="auto"/>
+        <w:ind w:left="700"/>
+        <w:rPr>
+          <w:rFonts w:ascii="Montserrat" w:hAnsi="Montserrat"/>
+          <w:color w:val="1A1A1A"/>
+          <w:sz w:val="22"/>
+        </w:rPr>
+      </w:pPr>
+      <w:r>
+        <w:rPr>
+          <w:rFonts w:ascii="Montserrat" w:hAnsi="Montserrat"/>
+          <w:color w:val="1A1A1A"/>
+          <w:sz w:val="22"/>
+        </w:rPr>
+        <w:t>Quem pode gerenciar essas configuracoes: papeis liberados para alterar esta tela, alem do PMO/Admin, que sempre tem acesso.</w:t>
+      </w:r>
+    </w:p>
+    <w:p>
+      <w:pPr>
+        <w:pStyle w:val="PargrafodaLista"/>
+        <w:numPr>
+          <w:ilvl w:val="0"/>
+          <w:numId w:val="39"/>
+        </w:numPr>
+        <w:spacing w:after="80" w:line="260" w:lineRule="auto"/>
+        <w:ind w:left="700"/>
+        <w:rPr>
+          <w:rFonts w:ascii="Montserrat" w:hAnsi="Montserrat"/>
+          <w:color w:val="1A1A1A"/>
+          <w:sz w:val="22"/>
+        </w:rPr>
+      </w:pPr>
+      <w:r>
+        <w:rPr>
+          <w:rFonts w:ascii="Montserrat" w:hAnsi="Montserrat"/>
+          <w:color w:val="1A1A1A"/>
+          <w:sz w:val="22"/>
+        </w:rPr>
         <w:t>Ultima execucao: data/hora e status (sucesso ou falha) da ultima vez que a rotina automatizada rodou, preenchido por ela mesma.</w:t>
       </w:r>
     </w:p>
@@ -23626,16 +23677,16 @@
           <w:noProof/>
         </w:rPr>
         <w:drawing>
-          <wp:inline distT="0" distB="0" distL="0" distR="0" wp14:anchorId="0D5045F0" wp14:editId="0CBD3A4A">
+          <wp:inline distT="0" distB="0" distL="0" distR="0" wp14:anchorId="5B583D47" wp14:editId="48B97253">
             <wp:extent cx="5303520" cy="1351384"/>
             <wp:effectExtent l="19050" t="19050" r="11430" b="20320"/>
-            <wp:docPr id="789505750" name="Imagem 56"/>
+            <wp:docPr id="958026046" name="Imagem 56"/>
             <wp:cNvGraphicFramePr/>
             <a:graphic xmlns:a="http://schemas.openxmlformats.org/drawingml/2006/main">
               <a:graphicData uri="http://schemas.openxmlformats.org/drawingml/2006/picture">
                 <pic:pic xmlns:pic="http://schemas.openxmlformats.org/drawingml/2006/picture">
                   <pic:nvPicPr>
-                    <pic:cNvPr id="789505750" name=""/>
+                    <pic:cNvPr id="958026046" name=""/>
                     <pic:cNvPicPr/>
                   </pic:nvPicPr>
                   <pic:blipFill>
@@ -23703,7 +23754,7 @@
           <w:sz w:val="27"/>
         </w:rPr>
       </w:pPr>
-      <w:bookmarkStart w:id="52" w:name="_Toc240463940"/>
+      <w:bookmarkStart w:id="52" w:name="_Toc240465804"/>
       <w:r>
         <w:rPr>
           <w:rFonts w:ascii="Montserrat" w:hAnsi="Montserrat"/>
@@ -23739,7 +23790,7 @@
         <w:pStyle w:val="PargrafodaLista"/>
         <w:numPr>
           <w:ilvl w:val="0"/>
-          <w:numId w:val="39"/>
+          <w:numId w:val="40"/>
         </w:numPr>
         <w:spacing w:after="80" w:line="260" w:lineRule="auto"/>
         <w:ind w:left="700"/>
@@ -23763,7 +23814,7 @@
         <w:pStyle w:val="PargrafodaLista"/>
         <w:numPr>
           <w:ilvl w:val="0"/>
-          <w:numId w:val="39"/>
+          <w:numId w:val="40"/>
         </w:numPr>
         <w:spacing w:after="80" w:line="260" w:lineRule="auto"/>
         <w:ind w:left="700"/>
@@ -23787,7 +23838,7 @@
         <w:pStyle w:val="PargrafodaLista"/>
         <w:numPr>
           <w:ilvl w:val="0"/>
-          <w:numId w:val="39"/>
+          <w:numId w:val="40"/>
         </w:numPr>
         <w:spacing w:after="80" w:line="260" w:lineRule="auto"/>
         <w:ind w:left="700"/>
@@ -23811,7 +23862,7 @@
         <w:pStyle w:val="PargrafodaLista"/>
         <w:numPr>
           <w:ilvl w:val="0"/>
-          <w:numId w:val="39"/>
+          <w:numId w:val="40"/>
         </w:numPr>
         <w:spacing w:after="80" w:line="260" w:lineRule="auto"/>
         <w:ind w:left="700"/>
@@ -23840,16 +23891,16 @@
           <w:noProof/>
         </w:rPr>
         <w:drawing>
-          <wp:inline distT="0" distB="0" distL="0" distR="0" wp14:anchorId="76E4D626" wp14:editId="4487E693">
+          <wp:inline distT="0" distB="0" distL="0" distR="0" wp14:anchorId="4F2030AC" wp14:editId="580BB4A8">
             <wp:extent cx="5303520" cy="1422793"/>
             <wp:effectExtent l="19050" t="19050" r="11430" b="25400"/>
-            <wp:docPr id="1931821066" name="Imagem 57"/>
+            <wp:docPr id="1198676987" name="Imagem 57"/>
             <wp:cNvGraphicFramePr/>
             <a:graphic xmlns:a="http://schemas.openxmlformats.org/drawingml/2006/main">
               <a:graphicData uri="http://schemas.openxmlformats.org/drawingml/2006/picture">
                 <pic:pic xmlns:pic="http://schemas.openxmlformats.org/drawingml/2006/picture">
                   <pic:nvPicPr>
-                    <pic:cNvPr id="1931821066" name=""/>
+                    <pic:cNvPr id="1198676987" name=""/>
                     <pic:cNvPicPr/>
                   </pic:nvPicPr>
                   <pic:blipFill>
@@ -23984,7 +24035,7 @@
         <w:pStyle w:val="PargrafodaLista"/>
         <w:numPr>
           <w:ilvl w:val="0"/>
-          <w:numId w:val="40"/>
+          <w:numId w:val="41"/>
         </w:numPr>
         <w:spacing w:after="80" w:line="260" w:lineRule="auto"/>
         <w:ind w:left="700"/>
@@ -24013,16 +24064,16 @@
           <w:noProof/>
         </w:rPr>
         <w:drawing>
-          <wp:inline distT="0" distB="0" distL="0" distR="0" wp14:anchorId="1DADD424" wp14:editId="31B400B3">
+          <wp:inline distT="0" distB="0" distL="0" distR="0" wp14:anchorId="77310B0D" wp14:editId="746CFDF5">
             <wp:extent cx="5303520" cy="1841050"/>
             <wp:effectExtent l="19050" t="19050" r="11430" b="26035"/>
-            <wp:docPr id="1837310868" name="Imagem 58"/>
+            <wp:docPr id="1283425083" name="Imagem 58"/>
             <wp:cNvGraphicFramePr/>
             <a:graphic xmlns:a="http://schemas.openxmlformats.org/drawingml/2006/main">
               <a:graphicData uri="http://schemas.openxmlformats.org/drawingml/2006/picture">
                 <pic:pic xmlns:pic="http://schemas.openxmlformats.org/drawingml/2006/picture">
                   <pic:nvPicPr>
-                    <pic:cNvPr id="1837310868" name=""/>
+                    <pic:cNvPr id="1283425083" name=""/>
                     <pic:cNvPicPr/>
                   </pic:nvPicPr>
                   <pic:blipFill>
@@ -24123,7 +24174,7 @@
         <w:pStyle w:val="PargrafodaLista"/>
         <w:numPr>
           <w:ilvl w:val="0"/>
-          <w:numId w:val="40"/>
+          <w:numId w:val="41"/>
         </w:numPr>
         <w:spacing w:after="80" w:line="260" w:lineRule="auto"/>
         <w:ind w:left="700"/>
@@ -24147,7 +24198,7 @@
         <w:pStyle w:val="PargrafodaLista"/>
         <w:numPr>
           <w:ilvl w:val="0"/>
-          <w:numId w:val="40"/>
+          <w:numId w:val="41"/>
         </w:numPr>
         <w:spacing w:after="80" w:line="260" w:lineRule="auto"/>
         <w:ind w:left="700"/>
@@ -24185,16 +24236,16 @@
           <w:noProof/>
         </w:rPr>
         <w:drawing>
-          <wp:inline distT="0" distB="0" distL="0" distR="0" wp14:anchorId="13F057EB" wp14:editId="3688432E">
+          <wp:inline distT="0" distB="0" distL="0" distR="0" wp14:anchorId="45C3B0AA" wp14:editId="262E912B">
             <wp:extent cx="5303520" cy="303041"/>
             <wp:effectExtent l="19050" t="19050" r="11430" b="20955"/>
-            <wp:docPr id="1562015630" name="Imagem 59"/>
+            <wp:docPr id="1591923434" name="Imagem 59"/>
             <wp:cNvGraphicFramePr/>
             <a:graphic xmlns:a="http://schemas.openxmlformats.org/drawingml/2006/main">
               <a:graphicData uri="http://schemas.openxmlformats.org/drawingml/2006/picture">
                 <pic:pic xmlns:pic="http://schemas.openxmlformats.org/drawingml/2006/picture">
                   <pic:nvPicPr>
-                    <pic:cNvPr id="1562015630" name=""/>
+                    <pic:cNvPr id="1591923434" name=""/>
                     <pic:cNvPicPr/>
                   </pic:nvPicPr>
                   <pic:blipFill>
@@ -24261,16 +24312,16 @@
           <w:noProof/>
         </w:rPr>
         <w:drawing>
-          <wp:inline distT="0" distB="0" distL="0" distR="0" wp14:anchorId="59CB26B1" wp14:editId="5BBD7268">
+          <wp:inline distT="0" distB="0" distL="0" distR="0" wp14:anchorId="4DCA0744" wp14:editId="68098DD3">
             <wp:extent cx="5303520" cy="2983005"/>
             <wp:effectExtent l="19050" t="19050" r="11430" b="27305"/>
-            <wp:docPr id="1302134349" name="Imagem 60"/>
+            <wp:docPr id="1017326446" name="Imagem 60"/>
             <wp:cNvGraphicFramePr/>
             <a:graphic xmlns:a="http://schemas.openxmlformats.org/drawingml/2006/main">
               <a:graphicData uri="http://schemas.openxmlformats.org/drawingml/2006/picture">
                 <pic:pic xmlns:pic="http://schemas.openxmlformats.org/drawingml/2006/picture">
                   <pic:nvPicPr>
-                    <pic:cNvPr id="1302134349" name=""/>
+                    <pic:cNvPr id="1017326446" name=""/>
                     <pic:cNvPicPr/>
                   </pic:nvPicPr>
                   <pic:blipFill>
@@ -24342,7 +24393,7 @@
           <w:sz w:val="34"/>
         </w:rPr>
       </w:pPr>
-      <w:bookmarkStart w:id="53" w:name="_Toc240463941"/>
+      <w:bookmarkStart w:id="53" w:name="_Toc240465805"/>
       <w:r>
         <w:rPr>
           <w:rFonts w:ascii="Montserrat" w:hAnsi="Montserrat"/>
@@ -24586,7 +24637,7 @@
           <w:sz w:val="34"/>
         </w:rPr>
       </w:pPr>
-      <w:bookmarkStart w:id="54" w:name="_Toc240463942"/>
+      <w:bookmarkStart w:id="54" w:name="_Toc240465806"/>
       <w:r>
         <w:rPr>
           <w:rFonts w:ascii="Montserrat" w:hAnsi="Montserrat"/>
@@ -26374,7 +26425,7 @@
 <file path=word/numbering.xml><?xml version="1.0" encoding="utf-8"?>
 <w:numbering xmlns:wpc="http://schemas.microsoft.com/office/word/2010/wordprocessingCanvas" xmlns:cx="http://schemas.microsoft.com/office/drawing/2014/chartex" xmlns:cx1="http://schemas.microsoft.com/office/drawing/2015/9/8/chartex" xmlns:cx2="http://schemas.microsoft.com/office/drawing/2015/10/21/chartex" xmlns:cx3="http://schemas.microsoft.com/office/drawing/2016/5/9/chartex" xmlns:cx4="http://schemas.microsoft.com/office/drawing/2016/5/10/chartex" xmlns:cx5="http://schemas.microsoft.com/office/drawing/2016/5/11/chartex" xmlns:cx6="http://schemas.microsoft.com/office/drawing/2016/5/12/chartex" xmlns:cx7="http://schemas.microsoft.com/office/drawing/2016/5/13/chartex" xmlns:cx8="http://schemas.microsoft.com/office/drawing/2016/5/14/chartex" xmlns:mc="http://schemas.openxmlformats.org/markup-compatibility/2006" xmlns:aink="http://schemas.microsoft.com/office/drawing/2016/ink" xmlns:am3d="http://schemas.microsoft.com/office/drawing/2017/model3d" xmlns:o="urn:schemas-microsoft-com:office:office" xmlns:oel="http://schemas.microsoft.com/office/2019/extlst" xmlns:r="http://schemas.openxmlformats.org/officeDocument/2006/relationships" xmlns:m="http://schemas.openxmlformats.org/officeDocument/2006/math" xmlns:v="urn:schemas-microsoft-com:vml" xmlns:wp14="http://schemas.microsoft.com/office/word/2010/wordprocessingDrawing" xmlns:wp="http://schemas.openxmlformats.org/drawingml/2006/wordprocessingDrawing" xmlns:w10="urn:schemas-microsoft-com:office:word" xmlns:w="http://schemas.openxmlformats.org/wordprocessingml/2006/main" xmlns:w14="http://schemas.microsoft.com/office/word/2010/wordml" xmlns:w15="http://schemas.microsoft.com/office/word/2012/wordml" xmlns:w16cex="http://schemas.microsoft.com/office/word/2018/wordml/cex" xmlns:w16cid="http://schemas.microsoft.com/office/word/2016/wordml/cid" xmlns:w16="http://schemas.microsoft.com/office/word/2018/wordml" xmlns:w16du="http://schemas.microsoft.com/office/word/2023/wordml/word16du" xmlns:w16sdtdh="http://schemas.microsoft.com/office/word/2020/wordml/sdtdatahash" xmlns:w16sdtfl="http://schemas.microsoft.com/office/word/2024/wordml/sdtformatlock" xmlns:w16se="http://schemas.microsoft.com/office/word/2015/wordml/symex" xmlns:wpg="http://schemas.microsoft.com/office/word/2010/wordprocessingGroup" xmlns:wpi="http://schemas.microsoft.com/office/word/2010/wordprocessingInk" xmlns:wne="http://schemas.microsoft.com/office/word/2006/wordml" xmlns:wps="http://schemas.microsoft.com/office/word/2010/wordprocessingShape" mc:Ignorable="w14 w15 w16se w16cid w16 w16cex w16sdtdh w16sdtfl w16du wp14">
   <w:abstractNum w:abstractNumId="0" w15:restartNumberingAfterBreak="0">
-    <w:nsid w:val="00C52AC6"/>
+    <w:nsid w:val="01DA2D83"/>
     <w:multiLevelType w:val="singleLevel"/>
     <w:tmpl w:val="04160001"/>
     <w:lvl w:ilvl="0">
@@ -26391,7 +26442,7 @@
     </w:lvl>
   </w:abstractNum>
   <w:abstractNum w:abstractNumId="1" w15:restartNumberingAfterBreak="0">
-    <w:nsid w:val="01D8582D"/>
+    <w:nsid w:val="07FE58C8"/>
     <w:multiLevelType w:val="singleLevel"/>
     <w:tmpl w:val="04160001"/>
     <w:lvl w:ilvl="0">
@@ -26408,7 +26459,7 @@
     </w:lvl>
   </w:abstractNum>
   <w:abstractNum w:abstractNumId="2" w15:restartNumberingAfterBreak="0">
-    <w:nsid w:val="03D47C17"/>
+    <w:nsid w:val="0C524D5A"/>
     <w:multiLevelType w:val="singleLevel"/>
     <w:tmpl w:val="04160001"/>
     <w:lvl w:ilvl="0">
@@ -26425,7 +26476,7 @@
     </w:lvl>
   </w:abstractNum>
   <w:abstractNum w:abstractNumId="3" w15:restartNumberingAfterBreak="0">
-    <w:nsid w:val="06CA1A92"/>
+    <w:nsid w:val="207B4609"/>
     <w:multiLevelType w:val="singleLevel"/>
     <w:tmpl w:val="04160001"/>
     <w:lvl w:ilvl="0">
@@ -26442,7 +26493,7 @@
     </w:lvl>
   </w:abstractNum>
   <w:abstractNum w:abstractNumId="4" w15:restartNumberingAfterBreak="0">
-    <w:nsid w:val="0F9A3742"/>
+    <w:nsid w:val="2D584E33"/>
     <w:multiLevelType w:val="singleLevel"/>
     <w:tmpl w:val="04160001"/>
     <w:lvl w:ilvl="0">
@@ -26459,7 +26510,7 @@
     </w:lvl>
   </w:abstractNum>
   <w:abstractNum w:abstractNumId="5" w15:restartNumberingAfterBreak="0">
-    <w:nsid w:val="18B918E0"/>
+    <w:nsid w:val="2DED086B"/>
     <w:multiLevelType w:val="singleLevel"/>
     <w:tmpl w:val="04160001"/>
     <w:lvl w:ilvl="0">
@@ -26476,7 +26527,7 @@
     </w:lvl>
   </w:abstractNum>
   <w:abstractNum w:abstractNumId="6" w15:restartNumberingAfterBreak="0">
-    <w:nsid w:val="19452D61"/>
+    <w:nsid w:val="2FAE6CC1"/>
     <w:multiLevelType w:val="singleLevel"/>
     <w:tmpl w:val="04160001"/>
     <w:lvl w:ilvl="0">
@@ -26493,7 +26544,7 @@
     </w:lvl>
   </w:abstractNum>
   <w:abstractNum w:abstractNumId="7" w15:restartNumberingAfterBreak="0">
-    <w:nsid w:val="1CE82FDB"/>
+    <w:nsid w:val="323D0C04"/>
     <w:multiLevelType w:val="singleLevel"/>
     <w:tmpl w:val="04160001"/>
     <w:lvl w:ilvl="0">
@@ -26510,7 +26561,7 @@
     </w:lvl>
   </w:abstractNum>
   <w:abstractNum w:abstractNumId="8" w15:restartNumberingAfterBreak="0">
-    <w:nsid w:val="1D1B3E93"/>
+    <w:nsid w:val="340B44C7"/>
     <w:multiLevelType w:val="singleLevel"/>
     <w:tmpl w:val="04160001"/>
     <w:lvl w:ilvl="0">
@@ -26527,7 +26578,7 @@
     </w:lvl>
   </w:abstractNum>
   <w:abstractNum w:abstractNumId="9" w15:restartNumberingAfterBreak="0">
-    <w:nsid w:val="234951BC"/>
+    <w:nsid w:val="35430445"/>
     <w:multiLevelType w:val="singleLevel"/>
     <w:tmpl w:val="04160001"/>
     <w:lvl w:ilvl="0">
@@ -26544,7 +26595,7 @@
     </w:lvl>
   </w:abstractNum>
   <w:abstractNum w:abstractNumId="10" w15:restartNumberingAfterBreak="0">
-    <w:nsid w:val="27DB4678"/>
+    <w:nsid w:val="39385472"/>
     <w:multiLevelType w:val="singleLevel"/>
     <w:tmpl w:val="04160001"/>
     <w:lvl w:ilvl="0">
@@ -26561,7 +26612,7 @@
     </w:lvl>
   </w:abstractNum>
   <w:abstractNum w:abstractNumId="11" w15:restartNumberingAfterBreak="0">
-    <w:nsid w:val="284E71BD"/>
+    <w:nsid w:val="42697ABD"/>
     <w:multiLevelType w:val="singleLevel"/>
     <w:tmpl w:val="04160001"/>
     <w:lvl w:ilvl="0">
@@ -26578,7 +26629,7 @@
     </w:lvl>
   </w:abstractNum>
   <w:abstractNum w:abstractNumId="12" w15:restartNumberingAfterBreak="0">
-    <w:nsid w:val="28C54449"/>
+    <w:nsid w:val="43C34474"/>
     <w:multiLevelType w:val="singleLevel"/>
     <w:tmpl w:val="04160001"/>
     <w:lvl w:ilvl="0">
@@ -26595,7 +26646,7 @@
     </w:lvl>
   </w:abstractNum>
   <w:abstractNum w:abstractNumId="13" w15:restartNumberingAfterBreak="0">
-    <w:nsid w:val="29030331"/>
+    <w:nsid w:val="466B2923"/>
     <w:multiLevelType w:val="singleLevel"/>
     <w:tmpl w:val="04160001"/>
     <w:lvl w:ilvl="0">
@@ -26612,7 +26663,7 @@
     </w:lvl>
   </w:abstractNum>
   <w:abstractNum w:abstractNumId="14" w15:restartNumberingAfterBreak="0">
-    <w:nsid w:val="2F9D6706"/>
+    <w:nsid w:val="46754246"/>
     <w:multiLevelType w:val="singleLevel"/>
     <w:tmpl w:val="04160001"/>
     <w:lvl w:ilvl="0">
@@ -26629,7 +26680,7 @@
     </w:lvl>
   </w:abstractNum>
   <w:abstractNum w:abstractNumId="15" w15:restartNumberingAfterBreak="0">
-    <w:nsid w:val="33016F3D"/>
+    <w:nsid w:val="47E02515"/>
     <w:multiLevelType w:val="singleLevel"/>
     <w:tmpl w:val="04160001"/>
     <w:lvl w:ilvl="0">
@@ -26646,7 +26697,7 @@
     </w:lvl>
   </w:abstractNum>
   <w:abstractNum w:abstractNumId="16" w15:restartNumberingAfterBreak="0">
-    <w:nsid w:val="383172AA"/>
+    <w:nsid w:val="4B8457D7"/>
     <w:multiLevelType w:val="singleLevel"/>
     <w:tmpl w:val="04160001"/>
     <w:lvl w:ilvl="0">
@@ -26663,7 +26714,7 @@
     </w:lvl>
   </w:abstractNum>
   <w:abstractNum w:abstractNumId="17" w15:restartNumberingAfterBreak="0">
-    <w:nsid w:val="39BF031D"/>
+    <w:nsid w:val="503723DE"/>
     <w:multiLevelType w:val="singleLevel"/>
     <w:tmpl w:val="04160001"/>
     <w:lvl w:ilvl="0">
@@ -26680,7 +26731,7 @@
     </w:lvl>
   </w:abstractNum>
   <w:abstractNum w:abstractNumId="18" w15:restartNumberingAfterBreak="0">
-    <w:nsid w:val="3AC966A6"/>
+    <w:nsid w:val="515B6839"/>
     <w:multiLevelType w:val="singleLevel"/>
     <w:tmpl w:val="04160001"/>
     <w:lvl w:ilvl="0">
@@ -26697,7 +26748,7 @@
     </w:lvl>
   </w:abstractNum>
   <w:abstractNum w:abstractNumId="19" w15:restartNumberingAfterBreak="0">
-    <w:nsid w:val="41BA3235"/>
+    <w:nsid w:val="531B6952"/>
     <w:multiLevelType w:val="singleLevel"/>
     <w:tmpl w:val="04160001"/>
     <w:lvl w:ilvl="0">
@@ -26714,7 +26765,7 @@
     </w:lvl>
   </w:abstractNum>
   <w:abstractNum w:abstractNumId="20" w15:restartNumberingAfterBreak="0">
-    <w:nsid w:val="4CEE7B0F"/>
+    <w:nsid w:val="558F08A1"/>
     <w:multiLevelType w:val="singleLevel"/>
     <w:tmpl w:val="04160001"/>
     <w:lvl w:ilvl="0">
@@ -26731,7 +26782,7 @@
     </w:lvl>
   </w:abstractNum>
   <w:abstractNum w:abstractNumId="21" w15:restartNumberingAfterBreak="0">
-    <w:nsid w:val="51D40B2F"/>
+    <w:nsid w:val="598E6C6E"/>
     <w:multiLevelType w:val="singleLevel"/>
     <w:tmpl w:val="04160001"/>
     <w:lvl w:ilvl="0">
@@ -26748,7 +26799,7 @@
     </w:lvl>
   </w:abstractNum>
   <w:abstractNum w:abstractNumId="22" w15:restartNumberingAfterBreak="0">
-    <w:nsid w:val="535369A4"/>
+    <w:nsid w:val="5CFC7609"/>
     <w:multiLevelType w:val="singleLevel"/>
     <w:tmpl w:val="04160001"/>
     <w:lvl w:ilvl="0">
@@ -26765,7 +26816,7 @@
     </w:lvl>
   </w:abstractNum>
   <w:abstractNum w:abstractNumId="23" w15:restartNumberingAfterBreak="0">
-    <w:nsid w:val="56147642"/>
+    <w:nsid w:val="5D497151"/>
     <w:multiLevelType w:val="singleLevel"/>
     <w:tmpl w:val="04160001"/>
     <w:lvl w:ilvl="0">
@@ -26782,7 +26833,7 @@
     </w:lvl>
   </w:abstractNum>
   <w:abstractNum w:abstractNumId="24" w15:restartNumberingAfterBreak="0">
-    <w:nsid w:val="56454CB5"/>
+    <w:nsid w:val="5EA2344D"/>
     <w:multiLevelType w:val="singleLevel"/>
     <w:tmpl w:val="04160001"/>
     <w:lvl w:ilvl="0">
@@ -26799,7 +26850,7 @@
     </w:lvl>
   </w:abstractNum>
   <w:abstractNum w:abstractNumId="25" w15:restartNumberingAfterBreak="0">
-    <w:nsid w:val="59BF4CB2"/>
+    <w:nsid w:val="5FB9027B"/>
     <w:multiLevelType w:val="singleLevel"/>
     <w:tmpl w:val="04160001"/>
     <w:lvl w:ilvl="0">
@@ -26816,7 +26867,7 @@
     </w:lvl>
   </w:abstractNum>
   <w:abstractNum w:abstractNumId="26" w15:restartNumberingAfterBreak="0">
-    <w:nsid w:val="5B895553"/>
+    <w:nsid w:val="60AF5788"/>
     <w:multiLevelType w:val="singleLevel"/>
     <w:tmpl w:val="04160001"/>
     <w:lvl w:ilvl="0">
@@ -26833,7 +26884,7 @@
     </w:lvl>
   </w:abstractNum>
   <w:abstractNum w:abstractNumId="27" w15:restartNumberingAfterBreak="0">
-    <w:nsid w:val="5D6C3318"/>
+    <w:nsid w:val="62F6446A"/>
     <w:multiLevelType w:val="singleLevel"/>
     <w:tmpl w:val="04160001"/>
     <w:lvl w:ilvl="0">
@@ -26850,7 +26901,7 @@
     </w:lvl>
   </w:abstractNum>
   <w:abstractNum w:abstractNumId="28" w15:restartNumberingAfterBreak="0">
-    <w:nsid w:val="5EA76F2A"/>
+    <w:nsid w:val="64113B37"/>
     <w:multiLevelType w:val="singleLevel"/>
     <w:tmpl w:val="04160001"/>
     <w:lvl w:ilvl="0">
@@ -26867,7 +26918,7 @@
     </w:lvl>
   </w:abstractNum>
   <w:abstractNum w:abstractNumId="29" w15:restartNumberingAfterBreak="0">
-    <w:nsid w:val="630C1684"/>
+    <w:nsid w:val="651F15ED"/>
     <w:multiLevelType w:val="singleLevel"/>
     <w:tmpl w:val="04160001"/>
     <w:lvl w:ilvl="0">
@@ -26884,7 +26935,7 @@
     </w:lvl>
   </w:abstractNum>
   <w:abstractNum w:abstractNumId="30" w15:restartNumberingAfterBreak="0">
-    <w:nsid w:val="64E43924"/>
+    <w:nsid w:val="6BCC3DA5"/>
     <w:multiLevelType w:val="singleLevel"/>
     <w:tmpl w:val="04160001"/>
     <w:lvl w:ilvl="0">
@@ -26901,7 +26952,7 @@
     </w:lvl>
   </w:abstractNum>
   <w:abstractNum w:abstractNumId="31" w15:restartNumberingAfterBreak="0">
-    <w:nsid w:val="66256248"/>
+    <w:nsid w:val="6D407764"/>
     <w:multiLevelType w:val="singleLevel"/>
     <w:tmpl w:val="04160001"/>
     <w:lvl w:ilvl="0">
@@ -26918,7 +26969,7 @@
     </w:lvl>
   </w:abstractNum>
   <w:abstractNum w:abstractNumId="32" w15:restartNumberingAfterBreak="0">
-    <w:nsid w:val="6ABE4DD5"/>
+    <w:nsid w:val="6E92332C"/>
     <w:multiLevelType w:val="singleLevel"/>
     <w:tmpl w:val="04160001"/>
     <w:lvl w:ilvl="0">
@@ -26935,7 +26986,7 @@
     </w:lvl>
   </w:abstractNum>
   <w:abstractNum w:abstractNumId="33" w15:restartNumberingAfterBreak="0">
-    <w:nsid w:val="6EDE7DE1"/>
+    <w:nsid w:val="6EA45BD3"/>
     <w:multiLevelType w:val="singleLevel"/>
     <w:tmpl w:val="04160001"/>
     <w:lvl w:ilvl="0">
@@ -26952,7 +27003,7 @@
     </w:lvl>
   </w:abstractNum>
   <w:abstractNum w:abstractNumId="34" w15:restartNumberingAfterBreak="0">
-    <w:nsid w:val="6F974EEB"/>
+    <w:nsid w:val="6F236EAC"/>
     <w:multiLevelType w:val="singleLevel"/>
     <w:tmpl w:val="04160001"/>
     <w:lvl w:ilvl="0">
@@ -26969,7 +27020,7 @@
     </w:lvl>
   </w:abstractNum>
   <w:abstractNum w:abstractNumId="35" w15:restartNumberingAfterBreak="0">
-    <w:nsid w:val="77DF67AE"/>
+    <w:nsid w:val="6FDC2542"/>
     <w:multiLevelType w:val="singleLevel"/>
     <w:tmpl w:val="04160001"/>
     <w:lvl w:ilvl="0">
@@ -26986,7 +27037,7 @@
     </w:lvl>
   </w:abstractNum>
   <w:abstractNum w:abstractNumId="36" w15:restartNumberingAfterBreak="0">
-    <w:nsid w:val="7835695B"/>
+    <w:nsid w:val="70A65BC6"/>
     <w:multiLevelType w:val="singleLevel"/>
     <w:tmpl w:val="04160001"/>
     <w:lvl w:ilvl="0">
@@ -27003,7 +27054,7 @@
     </w:lvl>
   </w:abstractNum>
   <w:abstractNum w:abstractNumId="37" w15:restartNumberingAfterBreak="0">
-    <w:nsid w:val="79767364"/>
+    <w:nsid w:val="7258631C"/>
     <w:multiLevelType w:val="singleLevel"/>
     <w:tmpl w:val="04160001"/>
     <w:lvl w:ilvl="0">
@@ -27020,7 +27071,7 @@
     </w:lvl>
   </w:abstractNum>
   <w:abstractNum w:abstractNumId="38" w15:restartNumberingAfterBreak="0">
-    <w:nsid w:val="79B61C8F"/>
+    <w:nsid w:val="789E173F"/>
     <w:multiLevelType w:val="singleLevel"/>
     <w:tmpl w:val="04160001"/>
     <w:lvl w:ilvl="0">
@@ -27037,7 +27088,7 @@
     </w:lvl>
   </w:abstractNum>
   <w:abstractNum w:abstractNumId="39" w15:restartNumberingAfterBreak="0">
-    <w:nsid w:val="7BA53BAD"/>
+    <w:nsid w:val="793E1EF0"/>
     <w:multiLevelType w:val="singleLevel"/>
     <w:tmpl w:val="04160001"/>
     <w:lvl w:ilvl="0">
@@ -27053,125 +27104,145 @@
       </w:rPr>
     </w:lvl>
   </w:abstractNum>
-  <w:num w:numId="1" w16cid:durableId="1693914094">
+  <w:abstractNum w:abstractNumId="40" w15:restartNumberingAfterBreak="0">
+    <w:nsid w:val="79FB5C30"/>
+    <w:multiLevelType w:val="singleLevel"/>
+    <w:tmpl w:val="04160001"/>
+    <w:lvl w:ilvl="0">
+      <w:start w:val="1"/>
+      <w:numFmt w:val="bullet"/>
+      <w:lvlText w:val=""/>
+      <w:lvlJc w:val="left"/>
+      <w:pPr>
+        <w:ind w:left="720" w:hanging="360"/>
+      </w:pPr>
+      <w:rPr>
+        <w:rFonts w:ascii="Symbol" w:hAnsi="Symbol" w:hint="default"/>
+      </w:rPr>
+    </w:lvl>
+  </w:abstractNum>
+  <w:num w:numId="1" w16cid:durableId="1427768962">
+    <w:abstractNumId w:val="29"/>
+  </w:num>
+  <w:num w:numId="2" w16cid:durableId="1375694504">
+    <w:abstractNumId w:val="25"/>
+  </w:num>
+  <w:num w:numId="3" w16cid:durableId="1198733868">
     <w:abstractNumId w:val="22"/>
   </w:num>
-  <w:num w:numId="2" w16cid:durableId="804738408">
+  <w:num w:numId="4" w16cid:durableId="260644600">
+    <w:abstractNumId w:val="20"/>
+  </w:num>
+  <w:num w:numId="5" w16cid:durableId="383481092">
+    <w:abstractNumId w:val="34"/>
+  </w:num>
+  <w:num w:numId="6" w16cid:durableId="514997511">
+    <w:abstractNumId w:val="40"/>
+  </w:num>
+  <w:num w:numId="7" w16cid:durableId="1037972137">
+    <w:abstractNumId w:val="11"/>
+  </w:num>
+  <w:num w:numId="8" w16cid:durableId="681316324">
+    <w:abstractNumId w:val="23"/>
+  </w:num>
+  <w:num w:numId="9" w16cid:durableId="2022851013">
+    <w:abstractNumId w:val="37"/>
+  </w:num>
+  <w:num w:numId="10" w16cid:durableId="1301351017">
+    <w:abstractNumId w:val="3"/>
+  </w:num>
+  <w:num w:numId="11" w16cid:durableId="67073988">
+    <w:abstractNumId w:val="33"/>
+  </w:num>
+  <w:num w:numId="12" w16cid:durableId="502359218">
+    <w:abstractNumId w:val="17"/>
+  </w:num>
+  <w:num w:numId="13" w16cid:durableId="892934465">
+    <w:abstractNumId w:val="38"/>
+  </w:num>
+  <w:num w:numId="14" w16cid:durableId="912543637">
+    <w:abstractNumId w:val="15"/>
+  </w:num>
+  <w:num w:numId="15" w16cid:durableId="1016343722">
+    <w:abstractNumId w:val="7"/>
+  </w:num>
+  <w:num w:numId="16" w16cid:durableId="1504736656">
+    <w:abstractNumId w:val="31"/>
+  </w:num>
+  <w:num w:numId="17" w16cid:durableId="1828663835">
+    <w:abstractNumId w:val="32"/>
+  </w:num>
+  <w:num w:numId="18" w16cid:durableId="1194466745">
+    <w:abstractNumId w:val="36"/>
+  </w:num>
+  <w:num w:numId="19" w16cid:durableId="1685546856">
+    <w:abstractNumId w:val="12"/>
+  </w:num>
+  <w:num w:numId="20" w16cid:durableId="1817144019">
+    <w:abstractNumId w:val="39"/>
+  </w:num>
+  <w:num w:numId="21" w16cid:durableId="1837262460">
+    <w:abstractNumId w:val="24"/>
+  </w:num>
+  <w:num w:numId="22" w16cid:durableId="233122390">
+    <w:abstractNumId w:val="35"/>
+  </w:num>
+  <w:num w:numId="23" w16cid:durableId="2055230375">
+    <w:abstractNumId w:val="30"/>
+  </w:num>
+  <w:num w:numId="24" w16cid:durableId="1859463616">
+    <w:abstractNumId w:val="27"/>
+  </w:num>
+  <w:num w:numId="25" w16cid:durableId="1220089882">
+    <w:abstractNumId w:val="26"/>
+  </w:num>
+  <w:num w:numId="26" w16cid:durableId="1022440512">
+    <w:abstractNumId w:val="9"/>
+  </w:num>
+  <w:num w:numId="27" w16cid:durableId="229926592">
+    <w:abstractNumId w:val="5"/>
+  </w:num>
+  <w:num w:numId="28" w16cid:durableId="160198297">
+    <w:abstractNumId w:val="10"/>
+  </w:num>
+  <w:num w:numId="29" w16cid:durableId="619534825">
+    <w:abstractNumId w:val="1"/>
+  </w:num>
+  <w:num w:numId="30" w16cid:durableId="188375001">
+    <w:abstractNumId w:val="16"/>
+  </w:num>
+  <w:num w:numId="31" w16cid:durableId="401415807">
+    <w:abstractNumId w:val="4"/>
+  </w:num>
+  <w:num w:numId="32" w16cid:durableId="2033414870">
+    <w:abstractNumId w:val="14"/>
+  </w:num>
+  <w:num w:numId="33" w16cid:durableId="1987660157">
+    <w:abstractNumId w:val="0"/>
+  </w:num>
+  <w:num w:numId="34" w16cid:durableId="1797528761">
+    <w:abstractNumId w:val="2"/>
+  </w:num>
+  <w:num w:numId="35" w16cid:durableId="365838996">
+    <w:abstractNumId w:val="21"/>
+  </w:num>
+  <w:num w:numId="36" w16cid:durableId="1638873363">
     <w:abstractNumId w:val="18"/>
   </w:num>
-  <w:num w:numId="3" w16cid:durableId="1627002437">
-    <w:abstractNumId w:val="37"/>
+  <w:num w:numId="37" w16cid:durableId="933168053">
+    <w:abstractNumId w:val="28"/>
   </w:num>
-  <w:num w:numId="4" w16cid:durableId="595558262">
-    <w:abstractNumId w:val="15"/>
+  <w:num w:numId="38" w16cid:durableId="1777865086">
+    <w:abstractNumId w:val="8"/>
   </w:num>
-  <w:num w:numId="5" w16cid:durableId="936251589">
-    <w:abstractNumId w:val="35"/>
+  <w:num w:numId="39" w16cid:durableId="495268552">
+    <w:abstractNumId w:val="19"/>
   </w:num>
-  <w:num w:numId="6" w16cid:durableId="1083911437">
-    <w:abstractNumId w:val="5"/>
-  </w:num>
-  <w:num w:numId="7" w16cid:durableId="69472619">
-    <w:abstractNumId w:val="33"/>
-  </w:num>
-  <w:num w:numId="8" w16cid:durableId="580064286">
-    <w:abstractNumId w:val="1"/>
-  </w:num>
-  <w:num w:numId="9" w16cid:durableId="395394549">
-    <w:abstractNumId w:val="14"/>
-  </w:num>
-  <w:num w:numId="10" w16cid:durableId="1842622992">
-    <w:abstractNumId w:val="26"/>
-  </w:num>
-  <w:num w:numId="11" w16cid:durableId="870335973">
-    <w:abstractNumId w:val="9"/>
-  </w:num>
-  <w:num w:numId="12" w16cid:durableId="1253200365">
-    <w:abstractNumId w:val="13"/>
-  </w:num>
-  <w:num w:numId="13" w16cid:durableId="1975066222">
+  <w:num w:numId="40" w16cid:durableId="1135417709">
     <w:abstractNumId w:val="6"/>
   </w:num>
-  <w:num w:numId="14" w16cid:durableId="1045326114">
-    <w:abstractNumId w:val="39"/>
-  </w:num>
-  <w:num w:numId="15" w16cid:durableId="200748080">
-    <w:abstractNumId w:val="23"/>
-  </w:num>
-  <w:num w:numId="16" w16cid:durableId="264071480">
-    <w:abstractNumId w:val="27"/>
-  </w:num>
-  <w:num w:numId="17" w16cid:durableId="1111902979">
-    <w:abstractNumId w:val="30"/>
-  </w:num>
-  <w:num w:numId="18" w16cid:durableId="1135492026">
-    <w:abstractNumId w:val="2"/>
-  </w:num>
-  <w:num w:numId="19" w16cid:durableId="1380667207">
-    <w:abstractNumId w:val="10"/>
-  </w:num>
-  <w:num w:numId="20" w16cid:durableId="1546795667">
-    <w:abstractNumId w:val="24"/>
-  </w:num>
-  <w:num w:numId="21" w16cid:durableId="253784740">
-    <w:abstractNumId w:val="25"/>
-  </w:num>
-  <w:num w:numId="22" w16cid:durableId="537739729">
-    <w:abstractNumId w:val="11"/>
-  </w:num>
-  <w:num w:numId="23" w16cid:durableId="1833369718">
-    <w:abstractNumId w:val="31"/>
-  </w:num>
-  <w:num w:numId="24" w16cid:durableId="765156624">
-    <w:abstractNumId w:val="38"/>
-  </w:num>
-  <w:num w:numId="25" w16cid:durableId="29110608">
-    <w:abstractNumId w:val="36"/>
-  </w:num>
-  <w:num w:numId="26" w16cid:durableId="704328778">
-    <w:abstractNumId w:val="19"/>
-  </w:num>
-  <w:num w:numId="27" w16cid:durableId="459762414">
-    <w:abstractNumId w:val="32"/>
-  </w:num>
-  <w:num w:numId="28" w16cid:durableId="1096947344">
-    <w:abstractNumId w:val="21"/>
-  </w:num>
-  <w:num w:numId="29" w16cid:durableId="544945904">
-    <w:abstractNumId w:val="29"/>
-  </w:num>
-  <w:num w:numId="30" w16cid:durableId="1847591869">
-    <w:abstractNumId w:val="3"/>
-  </w:num>
-  <w:num w:numId="31" w16cid:durableId="370038269">
-    <w:abstractNumId w:val="4"/>
-  </w:num>
-  <w:num w:numId="32" w16cid:durableId="1941837418">
-    <w:abstractNumId w:val="8"/>
-  </w:num>
-  <w:num w:numId="33" w16cid:durableId="908685618">
-    <w:abstractNumId w:val="20"/>
-  </w:num>
-  <w:num w:numId="34" w16cid:durableId="1667048065">
-    <w:abstractNumId w:val="34"/>
-  </w:num>
-  <w:num w:numId="35" w16cid:durableId="913516079">
-    <w:abstractNumId w:val="7"/>
-  </w:num>
-  <w:num w:numId="36" w16cid:durableId="1505701995">
-    <w:abstractNumId w:val="12"/>
-  </w:num>
-  <w:num w:numId="37" w16cid:durableId="793451018">
-    <w:abstractNumId w:val="17"/>
-  </w:num>
-  <w:num w:numId="38" w16cid:durableId="1198203942">
-    <w:abstractNumId w:val="0"/>
-  </w:num>
-  <w:num w:numId="39" w16cid:durableId="912742267">
-    <w:abstractNumId w:val="28"/>
-  </w:num>
-  <w:num w:numId="40" w16cid:durableId="1992979241">
-    <w:abstractNumId w:val="16"/>
+  <w:num w:numId="41" w16cid:durableId="1462075365">
+    <w:abstractNumId w:val="13"/>
   </w:num>
 </w:numbering>
 </file>
@@ -27584,7 +27655,7 @@
     <w:link w:val="Ttulo1Char"/>
     <w:uiPriority w:val="9"/>
     <w:qFormat/>
-    <w:rsid w:val="00410908"/>
+    <w:rsid w:val="002E3E0E"/>
     <w:pPr>
       <w:keepNext/>
       <w:keepLines/>
@@ -27606,7 +27677,7 @@
     <w:uiPriority w:val="9"/>
     <w:unhideWhenUsed/>
     <w:qFormat/>
-    <w:rsid w:val="00410908"/>
+    <w:rsid w:val="002E3E0E"/>
     <w:pPr>
       <w:keepNext/>
       <w:keepLines/>
@@ -27629,7 +27700,7 @@
     <w:semiHidden/>
     <w:unhideWhenUsed/>
     <w:qFormat/>
-    <w:rsid w:val="00410908"/>
+    <w:rsid w:val="002E3E0E"/>
     <w:pPr>
       <w:keepNext/>
       <w:keepLines/>
@@ -27652,7 +27723,7 @@
     <w:semiHidden/>
     <w:unhideWhenUsed/>
     <w:qFormat/>
-    <w:rsid w:val="00410908"/>
+    <w:rsid w:val="002E3E0E"/>
     <w:pPr>
       <w:keepNext/>
       <w:keepLines/>
@@ -27675,7 +27746,7 @@
     <w:semiHidden/>
     <w:unhideWhenUsed/>
     <w:qFormat/>
-    <w:rsid w:val="00410908"/>
+    <w:rsid w:val="002E3E0E"/>
     <w:pPr>
       <w:keepNext/>
       <w:keepLines/>
@@ -27696,7 +27767,7 @@
     <w:semiHidden/>
     <w:unhideWhenUsed/>
     <w:qFormat/>
-    <w:rsid w:val="00410908"/>
+    <w:rsid w:val="002E3E0E"/>
     <w:pPr>
       <w:keepNext/>
       <w:keepLines/>
@@ -27719,7 +27790,7 @@
     <w:semiHidden/>
     <w:unhideWhenUsed/>
     <w:qFormat/>
-    <w:rsid w:val="00410908"/>
+    <w:rsid w:val="002E3E0E"/>
     <w:pPr>
       <w:keepNext/>
       <w:keepLines/>
@@ -27740,7 +27811,7 @@
     <w:semiHidden/>
     <w:unhideWhenUsed/>
     <w:qFormat/>
-    <w:rsid w:val="00410908"/>
+    <w:rsid w:val="002E3E0E"/>
     <w:pPr>
       <w:keepNext/>
       <w:keepLines/>
@@ -27763,7 +27834,7 @@
     <w:semiHidden/>
     <w:unhideWhenUsed/>
     <w:qFormat/>
-    <w:rsid w:val="00410908"/>
+    <w:rsid w:val="002E3E0E"/>
     <w:pPr>
       <w:keepNext/>
       <w:keepLines/>
@@ -27807,7 +27878,7 @@
     <w:basedOn w:val="Fontepargpadro"/>
     <w:link w:val="Ttulo1"/>
     <w:uiPriority w:val="9"/>
-    <w:rsid w:val="00410908"/>
+    <w:rsid w:val="002E3E0E"/>
     <w:rPr>
       <w:rFonts w:asciiTheme="majorHAnsi" w:eastAsiaTheme="majorEastAsia" w:hAnsiTheme="majorHAnsi" w:cstheme="majorBidi"/>
       <w:color w:val="0F4761" w:themeColor="accent1" w:themeShade="BF"/>
@@ -27820,7 +27891,7 @@
     <w:basedOn w:val="Fontepargpadro"/>
     <w:link w:val="Ttulo2"/>
     <w:uiPriority w:val="9"/>
-    <w:rsid w:val="00410908"/>
+    <w:rsid w:val="002E3E0E"/>
     <w:rPr>
       <w:rFonts w:asciiTheme="majorHAnsi" w:eastAsiaTheme="majorEastAsia" w:hAnsiTheme="majorHAnsi" w:cstheme="majorBidi"/>
       <w:color w:val="0F4761" w:themeColor="accent1" w:themeShade="BF"/>
@@ -27834,7 +27905,7 @@
     <w:link w:val="Ttulo3"/>
     <w:uiPriority w:val="9"/>
     <w:semiHidden/>
-    <w:rsid w:val="00410908"/>
+    <w:rsid w:val="002E3E0E"/>
     <w:rPr>
       <w:rFonts w:eastAsiaTheme="majorEastAsia" w:cstheme="majorBidi"/>
       <w:color w:val="0F4761" w:themeColor="accent1" w:themeShade="BF"/>
@@ -27848,7 +27919,7 @@
     <w:link w:val="Ttulo4"/>
     <w:uiPriority w:val="9"/>
     <w:semiHidden/>
-    <w:rsid w:val="00410908"/>
+    <w:rsid w:val="002E3E0E"/>
     <w:rPr>
       <w:rFonts w:eastAsiaTheme="majorEastAsia" w:cstheme="majorBidi"/>
       <w:i/>
@@ -27862,7 +27933,7 @@
     <w:link w:val="Ttulo5"/>
     <w:uiPriority w:val="9"/>
     <w:semiHidden/>
-    <w:rsid w:val="00410908"/>
+    <w:rsid w:val="002E3E0E"/>
     <w:rPr>
       <w:rFonts w:eastAsiaTheme="majorEastAsia" w:cstheme="majorBidi"/>
       <w:color w:val="0F4761" w:themeColor="accent1" w:themeShade="BF"/>
@@ -27874,7 +27945,7 @@
     <w:link w:val="Ttulo6"/>
     <w:uiPriority w:val="9"/>
     <w:semiHidden/>
-    <w:rsid w:val="00410908"/>
+    <w:rsid w:val="002E3E0E"/>
     <w:rPr>
       <w:rFonts w:eastAsiaTheme="majorEastAsia" w:cstheme="majorBidi"/>
       <w:i/>
@@ -27888,7 +27959,7 @@
     <w:link w:val="Ttulo7"/>
     <w:uiPriority w:val="9"/>
     <w:semiHidden/>
-    <w:rsid w:val="00410908"/>
+    <w:rsid w:val="002E3E0E"/>
     <w:rPr>
       <w:rFonts w:eastAsiaTheme="majorEastAsia" w:cstheme="majorBidi"/>
       <w:color w:val="595959" w:themeColor="text1" w:themeTint="A6"/>
@@ -27900,7 +27971,7 @@
     <w:link w:val="Ttulo8"/>
     <w:uiPriority w:val="9"/>
     <w:semiHidden/>
-    <w:rsid w:val="00410908"/>
+    <w:rsid w:val="002E3E0E"/>
     <w:rPr>
       <w:rFonts w:eastAsiaTheme="majorEastAsia" w:cstheme="majorBidi"/>
       <w:i/>
@@ -27914,7 +27985,7 @@
     <w:link w:val="Ttulo9"/>
     <w:uiPriority w:val="9"/>
     <w:semiHidden/>
-    <w:rsid w:val="00410908"/>
+    <w:rsid w:val="002E3E0E"/>
     <w:rPr>
       <w:rFonts w:eastAsiaTheme="majorEastAsia" w:cstheme="majorBidi"/>
       <w:color w:val="272727" w:themeColor="text1" w:themeTint="D8"/>
@@ -27927,7 +27998,7 @@
     <w:link w:val="TtuloChar"/>
     <w:uiPriority w:val="10"/>
     <w:qFormat/>
-    <w:rsid w:val="00410908"/>
+    <w:rsid w:val="002E3E0E"/>
     <w:pPr>
       <w:spacing w:after="80" w:line="240" w:lineRule="auto"/>
       <w:contextualSpacing/>
@@ -27945,7 +28016,7 @@
     <w:basedOn w:val="Fontepargpadro"/>
     <w:link w:val="Ttulo"/>
     <w:uiPriority w:val="10"/>
-    <w:rsid w:val="00410908"/>
+    <w:rsid w:val="002E3E0E"/>
     <w:rPr>
       <w:rFonts w:asciiTheme="majorHAnsi" w:eastAsiaTheme="majorEastAsia" w:hAnsiTheme="majorHAnsi" w:cstheme="majorBidi"/>
       <w:spacing w:val="-10"/>
@@ -27961,7 +28032,7 @@
     <w:link w:val="SubttuloChar"/>
     <w:uiPriority w:val="11"/>
     <w:qFormat/>
-    <w:rsid w:val="00410908"/>
+    <w:rsid w:val="002E3E0E"/>
     <w:pPr>
       <w:numPr>
         <w:ilvl w:val="1"/>
@@ -27980,7 +28051,7 @@
     <w:basedOn w:val="Fontepargpadro"/>
     <w:link w:val="Subttulo"/>
     <w:uiPriority w:val="11"/>
-    <w:rsid w:val="00410908"/>
+    <w:rsid w:val="002E3E0E"/>
     <w:rPr>
       <w:rFonts w:eastAsiaTheme="majorEastAsia" w:cstheme="majorBidi"/>
       <w:color w:val="595959" w:themeColor="text1" w:themeTint="A6"/>
@@ -27996,7 +28067,7 @@
     <w:link w:val="CitaoChar"/>
     <w:uiPriority w:val="29"/>
     <w:qFormat/>
-    <w:rsid w:val="00410908"/>
+    <w:rsid w:val="002E3E0E"/>
     <w:pPr>
       <w:spacing w:before="160"/>
       <w:jc w:val="center"/>
@@ -28012,7 +28083,7 @@
     <w:basedOn w:val="Fontepargpadro"/>
     <w:link w:val="Citao"/>
     <w:uiPriority w:val="29"/>
-    <w:rsid w:val="00410908"/>
+    <w:rsid w:val="002E3E0E"/>
     <w:rPr>
       <w:i/>
       <w:iCs/>
@@ -28024,7 +28095,7 @@
     <w:basedOn w:val="Normal"/>
     <w:uiPriority w:val="34"/>
     <w:qFormat/>
-    <w:rsid w:val="00410908"/>
+    <w:rsid w:val="002E3E0E"/>
     <w:pPr>
       <w:ind w:left="720"/>
       <w:contextualSpacing/>
@@ -28035,7 +28106,7 @@
     <w:basedOn w:val="Fontepargpadro"/>
     <w:uiPriority w:val="21"/>
     <w:qFormat/>
-    <w:rsid w:val="00410908"/>
+    <w:rsid w:val="002E3E0E"/>
     <w:rPr>
       <w:i/>
       <w:iCs/>
@@ -28049,7 +28120,7 @@
     <w:link w:val="CitaoIntensaChar"/>
     <w:uiPriority w:val="30"/>
     <w:qFormat/>
-    <w:rsid w:val="00410908"/>
+    <w:rsid w:val="002E3E0E"/>
     <w:pPr>
       <w:pBdr>
         <w:top w:val="single" w:sz="4" w:space="10" w:color="0F4761" w:themeColor="accent1" w:themeShade="BF"/>
@@ -28070,7 +28141,7 @@
     <w:basedOn w:val="Fontepargpadro"/>
     <w:link w:val="CitaoIntensa"/>
     <w:uiPriority w:val="30"/>
-    <w:rsid w:val="00410908"/>
+    <w:rsid w:val="002E3E0E"/>
     <w:rPr>
       <w:i/>
       <w:iCs/>
@@ -28082,7 +28153,7 @@
     <w:basedOn w:val="Fontepargpadro"/>
     <w:uiPriority w:val="32"/>
     <w:qFormat/>
-    <w:rsid w:val="00410908"/>
+    <w:rsid w:val="002E3E0E"/>
     <w:rPr>
       <w:b/>
       <w:bCs/>
@@ -28097,7 +28168,7 @@
     <w:link w:val="CabealhoChar"/>
     <w:uiPriority w:val="99"/>
     <w:unhideWhenUsed/>
-    <w:rsid w:val="00410908"/>
+    <w:rsid w:val="002E3E0E"/>
     <w:pPr>
       <w:tabs>
         <w:tab w:val="center" w:pos="4252"/>
@@ -28111,7 +28182,7 @@
     <w:basedOn w:val="Fontepargpadro"/>
     <w:link w:val="Cabealho"/>
     <w:uiPriority w:val="99"/>
-    <w:rsid w:val="00410908"/>
+    <w:rsid w:val="002E3E0E"/>
   </w:style>
   <w:style w:type="paragraph" w:styleId="Rodap">
     <w:name w:val="footer"/>
@@ -28119,7 +28190,7 @@
     <w:link w:val="RodapChar"/>
     <w:uiPriority w:val="99"/>
     <w:unhideWhenUsed/>
-    <w:rsid w:val="00410908"/>
+    <w:rsid w:val="002E3E0E"/>
     <w:pPr>
       <w:tabs>
         <w:tab w:val="center" w:pos="4252"/>
@@ -28133,7 +28204,7 @@
     <w:basedOn w:val="Fontepargpadro"/>
     <w:link w:val="Rodap"/>
     <w:uiPriority w:val="99"/>
-    <w:rsid w:val="00410908"/>
+    <w:rsid w:val="002E3E0E"/>
   </w:style>
   <w:style w:type="paragraph" w:styleId="Sumrio1">
     <w:name w:val="toc 1"/>
@@ -28142,7 +28213,7 @@
     <w:autoRedefine/>
     <w:uiPriority w:val="39"/>
     <w:unhideWhenUsed/>
-    <w:rsid w:val="00410908"/>
+    <w:rsid w:val="002E3E0E"/>
     <w:pPr>
       <w:spacing w:after="100"/>
     </w:pPr>
@@ -28154,7 +28225,7 @@
     <w:autoRedefine/>
     <w:uiPriority w:val="39"/>
     <w:unhideWhenUsed/>
-    <w:rsid w:val="00410908"/>
+    <w:rsid w:val="002E3E0E"/>
     <w:pPr>
       <w:spacing w:after="100"/>
       <w:ind w:left="240"/>

</xml_diff>

<commit_message>
Atualiza Manual de Uso para o autorrelato de execucao (versao 2.85)
Documenta a coluna Execucao do cronograma, o seletor no Meu Painel
e o destaque de marcos sem atualizacao no Painel de Prazos - ja
implantado e publicado no codigo.

Co-Authored-By: Claude Sonnet 5 <noreply@anthropic.com>
</commit_message>
<xml_diff>
--- a/Manual de Uso - Ferramenta de Gestao de Projetos.docx
+++ b/Manual de Uso - Ferramenta de Gestao de Projetos.docx
@@ -129,7 +129,7 @@
           <w:color w:val="6A6A70"/>
           <w:sz w:val="22"/>
         </w:rPr>
-        <w:t>Versao 2.84 - 16 de setembro de 2026 (substitui a versao 2.83 de 16/09/2026)</w:t>
+        <w:t>Versao 2.85 - 17 de setembro de 2026 (substitui a versao 2.84 de 16/09/2026)</w:t>
       </w:r>
     </w:p>
     <w:p>
@@ -229,7 +229,7 @@
         <w:rPr>
           <w:noProof/>
         </w:rPr>
-        <w:instrText xml:space="preserve"> PAGEREF _Toc240465752 \h </w:instrText>
+        <w:instrText xml:space="preserve"> PAGEREF _Toc240532307 \h </w:instrText>
       </w:r>
       <w:r>
         <w:rPr>
@@ -290,7 +290,7 @@
         <w:rPr>
           <w:noProof/>
         </w:rPr>
-        <w:instrText xml:space="preserve"> PAGEREF _Toc240465753 \h </w:instrText>
+        <w:instrText xml:space="preserve"> PAGEREF _Toc240532308 \h </w:instrText>
       </w:r>
       <w:r>
         <w:rPr>
@@ -351,7 +351,7 @@
         <w:rPr>
           <w:noProof/>
         </w:rPr>
-        <w:instrText xml:space="preserve"> PAGEREF _Toc240465754 \h </w:instrText>
+        <w:instrText xml:space="preserve"> PAGEREF _Toc240532309 \h </w:instrText>
       </w:r>
       <w:r>
         <w:rPr>
@@ -412,7 +412,7 @@
         <w:rPr>
           <w:noProof/>
         </w:rPr>
-        <w:instrText xml:space="preserve"> PAGEREF _Toc240465755 \h </w:instrText>
+        <w:instrText xml:space="preserve"> PAGEREF _Toc240532310 \h </w:instrText>
       </w:r>
       <w:r>
         <w:rPr>
@@ -473,7 +473,7 @@
         <w:rPr>
           <w:noProof/>
         </w:rPr>
-        <w:instrText xml:space="preserve"> PAGEREF _Toc240465756 \h </w:instrText>
+        <w:instrText xml:space="preserve"> PAGEREF _Toc240532311 \h </w:instrText>
       </w:r>
       <w:r>
         <w:rPr>
@@ -534,7 +534,7 @@
         <w:rPr>
           <w:noProof/>
         </w:rPr>
-        <w:instrText xml:space="preserve"> PAGEREF _Toc240465757 \h </w:instrText>
+        <w:instrText xml:space="preserve"> PAGEREF _Toc240532312 \h </w:instrText>
       </w:r>
       <w:r>
         <w:rPr>
@@ -595,7 +595,7 @@
         <w:rPr>
           <w:noProof/>
         </w:rPr>
-        <w:instrText xml:space="preserve"> PAGEREF _Toc240465758 \h </w:instrText>
+        <w:instrText xml:space="preserve"> PAGEREF _Toc240532313 \h </w:instrText>
       </w:r>
       <w:r>
         <w:rPr>
@@ -656,7 +656,7 @@
         <w:rPr>
           <w:noProof/>
         </w:rPr>
-        <w:instrText xml:space="preserve"> PAGEREF _Toc240465759 \h </w:instrText>
+        <w:instrText xml:space="preserve"> PAGEREF _Toc240532314 \h </w:instrText>
       </w:r>
       <w:r>
         <w:rPr>
@@ -717,7 +717,7 @@
         <w:rPr>
           <w:noProof/>
         </w:rPr>
-        <w:instrText xml:space="preserve"> PAGEREF _Toc240465760 \h </w:instrText>
+        <w:instrText xml:space="preserve"> PAGEREF _Toc240532315 \h </w:instrText>
       </w:r>
       <w:r>
         <w:rPr>
@@ -778,7 +778,7 @@
         <w:rPr>
           <w:noProof/>
         </w:rPr>
-        <w:instrText xml:space="preserve"> PAGEREF _Toc240465761 \h </w:instrText>
+        <w:instrText xml:space="preserve"> PAGEREF _Toc240532316 \h </w:instrText>
       </w:r>
       <w:r>
         <w:rPr>
@@ -839,7 +839,7 @@
         <w:rPr>
           <w:noProof/>
         </w:rPr>
-        <w:instrText xml:space="preserve"> PAGEREF _Toc240465762 \h </w:instrText>
+        <w:instrText xml:space="preserve"> PAGEREF _Toc240532317 \h </w:instrText>
       </w:r>
       <w:r>
         <w:rPr>
@@ -900,7 +900,7 @@
         <w:rPr>
           <w:noProof/>
         </w:rPr>
-        <w:instrText xml:space="preserve"> PAGEREF _Toc240465763 \h </w:instrText>
+        <w:instrText xml:space="preserve"> PAGEREF _Toc240532318 \h </w:instrText>
       </w:r>
       <w:r>
         <w:rPr>
@@ -961,7 +961,7 @@
         <w:rPr>
           <w:noProof/>
         </w:rPr>
-        <w:instrText xml:space="preserve"> PAGEREF _Toc240465764 \h </w:instrText>
+        <w:instrText xml:space="preserve"> PAGEREF _Toc240532319 \h </w:instrText>
       </w:r>
       <w:r>
         <w:rPr>
@@ -1022,7 +1022,7 @@
         <w:rPr>
           <w:noProof/>
         </w:rPr>
-        <w:instrText xml:space="preserve"> PAGEREF _Toc240465765 \h </w:instrText>
+        <w:instrText xml:space="preserve"> PAGEREF _Toc240532320 \h </w:instrText>
       </w:r>
       <w:r>
         <w:rPr>
@@ -1083,7 +1083,7 @@
         <w:rPr>
           <w:noProof/>
         </w:rPr>
-        <w:instrText xml:space="preserve"> PAGEREF _Toc240465766 \h </w:instrText>
+        <w:instrText xml:space="preserve"> PAGEREF _Toc240532321 \h </w:instrText>
       </w:r>
       <w:r>
         <w:rPr>
@@ -1144,7 +1144,7 @@
         <w:rPr>
           <w:noProof/>
         </w:rPr>
-        <w:instrText xml:space="preserve"> PAGEREF _Toc240465767 \h </w:instrText>
+        <w:instrText xml:space="preserve"> PAGEREF _Toc240532322 \h </w:instrText>
       </w:r>
       <w:r>
         <w:rPr>
@@ -1205,7 +1205,7 @@
         <w:rPr>
           <w:noProof/>
         </w:rPr>
-        <w:instrText xml:space="preserve"> PAGEREF _Toc240465768 \h </w:instrText>
+        <w:instrText xml:space="preserve"> PAGEREF _Toc240532323 \h </w:instrText>
       </w:r>
       <w:r>
         <w:rPr>
@@ -1266,7 +1266,7 @@
         <w:rPr>
           <w:noProof/>
         </w:rPr>
-        <w:instrText xml:space="preserve"> PAGEREF _Toc240465769 \h </w:instrText>
+        <w:instrText xml:space="preserve"> PAGEREF _Toc240532324 \h </w:instrText>
       </w:r>
       <w:r>
         <w:rPr>
@@ -1327,7 +1327,7 @@
         <w:rPr>
           <w:noProof/>
         </w:rPr>
-        <w:instrText xml:space="preserve"> PAGEREF _Toc240465770 \h </w:instrText>
+        <w:instrText xml:space="preserve"> PAGEREF _Toc240532325 \h </w:instrText>
       </w:r>
       <w:r>
         <w:rPr>
@@ -1388,7 +1388,7 @@
         <w:rPr>
           <w:noProof/>
         </w:rPr>
-        <w:instrText xml:space="preserve"> PAGEREF _Toc240465771 \h </w:instrText>
+        <w:instrText xml:space="preserve"> PAGEREF _Toc240532326 \h </w:instrText>
       </w:r>
       <w:r>
         <w:rPr>
@@ -1449,7 +1449,7 @@
         <w:rPr>
           <w:noProof/>
         </w:rPr>
-        <w:instrText xml:space="preserve"> PAGEREF _Toc240465772 \h </w:instrText>
+        <w:instrText xml:space="preserve"> PAGEREF _Toc240532327 \h </w:instrText>
       </w:r>
       <w:r>
         <w:rPr>
@@ -1510,7 +1510,7 @@
         <w:rPr>
           <w:noProof/>
         </w:rPr>
-        <w:instrText xml:space="preserve"> PAGEREF _Toc240465773 \h </w:instrText>
+        <w:instrText xml:space="preserve"> PAGEREF _Toc240532328 \h </w:instrText>
       </w:r>
       <w:r>
         <w:rPr>
@@ -1571,7 +1571,7 @@
         <w:rPr>
           <w:noProof/>
         </w:rPr>
-        <w:instrText xml:space="preserve"> PAGEREF _Toc240465774 \h </w:instrText>
+        <w:instrText xml:space="preserve"> PAGEREF _Toc240532329 \h </w:instrText>
       </w:r>
       <w:r>
         <w:rPr>
@@ -1632,7 +1632,7 @@
         <w:rPr>
           <w:noProof/>
         </w:rPr>
-        <w:instrText xml:space="preserve"> PAGEREF _Toc240465775 \h </w:instrText>
+        <w:instrText xml:space="preserve"> PAGEREF _Toc240532330 \h </w:instrText>
       </w:r>
       <w:r>
         <w:rPr>
@@ -1693,7 +1693,7 @@
         <w:rPr>
           <w:noProof/>
         </w:rPr>
-        <w:instrText xml:space="preserve"> PAGEREF _Toc240465776 \h </w:instrText>
+        <w:instrText xml:space="preserve"> PAGEREF _Toc240532331 \h </w:instrText>
       </w:r>
       <w:r>
         <w:rPr>
@@ -1754,7 +1754,7 @@
         <w:rPr>
           <w:noProof/>
         </w:rPr>
-        <w:instrText xml:space="preserve"> PAGEREF _Toc240465777 \h </w:instrText>
+        <w:instrText xml:space="preserve"> PAGEREF _Toc240532332 \h </w:instrText>
       </w:r>
       <w:r>
         <w:rPr>
@@ -1816,7 +1816,7 @@
         <w:rPr>
           <w:noProof/>
         </w:rPr>
-        <w:instrText xml:space="preserve"> PAGEREF _Toc240465778 \h </w:instrText>
+        <w:instrText xml:space="preserve"> PAGEREF _Toc240532333 \h </w:instrText>
       </w:r>
       <w:r>
         <w:rPr>
@@ -1877,7 +1877,7 @@
         <w:rPr>
           <w:noProof/>
         </w:rPr>
-        <w:instrText xml:space="preserve"> PAGEREF _Toc240465779 \h </w:instrText>
+        <w:instrText xml:space="preserve"> PAGEREF _Toc240532334 \h </w:instrText>
       </w:r>
       <w:r>
         <w:rPr>
@@ -1894,7 +1894,7 @@
         <w:rPr>
           <w:noProof/>
         </w:rPr>
-        <w:t>54</w:t>
+        <w:t>55</w:t>
       </w:r>
       <w:r>
         <w:rPr>
@@ -1938,7 +1938,7 @@
         <w:rPr>
           <w:noProof/>
         </w:rPr>
-        <w:instrText xml:space="preserve"> PAGEREF _Toc240465780 \h </w:instrText>
+        <w:instrText xml:space="preserve"> PAGEREF _Toc240532335 \h </w:instrText>
       </w:r>
       <w:r>
         <w:rPr>
@@ -1999,7 +1999,7 @@
         <w:rPr>
           <w:noProof/>
         </w:rPr>
-        <w:instrText xml:space="preserve"> PAGEREF _Toc240465781 \h </w:instrText>
+        <w:instrText xml:space="preserve"> PAGEREF _Toc240532336 \h </w:instrText>
       </w:r>
       <w:r>
         <w:rPr>
@@ -2060,7 +2060,7 @@
         <w:rPr>
           <w:noProof/>
         </w:rPr>
-        <w:instrText xml:space="preserve"> PAGEREF _Toc240465782 \h </w:instrText>
+        <w:instrText xml:space="preserve"> PAGEREF _Toc240532337 \h </w:instrText>
       </w:r>
       <w:r>
         <w:rPr>
@@ -2121,7 +2121,7 @@
         <w:rPr>
           <w:noProof/>
         </w:rPr>
-        <w:instrText xml:space="preserve"> PAGEREF _Toc240465783 \h </w:instrText>
+        <w:instrText xml:space="preserve"> PAGEREF _Toc240532338 \h </w:instrText>
       </w:r>
       <w:r>
         <w:rPr>
@@ -2182,7 +2182,7 @@
         <w:rPr>
           <w:noProof/>
         </w:rPr>
-        <w:instrText xml:space="preserve"> PAGEREF _Toc240465784 \h </w:instrText>
+        <w:instrText xml:space="preserve"> PAGEREF _Toc240532339 \h </w:instrText>
       </w:r>
       <w:r>
         <w:rPr>
@@ -2243,7 +2243,7 @@
         <w:rPr>
           <w:noProof/>
         </w:rPr>
-        <w:instrText xml:space="preserve"> PAGEREF _Toc240465785 \h </w:instrText>
+        <w:instrText xml:space="preserve"> PAGEREF _Toc240532340 \h </w:instrText>
       </w:r>
       <w:r>
         <w:rPr>
@@ -2304,7 +2304,7 @@
         <w:rPr>
           <w:noProof/>
         </w:rPr>
-        <w:instrText xml:space="preserve"> PAGEREF _Toc240465786 \h </w:instrText>
+        <w:instrText xml:space="preserve"> PAGEREF _Toc240532341 \h </w:instrText>
       </w:r>
       <w:r>
         <w:rPr>
@@ -2365,7 +2365,7 @@
         <w:rPr>
           <w:noProof/>
         </w:rPr>
-        <w:instrText xml:space="preserve"> PAGEREF _Toc240465787 \h </w:instrText>
+        <w:instrText xml:space="preserve"> PAGEREF _Toc240532342 \h </w:instrText>
       </w:r>
       <w:r>
         <w:rPr>
@@ -2426,7 +2426,7 @@
         <w:rPr>
           <w:noProof/>
         </w:rPr>
-        <w:instrText xml:space="preserve"> PAGEREF _Toc240465788 \h </w:instrText>
+        <w:instrText xml:space="preserve"> PAGEREF _Toc240532343 \h </w:instrText>
       </w:r>
       <w:r>
         <w:rPr>
@@ -2487,7 +2487,7 @@
         <w:rPr>
           <w:noProof/>
         </w:rPr>
-        <w:instrText xml:space="preserve"> PAGEREF _Toc240465789 \h </w:instrText>
+        <w:instrText xml:space="preserve"> PAGEREF _Toc240532344 \h </w:instrText>
       </w:r>
       <w:r>
         <w:rPr>
@@ -2548,7 +2548,7 @@
         <w:rPr>
           <w:noProof/>
         </w:rPr>
-        <w:instrText xml:space="preserve"> PAGEREF _Toc240465790 \h </w:instrText>
+        <w:instrText xml:space="preserve"> PAGEREF _Toc240532345 \h </w:instrText>
       </w:r>
       <w:r>
         <w:rPr>
@@ -2609,7 +2609,7 @@
         <w:rPr>
           <w:noProof/>
         </w:rPr>
-        <w:instrText xml:space="preserve"> PAGEREF _Toc240465791 \h </w:instrText>
+        <w:instrText xml:space="preserve"> PAGEREF _Toc240532346 \h </w:instrText>
       </w:r>
       <w:r>
         <w:rPr>
@@ -2670,7 +2670,7 @@
         <w:rPr>
           <w:noProof/>
         </w:rPr>
-        <w:instrText xml:space="preserve"> PAGEREF _Toc240465792 \h </w:instrText>
+        <w:instrText xml:space="preserve"> PAGEREF _Toc240532347 \h </w:instrText>
       </w:r>
       <w:r>
         <w:rPr>
@@ -2731,7 +2731,7 @@
         <w:rPr>
           <w:noProof/>
         </w:rPr>
-        <w:instrText xml:space="preserve"> PAGEREF _Toc240465793 \h </w:instrText>
+        <w:instrText xml:space="preserve"> PAGEREF _Toc240532348 \h </w:instrText>
       </w:r>
       <w:r>
         <w:rPr>
@@ -2792,7 +2792,7 @@
         <w:rPr>
           <w:noProof/>
         </w:rPr>
-        <w:instrText xml:space="preserve"> PAGEREF _Toc240465794 \h </w:instrText>
+        <w:instrText xml:space="preserve"> PAGEREF _Toc240532349 \h </w:instrText>
       </w:r>
       <w:r>
         <w:rPr>
@@ -2853,7 +2853,7 @@
         <w:rPr>
           <w:noProof/>
         </w:rPr>
-        <w:instrText xml:space="preserve"> PAGEREF _Toc240465795 \h </w:instrText>
+        <w:instrText xml:space="preserve"> PAGEREF _Toc240532350 \h </w:instrText>
       </w:r>
       <w:r>
         <w:rPr>
@@ -2914,7 +2914,7 @@
         <w:rPr>
           <w:noProof/>
         </w:rPr>
-        <w:instrText xml:space="preserve"> PAGEREF _Toc240465796 \h </w:instrText>
+        <w:instrText xml:space="preserve"> PAGEREF _Toc240532351 \h </w:instrText>
       </w:r>
       <w:r>
         <w:rPr>
@@ -2975,7 +2975,7 @@
         <w:rPr>
           <w:noProof/>
         </w:rPr>
-        <w:instrText xml:space="preserve"> PAGEREF _Toc240465797 \h </w:instrText>
+        <w:instrText xml:space="preserve"> PAGEREF _Toc240532352 \h </w:instrText>
       </w:r>
       <w:r>
         <w:rPr>
@@ -3036,7 +3036,7 @@
         <w:rPr>
           <w:noProof/>
         </w:rPr>
-        <w:instrText xml:space="preserve"> PAGEREF _Toc240465798 \h </w:instrText>
+        <w:instrText xml:space="preserve"> PAGEREF _Toc240532353 \h </w:instrText>
       </w:r>
       <w:r>
         <w:rPr>
@@ -3097,7 +3097,7 @@
         <w:rPr>
           <w:noProof/>
         </w:rPr>
-        <w:instrText xml:space="preserve"> PAGEREF _Toc240465799 \h </w:instrText>
+        <w:instrText xml:space="preserve"> PAGEREF _Toc240532354 \h </w:instrText>
       </w:r>
       <w:r>
         <w:rPr>
@@ -3158,7 +3158,7 @@
         <w:rPr>
           <w:noProof/>
         </w:rPr>
-        <w:instrText xml:space="preserve"> PAGEREF _Toc240465800 \h </w:instrText>
+        <w:instrText xml:space="preserve"> PAGEREF _Toc240532355 \h </w:instrText>
       </w:r>
       <w:r>
         <w:rPr>
@@ -3219,7 +3219,7 @@
         <w:rPr>
           <w:noProof/>
         </w:rPr>
-        <w:instrText xml:space="preserve"> PAGEREF _Toc240465801 \h </w:instrText>
+        <w:instrText xml:space="preserve"> PAGEREF _Toc240532356 \h </w:instrText>
       </w:r>
       <w:r>
         <w:rPr>
@@ -3280,7 +3280,7 @@
         <w:rPr>
           <w:noProof/>
         </w:rPr>
-        <w:instrText xml:space="preserve"> PAGEREF _Toc240465802 \h </w:instrText>
+        <w:instrText xml:space="preserve"> PAGEREF _Toc240532357 \h </w:instrText>
       </w:r>
       <w:r>
         <w:rPr>
@@ -3341,7 +3341,7 @@
         <w:rPr>
           <w:noProof/>
         </w:rPr>
-        <w:instrText xml:space="preserve"> PAGEREF _Toc240465803 \h </w:instrText>
+        <w:instrText xml:space="preserve"> PAGEREF _Toc240532358 \h </w:instrText>
       </w:r>
       <w:r>
         <w:rPr>
@@ -3402,7 +3402,7 @@
         <w:rPr>
           <w:noProof/>
         </w:rPr>
-        <w:instrText xml:space="preserve"> PAGEREF _Toc240465804 \h </w:instrText>
+        <w:instrText xml:space="preserve"> PAGEREF _Toc240532359 \h </w:instrText>
       </w:r>
       <w:r>
         <w:rPr>
@@ -3464,7 +3464,7 @@
         <w:rPr>
           <w:noProof/>
         </w:rPr>
-        <w:instrText xml:space="preserve"> PAGEREF _Toc240465805 \h </w:instrText>
+        <w:instrText xml:space="preserve"> PAGEREF _Toc240532360 \h </w:instrText>
       </w:r>
       <w:r>
         <w:rPr>
@@ -3525,7 +3525,7 @@
         <w:rPr>
           <w:noProof/>
         </w:rPr>
-        <w:instrText xml:space="preserve"> PAGEREF _Toc240465806 \h </w:instrText>
+        <w:instrText xml:space="preserve"> PAGEREF _Toc240532361 \h </w:instrText>
       </w:r>
       <w:r>
         <w:rPr>
@@ -3601,7 +3601,7 @@
           <w:sz w:val="34"/>
         </w:rPr>
       </w:pPr>
-      <w:bookmarkStart w:id="0" w:name="_Toc240465752"/>
+      <w:bookmarkStart w:id="0" w:name="_Toc240532307"/>
       <w:r>
         <w:rPr>
           <w:rFonts w:ascii="Montserrat" w:hAnsi="Montserrat"/>
@@ -3625,7 +3625,7 @@
           <w:sz w:val="27"/>
         </w:rPr>
       </w:pPr>
-      <w:bookmarkStart w:id="1" w:name="_Toc240465753"/>
+      <w:bookmarkStart w:id="1" w:name="_Toc240532308"/>
       <w:r>
         <w:rPr>
           <w:rFonts w:ascii="Montserrat" w:hAnsi="Montserrat"/>
@@ -5318,6 +5318,33 @@
           <w:color w:val="1A1A1A"/>
           <w:sz w:val="22"/>
         </w:rPr>
+        <w:t xml:space="preserve">Esta e a versao 2.85 do manual. Em relacao a versao 2.84 (16/09/2026), cada marco do cronograma (Passo 4) ganhou uma coluna Execucao - autorrelato de A iniciar/Em andamento/Atrasado/Concluido, com a data da ultima mudanca gravada automaticamente. Diferente do calculo automatico de atraso (que so olha as datas), e a propria pessoa sinalizando se esta de fato trabalhando no marco - visivel/editavel tambem no Meu Painel (secao 6.4.4) e exibido ao lado de </w:t>
+      </w:r>
+      <w:r>
+        <w:rPr>
+          <w:rFonts w:ascii="Montserrat" w:hAnsi="Montserrat"/>
+          <w:color w:val="1A1A1A"/>
+          <w:sz w:val="22"/>
+        </w:rPr>
+        <w:lastRenderedPageBreak/>
+        <w:t>cada marco atrasado ou vencendo no Painel de Prazos (secao 6.4.2), que passa a destacar os marcos sem nenhuma atualizacao de execucao.</w:t>
+      </w:r>
+    </w:p>
+    <w:p>
+      <w:pPr>
+        <w:spacing w:line="280" w:lineRule="auto"/>
+        <w:rPr>
+          <w:rFonts w:ascii="Montserrat" w:hAnsi="Montserrat"/>
+          <w:color w:val="1A1A1A"/>
+          <w:sz w:val="22"/>
+        </w:rPr>
+      </w:pPr>
+      <w:r>
+        <w:rPr>
+          <w:rFonts w:ascii="Montserrat" w:hAnsi="Montserrat"/>
+          <w:color w:val="1A1A1A"/>
+          <w:sz w:val="22"/>
+        </w:rPr>
         <w:t>O manual nao substitui as Diretrizes para a Gestao de Projetos da UNIALFA (documento institucional que define o framework D01 a D07) nem o documento Regras de Acesso e Permissoes (que detalha cada regra de controle de acesso); ele e o guia operacional de como usar cada ferramenta na pratica.</w:t>
       </w:r>
     </w:p>
@@ -5332,7 +5359,7 @@
           <w:sz w:val="27"/>
         </w:rPr>
       </w:pPr>
-      <w:bookmarkStart w:id="2" w:name="_Toc240465754"/>
+      <w:bookmarkStart w:id="2" w:name="_Toc240532309"/>
       <w:r>
         <w:rPr>
           <w:rFonts w:ascii="Montserrat" w:hAnsi="Montserrat"/>
@@ -5340,7 +5367,6 @@
           <w:color w:val="B91D2E"/>
           <w:sz w:val="27"/>
         </w:rPr>
-        <w:lastRenderedPageBreak/>
         <w:t>1.2 Visao geral da ferramenta</w:t>
       </w:r>
       <w:bookmarkEnd w:id="2"/>
@@ -5530,16 +5556,16 @@
         </w:rPr>
         <w:lastRenderedPageBreak/>
         <w:drawing>
-          <wp:inline distT="0" distB="0" distL="0" distR="0" wp14:anchorId="3B2F0A61" wp14:editId="2CC42831">
+          <wp:inline distT="0" distB="0" distL="0" distR="0" wp14:anchorId="28BF37C2" wp14:editId="042D2C97">
             <wp:extent cx="5303520" cy="4792851"/>
             <wp:effectExtent l="19050" t="19050" r="11430" b="27305"/>
-            <wp:docPr id="1609186178" name="Imagem 1"/>
+            <wp:docPr id="112948044" name="Imagem 1"/>
             <wp:cNvGraphicFramePr/>
             <a:graphic xmlns:a="http://schemas.openxmlformats.org/drawingml/2006/main">
               <a:graphicData uri="http://schemas.openxmlformats.org/drawingml/2006/picture">
                 <pic:pic xmlns:pic="http://schemas.openxmlformats.org/drawingml/2006/picture">
                   <pic:nvPicPr>
-                    <pic:cNvPr id="1609186178" name=""/>
+                    <pic:cNvPr id="112948044" name=""/>
                     <pic:cNvPicPr/>
                   </pic:nvPicPr>
                   <pic:blipFill>
@@ -5607,7 +5633,7 @@
           <w:sz w:val="27"/>
         </w:rPr>
       </w:pPr>
-      <w:bookmarkStart w:id="3" w:name="_Toc240465755"/>
+      <w:bookmarkStart w:id="3" w:name="_Toc240532310"/>
       <w:r>
         <w:rPr>
           <w:rFonts w:ascii="Montserrat" w:hAnsi="Montserrat"/>
@@ -5648,16 +5674,16 @@
         </w:rPr>
         <w:lastRenderedPageBreak/>
         <w:drawing>
-          <wp:inline distT="0" distB="0" distL="0" distR="0" wp14:anchorId="591C9949" wp14:editId="3FC571C1">
+          <wp:inline distT="0" distB="0" distL="0" distR="0" wp14:anchorId="25B5D049" wp14:editId="6317DC88">
             <wp:extent cx="4206240" cy="3801227"/>
             <wp:effectExtent l="19050" t="19050" r="22860" b="27940"/>
-            <wp:docPr id="1619580238" name="Imagem 2"/>
+            <wp:docPr id="798172568" name="Imagem 2"/>
             <wp:cNvGraphicFramePr/>
             <a:graphic xmlns:a="http://schemas.openxmlformats.org/drawingml/2006/main">
               <a:graphicData uri="http://schemas.openxmlformats.org/drawingml/2006/picture">
                 <pic:pic xmlns:pic="http://schemas.openxmlformats.org/drawingml/2006/picture">
                   <pic:nvPicPr>
-                    <pic:cNvPr id="1619580238" name=""/>
+                    <pic:cNvPr id="798172568" name=""/>
                     <pic:cNvPicPr/>
                   </pic:nvPicPr>
                   <pic:blipFill>
@@ -5830,7 +5856,7 @@
           <w:sz w:val="27"/>
         </w:rPr>
       </w:pPr>
-      <w:bookmarkStart w:id="4" w:name="_Toc240465756"/>
+      <w:bookmarkStart w:id="4" w:name="_Toc240532311"/>
       <w:r>
         <w:rPr>
           <w:rFonts w:ascii="Montserrat" w:hAnsi="Montserrat"/>
@@ -7069,7 +7095,7 @@
           <w:sz w:val="34"/>
         </w:rPr>
       </w:pPr>
-      <w:bookmarkStart w:id="5" w:name="_Toc240465757"/>
+      <w:bookmarkStart w:id="5" w:name="_Toc240532312"/>
       <w:r>
         <w:rPr>
           <w:rFonts w:ascii="Montserrat" w:hAnsi="Montserrat"/>
@@ -7093,7 +7119,7 @@
           <w:sz w:val="27"/>
         </w:rPr>
       </w:pPr>
-      <w:bookmarkStart w:id="6" w:name="_Toc240465758"/>
+      <w:bookmarkStart w:id="6" w:name="_Toc240532313"/>
       <w:r>
         <w:rPr>
           <w:rFonts w:ascii="Montserrat" w:hAnsi="Montserrat"/>
@@ -7134,7 +7160,7 @@
           <w:sz w:val="27"/>
         </w:rPr>
       </w:pPr>
-      <w:bookmarkStart w:id="7" w:name="_Toc240465759"/>
+      <w:bookmarkStart w:id="7" w:name="_Toc240532314"/>
       <w:r>
         <w:rPr>
           <w:rFonts w:ascii="Montserrat" w:hAnsi="Montserrat"/>
@@ -7253,7 +7279,7 @@
           <w:sz w:val="27"/>
         </w:rPr>
       </w:pPr>
-      <w:bookmarkStart w:id="8" w:name="_Toc240465760"/>
+      <w:bookmarkStart w:id="8" w:name="_Toc240532315"/>
       <w:r>
         <w:rPr>
           <w:rFonts w:ascii="Montserrat" w:hAnsi="Montserrat"/>
@@ -7866,7 +7892,7 @@
           <w:sz w:val="27"/>
         </w:rPr>
       </w:pPr>
-      <w:bookmarkStart w:id="9" w:name="_Toc240465761"/>
+      <w:bookmarkStart w:id="9" w:name="_Toc240532316"/>
       <w:r>
         <w:rPr>
           <w:rFonts w:ascii="Montserrat" w:hAnsi="Montserrat"/>
@@ -7955,16 +7981,16 @@
         </w:rPr>
         <w:lastRenderedPageBreak/>
         <w:drawing>
-          <wp:inline distT="0" distB="0" distL="0" distR="0" wp14:anchorId="598C6453" wp14:editId="3340DC4B">
+          <wp:inline distT="0" distB="0" distL="0" distR="0" wp14:anchorId="2FB488BF" wp14:editId="531ADBF7">
             <wp:extent cx="4937760" cy="4462310"/>
             <wp:effectExtent l="19050" t="19050" r="15240" b="14605"/>
-            <wp:docPr id="805402880" name="Imagem 3"/>
+            <wp:docPr id="837459821" name="Imagem 3"/>
             <wp:cNvGraphicFramePr/>
             <a:graphic xmlns:a="http://schemas.openxmlformats.org/drawingml/2006/main">
               <a:graphicData uri="http://schemas.openxmlformats.org/drawingml/2006/picture">
                 <pic:pic xmlns:pic="http://schemas.openxmlformats.org/drawingml/2006/picture">
                   <pic:nvPicPr>
-                    <pic:cNvPr id="805402880" name=""/>
+                    <pic:cNvPr id="837459821" name=""/>
                     <pic:cNvPicPr/>
                   </pic:nvPicPr>
                   <pic:blipFill>
@@ -8032,7 +8058,7 @@
           <w:sz w:val="27"/>
         </w:rPr>
       </w:pPr>
-      <w:bookmarkStart w:id="10" w:name="_Toc240465762"/>
+      <w:bookmarkStart w:id="10" w:name="_Toc240532317"/>
       <w:r>
         <w:rPr>
           <w:rFonts w:ascii="Montserrat" w:hAnsi="Montserrat"/>
@@ -8073,16 +8099,16 @@
         </w:rPr>
         <w:lastRenderedPageBreak/>
         <w:drawing>
-          <wp:inline distT="0" distB="0" distL="0" distR="0" wp14:anchorId="11480311" wp14:editId="7C72DB60">
+          <wp:inline distT="0" distB="0" distL="0" distR="0" wp14:anchorId="6FCE3B93" wp14:editId="103B89B5">
             <wp:extent cx="5120640" cy="4627581"/>
             <wp:effectExtent l="19050" t="19050" r="22860" b="20955"/>
-            <wp:docPr id="2067372196" name="Imagem 4"/>
+            <wp:docPr id="293489662" name="Imagem 4"/>
             <wp:cNvGraphicFramePr/>
             <a:graphic xmlns:a="http://schemas.openxmlformats.org/drawingml/2006/main">
               <a:graphicData uri="http://schemas.openxmlformats.org/drawingml/2006/picture">
                 <pic:pic xmlns:pic="http://schemas.openxmlformats.org/drawingml/2006/picture">
                   <pic:nvPicPr>
-                    <pic:cNvPr id="2067372196" name=""/>
+                    <pic:cNvPr id="293489662" name=""/>
                     <pic:cNvPicPr/>
                   </pic:nvPicPr>
                   <pic:blipFill>
@@ -8265,7 +8291,7 @@
           <w:sz w:val="27"/>
         </w:rPr>
       </w:pPr>
-      <w:bookmarkStart w:id="11" w:name="_Toc240465763"/>
+      <w:bookmarkStart w:id="11" w:name="_Toc240532318"/>
       <w:r>
         <w:rPr>
           <w:rFonts w:ascii="Montserrat" w:hAnsi="Montserrat"/>
@@ -8305,16 +8331,16 @@
           <w:noProof/>
         </w:rPr>
         <w:drawing>
-          <wp:inline distT="0" distB="0" distL="0" distR="0" wp14:anchorId="3628E8C8" wp14:editId="3C8119BE">
+          <wp:inline distT="0" distB="0" distL="0" distR="0" wp14:anchorId="39A5F5BE" wp14:editId="070B99CC">
             <wp:extent cx="4206240" cy="3801227"/>
             <wp:effectExtent l="19050" t="19050" r="22860" b="27940"/>
-            <wp:docPr id="1033434288" name="Imagem 5"/>
+            <wp:docPr id="1635164158" name="Imagem 5"/>
             <wp:cNvGraphicFramePr/>
             <a:graphic xmlns:a="http://schemas.openxmlformats.org/drawingml/2006/main">
               <a:graphicData uri="http://schemas.openxmlformats.org/drawingml/2006/picture">
                 <pic:pic xmlns:pic="http://schemas.openxmlformats.org/drawingml/2006/picture">
                   <pic:nvPicPr>
-                    <pic:cNvPr id="1033434288" name=""/>
+                    <pic:cNvPr id="1635164158" name=""/>
                     <pic:cNvPicPr/>
                   </pic:nvPicPr>
                   <pic:blipFill>
@@ -8382,16 +8408,16 @@
         </w:rPr>
         <w:lastRenderedPageBreak/>
         <w:drawing>
-          <wp:inline distT="0" distB="0" distL="0" distR="0" wp14:anchorId="5FFDE452" wp14:editId="08EE640E">
+          <wp:inline distT="0" distB="0" distL="0" distR="0" wp14:anchorId="4239831B" wp14:editId="7FEB759A">
             <wp:extent cx="4206240" cy="3801227"/>
             <wp:effectExtent l="19050" t="19050" r="22860" b="27940"/>
-            <wp:docPr id="1916076851" name="Imagem 6"/>
+            <wp:docPr id="547555009" name="Imagem 6"/>
             <wp:cNvGraphicFramePr/>
             <a:graphic xmlns:a="http://schemas.openxmlformats.org/drawingml/2006/main">
               <a:graphicData uri="http://schemas.openxmlformats.org/drawingml/2006/picture">
                 <pic:pic xmlns:pic="http://schemas.openxmlformats.org/drawingml/2006/picture">
                   <pic:nvPicPr>
-                    <pic:cNvPr id="1916076851" name=""/>
+                    <pic:cNvPr id="547555009" name=""/>
                     <pic:cNvPicPr/>
                   </pic:nvPicPr>
                   <pic:blipFill>
@@ -8507,7 +8533,7 @@
           <w:sz w:val="27"/>
         </w:rPr>
       </w:pPr>
-      <w:bookmarkStart w:id="12" w:name="_Toc240465764"/>
+      <w:bookmarkStart w:id="12" w:name="_Toc240532319"/>
       <w:r>
         <w:rPr>
           <w:rFonts w:ascii="Montserrat" w:hAnsi="Montserrat"/>
@@ -8575,7 +8601,7 @@
           <w:sz w:val="27"/>
         </w:rPr>
       </w:pPr>
-      <w:bookmarkStart w:id="13" w:name="_Toc240465765"/>
+      <w:bookmarkStart w:id="13" w:name="_Toc240532320"/>
       <w:r>
         <w:rPr>
           <w:rFonts w:ascii="Montserrat" w:hAnsi="Montserrat"/>
@@ -8735,12 +8761,16 @@
         <w:spacing w:after="80" w:line="260" w:lineRule="auto"/>
         <w:ind w:left="700"/>
         <w:rPr>
-          <w:color w:val="1A1A1A"/>
-        </w:rPr>
-      </w:pPr>
-      <w:r>
-        <w:rPr>
-          <w:color w:val="1A1A1A"/>
+          <w:rFonts w:ascii="Montserrat" w:hAnsi="Montserrat"/>
+          <w:color w:val="1A1A1A"/>
+          <w:sz w:val="22"/>
+        </w:rPr>
+      </w:pPr>
+      <w:r>
+        <w:rPr>
+          <w:rFonts w:ascii="Montserrat" w:hAnsi="Montserrat"/>
+          <w:color w:val="1A1A1A"/>
+          <w:sz w:val="22"/>
         </w:rPr>
         <w:t>TEP: ao registrar um novo Termo de Encerramento.</w:t>
       </w:r>
@@ -8798,7 +8828,7 @@
           <w:sz w:val="27"/>
         </w:rPr>
       </w:pPr>
-      <w:bookmarkStart w:id="14" w:name="_Toc240465766"/>
+      <w:bookmarkStart w:id="14" w:name="_Toc240532321"/>
       <w:r>
         <w:rPr>
           <w:rFonts w:ascii="Montserrat" w:hAnsi="Montserrat"/>
@@ -8957,7 +8987,7 @@
           <w:sz w:val="27"/>
         </w:rPr>
       </w:pPr>
-      <w:bookmarkStart w:id="15" w:name="_Toc240465767"/>
+      <w:bookmarkStart w:id="15" w:name="_Toc240532322"/>
       <w:r>
         <w:rPr>
           <w:rFonts w:ascii="Montserrat" w:hAnsi="Montserrat"/>
@@ -9149,7 +9179,7 @@
           <w:sz w:val="27"/>
         </w:rPr>
       </w:pPr>
-      <w:bookmarkStart w:id="16" w:name="_Toc240465768"/>
+      <w:bookmarkStart w:id="16" w:name="_Toc240532323"/>
       <w:r>
         <w:rPr>
           <w:rFonts w:ascii="Montserrat" w:hAnsi="Montserrat"/>
@@ -9277,7 +9307,7 @@
           <w:sz w:val="27"/>
         </w:rPr>
       </w:pPr>
-      <w:bookmarkStart w:id="17" w:name="_Toc240465769"/>
+      <w:bookmarkStart w:id="17" w:name="_Toc240532324"/>
       <w:r>
         <w:rPr>
           <w:rFonts w:ascii="Montserrat" w:hAnsi="Montserrat"/>
@@ -9607,7 +9637,7 @@
           <w:sz w:val="27"/>
         </w:rPr>
       </w:pPr>
-      <w:bookmarkStart w:id="18" w:name="_Toc240465770"/>
+      <w:bookmarkStart w:id="18" w:name="_Toc240532325"/>
       <w:r>
         <w:rPr>
           <w:rFonts w:ascii="Montserrat" w:hAnsi="Montserrat"/>
@@ -9744,7 +9774,7 @@
           <w:sz w:val="27"/>
         </w:rPr>
       </w:pPr>
-      <w:bookmarkStart w:id="19" w:name="_Toc240465771"/>
+      <w:bookmarkStart w:id="19" w:name="_Toc240532326"/>
       <w:r>
         <w:rPr>
           <w:rFonts w:ascii="Montserrat" w:hAnsi="Montserrat"/>
@@ -10023,7 +10053,7 @@
           <w:sz w:val="27"/>
         </w:rPr>
       </w:pPr>
-      <w:bookmarkStart w:id="20" w:name="_Toc240465772"/>
+      <w:bookmarkStart w:id="20" w:name="_Toc240532327"/>
       <w:r>
         <w:rPr>
           <w:rFonts w:ascii="Montserrat" w:hAnsi="Montserrat"/>
@@ -10200,7 +10230,7 @@
           <w:sz w:val="27"/>
         </w:rPr>
       </w:pPr>
-      <w:bookmarkStart w:id="21" w:name="_Toc240465773"/>
+      <w:bookmarkStart w:id="21" w:name="_Toc240532328"/>
       <w:r>
         <w:rPr>
           <w:rFonts w:ascii="Montserrat" w:hAnsi="Montserrat"/>
@@ -10314,7 +10344,7 @@
           <w:sz w:val="34"/>
         </w:rPr>
       </w:pPr>
-      <w:bookmarkStart w:id="22" w:name="_Toc240465774"/>
+      <w:bookmarkStart w:id="22" w:name="_Toc240532329"/>
       <w:r>
         <w:rPr>
           <w:rFonts w:ascii="Montserrat" w:hAnsi="Montserrat"/>
@@ -10356,7 +10386,7 @@
           <w:sz w:val="27"/>
         </w:rPr>
       </w:pPr>
-      <w:bookmarkStart w:id="23" w:name="_Toc240465775"/>
+      <w:bookmarkStart w:id="23" w:name="_Toc240532330"/>
       <w:r>
         <w:rPr>
           <w:rFonts w:ascii="Montserrat" w:hAnsi="Montserrat"/>
@@ -11436,16 +11466,16 @@
         </w:rPr>
         <w:lastRenderedPageBreak/>
         <w:drawing>
-          <wp:inline distT="0" distB="0" distL="0" distR="0" wp14:anchorId="6F2E45A9" wp14:editId="4F4FEE6F">
+          <wp:inline distT="0" distB="0" distL="0" distR="0" wp14:anchorId="09E080A2" wp14:editId="11537308">
             <wp:extent cx="5120640" cy="4627581"/>
             <wp:effectExtent l="19050" t="19050" r="22860" b="20955"/>
-            <wp:docPr id="1707357492" name="Imagem 7"/>
+            <wp:docPr id="1436640465" name="Imagem 7"/>
             <wp:cNvGraphicFramePr/>
             <a:graphic xmlns:a="http://schemas.openxmlformats.org/drawingml/2006/main">
               <a:graphicData uri="http://schemas.openxmlformats.org/drawingml/2006/picture">
                 <pic:pic xmlns:pic="http://schemas.openxmlformats.org/drawingml/2006/picture">
                   <pic:nvPicPr>
-                    <pic:cNvPr id="1707357492" name=""/>
+                    <pic:cNvPr id="1436640465" name=""/>
                     <pic:cNvPicPr/>
                   </pic:nvPicPr>
                   <pic:blipFill>
@@ -11513,16 +11543,16 @@
         </w:rPr>
         <w:lastRenderedPageBreak/>
         <w:drawing>
-          <wp:inline distT="0" distB="0" distL="0" distR="0" wp14:anchorId="04B40157" wp14:editId="0C37CA5C">
+          <wp:inline distT="0" distB="0" distL="0" distR="0" wp14:anchorId="463D1B74" wp14:editId="0CB9B468">
             <wp:extent cx="5120640" cy="4627581"/>
             <wp:effectExtent l="19050" t="19050" r="22860" b="20955"/>
-            <wp:docPr id="1219630775" name="Imagem 8"/>
+            <wp:docPr id="629524340" name="Imagem 8"/>
             <wp:cNvGraphicFramePr/>
             <a:graphic xmlns:a="http://schemas.openxmlformats.org/drawingml/2006/main">
               <a:graphicData uri="http://schemas.openxmlformats.org/drawingml/2006/picture">
                 <pic:pic xmlns:pic="http://schemas.openxmlformats.org/drawingml/2006/picture">
                   <pic:nvPicPr>
-                    <pic:cNvPr id="1219630775" name=""/>
+                    <pic:cNvPr id="629524340" name=""/>
                     <pic:cNvPicPr/>
                   </pic:nvPicPr>
                   <pic:blipFill>
@@ -11730,7 +11760,7 @@
           <w:sz w:val="27"/>
         </w:rPr>
       </w:pPr>
-      <w:bookmarkStart w:id="24" w:name="_Toc240465776"/>
+      <w:bookmarkStart w:id="24" w:name="_Toc240532331"/>
       <w:r>
         <w:rPr>
           <w:rFonts w:ascii="Montserrat" w:hAnsi="Montserrat"/>
@@ -12655,16 +12685,16 @@
           <w:noProof/>
         </w:rPr>
         <w:drawing>
-          <wp:inline distT="0" distB="0" distL="0" distR="0" wp14:anchorId="24030871" wp14:editId="3F6CB173">
+          <wp:inline distT="0" distB="0" distL="0" distR="0" wp14:anchorId="2273F57C" wp14:editId="1399CB5D">
             <wp:extent cx="5120640" cy="4627581"/>
             <wp:effectExtent l="19050" t="19050" r="22860" b="20955"/>
-            <wp:docPr id="1842527425" name="Imagem 9"/>
+            <wp:docPr id="461479595" name="Imagem 9"/>
             <wp:cNvGraphicFramePr/>
             <a:graphic xmlns:a="http://schemas.openxmlformats.org/drawingml/2006/main">
               <a:graphicData uri="http://schemas.openxmlformats.org/drawingml/2006/picture">
                 <pic:pic xmlns:pic="http://schemas.openxmlformats.org/drawingml/2006/picture">
                   <pic:nvPicPr>
-                    <pic:cNvPr id="1842527425" name=""/>
+                    <pic:cNvPr id="461479595" name=""/>
                     <pic:cNvPicPr/>
                   </pic:nvPicPr>
                   <pic:blipFill>
@@ -12732,16 +12762,16 @@
         </w:rPr>
         <w:lastRenderedPageBreak/>
         <w:drawing>
-          <wp:inline distT="0" distB="0" distL="0" distR="0" wp14:anchorId="5F8D6AAC" wp14:editId="13C00648">
+          <wp:inline distT="0" distB="0" distL="0" distR="0" wp14:anchorId="6A8C7A62" wp14:editId="7CE6FBAC">
             <wp:extent cx="5120640" cy="4627581"/>
             <wp:effectExtent l="19050" t="19050" r="22860" b="20955"/>
-            <wp:docPr id="731322030" name="Imagem 10"/>
+            <wp:docPr id="1099894303" name="Imagem 10"/>
             <wp:cNvGraphicFramePr/>
             <a:graphic xmlns:a="http://schemas.openxmlformats.org/drawingml/2006/main">
               <a:graphicData uri="http://schemas.openxmlformats.org/drawingml/2006/picture">
                 <pic:pic xmlns:pic="http://schemas.openxmlformats.org/drawingml/2006/picture">
                   <pic:nvPicPr>
-                    <pic:cNvPr id="731322030" name=""/>
+                    <pic:cNvPr id="1099894303" name=""/>
                     <pic:cNvPicPr/>
                   </pic:nvPicPr>
                   <pic:blipFill>
@@ -12875,7 +12905,7 @@
           <w:sz w:val="27"/>
         </w:rPr>
       </w:pPr>
-      <w:bookmarkStart w:id="25" w:name="_Toc240465777"/>
+      <w:bookmarkStart w:id="25" w:name="_Toc240532332"/>
       <w:r>
         <w:rPr>
           <w:rFonts w:ascii="Montserrat" w:hAnsi="Montserrat"/>
@@ -13960,16 +13990,16 @@
         </w:rPr>
         <w:lastRenderedPageBreak/>
         <w:drawing>
-          <wp:inline distT="0" distB="0" distL="0" distR="0" wp14:anchorId="6A83A180" wp14:editId="315FF08A">
+          <wp:inline distT="0" distB="0" distL="0" distR="0" wp14:anchorId="35CF420C" wp14:editId="2BB4BBD3">
             <wp:extent cx="5120640" cy="3338440"/>
             <wp:effectExtent l="19050" t="19050" r="22860" b="14605"/>
-            <wp:docPr id="1235063267" name="Imagem 11"/>
+            <wp:docPr id="2113924487" name="Imagem 11"/>
             <wp:cNvGraphicFramePr/>
             <a:graphic xmlns:a="http://schemas.openxmlformats.org/drawingml/2006/main">
               <a:graphicData uri="http://schemas.openxmlformats.org/drawingml/2006/picture">
                 <pic:pic xmlns:pic="http://schemas.openxmlformats.org/drawingml/2006/picture">
                   <pic:nvPicPr>
-                    <pic:cNvPr id="1235063267" name=""/>
+                    <pic:cNvPr id="2113924487" name=""/>
                     <pic:cNvPicPr/>
                   </pic:nvPicPr>
                   <pic:blipFill>
@@ -14037,16 +14067,16 @@
         </w:rPr>
         <w:lastRenderedPageBreak/>
         <w:drawing>
-          <wp:inline distT="0" distB="0" distL="0" distR="0" wp14:anchorId="567950C0" wp14:editId="54B1B155">
+          <wp:inline distT="0" distB="0" distL="0" distR="0" wp14:anchorId="0DCD6CAC" wp14:editId="69BBDE56">
             <wp:extent cx="5120640" cy="4627581"/>
             <wp:effectExtent l="19050" t="19050" r="22860" b="20955"/>
-            <wp:docPr id="1607854673" name="Imagem 12"/>
+            <wp:docPr id="565897752" name="Imagem 12"/>
             <wp:cNvGraphicFramePr/>
             <a:graphic xmlns:a="http://schemas.openxmlformats.org/drawingml/2006/main">
               <a:graphicData uri="http://schemas.openxmlformats.org/drawingml/2006/picture">
                 <pic:pic xmlns:pic="http://schemas.openxmlformats.org/drawingml/2006/picture">
                   <pic:nvPicPr>
-                    <pic:cNvPr id="1607854673" name=""/>
+                    <pic:cNvPr id="565897752" name=""/>
                     <pic:cNvPicPr/>
                   </pic:nvPicPr>
                   <pic:blipFill>
@@ -14250,7 +14280,7 @@
           <w:sz w:val="27"/>
         </w:rPr>
       </w:pPr>
-      <w:bookmarkStart w:id="26" w:name="_Toc240465778"/>
+      <w:bookmarkStart w:id="26" w:name="_Toc240532333"/>
       <w:r>
         <w:rPr>
           <w:rFonts w:ascii="Montserrat" w:hAnsi="Montserrat"/>
@@ -14811,16 +14841,16 @@
           <w:noProof/>
         </w:rPr>
         <w:drawing>
-          <wp:inline distT="0" distB="0" distL="0" distR="0" wp14:anchorId="74A1E8D5" wp14:editId="2771648B">
+          <wp:inline distT="0" distB="0" distL="0" distR="0" wp14:anchorId="20CC4F15" wp14:editId="74CA6124">
             <wp:extent cx="5120640" cy="4627581"/>
             <wp:effectExtent l="19050" t="19050" r="22860" b="20955"/>
-            <wp:docPr id="1933777724" name="Imagem 13"/>
+            <wp:docPr id="290037669" name="Imagem 13"/>
             <wp:cNvGraphicFramePr/>
             <a:graphic xmlns:a="http://schemas.openxmlformats.org/drawingml/2006/main">
               <a:graphicData uri="http://schemas.openxmlformats.org/drawingml/2006/picture">
                 <pic:pic xmlns:pic="http://schemas.openxmlformats.org/drawingml/2006/picture">
                   <pic:nvPicPr>
-                    <pic:cNvPr id="1933777724" name=""/>
+                    <pic:cNvPr id="290037669" name=""/>
                     <pic:cNvPicPr/>
                   </pic:nvPicPr>
                   <pic:blipFill>
@@ -14888,16 +14918,16 @@
         </w:rPr>
         <w:lastRenderedPageBreak/>
         <w:drawing>
-          <wp:inline distT="0" distB="0" distL="0" distR="0" wp14:anchorId="19FB973B" wp14:editId="0D4AAB34">
+          <wp:inline distT="0" distB="0" distL="0" distR="0" wp14:anchorId="77A16D6D" wp14:editId="38A767A4">
             <wp:extent cx="5120640" cy="4627581"/>
             <wp:effectExtent l="19050" t="19050" r="22860" b="20955"/>
-            <wp:docPr id="1561180549" name="Imagem 14"/>
+            <wp:docPr id="218919085" name="Imagem 14"/>
             <wp:cNvGraphicFramePr/>
             <a:graphic xmlns:a="http://schemas.openxmlformats.org/drawingml/2006/main">
               <a:graphicData uri="http://schemas.openxmlformats.org/drawingml/2006/picture">
                 <pic:pic xmlns:pic="http://schemas.openxmlformats.org/drawingml/2006/picture">
                   <pic:nvPicPr>
-                    <pic:cNvPr id="1561180549" name=""/>
+                    <pic:cNvPr id="218919085" name=""/>
                     <pic:cNvPicPr/>
                   </pic:nvPicPr>
                   <pic:blipFill>
@@ -15110,6 +15140,33 @@
           <w:color w:val="1A1A1A"/>
           <w:sz w:val="22"/>
         </w:rPr>
+        <w:t xml:space="preserve">Execucao (autorrelato): cada marco tem uma coluna Execucao - um seletor com A iniciar / Em andamento / Atrasado / Concluido, com a data da ultima mudanca gravada automaticamente (nao editada a mao). E diferente do que o sistema ja calculava sozinho a partir das datas (atrasado ou nao): e a propria pessoa sinalizando se esta de fato trabalhando no marco - o unico jeito de saber isso entre o Inicio previsto e o vencimento, ja que antes so dava pra descobrir que nada andou quando o prazo ja tinha passado. Aparece tambem no Meu Painel (secao 6.4.4, onde o responsavel normalmente atualiza, sem precisar abrir o Planejamento inteiro) e no Painel de Prazos (secao 6.4.2), ao lado de cada </w:t>
+      </w:r>
+      <w:r>
+        <w:rPr>
+          <w:rFonts w:ascii="Montserrat" w:hAnsi="Montserrat"/>
+          <w:color w:val="1A1A1A"/>
+          <w:sz w:val="22"/>
+        </w:rPr>
+        <w:lastRenderedPageBreak/>
+        <w:t>marco atrasado ou vencendo. Escolher Concluido tambem preenche a Conclusao real com a data de hoje, para os dois campos nao ficarem discordando.</w:t>
+      </w:r>
+    </w:p>
+    <w:p>
+      <w:pPr>
+        <w:spacing w:line="280" w:lineRule="auto"/>
+        <w:rPr>
+          <w:rFonts w:ascii="Montserrat" w:hAnsi="Montserrat"/>
+          <w:color w:val="1A1A1A"/>
+          <w:sz w:val="22"/>
+        </w:rPr>
+      </w:pPr>
+      <w:r>
+        <w:rPr>
+          <w:rFonts w:ascii="Montserrat" w:hAnsi="Montserrat"/>
+          <w:color w:val="1A1A1A"/>
+          <w:sz w:val="22"/>
+        </w:rPr>
         <w:t xml:space="preserve">Responsavel (conta): alem do campo de texto livre Responsavel, cada marco tem um segundo campo opcional, Responsavel (conta) - um botao que abre um painel com uma caixa de selecao para cada conta da equipe do projeto selecionado (secao 2.5), permitindo marcar uma ou mais pessoas para o mesmo marco. A lista mostra o nome cadastrado de cada conta (caindo para o e-mail quando nao houver nome), e o botao resume a escolha (nome, ou </w:t>
       </w:r>
     </w:p>
@@ -15128,16 +15185,7 @@
           <w:color w:val="1A1A1A"/>
           <w:sz w:val="22"/>
         </w:rPr>
-        <w:t xml:space="preserve">ome +N com mais de uma pessoa marcada). Diferente do texto livre, que e so uma anotacao, esse campo vincula o marco a contas de verdade: e a partir dele (mais o papel Gerente de Projetos da equipe do projeto) que o sistema sabe </w:t>
-      </w:r>
-      <w:r>
-        <w:rPr>
-          <w:rFonts w:ascii="Montserrat" w:hAnsi="Montserrat"/>
-          <w:color w:val="1A1A1A"/>
-          <w:sz w:val="22"/>
-        </w:rPr>
-        <w:lastRenderedPageBreak/>
-        <w:t>para quem mandar o aviso automatico de prazo (secao 6.4.3), para popular o Painel de Prazos (secao 6.4.2) e para popular o Meu Painel (secao 6.4.4) de cada conta marcada. Preencher esse campo e opcional - um marco sem Responsavel (conta) continua funcionando normalmente, so nao gera aviso individual nem aparece no Meu Painel de ninguem.</w:t>
+        <w:t>ome +N com mais de uma pessoa marcada). Diferente do texto livre, que e so uma anotacao, esse campo vincula o marco a contas de verdade: e a partir dele (mais o papel Gerente de Projetos da equipe do projeto) que o sistema sabe para quem mandar o aviso automatico de prazo (secao 6.4.3), para popular o Painel de Prazos (secao 6.4.2) e para popular o Meu Painel (secao 6.4.4) de cada conta marcada. Preencher esse campo e opcional - um marco sem Responsavel (conta) continua funcionando normalmente, so nao gera aviso individual nem aparece no Meu Painel de ninguem.</w:t>
       </w:r>
     </w:p>
     <w:p>
@@ -15197,7 +15245,16 @@
           <w:color w:val="1A1A1A"/>
           <w:sz w:val="22"/>
         </w:rPr>
-        <w:t>Assistente de preenchimento por IA: apos selecionar o Projeto vinculado, o botao Sugerir com IA le a Solicitacao de Demanda, o TAP, o Canvas e as Atas de Reuniao do projeto e sugere o Solicitante (capa), o preenchimento da aba Pre-projeto (incluindo Macro fases, resumidas dos entregaveis/escopo do TAP), um rascunho inicial do cronograma (aba 3, quando ainda vazio) e a Introducao/Situacao atual/Proposta de mudanca/Beneficios na aba Viabilidade. O campo Negocio (capa) fica de fora, por nao ter fonte confiavel nos documentos (secao 2.12).</w:t>
+        <w:t xml:space="preserve">Assistente de preenchimento por IA: apos selecionar o Projeto vinculado, o botao Sugerir com IA le a Solicitacao de Demanda, o TAP, o Canvas e as Atas de Reuniao do projeto e sugere o Solicitante (capa), o preenchimento da aba Pre-projeto (incluindo Macro fases, resumidas dos entregaveis/escopo do TAP), um rascunho inicial do cronograma (aba 3, quando ainda vazio) e a Introducao/Situacao atual/Proposta de </w:t>
+      </w:r>
+      <w:r>
+        <w:rPr>
+          <w:rFonts w:ascii="Montserrat" w:hAnsi="Montserrat"/>
+          <w:color w:val="1A1A1A"/>
+          <w:sz w:val="22"/>
+        </w:rPr>
+        <w:lastRenderedPageBreak/>
+        <w:t>mudanca/Beneficios na aba Viabilidade. O campo Negocio (capa) fica de fora, por nao ter fonte confiavel nos documentos (secao 2.12).</w:t>
       </w:r>
     </w:p>
     <w:p>
@@ -15211,7 +15268,7 @@
           <w:sz w:val="27"/>
         </w:rPr>
       </w:pPr>
-      <w:bookmarkStart w:id="27" w:name="_Toc240465779"/>
+      <w:bookmarkStart w:id="27" w:name="_Toc240532334"/>
       <w:r>
         <w:rPr>
           <w:rFonts w:ascii="Montserrat" w:hAnsi="Montserrat"/>
@@ -15250,18 +15307,17 @@
         <w:rPr>
           <w:noProof/>
         </w:rPr>
-        <w:lastRenderedPageBreak/>
         <w:drawing>
-          <wp:inline distT="0" distB="0" distL="0" distR="0" wp14:anchorId="007B154A" wp14:editId="222A0E0B">
+          <wp:inline distT="0" distB="0" distL="0" distR="0" wp14:anchorId="3ABF3553" wp14:editId="0D11491E">
             <wp:extent cx="5120640" cy="4627581"/>
             <wp:effectExtent l="19050" t="19050" r="22860" b="20955"/>
-            <wp:docPr id="328953750" name="Imagem 15"/>
+            <wp:docPr id="813505992" name="Imagem 15"/>
             <wp:cNvGraphicFramePr/>
             <a:graphic xmlns:a="http://schemas.openxmlformats.org/drawingml/2006/main">
               <a:graphicData uri="http://schemas.openxmlformats.org/drawingml/2006/picture">
                 <pic:pic xmlns:pic="http://schemas.openxmlformats.org/drawingml/2006/picture">
                   <pic:nvPicPr>
-                    <pic:cNvPr id="328953750" name=""/>
+                    <pic:cNvPr id="813505992" name=""/>
                     <pic:cNvPicPr/>
                   </pic:nvPicPr>
                   <pic:blipFill>
@@ -15329,16 +15385,16 @@
         </w:rPr>
         <w:lastRenderedPageBreak/>
         <w:drawing>
-          <wp:inline distT="0" distB="0" distL="0" distR="0" wp14:anchorId="0D2F6DE6" wp14:editId="394A0F3D">
+          <wp:inline distT="0" distB="0" distL="0" distR="0" wp14:anchorId="3643B1F1" wp14:editId="7398884F">
             <wp:extent cx="5120640" cy="4627581"/>
             <wp:effectExtent l="19050" t="19050" r="22860" b="20955"/>
-            <wp:docPr id="560247088" name="Imagem 16"/>
+            <wp:docPr id="1330787328" name="Imagem 16"/>
             <wp:cNvGraphicFramePr/>
             <a:graphic xmlns:a="http://schemas.openxmlformats.org/drawingml/2006/main">
               <a:graphicData uri="http://schemas.openxmlformats.org/drawingml/2006/picture">
                 <pic:pic xmlns:pic="http://schemas.openxmlformats.org/drawingml/2006/picture">
                   <pic:nvPicPr>
-                    <pic:cNvPr id="560247088" name=""/>
+                    <pic:cNvPr id="1330787328" name=""/>
                     <pic:cNvPicPr/>
                   </pic:nvPicPr>
                   <pic:blipFill>
@@ -15502,16 +15558,16 @@
         </w:rPr>
         <w:lastRenderedPageBreak/>
         <w:drawing>
-          <wp:inline distT="0" distB="0" distL="0" distR="0" wp14:anchorId="185017F8" wp14:editId="65EC11BB">
+          <wp:inline distT="0" distB="0" distL="0" distR="0" wp14:anchorId="64269912" wp14:editId="627A950E">
             <wp:extent cx="5120640" cy="3282818"/>
             <wp:effectExtent l="19050" t="19050" r="22860" b="13335"/>
-            <wp:docPr id="1140910285" name="Imagem 17"/>
+            <wp:docPr id="737322409" name="Imagem 17"/>
             <wp:cNvGraphicFramePr/>
             <a:graphic xmlns:a="http://schemas.openxmlformats.org/drawingml/2006/main">
               <a:graphicData uri="http://schemas.openxmlformats.org/drawingml/2006/picture">
                 <pic:pic xmlns:pic="http://schemas.openxmlformats.org/drawingml/2006/picture">
                   <pic:nvPicPr>
-                    <pic:cNvPr id="1140910285" name=""/>
+                    <pic:cNvPr id="737322409" name=""/>
                     <pic:cNvPicPr/>
                   </pic:nvPicPr>
                   <pic:blipFill>
@@ -15577,18 +15633,8 @@
         </w:numPr>
         <w:spacing w:after="80" w:line="260" w:lineRule="auto"/>
         <w:ind w:left="700"/>
-        <w:rPr>
-          <w:rFonts w:ascii="Montserrat" w:hAnsi="Montserrat"/>
-          <w:color w:val="1A1A1A"/>
-          <w:sz w:val="22"/>
-        </w:rPr>
-      </w:pPr>
-      <w:r>
-        <w:rPr>
-          <w:rFonts w:ascii="Montserrat" w:hAnsi="Montserrat"/>
-          <w:color w:val="1A1A1A"/>
-          <w:sz w:val="22"/>
-        </w:rPr>
+      </w:pPr>
+      <w:r>
         <w:t>Status automatico da entrega: ao clicar em Visualizar arvore (ou ao abrir uma EAP ja registrada), cada Entrega (nivel 2) ganha um selo - Concluida, Atrasada, No prazo ou Sem cronograma vinculado - calculado automaticamente a partir do cronograma do Planejamento (Passo 4), casando pelo nome da entrega com o nome do marco. Nao ha nenhum campo novo para preencher na EAP: uma entrega fica Concluida se o marco correspondente tiver Conclusao real preenchida no cronograma, Atrasada se nao tiver conclusao e o Termino previsto ja tiver passado, e Sem cronograma vinculado se nao houver marco com o mesmo nome. Um resumo no topo da arvore mostra o percentual de entregas concluidas do projeto.</w:t>
       </w:r>
     </w:p>
@@ -15702,7 +15748,7 @@
           <w:sz w:val="27"/>
         </w:rPr>
       </w:pPr>
-      <w:bookmarkStart w:id="28" w:name="_Toc240465780"/>
+      <w:bookmarkStart w:id="28" w:name="_Toc240532335"/>
       <w:r>
         <w:rPr>
           <w:rFonts w:ascii="Montserrat" w:hAnsi="Montserrat"/>
@@ -15742,16 +15788,16 @@
           <w:noProof/>
         </w:rPr>
         <w:drawing>
-          <wp:inline distT="0" distB="0" distL="0" distR="0" wp14:anchorId="1F69D7C7" wp14:editId="1D762D12">
+          <wp:inline distT="0" distB="0" distL="0" distR="0" wp14:anchorId="0C82608C" wp14:editId="5586C564">
             <wp:extent cx="5120640" cy="4627581"/>
             <wp:effectExtent l="19050" t="19050" r="22860" b="20955"/>
-            <wp:docPr id="112040627" name="Imagem 18"/>
+            <wp:docPr id="1663229197" name="Imagem 18"/>
             <wp:cNvGraphicFramePr/>
             <a:graphic xmlns:a="http://schemas.openxmlformats.org/drawingml/2006/main">
               <a:graphicData uri="http://schemas.openxmlformats.org/drawingml/2006/picture">
                 <pic:pic xmlns:pic="http://schemas.openxmlformats.org/drawingml/2006/picture">
                   <pic:nvPicPr>
-                    <pic:cNvPr id="112040627" name=""/>
+                    <pic:cNvPr id="1663229197" name=""/>
                     <pic:cNvPicPr/>
                   </pic:nvPicPr>
                   <pic:blipFill>
@@ -15819,16 +15865,16 @@
         </w:rPr>
         <w:lastRenderedPageBreak/>
         <w:drawing>
-          <wp:inline distT="0" distB="0" distL="0" distR="0" wp14:anchorId="3F4B46CB" wp14:editId="37C2EC94">
+          <wp:inline distT="0" distB="0" distL="0" distR="0" wp14:anchorId="7511633A" wp14:editId="630348AD">
             <wp:extent cx="5120640" cy="4627581"/>
             <wp:effectExtent l="19050" t="19050" r="22860" b="20955"/>
-            <wp:docPr id="1616113259" name="Imagem 19"/>
+            <wp:docPr id="1735535561" name="Imagem 19"/>
             <wp:cNvGraphicFramePr/>
             <a:graphic xmlns:a="http://schemas.openxmlformats.org/drawingml/2006/main">
               <a:graphicData uri="http://schemas.openxmlformats.org/drawingml/2006/picture">
                 <pic:pic xmlns:pic="http://schemas.openxmlformats.org/drawingml/2006/picture">
                   <pic:nvPicPr>
-                    <pic:cNvPr id="1616113259" name=""/>
+                    <pic:cNvPr id="1735535561" name=""/>
                     <pic:cNvPicPr/>
                   </pic:nvPicPr>
                   <pic:blipFill>
@@ -16011,7 +16057,7 @@
           <w:sz w:val="27"/>
         </w:rPr>
       </w:pPr>
-      <w:bookmarkStart w:id="29" w:name="_Toc240465781"/>
+      <w:bookmarkStart w:id="29" w:name="_Toc240532336"/>
       <w:r>
         <w:rPr>
           <w:rFonts w:ascii="Montserrat" w:hAnsi="Montserrat"/>
@@ -16051,16 +16097,16 @@
           <w:noProof/>
         </w:rPr>
         <w:drawing>
-          <wp:inline distT="0" distB="0" distL="0" distR="0" wp14:anchorId="0EF5F0DD" wp14:editId="4B29245B">
+          <wp:inline distT="0" distB="0" distL="0" distR="0" wp14:anchorId="168D33C6" wp14:editId="4E8939DD">
             <wp:extent cx="5120640" cy="4627581"/>
             <wp:effectExtent l="19050" t="19050" r="22860" b="20955"/>
-            <wp:docPr id="336690628" name="Imagem 20"/>
+            <wp:docPr id="534393430" name="Imagem 20"/>
             <wp:cNvGraphicFramePr/>
             <a:graphic xmlns:a="http://schemas.openxmlformats.org/drawingml/2006/main">
               <a:graphicData uri="http://schemas.openxmlformats.org/drawingml/2006/picture">
                 <pic:pic xmlns:pic="http://schemas.openxmlformats.org/drawingml/2006/picture">
                   <pic:nvPicPr>
-                    <pic:cNvPr id="336690628" name=""/>
+                    <pic:cNvPr id="534393430" name=""/>
                     <pic:cNvPicPr/>
                   </pic:nvPicPr>
                   <pic:blipFill>
@@ -16128,16 +16174,16 @@
         </w:rPr>
         <w:lastRenderedPageBreak/>
         <w:drawing>
-          <wp:inline distT="0" distB="0" distL="0" distR="0" wp14:anchorId="18F3F1B5" wp14:editId="193903B3">
+          <wp:inline distT="0" distB="0" distL="0" distR="0" wp14:anchorId="1C99E665" wp14:editId="173F9099">
             <wp:extent cx="5120640" cy="4627581"/>
             <wp:effectExtent l="19050" t="19050" r="22860" b="20955"/>
-            <wp:docPr id="1410194895" name="Imagem 21"/>
+            <wp:docPr id="650133252" name="Imagem 21"/>
             <wp:cNvGraphicFramePr/>
             <a:graphic xmlns:a="http://schemas.openxmlformats.org/drawingml/2006/main">
               <a:graphicData uri="http://schemas.openxmlformats.org/drawingml/2006/picture">
                 <pic:pic xmlns:pic="http://schemas.openxmlformats.org/drawingml/2006/picture">
                   <pic:nvPicPr>
-                    <pic:cNvPr id="1410194895" name=""/>
+                    <pic:cNvPr id="650133252" name=""/>
                     <pic:cNvPicPr/>
                   </pic:nvPicPr>
                   <pic:blipFill>
@@ -16343,16 +16389,16 @@
           <w:noProof/>
         </w:rPr>
         <w:drawing>
-          <wp:inline distT="0" distB="0" distL="0" distR="0" wp14:anchorId="10925CE9" wp14:editId="57233E1A">
+          <wp:inline distT="0" distB="0" distL="0" distR="0" wp14:anchorId="7D9709F8" wp14:editId="074C05B7">
             <wp:extent cx="5120640" cy="1757287"/>
             <wp:effectExtent l="19050" t="19050" r="22860" b="14605"/>
-            <wp:docPr id="188821688" name="Imagem 22"/>
+            <wp:docPr id="1874087592" name="Imagem 22"/>
             <wp:cNvGraphicFramePr/>
             <a:graphic xmlns:a="http://schemas.openxmlformats.org/drawingml/2006/main">
               <a:graphicData uri="http://schemas.openxmlformats.org/drawingml/2006/picture">
                 <pic:pic xmlns:pic="http://schemas.openxmlformats.org/drawingml/2006/picture">
                   <pic:nvPicPr>
-                    <pic:cNvPr id="188821688" name=""/>
+                    <pic:cNvPr id="1874087592" name=""/>
                     <pic:cNvPicPr/>
                   </pic:nvPicPr>
                   <pic:blipFill>
@@ -16465,7 +16511,7 @@
           <w:sz w:val="27"/>
         </w:rPr>
       </w:pPr>
-      <w:bookmarkStart w:id="30" w:name="_Toc240465782"/>
+      <w:bookmarkStart w:id="30" w:name="_Toc240532337"/>
       <w:r>
         <w:rPr>
           <w:rFonts w:ascii="Montserrat" w:hAnsi="Montserrat"/>
@@ -16506,16 +16552,16 @@
         </w:rPr>
         <w:lastRenderedPageBreak/>
         <w:drawing>
-          <wp:inline distT="0" distB="0" distL="0" distR="0" wp14:anchorId="7DA59EAD" wp14:editId="539A1C7D">
+          <wp:inline distT="0" distB="0" distL="0" distR="0" wp14:anchorId="621CFF86" wp14:editId="1682217B">
             <wp:extent cx="5120640" cy="4627581"/>
             <wp:effectExtent l="19050" t="19050" r="22860" b="20955"/>
-            <wp:docPr id="196092187" name="Imagem 23"/>
+            <wp:docPr id="1883951483" name="Imagem 23"/>
             <wp:cNvGraphicFramePr/>
             <a:graphic xmlns:a="http://schemas.openxmlformats.org/drawingml/2006/main">
               <a:graphicData uri="http://schemas.openxmlformats.org/drawingml/2006/picture">
                 <pic:pic xmlns:pic="http://schemas.openxmlformats.org/drawingml/2006/picture">
                   <pic:nvPicPr>
-                    <pic:cNvPr id="196092187" name=""/>
+                    <pic:cNvPr id="1883951483" name=""/>
                     <pic:cNvPicPr/>
                   </pic:nvPicPr>
                   <pic:blipFill>
@@ -16583,16 +16629,16 @@
         </w:rPr>
         <w:lastRenderedPageBreak/>
         <w:drawing>
-          <wp:inline distT="0" distB="0" distL="0" distR="0" wp14:anchorId="09490D42" wp14:editId="47981B0A">
+          <wp:inline distT="0" distB="0" distL="0" distR="0" wp14:anchorId="3F175DEE" wp14:editId="72F6860D">
             <wp:extent cx="5120640" cy="4627581"/>
             <wp:effectExtent l="19050" t="19050" r="22860" b="20955"/>
-            <wp:docPr id="2018862260" name="Imagem 24"/>
+            <wp:docPr id="1806675231" name="Imagem 24"/>
             <wp:cNvGraphicFramePr/>
             <a:graphic xmlns:a="http://schemas.openxmlformats.org/drawingml/2006/main">
               <a:graphicData uri="http://schemas.openxmlformats.org/drawingml/2006/picture">
                 <pic:pic xmlns:pic="http://schemas.openxmlformats.org/drawingml/2006/picture">
                   <pic:nvPicPr>
-                    <pic:cNvPr id="2018862260" name=""/>
+                    <pic:cNvPr id="1806675231" name=""/>
                     <pic:cNvPicPr/>
                   </pic:nvPicPr>
                   <pic:blipFill>
@@ -16829,7 +16875,7 @@
           <w:sz w:val="27"/>
         </w:rPr>
       </w:pPr>
-      <w:bookmarkStart w:id="31" w:name="_Toc240465783"/>
+      <w:bookmarkStart w:id="31" w:name="_Toc240532338"/>
       <w:r>
         <w:rPr>
           <w:rFonts w:ascii="Montserrat" w:hAnsi="Montserrat"/>
@@ -16869,16 +16915,16 @@
           <w:noProof/>
         </w:rPr>
         <w:drawing>
-          <wp:inline distT="0" distB="0" distL="0" distR="0" wp14:anchorId="40464485" wp14:editId="45A44976">
+          <wp:inline distT="0" distB="0" distL="0" distR="0" wp14:anchorId="0408A65C" wp14:editId="6A4B9734">
             <wp:extent cx="5120640" cy="4627581"/>
             <wp:effectExtent l="19050" t="19050" r="22860" b="20955"/>
-            <wp:docPr id="1920206086" name="Imagem 25"/>
+            <wp:docPr id="431577049" name="Imagem 25"/>
             <wp:cNvGraphicFramePr/>
             <a:graphic xmlns:a="http://schemas.openxmlformats.org/drawingml/2006/main">
               <a:graphicData uri="http://schemas.openxmlformats.org/drawingml/2006/picture">
                 <pic:pic xmlns:pic="http://schemas.openxmlformats.org/drawingml/2006/picture">
                   <pic:nvPicPr>
-                    <pic:cNvPr id="1920206086" name=""/>
+                    <pic:cNvPr id="431577049" name=""/>
                     <pic:cNvPicPr/>
                   </pic:nvPicPr>
                   <pic:blipFill>
@@ -16946,16 +16992,16 @@
         </w:rPr>
         <w:lastRenderedPageBreak/>
         <w:drawing>
-          <wp:inline distT="0" distB="0" distL="0" distR="0" wp14:anchorId="64AC3216" wp14:editId="23D2FF3B">
+          <wp:inline distT="0" distB="0" distL="0" distR="0" wp14:anchorId="7A4F60C8" wp14:editId="3EF4975E">
             <wp:extent cx="5120640" cy="4627581"/>
             <wp:effectExtent l="19050" t="19050" r="22860" b="20955"/>
-            <wp:docPr id="1513316072" name="Imagem 26"/>
+            <wp:docPr id="835533801" name="Imagem 26"/>
             <wp:cNvGraphicFramePr/>
             <a:graphic xmlns:a="http://schemas.openxmlformats.org/drawingml/2006/main">
               <a:graphicData uri="http://schemas.openxmlformats.org/drawingml/2006/picture">
                 <pic:pic xmlns:pic="http://schemas.openxmlformats.org/drawingml/2006/picture">
                   <pic:nvPicPr>
-                    <pic:cNvPr id="1513316072" name=""/>
+                    <pic:cNvPr id="835533801" name=""/>
                     <pic:cNvPicPr/>
                   </pic:nvPicPr>
                   <pic:blipFill>
@@ -17146,7 +17192,7 @@
           <w:sz w:val="27"/>
         </w:rPr>
       </w:pPr>
-      <w:bookmarkStart w:id="32" w:name="_Toc240465784"/>
+      <w:bookmarkStart w:id="32" w:name="_Toc240532339"/>
       <w:r>
         <w:rPr>
           <w:rFonts w:ascii="Montserrat" w:hAnsi="Montserrat"/>
@@ -17186,16 +17232,16 @@
           <w:noProof/>
         </w:rPr>
         <w:drawing>
-          <wp:inline distT="0" distB="0" distL="0" distR="0" wp14:anchorId="658C60B5" wp14:editId="5192D47B">
+          <wp:inline distT="0" distB="0" distL="0" distR="0" wp14:anchorId="2958DBB0" wp14:editId="25CB3636">
             <wp:extent cx="5120640" cy="4000682"/>
             <wp:effectExtent l="19050" t="19050" r="22860" b="19050"/>
-            <wp:docPr id="1109050576" name="Imagem 27"/>
+            <wp:docPr id="854388804" name="Imagem 27"/>
             <wp:cNvGraphicFramePr/>
             <a:graphic xmlns:a="http://schemas.openxmlformats.org/drawingml/2006/main">
               <a:graphicData uri="http://schemas.openxmlformats.org/drawingml/2006/picture">
                 <pic:pic xmlns:pic="http://schemas.openxmlformats.org/drawingml/2006/picture">
                   <pic:nvPicPr>
-                    <pic:cNvPr id="1109050576" name=""/>
+                    <pic:cNvPr id="854388804" name=""/>
                     <pic:cNvPicPr/>
                   </pic:nvPicPr>
                   <pic:blipFill>
@@ -17719,7 +17765,7 @@
           <w:sz w:val="34"/>
         </w:rPr>
       </w:pPr>
-      <w:bookmarkStart w:id="33" w:name="_Toc240465785"/>
+      <w:bookmarkStart w:id="33" w:name="_Toc240532340"/>
       <w:r>
         <w:rPr>
           <w:rFonts w:ascii="Montserrat" w:hAnsi="Montserrat"/>
@@ -17761,7 +17807,7 @@
           <w:sz w:val="27"/>
         </w:rPr>
       </w:pPr>
-      <w:bookmarkStart w:id="34" w:name="_Toc240465786"/>
+      <w:bookmarkStart w:id="34" w:name="_Toc240532341"/>
       <w:r>
         <w:rPr>
           <w:rFonts w:ascii="Montserrat" w:hAnsi="Montserrat"/>
@@ -17801,16 +17847,16 @@
           <w:noProof/>
         </w:rPr>
         <w:drawing>
-          <wp:inline distT="0" distB="0" distL="0" distR="0" wp14:anchorId="2F8B01DF" wp14:editId="2090901C">
+          <wp:inline distT="0" distB="0" distL="0" distR="0" wp14:anchorId="1E15410B" wp14:editId="4FF68268">
             <wp:extent cx="5120640" cy="4627581"/>
             <wp:effectExtent l="19050" t="19050" r="22860" b="20955"/>
-            <wp:docPr id="904793937" name="Imagem 28"/>
+            <wp:docPr id="1613119061" name="Imagem 28"/>
             <wp:cNvGraphicFramePr/>
             <a:graphic xmlns:a="http://schemas.openxmlformats.org/drawingml/2006/main">
               <a:graphicData uri="http://schemas.openxmlformats.org/drawingml/2006/picture">
                 <pic:pic xmlns:pic="http://schemas.openxmlformats.org/drawingml/2006/picture">
                   <pic:nvPicPr>
-                    <pic:cNvPr id="904793937" name=""/>
+                    <pic:cNvPr id="1613119061" name=""/>
                     <pic:cNvPicPr/>
                   </pic:nvPicPr>
                   <pic:blipFill>
@@ -17878,16 +17924,16 @@
         </w:rPr>
         <w:lastRenderedPageBreak/>
         <w:drawing>
-          <wp:inline distT="0" distB="0" distL="0" distR="0" wp14:anchorId="058C6CCD" wp14:editId="2096DCDF">
+          <wp:inline distT="0" distB="0" distL="0" distR="0" wp14:anchorId="396F3F2F" wp14:editId="5EEAA763">
             <wp:extent cx="5120640" cy="4627581"/>
             <wp:effectExtent l="19050" t="19050" r="22860" b="20955"/>
-            <wp:docPr id="434445378" name="Imagem 29"/>
+            <wp:docPr id="910720728" name="Imagem 29"/>
             <wp:cNvGraphicFramePr/>
             <a:graphic xmlns:a="http://schemas.openxmlformats.org/drawingml/2006/main">
               <a:graphicData uri="http://schemas.openxmlformats.org/drawingml/2006/picture">
                 <pic:pic xmlns:pic="http://schemas.openxmlformats.org/drawingml/2006/picture">
                   <pic:nvPicPr>
-                    <pic:cNvPr id="434445378" name=""/>
+                    <pic:cNvPr id="910720728" name=""/>
                     <pic:cNvPicPr/>
                   </pic:nvPicPr>
                   <pic:blipFill>
@@ -17955,16 +18001,16 @@
         </w:rPr>
         <w:lastRenderedPageBreak/>
         <w:drawing>
-          <wp:inline distT="0" distB="0" distL="0" distR="0" wp14:anchorId="2F2BADE3" wp14:editId="6C30F95B">
+          <wp:inline distT="0" distB="0" distL="0" distR="0" wp14:anchorId="0275FFAA" wp14:editId="3756A29E">
             <wp:extent cx="5120640" cy="4627581"/>
             <wp:effectExtent l="19050" t="19050" r="22860" b="20955"/>
-            <wp:docPr id="1587189240" name="Imagem 30"/>
+            <wp:docPr id="1110652849" name="Imagem 30"/>
             <wp:cNvGraphicFramePr/>
             <a:graphic xmlns:a="http://schemas.openxmlformats.org/drawingml/2006/main">
               <a:graphicData uri="http://schemas.openxmlformats.org/drawingml/2006/picture">
                 <pic:pic xmlns:pic="http://schemas.openxmlformats.org/drawingml/2006/picture">
                   <pic:nvPicPr>
-                    <pic:cNvPr id="1587189240" name=""/>
+                    <pic:cNvPr id="1110652849" name=""/>
                     <pic:cNvPicPr/>
                   </pic:nvPicPr>
                   <pic:blipFill>
@@ -18166,16 +18212,16 @@
           <w:noProof/>
         </w:rPr>
         <w:drawing>
-          <wp:inline distT="0" distB="0" distL="0" distR="0" wp14:anchorId="7BA82354" wp14:editId="28C0C4C4">
+          <wp:inline distT="0" distB="0" distL="0" distR="0" wp14:anchorId="6949DDB3" wp14:editId="34112375">
             <wp:extent cx="5120640" cy="1715571"/>
             <wp:effectExtent l="19050" t="19050" r="22860" b="18415"/>
-            <wp:docPr id="1144066898" name="Imagem 31"/>
+            <wp:docPr id="497286488" name="Imagem 31"/>
             <wp:cNvGraphicFramePr/>
             <a:graphic xmlns:a="http://schemas.openxmlformats.org/drawingml/2006/main">
               <a:graphicData uri="http://schemas.openxmlformats.org/drawingml/2006/picture">
                 <pic:pic xmlns:pic="http://schemas.openxmlformats.org/drawingml/2006/picture">
                   <pic:nvPicPr>
-                    <pic:cNvPr id="1144066898" name=""/>
+                    <pic:cNvPr id="497286488" name=""/>
                     <pic:cNvPicPr/>
                   </pic:nvPicPr>
                   <pic:blipFill>
@@ -18312,16 +18358,16 @@
           <w:noProof/>
         </w:rPr>
         <w:drawing>
-          <wp:inline distT="0" distB="0" distL="0" distR="0" wp14:anchorId="510A5267" wp14:editId="7A2F3E6A">
+          <wp:inline distT="0" distB="0" distL="0" distR="0" wp14:anchorId="0F007B52" wp14:editId="678C29B2">
             <wp:extent cx="5120640" cy="3282818"/>
             <wp:effectExtent l="19050" t="19050" r="22860" b="13335"/>
-            <wp:docPr id="1981213004" name="Imagem 32"/>
+            <wp:docPr id="1932124730" name="Imagem 32"/>
             <wp:cNvGraphicFramePr/>
             <a:graphic xmlns:a="http://schemas.openxmlformats.org/drawingml/2006/main">
               <a:graphicData uri="http://schemas.openxmlformats.org/drawingml/2006/picture">
                 <pic:pic xmlns:pic="http://schemas.openxmlformats.org/drawingml/2006/picture">
                   <pic:nvPicPr>
-                    <pic:cNvPr id="1981213004" name=""/>
+                    <pic:cNvPr id="1932124730" name=""/>
                     <pic:cNvPicPr/>
                   </pic:nvPicPr>
                   <pic:blipFill>
@@ -18455,16 +18501,16 @@
           <w:noProof/>
         </w:rPr>
         <w:drawing>
-          <wp:inline distT="0" distB="0" distL="0" distR="0" wp14:anchorId="3E63025C" wp14:editId="207C5FC2">
+          <wp:inline distT="0" distB="0" distL="0" distR="0" wp14:anchorId="2CC0CC94" wp14:editId="282811CB">
             <wp:extent cx="5120640" cy="951357"/>
             <wp:effectExtent l="19050" t="19050" r="22860" b="20320"/>
-            <wp:docPr id="1791392202" name="Imagem 33"/>
+            <wp:docPr id="2055688744" name="Imagem 33"/>
             <wp:cNvGraphicFramePr/>
             <a:graphic xmlns:a="http://schemas.openxmlformats.org/drawingml/2006/main">
               <a:graphicData uri="http://schemas.openxmlformats.org/drawingml/2006/picture">
                 <pic:pic xmlns:pic="http://schemas.openxmlformats.org/drawingml/2006/picture">
                   <pic:nvPicPr>
-                    <pic:cNvPr id="1791392202" name=""/>
+                    <pic:cNvPr id="2055688744" name=""/>
                     <pic:cNvPicPr/>
                   </pic:nvPicPr>
                   <pic:blipFill>
@@ -18628,16 +18674,16 @@
           <w:noProof/>
         </w:rPr>
         <w:drawing>
-          <wp:inline distT="0" distB="0" distL="0" distR="0" wp14:anchorId="79C83634" wp14:editId="741C85D8">
+          <wp:inline distT="0" distB="0" distL="0" distR="0" wp14:anchorId="2EAE814C" wp14:editId="6666E4CE">
             <wp:extent cx="5120640" cy="1515102"/>
             <wp:effectExtent l="19050" t="19050" r="22860" b="28575"/>
-            <wp:docPr id="1967993906" name="Imagem 34"/>
+            <wp:docPr id="268896839" name="Imagem 34"/>
             <wp:cNvGraphicFramePr/>
             <a:graphic xmlns:a="http://schemas.openxmlformats.org/drawingml/2006/main">
               <a:graphicData uri="http://schemas.openxmlformats.org/drawingml/2006/picture">
                 <pic:pic xmlns:pic="http://schemas.openxmlformats.org/drawingml/2006/picture">
                   <pic:nvPicPr>
-                    <pic:cNvPr id="1967993906" name=""/>
+                    <pic:cNvPr id="268896839" name=""/>
                     <pic:cNvPicPr/>
                   </pic:nvPicPr>
                   <pic:blipFill>
@@ -18749,16 +18795,16 @@
           <w:noProof/>
         </w:rPr>
         <w:drawing>
-          <wp:inline distT="0" distB="0" distL="0" distR="0" wp14:anchorId="5FDD5537" wp14:editId="0F4966D9">
+          <wp:inline distT="0" distB="0" distL="0" distR="0" wp14:anchorId="22AB6788" wp14:editId="52AF38CE">
             <wp:extent cx="5120640" cy="1391113"/>
             <wp:effectExtent l="19050" t="19050" r="22860" b="19050"/>
-            <wp:docPr id="823542101" name="Imagem 35"/>
+            <wp:docPr id="971517083" name="Imagem 35"/>
             <wp:cNvGraphicFramePr/>
             <a:graphic xmlns:a="http://schemas.openxmlformats.org/drawingml/2006/main">
               <a:graphicData uri="http://schemas.openxmlformats.org/drawingml/2006/picture">
                 <pic:pic xmlns:pic="http://schemas.openxmlformats.org/drawingml/2006/picture">
                   <pic:nvPicPr>
-                    <pic:cNvPr id="823542101" name=""/>
+                    <pic:cNvPr id="971517083" name=""/>
                     <pic:cNvPicPr/>
                   </pic:nvPicPr>
                   <pic:blipFill>
@@ -18880,16 +18926,16 @@
           <w:noProof/>
         </w:rPr>
         <w:drawing>
-          <wp:inline distT="0" distB="0" distL="0" distR="0" wp14:anchorId="01DEBB01" wp14:editId="59DB14E2">
+          <wp:inline distT="0" distB="0" distL="0" distR="0" wp14:anchorId="5CD1D045" wp14:editId="3DB00622">
             <wp:extent cx="5120640" cy="1125174"/>
             <wp:effectExtent l="19050" t="19050" r="22860" b="18415"/>
-            <wp:docPr id="1817827628" name="Imagem 36"/>
+            <wp:docPr id="730635605" name="Imagem 36"/>
             <wp:cNvGraphicFramePr/>
             <a:graphic xmlns:a="http://schemas.openxmlformats.org/drawingml/2006/main">
               <a:graphicData uri="http://schemas.openxmlformats.org/drawingml/2006/picture">
                 <pic:pic xmlns:pic="http://schemas.openxmlformats.org/drawingml/2006/picture">
                   <pic:nvPicPr>
-                    <pic:cNvPr id="1817827628" name=""/>
+                    <pic:cNvPr id="730635605" name=""/>
                     <pic:cNvPicPr/>
                   </pic:nvPicPr>
                   <pic:blipFill>
@@ -18978,7 +19024,7 @@
           <w:sz w:val="27"/>
         </w:rPr>
       </w:pPr>
-      <w:bookmarkStart w:id="35" w:name="_Toc240465787"/>
+      <w:bookmarkStart w:id="35" w:name="_Toc240532342"/>
       <w:r>
         <w:rPr>
           <w:rFonts w:ascii="Montserrat" w:hAnsi="Montserrat"/>
@@ -19019,16 +19065,16 @@
         </w:rPr>
         <w:lastRenderedPageBreak/>
         <w:drawing>
-          <wp:inline distT="0" distB="0" distL="0" distR="0" wp14:anchorId="75E73447" wp14:editId="41F7F609">
+          <wp:inline distT="0" distB="0" distL="0" distR="0" wp14:anchorId="335DA47A" wp14:editId="191D72CE">
             <wp:extent cx="5120640" cy="4627581"/>
             <wp:effectExtent l="19050" t="19050" r="22860" b="20955"/>
-            <wp:docPr id="1743500959" name="Imagem 37"/>
+            <wp:docPr id="864275392" name="Imagem 37"/>
             <wp:cNvGraphicFramePr/>
             <a:graphic xmlns:a="http://schemas.openxmlformats.org/drawingml/2006/main">
               <a:graphicData uri="http://schemas.openxmlformats.org/drawingml/2006/picture">
                 <pic:pic xmlns:pic="http://schemas.openxmlformats.org/drawingml/2006/picture">
                   <pic:nvPicPr>
-                    <pic:cNvPr id="1743500959" name=""/>
+                    <pic:cNvPr id="864275392" name=""/>
                     <pic:cNvPicPr/>
                   </pic:nvPicPr>
                   <pic:blipFill>
@@ -19096,16 +19142,16 @@
         </w:rPr>
         <w:lastRenderedPageBreak/>
         <w:drawing>
-          <wp:inline distT="0" distB="0" distL="0" distR="0" wp14:anchorId="669C9B03" wp14:editId="2D2C2B4D">
+          <wp:inline distT="0" distB="0" distL="0" distR="0" wp14:anchorId="39A4F8DA" wp14:editId="3CC26DB1">
             <wp:extent cx="5120640" cy="4627581"/>
             <wp:effectExtent l="19050" t="19050" r="22860" b="20955"/>
-            <wp:docPr id="611885013" name="Imagem 38"/>
+            <wp:docPr id="1815964052" name="Imagem 38"/>
             <wp:cNvGraphicFramePr/>
             <a:graphic xmlns:a="http://schemas.openxmlformats.org/drawingml/2006/main">
               <a:graphicData uri="http://schemas.openxmlformats.org/drawingml/2006/picture">
                 <pic:pic xmlns:pic="http://schemas.openxmlformats.org/drawingml/2006/picture">
                   <pic:nvPicPr>
-                    <pic:cNvPr id="611885013" name=""/>
+                    <pic:cNvPr id="1815964052" name=""/>
                     <pic:cNvPicPr/>
                   </pic:nvPicPr>
                   <pic:blipFill>
@@ -19274,16 +19320,16 @@
           <w:noProof/>
         </w:rPr>
         <w:drawing>
-          <wp:inline distT="0" distB="0" distL="0" distR="0" wp14:anchorId="33549D30" wp14:editId="29F610B0">
+          <wp:inline distT="0" distB="0" distL="0" distR="0" wp14:anchorId="0E8D94B0" wp14:editId="0186FA42">
             <wp:extent cx="5120640" cy="2144319"/>
             <wp:effectExtent l="19050" t="19050" r="22860" b="27940"/>
-            <wp:docPr id="1906157275" name="Imagem 39"/>
+            <wp:docPr id="1455314675" name="Imagem 39"/>
             <wp:cNvGraphicFramePr/>
             <a:graphic xmlns:a="http://schemas.openxmlformats.org/drawingml/2006/main">
               <a:graphicData uri="http://schemas.openxmlformats.org/drawingml/2006/picture">
                 <pic:pic xmlns:pic="http://schemas.openxmlformats.org/drawingml/2006/picture">
                   <pic:nvPicPr>
-                    <pic:cNvPr id="1906157275" name=""/>
+                    <pic:cNvPr id="1455314675" name=""/>
                     <pic:cNvPicPr/>
                   </pic:nvPicPr>
                   <pic:blipFill>
@@ -19371,16 +19417,16 @@
           <w:noProof/>
         </w:rPr>
         <w:drawing>
-          <wp:inline distT="0" distB="0" distL="0" distR="0" wp14:anchorId="506F8A4F" wp14:editId="3ABB3D96">
+          <wp:inline distT="0" distB="0" distL="0" distR="0" wp14:anchorId="4DEBE5FE" wp14:editId="10C2B8C6">
             <wp:extent cx="5120640" cy="1055647"/>
             <wp:effectExtent l="19050" t="19050" r="22860" b="11430"/>
-            <wp:docPr id="755475751" name="Imagem 40"/>
+            <wp:docPr id="1038857054" name="Imagem 40"/>
             <wp:cNvGraphicFramePr/>
             <a:graphic xmlns:a="http://schemas.openxmlformats.org/drawingml/2006/main">
               <a:graphicData uri="http://schemas.openxmlformats.org/drawingml/2006/picture">
                 <pic:pic xmlns:pic="http://schemas.openxmlformats.org/drawingml/2006/picture">
                   <pic:nvPicPr>
-                    <pic:cNvPr id="755475751" name=""/>
+                    <pic:cNvPr id="1038857054" name=""/>
                     <pic:cNvPicPr/>
                   </pic:nvPicPr>
                   <pic:blipFill>
@@ -19502,16 +19548,16 @@
           <w:noProof/>
         </w:rPr>
         <w:drawing>
-          <wp:inline distT="0" distB="0" distL="0" distR="0" wp14:anchorId="1E5923FD" wp14:editId="0EAF4CC1">
+          <wp:inline distT="0" distB="0" distL="0" distR="0" wp14:anchorId="1175928C" wp14:editId="2C160A5A">
             <wp:extent cx="5120640" cy="3282818"/>
             <wp:effectExtent l="19050" t="19050" r="22860" b="13335"/>
-            <wp:docPr id="832668684" name="Imagem 41"/>
+            <wp:docPr id="1727305586" name="Imagem 41"/>
             <wp:cNvGraphicFramePr/>
             <a:graphic xmlns:a="http://schemas.openxmlformats.org/drawingml/2006/main">
               <a:graphicData uri="http://schemas.openxmlformats.org/drawingml/2006/picture">
                 <pic:pic xmlns:pic="http://schemas.openxmlformats.org/drawingml/2006/picture">
                   <pic:nvPicPr>
-                    <pic:cNvPr id="832668684" name=""/>
+                    <pic:cNvPr id="1727305586" name=""/>
                     <pic:cNvPicPr/>
                   </pic:nvPicPr>
                   <pic:blipFill>
@@ -19645,16 +19691,16 @@
         </w:rPr>
         <w:lastRenderedPageBreak/>
         <w:drawing>
-          <wp:inline distT="0" distB="0" distL="0" distR="0" wp14:anchorId="191506A3" wp14:editId="662943F8">
+          <wp:inline distT="0" distB="0" distL="0" distR="0" wp14:anchorId="671DFF9A" wp14:editId="011B574E">
             <wp:extent cx="5120640" cy="1978034"/>
             <wp:effectExtent l="19050" t="19050" r="22860" b="22225"/>
-            <wp:docPr id="2102454165" name="Imagem 42"/>
+            <wp:docPr id="1696908175" name="Imagem 42"/>
             <wp:cNvGraphicFramePr/>
             <a:graphic xmlns:a="http://schemas.openxmlformats.org/drawingml/2006/main">
               <a:graphicData uri="http://schemas.openxmlformats.org/drawingml/2006/picture">
                 <pic:pic xmlns:pic="http://schemas.openxmlformats.org/drawingml/2006/picture">
                   <pic:nvPicPr>
-                    <pic:cNvPr id="2102454165" name=""/>
+                    <pic:cNvPr id="1696908175" name=""/>
                     <pic:cNvPicPr/>
                   </pic:nvPicPr>
                   <pic:blipFill>
@@ -19726,7 +19772,7 @@
           <w:sz w:val="34"/>
         </w:rPr>
       </w:pPr>
-      <w:bookmarkStart w:id="36" w:name="_Toc240465788"/>
+      <w:bookmarkStart w:id="36" w:name="_Toc240532343"/>
       <w:r>
         <w:rPr>
           <w:rFonts w:ascii="Montserrat" w:hAnsi="Montserrat"/>
@@ -19786,7 +19832,7 @@
           <w:sz w:val="27"/>
         </w:rPr>
       </w:pPr>
-      <w:bookmarkStart w:id="37" w:name="_Toc240465789"/>
+      <w:bookmarkStart w:id="37" w:name="_Toc240532344"/>
       <w:r>
         <w:rPr>
           <w:rFonts w:ascii="Montserrat" w:hAnsi="Montserrat"/>
@@ -19826,16 +19872,16 @@
           <w:noProof/>
         </w:rPr>
         <w:drawing>
-          <wp:inline distT="0" distB="0" distL="0" distR="0" wp14:anchorId="391C0649" wp14:editId="7E12592B">
+          <wp:inline distT="0" distB="0" distL="0" distR="0" wp14:anchorId="459EDBA4" wp14:editId="0F79058F">
             <wp:extent cx="5303520" cy="4792851"/>
             <wp:effectExtent l="19050" t="19050" r="11430" b="27305"/>
-            <wp:docPr id="1644984954" name="Imagem 43"/>
+            <wp:docPr id="17792798" name="Imagem 43"/>
             <wp:cNvGraphicFramePr/>
             <a:graphic xmlns:a="http://schemas.openxmlformats.org/drawingml/2006/main">
               <a:graphicData uri="http://schemas.openxmlformats.org/drawingml/2006/picture">
                 <pic:pic xmlns:pic="http://schemas.openxmlformats.org/drawingml/2006/picture">
                   <pic:nvPicPr>
-                    <pic:cNvPr id="1644984954" name=""/>
+                    <pic:cNvPr id="17792798" name=""/>
                     <pic:cNvPicPr/>
                   </pic:nvPicPr>
                   <pic:blipFill>
@@ -19904,7 +19950,7 @@
           <w:sz w:val="27"/>
         </w:rPr>
       </w:pPr>
-      <w:bookmarkStart w:id="38" w:name="_Toc240465790"/>
+      <w:bookmarkStart w:id="38" w:name="_Toc240532345"/>
       <w:r>
         <w:rPr>
           <w:rFonts w:ascii="Montserrat" w:hAnsi="Montserrat"/>
@@ -19944,16 +19990,16 @@
           <w:noProof/>
         </w:rPr>
         <w:drawing>
-          <wp:inline distT="0" distB="0" distL="0" distR="0" wp14:anchorId="3E3D3D5E" wp14:editId="4D913422">
+          <wp:inline distT="0" distB="0" distL="0" distR="0" wp14:anchorId="2749A2EB" wp14:editId="4E8C1F0C">
             <wp:extent cx="5303520" cy="4792851"/>
             <wp:effectExtent l="19050" t="19050" r="11430" b="27305"/>
-            <wp:docPr id="1540163130" name="Imagem 44"/>
+            <wp:docPr id="103681468" name="Imagem 44"/>
             <wp:cNvGraphicFramePr/>
             <a:graphic xmlns:a="http://schemas.openxmlformats.org/drawingml/2006/main">
               <a:graphicData uri="http://schemas.openxmlformats.org/drawingml/2006/picture">
                 <pic:pic xmlns:pic="http://schemas.openxmlformats.org/drawingml/2006/picture">
                   <pic:nvPicPr>
-                    <pic:cNvPr id="1540163130" name=""/>
+                    <pic:cNvPr id="103681468" name=""/>
                     <pic:cNvPicPr/>
                   </pic:nvPicPr>
                   <pic:blipFill>
@@ -20021,7 +20067,7 @@
           <w:sz w:val="27"/>
         </w:rPr>
       </w:pPr>
-      <w:bookmarkStart w:id="39" w:name="_Toc240465791"/>
+      <w:bookmarkStart w:id="39" w:name="_Toc240532346"/>
       <w:r>
         <w:rPr>
           <w:rFonts w:ascii="Montserrat" w:hAnsi="Montserrat"/>
@@ -20062,16 +20108,16 @@
         </w:rPr>
         <w:lastRenderedPageBreak/>
         <w:drawing>
-          <wp:inline distT="0" distB="0" distL="0" distR="0" wp14:anchorId="66EF30F2" wp14:editId="378055A8">
+          <wp:inline distT="0" distB="0" distL="0" distR="0" wp14:anchorId="2473DA06" wp14:editId="56A4D4CD">
             <wp:extent cx="5303520" cy="4792851"/>
             <wp:effectExtent l="19050" t="19050" r="11430" b="27305"/>
-            <wp:docPr id="1934327371" name="Imagem 45"/>
+            <wp:docPr id="1175407808" name="Imagem 45"/>
             <wp:cNvGraphicFramePr/>
             <a:graphic xmlns:a="http://schemas.openxmlformats.org/drawingml/2006/main">
               <a:graphicData uri="http://schemas.openxmlformats.org/drawingml/2006/picture">
                 <pic:pic xmlns:pic="http://schemas.openxmlformats.org/drawingml/2006/picture">
                   <pic:nvPicPr>
-                    <pic:cNvPr id="1934327371" name=""/>
+                    <pic:cNvPr id="1175407808" name=""/>
                     <pic:cNvPicPr/>
                   </pic:nvPicPr>
                   <pic:blipFill>
@@ -20139,16 +20185,16 @@
         </w:rPr>
         <w:lastRenderedPageBreak/>
         <w:drawing>
-          <wp:inline distT="0" distB="0" distL="0" distR="0" wp14:anchorId="2A95691A" wp14:editId="4711D3D4">
+          <wp:inline distT="0" distB="0" distL="0" distR="0" wp14:anchorId="0EFA38FD" wp14:editId="4D31D438">
             <wp:extent cx="5303520" cy="4792851"/>
             <wp:effectExtent l="19050" t="19050" r="11430" b="27305"/>
-            <wp:docPr id="508852150" name="Imagem 46"/>
+            <wp:docPr id="14209089" name="Imagem 46"/>
             <wp:cNvGraphicFramePr/>
             <a:graphic xmlns:a="http://schemas.openxmlformats.org/drawingml/2006/main">
               <a:graphicData uri="http://schemas.openxmlformats.org/drawingml/2006/picture">
                 <pic:pic xmlns:pic="http://schemas.openxmlformats.org/drawingml/2006/picture">
                   <pic:nvPicPr>
-                    <pic:cNvPr id="508852150" name=""/>
+                    <pic:cNvPr id="14209089" name=""/>
                     <pic:cNvPicPr/>
                   </pic:nvPicPr>
                   <pic:blipFill>
@@ -20241,7 +20287,7 @@
           <w:sz w:val="34"/>
         </w:rPr>
       </w:pPr>
-      <w:bookmarkStart w:id="40" w:name="_Toc240465792"/>
+      <w:bookmarkStart w:id="40" w:name="_Toc240532347"/>
       <w:r>
         <w:rPr>
           <w:rFonts w:ascii="Montserrat" w:hAnsi="Montserrat"/>
@@ -20283,7 +20329,7 @@
           <w:sz w:val="27"/>
         </w:rPr>
       </w:pPr>
-      <w:bookmarkStart w:id="41" w:name="_Toc240465793"/>
+      <w:bookmarkStart w:id="41" w:name="_Toc240532348"/>
       <w:r>
         <w:rPr>
           <w:rFonts w:ascii="Montserrat" w:hAnsi="Montserrat"/>
@@ -20323,16 +20369,16 @@
           <w:noProof/>
         </w:rPr>
         <w:drawing>
-          <wp:inline distT="0" distB="0" distL="0" distR="0" wp14:anchorId="5228F560" wp14:editId="173F03CA">
+          <wp:inline distT="0" distB="0" distL="0" distR="0" wp14:anchorId="0B46FC3B" wp14:editId="4E4AF922">
             <wp:extent cx="5303520" cy="4792851"/>
             <wp:effectExtent l="19050" t="19050" r="11430" b="27305"/>
-            <wp:docPr id="367410380" name="Imagem 47"/>
+            <wp:docPr id="835579263" name="Imagem 47"/>
             <wp:cNvGraphicFramePr/>
             <a:graphic xmlns:a="http://schemas.openxmlformats.org/drawingml/2006/main">
               <a:graphicData uri="http://schemas.openxmlformats.org/drawingml/2006/picture">
                 <pic:pic xmlns:pic="http://schemas.openxmlformats.org/drawingml/2006/picture">
                   <pic:nvPicPr>
-                    <pic:cNvPr id="367410380" name=""/>
+                    <pic:cNvPr id="835579263" name=""/>
                     <pic:cNvPicPr/>
                   </pic:nvPicPr>
                   <pic:blipFill>
@@ -20587,7 +20633,7 @@
           <w:sz w:val="27"/>
         </w:rPr>
       </w:pPr>
-      <w:bookmarkStart w:id="42" w:name="_Toc240465794"/>
+      <w:bookmarkStart w:id="42" w:name="_Toc240532349"/>
       <w:r>
         <w:rPr>
           <w:rFonts w:ascii="Montserrat" w:hAnsi="Montserrat"/>
@@ -20628,16 +20674,16 @@
         </w:rPr>
         <w:lastRenderedPageBreak/>
         <w:drawing>
-          <wp:inline distT="0" distB="0" distL="0" distR="0" wp14:anchorId="4DFF7DFD" wp14:editId="7B3F4FDD">
+          <wp:inline distT="0" distB="0" distL="0" distR="0" wp14:anchorId="30299A44" wp14:editId="6F5E1E2C">
             <wp:extent cx="5303520" cy="4792851"/>
             <wp:effectExtent l="19050" t="19050" r="11430" b="27305"/>
-            <wp:docPr id="215460714" name="Imagem 48"/>
+            <wp:docPr id="247764840" name="Imagem 48"/>
             <wp:cNvGraphicFramePr/>
             <a:graphic xmlns:a="http://schemas.openxmlformats.org/drawingml/2006/main">
               <a:graphicData uri="http://schemas.openxmlformats.org/drawingml/2006/picture">
                 <pic:pic xmlns:pic="http://schemas.openxmlformats.org/drawingml/2006/picture">
                   <pic:nvPicPr>
-                    <pic:cNvPr id="215460714" name=""/>
+                    <pic:cNvPr id="247764840" name=""/>
                     <pic:cNvPicPr/>
                   </pic:nvPicPr>
                   <pic:blipFill>
@@ -20726,7 +20772,7 @@
           <w:sz w:val="27"/>
         </w:rPr>
       </w:pPr>
-      <w:bookmarkStart w:id="43" w:name="_Toc240465795"/>
+      <w:bookmarkStart w:id="43" w:name="_Toc240532350"/>
       <w:r>
         <w:rPr>
           <w:rFonts w:ascii="Montserrat" w:hAnsi="Montserrat"/>
@@ -20767,16 +20813,16 @@
         </w:rPr>
         <w:lastRenderedPageBreak/>
         <w:drawing>
-          <wp:inline distT="0" distB="0" distL="0" distR="0" wp14:anchorId="310B2DA1" wp14:editId="1DC2B9BE">
+          <wp:inline distT="0" distB="0" distL="0" distR="0" wp14:anchorId="261713EB" wp14:editId="3B98FDE0">
             <wp:extent cx="5303520" cy="4792851"/>
             <wp:effectExtent l="19050" t="19050" r="11430" b="27305"/>
-            <wp:docPr id="809193196" name="Imagem 49"/>
+            <wp:docPr id="711264101" name="Imagem 49"/>
             <wp:cNvGraphicFramePr/>
             <a:graphic xmlns:a="http://schemas.openxmlformats.org/drawingml/2006/main">
               <a:graphicData uri="http://schemas.openxmlformats.org/drawingml/2006/picture">
                 <pic:pic xmlns:pic="http://schemas.openxmlformats.org/drawingml/2006/picture">
                   <pic:nvPicPr>
-                    <pic:cNvPr id="809193196" name=""/>
+                    <pic:cNvPr id="711264101" name=""/>
                     <pic:cNvPicPr/>
                   </pic:nvPicPr>
                   <pic:blipFill>
@@ -20920,7 +20966,7 @@
           <w:sz w:val="27"/>
         </w:rPr>
       </w:pPr>
-      <w:bookmarkStart w:id="44" w:name="_Toc240465796"/>
+      <w:bookmarkStart w:id="44" w:name="_Toc240532351"/>
       <w:r>
         <w:rPr>
           <w:rFonts w:ascii="Montserrat" w:hAnsi="Montserrat"/>
@@ -21007,18 +21053,8 @@
         </w:numPr>
         <w:spacing w:after="80" w:line="260" w:lineRule="auto"/>
         <w:ind w:left="700"/>
-        <w:rPr>
-          <w:rFonts w:ascii="Montserrat" w:hAnsi="Montserrat"/>
-          <w:color w:val="1A1A1A"/>
-          <w:sz w:val="22"/>
-        </w:rPr>
-      </w:pPr>
-      <w:r>
-        <w:rPr>
-          <w:rFonts w:ascii="Montserrat" w:hAnsi="Montserrat"/>
-          <w:color w:val="1A1A1A"/>
-          <w:sz w:val="22"/>
-        </w:rPr>
+      </w:pPr>
+      <w:r>
         <w:t>Riscos do portfolio (dados do TAP - Passo 3, secao 9): contagem total de riscos em aberto (Status diferente de Encerrado) com severidade Critico e com severidade Alto, somando o Registro de riscos de todos os TAPs cadastrados - mesma matriz de severidade (Probabilidade x Impacto) usada na Matriz de risco de cada TAP.</w:t>
       </w:r>
     </w:p>
@@ -21185,16 +21221,16 @@
           <w:noProof/>
         </w:rPr>
         <w:drawing>
-          <wp:inline distT="0" distB="0" distL="0" distR="0" wp14:anchorId="282ADB2C" wp14:editId="057FA4D1">
+          <wp:inline distT="0" distB="0" distL="0" distR="0" wp14:anchorId="68FA3F5A" wp14:editId="6EE0A1D2">
             <wp:extent cx="5303520" cy="4267180"/>
             <wp:effectExtent l="19050" t="19050" r="11430" b="19685"/>
-            <wp:docPr id="829163220" name="Imagem 50"/>
+            <wp:docPr id="369030101" name="Imagem 50"/>
             <wp:cNvGraphicFramePr/>
             <a:graphic xmlns:a="http://schemas.openxmlformats.org/drawingml/2006/main">
               <a:graphicData uri="http://schemas.openxmlformats.org/drawingml/2006/picture">
                 <pic:pic xmlns:pic="http://schemas.openxmlformats.org/drawingml/2006/picture">
                   <pic:nvPicPr>
-                    <pic:cNvPr id="829163220" name=""/>
+                    <pic:cNvPr id="369030101" name=""/>
                     <pic:cNvPicPr/>
                   </pic:nvPicPr>
                   <pic:blipFill>
@@ -21262,16 +21298,16 @@
           <w:noProof/>
         </w:rPr>
         <w:drawing>
-          <wp:inline distT="0" distB="0" distL="0" distR="0" wp14:anchorId="108B90C4" wp14:editId="0B5AA0AD">
+          <wp:inline distT="0" distB="0" distL="0" distR="0" wp14:anchorId="4A9D7F32" wp14:editId="10FF185A">
             <wp:extent cx="5303520" cy="3382059"/>
             <wp:effectExtent l="19050" t="19050" r="11430" b="27940"/>
-            <wp:docPr id="1665335608" name="Imagem 51"/>
+            <wp:docPr id="323486523" name="Imagem 51"/>
             <wp:cNvGraphicFramePr/>
             <a:graphic xmlns:a="http://schemas.openxmlformats.org/drawingml/2006/main">
               <a:graphicData uri="http://schemas.openxmlformats.org/drawingml/2006/picture">
                 <pic:pic xmlns:pic="http://schemas.openxmlformats.org/drawingml/2006/picture">
                   <pic:nvPicPr>
-                    <pic:cNvPr id="1665335608" name=""/>
+                    <pic:cNvPr id="323486523" name=""/>
                     <pic:cNvPicPr/>
                   </pic:nvPicPr>
                   <pic:blipFill>
@@ -21339,16 +21375,16 @@
         </w:rPr>
         <w:lastRenderedPageBreak/>
         <w:drawing>
-          <wp:inline distT="0" distB="0" distL="0" distR="0" wp14:anchorId="60E98936" wp14:editId="3297A3B9">
+          <wp:inline distT="0" distB="0" distL="0" distR="0" wp14:anchorId="3DD7A046" wp14:editId="16369998">
             <wp:extent cx="5303520" cy="4417800"/>
             <wp:effectExtent l="19050" t="19050" r="11430" b="20955"/>
-            <wp:docPr id="1496254096" name="Imagem 52"/>
+            <wp:docPr id="1017025118" name="Imagem 52"/>
             <wp:cNvGraphicFramePr/>
             <a:graphic xmlns:a="http://schemas.openxmlformats.org/drawingml/2006/main">
               <a:graphicData uri="http://schemas.openxmlformats.org/drawingml/2006/picture">
                 <pic:pic xmlns:pic="http://schemas.openxmlformats.org/drawingml/2006/picture">
                   <pic:nvPicPr>
-                    <pic:cNvPr id="1496254096" name=""/>
+                    <pic:cNvPr id="1017025118" name=""/>
                     <pic:cNvPicPr/>
                   </pic:nvPicPr>
                   <pic:blipFill>
@@ -21458,7 +21494,7 @@
           <w:sz w:val="27"/>
         </w:rPr>
       </w:pPr>
-      <w:bookmarkStart w:id="45" w:name="_Toc240465797"/>
+      <w:bookmarkStart w:id="45" w:name="_Toc240532352"/>
       <w:r>
         <w:rPr>
           <w:rFonts w:ascii="Montserrat" w:hAnsi="Montserrat"/>
@@ -21724,16 +21760,16 @@
         </w:rPr>
         <w:lastRenderedPageBreak/>
         <w:drawing>
-          <wp:inline distT="0" distB="0" distL="0" distR="0" wp14:anchorId="5272A135" wp14:editId="2389E20D">
+          <wp:inline distT="0" distB="0" distL="0" distR="0" wp14:anchorId="54E363E4" wp14:editId="21CEB20A">
             <wp:extent cx="5303520" cy="7628836"/>
             <wp:effectExtent l="19050" t="19050" r="11430" b="10795"/>
-            <wp:docPr id="2031078954" name="Imagem 53"/>
+            <wp:docPr id="671007016" name="Imagem 53"/>
             <wp:cNvGraphicFramePr/>
             <a:graphic xmlns:a="http://schemas.openxmlformats.org/drawingml/2006/main">
               <a:graphicData uri="http://schemas.openxmlformats.org/drawingml/2006/picture">
                 <pic:pic xmlns:pic="http://schemas.openxmlformats.org/drawingml/2006/picture">
                   <pic:nvPicPr>
-                    <pic:cNvPr id="2031078954" name=""/>
+                    <pic:cNvPr id="671007016" name=""/>
                     <pic:cNvPicPr/>
                   </pic:nvPicPr>
                   <pic:blipFill>
@@ -21865,7 +21901,7 @@
           <w:sz w:val="27"/>
         </w:rPr>
       </w:pPr>
-      <w:bookmarkStart w:id="46" w:name="_Toc240465798"/>
+      <w:bookmarkStart w:id="46" w:name="_Toc240532353"/>
       <w:r>
         <w:rPr>
           <w:rFonts w:ascii="Montserrat" w:hAnsi="Montserrat"/>
@@ -21962,6 +21998,27 @@
           <w:sz w:val="21"/>
         </w:rPr>
         <w:lastRenderedPageBreak/>
+        <w:t>Execucao ao lado de cada marco: alem do prazo, cada marco atrasado ou vencendo mostra o que a pessoa sinalizou no campo Execucao (secao 6.2, Passo 4) e ha quanto tempo - por exemplo Em andamento - atualizado ha 2 dias. Um marco sem nenhuma atualizacao mostra sem atualizacao de execucao em destaque - e o sinal de que ninguem sinalizou estar trabalhando naquilo, util para separar quem esta atrasado mas ativo de quem esta atrasado em silencio.</w:t>
+      </w:r>
+    </w:p>
+    <w:p>
+      <w:pPr>
+        <w:spacing w:before="160" w:after="200"/>
+        <w:ind w:left="283"/>
+        <w:rPr>
+          <w:rFonts w:ascii="Montserrat" w:hAnsi="Montserrat"/>
+          <w:i/>
+          <w:color w:val="6A6A70"/>
+          <w:sz w:val="21"/>
+        </w:rPr>
+      </w:pPr>
+      <w:r>
+        <w:rPr>
+          <w:rFonts w:ascii="Montserrat" w:hAnsi="Montserrat"/>
+          <w:i/>
+          <w:color w:val="6A6A70"/>
+          <w:sz w:val="21"/>
+        </w:rPr>
         <w:t>Este painel so mostra os dados - quem efetivamente recebe um aviso por e-mail/push quando um prazo se aproxima e o mecanismo descrito a seguir, que roda sozinho todo dia sem precisar desta tela aberta.</w:t>
       </w:r>
     </w:p>
@@ -21976,7 +22033,7 @@
           <w:sz w:val="27"/>
         </w:rPr>
       </w:pPr>
-      <w:bookmarkStart w:id="47" w:name="_Toc240465799"/>
+      <w:bookmarkStart w:id="47" w:name="_Toc240532354"/>
       <w:r>
         <w:rPr>
           <w:rFonts w:ascii="Montserrat" w:hAnsi="Montserrat"/>
@@ -22180,7 +22237,17 @@
           <w:color w:val="6A6A70"/>
           <w:sz w:val="21"/>
         </w:rPr>
-        <w:t>Cada aviso e enviado uma unica vez por marco e por janela (5 dias, 2 dias, no dia) - nao repete todo dia dentro da mesma janela. Ja o aviso de atraso repete a cada 7 dias, para continuar chegando enquanto a pendencia nao for resolvida, sem virar um lembrete diario.</w:t>
+        <w:t xml:space="preserve">Cada aviso e enviado uma unica vez por marco e por janela (5 dias, 2 dias, no dia) - nao repete todo dia dentro da mesma janela. Ja o aviso de atraso repete a </w:t>
+      </w:r>
+      <w:r>
+        <w:rPr>
+          <w:rFonts w:ascii="Montserrat" w:hAnsi="Montserrat"/>
+          <w:i/>
+          <w:color w:val="6A6A70"/>
+          <w:sz w:val="21"/>
+        </w:rPr>
+        <w:lastRenderedPageBreak/>
+        <w:t>cada 7 dias, para continuar chegando enquanto a pendencia nao for resolvida, sem virar um lembrete diario.</w:t>
       </w:r>
     </w:p>
     <w:p>
@@ -22228,7 +22295,6 @@
           <w:color w:val="1A1A1A"/>
           <w:sz w:val="22"/>
         </w:rPr>
-        <w:lastRenderedPageBreak/>
         <w:t>O e-mail termina indicando a Gerencia de Projetos como alternativa de contato, caso a pessoa prefira ajustar o prazo diretamente em vez de seguir so pelo aviso automatico - o nome do Gerente vem do campo Gerente do projeto do proprio Planejamento (aba 1, capa), nao e fixo; se esse campo estiver vazio no projeto, a frase aparece sem nome.</w:t>
       </w:r>
     </w:p>
@@ -22243,7 +22309,7 @@
           <w:sz w:val="27"/>
         </w:rPr>
       </w:pPr>
-      <w:bookmarkStart w:id="48" w:name="_Toc240465800"/>
+      <w:bookmarkStart w:id="48" w:name="_Toc240532355"/>
       <w:r>
         <w:rPr>
           <w:rFonts w:ascii="Montserrat" w:hAnsi="Montserrat"/>
@@ -22861,16 +22927,16 @@
         </w:rPr>
         <w:lastRenderedPageBreak/>
         <w:drawing>
-          <wp:inline distT="0" distB="0" distL="0" distR="0" wp14:anchorId="157C5506" wp14:editId="19D78C73">
+          <wp:inline distT="0" distB="0" distL="0" distR="0" wp14:anchorId="2D35E982" wp14:editId="6E714E66">
             <wp:extent cx="5120640" cy="6240599"/>
             <wp:effectExtent l="19050" t="19050" r="22860" b="27305"/>
-            <wp:docPr id="627213485" name="Imagem 54"/>
+            <wp:docPr id="1552422695" name="Imagem 54"/>
             <wp:cNvGraphicFramePr/>
             <a:graphic xmlns:a="http://schemas.openxmlformats.org/drawingml/2006/main">
               <a:graphicData uri="http://schemas.openxmlformats.org/drawingml/2006/picture">
                 <pic:pic xmlns:pic="http://schemas.openxmlformats.org/drawingml/2006/picture">
                   <pic:nvPicPr>
-                    <pic:cNvPr id="627213485" name=""/>
+                    <pic:cNvPr id="1552422695" name=""/>
                     <pic:cNvPicPr/>
                   </pic:nvPicPr>
                   <pic:blipFill>
@@ -22967,7 +23033,7 @@
           <w:sz w:val="21"/>
         </w:rPr>
         <w:lastRenderedPageBreak/>
-        <w:t>A aba Verificacao do Planejamento (aba 6) nao entra no Meu Painel nem tem campo Responsavel (conta) - ficou de fora deliberadamente.</w:t>
+        <w:t>Execucao, ao lado de cada marco: um seletor com A iniciar/Em andamento/Atrasado/Concluido, salvando na hora ao ser alterado (mesmo padrao do botao Concluir) - e aqui, no Meu Painel, que normalmente faz mais sentido atualizar, sem precisar abrir o Planejamento inteiro. Grava tambem a data/hora da ultima mudanca, usada no Painel de Prazos (secao 6.4.2) para mostrar ha quanto tempo aquele marco foi atualizado pela ultima vez.</w:t>
       </w:r>
     </w:p>
     <w:p>
@@ -22988,6 +23054,27 @@
           <w:color w:val="6A6A70"/>
           <w:sz w:val="21"/>
         </w:rPr>
+        <w:t>A aba Verificacao do Planejamento (aba 6) nao entra no Meu Painel nem tem campo Responsavel (conta) - ficou de fora deliberadamente.</w:t>
+      </w:r>
+    </w:p>
+    <w:p>
+      <w:pPr>
+        <w:spacing w:before="160" w:after="200"/>
+        <w:ind w:left="283"/>
+        <w:rPr>
+          <w:rFonts w:ascii="Montserrat" w:hAnsi="Montserrat"/>
+          <w:i/>
+          <w:color w:val="6A6A70"/>
+          <w:sz w:val="21"/>
+        </w:rPr>
+      </w:pPr>
+      <w:r>
+        <w:rPr>
+          <w:rFonts w:ascii="Montserrat" w:hAnsi="Montserrat"/>
+          <w:i/>
+          <w:color w:val="6A6A70"/>
+          <w:sz w:val="21"/>
+        </w:rPr>
         <w:t>Concluir um item aqui grava direto no mesmo registro compartilhado do formulario de origem (Planejamento, TAP ou Relatorio de Situacao) - nao e uma copia separada. Se duas pessoas mexerem no mesmo registro ao mesmo tempo (por exemplo, uma concluindo um item pelo Meu Painel enquanto outra edita o formulario de origem), o sistema busca a versao mais recente do registro e tenta gravar de novo automaticamente antes de desistir - mesma logica de edicao simultanea ja usada nos demais formularios (secao 2.14).</w:t>
       </w:r>
     </w:p>
@@ -23020,7 +23107,7 @@
           <w:sz w:val="27"/>
         </w:rPr>
       </w:pPr>
-      <w:bookmarkStart w:id="49" w:name="_Toc240465801"/>
+      <w:bookmarkStart w:id="49" w:name="_Toc240532356"/>
       <w:r>
         <w:rPr>
           <w:rFonts w:ascii="Montserrat" w:hAnsi="Montserrat"/>
@@ -23133,16 +23220,16 @@
         </w:rPr>
         <w:lastRenderedPageBreak/>
         <w:drawing>
-          <wp:inline distT="0" distB="0" distL="0" distR="0" wp14:anchorId="1B9C0AFE" wp14:editId="47C2EE71">
+          <wp:inline distT="0" distB="0" distL="0" distR="0" wp14:anchorId="498AEE71" wp14:editId="6EAC2C25">
             <wp:extent cx="5120640" cy="6187296"/>
             <wp:effectExtent l="19050" t="19050" r="22860" b="23495"/>
-            <wp:docPr id="657531858" name="Imagem 55"/>
+            <wp:docPr id="956505478" name="Imagem 55"/>
             <wp:cNvGraphicFramePr/>
             <a:graphic xmlns:a="http://schemas.openxmlformats.org/drawingml/2006/main">
               <a:graphicData uri="http://schemas.openxmlformats.org/drawingml/2006/picture">
                 <pic:pic xmlns:pic="http://schemas.openxmlformats.org/drawingml/2006/picture">
                   <pic:nvPicPr>
-                    <pic:cNvPr id="657531858" name=""/>
+                    <pic:cNvPr id="956505478" name=""/>
                     <pic:cNvPicPr/>
                   </pic:nvPicPr>
                   <pic:blipFill>
@@ -23231,7 +23318,7 @@
           <w:sz w:val="27"/>
         </w:rPr>
       </w:pPr>
-      <w:bookmarkStart w:id="50" w:name="_Toc240465802"/>
+      <w:bookmarkStart w:id="50" w:name="_Toc240532357"/>
       <w:r>
         <w:rPr>
           <w:rFonts w:ascii="Montserrat" w:hAnsi="Montserrat"/>
@@ -23384,7 +23471,7 @@
           <w:sz w:val="27"/>
         </w:rPr>
       </w:pPr>
-      <w:bookmarkStart w:id="51" w:name="_Toc240465803"/>
+      <w:bookmarkStart w:id="51" w:name="_Toc240532358"/>
       <w:r>
         <w:rPr>
           <w:rFonts w:ascii="Montserrat" w:hAnsi="Montserrat"/>
@@ -23677,16 +23764,16 @@
           <w:noProof/>
         </w:rPr>
         <w:drawing>
-          <wp:inline distT="0" distB="0" distL="0" distR="0" wp14:anchorId="5B583D47" wp14:editId="48B97253">
+          <wp:inline distT="0" distB="0" distL="0" distR="0" wp14:anchorId="00D7740D" wp14:editId="41B99DF5">
             <wp:extent cx="5303520" cy="1351384"/>
             <wp:effectExtent l="19050" t="19050" r="11430" b="20320"/>
-            <wp:docPr id="958026046" name="Imagem 56"/>
+            <wp:docPr id="37364236" name="Imagem 56"/>
             <wp:cNvGraphicFramePr/>
             <a:graphic xmlns:a="http://schemas.openxmlformats.org/drawingml/2006/main">
               <a:graphicData uri="http://schemas.openxmlformats.org/drawingml/2006/picture">
                 <pic:pic xmlns:pic="http://schemas.openxmlformats.org/drawingml/2006/picture">
                   <pic:nvPicPr>
-                    <pic:cNvPr id="958026046" name=""/>
+                    <pic:cNvPr id="37364236" name=""/>
                     <pic:cNvPicPr/>
                   </pic:nvPicPr>
                   <pic:blipFill>
@@ -23754,7 +23841,7 @@
           <w:sz w:val="27"/>
         </w:rPr>
       </w:pPr>
-      <w:bookmarkStart w:id="52" w:name="_Toc240465804"/>
+      <w:bookmarkStart w:id="52" w:name="_Toc240532359"/>
       <w:r>
         <w:rPr>
           <w:rFonts w:ascii="Montserrat" w:hAnsi="Montserrat"/>
@@ -23891,16 +23978,16 @@
           <w:noProof/>
         </w:rPr>
         <w:drawing>
-          <wp:inline distT="0" distB="0" distL="0" distR="0" wp14:anchorId="4F2030AC" wp14:editId="580BB4A8">
+          <wp:inline distT="0" distB="0" distL="0" distR="0" wp14:anchorId="5744275D" wp14:editId="6B7FB39F">
             <wp:extent cx="5303520" cy="1422793"/>
             <wp:effectExtent l="19050" t="19050" r="11430" b="25400"/>
-            <wp:docPr id="1198676987" name="Imagem 57"/>
+            <wp:docPr id="198359354" name="Imagem 57"/>
             <wp:cNvGraphicFramePr/>
             <a:graphic xmlns:a="http://schemas.openxmlformats.org/drawingml/2006/main">
               <a:graphicData uri="http://schemas.openxmlformats.org/drawingml/2006/picture">
                 <pic:pic xmlns:pic="http://schemas.openxmlformats.org/drawingml/2006/picture">
                   <pic:nvPicPr>
-                    <pic:cNvPr id="1198676987" name=""/>
+                    <pic:cNvPr id="198359354" name=""/>
                     <pic:cNvPicPr/>
                   </pic:nvPicPr>
                   <pic:blipFill>
@@ -24064,16 +24151,16 @@
           <w:noProof/>
         </w:rPr>
         <w:drawing>
-          <wp:inline distT="0" distB="0" distL="0" distR="0" wp14:anchorId="77310B0D" wp14:editId="746CFDF5">
+          <wp:inline distT="0" distB="0" distL="0" distR="0" wp14:anchorId="37BA9138" wp14:editId="1AAB418F">
             <wp:extent cx="5303520" cy="1841050"/>
             <wp:effectExtent l="19050" t="19050" r="11430" b="26035"/>
-            <wp:docPr id="1283425083" name="Imagem 58"/>
+            <wp:docPr id="1410507861" name="Imagem 58"/>
             <wp:cNvGraphicFramePr/>
             <a:graphic xmlns:a="http://schemas.openxmlformats.org/drawingml/2006/main">
               <a:graphicData uri="http://schemas.openxmlformats.org/drawingml/2006/picture">
                 <pic:pic xmlns:pic="http://schemas.openxmlformats.org/drawingml/2006/picture">
                   <pic:nvPicPr>
-                    <pic:cNvPr id="1283425083" name=""/>
+                    <pic:cNvPr id="1410507861" name=""/>
                     <pic:cNvPicPr/>
                   </pic:nvPicPr>
                   <pic:blipFill>
@@ -24236,16 +24323,16 @@
           <w:noProof/>
         </w:rPr>
         <w:drawing>
-          <wp:inline distT="0" distB="0" distL="0" distR="0" wp14:anchorId="45C3B0AA" wp14:editId="262E912B">
+          <wp:inline distT="0" distB="0" distL="0" distR="0" wp14:anchorId="36EC94EB" wp14:editId="5322CE2C">
             <wp:extent cx="5303520" cy="303041"/>
             <wp:effectExtent l="19050" t="19050" r="11430" b="20955"/>
-            <wp:docPr id="1591923434" name="Imagem 59"/>
+            <wp:docPr id="1749707875" name="Imagem 59"/>
             <wp:cNvGraphicFramePr/>
             <a:graphic xmlns:a="http://schemas.openxmlformats.org/drawingml/2006/main">
               <a:graphicData uri="http://schemas.openxmlformats.org/drawingml/2006/picture">
                 <pic:pic xmlns:pic="http://schemas.openxmlformats.org/drawingml/2006/picture">
                   <pic:nvPicPr>
-                    <pic:cNvPr id="1591923434" name=""/>
+                    <pic:cNvPr id="1749707875" name=""/>
                     <pic:cNvPicPr/>
                   </pic:nvPicPr>
                   <pic:blipFill>
@@ -24312,16 +24399,16 @@
           <w:noProof/>
         </w:rPr>
         <w:drawing>
-          <wp:inline distT="0" distB="0" distL="0" distR="0" wp14:anchorId="4DCA0744" wp14:editId="68098DD3">
+          <wp:inline distT="0" distB="0" distL="0" distR="0" wp14:anchorId="3CF2E59F" wp14:editId="2FC14D9C">
             <wp:extent cx="5303520" cy="2983005"/>
             <wp:effectExtent l="19050" t="19050" r="11430" b="27305"/>
-            <wp:docPr id="1017326446" name="Imagem 60"/>
+            <wp:docPr id="1175493428" name="Imagem 60"/>
             <wp:cNvGraphicFramePr/>
             <a:graphic xmlns:a="http://schemas.openxmlformats.org/drawingml/2006/main">
               <a:graphicData uri="http://schemas.openxmlformats.org/drawingml/2006/picture">
                 <pic:pic xmlns:pic="http://schemas.openxmlformats.org/drawingml/2006/picture">
                   <pic:nvPicPr>
-                    <pic:cNvPr id="1017326446" name=""/>
+                    <pic:cNvPr id="1175493428" name=""/>
                     <pic:cNvPicPr/>
                   </pic:nvPicPr>
                   <pic:blipFill>
@@ -24393,7 +24480,7 @@
           <w:sz w:val="34"/>
         </w:rPr>
       </w:pPr>
-      <w:bookmarkStart w:id="53" w:name="_Toc240465805"/>
+      <w:bookmarkStart w:id="53" w:name="_Toc240532360"/>
       <w:r>
         <w:rPr>
           <w:rFonts w:ascii="Montserrat" w:hAnsi="Montserrat"/>
@@ -24637,7 +24724,7 @@
           <w:sz w:val="34"/>
         </w:rPr>
       </w:pPr>
-      <w:bookmarkStart w:id="54" w:name="_Toc240465806"/>
+      <w:bookmarkStart w:id="54" w:name="_Toc240532361"/>
       <w:r>
         <w:rPr>
           <w:rFonts w:ascii="Montserrat" w:hAnsi="Montserrat"/>
@@ -26425,7 +26512,7 @@
 <file path=word/numbering.xml><?xml version="1.0" encoding="utf-8"?>
 <w:numbering xmlns:wpc="http://schemas.microsoft.com/office/word/2010/wordprocessingCanvas" xmlns:cx="http://schemas.microsoft.com/office/drawing/2014/chartex" xmlns:cx1="http://schemas.microsoft.com/office/drawing/2015/9/8/chartex" xmlns:cx2="http://schemas.microsoft.com/office/drawing/2015/10/21/chartex" xmlns:cx3="http://schemas.microsoft.com/office/drawing/2016/5/9/chartex" xmlns:cx4="http://schemas.microsoft.com/office/drawing/2016/5/10/chartex" xmlns:cx5="http://schemas.microsoft.com/office/drawing/2016/5/11/chartex" xmlns:cx6="http://schemas.microsoft.com/office/drawing/2016/5/12/chartex" xmlns:cx7="http://schemas.microsoft.com/office/drawing/2016/5/13/chartex" xmlns:cx8="http://schemas.microsoft.com/office/drawing/2016/5/14/chartex" xmlns:mc="http://schemas.openxmlformats.org/markup-compatibility/2006" xmlns:aink="http://schemas.microsoft.com/office/drawing/2016/ink" xmlns:am3d="http://schemas.microsoft.com/office/drawing/2017/model3d" xmlns:o="urn:schemas-microsoft-com:office:office" xmlns:oel="http://schemas.microsoft.com/office/2019/extlst" xmlns:r="http://schemas.openxmlformats.org/officeDocument/2006/relationships" xmlns:m="http://schemas.openxmlformats.org/officeDocument/2006/math" xmlns:v="urn:schemas-microsoft-com:vml" xmlns:wp14="http://schemas.microsoft.com/office/word/2010/wordprocessingDrawing" xmlns:wp="http://schemas.openxmlformats.org/drawingml/2006/wordprocessingDrawing" xmlns:w10="urn:schemas-microsoft-com:office:word" xmlns:w="http://schemas.openxmlformats.org/wordprocessingml/2006/main" xmlns:w14="http://schemas.microsoft.com/office/word/2010/wordml" xmlns:w15="http://schemas.microsoft.com/office/word/2012/wordml" xmlns:w16cex="http://schemas.microsoft.com/office/word/2018/wordml/cex" xmlns:w16cid="http://schemas.microsoft.com/office/word/2016/wordml/cid" xmlns:w16="http://schemas.microsoft.com/office/word/2018/wordml" xmlns:w16du="http://schemas.microsoft.com/office/word/2023/wordml/word16du" xmlns:w16sdtdh="http://schemas.microsoft.com/office/word/2020/wordml/sdtdatahash" xmlns:w16sdtfl="http://schemas.microsoft.com/office/word/2024/wordml/sdtformatlock" xmlns:w16se="http://schemas.microsoft.com/office/word/2015/wordml/symex" xmlns:wpg="http://schemas.microsoft.com/office/word/2010/wordprocessingGroup" xmlns:wpi="http://schemas.microsoft.com/office/word/2010/wordprocessingInk" xmlns:wne="http://schemas.microsoft.com/office/word/2006/wordml" xmlns:wps="http://schemas.microsoft.com/office/word/2010/wordprocessingShape" mc:Ignorable="w14 w15 w16se w16cid w16 w16cex w16sdtdh w16sdtfl w16du wp14">
   <w:abstractNum w:abstractNumId="0" w15:restartNumberingAfterBreak="0">
-    <w:nsid w:val="01DA2D83"/>
+    <w:nsid w:val="022D2014"/>
     <w:multiLevelType w:val="singleLevel"/>
     <w:tmpl w:val="04160001"/>
     <w:lvl w:ilvl="0">
@@ -26442,7 +26529,7 @@
     </w:lvl>
   </w:abstractNum>
   <w:abstractNum w:abstractNumId="1" w15:restartNumberingAfterBreak="0">
-    <w:nsid w:val="07FE58C8"/>
+    <w:nsid w:val="02576681"/>
     <w:multiLevelType w:val="singleLevel"/>
     <w:tmpl w:val="04160001"/>
     <w:lvl w:ilvl="0">
@@ -26459,7 +26546,7 @@
     </w:lvl>
   </w:abstractNum>
   <w:abstractNum w:abstractNumId="2" w15:restartNumberingAfterBreak="0">
-    <w:nsid w:val="0C524D5A"/>
+    <w:nsid w:val="0E050507"/>
     <w:multiLevelType w:val="singleLevel"/>
     <w:tmpl w:val="04160001"/>
     <w:lvl w:ilvl="0">
@@ -26476,7 +26563,7 @@
     </w:lvl>
   </w:abstractNum>
   <w:abstractNum w:abstractNumId="3" w15:restartNumberingAfterBreak="0">
-    <w:nsid w:val="207B4609"/>
+    <w:nsid w:val="10053485"/>
     <w:multiLevelType w:val="singleLevel"/>
     <w:tmpl w:val="04160001"/>
     <w:lvl w:ilvl="0">
@@ -26493,7 +26580,7 @@
     </w:lvl>
   </w:abstractNum>
   <w:abstractNum w:abstractNumId="4" w15:restartNumberingAfterBreak="0">
-    <w:nsid w:val="2D584E33"/>
+    <w:nsid w:val="10A969C7"/>
     <w:multiLevelType w:val="singleLevel"/>
     <w:tmpl w:val="04160001"/>
     <w:lvl w:ilvl="0">
@@ -26510,7 +26597,7 @@
     </w:lvl>
   </w:abstractNum>
   <w:abstractNum w:abstractNumId="5" w15:restartNumberingAfterBreak="0">
-    <w:nsid w:val="2DED086B"/>
+    <w:nsid w:val="13A12C09"/>
     <w:multiLevelType w:val="singleLevel"/>
     <w:tmpl w:val="04160001"/>
     <w:lvl w:ilvl="0">
@@ -26527,7 +26614,7 @@
     </w:lvl>
   </w:abstractNum>
   <w:abstractNum w:abstractNumId="6" w15:restartNumberingAfterBreak="0">
-    <w:nsid w:val="2FAE6CC1"/>
+    <w:nsid w:val="195E66CF"/>
     <w:multiLevelType w:val="singleLevel"/>
     <w:tmpl w:val="04160001"/>
     <w:lvl w:ilvl="0">
@@ -26544,7 +26631,7 @@
     </w:lvl>
   </w:abstractNum>
   <w:abstractNum w:abstractNumId="7" w15:restartNumberingAfterBreak="0">
-    <w:nsid w:val="323D0C04"/>
+    <w:nsid w:val="21870055"/>
     <w:multiLevelType w:val="singleLevel"/>
     <w:tmpl w:val="04160001"/>
     <w:lvl w:ilvl="0">
@@ -26561,7 +26648,7 @@
     </w:lvl>
   </w:abstractNum>
   <w:abstractNum w:abstractNumId="8" w15:restartNumberingAfterBreak="0">
-    <w:nsid w:val="340B44C7"/>
+    <w:nsid w:val="21916885"/>
     <w:multiLevelType w:val="singleLevel"/>
     <w:tmpl w:val="04160001"/>
     <w:lvl w:ilvl="0">
@@ -26578,7 +26665,7 @@
     </w:lvl>
   </w:abstractNum>
   <w:abstractNum w:abstractNumId="9" w15:restartNumberingAfterBreak="0">
-    <w:nsid w:val="35430445"/>
+    <w:nsid w:val="252C53E0"/>
     <w:multiLevelType w:val="singleLevel"/>
     <w:tmpl w:val="04160001"/>
     <w:lvl w:ilvl="0">
@@ -26595,7 +26682,7 @@
     </w:lvl>
   </w:abstractNum>
   <w:abstractNum w:abstractNumId="10" w15:restartNumberingAfterBreak="0">
-    <w:nsid w:val="39385472"/>
+    <w:nsid w:val="27454707"/>
     <w:multiLevelType w:val="singleLevel"/>
     <w:tmpl w:val="04160001"/>
     <w:lvl w:ilvl="0">
@@ -26612,7 +26699,7 @@
     </w:lvl>
   </w:abstractNum>
   <w:abstractNum w:abstractNumId="11" w15:restartNumberingAfterBreak="0">
-    <w:nsid w:val="42697ABD"/>
+    <w:nsid w:val="288F3C9A"/>
     <w:multiLevelType w:val="singleLevel"/>
     <w:tmpl w:val="04160001"/>
     <w:lvl w:ilvl="0">
@@ -26629,7 +26716,7 @@
     </w:lvl>
   </w:abstractNum>
   <w:abstractNum w:abstractNumId="12" w15:restartNumberingAfterBreak="0">
-    <w:nsid w:val="43C34474"/>
+    <w:nsid w:val="298E6E15"/>
     <w:multiLevelType w:val="singleLevel"/>
     <w:tmpl w:val="04160001"/>
     <w:lvl w:ilvl="0">
@@ -26646,7 +26733,7 @@
     </w:lvl>
   </w:abstractNum>
   <w:abstractNum w:abstractNumId="13" w15:restartNumberingAfterBreak="0">
-    <w:nsid w:val="466B2923"/>
+    <w:nsid w:val="2DFA1CDE"/>
     <w:multiLevelType w:val="singleLevel"/>
     <w:tmpl w:val="04160001"/>
     <w:lvl w:ilvl="0">
@@ -26663,7 +26750,7 @@
     </w:lvl>
   </w:abstractNum>
   <w:abstractNum w:abstractNumId="14" w15:restartNumberingAfterBreak="0">
-    <w:nsid w:val="46754246"/>
+    <w:nsid w:val="33A861BB"/>
     <w:multiLevelType w:val="singleLevel"/>
     <w:tmpl w:val="04160001"/>
     <w:lvl w:ilvl="0">
@@ -26680,7 +26767,7 @@
     </w:lvl>
   </w:abstractNum>
   <w:abstractNum w:abstractNumId="15" w15:restartNumberingAfterBreak="0">
-    <w:nsid w:val="47E02515"/>
+    <w:nsid w:val="34253CAD"/>
     <w:multiLevelType w:val="singleLevel"/>
     <w:tmpl w:val="04160001"/>
     <w:lvl w:ilvl="0">
@@ -26697,7 +26784,7 @@
     </w:lvl>
   </w:abstractNum>
   <w:abstractNum w:abstractNumId="16" w15:restartNumberingAfterBreak="0">
-    <w:nsid w:val="4B8457D7"/>
+    <w:nsid w:val="34F84013"/>
     <w:multiLevelType w:val="singleLevel"/>
     <w:tmpl w:val="04160001"/>
     <w:lvl w:ilvl="0">
@@ -26714,7 +26801,7 @@
     </w:lvl>
   </w:abstractNum>
   <w:abstractNum w:abstractNumId="17" w15:restartNumberingAfterBreak="0">
-    <w:nsid w:val="503723DE"/>
+    <w:nsid w:val="366634C3"/>
     <w:multiLevelType w:val="singleLevel"/>
     <w:tmpl w:val="04160001"/>
     <w:lvl w:ilvl="0">
@@ -26731,7 +26818,7 @@
     </w:lvl>
   </w:abstractNum>
   <w:abstractNum w:abstractNumId="18" w15:restartNumberingAfterBreak="0">
-    <w:nsid w:val="515B6839"/>
+    <w:nsid w:val="37667F38"/>
     <w:multiLevelType w:val="singleLevel"/>
     <w:tmpl w:val="04160001"/>
     <w:lvl w:ilvl="0">
@@ -26748,7 +26835,7 @@
     </w:lvl>
   </w:abstractNum>
   <w:abstractNum w:abstractNumId="19" w15:restartNumberingAfterBreak="0">
-    <w:nsid w:val="531B6952"/>
+    <w:nsid w:val="3A371D1A"/>
     <w:multiLevelType w:val="singleLevel"/>
     <w:tmpl w:val="04160001"/>
     <w:lvl w:ilvl="0">
@@ -26765,7 +26852,7 @@
     </w:lvl>
   </w:abstractNum>
   <w:abstractNum w:abstractNumId="20" w15:restartNumberingAfterBreak="0">
-    <w:nsid w:val="558F08A1"/>
+    <w:nsid w:val="3D0F2813"/>
     <w:multiLevelType w:val="singleLevel"/>
     <w:tmpl w:val="04160001"/>
     <w:lvl w:ilvl="0">
@@ -26782,7 +26869,7 @@
     </w:lvl>
   </w:abstractNum>
   <w:abstractNum w:abstractNumId="21" w15:restartNumberingAfterBreak="0">
-    <w:nsid w:val="598E6C6E"/>
+    <w:nsid w:val="3D936641"/>
     <w:multiLevelType w:val="singleLevel"/>
     <w:tmpl w:val="04160001"/>
     <w:lvl w:ilvl="0">
@@ -26799,7 +26886,7 @@
     </w:lvl>
   </w:abstractNum>
   <w:abstractNum w:abstractNumId="22" w15:restartNumberingAfterBreak="0">
-    <w:nsid w:val="5CFC7609"/>
+    <w:nsid w:val="3F4621B2"/>
     <w:multiLevelType w:val="singleLevel"/>
     <w:tmpl w:val="04160001"/>
     <w:lvl w:ilvl="0">
@@ -26816,7 +26903,7 @@
     </w:lvl>
   </w:abstractNum>
   <w:abstractNum w:abstractNumId="23" w15:restartNumberingAfterBreak="0">
-    <w:nsid w:val="5D497151"/>
+    <w:nsid w:val="400255D9"/>
     <w:multiLevelType w:val="singleLevel"/>
     <w:tmpl w:val="04160001"/>
     <w:lvl w:ilvl="0">
@@ -26833,7 +26920,7 @@
     </w:lvl>
   </w:abstractNum>
   <w:abstractNum w:abstractNumId="24" w15:restartNumberingAfterBreak="0">
-    <w:nsid w:val="5EA2344D"/>
+    <w:nsid w:val="41657299"/>
     <w:multiLevelType w:val="singleLevel"/>
     <w:tmpl w:val="04160001"/>
     <w:lvl w:ilvl="0">
@@ -26850,7 +26937,7 @@
     </w:lvl>
   </w:abstractNum>
   <w:abstractNum w:abstractNumId="25" w15:restartNumberingAfterBreak="0">
-    <w:nsid w:val="5FB9027B"/>
+    <w:nsid w:val="4A8506A2"/>
     <w:multiLevelType w:val="singleLevel"/>
     <w:tmpl w:val="04160001"/>
     <w:lvl w:ilvl="0">
@@ -26867,7 +26954,7 @@
     </w:lvl>
   </w:abstractNum>
   <w:abstractNum w:abstractNumId="26" w15:restartNumberingAfterBreak="0">
-    <w:nsid w:val="60AF5788"/>
+    <w:nsid w:val="54877EE0"/>
     <w:multiLevelType w:val="singleLevel"/>
     <w:tmpl w:val="04160001"/>
     <w:lvl w:ilvl="0">
@@ -26884,7 +26971,7 @@
     </w:lvl>
   </w:abstractNum>
   <w:abstractNum w:abstractNumId="27" w15:restartNumberingAfterBreak="0">
-    <w:nsid w:val="62F6446A"/>
+    <w:nsid w:val="56B478D1"/>
     <w:multiLevelType w:val="singleLevel"/>
     <w:tmpl w:val="04160001"/>
     <w:lvl w:ilvl="0">
@@ -26901,7 +26988,7 @@
     </w:lvl>
   </w:abstractNum>
   <w:abstractNum w:abstractNumId="28" w15:restartNumberingAfterBreak="0">
-    <w:nsid w:val="64113B37"/>
+    <w:nsid w:val="57703043"/>
     <w:multiLevelType w:val="singleLevel"/>
     <w:tmpl w:val="04160001"/>
     <w:lvl w:ilvl="0">
@@ -26918,7 +27005,7 @@
     </w:lvl>
   </w:abstractNum>
   <w:abstractNum w:abstractNumId="29" w15:restartNumberingAfterBreak="0">
-    <w:nsid w:val="651F15ED"/>
+    <w:nsid w:val="581C64C7"/>
     <w:multiLevelType w:val="singleLevel"/>
     <w:tmpl w:val="04160001"/>
     <w:lvl w:ilvl="0">
@@ -26935,7 +27022,7 @@
     </w:lvl>
   </w:abstractNum>
   <w:abstractNum w:abstractNumId="30" w15:restartNumberingAfterBreak="0">
-    <w:nsid w:val="6BCC3DA5"/>
+    <w:nsid w:val="585B6B5B"/>
     <w:multiLevelType w:val="singleLevel"/>
     <w:tmpl w:val="04160001"/>
     <w:lvl w:ilvl="0">
@@ -26952,7 +27039,7 @@
     </w:lvl>
   </w:abstractNum>
   <w:abstractNum w:abstractNumId="31" w15:restartNumberingAfterBreak="0">
-    <w:nsid w:val="6D407764"/>
+    <w:nsid w:val="58A62B43"/>
     <w:multiLevelType w:val="singleLevel"/>
     <w:tmpl w:val="04160001"/>
     <w:lvl w:ilvl="0">
@@ -26969,7 +27056,7 @@
     </w:lvl>
   </w:abstractNum>
   <w:abstractNum w:abstractNumId="32" w15:restartNumberingAfterBreak="0">
-    <w:nsid w:val="6E92332C"/>
+    <w:nsid w:val="5DCE76ED"/>
     <w:multiLevelType w:val="singleLevel"/>
     <w:tmpl w:val="04160001"/>
     <w:lvl w:ilvl="0">
@@ -26986,7 +27073,7 @@
     </w:lvl>
   </w:abstractNum>
   <w:abstractNum w:abstractNumId="33" w15:restartNumberingAfterBreak="0">
-    <w:nsid w:val="6EA45BD3"/>
+    <w:nsid w:val="62CE3C48"/>
     <w:multiLevelType w:val="singleLevel"/>
     <w:tmpl w:val="04160001"/>
     <w:lvl w:ilvl="0">
@@ -27003,7 +27090,7 @@
     </w:lvl>
   </w:abstractNum>
   <w:abstractNum w:abstractNumId="34" w15:restartNumberingAfterBreak="0">
-    <w:nsid w:val="6F236EAC"/>
+    <w:nsid w:val="66010EC4"/>
     <w:multiLevelType w:val="singleLevel"/>
     <w:tmpl w:val="04160001"/>
     <w:lvl w:ilvl="0">
@@ -27020,7 +27107,7 @@
     </w:lvl>
   </w:abstractNum>
   <w:abstractNum w:abstractNumId="35" w15:restartNumberingAfterBreak="0">
-    <w:nsid w:val="6FDC2542"/>
+    <w:nsid w:val="6D9371F2"/>
     <w:multiLevelType w:val="singleLevel"/>
     <w:tmpl w:val="04160001"/>
     <w:lvl w:ilvl="0">
@@ -27037,7 +27124,7 @@
     </w:lvl>
   </w:abstractNum>
   <w:abstractNum w:abstractNumId="36" w15:restartNumberingAfterBreak="0">
-    <w:nsid w:val="70A65BC6"/>
+    <w:nsid w:val="6F597B8F"/>
     <w:multiLevelType w:val="singleLevel"/>
     <w:tmpl w:val="04160001"/>
     <w:lvl w:ilvl="0">
@@ -27054,7 +27141,7 @@
     </w:lvl>
   </w:abstractNum>
   <w:abstractNum w:abstractNumId="37" w15:restartNumberingAfterBreak="0">
-    <w:nsid w:val="7258631C"/>
+    <w:nsid w:val="703B4967"/>
     <w:multiLevelType w:val="singleLevel"/>
     <w:tmpl w:val="04160001"/>
     <w:lvl w:ilvl="0">
@@ -27071,7 +27158,7 @@
     </w:lvl>
   </w:abstractNum>
   <w:abstractNum w:abstractNumId="38" w15:restartNumberingAfterBreak="0">
-    <w:nsid w:val="789E173F"/>
+    <w:nsid w:val="76197F3D"/>
     <w:multiLevelType w:val="singleLevel"/>
     <w:tmpl w:val="04160001"/>
     <w:lvl w:ilvl="0">
@@ -27088,7 +27175,7 @@
     </w:lvl>
   </w:abstractNum>
   <w:abstractNum w:abstractNumId="39" w15:restartNumberingAfterBreak="0">
-    <w:nsid w:val="793E1EF0"/>
+    <w:nsid w:val="76794113"/>
     <w:multiLevelType w:val="singleLevel"/>
     <w:tmpl w:val="04160001"/>
     <w:lvl w:ilvl="0">
@@ -27105,7 +27192,7 @@
     </w:lvl>
   </w:abstractNum>
   <w:abstractNum w:abstractNumId="40" w15:restartNumberingAfterBreak="0">
-    <w:nsid w:val="79FB5C30"/>
+    <w:nsid w:val="7E5D0C0B"/>
     <w:multiLevelType w:val="singleLevel"/>
     <w:tmpl w:val="04160001"/>
     <w:lvl w:ilvl="0">
@@ -27121,128 +27208,128 @@
       </w:rPr>
     </w:lvl>
   </w:abstractNum>
-  <w:num w:numId="1" w16cid:durableId="1427768962">
+  <w:num w:numId="1" w16cid:durableId="2106536095">
+    <w:abstractNumId w:val="39"/>
+  </w:num>
+  <w:num w:numId="2" w16cid:durableId="1758749000">
+    <w:abstractNumId w:val="33"/>
+  </w:num>
+  <w:num w:numId="3" w16cid:durableId="536546478">
+    <w:abstractNumId w:val="15"/>
+  </w:num>
+  <w:num w:numId="4" w16cid:durableId="1473281088">
+    <w:abstractNumId w:val="40"/>
+  </w:num>
+  <w:num w:numId="5" w16cid:durableId="1181359102">
+    <w:abstractNumId w:val="6"/>
+  </w:num>
+  <w:num w:numId="6" w16cid:durableId="452948265">
+    <w:abstractNumId w:val="4"/>
+  </w:num>
+  <w:num w:numId="7" w16cid:durableId="1009403662">
+    <w:abstractNumId w:val="7"/>
+  </w:num>
+  <w:num w:numId="8" w16cid:durableId="391273958">
+    <w:abstractNumId w:val="2"/>
+  </w:num>
+  <w:num w:numId="9" w16cid:durableId="641157559">
+    <w:abstractNumId w:val="24"/>
+  </w:num>
+  <w:num w:numId="10" w16cid:durableId="695885594">
+    <w:abstractNumId w:val="8"/>
+  </w:num>
+  <w:num w:numId="11" w16cid:durableId="458689434">
+    <w:abstractNumId w:val="23"/>
+  </w:num>
+  <w:num w:numId="12" w16cid:durableId="1712538804">
+    <w:abstractNumId w:val="37"/>
+  </w:num>
+  <w:num w:numId="13" w16cid:durableId="1788962270">
+    <w:abstractNumId w:val="25"/>
+  </w:num>
+  <w:num w:numId="14" w16cid:durableId="913003199">
+    <w:abstractNumId w:val="20"/>
+  </w:num>
+  <w:num w:numId="15" w16cid:durableId="384178722">
+    <w:abstractNumId w:val="22"/>
+  </w:num>
+  <w:num w:numId="16" w16cid:durableId="693383842">
+    <w:abstractNumId w:val="12"/>
+  </w:num>
+  <w:num w:numId="17" w16cid:durableId="447162622">
+    <w:abstractNumId w:val="27"/>
+  </w:num>
+  <w:num w:numId="18" w16cid:durableId="1700545124">
+    <w:abstractNumId w:val="19"/>
+  </w:num>
+  <w:num w:numId="19" w16cid:durableId="2016805253">
+    <w:abstractNumId w:val="38"/>
+  </w:num>
+  <w:num w:numId="20" w16cid:durableId="2110082082">
+    <w:abstractNumId w:val="0"/>
+  </w:num>
+  <w:num w:numId="21" w16cid:durableId="1874030391">
+    <w:abstractNumId w:val="30"/>
+  </w:num>
+  <w:num w:numId="22" w16cid:durableId="451553878">
+    <w:abstractNumId w:val="32"/>
+  </w:num>
+  <w:num w:numId="23" w16cid:durableId="1630361093">
+    <w:abstractNumId w:val="31"/>
+  </w:num>
+  <w:num w:numId="24" w16cid:durableId="1437484464">
+    <w:abstractNumId w:val="10"/>
+  </w:num>
+  <w:num w:numId="25" w16cid:durableId="1090273620">
+    <w:abstractNumId w:val="36"/>
+  </w:num>
+  <w:num w:numId="26" w16cid:durableId="187719432">
+    <w:abstractNumId w:val="35"/>
+  </w:num>
+  <w:num w:numId="27" w16cid:durableId="1672296561">
+    <w:abstractNumId w:val="5"/>
+  </w:num>
+  <w:num w:numId="28" w16cid:durableId="1719744015">
+    <w:abstractNumId w:val="9"/>
+  </w:num>
+  <w:num w:numId="29" w16cid:durableId="267397317">
     <w:abstractNumId w:val="29"/>
   </w:num>
-  <w:num w:numId="2" w16cid:durableId="1375694504">
-    <w:abstractNumId w:val="25"/>
+  <w:num w:numId="30" w16cid:durableId="1053235682">
+    <w:abstractNumId w:val="18"/>
   </w:num>
-  <w:num w:numId="3" w16cid:durableId="1198733868">
-    <w:abstractNumId w:val="22"/>
+  <w:num w:numId="31" w16cid:durableId="818838558">
+    <w:abstractNumId w:val="28"/>
   </w:num>
-  <w:num w:numId="4" w16cid:durableId="260644600">
-    <w:abstractNumId w:val="20"/>
+  <w:num w:numId="32" w16cid:durableId="420684169">
+    <w:abstractNumId w:val="16"/>
   </w:num>
-  <w:num w:numId="5" w16cid:durableId="383481092">
+  <w:num w:numId="33" w16cid:durableId="1772583389">
     <w:abstractNumId w:val="34"/>
   </w:num>
-  <w:num w:numId="6" w16cid:durableId="514997511">
-    <w:abstractNumId w:val="40"/>
-  </w:num>
-  <w:num w:numId="7" w16cid:durableId="1037972137">
+  <w:num w:numId="34" w16cid:durableId="1274048723">
     <w:abstractNumId w:val="11"/>
   </w:num>
-  <w:num w:numId="8" w16cid:durableId="681316324">
-    <w:abstractNumId w:val="23"/>
+  <w:num w:numId="35" w16cid:durableId="144249916">
+    <w:abstractNumId w:val="1"/>
   </w:num>
-  <w:num w:numId="9" w16cid:durableId="2022851013">
-    <w:abstractNumId w:val="37"/>
+  <w:num w:numId="36" w16cid:durableId="1103452473">
+    <w:abstractNumId w:val="17"/>
   </w:num>
-  <w:num w:numId="10" w16cid:durableId="1301351017">
+  <w:num w:numId="37" w16cid:durableId="504512070">
+    <w:abstractNumId w:val="26"/>
+  </w:num>
+  <w:num w:numId="38" w16cid:durableId="283926572">
+    <w:abstractNumId w:val="14"/>
+  </w:num>
+  <w:num w:numId="39" w16cid:durableId="407771475">
+    <w:abstractNumId w:val="13"/>
+  </w:num>
+  <w:num w:numId="40" w16cid:durableId="1402948222">
     <w:abstractNumId w:val="3"/>
   </w:num>
-  <w:num w:numId="11" w16cid:durableId="67073988">
-    <w:abstractNumId w:val="33"/>
-  </w:num>
-  <w:num w:numId="12" w16cid:durableId="502359218">
-    <w:abstractNumId w:val="17"/>
-  </w:num>
-  <w:num w:numId="13" w16cid:durableId="892934465">
-    <w:abstractNumId w:val="38"/>
-  </w:num>
-  <w:num w:numId="14" w16cid:durableId="912543637">
-    <w:abstractNumId w:val="15"/>
-  </w:num>
-  <w:num w:numId="15" w16cid:durableId="1016343722">
-    <w:abstractNumId w:val="7"/>
-  </w:num>
-  <w:num w:numId="16" w16cid:durableId="1504736656">
-    <w:abstractNumId w:val="31"/>
-  </w:num>
-  <w:num w:numId="17" w16cid:durableId="1828663835">
-    <w:abstractNumId w:val="32"/>
-  </w:num>
-  <w:num w:numId="18" w16cid:durableId="1194466745">
-    <w:abstractNumId w:val="36"/>
-  </w:num>
-  <w:num w:numId="19" w16cid:durableId="1685546856">
-    <w:abstractNumId w:val="12"/>
-  </w:num>
-  <w:num w:numId="20" w16cid:durableId="1817144019">
-    <w:abstractNumId w:val="39"/>
-  </w:num>
-  <w:num w:numId="21" w16cid:durableId="1837262460">
-    <w:abstractNumId w:val="24"/>
-  </w:num>
-  <w:num w:numId="22" w16cid:durableId="233122390">
-    <w:abstractNumId w:val="35"/>
-  </w:num>
-  <w:num w:numId="23" w16cid:durableId="2055230375">
-    <w:abstractNumId w:val="30"/>
-  </w:num>
-  <w:num w:numId="24" w16cid:durableId="1859463616">
-    <w:abstractNumId w:val="27"/>
-  </w:num>
-  <w:num w:numId="25" w16cid:durableId="1220089882">
-    <w:abstractNumId w:val="26"/>
-  </w:num>
-  <w:num w:numId="26" w16cid:durableId="1022440512">
-    <w:abstractNumId w:val="9"/>
-  </w:num>
-  <w:num w:numId="27" w16cid:durableId="229926592">
-    <w:abstractNumId w:val="5"/>
-  </w:num>
-  <w:num w:numId="28" w16cid:durableId="160198297">
-    <w:abstractNumId w:val="10"/>
-  </w:num>
-  <w:num w:numId="29" w16cid:durableId="619534825">
-    <w:abstractNumId w:val="1"/>
-  </w:num>
-  <w:num w:numId="30" w16cid:durableId="188375001">
-    <w:abstractNumId w:val="16"/>
-  </w:num>
-  <w:num w:numId="31" w16cid:durableId="401415807">
-    <w:abstractNumId w:val="4"/>
-  </w:num>
-  <w:num w:numId="32" w16cid:durableId="2033414870">
-    <w:abstractNumId w:val="14"/>
-  </w:num>
-  <w:num w:numId="33" w16cid:durableId="1987660157">
-    <w:abstractNumId w:val="0"/>
-  </w:num>
-  <w:num w:numId="34" w16cid:durableId="1797528761">
-    <w:abstractNumId w:val="2"/>
-  </w:num>
-  <w:num w:numId="35" w16cid:durableId="365838996">
+  <w:num w:numId="41" w16cid:durableId="66463000">
     <w:abstractNumId w:val="21"/>
-  </w:num>
-  <w:num w:numId="36" w16cid:durableId="1638873363">
-    <w:abstractNumId w:val="18"/>
-  </w:num>
-  <w:num w:numId="37" w16cid:durableId="933168053">
-    <w:abstractNumId w:val="28"/>
-  </w:num>
-  <w:num w:numId="38" w16cid:durableId="1777865086">
-    <w:abstractNumId w:val="8"/>
-  </w:num>
-  <w:num w:numId="39" w16cid:durableId="495268552">
-    <w:abstractNumId w:val="19"/>
-  </w:num>
-  <w:num w:numId="40" w16cid:durableId="1135417709">
-    <w:abstractNumId w:val="6"/>
-  </w:num>
-  <w:num w:numId="41" w16cid:durableId="1462075365">
-    <w:abstractNumId w:val="13"/>
   </w:num>
 </w:numbering>
 </file>
@@ -27655,7 +27742,7 @@
     <w:link w:val="Ttulo1Char"/>
     <w:uiPriority w:val="9"/>
     <w:qFormat/>
-    <w:rsid w:val="002E3E0E"/>
+    <w:rsid w:val="00163458"/>
     <w:pPr>
       <w:keepNext/>
       <w:keepLines/>
@@ -27677,7 +27764,7 @@
     <w:uiPriority w:val="9"/>
     <w:unhideWhenUsed/>
     <w:qFormat/>
-    <w:rsid w:val="002E3E0E"/>
+    <w:rsid w:val="00163458"/>
     <w:pPr>
       <w:keepNext/>
       <w:keepLines/>
@@ -27700,7 +27787,7 @@
     <w:semiHidden/>
     <w:unhideWhenUsed/>
     <w:qFormat/>
-    <w:rsid w:val="002E3E0E"/>
+    <w:rsid w:val="00163458"/>
     <w:pPr>
       <w:keepNext/>
       <w:keepLines/>
@@ -27723,7 +27810,7 @@
     <w:semiHidden/>
     <w:unhideWhenUsed/>
     <w:qFormat/>
-    <w:rsid w:val="002E3E0E"/>
+    <w:rsid w:val="00163458"/>
     <w:pPr>
       <w:keepNext/>
       <w:keepLines/>
@@ -27746,7 +27833,7 @@
     <w:semiHidden/>
     <w:unhideWhenUsed/>
     <w:qFormat/>
-    <w:rsid w:val="002E3E0E"/>
+    <w:rsid w:val="00163458"/>
     <w:pPr>
       <w:keepNext/>
       <w:keepLines/>
@@ -27767,7 +27854,7 @@
     <w:semiHidden/>
     <w:unhideWhenUsed/>
     <w:qFormat/>
-    <w:rsid w:val="002E3E0E"/>
+    <w:rsid w:val="00163458"/>
     <w:pPr>
       <w:keepNext/>
       <w:keepLines/>
@@ -27790,7 +27877,7 @@
     <w:semiHidden/>
     <w:unhideWhenUsed/>
     <w:qFormat/>
-    <w:rsid w:val="002E3E0E"/>
+    <w:rsid w:val="00163458"/>
     <w:pPr>
       <w:keepNext/>
       <w:keepLines/>
@@ -27811,7 +27898,7 @@
     <w:semiHidden/>
     <w:unhideWhenUsed/>
     <w:qFormat/>
-    <w:rsid w:val="002E3E0E"/>
+    <w:rsid w:val="00163458"/>
     <w:pPr>
       <w:keepNext/>
       <w:keepLines/>
@@ -27834,7 +27921,7 @@
     <w:semiHidden/>
     <w:unhideWhenUsed/>
     <w:qFormat/>
-    <w:rsid w:val="002E3E0E"/>
+    <w:rsid w:val="00163458"/>
     <w:pPr>
       <w:keepNext/>
       <w:keepLines/>
@@ -27878,7 +27965,7 @@
     <w:basedOn w:val="Fontepargpadro"/>
     <w:link w:val="Ttulo1"/>
     <w:uiPriority w:val="9"/>
-    <w:rsid w:val="002E3E0E"/>
+    <w:rsid w:val="00163458"/>
     <w:rPr>
       <w:rFonts w:asciiTheme="majorHAnsi" w:eastAsiaTheme="majorEastAsia" w:hAnsiTheme="majorHAnsi" w:cstheme="majorBidi"/>
       <w:color w:val="0F4761" w:themeColor="accent1" w:themeShade="BF"/>
@@ -27891,7 +27978,7 @@
     <w:basedOn w:val="Fontepargpadro"/>
     <w:link w:val="Ttulo2"/>
     <w:uiPriority w:val="9"/>
-    <w:rsid w:val="002E3E0E"/>
+    <w:rsid w:val="00163458"/>
     <w:rPr>
       <w:rFonts w:asciiTheme="majorHAnsi" w:eastAsiaTheme="majorEastAsia" w:hAnsiTheme="majorHAnsi" w:cstheme="majorBidi"/>
       <w:color w:val="0F4761" w:themeColor="accent1" w:themeShade="BF"/>
@@ -27905,7 +27992,7 @@
     <w:link w:val="Ttulo3"/>
     <w:uiPriority w:val="9"/>
     <w:semiHidden/>
-    <w:rsid w:val="002E3E0E"/>
+    <w:rsid w:val="00163458"/>
     <w:rPr>
       <w:rFonts w:eastAsiaTheme="majorEastAsia" w:cstheme="majorBidi"/>
       <w:color w:val="0F4761" w:themeColor="accent1" w:themeShade="BF"/>
@@ -27919,7 +28006,7 @@
     <w:link w:val="Ttulo4"/>
     <w:uiPriority w:val="9"/>
     <w:semiHidden/>
-    <w:rsid w:val="002E3E0E"/>
+    <w:rsid w:val="00163458"/>
     <w:rPr>
       <w:rFonts w:eastAsiaTheme="majorEastAsia" w:cstheme="majorBidi"/>
       <w:i/>
@@ -27933,7 +28020,7 @@
     <w:link w:val="Ttulo5"/>
     <w:uiPriority w:val="9"/>
     <w:semiHidden/>
-    <w:rsid w:val="002E3E0E"/>
+    <w:rsid w:val="00163458"/>
     <w:rPr>
       <w:rFonts w:eastAsiaTheme="majorEastAsia" w:cstheme="majorBidi"/>
       <w:color w:val="0F4761" w:themeColor="accent1" w:themeShade="BF"/>
@@ -27945,7 +28032,7 @@
     <w:link w:val="Ttulo6"/>
     <w:uiPriority w:val="9"/>
     <w:semiHidden/>
-    <w:rsid w:val="002E3E0E"/>
+    <w:rsid w:val="00163458"/>
     <w:rPr>
       <w:rFonts w:eastAsiaTheme="majorEastAsia" w:cstheme="majorBidi"/>
       <w:i/>
@@ -27959,7 +28046,7 @@
     <w:link w:val="Ttulo7"/>
     <w:uiPriority w:val="9"/>
     <w:semiHidden/>
-    <w:rsid w:val="002E3E0E"/>
+    <w:rsid w:val="00163458"/>
     <w:rPr>
       <w:rFonts w:eastAsiaTheme="majorEastAsia" w:cstheme="majorBidi"/>
       <w:color w:val="595959" w:themeColor="text1" w:themeTint="A6"/>
@@ -27971,7 +28058,7 @@
     <w:link w:val="Ttulo8"/>
     <w:uiPriority w:val="9"/>
     <w:semiHidden/>
-    <w:rsid w:val="002E3E0E"/>
+    <w:rsid w:val="00163458"/>
     <w:rPr>
       <w:rFonts w:eastAsiaTheme="majorEastAsia" w:cstheme="majorBidi"/>
       <w:i/>
@@ -27985,7 +28072,7 @@
     <w:link w:val="Ttulo9"/>
     <w:uiPriority w:val="9"/>
     <w:semiHidden/>
-    <w:rsid w:val="002E3E0E"/>
+    <w:rsid w:val="00163458"/>
     <w:rPr>
       <w:rFonts w:eastAsiaTheme="majorEastAsia" w:cstheme="majorBidi"/>
       <w:color w:val="272727" w:themeColor="text1" w:themeTint="D8"/>
@@ -27998,7 +28085,7 @@
     <w:link w:val="TtuloChar"/>
     <w:uiPriority w:val="10"/>
     <w:qFormat/>
-    <w:rsid w:val="002E3E0E"/>
+    <w:rsid w:val="00163458"/>
     <w:pPr>
       <w:spacing w:after="80" w:line="240" w:lineRule="auto"/>
       <w:contextualSpacing/>
@@ -28016,7 +28103,7 @@
     <w:basedOn w:val="Fontepargpadro"/>
     <w:link w:val="Ttulo"/>
     <w:uiPriority w:val="10"/>
-    <w:rsid w:val="002E3E0E"/>
+    <w:rsid w:val="00163458"/>
     <w:rPr>
       <w:rFonts w:asciiTheme="majorHAnsi" w:eastAsiaTheme="majorEastAsia" w:hAnsiTheme="majorHAnsi" w:cstheme="majorBidi"/>
       <w:spacing w:val="-10"/>
@@ -28032,7 +28119,7 @@
     <w:link w:val="SubttuloChar"/>
     <w:uiPriority w:val="11"/>
     <w:qFormat/>
-    <w:rsid w:val="002E3E0E"/>
+    <w:rsid w:val="00163458"/>
     <w:pPr>
       <w:numPr>
         <w:ilvl w:val="1"/>
@@ -28051,7 +28138,7 @@
     <w:basedOn w:val="Fontepargpadro"/>
     <w:link w:val="Subttulo"/>
     <w:uiPriority w:val="11"/>
-    <w:rsid w:val="002E3E0E"/>
+    <w:rsid w:val="00163458"/>
     <w:rPr>
       <w:rFonts w:eastAsiaTheme="majorEastAsia" w:cstheme="majorBidi"/>
       <w:color w:val="595959" w:themeColor="text1" w:themeTint="A6"/>
@@ -28067,7 +28154,7 @@
     <w:link w:val="CitaoChar"/>
     <w:uiPriority w:val="29"/>
     <w:qFormat/>
-    <w:rsid w:val="002E3E0E"/>
+    <w:rsid w:val="00163458"/>
     <w:pPr>
       <w:spacing w:before="160"/>
       <w:jc w:val="center"/>
@@ -28083,7 +28170,7 @@
     <w:basedOn w:val="Fontepargpadro"/>
     <w:link w:val="Citao"/>
     <w:uiPriority w:val="29"/>
-    <w:rsid w:val="002E3E0E"/>
+    <w:rsid w:val="00163458"/>
     <w:rPr>
       <w:i/>
       <w:iCs/>
@@ -28095,7 +28182,7 @@
     <w:basedOn w:val="Normal"/>
     <w:uiPriority w:val="34"/>
     <w:qFormat/>
-    <w:rsid w:val="002E3E0E"/>
+    <w:rsid w:val="00163458"/>
     <w:pPr>
       <w:ind w:left="720"/>
       <w:contextualSpacing/>
@@ -28106,7 +28193,7 @@
     <w:basedOn w:val="Fontepargpadro"/>
     <w:uiPriority w:val="21"/>
     <w:qFormat/>
-    <w:rsid w:val="002E3E0E"/>
+    <w:rsid w:val="00163458"/>
     <w:rPr>
       <w:i/>
       <w:iCs/>
@@ -28120,7 +28207,7 @@
     <w:link w:val="CitaoIntensaChar"/>
     <w:uiPriority w:val="30"/>
     <w:qFormat/>
-    <w:rsid w:val="002E3E0E"/>
+    <w:rsid w:val="00163458"/>
     <w:pPr>
       <w:pBdr>
         <w:top w:val="single" w:sz="4" w:space="10" w:color="0F4761" w:themeColor="accent1" w:themeShade="BF"/>
@@ -28141,7 +28228,7 @@
     <w:basedOn w:val="Fontepargpadro"/>
     <w:link w:val="CitaoIntensa"/>
     <w:uiPriority w:val="30"/>
-    <w:rsid w:val="002E3E0E"/>
+    <w:rsid w:val="00163458"/>
     <w:rPr>
       <w:i/>
       <w:iCs/>
@@ -28153,7 +28240,7 @@
     <w:basedOn w:val="Fontepargpadro"/>
     <w:uiPriority w:val="32"/>
     <w:qFormat/>
-    <w:rsid w:val="002E3E0E"/>
+    <w:rsid w:val="00163458"/>
     <w:rPr>
       <w:b/>
       <w:bCs/>
@@ -28168,7 +28255,7 @@
     <w:link w:val="CabealhoChar"/>
     <w:uiPriority w:val="99"/>
     <w:unhideWhenUsed/>
-    <w:rsid w:val="002E3E0E"/>
+    <w:rsid w:val="00163458"/>
     <w:pPr>
       <w:tabs>
         <w:tab w:val="center" w:pos="4252"/>
@@ -28182,7 +28269,7 @@
     <w:basedOn w:val="Fontepargpadro"/>
     <w:link w:val="Cabealho"/>
     <w:uiPriority w:val="99"/>
-    <w:rsid w:val="002E3E0E"/>
+    <w:rsid w:val="00163458"/>
   </w:style>
   <w:style w:type="paragraph" w:styleId="Rodap">
     <w:name w:val="footer"/>
@@ -28190,7 +28277,7 @@
     <w:link w:val="RodapChar"/>
     <w:uiPriority w:val="99"/>
     <w:unhideWhenUsed/>
-    <w:rsid w:val="002E3E0E"/>
+    <w:rsid w:val="00163458"/>
     <w:pPr>
       <w:tabs>
         <w:tab w:val="center" w:pos="4252"/>
@@ -28204,7 +28291,7 @@
     <w:basedOn w:val="Fontepargpadro"/>
     <w:link w:val="Rodap"/>
     <w:uiPriority w:val="99"/>
-    <w:rsid w:val="002E3E0E"/>
+    <w:rsid w:val="00163458"/>
   </w:style>
   <w:style w:type="paragraph" w:styleId="Sumrio1">
     <w:name w:val="toc 1"/>
@@ -28213,7 +28300,7 @@
     <w:autoRedefine/>
     <w:uiPriority w:val="39"/>
     <w:unhideWhenUsed/>
-    <w:rsid w:val="002E3E0E"/>
+    <w:rsid w:val="00163458"/>
     <w:pPr>
       <w:spacing w:after="100"/>
     </w:pPr>
@@ -28225,7 +28312,7 @@
     <w:autoRedefine/>
     <w:uiPriority w:val="39"/>
     <w:unhideWhenUsed/>
-    <w:rsid w:val="002E3E0E"/>
+    <w:rsid w:val="00163458"/>
     <w:pPr>
       <w:spacing w:after="100"/>
       <w:ind w:left="240"/>

</xml_diff>

<commit_message>
Atualiza Manual de Uso para o aviso automatico de silencio (versao 2.86)
Documenta o segundo mecanismo do aviso automatico de prazo - ja
implantado e publicado no codigo.

Co-Authored-By: Claude Sonnet 5 <noreply@anthropic.com>
</commit_message>
<xml_diff>
--- a/Manual de Uso - Ferramenta de Gestao de Projetos.docx
+++ b/Manual de Uso - Ferramenta de Gestao de Projetos.docx
@@ -129,7 +129,7 @@
           <w:color w:val="6A6A70"/>
           <w:sz w:val="22"/>
         </w:rPr>
-        <w:t>Versao 2.85 - 17 de setembro de 2026 (substitui a versao 2.84 de 16/09/2026)</w:t>
+        <w:t>Versao 2.86 - 17 de setembro de 2026 (substitui a versao 2.85 de 17/09/2026)</w:t>
       </w:r>
     </w:p>
     <w:p>
@@ -229,7 +229,7 @@
         <w:rPr>
           <w:noProof/>
         </w:rPr>
-        <w:instrText xml:space="preserve"> PAGEREF _Toc240532307 \h </w:instrText>
+        <w:instrText xml:space="preserve"> PAGEREF _Toc240533420 \h </w:instrText>
       </w:r>
       <w:r>
         <w:rPr>
@@ -290,7 +290,7 @@
         <w:rPr>
           <w:noProof/>
         </w:rPr>
-        <w:instrText xml:space="preserve"> PAGEREF _Toc240532308 \h </w:instrText>
+        <w:instrText xml:space="preserve"> PAGEREF _Toc240533421 \h </w:instrText>
       </w:r>
       <w:r>
         <w:rPr>
@@ -351,7 +351,7 @@
         <w:rPr>
           <w:noProof/>
         </w:rPr>
-        <w:instrText xml:space="preserve"> PAGEREF _Toc240532309 \h </w:instrText>
+        <w:instrText xml:space="preserve"> PAGEREF _Toc240533422 \h </w:instrText>
       </w:r>
       <w:r>
         <w:rPr>
@@ -412,7 +412,7 @@
         <w:rPr>
           <w:noProof/>
         </w:rPr>
-        <w:instrText xml:space="preserve"> PAGEREF _Toc240532310 \h </w:instrText>
+        <w:instrText xml:space="preserve"> PAGEREF _Toc240533423 \h </w:instrText>
       </w:r>
       <w:r>
         <w:rPr>
@@ -473,7 +473,7 @@
         <w:rPr>
           <w:noProof/>
         </w:rPr>
-        <w:instrText xml:space="preserve"> PAGEREF _Toc240532311 \h </w:instrText>
+        <w:instrText xml:space="preserve"> PAGEREF _Toc240533424 \h </w:instrText>
       </w:r>
       <w:r>
         <w:rPr>
@@ -534,7 +534,7 @@
         <w:rPr>
           <w:noProof/>
         </w:rPr>
-        <w:instrText xml:space="preserve"> PAGEREF _Toc240532312 \h </w:instrText>
+        <w:instrText xml:space="preserve"> PAGEREF _Toc240533425 \h </w:instrText>
       </w:r>
       <w:r>
         <w:rPr>
@@ -595,7 +595,7 @@
         <w:rPr>
           <w:noProof/>
         </w:rPr>
-        <w:instrText xml:space="preserve"> PAGEREF _Toc240532313 \h </w:instrText>
+        <w:instrText xml:space="preserve"> PAGEREF _Toc240533426 \h </w:instrText>
       </w:r>
       <w:r>
         <w:rPr>
@@ -656,7 +656,7 @@
         <w:rPr>
           <w:noProof/>
         </w:rPr>
-        <w:instrText xml:space="preserve"> PAGEREF _Toc240532314 \h </w:instrText>
+        <w:instrText xml:space="preserve"> PAGEREF _Toc240533427 \h </w:instrText>
       </w:r>
       <w:r>
         <w:rPr>
@@ -717,7 +717,7 @@
         <w:rPr>
           <w:noProof/>
         </w:rPr>
-        <w:instrText xml:space="preserve"> PAGEREF _Toc240532315 \h </w:instrText>
+        <w:instrText xml:space="preserve"> PAGEREF _Toc240533428 \h </w:instrText>
       </w:r>
       <w:r>
         <w:rPr>
@@ -778,7 +778,7 @@
         <w:rPr>
           <w:noProof/>
         </w:rPr>
-        <w:instrText xml:space="preserve"> PAGEREF _Toc240532316 \h </w:instrText>
+        <w:instrText xml:space="preserve"> PAGEREF _Toc240533429 \h </w:instrText>
       </w:r>
       <w:r>
         <w:rPr>
@@ -839,7 +839,7 @@
         <w:rPr>
           <w:noProof/>
         </w:rPr>
-        <w:instrText xml:space="preserve"> PAGEREF _Toc240532317 \h </w:instrText>
+        <w:instrText xml:space="preserve"> PAGEREF _Toc240533430 \h </w:instrText>
       </w:r>
       <w:r>
         <w:rPr>
@@ -900,7 +900,7 @@
         <w:rPr>
           <w:noProof/>
         </w:rPr>
-        <w:instrText xml:space="preserve"> PAGEREF _Toc240532318 \h </w:instrText>
+        <w:instrText xml:space="preserve"> PAGEREF _Toc240533431 \h </w:instrText>
       </w:r>
       <w:r>
         <w:rPr>
@@ -961,7 +961,7 @@
         <w:rPr>
           <w:noProof/>
         </w:rPr>
-        <w:instrText xml:space="preserve"> PAGEREF _Toc240532319 \h </w:instrText>
+        <w:instrText xml:space="preserve"> PAGEREF _Toc240533432 \h </w:instrText>
       </w:r>
       <w:r>
         <w:rPr>
@@ -1022,7 +1022,7 @@
         <w:rPr>
           <w:noProof/>
         </w:rPr>
-        <w:instrText xml:space="preserve"> PAGEREF _Toc240532320 \h </w:instrText>
+        <w:instrText xml:space="preserve"> PAGEREF _Toc240533433 \h </w:instrText>
       </w:r>
       <w:r>
         <w:rPr>
@@ -1083,7 +1083,7 @@
         <w:rPr>
           <w:noProof/>
         </w:rPr>
-        <w:instrText xml:space="preserve"> PAGEREF _Toc240532321 \h </w:instrText>
+        <w:instrText xml:space="preserve"> PAGEREF _Toc240533434 \h </w:instrText>
       </w:r>
       <w:r>
         <w:rPr>
@@ -1144,7 +1144,7 @@
         <w:rPr>
           <w:noProof/>
         </w:rPr>
-        <w:instrText xml:space="preserve"> PAGEREF _Toc240532322 \h </w:instrText>
+        <w:instrText xml:space="preserve"> PAGEREF _Toc240533435 \h </w:instrText>
       </w:r>
       <w:r>
         <w:rPr>
@@ -1205,7 +1205,7 @@
         <w:rPr>
           <w:noProof/>
         </w:rPr>
-        <w:instrText xml:space="preserve"> PAGEREF _Toc240532323 \h </w:instrText>
+        <w:instrText xml:space="preserve"> PAGEREF _Toc240533436 \h </w:instrText>
       </w:r>
       <w:r>
         <w:rPr>
@@ -1266,7 +1266,7 @@
         <w:rPr>
           <w:noProof/>
         </w:rPr>
-        <w:instrText xml:space="preserve"> PAGEREF _Toc240532324 \h </w:instrText>
+        <w:instrText xml:space="preserve"> PAGEREF _Toc240533437 \h </w:instrText>
       </w:r>
       <w:r>
         <w:rPr>
@@ -1327,7 +1327,7 @@
         <w:rPr>
           <w:noProof/>
         </w:rPr>
-        <w:instrText xml:space="preserve"> PAGEREF _Toc240532325 \h </w:instrText>
+        <w:instrText xml:space="preserve"> PAGEREF _Toc240533438 \h </w:instrText>
       </w:r>
       <w:r>
         <w:rPr>
@@ -1388,7 +1388,7 @@
         <w:rPr>
           <w:noProof/>
         </w:rPr>
-        <w:instrText xml:space="preserve"> PAGEREF _Toc240532326 \h </w:instrText>
+        <w:instrText xml:space="preserve"> PAGEREF _Toc240533439 \h </w:instrText>
       </w:r>
       <w:r>
         <w:rPr>
@@ -1449,7 +1449,7 @@
         <w:rPr>
           <w:noProof/>
         </w:rPr>
-        <w:instrText xml:space="preserve"> PAGEREF _Toc240532327 \h </w:instrText>
+        <w:instrText xml:space="preserve"> PAGEREF _Toc240533440 \h </w:instrText>
       </w:r>
       <w:r>
         <w:rPr>
@@ -1510,7 +1510,7 @@
         <w:rPr>
           <w:noProof/>
         </w:rPr>
-        <w:instrText xml:space="preserve"> PAGEREF _Toc240532328 \h </w:instrText>
+        <w:instrText xml:space="preserve"> PAGEREF _Toc240533441 \h </w:instrText>
       </w:r>
       <w:r>
         <w:rPr>
@@ -1571,7 +1571,7 @@
         <w:rPr>
           <w:noProof/>
         </w:rPr>
-        <w:instrText xml:space="preserve"> PAGEREF _Toc240532329 \h </w:instrText>
+        <w:instrText xml:space="preserve"> PAGEREF _Toc240533442 \h </w:instrText>
       </w:r>
       <w:r>
         <w:rPr>
@@ -1632,7 +1632,7 @@
         <w:rPr>
           <w:noProof/>
         </w:rPr>
-        <w:instrText xml:space="preserve"> PAGEREF _Toc240532330 \h </w:instrText>
+        <w:instrText xml:space="preserve"> PAGEREF _Toc240533443 \h </w:instrText>
       </w:r>
       <w:r>
         <w:rPr>
@@ -1693,7 +1693,7 @@
         <w:rPr>
           <w:noProof/>
         </w:rPr>
-        <w:instrText xml:space="preserve"> PAGEREF _Toc240532331 \h </w:instrText>
+        <w:instrText xml:space="preserve"> PAGEREF _Toc240533444 \h </w:instrText>
       </w:r>
       <w:r>
         <w:rPr>
@@ -1754,7 +1754,7 @@
         <w:rPr>
           <w:noProof/>
         </w:rPr>
-        <w:instrText xml:space="preserve"> PAGEREF _Toc240532332 \h </w:instrText>
+        <w:instrText xml:space="preserve"> PAGEREF _Toc240533445 \h </w:instrText>
       </w:r>
       <w:r>
         <w:rPr>
@@ -1816,7 +1816,7 @@
         <w:rPr>
           <w:noProof/>
         </w:rPr>
-        <w:instrText xml:space="preserve"> PAGEREF _Toc240532333 \h </w:instrText>
+        <w:instrText xml:space="preserve"> PAGEREF _Toc240533446 \h </w:instrText>
       </w:r>
       <w:r>
         <w:rPr>
@@ -1877,7 +1877,7 @@
         <w:rPr>
           <w:noProof/>
         </w:rPr>
-        <w:instrText xml:space="preserve"> PAGEREF _Toc240532334 \h </w:instrText>
+        <w:instrText xml:space="preserve"> PAGEREF _Toc240533447 \h </w:instrText>
       </w:r>
       <w:r>
         <w:rPr>
@@ -1938,7 +1938,7 @@
         <w:rPr>
           <w:noProof/>
         </w:rPr>
-        <w:instrText xml:space="preserve"> PAGEREF _Toc240532335 \h </w:instrText>
+        <w:instrText xml:space="preserve"> PAGEREF _Toc240533448 \h </w:instrText>
       </w:r>
       <w:r>
         <w:rPr>
@@ -1999,7 +1999,7 @@
         <w:rPr>
           <w:noProof/>
         </w:rPr>
-        <w:instrText xml:space="preserve"> PAGEREF _Toc240532336 \h </w:instrText>
+        <w:instrText xml:space="preserve"> PAGEREF _Toc240533449 \h </w:instrText>
       </w:r>
       <w:r>
         <w:rPr>
@@ -2060,7 +2060,7 @@
         <w:rPr>
           <w:noProof/>
         </w:rPr>
-        <w:instrText xml:space="preserve"> PAGEREF _Toc240532337 \h </w:instrText>
+        <w:instrText xml:space="preserve"> PAGEREF _Toc240533450 \h </w:instrText>
       </w:r>
       <w:r>
         <w:rPr>
@@ -2121,7 +2121,7 @@
         <w:rPr>
           <w:noProof/>
         </w:rPr>
-        <w:instrText xml:space="preserve"> PAGEREF _Toc240532338 \h </w:instrText>
+        <w:instrText xml:space="preserve"> PAGEREF _Toc240533451 \h </w:instrText>
       </w:r>
       <w:r>
         <w:rPr>
@@ -2182,7 +2182,7 @@
         <w:rPr>
           <w:noProof/>
         </w:rPr>
-        <w:instrText xml:space="preserve"> PAGEREF _Toc240532339 \h </w:instrText>
+        <w:instrText xml:space="preserve"> PAGEREF _Toc240533452 \h </w:instrText>
       </w:r>
       <w:r>
         <w:rPr>
@@ -2243,7 +2243,7 @@
         <w:rPr>
           <w:noProof/>
         </w:rPr>
-        <w:instrText xml:space="preserve"> PAGEREF _Toc240532340 \h </w:instrText>
+        <w:instrText xml:space="preserve"> PAGEREF _Toc240533453 \h </w:instrText>
       </w:r>
       <w:r>
         <w:rPr>
@@ -2304,7 +2304,7 @@
         <w:rPr>
           <w:noProof/>
         </w:rPr>
-        <w:instrText xml:space="preserve"> PAGEREF _Toc240532341 \h </w:instrText>
+        <w:instrText xml:space="preserve"> PAGEREF _Toc240533454 \h </w:instrText>
       </w:r>
       <w:r>
         <w:rPr>
@@ -2365,7 +2365,7 @@
         <w:rPr>
           <w:noProof/>
         </w:rPr>
-        <w:instrText xml:space="preserve"> PAGEREF _Toc240532342 \h </w:instrText>
+        <w:instrText xml:space="preserve"> PAGEREF _Toc240533455 \h </w:instrText>
       </w:r>
       <w:r>
         <w:rPr>
@@ -2426,7 +2426,7 @@
         <w:rPr>
           <w:noProof/>
         </w:rPr>
-        <w:instrText xml:space="preserve"> PAGEREF _Toc240532343 \h </w:instrText>
+        <w:instrText xml:space="preserve"> PAGEREF _Toc240533456 \h </w:instrText>
       </w:r>
       <w:r>
         <w:rPr>
@@ -2487,7 +2487,7 @@
         <w:rPr>
           <w:noProof/>
         </w:rPr>
-        <w:instrText xml:space="preserve"> PAGEREF _Toc240532344 \h </w:instrText>
+        <w:instrText xml:space="preserve"> PAGEREF _Toc240533457 \h </w:instrText>
       </w:r>
       <w:r>
         <w:rPr>
@@ -2548,7 +2548,7 @@
         <w:rPr>
           <w:noProof/>
         </w:rPr>
-        <w:instrText xml:space="preserve"> PAGEREF _Toc240532345 \h </w:instrText>
+        <w:instrText xml:space="preserve"> PAGEREF _Toc240533458 \h </w:instrText>
       </w:r>
       <w:r>
         <w:rPr>
@@ -2609,7 +2609,7 @@
         <w:rPr>
           <w:noProof/>
         </w:rPr>
-        <w:instrText xml:space="preserve"> PAGEREF _Toc240532346 \h </w:instrText>
+        <w:instrText xml:space="preserve"> PAGEREF _Toc240533459 \h </w:instrText>
       </w:r>
       <w:r>
         <w:rPr>
@@ -2670,7 +2670,7 @@
         <w:rPr>
           <w:noProof/>
         </w:rPr>
-        <w:instrText xml:space="preserve"> PAGEREF _Toc240532347 \h </w:instrText>
+        <w:instrText xml:space="preserve"> PAGEREF _Toc240533460 \h </w:instrText>
       </w:r>
       <w:r>
         <w:rPr>
@@ -2731,7 +2731,7 @@
         <w:rPr>
           <w:noProof/>
         </w:rPr>
-        <w:instrText xml:space="preserve"> PAGEREF _Toc240532348 \h </w:instrText>
+        <w:instrText xml:space="preserve"> PAGEREF _Toc240533461 \h </w:instrText>
       </w:r>
       <w:r>
         <w:rPr>
@@ -2792,7 +2792,7 @@
         <w:rPr>
           <w:noProof/>
         </w:rPr>
-        <w:instrText xml:space="preserve"> PAGEREF _Toc240532349 \h </w:instrText>
+        <w:instrText xml:space="preserve"> PAGEREF _Toc240533462 \h </w:instrText>
       </w:r>
       <w:r>
         <w:rPr>
@@ -2853,7 +2853,7 @@
         <w:rPr>
           <w:noProof/>
         </w:rPr>
-        <w:instrText xml:space="preserve"> PAGEREF _Toc240532350 \h </w:instrText>
+        <w:instrText xml:space="preserve"> PAGEREF _Toc240533463 \h </w:instrText>
       </w:r>
       <w:r>
         <w:rPr>
@@ -2914,7 +2914,7 @@
         <w:rPr>
           <w:noProof/>
         </w:rPr>
-        <w:instrText xml:space="preserve"> PAGEREF _Toc240532351 \h </w:instrText>
+        <w:instrText xml:space="preserve"> PAGEREF _Toc240533464 \h </w:instrText>
       </w:r>
       <w:r>
         <w:rPr>
@@ -2975,7 +2975,7 @@
         <w:rPr>
           <w:noProof/>
         </w:rPr>
-        <w:instrText xml:space="preserve"> PAGEREF _Toc240532352 \h </w:instrText>
+        <w:instrText xml:space="preserve"> PAGEREF _Toc240533465 \h </w:instrText>
       </w:r>
       <w:r>
         <w:rPr>
@@ -3036,7 +3036,7 @@
         <w:rPr>
           <w:noProof/>
         </w:rPr>
-        <w:instrText xml:space="preserve"> PAGEREF _Toc240532353 \h </w:instrText>
+        <w:instrText xml:space="preserve"> PAGEREF _Toc240533466 \h </w:instrText>
       </w:r>
       <w:r>
         <w:rPr>
@@ -3097,7 +3097,7 @@
         <w:rPr>
           <w:noProof/>
         </w:rPr>
-        <w:instrText xml:space="preserve"> PAGEREF _Toc240532354 \h </w:instrText>
+        <w:instrText xml:space="preserve"> PAGEREF _Toc240533467 \h </w:instrText>
       </w:r>
       <w:r>
         <w:rPr>
@@ -3140,7 +3140,7 @@
           <w:noProof/>
           <w:color w:val="B91D2E"/>
         </w:rPr>
-        <w:t>6.4.4 Meu Painel</w:t>
+        <w:t>Aviso automatico de silencio (e-mail e push)</w:t>
       </w:r>
       <w:r>
         <w:rPr>
@@ -3158,7 +3158,7 @@
         <w:rPr>
           <w:noProof/>
         </w:rPr>
-        <w:instrText xml:space="preserve"> PAGEREF _Toc240532355 \h </w:instrText>
+        <w:instrText xml:space="preserve"> PAGEREF _Toc240533468 \h </w:instrText>
       </w:r>
       <w:r>
         <w:rPr>
@@ -3201,7 +3201,7 @@
           <w:noProof/>
           <w:color w:val="B91D2E"/>
         </w:rPr>
-        <w:t>6.4.5 Gestao de Atividades</w:t>
+        <w:t>6.4.4 Meu Painel</w:t>
       </w:r>
       <w:r>
         <w:rPr>
@@ -3219,7 +3219,7 @@
         <w:rPr>
           <w:noProof/>
         </w:rPr>
-        <w:instrText xml:space="preserve"> PAGEREF _Toc240532356 \h </w:instrText>
+        <w:instrText xml:space="preserve"> PAGEREF _Toc240533469 \h </w:instrText>
       </w:r>
       <w:r>
         <w:rPr>
@@ -3236,7 +3236,7 @@
         <w:rPr>
           <w:noProof/>
         </w:rPr>
-        <w:t>101</w:t>
+        <w:t>99</w:t>
       </w:r>
       <w:r>
         <w:rPr>
@@ -3262,7 +3262,7 @@
           <w:noProof/>
           <w:color w:val="B91D2E"/>
         </w:rPr>
-        <w:t>6.5 Ambiente de Treino</w:t>
+        <w:t>6.4.5 Gestao de Atividades</w:t>
       </w:r>
       <w:r>
         <w:rPr>
@@ -3280,7 +3280,7 @@
         <w:rPr>
           <w:noProof/>
         </w:rPr>
-        <w:instrText xml:space="preserve"> PAGEREF _Toc240532357 \h </w:instrText>
+        <w:instrText xml:space="preserve"> PAGEREF _Toc240533470 \h </w:instrText>
       </w:r>
       <w:r>
         <w:rPr>
@@ -3297,7 +3297,7 @@
         <w:rPr>
           <w:noProof/>
         </w:rPr>
-        <w:t>103</w:t>
+        <w:t>102</w:t>
       </w:r>
       <w:r>
         <w:rPr>
@@ -3323,7 +3323,7 @@
           <w:noProof/>
           <w:color w:val="B91D2E"/>
         </w:rPr>
-        <w:t>6.6 Backup automatizado</w:t>
+        <w:t>6.5 Ambiente de Treino</w:t>
       </w:r>
       <w:r>
         <w:rPr>
@@ -3341,7 +3341,7 @@
         <w:rPr>
           <w:noProof/>
         </w:rPr>
-        <w:instrText xml:space="preserve"> PAGEREF _Toc240532358 \h </w:instrText>
+        <w:instrText xml:space="preserve"> PAGEREF _Toc240533471 \h </w:instrText>
       </w:r>
       <w:r>
         <w:rPr>
@@ -3358,7 +3358,7 @@
         <w:rPr>
           <w:noProof/>
         </w:rPr>
-        <w:t>103</w:t>
+        <w:t>104</w:t>
       </w:r>
       <w:r>
         <w:rPr>
@@ -3384,6 +3384,68 @@
           <w:noProof/>
           <w:color w:val="B91D2E"/>
         </w:rPr>
+        <w:t>6.6 Backup automatizado</w:t>
+      </w:r>
+      <w:r>
+        <w:rPr>
+          <w:noProof/>
+        </w:rPr>
+        <w:tab/>
+      </w:r>
+      <w:r>
+        <w:rPr>
+          <w:noProof/>
+        </w:rPr>
+        <w:fldChar w:fldCharType="begin"/>
+      </w:r>
+      <w:r>
+        <w:rPr>
+          <w:noProof/>
+        </w:rPr>
+        <w:instrText xml:space="preserve"> PAGEREF _Toc240533472 \h </w:instrText>
+      </w:r>
+      <w:r>
+        <w:rPr>
+          <w:noProof/>
+        </w:rPr>
+      </w:r>
+      <w:r>
+        <w:rPr>
+          <w:noProof/>
+        </w:rPr>
+        <w:fldChar w:fldCharType="separate"/>
+      </w:r>
+      <w:r>
+        <w:rPr>
+          <w:noProof/>
+        </w:rPr>
+        <w:t>104</w:t>
+      </w:r>
+      <w:r>
+        <w:rPr>
+          <w:noProof/>
+        </w:rPr>
+        <w:fldChar w:fldCharType="end"/>
+      </w:r>
+    </w:p>
+    <w:p>
+      <w:pPr>
+        <w:pStyle w:val="Sumrio2"/>
+        <w:tabs>
+          <w:tab w:val="right" w:leader="dot" w:pos="8828"/>
+        </w:tabs>
+        <w:rPr>
+          <w:noProof/>
+        </w:rPr>
+      </w:pPr>
+      <w:r>
+        <w:rPr>
+          <w:rFonts w:ascii="Montserrat" w:hAnsi="Montserrat"/>
+          <w:b/>
+          <w:noProof/>
+          <w:color w:val="B91D2E"/>
+        </w:rPr>
+        <w:lastRenderedPageBreak/>
         <w:t>6.7 Relatorio de Resultados</w:t>
       </w:r>
       <w:r>
@@ -3402,7 +3464,7 @@
         <w:rPr>
           <w:noProof/>
         </w:rPr>
-        <w:instrText xml:space="preserve"> PAGEREF _Toc240532359 \h </w:instrText>
+        <w:instrText xml:space="preserve"> PAGEREF _Toc240533473 \h </w:instrText>
       </w:r>
       <w:r>
         <w:rPr>
@@ -3419,7 +3481,7 @@
         <w:rPr>
           <w:noProof/>
         </w:rPr>
-        <w:t>105</w:t>
+        <w:t>106</w:t>
       </w:r>
       <w:r>
         <w:rPr>
@@ -3445,7 +3507,6 @@
           <w:noProof/>
           <w:color w:val="1A1A1A"/>
         </w:rPr>
-        <w:lastRenderedPageBreak/>
         <w:t>7. Perguntas frequentes</w:t>
       </w:r>
       <w:r>
@@ -3464,7 +3525,7 @@
         <w:rPr>
           <w:noProof/>
         </w:rPr>
-        <w:instrText xml:space="preserve"> PAGEREF _Toc240532360 \h </w:instrText>
+        <w:instrText xml:space="preserve"> PAGEREF _Toc240533474 \h </w:instrText>
       </w:r>
       <w:r>
         <w:rPr>
@@ -3481,7 +3542,7 @@
         <w:rPr>
           <w:noProof/>
         </w:rPr>
-        <w:t>108</w:t>
+        <w:t>109</w:t>
       </w:r>
       <w:r>
         <w:rPr>
@@ -3525,7 +3586,7 @@
         <w:rPr>
           <w:noProof/>
         </w:rPr>
-        <w:instrText xml:space="preserve"> PAGEREF _Toc240532361 \h </w:instrText>
+        <w:instrText xml:space="preserve"> PAGEREF _Toc240533475 \h </w:instrText>
       </w:r>
       <w:r>
         <w:rPr>
@@ -3542,7 +3603,7 @@
         <w:rPr>
           <w:noProof/>
         </w:rPr>
-        <w:t>109</w:t>
+        <w:t>110</w:t>
       </w:r>
       <w:r>
         <w:rPr>
@@ -3601,7 +3662,7 @@
           <w:sz w:val="34"/>
         </w:rPr>
       </w:pPr>
-      <w:bookmarkStart w:id="0" w:name="_Toc240532307"/>
+      <w:bookmarkStart w:id="0" w:name="_Toc240533420"/>
       <w:r>
         <w:rPr>
           <w:rFonts w:ascii="Montserrat" w:hAnsi="Montserrat"/>
@@ -3625,7 +3686,7 @@
           <w:sz w:val="27"/>
         </w:rPr>
       </w:pPr>
-      <w:bookmarkStart w:id="1" w:name="_Toc240532308"/>
+      <w:bookmarkStart w:id="1" w:name="_Toc240533421"/>
       <w:r>
         <w:rPr>
           <w:rFonts w:ascii="Montserrat" w:hAnsi="Montserrat"/>
@@ -5345,6 +5406,24 @@
           <w:color w:val="1A1A1A"/>
           <w:sz w:val="22"/>
         </w:rPr>
+        <w:t>Esta e a versao 2.86 do manual. Em relacao a versao 2.85 (17/09/2026), o aviso automatico de prazo (secao 6.4.3) ganhou um segundo mecanismo, de silencio: quando um marco ja comecou e fica 5 dias ou mais sem nenhuma atualizacao no campo Execucao, um e-mail avisa os mesmos destinatarios do aviso de prazo, repetindo a cada 5 dias enquanto continuar parado. Diferente do aviso de prazo (que so olha a data final), este dispara por causa da inatividade - fecha a lacuna de um marco com vencimento ainda distante que podia ficar semanas parado sem ninguem ser avisado.</w:t>
+      </w:r>
+    </w:p>
+    <w:p>
+      <w:pPr>
+        <w:spacing w:line="280" w:lineRule="auto"/>
+        <w:rPr>
+          <w:rFonts w:ascii="Montserrat" w:hAnsi="Montserrat"/>
+          <w:color w:val="1A1A1A"/>
+          <w:sz w:val="22"/>
+        </w:rPr>
+      </w:pPr>
+      <w:r>
+        <w:rPr>
+          <w:rFonts w:ascii="Montserrat" w:hAnsi="Montserrat"/>
+          <w:color w:val="1A1A1A"/>
+          <w:sz w:val="22"/>
+        </w:rPr>
         <w:t>O manual nao substitui as Diretrizes para a Gestao de Projetos da UNIALFA (documento institucional que define o framework D01 a D07) nem o documento Regras de Acesso e Permissoes (que detalha cada regra de controle de acesso); ele e o guia operacional de como usar cada ferramenta na pratica.</w:t>
       </w:r>
     </w:p>
@@ -5359,7 +5438,7 @@
           <w:sz w:val="27"/>
         </w:rPr>
       </w:pPr>
-      <w:bookmarkStart w:id="2" w:name="_Toc240532309"/>
+      <w:bookmarkStart w:id="2" w:name="_Toc240533422"/>
       <w:r>
         <w:rPr>
           <w:rFonts w:ascii="Montserrat" w:hAnsi="Montserrat"/>
@@ -5556,16 +5635,16 @@
         </w:rPr>
         <w:lastRenderedPageBreak/>
         <w:drawing>
-          <wp:inline distT="0" distB="0" distL="0" distR="0" wp14:anchorId="28BF37C2" wp14:editId="042D2C97">
+          <wp:inline distT="0" distB="0" distL="0" distR="0" wp14:anchorId="3FF95704" wp14:editId="3FB27D42">
             <wp:extent cx="5303520" cy="4792851"/>
             <wp:effectExtent l="19050" t="19050" r="11430" b="27305"/>
-            <wp:docPr id="112948044" name="Imagem 1"/>
+            <wp:docPr id="587430386" name="Imagem 1"/>
             <wp:cNvGraphicFramePr/>
             <a:graphic xmlns:a="http://schemas.openxmlformats.org/drawingml/2006/main">
               <a:graphicData uri="http://schemas.openxmlformats.org/drawingml/2006/picture">
                 <pic:pic xmlns:pic="http://schemas.openxmlformats.org/drawingml/2006/picture">
                   <pic:nvPicPr>
-                    <pic:cNvPr id="112948044" name=""/>
+                    <pic:cNvPr id="587430386" name=""/>
                     <pic:cNvPicPr/>
                   </pic:nvPicPr>
                   <pic:blipFill>
@@ -5633,7 +5712,7 @@
           <w:sz w:val="27"/>
         </w:rPr>
       </w:pPr>
-      <w:bookmarkStart w:id="3" w:name="_Toc240532310"/>
+      <w:bookmarkStart w:id="3" w:name="_Toc240533423"/>
       <w:r>
         <w:rPr>
           <w:rFonts w:ascii="Montserrat" w:hAnsi="Montserrat"/>
@@ -5674,16 +5753,16 @@
         </w:rPr>
         <w:lastRenderedPageBreak/>
         <w:drawing>
-          <wp:inline distT="0" distB="0" distL="0" distR="0" wp14:anchorId="25B5D049" wp14:editId="6317DC88">
+          <wp:inline distT="0" distB="0" distL="0" distR="0" wp14:anchorId="13F4CAAD" wp14:editId="5F1911C1">
             <wp:extent cx="4206240" cy="3801227"/>
             <wp:effectExtent l="19050" t="19050" r="22860" b="27940"/>
-            <wp:docPr id="798172568" name="Imagem 2"/>
+            <wp:docPr id="1979306800" name="Imagem 2"/>
             <wp:cNvGraphicFramePr/>
             <a:graphic xmlns:a="http://schemas.openxmlformats.org/drawingml/2006/main">
               <a:graphicData uri="http://schemas.openxmlformats.org/drawingml/2006/picture">
                 <pic:pic xmlns:pic="http://schemas.openxmlformats.org/drawingml/2006/picture">
                   <pic:nvPicPr>
-                    <pic:cNvPr id="798172568" name=""/>
+                    <pic:cNvPr id="1979306800" name=""/>
                     <pic:cNvPicPr/>
                   </pic:nvPicPr>
                   <pic:blipFill>
@@ -5856,7 +5935,7 @@
           <w:sz w:val="27"/>
         </w:rPr>
       </w:pPr>
-      <w:bookmarkStart w:id="4" w:name="_Toc240532311"/>
+      <w:bookmarkStart w:id="4" w:name="_Toc240533424"/>
       <w:r>
         <w:rPr>
           <w:rFonts w:ascii="Montserrat" w:hAnsi="Montserrat"/>
@@ -7095,7 +7174,7 @@
           <w:sz w:val="34"/>
         </w:rPr>
       </w:pPr>
-      <w:bookmarkStart w:id="5" w:name="_Toc240532312"/>
+      <w:bookmarkStart w:id="5" w:name="_Toc240533425"/>
       <w:r>
         <w:rPr>
           <w:rFonts w:ascii="Montserrat" w:hAnsi="Montserrat"/>
@@ -7119,7 +7198,7 @@
           <w:sz w:val="27"/>
         </w:rPr>
       </w:pPr>
-      <w:bookmarkStart w:id="6" w:name="_Toc240532313"/>
+      <w:bookmarkStart w:id="6" w:name="_Toc240533426"/>
       <w:r>
         <w:rPr>
           <w:rFonts w:ascii="Montserrat" w:hAnsi="Montserrat"/>
@@ -7160,7 +7239,7 @@
           <w:sz w:val="27"/>
         </w:rPr>
       </w:pPr>
-      <w:bookmarkStart w:id="7" w:name="_Toc240532314"/>
+      <w:bookmarkStart w:id="7" w:name="_Toc240533427"/>
       <w:r>
         <w:rPr>
           <w:rFonts w:ascii="Montserrat" w:hAnsi="Montserrat"/>
@@ -7279,7 +7358,7 @@
           <w:sz w:val="27"/>
         </w:rPr>
       </w:pPr>
-      <w:bookmarkStart w:id="8" w:name="_Toc240532315"/>
+      <w:bookmarkStart w:id="8" w:name="_Toc240533428"/>
       <w:r>
         <w:rPr>
           <w:rFonts w:ascii="Montserrat" w:hAnsi="Montserrat"/>
@@ -7892,7 +7971,7 @@
           <w:sz w:val="27"/>
         </w:rPr>
       </w:pPr>
-      <w:bookmarkStart w:id="9" w:name="_Toc240532316"/>
+      <w:bookmarkStart w:id="9" w:name="_Toc240533429"/>
       <w:r>
         <w:rPr>
           <w:rFonts w:ascii="Montserrat" w:hAnsi="Montserrat"/>
@@ -7981,16 +8060,16 @@
         </w:rPr>
         <w:lastRenderedPageBreak/>
         <w:drawing>
-          <wp:inline distT="0" distB="0" distL="0" distR="0" wp14:anchorId="2FB488BF" wp14:editId="531ADBF7">
+          <wp:inline distT="0" distB="0" distL="0" distR="0" wp14:anchorId="347B1049" wp14:editId="226DA73D">
             <wp:extent cx="4937760" cy="4462310"/>
             <wp:effectExtent l="19050" t="19050" r="15240" b="14605"/>
-            <wp:docPr id="837459821" name="Imagem 3"/>
+            <wp:docPr id="391696970" name="Imagem 3"/>
             <wp:cNvGraphicFramePr/>
             <a:graphic xmlns:a="http://schemas.openxmlformats.org/drawingml/2006/main">
               <a:graphicData uri="http://schemas.openxmlformats.org/drawingml/2006/picture">
                 <pic:pic xmlns:pic="http://schemas.openxmlformats.org/drawingml/2006/picture">
                   <pic:nvPicPr>
-                    <pic:cNvPr id="837459821" name=""/>
+                    <pic:cNvPr id="391696970" name=""/>
                     <pic:cNvPicPr/>
                   </pic:nvPicPr>
                   <pic:blipFill>
@@ -8058,7 +8137,7 @@
           <w:sz w:val="27"/>
         </w:rPr>
       </w:pPr>
-      <w:bookmarkStart w:id="10" w:name="_Toc240532317"/>
+      <w:bookmarkStart w:id="10" w:name="_Toc240533430"/>
       <w:r>
         <w:rPr>
           <w:rFonts w:ascii="Montserrat" w:hAnsi="Montserrat"/>
@@ -8099,16 +8178,16 @@
         </w:rPr>
         <w:lastRenderedPageBreak/>
         <w:drawing>
-          <wp:inline distT="0" distB="0" distL="0" distR="0" wp14:anchorId="6FCE3B93" wp14:editId="103B89B5">
+          <wp:inline distT="0" distB="0" distL="0" distR="0" wp14:anchorId="15105A31" wp14:editId="47DACA10">
             <wp:extent cx="5120640" cy="4627581"/>
             <wp:effectExtent l="19050" t="19050" r="22860" b="20955"/>
-            <wp:docPr id="293489662" name="Imagem 4"/>
+            <wp:docPr id="310352455" name="Imagem 4"/>
             <wp:cNvGraphicFramePr/>
             <a:graphic xmlns:a="http://schemas.openxmlformats.org/drawingml/2006/main">
               <a:graphicData uri="http://schemas.openxmlformats.org/drawingml/2006/picture">
                 <pic:pic xmlns:pic="http://schemas.openxmlformats.org/drawingml/2006/picture">
                   <pic:nvPicPr>
-                    <pic:cNvPr id="293489662" name=""/>
+                    <pic:cNvPr id="310352455" name=""/>
                     <pic:cNvPicPr/>
                   </pic:nvPicPr>
                   <pic:blipFill>
@@ -8291,7 +8370,7 @@
           <w:sz w:val="27"/>
         </w:rPr>
       </w:pPr>
-      <w:bookmarkStart w:id="11" w:name="_Toc240532318"/>
+      <w:bookmarkStart w:id="11" w:name="_Toc240533431"/>
       <w:r>
         <w:rPr>
           <w:rFonts w:ascii="Montserrat" w:hAnsi="Montserrat"/>
@@ -8331,16 +8410,16 @@
           <w:noProof/>
         </w:rPr>
         <w:drawing>
-          <wp:inline distT="0" distB="0" distL="0" distR="0" wp14:anchorId="39A5F5BE" wp14:editId="070B99CC">
+          <wp:inline distT="0" distB="0" distL="0" distR="0" wp14:anchorId="7E20C856" wp14:editId="329A28B9">
             <wp:extent cx="4206240" cy="3801227"/>
             <wp:effectExtent l="19050" t="19050" r="22860" b="27940"/>
-            <wp:docPr id="1635164158" name="Imagem 5"/>
+            <wp:docPr id="544452103" name="Imagem 5"/>
             <wp:cNvGraphicFramePr/>
             <a:graphic xmlns:a="http://schemas.openxmlformats.org/drawingml/2006/main">
               <a:graphicData uri="http://schemas.openxmlformats.org/drawingml/2006/picture">
                 <pic:pic xmlns:pic="http://schemas.openxmlformats.org/drawingml/2006/picture">
                   <pic:nvPicPr>
-                    <pic:cNvPr id="1635164158" name=""/>
+                    <pic:cNvPr id="544452103" name=""/>
                     <pic:cNvPicPr/>
                   </pic:nvPicPr>
                   <pic:blipFill>
@@ -8408,16 +8487,16 @@
         </w:rPr>
         <w:lastRenderedPageBreak/>
         <w:drawing>
-          <wp:inline distT="0" distB="0" distL="0" distR="0" wp14:anchorId="4239831B" wp14:editId="7FEB759A">
+          <wp:inline distT="0" distB="0" distL="0" distR="0" wp14:anchorId="61B9BB78" wp14:editId="6F58895A">
             <wp:extent cx="4206240" cy="3801227"/>
             <wp:effectExtent l="19050" t="19050" r="22860" b="27940"/>
-            <wp:docPr id="547555009" name="Imagem 6"/>
+            <wp:docPr id="1987647080" name="Imagem 6"/>
             <wp:cNvGraphicFramePr/>
             <a:graphic xmlns:a="http://schemas.openxmlformats.org/drawingml/2006/main">
               <a:graphicData uri="http://schemas.openxmlformats.org/drawingml/2006/picture">
                 <pic:pic xmlns:pic="http://schemas.openxmlformats.org/drawingml/2006/picture">
                   <pic:nvPicPr>
-                    <pic:cNvPr id="547555009" name=""/>
+                    <pic:cNvPr id="1987647080" name=""/>
                     <pic:cNvPicPr/>
                   </pic:nvPicPr>
                   <pic:blipFill>
@@ -8533,7 +8612,7 @@
           <w:sz w:val="27"/>
         </w:rPr>
       </w:pPr>
-      <w:bookmarkStart w:id="12" w:name="_Toc240532319"/>
+      <w:bookmarkStart w:id="12" w:name="_Toc240533432"/>
       <w:r>
         <w:rPr>
           <w:rFonts w:ascii="Montserrat" w:hAnsi="Montserrat"/>
@@ -8601,7 +8680,7 @@
           <w:sz w:val="27"/>
         </w:rPr>
       </w:pPr>
-      <w:bookmarkStart w:id="13" w:name="_Toc240532320"/>
+      <w:bookmarkStart w:id="13" w:name="_Toc240533433"/>
       <w:r>
         <w:rPr>
           <w:rFonts w:ascii="Montserrat" w:hAnsi="Montserrat"/>
@@ -8828,7 +8907,7 @@
           <w:sz w:val="27"/>
         </w:rPr>
       </w:pPr>
-      <w:bookmarkStart w:id="14" w:name="_Toc240532321"/>
+      <w:bookmarkStart w:id="14" w:name="_Toc240533434"/>
       <w:r>
         <w:rPr>
           <w:rFonts w:ascii="Montserrat" w:hAnsi="Montserrat"/>
@@ -8987,7 +9066,7 @@
           <w:sz w:val="27"/>
         </w:rPr>
       </w:pPr>
-      <w:bookmarkStart w:id="15" w:name="_Toc240532322"/>
+      <w:bookmarkStart w:id="15" w:name="_Toc240533435"/>
       <w:r>
         <w:rPr>
           <w:rFonts w:ascii="Montserrat" w:hAnsi="Montserrat"/>
@@ -9179,7 +9258,7 @@
           <w:sz w:val="27"/>
         </w:rPr>
       </w:pPr>
-      <w:bookmarkStart w:id="16" w:name="_Toc240532323"/>
+      <w:bookmarkStart w:id="16" w:name="_Toc240533436"/>
       <w:r>
         <w:rPr>
           <w:rFonts w:ascii="Montserrat" w:hAnsi="Montserrat"/>
@@ -9307,7 +9386,7 @@
           <w:sz w:val="27"/>
         </w:rPr>
       </w:pPr>
-      <w:bookmarkStart w:id="17" w:name="_Toc240532324"/>
+      <w:bookmarkStart w:id="17" w:name="_Toc240533437"/>
       <w:r>
         <w:rPr>
           <w:rFonts w:ascii="Montserrat" w:hAnsi="Montserrat"/>
@@ -9637,7 +9716,7 @@
           <w:sz w:val="27"/>
         </w:rPr>
       </w:pPr>
-      <w:bookmarkStart w:id="18" w:name="_Toc240532325"/>
+      <w:bookmarkStart w:id="18" w:name="_Toc240533438"/>
       <w:r>
         <w:rPr>
           <w:rFonts w:ascii="Montserrat" w:hAnsi="Montserrat"/>
@@ -9774,7 +9853,7 @@
           <w:sz w:val="27"/>
         </w:rPr>
       </w:pPr>
-      <w:bookmarkStart w:id="19" w:name="_Toc240532326"/>
+      <w:bookmarkStart w:id="19" w:name="_Toc240533439"/>
       <w:r>
         <w:rPr>
           <w:rFonts w:ascii="Montserrat" w:hAnsi="Montserrat"/>
@@ -10053,7 +10132,7 @@
           <w:sz w:val="27"/>
         </w:rPr>
       </w:pPr>
-      <w:bookmarkStart w:id="20" w:name="_Toc240532327"/>
+      <w:bookmarkStart w:id="20" w:name="_Toc240533440"/>
       <w:r>
         <w:rPr>
           <w:rFonts w:ascii="Montserrat" w:hAnsi="Montserrat"/>
@@ -10230,7 +10309,7 @@
           <w:sz w:val="27"/>
         </w:rPr>
       </w:pPr>
-      <w:bookmarkStart w:id="21" w:name="_Toc240532328"/>
+      <w:bookmarkStart w:id="21" w:name="_Toc240533441"/>
       <w:r>
         <w:rPr>
           <w:rFonts w:ascii="Montserrat" w:hAnsi="Montserrat"/>
@@ -10344,7 +10423,7 @@
           <w:sz w:val="34"/>
         </w:rPr>
       </w:pPr>
-      <w:bookmarkStart w:id="22" w:name="_Toc240532329"/>
+      <w:bookmarkStart w:id="22" w:name="_Toc240533442"/>
       <w:r>
         <w:rPr>
           <w:rFonts w:ascii="Montserrat" w:hAnsi="Montserrat"/>
@@ -10386,7 +10465,7 @@
           <w:sz w:val="27"/>
         </w:rPr>
       </w:pPr>
-      <w:bookmarkStart w:id="23" w:name="_Toc240532330"/>
+      <w:bookmarkStart w:id="23" w:name="_Toc240533443"/>
       <w:r>
         <w:rPr>
           <w:rFonts w:ascii="Montserrat" w:hAnsi="Montserrat"/>
@@ -11466,16 +11545,16 @@
         </w:rPr>
         <w:lastRenderedPageBreak/>
         <w:drawing>
-          <wp:inline distT="0" distB="0" distL="0" distR="0" wp14:anchorId="09E080A2" wp14:editId="11537308">
+          <wp:inline distT="0" distB="0" distL="0" distR="0" wp14:anchorId="703C227C" wp14:editId="32D12828">
             <wp:extent cx="5120640" cy="4627581"/>
             <wp:effectExtent l="19050" t="19050" r="22860" b="20955"/>
-            <wp:docPr id="1436640465" name="Imagem 7"/>
+            <wp:docPr id="2090550391" name="Imagem 7"/>
             <wp:cNvGraphicFramePr/>
             <a:graphic xmlns:a="http://schemas.openxmlformats.org/drawingml/2006/main">
               <a:graphicData uri="http://schemas.openxmlformats.org/drawingml/2006/picture">
                 <pic:pic xmlns:pic="http://schemas.openxmlformats.org/drawingml/2006/picture">
                   <pic:nvPicPr>
-                    <pic:cNvPr id="1436640465" name=""/>
+                    <pic:cNvPr id="2090550391" name=""/>
                     <pic:cNvPicPr/>
                   </pic:nvPicPr>
                   <pic:blipFill>
@@ -11543,16 +11622,16 @@
         </w:rPr>
         <w:lastRenderedPageBreak/>
         <w:drawing>
-          <wp:inline distT="0" distB="0" distL="0" distR="0" wp14:anchorId="463D1B74" wp14:editId="0CB9B468">
+          <wp:inline distT="0" distB="0" distL="0" distR="0" wp14:anchorId="6E6ED76E" wp14:editId="4F80E00C">
             <wp:extent cx="5120640" cy="4627581"/>
             <wp:effectExtent l="19050" t="19050" r="22860" b="20955"/>
-            <wp:docPr id="629524340" name="Imagem 8"/>
+            <wp:docPr id="791535652" name="Imagem 8"/>
             <wp:cNvGraphicFramePr/>
             <a:graphic xmlns:a="http://schemas.openxmlformats.org/drawingml/2006/main">
               <a:graphicData uri="http://schemas.openxmlformats.org/drawingml/2006/picture">
                 <pic:pic xmlns:pic="http://schemas.openxmlformats.org/drawingml/2006/picture">
                   <pic:nvPicPr>
-                    <pic:cNvPr id="629524340" name=""/>
+                    <pic:cNvPr id="791535652" name=""/>
                     <pic:cNvPicPr/>
                   </pic:nvPicPr>
                   <pic:blipFill>
@@ -11760,7 +11839,7 @@
           <w:sz w:val="27"/>
         </w:rPr>
       </w:pPr>
-      <w:bookmarkStart w:id="24" w:name="_Toc240532331"/>
+      <w:bookmarkStart w:id="24" w:name="_Toc240533444"/>
       <w:r>
         <w:rPr>
           <w:rFonts w:ascii="Montserrat" w:hAnsi="Montserrat"/>
@@ -12685,16 +12764,16 @@
           <w:noProof/>
         </w:rPr>
         <w:drawing>
-          <wp:inline distT="0" distB="0" distL="0" distR="0" wp14:anchorId="2273F57C" wp14:editId="1399CB5D">
+          <wp:inline distT="0" distB="0" distL="0" distR="0" wp14:anchorId="1B86F079" wp14:editId="6F49236A">
             <wp:extent cx="5120640" cy="4627581"/>
             <wp:effectExtent l="19050" t="19050" r="22860" b="20955"/>
-            <wp:docPr id="461479595" name="Imagem 9"/>
+            <wp:docPr id="1006115914" name="Imagem 9"/>
             <wp:cNvGraphicFramePr/>
             <a:graphic xmlns:a="http://schemas.openxmlformats.org/drawingml/2006/main">
               <a:graphicData uri="http://schemas.openxmlformats.org/drawingml/2006/picture">
                 <pic:pic xmlns:pic="http://schemas.openxmlformats.org/drawingml/2006/picture">
                   <pic:nvPicPr>
-                    <pic:cNvPr id="461479595" name=""/>
+                    <pic:cNvPr id="1006115914" name=""/>
                     <pic:cNvPicPr/>
                   </pic:nvPicPr>
                   <pic:blipFill>
@@ -12762,16 +12841,16 @@
         </w:rPr>
         <w:lastRenderedPageBreak/>
         <w:drawing>
-          <wp:inline distT="0" distB="0" distL="0" distR="0" wp14:anchorId="6A8C7A62" wp14:editId="7CE6FBAC">
+          <wp:inline distT="0" distB="0" distL="0" distR="0" wp14:anchorId="3C053E91" wp14:editId="4CCE4868">
             <wp:extent cx="5120640" cy="4627581"/>
             <wp:effectExtent l="19050" t="19050" r="22860" b="20955"/>
-            <wp:docPr id="1099894303" name="Imagem 10"/>
+            <wp:docPr id="41730275" name="Imagem 10"/>
             <wp:cNvGraphicFramePr/>
             <a:graphic xmlns:a="http://schemas.openxmlformats.org/drawingml/2006/main">
               <a:graphicData uri="http://schemas.openxmlformats.org/drawingml/2006/picture">
                 <pic:pic xmlns:pic="http://schemas.openxmlformats.org/drawingml/2006/picture">
                   <pic:nvPicPr>
-                    <pic:cNvPr id="1099894303" name=""/>
+                    <pic:cNvPr id="41730275" name=""/>
                     <pic:cNvPicPr/>
                   </pic:nvPicPr>
                   <pic:blipFill>
@@ -12905,7 +12984,7 @@
           <w:sz w:val="27"/>
         </w:rPr>
       </w:pPr>
-      <w:bookmarkStart w:id="25" w:name="_Toc240532332"/>
+      <w:bookmarkStart w:id="25" w:name="_Toc240533445"/>
       <w:r>
         <w:rPr>
           <w:rFonts w:ascii="Montserrat" w:hAnsi="Montserrat"/>
@@ -13990,16 +14069,16 @@
         </w:rPr>
         <w:lastRenderedPageBreak/>
         <w:drawing>
-          <wp:inline distT="0" distB="0" distL="0" distR="0" wp14:anchorId="35CF420C" wp14:editId="2BB4BBD3">
+          <wp:inline distT="0" distB="0" distL="0" distR="0" wp14:anchorId="110E3F14" wp14:editId="74517626">
             <wp:extent cx="5120640" cy="3338440"/>
             <wp:effectExtent l="19050" t="19050" r="22860" b="14605"/>
-            <wp:docPr id="2113924487" name="Imagem 11"/>
+            <wp:docPr id="154694690" name="Imagem 11"/>
             <wp:cNvGraphicFramePr/>
             <a:graphic xmlns:a="http://schemas.openxmlformats.org/drawingml/2006/main">
               <a:graphicData uri="http://schemas.openxmlformats.org/drawingml/2006/picture">
                 <pic:pic xmlns:pic="http://schemas.openxmlformats.org/drawingml/2006/picture">
                   <pic:nvPicPr>
-                    <pic:cNvPr id="2113924487" name=""/>
+                    <pic:cNvPr id="154694690" name=""/>
                     <pic:cNvPicPr/>
                   </pic:nvPicPr>
                   <pic:blipFill>
@@ -14067,16 +14146,16 @@
         </w:rPr>
         <w:lastRenderedPageBreak/>
         <w:drawing>
-          <wp:inline distT="0" distB="0" distL="0" distR="0" wp14:anchorId="0DCD6CAC" wp14:editId="69BBDE56">
+          <wp:inline distT="0" distB="0" distL="0" distR="0" wp14:anchorId="05D97AFB" wp14:editId="2921CAAE">
             <wp:extent cx="5120640" cy="4627581"/>
             <wp:effectExtent l="19050" t="19050" r="22860" b="20955"/>
-            <wp:docPr id="565897752" name="Imagem 12"/>
+            <wp:docPr id="821478588" name="Imagem 12"/>
             <wp:cNvGraphicFramePr/>
             <a:graphic xmlns:a="http://schemas.openxmlformats.org/drawingml/2006/main">
               <a:graphicData uri="http://schemas.openxmlformats.org/drawingml/2006/picture">
                 <pic:pic xmlns:pic="http://schemas.openxmlformats.org/drawingml/2006/picture">
                   <pic:nvPicPr>
-                    <pic:cNvPr id="565897752" name=""/>
+                    <pic:cNvPr id="821478588" name=""/>
                     <pic:cNvPicPr/>
                   </pic:nvPicPr>
                   <pic:blipFill>
@@ -14280,7 +14359,7 @@
           <w:sz w:val="27"/>
         </w:rPr>
       </w:pPr>
-      <w:bookmarkStart w:id="26" w:name="_Toc240532333"/>
+      <w:bookmarkStart w:id="26" w:name="_Toc240533446"/>
       <w:r>
         <w:rPr>
           <w:rFonts w:ascii="Montserrat" w:hAnsi="Montserrat"/>
@@ -14841,16 +14920,16 @@
           <w:noProof/>
         </w:rPr>
         <w:drawing>
-          <wp:inline distT="0" distB="0" distL="0" distR="0" wp14:anchorId="20CC4F15" wp14:editId="74CA6124">
+          <wp:inline distT="0" distB="0" distL="0" distR="0" wp14:anchorId="5DAB0AA6" wp14:editId="7CD36D61">
             <wp:extent cx="5120640" cy="4627581"/>
             <wp:effectExtent l="19050" t="19050" r="22860" b="20955"/>
-            <wp:docPr id="290037669" name="Imagem 13"/>
+            <wp:docPr id="858756615" name="Imagem 13"/>
             <wp:cNvGraphicFramePr/>
             <a:graphic xmlns:a="http://schemas.openxmlformats.org/drawingml/2006/main">
               <a:graphicData uri="http://schemas.openxmlformats.org/drawingml/2006/picture">
                 <pic:pic xmlns:pic="http://schemas.openxmlformats.org/drawingml/2006/picture">
                   <pic:nvPicPr>
-                    <pic:cNvPr id="290037669" name=""/>
+                    <pic:cNvPr id="858756615" name=""/>
                     <pic:cNvPicPr/>
                   </pic:nvPicPr>
                   <pic:blipFill>
@@ -14918,16 +14997,16 @@
         </w:rPr>
         <w:lastRenderedPageBreak/>
         <w:drawing>
-          <wp:inline distT="0" distB="0" distL="0" distR="0" wp14:anchorId="77A16D6D" wp14:editId="38A767A4">
+          <wp:inline distT="0" distB="0" distL="0" distR="0" wp14:anchorId="29A5EE59" wp14:editId="1E22BC85">
             <wp:extent cx="5120640" cy="4627581"/>
             <wp:effectExtent l="19050" t="19050" r="22860" b="20955"/>
-            <wp:docPr id="218919085" name="Imagem 14"/>
+            <wp:docPr id="302441448" name="Imagem 14"/>
             <wp:cNvGraphicFramePr/>
             <a:graphic xmlns:a="http://schemas.openxmlformats.org/drawingml/2006/main">
               <a:graphicData uri="http://schemas.openxmlformats.org/drawingml/2006/picture">
                 <pic:pic xmlns:pic="http://schemas.openxmlformats.org/drawingml/2006/picture">
                   <pic:nvPicPr>
-                    <pic:cNvPr id="218919085" name=""/>
+                    <pic:cNvPr id="302441448" name=""/>
                     <pic:cNvPicPr/>
                   </pic:nvPicPr>
                   <pic:blipFill>
@@ -15268,7 +15347,7 @@
           <w:sz w:val="27"/>
         </w:rPr>
       </w:pPr>
-      <w:bookmarkStart w:id="27" w:name="_Toc240532334"/>
+      <w:bookmarkStart w:id="27" w:name="_Toc240533447"/>
       <w:r>
         <w:rPr>
           <w:rFonts w:ascii="Montserrat" w:hAnsi="Montserrat"/>
@@ -15308,16 +15387,16 @@
           <w:noProof/>
         </w:rPr>
         <w:drawing>
-          <wp:inline distT="0" distB="0" distL="0" distR="0" wp14:anchorId="3ABF3553" wp14:editId="0D11491E">
+          <wp:inline distT="0" distB="0" distL="0" distR="0" wp14:anchorId="431C4295" wp14:editId="61B4BFB3">
             <wp:extent cx="5120640" cy="4627581"/>
             <wp:effectExtent l="19050" t="19050" r="22860" b="20955"/>
-            <wp:docPr id="813505992" name="Imagem 15"/>
+            <wp:docPr id="2096028679" name="Imagem 15"/>
             <wp:cNvGraphicFramePr/>
             <a:graphic xmlns:a="http://schemas.openxmlformats.org/drawingml/2006/main">
               <a:graphicData uri="http://schemas.openxmlformats.org/drawingml/2006/picture">
                 <pic:pic xmlns:pic="http://schemas.openxmlformats.org/drawingml/2006/picture">
                   <pic:nvPicPr>
-                    <pic:cNvPr id="813505992" name=""/>
+                    <pic:cNvPr id="2096028679" name=""/>
                     <pic:cNvPicPr/>
                   </pic:nvPicPr>
                   <pic:blipFill>
@@ -15385,16 +15464,16 @@
         </w:rPr>
         <w:lastRenderedPageBreak/>
         <w:drawing>
-          <wp:inline distT="0" distB="0" distL="0" distR="0" wp14:anchorId="3643B1F1" wp14:editId="7398884F">
+          <wp:inline distT="0" distB="0" distL="0" distR="0" wp14:anchorId="0C9B664F" wp14:editId="1D67CFCE">
             <wp:extent cx="5120640" cy="4627581"/>
             <wp:effectExtent l="19050" t="19050" r="22860" b="20955"/>
-            <wp:docPr id="1330787328" name="Imagem 16"/>
+            <wp:docPr id="820563370" name="Imagem 16"/>
             <wp:cNvGraphicFramePr/>
             <a:graphic xmlns:a="http://schemas.openxmlformats.org/drawingml/2006/main">
               <a:graphicData uri="http://schemas.openxmlformats.org/drawingml/2006/picture">
                 <pic:pic xmlns:pic="http://schemas.openxmlformats.org/drawingml/2006/picture">
                   <pic:nvPicPr>
-                    <pic:cNvPr id="1330787328" name=""/>
+                    <pic:cNvPr id="820563370" name=""/>
                     <pic:cNvPicPr/>
                   </pic:nvPicPr>
                   <pic:blipFill>
@@ -15558,16 +15637,16 @@
         </w:rPr>
         <w:lastRenderedPageBreak/>
         <w:drawing>
-          <wp:inline distT="0" distB="0" distL="0" distR="0" wp14:anchorId="64269912" wp14:editId="627A950E">
+          <wp:inline distT="0" distB="0" distL="0" distR="0" wp14:anchorId="291F41E9" wp14:editId="6E437735">
             <wp:extent cx="5120640" cy="3282818"/>
             <wp:effectExtent l="19050" t="19050" r="22860" b="13335"/>
-            <wp:docPr id="737322409" name="Imagem 17"/>
+            <wp:docPr id="961814141" name="Imagem 17"/>
             <wp:cNvGraphicFramePr/>
             <a:graphic xmlns:a="http://schemas.openxmlformats.org/drawingml/2006/main">
               <a:graphicData uri="http://schemas.openxmlformats.org/drawingml/2006/picture">
                 <pic:pic xmlns:pic="http://schemas.openxmlformats.org/drawingml/2006/picture">
                   <pic:nvPicPr>
-                    <pic:cNvPr id="737322409" name=""/>
+                    <pic:cNvPr id="961814141" name=""/>
                     <pic:cNvPicPr/>
                   </pic:nvPicPr>
                   <pic:blipFill>
@@ -15633,8 +15712,18 @@
         </w:numPr>
         <w:spacing w:after="80" w:line="260" w:lineRule="auto"/>
         <w:ind w:left="700"/>
-      </w:pPr>
-      <w:r>
+        <w:rPr>
+          <w:rFonts w:ascii="Montserrat" w:hAnsi="Montserrat"/>
+          <w:color w:val="1A1A1A"/>
+          <w:sz w:val="22"/>
+        </w:rPr>
+      </w:pPr>
+      <w:r>
+        <w:rPr>
+          <w:rFonts w:ascii="Montserrat" w:hAnsi="Montserrat"/>
+          <w:color w:val="1A1A1A"/>
+          <w:sz w:val="22"/>
+        </w:rPr>
         <w:t>Status automatico da entrega: ao clicar em Visualizar arvore (ou ao abrir uma EAP ja registrada), cada Entrega (nivel 2) ganha um selo - Concluida, Atrasada, No prazo ou Sem cronograma vinculado - calculado automaticamente a partir do cronograma do Planejamento (Passo 4), casando pelo nome da entrega com o nome do marco. Nao ha nenhum campo novo para preencher na EAP: uma entrega fica Concluida se o marco correspondente tiver Conclusao real preenchida no cronograma, Atrasada se nao tiver conclusao e o Termino previsto ja tiver passado, e Sem cronograma vinculado se nao houver marco com o mesmo nome. Um resumo no topo da arvore mostra o percentual de entregas concluidas do projeto.</w:t>
       </w:r>
     </w:p>
@@ -15748,7 +15837,7 @@
           <w:sz w:val="27"/>
         </w:rPr>
       </w:pPr>
-      <w:bookmarkStart w:id="28" w:name="_Toc240532335"/>
+      <w:bookmarkStart w:id="28" w:name="_Toc240533448"/>
       <w:r>
         <w:rPr>
           <w:rFonts w:ascii="Montserrat" w:hAnsi="Montserrat"/>
@@ -15788,16 +15877,16 @@
           <w:noProof/>
         </w:rPr>
         <w:drawing>
-          <wp:inline distT="0" distB="0" distL="0" distR="0" wp14:anchorId="0C82608C" wp14:editId="5586C564">
+          <wp:inline distT="0" distB="0" distL="0" distR="0" wp14:anchorId="12CEB040" wp14:editId="389343B9">
             <wp:extent cx="5120640" cy="4627581"/>
             <wp:effectExtent l="19050" t="19050" r="22860" b="20955"/>
-            <wp:docPr id="1663229197" name="Imagem 18"/>
+            <wp:docPr id="385811409" name="Imagem 18"/>
             <wp:cNvGraphicFramePr/>
             <a:graphic xmlns:a="http://schemas.openxmlformats.org/drawingml/2006/main">
               <a:graphicData uri="http://schemas.openxmlformats.org/drawingml/2006/picture">
                 <pic:pic xmlns:pic="http://schemas.openxmlformats.org/drawingml/2006/picture">
                   <pic:nvPicPr>
-                    <pic:cNvPr id="1663229197" name=""/>
+                    <pic:cNvPr id="385811409" name=""/>
                     <pic:cNvPicPr/>
                   </pic:nvPicPr>
                   <pic:blipFill>
@@ -15865,16 +15954,16 @@
         </w:rPr>
         <w:lastRenderedPageBreak/>
         <w:drawing>
-          <wp:inline distT="0" distB="0" distL="0" distR="0" wp14:anchorId="7511633A" wp14:editId="630348AD">
+          <wp:inline distT="0" distB="0" distL="0" distR="0" wp14:anchorId="6CAF86D8" wp14:editId="7E2E4221">
             <wp:extent cx="5120640" cy="4627581"/>
             <wp:effectExtent l="19050" t="19050" r="22860" b="20955"/>
-            <wp:docPr id="1735535561" name="Imagem 19"/>
+            <wp:docPr id="665823667" name="Imagem 19"/>
             <wp:cNvGraphicFramePr/>
             <a:graphic xmlns:a="http://schemas.openxmlformats.org/drawingml/2006/main">
               <a:graphicData uri="http://schemas.openxmlformats.org/drawingml/2006/picture">
                 <pic:pic xmlns:pic="http://schemas.openxmlformats.org/drawingml/2006/picture">
                   <pic:nvPicPr>
-                    <pic:cNvPr id="1735535561" name=""/>
+                    <pic:cNvPr id="665823667" name=""/>
                     <pic:cNvPicPr/>
                   </pic:nvPicPr>
                   <pic:blipFill>
@@ -16057,7 +16146,7 @@
           <w:sz w:val="27"/>
         </w:rPr>
       </w:pPr>
-      <w:bookmarkStart w:id="29" w:name="_Toc240532336"/>
+      <w:bookmarkStart w:id="29" w:name="_Toc240533449"/>
       <w:r>
         <w:rPr>
           <w:rFonts w:ascii="Montserrat" w:hAnsi="Montserrat"/>
@@ -16097,16 +16186,16 @@
           <w:noProof/>
         </w:rPr>
         <w:drawing>
-          <wp:inline distT="0" distB="0" distL="0" distR="0" wp14:anchorId="168D33C6" wp14:editId="4E8939DD">
+          <wp:inline distT="0" distB="0" distL="0" distR="0" wp14:anchorId="1E103CB1" wp14:editId="5C76B413">
             <wp:extent cx="5120640" cy="4627581"/>
             <wp:effectExtent l="19050" t="19050" r="22860" b="20955"/>
-            <wp:docPr id="534393430" name="Imagem 20"/>
+            <wp:docPr id="1537368409" name="Imagem 20"/>
             <wp:cNvGraphicFramePr/>
             <a:graphic xmlns:a="http://schemas.openxmlformats.org/drawingml/2006/main">
               <a:graphicData uri="http://schemas.openxmlformats.org/drawingml/2006/picture">
                 <pic:pic xmlns:pic="http://schemas.openxmlformats.org/drawingml/2006/picture">
                   <pic:nvPicPr>
-                    <pic:cNvPr id="534393430" name=""/>
+                    <pic:cNvPr id="1537368409" name=""/>
                     <pic:cNvPicPr/>
                   </pic:nvPicPr>
                   <pic:blipFill>
@@ -16174,16 +16263,16 @@
         </w:rPr>
         <w:lastRenderedPageBreak/>
         <w:drawing>
-          <wp:inline distT="0" distB="0" distL="0" distR="0" wp14:anchorId="1C99E665" wp14:editId="173F9099">
+          <wp:inline distT="0" distB="0" distL="0" distR="0" wp14:anchorId="76FA0A9C" wp14:editId="3F6D1AE7">
             <wp:extent cx="5120640" cy="4627581"/>
             <wp:effectExtent l="19050" t="19050" r="22860" b="20955"/>
-            <wp:docPr id="650133252" name="Imagem 21"/>
+            <wp:docPr id="1561598171" name="Imagem 21"/>
             <wp:cNvGraphicFramePr/>
             <a:graphic xmlns:a="http://schemas.openxmlformats.org/drawingml/2006/main">
               <a:graphicData uri="http://schemas.openxmlformats.org/drawingml/2006/picture">
                 <pic:pic xmlns:pic="http://schemas.openxmlformats.org/drawingml/2006/picture">
                   <pic:nvPicPr>
-                    <pic:cNvPr id="650133252" name=""/>
+                    <pic:cNvPr id="1561598171" name=""/>
                     <pic:cNvPicPr/>
                   </pic:nvPicPr>
                   <pic:blipFill>
@@ -16389,16 +16478,16 @@
           <w:noProof/>
         </w:rPr>
         <w:drawing>
-          <wp:inline distT="0" distB="0" distL="0" distR="0" wp14:anchorId="7D9709F8" wp14:editId="074C05B7">
+          <wp:inline distT="0" distB="0" distL="0" distR="0" wp14:anchorId="6D375B49" wp14:editId="0CD2B757">
             <wp:extent cx="5120640" cy="1757287"/>
             <wp:effectExtent l="19050" t="19050" r="22860" b="14605"/>
-            <wp:docPr id="1874087592" name="Imagem 22"/>
+            <wp:docPr id="1136601988" name="Imagem 22"/>
             <wp:cNvGraphicFramePr/>
             <a:graphic xmlns:a="http://schemas.openxmlformats.org/drawingml/2006/main">
               <a:graphicData uri="http://schemas.openxmlformats.org/drawingml/2006/picture">
                 <pic:pic xmlns:pic="http://schemas.openxmlformats.org/drawingml/2006/picture">
                   <pic:nvPicPr>
-                    <pic:cNvPr id="1874087592" name=""/>
+                    <pic:cNvPr id="1136601988" name=""/>
                     <pic:cNvPicPr/>
                   </pic:nvPicPr>
                   <pic:blipFill>
@@ -16511,7 +16600,7 @@
           <w:sz w:val="27"/>
         </w:rPr>
       </w:pPr>
-      <w:bookmarkStart w:id="30" w:name="_Toc240532337"/>
+      <w:bookmarkStart w:id="30" w:name="_Toc240533450"/>
       <w:r>
         <w:rPr>
           <w:rFonts w:ascii="Montserrat" w:hAnsi="Montserrat"/>
@@ -16552,16 +16641,16 @@
         </w:rPr>
         <w:lastRenderedPageBreak/>
         <w:drawing>
-          <wp:inline distT="0" distB="0" distL="0" distR="0" wp14:anchorId="621CFF86" wp14:editId="1682217B">
+          <wp:inline distT="0" distB="0" distL="0" distR="0" wp14:anchorId="64445A6C" wp14:editId="4C21C994">
             <wp:extent cx="5120640" cy="4627581"/>
             <wp:effectExtent l="19050" t="19050" r="22860" b="20955"/>
-            <wp:docPr id="1883951483" name="Imagem 23"/>
+            <wp:docPr id="308507439" name="Imagem 23"/>
             <wp:cNvGraphicFramePr/>
             <a:graphic xmlns:a="http://schemas.openxmlformats.org/drawingml/2006/main">
               <a:graphicData uri="http://schemas.openxmlformats.org/drawingml/2006/picture">
                 <pic:pic xmlns:pic="http://schemas.openxmlformats.org/drawingml/2006/picture">
                   <pic:nvPicPr>
-                    <pic:cNvPr id="1883951483" name=""/>
+                    <pic:cNvPr id="308507439" name=""/>
                     <pic:cNvPicPr/>
                   </pic:nvPicPr>
                   <pic:blipFill>
@@ -16629,16 +16718,16 @@
         </w:rPr>
         <w:lastRenderedPageBreak/>
         <w:drawing>
-          <wp:inline distT="0" distB="0" distL="0" distR="0" wp14:anchorId="3F175DEE" wp14:editId="72F6860D">
+          <wp:inline distT="0" distB="0" distL="0" distR="0" wp14:anchorId="666596CE" wp14:editId="5BAE4079">
             <wp:extent cx="5120640" cy="4627581"/>
             <wp:effectExtent l="19050" t="19050" r="22860" b="20955"/>
-            <wp:docPr id="1806675231" name="Imagem 24"/>
+            <wp:docPr id="2055616634" name="Imagem 24"/>
             <wp:cNvGraphicFramePr/>
             <a:graphic xmlns:a="http://schemas.openxmlformats.org/drawingml/2006/main">
               <a:graphicData uri="http://schemas.openxmlformats.org/drawingml/2006/picture">
                 <pic:pic xmlns:pic="http://schemas.openxmlformats.org/drawingml/2006/picture">
                   <pic:nvPicPr>
-                    <pic:cNvPr id="1806675231" name=""/>
+                    <pic:cNvPr id="2055616634" name=""/>
                     <pic:cNvPicPr/>
                   </pic:nvPicPr>
                   <pic:blipFill>
@@ -16875,7 +16964,7 @@
           <w:sz w:val="27"/>
         </w:rPr>
       </w:pPr>
-      <w:bookmarkStart w:id="31" w:name="_Toc240532338"/>
+      <w:bookmarkStart w:id="31" w:name="_Toc240533451"/>
       <w:r>
         <w:rPr>
           <w:rFonts w:ascii="Montserrat" w:hAnsi="Montserrat"/>
@@ -16915,16 +17004,16 @@
           <w:noProof/>
         </w:rPr>
         <w:drawing>
-          <wp:inline distT="0" distB="0" distL="0" distR="0" wp14:anchorId="0408A65C" wp14:editId="6A4B9734">
+          <wp:inline distT="0" distB="0" distL="0" distR="0" wp14:anchorId="4042375F" wp14:editId="3966EF43">
             <wp:extent cx="5120640" cy="4627581"/>
             <wp:effectExtent l="19050" t="19050" r="22860" b="20955"/>
-            <wp:docPr id="431577049" name="Imagem 25"/>
+            <wp:docPr id="1115056875" name="Imagem 25"/>
             <wp:cNvGraphicFramePr/>
             <a:graphic xmlns:a="http://schemas.openxmlformats.org/drawingml/2006/main">
               <a:graphicData uri="http://schemas.openxmlformats.org/drawingml/2006/picture">
                 <pic:pic xmlns:pic="http://schemas.openxmlformats.org/drawingml/2006/picture">
                   <pic:nvPicPr>
-                    <pic:cNvPr id="431577049" name=""/>
+                    <pic:cNvPr id="1115056875" name=""/>
                     <pic:cNvPicPr/>
                   </pic:nvPicPr>
                   <pic:blipFill>
@@ -16992,16 +17081,16 @@
         </w:rPr>
         <w:lastRenderedPageBreak/>
         <w:drawing>
-          <wp:inline distT="0" distB="0" distL="0" distR="0" wp14:anchorId="7A4F60C8" wp14:editId="3EF4975E">
+          <wp:inline distT="0" distB="0" distL="0" distR="0" wp14:anchorId="2D6304FE" wp14:editId="05163030">
             <wp:extent cx="5120640" cy="4627581"/>
             <wp:effectExtent l="19050" t="19050" r="22860" b="20955"/>
-            <wp:docPr id="835533801" name="Imagem 26"/>
+            <wp:docPr id="1263298313" name="Imagem 26"/>
             <wp:cNvGraphicFramePr/>
             <a:graphic xmlns:a="http://schemas.openxmlformats.org/drawingml/2006/main">
               <a:graphicData uri="http://schemas.openxmlformats.org/drawingml/2006/picture">
                 <pic:pic xmlns:pic="http://schemas.openxmlformats.org/drawingml/2006/picture">
                   <pic:nvPicPr>
-                    <pic:cNvPr id="835533801" name=""/>
+                    <pic:cNvPr id="1263298313" name=""/>
                     <pic:cNvPicPr/>
                   </pic:nvPicPr>
                   <pic:blipFill>
@@ -17192,7 +17281,7 @@
           <w:sz w:val="27"/>
         </w:rPr>
       </w:pPr>
-      <w:bookmarkStart w:id="32" w:name="_Toc240532339"/>
+      <w:bookmarkStart w:id="32" w:name="_Toc240533452"/>
       <w:r>
         <w:rPr>
           <w:rFonts w:ascii="Montserrat" w:hAnsi="Montserrat"/>
@@ -17232,16 +17321,16 @@
           <w:noProof/>
         </w:rPr>
         <w:drawing>
-          <wp:inline distT="0" distB="0" distL="0" distR="0" wp14:anchorId="2958DBB0" wp14:editId="25CB3636">
+          <wp:inline distT="0" distB="0" distL="0" distR="0" wp14:anchorId="1234AD6F" wp14:editId="63C7496B">
             <wp:extent cx="5120640" cy="4000682"/>
             <wp:effectExtent l="19050" t="19050" r="22860" b="19050"/>
-            <wp:docPr id="854388804" name="Imagem 27"/>
+            <wp:docPr id="1707858560" name="Imagem 27"/>
             <wp:cNvGraphicFramePr/>
             <a:graphic xmlns:a="http://schemas.openxmlformats.org/drawingml/2006/main">
               <a:graphicData uri="http://schemas.openxmlformats.org/drawingml/2006/picture">
                 <pic:pic xmlns:pic="http://schemas.openxmlformats.org/drawingml/2006/picture">
                   <pic:nvPicPr>
-                    <pic:cNvPr id="854388804" name=""/>
+                    <pic:cNvPr id="1707858560" name=""/>
                     <pic:cNvPicPr/>
                   </pic:nvPicPr>
                   <pic:blipFill>
@@ -17765,7 +17854,7 @@
           <w:sz w:val="34"/>
         </w:rPr>
       </w:pPr>
-      <w:bookmarkStart w:id="33" w:name="_Toc240532340"/>
+      <w:bookmarkStart w:id="33" w:name="_Toc240533453"/>
       <w:r>
         <w:rPr>
           <w:rFonts w:ascii="Montserrat" w:hAnsi="Montserrat"/>
@@ -17807,7 +17896,7 @@
           <w:sz w:val="27"/>
         </w:rPr>
       </w:pPr>
-      <w:bookmarkStart w:id="34" w:name="_Toc240532341"/>
+      <w:bookmarkStart w:id="34" w:name="_Toc240533454"/>
       <w:r>
         <w:rPr>
           <w:rFonts w:ascii="Montserrat" w:hAnsi="Montserrat"/>
@@ -17847,16 +17936,16 @@
           <w:noProof/>
         </w:rPr>
         <w:drawing>
-          <wp:inline distT="0" distB="0" distL="0" distR="0" wp14:anchorId="1E15410B" wp14:editId="4FF68268">
+          <wp:inline distT="0" distB="0" distL="0" distR="0" wp14:anchorId="7DA36D45" wp14:editId="38B20DD9">
             <wp:extent cx="5120640" cy="4627581"/>
             <wp:effectExtent l="19050" t="19050" r="22860" b="20955"/>
-            <wp:docPr id="1613119061" name="Imagem 28"/>
+            <wp:docPr id="1157595342" name="Imagem 28"/>
             <wp:cNvGraphicFramePr/>
             <a:graphic xmlns:a="http://schemas.openxmlformats.org/drawingml/2006/main">
               <a:graphicData uri="http://schemas.openxmlformats.org/drawingml/2006/picture">
                 <pic:pic xmlns:pic="http://schemas.openxmlformats.org/drawingml/2006/picture">
                   <pic:nvPicPr>
-                    <pic:cNvPr id="1613119061" name=""/>
+                    <pic:cNvPr id="1157595342" name=""/>
                     <pic:cNvPicPr/>
                   </pic:nvPicPr>
                   <pic:blipFill>
@@ -17924,16 +18013,16 @@
         </w:rPr>
         <w:lastRenderedPageBreak/>
         <w:drawing>
-          <wp:inline distT="0" distB="0" distL="0" distR="0" wp14:anchorId="396F3F2F" wp14:editId="5EEAA763">
+          <wp:inline distT="0" distB="0" distL="0" distR="0" wp14:anchorId="1235580E" wp14:editId="5CE2CAD1">
             <wp:extent cx="5120640" cy="4627581"/>
             <wp:effectExtent l="19050" t="19050" r="22860" b="20955"/>
-            <wp:docPr id="910720728" name="Imagem 29"/>
+            <wp:docPr id="1109383760" name="Imagem 29"/>
             <wp:cNvGraphicFramePr/>
             <a:graphic xmlns:a="http://schemas.openxmlformats.org/drawingml/2006/main">
               <a:graphicData uri="http://schemas.openxmlformats.org/drawingml/2006/picture">
                 <pic:pic xmlns:pic="http://schemas.openxmlformats.org/drawingml/2006/picture">
                   <pic:nvPicPr>
-                    <pic:cNvPr id="910720728" name=""/>
+                    <pic:cNvPr id="1109383760" name=""/>
                     <pic:cNvPicPr/>
                   </pic:nvPicPr>
                   <pic:blipFill>
@@ -18001,16 +18090,16 @@
         </w:rPr>
         <w:lastRenderedPageBreak/>
         <w:drawing>
-          <wp:inline distT="0" distB="0" distL="0" distR="0" wp14:anchorId="0275FFAA" wp14:editId="3756A29E">
+          <wp:inline distT="0" distB="0" distL="0" distR="0" wp14:anchorId="2FFE0B1B" wp14:editId="2316E8C3">
             <wp:extent cx="5120640" cy="4627581"/>
             <wp:effectExtent l="19050" t="19050" r="22860" b="20955"/>
-            <wp:docPr id="1110652849" name="Imagem 30"/>
+            <wp:docPr id="1864248236" name="Imagem 30"/>
             <wp:cNvGraphicFramePr/>
             <a:graphic xmlns:a="http://schemas.openxmlformats.org/drawingml/2006/main">
               <a:graphicData uri="http://schemas.openxmlformats.org/drawingml/2006/picture">
                 <pic:pic xmlns:pic="http://schemas.openxmlformats.org/drawingml/2006/picture">
                   <pic:nvPicPr>
-                    <pic:cNvPr id="1110652849" name=""/>
+                    <pic:cNvPr id="1864248236" name=""/>
                     <pic:cNvPicPr/>
                   </pic:nvPicPr>
                   <pic:blipFill>
@@ -18212,16 +18301,16 @@
           <w:noProof/>
         </w:rPr>
         <w:drawing>
-          <wp:inline distT="0" distB="0" distL="0" distR="0" wp14:anchorId="6949DDB3" wp14:editId="34112375">
+          <wp:inline distT="0" distB="0" distL="0" distR="0" wp14:anchorId="33CE748C" wp14:editId="7C5C6117">
             <wp:extent cx="5120640" cy="1715571"/>
             <wp:effectExtent l="19050" t="19050" r="22860" b="18415"/>
-            <wp:docPr id="497286488" name="Imagem 31"/>
+            <wp:docPr id="625699793" name="Imagem 31"/>
             <wp:cNvGraphicFramePr/>
             <a:graphic xmlns:a="http://schemas.openxmlformats.org/drawingml/2006/main">
               <a:graphicData uri="http://schemas.openxmlformats.org/drawingml/2006/picture">
                 <pic:pic xmlns:pic="http://schemas.openxmlformats.org/drawingml/2006/picture">
                   <pic:nvPicPr>
-                    <pic:cNvPr id="497286488" name=""/>
+                    <pic:cNvPr id="625699793" name=""/>
                     <pic:cNvPicPr/>
                   </pic:nvPicPr>
                   <pic:blipFill>
@@ -18358,16 +18447,16 @@
           <w:noProof/>
         </w:rPr>
         <w:drawing>
-          <wp:inline distT="0" distB="0" distL="0" distR="0" wp14:anchorId="0F007B52" wp14:editId="678C29B2">
+          <wp:inline distT="0" distB="0" distL="0" distR="0" wp14:anchorId="139F0936" wp14:editId="0CCA53B2">
             <wp:extent cx="5120640" cy="3282818"/>
             <wp:effectExtent l="19050" t="19050" r="22860" b="13335"/>
-            <wp:docPr id="1932124730" name="Imagem 32"/>
+            <wp:docPr id="1790983737" name="Imagem 32"/>
             <wp:cNvGraphicFramePr/>
             <a:graphic xmlns:a="http://schemas.openxmlformats.org/drawingml/2006/main">
               <a:graphicData uri="http://schemas.openxmlformats.org/drawingml/2006/picture">
                 <pic:pic xmlns:pic="http://schemas.openxmlformats.org/drawingml/2006/picture">
                   <pic:nvPicPr>
-                    <pic:cNvPr id="1932124730" name=""/>
+                    <pic:cNvPr id="1790983737" name=""/>
                     <pic:cNvPicPr/>
                   </pic:nvPicPr>
                   <pic:blipFill>
@@ -18501,16 +18590,16 @@
           <w:noProof/>
         </w:rPr>
         <w:drawing>
-          <wp:inline distT="0" distB="0" distL="0" distR="0" wp14:anchorId="2CC0CC94" wp14:editId="282811CB">
+          <wp:inline distT="0" distB="0" distL="0" distR="0" wp14:anchorId="39FD0AEC" wp14:editId="7F317A9C">
             <wp:extent cx="5120640" cy="951357"/>
             <wp:effectExtent l="19050" t="19050" r="22860" b="20320"/>
-            <wp:docPr id="2055688744" name="Imagem 33"/>
+            <wp:docPr id="1512951966" name="Imagem 33"/>
             <wp:cNvGraphicFramePr/>
             <a:graphic xmlns:a="http://schemas.openxmlformats.org/drawingml/2006/main">
               <a:graphicData uri="http://schemas.openxmlformats.org/drawingml/2006/picture">
                 <pic:pic xmlns:pic="http://schemas.openxmlformats.org/drawingml/2006/picture">
                   <pic:nvPicPr>
-                    <pic:cNvPr id="2055688744" name=""/>
+                    <pic:cNvPr id="1512951966" name=""/>
                     <pic:cNvPicPr/>
                   </pic:nvPicPr>
                   <pic:blipFill>
@@ -18674,16 +18763,16 @@
           <w:noProof/>
         </w:rPr>
         <w:drawing>
-          <wp:inline distT="0" distB="0" distL="0" distR="0" wp14:anchorId="2EAE814C" wp14:editId="6666E4CE">
+          <wp:inline distT="0" distB="0" distL="0" distR="0" wp14:anchorId="77FB6520" wp14:editId="182C9DB0">
             <wp:extent cx="5120640" cy="1515102"/>
             <wp:effectExtent l="19050" t="19050" r="22860" b="28575"/>
-            <wp:docPr id="268896839" name="Imagem 34"/>
+            <wp:docPr id="128781152" name="Imagem 34"/>
             <wp:cNvGraphicFramePr/>
             <a:graphic xmlns:a="http://schemas.openxmlformats.org/drawingml/2006/main">
               <a:graphicData uri="http://schemas.openxmlformats.org/drawingml/2006/picture">
                 <pic:pic xmlns:pic="http://schemas.openxmlformats.org/drawingml/2006/picture">
                   <pic:nvPicPr>
-                    <pic:cNvPr id="268896839" name=""/>
+                    <pic:cNvPr id="128781152" name=""/>
                     <pic:cNvPicPr/>
                   </pic:nvPicPr>
                   <pic:blipFill>
@@ -18795,16 +18884,16 @@
           <w:noProof/>
         </w:rPr>
         <w:drawing>
-          <wp:inline distT="0" distB="0" distL="0" distR="0" wp14:anchorId="22AB6788" wp14:editId="52AF38CE">
+          <wp:inline distT="0" distB="0" distL="0" distR="0" wp14:anchorId="237A4804" wp14:editId="53D9F164">
             <wp:extent cx="5120640" cy="1391113"/>
             <wp:effectExtent l="19050" t="19050" r="22860" b="19050"/>
-            <wp:docPr id="971517083" name="Imagem 35"/>
+            <wp:docPr id="832010126" name="Imagem 35"/>
             <wp:cNvGraphicFramePr/>
             <a:graphic xmlns:a="http://schemas.openxmlformats.org/drawingml/2006/main">
               <a:graphicData uri="http://schemas.openxmlformats.org/drawingml/2006/picture">
                 <pic:pic xmlns:pic="http://schemas.openxmlformats.org/drawingml/2006/picture">
                   <pic:nvPicPr>
-                    <pic:cNvPr id="971517083" name=""/>
+                    <pic:cNvPr id="832010126" name=""/>
                     <pic:cNvPicPr/>
                   </pic:nvPicPr>
                   <pic:blipFill>
@@ -18926,16 +19015,16 @@
           <w:noProof/>
         </w:rPr>
         <w:drawing>
-          <wp:inline distT="0" distB="0" distL="0" distR="0" wp14:anchorId="5CD1D045" wp14:editId="3DB00622">
+          <wp:inline distT="0" distB="0" distL="0" distR="0" wp14:anchorId="3DAF692F" wp14:editId="74F29EF8">
             <wp:extent cx="5120640" cy="1125174"/>
             <wp:effectExtent l="19050" t="19050" r="22860" b="18415"/>
-            <wp:docPr id="730635605" name="Imagem 36"/>
+            <wp:docPr id="352304831" name="Imagem 36"/>
             <wp:cNvGraphicFramePr/>
             <a:graphic xmlns:a="http://schemas.openxmlformats.org/drawingml/2006/main">
               <a:graphicData uri="http://schemas.openxmlformats.org/drawingml/2006/picture">
                 <pic:pic xmlns:pic="http://schemas.openxmlformats.org/drawingml/2006/picture">
                   <pic:nvPicPr>
-                    <pic:cNvPr id="730635605" name=""/>
+                    <pic:cNvPr id="352304831" name=""/>
                     <pic:cNvPicPr/>
                   </pic:nvPicPr>
                   <pic:blipFill>
@@ -19024,7 +19113,7 @@
           <w:sz w:val="27"/>
         </w:rPr>
       </w:pPr>
-      <w:bookmarkStart w:id="35" w:name="_Toc240532342"/>
+      <w:bookmarkStart w:id="35" w:name="_Toc240533455"/>
       <w:r>
         <w:rPr>
           <w:rFonts w:ascii="Montserrat" w:hAnsi="Montserrat"/>
@@ -19065,16 +19154,16 @@
         </w:rPr>
         <w:lastRenderedPageBreak/>
         <w:drawing>
-          <wp:inline distT="0" distB="0" distL="0" distR="0" wp14:anchorId="335DA47A" wp14:editId="191D72CE">
+          <wp:inline distT="0" distB="0" distL="0" distR="0" wp14:anchorId="2A1ED987" wp14:editId="3A81409B">
             <wp:extent cx="5120640" cy="4627581"/>
             <wp:effectExtent l="19050" t="19050" r="22860" b="20955"/>
-            <wp:docPr id="864275392" name="Imagem 37"/>
+            <wp:docPr id="1926961395" name="Imagem 37"/>
             <wp:cNvGraphicFramePr/>
             <a:graphic xmlns:a="http://schemas.openxmlformats.org/drawingml/2006/main">
               <a:graphicData uri="http://schemas.openxmlformats.org/drawingml/2006/picture">
                 <pic:pic xmlns:pic="http://schemas.openxmlformats.org/drawingml/2006/picture">
                   <pic:nvPicPr>
-                    <pic:cNvPr id="864275392" name=""/>
+                    <pic:cNvPr id="1926961395" name=""/>
                     <pic:cNvPicPr/>
                   </pic:nvPicPr>
                   <pic:blipFill>
@@ -19142,16 +19231,16 @@
         </w:rPr>
         <w:lastRenderedPageBreak/>
         <w:drawing>
-          <wp:inline distT="0" distB="0" distL="0" distR="0" wp14:anchorId="39A4F8DA" wp14:editId="3CC26DB1">
+          <wp:inline distT="0" distB="0" distL="0" distR="0" wp14:anchorId="0E459AE7" wp14:editId="4A389453">
             <wp:extent cx="5120640" cy="4627581"/>
             <wp:effectExtent l="19050" t="19050" r="22860" b="20955"/>
-            <wp:docPr id="1815964052" name="Imagem 38"/>
+            <wp:docPr id="1664096256" name="Imagem 38"/>
             <wp:cNvGraphicFramePr/>
             <a:graphic xmlns:a="http://schemas.openxmlformats.org/drawingml/2006/main">
               <a:graphicData uri="http://schemas.openxmlformats.org/drawingml/2006/picture">
                 <pic:pic xmlns:pic="http://schemas.openxmlformats.org/drawingml/2006/picture">
                   <pic:nvPicPr>
-                    <pic:cNvPr id="1815964052" name=""/>
+                    <pic:cNvPr id="1664096256" name=""/>
                     <pic:cNvPicPr/>
                   </pic:nvPicPr>
                   <pic:blipFill>
@@ -19320,16 +19409,16 @@
           <w:noProof/>
         </w:rPr>
         <w:drawing>
-          <wp:inline distT="0" distB="0" distL="0" distR="0" wp14:anchorId="0E8D94B0" wp14:editId="0186FA42">
+          <wp:inline distT="0" distB="0" distL="0" distR="0" wp14:anchorId="48842377" wp14:editId="1D6C4099">
             <wp:extent cx="5120640" cy="2144319"/>
             <wp:effectExtent l="19050" t="19050" r="22860" b="27940"/>
-            <wp:docPr id="1455314675" name="Imagem 39"/>
+            <wp:docPr id="103055623" name="Imagem 39"/>
             <wp:cNvGraphicFramePr/>
             <a:graphic xmlns:a="http://schemas.openxmlformats.org/drawingml/2006/main">
               <a:graphicData uri="http://schemas.openxmlformats.org/drawingml/2006/picture">
                 <pic:pic xmlns:pic="http://schemas.openxmlformats.org/drawingml/2006/picture">
                   <pic:nvPicPr>
-                    <pic:cNvPr id="1455314675" name=""/>
+                    <pic:cNvPr id="103055623" name=""/>
                     <pic:cNvPicPr/>
                   </pic:nvPicPr>
                   <pic:blipFill>
@@ -19417,16 +19506,16 @@
           <w:noProof/>
         </w:rPr>
         <w:drawing>
-          <wp:inline distT="0" distB="0" distL="0" distR="0" wp14:anchorId="4DEBE5FE" wp14:editId="10C2B8C6">
+          <wp:inline distT="0" distB="0" distL="0" distR="0" wp14:anchorId="13C07404" wp14:editId="369C742F">
             <wp:extent cx="5120640" cy="1055647"/>
             <wp:effectExtent l="19050" t="19050" r="22860" b="11430"/>
-            <wp:docPr id="1038857054" name="Imagem 40"/>
+            <wp:docPr id="339467279" name="Imagem 40"/>
             <wp:cNvGraphicFramePr/>
             <a:graphic xmlns:a="http://schemas.openxmlformats.org/drawingml/2006/main">
               <a:graphicData uri="http://schemas.openxmlformats.org/drawingml/2006/picture">
                 <pic:pic xmlns:pic="http://schemas.openxmlformats.org/drawingml/2006/picture">
                   <pic:nvPicPr>
-                    <pic:cNvPr id="1038857054" name=""/>
+                    <pic:cNvPr id="339467279" name=""/>
                     <pic:cNvPicPr/>
                   </pic:nvPicPr>
                   <pic:blipFill>
@@ -19548,16 +19637,16 @@
           <w:noProof/>
         </w:rPr>
         <w:drawing>
-          <wp:inline distT="0" distB="0" distL="0" distR="0" wp14:anchorId="1175928C" wp14:editId="2C160A5A">
+          <wp:inline distT="0" distB="0" distL="0" distR="0" wp14:anchorId="650842F9" wp14:editId="22666E2C">
             <wp:extent cx="5120640" cy="3282818"/>
             <wp:effectExtent l="19050" t="19050" r="22860" b="13335"/>
-            <wp:docPr id="1727305586" name="Imagem 41"/>
+            <wp:docPr id="654065130" name="Imagem 41"/>
             <wp:cNvGraphicFramePr/>
             <a:graphic xmlns:a="http://schemas.openxmlformats.org/drawingml/2006/main">
               <a:graphicData uri="http://schemas.openxmlformats.org/drawingml/2006/picture">
                 <pic:pic xmlns:pic="http://schemas.openxmlformats.org/drawingml/2006/picture">
                   <pic:nvPicPr>
-                    <pic:cNvPr id="1727305586" name=""/>
+                    <pic:cNvPr id="654065130" name=""/>
                     <pic:cNvPicPr/>
                   </pic:nvPicPr>
                   <pic:blipFill>
@@ -19691,16 +19780,16 @@
         </w:rPr>
         <w:lastRenderedPageBreak/>
         <w:drawing>
-          <wp:inline distT="0" distB="0" distL="0" distR="0" wp14:anchorId="671DFF9A" wp14:editId="011B574E">
+          <wp:inline distT="0" distB="0" distL="0" distR="0" wp14:anchorId="42ED4821" wp14:editId="3C76AC09">
             <wp:extent cx="5120640" cy="1978034"/>
             <wp:effectExtent l="19050" t="19050" r="22860" b="22225"/>
-            <wp:docPr id="1696908175" name="Imagem 42"/>
+            <wp:docPr id="1595870576" name="Imagem 42"/>
             <wp:cNvGraphicFramePr/>
             <a:graphic xmlns:a="http://schemas.openxmlformats.org/drawingml/2006/main">
               <a:graphicData uri="http://schemas.openxmlformats.org/drawingml/2006/picture">
                 <pic:pic xmlns:pic="http://schemas.openxmlformats.org/drawingml/2006/picture">
                   <pic:nvPicPr>
-                    <pic:cNvPr id="1696908175" name=""/>
+                    <pic:cNvPr id="1595870576" name=""/>
                     <pic:cNvPicPr/>
                   </pic:nvPicPr>
                   <pic:blipFill>
@@ -19772,7 +19861,7 @@
           <w:sz w:val="34"/>
         </w:rPr>
       </w:pPr>
-      <w:bookmarkStart w:id="36" w:name="_Toc240532343"/>
+      <w:bookmarkStart w:id="36" w:name="_Toc240533456"/>
       <w:r>
         <w:rPr>
           <w:rFonts w:ascii="Montserrat" w:hAnsi="Montserrat"/>
@@ -19832,7 +19921,7 @@
           <w:sz w:val="27"/>
         </w:rPr>
       </w:pPr>
-      <w:bookmarkStart w:id="37" w:name="_Toc240532344"/>
+      <w:bookmarkStart w:id="37" w:name="_Toc240533457"/>
       <w:r>
         <w:rPr>
           <w:rFonts w:ascii="Montserrat" w:hAnsi="Montserrat"/>
@@ -19872,16 +19961,16 @@
           <w:noProof/>
         </w:rPr>
         <w:drawing>
-          <wp:inline distT="0" distB="0" distL="0" distR="0" wp14:anchorId="459EDBA4" wp14:editId="0F79058F">
+          <wp:inline distT="0" distB="0" distL="0" distR="0" wp14:anchorId="5A3CB9AD" wp14:editId="181F0145">
             <wp:extent cx="5303520" cy="4792851"/>
             <wp:effectExtent l="19050" t="19050" r="11430" b="27305"/>
-            <wp:docPr id="17792798" name="Imagem 43"/>
+            <wp:docPr id="1354762991" name="Imagem 43"/>
             <wp:cNvGraphicFramePr/>
             <a:graphic xmlns:a="http://schemas.openxmlformats.org/drawingml/2006/main">
               <a:graphicData uri="http://schemas.openxmlformats.org/drawingml/2006/picture">
                 <pic:pic xmlns:pic="http://schemas.openxmlformats.org/drawingml/2006/picture">
                   <pic:nvPicPr>
-                    <pic:cNvPr id="17792798" name=""/>
+                    <pic:cNvPr id="1354762991" name=""/>
                     <pic:cNvPicPr/>
                   </pic:nvPicPr>
                   <pic:blipFill>
@@ -19950,7 +20039,7 @@
           <w:sz w:val="27"/>
         </w:rPr>
       </w:pPr>
-      <w:bookmarkStart w:id="38" w:name="_Toc240532345"/>
+      <w:bookmarkStart w:id="38" w:name="_Toc240533458"/>
       <w:r>
         <w:rPr>
           <w:rFonts w:ascii="Montserrat" w:hAnsi="Montserrat"/>
@@ -19990,16 +20079,16 @@
           <w:noProof/>
         </w:rPr>
         <w:drawing>
-          <wp:inline distT="0" distB="0" distL="0" distR="0" wp14:anchorId="2749A2EB" wp14:editId="4E8C1F0C">
+          <wp:inline distT="0" distB="0" distL="0" distR="0" wp14:anchorId="44F20D2A" wp14:editId="262C6F4C">
             <wp:extent cx="5303520" cy="4792851"/>
             <wp:effectExtent l="19050" t="19050" r="11430" b="27305"/>
-            <wp:docPr id="103681468" name="Imagem 44"/>
+            <wp:docPr id="1925971145" name="Imagem 44"/>
             <wp:cNvGraphicFramePr/>
             <a:graphic xmlns:a="http://schemas.openxmlformats.org/drawingml/2006/main">
               <a:graphicData uri="http://schemas.openxmlformats.org/drawingml/2006/picture">
                 <pic:pic xmlns:pic="http://schemas.openxmlformats.org/drawingml/2006/picture">
                   <pic:nvPicPr>
-                    <pic:cNvPr id="103681468" name=""/>
+                    <pic:cNvPr id="1925971145" name=""/>
                     <pic:cNvPicPr/>
                   </pic:nvPicPr>
                   <pic:blipFill>
@@ -20067,7 +20156,7 @@
           <w:sz w:val="27"/>
         </w:rPr>
       </w:pPr>
-      <w:bookmarkStart w:id="39" w:name="_Toc240532346"/>
+      <w:bookmarkStart w:id="39" w:name="_Toc240533459"/>
       <w:r>
         <w:rPr>
           <w:rFonts w:ascii="Montserrat" w:hAnsi="Montserrat"/>
@@ -20108,16 +20197,16 @@
         </w:rPr>
         <w:lastRenderedPageBreak/>
         <w:drawing>
-          <wp:inline distT="0" distB="0" distL="0" distR="0" wp14:anchorId="2473DA06" wp14:editId="56A4D4CD">
+          <wp:inline distT="0" distB="0" distL="0" distR="0" wp14:anchorId="0C14C5BC" wp14:editId="76FDAE1F">
             <wp:extent cx="5303520" cy="4792851"/>
             <wp:effectExtent l="19050" t="19050" r="11430" b="27305"/>
-            <wp:docPr id="1175407808" name="Imagem 45"/>
+            <wp:docPr id="310684108" name="Imagem 45"/>
             <wp:cNvGraphicFramePr/>
             <a:graphic xmlns:a="http://schemas.openxmlformats.org/drawingml/2006/main">
               <a:graphicData uri="http://schemas.openxmlformats.org/drawingml/2006/picture">
                 <pic:pic xmlns:pic="http://schemas.openxmlformats.org/drawingml/2006/picture">
                   <pic:nvPicPr>
-                    <pic:cNvPr id="1175407808" name=""/>
+                    <pic:cNvPr id="310684108" name=""/>
                     <pic:cNvPicPr/>
                   </pic:nvPicPr>
                   <pic:blipFill>
@@ -20185,16 +20274,16 @@
         </w:rPr>
         <w:lastRenderedPageBreak/>
         <w:drawing>
-          <wp:inline distT="0" distB="0" distL="0" distR="0" wp14:anchorId="0EFA38FD" wp14:editId="4D31D438">
+          <wp:inline distT="0" distB="0" distL="0" distR="0" wp14:anchorId="0143005E" wp14:editId="391F120C">
             <wp:extent cx="5303520" cy="4792851"/>
             <wp:effectExtent l="19050" t="19050" r="11430" b="27305"/>
-            <wp:docPr id="14209089" name="Imagem 46"/>
+            <wp:docPr id="1892086130" name="Imagem 46"/>
             <wp:cNvGraphicFramePr/>
             <a:graphic xmlns:a="http://schemas.openxmlformats.org/drawingml/2006/main">
               <a:graphicData uri="http://schemas.openxmlformats.org/drawingml/2006/picture">
                 <pic:pic xmlns:pic="http://schemas.openxmlformats.org/drawingml/2006/picture">
                   <pic:nvPicPr>
-                    <pic:cNvPr id="14209089" name=""/>
+                    <pic:cNvPr id="1892086130" name=""/>
                     <pic:cNvPicPr/>
                   </pic:nvPicPr>
                   <pic:blipFill>
@@ -20287,7 +20376,7 @@
           <w:sz w:val="34"/>
         </w:rPr>
       </w:pPr>
-      <w:bookmarkStart w:id="40" w:name="_Toc240532347"/>
+      <w:bookmarkStart w:id="40" w:name="_Toc240533460"/>
       <w:r>
         <w:rPr>
           <w:rFonts w:ascii="Montserrat" w:hAnsi="Montserrat"/>
@@ -20329,7 +20418,7 @@
           <w:sz w:val="27"/>
         </w:rPr>
       </w:pPr>
-      <w:bookmarkStart w:id="41" w:name="_Toc240532348"/>
+      <w:bookmarkStart w:id="41" w:name="_Toc240533461"/>
       <w:r>
         <w:rPr>
           <w:rFonts w:ascii="Montserrat" w:hAnsi="Montserrat"/>
@@ -20369,16 +20458,16 @@
           <w:noProof/>
         </w:rPr>
         <w:drawing>
-          <wp:inline distT="0" distB="0" distL="0" distR="0" wp14:anchorId="0B46FC3B" wp14:editId="4E4AF922">
+          <wp:inline distT="0" distB="0" distL="0" distR="0" wp14:anchorId="7A77C17E" wp14:editId="1DE6142C">
             <wp:extent cx="5303520" cy="4792851"/>
             <wp:effectExtent l="19050" t="19050" r="11430" b="27305"/>
-            <wp:docPr id="835579263" name="Imagem 47"/>
+            <wp:docPr id="745246" name="Imagem 47"/>
             <wp:cNvGraphicFramePr/>
             <a:graphic xmlns:a="http://schemas.openxmlformats.org/drawingml/2006/main">
               <a:graphicData uri="http://schemas.openxmlformats.org/drawingml/2006/picture">
                 <pic:pic xmlns:pic="http://schemas.openxmlformats.org/drawingml/2006/picture">
                   <pic:nvPicPr>
-                    <pic:cNvPr id="835579263" name=""/>
+                    <pic:cNvPr id="745246" name=""/>
                     <pic:cNvPicPr/>
                   </pic:nvPicPr>
                   <pic:blipFill>
@@ -20633,7 +20722,7 @@
           <w:sz w:val="27"/>
         </w:rPr>
       </w:pPr>
-      <w:bookmarkStart w:id="42" w:name="_Toc240532349"/>
+      <w:bookmarkStart w:id="42" w:name="_Toc240533462"/>
       <w:r>
         <w:rPr>
           <w:rFonts w:ascii="Montserrat" w:hAnsi="Montserrat"/>
@@ -20674,16 +20763,16 @@
         </w:rPr>
         <w:lastRenderedPageBreak/>
         <w:drawing>
-          <wp:inline distT="0" distB="0" distL="0" distR="0" wp14:anchorId="30299A44" wp14:editId="6F5E1E2C">
+          <wp:inline distT="0" distB="0" distL="0" distR="0" wp14:anchorId="01B49B00" wp14:editId="486803B7">
             <wp:extent cx="5303520" cy="4792851"/>
             <wp:effectExtent l="19050" t="19050" r="11430" b="27305"/>
-            <wp:docPr id="247764840" name="Imagem 48"/>
+            <wp:docPr id="514512659" name="Imagem 48"/>
             <wp:cNvGraphicFramePr/>
             <a:graphic xmlns:a="http://schemas.openxmlformats.org/drawingml/2006/main">
               <a:graphicData uri="http://schemas.openxmlformats.org/drawingml/2006/picture">
                 <pic:pic xmlns:pic="http://schemas.openxmlformats.org/drawingml/2006/picture">
                   <pic:nvPicPr>
-                    <pic:cNvPr id="247764840" name=""/>
+                    <pic:cNvPr id="514512659" name=""/>
                     <pic:cNvPicPr/>
                   </pic:nvPicPr>
                   <pic:blipFill>
@@ -20772,7 +20861,7 @@
           <w:sz w:val="27"/>
         </w:rPr>
       </w:pPr>
-      <w:bookmarkStart w:id="43" w:name="_Toc240532350"/>
+      <w:bookmarkStart w:id="43" w:name="_Toc240533463"/>
       <w:r>
         <w:rPr>
           <w:rFonts w:ascii="Montserrat" w:hAnsi="Montserrat"/>
@@ -20813,16 +20902,16 @@
         </w:rPr>
         <w:lastRenderedPageBreak/>
         <w:drawing>
-          <wp:inline distT="0" distB="0" distL="0" distR="0" wp14:anchorId="261713EB" wp14:editId="3B98FDE0">
+          <wp:inline distT="0" distB="0" distL="0" distR="0" wp14:anchorId="13776E25" wp14:editId="31ECBBF5">
             <wp:extent cx="5303520" cy="4792851"/>
             <wp:effectExtent l="19050" t="19050" r="11430" b="27305"/>
-            <wp:docPr id="711264101" name="Imagem 49"/>
+            <wp:docPr id="182483885" name="Imagem 49"/>
             <wp:cNvGraphicFramePr/>
             <a:graphic xmlns:a="http://schemas.openxmlformats.org/drawingml/2006/main">
               <a:graphicData uri="http://schemas.openxmlformats.org/drawingml/2006/picture">
                 <pic:pic xmlns:pic="http://schemas.openxmlformats.org/drawingml/2006/picture">
                   <pic:nvPicPr>
-                    <pic:cNvPr id="711264101" name=""/>
+                    <pic:cNvPr id="182483885" name=""/>
                     <pic:cNvPicPr/>
                   </pic:nvPicPr>
                   <pic:blipFill>
@@ -20966,7 +21055,7 @@
           <w:sz w:val="27"/>
         </w:rPr>
       </w:pPr>
-      <w:bookmarkStart w:id="44" w:name="_Toc240532351"/>
+      <w:bookmarkStart w:id="44" w:name="_Toc240533464"/>
       <w:r>
         <w:rPr>
           <w:rFonts w:ascii="Montserrat" w:hAnsi="Montserrat"/>
@@ -21053,8 +21142,18 @@
         </w:numPr>
         <w:spacing w:after="80" w:line="260" w:lineRule="auto"/>
         <w:ind w:left="700"/>
-      </w:pPr>
-      <w:r>
+        <w:rPr>
+          <w:rFonts w:ascii="Montserrat" w:hAnsi="Montserrat"/>
+          <w:color w:val="1A1A1A"/>
+          <w:sz w:val="22"/>
+        </w:rPr>
+      </w:pPr>
+      <w:r>
+        <w:rPr>
+          <w:rFonts w:ascii="Montserrat" w:hAnsi="Montserrat"/>
+          <w:color w:val="1A1A1A"/>
+          <w:sz w:val="22"/>
+        </w:rPr>
         <w:t>Riscos do portfolio (dados do TAP - Passo 3, secao 9): contagem total de riscos em aberto (Status diferente de Encerrado) com severidade Critico e com severidade Alto, somando o Registro de riscos de todos os TAPs cadastrados - mesma matriz de severidade (Probabilidade x Impacto) usada na Matriz de risco de cada TAP.</w:t>
       </w:r>
     </w:p>
@@ -21221,16 +21320,16 @@
           <w:noProof/>
         </w:rPr>
         <w:drawing>
-          <wp:inline distT="0" distB="0" distL="0" distR="0" wp14:anchorId="68FA3F5A" wp14:editId="6EE0A1D2">
+          <wp:inline distT="0" distB="0" distL="0" distR="0" wp14:anchorId="3D939B61" wp14:editId="2A30E1C9">
             <wp:extent cx="5303520" cy="4267180"/>
             <wp:effectExtent l="19050" t="19050" r="11430" b="19685"/>
-            <wp:docPr id="369030101" name="Imagem 50"/>
+            <wp:docPr id="1114477027" name="Imagem 50"/>
             <wp:cNvGraphicFramePr/>
             <a:graphic xmlns:a="http://schemas.openxmlformats.org/drawingml/2006/main">
               <a:graphicData uri="http://schemas.openxmlformats.org/drawingml/2006/picture">
                 <pic:pic xmlns:pic="http://schemas.openxmlformats.org/drawingml/2006/picture">
                   <pic:nvPicPr>
-                    <pic:cNvPr id="369030101" name=""/>
+                    <pic:cNvPr id="1114477027" name=""/>
                     <pic:cNvPicPr/>
                   </pic:nvPicPr>
                   <pic:blipFill>
@@ -21298,16 +21397,16 @@
           <w:noProof/>
         </w:rPr>
         <w:drawing>
-          <wp:inline distT="0" distB="0" distL="0" distR="0" wp14:anchorId="4A9D7F32" wp14:editId="10FF185A">
+          <wp:inline distT="0" distB="0" distL="0" distR="0" wp14:anchorId="32C4F5BB" wp14:editId="19342495">
             <wp:extent cx="5303520" cy="3382059"/>
             <wp:effectExtent l="19050" t="19050" r="11430" b="27940"/>
-            <wp:docPr id="323486523" name="Imagem 51"/>
+            <wp:docPr id="1053494920" name="Imagem 51"/>
             <wp:cNvGraphicFramePr/>
             <a:graphic xmlns:a="http://schemas.openxmlformats.org/drawingml/2006/main">
               <a:graphicData uri="http://schemas.openxmlformats.org/drawingml/2006/picture">
                 <pic:pic xmlns:pic="http://schemas.openxmlformats.org/drawingml/2006/picture">
                   <pic:nvPicPr>
-                    <pic:cNvPr id="323486523" name=""/>
+                    <pic:cNvPr id="1053494920" name=""/>
                     <pic:cNvPicPr/>
                   </pic:nvPicPr>
                   <pic:blipFill>
@@ -21375,16 +21474,16 @@
         </w:rPr>
         <w:lastRenderedPageBreak/>
         <w:drawing>
-          <wp:inline distT="0" distB="0" distL="0" distR="0" wp14:anchorId="3DD7A046" wp14:editId="16369998">
+          <wp:inline distT="0" distB="0" distL="0" distR="0" wp14:anchorId="3962365A" wp14:editId="4F9EDF24">
             <wp:extent cx="5303520" cy="4417800"/>
             <wp:effectExtent l="19050" t="19050" r="11430" b="20955"/>
-            <wp:docPr id="1017025118" name="Imagem 52"/>
+            <wp:docPr id="728490290" name="Imagem 52"/>
             <wp:cNvGraphicFramePr/>
             <a:graphic xmlns:a="http://schemas.openxmlformats.org/drawingml/2006/main">
               <a:graphicData uri="http://schemas.openxmlformats.org/drawingml/2006/picture">
                 <pic:pic xmlns:pic="http://schemas.openxmlformats.org/drawingml/2006/picture">
                   <pic:nvPicPr>
-                    <pic:cNvPr id="1017025118" name=""/>
+                    <pic:cNvPr id="728490290" name=""/>
                     <pic:cNvPicPr/>
                   </pic:nvPicPr>
                   <pic:blipFill>
@@ -21494,7 +21593,7 @@
           <w:sz w:val="27"/>
         </w:rPr>
       </w:pPr>
-      <w:bookmarkStart w:id="45" w:name="_Toc240532352"/>
+      <w:bookmarkStart w:id="45" w:name="_Toc240533465"/>
       <w:r>
         <w:rPr>
           <w:rFonts w:ascii="Montserrat" w:hAnsi="Montserrat"/>
@@ -21760,16 +21859,16 @@
         </w:rPr>
         <w:lastRenderedPageBreak/>
         <w:drawing>
-          <wp:inline distT="0" distB="0" distL="0" distR="0" wp14:anchorId="54E363E4" wp14:editId="21CEB20A">
+          <wp:inline distT="0" distB="0" distL="0" distR="0" wp14:anchorId="3F1A50AF" wp14:editId="6B8EBA8D">
             <wp:extent cx="5303520" cy="7628836"/>
             <wp:effectExtent l="19050" t="19050" r="11430" b="10795"/>
-            <wp:docPr id="671007016" name="Imagem 53"/>
+            <wp:docPr id="574680958" name="Imagem 53"/>
             <wp:cNvGraphicFramePr/>
             <a:graphic xmlns:a="http://schemas.openxmlformats.org/drawingml/2006/main">
               <a:graphicData uri="http://schemas.openxmlformats.org/drawingml/2006/picture">
                 <pic:pic xmlns:pic="http://schemas.openxmlformats.org/drawingml/2006/picture">
                   <pic:nvPicPr>
-                    <pic:cNvPr id="671007016" name=""/>
+                    <pic:cNvPr id="574680958" name=""/>
                     <pic:cNvPicPr/>
                   </pic:nvPicPr>
                   <pic:blipFill>
@@ -21901,7 +22000,7 @@
           <w:sz w:val="27"/>
         </w:rPr>
       </w:pPr>
-      <w:bookmarkStart w:id="46" w:name="_Toc240532353"/>
+      <w:bookmarkStart w:id="46" w:name="_Toc240533466"/>
       <w:r>
         <w:rPr>
           <w:rFonts w:ascii="Montserrat" w:hAnsi="Montserrat"/>
@@ -22033,7 +22132,7 @@
           <w:sz w:val="27"/>
         </w:rPr>
       </w:pPr>
-      <w:bookmarkStart w:id="47" w:name="_Toc240532354"/>
+      <w:bookmarkStart w:id="47" w:name="_Toc240533467"/>
       <w:r>
         <w:rPr>
           <w:rFonts w:ascii="Montserrat" w:hAnsi="Montserrat"/>
@@ -22309,7 +22408,7 @@
           <w:sz w:val="27"/>
         </w:rPr>
       </w:pPr>
-      <w:bookmarkStart w:id="48" w:name="_Toc240532355"/>
+      <w:bookmarkStart w:id="48" w:name="_Toc240533468"/>
       <w:r>
         <w:rPr>
           <w:rFonts w:ascii="Montserrat" w:hAnsi="Montserrat"/>
@@ -22317,9 +22416,71 @@
           <w:color w:val="B91D2E"/>
           <w:sz w:val="27"/>
         </w:rPr>
+        <w:t>Aviso automatico de silencio (e-mail e push)</w:t>
+      </w:r>
+      <w:bookmarkEnd w:id="48"/>
+    </w:p>
+    <w:p>
+      <w:pPr>
+        <w:spacing w:line="280" w:lineRule="auto"/>
+        <w:rPr>
+          <w:rFonts w:ascii="Montserrat" w:hAnsi="Montserrat"/>
+          <w:color w:val="1A1A1A"/>
+          <w:sz w:val="22"/>
+        </w:rPr>
+      </w:pPr>
+      <w:r>
+        <w:rPr>
+          <w:rFonts w:ascii="Montserrat" w:hAnsi="Montserrat"/>
+          <w:color w:val="1A1A1A"/>
+          <w:sz w:val="22"/>
+        </w:rPr>
+        <w:t>Complementa o aviso de prazo acima, mas olha para outra coisa: em vez do vencimento, olha se a pessoa esta de fato sinalizando execucao. O mesmo mecanismo diario dispara um segundo aviso quando um marco ja comecou (Inicio previsto ja chegou) e esta 5 dias ou mais sem nenhuma mudanca no campo Execucao (secao 6.2, Passo 4) - contando a partir da ultima atualizacao, ou do proprio Inicio previsto se o campo nunca foi preenchido. Repete a cada 5 dias enquanto continuar parado, com o mesmo destinatario e o mesmo link para o Meu Painel do aviso de prazo.</w:t>
+      </w:r>
+    </w:p>
+    <w:p>
+      <w:pPr>
+        <w:spacing w:before="160" w:after="200"/>
+        <w:ind w:left="283"/>
+        <w:rPr>
+          <w:rFonts w:ascii="Montserrat" w:hAnsi="Montserrat"/>
+          <w:i/>
+          <w:color w:val="6A6A70"/>
+          <w:sz w:val="21"/>
+        </w:rPr>
+      </w:pPr>
+      <w:r>
+        <w:rPr>
+          <w:rFonts w:ascii="Montserrat" w:hAnsi="Montserrat"/>
+          <w:i/>
+          <w:color w:val="6A6A70"/>
+          <w:sz w:val="21"/>
+        </w:rPr>
+        <w:t>Por que existe: o aviso de prazo acima so olha a data final - um marco com o Termino previsto ainda longe (semanas ou meses) podia ficar parado o tempo todo sem ninguem ser avisado, mesmo com o campo Execucao existindo desde a criacao dele. O aviso de silencio fecha essa lacuna, avisando por causa da inatividade, nao do prazo. No mesmo dia em que o aviso de prazo ja foi enviado para um marco, o aviso de silencio nao dispara tambem, para nao mandar dois e-mails de uma vez.</w:t>
+      </w:r>
+    </w:p>
+    <w:p>
+      <w:pPr>
+        <w:pStyle w:val="Ttulo2"/>
+        <w:spacing w:before="320" w:after="120"/>
+        <w:rPr>
+          <w:rFonts w:ascii="Montserrat" w:hAnsi="Montserrat"/>
+          <w:b/>
+          <w:color w:val="B91D2E"/>
+          <w:sz w:val="27"/>
+        </w:rPr>
+      </w:pPr>
+      <w:bookmarkStart w:id="49" w:name="_Toc240533469"/>
+      <w:r>
+        <w:rPr>
+          <w:rFonts w:ascii="Montserrat" w:hAnsi="Montserrat"/>
+          <w:b/>
+          <w:color w:val="B91D2E"/>
+          <w:sz w:val="27"/>
+        </w:rPr>
         <w:t>6.4.4 Meu Painel</w:t>
       </w:r>
-      <w:bookmarkEnd w:id="48"/>
+      <w:bookmarkEnd w:id="49"/>
     </w:p>
     <w:p>
       <w:pPr>
@@ -22551,6 +22712,7 @@
                 <w:color w:val="1A1A1A"/>
                 <w:sz w:val="19"/>
               </w:rPr>
+              <w:lastRenderedPageBreak/>
               <w:t>Marcos atribuidos a mim</w:t>
             </w:r>
           </w:p>
@@ -22927,16 +23089,16 @@
         </w:rPr>
         <w:lastRenderedPageBreak/>
         <w:drawing>
-          <wp:inline distT="0" distB="0" distL="0" distR="0" wp14:anchorId="2D35E982" wp14:editId="6E714E66">
+          <wp:inline distT="0" distB="0" distL="0" distR="0" wp14:anchorId="6984133D" wp14:editId="6B4B24EC">
             <wp:extent cx="5120640" cy="6240599"/>
             <wp:effectExtent l="19050" t="19050" r="22860" b="27305"/>
-            <wp:docPr id="1552422695" name="Imagem 54"/>
+            <wp:docPr id="728369398" name="Imagem 54"/>
             <wp:cNvGraphicFramePr/>
             <a:graphic xmlns:a="http://schemas.openxmlformats.org/drawingml/2006/main">
               <a:graphicData uri="http://schemas.openxmlformats.org/drawingml/2006/picture">
                 <pic:pic xmlns:pic="http://schemas.openxmlformats.org/drawingml/2006/picture">
                   <pic:nvPicPr>
-                    <pic:cNvPr id="1552422695" name=""/>
+                    <pic:cNvPr id="728369398" name=""/>
                     <pic:cNvPicPr/>
                   </pic:nvPicPr>
                   <pic:blipFill>
@@ -23107,7 +23269,7 @@
           <w:sz w:val="27"/>
         </w:rPr>
       </w:pPr>
-      <w:bookmarkStart w:id="49" w:name="_Toc240532356"/>
+      <w:bookmarkStart w:id="50" w:name="_Toc240533470"/>
       <w:r>
         <w:rPr>
           <w:rFonts w:ascii="Montserrat" w:hAnsi="Montserrat"/>
@@ -23117,7 +23279,7 @@
         </w:rPr>
         <w:t>6.4.5 Gestao de Atividades</w:t>
       </w:r>
-      <w:bookmarkEnd w:id="49"/>
+      <w:bookmarkEnd w:id="50"/>
     </w:p>
     <w:p>
       <w:pPr>
@@ -23220,16 +23382,16 @@
         </w:rPr>
         <w:lastRenderedPageBreak/>
         <w:drawing>
-          <wp:inline distT="0" distB="0" distL="0" distR="0" wp14:anchorId="498AEE71" wp14:editId="6EAC2C25">
+          <wp:inline distT="0" distB="0" distL="0" distR="0" wp14:anchorId="0C885D2E" wp14:editId="4F09FDA4">
             <wp:extent cx="5120640" cy="6187296"/>
             <wp:effectExtent l="19050" t="19050" r="22860" b="23495"/>
-            <wp:docPr id="956505478" name="Imagem 55"/>
+            <wp:docPr id="131657961" name="Imagem 55"/>
             <wp:cNvGraphicFramePr/>
             <a:graphic xmlns:a="http://schemas.openxmlformats.org/drawingml/2006/main">
               <a:graphicData uri="http://schemas.openxmlformats.org/drawingml/2006/picture">
                 <pic:pic xmlns:pic="http://schemas.openxmlformats.org/drawingml/2006/picture">
                   <pic:nvPicPr>
-                    <pic:cNvPr id="956505478" name=""/>
+                    <pic:cNvPr id="131657961" name=""/>
                     <pic:cNvPicPr/>
                   </pic:nvPicPr>
                   <pic:blipFill>
@@ -23318,7 +23480,7 @@
           <w:sz w:val="27"/>
         </w:rPr>
       </w:pPr>
-      <w:bookmarkStart w:id="50" w:name="_Toc240532357"/>
+      <w:bookmarkStart w:id="51" w:name="_Toc240533471"/>
       <w:r>
         <w:rPr>
           <w:rFonts w:ascii="Montserrat" w:hAnsi="Montserrat"/>
@@ -23329,7 +23491,7 @@
         <w:lastRenderedPageBreak/>
         <w:t>6.5 Ambiente de Treino</w:t>
       </w:r>
-      <w:bookmarkEnd w:id="50"/>
+      <w:bookmarkEnd w:id="51"/>
     </w:p>
     <w:p>
       <w:pPr>
@@ -23471,7 +23633,7 @@
           <w:sz w:val="27"/>
         </w:rPr>
       </w:pPr>
-      <w:bookmarkStart w:id="51" w:name="_Toc240532358"/>
+      <w:bookmarkStart w:id="52" w:name="_Toc240533472"/>
       <w:r>
         <w:rPr>
           <w:rFonts w:ascii="Montserrat" w:hAnsi="Montserrat"/>
@@ -23481,7 +23643,7 @@
         </w:rPr>
         <w:t>6.6 Backup automatizado</w:t>
       </w:r>
-      <w:bookmarkEnd w:id="51"/>
+      <w:bookmarkEnd w:id="52"/>
     </w:p>
     <w:p>
       <w:pPr>
@@ -23764,16 +23926,16 @@
           <w:noProof/>
         </w:rPr>
         <w:drawing>
-          <wp:inline distT="0" distB="0" distL="0" distR="0" wp14:anchorId="00D7740D" wp14:editId="41B99DF5">
+          <wp:inline distT="0" distB="0" distL="0" distR="0" wp14:anchorId="79FC1812" wp14:editId="323357EF">
             <wp:extent cx="5303520" cy="1351384"/>
             <wp:effectExtent l="19050" t="19050" r="11430" b="20320"/>
-            <wp:docPr id="37364236" name="Imagem 56"/>
+            <wp:docPr id="631032592" name="Imagem 56"/>
             <wp:cNvGraphicFramePr/>
             <a:graphic xmlns:a="http://schemas.openxmlformats.org/drawingml/2006/main">
               <a:graphicData uri="http://schemas.openxmlformats.org/drawingml/2006/picture">
                 <pic:pic xmlns:pic="http://schemas.openxmlformats.org/drawingml/2006/picture">
                   <pic:nvPicPr>
-                    <pic:cNvPr id="37364236" name=""/>
+                    <pic:cNvPr id="631032592" name=""/>
                     <pic:cNvPicPr/>
                   </pic:nvPicPr>
                   <pic:blipFill>
@@ -23841,7 +24003,7 @@
           <w:sz w:val="27"/>
         </w:rPr>
       </w:pPr>
-      <w:bookmarkStart w:id="52" w:name="_Toc240532359"/>
+      <w:bookmarkStart w:id="53" w:name="_Toc240533473"/>
       <w:r>
         <w:rPr>
           <w:rFonts w:ascii="Montserrat" w:hAnsi="Montserrat"/>
@@ -23852,7 +24014,7 @@
         <w:lastRenderedPageBreak/>
         <w:t>6.7 Relatorio de Resultados</w:t>
       </w:r>
-      <w:bookmarkEnd w:id="52"/>
+      <w:bookmarkEnd w:id="53"/>
     </w:p>
     <w:p>
       <w:pPr>
@@ -23978,16 +24140,16 @@
           <w:noProof/>
         </w:rPr>
         <w:drawing>
-          <wp:inline distT="0" distB="0" distL="0" distR="0" wp14:anchorId="5744275D" wp14:editId="6B7FB39F">
+          <wp:inline distT="0" distB="0" distL="0" distR="0" wp14:anchorId="149D1E71" wp14:editId="3FB250B1">
             <wp:extent cx="5303520" cy="1422793"/>
             <wp:effectExtent l="19050" t="19050" r="11430" b="25400"/>
-            <wp:docPr id="198359354" name="Imagem 57"/>
+            <wp:docPr id="917693102" name="Imagem 57"/>
             <wp:cNvGraphicFramePr/>
             <a:graphic xmlns:a="http://schemas.openxmlformats.org/drawingml/2006/main">
               <a:graphicData uri="http://schemas.openxmlformats.org/drawingml/2006/picture">
                 <pic:pic xmlns:pic="http://schemas.openxmlformats.org/drawingml/2006/picture">
                   <pic:nvPicPr>
-                    <pic:cNvPr id="198359354" name=""/>
+                    <pic:cNvPr id="917693102" name=""/>
                     <pic:cNvPicPr/>
                   </pic:nvPicPr>
                   <pic:blipFill>
@@ -24151,16 +24313,16 @@
           <w:noProof/>
         </w:rPr>
         <w:drawing>
-          <wp:inline distT="0" distB="0" distL="0" distR="0" wp14:anchorId="37BA9138" wp14:editId="1AAB418F">
+          <wp:inline distT="0" distB="0" distL="0" distR="0" wp14:anchorId="3E13C1D1" wp14:editId="182E671F">
             <wp:extent cx="5303520" cy="1841050"/>
             <wp:effectExtent l="19050" t="19050" r="11430" b="26035"/>
-            <wp:docPr id="1410507861" name="Imagem 58"/>
+            <wp:docPr id="264151214" name="Imagem 58"/>
             <wp:cNvGraphicFramePr/>
             <a:graphic xmlns:a="http://schemas.openxmlformats.org/drawingml/2006/main">
               <a:graphicData uri="http://schemas.openxmlformats.org/drawingml/2006/picture">
                 <pic:pic xmlns:pic="http://schemas.openxmlformats.org/drawingml/2006/picture">
                   <pic:nvPicPr>
-                    <pic:cNvPr id="1410507861" name=""/>
+                    <pic:cNvPr id="264151214" name=""/>
                     <pic:cNvPicPr/>
                   </pic:nvPicPr>
                   <pic:blipFill>
@@ -24323,16 +24485,16 @@
           <w:noProof/>
         </w:rPr>
         <w:drawing>
-          <wp:inline distT="0" distB="0" distL="0" distR="0" wp14:anchorId="36EC94EB" wp14:editId="5322CE2C">
+          <wp:inline distT="0" distB="0" distL="0" distR="0" wp14:anchorId="5607F05E" wp14:editId="1C2ECFB7">
             <wp:extent cx="5303520" cy="303041"/>
             <wp:effectExtent l="19050" t="19050" r="11430" b="20955"/>
-            <wp:docPr id="1749707875" name="Imagem 59"/>
+            <wp:docPr id="750775795" name="Imagem 59"/>
             <wp:cNvGraphicFramePr/>
             <a:graphic xmlns:a="http://schemas.openxmlformats.org/drawingml/2006/main">
               <a:graphicData uri="http://schemas.openxmlformats.org/drawingml/2006/picture">
                 <pic:pic xmlns:pic="http://schemas.openxmlformats.org/drawingml/2006/picture">
                   <pic:nvPicPr>
-                    <pic:cNvPr id="1749707875" name=""/>
+                    <pic:cNvPr id="750775795" name=""/>
                     <pic:cNvPicPr/>
                   </pic:nvPicPr>
                   <pic:blipFill>
@@ -24399,16 +24561,16 @@
           <w:noProof/>
         </w:rPr>
         <w:drawing>
-          <wp:inline distT="0" distB="0" distL="0" distR="0" wp14:anchorId="3CF2E59F" wp14:editId="2FC14D9C">
+          <wp:inline distT="0" distB="0" distL="0" distR="0" wp14:anchorId="36910684" wp14:editId="3F3EB58A">
             <wp:extent cx="5303520" cy="2983005"/>
             <wp:effectExtent l="19050" t="19050" r="11430" b="27305"/>
-            <wp:docPr id="1175493428" name="Imagem 60"/>
+            <wp:docPr id="614753420" name="Imagem 60"/>
             <wp:cNvGraphicFramePr/>
             <a:graphic xmlns:a="http://schemas.openxmlformats.org/drawingml/2006/main">
               <a:graphicData uri="http://schemas.openxmlformats.org/drawingml/2006/picture">
                 <pic:pic xmlns:pic="http://schemas.openxmlformats.org/drawingml/2006/picture">
                   <pic:nvPicPr>
-                    <pic:cNvPr id="1175493428" name=""/>
+                    <pic:cNvPr id="614753420" name=""/>
                     <pic:cNvPicPr/>
                   </pic:nvPicPr>
                   <pic:blipFill>
@@ -24480,7 +24642,7 @@
           <w:sz w:val="34"/>
         </w:rPr>
       </w:pPr>
-      <w:bookmarkStart w:id="53" w:name="_Toc240532360"/>
+      <w:bookmarkStart w:id="54" w:name="_Toc240533474"/>
       <w:r>
         <w:rPr>
           <w:rFonts w:ascii="Montserrat" w:hAnsi="Montserrat"/>
@@ -24491,7 +24653,7 @@
         <w:lastRenderedPageBreak/>
         <w:t>7. Perguntas frequentes</w:t>
       </w:r>
-      <w:bookmarkEnd w:id="53"/>
+      <w:bookmarkEnd w:id="54"/>
     </w:p>
     <w:p>
       <w:pPr>
@@ -24724,7 +24886,7 @@
           <w:sz w:val="34"/>
         </w:rPr>
       </w:pPr>
-      <w:bookmarkStart w:id="54" w:name="_Toc240532361"/>
+      <w:bookmarkStart w:id="55" w:name="_Toc240533475"/>
       <w:r>
         <w:rPr>
           <w:rFonts w:ascii="Montserrat" w:hAnsi="Montserrat"/>
@@ -24735,7 +24897,7 @@
         <w:lastRenderedPageBreak/>
         <w:t>8. Anexo - Tabela de artefatos</w:t>
       </w:r>
-      <w:bookmarkEnd w:id="54"/>
+      <w:bookmarkEnd w:id="55"/>
     </w:p>
     <w:tbl>
       <w:tblPr>
@@ -26512,7 +26674,7 @@
 <file path=word/numbering.xml><?xml version="1.0" encoding="utf-8"?>
 <w:numbering xmlns:wpc="http://schemas.microsoft.com/office/word/2010/wordprocessingCanvas" xmlns:cx="http://schemas.microsoft.com/office/drawing/2014/chartex" xmlns:cx1="http://schemas.microsoft.com/office/drawing/2015/9/8/chartex" xmlns:cx2="http://schemas.microsoft.com/office/drawing/2015/10/21/chartex" xmlns:cx3="http://schemas.microsoft.com/office/drawing/2016/5/9/chartex" xmlns:cx4="http://schemas.microsoft.com/office/drawing/2016/5/10/chartex" xmlns:cx5="http://schemas.microsoft.com/office/drawing/2016/5/11/chartex" xmlns:cx6="http://schemas.microsoft.com/office/drawing/2016/5/12/chartex" xmlns:cx7="http://schemas.microsoft.com/office/drawing/2016/5/13/chartex" xmlns:cx8="http://schemas.microsoft.com/office/drawing/2016/5/14/chartex" xmlns:mc="http://schemas.openxmlformats.org/markup-compatibility/2006" xmlns:aink="http://schemas.microsoft.com/office/drawing/2016/ink" xmlns:am3d="http://schemas.microsoft.com/office/drawing/2017/model3d" xmlns:o="urn:schemas-microsoft-com:office:office" xmlns:oel="http://schemas.microsoft.com/office/2019/extlst" xmlns:r="http://schemas.openxmlformats.org/officeDocument/2006/relationships" xmlns:m="http://schemas.openxmlformats.org/officeDocument/2006/math" xmlns:v="urn:schemas-microsoft-com:vml" xmlns:wp14="http://schemas.microsoft.com/office/word/2010/wordprocessingDrawing" xmlns:wp="http://schemas.openxmlformats.org/drawingml/2006/wordprocessingDrawing" xmlns:w10="urn:schemas-microsoft-com:office:word" xmlns:w="http://schemas.openxmlformats.org/wordprocessingml/2006/main" xmlns:w14="http://schemas.microsoft.com/office/word/2010/wordml" xmlns:w15="http://schemas.microsoft.com/office/word/2012/wordml" xmlns:w16cex="http://schemas.microsoft.com/office/word/2018/wordml/cex" xmlns:w16cid="http://schemas.microsoft.com/office/word/2016/wordml/cid" xmlns:w16="http://schemas.microsoft.com/office/word/2018/wordml" xmlns:w16du="http://schemas.microsoft.com/office/word/2023/wordml/word16du" xmlns:w16sdtdh="http://schemas.microsoft.com/office/word/2020/wordml/sdtdatahash" xmlns:w16sdtfl="http://schemas.microsoft.com/office/word/2024/wordml/sdtformatlock" xmlns:w16se="http://schemas.microsoft.com/office/word/2015/wordml/symex" xmlns:wpg="http://schemas.microsoft.com/office/word/2010/wordprocessingGroup" xmlns:wpi="http://schemas.microsoft.com/office/word/2010/wordprocessingInk" xmlns:wne="http://schemas.microsoft.com/office/word/2006/wordml" xmlns:wps="http://schemas.microsoft.com/office/word/2010/wordprocessingShape" mc:Ignorable="w14 w15 w16se w16cid w16 w16cex w16sdtdh w16sdtfl w16du wp14">
   <w:abstractNum w:abstractNumId="0" w15:restartNumberingAfterBreak="0">
-    <w:nsid w:val="022D2014"/>
+    <w:nsid w:val="00FE3EE4"/>
     <w:multiLevelType w:val="singleLevel"/>
     <w:tmpl w:val="04160001"/>
     <w:lvl w:ilvl="0">
@@ -26529,7 +26691,7 @@
     </w:lvl>
   </w:abstractNum>
   <w:abstractNum w:abstractNumId="1" w15:restartNumberingAfterBreak="0">
-    <w:nsid w:val="02576681"/>
+    <w:nsid w:val="047401CA"/>
     <w:multiLevelType w:val="singleLevel"/>
     <w:tmpl w:val="04160001"/>
     <w:lvl w:ilvl="0">
@@ -26546,7 +26708,7 @@
     </w:lvl>
   </w:abstractNum>
   <w:abstractNum w:abstractNumId="2" w15:restartNumberingAfterBreak="0">
-    <w:nsid w:val="0E050507"/>
+    <w:nsid w:val="09FE039D"/>
     <w:multiLevelType w:val="singleLevel"/>
     <w:tmpl w:val="04160001"/>
     <w:lvl w:ilvl="0">
@@ -26563,7 +26725,7 @@
     </w:lvl>
   </w:abstractNum>
   <w:abstractNum w:abstractNumId="3" w15:restartNumberingAfterBreak="0">
-    <w:nsid w:val="10053485"/>
+    <w:nsid w:val="0B4E5D7F"/>
     <w:multiLevelType w:val="singleLevel"/>
     <w:tmpl w:val="04160001"/>
     <w:lvl w:ilvl="0">
@@ -26580,7 +26742,7 @@
     </w:lvl>
   </w:abstractNum>
   <w:abstractNum w:abstractNumId="4" w15:restartNumberingAfterBreak="0">
-    <w:nsid w:val="10A969C7"/>
+    <w:nsid w:val="0E91156C"/>
     <w:multiLevelType w:val="singleLevel"/>
     <w:tmpl w:val="04160001"/>
     <w:lvl w:ilvl="0">
@@ -26597,7 +26759,7 @@
     </w:lvl>
   </w:abstractNum>
   <w:abstractNum w:abstractNumId="5" w15:restartNumberingAfterBreak="0">
-    <w:nsid w:val="13A12C09"/>
+    <w:nsid w:val="11163B21"/>
     <w:multiLevelType w:val="singleLevel"/>
     <w:tmpl w:val="04160001"/>
     <w:lvl w:ilvl="0">
@@ -26614,7 +26776,7 @@
     </w:lvl>
   </w:abstractNum>
   <w:abstractNum w:abstractNumId="6" w15:restartNumberingAfterBreak="0">
-    <w:nsid w:val="195E66CF"/>
+    <w:nsid w:val="11996076"/>
     <w:multiLevelType w:val="singleLevel"/>
     <w:tmpl w:val="04160001"/>
     <w:lvl w:ilvl="0">
@@ -26631,7 +26793,7 @@
     </w:lvl>
   </w:abstractNum>
   <w:abstractNum w:abstractNumId="7" w15:restartNumberingAfterBreak="0">
-    <w:nsid w:val="21870055"/>
+    <w:nsid w:val="11AB7E08"/>
     <w:multiLevelType w:val="singleLevel"/>
     <w:tmpl w:val="04160001"/>
     <w:lvl w:ilvl="0">
@@ -26648,7 +26810,7 @@
     </w:lvl>
   </w:abstractNum>
   <w:abstractNum w:abstractNumId="8" w15:restartNumberingAfterBreak="0">
-    <w:nsid w:val="21916885"/>
+    <w:nsid w:val="138F7724"/>
     <w:multiLevelType w:val="singleLevel"/>
     <w:tmpl w:val="04160001"/>
     <w:lvl w:ilvl="0">
@@ -26665,7 +26827,7 @@
     </w:lvl>
   </w:abstractNum>
   <w:abstractNum w:abstractNumId="9" w15:restartNumberingAfterBreak="0">
-    <w:nsid w:val="252C53E0"/>
+    <w:nsid w:val="15713DDB"/>
     <w:multiLevelType w:val="singleLevel"/>
     <w:tmpl w:val="04160001"/>
     <w:lvl w:ilvl="0">
@@ -26682,7 +26844,7 @@
     </w:lvl>
   </w:abstractNum>
   <w:abstractNum w:abstractNumId="10" w15:restartNumberingAfterBreak="0">
-    <w:nsid w:val="27454707"/>
+    <w:nsid w:val="185D5752"/>
     <w:multiLevelType w:val="singleLevel"/>
     <w:tmpl w:val="04160001"/>
     <w:lvl w:ilvl="0">
@@ -26699,7 +26861,7 @@
     </w:lvl>
   </w:abstractNum>
   <w:abstractNum w:abstractNumId="11" w15:restartNumberingAfterBreak="0">
-    <w:nsid w:val="288F3C9A"/>
+    <w:nsid w:val="23117B76"/>
     <w:multiLevelType w:val="singleLevel"/>
     <w:tmpl w:val="04160001"/>
     <w:lvl w:ilvl="0">
@@ -26716,7 +26878,7 @@
     </w:lvl>
   </w:abstractNum>
   <w:abstractNum w:abstractNumId="12" w15:restartNumberingAfterBreak="0">
-    <w:nsid w:val="298E6E15"/>
+    <w:nsid w:val="28214323"/>
     <w:multiLevelType w:val="singleLevel"/>
     <w:tmpl w:val="04160001"/>
     <w:lvl w:ilvl="0">
@@ -26733,7 +26895,7 @@
     </w:lvl>
   </w:abstractNum>
   <w:abstractNum w:abstractNumId="13" w15:restartNumberingAfterBreak="0">
-    <w:nsid w:val="2DFA1CDE"/>
+    <w:nsid w:val="2CBE317F"/>
     <w:multiLevelType w:val="singleLevel"/>
     <w:tmpl w:val="04160001"/>
     <w:lvl w:ilvl="0">
@@ -26750,7 +26912,7 @@
     </w:lvl>
   </w:abstractNum>
   <w:abstractNum w:abstractNumId="14" w15:restartNumberingAfterBreak="0">
-    <w:nsid w:val="33A861BB"/>
+    <w:nsid w:val="2F187A3F"/>
     <w:multiLevelType w:val="singleLevel"/>
     <w:tmpl w:val="04160001"/>
     <w:lvl w:ilvl="0">
@@ -26767,7 +26929,7 @@
     </w:lvl>
   </w:abstractNum>
   <w:abstractNum w:abstractNumId="15" w15:restartNumberingAfterBreak="0">
-    <w:nsid w:val="34253CAD"/>
+    <w:nsid w:val="31F12EBE"/>
     <w:multiLevelType w:val="singleLevel"/>
     <w:tmpl w:val="04160001"/>
     <w:lvl w:ilvl="0">
@@ -26784,7 +26946,7 @@
     </w:lvl>
   </w:abstractNum>
   <w:abstractNum w:abstractNumId="16" w15:restartNumberingAfterBreak="0">
-    <w:nsid w:val="34F84013"/>
+    <w:nsid w:val="3C280413"/>
     <w:multiLevelType w:val="singleLevel"/>
     <w:tmpl w:val="04160001"/>
     <w:lvl w:ilvl="0">
@@ -26801,7 +26963,7 @@
     </w:lvl>
   </w:abstractNum>
   <w:abstractNum w:abstractNumId="17" w15:restartNumberingAfterBreak="0">
-    <w:nsid w:val="366634C3"/>
+    <w:nsid w:val="41C8642A"/>
     <w:multiLevelType w:val="singleLevel"/>
     <w:tmpl w:val="04160001"/>
     <w:lvl w:ilvl="0">
@@ -26818,7 +26980,7 @@
     </w:lvl>
   </w:abstractNum>
   <w:abstractNum w:abstractNumId="18" w15:restartNumberingAfterBreak="0">
-    <w:nsid w:val="37667F38"/>
+    <w:nsid w:val="44606987"/>
     <w:multiLevelType w:val="singleLevel"/>
     <w:tmpl w:val="04160001"/>
     <w:lvl w:ilvl="0">
@@ -26835,7 +26997,7 @@
     </w:lvl>
   </w:abstractNum>
   <w:abstractNum w:abstractNumId="19" w15:restartNumberingAfterBreak="0">
-    <w:nsid w:val="3A371D1A"/>
+    <w:nsid w:val="45FC236C"/>
     <w:multiLevelType w:val="singleLevel"/>
     <w:tmpl w:val="04160001"/>
     <w:lvl w:ilvl="0">
@@ -26852,7 +27014,7 @@
     </w:lvl>
   </w:abstractNum>
   <w:abstractNum w:abstractNumId="20" w15:restartNumberingAfterBreak="0">
-    <w:nsid w:val="3D0F2813"/>
+    <w:nsid w:val="473C0D01"/>
     <w:multiLevelType w:val="singleLevel"/>
     <w:tmpl w:val="04160001"/>
     <w:lvl w:ilvl="0">
@@ -26869,7 +27031,7 @@
     </w:lvl>
   </w:abstractNum>
   <w:abstractNum w:abstractNumId="21" w15:restartNumberingAfterBreak="0">
-    <w:nsid w:val="3D936641"/>
+    <w:nsid w:val="4CD01F0D"/>
     <w:multiLevelType w:val="singleLevel"/>
     <w:tmpl w:val="04160001"/>
     <w:lvl w:ilvl="0">
@@ -26886,7 +27048,7 @@
     </w:lvl>
   </w:abstractNum>
   <w:abstractNum w:abstractNumId="22" w15:restartNumberingAfterBreak="0">
-    <w:nsid w:val="3F4621B2"/>
+    <w:nsid w:val="4D62734B"/>
     <w:multiLevelType w:val="singleLevel"/>
     <w:tmpl w:val="04160001"/>
     <w:lvl w:ilvl="0">
@@ -26903,7 +27065,7 @@
     </w:lvl>
   </w:abstractNum>
   <w:abstractNum w:abstractNumId="23" w15:restartNumberingAfterBreak="0">
-    <w:nsid w:val="400255D9"/>
+    <w:nsid w:val="4E363247"/>
     <w:multiLevelType w:val="singleLevel"/>
     <w:tmpl w:val="04160001"/>
     <w:lvl w:ilvl="0">
@@ -26920,7 +27082,7 @@
     </w:lvl>
   </w:abstractNum>
   <w:abstractNum w:abstractNumId="24" w15:restartNumberingAfterBreak="0">
-    <w:nsid w:val="41657299"/>
+    <w:nsid w:val="4E7402E1"/>
     <w:multiLevelType w:val="singleLevel"/>
     <w:tmpl w:val="04160001"/>
     <w:lvl w:ilvl="0">
@@ -26937,7 +27099,7 @@
     </w:lvl>
   </w:abstractNum>
   <w:abstractNum w:abstractNumId="25" w15:restartNumberingAfterBreak="0">
-    <w:nsid w:val="4A8506A2"/>
+    <w:nsid w:val="4ED04CCE"/>
     <w:multiLevelType w:val="singleLevel"/>
     <w:tmpl w:val="04160001"/>
     <w:lvl w:ilvl="0">
@@ -26954,7 +27116,7 @@
     </w:lvl>
   </w:abstractNum>
   <w:abstractNum w:abstractNumId="26" w15:restartNumberingAfterBreak="0">
-    <w:nsid w:val="54877EE0"/>
+    <w:nsid w:val="4FB3422F"/>
     <w:multiLevelType w:val="singleLevel"/>
     <w:tmpl w:val="04160001"/>
     <w:lvl w:ilvl="0">
@@ -26971,7 +27133,7 @@
     </w:lvl>
   </w:abstractNum>
   <w:abstractNum w:abstractNumId="27" w15:restartNumberingAfterBreak="0">
-    <w:nsid w:val="56B478D1"/>
+    <w:nsid w:val="527B0183"/>
     <w:multiLevelType w:val="singleLevel"/>
     <w:tmpl w:val="04160001"/>
     <w:lvl w:ilvl="0">
@@ -26988,7 +27150,7 @@
     </w:lvl>
   </w:abstractNum>
   <w:abstractNum w:abstractNumId="28" w15:restartNumberingAfterBreak="0">
-    <w:nsid w:val="57703043"/>
+    <w:nsid w:val="5489490C"/>
     <w:multiLevelType w:val="singleLevel"/>
     <w:tmpl w:val="04160001"/>
     <w:lvl w:ilvl="0">
@@ -27005,7 +27167,7 @@
     </w:lvl>
   </w:abstractNum>
   <w:abstractNum w:abstractNumId="29" w15:restartNumberingAfterBreak="0">
-    <w:nsid w:val="581C64C7"/>
+    <w:nsid w:val="58B43F9F"/>
     <w:multiLevelType w:val="singleLevel"/>
     <w:tmpl w:val="04160001"/>
     <w:lvl w:ilvl="0">
@@ -27022,7 +27184,7 @@
     </w:lvl>
   </w:abstractNum>
   <w:abstractNum w:abstractNumId="30" w15:restartNumberingAfterBreak="0">
-    <w:nsid w:val="585B6B5B"/>
+    <w:nsid w:val="5FD41642"/>
     <w:multiLevelType w:val="singleLevel"/>
     <w:tmpl w:val="04160001"/>
     <w:lvl w:ilvl="0">
@@ -27039,7 +27201,7 @@
     </w:lvl>
   </w:abstractNum>
   <w:abstractNum w:abstractNumId="31" w15:restartNumberingAfterBreak="0">
-    <w:nsid w:val="58A62B43"/>
+    <w:nsid w:val="62DA22B0"/>
     <w:multiLevelType w:val="singleLevel"/>
     <w:tmpl w:val="04160001"/>
     <w:lvl w:ilvl="0">
@@ -27056,7 +27218,7 @@
     </w:lvl>
   </w:abstractNum>
   <w:abstractNum w:abstractNumId="32" w15:restartNumberingAfterBreak="0">
-    <w:nsid w:val="5DCE76ED"/>
+    <w:nsid w:val="67B43E63"/>
     <w:multiLevelType w:val="singleLevel"/>
     <w:tmpl w:val="04160001"/>
     <w:lvl w:ilvl="0">
@@ -27073,7 +27235,7 @@
     </w:lvl>
   </w:abstractNum>
   <w:abstractNum w:abstractNumId="33" w15:restartNumberingAfterBreak="0">
-    <w:nsid w:val="62CE3C48"/>
+    <w:nsid w:val="6A045827"/>
     <w:multiLevelType w:val="singleLevel"/>
     <w:tmpl w:val="04160001"/>
     <w:lvl w:ilvl="0">
@@ -27090,7 +27252,7 @@
     </w:lvl>
   </w:abstractNum>
   <w:abstractNum w:abstractNumId="34" w15:restartNumberingAfterBreak="0">
-    <w:nsid w:val="66010EC4"/>
+    <w:nsid w:val="6BC07AD8"/>
     <w:multiLevelType w:val="singleLevel"/>
     <w:tmpl w:val="04160001"/>
     <w:lvl w:ilvl="0">
@@ -27107,7 +27269,7 @@
     </w:lvl>
   </w:abstractNum>
   <w:abstractNum w:abstractNumId="35" w15:restartNumberingAfterBreak="0">
-    <w:nsid w:val="6D9371F2"/>
+    <w:nsid w:val="6C3331EA"/>
     <w:multiLevelType w:val="singleLevel"/>
     <w:tmpl w:val="04160001"/>
     <w:lvl w:ilvl="0">
@@ -27124,7 +27286,7 @@
     </w:lvl>
   </w:abstractNum>
   <w:abstractNum w:abstractNumId="36" w15:restartNumberingAfterBreak="0">
-    <w:nsid w:val="6F597B8F"/>
+    <w:nsid w:val="6ED82514"/>
     <w:multiLevelType w:val="singleLevel"/>
     <w:tmpl w:val="04160001"/>
     <w:lvl w:ilvl="0">
@@ -27141,7 +27303,7 @@
     </w:lvl>
   </w:abstractNum>
   <w:abstractNum w:abstractNumId="37" w15:restartNumberingAfterBreak="0">
-    <w:nsid w:val="703B4967"/>
+    <w:nsid w:val="7A22405F"/>
     <w:multiLevelType w:val="singleLevel"/>
     <w:tmpl w:val="04160001"/>
     <w:lvl w:ilvl="0">
@@ -27158,7 +27320,7 @@
     </w:lvl>
   </w:abstractNum>
   <w:abstractNum w:abstractNumId="38" w15:restartNumberingAfterBreak="0">
-    <w:nsid w:val="76197F3D"/>
+    <w:nsid w:val="7C180533"/>
     <w:multiLevelType w:val="singleLevel"/>
     <w:tmpl w:val="04160001"/>
     <w:lvl w:ilvl="0">
@@ -27175,7 +27337,7 @@
     </w:lvl>
   </w:abstractNum>
   <w:abstractNum w:abstractNumId="39" w15:restartNumberingAfterBreak="0">
-    <w:nsid w:val="76794113"/>
+    <w:nsid w:val="7F0F2A04"/>
     <w:multiLevelType w:val="singleLevel"/>
     <w:tmpl w:val="04160001"/>
     <w:lvl w:ilvl="0">
@@ -27192,7 +27354,7 @@
     </w:lvl>
   </w:abstractNum>
   <w:abstractNum w:abstractNumId="40" w15:restartNumberingAfterBreak="0">
-    <w:nsid w:val="7E5D0C0B"/>
+    <w:nsid w:val="7F553D3C"/>
     <w:multiLevelType w:val="singleLevel"/>
     <w:tmpl w:val="04160001"/>
     <w:lvl w:ilvl="0">
@@ -27208,128 +27370,128 @@
       </w:rPr>
     </w:lvl>
   </w:abstractNum>
-  <w:num w:numId="1" w16cid:durableId="2106536095">
+  <w:num w:numId="1" w16cid:durableId="1045643675">
+    <w:abstractNumId w:val="8"/>
+  </w:num>
+  <w:num w:numId="2" w16cid:durableId="470170162">
+    <w:abstractNumId w:val="23"/>
+  </w:num>
+  <w:num w:numId="3" w16cid:durableId="681276898">
+    <w:abstractNumId w:val="17"/>
+  </w:num>
+  <w:num w:numId="4" w16cid:durableId="1042940547">
+    <w:abstractNumId w:val="38"/>
+  </w:num>
+  <w:num w:numId="5" w16cid:durableId="2093891213">
+    <w:abstractNumId w:val="32"/>
+  </w:num>
+  <w:num w:numId="6" w16cid:durableId="467554412">
+    <w:abstractNumId w:val="37"/>
+  </w:num>
+  <w:num w:numId="7" w16cid:durableId="696731862">
+    <w:abstractNumId w:val="4"/>
+  </w:num>
+  <w:num w:numId="8" w16cid:durableId="1876233967">
+    <w:abstractNumId w:val="7"/>
+  </w:num>
+  <w:num w:numId="9" w16cid:durableId="825123474">
+    <w:abstractNumId w:val="19"/>
+  </w:num>
+  <w:num w:numId="10" w16cid:durableId="158469006">
     <w:abstractNumId w:val="39"/>
   </w:num>
-  <w:num w:numId="2" w16cid:durableId="1758749000">
+  <w:num w:numId="11" w16cid:durableId="398745231">
+    <w:abstractNumId w:val="21"/>
+  </w:num>
+  <w:num w:numId="12" w16cid:durableId="1624187920">
+    <w:abstractNumId w:val="16"/>
+  </w:num>
+  <w:num w:numId="13" w16cid:durableId="1254826062">
+    <w:abstractNumId w:val="3"/>
+  </w:num>
+  <w:num w:numId="14" w16cid:durableId="135684153">
+    <w:abstractNumId w:val="15"/>
+  </w:num>
+  <w:num w:numId="15" w16cid:durableId="2072270697">
+    <w:abstractNumId w:val="12"/>
+  </w:num>
+  <w:num w:numId="16" w16cid:durableId="653338026">
+    <w:abstractNumId w:val="13"/>
+  </w:num>
+  <w:num w:numId="17" w16cid:durableId="1249341027">
+    <w:abstractNumId w:val="2"/>
+  </w:num>
+  <w:num w:numId="18" w16cid:durableId="405420351">
+    <w:abstractNumId w:val="28"/>
+  </w:num>
+  <w:num w:numId="19" w16cid:durableId="716509082">
+    <w:abstractNumId w:val="20"/>
+  </w:num>
+  <w:num w:numId="20" w16cid:durableId="744038407">
+    <w:abstractNumId w:val="31"/>
+  </w:num>
+  <w:num w:numId="21" w16cid:durableId="1967734586">
+    <w:abstractNumId w:val="18"/>
+  </w:num>
+  <w:num w:numId="22" w16cid:durableId="857735897">
+    <w:abstractNumId w:val="34"/>
+  </w:num>
+  <w:num w:numId="23" w16cid:durableId="711807242">
+    <w:abstractNumId w:val="11"/>
+  </w:num>
+  <w:num w:numId="24" w16cid:durableId="758258617">
+    <w:abstractNumId w:val="24"/>
+  </w:num>
+  <w:num w:numId="25" w16cid:durableId="1752045159">
+    <w:abstractNumId w:val="10"/>
+  </w:num>
+  <w:num w:numId="26" w16cid:durableId="1712993716">
+    <w:abstractNumId w:val="1"/>
+  </w:num>
+  <w:num w:numId="27" w16cid:durableId="267276736">
+    <w:abstractNumId w:val="40"/>
+  </w:num>
+  <w:num w:numId="28" w16cid:durableId="1060639203">
+    <w:abstractNumId w:val="27"/>
+  </w:num>
+  <w:num w:numId="29" w16cid:durableId="23290824">
+    <w:abstractNumId w:val="22"/>
+  </w:num>
+  <w:num w:numId="30" w16cid:durableId="135684294">
+    <w:abstractNumId w:val="26"/>
+  </w:num>
+  <w:num w:numId="31" w16cid:durableId="1797874327">
+    <w:abstractNumId w:val="6"/>
+  </w:num>
+  <w:num w:numId="32" w16cid:durableId="1747921381">
+    <w:abstractNumId w:val="0"/>
+  </w:num>
+  <w:num w:numId="33" w16cid:durableId="461504880">
+    <w:abstractNumId w:val="29"/>
+  </w:num>
+  <w:num w:numId="34" w16cid:durableId="763956352">
+    <w:abstractNumId w:val="25"/>
+  </w:num>
+  <w:num w:numId="35" w16cid:durableId="282882014">
+    <w:abstractNumId w:val="36"/>
+  </w:num>
+  <w:num w:numId="36" w16cid:durableId="1822650996">
+    <w:abstractNumId w:val="9"/>
+  </w:num>
+  <w:num w:numId="37" w16cid:durableId="1757903558">
+    <w:abstractNumId w:val="30"/>
+  </w:num>
+  <w:num w:numId="38" w16cid:durableId="1557814177">
     <w:abstractNumId w:val="33"/>
   </w:num>
-  <w:num w:numId="3" w16cid:durableId="536546478">
-    <w:abstractNumId w:val="15"/>
+  <w:num w:numId="39" w16cid:durableId="733545222">
+    <w:abstractNumId w:val="14"/>
   </w:num>
-  <w:num w:numId="4" w16cid:durableId="1473281088">
-    <w:abstractNumId w:val="40"/>
-  </w:num>
-  <w:num w:numId="5" w16cid:durableId="1181359102">
-    <w:abstractNumId w:val="6"/>
-  </w:num>
-  <w:num w:numId="6" w16cid:durableId="452948265">
-    <w:abstractNumId w:val="4"/>
-  </w:num>
-  <w:num w:numId="7" w16cid:durableId="1009403662">
-    <w:abstractNumId w:val="7"/>
-  </w:num>
-  <w:num w:numId="8" w16cid:durableId="391273958">
-    <w:abstractNumId w:val="2"/>
-  </w:num>
-  <w:num w:numId="9" w16cid:durableId="641157559">
-    <w:abstractNumId w:val="24"/>
-  </w:num>
-  <w:num w:numId="10" w16cid:durableId="695885594">
-    <w:abstractNumId w:val="8"/>
-  </w:num>
-  <w:num w:numId="11" w16cid:durableId="458689434">
-    <w:abstractNumId w:val="23"/>
-  </w:num>
-  <w:num w:numId="12" w16cid:durableId="1712538804">
-    <w:abstractNumId w:val="37"/>
-  </w:num>
-  <w:num w:numId="13" w16cid:durableId="1788962270">
-    <w:abstractNumId w:val="25"/>
-  </w:num>
-  <w:num w:numId="14" w16cid:durableId="913003199">
-    <w:abstractNumId w:val="20"/>
-  </w:num>
-  <w:num w:numId="15" w16cid:durableId="384178722">
-    <w:abstractNumId w:val="22"/>
-  </w:num>
-  <w:num w:numId="16" w16cid:durableId="693383842">
-    <w:abstractNumId w:val="12"/>
-  </w:num>
-  <w:num w:numId="17" w16cid:durableId="447162622">
-    <w:abstractNumId w:val="27"/>
-  </w:num>
-  <w:num w:numId="18" w16cid:durableId="1700545124">
-    <w:abstractNumId w:val="19"/>
-  </w:num>
-  <w:num w:numId="19" w16cid:durableId="2016805253">
-    <w:abstractNumId w:val="38"/>
-  </w:num>
-  <w:num w:numId="20" w16cid:durableId="2110082082">
-    <w:abstractNumId w:val="0"/>
-  </w:num>
-  <w:num w:numId="21" w16cid:durableId="1874030391">
-    <w:abstractNumId w:val="30"/>
-  </w:num>
-  <w:num w:numId="22" w16cid:durableId="451553878">
-    <w:abstractNumId w:val="32"/>
-  </w:num>
-  <w:num w:numId="23" w16cid:durableId="1630361093">
-    <w:abstractNumId w:val="31"/>
-  </w:num>
-  <w:num w:numId="24" w16cid:durableId="1437484464">
-    <w:abstractNumId w:val="10"/>
-  </w:num>
-  <w:num w:numId="25" w16cid:durableId="1090273620">
-    <w:abstractNumId w:val="36"/>
-  </w:num>
-  <w:num w:numId="26" w16cid:durableId="187719432">
+  <w:num w:numId="40" w16cid:durableId="1163858910">
     <w:abstractNumId w:val="35"/>
   </w:num>
-  <w:num w:numId="27" w16cid:durableId="1672296561">
+  <w:num w:numId="41" w16cid:durableId="88620099">
     <w:abstractNumId w:val="5"/>
-  </w:num>
-  <w:num w:numId="28" w16cid:durableId="1719744015">
-    <w:abstractNumId w:val="9"/>
-  </w:num>
-  <w:num w:numId="29" w16cid:durableId="267397317">
-    <w:abstractNumId w:val="29"/>
-  </w:num>
-  <w:num w:numId="30" w16cid:durableId="1053235682">
-    <w:abstractNumId w:val="18"/>
-  </w:num>
-  <w:num w:numId="31" w16cid:durableId="818838558">
-    <w:abstractNumId w:val="28"/>
-  </w:num>
-  <w:num w:numId="32" w16cid:durableId="420684169">
-    <w:abstractNumId w:val="16"/>
-  </w:num>
-  <w:num w:numId="33" w16cid:durableId="1772583389">
-    <w:abstractNumId w:val="34"/>
-  </w:num>
-  <w:num w:numId="34" w16cid:durableId="1274048723">
-    <w:abstractNumId w:val="11"/>
-  </w:num>
-  <w:num w:numId="35" w16cid:durableId="144249916">
-    <w:abstractNumId w:val="1"/>
-  </w:num>
-  <w:num w:numId="36" w16cid:durableId="1103452473">
-    <w:abstractNumId w:val="17"/>
-  </w:num>
-  <w:num w:numId="37" w16cid:durableId="504512070">
-    <w:abstractNumId w:val="26"/>
-  </w:num>
-  <w:num w:numId="38" w16cid:durableId="283926572">
-    <w:abstractNumId w:val="14"/>
-  </w:num>
-  <w:num w:numId="39" w16cid:durableId="407771475">
-    <w:abstractNumId w:val="13"/>
-  </w:num>
-  <w:num w:numId="40" w16cid:durableId="1402948222">
-    <w:abstractNumId w:val="3"/>
-  </w:num>
-  <w:num w:numId="41" w16cid:durableId="66463000">
-    <w:abstractNumId w:val="21"/>
   </w:num>
 </w:numbering>
 </file>
@@ -27742,7 +27904,7 @@
     <w:link w:val="Ttulo1Char"/>
     <w:uiPriority w:val="9"/>
     <w:qFormat/>
-    <w:rsid w:val="00163458"/>
+    <w:rsid w:val="00222017"/>
     <w:pPr>
       <w:keepNext/>
       <w:keepLines/>
@@ -27764,7 +27926,7 @@
     <w:uiPriority w:val="9"/>
     <w:unhideWhenUsed/>
     <w:qFormat/>
-    <w:rsid w:val="00163458"/>
+    <w:rsid w:val="00222017"/>
     <w:pPr>
       <w:keepNext/>
       <w:keepLines/>
@@ -27787,7 +27949,7 @@
     <w:semiHidden/>
     <w:unhideWhenUsed/>
     <w:qFormat/>
-    <w:rsid w:val="00163458"/>
+    <w:rsid w:val="00222017"/>
     <w:pPr>
       <w:keepNext/>
       <w:keepLines/>
@@ -27810,7 +27972,7 @@
     <w:semiHidden/>
     <w:unhideWhenUsed/>
     <w:qFormat/>
-    <w:rsid w:val="00163458"/>
+    <w:rsid w:val="00222017"/>
     <w:pPr>
       <w:keepNext/>
       <w:keepLines/>
@@ -27833,7 +27995,7 @@
     <w:semiHidden/>
     <w:unhideWhenUsed/>
     <w:qFormat/>
-    <w:rsid w:val="00163458"/>
+    <w:rsid w:val="00222017"/>
     <w:pPr>
       <w:keepNext/>
       <w:keepLines/>
@@ -27854,7 +28016,7 @@
     <w:semiHidden/>
     <w:unhideWhenUsed/>
     <w:qFormat/>
-    <w:rsid w:val="00163458"/>
+    <w:rsid w:val="00222017"/>
     <w:pPr>
       <w:keepNext/>
       <w:keepLines/>
@@ -27877,7 +28039,7 @@
     <w:semiHidden/>
     <w:unhideWhenUsed/>
     <w:qFormat/>
-    <w:rsid w:val="00163458"/>
+    <w:rsid w:val="00222017"/>
     <w:pPr>
       <w:keepNext/>
       <w:keepLines/>
@@ -27898,7 +28060,7 @@
     <w:semiHidden/>
     <w:unhideWhenUsed/>
     <w:qFormat/>
-    <w:rsid w:val="00163458"/>
+    <w:rsid w:val="00222017"/>
     <w:pPr>
       <w:keepNext/>
       <w:keepLines/>
@@ -27921,7 +28083,7 @@
     <w:semiHidden/>
     <w:unhideWhenUsed/>
     <w:qFormat/>
-    <w:rsid w:val="00163458"/>
+    <w:rsid w:val="00222017"/>
     <w:pPr>
       <w:keepNext/>
       <w:keepLines/>
@@ -27965,7 +28127,7 @@
     <w:basedOn w:val="Fontepargpadro"/>
     <w:link w:val="Ttulo1"/>
     <w:uiPriority w:val="9"/>
-    <w:rsid w:val="00163458"/>
+    <w:rsid w:val="00222017"/>
     <w:rPr>
       <w:rFonts w:asciiTheme="majorHAnsi" w:eastAsiaTheme="majorEastAsia" w:hAnsiTheme="majorHAnsi" w:cstheme="majorBidi"/>
       <w:color w:val="0F4761" w:themeColor="accent1" w:themeShade="BF"/>
@@ -27978,7 +28140,7 @@
     <w:basedOn w:val="Fontepargpadro"/>
     <w:link w:val="Ttulo2"/>
     <w:uiPriority w:val="9"/>
-    <w:rsid w:val="00163458"/>
+    <w:rsid w:val="00222017"/>
     <w:rPr>
       <w:rFonts w:asciiTheme="majorHAnsi" w:eastAsiaTheme="majorEastAsia" w:hAnsiTheme="majorHAnsi" w:cstheme="majorBidi"/>
       <w:color w:val="0F4761" w:themeColor="accent1" w:themeShade="BF"/>
@@ -27992,7 +28154,7 @@
     <w:link w:val="Ttulo3"/>
     <w:uiPriority w:val="9"/>
     <w:semiHidden/>
-    <w:rsid w:val="00163458"/>
+    <w:rsid w:val="00222017"/>
     <w:rPr>
       <w:rFonts w:eastAsiaTheme="majorEastAsia" w:cstheme="majorBidi"/>
       <w:color w:val="0F4761" w:themeColor="accent1" w:themeShade="BF"/>
@@ -28006,7 +28168,7 @@
     <w:link w:val="Ttulo4"/>
     <w:uiPriority w:val="9"/>
     <w:semiHidden/>
-    <w:rsid w:val="00163458"/>
+    <w:rsid w:val="00222017"/>
     <w:rPr>
       <w:rFonts w:eastAsiaTheme="majorEastAsia" w:cstheme="majorBidi"/>
       <w:i/>
@@ -28020,7 +28182,7 @@
     <w:link w:val="Ttulo5"/>
     <w:uiPriority w:val="9"/>
     <w:semiHidden/>
-    <w:rsid w:val="00163458"/>
+    <w:rsid w:val="00222017"/>
     <w:rPr>
       <w:rFonts w:eastAsiaTheme="majorEastAsia" w:cstheme="majorBidi"/>
       <w:color w:val="0F4761" w:themeColor="accent1" w:themeShade="BF"/>
@@ -28032,7 +28194,7 @@
     <w:link w:val="Ttulo6"/>
     <w:uiPriority w:val="9"/>
     <w:semiHidden/>
-    <w:rsid w:val="00163458"/>
+    <w:rsid w:val="00222017"/>
     <w:rPr>
       <w:rFonts w:eastAsiaTheme="majorEastAsia" w:cstheme="majorBidi"/>
       <w:i/>
@@ -28046,7 +28208,7 @@
     <w:link w:val="Ttulo7"/>
     <w:uiPriority w:val="9"/>
     <w:semiHidden/>
-    <w:rsid w:val="00163458"/>
+    <w:rsid w:val="00222017"/>
     <w:rPr>
       <w:rFonts w:eastAsiaTheme="majorEastAsia" w:cstheme="majorBidi"/>
       <w:color w:val="595959" w:themeColor="text1" w:themeTint="A6"/>
@@ -28058,7 +28220,7 @@
     <w:link w:val="Ttulo8"/>
     <w:uiPriority w:val="9"/>
     <w:semiHidden/>
-    <w:rsid w:val="00163458"/>
+    <w:rsid w:val="00222017"/>
     <w:rPr>
       <w:rFonts w:eastAsiaTheme="majorEastAsia" w:cstheme="majorBidi"/>
       <w:i/>
@@ -28072,7 +28234,7 @@
     <w:link w:val="Ttulo9"/>
     <w:uiPriority w:val="9"/>
     <w:semiHidden/>
-    <w:rsid w:val="00163458"/>
+    <w:rsid w:val="00222017"/>
     <w:rPr>
       <w:rFonts w:eastAsiaTheme="majorEastAsia" w:cstheme="majorBidi"/>
       <w:color w:val="272727" w:themeColor="text1" w:themeTint="D8"/>
@@ -28085,7 +28247,7 @@
     <w:link w:val="TtuloChar"/>
     <w:uiPriority w:val="10"/>
     <w:qFormat/>
-    <w:rsid w:val="00163458"/>
+    <w:rsid w:val="00222017"/>
     <w:pPr>
       <w:spacing w:after="80" w:line="240" w:lineRule="auto"/>
       <w:contextualSpacing/>
@@ -28103,7 +28265,7 @@
     <w:basedOn w:val="Fontepargpadro"/>
     <w:link w:val="Ttulo"/>
     <w:uiPriority w:val="10"/>
-    <w:rsid w:val="00163458"/>
+    <w:rsid w:val="00222017"/>
     <w:rPr>
       <w:rFonts w:asciiTheme="majorHAnsi" w:eastAsiaTheme="majorEastAsia" w:hAnsiTheme="majorHAnsi" w:cstheme="majorBidi"/>
       <w:spacing w:val="-10"/>
@@ -28119,7 +28281,7 @@
     <w:link w:val="SubttuloChar"/>
     <w:uiPriority w:val="11"/>
     <w:qFormat/>
-    <w:rsid w:val="00163458"/>
+    <w:rsid w:val="00222017"/>
     <w:pPr>
       <w:numPr>
         <w:ilvl w:val="1"/>
@@ -28138,7 +28300,7 @@
     <w:basedOn w:val="Fontepargpadro"/>
     <w:link w:val="Subttulo"/>
     <w:uiPriority w:val="11"/>
-    <w:rsid w:val="00163458"/>
+    <w:rsid w:val="00222017"/>
     <w:rPr>
       <w:rFonts w:eastAsiaTheme="majorEastAsia" w:cstheme="majorBidi"/>
       <w:color w:val="595959" w:themeColor="text1" w:themeTint="A6"/>
@@ -28154,7 +28316,7 @@
     <w:link w:val="CitaoChar"/>
     <w:uiPriority w:val="29"/>
     <w:qFormat/>
-    <w:rsid w:val="00163458"/>
+    <w:rsid w:val="00222017"/>
     <w:pPr>
       <w:spacing w:before="160"/>
       <w:jc w:val="center"/>
@@ -28170,7 +28332,7 @@
     <w:basedOn w:val="Fontepargpadro"/>
     <w:link w:val="Citao"/>
     <w:uiPriority w:val="29"/>
-    <w:rsid w:val="00163458"/>
+    <w:rsid w:val="00222017"/>
     <w:rPr>
       <w:i/>
       <w:iCs/>
@@ -28182,7 +28344,7 @@
     <w:basedOn w:val="Normal"/>
     <w:uiPriority w:val="34"/>
     <w:qFormat/>
-    <w:rsid w:val="00163458"/>
+    <w:rsid w:val="00222017"/>
     <w:pPr>
       <w:ind w:left="720"/>
       <w:contextualSpacing/>
@@ -28193,7 +28355,7 @@
     <w:basedOn w:val="Fontepargpadro"/>
     <w:uiPriority w:val="21"/>
     <w:qFormat/>
-    <w:rsid w:val="00163458"/>
+    <w:rsid w:val="00222017"/>
     <w:rPr>
       <w:i/>
       <w:iCs/>
@@ -28207,7 +28369,7 @@
     <w:link w:val="CitaoIntensaChar"/>
     <w:uiPriority w:val="30"/>
     <w:qFormat/>
-    <w:rsid w:val="00163458"/>
+    <w:rsid w:val="00222017"/>
     <w:pPr>
       <w:pBdr>
         <w:top w:val="single" w:sz="4" w:space="10" w:color="0F4761" w:themeColor="accent1" w:themeShade="BF"/>
@@ -28228,7 +28390,7 @@
     <w:basedOn w:val="Fontepargpadro"/>
     <w:link w:val="CitaoIntensa"/>
     <w:uiPriority w:val="30"/>
-    <w:rsid w:val="00163458"/>
+    <w:rsid w:val="00222017"/>
     <w:rPr>
       <w:i/>
       <w:iCs/>
@@ -28240,7 +28402,7 @@
     <w:basedOn w:val="Fontepargpadro"/>
     <w:uiPriority w:val="32"/>
     <w:qFormat/>
-    <w:rsid w:val="00163458"/>
+    <w:rsid w:val="00222017"/>
     <w:rPr>
       <w:b/>
       <w:bCs/>
@@ -28255,7 +28417,7 @@
     <w:link w:val="CabealhoChar"/>
     <w:uiPriority w:val="99"/>
     <w:unhideWhenUsed/>
-    <w:rsid w:val="00163458"/>
+    <w:rsid w:val="00222017"/>
     <w:pPr>
       <w:tabs>
         <w:tab w:val="center" w:pos="4252"/>
@@ -28269,7 +28431,7 @@
     <w:basedOn w:val="Fontepargpadro"/>
     <w:link w:val="Cabealho"/>
     <w:uiPriority w:val="99"/>
-    <w:rsid w:val="00163458"/>
+    <w:rsid w:val="00222017"/>
   </w:style>
   <w:style w:type="paragraph" w:styleId="Rodap">
     <w:name w:val="footer"/>
@@ -28277,7 +28439,7 @@
     <w:link w:val="RodapChar"/>
     <w:uiPriority w:val="99"/>
     <w:unhideWhenUsed/>
-    <w:rsid w:val="00163458"/>
+    <w:rsid w:val="00222017"/>
     <w:pPr>
       <w:tabs>
         <w:tab w:val="center" w:pos="4252"/>
@@ -28291,7 +28453,7 @@
     <w:basedOn w:val="Fontepargpadro"/>
     <w:link w:val="Rodap"/>
     <w:uiPriority w:val="99"/>
-    <w:rsid w:val="00163458"/>
+    <w:rsid w:val="00222017"/>
   </w:style>
   <w:style w:type="paragraph" w:styleId="Sumrio1">
     <w:name w:val="toc 1"/>
@@ -28300,7 +28462,7 @@
     <w:autoRedefine/>
     <w:uiPriority w:val="39"/>
     <w:unhideWhenUsed/>
-    <w:rsid w:val="00163458"/>
+    <w:rsid w:val="00222017"/>
     <w:pPr>
       <w:spacing w:after="100"/>
     </w:pPr>
@@ -28312,7 +28474,7 @@
     <w:autoRedefine/>
     <w:uiPriority w:val="39"/>
     <w:unhideWhenUsed/>
-    <w:rsid w:val="00163458"/>
+    <w:rsid w:val="00222017"/>
     <w:pPr>
       <w:spacing w:after="100"/>
       <w:ind w:left="240"/>

</xml_diff>

<commit_message>
Atualiza Manual de Uso para os dias configuraveis dos avisos automaticos (versao 2.87)
Documenta o novo bloco Regras de aviso automatico de prazo e
execucao em Administracao > Configuracoes - ja implantado e
publicado no codigo.

Co-Authored-By: Claude Sonnet 5 <noreply@anthropic.com>
</commit_message>
<xml_diff>
--- a/Manual de Uso - Ferramenta de Gestao de Projetos.docx
+++ b/Manual de Uso - Ferramenta de Gestao de Projetos.docx
@@ -129,7 +129,7 @@
           <w:color w:val="6A6A70"/>
           <w:sz w:val="22"/>
         </w:rPr>
-        <w:t>Versao 2.86 - 17 de setembro de 2026 (substitui a versao 2.85 de 17/09/2026)</w:t>
+        <w:t>Versao 2.87 - 17 de setembro de 2026 (substitui a versao 2.86 de 17/09/2026)</w:t>
       </w:r>
     </w:p>
     <w:p>
@@ -229,7 +229,7 @@
         <w:rPr>
           <w:noProof/>
         </w:rPr>
-        <w:instrText xml:space="preserve"> PAGEREF _Toc240533420 \h </w:instrText>
+        <w:instrText xml:space="preserve"> PAGEREF _Toc240534275 \h </w:instrText>
       </w:r>
       <w:r>
         <w:rPr>
@@ -290,7 +290,7 @@
         <w:rPr>
           <w:noProof/>
         </w:rPr>
-        <w:instrText xml:space="preserve"> PAGEREF _Toc240533421 \h </w:instrText>
+        <w:instrText xml:space="preserve"> PAGEREF _Toc240534276 \h </w:instrText>
       </w:r>
       <w:r>
         <w:rPr>
@@ -351,7 +351,7 @@
         <w:rPr>
           <w:noProof/>
         </w:rPr>
-        <w:instrText xml:space="preserve"> PAGEREF _Toc240533422 \h </w:instrText>
+        <w:instrText xml:space="preserve"> PAGEREF _Toc240534277 \h </w:instrText>
       </w:r>
       <w:r>
         <w:rPr>
@@ -412,7 +412,7 @@
         <w:rPr>
           <w:noProof/>
         </w:rPr>
-        <w:instrText xml:space="preserve"> PAGEREF _Toc240533423 \h </w:instrText>
+        <w:instrText xml:space="preserve"> PAGEREF _Toc240534278 \h </w:instrText>
       </w:r>
       <w:r>
         <w:rPr>
@@ -473,7 +473,7 @@
         <w:rPr>
           <w:noProof/>
         </w:rPr>
-        <w:instrText xml:space="preserve"> PAGEREF _Toc240533424 \h </w:instrText>
+        <w:instrText xml:space="preserve"> PAGEREF _Toc240534279 \h </w:instrText>
       </w:r>
       <w:r>
         <w:rPr>
@@ -534,7 +534,7 @@
         <w:rPr>
           <w:noProof/>
         </w:rPr>
-        <w:instrText xml:space="preserve"> PAGEREF _Toc240533425 \h </w:instrText>
+        <w:instrText xml:space="preserve"> PAGEREF _Toc240534280 \h </w:instrText>
       </w:r>
       <w:r>
         <w:rPr>
@@ -595,7 +595,7 @@
         <w:rPr>
           <w:noProof/>
         </w:rPr>
-        <w:instrText xml:space="preserve"> PAGEREF _Toc240533426 \h </w:instrText>
+        <w:instrText xml:space="preserve"> PAGEREF _Toc240534281 \h </w:instrText>
       </w:r>
       <w:r>
         <w:rPr>
@@ -656,7 +656,7 @@
         <w:rPr>
           <w:noProof/>
         </w:rPr>
-        <w:instrText xml:space="preserve"> PAGEREF _Toc240533427 \h </w:instrText>
+        <w:instrText xml:space="preserve"> PAGEREF _Toc240534282 \h </w:instrText>
       </w:r>
       <w:r>
         <w:rPr>
@@ -717,7 +717,7 @@
         <w:rPr>
           <w:noProof/>
         </w:rPr>
-        <w:instrText xml:space="preserve"> PAGEREF _Toc240533428 \h </w:instrText>
+        <w:instrText xml:space="preserve"> PAGEREF _Toc240534283 \h </w:instrText>
       </w:r>
       <w:r>
         <w:rPr>
@@ -778,7 +778,7 @@
         <w:rPr>
           <w:noProof/>
         </w:rPr>
-        <w:instrText xml:space="preserve"> PAGEREF _Toc240533429 \h </w:instrText>
+        <w:instrText xml:space="preserve"> PAGEREF _Toc240534284 \h </w:instrText>
       </w:r>
       <w:r>
         <w:rPr>
@@ -839,7 +839,7 @@
         <w:rPr>
           <w:noProof/>
         </w:rPr>
-        <w:instrText xml:space="preserve"> PAGEREF _Toc240533430 \h </w:instrText>
+        <w:instrText xml:space="preserve"> PAGEREF _Toc240534285 \h </w:instrText>
       </w:r>
       <w:r>
         <w:rPr>
@@ -900,7 +900,7 @@
         <w:rPr>
           <w:noProof/>
         </w:rPr>
-        <w:instrText xml:space="preserve"> PAGEREF _Toc240533431 \h </w:instrText>
+        <w:instrText xml:space="preserve"> PAGEREF _Toc240534286 \h </w:instrText>
       </w:r>
       <w:r>
         <w:rPr>
@@ -961,7 +961,7 @@
         <w:rPr>
           <w:noProof/>
         </w:rPr>
-        <w:instrText xml:space="preserve"> PAGEREF _Toc240533432 \h </w:instrText>
+        <w:instrText xml:space="preserve"> PAGEREF _Toc240534287 \h </w:instrText>
       </w:r>
       <w:r>
         <w:rPr>
@@ -1022,7 +1022,7 @@
         <w:rPr>
           <w:noProof/>
         </w:rPr>
-        <w:instrText xml:space="preserve"> PAGEREF _Toc240533433 \h </w:instrText>
+        <w:instrText xml:space="preserve"> PAGEREF _Toc240534288 \h </w:instrText>
       </w:r>
       <w:r>
         <w:rPr>
@@ -1083,7 +1083,7 @@
         <w:rPr>
           <w:noProof/>
         </w:rPr>
-        <w:instrText xml:space="preserve"> PAGEREF _Toc240533434 \h </w:instrText>
+        <w:instrText xml:space="preserve"> PAGEREF _Toc240534289 \h </w:instrText>
       </w:r>
       <w:r>
         <w:rPr>
@@ -1144,7 +1144,7 @@
         <w:rPr>
           <w:noProof/>
         </w:rPr>
-        <w:instrText xml:space="preserve"> PAGEREF _Toc240533435 \h </w:instrText>
+        <w:instrText xml:space="preserve"> PAGEREF _Toc240534290 \h </w:instrText>
       </w:r>
       <w:r>
         <w:rPr>
@@ -1205,7 +1205,7 @@
         <w:rPr>
           <w:noProof/>
         </w:rPr>
-        <w:instrText xml:space="preserve"> PAGEREF _Toc240533436 \h </w:instrText>
+        <w:instrText xml:space="preserve"> PAGEREF _Toc240534291 \h </w:instrText>
       </w:r>
       <w:r>
         <w:rPr>
@@ -1266,7 +1266,7 @@
         <w:rPr>
           <w:noProof/>
         </w:rPr>
-        <w:instrText xml:space="preserve"> PAGEREF _Toc240533437 \h </w:instrText>
+        <w:instrText xml:space="preserve"> PAGEREF _Toc240534292 \h </w:instrText>
       </w:r>
       <w:r>
         <w:rPr>
@@ -1327,7 +1327,7 @@
         <w:rPr>
           <w:noProof/>
         </w:rPr>
-        <w:instrText xml:space="preserve"> PAGEREF _Toc240533438 \h </w:instrText>
+        <w:instrText xml:space="preserve"> PAGEREF _Toc240534293 \h </w:instrText>
       </w:r>
       <w:r>
         <w:rPr>
@@ -1388,7 +1388,7 @@
         <w:rPr>
           <w:noProof/>
         </w:rPr>
-        <w:instrText xml:space="preserve"> PAGEREF _Toc240533439 \h </w:instrText>
+        <w:instrText xml:space="preserve"> PAGEREF _Toc240534294 \h </w:instrText>
       </w:r>
       <w:r>
         <w:rPr>
@@ -1449,7 +1449,7 @@
         <w:rPr>
           <w:noProof/>
         </w:rPr>
-        <w:instrText xml:space="preserve"> PAGEREF _Toc240533440 \h </w:instrText>
+        <w:instrText xml:space="preserve"> PAGEREF _Toc240534295 \h </w:instrText>
       </w:r>
       <w:r>
         <w:rPr>
@@ -1510,7 +1510,7 @@
         <w:rPr>
           <w:noProof/>
         </w:rPr>
-        <w:instrText xml:space="preserve"> PAGEREF _Toc240533441 \h </w:instrText>
+        <w:instrText xml:space="preserve"> PAGEREF _Toc240534296 \h </w:instrText>
       </w:r>
       <w:r>
         <w:rPr>
@@ -1571,7 +1571,7 @@
         <w:rPr>
           <w:noProof/>
         </w:rPr>
-        <w:instrText xml:space="preserve"> PAGEREF _Toc240533442 \h </w:instrText>
+        <w:instrText xml:space="preserve"> PAGEREF _Toc240534297 \h </w:instrText>
       </w:r>
       <w:r>
         <w:rPr>
@@ -1632,7 +1632,7 @@
         <w:rPr>
           <w:noProof/>
         </w:rPr>
-        <w:instrText xml:space="preserve"> PAGEREF _Toc240533443 \h </w:instrText>
+        <w:instrText xml:space="preserve"> PAGEREF _Toc240534298 \h </w:instrText>
       </w:r>
       <w:r>
         <w:rPr>
@@ -1693,7 +1693,7 @@
         <w:rPr>
           <w:noProof/>
         </w:rPr>
-        <w:instrText xml:space="preserve"> PAGEREF _Toc240533444 \h </w:instrText>
+        <w:instrText xml:space="preserve"> PAGEREF _Toc240534299 \h </w:instrText>
       </w:r>
       <w:r>
         <w:rPr>
@@ -1754,7 +1754,7 @@
         <w:rPr>
           <w:noProof/>
         </w:rPr>
-        <w:instrText xml:space="preserve"> PAGEREF _Toc240533445 \h </w:instrText>
+        <w:instrText xml:space="preserve"> PAGEREF _Toc240534300 \h </w:instrText>
       </w:r>
       <w:r>
         <w:rPr>
@@ -1816,7 +1816,7 @@
         <w:rPr>
           <w:noProof/>
         </w:rPr>
-        <w:instrText xml:space="preserve"> PAGEREF _Toc240533446 \h </w:instrText>
+        <w:instrText xml:space="preserve"> PAGEREF _Toc240534301 \h </w:instrText>
       </w:r>
       <w:r>
         <w:rPr>
@@ -1877,7 +1877,7 @@
         <w:rPr>
           <w:noProof/>
         </w:rPr>
-        <w:instrText xml:space="preserve"> PAGEREF _Toc240533447 \h </w:instrText>
+        <w:instrText xml:space="preserve"> PAGEREF _Toc240534302 \h </w:instrText>
       </w:r>
       <w:r>
         <w:rPr>
@@ -1938,7 +1938,7 @@
         <w:rPr>
           <w:noProof/>
         </w:rPr>
-        <w:instrText xml:space="preserve"> PAGEREF _Toc240533448 \h </w:instrText>
+        <w:instrText xml:space="preserve"> PAGEREF _Toc240534303 \h </w:instrText>
       </w:r>
       <w:r>
         <w:rPr>
@@ -1999,7 +1999,7 @@
         <w:rPr>
           <w:noProof/>
         </w:rPr>
-        <w:instrText xml:space="preserve"> PAGEREF _Toc240533449 \h </w:instrText>
+        <w:instrText xml:space="preserve"> PAGEREF _Toc240534304 \h </w:instrText>
       </w:r>
       <w:r>
         <w:rPr>
@@ -2060,7 +2060,7 @@
         <w:rPr>
           <w:noProof/>
         </w:rPr>
-        <w:instrText xml:space="preserve"> PAGEREF _Toc240533450 \h </w:instrText>
+        <w:instrText xml:space="preserve"> PAGEREF _Toc240534305 \h </w:instrText>
       </w:r>
       <w:r>
         <w:rPr>
@@ -2121,7 +2121,7 @@
         <w:rPr>
           <w:noProof/>
         </w:rPr>
-        <w:instrText xml:space="preserve"> PAGEREF _Toc240533451 \h </w:instrText>
+        <w:instrText xml:space="preserve"> PAGEREF _Toc240534306 \h </w:instrText>
       </w:r>
       <w:r>
         <w:rPr>
@@ -2182,7 +2182,7 @@
         <w:rPr>
           <w:noProof/>
         </w:rPr>
-        <w:instrText xml:space="preserve"> PAGEREF _Toc240533452 \h </w:instrText>
+        <w:instrText xml:space="preserve"> PAGEREF _Toc240534307 \h </w:instrText>
       </w:r>
       <w:r>
         <w:rPr>
@@ -2243,7 +2243,7 @@
         <w:rPr>
           <w:noProof/>
         </w:rPr>
-        <w:instrText xml:space="preserve"> PAGEREF _Toc240533453 \h </w:instrText>
+        <w:instrText xml:space="preserve"> PAGEREF _Toc240534308 \h </w:instrText>
       </w:r>
       <w:r>
         <w:rPr>
@@ -2304,7 +2304,7 @@
         <w:rPr>
           <w:noProof/>
         </w:rPr>
-        <w:instrText xml:space="preserve"> PAGEREF _Toc240533454 \h </w:instrText>
+        <w:instrText xml:space="preserve"> PAGEREF _Toc240534309 \h </w:instrText>
       </w:r>
       <w:r>
         <w:rPr>
@@ -2365,7 +2365,7 @@
         <w:rPr>
           <w:noProof/>
         </w:rPr>
-        <w:instrText xml:space="preserve"> PAGEREF _Toc240533455 \h </w:instrText>
+        <w:instrText xml:space="preserve"> PAGEREF _Toc240534310 \h </w:instrText>
       </w:r>
       <w:r>
         <w:rPr>
@@ -2426,7 +2426,7 @@
         <w:rPr>
           <w:noProof/>
         </w:rPr>
-        <w:instrText xml:space="preserve"> PAGEREF _Toc240533456 \h </w:instrText>
+        <w:instrText xml:space="preserve"> PAGEREF _Toc240534311 \h </w:instrText>
       </w:r>
       <w:r>
         <w:rPr>
@@ -2487,7 +2487,7 @@
         <w:rPr>
           <w:noProof/>
         </w:rPr>
-        <w:instrText xml:space="preserve"> PAGEREF _Toc240533457 \h </w:instrText>
+        <w:instrText xml:space="preserve"> PAGEREF _Toc240534312 \h </w:instrText>
       </w:r>
       <w:r>
         <w:rPr>
@@ -2548,7 +2548,7 @@
         <w:rPr>
           <w:noProof/>
         </w:rPr>
-        <w:instrText xml:space="preserve"> PAGEREF _Toc240533458 \h </w:instrText>
+        <w:instrText xml:space="preserve"> PAGEREF _Toc240534313 \h </w:instrText>
       </w:r>
       <w:r>
         <w:rPr>
@@ -2609,7 +2609,7 @@
         <w:rPr>
           <w:noProof/>
         </w:rPr>
-        <w:instrText xml:space="preserve"> PAGEREF _Toc240533459 \h </w:instrText>
+        <w:instrText xml:space="preserve"> PAGEREF _Toc240534314 \h </w:instrText>
       </w:r>
       <w:r>
         <w:rPr>
@@ -2670,7 +2670,7 @@
         <w:rPr>
           <w:noProof/>
         </w:rPr>
-        <w:instrText xml:space="preserve"> PAGEREF _Toc240533460 \h </w:instrText>
+        <w:instrText xml:space="preserve"> PAGEREF _Toc240534315 \h </w:instrText>
       </w:r>
       <w:r>
         <w:rPr>
@@ -2731,7 +2731,7 @@
         <w:rPr>
           <w:noProof/>
         </w:rPr>
-        <w:instrText xml:space="preserve"> PAGEREF _Toc240533461 \h </w:instrText>
+        <w:instrText xml:space="preserve"> PAGEREF _Toc240534316 \h </w:instrText>
       </w:r>
       <w:r>
         <w:rPr>
@@ -2792,7 +2792,7 @@
         <w:rPr>
           <w:noProof/>
         </w:rPr>
-        <w:instrText xml:space="preserve"> PAGEREF _Toc240533462 \h </w:instrText>
+        <w:instrText xml:space="preserve"> PAGEREF _Toc240534317 \h </w:instrText>
       </w:r>
       <w:r>
         <w:rPr>
@@ -2853,7 +2853,7 @@
         <w:rPr>
           <w:noProof/>
         </w:rPr>
-        <w:instrText xml:space="preserve"> PAGEREF _Toc240533463 \h </w:instrText>
+        <w:instrText xml:space="preserve"> PAGEREF _Toc240534318 \h </w:instrText>
       </w:r>
       <w:r>
         <w:rPr>
@@ -2914,7 +2914,7 @@
         <w:rPr>
           <w:noProof/>
         </w:rPr>
-        <w:instrText xml:space="preserve"> PAGEREF _Toc240533464 \h </w:instrText>
+        <w:instrText xml:space="preserve"> PAGEREF _Toc240534319 \h </w:instrText>
       </w:r>
       <w:r>
         <w:rPr>
@@ -2975,7 +2975,7 @@
         <w:rPr>
           <w:noProof/>
         </w:rPr>
-        <w:instrText xml:space="preserve"> PAGEREF _Toc240533465 \h </w:instrText>
+        <w:instrText xml:space="preserve"> PAGEREF _Toc240534320 \h </w:instrText>
       </w:r>
       <w:r>
         <w:rPr>
@@ -3036,7 +3036,7 @@
         <w:rPr>
           <w:noProof/>
         </w:rPr>
-        <w:instrText xml:space="preserve"> PAGEREF _Toc240533466 \h </w:instrText>
+        <w:instrText xml:space="preserve"> PAGEREF _Toc240534321 \h </w:instrText>
       </w:r>
       <w:r>
         <w:rPr>
@@ -3097,7 +3097,7 @@
         <w:rPr>
           <w:noProof/>
         </w:rPr>
-        <w:instrText xml:space="preserve"> PAGEREF _Toc240533467 \h </w:instrText>
+        <w:instrText xml:space="preserve"> PAGEREF _Toc240534322 \h </w:instrText>
       </w:r>
       <w:r>
         <w:rPr>
@@ -3158,7 +3158,7 @@
         <w:rPr>
           <w:noProof/>
         </w:rPr>
-        <w:instrText xml:space="preserve"> PAGEREF _Toc240533468 \h </w:instrText>
+        <w:instrText xml:space="preserve"> PAGEREF _Toc240534323 \h </w:instrText>
       </w:r>
       <w:r>
         <w:rPr>
@@ -3219,7 +3219,7 @@
         <w:rPr>
           <w:noProof/>
         </w:rPr>
-        <w:instrText xml:space="preserve"> PAGEREF _Toc240533469 \h </w:instrText>
+        <w:instrText xml:space="preserve"> PAGEREF _Toc240534324 \h </w:instrText>
       </w:r>
       <w:r>
         <w:rPr>
@@ -3280,7 +3280,7 @@
         <w:rPr>
           <w:noProof/>
         </w:rPr>
-        <w:instrText xml:space="preserve"> PAGEREF _Toc240533470 \h </w:instrText>
+        <w:instrText xml:space="preserve"> PAGEREF _Toc240534325 \h </w:instrText>
       </w:r>
       <w:r>
         <w:rPr>
@@ -3341,7 +3341,7 @@
         <w:rPr>
           <w:noProof/>
         </w:rPr>
-        <w:instrText xml:space="preserve"> PAGEREF _Toc240533471 \h </w:instrText>
+        <w:instrText xml:space="preserve"> PAGEREF _Toc240534326 \h </w:instrText>
       </w:r>
       <w:r>
         <w:rPr>
@@ -3402,7 +3402,7 @@
         <w:rPr>
           <w:noProof/>
         </w:rPr>
-        <w:instrText xml:space="preserve"> PAGEREF _Toc240533472 \h </w:instrText>
+        <w:instrText xml:space="preserve"> PAGEREF _Toc240534327 \h </w:instrText>
       </w:r>
       <w:r>
         <w:rPr>
@@ -3464,7 +3464,7 @@
         <w:rPr>
           <w:noProof/>
         </w:rPr>
-        <w:instrText xml:space="preserve"> PAGEREF _Toc240533473 \h </w:instrText>
+        <w:instrText xml:space="preserve"> PAGEREF _Toc240534328 \h </w:instrText>
       </w:r>
       <w:r>
         <w:rPr>
@@ -3525,7 +3525,7 @@
         <w:rPr>
           <w:noProof/>
         </w:rPr>
-        <w:instrText xml:space="preserve"> PAGEREF _Toc240533474 \h </w:instrText>
+        <w:instrText xml:space="preserve"> PAGEREF _Toc240534329 \h </w:instrText>
       </w:r>
       <w:r>
         <w:rPr>
@@ -3586,7 +3586,7 @@
         <w:rPr>
           <w:noProof/>
         </w:rPr>
-        <w:instrText xml:space="preserve"> PAGEREF _Toc240533475 \h </w:instrText>
+        <w:instrText xml:space="preserve"> PAGEREF _Toc240534330 \h </w:instrText>
       </w:r>
       <w:r>
         <w:rPr>
@@ -3662,7 +3662,7 @@
           <w:sz w:val="34"/>
         </w:rPr>
       </w:pPr>
-      <w:bookmarkStart w:id="0" w:name="_Toc240533420"/>
+      <w:bookmarkStart w:id="0" w:name="_Toc240534275"/>
       <w:r>
         <w:rPr>
           <w:rFonts w:ascii="Montserrat" w:hAnsi="Montserrat"/>
@@ -3686,7 +3686,7 @@
           <w:sz w:val="27"/>
         </w:rPr>
       </w:pPr>
-      <w:bookmarkStart w:id="1" w:name="_Toc240533421"/>
+      <w:bookmarkStart w:id="1" w:name="_Toc240534276"/>
       <w:r>
         <w:rPr>
           <w:rFonts w:ascii="Montserrat" w:hAnsi="Montserrat"/>
@@ -5424,6 +5424,24 @@
           <w:color w:val="1A1A1A"/>
           <w:sz w:val="22"/>
         </w:rPr>
+        <w:t>Esta e a versao 2.87 do manual. Em relacao a versao 2.86 (17/09/2026), os dias das duas regras do aviso automatico (secao 6.4.3) - janelas do aviso de prazo, repeticao do atrasado, limite e repeticao do aviso de silencio - deixaram de ser fixos no codigo e passaram a ser configuraveis em Administracao &gt; Configuracoes (secao 6.3), num novo bloco Regras de aviso automatico de prazo e execucao, no mesmo padrao ja usado pelas metas do Relatorio de Resultados.</w:t>
+      </w:r>
+    </w:p>
+    <w:p>
+      <w:pPr>
+        <w:spacing w:line="280" w:lineRule="auto"/>
+        <w:rPr>
+          <w:rFonts w:ascii="Montserrat" w:hAnsi="Montserrat"/>
+          <w:color w:val="1A1A1A"/>
+          <w:sz w:val="22"/>
+        </w:rPr>
+      </w:pPr>
+      <w:r>
+        <w:rPr>
+          <w:rFonts w:ascii="Montserrat" w:hAnsi="Montserrat"/>
+          <w:color w:val="1A1A1A"/>
+          <w:sz w:val="22"/>
+        </w:rPr>
         <w:t>O manual nao substitui as Diretrizes para a Gestao de Projetos da UNIALFA (documento institucional que define o framework D01 a D07) nem o documento Regras de Acesso e Permissoes (que detalha cada regra de controle de acesso); ele e o guia operacional de como usar cada ferramenta na pratica.</w:t>
       </w:r>
     </w:p>
@@ -5438,7 +5456,7 @@
           <w:sz w:val="27"/>
         </w:rPr>
       </w:pPr>
-      <w:bookmarkStart w:id="2" w:name="_Toc240533422"/>
+      <w:bookmarkStart w:id="2" w:name="_Toc240534277"/>
       <w:r>
         <w:rPr>
           <w:rFonts w:ascii="Montserrat" w:hAnsi="Montserrat"/>
@@ -5621,6 +5639,7 @@
           <w:color w:val="1A1A1A"/>
           <w:sz w:val="22"/>
         </w:rPr>
+        <w:lastRenderedPageBreak/>
         <w:t>O Mapa de Diretrizes (pagina inicial) apresenta visualmente as 7 diretrizes (D01 a D07) e mostra, para cada etapa do processo, quais ferramentas usar. E o ponto de partida recomendado para quem quer entender o processo antes de preencher os formularios - e a unica pagina, junto com o Validador de Projetos, que nao exige login.</w:t>
       </w:r>
     </w:p>
@@ -5633,18 +5652,17 @@
         <w:rPr>
           <w:noProof/>
         </w:rPr>
-        <w:lastRenderedPageBreak/>
         <w:drawing>
-          <wp:inline distT="0" distB="0" distL="0" distR="0" wp14:anchorId="3FF95704" wp14:editId="3FB27D42">
+          <wp:inline distT="0" distB="0" distL="0" distR="0" wp14:anchorId="370809DF" wp14:editId="458A2D3E">
             <wp:extent cx="5303520" cy="4792851"/>
             <wp:effectExtent l="19050" t="19050" r="11430" b="27305"/>
-            <wp:docPr id="587430386" name="Imagem 1"/>
+            <wp:docPr id="748312340" name="Imagem 1"/>
             <wp:cNvGraphicFramePr/>
             <a:graphic xmlns:a="http://schemas.openxmlformats.org/drawingml/2006/main">
               <a:graphicData uri="http://schemas.openxmlformats.org/drawingml/2006/picture">
                 <pic:pic xmlns:pic="http://schemas.openxmlformats.org/drawingml/2006/picture">
                   <pic:nvPicPr>
-                    <pic:cNvPr id="587430386" name=""/>
+                    <pic:cNvPr id="748312340" name=""/>
                     <pic:cNvPicPr/>
                   </pic:nvPicPr>
                   <pic:blipFill>
@@ -5712,7 +5730,7 @@
           <w:sz w:val="27"/>
         </w:rPr>
       </w:pPr>
-      <w:bookmarkStart w:id="3" w:name="_Toc240533423"/>
+      <w:bookmarkStart w:id="3" w:name="_Toc240534278"/>
       <w:r>
         <w:rPr>
           <w:rFonts w:ascii="Montserrat" w:hAnsi="Montserrat"/>
@@ -5753,16 +5771,16 @@
         </w:rPr>
         <w:lastRenderedPageBreak/>
         <w:drawing>
-          <wp:inline distT="0" distB="0" distL="0" distR="0" wp14:anchorId="13F4CAAD" wp14:editId="5F1911C1">
+          <wp:inline distT="0" distB="0" distL="0" distR="0" wp14:anchorId="3C6EEF4D" wp14:editId="26D28AA1">
             <wp:extent cx="4206240" cy="3801227"/>
             <wp:effectExtent l="19050" t="19050" r="22860" b="27940"/>
-            <wp:docPr id="1979306800" name="Imagem 2"/>
+            <wp:docPr id="1282825278" name="Imagem 2"/>
             <wp:cNvGraphicFramePr/>
             <a:graphic xmlns:a="http://schemas.openxmlformats.org/drawingml/2006/main">
               <a:graphicData uri="http://schemas.openxmlformats.org/drawingml/2006/picture">
                 <pic:pic xmlns:pic="http://schemas.openxmlformats.org/drawingml/2006/picture">
                   <pic:nvPicPr>
-                    <pic:cNvPr id="1979306800" name=""/>
+                    <pic:cNvPr id="1282825278" name=""/>
                     <pic:cNvPicPr/>
                   </pic:nvPicPr>
                   <pic:blipFill>
@@ -5935,7 +5953,7 @@
           <w:sz w:val="27"/>
         </w:rPr>
       </w:pPr>
-      <w:bookmarkStart w:id="4" w:name="_Toc240533424"/>
+      <w:bookmarkStart w:id="4" w:name="_Toc240534279"/>
       <w:r>
         <w:rPr>
           <w:rFonts w:ascii="Montserrat" w:hAnsi="Montserrat"/>
@@ -7174,7 +7192,7 @@
           <w:sz w:val="34"/>
         </w:rPr>
       </w:pPr>
-      <w:bookmarkStart w:id="5" w:name="_Toc240533425"/>
+      <w:bookmarkStart w:id="5" w:name="_Toc240534280"/>
       <w:r>
         <w:rPr>
           <w:rFonts w:ascii="Montserrat" w:hAnsi="Montserrat"/>
@@ -7198,7 +7216,7 @@
           <w:sz w:val="27"/>
         </w:rPr>
       </w:pPr>
-      <w:bookmarkStart w:id="6" w:name="_Toc240533426"/>
+      <w:bookmarkStart w:id="6" w:name="_Toc240534281"/>
       <w:r>
         <w:rPr>
           <w:rFonts w:ascii="Montserrat" w:hAnsi="Montserrat"/>
@@ -7239,7 +7257,7 @@
           <w:sz w:val="27"/>
         </w:rPr>
       </w:pPr>
-      <w:bookmarkStart w:id="7" w:name="_Toc240533427"/>
+      <w:bookmarkStart w:id="7" w:name="_Toc240534282"/>
       <w:r>
         <w:rPr>
           <w:rFonts w:ascii="Montserrat" w:hAnsi="Montserrat"/>
@@ -7358,7 +7376,7 @@
           <w:sz w:val="27"/>
         </w:rPr>
       </w:pPr>
-      <w:bookmarkStart w:id="8" w:name="_Toc240533428"/>
+      <w:bookmarkStart w:id="8" w:name="_Toc240534283"/>
       <w:r>
         <w:rPr>
           <w:rFonts w:ascii="Montserrat" w:hAnsi="Montserrat"/>
@@ -7971,7 +7989,7 @@
           <w:sz w:val="27"/>
         </w:rPr>
       </w:pPr>
-      <w:bookmarkStart w:id="9" w:name="_Toc240533429"/>
+      <w:bookmarkStart w:id="9" w:name="_Toc240534284"/>
       <w:r>
         <w:rPr>
           <w:rFonts w:ascii="Montserrat" w:hAnsi="Montserrat"/>
@@ -8060,16 +8078,16 @@
         </w:rPr>
         <w:lastRenderedPageBreak/>
         <w:drawing>
-          <wp:inline distT="0" distB="0" distL="0" distR="0" wp14:anchorId="347B1049" wp14:editId="226DA73D">
+          <wp:inline distT="0" distB="0" distL="0" distR="0" wp14:anchorId="5098D2FB" wp14:editId="7C3CFD61">
             <wp:extent cx="4937760" cy="4462310"/>
             <wp:effectExtent l="19050" t="19050" r="15240" b="14605"/>
-            <wp:docPr id="391696970" name="Imagem 3"/>
+            <wp:docPr id="2000801104" name="Imagem 3"/>
             <wp:cNvGraphicFramePr/>
             <a:graphic xmlns:a="http://schemas.openxmlformats.org/drawingml/2006/main">
               <a:graphicData uri="http://schemas.openxmlformats.org/drawingml/2006/picture">
                 <pic:pic xmlns:pic="http://schemas.openxmlformats.org/drawingml/2006/picture">
                   <pic:nvPicPr>
-                    <pic:cNvPr id="391696970" name=""/>
+                    <pic:cNvPr id="2000801104" name=""/>
                     <pic:cNvPicPr/>
                   </pic:nvPicPr>
                   <pic:blipFill>
@@ -8137,7 +8155,7 @@
           <w:sz w:val="27"/>
         </w:rPr>
       </w:pPr>
-      <w:bookmarkStart w:id="10" w:name="_Toc240533430"/>
+      <w:bookmarkStart w:id="10" w:name="_Toc240534285"/>
       <w:r>
         <w:rPr>
           <w:rFonts w:ascii="Montserrat" w:hAnsi="Montserrat"/>
@@ -8178,16 +8196,16 @@
         </w:rPr>
         <w:lastRenderedPageBreak/>
         <w:drawing>
-          <wp:inline distT="0" distB="0" distL="0" distR="0" wp14:anchorId="15105A31" wp14:editId="47DACA10">
+          <wp:inline distT="0" distB="0" distL="0" distR="0" wp14:anchorId="2A79F493" wp14:editId="13C6BDDA">
             <wp:extent cx="5120640" cy="4627581"/>
             <wp:effectExtent l="19050" t="19050" r="22860" b="20955"/>
-            <wp:docPr id="310352455" name="Imagem 4"/>
+            <wp:docPr id="1723586954" name="Imagem 4"/>
             <wp:cNvGraphicFramePr/>
             <a:graphic xmlns:a="http://schemas.openxmlformats.org/drawingml/2006/main">
               <a:graphicData uri="http://schemas.openxmlformats.org/drawingml/2006/picture">
                 <pic:pic xmlns:pic="http://schemas.openxmlformats.org/drawingml/2006/picture">
                   <pic:nvPicPr>
-                    <pic:cNvPr id="310352455" name=""/>
+                    <pic:cNvPr id="1723586954" name=""/>
                     <pic:cNvPicPr/>
                   </pic:nvPicPr>
                   <pic:blipFill>
@@ -8370,7 +8388,7 @@
           <w:sz w:val="27"/>
         </w:rPr>
       </w:pPr>
-      <w:bookmarkStart w:id="11" w:name="_Toc240533431"/>
+      <w:bookmarkStart w:id="11" w:name="_Toc240534286"/>
       <w:r>
         <w:rPr>
           <w:rFonts w:ascii="Montserrat" w:hAnsi="Montserrat"/>
@@ -8410,16 +8428,16 @@
           <w:noProof/>
         </w:rPr>
         <w:drawing>
-          <wp:inline distT="0" distB="0" distL="0" distR="0" wp14:anchorId="7E20C856" wp14:editId="329A28B9">
+          <wp:inline distT="0" distB="0" distL="0" distR="0" wp14:anchorId="11365BA7" wp14:editId="0A1A1CE1">
             <wp:extent cx="4206240" cy="3801227"/>
             <wp:effectExtent l="19050" t="19050" r="22860" b="27940"/>
-            <wp:docPr id="544452103" name="Imagem 5"/>
+            <wp:docPr id="1101686757" name="Imagem 5"/>
             <wp:cNvGraphicFramePr/>
             <a:graphic xmlns:a="http://schemas.openxmlformats.org/drawingml/2006/main">
               <a:graphicData uri="http://schemas.openxmlformats.org/drawingml/2006/picture">
                 <pic:pic xmlns:pic="http://schemas.openxmlformats.org/drawingml/2006/picture">
                   <pic:nvPicPr>
-                    <pic:cNvPr id="544452103" name=""/>
+                    <pic:cNvPr id="1101686757" name=""/>
                     <pic:cNvPicPr/>
                   </pic:nvPicPr>
                   <pic:blipFill>
@@ -8487,16 +8505,16 @@
         </w:rPr>
         <w:lastRenderedPageBreak/>
         <w:drawing>
-          <wp:inline distT="0" distB="0" distL="0" distR="0" wp14:anchorId="61B9BB78" wp14:editId="6F58895A">
+          <wp:inline distT="0" distB="0" distL="0" distR="0" wp14:anchorId="000B5D7C" wp14:editId="75CE6589">
             <wp:extent cx="4206240" cy="3801227"/>
             <wp:effectExtent l="19050" t="19050" r="22860" b="27940"/>
-            <wp:docPr id="1987647080" name="Imagem 6"/>
+            <wp:docPr id="1584167369" name="Imagem 6"/>
             <wp:cNvGraphicFramePr/>
             <a:graphic xmlns:a="http://schemas.openxmlformats.org/drawingml/2006/main">
               <a:graphicData uri="http://schemas.openxmlformats.org/drawingml/2006/picture">
                 <pic:pic xmlns:pic="http://schemas.openxmlformats.org/drawingml/2006/picture">
                   <pic:nvPicPr>
-                    <pic:cNvPr id="1987647080" name=""/>
+                    <pic:cNvPr id="1584167369" name=""/>
                     <pic:cNvPicPr/>
                   </pic:nvPicPr>
                   <pic:blipFill>
@@ -8612,7 +8630,7 @@
           <w:sz w:val="27"/>
         </w:rPr>
       </w:pPr>
-      <w:bookmarkStart w:id="12" w:name="_Toc240533432"/>
+      <w:bookmarkStart w:id="12" w:name="_Toc240534287"/>
       <w:r>
         <w:rPr>
           <w:rFonts w:ascii="Montserrat" w:hAnsi="Montserrat"/>
@@ -8680,7 +8698,7 @@
           <w:sz w:val="27"/>
         </w:rPr>
       </w:pPr>
-      <w:bookmarkStart w:id="13" w:name="_Toc240533433"/>
+      <w:bookmarkStart w:id="13" w:name="_Toc240534288"/>
       <w:r>
         <w:rPr>
           <w:rFonts w:ascii="Montserrat" w:hAnsi="Montserrat"/>
@@ -8907,7 +8925,7 @@
           <w:sz w:val="27"/>
         </w:rPr>
       </w:pPr>
-      <w:bookmarkStart w:id="14" w:name="_Toc240533434"/>
+      <w:bookmarkStart w:id="14" w:name="_Toc240534289"/>
       <w:r>
         <w:rPr>
           <w:rFonts w:ascii="Montserrat" w:hAnsi="Montserrat"/>
@@ -9066,7 +9084,7 @@
           <w:sz w:val="27"/>
         </w:rPr>
       </w:pPr>
-      <w:bookmarkStart w:id="15" w:name="_Toc240533435"/>
+      <w:bookmarkStart w:id="15" w:name="_Toc240534290"/>
       <w:r>
         <w:rPr>
           <w:rFonts w:ascii="Montserrat" w:hAnsi="Montserrat"/>
@@ -9258,7 +9276,7 @@
           <w:sz w:val="27"/>
         </w:rPr>
       </w:pPr>
-      <w:bookmarkStart w:id="16" w:name="_Toc240533436"/>
+      <w:bookmarkStart w:id="16" w:name="_Toc240534291"/>
       <w:r>
         <w:rPr>
           <w:rFonts w:ascii="Montserrat" w:hAnsi="Montserrat"/>
@@ -9386,7 +9404,7 @@
           <w:sz w:val="27"/>
         </w:rPr>
       </w:pPr>
-      <w:bookmarkStart w:id="17" w:name="_Toc240533437"/>
+      <w:bookmarkStart w:id="17" w:name="_Toc240534292"/>
       <w:r>
         <w:rPr>
           <w:rFonts w:ascii="Montserrat" w:hAnsi="Montserrat"/>
@@ -9716,7 +9734,7 @@
           <w:sz w:val="27"/>
         </w:rPr>
       </w:pPr>
-      <w:bookmarkStart w:id="18" w:name="_Toc240533438"/>
+      <w:bookmarkStart w:id="18" w:name="_Toc240534293"/>
       <w:r>
         <w:rPr>
           <w:rFonts w:ascii="Montserrat" w:hAnsi="Montserrat"/>
@@ -9853,7 +9871,7 @@
           <w:sz w:val="27"/>
         </w:rPr>
       </w:pPr>
-      <w:bookmarkStart w:id="19" w:name="_Toc240533439"/>
+      <w:bookmarkStart w:id="19" w:name="_Toc240534294"/>
       <w:r>
         <w:rPr>
           <w:rFonts w:ascii="Montserrat" w:hAnsi="Montserrat"/>
@@ -10132,7 +10150,7 @@
           <w:sz w:val="27"/>
         </w:rPr>
       </w:pPr>
-      <w:bookmarkStart w:id="20" w:name="_Toc240533440"/>
+      <w:bookmarkStart w:id="20" w:name="_Toc240534295"/>
       <w:r>
         <w:rPr>
           <w:rFonts w:ascii="Montserrat" w:hAnsi="Montserrat"/>
@@ -10309,7 +10327,7 @@
           <w:sz w:val="27"/>
         </w:rPr>
       </w:pPr>
-      <w:bookmarkStart w:id="21" w:name="_Toc240533441"/>
+      <w:bookmarkStart w:id="21" w:name="_Toc240534296"/>
       <w:r>
         <w:rPr>
           <w:rFonts w:ascii="Montserrat" w:hAnsi="Montserrat"/>
@@ -10423,7 +10441,7 @@
           <w:sz w:val="34"/>
         </w:rPr>
       </w:pPr>
-      <w:bookmarkStart w:id="22" w:name="_Toc240533442"/>
+      <w:bookmarkStart w:id="22" w:name="_Toc240534297"/>
       <w:r>
         <w:rPr>
           <w:rFonts w:ascii="Montserrat" w:hAnsi="Montserrat"/>
@@ -10465,7 +10483,7 @@
           <w:sz w:val="27"/>
         </w:rPr>
       </w:pPr>
-      <w:bookmarkStart w:id="23" w:name="_Toc240533443"/>
+      <w:bookmarkStart w:id="23" w:name="_Toc240534298"/>
       <w:r>
         <w:rPr>
           <w:rFonts w:ascii="Montserrat" w:hAnsi="Montserrat"/>
@@ -11545,16 +11563,16 @@
         </w:rPr>
         <w:lastRenderedPageBreak/>
         <w:drawing>
-          <wp:inline distT="0" distB="0" distL="0" distR="0" wp14:anchorId="703C227C" wp14:editId="32D12828">
+          <wp:inline distT="0" distB="0" distL="0" distR="0" wp14:anchorId="03BA346E" wp14:editId="0E8DC0C6">
             <wp:extent cx="5120640" cy="4627581"/>
             <wp:effectExtent l="19050" t="19050" r="22860" b="20955"/>
-            <wp:docPr id="2090550391" name="Imagem 7"/>
+            <wp:docPr id="138586684" name="Imagem 7"/>
             <wp:cNvGraphicFramePr/>
             <a:graphic xmlns:a="http://schemas.openxmlformats.org/drawingml/2006/main">
               <a:graphicData uri="http://schemas.openxmlformats.org/drawingml/2006/picture">
                 <pic:pic xmlns:pic="http://schemas.openxmlformats.org/drawingml/2006/picture">
                   <pic:nvPicPr>
-                    <pic:cNvPr id="2090550391" name=""/>
+                    <pic:cNvPr id="138586684" name=""/>
                     <pic:cNvPicPr/>
                   </pic:nvPicPr>
                   <pic:blipFill>
@@ -11622,16 +11640,16 @@
         </w:rPr>
         <w:lastRenderedPageBreak/>
         <w:drawing>
-          <wp:inline distT="0" distB="0" distL="0" distR="0" wp14:anchorId="6E6ED76E" wp14:editId="4F80E00C">
+          <wp:inline distT="0" distB="0" distL="0" distR="0" wp14:anchorId="27452FFA" wp14:editId="3B2A3652">
             <wp:extent cx="5120640" cy="4627581"/>
             <wp:effectExtent l="19050" t="19050" r="22860" b="20955"/>
-            <wp:docPr id="791535652" name="Imagem 8"/>
+            <wp:docPr id="1837242816" name="Imagem 8"/>
             <wp:cNvGraphicFramePr/>
             <a:graphic xmlns:a="http://schemas.openxmlformats.org/drawingml/2006/main">
               <a:graphicData uri="http://schemas.openxmlformats.org/drawingml/2006/picture">
                 <pic:pic xmlns:pic="http://schemas.openxmlformats.org/drawingml/2006/picture">
                   <pic:nvPicPr>
-                    <pic:cNvPr id="791535652" name=""/>
+                    <pic:cNvPr id="1837242816" name=""/>
                     <pic:cNvPicPr/>
                   </pic:nvPicPr>
                   <pic:blipFill>
@@ -11839,7 +11857,7 @@
           <w:sz w:val="27"/>
         </w:rPr>
       </w:pPr>
-      <w:bookmarkStart w:id="24" w:name="_Toc240533444"/>
+      <w:bookmarkStart w:id="24" w:name="_Toc240534299"/>
       <w:r>
         <w:rPr>
           <w:rFonts w:ascii="Montserrat" w:hAnsi="Montserrat"/>
@@ -12764,16 +12782,16 @@
           <w:noProof/>
         </w:rPr>
         <w:drawing>
-          <wp:inline distT="0" distB="0" distL="0" distR="0" wp14:anchorId="1B86F079" wp14:editId="6F49236A">
+          <wp:inline distT="0" distB="0" distL="0" distR="0" wp14:anchorId="19C4D872" wp14:editId="0F1E0624">
             <wp:extent cx="5120640" cy="4627581"/>
             <wp:effectExtent l="19050" t="19050" r="22860" b="20955"/>
-            <wp:docPr id="1006115914" name="Imagem 9"/>
+            <wp:docPr id="1703843025" name="Imagem 9"/>
             <wp:cNvGraphicFramePr/>
             <a:graphic xmlns:a="http://schemas.openxmlformats.org/drawingml/2006/main">
               <a:graphicData uri="http://schemas.openxmlformats.org/drawingml/2006/picture">
                 <pic:pic xmlns:pic="http://schemas.openxmlformats.org/drawingml/2006/picture">
                   <pic:nvPicPr>
-                    <pic:cNvPr id="1006115914" name=""/>
+                    <pic:cNvPr id="1703843025" name=""/>
                     <pic:cNvPicPr/>
                   </pic:nvPicPr>
                   <pic:blipFill>
@@ -12841,16 +12859,16 @@
         </w:rPr>
         <w:lastRenderedPageBreak/>
         <w:drawing>
-          <wp:inline distT="0" distB="0" distL="0" distR="0" wp14:anchorId="3C053E91" wp14:editId="4CCE4868">
+          <wp:inline distT="0" distB="0" distL="0" distR="0" wp14:anchorId="2C30310E" wp14:editId="2BB9FFFE">
             <wp:extent cx="5120640" cy="4627581"/>
             <wp:effectExtent l="19050" t="19050" r="22860" b="20955"/>
-            <wp:docPr id="41730275" name="Imagem 10"/>
+            <wp:docPr id="85640838" name="Imagem 10"/>
             <wp:cNvGraphicFramePr/>
             <a:graphic xmlns:a="http://schemas.openxmlformats.org/drawingml/2006/main">
               <a:graphicData uri="http://schemas.openxmlformats.org/drawingml/2006/picture">
                 <pic:pic xmlns:pic="http://schemas.openxmlformats.org/drawingml/2006/picture">
                   <pic:nvPicPr>
-                    <pic:cNvPr id="41730275" name=""/>
+                    <pic:cNvPr id="85640838" name=""/>
                     <pic:cNvPicPr/>
                   </pic:nvPicPr>
                   <pic:blipFill>
@@ -12984,7 +13002,7 @@
           <w:sz w:val="27"/>
         </w:rPr>
       </w:pPr>
-      <w:bookmarkStart w:id="25" w:name="_Toc240533445"/>
+      <w:bookmarkStart w:id="25" w:name="_Toc240534300"/>
       <w:r>
         <w:rPr>
           <w:rFonts w:ascii="Montserrat" w:hAnsi="Montserrat"/>
@@ -14069,16 +14087,16 @@
         </w:rPr>
         <w:lastRenderedPageBreak/>
         <w:drawing>
-          <wp:inline distT="0" distB="0" distL="0" distR="0" wp14:anchorId="110E3F14" wp14:editId="74517626">
+          <wp:inline distT="0" distB="0" distL="0" distR="0" wp14:anchorId="1A060880" wp14:editId="117249B8">
             <wp:extent cx="5120640" cy="3338440"/>
             <wp:effectExtent l="19050" t="19050" r="22860" b="14605"/>
-            <wp:docPr id="154694690" name="Imagem 11"/>
+            <wp:docPr id="1093642623" name="Imagem 11"/>
             <wp:cNvGraphicFramePr/>
             <a:graphic xmlns:a="http://schemas.openxmlformats.org/drawingml/2006/main">
               <a:graphicData uri="http://schemas.openxmlformats.org/drawingml/2006/picture">
                 <pic:pic xmlns:pic="http://schemas.openxmlformats.org/drawingml/2006/picture">
                   <pic:nvPicPr>
-                    <pic:cNvPr id="154694690" name=""/>
+                    <pic:cNvPr id="1093642623" name=""/>
                     <pic:cNvPicPr/>
                   </pic:nvPicPr>
                   <pic:blipFill>
@@ -14146,16 +14164,16 @@
         </w:rPr>
         <w:lastRenderedPageBreak/>
         <w:drawing>
-          <wp:inline distT="0" distB="0" distL="0" distR="0" wp14:anchorId="05D97AFB" wp14:editId="2921CAAE">
+          <wp:inline distT="0" distB="0" distL="0" distR="0" wp14:anchorId="4D0E6256" wp14:editId="432C64CE">
             <wp:extent cx="5120640" cy="4627581"/>
             <wp:effectExtent l="19050" t="19050" r="22860" b="20955"/>
-            <wp:docPr id="821478588" name="Imagem 12"/>
+            <wp:docPr id="1735738453" name="Imagem 12"/>
             <wp:cNvGraphicFramePr/>
             <a:graphic xmlns:a="http://schemas.openxmlformats.org/drawingml/2006/main">
               <a:graphicData uri="http://schemas.openxmlformats.org/drawingml/2006/picture">
                 <pic:pic xmlns:pic="http://schemas.openxmlformats.org/drawingml/2006/picture">
                   <pic:nvPicPr>
-                    <pic:cNvPr id="821478588" name=""/>
+                    <pic:cNvPr id="1735738453" name=""/>
                     <pic:cNvPicPr/>
                   </pic:nvPicPr>
                   <pic:blipFill>
@@ -14359,7 +14377,7 @@
           <w:sz w:val="27"/>
         </w:rPr>
       </w:pPr>
-      <w:bookmarkStart w:id="26" w:name="_Toc240533446"/>
+      <w:bookmarkStart w:id="26" w:name="_Toc240534301"/>
       <w:r>
         <w:rPr>
           <w:rFonts w:ascii="Montserrat" w:hAnsi="Montserrat"/>
@@ -14920,16 +14938,16 @@
           <w:noProof/>
         </w:rPr>
         <w:drawing>
-          <wp:inline distT="0" distB="0" distL="0" distR="0" wp14:anchorId="5DAB0AA6" wp14:editId="7CD36D61">
+          <wp:inline distT="0" distB="0" distL="0" distR="0" wp14:anchorId="77851C41" wp14:editId="6384BD6E">
             <wp:extent cx="5120640" cy="4627581"/>
             <wp:effectExtent l="19050" t="19050" r="22860" b="20955"/>
-            <wp:docPr id="858756615" name="Imagem 13"/>
+            <wp:docPr id="1022771252" name="Imagem 13"/>
             <wp:cNvGraphicFramePr/>
             <a:graphic xmlns:a="http://schemas.openxmlformats.org/drawingml/2006/main">
               <a:graphicData uri="http://schemas.openxmlformats.org/drawingml/2006/picture">
                 <pic:pic xmlns:pic="http://schemas.openxmlformats.org/drawingml/2006/picture">
                   <pic:nvPicPr>
-                    <pic:cNvPr id="858756615" name=""/>
+                    <pic:cNvPr id="1022771252" name=""/>
                     <pic:cNvPicPr/>
                   </pic:nvPicPr>
                   <pic:blipFill>
@@ -14997,16 +15015,16 @@
         </w:rPr>
         <w:lastRenderedPageBreak/>
         <w:drawing>
-          <wp:inline distT="0" distB="0" distL="0" distR="0" wp14:anchorId="29A5EE59" wp14:editId="1E22BC85">
+          <wp:inline distT="0" distB="0" distL="0" distR="0" wp14:anchorId="70A09ABC" wp14:editId="2C3AC5E9">
             <wp:extent cx="5120640" cy="4627581"/>
             <wp:effectExtent l="19050" t="19050" r="22860" b="20955"/>
-            <wp:docPr id="302441448" name="Imagem 14"/>
+            <wp:docPr id="734049158" name="Imagem 14"/>
             <wp:cNvGraphicFramePr/>
             <a:graphic xmlns:a="http://schemas.openxmlformats.org/drawingml/2006/main">
               <a:graphicData uri="http://schemas.openxmlformats.org/drawingml/2006/picture">
                 <pic:pic xmlns:pic="http://schemas.openxmlformats.org/drawingml/2006/picture">
                   <pic:nvPicPr>
-                    <pic:cNvPr id="302441448" name=""/>
+                    <pic:cNvPr id="734049158" name=""/>
                     <pic:cNvPicPr/>
                   </pic:nvPicPr>
                   <pic:blipFill>
@@ -15347,7 +15365,7 @@
           <w:sz w:val="27"/>
         </w:rPr>
       </w:pPr>
-      <w:bookmarkStart w:id="27" w:name="_Toc240533447"/>
+      <w:bookmarkStart w:id="27" w:name="_Toc240534302"/>
       <w:r>
         <w:rPr>
           <w:rFonts w:ascii="Montserrat" w:hAnsi="Montserrat"/>
@@ -15387,16 +15405,16 @@
           <w:noProof/>
         </w:rPr>
         <w:drawing>
-          <wp:inline distT="0" distB="0" distL="0" distR="0" wp14:anchorId="431C4295" wp14:editId="61B4BFB3">
+          <wp:inline distT="0" distB="0" distL="0" distR="0" wp14:anchorId="3F2E5DAB" wp14:editId="5BFBC86F">
             <wp:extent cx="5120640" cy="4627581"/>
             <wp:effectExtent l="19050" t="19050" r="22860" b="20955"/>
-            <wp:docPr id="2096028679" name="Imagem 15"/>
+            <wp:docPr id="614626995" name="Imagem 15"/>
             <wp:cNvGraphicFramePr/>
             <a:graphic xmlns:a="http://schemas.openxmlformats.org/drawingml/2006/main">
               <a:graphicData uri="http://schemas.openxmlformats.org/drawingml/2006/picture">
                 <pic:pic xmlns:pic="http://schemas.openxmlformats.org/drawingml/2006/picture">
                   <pic:nvPicPr>
-                    <pic:cNvPr id="2096028679" name=""/>
+                    <pic:cNvPr id="614626995" name=""/>
                     <pic:cNvPicPr/>
                   </pic:nvPicPr>
                   <pic:blipFill>
@@ -15464,16 +15482,16 @@
         </w:rPr>
         <w:lastRenderedPageBreak/>
         <w:drawing>
-          <wp:inline distT="0" distB="0" distL="0" distR="0" wp14:anchorId="0C9B664F" wp14:editId="1D67CFCE">
+          <wp:inline distT="0" distB="0" distL="0" distR="0" wp14:anchorId="7DE4C064" wp14:editId="6E277E70">
             <wp:extent cx="5120640" cy="4627581"/>
             <wp:effectExtent l="19050" t="19050" r="22860" b="20955"/>
-            <wp:docPr id="820563370" name="Imagem 16"/>
+            <wp:docPr id="525679683" name="Imagem 16"/>
             <wp:cNvGraphicFramePr/>
             <a:graphic xmlns:a="http://schemas.openxmlformats.org/drawingml/2006/main">
               <a:graphicData uri="http://schemas.openxmlformats.org/drawingml/2006/picture">
                 <pic:pic xmlns:pic="http://schemas.openxmlformats.org/drawingml/2006/picture">
                   <pic:nvPicPr>
-                    <pic:cNvPr id="820563370" name=""/>
+                    <pic:cNvPr id="525679683" name=""/>
                     <pic:cNvPicPr/>
                   </pic:nvPicPr>
                   <pic:blipFill>
@@ -15637,16 +15655,16 @@
         </w:rPr>
         <w:lastRenderedPageBreak/>
         <w:drawing>
-          <wp:inline distT="0" distB="0" distL="0" distR="0" wp14:anchorId="291F41E9" wp14:editId="6E437735">
+          <wp:inline distT="0" distB="0" distL="0" distR="0" wp14:anchorId="4359188A" wp14:editId="382E125D">
             <wp:extent cx="5120640" cy="3282818"/>
             <wp:effectExtent l="19050" t="19050" r="22860" b="13335"/>
-            <wp:docPr id="961814141" name="Imagem 17"/>
+            <wp:docPr id="164350851" name="Imagem 17"/>
             <wp:cNvGraphicFramePr/>
             <a:graphic xmlns:a="http://schemas.openxmlformats.org/drawingml/2006/main">
               <a:graphicData uri="http://schemas.openxmlformats.org/drawingml/2006/picture">
                 <pic:pic xmlns:pic="http://schemas.openxmlformats.org/drawingml/2006/picture">
                   <pic:nvPicPr>
-                    <pic:cNvPr id="961814141" name=""/>
+                    <pic:cNvPr id="164350851" name=""/>
                     <pic:cNvPicPr/>
                   </pic:nvPicPr>
                   <pic:blipFill>
@@ -15837,7 +15855,7 @@
           <w:sz w:val="27"/>
         </w:rPr>
       </w:pPr>
-      <w:bookmarkStart w:id="28" w:name="_Toc240533448"/>
+      <w:bookmarkStart w:id="28" w:name="_Toc240534303"/>
       <w:r>
         <w:rPr>
           <w:rFonts w:ascii="Montserrat" w:hAnsi="Montserrat"/>
@@ -15877,16 +15895,16 @@
           <w:noProof/>
         </w:rPr>
         <w:drawing>
-          <wp:inline distT="0" distB="0" distL="0" distR="0" wp14:anchorId="12CEB040" wp14:editId="389343B9">
+          <wp:inline distT="0" distB="0" distL="0" distR="0" wp14:anchorId="4D99ABB3" wp14:editId="1B36AAC7">
             <wp:extent cx="5120640" cy="4627581"/>
             <wp:effectExtent l="19050" t="19050" r="22860" b="20955"/>
-            <wp:docPr id="385811409" name="Imagem 18"/>
+            <wp:docPr id="946431405" name="Imagem 18"/>
             <wp:cNvGraphicFramePr/>
             <a:graphic xmlns:a="http://schemas.openxmlformats.org/drawingml/2006/main">
               <a:graphicData uri="http://schemas.openxmlformats.org/drawingml/2006/picture">
                 <pic:pic xmlns:pic="http://schemas.openxmlformats.org/drawingml/2006/picture">
                   <pic:nvPicPr>
-                    <pic:cNvPr id="385811409" name=""/>
+                    <pic:cNvPr id="946431405" name=""/>
                     <pic:cNvPicPr/>
                   </pic:nvPicPr>
                   <pic:blipFill>
@@ -15954,16 +15972,16 @@
         </w:rPr>
         <w:lastRenderedPageBreak/>
         <w:drawing>
-          <wp:inline distT="0" distB="0" distL="0" distR="0" wp14:anchorId="6CAF86D8" wp14:editId="7E2E4221">
+          <wp:inline distT="0" distB="0" distL="0" distR="0" wp14:anchorId="133F9092" wp14:editId="5079B29D">
             <wp:extent cx="5120640" cy="4627581"/>
             <wp:effectExtent l="19050" t="19050" r="22860" b="20955"/>
-            <wp:docPr id="665823667" name="Imagem 19"/>
+            <wp:docPr id="2050065198" name="Imagem 19"/>
             <wp:cNvGraphicFramePr/>
             <a:graphic xmlns:a="http://schemas.openxmlformats.org/drawingml/2006/main">
               <a:graphicData uri="http://schemas.openxmlformats.org/drawingml/2006/picture">
                 <pic:pic xmlns:pic="http://schemas.openxmlformats.org/drawingml/2006/picture">
                   <pic:nvPicPr>
-                    <pic:cNvPr id="665823667" name=""/>
+                    <pic:cNvPr id="2050065198" name=""/>
                     <pic:cNvPicPr/>
                   </pic:nvPicPr>
                   <pic:blipFill>
@@ -16146,7 +16164,7 @@
           <w:sz w:val="27"/>
         </w:rPr>
       </w:pPr>
-      <w:bookmarkStart w:id="29" w:name="_Toc240533449"/>
+      <w:bookmarkStart w:id="29" w:name="_Toc240534304"/>
       <w:r>
         <w:rPr>
           <w:rFonts w:ascii="Montserrat" w:hAnsi="Montserrat"/>
@@ -16186,16 +16204,16 @@
           <w:noProof/>
         </w:rPr>
         <w:drawing>
-          <wp:inline distT="0" distB="0" distL="0" distR="0" wp14:anchorId="1E103CB1" wp14:editId="5C76B413">
+          <wp:inline distT="0" distB="0" distL="0" distR="0" wp14:anchorId="33642435" wp14:editId="6E67BA72">
             <wp:extent cx="5120640" cy="4627581"/>
             <wp:effectExtent l="19050" t="19050" r="22860" b="20955"/>
-            <wp:docPr id="1537368409" name="Imagem 20"/>
+            <wp:docPr id="192852124" name="Imagem 20"/>
             <wp:cNvGraphicFramePr/>
             <a:graphic xmlns:a="http://schemas.openxmlformats.org/drawingml/2006/main">
               <a:graphicData uri="http://schemas.openxmlformats.org/drawingml/2006/picture">
                 <pic:pic xmlns:pic="http://schemas.openxmlformats.org/drawingml/2006/picture">
                   <pic:nvPicPr>
-                    <pic:cNvPr id="1537368409" name=""/>
+                    <pic:cNvPr id="192852124" name=""/>
                     <pic:cNvPicPr/>
                   </pic:nvPicPr>
                   <pic:blipFill>
@@ -16263,16 +16281,16 @@
         </w:rPr>
         <w:lastRenderedPageBreak/>
         <w:drawing>
-          <wp:inline distT="0" distB="0" distL="0" distR="0" wp14:anchorId="76FA0A9C" wp14:editId="3F6D1AE7">
+          <wp:inline distT="0" distB="0" distL="0" distR="0" wp14:anchorId="55A52552" wp14:editId="33FB16FF">
             <wp:extent cx="5120640" cy="4627581"/>
             <wp:effectExtent l="19050" t="19050" r="22860" b="20955"/>
-            <wp:docPr id="1561598171" name="Imagem 21"/>
+            <wp:docPr id="1916819492" name="Imagem 21"/>
             <wp:cNvGraphicFramePr/>
             <a:graphic xmlns:a="http://schemas.openxmlformats.org/drawingml/2006/main">
               <a:graphicData uri="http://schemas.openxmlformats.org/drawingml/2006/picture">
                 <pic:pic xmlns:pic="http://schemas.openxmlformats.org/drawingml/2006/picture">
                   <pic:nvPicPr>
-                    <pic:cNvPr id="1561598171" name=""/>
+                    <pic:cNvPr id="1916819492" name=""/>
                     <pic:cNvPicPr/>
                   </pic:nvPicPr>
                   <pic:blipFill>
@@ -16478,16 +16496,16 @@
           <w:noProof/>
         </w:rPr>
         <w:drawing>
-          <wp:inline distT="0" distB="0" distL="0" distR="0" wp14:anchorId="6D375B49" wp14:editId="0CD2B757">
+          <wp:inline distT="0" distB="0" distL="0" distR="0" wp14:anchorId="3E3B8EB9" wp14:editId="7203813C">
             <wp:extent cx="5120640" cy="1757287"/>
             <wp:effectExtent l="19050" t="19050" r="22860" b="14605"/>
-            <wp:docPr id="1136601988" name="Imagem 22"/>
+            <wp:docPr id="1175019115" name="Imagem 22"/>
             <wp:cNvGraphicFramePr/>
             <a:graphic xmlns:a="http://schemas.openxmlformats.org/drawingml/2006/main">
               <a:graphicData uri="http://schemas.openxmlformats.org/drawingml/2006/picture">
                 <pic:pic xmlns:pic="http://schemas.openxmlformats.org/drawingml/2006/picture">
                   <pic:nvPicPr>
-                    <pic:cNvPr id="1136601988" name=""/>
+                    <pic:cNvPr id="1175019115" name=""/>
                     <pic:cNvPicPr/>
                   </pic:nvPicPr>
                   <pic:blipFill>
@@ -16600,7 +16618,7 @@
           <w:sz w:val="27"/>
         </w:rPr>
       </w:pPr>
-      <w:bookmarkStart w:id="30" w:name="_Toc240533450"/>
+      <w:bookmarkStart w:id="30" w:name="_Toc240534305"/>
       <w:r>
         <w:rPr>
           <w:rFonts w:ascii="Montserrat" w:hAnsi="Montserrat"/>
@@ -16641,16 +16659,16 @@
         </w:rPr>
         <w:lastRenderedPageBreak/>
         <w:drawing>
-          <wp:inline distT="0" distB="0" distL="0" distR="0" wp14:anchorId="64445A6C" wp14:editId="4C21C994">
+          <wp:inline distT="0" distB="0" distL="0" distR="0" wp14:anchorId="533C3A4A" wp14:editId="4280A35F">
             <wp:extent cx="5120640" cy="4627581"/>
             <wp:effectExtent l="19050" t="19050" r="22860" b="20955"/>
-            <wp:docPr id="308507439" name="Imagem 23"/>
+            <wp:docPr id="872600612" name="Imagem 23"/>
             <wp:cNvGraphicFramePr/>
             <a:graphic xmlns:a="http://schemas.openxmlformats.org/drawingml/2006/main">
               <a:graphicData uri="http://schemas.openxmlformats.org/drawingml/2006/picture">
                 <pic:pic xmlns:pic="http://schemas.openxmlformats.org/drawingml/2006/picture">
                   <pic:nvPicPr>
-                    <pic:cNvPr id="308507439" name=""/>
+                    <pic:cNvPr id="872600612" name=""/>
                     <pic:cNvPicPr/>
                   </pic:nvPicPr>
                   <pic:blipFill>
@@ -16718,16 +16736,16 @@
         </w:rPr>
         <w:lastRenderedPageBreak/>
         <w:drawing>
-          <wp:inline distT="0" distB="0" distL="0" distR="0" wp14:anchorId="666596CE" wp14:editId="5BAE4079">
+          <wp:inline distT="0" distB="0" distL="0" distR="0" wp14:anchorId="36A76425" wp14:editId="224738A9">
             <wp:extent cx="5120640" cy="4627581"/>
             <wp:effectExtent l="19050" t="19050" r="22860" b="20955"/>
-            <wp:docPr id="2055616634" name="Imagem 24"/>
+            <wp:docPr id="1482220367" name="Imagem 24"/>
             <wp:cNvGraphicFramePr/>
             <a:graphic xmlns:a="http://schemas.openxmlformats.org/drawingml/2006/main">
               <a:graphicData uri="http://schemas.openxmlformats.org/drawingml/2006/picture">
                 <pic:pic xmlns:pic="http://schemas.openxmlformats.org/drawingml/2006/picture">
                   <pic:nvPicPr>
-                    <pic:cNvPr id="2055616634" name=""/>
+                    <pic:cNvPr id="1482220367" name=""/>
                     <pic:cNvPicPr/>
                   </pic:nvPicPr>
                   <pic:blipFill>
@@ -16964,7 +16982,7 @@
           <w:sz w:val="27"/>
         </w:rPr>
       </w:pPr>
-      <w:bookmarkStart w:id="31" w:name="_Toc240533451"/>
+      <w:bookmarkStart w:id="31" w:name="_Toc240534306"/>
       <w:r>
         <w:rPr>
           <w:rFonts w:ascii="Montserrat" w:hAnsi="Montserrat"/>
@@ -17004,16 +17022,16 @@
           <w:noProof/>
         </w:rPr>
         <w:drawing>
-          <wp:inline distT="0" distB="0" distL="0" distR="0" wp14:anchorId="4042375F" wp14:editId="3966EF43">
+          <wp:inline distT="0" distB="0" distL="0" distR="0" wp14:anchorId="2E415F60" wp14:editId="18E5F699">
             <wp:extent cx="5120640" cy="4627581"/>
             <wp:effectExtent l="19050" t="19050" r="22860" b="20955"/>
-            <wp:docPr id="1115056875" name="Imagem 25"/>
+            <wp:docPr id="1270955327" name="Imagem 25"/>
             <wp:cNvGraphicFramePr/>
             <a:graphic xmlns:a="http://schemas.openxmlformats.org/drawingml/2006/main">
               <a:graphicData uri="http://schemas.openxmlformats.org/drawingml/2006/picture">
                 <pic:pic xmlns:pic="http://schemas.openxmlformats.org/drawingml/2006/picture">
                   <pic:nvPicPr>
-                    <pic:cNvPr id="1115056875" name=""/>
+                    <pic:cNvPr id="1270955327" name=""/>
                     <pic:cNvPicPr/>
                   </pic:nvPicPr>
                   <pic:blipFill>
@@ -17081,16 +17099,16 @@
         </w:rPr>
         <w:lastRenderedPageBreak/>
         <w:drawing>
-          <wp:inline distT="0" distB="0" distL="0" distR="0" wp14:anchorId="2D6304FE" wp14:editId="05163030">
+          <wp:inline distT="0" distB="0" distL="0" distR="0" wp14:anchorId="1B891C7D" wp14:editId="37A42F32">
             <wp:extent cx="5120640" cy="4627581"/>
             <wp:effectExtent l="19050" t="19050" r="22860" b="20955"/>
-            <wp:docPr id="1263298313" name="Imagem 26"/>
+            <wp:docPr id="2006229292" name="Imagem 26"/>
             <wp:cNvGraphicFramePr/>
             <a:graphic xmlns:a="http://schemas.openxmlformats.org/drawingml/2006/main">
               <a:graphicData uri="http://schemas.openxmlformats.org/drawingml/2006/picture">
                 <pic:pic xmlns:pic="http://schemas.openxmlformats.org/drawingml/2006/picture">
                   <pic:nvPicPr>
-                    <pic:cNvPr id="1263298313" name=""/>
+                    <pic:cNvPr id="2006229292" name=""/>
                     <pic:cNvPicPr/>
                   </pic:nvPicPr>
                   <pic:blipFill>
@@ -17281,7 +17299,7 @@
           <w:sz w:val="27"/>
         </w:rPr>
       </w:pPr>
-      <w:bookmarkStart w:id="32" w:name="_Toc240533452"/>
+      <w:bookmarkStart w:id="32" w:name="_Toc240534307"/>
       <w:r>
         <w:rPr>
           <w:rFonts w:ascii="Montserrat" w:hAnsi="Montserrat"/>
@@ -17321,16 +17339,16 @@
           <w:noProof/>
         </w:rPr>
         <w:drawing>
-          <wp:inline distT="0" distB="0" distL="0" distR="0" wp14:anchorId="1234AD6F" wp14:editId="63C7496B">
+          <wp:inline distT="0" distB="0" distL="0" distR="0" wp14:anchorId="5D8DB311" wp14:editId="3892E0FF">
             <wp:extent cx="5120640" cy="4000682"/>
             <wp:effectExtent l="19050" t="19050" r="22860" b="19050"/>
-            <wp:docPr id="1707858560" name="Imagem 27"/>
+            <wp:docPr id="995745418" name="Imagem 27"/>
             <wp:cNvGraphicFramePr/>
             <a:graphic xmlns:a="http://schemas.openxmlformats.org/drawingml/2006/main">
               <a:graphicData uri="http://schemas.openxmlformats.org/drawingml/2006/picture">
                 <pic:pic xmlns:pic="http://schemas.openxmlformats.org/drawingml/2006/picture">
                   <pic:nvPicPr>
-                    <pic:cNvPr id="1707858560" name=""/>
+                    <pic:cNvPr id="995745418" name=""/>
                     <pic:cNvPicPr/>
                   </pic:nvPicPr>
                   <pic:blipFill>
@@ -17854,7 +17872,7 @@
           <w:sz w:val="34"/>
         </w:rPr>
       </w:pPr>
-      <w:bookmarkStart w:id="33" w:name="_Toc240533453"/>
+      <w:bookmarkStart w:id="33" w:name="_Toc240534308"/>
       <w:r>
         <w:rPr>
           <w:rFonts w:ascii="Montserrat" w:hAnsi="Montserrat"/>
@@ -17896,7 +17914,7 @@
           <w:sz w:val="27"/>
         </w:rPr>
       </w:pPr>
-      <w:bookmarkStart w:id="34" w:name="_Toc240533454"/>
+      <w:bookmarkStart w:id="34" w:name="_Toc240534309"/>
       <w:r>
         <w:rPr>
           <w:rFonts w:ascii="Montserrat" w:hAnsi="Montserrat"/>
@@ -17936,16 +17954,16 @@
           <w:noProof/>
         </w:rPr>
         <w:drawing>
-          <wp:inline distT="0" distB="0" distL="0" distR="0" wp14:anchorId="7DA36D45" wp14:editId="38B20DD9">
+          <wp:inline distT="0" distB="0" distL="0" distR="0" wp14:anchorId="2ED5C115" wp14:editId="674D0A6B">
             <wp:extent cx="5120640" cy="4627581"/>
             <wp:effectExtent l="19050" t="19050" r="22860" b="20955"/>
-            <wp:docPr id="1157595342" name="Imagem 28"/>
+            <wp:docPr id="752101963" name="Imagem 28"/>
             <wp:cNvGraphicFramePr/>
             <a:graphic xmlns:a="http://schemas.openxmlformats.org/drawingml/2006/main">
               <a:graphicData uri="http://schemas.openxmlformats.org/drawingml/2006/picture">
                 <pic:pic xmlns:pic="http://schemas.openxmlformats.org/drawingml/2006/picture">
                   <pic:nvPicPr>
-                    <pic:cNvPr id="1157595342" name=""/>
+                    <pic:cNvPr id="752101963" name=""/>
                     <pic:cNvPicPr/>
                   </pic:nvPicPr>
                   <pic:blipFill>
@@ -18013,16 +18031,16 @@
         </w:rPr>
         <w:lastRenderedPageBreak/>
         <w:drawing>
-          <wp:inline distT="0" distB="0" distL="0" distR="0" wp14:anchorId="1235580E" wp14:editId="5CE2CAD1">
+          <wp:inline distT="0" distB="0" distL="0" distR="0" wp14:anchorId="2F58D419" wp14:editId="67ECF7AE">
             <wp:extent cx="5120640" cy="4627581"/>
             <wp:effectExtent l="19050" t="19050" r="22860" b="20955"/>
-            <wp:docPr id="1109383760" name="Imagem 29"/>
+            <wp:docPr id="582199895" name="Imagem 29"/>
             <wp:cNvGraphicFramePr/>
             <a:graphic xmlns:a="http://schemas.openxmlformats.org/drawingml/2006/main">
               <a:graphicData uri="http://schemas.openxmlformats.org/drawingml/2006/picture">
                 <pic:pic xmlns:pic="http://schemas.openxmlformats.org/drawingml/2006/picture">
                   <pic:nvPicPr>
-                    <pic:cNvPr id="1109383760" name=""/>
+                    <pic:cNvPr id="582199895" name=""/>
                     <pic:cNvPicPr/>
                   </pic:nvPicPr>
                   <pic:blipFill>
@@ -18090,16 +18108,16 @@
         </w:rPr>
         <w:lastRenderedPageBreak/>
         <w:drawing>
-          <wp:inline distT="0" distB="0" distL="0" distR="0" wp14:anchorId="2FFE0B1B" wp14:editId="2316E8C3">
+          <wp:inline distT="0" distB="0" distL="0" distR="0" wp14:anchorId="382DFC04" wp14:editId="492D25D5">
             <wp:extent cx="5120640" cy="4627581"/>
             <wp:effectExtent l="19050" t="19050" r="22860" b="20955"/>
-            <wp:docPr id="1864248236" name="Imagem 30"/>
+            <wp:docPr id="1516417993" name="Imagem 30"/>
             <wp:cNvGraphicFramePr/>
             <a:graphic xmlns:a="http://schemas.openxmlformats.org/drawingml/2006/main">
               <a:graphicData uri="http://schemas.openxmlformats.org/drawingml/2006/picture">
                 <pic:pic xmlns:pic="http://schemas.openxmlformats.org/drawingml/2006/picture">
                   <pic:nvPicPr>
-                    <pic:cNvPr id="1864248236" name=""/>
+                    <pic:cNvPr id="1516417993" name=""/>
                     <pic:cNvPicPr/>
                   </pic:nvPicPr>
                   <pic:blipFill>
@@ -18301,16 +18319,16 @@
           <w:noProof/>
         </w:rPr>
         <w:drawing>
-          <wp:inline distT="0" distB="0" distL="0" distR="0" wp14:anchorId="33CE748C" wp14:editId="7C5C6117">
+          <wp:inline distT="0" distB="0" distL="0" distR="0" wp14:anchorId="2508F8E4" wp14:editId="0C6580B0">
             <wp:extent cx="5120640" cy="1715571"/>
             <wp:effectExtent l="19050" t="19050" r="22860" b="18415"/>
-            <wp:docPr id="625699793" name="Imagem 31"/>
+            <wp:docPr id="89472656" name="Imagem 31"/>
             <wp:cNvGraphicFramePr/>
             <a:graphic xmlns:a="http://schemas.openxmlformats.org/drawingml/2006/main">
               <a:graphicData uri="http://schemas.openxmlformats.org/drawingml/2006/picture">
                 <pic:pic xmlns:pic="http://schemas.openxmlformats.org/drawingml/2006/picture">
                   <pic:nvPicPr>
-                    <pic:cNvPr id="625699793" name=""/>
+                    <pic:cNvPr id="89472656" name=""/>
                     <pic:cNvPicPr/>
                   </pic:nvPicPr>
                   <pic:blipFill>
@@ -18447,16 +18465,16 @@
           <w:noProof/>
         </w:rPr>
         <w:drawing>
-          <wp:inline distT="0" distB="0" distL="0" distR="0" wp14:anchorId="139F0936" wp14:editId="0CCA53B2">
+          <wp:inline distT="0" distB="0" distL="0" distR="0" wp14:anchorId="3CF88D3A" wp14:editId="717A0B0A">
             <wp:extent cx="5120640" cy="3282818"/>
             <wp:effectExtent l="19050" t="19050" r="22860" b="13335"/>
-            <wp:docPr id="1790983737" name="Imagem 32"/>
+            <wp:docPr id="95148903" name="Imagem 32"/>
             <wp:cNvGraphicFramePr/>
             <a:graphic xmlns:a="http://schemas.openxmlformats.org/drawingml/2006/main">
               <a:graphicData uri="http://schemas.openxmlformats.org/drawingml/2006/picture">
                 <pic:pic xmlns:pic="http://schemas.openxmlformats.org/drawingml/2006/picture">
                   <pic:nvPicPr>
-                    <pic:cNvPr id="1790983737" name=""/>
+                    <pic:cNvPr id="95148903" name=""/>
                     <pic:cNvPicPr/>
                   </pic:nvPicPr>
                   <pic:blipFill>
@@ -18590,16 +18608,16 @@
           <w:noProof/>
         </w:rPr>
         <w:drawing>
-          <wp:inline distT="0" distB="0" distL="0" distR="0" wp14:anchorId="39FD0AEC" wp14:editId="7F317A9C">
+          <wp:inline distT="0" distB="0" distL="0" distR="0" wp14:anchorId="20F0B888" wp14:editId="0D3332AB">
             <wp:extent cx="5120640" cy="951357"/>
             <wp:effectExtent l="19050" t="19050" r="22860" b="20320"/>
-            <wp:docPr id="1512951966" name="Imagem 33"/>
+            <wp:docPr id="1588785654" name="Imagem 33"/>
             <wp:cNvGraphicFramePr/>
             <a:graphic xmlns:a="http://schemas.openxmlformats.org/drawingml/2006/main">
               <a:graphicData uri="http://schemas.openxmlformats.org/drawingml/2006/picture">
                 <pic:pic xmlns:pic="http://schemas.openxmlformats.org/drawingml/2006/picture">
                   <pic:nvPicPr>
-                    <pic:cNvPr id="1512951966" name=""/>
+                    <pic:cNvPr id="1588785654" name=""/>
                     <pic:cNvPicPr/>
                   </pic:nvPicPr>
                   <pic:blipFill>
@@ -18763,16 +18781,16 @@
           <w:noProof/>
         </w:rPr>
         <w:drawing>
-          <wp:inline distT="0" distB="0" distL="0" distR="0" wp14:anchorId="77FB6520" wp14:editId="182C9DB0">
+          <wp:inline distT="0" distB="0" distL="0" distR="0" wp14:anchorId="4776ADCA" wp14:editId="532B1925">
             <wp:extent cx="5120640" cy="1515102"/>
             <wp:effectExtent l="19050" t="19050" r="22860" b="28575"/>
-            <wp:docPr id="128781152" name="Imagem 34"/>
+            <wp:docPr id="1435944463" name="Imagem 34"/>
             <wp:cNvGraphicFramePr/>
             <a:graphic xmlns:a="http://schemas.openxmlformats.org/drawingml/2006/main">
               <a:graphicData uri="http://schemas.openxmlformats.org/drawingml/2006/picture">
                 <pic:pic xmlns:pic="http://schemas.openxmlformats.org/drawingml/2006/picture">
                   <pic:nvPicPr>
-                    <pic:cNvPr id="128781152" name=""/>
+                    <pic:cNvPr id="1435944463" name=""/>
                     <pic:cNvPicPr/>
                   </pic:nvPicPr>
                   <pic:blipFill>
@@ -18884,16 +18902,16 @@
           <w:noProof/>
         </w:rPr>
         <w:drawing>
-          <wp:inline distT="0" distB="0" distL="0" distR="0" wp14:anchorId="237A4804" wp14:editId="53D9F164">
+          <wp:inline distT="0" distB="0" distL="0" distR="0" wp14:anchorId="7A8E11D3" wp14:editId="104CAB87">
             <wp:extent cx="5120640" cy="1391113"/>
             <wp:effectExtent l="19050" t="19050" r="22860" b="19050"/>
-            <wp:docPr id="832010126" name="Imagem 35"/>
+            <wp:docPr id="573801576" name="Imagem 35"/>
             <wp:cNvGraphicFramePr/>
             <a:graphic xmlns:a="http://schemas.openxmlformats.org/drawingml/2006/main">
               <a:graphicData uri="http://schemas.openxmlformats.org/drawingml/2006/picture">
                 <pic:pic xmlns:pic="http://schemas.openxmlformats.org/drawingml/2006/picture">
                   <pic:nvPicPr>
-                    <pic:cNvPr id="832010126" name=""/>
+                    <pic:cNvPr id="573801576" name=""/>
                     <pic:cNvPicPr/>
                   </pic:nvPicPr>
                   <pic:blipFill>
@@ -19015,16 +19033,16 @@
           <w:noProof/>
         </w:rPr>
         <w:drawing>
-          <wp:inline distT="0" distB="0" distL="0" distR="0" wp14:anchorId="3DAF692F" wp14:editId="74F29EF8">
+          <wp:inline distT="0" distB="0" distL="0" distR="0" wp14:anchorId="4D8AD5C6" wp14:editId="5800068E">
             <wp:extent cx="5120640" cy="1125174"/>
             <wp:effectExtent l="19050" t="19050" r="22860" b="18415"/>
-            <wp:docPr id="352304831" name="Imagem 36"/>
+            <wp:docPr id="1398047487" name="Imagem 36"/>
             <wp:cNvGraphicFramePr/>
             <a:graphic xmlns:a="http://schemas.openxmlformats.org/drawingml/2006/main">
               <a:graphicData uri="http://schemas.openxmlformats.org/drawingml/2006/picture">
                 <pic:pic xmlns:pic="http://schemas.openxmlformats.org/drawingml/2006/picture">
                   <pic:nvPicPr>
-                    <pic:cNvPr id="352304831" name=""/>
+                    <pic:cNvPr id="1398047487" name=""/>
                     <pic:cNvPicPr/>
                   </pic:nvPicPr>
                   <pic:blipFill>
@@ -19113,7 +19131,7 @@
           <w:sz w:val="27"/>
         </w:rPr>
       </w:pPr>
-      <w:bookmarkStart w:id="35" w:name="_Toc240533455"/>
+      <w:bookmarkStart w:id="35" w:name="_Toc240534310"/>
       <w:r>
         <w:rPr>
           <w:rFonts w:ascii="Montserrat" w:hAnsi="Montserrat"/>
@@ -19154,16 +19172,16 @@
         </w:rPr>
         <w:lastRenderedPageBreak/>
         <w:drawing>
-          <wp:inline distT="0" distB="0" distL="0" distR="0" wp14:anchorId="2A1ED987" wp14:editId="3A81409B">
+          <wp:inline distT="0" distB="0" distL="0" distR="0" wp14:anchorId="377C3F36" wp14:editId="7D66617E">
             <wp:extent cx="5120640" cy="4627581"/>
             <wp:effectExtent l="19050" t="19050" r="22860" b="20955"/>
-            <wp:docPr id="1926961395" name="Imagem 37"/>
+            <wp:docPr id="77055237" name="Imagem 37"/>
             <wp:cNvGraphicFramePr/>
             <a:graphic xmlns:a="http://schemas.openxmlformats.org/drawingml/2006/main">
               <a:graphicData uri="http://schemas.openxmlformats.org/drawingml/2006/picture">
                 <pic:pic xmlns:pic="http://schemas.openxmlformats.org/drawingml/2006/picture">
                   <pic:nvPicPr>
-                    <pic:cNvPr id="1926961395" name=""/>
+                    <pic:cNvPr id="77055237" name=""/>
                     <pic:cNvPicPr/>
                   </pic:nvPicPr>
                   <pic:blipFill>
@@ -19231,16 +19249,16 @@
         </w:rPr>
         <w:lastRenderedPageBreak/>
         <w:drawing>
-          <wp:inline distT="0" distB="0" distL="0" distR="0" wp14:anchorId="0E459AE7" wp14:editId="4A389453">
+          <wp:inline distT="0" distB="0" distL="0" distR="0" wp14:anchorId="13F2ACD8" wp14:editId="6CC05DF4">
             <wp:extent cx="5120640" cy="4627581"/>
             <wp:effectExtent l="19050" t="19050" r="22860" b="20955"/>
-            <wp:docPr id="1664096256" name="Imagem 38"/>
+            <wp:docPr id="1677663333" name="Imagem 38"/>
             <wp:cNvGraphicFramePr/>
             <a:graphic xmlns:a="http://schemas.openxmlformats.org/drawingml/2006/main">
               <a:graphicData uri="http://schemas.openxmlformats.org/drawingml/2006/picture">
                 <pic:pic xmlns:pic="http://schemas.openxmlformats.org/drawingml/2006/picture">
                   <pic:nvPicPr>
-                    <pic:cNvPr id="1664096256" name=""/>
+                    <pic:cNvPr id="1677663333" name=""/>
                     <pic:cNvPicPr/>
                   </pic:nvPicPr>
                   <pic:blipFill>
@@ -19409,16 +19427,16 @@
           <w:noProof/>
         </w:rPr>
         <w:drawing>
-          <wp:inline distT="0" distB="0" distL="0" distR="0" wp14:anchorId="48842377" wp14:editId="1D6C4099">
+          <wp:inline distT="0" distB="0" distL="0" distR="0" wp14:anchorId="7AD95F81" wp14:editId="748A4BED">
             <wp:extent cx="5120640" cy="2144319"/>
             <wp:effectExtent l="19050" t="19050" r="22860" b="27940"/>
-            <wp:docPr id="103055623" name="Imagem 39"/>
+            <wp:docPr id="73399281" name="Imagem 39"/>
             <wp:cNvGraphicFramePr/>
             <a:graphic xmlns:a="http://schemas.openxmlformats.org/drawingml/2006/main">
               <a:graphicData uri="http://schemas.openxmlformats.org/drawingml/2006/picture">
                 <pic:pic xmlns:pic="http://schemas.openxmlformats.org/drawingml/2006/picture">
                   <pic:nvPicPr>
-                    <pic:cNvPr id="103055623" name=""/>
+                    <pic:cNvPr id="73399281" name=""/>
                     <pic:cNvPicPr/>
                   </pic:nvPicPr>
                   <pic:blipFill>
@@ -19506,16 +19524,16 @@
           <w:noProof/>
         </w:rPr>
         <w:drawing>
-          <wp:inline distT="0" distB="0" distL="0" distR="0" wp14:anchorId="13C07404" wp14:editId="369C742F">
+          <wp:inline distT="0" distB="0" distL="0" distR="0" wp14:anchorId="156BB43D" wp14:editId="62E6C4C5">
             <wp:extent cx="5120640" cy="1055647"/>
             <wp:effectExtent l="19050" t="19050" r="22860" b="11430"/>
-            <wp:docPr id="339467279" name="Imagem 40"/>
+            <wp:docPr id="203865889" name="Imagem 40"/>
             <wp:cNvGraphicFramePr/>
             <a:graphic xmlns:a="http://schemas.openxmlformats.org/drawingml/2006/main">
               <a:graphicData uri="http://schemas.openxmlformats.org/drawingml/2006/picture">
                 <pic:pic xmlns:pic="http://schemas.openxmlformats.org/drawingml/2006/picture">
                   <pic:nvPicPr>
-                    <pic:cNvPr id="339467279" name=""/>
+                    <pic:cNvPr id="203865889" name=""/>
                     <pic:cNvPicPr/>
                   </pic:nvPicPr>
                   <pic:blipFill>
@@ -19637,16 +19655,16 @@
           <w:noProof/>
         </w:rPr>
         <w:drawing>
-          <wp:inline distT="0" distB="0" distL="0" distR="0" wp14:anchorId="650842F9" wp14:editId="22666E2C">
+          <wp:inline distT="0" distB="0" distL="0" distR="0" wp14:anchorId="6FDCCC32" wp14:editId="185CDA0D">
             <wp:extent cx="5120640" cy="3282818"/>
             <wp:effectExtent l="19050" t="19050" r="22860" b="13335"/>
-            <wp:docPr id="654065130" name="Imagem 41"/>
+            <wp:docPr id="424371653" name="Imagem 41"/>
             <wp:cNvGraphicFramePr/>
             <a:graphic xmlns:a="http://schemas.openxmlformats.org/drawingml/2006/main">
               <a:graphicData uri="http://schemas.openxmlformats.org/drawingml/2006/picture">
                 <pic:pic xmlns:pic="http://schemas.openxmlformats.org/drawingml/2006/picture">
                   <pic:nvPicPr>
-                    <pic:cNvPr id="654065130" name=""/>
+                    <pic:cNvPr id="424371653" name=""/>
                     <pic:cNvPicPr/>
                   </pic:nvPicPr>
                   <pic:blipFill>
@@ -19780,16 +19798,16 @@
         </w:rPr>
         <w:lastRenderedPageBreak/>
         <w:drawing>
-          <wp:inline distT="0" distB="0" distL="0" distR="0" wp14:anchorId="42ED4821" wp14:editId="3C76AC09">
+          <wp:inline distT="0" distB="0" distL="0" distR="0" wp14:anchorId="2F818899" wp14:editId="5B62383E">
             <wp:extent cx="5120640" cy="1978034"/>
             <wp:effectExtent l="19050" t="19050" r="22860" b="22225"/>
-            <wp:docPr id="1595870576" name="Imagem 42"/>
+            <wp:docPr id="1355868392" name="Imagem 42"/>
             <wp:cNvGraphicFramePr/>
             <a:graphic xmlns:a="http://schemas.openxmlformats.org/drawingml/2006/main">
               <a:graphicData uri="http://schemas.openxmlformats.org/drawingml/2006/picture">
                 <pic:pic xmlns:pic="http://schemas.openxmlformats.org/drawingml/2006/picture">
                   <pic:nvPicPr>
-                    <pic:cNvPr id="1595870576" name=""/>
+                    <pic:cNvPr id="1355868392" name=""/>
                     <pic:cNvPicPr/>
                   </pic:nvPicPr>
                   <pic:blipFill>
@@ -19861,7 +19879,7 @@
           <w:sz w:val="34"/>
         </w:rPr>
       </w:pPr>
-      <w:bookmarkStart w:id="36" w:name="_Toc240533456"/>
+      <w:bookmarkStart w:id="36" w:name="_Toc240534311"/>
       <w:r>
         <w:rPr>
           <w:rFonts w:ascii="Montserrat" w:hAnsi="Montserrat"/>
@@ -19921,7 +19939,7 @@
           <w:sz w:val="27"/>
         </w:rPr>
       </w:pPr>
-      <w:bookmarkStart w:id="37" w:name="_Toc240533457"/>
+      <w:bookmarkStart w:id="37" w:name="_Toc240534312"/>
       <w:r>
         <w:rPr>
           <w:rFonts w:ascii="Montserrat" w:hAnsi="Montserrat"/>
@@ -19961,16 +19979,16 @@
           <w:noProof/>
         </w:rPr>
         <w:drawing>
-          <wp:inline distT="0" distB="0" distL="0" distR="0" wp14:anchorId="5A3CB9AD" wp14:editId="181F0145">
+          <wp:inline distT="0" distB="0" distL="0" distR="0" wp14:anchorId="5C13EC11" wp14:editId="1234C27E">
             <wp:extent cx="5303520" cy="4792851"/>
             <wp:effectExtent l="19050" t="19050" r="11430" b="27305"/>
-            <wp:docPr id="1354762991" name="Imagem 43"/>
+            <wp:docPr id="526403251" name="Imagem 43"/>
             <wp:cNvGraphicFramePr/>
             <a:graphic xmlns:a="http://schemas.openxmlformats.org/drawingml/2006/main">
               <a:graphicData uri="http://schemas.openxmlformats.org/drawingml/2006/picture">
                 <pic:pic xmlns:pic="http://schemas.openxmlformats.org/drawingml/2006/picture">
                   <pic:nvPicPr>
-                    <pic:cNvPr id="1354762991" name=""/>
+                    <pic:cNvPr id="526403251" name=""/>
                     <pic:cNvPicPr/>
                   </pic:nvPicPr>
                   <pic:blipFill>
@@ -20039,7 +20057,7 @@
           <w:sz w:val="27"/>
         </w:rPr>
       </w:pPr>
-      <w:bookmarkStart w:id="38" w:name="_Toc240533458"/>
+      <w:bookmarkStart w:id="38" w:name="_Toc240534313"/>
       <w:r>
         <w:rPr>
           <w:rFonts w:ascii="Montserrat" w:hAnsi="Montserrat"/>
@@ -20079,16 +20097,16 @@
           <w:noProof/>
         </w:rPr>
         <w:drawing>
-          <wp:inline distT="0" distB="0" distL="0" distR="0" wp14:anchorId="44F20D2A" wp14:editId="262C6F4C">
+          <wp:inline distT="0" distB="0" distL="0" distR="0" wp14:anchorId="611AE900" wp14:editId="23D9FA6D">
             <wp:extent cx="5303520" cy="4792851"/>
             <wp:effectExtent l="19050" t="19050" r="11430" b="27305"/>
-            <wp:docPr id="1925971145" name="Imagem 44"/>
+            <wp:docPr id="1936143486" name="Imagem 44"/>
             <wp:cNvGraphicFramePr/>
             <a:graphic xmlns:a="http://schemas.openxmlformats.org/drawingml/2006/main">
               <a:graphicData uri="http://schemas.openxmlformats.org/drawingml/2006/picture">
                 <pic:pic xmlns:pic="http://schemas.openxmlformats.org/drawingml/2006/picture">
                   <pic:nvPicPr>
-                    <pic:cNvPr id="1925971145" name=""/>
+                    <pic:cNvPr id="1936143486" name=""/>
                     <pic:cNvPicPr/>
                   </pic:nvPicPr>
                   <pic:blipFill>
@@ -20156,7 +20174,7 @@
           <w:sz w:val="27"/>
         </w:rPr>
       </w:pPr>
-      <w:bookmarkStart w:id="39" w:name="_Toc240533459"/>
+      <w:bookmarkStart w:id="39" w:name="_Toc240534314"/>
       <w:r>
         <w:rPr>
           <w:rFonts w:ascii="Montserrat" w:hAnsi="Montserrat"/>
@@ -20197,16 +20215,16 @@
         </w:rPr>
         <w:lastRenderedPageBreak/>
         <w:drawing>
-          <wp:inline distT="0" distB="0" distL="0" distR="0" wp14:anchorId="0C14C5BC" wp14:editId="76FDAE1F">
+          <wp:inline distT="0" distB="0" distL="0" distR="0" wp14:anchorId="6678B38E" wp14:editId="2BC0AA88">
             <wp:extent cx="5303520" cy="4792851"/>
             <wp:effectExtent l="19050" t="19050" r="11430" b="27305"/>
-            <wp:docPr id="310684108" name="Imagem 45"/>
+            <wp:docPr id="1984342543" name="Imagem 45"/>
             <wp:cNvGraphicFramePr/>
             <a:graphic xmlns:a="http://schemas.openxmlformats.org/drawingml/2006/main">
               <a:graphicData uri="http://schemas.openxmlformats.org/drawingml/2006/picture">
                 <pic:pic xmlns:pic="http://schemas.openxmlformats.org/drawingml/2006/picture">
                   <pic:nvPicPr>
-                    <pic:cNvPr id="310684108" name=""/>
+                    <pic:cNvPr id="1984342543" name=""/>
                     <pic:cNvPicPr/>
                   </pic:nvPicPr>
                   <pic:blipFill>
@@ -20274,16 +20292,16 @@
         </w:rPr>
         <w:lastRenderedPageBreak/>
         <w:drawing>
-          <wp:inline distT="0" distB="0" distL="0" distR="0" wp14:anchorId="0143005E" wp14:editId="391F120C">
+          <wp:inline distT="0" distB="0" distL="0" distR="0" wp14:anchorId="7ACE0041" wp14:editId="4904421D">
             <wp:extent cx="5303520" cy="4792851"/>
             <wp:effectExtent l="19050" t="19050" r="11430" b="27305"/>
-            <wp:docPr id="1892086130" name="Imagem 46"/>
+            <wp:docPr id="1123543209" name="Imagem 46"/>
             <wp:cNvGraphicFramePr/>
             <a:graphic xmlns:a="http://schemas.openxmlformats.org/drawingml/2006/main">
               <a:graphicData uri="http://schemas.openxmlformats.org/drawingml/2006/picture">
                 <pic:pic xmlns:pic="http://schemas.openxmlformats.org/drawingml/2006/picture">
                   <pic:nvPicPr>
-                    <pic:cNvPr id="1892086130" name=""/>
+                    <pic:cNvPr id="1123543209" name=""/>
                     <pic:cNvPicPr/>
                   </pic:nvPicPr>
                   <pic:blipFill>
@@ -20376,7 +20394,7 @@
           <w:sz w:val="34"/>
         </w:rPr>
       </w:pPr>
-      <w:bookmarkStart w:id="40" w:name="_Toc240533460"/>
+      <w:bookmarkStart w:id="40" w:name="_Toc240534315"/>
       <w:r>
         <w:rPr>
           <w:rFonts w:ascii="Montserrat" w:hAnsi="Montserrat"/>
@@ -20418,7 +20436,7 @@
           <w:sz w:val="27"/>
         </w:rPr>
       </w:pPr>
-      <w:bookmarkStart w:id="41" w:name="_Toc240533461"/>
+      <w:bookmarkStart w:id="41" w:name="_Toc240534316"/>
       <w:r>
         <w:rPr>
           <w:rFonts w:ascii="Montserrat" w:hAnsi="Montserrat"/>
@@ -20458,16 +20476,16 @@
           <w:noProof/>
         </w:rPr>
         <w:drawing>
-          <wp:inline distT="0" distB="0" distL="0" distR="0" wp14:anchorId="7A77C17E" wp14:editId="1DE6142C">
+          <wp:inline distT="0" distB="0" distL="0" distR="0" wp14:anchorId="71DE4155" wp14:editId="7D32F0D3">
             <wp:extent cx="5303520" cy="4792851"/>
             <wp:effectExtent l="19050" t="19050" r="11430" b="27305"/>
-            <wp:docPr id="745246" name="Imagem 47"/>
+            <wp:docPr id="830532177" name="Imagem 47"/>
             <wp:cNvGraphicFramePr/>
             <a:graphic xmlns:a="http://schemas.openxmlformats.org/drawingml/2006/main">
               <a:graphicData uri="http://schemas.openxmlformats.org/drawingml/2006/picture">
                 <pic:pic xmlns:pic="http://schemas.openxmlformats.org/drawingml/2006/picture">
                   <pic:nvPicPr>
-                    <pic:cNvPr id="745246" name=""/>
+                    <pic:cNvPr id="830532177" name=""/>
                     <pic:cNvPicPr/>
                   </pic:nvPicPr>
                   <pic:blipFill>
@@ -20722,7 +20740,7 @@
           <w:sz w:val="27"/>
         </w:rPr>
       </w:pPr>
-      <w:bookmarkStart w:id="42" w:name="_Toc240533462"/>
+      <w:bookmarkStart w:id="42" w:name="_Toc240534317"/>
       <w:r>
         <w:rPr>
           <w:rFonts w:ascii="Montserrat" w:hAnsi="Montserrat"/>
@@ -20763,16 +20781,16 @@
         </w:rPr>
         <w:lastRenderedPageBreak/>
         <w:drawing>
-          <wp:inline distT="0" distB="0" distL="0" distR="0" wp14:anchorId="01B49B00" wp14:editId="486803B7">
+          <wp:inline distT="0" distB="0" distL="0" distR="0" wp14:anchorId="28AB1E46" wp14:editId="02589F06">
             <wp:extent cx="5303520" cy="4792851"/>
             <wp:effectExtent l="19050" t="19050" r="11430" b="27305"/>
-            <wp:docPr id="514512659" name="Imagem 48"/>
+            <wp:docPr id="1193608740" name="Imagem 48"/>
             <wp:cNvGraphicFramePr/>
             <a:graphic xmlns:a="http://schemas.openxmlformats.org/drawingml/2006/main">
               <a:graphicData uri="http://schemas.openxmlformats.org/drawingml/2006/picture">
                 <pic:pic xmlns:pic="http://schemas.openxmlformats.org/drawingml/2006/picture">
                   <pic:nvPicPr>
-                    <pic:cNvPr id="514512659" name=""/>
+                    <pic:cNvPr id="1193608740" name=""/>
                     <pic:cNvPicPr/>
                   </pic:nvPicPr>
                   <pic:blipFill>
@@ -20861,7 +20879,7 @@
           <w:sz w:val="27"/>
         </w:rPr>
       </w:pPr>
-      <w:bookmarkStart w:id="43" w:name="_Toc240533463"/>
+      <w:bookmarkStart w:id="43" w:name="_Toc240534318"/>
       <w:r>
         <w:rPr>
           <w:rFonts w:ascii="Montserrat" w:hAnsi="Montserrat"/>
@@ -20902,16 +20920,16 @@
         </w:rPr>
         <w:lastRenderedPageBreak/>
         <w:drawing>
-          <wp:inline distT="0" distB="0" distL="0" distR="0" wp14:anchorId="13776E25" wp14:editId="31ECBBF5">
+          <wp:inline distT="0" distB="0" distL="0" distR="0" wp14:anchorId="79519FCE" wp14:editId="6C07019F">
             <wp:extent cx="5303520" cy="4792851"/>
             <wp:effectExtent l="19050" t="19050" r="11430" b="27305"/>
-            <wp:docPr id="182483885" name="Imagem 49"/>
+            <wp:docPr id="969670656" name="Imagem 49"/>
             <wp:cNvGraphicFramePr/>
             <a:graphic xmlns:a="http://schemas.openxmlformats.org/drawingml/2006/main">
               <a:graphicData uri="http://schemas.openxmlformats.org/drawingml/2006/picture">
                 <pic:pic xmlns:pic="http://schemas.openxmlformats.org/drawingml/2006/picture">
                   <pic:nvPicPr>
-                    <pic:cNvPr id="182483885" name=""/>
+                    <pic:cNvPr id="969670656" name=""/>
                     <pic:cNvPicPr/>
                   </pic:nvPicPr>
                   <pic:blipFill>
@@ -21055,7 +21073,7 @@
           <w:sz w:val="27"/>
         </w:rPr>
       </w:pPr>
-      <w:bookmarkStart w:id="44" w:name="_Toc240533464"/>
+      <w:bookmarkStart w:id="44" w:name="_Toc240534319"/>
       <w:r>
         <w:rPr>
           <w:rFonts w:ascii="Montserrat" w:hAnsi="Montserrat"/>
@@ -21320,16 +21338,16 @@
           <w:noProof/>
         </w:rPr>
         <w:drawing>
-          <wp:inline distT="0" distB="0" distL="0" distR="0" wp14:anchorId="3D939B61" wp14:editId="2A30E1C9">
+          <wp:inline distT="0" distB="0" distL="0" distR="0" wp14:anchorId="24B31600" wp14:editId="1CF697E1">
             <wp:extent cx="5303520" cy="4267180"/>
             <wp:effectExtent l="19050" t="19050" r="11430" b="19685"/>
-            <wp:docPr id="1114477027" name="Imagem 50"/>
+            <wp:docPr id="376880162" name="Imagem 50"/>
             <wp:cNvGraphicFramePr/>
             <a:graphic xmlns:a="http://schemas.openxmlformats.org/drawingml/2006/main">
               <a:graphicData uri="http://schemas.openxmlformats.org/drawingml/2006/picture">
                 <pic:pic xmlns:pic="http://schemas.openxmlformats.org/drawingml/2006/picture">
                   <pic:nvPicPr>
-                    <pic:cNvPr id="1114477027" name=""/>
+                    <pic:cNvPr id="376880162" name=""/>
                     <pic:cNvPicPr/>
                   </pic:nvPicPr>
                   <pic:blipFill>
@@ -21397,16 +21415,16 @@
           <w:noProof/>
         </w:rPr>
         <w:drawing>
-          <wp:inline distT="0" distB="0" distL="0" distR="0" wp14:anchorId="32C4F5BB" wp14:editId="19342495">
+          <wp:inline distT="0" distB="0" distL="0" distR="0" wp14:anchorId="1D5D6AFA" wp14:editId="206D8D91">
             <wp:extent cx="5303520" cy="3382059"/>
             <wp:effectExtent l="19050" t="19050" r="11430" b="27940"/>
-            <wp:docPr id="1053494920" name="Imagem 51"/>
+            <wp:docPr id="89317920" name="Imagem 51"/>
             <wp:cNvGraphicFramePr/>
             <a:graphic xmlns:a="http://schemas.openxmlformats.org/drawingml/2006/main">
               <a:graphicData uri="http://schemas.openxmlformats.org/drawingml/2006/picture">
                 <pic:pic xmlns:pic="http://schemas.openxmlformats.org/drawingml/2006/picture">
                   <pic:nvPicPr>
-                    <pic:cNvPr id="1053494920" name=""/>
+                    <pic:cNvPr id="89317920" name=""/>
                     <pic:cNvPicPr/>
                   </pic:nvPicPr>
                   <pic:blipFill>
@@ -21474,16 +21492,16 @@
         </w:rPr>
         <w:lastRenderedPageBreak/>
         <w:drawing>
-          <wp:inline distT="0" distB="0" distL="0" distR="0" wp14:anchorId="3962365A" wp14:editId="4F9EDF24">
+          <wp:inline distT="0" distB="0" distL="0" distR="0" wp14:anchorId="62EB4BFF" wp14:editId="6C74E5E6">
             <wp:extent cx="5303520" cy="4417800"/>
             <wp:effectExtent l="19050" t="19050" r="11430" b="20955"/>
-            <wp:docPr id="728490290" name="Imagem 52"/>
+            <wp:docPr id="2076820330" name="Imagem 52"/>
             <wp:cNvGraphicFramePr/>
             <a:graphic xmlns:a="http://schemas.openxmlformats.org/drawingml/2006/main">
               <a:graphicData uri="http://schemas.openxmlformats.org/drawingml/2006/picture">
                 <pic:pic xmlns:pic="http://schemas.openxmlformats.org/drawingml/2006/picture">
                   <pic:nvPicPr>
-                    <pic:cNvPr id="728490290" name=""/>
+                    <pic:cNvPr id="2076820330" name=""/>
                     <pic:cNvPicPr/>
                   </pic:nvPicPr>
                   <pic:blipFill>
@@ -21593,7 +21611,7 @@
           <w:sz w:val="27"/>
         </w:rPr>
       </w:pPr>
-      <w:bookmarkStart w:id="45" w:name="_Toc240533465"/>
+      <w:bookmarkStart w:id="45" w:name="_Toc240534320"/>
       <w:r>
         <w:rPr>
           <w:rFonts w:ascii="Montserrat" w:hAnsi="Montserrat"/>
@@ -21859,16 +21877,16 @@
         </w:rPr>
         <w:lastRenderedPageBreak/>
         <w:drawing>
-          <wp:inline distT="0" distB="0" distL="0" distR="0" wp14:anchorId="3F1A50AF" wp14:editId="6B8EBA8D">
+          <wp:inline distT="0" distB="0" distL="0" distR="0" wp14:anchorId="58B9F553" wp14:editId="20452B44">
             <wp:extent cx="5303520" cy="7628836"/>
             <wp:effectExtent l="19050" t="19050" r="11430" b="10795"/>
-            <wp:docPr id="574680958" name="Imagem 53"/>
+            <wp:docPr id="1898085782" name="Imagem 53"/>
             <wp:cNvGraphicFramePr/>
             <a:graphic xmlns:a="http://schemas.openxmlformats.org/drawingml/2006/main">
               <a:graphicData uri="http://schemas.openxmlformats.org/drawingml/2006/picture">
                 <pic:pic xmlns:pic="http://schemas.openxmlformats.org/drawingml/2006/picture">
                   <pic:nvPicPr>
-                    <pic:cNvPr id="574680958" name=""/>
+                    <pic:cNvPr id="1898085782" name=""/>
                     <pic:cNvPicPr/>
                   </pic:nvPicPr>
                   <pic:blipFill>
@@ -22000,7 +22018,7 @@
           <w:sz w:val="27"/>
         </w:rPr>
       </w:pPr>
-      <w:bookmarkStart w:id="46" w:name="_Toc240533466"/>
+      <w:bookmarkStart w:id="46" w:name="_Toc240534321"/>
       <w:r>
         <w:rPr>
           <w:rFonts w:ascii="Montserrat" w:hAnsi="Montserrat"/>
@@ -22132,7 +22150,7 @@
           <w:sz w:val="27"/>
         </w:rPr>
       </w:pPr>
-      <w:bookmarkStart w:id="47" w:name="_Toc240533467"/>
+      <w:bookmarkStart w:id="47" w:name="_Toc240534322"/>
       <w:r>
         <w:rPr>
           <w:rFonts w:ascii="Montserrat" w:hAnsi="Montserrat"/>
@@ -22260,24 +22278,6 @@
     </w:p>
     <w:p>
       <w:pPr>
-        <w:spacing w:line="280" w:lineRule="auto"/>
-        <w:rPr>
-          <w:rFonts w:ascii="Montserrat" w:hAnsi="Montserrat"/>
-          <w:color w:val="1A1A1A"/>
-          <w:sz w:val="22"/>
-        </w:rPr>
-      </w:pPr>
-      <w:r>
-        <w:rPr>
-          <w:rFonts w:ascii="Montserrat" w:hAnsi="Montserrat"/>
-          <w:color w:val="1A1A1A"/>
-          <w:sz w:val="22"/>
-        </w:rPr>
-        <w:t>Quem recebe cada aviso: toda conta vinculada no campo Responsavel (conta) do cronograma (Passo 4, aba 3), quando preenchido - pode ser uma ou mais de uma pessoa -, mais toda conta com papel Gerente de Projetos que estiver na equipe daquele projeto (secao 2.5) - nao o campo de texto livre Gerente do cadastro do projeto. Se nenhuma conta existir para aquele marco (nem Responsavel (conta), nem Gerente de Projetos na equipe), ninguem recebe o aviso automatico, mas o indicador visual no Painel de Prazos continua aparecendo normalmente.</w:t>
-      </w:r>
-    </w:p>
-    <w:p>
-      <w:pPr>
         <w:spacing w:before="160" w:after="200"/>
         <w:ind w:left="283"/>
         <w:rPr>
@@ -22294,7 +22294,25 @@
           <w:color w:val="6A6A70"/>
           <w:sz w:val="21"/>
         </w:rPr>
-        <w:t xml:space="preserve">O campo Responsavel (conta) e nao a pessoa preenche o texto livre Responsavel ja existente: e um segundo campo, um botao que abre um painel com uma caixa de selecao por conta da equipe do projeto selecionado, podendo marcar mais de uma pessoa para o mesmo marco. A lista mostra o nome cadastrado de cada conta (caindo para o e-mail quando nao houver nome), e o botao resume a escolha (nome, ou </w:t>
+        <w:t>Os numeros acima (5, 2 e 7 dias) sao o padrao de fabrica - o Admin pode altera-los em Administracao &gt; Configuracoes &gt; Regras de aviso automatico de prazo e execucao (secao 6.3), sem mexer em codigo. Um valor em branco ou invalido faz a regra correspondente voltar ao padrao, sem deixar de funcionar.</w:t>
+      </w:r>
+    </w:p>
+    <w:p>
+      <w:pPr>
+        <w:spacing w:line="280" w:lineRule="auto"/>
+        <w:rPr>
+          <w:rFonts w:ascii="Montserrat" w:hAnsi="Montserrat"/>
+          <w:color w:val="1A1A1A"/>
+          <w:sz w:val="22"/>
+        </w:rPr>
+      </w:pPr>
+      <w:r>
+        <w:rPr>
+          <w:rFonts w:ascii="Montserrat" w:hAnsi="Montserrat"/>
+          <w:color w:val="1A1A1A"/>
+          <w:sz w:val="22"/>
+        </w:rPr>
+        <w:t>Quem recebe cada aviso: toda conta vinculada no campo Responsavel (conta) do cronograma (Passo 4, aba 3), quando preenchido - pode ser uma ou mais de uma pessoa -, mais toda conta com papel Gerente de Projetos que estiver na equipe daquele projeto (secao 2.5) - nao o campo de texto livre Gerente do cadastro do projeto. Se nenhuma conta existir para aquele marco (nem Responsavel (conta), nem Gerente de Projetos na equipe), ninguem recebe o aviso automatico, mas o indicador visual no Painel de Prazos continua aparecendo normalmente.</w:t>
       </w:r>
     </w:p>
     <w:p>
@@ -22315,7 +22333,7 @@
           <w:color w:val="6A6A70"/>
           <w:sz w:val="21"/>
         </w:rPr>
-        <w:t>ome +N com mais de uma pessoa marcada). O texto livre Responsavel continua existindo do lado, sem nenhuma mudanca - o campo novo serve so para o sistema saber para quais contas mandar o aviso automatico.</w:t>
+        <w:t xml:space="preserve">O campo Responsavel (conta) e nao a pessoa preenche o texto livre Responsavel ja existente: e um segundo campo, um botao que abre um painel com uma caixa de selecao por conta da equipe do projeto selecionado, podendo marcar mais de uma pessoa para o mesmo marco. A lista mostra o nome cadastrado de cada conta (caindo para o e-mail quando nao houver nome), e o botao resume a escolha (nome, ou </w:t>
       </w:r>
     </w:p>
     <w:p>
@@ -22336,17 +22354,29 @@
           <w:color w:val="6A6A70"/>
           <w:sz w:val="21"/>
         </w:rPr>
-        <w:t xml:space="preserve">Cada aviso e enviado uma unica vez por marco e por janela (5 dias, 2 dias, no dia) - nao repete todo dia dentro da mesma janela. Ja o aviso de atraso repete a </w:t>
-      </w:r>
-      <w:r>
+        <w:lastRenderedPageBreak/>
+        <w:t>ome +N com mais de uma pessoa marcada). O texto livre Responsavel continua existindo do lado, sem nenhuma mudanca - o campo novo serve so para o sistema saber para quais contas mandar o aviso automatico.</w:t>
+      </w:r>
+    </w:p>
+    <w:p>
+      <w:pPr>
+        <w:spacing w:before="160" w:after="200"/>
+        <w:ind w:left="283"/>
         <w:rPr>
           <w:rFonts w:ascii="Montserrat" w:hAnsi="Montserrat"/>
           <w:i/>
           <w:color w:val="6A6A70"/>
           <w:sz w:val="21"/>
         </w:rPr>
-        <w:lastRenderedPageBreak/>
-        <w:t>cada 7 dias, para continuar chegando enquanto a pendencia nao for resolvida, sem virar um lembrete diario.</w:t>
+      </w:pPr>
+      <w:r>
+        <w:rPr>
+          <w:rFonts w:ascii="Montserrat" w:hAnsi="Montserrat"/>
+          <w:i/>
+          <w:color w:val="6A6A70"/>
+          <w:sz w:val="21"/>
+        </w:rPr>
+        <w:t>Cada aviso e enviado uma unica vez por marco e por janela (5 dias, 2 dias, no dia) - nao repete todo dia dentro da mesma janela. Ja o aviso de atraso repete a cada 7 dias, para continuar chegando enquanto a pendencia nao for resolvida, sem virar um lembrete diario.</w:t>
       </w:r>
     </w:p>
     <w:p>
@@ -22408,7 +22438,7 @@
           <w:sz w:val="27"/>
         </w:rPr>
       </w:pPr>
-      <w:bookmarkStart w:id="48" w:name="_Toc240533468"/>
+      <w:bookmarkStart w:id="48" w:name="_Toc240534323"/>
       <w:r>
         <w:rPr>
           <w:rFonts w:ascii="Montserrat" w:hAnsi="Montserrat"/>
@@ -22456,7 +22486,7 @@
           <w:color w:val="6A6A70"/>
           <w:sz w:val="21"/>
         </w:rPr>
-        <w:t>Por que existe: o aviso de prazo acima so olha a data final - um marco com o Termino previsto ainda longe (semanas ou meses) podia ficar parado o tempo todo sem ninguem ser avisado, mesmo com o campo Execucao existindo desde a criacao dele. O aviso de silencio fecha essa lacuna, avisando por causa da inatividade, nao do prazo. No mesmo dia em que o aviso de prazo ja foi enviado para um marco, o aviso de silencio nao dispara tambem, para nao mandar dois e-mails de uma vez.</w:t>
+        <w:t>Por que existe: o aviso de prazo acima so olha a data final - um marco com o Termino previsto ainda longe (semanas ou meses) podia ficar parado o tempo todo sem ninguem ser avisado, mesmo com o campo Execucao existindo desde a criacao dele. O aviso de silencio fecha essa lacuna, avisando por causa da inatividade, nao do prazo. No mesmo dia em que o aviso de prazo ja foi enviado para um marco, o aviso de silencio nao dispara tambem, para nao mandar dois e-mails de uma vez. Os dois numeros (5 e 5 dias) tambem sao configuraveis em Administracao &gt; Configuracoes (secao 6.3), junto com os do aviso de prazo.</w:t>
       </w:r>
     </w:p>
     <w:p>
@@ -22470,7 +22500,7 @@
           <w:sz w:val="27"/>
         </w:rPr>
       </w:pPr>
-      <w:bookmarkStart w:id="49" w:name="_Toc240533469"/>
+      <w:bookmarkStart w:id="49" w:name="_Toc240534324"/>
       <w:r>
         <w:rPr>
           <w:rFonts w:ascii="Montserrat" w:hAnsi="Montserrat"/>
@@ -22552,6 +22582,7 @@
                 <w:color w:val="FFFFFF"/>
                 <w:sz w:val="19"/>
               </w:rPr>
+              <w:lastRenderedPageBreak/>
               <w:t>Secao</w:t>
             </w:r>
           </w:p>
@@ -22712,7 +22743,6 @@
                 <w:color w:val="1A1A1A"/>
                 <w:sz w:val="19"/>
               </w:rPr>
-              <w:lastRenderedPageBreak/>
               <w:t>Marcos atribuidos a mim</w:t>
             </w:r>
           </w:p>
@@ -23089,16 +23119,16 @@
         </w:rPr>
         <w:lastRenderedPageBreak/>
         <w:drawing>
-          <wp:inline distT="0" distB="0" distL="0" distR="0" wp14:anchorId="6984133D" wp14:editId="6B4B24EC">
+          <wp:inline distT="0" distB="0" distL="0" distR="0" wp14:anchorId="198CEA24" wp14:editId="20D27D4C">
             <wp:extent cx="5120640" cy="6240599"/>
             <wp:effectExtent l="19050" t="19050" r="22860" b="27305"/>
-            <wp:docPr id="728369398" name="Imagem 54"/>
+            <wp:docPr id="1452714312" name="Imagem 54"/>
             <wp:cNvGraphicFramePr/>
             <a:graphic xmlns:a="http://schemas.openxmlformats.org/drawingml/2006/main">
               <a:graphicData uri="http://schemas.openxmlformats.org/drawingml/2006/picture">
                 <pic:pic xmlns:pic="http://schemas.openxmlformats.org/drawingml/2006/picture">
                   <pic:nvPicPr>
-                    <pic:cNvPr id="728369398" name=""/>
+                    <pic:cNvPr id="1452714312" name=""/>
                     <pic:cNvPicPr/>
                   </pic:nvPicPr>
                   <pic:blipFill>
@@ -23269,7 +23299,7 @@
           <w:sz w:val="27"/>
         </w:rPr>
       </w:pPr>
-      <w:bookmarkStart w:id="50" w:name="_Toc240533470"/>
+      <w:bookmarkStart w:id="50" w:name="_Toc240534325"/>
       <w:r>
         <w:rPr>
           <w:rFonts w:ascii="Montserrat" w:hAnsi="Montserrat"/>
@@ -23382,16 +23412,16 @@
         </w:rPr>
         <w:lastRenderedPageBreak/>
         <w:drawing>
-          <wp:inline distT="0" distB="0" distL="0" distR="0" wp14:anchorId="0C885D2E" wp14:editId="4F09FDA4">
+          <wp:inline distT="0" distB="0" distL="0" distR="0" wp14:anchorId="68FDEAC8" wp14:editId="1BB4B800">
             <wp:extent cx="5120640" cy="6187296"/>
             <wp:effectExtent l="19050" t="19050" r="22860" b="23495"/>
-            <wp:docPr id="131657961" name="Imagem 55"/>
+            <wp:docPr id="339531296" name="Imagem 55"/>
             <wp:cNvGraphicFramePr/>
             <a:graphic xmlns:a="http://schemas.openxmlformats.org/drawingml/2006/main">
               <a:graphicData uri="http://schemas.openxmlformats.org/drawingml/2006/picture">
                 <pic:pic xmlns:pic="http://schemas.openxmlformats.org/drawingml/2006/picture">
                   <pic:nvPicPr>
-                    <pic:cNvPr id="131657961" name=""/>
+                    <pic:cNvPr id="339531296" name=""/>
                     <pic:cNvPicPr/>
                   </pic:nvPicPr>
                   <pic:blipFill>
@@ -23480,7 +23510,7 @@
           <w:sz w:val="27"/>
         </w:rPr>
       </w:pPr>
-      <w:bookmarkStart w:id="51" w:name="_Toc240533471"/>
+      <w:bookmarkStart w:id="51" w:name="_Toc240534326"/>
       <w:r>
         <w:rPr>
           <w:rFonts w:ascii="Montserrat" w:hAnsi="Montserrat"/>
@@ -23633,7 +23663,7 @@
           <w:sz w:val="27"/>
         </w:rPr>
       </w:pPr>
-      <w:bookmarkStart w:id="52" w:name="_Toc240533472"/>
+      <w:bookmarkStart w:id="52" w:name="_Toc240534327"/>
       <w:r>
         <w:rPr>
           <w:rFonts w:ascii="Montserrat" w:hAnsi="Montserrat"/>
@@ -23926,16 +23956,16 @@
           <w:noProof/>
         </w:rPr>
         <w:drawing>
-          <wp:inline distT="0" distB="0" distL="0" distR="0" wp14:anchorId="79FC1812" wp14:editId="323357EF">
+          <wp:inline distT="0" distB="0" distL="0" distR="0" wp14:anchorId="19089BA1" wp14:editId="3CB4BD48">
             <wp:extent cx="5303520" cy="1351384"/>
             <wp:effectExtent l="19050" t="19050" r="11430" b="20320"/>
-            <wp:docPr id="631032592" name="Imagem 56"/>
+            <wp:docPr id="1580081611" name="Imagem 56"/>
             <wp:cNvGraphicFramePr/>
             <a:graphic xmlns:a="http://schemas.openxmlformats.org/drawingml/2006/main">
               <a:graphicData uri="http://schemas.openxmlformats.org/drawingml/2006/picture">
                 <pic:pic xmlns:pic="http://schemas.openxmlformats.org/drawingml/2006/picture">
                   <pic:nvPicPr>
-                    <pic:cNvPr id="631032592" name=""/>
+                    <pic:cNvPr id="1580081611" name=""/>
                     <pic:cNvPicPr/>
                   </pic:nvPicPr>
                   <pic:blipFill>
@@ -23994,6 +24024,25 @@
     </w:p>
     <w:p>
       <w:pPr>
+        <w:spacing w:line="280" w:lineRule="auto"/>
+        <w:rPr>
+          <w:rFonts w:ascii="Montserrat" w:hAnsi="Montserrat"/>
+          <w:color w:val="1A1A1A"/>
+          <w:sz w:val="22"/>
+        </w:rPr>
+      </w:pPr>
+      <w:r>
+        <w:rPr>
+          <w:rFonts w:ascii="Montserrat" w:hAnsi="Montserrat"/>
+          <w:color w:val="1A1A1A"/>
+          <w:sz w:val="22"/>
+        </w:rPr>
+        <w:lastRenderedPageBreak/>
+        <w:t>Um ultimo bloco, Regras de aviso automatico de prazo e execucao, define em dias as duas regras do mecanismo diario descrito na secao 6.4.3: quantos dias antes do Termino previsto cada janela do aviso de prazo comeca (padrao 5 e 2), a cada quantos dias o aviso de atrasado se repete (padrao 7), apos quantos dias sem atualizar Execucao o aviso de silencio dispara (padrao 5) e a cada quantos dias ele se repete (padrao 5). Um campo em branco ou com valor invalido faz a regra correspondente usar o padrao de fabrica, sem deixar de funcionar.</w:t>
+      </w:r>
+    </w:p>
+    <w:p>
+      <w:pPr>
         <w:pStyle w:val="Ttulo2"/>
         <w:spacing w:before="320" w:after="120"/>
         <w:rPr>
@@ -24003,7 +24052,7 @@
           <w:sz w:val="27"/>
         </w:rPr>
       </w:pPr>
-      <w:bookmarkStart w:id="53" w:name="_Toc240533473"/>
+      <w:bookmarkStart w:id="53" w:name="_Toc240534328"/>
       <w:r>
         <w:rPr>
           <w:rFonts w:ascii="Montserrat" w:hAnsi="Montserrat"/>
@@ -24011,7 +24060,6 @@
           <w:color w:val="B91D2E"/>
           <w:sz w:val="27"/>
         </w:rPr>
-        <w:lastRenderedPageBreak/>
         <w:t>6.7 Relatorio de Resultados</w:t>
       </w:r>
       <w:bookmarkEnd w:id="53"/>
@@ -24140,16 +24188,16 @@
           <w:noProof/>
         </w:rPr>
         <w:drawing>
-          <wp:inline distT="0" distB="0" distL="0" distR="0" wp14:anchorId="149D1E71" wp14:editId="3FB250B1">
+          <wp:inline distT="0" distB="0" distL="0" distR="0" wp14:anchorId="4AA5C576" wp14:editId="72615694">
             <wp:extent cx="5303520" cy="1422793"/>
             <wp:effectExtent l="19050" t="19050" r="11430" b="25400"/>
-            <wp:docPr id="917693102" name="Imagem 57"/>
+            <wp:docPr id="301743695" name="Imagem 57"/>
             <wp:cNvGraphicFramePr/>
             <a:graphic xmlns:a="http://schemas.openxmlformats.org/drawingml/2006/main">
               <a:graphicData uri="http://schemas.openxmlformats.org/drawingml/2006/picture">
                 <pic:pic xmlns:pic="http://schemas.openxmlformats.org/drawingml/2006/picture">
                   <pic:nvPicPr>
-                    <pic:cNvPr id="917693102" name=""/>
+                    <pic:cNvPr id="301743695" name=""/>
                     <pic:cNvPicPr/>
                   </pic:nvPicPr>
                   <pic:blipFill>
@@ -24224,6 +24272,7 @@
           <w:color w:val="6A6A70"/>
           <w:sz w:val="21"/>
         </w:rPr>
+        <w:lastRenderedPageBreak/>
         <w:t>Meta e selo de status (Normal/Atencao/Critico): cada indicador compara o realizado com a meta definida pelo Admin (secao 6.3). Sem meta definida, o cartao mostra Meta nao definida em vez de um selo - nunca inventa um status. Com meta definida: Normal na meta ou acima; Atencao ate 15 pontos percentuais abaixo da meta; Critico alem disso.</w:t>
       </w:r>
     </w:p>
@@ -24245,17 +24294,7 @@
           <w:color w:val="6A6A70"/>
           <w:sz w:val="21"/>
         </w:rPr>
-        <w:t xml:space="preserve">Tendencia: Marcos no prazo, Projetos dentro do orcamento e Projetos sem risco alto/critico mostram a evolucao dos ultimos salvamentos do Relatorio de </w:t>
-      </w:r>
-      <w:r>
-        <w:rPr>
-          <w:rFonts w:ascii="Montserrat" w:hAnsi="Montserrat"/>
-          <w:i/>
-          <w:color w:val="6A6A70"/>
-          <w:sz w:val="21"/>
-        </w:rPr>
-        <w:lastRenderedPageBreak/>
-        <w:t>Situacao (ex.: 81% -&gt; 85% -&gt; 87%), recalculada a partir do historico de versoes que esse relatorio ja mantinha (secao 4.1) - nao e um fechamento de calendario mes a mes, e sim uma tendencia de ultimos salvamentos. A tendencia de risco so existe a partir do primeiro salvamento feito depois que este indicador foi lancado - salvamentos anteriores nao tem esse numero registrado.</w:t>
+        <w:t>Tendencia: Marcos no prazo, Projetos dentro do orcamento e Projetos sem risco alto/critico mostram a evolucao dos ultimos salvamentos do Relatorio de Situacao (ex.: 81% -&gt; 85% -&gt; 87%), recalculada a partir do historico de versoes que esse relatorio ja mantinha (secao 4.1) - nao e um fechamento de calendario mes a mes, e sim uma tendencia de ultimos salvamentos. A tendencia de risco so existe a partir do primeiro salvamento feito depois que este indicador foi lancado - salvamentos anteriores nao tem esse numero registrado.</w:t>
       </w:r>
     </w:p>
     <w:p>
@@ -24313,16 +24352,16 @@
           <w:noProof/>
         </w:rPr>
         <w:drawing>
-          <wp:inline distT="0" distB="0" distL="0" distR="0" wp14:anchorId="3E13C1D1" wp14:editId="182E671F">
+          <wp:inline distT="0" distB="0" distL="0" distR="0" wp14:anchorId="4190A388" wp14:editId="70D6A144">
             <wp:extent cx="5303520" cy="1841050"/>
             <wp:effectExtent l="19050" t="19050" r="11430" b="26035"/>
-            <wp:docPr id="264151214" name="Imagem 58"/>
+            <wp:docPr id="597784760" name="Imagem 58"/>
             <wp:cNvGraphicFramePr/>
             <a:graphic xmlns:a="http://schemas.openxmlformats.org/drawingml/2006/main">
               <a:graphicData uri="http://schemas.openxmlformats.org/drawingml/2006/picture">
                 <pic:pic xmlns:pic="http://schemas.openxmlformats.org/drawingml/2006/picture">
                   <pic:nvPicPr>
-                    <pic:cNvPr id="264151214" name=""/>
+                    <pic:cNvPr id="597784760" name=""/>
                     <pic:cNvPicPr/>
                   </pic:nvPicPr>
                   <pic:blipFill>
@@ -24439,6 +24478,7 @@
           <w:color w:val="1A1A1A"/>
           <w:sz w:val="22"/>
         </w:rPr>
+        <w:lastRenderedPageBreak/>
         <w:t>Exportar PDF: abre a caixa de impressao do navegador com o conteudo da pagina pronto para salvar como PDF - mesmo mecanismo Imprimir ja usado nos demais relatorios (esconde a barra de autenticacao e os botoes antes de imprimir).</w:t>
       </w:r>
     </w:p>
@@ -24463,16 +24503,7 @@
           <w:color w:val="1A1A1A"/>
           <w:sz w:val="22"/>
         </w:rPr>
-        <w:t xml:space="preserve">Gerar Apresentacao (PPTX): monta, inteiramente no navegador, uma apresentacao de 3 slides - capa, os indicadores estrategicos (com meta, barra de progresso, selo de status e tendencia) e o Plano de Acao - usando os mesmos numeros exibidos na tela naquele momento. Uma </w:t>
-      </w:r>
-      <w:r>
-        <w:rPr>
-          <w:rFonts w:ascii="Montserrat" w:hAnsi="Montserrat"/>
-          <w:color w:val="1A1A1A"/>
-          <w:sz w:val="22"/>
-        </w:rPr>
-        <w:lastRenderedPageBreak/>
-        <w:t>biblioteca de geracao e carregada sob demanda na primeira vez que o botao e usado (pode levar alguns segundos).</w:t>
+        <w:t>Gerar Apresentacao (PPTX): monta, inteiramente no navegador, uma apresentacao de 3 slides - capa, os indicadores estrategicos (com meta, barra de progresso, selo de status e tendencia) e o Plano de Acao - usando os mesmos numeros exibidos na tela naquele momento. Uma biblioteca de geracao e carregada sob demanda na primeira vez que o botao e usado (pode levar alguns segundos).</w:t>
       </w:r>
     </w:p>
     <w:p>
@@ -24485,16 +24516,16 @@
           <w:noProof/>
         </w:rPr>
         <w:drawing>
-          <wp:inline distT="0" distB="0" distL="0" distR="0" wp14:anchorId="5607F05E" wp14:editId="1C2ECFB7">
+          <wp:inline distT="0" distB="0" distL="0" distR="0" wp14:anchorId="565026A7" wp14:editId="41DF64E8">
             <wp:extent cx="5303520" cy="303041"/>
             <wp:effectExtent l="19050" t="19050" r="11430" b="20955"/>
-            <wp:docPr id="750775795" name="Imagem 59"/>
+            <wp:docPr id="639880905" name="Imagem 59"/>
             <wp:cNvGraphicFramePr/>
             <a:graphic xmlns:a="http://schemas.openxmlformats.org/drawingml/2006/main">
               <a:graphicData uri="http://schemas.openxmlformats.org/drawingml/2006/picture">
                 <pic:pic xmlns:pic="http://schemas.openxmlformats.org/drawingml/2006/picture">
                   <pic:nvPicPr>
-                    <pic:cNvPr id="750775795" name=""/>
+                    <pic:cNvPr id="639880905" name=""/>
                     <pic:cNvPicPr/>
                   </pic:nvPicPr>
                   <pic:blipFill>
@@ -24561,16 +24592,16 @@
           <w:noProof/>
         </w:rPr>
         <w:drawing>
-          <wp:inline distT="0" distB="0" distL="0" distR="0" wp14:anchorId="36910684" wp14:editId="3F3EB58A">
+          <wp:inline distT="0" distB="0" distL="0" distR="0" wp14:anchorId="6F0C7BB8" wp14:editId="7F609DCE">
             <wp:extent cx="5303520" cy="2983005"/>
             <wp:effectExtent l="19050" t="19050" r="11430" b="27305"/>
-            <wp:docPr id="614753420" name="Imagem 60"/>
+            <wp:docPr id="515586824" name="Imagem 60"/>
             <wp:cNvGraphicFramePr/>
             <a:graphic xmlns:a="http://schemas.openxmlformats.org/drawingml/2006/main">
               <a:graphicData uri="http://schemas.openxmlformats.org/drawingml/2006/picture">
                 <pic:pic xmlns:pic="http://schemas.openxmlformats.org/drawingml/2006/picture">
                   <pic:nvPicPr>
-                    <pic:cNvPr id="614753420" name=""/>
+                    <pic:cNvPr id="515586824" name=""/>
                     <pic:cNvPicPr/>
                   </pic:nvPicPr>
                   <pic:blipFill>
@@ -24642,7 +24673,7 @@
           <w:sz w:val="34"/>
         </w:rPr>
       </w:pPr>
-      <w:bookmarkStart w:id="54" w:name="_Toc240533474"/>
+      <w:bookmarkStart w:id="54" w:name="_Toc240534329"/>
       <w:r>
         <w:rPr>
           <w:rFonts w:ascii="Montserrat" w:hAnsi="Montserrat"/>
@@ -24886,7 +24917,7 @@
           <w:sz w:val="34"/>
         </w:rPr>
       </w:pPr>
-      <w:bookmarkStart w:id="55" w:name="_Toc240533475"/>
+      <w:bookmarkStart w:id="55" w:name="_Toc240534330"/>
       <w:r>
         <w:rPr>
           <w:rFonts w:ascii="Montserrat" w:hAnsi="Montserrat"/>
@@ -26674,7 +26705,7 @@
 <file path=word/numbering.xml><?xml version="1.0" encoding="utf-8"?>
 <w:numbering xmlns:wpc="http://schemas.microsoft.com/office/word/2010/wordprocessingCanvas" xmlns:cx="http://schemas.microsoft.com/office/drawing/2014/chartex" xmlns:cx1="http://schemas.microsoft.com/office/drawing/2015/9/8/chartex" xmlns:cx2="http://schemas.microsoft.com/office/drawing/2015/10/21/chartex" xmlns:cx3="http://schemas.microsoft.com/office/drawing/2016/5/9/chartex" xmlns:cx4="http://schemas.microsoft.com/office/drawing/2016/5/10/chartex" xmlns:cx5="http://schemas.microsoft.com/office/drawing/2016/5/11/chartex" xmlns:cx6="http://schemas.microsoft.com/office/drawing/2016/5/12/chartex" xmlns:cx7="http://schemas.microsoft.com/office/drawing/2016/5/13/chartex" xmlns:cx8="http://schemas.microsoft.com/office/drawing/2016/5/14/chartex" xmlns:mc="http://schemas.openxmlformats.org/markup-compatibility/2006" xmlns:aink="http://schemas.microsoft.com/office/drawing/2016/ink" xmlns:am3d="http://schemas.microsoft.com/office/drawing/2017/model3d" xmlns:o="urn:schemas-microsoft-com:office:office" xmlns:oel="http://schemas.microsoft.com/office/2019/extlst" xmlns:r="http://schemas.openxmlformats.org/officeDocument/2006/relationships" xmlns:m="http://schemas.openxmlformats.org/officeDocument/2006/math" xmlns:v="urn:schemas-microsoft-com:vml" xmlns:wp14="http://schemas.microsoft.com/office/word/2010/wordprocessingDrawing" xmlns:wp="http://schemas.openxmlformats.org/drawingml/2006/wordprocessingDrawing" xmlns:w10="urn:schemas-microsoft-com:office:word" xmlns:w="http://schemas.openxmlformats.org/wordprocessingml/2006/main" xmlns:w14="http://schemas.microsoft.com/office/word/2010/wordml" xmlns:w15="http://schemas.microsoft.com/office/word/2012/wordml" xmlns:w16cex="http://schemas.microsoft.com/office/word/2018/wordml/cex" xmlns:w16cid="http://schemas.microsoft.com/office/word/2016/wordml/cid" xmlns:w16="http://schemas.microsoft.com/office/word/2018/wordml" xmlns:w16du="http://schemas.microsoft.com/office/word/2023/wordml/word16du" xmlns:w16sdtdh="http://schemas.microsoft.com/office/word/2020/wordml/sdtdatahash" xmlns:w16sdtfl="http://schemas.microsoft.com/office/word/2024/wordml/sdtformatlock" xmlns:w16se="http://schemas.microsoft.com/office/word/2015/wordml/symex" xmlns:wpg="http://schemas.microsoft.com/office/word/2010/wordprocessingGroup" xmlns:wpi="http://schemas.microsoft.com/office/word/2010/wordprocessingInk" xmlns:wne="http://schemas.microsoft.com/office/word/2006/wordml" xmlns:wps="http://schemas.microsoft.com/office/word/2010/wordprocessingShape" mc:Ignorable="w14 w15 w16se w16cid w16 w16cex w16sdtdh w16sdtfl w16du wp14">
   <w:abstractNum w:abstractNumId="0" w15:restartNumberingAfterBreak="0">
-    <w:nsid w:val="00FE3EE4"/>
+    <w:nsid w:val="031E3361"/>
     <w:multiLevelType w:val="singleLevel"/>
     <w:tmpl w:val="04160001"/>
     <w:lvl w:ilvl="0">
@@ -26691,7 +26722,7 @@
     </w:lvl>
   </w:abstractNum>
   <w:abstractNum w:abstractNumId="1" w15:restartNumberingAfterBreak="0">
-    <w:nsid w:val="047401CA"/>
+    <w:nsid w:val="05023B51"/>
     <w:multiLevelType w:val="singleLevel"/>
     <w:tmpl w:val="04160001"/>
     <w:lvl w:ilvl="0">
@@ -26708,7 +26739,7 @@
     </w:lvl>
   </w:abstractNum>
   <w:abstractNum w:abstractNumId="2" w15:restartNumberingAfterBreak="0">
-    <w:nsid w:val="09FE039D"/>
+    <w:nsid w:val="0A9F1ACB"/>
     <w:multiLevelType w:val="singleLevel"/>
     <w:tmpl w:val="04160001"/>
     <w:lvl w:ilvl="0">
@@ -26725,7 +26756,7 @@
     </w:lvl>
   </w:abstractNum>
   <w:abstractNum w:abstractNumId="3" w15:restartNumberingAfterBreak="0">
-    <w:nsid w:val="0B4E5D7F"/>
+    <w:nsid w:val="0CAD7742"/>
     <w:multiLevelType w:val="singleLevel"/>
     <w:tmpl w:val="04160001"/>
     <w:lvl w:ilvl="0">
@@ -26742,7 +26773,7 @@
     </w:lvl>
   </w:abstractNum>
   <w:abstractNum w:abstractNumId="4" w15:restartNumberingAfterBreak="0">
-    <w:nsid w:val="0E91156C"/>
+    <w:nsid w:val="0D010E15"/>
     <w:multiLevelType w:val="singleLevel"/>
     <w:tmpl w:val="04160001"/>
     <w:lvl w:ilvl="0">
@@ -26759,7 +26790,7 @@
     </w:lvl>
   </w:abstractNum>
   <w:abstractNum w:abstractNumId="5" w15:restartNumberingAfterBreak="0">
-    <w:nsid w:val="11163B21"/>
+    <w:nsid w:val="101763F5"/>
     <w:multiLevelType w:val="singleLevel"/>
     <w:tmpl w:val="04160001"/>
     <w:lvl w:ilvl="0">
@@ -26776,7 +26807,7 @@
     </w:lvl>
   </w:abstractNum>
   <w:abstractNum w:abstractNumId="6" w15:restartNumberingAfterBreak="0">
-    <w:nsid w:val="11996076"/>
+    <w:nsid w:val="14E54488"/>
     <w:multiLevelType w:val="singleLevel"/>
     <w:tmpl w:val="04160001"/>
     <w:lvl w:ilvl="0">
@@ -26793,7 +26824,7 @@
     </w:lvl>
   </w:abstractNum>
   <w:abstractNum w:abstractNumId="7" w15:restartNumberingAfterBreak="0">
-    <w:nsid w:val="11AB7E08"/>
+    <w:nsid w:val="173B63D2"/>
     <w:multiLevelType w:val="singleLevel"/>
     <w:tmpl w:val="04160001"/>
     <w:lvl w:ilvl="0">
@@ -26810,7 +26841,7 @@
     </w:lvl>
   </w:abstractNum>
   <w:abstractNum w:abstractNumId="8" w15:restartNumberingAfterBreak="0">
-    <w:nsid w:val="138F7724"/>
+    <w:nsid w:val="17ED0876"/>
     <w:multiLevelType w:val="singleLevel"/>
     <w:tmpl w:val="04160001"/>
     <w:lvl w:ilvl="0">
@@ -26827,7 +26858,7 @@
     </w:lvl>
   </w:abstractNum>
   <w:abstractNum w:abstractNumId="9" w15:restartNumberingAfterBreak="0">
-    <w:nsid w:val="15713DDB"/>
+    <w:nsid w:val="1E22258F"/>
     <w:multiLevelType w:val="singleLevel"/>
     <w:tmpl w:val="04160001"/>
     <w:lvl w:ilvl="0">
@@ -26844,7 +26875,7 @@
     </w:lvl>
   </w:abstractNum>
   <w:abstractNum w:abstractNumId="10" w15:restartNumberingAfterBreak="0">
-    <w:nsid w:val="185D5752"/>
+    <w:nsid w:val="1FFB17C1"/>
     <w:multiLevelType w:val="singleLevel"/>
     <w:tmpl w:val="04160001"/>
     <w:lvl w:ilvl="0">
@@ -26861,7 +26892,7 @@
     </w:lvl>
   </w:abstractNum>
   <w:abstractNum w:abstractNumId="11" w15:restartNumberingAfterBreak="0">
-    <w:nsid w:val="23117B76"/>
+    <w:nsid w:val="21351ECB"/>
     <w:multiLevelType w:val="singleLevel"/>
     <w:tmpl w:val="04160001"/>
     <w:lvl w:ilvl="0">
@@ -26878,7 +26909,7 @@
     </w:lvl>
   </w:abstractNum>
   <w:abstractNum w:abstractNumId="12" w15:restartNumberingAfterBreak="0">
-    <w:nsid w:val="28214323"/>
+    <w:nsid w:val="23551EA3"/>
     <w:multiLevelType w:val="singleLevel"/>
     <w:tmpl w:val="04160001"/>
     <w:lvl w:ilvl="0">
@@ -26895,7 +26926,7 @@
     </w:lvl>
   </w:abstractNum>
   <w:abstractNum w:abstractNumId="13" w15:restartNumberingAfterBreak="0">
-    <w:nsid w:val="2CBE317F"/>
+    <w:nsid w:val="247A2190"/>
     <w:multiLevelType w:val="singleLevel"/>
     <w:tmpl w:val="04160001"/>
     <w:lvl w:ilvl="0">
@@ -26912,7 +26943,7 @@
     </w:lvl>
   </w:abstractNum>
   <w:abstractNum w:abstractNumId="14" w15:restartNumberingAfterBreak="0">
-    <w:nsid w:val="2F187A3F"/>
+    <w:nsid w:val="2BC73303"/>
     <w:multiLevelType w:val="singleLevel"/>
     <w:tmpl w:val="04160001"/>
     <w:lvl w:ilvl="0">
@@ -26929,7 +26960,7 @@
     </w:lvl>
   </w:abstractNum>
   <w:abstractNum w:abstractNumId="15" w15:restartNumberingAfterBreak="0">
-    <w:nsid w:val="31F12EBE"/>
+    <w:nsid w:val="33795AB5"/>
     <w:multiLevelType w:val="singleLevel"/>
     <w:tmpl w:val="04160001"/>
     <w:lvl w:ilvl="0">
@@ -26946,7 +26977,7 @@
     </w:lvl>
   </w:abstractNum>
   <w:abstractNum w:abstractNumId="16" w15:restartNumberingAfterBreak="0">
-    <w:nsid w:val="3C280413"/>
+    <w:nsid w:val="362A1823"/>
     <w:multiLevelType w:val="singleLevel"/>
     <w:tmpl w:val="04160001"/>
     <w:lvl w:ilvl="0">
@@ -26963,7 +26994,7 @@
     </w:lvl>
   </w:abstractNum>
   <w:abstractNum w:abstractNumId="17" w15:restartNumberingAfterBreak="0">
-    <w:nsid w:val="41C8642A"/>
+    <w:nsid w:val="3A54798D"/>
     <w:multiLevelType w:val="singleLevel"/>
     <w:tmpl w:val="04160001"/>
     <w:lvl w:ilvl="0">
@@ -26980,7 +27011,7 @@
     </w:lvl>
   </w:abstractNum>
   <w:abstractNum w:abstractNumId="18" w15:restartNumberingAfterBreak="0">
-    <w:nsid w:val="44606987"/>
+    <w:nsid w:val="3C4D0FE7"/>
     <w:multiLevelType w:val="singleLevel"/>
     <w:tmpl w:val="04160001"/>
     <w:lvl w:ilvl="0">
@@ -26997,7 +27028,7 @@
     </w:lvl>
   </w:abstractNum>
   <w:abstractNum w:abstractNumId="19" w15:restartNumberingAfterBreak="0">
-    <w:nsid w:val="45FC236C"/>
+    <w:nsid w:val="3C6703F4"/>
     <w:multiLevelType w:val="singleLevel"/>
     <w:tmpl w:val="04160001"/>
     <w:lvl w:ilvl="0">
@@ -27014,7 +27045,7 @@
     </w:lvl>
   </w:abstractNum>
   <w:abstractNum w:abstractNumId="20" w15:restartNumberingAfterBreak="0">
-    <w:nsid w:val="473C0D01"/>
+    <w:nsid w:val="3F2C2A24"/>
     <w:multiLevelType w:val="singleLevel"/>
     <w:tmpl w:val="04160001"/>
     <w:lvl w:ilvl="0">
@@ -27031,7 +27062,7 @@
     </w:lvl>
   </w:abstractNum>
   <w:abstractNum w:abstractNumId="21" w15:restartNumberingAfterBreak="0">
-    <w:nsid w:val="4CD01F0D"/>
+    <w:nsid w:val="41F80DD9"/>
     <w:multiLevelType w:val="singleLevel"/>
     <w:tmpl w:val="04160001"/>
     <w:lvl w:ilvl="0">
@@ -27048,7 +27079,7 @@
     </w:lvl>
   </w:abstractNum>
   <w:abstractNum w:abstractNumId="22" w15:restartNumberingAfterBreak="0">
-    <w:nsid w:val="4D62734B"/>
+    <w:nsid w:val="48C44A1C"/>
     <w:multiLevelType w:val="singleLevel"/>
     <w:tmpl w:val="04160001"/>
     <w:lvl w:ilvl="0">
@@ -27065,7 +27096,7 @@
     </w:lvl>
   </w:abstractNum>
   <w:abstractNum w:abstractNumId="23" w15:restartNumberingAfterBreak="0">
-    <w:nsid w:val="4E363247"/>
+    <w:nsid w:val="4D9F13A3"/>
     <w:multiLevelType w:val="singleLevel"/>
     <w:tmpl w:val="04160001"/>
     <w:lvl w:ilvl="0">
@@ -27082,7 +27113,7 @@
     </w:lvl>
   </w:abstractNum>
   <w:abstractNum w:abstractNumId="24" w15:restartNumberingAfterBreak="0">
-    <w:nsid w:val="4E7402E1"/>
+    <w:nsid w:val="506A42FA"/>
     <w:multiLevelType w:val="singleLevel"/>
     <w:tmpl w:val="04160001"/>
     <w:lvl w:ilvl="0">
@@ -27099,7 +27130,7 @@
     </w:lvl>
   </w:abstractNum>
   <w:abstractNum w:abstractNumId="25" w15:restartNumberingAfterBreak="0">
-    <w:nsid w:val="4ED04CCE"/>
+    <w:nsid w:val="523C066C"/>
     <w:multiLevelType w:val="singleLevel"/>
     <w:tmpl w:val="04160001"/>
     <w:lvl w:ilvl="0">
@@ -27116,7 +27147,7 @@
     </w:lvl>
   </w:abstractNum>
   <w:abstractNum w:abstractNumId="26" w15:restartNumberingAfterBreak="0">
-    <w:nsid w:val="4FB3422F"/>
+    <w:nsid w:val="6176497F"/>
     <w:multiLevelType w:val="singleLevel"/>
     <w:tmpl w:val="04160001"/>
     <w:lvl w:ilvl="0">
@@ -27133,7 +27164,7 @@
     </w:lvl>
   </w:abstractNum>
   <w:abstractNum w:abstractNumId="27" w15:restartNumberingAfterBreak="0">
-    <w:nsid w:val="527B0183"/>
+    <w:nsid w:val="618A33DA"/>
     <w:multiLevelType w:val="singleLevel"/>
     <w:tmpl w:val="04160001"/>
     <w:lvl w:ilvl="0">
@@ -27150,7 +27181,7 @@
     </w:lvl>
   </w:abstractNum>
   <w:abstractNum w:abstractNumId="28" w15:restartNumberingAfterBreak="0">
-    <w:nsid w:val="5489490C"/>
+    <w:nsid w:val="633F28BB"/>
     <w:multiLevelType w:val="singleLevel"/>
     <w:tmpl w:val="04160001"/>
     <w:lvl w:ilvl="0">
@@ -27167,7 +27198,7 @@
     </w:lvl>
   </w:abstractNum>
   <w:abstractNum w:abstractNumId="29" w15:restartNumberingAfterBreak="0">
-    <w:nsid w:val="58B43F9F"/>
+    <w:nsid w:val="65E1455C"/>
     <w:multiLevelType w:val="singleLevel"/>
     <w:tmpl w:val="04160001"/>
     <w:lvl w:ilvl="0">
@@ -27184,7 +27215,7 @@
     </w:lvl>
   </w:abstractNum>
   <w:abstractNum w:abstractNumId="30" w15:restartNumberingAfterBreak="0">
-    <w:nsid w:val="5FD41642"/>
+    <w:nsid w:val="67A74DE8"/>
     <w:multiLevelType w:val="singleLevel"/>
     <w:tmpl w:val="04160001"/>
     <w:lvl w:ilvl="0">
@@ -27201,7 +27232,7 @@
     </w:lvl>
   </w:abstractNum>
   <w:abstractNum w:abstractNumId="31" w15:restartNumberingAfterBreak="0">
-    <w:nsid w:val="62DA22B0"/>
+    <w:nsid w:val="680556D4"/>
     <w:multiLevelType w:val="singleLevel"/>
     <w:tmpl w:val="04160001"/>
     <w:lvl w:ilvl="0">
@@ -27218,7 +27249,7 @@
     </w:lvl>
   </w:abstractNum>
   <w:abstractNum w:abstractNumId="32" w15:restartNumberingAfterBreak="0">
-    <w:nsid w:val="67B43E63"/>
+    <w:nsid w:val="69A93401"/>
     <w:multiLevelType w:val="singleLevel"/>
     <w:tmpl w:val="04160001"/>
     <w:lvl w:ilvl="0">
@@ -27235,7 +27266,7 @@
     </w:lvl>
   </w:abstractNum>
   <w:abstractNum w:abstractNumId="33" w15:restartNumberingAfterBreak="0">
-    <w:nsid w:val="6A045827"/>
+    <w:nsid w:val="6ED94B54"/>
     <w:multiLevelType w:val="singleLevel"/>
     <w:tmpl w:val="04160001"/>
     <w:lvl w:ilvl="0">
@@ -27252,7 +27283,7 @@
     </w:lvl>
   </w:abstractNum>
   <w:abstractNum w:abstractNumId="34" w15:restartNumberingAfterBreak="0">
-    <w:nsid w:val="6BC07AD8"/>
+    <w:nsid w:val="70885598"/>
     <w:multiLevelType w:val="singleLevel"/>
     <w:tmpl w:val="04160001"/>
     <w:lvl w:ilvl="0">
@@ -27269,7 +27300,7 @@
     </w:lvl>
   </w:abstractNum>
   <w:abstractNum w:abstractNumId="35" w15:restartNumberingAfterBreak="0">
-    <w:nsid w:val="6C3331EA"/>
+    <w:nsid w:val="75917BD4"/>
     <w:multiLevelType w:val="singleLevel"/>
     <w:tmpl w:val="04160001"/>
     <w:lvl w:ilvl="0">
@@ -27286,7 +27317,7 @@
     </w:lvl>
   </w:abstractNum>
   <w:abstractNum w:abstractNumId="36" w15:restartNumberingAfterBreak="0">
-    <w:nsid w:val="6ED82514"/>
+    <w:nsid w:val="78A92F34"/>
     <w:multiLevelType w:val="singleLevel"/>
     <w:tmpl w:val="04160001"/>
     <w:lvl w:ilvl="0">
@@ -27303,7 +27334,7 @@
     </w:lvl>
   </w:abstractNum>
   <w:abstractNum w:abstractNumId="37" w15:restartNumberingAfterBreak="0">
-    <w:nsid w:val="7A22405F"/>
+    <w:nsid w:val="7C077A2D"/>
     <w:multiLevelType w:val="singleLevel"/>
     <w:tmpl w:val="04160001"/>
     <w:lvl w:ilvl="0">
@@ -27320,7 +27351,7 @@
     </w:lvl>
   </w:abstractNum>
   <w:abstractNum w:abstractNumId="38" w15:restartNumberingAfterBreak="0">
-    <w:nsid w:val="7C180533"/>
+    <w:nsid w:val="7CAD52FA"/>
     <w:multiLevelType w:val="singleLevel"/>
     <w:tmpl w:val="04160001"/>
     <w:lvl w:ilvl="0">
@@ -27337,7 +27368,7 @@
     </w:lvl>
   </w:abstractNum>
   <w:abstractNum w:abstractNumId="39" w15:restartNumberingAfterBreak="0">
-    <w:nsid w:val="7F0F2A04"/>
+    <w:nsid w:val="7F7F7299"/>
     <w:multiLevelType w:val="singleLevel"/>
     <w:tmpl w:val="04160001"/>
     <w:lvl w:ilvl="0">
@@ -27354,7 +27385,7 @@
     </w:lvl>
   </w:abstractNum>
   <w:abstractNum w:abstractNumId="40" w15:restartNumberingAfterBreak="0">
-    <w:nsid w:val="7F553D3C"/>
+    <w:nsid w:val="7F8275C0"/>
     <w:multiLevelType w:val="singleLevel"/>
     <w:tmpl w:val="04160001"/>
     <w:lvl w:ilvl="0">
@@ -27370,128 +27401,128 @@
       </w:rPr>
     </w:lvl>
   </w:abstractNum>
-  <w:num w:numId="1" w16cid:durableId="1045643675">
+  <w:num w:numId="1" w16cid:durableId="545917401">
+    <w:abstractNumId w:val="38"/>
+  </w:num>
+  <w:num w:numId="2" w16cid:durableId="718093525">
+    <w:abstractNumId w:val="33"/>
+  </w:num>
+  <w:num w:numId="3" w16cid:durableId="527523053">
+    <w:abstractNumId w:val="21"/>
+  </w:num>
+  <w:num w:numId="4" w16cid:durableId="67387022">
+    <w:abstractNumId w:val="2"/>
+  </w:num>
+  <w:num w:numId="5" w16cid:durableId="1646809921">
+    <w:abstractNumId w:val="14"/>
+  </w:num>
+  <w:num w:numId="6" w16cid:durableId="2074767508">
+    <w:abstractNumId w:val="15"/>
+  </w:num>
+  <w:num w:numId="7" w16cid:durableId="520630865">
+    <w:abstractNumId w:val="40"/>
+  </w:num>
+  <w:num w:numId="8" w16cid:durableId="109714215">
+    <w:abstractNumId w:val="25"/>
+  </w:num>
+  <w:num w:numId="9" w16cid:durableId="1830097979">
+    <w:abstractNumId w:val="26"/>
+  </w:num>
+  <w:num w:numId="10" w16cid:durableId="44644993">
+    <w:abstractNumId w:val="9"/>
+  </w:num>
+  <w:num w:numId="11" w16cid:durableId="902329036">
+    <w:abstractNumId w:val="22"/>
+  </w:num>
+  <w:num w:numId="12" w16cid:durableId="719550357">
+    <w:abstractNumId w:val="30"/>
+  </w:num>
+  <w:num w:numId="13" w16cid:durableId="326443111">
+    <w:abstractNumId w:val="17"/>
+  </w:num>
+  <w:num w:numId="14" w16cid:durableId="1563516565">
+    <w:abstractNumId w:val="20"/>
+  </w:num>
+  <w:num w:numId="15" w16cid:durableId="1718821588">
+    <w:abstractNumId w:val="32"/>
+  </w:num>
+  <w:num w:numId="16" w16cid:durableId="204174180">
+    <w:abstractNumId w:val="6"/>
+  </w:num>
+  <w:num w:numId="17" w16cid:durableId="1248657834">
+    <w:abstractNumId w:val="5"/>
+  </w:num>
+  <w:num w:numId="18" w16cid:durableId="554313426">
+    <w:abstractNumId w:val="34"/>
+  </w:num>
+  <w:num w:numId="19" w16cid:durableId="1100105163">
+    <w:abstractNumId w:val="18"/>
+  </w:num>
+  <w:num w:numId="20" w16cid:durableId="1063067611">
+    <w:abstractNumId w:val="23"/>
+  </w:num>
+  <w:num w:numId="21" w16cid:durableId="1205874306">
+    <w:abstractNumId w:val="31"/>
+  </w:num>
+  <w:num w:numId="22" w16cid:durableId="2099859376">
+    <w:abstractNumId w:val="24"/>
+  </w:num>
+  <w:num w:numId="23" w16cid:durableId="2111897603">
+    <w:abstractNumId w:val="13"/>
+  </w:num>
+  <w:num w:numId="24" w16cid:durableId="1026832524">
+    <w:abstractNumId w:val="4"/>
+  </w:num>
+  <w:num w:numId="25" w16cid:durableId="436026668">
+    <w:abstractNumId w:val="35"/>
+  </w:num>
+  <w:num w:numId="26" w16cid:durableId="252013127">
+    <w:abstractNumId w:val="36"/>
+  </w:num>
+  <w:num w:numId="27" w16cid:durableId="1574311880">
     <w:abstractNumId w:val="8"/>
   </w:num>
-  <w:num w:numId="2" w16cid:durableId="470170162">
-    <w:abstractNumId w:val="23"/>
+  <w:num w:numId="28" w16cid:durableId="1961111764">
+    <w:abstractNumId w:val="0"/>
   </w:num>
-  <w:num w:numId="3" w16cid:durableId="681276898">
-    <w:abstractNumId w:val="17"/>
+  <w:num w:numId="29" w16cid:durableId="1807119080">
+    <w:abstractNumId w:val="3"/>
   </w:num>
-  <w:num w:numId="4" w16cid:durableId="1042940547">
-    <w:abstractNumId w:val="38"/>
+  <w:num w:numId="30" w16cid:durableId="27874570">
+    <w:abstractNumId w:val="12"/>
   </w:num>
-  <w:num w:numId="5" w16cid:durableId="2093891213">
-    <w:abstractNumId w:val="32"/>
+  <w:num w:numId="31" w16cid:durableId="215509349">
+    <w:abstractNumId w:val="10"/>
   </w:num>
-  <w:num w:numId="6" w16cid:durableId="467554412">
+  <w:num w:numId="32" w16cid:durableId="261492970">
+    <w:abstractNumId w:val="7"/>
+  </w:num>
+  <w:num w:numId="33" w16cid:durableId="12614503">
     <w:abstractNumId w:val="37"/>
   </w:num>
-  <w:num w:numId="7" w16cid:durableId="696731862">
-    <w:abstractNumId w:val="4"/>
+  <w:num w:numId="34" w16cid:durableId="183178189">
+    <w:abstractNumId w:val="28"/>
   </w:num>
-  <w:num w:numId="8" w16cid:durableId="1876233967">
-    <w:abstractNumId w:val="7"/>
+  <w:num w:numId="35" w16cid:durableId="1435978683">
+    <w:abstractNumId w:val="1"/>
   </w:num>
-  <w:num w:numId="9" w16cid:durableId="825123474">
+  <w:num w:numId="36" w16cid:durableId="753939262">
+    <w:abstractNumId w:val="39"/>
+  </w:num>
+  <w:num w:numId="37" w16cid:durableId="1969894472">
+    <w:abstractNumId w:val="29"/>
+  </w:num>
+  <w:num w:numId="38" w16cid:durableId="1797676774">
+    <w:abstractNumId w:val="27"/>
+  </w:num>
+  <w:num w:numId="39" w16cid:durableId="1491942608">
     <w:abstractNumId w:val="19"/>
   </w:num>
-  <w:num w:numId="10" w16cid:durableId="158469006">
-    <w:abstractNumId w:val="39"/>
-  </w:num>
-  <w:num w:numId="11" w16cid:durableId="398745231">
-    <w:abstractNumId w:val="21"/>
-  </w:num>
-  <w:num w:numId="12" w16cid:durableId="1624187920">
+  <w:num w:numId="40" w16cid:durableId="786774407">
     <w:abstractNumId w:val="16"/>
   </w:num>
-  <w:num w:numId="13" w16cid:durableId="1254826062">
-    <w:abstractNumId w:val="3"/>
-  </w:num>
-  <w:num w:numId="14" w16cid:durableId="135684153">
-    <w:abstractNumId w:val="15"/>
-  </w:num>
-  <w:num w:numId="15" w16cid:durableId="2072270697">
-    <w:abstractNumId w:val="12"/>
-  </w:num>
-  <w:num w:numId="16" w16cid:durableId="653338026">
-    <w:abstractNumId w:val="13"/>
-  </w:num>
-  <w:num w:numId="17" w16cid:durableId="1249341027">
-    <w:abstractNumId w:val="2"/>
-  </w:num>
-  <w:num w:numId="18" w16cid:durableId="405420351">
-    <w:abstractNumId w:val="28"/>
-  </w:num>
-  <w:num w:numId="19" w16cid:durableId="716509082">
-    <w:abstractNumId w:val="20"/>
-  </w:num>
-  <w:num w:numId="20" w16cid:durableId="744038407">
-    <w:abstractNumId w:val="31"/>
-  </w:num>
-  <w:num w:numId="21" w16cid:durableId="1967734586">
-    <w:abstractNumId w:val="18"/>
-  </w:num>
-  <w:num w:numId="22" w16cid:durableId="857735897">
-    <w:abstractNumId w:val="34"/>
-  </w:num>
-  <w:num w:numId="23" w16cid:durableId="711807242">
+  <w:num w:numId="41" w16cid:durableId="532159069">
     <w:abstractNumId w:val="11"/>
-  </w:num>
-  <w:num w:numId="24" w16cid:durableId="758258617">
-    <w:abstractNumId w:val="24"/>
-  </w:num>
-  <w:num w:numId="25" w16cid:durableId="1752045159">
-    <w:abstractNumId w:val="10"/>
-  </w:num>
-  <w:num w:numId="26" w16cid:durableId="1712993716">
-    <w:abstractNumId w:val="1"/>
-  </w:num>
-  <w:num w:numId="27" w16cid:durableId="267276736">
-    <w:abstractNumId w:val="40"/>
-  </w:num>
-  <w:num w:numId="28" w16cid:durableId="1060639203">
-    <w:abstractNumId w:val="27"/>
-  </w:num>
-  <w:num w:numId="29" w16cid:durableId="23290824">
-    <w:abstractNumId w:val="22"/>
-  </w:num>
-  <w:num w:numId="30" w16cid:durableId="135684294">
-    <w:abstractNumId w:val="26"/>
-  </w:num>
-  <w:num w:numId="31" w16cid:durableId="1797874327">
-    <w:abstractNumId w:val="6"/>
-  </w:num>
-  <w:num w:numId="32" w16cid:durableId="1747921381">
-    <w:abstractNumId w:val="0"/>
-  </w:num>
-  <w:num w:numId="33" w16cid:durableId="461504880">
-    <w:abstractNumId w:val="29"/>
-  </w:num>
-  <w:num w:numId="34" w16cid:durableId="763956352">
-    <w:abstractNumId w:val="25"/>
-  </w:num>
-  <w:num w:numId="35" w16cid:durableId="282882014">
-    <w:abstractNumId w:val="36"/>
-  </w:num>
-  <w:num w:numId="36" w16cid:durableId="1822650996">
-    <w:abstractNumId w:val="9"/>
-  </w:num>
-  <w:num w:numId="37" w16cid:durableId="1757903558">
-    <w:abstractNumId w:val="30"/>
-  </w:num>
-  <w:num w:numId="38" w16cid:durableId="1557814177">
-    <w:abstractNumId w:val="33"/>
-  </w:num>
-  <w:num w:numId="39" w16cid:durableId="733545222">
-    <w:abstractNumId w:val="14"/>
-  </w:num>
-  <w:num w:numId="40" w16cid:durableId="1163858910">
-    <w:abstractNumId w:val="35"/>
-  </w:num>
-  <w:num w:numId="41" w16cid:durableId="88620099">
-    <w:abstractNumId w:val="5"/>
   </w:num>
 </w:numbering>
 </file>
@@ -27904,7 +27935,7 @@
     <w:link w:val="Ttulo1Char"/>
     <w:uiPriority w:val="9"/>
     <w:qFormat/>
-    <w:rsid w:val="00222017"/>
+    <w:rsid w:val="003769CF"/>
     <w:pPr>
       <w:keepNext/>
       <w:keepLines/>
@@ -27926,7 +27957,7 @@
     <w:uiPriority w:val="9"/>
     <w:unhideWhenUsed/>
     <w:qFormat/>
-    <w:rsid w:val="00222017"/>
+    <w:rsid w:val="003769CF"/>
     <w:pPr>
       <w:keepNext/>
       <w:keepLines/>
@@ -27949,7 +27980,7 @@
     <w:semiHidden/>
     <w:unhideWhenUsed/>
     <w:qFormat/>
-    <w:rsid w:val="00222017"/>
+    <w:rsid w:val="003769CF"/>
     <w:pPr>
       <w:keepNext/>
       <w:keepLines/>
@@ -27972,7 +28003,7 @@
     <w:semiHidden/>
     <w:unhideWhenUsed/>
     <w:qFormat/>
-    <w:rsid w:val="00222017"/>
+    <w:rsid w:val="003769CF"/>
     <w:pPr>
       <w:keepNext/>
       <w:keepLines/>
@@ -27995,7 +28026,7 @@
     <w:semiHidden/>
     <w:unhideWhenUsed/>
     <w:qFormat/>
-    <w:rsid w:val="00222017"/>
+    <w:rsid w:val="003769CF"/>
     <w:pPr>
       <w:keepNext/>
       <w:keepLines/>
@@ -28016,7 +28047,7 @@
     <w:semiHidden/>
     <w:unhideWhenUsed/>
     <w:qFormat/>
-    <w:rsid w:val="00222017"/>
+    <w:rsid w:val="003769CF"/>
     <w:pPr>
       <w:keepNext/>
       <w:keepLines/>
@@ -28039,7 +28070,7 @@
     <w:semiHidden/>
     <w:unhideWhenUsed/>
     <w:qFormat/>
-    <w:rsid w:val="00222017"/>
+    <w:rsid w:val="003769CF"/>
     <w:pPr>
       <w:keepNext/>
       <w:keepLines/>
@@ -28060,7 +28091,7 @@
     <w:semiHidden/>
     <w:unhideWhenUsed/>
     <w:qFormat/>
-    <w:rsid w:val="00222017"/>
+    <w:rsid w:val="003769CF"/>
     <w:pPr>
       <w:keepNext/>
       <w:keepLines/>
@@ -28083,7 +28114,7 @@
     <w:semiHidden/>
     <w:unhideWhenUsed/>
     <w:qFormat/>
-    <w:rsid w:val="00222017"/>
+    <w:rsid w:val="003769CF"/>
     <w:pPr>
       <w:keepNext/>
       <w:keepLines/>
@@ -28127,7 +28158,7 @@
     <w:basedOn w:val="Fontepargpadro"/>
     <w:link w:val="Ttulo1"/>
     <w:uiPriority w:val="9"/>
-    <w:rsid w:val="00222017"/>
+    <w:rsid w:val="003769CF"/>
     <w:rPr>
       <w:rFonts w:asciiTheme="majorHAnsi" w:eastAsiaTheme="majorEastAsia" w:hAnsiTheme="majorHAnsi" w:cstheme="majorBidi"/>
       <w:color w:val="0F4761" w:themeColor="accent1" w:themeShade="BF"/>
@@ -28140,7 +28171,7 @@
     <w:basedOn w:val="Fontepargpadro"/>
     <w:link w:val="Ttulo2"/>
     <w:uiPriority w:val="9"/>
-    <w:rsid w:val="00222017"/>
+    <w:rsid w:val="003769CF"/>
     <w:rPr>
       <w:rFonts w:asciiTheme="majorHAnsi" w:eastAsiaTheme="majorEastAsia" w:hAnsiTheme="majorHAnsi" w:cstheme="majorBidi"/>
       <w:color w:val="0F4761" w:themeColor="accent1" w:themeShade="BF"/>
@@ -28154,7 +28185,7 @@
     <w:link w:val="Ttulo3"/>
     <w:uiPriority w:val="9"/>
     <w:semiHidden/>
-    <w:rsid w:val="00222017"/>
+    <w:rsid w:val="003769CF"/>
     <w:rPr>
       <w:rFonts w:eastAsiaTheme="majorEastAsia" w:cstheme="majorBidi"/>
       <w:color w:val="0F4761" w:themeColor="accent1" w:themeShade="BF"/>
@@ -28168,7 +28199,7 @@
     <w:link w:val="Ttulo4"/>
     <w:uiPriority w:val="9"/>
     <w:semiHidden/>
-    <w:rsid w:val="00222017"/>
+    <w:rsid w:val="003769CF"/>
     <w:rPr>
       <w:rFonts w:eastAsiaTheme="majorEastAsia" w:cstheme="majorBidi"/>
       <w:i/>
@@ -28182,7 +28213,7 @@
     <w:link w:val="Ttulo5"/>
     <w:uiPriority w:val="9"/>
     <w:semiHidden/>
-    <w:rsid w:val="00222017"/>
+    <w:rsid w:val="003769CF"/>
     <w:rPr>
       <w:rFonts w:eastAsiaTheme="majorEastAsia" w:cstheme="majorBidi"/>
       <w:color w:val="0F4761" w:themeColor="accent1" w:themeShade="BF"/>
@@ -28194,7 +28225,7 @@
     <w:link w:val="Ttulo6"/>
     <w:uiPriority w:val="9"/>
     <w:semiHidden/>
-    <w:rsid w:val="00222017"/>
+    <w:rsid w:val="003769CF"/>
     <w:rPr>
       <w:rFonts w:eastAsiaTheme="majorEastAsia" w:cstheme="majorBidi"/>
       <w:i/>
@@ -28208,7 +28239,7 @@
     <w:link w:val="Ttulo7"/>
     <w:uiPriority w:val="9"/>
     <w:semiHidden/>
-    <w:rsid w:val="00222017"/>
+    <w:rsid w:val="003769CF"/>
     <w:rPr>
       <w:rFonts w:eastAsiaTheme="majorEastAsia" w:cstheme="majorBidi"/>
       <w:color w:val="595959" w:themeColor="text1" w:themeTint="A6"/>
@@ -28220,7 +28251,7 @@
     <w:link w:val="Ttulo8"/>
     <w:uiPriority w:val="9"/>
     <w:semiHidden/>
-    <w:rsid w:val="00222017"/>
+    <w:rsid w:val="003769CF"/>
     <w:rPr>
       <w:rFonts w:eastAsiaTheme="majorEastAsia" w:cstheme="majorBidi"/>
       <w:i/>
@@ -28234,7 +28265,7 @@
     <w:link w:val="Ttulo9"/>
     <w:uiPriority w:val="9"/>
     <w:semiHidden/>
-    <w:rsid w:val="00222017"/>
+    <w:rsid w:val="003769CF"/>
     <w:rPr>
       <w:rFonts w:eastAsiaTheme="majorEastAsia" w:cstheme="majorBidi"/>
       <w:color w:val="272727" w:themeColor="text1" w:themeTint="D8"/>
@@ -28247,7 +28278,7 @@
     <w:link w:val="TtuloChar"/>
     <w:uiPriority w:val="10"/>
     <w:qFormat/>
-    <w:rsid w:val="00222017"/>
+    <w:rsid w:val="003769CF"/>
     <w:pPr>
       <w:spacing w:after="80" w:line="240" w:lineRule="auto"/>
       <w:contextualSpacing/>
@@ -28265,7 +28296,7 @@
     <w:basedOn w:val="Fontepargpadro"/>
     <w:link w:val="Ttulo"/>
     <w:uiPriority w:val="10"/>
-    <w:rsid w:val="00222017"/>
+    <w:rsid w:val="003769CF"/>
     <w:rPr>
       <w:rFonts w:asciiTheme="majorHAnsi" w:eastAsiaTheme="majorEastAsia" w:hAnsiTheme="majorHAnsi" w:cstheme="majorBidi"/>
       <w:spacing w:val="-10"/>
@@ -28281,7 +28312,7 @@
     <w:link w:val="SubttuloChar"/>
     <w:uiPriority w:val="11"/>
     <w:qFormat/>
-    <w:rsid w:val="00222017"/>
+    <w:rsid w:val="003769CF"/>
     <w:pPr>
       <w:numPr>
         <w:ilvl w:val="1"/>
@@ -28300,7 +28331,7 @@
     <w:basedOn w:val="Fontepargpadro"/>
     <w:link w:val="Subttulo"/>
     <w:uiPriority w:val="11"/>
-    <w:rsid w:val="00222017"/>
+    <w:rsid w:val="003769CF"/>
     <w:rPr>
       <w:rFonts w:eastAsiaTheme="majorEastAsia" w:cstheme="majorBidi"/>
       <w:color w:val="595959" w:themeColor="text1" w:themeTint="A6"/>
@@ -28316,7 +28347,7 @@
     <w:link w:val="CitaoChar"/>
     <w:uiPriority w:val="29"/>
     <w:qFormat/>
-    <w:rsid w:val="00222017"/>
+    <w:rsid w:val="003769CF"/>
     <w:pPr>
       <w:spacing w:before="160"/>
       <w:jc w:val="center"/>
@@ -28332,7 +28363,7 @@
     <w:basedOn w:val="Fontepargpadro"/>
     <w:link w:val="Citao"/>
     <w:uiPriority w:val="29"/>
-    <w:rsid w:val="00222017"/>
+    <w:rsid w:val="003769CF"/>
     <w:rPr>
       <w:i/>
       <w:iCs/>
@@ -28344,7 +28375,7 @@
     <w:basedOn w:val="Normal"/>
     <w:uiPriority w:val="34"/>
     <w:qFormat/>
-    <w:rsid w:val="00222017"/>
+    <w:rsid w:val="003769CF"/>
     <w:pPr>
       <w:ind w:left="720"/>
       <w:contextualSpacing/>
@@ -28355,7 +28386,7 @@
     <w:basedOn w:val="Fontepargpadro"/>
     <w:uiPriority w:val="21"/>
     <w:qFormat/>
-    <w:rsid w:val="00222017"/>
+    <w:rsid w:val="003769CF"/>
     <w:rPr>
       <w:i/>
       <w:iCs/>
@@ -28369,7 +28400,7 @@
     <w:link w:val="CitaoIntensaChar"/>
     <w:uiPriority w:val="30"/>
     <w:qFormat/>
-    <w:rsid w:val="00222017"/>
+    <w:rsid w:val="003769CF"/>
     <w:pPr>
       <w:pBdr>
         <w:top w:val="single" w:sz="4" w:space="10" w:color="0F4761" w:themeColor="accent1" w:themeShade="BF"/>
@@ -28390,7 +28421,7 @@
     <w:basedOn w:val="Fontepargpadro"/>
     <w:link w:val="CitaoIntensa"/>
     <w:uiPriority w:val="30"/>
-    <w:rsid w:val="00222017"/>
+    <w:rsid w:val="003769CF"/>
     <w:rPr>
       <w:i/>
       <w:iCs/>
@@ -28402,7 +28433,7 @@
     <w:basedOn w:val="Fontepargpadro"/>
     <w:uiPriority w:val="32"/>
     <w:qFormat/>
-    <w:rsid w:val="00222017"/>
+    <w:rsid w:val="003769CF"/>
     <w:rPr>
       <w:b/>
       <w:bCs/>
@@ -28417,7 +28448,7 @@
     <w:link w:val="CabealhoChar"/>
     <w:uiPriority w:val="99"/>
     <w:unhideWhenUsed/>
-    <w:rsid w:val="00222017"/>
+    <w:rsid w:val="003769CF"/>
     <w:pPr>
       <w:tabs>
         <w:tab w:val="center" w:pos="4252"/>
@@ -28431,7 +28462,7 @@
     <w:basedOn w:val="Fontepargpadro"/>
     <w:link w:val="Cabealho"/>
     <w:uiPriority w:val="99"/>
-    <w:rsid w:val="00222017"/>
+    <w:rsid w:val="003769CF"/>
   </w:style>
   <w:style w:type="paragraph" w:styleId="Rodap">
     <w:name w:val="footer"/>
@@ -28439,7 +28470,7 @@
     <w:link w:val="RodapChar"/>
     <w:uiPriority w:val="99"/>
     <w:unhideWhenUsed/>
-    <w:rsid w:val="00222017"/>
+    <w:rsid w:val="003769CF"/>
     <w:pPr>
       <w:tabs>
         <w:tab w:val="center" w:pos="4252"/>
@@ -28453,7 +28484,7 @@
     <w:basedOn w:val="Fontepargpadro"/>
     <w:link w:val="Rodap"/>
     <w:uiPriority w:val="99"/>
-    <w:rsid w:val="00222017"/>
+    <w:rsid w:val="003769CF"/>
   </w:style>
   <w:style w:type="paragraph" w:styleId="Sumrio1">
     <w:name w:val="toc 1"/>
@@ -28462,7 +28493,7 @@
     <w:autoRedefine/>
     <w:uiPriority w:val="39"/>
     <w:unhideWhenUsed/>
-    <w:rsid w:val="00222017"/>
+    <w:rsid w:val="003769CF"/>
     <w:pPr>
       <w:spacing w:after="100"/>
     </w:pPr>
@@ -28474,7 +28505,7 @@
     <w:autoRedefine/>
     <w:uiPriority w:val="39"/>
     <w:unhideWhenUsed/>
-    <w:rsid w:val="00222017"/>
+    <w:rsid w:val="003769CF"/>
     <w:pPr>
       <w:spacing w:after="100"/>
       <w:ind w:left="240"/>

</xml_diff>

<commit_message>
Atualiza Central de Ajuda e Manual de Uso com as mudancas da Gestao de Atividades
Documenta o agrupamento por projeto (Marcos, Tarefas, Riscos e Entradas),
o contador de atrasados por projeto, a ordenacao dos grupos de Marcos pelo
mais critico primeiro, o rotulo explicito do campo de data (Termino previsto)
e o auto-expandir de pessoas com item atrasado - Manual de Uso vai para a
versao 2.88. Cache-busting da Central de Ajuda incrementado para v=72 em
todos os arquivos que linkam para ela.

Co-Authored-By: Claude Sonnet 5 <noreply@anthropic.com>
</commit_message>
<xml_diff>
--- a/Manual de Uso - Ferramenta de Gestao de Projetos.docx
+++ b/Manual de Uso - Ferramenta de Gestao de Projetos.docx
@@ -129,7 +129,7 @@
           <w:color w:val="6A6A70"/>
           <w:sz w:val="22"/>
         </w:rPr>
-        <w:t>Versao 2.87 - 17 de setembro de 2026 (substitui a versao 2.86 de 17/09/2026)</w:t>
+        <w:t>Versao 2.88 - 17 de setembro de 2026 (substitui a versao 2.87 de 17/09/2026)</w:t>
       </w:r>
     </w:p>
     <w:p>
@@ -229,7 +229,7 @@
         <w:rPr>
           <w:noProof/>
         </w:rPr>
-        <w:instrText xml:space="preserve"> PAGEREF _Toc240534275 \h </w:instrText>
+        <w:instrText xml:space="preserve"> PAGEREF _Toc240546251 \h </w:instrText>
       </w:r>
       <w:r>
         <w:rPr>
@@ -290,7 +290,7 @@
         <w:rPr>
           <w:noProof/>
         </w:rPr>
-        <w:instrText xml:space="preserve"> PAGEREF _Toc240534276 \h </w:instrText>
+        <w:instrText xml:space="preserve"> PAGEREF _Toc240546252 \h </w:instrText>
       </w:r>
       <w:r>
         <w:rPr>
@@ -351,7 +351,7 @@
         <w:rPr>
           <w:noProof/>
         </w:rPr>
-        <w:instrText xml:space="preserve"> PAGEREF _Toc240534277 \h </w:instrText>
+        <w:instrText xml:space="preserve"> PAGEREF _Toc240546253 \h </w:instrText>
       </w:r>
       <w:r>
         <w:rPr>
@@ -412,7 +412,7 @@
         <w:rPr>
           <w:noProof/>
         </w:rPr>
-        <w:instrText xml:space="preserve"> PAGEREF _Toc240534278 \h </w:instrText>
+        <w:instrText xml:space="preserve"> PAGEREF _Toc240546254 \h </w:instrText>
       </w:r>
       <w:r>
         <w:rPr>
@@ -429,7 +429,7 @@
         <w:rPr>
           <w:noProof/>
         </w:rPr>
-        <w:t>23</w:t>
+        <w:t>24</w:t>
       </w:r>
       <w:r>
         <w:rPr>
@@ -473,7 +473,7 @@
         <w:rPr>
           <w:noProof/>
         </w:rPr>
-        <w:instrText xml:space="preserve"> PAGEREF _Toc240534279 \h </w:instrText>
+        <w:instrText xml:space="preserve"> PAGEREF _Toc240546255 \h </w:instrText>
       </w:r>
       <w:r>
         <w:rPr>
@@ -490,7 +490,7 @@
         <w:rPr>
           <w:noProof/>
         </w:rPr>
-        <w:t>24</w:t>
+        <w:t>25</w:t>
       </w:r>
       <w:r>
         <w:rPr>
@@ -534,7 +534,7 @@
         <w:rPr>
           <w:noProof/>
         </w:rPr>
-        <w:instrText xml:space="preserve"> PAGEREF _Toc240534280 \h </w:instrText>
+        <w:instrText xml:space="preserve"> PAGEREF _Toc240546256 \h </w:instrText>
       </w:r>
       <w:r>
         <w:rPr>
@@ -595,7 +595,7 @@
         <w:rPr>
           <w:noProof/>
         </w:rPr>
-        <w:instrText xml:space="preserve"> PAGEREF _Toc240534281 \h </w:instrText>
+        <w:instrText xml:space="preserve"> PAGEREF _Toc240546257 \h </w:instrText>
       </w:r>
       <w:r>
         <w:rPr>
@@ -656,7 +656,7 @@
         <w:rPr>
           <w:noProof/>
         </w:rPr>
-        <w:instrText xml:space="preserve"> PAGEREF _Toc240534282 \h </w:instrText>
+        <w:instrText xml:space="preserve"> PAGEREF _Toc240546258 \h </w:instrText>
       </w:r>
       <w:r>
         <w:rPr>
@@ -717,7 +717,7 @@
         <w:rPr>
           <w:noProof/>
         </w:rPr>
-        <w:instrText xml:space="preserve"> PAGEREF _Toc240534283 \h </w:instrText>
+        <w:instrText xml:space="preserve"> PAGEREF _Toc240546259 \h </w:instrText>
       </w:r>
       <w:r>
         <w:rPr>
@@ -778,7 +778,7 @@
         <w:rPr>
           <w:noProof/>
         </w:rPr>
-        <w:instrText xml:space="preserve"> PAGEREF _Toc240534284 \h </w:instrText>
+        <w:instrText xml:space="preserve"> PAGEREF _Toc240546260 \h </w:instrText>
       </w:r>
       <w:r>
         <w:rPr>
@@ -839,7 +839,7 @@
         <w:rPr>
           <w:noProof/>
         </w:rPr>
-        <w:instrText xml:space="preserve"> PAGEREF _Toc240534285 \h </w:instrText>
+        <w:instrText xml:space="preserve"> PAGEREF _Toc240546261 \h </w:instrText>
       </w:r>
       <w:r>
         <w:rPr>
@@ -900,7 +900,7 @@
         <w:rPr>
           <w:noProof/>
         </w:rPr>
-        <w:instrText xml:space="preserve"> PAGEREF _Toc240534286 \h </w:instrText>
+        <w:instrText xml:space="preserve"> PAGEREF _Toc240546262 \h </w:instrText>
       </w:r>
       <w:r>
         <w:rPr>
@@ -961,7 +961,7 @@
         <w:rPr>
           <w:noProof/>
         </w:rPr>
-        <w:instrText xml:space="preserve"> PAGEREF _Toc240534287 \h </w:instrText>
+        <w:instrText xml:space="preserve"> PAGEREF _Toc240546263 \h </w:instrText>
       </w:r>
       <w:r>
         <w:rPr>
@@ -1022,7 +1022,7 @@
         <w:rPr>
           <w:noProof/>
         </w:rPr>
-        <w:instrText xml:space="preserve"> PAGEREF _Toc240534288 \h </w:instrText>
+        <w:instrText xml:space="preserve"> PAGEREF _Toc240546264 \h </w:instrText>
       </w:r>
       <w:r>
         <w:rPr>
@@ -1083,7 +1083,7 @@
         <w:rPr>
           <w:noProof/>
         </w:rPr>
-        <w:instrText xml:space="preserve"> PAGEREF _Toc240534289 \h </w:instrText>
+        <w:instrText xml:space="preserve"> PAGEREF _Toc240546265 \h </w:instrText>
       </w:r>
       <w:r>
         <w:rPr>
@@ -1144,7 +1144,7 @@
         <w:rPr>
           <w:noProof/>
         </w:rPr>
-        <w:instrText xml:space="preserve"> PAGEREF _Toc240534290 \h </w:instrText>
+        <w:instrText xml:space="preserve"> PAGEREF _Toc240546266 \h </w:instrText>
       </w:r>
       <w:r>
         <w:rPr>
@@ -1205,7 +1205,7 @@
         <w:rPr>
           <w:noProof/>
         </w:rPr>
-        <w:instrText xml:space="preserve"> PAGEREF _Toc240534291 \h </w:instrText>
+        <w:instrText xml:space="preserve"> PAGEREF _Toc240546267 \h </w:instrText>
       </w:r>
       <w:r>
         <w:rPr>
@@ -1266,7 +1266,7 @@
         <w:rPr>
           <w:noProof/>
         </w:rPr>
-        <w:instrText xml:space="preserve"> PAGEREF _Toc240534292 \h </w:instrText>
+        <w:instrText xml:space="preserve"> PAGEREF _Toc240546268 \h </w:instrText>
       </w:r>
       <w:r>
         <w:rPr>
@@ -1327,7 +1327,7 @@
         <w:rPr>
           <w:noProof/>
         </w:rPr>
-        <w:instrText xml:space="preserve"> PAGEREF _Toc240534293 \h </w:instrText>
+        <w:instrText xml:space="preserve"> PAGEREF _Toc240546269 \h </w:instrText>
       </w:r>
       <w:r>
         <w:rPr>
@@ -1388,7 +1388,7 @@
         <w:rPr>
           <w:noProof/>
         </w:rPr>
-        <w:instrText xml:space="preserve"> PAGEREF _Toc240534294 \h </w:instrText>
+        <w:instrText xml:space="preserve"> PAGEREF _Toc240546270 \h </w:instrText>
       </w:r>
       <w:r>
         <w:rPr>
@@ -1449,7 +1449,7 @@
         <w:rPr>
           <w:noProof/>
         </w:rPr>
-        <w:instrText xml:space="preserve"> PAGEREF _Toc240534295 \h </w:instrText>
+        <w:instrText xml:space="preserve"> PAGEREF _Toc240546271 \h </w:instrText>
       </w:r>
       <w:r>
         <w:rPr>
@@ -1510,7 +1510,7 @@
         <w:rPr>
           <w:noProof/>
         </w:rPr>
-        <w:instrText xml:space="preserve"> PAGEREF _Toc240534296 \h </w:instrText>
+        <w:instrText xml:space="preserve"> PAGEREF _Toc240546272 \h </w:instrText>
       </w:r>
       <w:r>
         <w:rPr>
@@ -1571,7 +1571,7 @@
         <w:rPr>
           <w:noProof/>
         </w:rPr>
-        <w:instrText xml:space="preserve"> PAGEREF _Toc240534297 \h </w:instrText>
+        <w:instrText xml:space="preserve"> PAGEREF _Toc240546273 \h </w:instrText>
       </w:r>
       <w:r>
         <w:rPr>
@@ -1632,7 +1632,7 @@
         <w:rPr>
           <w:noProof/>
         </w:rPr>
-        <w:instrText xml:space="preserve"> PAGEREF _Toc240534298 \h </w:instrText>
+        <w:instrText xml:space="preserve"> PAGEREF _Toc240546274 \h </w:instrText>
       </w:r>
       <w:r>
         <w:rPr>
@@ -1693,7 +1693,7 @@
         <w:rPr>
           <w:noProof/>
         </w:rPr>
-        <w:instrText xml:space="preserve"> PAGEREF _Toc240534299 \h </w:instrText>
+        <w:instrText xml:space="preserve"> PAGEREF _Toc240546275 \h </w:instrText>
       </w:r>
       <w:r>
         <w:rPr>
@@ -1754,7 +1754,7 @@
         <w:rPr>
           <w:noProof/>
         </w:rPr>
-        <w:instrText xml:space="preserve"> PAGEREF _Toc240534300 \h </w:instrText>
+        <w:instrText xml:space="preserve"> PAGEREF _Toc240546276 \h </w:instrText>
       </w:r>
       <w:r>
         <w:rPr>
@@ -1816,7 +1816,7 @@
         <w:rPr>
           <w:noProof/>
         </w:rPr>
-        <w:instrText xml:space="preserve"> PAGEREF _Toc240534301 \h </w:instrText>
+        <w:instrText xml:space="preserve"> PAGEREF _Toc240546277 \h </w:instrText>
       </w:r>
       <w:r>
         <w:rPr>
@@ -1877,7 +1877,7 @@
         <w:rPr>
           <w:noProof/>
         </w:rPr>
-        <w:instrText xml:space="preserve"> PAGEREF _Toc240534302 \h </w:instrText>
+        <w:instrText xml:space="preserve"> PAGEREF _Toc240546278 \h </w:instrText>
       </w:r>
       <w:r>
         <w:rPr>
@@ -1938,7 +1938,7 @@
         <w:rPr>
           <w:noProof/>
         </w:rPr>
-        <w:instrText xml:space="preserve"> PAGEREF _Toc240534303 \h </w:instrText>
+        <w:instrText xml:space="preserve"> PAGEREF _Toc240546279 \h </w:instrText>
       </w:r>
       <w:r>
         <w:rPr>
@@ -1999,7 +1999,7 @@
         <w:rPr>
           <w:noProof/>
         </w:rPr>
-        <w:instrText xml:space="preserve"> PAGEREF _Toc240534304 \h </w:instrText>
+        <w:instrText xml:space="preserve"> PAGEREF _Toc240546280 \h </w:instrText>
       </w:r>
       <w:r>
         <w:rPr>
@@ -2060,7 +2060,7 @@
         <w:rPr>
           <w:noProof/>
         </w:rPr>
-        <w:instrText xml:space="preserve"> PAGEREF _Toc240534305 \h </w:instrText>
+        <w:instrText xml:space="preserve"> PAGEREF _Toc240546281 \h </w:instrText>
       </w:r>
       <w:r>
         <w:rPr>
@@ -2121,7 +2121,7 @@
         <w:rPr>
           <w:noProof/>
         </w:rPr>
-        <w:instrText xml:space="preserve"> PAGEREF _Toc240534306 \h </w:instrText>
+        <w:instrText xml:space="preserve"> PAGEREF _Toc240546282 \h </w:instrText>
       </w:r>
       <w:r>
         <w:rPr>
@@ -2182,7 +2182,7 @@
         <w:rPr>
           <w:noProof/>
         </w:rPr>
-        <w:instrText xml:space="preserve"> PAGEREF _Toc240534307 \h </w:instrText>
+        <w:instrText xml:space="preserve"> PAGEREF _Toc240546283 \h </w:instrText>
       </w:r>
       <w:r>
         <w:rPr>
@@ -2243,7 +2243,7 @@
         <w:rPr>
           <w:noProof/>
         </w:rPr>
-        <w:instrText xml:space="preserve"> PAGEREF _Toc240534308 \h </w:instrText>
+        <w:instrText xml:space="preserve"> PAGEREF _Toc240546284 \h </w:instrText>
       </w:r>
       <w:r>
         <w:rPr>
@@ -2304,7 +2304,7 @@
         <w:rPr>
           <w:noProof/>
         </w:rPr>
-        <w:instrText xml:space="preserve"> PAGEREF _Toc240534309 \h </w:instrText>
+        <w:instrText xml:space="preserve"> PAGEREF _Toc240546285 \h </w:instrText>
       </w:r>
       <w:r>
         <w:rPr>
@@ -2365,7 +2365,7 @@
         <w:rPr>
           <w:noProof/>
         </w:rPr>
-        <w:instrText xml:space="preserve"> PAGEREF _Toc240534310 \h </w:instrText>
+        <w:instrText xml:space="preserve"> PAGEREF _Toc240546286 \h </w:instrText>
       </w:r>
       <w:r>
         <w:rPr>
@@ -2426,7 +2426,7 @@
         <w:rPr>
           <w:noProof/>
         </w:rPr>
-        <w:instrText xml:space="preserve"> PAGEREF _Toc240534311 \h </w:instrText>
+        <w:instrText xml:space="preserve"> PAGEREF _Toc240546287 \h </w:instrText>
       </w:r>
       <w:r>
         <w:rPr>
@@ -2487,7 +2487,7 @@
         <w:rPr>
           <w:noProof/>
         </w:rPr>
-        <w:instrText xml:space="preserve"> PAGEREF _Toc240534312 \h </w:instrText>
+        <w:instrText xml:space="preserve"> PAGEREF _Toc240546288 \h </w:instrText>
       </w:r>
       <w:r>
         <w:rPr>
@@ -2548,7 +2548,7 @@
         <w:rPr>
           <w:noProof/>
         </w:rPr>
-        <w:instrText xml:space="preserve"> PAGEREF _Toc240534313 \h </w:instrText>
+        <w:instrText xml:space="preserve"> PAGEREF _Toc240546289 \h </w:instrText>
       </w:r>
       <w:r>
         <w:rPr>
@@ -2609,7 +2609,7 @@
         <w:rPr>
           <w:noProof/>
         </w:rPr>
-        <w:instrText xml:space="preserve"> PAGEREF _Toc240534314 \h </w:instrText>
+        <w:instrText xml:space="preserve"> PAGEREF _Toc240546290 \h </w:instrText>
       </w:r>
       <w:r>
         <w:rPr>
@@ -2670,7 +2670,7 @@
         <w:rPr>
           <w:noProof/>
         </w:rPr>
-        <w:instrText xml:space="preserve"> PAGEREF _Toc240534315 \h </w:instrText>
+        <w:instrText xml:space="preserve"> PAGEREF _Toc240546291 \h </w:instrText>
       </w:r>
       <w:r>
         <w:rPr>
@@ -2731,7 +2731,7 @@
         <w:rPr>
           <w:noProof/>
         </w:rPr>
-        <w:instrText xml:space="preserve"> PAGEREF _Toc240534316 \h </w:instrText>
+        <w:instrText xml:space="preserve"> PAGEREF _Toc240546292 \h </w:instrText>
       </w:r>
       <w:r>
         <w:rPr>
@@ -2792,7 +2792,7 @@
         <w:rPr>
           <w:noProof/>
         </w:rPr>
-        <w:instrText xml:space="preserve"> PAGEREF _Toc240534317 \h </w:instrText>
+        <w:instrText xml:space="preserve"> PAGEREF _Toc240546293 \h </w:instrText>
       </w:r>
       <w:r>
         <w:rPr>
@@ -2853,7 +2853,7 @@
         <w:rPr>
           <w:noProof/>
         </w:rPr>
-        <w:instrText xml:space="preserve"> PAGEREF _Toc240534318 \h </w:instrText>
+        <w:instrText xml:space="preserve"> PAGEREF _Toc240546294 \h </w:instrText>
       </w:r>
       <w:r>
         <w:rPr>
@@ -2914,7 +2914,7 @@
         <w:rPr>
           <w:noProof/>
         </w:rPr>
-        <w:instrText xml:space="preserve"> PAGEREF _Toc240534319 \h </w:instrText>
+        <w:instrText xml:space="preserve"> PAGEREF _Toc240546295 \h </w:instrText>
       </w:r>
       <w:r>
         <w:rPr>
@@ -2975,7 +2975,7 @@
         <w:rPr>
           <w:noProof/>
         </w:rPr>
-        <w:instrText xml:space="preserve"> PAGEREF _Toc240534320 \h </w:instrText>
+        <w:instrText xml:space="preserve"> PAGEREF _Toc240546296 \h </w:instrText>
       </w:r>
       <w:r>
         <w:rPr>
@@ -3036,7 +3036,7 @@
         <w:rPr>
           <w:noProof/>
         </w:rPr>
-        <w:instrText xml:space="preserve"> PAGEREF _Toc240534321 \h </w:instrText>
+        <w:instrText xml:space="preserve"> PAGEREF _Toc240546297 \h </w:instrText>
       </w:r>
       <w:r>
         <w:rPr>
@@ -3097,7 +3097,7 @@
         <w:rPr>
           <w:noProof/>
         </w:rPr>
-        <w:instrText xml:space="preserve"> PAGEREF _Toc240534322 \h </w:instrText>
+        <w:instrText xml:space="preserve"> PAGEREF _Toc240546298 \h </w:instrText>
       </w:r>
       <w:r>
         <w:rPr>
@@ -3158,7 +3158,7 @@
         <w:rPr>
           <w:noProof/>
         </w:rPr>
-        <w:instrText xml:space="preserve"> PAGEREF _Toc240534323 \h </w:instrText>
+        <w:instrText xml:space="preserve"> PAGEREF _Toc240546299 \h </w:instrText>
       </w:r>
       <w:r>
         <w:rPr>
@@ -3219,7 +3219,7 @@
         <w:rPr>
           <w:noProof/>
         </w:rPr>
-        <w:instrText xml:space="preserve"> PAGEREF _Toc240534324 \h </w:instrText>
+        <w:instrText xml:space="preserve"> PAGEREF _Toc240546300 \h </w:instrText>
       </w:r>
       <w:r>
         <w:rPr>
@@ -3280,7 +3280,7 @@
         <w:rPr>
           <w:noProof/>
         </w:rPr>
-        <w:instrText xml:space="preserve"> PAGEREF _Toc240534325 \h </w:instrText>
+        <w:instrText xml:space="preserve"> PAGEREF _Toc240546301 \h </w:instrText>
       </w:r>
       <w:r>
         <w:rPr>
@@ -3341,7 +3341,7 @@
         <w:rPr>
           <w:noProof/>
         </w:rPr>
-        <w:instrText xml:space="preserve"> PAGEREF _Toc240534326 \h </w:instrText>
+        <w:instrText xml:space="preserve"> PAGEREF _Toc240546302 \h </w:instrText>
       </w:r>
       <w:r>
         <w:rPr>
@@ -3358,7 +3358,7 @@
         <w:rPr>
           <w:noProof/>
         </w:rPr>
-        <w:t>104</w:t>
+        <w:t>105</w:t>
       </w:r>
       <w:r>
         <w:rPr>
@@ -3402,7 +3402,7 @@
         <w:rPr>
           <w:noProof/>
         </w:rPr>
-        <w:instrText xml:space="preserve"> PAGEREF _Toc240534327 \h </w:instrText>
+        <w:instrText xml:space="preserve"> PAGEREF _Toc240546303 \h </w:instrText>
       </w:r>
       <w:r>
         <w:rPr>
@@ -3419,7 +3419,7 @@
         <w:rPr>
           <w:noProof/>
         </w:rPr>
-        <w:t>104</w:t>
+        <w:t>105</w:t>
       </w:r>
       <w:r>
         <w:rPr>
@@ -3464,7 +3464,7 @@
         <w:rPr>
           <w:noProof/>
         </w:rPr>
-        <w:instrText xml:space="preserve"> PAGEREF _Toc240534328 \h </w:instrText>
+        <w:instrText xml:space="preserve"> PAGEREF _Toc240546304 \h </w:instrText>
       </w:r>
       <w:r>
         <w:rPr>
@@ -3481,7 +3481,7 @@
         <w:rPr>
           <w:noProof/>
         </w:rPr>
-        <w:t>106</w:t>
+        <w:t>107</w:t>
       </w:r>
       <w:r>
         <w:rPr>
@@ -3525,7 +3525,7 @@
         <w:rPr>
           <w:noProof/>
         </w:rPr>
-        <w:instrText xml:space="preserve"> PAGEREF _Toc240534329 \h </w:instrText>
+        <w:instrText xml:space="preserve"> PAGEREF _Toc240546305 \h </w:instrText>
       </w:r>
       <w:r>
         <w:rPr>
@@ -3542,7 +3542,7 @@
         <w:rPr>
           <w:noProof/>
         </w:rPr>
-        <w:t>109</w:t>
+        <w:t>110</w:t>
       </w:r>
       <w:r>
         <w:rPr>
@@ -3586,7 +3586,7 @@
         <w:rPr>
           <w:noProof/>
         </w:rPr>
-        <w:instrText xml:space="preserve"> PAGEREF _Toc240534330 \h </w:instrText>
+        <w:instrText xml:space="preserve"> PAGEREF _Toc240546306 \h </w:instrText>
       </w:r>
       <w:r>
         <w:rPr>
@@ -3603,7 +3603,7 @@
         <w:rPr>
           <w:noProof/>
         </w:rPr>
-        <w:t>110</w:t>
+        <w:t>111</w:t>
       </w:r>
       <w:r>
         <w:rPr>
@@ -3662,7 +3662,7 @@
           <w:sz w:val="34"/>
         </w:rPr>
       </w:pPr>
-      <w:bookmarkStart w:id="0" w:name="_Toc240534275"/>
+      <w:bookmarkStart w:id="0" w:name="_Toc240546251"/>
       <w:r>
         <w:rPr>
           <w:rFonts w:ascii="Montserrat" w:hAnsi="Montserrat"/>
@@ -3686,7 +3686,7 @@
           <w:sz w:val="27"/>
         </w:rPr>
       </w:pPr>
-      <w:bookmarkStart w:id="1" w:name="_Toc240534276"/>
+      <w:bookmarkStart w:id="1" w:name="_Toc240546252"/>
       <w:r>
         <w:rPr>
           <w:rFonts w:ascii="Montserrat" w:hAnsi="Montserrat"/>
@@ -5442,6 +5442,24 @@
           <w:color w:val="1A1A1A"/>
           <w:sz w:val="22"/>
         </w:rPr>
+        <w:t>Esta e a versao 2.88 do manual. Em relacao a versao 2.87 (17/09/2026), a Gestao de Atividades (secao 6.4.5) passou a agrupar Marcos, Tarefas, Riscos (TAP) e Entradas (Planejamento) por projeto dentro do cartao de cada pessoa, em vez de listar os itens soltos: cada grupo de projeto mostra a contagem de itens e, em Marcos, quantos estao atrasados, com os grupos de Marcos ordenados pelo mais critico primeiro; cada marco tambem passou a indicar explicitamente o campo da data (Termino previsto). Pessoas com pelo menos um item atrasado agora abrem automaticamente ao carregar a pagina.</w:t>
+      </w:r>
+    </w:p>
+    <w:p>
+      <w:pPr>
+        <w:spacing w:line="280" w:lineRule="auto"/>
+        <w:rPr>
+          <w:rFonts w:ascii="Montserrat" w:hAnsi="Montserrat"/>
+          <w:color w:val="1A1A1A"/>
+          <w:sz w:val="22"/>
+        </w:rPr>
+      </w:pPr>
+      <w:r>
+        <w:rPr>
+          <w:rFonts w:ascii="Montserrat" w:hAnsi="Montserrat"/>
+          <w:color w:val="1A1A1A"/>
+          <w:sz w:val="22"/>
+        </w:rPr>
         <w:t>O manual nao substitui as Diretrizes para a Gestao de Projetos da UNIALFA (documento institucional que define o framework D01 a D07) nem o documento Regras de Acesso e Permissoes (que detalha cada regra de controle de acesso); ele e o guia operacional de como usar cada ferramenta na pratica.</w:t>
       </w:r>
     </w:p>
@@ -5456,7 +5474,7 @@
           <w:sz w:val="27"/>
         </w:rPr>
       </w:pPr>
-      <w:bookmarkStart w:id="2" w:name="_Toc240534277"/>
+      <w:bookmarkStart w:id="2" w:name="_Toc240546253"/>
       <w:r>
         <w:rPr>
           <w:rFonts w:ascii="Montserrat" w:hAnsi="Montserrat"/>
@@ -5579,6 +5597,7 @@
           <w:color w:val="1A1A1A"/>
           <w:sz w:val="22"/>
         </w:rPr>
+        <w:lastRenderedPageBreak/>
         <w:t>1 Painel Executivo, tambem restrito a Admin, com a visao agregada de todo o sistema (secao 6.4).</w:t>
       </w:r>
     </w:p>
@@ -5639,7 +5658,6 @@
           <w:color w:val="1A1A1A"/>
           <w:sz w:val="22"/>
         </w:rPr>
-        <w:lastRenderedPageBreak/>
         <w:t>O Mapa de Diretrizes (pagina inicial) apresenta visualmente as 7 diretrizes (D01 a D07) e mostra, para cada etapa do processo, quais ferramentas usar. E o ponto de partida recomendado para quem quer entender o processo antes de preencher os formularios - e a unica pagina, junto com o Validador de Projetos, que nao exige login.</w:t>
       </w:r>
     </w:p>
@@ -5653,16 +5671,16 @@
           <w:noProof/>
         </w:rPr>
         <w:drawing>
-          <wp:inline distT="0" distB="0" distL="0" distR="0" wp14:anchorId="370809DF" wp14:editId="458A2D3E">
+          <wp:inline distT="0" distB="0" distL="0" distR="0" wp14:anchorId="33EE0D4A" wp14:editId="20ACB958">
             <wp:extent cx="5303520" cy="4792851"/>
             <wp:effectExtent l="19050" t="19050" r="11430" b="27305"/>
-            <wp:docPr id="748312340" name="Imagem 1"/>
+            <wp:docPr id="446009559" name="Imagem 1"/>
             <wp:cNvGraphicFramePr/>
             <a:graphic xmlns:a="http://schemas.openxmlformats.org/drawingml/2006/main">
               <a:graphicData uri="http://schemas.openxmlformats.org/drawingml/2006/picture">
                 <pic:pic xmlns:pic="http://schemas.openxmlformats.org/drawingml/2006/picture">
                   <pic:nvPicPr>
-                    <pic:cNvPr id="748312340" name=""/>
+                    <pic:cNvPr id="446009559" name=""/>
                     <pic:cNvPicPr/>
                   </pic:nvPicPr>
                   <pic:blipFill>
@@ -5730,7 +5748,7 @@
           <w:sz w:val="27"/>
         </w:rPr>
       </w:pPr>
-      <w:bookmarkStart w:id="3" w:name="_Toc240534278"/>
+      <w:bookmarkStart w:id="3" w:name="_Toc240546254"/>
       <w:r>
         <w:rPr>
           <w:rFonts w:ascii="Montserrat" w:hAnsi="Montserrat"/>
@@ -5738,6 +5756,7 @@
           <w:color w:val="B91D2E"/>
           <w:sz w:val="27"/>
         </w:rPr>
+        <w:lastRenderedPageBreak/>
         <w:t>1.3 Como acessar e fazer login</w:t>
       </w:r>
       <w:bookmarkEnd w:id="3"/>
@@ -5769,18 +5788,17 @@
         <w:rPr>
           <w:noProof/>
         </w:rPr>
-        <w:lastRenderedPageBreak/>
         <w:drawing>
-          <wp:inline distT="0" distB="0" distL="0" distR="0" wp14:anchorId="3C6EEF4D" wp14:editId="26D28AA1">
+          <wp:inline distT="0" distB="0" distL="0" distR="0" wp14:anchorId="07812315" wp14:editId="43C296C4">
             <wp:extent cx="4206240" cy="3801227"/>
             <wp:effectExtent l="19050" t="19050" r="22860" b="27940"/>
-            <wp:docPr id="1282825278" name="Imagem 2"/>
+            <wp:docPr id="1498070839" name="Imagem 2"/>
             <wp:cNvGraphicFramePr/>
             <a:graphic xmlns:a="http://schemas.openxmlformats.org/drawingml/2006/main">
               <a:graphicData uri="http://schemas.openxmlformats.org/drawingml/2006/picture">
                 <pic:pic xmlns:pic="http://schemas.openxmlformats.org/drawingml/2006/picture">
                   <pic:nvPicPr>
-                    <pic:cNvPr id="1282825278" name=""/>
+                    <pic:cNvPr id="1498070839" name=""/>
                     <pic:cNvPicPr/>
                   </pic:nvPicPr>
                   <pic:blipFill>
@@ -5953,7 +5971,7 @@
           <w:sz w:val="27"/>
         </w:rPr>
       </w:pPr>
-      <w:bookmarkStart w:id="4" w:name="_Toc240534279"/>
+      <w:bookmarkStart w:id="4" w:name="_Toc240546255"/>
       <w:r>
         <w:rPr>
           <w:rFonts w:ascii="Montserrat" w:hAnsi="Montserrat"/>
@@ -5961,6 +5979,7 @@
           <w:color w:val="B91D2E"/>
           <w:sz w:val="27"/>
         </w:rPr>
+        <w:lastRenderedPageBreak/>
         <w:t>1.4 Como a ferramenta se relaciona com as Diretrizes (D01-D07)</w:t>
       </w:r>
       <w:bookmarkEnd w:id="4"/>
@@ -6035,7 +6054,6 @@
                 <w:color w:val="FFFFFF"/>
                 <w:sz w:val="19"/>
               </w:rPr>
-              <w:lastRenderedPageBreak/>
               <w:t>Passo</w:t>
             </w:r>
           </w:p>
@@ -7192,7 +7210,7 @@
           <w:sz w:val="34"/>
         </w:rPr>
       </w:pPr>
-      <w:bookmarkStart w:id="5" w:name="_Toc240534280"/>
+      <w:bookmarkStart w:id="5" w:name="_Toc240546256"/>
       <w:r>
         <w:rPr>
           <w:rFonts w:ascii="Montserrat" w:hAnsi="Montserrat"/>
@@ -7216,7 +7234,7 @@
           <w:sz w:val="27"/>
         </w:rPr>
       </w:pPr>
-      <w:bookmarkStart w:id="6" w:name="_Toc240534281"/>
+      <w:bookmarkStart w:id="6" w:name="_Toc240546257"/>
       <w:r>
         <w:rPr>
           <w:rFonts w:ascii="Montserrat" w:hAnsi="Montserrat"/>
@@ -7257,7 +7275,7 @@
           <w:sz w:val="27"/>
         </w:rPr>
       </w:pPr>
-      <w:bookmarkStart w:id="7" w:name="_Toc240534282"/>
+      <w:bookmarkStart w:id="7" w:name="_Toc240546258"/>
       <w:r>
         <w:rPr>
           <w:rFonts w:ascii="Montserrat" w:hAnsi="Montserrat"/>
@@ -7376,7 +7394,7 @@
           <w:sz w:val="27"/>
         </w:rPr>
       </w:pPr>
-      <w:bookmarkStart w:id="8" w:name="_Toc240534283"/>
+      <w:bookmarkStart w:id="8" w:name="_Toc240546259"/>
       <w:r>
         <w:rPr>
           <w:rFonts w:ascii="Montserrat" w:hAnsi="Montserrat"/>
@@ -7989,7 +8007,7 @@
           <w:sz w:val="27"/>
         </w:rPr>
       </w:pPr>
-      <w:bookmarkStart w:id="9" w:name="_Toc240534284"/>
+      <w:bookmarkStart w:id="9" w:name="_Toc240546260"/>
       <w:r>
         <w:rPr>
           <w:rFonts w:ascii="Montserrat" w:hAnsi="Montserrat"/>
@@ -8078,16 +8096,16 @@
         </w:rPr>
         <w:lastRenderedPageBreak/>
         <w:drawing>
-          <wp:inline distT="0" distB="0" distL="0" distR="0" wp14:anchorId="5098D2FB" wp14:editId="7C3CFD61">
+          <wp:inline distT="0" distB="0" distL="0" distR="0" wp14:anchorId="27EDF7C8" wp14:editId="1A5CDD2D">
             <wp:extent cx="4937760" cy="4462310"/>
             <wp:effectExtent l="19050" t="19050" r="15240" b="14605"/>
-            <wp:docPr id="2000801104" name="Imagem 3"/>
+            <wp:docPr id="1739795154" name="Imagem 3"/>
             <wp:cNvGraphicFramePr/>
             <a:graphic xmlns:a="http://schemas.openxmlformats.org/drawingml/2006/main">
               <a:graphicData uri="http://schemas.openxmlformats.org/drawingml/2006/picture">
                 <pic:pic xmlns:pic="http://schemas.openxmlformats.org/drawingml/2006/picture">
                   <pic:nvPicPr>
-                    <pic:cNvPr id="2000801104" name=""/>
+                    <pic:cNvPr id="1739795154" name=""/>
                     <pic:cNvPicPr/>
                   </pic:nvPicPr>
                   <pic:blipFill>
@@ -8155,7 +8173,7 @@
           <w:sz w:val="27"/>
         </w:rPr>
       </w:pPr>
-      <w:bookmarkStart w:id="10" w:name="_Toc240534285"/>
+      <w:bookmarkStart w:id="10" w:name="_Toc240546261"/>
       <w:r>
         <w:rPr>
           <w:rFonts w:ascii="Montserrat" w:hAnsi="Montserrat"/>
@@ -8196,16 +8214,16 @@
         </w:rPr>
         <w:lastRenderedPageBreak/>
         <w:drawing>
-          <wp:inline distT="0" distB="0" distL="0" distR="0" wp14:anchorId="2A79F493" wp14:editId="13C6BDDA">
+          <wp:inline distT="0" distB="0" distL="0" distR="0" wp14:anchorId="70E2E7B0" wp14:editId="120FE7DF">
             <wp:extent cx="5120640" cy="4627581"/>
             <wp:effectExtent l="19050" t="19050" r="22860" b="20955"/>
-            <wp:docPr id="1723586954" name="Imagem 4"/>
+            <wp:docPr id="169452548" name="Imagem 4"/>
             <wp:cNvGraphicFramePr/>
             <a:graphic xmlns:a="http://schemas.openxmlformats.org/drawingml/2006/main">
               <a:graphicData uri="http://schemas.openxmlformats.org/drawingml/2006/picture">
                 <pic:pic xmlns:pic="http://schemas.openxmlformats.org/drawingml/2006/picture">
                   <pic:nvPicPr>
-                    <pic:cNvPr id="1723586954" name=""/>
+                    <pic:cNvPr id="169452548" name=""/>
                     <pic:cNvPicPr/>
                   </pic:nvPicPr>
                   <pic:blipFill>
@@ -8388,7 +8406,7 @@
           <w:sz w:val="27"/>
         </w:rPr>
       </w:pPr>
-      <w:bookmarkStart w:id="11" w:name="_Toc240534286"/>
+      <w:bookmarkStart w:id="11" w:name="_Toc240546262"/>
       <w:r>
         <w:rPr>
           <w:rFonts w:ascii="Montserrat" w:hAnsi="Montserrat"/>
@@ -8428,16 +8446,16 @@
           <w:noProof/>
         </w:rPr>
         <w:drawing>
-          <wp:inline distT="0" distB="0" distL="0" distR="0" wp14:anchorId="11365BA7" wp14:editId="0A1A1CE1">
+          <wp:inline distT="0" distB="0" distL="0" distR="0" wp14:anchorId="2F5344CD" wp14:editId="3D3C0CC4">
             <wp:extent cx="4206240" cy="3801227"/>
             <wp:effectExtent l="19050" t="19050" r="22860" b="27940"/>
-            <wp:docPr id="1101686757" name="Imagem 5"/>
+            <wp:docPr id="784193309" name="Imagem 5"/>
             <wp:cNvGraphicFramePr/>
             <a:graphic xmlns:a="http://schemas.openxmlformats.org/drawingml/2006/main">
               <a:graphicData uri="http://schemas.openxmlformats.org/drawingml/2006/picture">
                 <pic:pic xmlns:pic="http://schemas.openxmlformats.org/drawingml/2006/picture">
                   <pic:nvPicPr>
-                    <pic:cNvPr id="1101686757" name=""/>
+                    <pic:cNvPr id="784193309" name=""/>
                     <pic:cNvPicPr/>
                   </pic:nvPicPr>
                   <pic:blipFill>
@@ -8505,16 +8523,16 @@
         </w:rPr>
         <w:lastRenderedPageBreak/>
         <w:drawing>
-          <wp:inline distT="0" distB="0" distL="0" distR="0" wp14:anchorId="000B5D7C" wp14:editId="75CE6589">
+          <wp:inline distT="0" distB="0" distL="0" distR="0" wp14:anchorId="03B41FAC" wp14:editId="310F910A">
             <wp:extent cx="4206240" cy="3801227"/>
             <wp:effectExtent l="19050" t="19050" r="22860" b="27940"/>
-            <wp:docPr id="1584167369" name="Imagem 6"/>
+            <wp:docPr id="1151458750" name="Imagem 6"/>
             <wp:cNvGraphicFramePr/>
             <a:graphic xmlns:a="http://schemas.openxmlformats.org/drawingml/2006/main">
               <a:graphicData uri="http://schemas.openxmlformats.org/drawingml/2006/picture">
                 <pic:pic xmlns:pic="http://schemas.openxmlformats.org/drawingml/2006/picture">
                   <pic:nvPicPr>
-                    <pic:cNvPr id="1584167369" name=""/>
+                    <pic:cNvPr id="1151458750" name=""/>
                     <pic:cNvPicPr/>
                   </pic:nvPicPr>
                   <pic:blipFill>
@@ -8630,7 +8648,7 @@
           <w:sz w:val="27"/>
         </w:rPr>
       </w:pPr>
-      <w:bookmarkStart w:id="12" w:name="_Toc240534287"/>
+      <w:bookmarkStart w:id="12" w:name="_Toc240546263"/>
       <w:r>
         <w:rPr>
           <w:rFonts w:ascii="Montserrat" w:hAnsi="Montserrat"/>
@@ -8698,7 +8716,7 @@
           <w:sz w:val="27"/>
         </w:rPr>
       </w:pPr>
-      <w:bookmarkStart w:id="13" w:name="_Toc240534288"/>
+      <w:bookmarkStart w:id="13" w:name="_Toc240546264"/>
       <w:r>
         <w:rPr>
           <w:rFonts w:ascii="Montserrat" w:hAnsi="Montserrat"/>
@@ -8925,7 +8943,7 @@
           <w:sz w:val="27"/>
         </w:rPr>
       </w:pPr>
-      <w:bookmarkStart w:id="14" w:name="_Toc240534289"/>
+      <w:bookmarkStart w:id="14" w:name="_Toc240546265"/>
       <w:r>
         <w:rPr>
           <w:rFonts w:ascii="Montserrat" w:hAnsi="Montserrat"/>
@@ -9084,7 +9102,7 @@
           <w:sz w:val="27"/>
         </w:rPr>
       </w:pPr>
-      <w:bookmarkStart w:id="15" w:name="_Toc240534290"/>
+      <w:bookmarkStart w:id="15" w:name="_Toc240546266"/>
       <w:r>
         <w:rPr>
           <w:rFonts w:ascii="Montserrat" w:hAnsi="Montserrat"/>
@@ -9276,7 +9294,7 @@
           <w:sz w:val="27"/>
         </w:rPr>
       </w:pPr>
-      <w:bookmarkStart w:id="16" w:name="_Toc240534291"/>
+      <w:bookmarkStart w:id="16" w:name="_Toc240546267"/>
       <w:r>
         <w:rPr>
           <w:rFonts w:ascii="Montserrat" w:hAnsi="Montserrat"/>
@@ -9404,7 +9422,7 @@
           <w:sz w:val="27"/>
         </w:rPr>
       </w:pPr>
-      <w:bookmarkStart w:id="17" w:name="_Toc240534292"/>
+      <w:bookmarkStart w:id="17" w:name="_Toc240546268"/>
       <w:r>
         <w:rPr>
           <w:rFonts w:ascii="Montserrat" w:hAnsi="Montserrat"/>
@@ -9734,7 +9752,7 @@
           <w:sz w:val="27"/>
         </w:rPr>
       </w:pPr>
-      <w:bookmarkStart w:id="18" w:name="_Toc240534293"/>
+      <w:bookmarkStart w:id="18" w:name="_Toc240546269"/>
       <w:r>
         <w:rPr>
           <w:rFonts w:ascii="Montserrat" w:hAnsi="Montserrat"/>
@@ -9871,7 +9889,7 @@
           <w:sz w:val="27"/>
         </w:rPr>
       </w:pPr>
-      <w:bookmarkStart w:id="19" w:name="_Toc240534294"/>
+      <w:bookmarkStart w:id="19" w:name="_Toc240546270"/>
       <w:r>
         <w:rPr>
           <w:rFonts w:ascii="Montserrat" w:hAnsi="Montserrat"/>
@@ -10150,7 +10168,7 @@
           <w:sz w:val="27"/>
         </w:rPr>
       </w:pPr>
-      <w:bookmarkStart w:id="20" w:name="_Toc240534295"/>
+      <w:bookmarkStart w:id="20" w:name="_Toc240546271"/>
       <w:r>
         <w:rPr>
           <w:rFonts w:ascii="Montserrat" w:hAnsi="Montserrat"/>
@@ -10327,7 +10345,7 @@
           <w:sz w:val="27"/>
         </w:rPr>
       </w:pPr>
-      <w:bookmarkStart w:id="21" w:name="_Toc240534296"/>
+      <w:bookmarkStart w:id="21" w:name="_Toc240546272"/>
       <w:r>
         <w:rPr>
           <w:rFonts w:ascii="Montserrat" w:hAnsi="Montserrat"/>
@@ -10441,7 +10459,7 @@
           <w:sz w:val="34"/>
         </w:rPr>
       </w:pPr>
-      <w:bookmarkStart w:id="22" w:name="_Toc240534297"/>
+      <w:bookmarkStart w:id="22" w:name="_Toc240546273"/>
       <w:r>
         <w:rPr>
           <w:rFonts w:ascii="Montserrat" w:hAnsi="Montserrat"/>
@@ -10483,7 +10501,7 @@
           <w:sz w:val="27"/>
         </w:rPr>
       </w:pPr>
-      <w:bookmarkStart w:id="23" w:name="_Toc240534298"/>
+      <w:bookmarkStart w:id="23" w:name="_Toc240546274"/>
       <w:r>
         <w:rPr>
           <w:rFonts w:ascii="Montserrat" w:hAnsi="Montserrat"/>
@@ -11563,16 +11581,16 @@
         </w:rPr>
         <w:lastRenderedPageBreak/>
         <w:drawing>
-          <wp:inline distT="0" distB="0" distL="0" distR="0" wp14:anchorId="03BA346E" wp14:editId="0E8DC0C6">
+          <wp:inline distT="0" distB="0" distL="0" distR="0" wp14:anchorId="11F49949" wp14:editId="031FF117">
             <wp:extent cx="5120640" cy="4627581"/>
             <wp:effectExtent l="19050" t="19050" r="22860" b="20955"/>
-            <wp:docPr id="138586684" name="Imagem 7"/>
+            <wp:docPr id="1487795486" name="Imagem 7"/>
             <wp:cNvGraphicFramePr/>
             <a:graphic xmlns:a="http://schemas.openxmlformats.org/drawingml/2006/main">
               <a:graphicData uri="http://schemas.openxmlformats.org/drawingml/2006/picture">
                 <pic:pic xmlns:pic="http://schemas.openxmlformats.org/drawingml/2006/picture">
                   <pic:nvPicPr>
-                    <pic:cNvPr id="138586684" name=""/>
+                    <pic:cNvPr id="1487795486" name=""/>
                     <pic:cNvPicPr/>
                   </pic:nvPicPr>
                   <pic:blipFill>
@@ -11640,16 +11658,16 @@
         </w:rPr>
         <w:lastRenderedPageBreak/>
         <w:drawing>
-          <wp:inline distT="0" distB="0" distL="0" distR="0" wp14:anchorId="27452FFA" wp14:editId="3B2A3652">
+          <wp:inline distT="0" distB="0" distL="0" distR="0" wp14:anchorId="4BAE089A" wp14:editId="7BF54E12">
             <wp:extent cx="5120640" cy="4627581"/>
             <wp:effectExtent l="19050" t="19050" r="22860" b="20955"/>
-            <wp:docPr id="1837242816" name="Imagem 8"/>
+            <wp:docPr id="957772476" name="Imagem 8"/>
             <wp:cNvGraphicFramePr/>
             <a:graphic xmlns:a="http://schemas.openxmlformats.org/drawingml/2006/main">
               <a:graphicData uri="http://schemas.openxmlformats.org/drawingml/2006/picture">
                 <pic:pic xmlns:pic="http://schemas.openxmlformats.org/drawingml/2006/picture">
                   <pic:nvPicPr>
-                    <pic:cNvPr id="1837242816" name=""/>
+                    <pic:cNvPr id="957772476" name=""/>
                     <pic:cNvPicPr/>
                   </pic:nvPicPr>
                   <pic:blipFill>
@@ -11857,7 +11875,7 @@
           <w:sz w:val="27"/>
         </w:rPr>
       </w:pPr>
-      <w:bookmarkStart w:id="24" w:name="_Toc240534299"/>
+      <w:bookmarkStart w:id="24" w:name="_Toc240546275"/>
       <w:r>
         <w:rPr>
           <w:rFonts w:ascii="Montserrat" w:hAnsi="Montserrat"/>
@@ -12782,16 +12800,16 @@
           <w:noProof/>
         </w:rPr>
         <w:drawing>
-          <wp:inline distT="0" distB="0" distL="0" distR="0" wp14:anchorId="19C4D872" wp14:editId="0F1E0624">
+          <wp:inline distT="0" distB="0" distL="0" distR="0" wp14:anchorId="6621E75F" wp14:editId="3C92042D">
             <wp:extent cx="5120640" cy="4627581"/>
             <wp:effectExtent l="19050" t="19050" r="22860" b="20955"/>
-            <wp:docPr id="1703843025" name="Imagem 9"/>
+            <wp:docPr id="923923928" name="Imagem 9"/>
             <wp:cNvGraphicFramePr/>
             <a:graphic xmlns:a="http://schemas.openxmlformats.org/drawingml/2006/main">
               <a:graphicData uri="http://schemas.openxmlformats.org/drawingml/2006/picture">
                 <pic:pic xmlns:pic="http://schemas.openxmlformats.org/drawingml/2006/picture">
                   <pic:nvPicPr>
-                    <pic:cNvPr id="1703843025" name=""/>
+                    <pic:cNvPr id="923923928" name=""/>
                     <pic:cNvPicPr/>
                   </pic:nvPicPr>
                   <pic:blipFill>
@@ -12859,16 +12877,16 @@
         </w:rPr>
         <w:lastRenderedPageBreak/>
         <w:drawing>
-          <wp:inline distT="0" distB="0" distL="0" distR="0" wp14:anchorId="2C30310E" wp14:editId="2BB9FFFE">
+          <wp:inline distT="0" distB="0" distL="0" distR="0" wp14:anchorId="7717F93B" wp14:editId="29BB50B9">
             <wp:extent cx="5120640" cy="4627581"/>
             <wp:effectExtent l="19050" t="19050" r="22860" b="20955"/>
-            <wp:docPr id="85640838" name="Imagem 10"/>
+            <wp:docPr id="580952051" name="Imagem 10"/>
             <wp:cNvGraphicFramePr/>
             <a:graphic xmlns:a="http://schemas.openxmlformats.org/drawingml/2006/main">
               <a:graphicData uri="http://schemas.openxmlformats.org/drawingml/2006/picture">
                 <pic:pic xmlns:pic="http://schemas.openxmlformats.org/drawingml/2006/picture">
                   <pic:nvPicPr>
-                    <pic:cNvPr id="85640838" name=""/>
+                    <pic:cNvPr id="580952051" name=""/>
                     <pic:cNvPicPr/>
                   </pic:nvPicPr>
                   <pic:blipFill>
@@ -13002,7 +13020,7 @@
           <w:sz w:val="27"/>
         </w:rPr>
       </w:pPr>
-      <w:bookmarkStart w:id="25" w:name="_Toc240534300"/>
+      <w:bookmarkStart w:id="25" w:name="_Toc240546276"/>
       <w:r>
         <w:rPr>
           <w:rFonts w:ascii="Montserrat" w:hAnsi="Montserrat"/>
@@ -14087,16 +14105,16 @@
         </w:rPr>
         <w:lastRenderedPageBreak/>
         <w:drawing>
-          <wp:inline distT="0" distB="0" distL="0" distR="0" wp14:anchorId="1A060880" wp14:editId="117249B8">
+          <wp:inline distT="0" distB="0" distL="0" distR="0" wp14:anchorId="64A77FF5" wp14:editId="26F6FECB">
             <wp:extent cx="5120640" cy="3338440"/>
             <wp:effectExtent l="19050" t="19050" r="22860" b="14605"/>
-            <wp:docPr id="1093642623" name="Imagem 11"/>
+            <wp:docPr id="1143300345" name="Imagem 11"/>
             <wp:cNvGraphicFramePr/>
             <a:graphic xmlns:a="http://schemas.openxmlformats.org/drawingml/2006/main">
               <a:graphicData uri="http://schemas.openxmlformats.org/drawingml/2006/picture">
                 <pic:pic xmlns:pic="http://schemas.openxmlformats.org/drawingml/2006/picture">
                   <pic:nvPicPr>
-                    <pic:cNvPr id="1093642623" name=""/>
+                    <pic:cNvPr id="1143300345" name=""/>
                     <pic:cNvPicPr/>
                   </pic:nvPicPr>
                   <pic:blipFill>
@@ -14164,16 +14182,16 @@
         </w:rPr>
         <w:lastRenderedPageBreak/>
         <w:drawing>
-          <wp:inline distT="0" distB="0" distL="0" distR="0" wp14:anchorId="4D0E6256" wp14:editId="432C64CE">
+          <wp:inline distT="0" distB="0" distL="0" distR="0" wp14:anchorId="02C891ED" wp14:editId="2FDDEBA1">
             <wp:extent cx="5120640" cy="4627581"/>
             <wp:effectExtent l="19050" t="19050" r="22860" b="20955"/>
-            <wp:docPr id="1735738453" name="Imagem 12"/>
+            <wp:docPr id="1593520326" name="Imagem 12"/>
             <wp:cNvGraphicFramePr/>
             <a:graphic xmlns:a="http://schemas.openxmlformats.org/drawingml/2006/main">
               <a:graphicData uri="http://schemas.openxmlformats.org/drawingml/2006/picture">
                 <pic:pic xmlns:pic="http://schemas.openxmlformats.org/drawingml/2006/picture">
                   <pic:nvPicPr>
-                    <pic:cNvPr id="1735738453" name=""/>
+                    <pic:cNvPr id="1593520326" name=""/>
                     <pic:cNvPicPr/>
                   </pic:nvPicPr>
                   <pic:blipFill>
@@ -14377,7 +14395,7 @@
           <w:sz w:val="27"/>
         </w:rPr>
       </w:pPr>
-      <w:bookmarkStart w:id="26" w:name="_Toc240534301"/>
+      <w:bookmarkStart w:id="26" w:name="_Toc240546277"/>
       <w:r>
         <w:rPr>
           <w:rFonts w:ascii="Montserrat" w:hAnsi="Montserrat"/>
@@ -14938,16 +14956,16 @@
           <w:noProof/>
         </w:rPr>
         <w:drawing>
-          <wp:inline distT="0" distB="0" distL="0" distR="0" wp14:anchorId="77851C41" wp14:editId="6384BD6E">
+          <wp:inline distT="0" distB="0" distL="0" distR="0" wp14:anchorId="64C60128" wp14:editId="03A0C32E">
             <wp:extent cx="5120640" cy="4627581"/>
             <wp:effectExtent l="19050" t="19050" r="22860" b="20955"/>
-            <wp:docPr id="1022771252" name="Imagem 13"/>
+            <wp:docPr id="835895128" name="Imagem 13"/>
             <wp:cNvGraphicFramePr/>
             <a:graphic xmlns:a="http://schemas.openxmlformats.org/drawingml/2006/main">
               <a:graphicData uri="http://schemas.openxmlformats.org/drawingml/2006/picture">
                 <pic:pic xmlns:pic="http://schemas.openxmlformats.org/drawingml/2006/picture">
                   <pic:nvPicPr>
-                    <pic:cNvPr id="1022771252" name=""/>
+                    <pic:cNvPr id="835895128" name=""/>
                     <pic:cNvPicPr/>
                   </pic:nvPicPr>
                   <pic:blipFill>
@@ -15015,16 +15033,16 @@
         </w:rPr>
         <w:lastRenderedPageBreak/>
         <w:drawing>
-          <wp:inline distT="0" distB="0" distL="0" distR="0" wp14:anchorId="70A09ABC" wp14:editId="2C3AC5E9">
+          <wp:inline distT="0" distB="0" distL="0" distR="0" wp14:anchorId="4BAF38B1" wp14:editId="0AF1ACEC">
             <wp:extent cx="5120640" cy="4627581"/>
             <wp:effectExtent l="19050" t="19050" r="22860" b="20955"/>
-            <wp:docPr id="734049158" name="Imagem 14"/>
+            <wp:docPr id="484676004" name="Imagem 14"/>
             <wp:cNvGraphicFramePr/>
             <a:graphic xmlns:a="http://schemas.openxmlformats.org/drawingml/2006/main">
               <a:graphicData uri="http://schemas.openxmlformats.org/drawingml/2006/picture">
                 <pic:pic xmlns:pic="http://schemas.openxmlformats.org/drawingml/2006/picture">
                   <pic:nvPicPr>
-                    <pic:cNvPr id="734049158" name=""/>
+                    <pic:cNvPr id="484676004" name=""/>
                     <pic:cNvPicPr/>
                   </pic:nvPicPr>
                   <pic:blipFill>
@@ -15365,7 +15383,7 @@
           <w:sz w:val="27"/>
         </w:rPr>
       </w:pPr>
-      <w:bookmarkStart w:id="27" w:name="_Toc240534302"/>
+      <w:bookmarkStart w:id="27" w:name="_Toc240546278"/>
       <w:r>
         <w:rPr>
           <w:rFonts w:ascii="Montserrat" w:hAnsi="Montserrat"/>
@@ -15405,16 +15423,16 @@
           <w:noProof/>
         </w:rPr>
         <w:drawing>
-          <wp:inline distT="0" distB="0" distL="0" distR="0" wp14:anchorId="3F2E5DAB" wp14:editId="5BFBC86F">
+          <wp:inline distT="0" distB="0" distL="0" distR="0" wp14:anchorId="51235413" wp14:editId="3CA26484">
             <wp:extent cx="5120640" cy="4627581"/>
             <wp:effectExtent l="19050" t="19050" r="22860" b="20955"/>
-            <wp:docPr id="614626995" name="Imagem 15"/>
+            <wp:docPr id="1352562710" name="Imagem 15"/>
             <wp:cNvGraphicFramePr/>
             <a:graphic xmlns:a="http://schemas.openxmlformats.org/drawingml/2006/main">
               <a:graphicData uri="http://schemas.openxmlformats.org/drawingml/2006/picture">
                 <pic:pic xmlns:pic="http://schemas.openxmlformats.org/drawingml/2006/picture">
                   <pic:nvPicPr>
-                    <pic:cNvPr id="614626995" name=""/>
+                    <pic:cNvPr id="1352562710" name=""/>
                     <pic:cNvPicPr/>
                   </pic:nvPicPr>
                   <pic:blipFill>
@@ -15482,16 +15500,16 @@
         </w:rPr>
         <w:lastRenderedPageBreak/>
         <w:drawing>
-          <wp:inline distT="0" distB="0" distL="0" distR="0" wp14:anchorId="7DE4C064" wp14:editId="6E277E70">
+          <wp:inline distT="0" distB="0" distL="0" distR="0" wp14:anchorId="08620D4A" wp14:editId="65AC64B8">
             <wp:extent cx="5120640" cy="4627581"/>
             <wp:effectExtent l="19050" t="19050" r="22860" b="20955"/>
-            <wp:docPr id="525679683" name="Imagem 16"/>
+            <wp:docPr id="380833007" name="Imagem 16"/>
             <wp:cNvGraphicFramePr/>
             <a:graphic xmlns:a="http://schemas.openxmlformats.org/drawingml/2006/main">
               <a:graphicData uri="http://schemas.openxmlformats.org/drawingml/2006/picture">
                 <pic:pic xmlns:pic="http://schemas.openxmlformats.org/drawingml/2006/picture">
                   <pic:nvPicPr>
-                    <pic:cNvPr id="525679683" name=""/>
+                    <pic:cNvPr id="380833007" name=""/>
                     <pic:cNvPicPr/>
                   </pic:nvPicPr>
                   <pic:blipFill>
@@ -15655,16 +15673,16 @@
         </w:rPr>
         <w:lastRenderedPageBreak/>
         <w:drawing>
-          <wp:inline distT="0" distB="0" distL="0" distR="0" wp14:anchorId="4359188A" wp14:editId="382E125D">
+          <wp:inline distT="0" distB="0" distL="0" distR="0" wp14:anchorId="7473A7B4" wp14:editId="3A2B39C1">
             <wp:extent cx="5120640" cy="3282818"/>
             <wp:effectExtent l="19050" t="19050" r="22860" b="13335"/>
-            <wp:docPr id="164350851" name="Imagem 17"/>
+            <wp:docPr id="1451665836" name="Imagem 17"/>
             <wp:cNvGraphicFramePr/>
             <a:graphic xmlns:a="http://schemas.openxmlformats.org/drawingml/2006/main">
               <a:graphicData uri="http://schemas.openxmlformats.org/drawingml/2006/picture">
                 <pic:pic xmlns:pic="http://schemas.openxmlformats.org/drawingml/2006/picture">
                   <pic:nvPicPr>
-                    <pic:cNvPr id="164350851" name=""/>
+                    <pic:cNvPr id="1451665836" name=""/>
                     <pic:cNvPicPr/>
                   </pic:nvPicPr>
                   <pic:blipFill>
@@ -15855,7 +15873,7 @@
           <w:sz w:val="27"/>
         </w:rPr>
       </w:pPr>
-      <w:bookmarkStart w:id="28" w:name="_Toc240534303"/>
+      <w:bookmarkStart w:id="28" w:name="_Toc240546279"/>
       <w:r>
         <w:rPr>
           <w:rFonts w:ascii="Montserrat" w:hAnsi="Montserrat"/>
@@ -15895,16 +15913,16 @@
           <w:noProof/>
         </w:rPr>
         <w:drawing>
-          <wp:inline distT="0" distB="0" distL="0" distR="0" wp14:anchorId="4D99ABB3" wp14:editId="1B36AAC7">
+          <wp:inline distT="0" distB="0" distL="0" distR="0" wp14:anchorId="7BCB1728" wp14:editId="72EBAA9C">
             <wp:extent cx="5120640" cy="4627581"/>
             <wp:effectExtent l="19050" t="19050" r="22860" b="20955"/>
-            <wp:docPr id="946431405" name="Imagem 18"/>
+            <wp:docPr id="450778131" name="Imagem 18"/>
             <wp:cNvGraphicFramePr/>
             <a:graphic xmlns:a="http://schemas.openxmlformats.org/drawingml/2006/main">
               <a:graphicData uri="http://schemas.openxmlformats.org/drawingml/2006/picture">
                 <pic:pic xmlns:pic="http://schemas.openxmlformats.org/drawingml/2006/picture">
                   <pic:nvPicPr>
-                    <pic:cNvPr id="946431405" name=""/>
+                    <pic:cNvPr id="450778131" name=""/>
                     <pic:cNvPicPr/>
                   </pic:nvPicPr>
                   <pic:blipFill>
@@ -15972,16 +15990,16 @@
         </w:rPr>
         <w:lastRenderedPageBreak/>
         <w:drawing>
-          <wp:inline distT="0" distB="0" distL="0" distR="0" wp14:anchorId="133F9092" wp14:editId="5079B29D">
+          <wp:inline distT="0" distB="0" distL="0" distR="0" wp14:anchorId="731499A5" wp14:editId="59FF85DD">
             <wp:extent cx="5120640" cy="4627581"/>
             <wp:effectExtent l="19050" t="19050" r="22860" b="20955"/>
-            <wp:docPr id="2050065198" name="Imagem 19"/>
+            <wp:docPr id="2087870827" name="Imagem 19"/>
             <wp:cNvGraphicFramePr/>
             <a:graphic xmlns:a="http://schemas.openxmlformats.org/drawingml/2006/main">
               <a:graphicData uri="http://schemas.openxmlformats.org/drawingml/2006/picture">
                 <pic:pic xmlns:pic="http://schemas.openxmlformats.org/drawingml/2006/picture">
                   <pic:nvPicPr>
-                    <pic:cNvPr id="2050065198" name=""/>
+                    <pic:cNvPr id="2087870827" name=""/>
                     <pic:cNvPicPr/>
                   </pic:nvPicPr>
                   <pic:blipFill>
@@ -16164,7 +16182,7 @@
           <w:sz w:val="27"/>
         </w:rPr>
       </w:pPr>
-      <w:bookmarkStart w:id="29" w:name="_Toc240534304"/>
+      <w:bookmarkStart w:id="29" w:name="_Toc240546280"/>
       <w:r>
         <w:rPr>
           <w:rFonts w:ascii="Montserrat" w:hAnsi="Montserrat"/>
@@ -16204,16 +16222,16 @@
           <w:noProof/>
         </w:rPr>
         <w:drawing>
-          <wp:inline distT="0" distB="0" distL="0" distR="0" wp14:anchorId="33642435" wp14:editId="6E67BA72">
+          <wp:inline distT="0" distB="0" distL="0" distR="0" wp14:anchorId="2AF76B0E" wp14:editId="2323AC3D">
             <wp:extent cx="5120640" cy="4627581"/>
             <wp:effectExtent l="19050" t="19050" r="22860" b="20955"/>
-            <wp:docPr id="192852124" name="Imagem 20"/>
+            <wp:docPr id="1998503427" name="Imagem 20"/>
             <wp:cNvGraphicFramePr/>
             <a:graphic xmlns:a="http://schemas.openxmlformats.org/drawingml/2006/main">
               <a:graphicData uri="http://schemas.openxmlformats.org/drawingml/2006/picture">
                 <pic:pic xmlns:pic="http://schemas.openxmlformats.org/drawingml/2006/picture">
                   <pic:nvPicPr>
-                    <pic:cNvPr id="192852124" name=""/>
+                    <pic:cNvPr id="1998503427" name=""/>
                     <pic:cNvPicPr/>
                   </pic:nvPicPr>
                   <pic:blipFill>
@@ -16281,16 +16299,16 @@
         </w:rPr>
         <w:lastRenderedPageBreak/>
         <w:drawing>
-          <wp:inline distT="0" distB="0" distL="0" distR="0" wp14:anchorId="55A52552" wp14:editId="33FB16FF">
+          <wp:inline distT="0" distB="0" distL="0" distR="0" wp14:anchorId="531BB58B" wp14:editId="1C629C13">
             <wp:extent cx="5120640" cy="4627581"/>
             <wp:effectExtent l="19050" t="19050" r="22860" b="20955"/>
-            <wp:docPr id="1916819492" name="Imagem 21"/>
+            <wp:docPr id="1584854364" name="Imagem 21"/>
             <wp:cNvGraphicFramePr/>
             <a:graphic xmlns:a="http://schemas.openxmlformats.org/drawingml/2006/main">
               <a:graphicData uri="http://schemas.openxmlformats.org/drawingml/2006/picture">
                 <pic:pic xmlns:pic="http://schemas.openxmlformats.org/drawingml/2006/picture">
                   <pic:nvPicPr>
-                    <pic:cNvPr id="1916819492" name=""/>
+                    <pic:cNvPr id="1584854364" name=""/>
                     <pic:cNvPicPr/>
                   </pic:nvPicPr>
                   <pic:blipFill>
@@ -16496,16 +16514,16 @@
           <w:noProof/>
         </w:rPr>
         <w:drawing>
-          <wp:inline distT="0" distB="0" distL="0" distR="0" wp14:anchorId="3E3B8EB9" wp14:editId="7203813C">
+          <wp:inline distT="0" distB="0" distL="0" distR="0" wp14:anchorId="5DF38313" wp14:editId="0BAD8051">
             <wp:extent cx="5120640" cy="1757287"/>
             <wp:effectExtent l="19050" t="19050" r="22860" b="14605"/>
-            <wp:docPr id="1175019115" name="Imagem 22"/>
+            <wp:docPr id="1339854765" name="Imagem 22"/>
             <wp:cNvGraphicFramePr/>
             <a:graphic xmlns:a="http://schemas.openxmlformats.org/drawingml/2006/main">
               <a:graphicData uri="http://schemas.openxmlformats.org/drawingml/2006/picture">
                 <pic:pic xmlns:pic="http://schemas.openxmlformats.org/drawingml/2006/picture">
                   <pic:nvPicPr>
-                    <pic:cNvPr id="1175019115" name=""/>
+                    <pic:cNvPr id="1339854765" name=""/>
                     <pic:cNvPicPr/>
                   </pic:nvPicPr>
                   <pic:blipFill>
@@ -16618,7 +16636,7 @@
           <w:sz w:val="27"/>
         </w:rPr>
       </w:pPr>
-      <w:bookmarkStart w:id="30" w:name="_Toc240534305"/>
+      <w:bookmarkStart w:id="30" w:name="_Toc240546281"/>
       <w:r>
         <w:rPr>
           <w:rFonts w:ascii="Montserrat" w:hAnsi="Montserrat"/>
@@ -16659,16 +16677,16 @@
         </w:rPr>
         <w:lastRenderedPageBreak/>
         <w:drawing>
-          <wp:inline distT="0" distB="0" distL="0" distR="0" wp14:anchorId="533C3A4A" wp14:editId="4280A35F">
+          <wp:inline distT="0" distB="0" distL="0" distR="0" wp14:anchorId="607A62BD" wp14:editId="1AC814FB">
             <wp:extent cx="5120640" cy="4627581"/>
             <wp:effectExtent l="19050" t="19050" r="22860" b="20955"/>
-            <wp:docPr id="872600612" name="Imagem 23"/>
+            <wp:docPr id="1940978289" name="Imagem 23"/>
             <wp:cNvGraphicFramePr/>
             <a:graphic xmlns:a="http://schemas.openxmlformats.org/drawingml/2006/main">
               <a:graphicData uri="http://schemas.openxmlformats.org/drawingml/2006/picture">
                 <pic:pic xmlns:pic="http://schemas.openxmlformats.org/drawingml/2006/picture">
                   <pic:nvPicPr>
-                    <pic:cNvPr id="872600612" name=""/>
+                    <pic:cNvPr id="1940978289" name=""/>
                     <pic:cNvPicPr/>
                   </pic:nvPicPr>
                   <pic:blipFill>
@@ -16736,16 +16754,16 @@
         </w:rPr>
         <w:lastRenderedPageBreak/>
         <w:drawing>
-          <wp:inline distT="0" distB="0" distL="0" distR="0" wp14:anchorId="36A76425" wp14:editId="224738A9">
+          <wp:inline distT="0" distB="0" distL="0" distR="0" wp14:anchorId="2DC1E021" wp14:editId="1384061C">
             <wp:extent cx="5120640" cy="4627581"/>
             <wp:effectExtent l="19050" t="19050" r="22860" b="20955"/>
-            <wp:docPr id="1482220367" name="Imagem 24"/>
+            <wp:docPr id="1411679356" name="Imagem 24"/>
             <wp:cNvGraphicFramePr/>
             <a:graphic xmlns:a="http://schemas.openxmlformats.org/drawingml/2006/main">
               <a:graphicData uri="http://schemas.openxmlformats.org/drawingml/2006/picture">
                 <pic:pic xmlns:pic="http://schemas.openxmlformats.org/drawingml/2006/picture">
                   <pic:nvPicPr>
-                    <pic:cNvPr id="1482220367" name=""/>
+                    <pic:cNvPr id="1411679356" name=""/>
                     <pic:cNvPicPr/>
                   </pic:nvPicPr>
                   <pic:blipFill>
@@ -16982,7 +17000,7 @@
           <w:sz w:val="27"/>
         </w:rPr>
       </w:pPr>
-      <w:bookmarkStart w:id="31" w:name="_Toc240534306"/>
+      <w:bookmarkStart w:id="31" w:name="_Toc240546282"/>
       <w:r>
         <w:rPr>
           <w:rFonts w:ascii="Montserrat" w:hAnsi="Montserrat"/>
@@ -17022,16 +17040,16 @@
           <w:noProof/>
         </w:rPr>
         <w:drawing>
-          <wp:inline distT="0" distB="0" distL="0" distR="0" wp14:anchorId="2E415F60" wp14:editId="18E5F699">
+          <wp:inline distT="0" distB="0" distL="0" distR="0" wp14:anchorId="2487C0EA" wp14:editId="20B43A65">
             <wp:extent cx="5120640" cy="4627581"/>
             <wp:effectExtent l="19050" t="19050" r="22860" b="20955"/>
-            <wp:docPr id="1270955327" name="Imagem 25"/>
+            <wp:docPr id="2009263202" name="Imagem 25"/>
             <wp:cNvGraphicFramePr/>
             <a:graphic xmlns:a="http://schemas.openxmlformats.org/drawingml/2006/main">
               <a:graphicData uri="http://schemas.openxmlformats.org/drawingml/2006/picture">
                 <pic:pic xmlns:pic="http://schemas.openxmlformats.org/drawingml/2006/picture">
                   <pic:nvPicPr>
-                    <pic:cNvPr id="1270955327" name=""/>
+                    <pic:cNvPr id="2009263202" name=""/>
                     <pic:cNvPicPr/>
                   </pic:nvPicPr>
                   <pic:blipFill>
@@ -17099,16 +17117,16 @@
         </w:rPr>
         <w:lastRenderedPageBreak/>
         <w:drawing>
-          <wp:inline distT="0" distB="0" distL="0" distR="0" wp14:anchorId="1B891C7D" wp14:editId="37A42F32">
+          <wp:inline distT="0" distB="0" distL="0" distR="0" wp14:anchorId="1813B1A2" wp14:editId="0A82891D">
             <wp:extent cx="5120640" cy="4627581"/>
             <wp:effectExtent l="19050" t="19050" r="22860" b="20955"/>
-            <wp:docPr id="2006229292" name="Imagem 26"/>
+            <wp:docPr id="1688474738" name="Imagem 26"/>
             <wp:cNvGraphicFramePr/>
             <a:graphic xmlns:a="http://schemas.openxmlformats.org/drawingml/2006/main">
               <a:graphicData uri="http://schemas.openxmlformats.org/drawingml/2006/picture">
                 <pic:pic xmlns:pic="http://schemas.openxmlformats.org/drawingml/2006/picture">
                   <pic:nvPicPr>
-                    <pic:cNvPr id="2006229292" name=""/>
+                    <pic:cNvPr id="1688474738" name=""/>
                     <pic:cNvPicPr/>
                   </pic:nvPicPr>
                   <pic:blipFill>
@@ -17299,7 +17317,7 @@
           <w:sz w:val="27"/>
         </w:rPr>
       </w:pPr>
-      <w:bookmarkStart w:id="32" w:name="_Toc240534307"/>
+      <w:bookmarkStart w:id="32" w:name="_Toc240546283"/>
       <w:r>
         <w:rPr>
           <w:rFonts w:ascii="Montserrat" w:hAnsi="Montserrat"/>
@@ -17339,16 +17357,16 @@
           <w:noProof/>
         </w:rPr>
         <w:drawing>
-          <wp:inline distT="0" distB="0" distL="0" distR="0" wp14:anchorId="5D8DB311" wp14:editId="3892E0FF">
+          <wp:inline distT="0" distB="0" distL="0" distR="0" wp14:anchorId="5A5F1247" wp14:editId="7831FEF9">
             <wp:extent cx="5120640" cy="4000682"/>
             <wp:effectExtent l="19050" t="19050" r="22860" b="19050"/>
-            <wp:docPr id="995745418" name="Imagem 27"/>
+            <wp:docPr id="1740070382" name="Imagem 27"/>
             <wp:cNvGraphicFramePr/>
             <a:graphic xmlns:a="http://schemas.openxmlformats.org/drawingml/2006/main">
               <a:graphicData uri="http://schemas.openxmlformats.org/drawingml/2006/picture">
                 <pic:pic xmlns:pic="http://schemas.openxmlformats.org/drawingml/2006/picture">
                   <pic:nvPicPr>
-                    <pic:cNvPr id="995745418" name=""/>
+                    <pic:cNvPr id="1740070382" name=""/>
                     <pic:cNvPicPr/>
                   </pic:nvPicPr>
                   <pic:blipFill>
@@ -17872,7 +17890,7 @@
           <w:sz w:val="34"/>
         </w:rPr>
       </w:pPr>
-      <w:bookmarkStart w:id="33" w:name="_Toc240534308"/>
+      <w:bookmarkStart w:id="33" w:name="_Toc240546284"/>
       <w:r>
         <w:rPr>
           <w:rFonts w:ascii="Montserrat" w:hAnsi="Montserrat"/>
@@ -17914,7 +17932,7 @@
           <w:sz w:val="27"/>
         </w:rPr>
       </w:pPr>
-      <w:bookmarkStart w:id="34" w:name="_Toc240534309"/>
+      <w:bookmarkStart w:id="34" w:name="_Toc240546285"/>
       <w:r>
         <w:rPr>
           <w:rFonts w:ascii="Montserrat" w:hAnsi="Montserrat"/>
@@ -17954,16 +17972,16 @@
           <w:noProof/>
         </w:rPr>
         <w:drawing>
-          <wp:inline distT="0" distB="0" distL="0" distR="0" wp14:anchorId="2ED5C115" wp14:editId="674D0A6B">
+          <wp:inline distT="0" distB="0" distL="0" distR="0" wp14:anchorId="2F533458" wp14:editId="7ADFAAEF">
             <wp:extent cx="5120640" cy="4627581"/>
             <wp:effectExtent l="19050" t="19050" r="22860" b="20955"/>
-            <wp:docPr id="752101963" name="Imagem 28"/>
+            <wp:docPr id="1610380136" name="Imagem 28"/>
             <wp:cNvGraphicFramePr/>
             <a:graphic xmlns:a="http://schemas.openxmlformats.org/drawingml/2006/main">
               <a:graphicData uri="http://schemas.openxmlformats.org/drawingml/2006/picture">
                 <pic:pic xmlns:pic="http://schemas.openxmlformats.org/drawingml/2006/picture">
                   <pic:nvPicPr>
-                    <pic:cNvPr id="752101963" name=""/>
+                    <pic:cNvPr id="1610380136" name=""/>
                     <pic:cNvPicPr/>
                   </pic:nvPicPr>
                   <pic:blipFill>
@@ -18031,16 +18049,16 @@
         </w:rPr>
         <w:lastRenderedPageBreak/>
         <w:drawing>
-          <wp:inline distT="0" distB="0" distL="0" distR="0" wp14:anchorId="2F58D419" wp14:editId="67ECF7AE">
+          <wp:inline distT="0" distB="0" distL="0" distR="0" wp14:anchorId="7CB0D4E2" wp14:editId="2568655F">
             <wp:extent cx="5120640" cy="4627581"/>
             <wp:effectExtent l="19050" t="19050" r="22860" b="20955"/>
-            <wp:docPr id="582199895" name="Imagem 29"/>
+            <wp:docPr id="288966843" name="Imagem 29"/>
             <wp:cNvGraphicFramePr/>
             <a:graphic xmlns:a="http://schemas.openxmlformats.org/drawingml/2006/main">
               <a:graphicData uri="http://schemas.openxmlformats.org/drawingml/2006/picture">
                 <pic:pic xmlns:pic="http://schemas.openxmlformats.org/drawingml/2006/picture">
                   <pic:nvPicPr>
-                    <pic:cNvPr id="582199895" name=""/>
+                    <pic:cNvPr id="288966843" name=""/>
                     <pic:cNvPicPr/>
                   </pic:nvPicPr>
                   <pic:blipFill>
@@ -18108,16 +18126,16 @@
         </w:rPr>
         <w:lastRenderedPageBreak/>
         <w:drawing>
-          <wp:inline distT="0" distB="0" distL="0" distR="0" wp14:anchorId="382DFC04" wp14:editId="492D25D5">
+          <wp:inline distT="0" distB="0" distL="0" distR="0" wp14:anchorId="77D4252B" wp14:editId="40607615">
             <wp:extent cx="5120640" cy="4627581"/>
             <wp:effectExtent l="19050" t="19050" r="22860" b="20955"/>
-            <wp:docPr id="1516417993" name="Imagem 30"/>
+            <wp:docPr id="2060772771" name="Imagem 30"/>
             <wp:cNvGraphicFramePr/>
             <a:graphic xmlns:a="http://schemas.openxmlformats.org/drawingml/2006/main">
               <a:graphicData uri="http://schemas.openxmlformats.org/drawingml/2006/picture">
                 <pic:pic xmlns:pic="http://schemas.openxmlformats.org/drawingml/2006/picture">
                   <pic:nvPicPr>
-                    <pic:cNvPr id="1516417993" name=""/>
+                    <pic:cNvPr id="2060772771" name=""/>
                     <pic:cNvPicPr/>
                   </pic:nvPicPr>
                   <pic:blipFill>
@@ -18319,16 +18337,16 @@
           <w:noProof/>
         </w:rPr>
         <w:drawing>
-          <wp:inline distT="0" distB="0" distL="0" distR="0" wp14:anchorId="2508F8E4" wp14:editId="0C6580B0">
+          <wp:inline distT="0" distB="0" distL="0" distR="0" wp14:anchorId="2FF5C93B" wp14:editId="2B9DB830">
             <wp:extent cx="5120640" cy="1715571"/>
             <wp:effectExtent l="19050" t="19050" r="22860" b="18415"/>
-            <wp:docPr id="89472656" name="Imagem 31"/>
+            <wp:docPr id="443173729" name="Imagem 31"/>
             <wp:cNvGraphicFramePr/>
             <a:graphic xmlns:a="http://schemas.openxmlformats.org/drawingml/2006/main">
               <a:graphicData uri="http://schemas.openxmlformats.org/drawingml/2006/picture">
                 <pic:pic xmlns:pic="http://schemas.openxmlformats.org/drawingml/2006/picture">
                   <pic:nvPicPr>
-                    <pic:cNvPr id="89472656" name=""/>
+                    <pic:cNvPr id="443173729" name=""/>
                     <pic:cNvPicPr/>
                   </pic:nvPicPr>
                   <pic:blipFill>
@@ -18465,16 +18483,16 @@
           <w:noProof/>
         </w:rPr>
         <w:drawing>
-          <wp:inline distT="0" distB="0" distL="0" distR="0" wp14:anchorId="3CF88D3A" wp14:editId="717A0B0A">
+          <wp:inline distT="0" distB="0" distL="0" distR="0" wp14:anchorId="5AE45FB1" wp14:editId="069C40F5">
             <wp:extent cx="5120640" cy="3282818"/>
             <wp:effectExtent l="19050" t="19050" r="22860" b="13335"/>
-            <wp:docPr id="95148903" name="Imagem 32"/>
+            <wp:docPr id="2098838164" name="Imagem 32"/>
             <wp:cNvGraphicFramePr/>
             <a:graphic xmlns:a="http://schemas.openxmlformats.org/drawingml/2006/main">
               <a:graphicData uri="http://schemas.openxmlformats.org/drawingml/2006/picture">
                 <pic:pic xmlns:pic="http://schemas.openxmlformats.org/drawingml/2006/picture">
                   <pic:nvPicPr>
-                    <pic:cNvPr id="95148903" name=""/>
+                    <pic:cNvPr id="2098838164" name=""/>
                     <pic:cNvPicPr/>
                   </pic:nvPicPr>
                   <pic:blipFill>
@@ -18608,16 +18626,16 @@
           <w:noProof/>
         </w:rPr>
         <w:drawing>
-          <wp:inline distT="0" distB="0" distL="0" distR="0" wp14:anchorId="20F0B888" wp14:editId="0D3332AB">
+          <wp:inline distT="0" distB="0" distL="0" distR="0" wp14:anchorId="2EAF2BAD" wp14:editId="2F848C6B">
             <wp:extent cx="5120640" cy="951357"/>
             <wp:effectExtent l="19050" t="19050" r="22860" b="20320"/>
-            <wp:docPr id="1588785654" name="Imagem 33"/>
+            <wp:docPr id="871846251" name="Imagem 33"/>
             <wp:cNvGraphicFramePr/>
             <a:graphic xmlns:a="http://schemas.openxmlformats.org/drawingml/2006/main">
               <a:graphicData uri="http://schemas.openxmlformats.org/drawingml/2006/picture">
                 <pic:pic xmlns:pic="http://schemas.openxmlformats.org/drawingml/2006/picture">
                   <pic:nvPicPr>
-                    <pic:cNvPr id="1588785654" name=""/>
+                    <pic:cNvPr id="871846251" name=""/>
                     <pic:cNvPicPr/>
                   </pic:nvPicPr>
                   <pic:blipFill>
@@ -18781,16 +18799,16 @@
           <w:noProof/>
         </w:rPr>
         <w:drawing>
-          <wp:inline distT="0" distB="0" distL="0" distR="0" wp14:anchorId="4776ADCA" wp14:editId="532B1925">
+          <wp:inline distT="0" distB="0" distL="0" distR="0" wp14:anchorId="0C64C23A" wp14:editId="4826962B">
             <wp:extent cx="5120640" cy="1515102"/>
             <wp:effectExtent l="19050" t="19050" r="22860" b="28575"/>
-            <wp:docPr id="1435944463" name="Imagem 34"/>
+            <wp:docPr id="1818792455" name="Imagem 34"/>
             <wp:cNvGraphicFramePr/>
             <a:graphic xmlns:a="http://schemas.openxmlformats.org/drawingml/2006/main">
               <a:graphicData uri="http://schemas.openxmlformats.org/drawingml/2006/picture">
                 <pic:pic xmlns:pic="http://schemas.openxmlformats.org/drawingml/2006/picture">
                   <pic:nvPicPr>
-                    <pic:cNvPr id="1435944463" name=""/>
+                    <pic:cNvPr id="1818792455" name=""/>
                     <pic:cNvPicPr/>
                   </pic:nvPicPr>
                   <pic:blipFill>
@@ -18902,16 +18920,16 @@
           <w:noProof/>
         </w:rPr>
         <w:drawing>
-          <wp:inline distT="0" distB="0" distL="0" distR="0" wp14:anchorId="7A8E11D3" wp14:editId="104CAB87">
+          <wp:inline distT="0" distB="0" distL="0" distR="0" wp14:anchorId="25C0EC56" wp14:editId="76A3BA77">
             <wp:extent cx="5120640" cy="1391113"/>
             <wp:effectExtent l="19050" t="19050" r="22860" b="19050"/>
-            <wp:docPr id="573801576" name="Imagem 35"/>
+            <wp:docPr id="1908932749" name="Imagem 35"/>
             <wp:cNvGraphicFramePr/>
             <a:graphic xmlns:a="http://schemas.openxmlformats.org/drawingml/2006/main">
               <a:graphicData uri="http://schemas.openxmlformats.org/drawingml/2006/picture">
                 <pic:pic xmlns:pic="http://schemas.openxmlformats.org/drawingml/2006/picture">
                   <pic:nvPicPr>
-                    <pic:cNvPr id="573801576" name=""/>
+                    <pic:cNvPr id="1908932749" name=""/>
                     <pic:cNvPicPr/>
                   </pic:nvPicPr>
                   <pic:blipFill>
@@ -19033,16 +19051,16 @@
           <w:noProof/>
         </w:rPr>
         <w:drawing>
-          <wp:inline distT="0" distB="0" distL="0" distR="0" wp14:anchorId="4D8AD5C6" wp14:editId="5800068E">
+          <wp:inline distT="0" distB="0" distL="0" distR="0" wp14:anchorId="0BBBBE99" wp14:editId="767B42C1">
             <wp:extent cx="5120640" cy="1125174"/>
             <wp:effectExtent l="19050" t="19050" r="22860" b="18415"/>
-            <wp:docPr id="1398047487" name="Imagem 36"/>
+            <wp:docPr id="2041216721" name="Imagem 36"/>
             <wp:cNvGraphicFramePr/>
             <a:graphic xmlns:a="http://schemas.openxmlformats.org/drawingml/2006/main">
               <a:graphicData uri="http://schemas.openxmlformats.org/drawingml/2006/picture">
                 <pic:pic xmlns:pic="http://schemas.openxmlformats.org/drawingml/2006/picture">
                   <pic:nvPicPr>
-                    <pic:cNvPr id="1398047487" name=""/>
+                    <pic:cNvPr id="2041216721" name=""/>
                     <pic:cNvPicPr/>
                   </pic:nvPicPr>
                   <pic:blipFill>
@@ -19131,7 +19149,7 @@
           <w:sz w:val="27"/>
         </w:rPr>
       </w:pPr>
-      <w:bookmarkStart w:id="35" w:name="_Toc240534310"/>
+      <w:bookmarkStart w:id="35" w:name="_Toc240546286"/>
       <w:r>
         <w:rPr>
           <w:rFonts w:ascii="Montserrat" w:hAnsi="Montserrat"/>
@@ -19172,16 +19190,16 @@
         </w:rPr>
         <w:lastRenderedPageBreak/>
         <w:drawing>
-          <wp:inline distT="0" distB="0" distL="0" distR="0" wp14:anchorId="377C3F36" wp14:editId="7D66617E">
+          <wp:inline distT="0" distB="0" distL="0" distR="0" wp14:anchorId="2851516E" wp14:editId="576568D3">
             <wp:extent cx="5120640" cy="4627581"/>
             <wp:effectExtent l="19050" t="19050" r="22860" b="20955"/>
-            <wp:docPr id="77055237" name="Imagem 37"/>
+            <wp:docPr id="1663824948" name="Imagem 37"/>
             <wp:cNvGraphicFramePr/>
             <a:graphic xmlns:a="http://schemas.openxmlformats.org/drawingml/2006/main">
               <a:graphicData uri="http://schemas.openxmlformats.org/drawingml/2006/picture">
                 <pic:pic xmlns:pic="http://schemas.openxmlformats.org/drawingml/2006/picture">
                   <pic:nvPicPr>
-                    <pic:cNvPr id="77055237" name=""/>
+                    <pic:cNvPr id="1663824948" name=""/>
                     <pic:cNvPicPr/>
                   </pic:nvPicPr>
                   <pic:blipFill>
@@ -19249,16 +19267,16 @@
         </w:rPr>
         <w:lastRenderedPageBreak/>
         <w:drawing>
-          <wp:inline distT="0" distB="0" distL="0" distR="0" wp14:anchorId="13F2ACD8" wp14:editId="6CC05DF4">
+          <wp:inline distT="0" distB="0" distL="0" distR="0" wp14:anchorId="2EAF2FE8" wp14:editId="0B8F78A7">
             <wp:extent cx="5120640" cy="4627581"/>
             <wp:effectExtent l="19050" t="19050" r="22860" b="20955"/>
-            <wp:docPr id="1677663333" name="Imagem 38"/>
+            <wp:docPr id="1504627216" name="Imagem 38"/>
             <wp:cNvGraphicFramePr/>
             <a:graphic xmlns:a="http://schemas.openxmlformats.org/drawingml/2006/main">
               <a:graphicData uri="http://schemas.openxmlformats.org/drawingml/2006/picture">
                 <pic:pic xmlns:pic="http://schemas.openxmlformats.org/drawingml/2006/picture">
                   <pic:nvPicPr>
-                    <pic:cNvPr id="1677663333" name=""/>
+                    <pic:cNvPr id="1504627216" name=""/>
                     <pic:cNvPicPr/>
                   </pic:nvPicPr>
                   <pic:blipFill>
@@ -19427,16 +19445,16 @@
           <w:noProof/>
         </w:rPr>
         <w:drawing>
-          <wp:inline distT="0" distB="0" distL="0" distR="0" wp14:anchorId="7AD95F81" wp14:editId="748A4BED">
+          <wp:inline distT="0" distB="0" distL="0" distR="0" wp14:anchorId="1036A542" wp14:editId="196ADF9C">
             <wp:extent cx="5120640" cy="2144319"/>
             <wp:effectExtent l="19050" t="19050" r="22860" b="27940"/>
-            <wp:docPr id="73399281" name="Imagem 39"/>
+            <wp:docPr id="1679230096" name="Imagem 39"/>
             <wp:cNvGraphicFramePr/>
             <a:graphic xmlns:a="http://schemas.openxmlformats.org/drawingml/2006/main">
               <a:graphicData uri="http://schemas.openxmlformats.org/drawingml/2006/picture">
                 <pic:pic xmlns:pic="http://schemas.openxmlformats.org/drawingml/2006/picture">
                   <pic:nvPicPr>
-                    <pic:cNvPr id="73399281" name=""/>
+                    <pic:cNvPr id="1679230096" name=""/>
                     <pic:cNvPicPr/>
                   </pic:nvPicPr>
                   <pic:blipFill>
@@ -19524,16 +19542,16 @@
           <w:noProof/>
         </w:rPr>
         <w:drawing>
-          <wp:inline distT="0" distB="0" distL="0" distR="0" wp14:anchorId="156BB43D" wp14:editId="62E6C4C5">
+          <wp:inline distT="0" distB="0" distL="0" distR="0" wp14:anchorId="0F40C386" wp14:editId="62ACA5A4">
             <wp:extent cx="5120640" cy="1055647"/>
             <wp:effectExtent l="19050" t="19050" r="22860" b="11430"/>
-            <wp:docPr id="203865889" name="Imagem 40"/>
+            <wp:docPr id="472810088" name="Imagem 40"/>
             <wp:cNvGraphicFramePr/>
             <a:graphic xmlns:a="http://schemas.openxmlformats.org/drawingml/2006/main">
               <a:graphicData uri="http://schemas.openxmlformats.org/drawingml/2006/picture">
                 <pic:pic xmlns:pic="http://schemas.openxmlformats.org/drawingml/2006/picture">
                   <pic:nvPicPr>
-                    <pic:cNvPr id="203865889" name=""/>
+                    <pic:cNvPr id="472810088" name=""/>
                     <pic:cNvPicPr/>
                   </pic:nvPicPr>
                   <pic:blipFill>
@@ -19655,16 +19673,16 @@
           <w:noProof/>
         </w:rPr>
         <w:drawing>
-          <wp:inline distT="0" distB="0" distL="0" distR="0" wp14:anchorId="6FDCCC32" wp14:editId="185CDA0D">
+          <wp:inline distT="0" distB="0" distL="0" distR="0" wp14:anchorId="0AC57C10" wp14:editId="6E360E62">
             <wp:extent cx="5120640" cy="3282818"/>
             <wp:effectExtent l="19050" t="19050" r="22860" b="13335"/>
-            <wp:docPr id="424371653" name="Imagem 41"/>
+            <wp:docPr id="4317050" name="Imagem 41"/>
             <wp:cNvGraphicFramePr/>
             <a:graphic xmlns:a="http://schemas.openxmlformats.org/drawingml/2006/main">
               <a:graphicData uri="http://schemas.openxmlformats.org/drawingml/2006/picture">
                 <pic:pic xmlns:pic="http://schemas.openxmlformats.org/drawingml/2006/picture">
                   <pic:nvPicPr>
-                    <pic:cNvPr id="424371653" name=""/>
+                    <pic:cNvPr id="4317050" name=""/>
                     <pic:cNvPicPr/>
                   </pic:nvPicPr>
                   <pic:blipFill>
@@ -19798,16 +19816,16 @@
         </w:rPr>
         <w:lastRenderedPageBreak/>
         <w:drawing>
-          <wp:inline distT="0" distB="0" distL="0" distR="0" wp14:anchorId="2F818899" wp14:editId="5B62383E">
+          <wp:inline distT="0" distB="0" distL="0" distR="0" wp14:anchorId="23944119" wp14:editId="6EE764B6">
             <wp:extent cx="5120640" cy="1978034"/>
             <wp:effectExtent l="19050" t="19050" r="22860" b="22225"/>
-            <wp:docPr id="1355868392" name="Imagem 42"/>
+            <wp:docPr id="1368932321" name="Imagem 42"/>
             <wp:cNvGraphicFramePr/>
             <a:graphic xmlns:a="http://schemas.openxmlformats.org/drawingml/2006/main">
               <a:graphicData uri="http://schemas.openxmlformats.org/drawingml/2006/picture">
                 <pic:pic xmlns:pic="http://schemas.openxmlformats.org/drawingml/2006/picture">
                   <pic:nvPicPr>
-                    <pic:cNvPr id="1355868392" name=""/>
+                    <pic:cNvPr id="1368932321" name=""/>
                     <pic:cNvPicPr/>
                   </pic:nvPicPr>
                   <pic:blipFill>
@@ -19879,7 +19897,7 @@
           <w:sz w:val="34"/>
         </w:rPr>
       </w:pPr>
-      <w:bookmarkStart w:id="36" w:name="_Toc240534311"/>
+      <w:bookmarkStart w:id="36" w:name="_Toc240546287"/>
       <w:r>
         <w:rPr>
           <w:rFonts w:ascii="Montserrat" w:hAnsi="Montserrat"/>
@@ -19939,7 +19957,7 @@
           <w:sz w:val="27"/>
         </w:rPr>
       </w:pPr>
-      <w:bookmarkStart w:id="37" w:name="_Toc240534312"/>
+      <w:bookmarkStart w:id="37" w:name="_Toc240546288"/>
       <w:r>
         <w:rPr>
           <w:rFonts w:ascii="Montserrat" w:hAnsi="Montserrat"/>
@@ -19979,16 +19997,16 @@
           <w:noProof/>
         </w:rPr>
         <w:drawing>
-          <wp:inline distT="0" distB="0" distL="0" distR="0" wp14:anchorId="5C13EC11" wp14:editId="1234C27E">
+          <wp:inline distT="0" distB="0" distL="0" distR="0" wp14:anchorId="13C666C9" wp14:editId="721DC802">
             <wp:extent cx="5303520" cy="4792851"/>
             <wp:effectExtent l="19050" t="19050" r="11430" b="27305"/>
-            <wp:docPr id="526403251" name="Imagem 43"/>
+            <wp:docPr id="428689677" name="Imagem 43"/>
             <wp:cNvGraphicFramePr/>
             <a:graphic xmlns:a="http://schemas.openxmlformats.org/drawingml/2006/main">
               <a:graphicData uri="http://schemas.openxmlformats.org/drawingml/2006/picture">
                 <pic:pic xmlns:pic="http://schemas.openxmlformats.org/drawingml/2006/picture">
                   <pic:nvPicPr>
-                    <pic:cNvPr id="526403251" name=""/>
+                    <pic:cNvPr id="428689677" name=""/>
                     <pic:cNvPicPr/>
                   </pic:nvPicPr>
                   <pic:blipFill>
@@ -20057,7 +20075,7 @@
           <w:sz w:val="27"/>
         </w:rPr>
       </w:pPr>
-      <w:bookmarkStart w:id="38" w:name="_Toc240534313"/>
+      <w:bookmarkStart w:id="38" w:name="_Toc240546289"/>
       <w:r>
         <w:rPr>
           <w:rFonts w:ascii="Montserrat" w:hAnsi="Montserrat"/>
@@ -20097,16 +20115,16 @@
           <w:noProof/>
         </w:rPr>
         <w:drawing>
-          <wp:inline distT="0" distB="0" distL="0" distR="0" wp14:anchorId="611AE900" wp14:editId="23D9FA6D">
+          <wp:inline distT="0" distB="0" distL="0" distR="0" wp14:anchorId="3C2EECA1" wp14:editId="0A9346AC">
             <wp:extent cx="5303520" cy="4792851"/>
             <wp:effectExtent l="19050" t="19050" r="11430" b="27305"/>
-            <wp:docPr id="1936143486" name="Imagem 44"/>
+            <wp:docPr id="451333402" name="Imagem 44"/>
             <wp:cNvGraphicFramePr/>
             <a:graphic xmlns:a="http://schemas.openxmlformats.org/drawingml/2006/main">
               <a:graphicData uri="http://schemas.openxmlformats.org/drawingml/2006/picture">
                 <pic:pic xmlns:pic="http://schemas.openxmlformats.org/drawingml/2006/picture">
                   <pic:nvPicPr>
-                    <pic:cNvPr id="1936143486" name=""/>
+                    <pic:cNvPr id="451333402" name=""/>
                     <pic:cNvPicPr/>
                   </pic:nvPicPr>
                   <pic:blipFill>
@@ -20174,7 +20192,7 @@
           <w:sz w:val="27"/>
         </w:rPr>
       </w:pPr>
-      <w:bookmarkStart w:id="39" w:name="_Toc240534314"/>
+      <w:bookmarkStart w:id="39" w:name="_Toc240546290"/>
       <w:r>
         <w:rPr>
           <w:rFonts w:ascii="Montserrat" w:hAnsi="Montserrat"/>
@@ -20215,16 +20233,16 @@
         </w:rPr>
         <w:lastRenderedPageBreak/>
         <w:drawing>
-          <wp:inline distT="0" distB="0" distL="0" distR="0" wp14:anchorId="6678B38E" wp14:editId="2BC0AA88">
+          <wp:inline distT="0" distB="0" distL="0" distR="0" wp14:anchorId="3BB58F5A" wp14:editId="59207877">
             <wp:extent cx="5303520" cy="4792851"/>
             <wp:effectExtent l="19050" t="19050" r="11430" b="27305"/>
-            <wp:docPr id="1984342543" name="Imagem 45"/>
+            <wp:docPr id="1795705678" name="Imagem 45"/>
             <wp:cNvGraphicFramePr/>
             <a:graphic xmlns:a="http://schemas.openxmlformats.org/drawingml/2006/main">
               <a:graphicData uri="http://schemas.openxmlformats.org/drawingml/2006/picture">
                 <pic:pic xmlns:pic="http://schemas.openxmlformats.org/drawingml/2006/picture">
                   <pic:nvPicPr>
-                    <pic:cNvPr id="1984342543" name=""/>
+                    <pic:cNvPr id="1795705678" name=""/>
                     <pic:cNvPicPr/>
                   </pic:nvPicPr>
                   <pic:blipFill>
@@ -20292,16 +20310,16 @@
         </w:rPr>
         <w:lastRenderedPageBreak/>
         <w:drawing>
-          <wp:inline distT="0" distB="0" distL="0" distR="0" wp14:anchorId="7ACE0041" wp14:editId="4904421D">
+          <wp:inline distT="0" distB="0" distL="0" distR="0" wp14:anchorId="1FDC5EA4" wp14:editId="01A96FFD">
             <wp:extent cx="5303520" cy="4792851"/>
             <wp:effectExtent l="19050" t="19050" r="11430" b="27305"/>
-            <wp:docPr id="1123543209" name="Imagem 46"/>
+            <wp:docPr id="662971174" name="Imagem 46"/>
             <wp:cNvGraphicFramePr/>
             <a:graphic xmlns:a="http://schemas.openxmlformats.org/drawingml/2006/main">
               <a:graphicData uri="http://schemas.openxmlformats.org/drawingml/2006/picture">
                 <pic:pic xmlns:pic="http://schemas.openxmlformats.org/drawingml/2006/picture">
                   <pic:nvPicPr>
-                    <pic:cNvPr id="1123543209" name=""/>
+                    <pic:cNvPr id="662971174" name=""/>
                     <pic:cNvPicPr/>
                   </pic:nvPicPr>
                   <pic:blipFill>
@@ -20394,7 +20412,7 @@
           <w:sz w:val="34"/>
         </w:rPr>
       </w:pPr>
-      <w:bookmarkStart w:id="40" w:name="_Toc240534315"/>
+      <w:bookmarkStart w:id="40" w:name="_Toc240546291"/>
       <w:r>
         <w:rPr>
           <w:rFonts w:ascii="Montserrat" w:hAnsi="Montserrat"/>
@@ -20436,7 +20454,7 @@
           <w:sz w:val="27"/>
         </w:rPr>
       </w:pPr>
-      <w:bookmarkStart w:id="41" w:name="_Toc240534316"/>
+      <w:bookmarkStart w:id="41" w:name="_Toc240546292"/>
       <w:r>
         <w:rPr>
           <w:rFonts w:ascii="Montserrat" w:hAnsi="Montserrat"/>
@@ -20476,16 +20494,16 @@
           <w:noProof/>
         </w:rPr>
         <w:drawing>
-          <wp:inline distT="0" distB="0" distL="0" distR="0" wp14:anchorId="71DE4155" wp14:editId="7D32F0D3">
+          <wp:inline distT="0" distB="0" distL="0" distR="0" wp14:anchorId="64BE1EAD" wp14:editId="0DE07671">
             <wp:extent cx="5303520" cy="4792851"/>
             <wp:effectExtent l="19050" t="19050" r="11430" b="27305"/>
-            <wp:docPr id="830532177" name="Imagem 47"/>
+            <wp:docPr id="234738610" name="Imagem 47"/>
             <wp:cNvGraphicFramePr/>
             <a:graphic xmlns:a="http://schemas.openxmlformats.org/drawingml/2006/main">
               <a:graphicData uri="http://schemas.openxmlformats.org/drawingml/2006/picture">
                 <pic:pic xmlns:pic="http://schemas.openxmlformats.org/drawingml/2006/picture">
                   <pic:nvPicPr>
-                    <pic:cNvPr id="830532177" name=""/>
+                    <pic:cNvPr id="234738610" name=""/>
                     <pic:cNvPicPr/>
                   </pic:nvPicPr>
                   <pic:blipFill>
@@ -20740,7 +20758,7 @@
           <w:sz w:val="27"/>
         </w:rPr>
       </w:pPr>
-      <w:bookmarkStart w:id="42" w:name="_Toc240534317"/>
+      <w:bookmarkStart w:id="42" w:name="_Toc240546293"/>
       <w:r>
         <w:rPr>
           <w:rFonts w:ascii="Montserrat" w:hAnsi="Montserrat"/>
@@ -20781,16 +20799,16 @@
         </w:rPr>
         <w:lastRenderedPageBreak/>
         <w:drawing>
-          <wp:inline distT="0" distB="0" distL="0" distR="0" wp14:anchorId="28AB1E46" wp14:editId="02589F06">
+          <wp:inline distT="0" distB="0" distL="0" distR="0" wp14:anchorId="2C51D7E1" wp14:editId="500117F8">
             <wp:extent cx="5303520" cy="4792851"/>
             <wp:effectExtent l="19050" t="19050" r="11430" b="27305"/>
-            <wp:docPr id="1193608740" name="Imagem 48"/>
+            <wp:docPr id="230526555" name="Imagem 48"/>
             <wp:cNvGraphicFramePr/>
             <a:graphic xmlns:a="http://schemas.openxmlformats.org/drawingml/2006/main">
               <a:graphicData uri="http://schemas.openxmlformats.org/drawingml/2006/picture">
                 <pic:pic xmlns:pic="http://schemas.openxmlformats.org/drawingml/2006/picture">
                   <pic:nvPicPr>
-                    <pic:cNvPr id="1193608740" name=""/>
+                    <pic:cNvPr id="230526555" name=""/>
                     <pic:cNvPicPr/>
                   </pic:nvPicPr>
                   <pic:blipFill>
@@ -20879,7 +20897,7 @@
           <w:sz w:val="27"/>
         </w:rPr>
       </w:pPr>
-      <w:bookmarkStart w:id="43" w:name="_Toc240534318"/>
+      <w:bookmarkStart w:id="43" w:name="_Toc240546294"/>
       <w:r>
         <w:rPr>
           <w:rFonts w:ascii="Montserrat" w:hAnsi="Montserrat"/>
@@ -20920,16 +20938,16 @@
         </w:rPr>
         <w:lastRenderedPageBreak/>
         <w:drawing>
-          <wp:inline distT="0" distB="0" distL="0" distR="0" wp14:anchorId="79519FCE" wp14:editId="6C07019F">
+          <wp:inline distT="0" distB="0" distL="0" distR="0" wp14:anchorId="35C52297" wp14:editId="14C23DA3">
             <wp:extent cx="5303520" cy="4792851"/>
             <wp:effectExtent l="19050" t="19050" r="11430" b="27305"/>
-            <wp:docPr id="969670656" name="Imagem 49"/>
+            <wp:docPr id="907413152" name="Imagem 49"/>
             <wp:cNvGraphicFramePr/>
             <a:graphic xmlns:a="http://schemas.openxmlformats.org/drawingml/2006/main">
               <a:graphicData uri="http://schemas.openxmlformats.org/drawingml/2006/picture">
                 <pic:pic xmlns:pic="http://schemas.openxmlformats.org/drawingml/2006/picture">
                   <pic:nvPicPr>
-                    <pic:cNvPr id="969670656" name=""/>
+                    <pic:cNvPr id="907413152" name=""/>
                     <pic:cNvPicPr/>
                   </pic:nvPicPr>
                   <pic:blipFill>
@@ -21073,7 +21091,7 @@
           <w:sz w:val="27"/>
         </w:rPr>
       </w:pPr>
-      <w:bookmarkStart w:id="44" w:name="_Toc240534319"/>
+      <w:bookmarkStart w:id="44" w:name="_Toc240546295"/>
       <w:r>
         <w:rPr>
           <w:rFonts w:ascii="Montserrat" w:hAnsi="Montserrat"/>
@@ -21338,16 +21356,16 @@
           <w:noProof/>
         </w:rPr>
         <w:drawing>
-          <wp:inline distT="0" distB="0" distL="0" distR="0" wp14:anchorId="24B31600" wp14:editId="1CF697E1">
+          <wp:inline distT="0" distB="0" distL="0" distR="0" wp14:anchorId="2C757429" wp14:editId="0813D4E1">
             <wp:extent cx="5303520" cy="4267180"/>
             <wp:effectExtent l="19050" t="19050" r="11430" b="19685"/>
-            <wp:docPr id="376880162" name="Imagem 50"/>
+            <wp:docPr id="2043339307" name="Imagem 50"/>
             <wp:cNvGraphicFramePr/>
             <a:graphic xmlns:a="http://schemas.openxmlformats.org/drawingml/2006/main">
               <a:graphicData uri="http://schemas.openxmlformats.org/drawingml/2006/picture">
                 <pic:pic xmlns:pic="http://schemas.openxmlformats.org/drawingml/2006/picture">
                   <pic:nvPicPr>
-                    <pic:cNvPr id="376880162" name=""/>
+                    <pic:cNvPr id="2043339307" name=""/>
                     <pic:cNvPicPr/>
                   </pic:nvPicPr>
                   <pic:blipFill>
@@ -21415,16 +21433,16 @@
           <w:noProof/>
         </w:rPr>
         <w:drawing>
-          <wp:inline distT="0" distB="0" distL="0" distR="0" wp14:anchorId="1D5D6AFA" wp14:editId="206D8D91">
+          <wp:inline distT="0" distB="0" distL="0" distR="0" wp14:anchorId="2CA38708" wp14:editId="2119F032">
             <wp:extent cx="5303520" cy="3382059"/>
             <wp:effectExtent l="19050" t="19050" r="11430" b="27940"/>
-            <wp:docPr id="89317920" name="Imagem 51"/>
+            <wp:docPr id="229545680" name="Imagem 51"/>
             <wp:cNvGraphicFramePr/>
             <a:graphic xmlns:a="http://schemas.openxmlformats.org/drawingml/2006/main">
               <a:graphicData uri="http://schemas.openxmlformats.org/drawingml/2006/picture">
                 <pic:pic xmlns:pic="http://schemas.openxmlformats.org/drawingml/2006/picture">
                   <pic:nvPicPr>
-                    <pic:cNvPr id="89317920" name=""/>
+                    <pic:cNvPr id="229545680" name=""/>
                     <pic:cNvPicPr/>
                   </pic:nvPicPr>
                   <pic:blipFill>
@@ -21492,16 +21510,16 @@
         </w:rPr>
         <w:lastRenderedPageBreak/>
         <w:drawing>
-          <wp:inline distT="0" distB="0" distL="0" distR="0" wp14:anchorId="62EB4BFF" wp14:editId="6C74E5E6">
+          <wp:inline distT="0" distB="0" distL="0" distR="0" wp14:anchorId="69F7358B" wp14:editId="7DE5FD25">
             <wp:extent cx="5303520" cy="4417800"/>
             <wp:effectExtent l="19050" t="19050" r="11430" b="20955"/>
-            <wp:docPr id="2076820330" name="Imagem 52"/>
+            <wp:docPr id="2008063477" name="Imagem 52"/>
             <wp:cNvGraphicFramePr/>
             <a:graphic xmlns:a="http://schemas.openxmlformats.org/drawingml/2006/main">
               <a:graphicData uri="http://schemas.openxmlformats.org/drawingml/2006/picture">
                 <pic:pic xmlns:pic="http://schemas.openxmlformats.org/drawingml/2006/picture">
                   <pic:nvPicPr>
-                    <pic:cNvPr id="2076820330" name=""/>
+                    <pic:cNvPr id="2008063477" name=""/>
                     <pic:cNvPicPr/>
                   </pic:nvPicPr>
                   <pic:blipFill>
@@ -21611,7 +21629,7 @@
           <w:sz w:val="27"/>
         </w:rPr>
       </w:pPr>
-      <w:bookmarkStart w:id="45" w:name="_Toc240534320"/>
+      <w:bookmarkStart w:id="45" w:name="_Toc240546296"/>
       <w:r>
         <w:rPr>
           <w:rFonts w:ascii="Montserrat" w:hAnsi="Montserrat"/>
@@ -21877,16 +21895,16 @@
         </w:rPr>
         <w:lastRenderedPageBreak/>
         <w:drawing>
-          <wp:inline distT="0" distB="0" distL="0" distR="0" wp14:anchorId="58B9F553" wp14:editId="20452B44">
+          <wp:inline distT="0" distB="0" distL="0" distR="0" wp14:anchorId="1F46432D" wp14:editId="4F17E250">
             <wp:extent cx="5303520" cy="7628836"/>
             <wp:effectExtent l="19050" t="19050" r="11430" b="10795"/>
-            <wp:docPr id="1898085782" name="Imagem 53"/>
+            <wp:docPr id="1753410516" name="Imagem 53"/>
             <wp:cNvGraphicFramePr/>
             <a:graphic xmlns:a="http://schemas.openxmlformats.org/drawingml/2006/main">
               <a:graphicData uri="http://schemas.openxmlformats.org/drawingml/2006/picture">
                 <pic:pic xmlns:pic="http://schemas.openxmlformats.org/drawingml/2006/picture">
                   <pic:nvPicPr>
-                    <pic:cNvPr id="1898085782" name=""/>
+                    <pic:cNvPr id="1753410516" name=""/>
                     <pic:cNvPicPr/>
                   </pic:nvPicPr>
                   <pic:blipFill>
@@ -22018,7 +22036,7 @@
           <w:sz w:val="27"/>
         </w:rPr>
       </w:pPr>
-      <w:bookmarkStart w:id="46" w:name="_Toc240534321"/>
+      <w:bookmarkStart w:id="46" w:name="_Toc240546297"/>
       <w:r>
         <w:rPr>
           <w:rFonts w:ascii="Montserrat" w:hAnsi="Montserrat"/>
@@ -22150,7 +22168,7 @@
           <w:sz w:val="27"/>
         </w:rPr>
       </w:pPr>
-      <w:bookmarkStart w:id="47" w:name="_Toc240534322"/>
+      <w:bookmarkStart w:id="47" w:name="_Toc240546298"/>
       <w:r>
         <w:rPr>
           <w:rFonts w:ascii="Montserrat" w:hAnsi="Montserrat"/>
@@ -22438,7 +22456,7 @@
           <w:sz w:val="27"/>
         </w:rPr>
       </w:pPr>
-      <w:bookmarkStart w:id="48" w:name="_Toc240534323"/>
+      <w:bookmarkStart w:id="48" w:name="_Toc240546299"/>
       <w:r>
         <w:rPr>
           <w:rFonts w:ascii="Montserrat" w:hAnsi="Montserrat"/>
@@ -22500,7 +22518,7 @@
           <w:sz w:val="27"/>
         </w:rPr>
       </w:pPr>
-      <w:bookmarkStart w:id="49" w:name="_Toc240534324"/>
+      <w:bookmarkStart w:id="49" w:name="_Toc240546300"/>
       <w:r>
         <w:rPr>
           <w:rFonts w:ascii="Montserrat" w:hAnsi="Montserrat"/>
@@ -23119,16 +23137,16 @@
         </w:rPr>
         <w:lastRenderedPageBreak/>
         <w:drawing>
-          <wp:inline distT="0" distB="0" distL="0" distR="0" wp14:anchorId="198CEA24" wp14:editId="20D27D4C">
+          <wp:inline distT="0" distB="0" distL="0" distR="0" wp14:anchorId="462F1515" wp14:editId="6589291D">
             <wp:extent cx="5120640" cy="6240599"/>
             <wp:effectExtent l="19050" t="19050" r="22860" b="27305"/>
-            <wp:docPr id="1452714312" name="Imagem 54"/>
+            <wp:docPr id="214358685" name="Imagem 54"/>
             <wp:cNvGraphicFramePr/>
             <a:graphic xmlns:a="http://schemas.openxmlformats.org/drawingml/2006/main">
               <a:graphicData uri="http://schemas.openxmlformats.org/drawingml/2006/picture">
                 <pic:pic xmlns:pic="http://schemas.openxmlformats.org/drawingml/2006/picture">
                   <pic:nvPicPr>
-                    <pic:cNvPr id="1452714312" name=""/>
+                    <pic:cNvPr id="214358685" name=""/>
                     <pic:cNvPicPr/>
                   </pic:nvPicPr>
                   <pic:blipFill>
@@ -23299,7 +23317,7 @@
           <w:sz w:val="27"/>
         </w:rPr>
       </w:pPr>
-      <w:bookmarkStart w:id="50" w:name="_Toc240534325"/>
+      <w:bookmarkStart w:id="50" w:name="_Toc240546301"/>
       <w:r>
         <w:rPr>
           <w:rFonts w:ascii="Montserrat" w:hAnsi="Montserrat"/>
@@ -23374,7 +23392,7 @@
           <w:color w:val="1A1A1A"/>
           <w:sz w:val="22"/>
         </w:rPr>
-        <w:t>Um cartao por pessoa, com nome, papel e a contagem de itens em cada uma das 5 categorias, mais quantos estao atrasados - clicar no cartao expande a lista detalhada de cada item, na mesma organizacao do Meu Painel. E somente visualizacao: nao ha botao para concluir um item em nome de outra pessoa.</w:t>
+        <w:t>Um cartao por pessoa, com nome, papel e a contagem de itens em cada uma das 5 categorias, mais quantos estao atrasados - clicar no cartao expande a lista detalhada de cada item. Pessoas com pelo menos um item atrasado ja aparecem expandidas ao carregar a pagina, sem precisar clicar. E somente visualizacao: nao ha botao para concluir um item em nome de outra pessoa.</w:t>
       </w:r>
     </w:p>
     <w:p>
@@ -23398,6 +23416,39 @@
           <w:color w:val="1A1A1A"/>
           <w:sz w:val="22"/>
         </w:rPr>
+        <w:t xml:space="preserve">Marcos, Tarefas, Riscos (TAP) e Entradas (Planejamento) agrupados por projeto: dentro de cada categoria, os itens da pessoa ficam organizados sob o nome do projeto a que pertencem, em vez de soltos numa lista so. </w:t>
+      </w:r>
+      <w:r>
+        <w:rPr>
+          <w:rFonts w:ascii="Montserrat" w:hAnsi="Montserrat"/>
+          <w:color w:val="1A1A1A"/>
+          <w:sz w:val="22"/>
+        </w:rPr>
+        <w:lastRenderedPageBreak/>
+        <w:t>O cabecalho de cada grupo mostra quantos itens tem e, em Marcos, quantos deles estao atrasados. Os grupos de Marcos aparecem ordenados pelo projeto mais critico primeiro (mais itens atrasados, depois o prazo mais proximo); nas demais categorias a ordem e alfabetica pelo nome do projeto. Cada marco mostra explicitamente de qual campo a data e (Termino previsto), o mesmo nome usado na coluna correspondente do cronograma do Planejamento (Passo 4).</w:t>
+      </w:r>
+    </w:p>
+    <w:p>
+      <w:pPr>
+        <w:pStyle w:val="PargrafodaLista"/>
+        <w:numPr>
+          <w:ilvl w:val="0"/>
+          <w:numId w:val="37"/>
+        </w:numPr>
+        <w:spacing w:after="80" w:line="260" w:lineRule="auto"/>
+        <w:ind w:left="700"/>
+        <w:rPr>
+          <w:rFonts w:ascii="Montserrat" w:hAnsi="Montserrat"/>
+          <w:color w:val="1A1A1A"/>
+          <w:sz w:val="22"/>
+        </w:rPr>
+      </w:pPr>
+      <w:r>
+        <w:rPr>
+          <w:rFonts w:ascii="Montserrat" w:hAnsi="Montserrat"/>
+          <w:color w:val="1A1A1A"/>
+          <w:sz w:val="22"/>
+        </w:rPr>
         <w:t>Itens sem responsavel (conta) atribuido: contagem por categoria dos itens em aberto que so tem o campo de texto livre Responsavel preenchido, sem o seletor de conta - ajuda o PMO a encontrar pendencias sem dono definido antes que virem atraso.</w:t>
       </w:r>
     </w:p>
@@ -23412,16 +23463,16 @@
         </w:rPr>
         <w:lastRenderedPageBreak/>
         <w:drawing>
-          <wp:inline distT="0" distB="0" distL="0" distR="0" wp14:anchorId="68FDEAC8" wp14:editId="1BB4B800">
+          <wp:inline distT="0" distB="0" distL="0" distR="0" wp14:anchorId="018F628B" wp14:editId="2EAAE100">
             <wp:extent cx="5120640" cy="6187296"/>
             <wp:effectExtent l="19050" t="19050" r="22860" b="23495"/>
-            <wp:docPr id="339531296" name="Imagem 55"/>
+            <wp:docPr id="2124818475" name="Imagem 55"/>
             <wp:cNvGraphicFramePr/>
             <a:graphic xmlns:a="http://schemas.openxmlformats.org/drawingml/2006/main">
               <a:graphicData uri="http://schemas.openxmlformats.org/drawingml/2006/picture">
                 <pic:pic xmlns:pic="http://schemas.openxmlformats.org/drawingml/2006/picture">
                   <pic:nvPicPr>
-                    <pic:cNvPr id="339531296" name=""/>
+                    <pic:cNvPr id="2124818475" name=""/>
                     <pic:cNvPicPr/>
                   </pic:nvPicPr>
                   <pic:blipFill>
@@ -23510,7 +23561,7 @@
           <w:sz w:val="27"/>
         </w:rPr>
       </w:pPr>
-      <w:bookmarkStart w:id="51" w:name="_Toc240534326"/>
+      <w:bookmarkStart w:id="51" w:name="_Toc240546302"/>
       <w:r>
         <w:rPr>
           <w:rFonts w:ascii="Montserrat" w:hAnsi="Montserrat"/>
@@ -23663,7 +23714,7 @@
           <w:sz w:val="27"/>
         </w:rPr>
       </w:pPr>
-      <w:bookmarkStart w:id="52" w:name="_Toc240534327"/>
+      <w:bookmarkStart w:id="52" w:name="_Toc240546303"/>
       <w:r>
         <w:rPr>
           <w:rFonts w:ascii="Montserrat" w:hAnsi="Montserrat"/>
@@ -23956,16 +24007,16 @@
           <w:noProof/>
         </w:rPr>
         <w:drawing>
-          <wp:inline distT="0" distB="0" distL="0" distR="0" wp14:anchorId="19089BA1" wp14:editId="3CB4BD48">
+          <wp:inline distT="0" distB="0" distL="0" distR="0" wp14:anchorId="467430F6" wp14:editId="13235DAC">
             <wp:extent cx="5303520" cy="1351384"/>
             <wp:effectExtent l="19050" t="19050" r="11430" b="20320"/>
-            <wp:docPr id="1580081611" name="Imagem 56"/>
+            <wp:docPr id="2098326095" name="Imagem 56"/>
             <wp:cNvGraphicFramePr/>
             <a:graphic xmlns:a="http://schemas.openxmlformats.org/drawingml/2006/main">
               <a:graphicData uri="http://schemas.openxmlformats.org/drawingml/2006/picture">
                 <pic:pic xmlns:pic="http://schemas.openxmlformats.org/drawingml/2006/picture">
                   <pic:nvPicPr>
-                    <pic:cNvPr id="1580081611" name=""/>
+                    <pic:cNvPr id="2098326095" name=""/>
                     <pic:cNvPicPr/>
                   </pic:nvPicPr>
                   <pic:blipFill>
@@ -24052,7 +24103,7 @@
           <w:sz w:val="27"/>
         </w:rPr>
       </w:pPr>
-      <w:bookmarkStart w:id="53" w:name="_Toc240534328"/>
+      <w:bookmarkStart w:id="53" w:name="_Toc240546304"/>
       <w:r>
         <w:rPr>
           <w:rFonts w:ascii="Montserrat" w:hAnsi="Montserrat"/>
@@ -24188,16 +24239,16 @@
           <w:noProof/>
         </w:rPr>
         <w:drawing>
-          <wp:inline distT="0" distB="0" distL="0" distR="0" wp14:anchorId="4AA5C576" wp14:editId="72615694">
+          <wp:inline distT="0" distB="0" distL="0" distR="0" wp14:anchorId="39488995" wp14:editId="0126253C">
             <wp:extent cx="5303520" cy="1422793"/>
             <wp:effectExtent l="19050" t="19050" r="11430" b="25400"/>
-            <wp:docPr id="301743695" name="Imagem 57"/>
+            <wp:docPr id="79552153" name="Imagem 57"/>
             <wp:cNvGraphicFramePr/>
             <a:graphic xmlns:a="http://schemas.openxmlformats.org/drawingml/2006/main">
               <a:graphicData uri="http://schemas.openxmlformats.org/drawingml/2006/picture">
                 <pic:pic xmlns:pic="http://schemas.openxmlformats.org/drawingml/2006/picture">
                   <pic:nvPicPr>
-                    <pic:cNvPr id="301743695" name=""/>
+                    <pic:cNvPr id="79552153" name=""/>
                     <pic:cNvPicPr/>
                   </pic:nvPicPr>
                   <pic:blipFill>
@@ -24352,16 +24403,16 @@
           <w:noProof/>
         </w:rPr>
         <w:drawing>
-          <wp:inline distT="0" distB="0" distL="0" distR="0" wp14:anchorId="4190A388" wp14:editId="70D6A144">
+          <wp:inline distT="0" distB="0" distL="0" distR="0" wp14:anchorId="3AAB5B80" wp14:editId="470BD42C">
             <wp:extent cx="5303520" cy="1841050"/>
             <wp:effectExtent l="19050" t="19050" r="11430" b="26035"/>
-            <wp:docPr id="597784760" name="Imagem 58"/>
+            <wp:docPr id="1704633885" name="Imagem 58"/>
             <wp:cNvGraphicFramePr/>
             <a:graphic xmlns:a="http://schemas.openxmlformats.org/drawingml/2006/main">
               <a:graphicData uri="http://schemas.openxmlformats.org/drawingml/2006/picture">
                 <pic:pic xmlns:pic="http://schemas.openxmlformats.org/drawingml/2006/picture">
                   <pic:nvPicPr>
-                    <pic:cNvPr id="597784760" name=""/>
+                    <pic:cNvPr id="1704633885" name=""/>
                     <pic:cNvPicPr/>
                   </pic:nvPicPr>
                   <pic:blipFill>
@@ -24516,16 +24567,16 @@
           <w:noProof/>
         </w:rPr>
         <w:drawing>
-          <wp:inline distT="0" distB="0" distL="0" distR="0" wp14:anchorId="565026A7" wp14:editId="41DF64E8">
+          <wp:inline distT="0" distB="0" distL="0" distR="0" wp14:anchorId="54D753D3" wp14:editId="76CA9D25">
             <wp:extent cx="5303520" cy="303041"/>
             <wp:effectExtent l="19050" t="19050" r="11430" b="20955"/>
-            <wp:docPr id="639880905" name="Imagem 59"/>
+            <wp:docPr id="1937202799" name="Imagem 59"/>
             <wp:cNvGraphicFramePr/>
             <a:graphic xmlns:a="http://schemas.openxmlformats.org/drawingml/2006/main">
               <a:graphicData uri="http://schemas.openxmlformats.org/drawingml/2006/picture">
                 <pic:pic xmlns:pic="http://schemas.openxmlformats.org/drawingml/2006/picture">
                   <pic:nvPicPr>
-                    <pic:cNvPr id="639880905" name=""/>
+                    <pic:cNvPr id="1937202799" name=""/>
                     <pic:cNvPicPr/>
                   </pic:nvPicPr>
                   <pic:blipFill>
@@ -24592,16 +24643,16 @@
           <w:noProof/>
         </w:rPr>
         <w:drawing>
-          <wp:inline distT="0" distB="0" distL="0" distR="0" wp14:anchorId="6F0C7BB8" wp14:editId="7F609DCE">
+          <wp:inline distT="0" distB="0" distL="0" distR="0" wp14:anchorId="0ED02094" wp14:editId="5DF0C13C">
             <wp:extent cx="5303520" cy="2983005"/>
             <wp:effectExtent l="19050" t="19050" r="11430" b="27305"/>
-            <wp:docPr id="515586824" name="Imagem 60"/>
+            <wp:docPr id="1510267185" name="Imagem 60"/>
             <wp:cNvGraphicFramePr/>
             <a:graphic xmlns:a="http://schemas.openxmlformats.org/drawingml/2006/main">
               <a:graphicData uri="http://schemas.openxmlformats.org/drawingml/2006/picture">
                 <pic:pic xmlns:pic="http://schemas.openxmlformats.org/drawingml/2006/picture">
                   <pic:nvPicPr>
-                    <pic:cNvPr id="515586824" name=""/>
+                    <pic:cNvPr id="1510267185" name=""/>
                     <pic:cNvPicPr/>
                   </pic:nvPicPr>
                   <pic:blipFill>
@@ -24673,7 +24724,7 @@
           <w:sz w:val="34"/>
         </w:rPr>
       </w:pPr>
-      <w:bookmarkStart w:id="54" w:name="_Toc240534329"/>
+      <w:bookmarkStart w:id="54" w:name="_Toc240546305"/>
       <w:r>
         <w:rPr>
           <w:rFonts w:ascii="Montserrat" w:hAnsi="Montserrat"/>
@@ -24917,7 +24968,7 @@
           <w:sz w:val="34"/>
         </w:rPr>
       </w:pPr>
-      <w:bookmarkStart w:id="55" w:name="_Toc240534330"/>
+      <w:bookmarkStart w:id="55" w:name="_Toc240546306"/>
       <w:r>
         <w:rPr>
           <w:rFonts w:ascii="Montserrat" w:hAnsi="Montserrat"/>
@@ -26705,7 +26756,7 @@
 <file path=word/numbering.xml><?xml version="1.0" encoding="utf-8"?>
 <w:numbering xmlns:wpc="http://schemas.microsoft.com/office/word/2010/wordprocessingCanvas" xmlns:cx="http://schemas.microsoft.com/office/drawing/2014/chartex" xmlns:cx1="http://schemas.microsoft.com/office/drawing/2015/9/8/chartex" xmlns:cx2="http://schemas.microsoft.com/office/drawing/2015/10/21/chartex" xmlns:cx3="http://schemas.microsoft.com/office/drawing/2016/5/9/chartex" xmlns:cx4="http://schemas.microsoft.com/office/drawing/2016/5/10/chartex" xmlns:cx5="http://schemas.microsoft.com/office/drawing/2016/5/11/chartex" xmlns:cx6="http://schemas.microsoft.com/office/drawing/2016/5/12/chartex" xmlns:cx7="http://schemas.microsoft.com/office/drawing/2016/5/13/chartex" xmlns:cx8="http://schemas.microsoft.com/office/drawing/2016/5/14/chartex" xmlns:mc="http://schemas.openxmlformats.org/markup-compatibility/2006" xmlns:aink="http://schemas.microsoft.com/office/drawing/2016/ink" xmlns:am3d="http://schemas.microsoft.com/office/drawing/2017/model3d" xmlns:o="urn:schemas-microsoft-com:office:office" xmlns:oel="http://schemas.microsoft.com/office/2019/extlst" xmlns:r="http://schemas.openxmlformats.org/officeDocument/2006/relationships" xmlns:m="http://schemas.openxmlformats.org/officeDocument/2006/math" xmlns:v="urn:schemas-microsoft-com:vml" xmlns:wp14="http://schemas.microsoft.com/office/word/2010/wordprocessingDrawing" xmlns:wp="http://schemas.openxmlformats.org/drawingml/2006/wordprocessingDrawing" xmlns:w10="urn:schemas-microsoft-com:office:word" xmlns:w="http://schemas.openxmlformats.org/wordprocessingml/2006/main" xmlns:w14="http://schemas.microsoft.com/office/word/2010/wordml" xmlns:w15="http://schemas.microsoft.com/office/word/2012/wordml" xmlns:w16cex="http://schemas.microsoft.com/office/word/2018/wordml/cex" xmlns:w16cid="http://schemas.microsoft.com/office/word/2016/wordml/cid" xmlns:w16="http://schemas.microsoft.com/office/word/2018/wordml" xmlns:w16du="http://schemas.microsoft.com/office/word/2023/wordml/word16du" xmlns:w16sdtdh="http://schemas.microsoft.com/office/word/2020/wordml/sdtdatahash" xmlns:w16sdtfl="http://schemas.microsoft.com/office/word/2024/wordml/sdtformatlock" xmlns:w16se="http://schemas.microsoft.com/office/word/2015/wordml/symex" xmlns:wpg="http://schemas.microsoft.com/office/word/2010/wordprocessingGroup" xmlns:wpi="http://schemas.microsoft.com/office/word/2010/wordprocessingInk" xmlns:wne="http://schemas.microsoft.com/office/word/2006/wordml" xmlns:wps="http://schemas.microsoft.com/office/word/2010/wordprocessingShape" mc:Ignorable="w14 w15 w16se w16cid w16 w16cex w16sdtdh w16sdtfl w16du wp14">
   <w:abstractNum w:abstractNumId="0" w15:restartNumberingAfterBreak="0">
-    <w:nsid w:val="031E3361"/>
+    <w:nsid w:val="007C331F"/>
     <w:multiLevelType w:val="singleLevel"/>
     <w:tmpl w:val="04160001"/>
     <w:lvl w:ilvl="0">
@@ -26722,7 +26773,7 @@
     </w:lvl>
   </w:abstractNum>
   <w:abstractNum w:abstractNumId="1" w15:restartNumberingAfterBreak="0">
-    <w:nsid w:val="05023B51"/>
+    <w:nsid w:val="05E13A90"/>
     <w:multiLevelType w:val="singleLevel"/>
     <w:tmpl w:val="04160001"/>
     <w:lvl w:ilvl="0">
@@ -26739,7 +26790,7 @@
     </w:lvl>
   </w:abstractNum>
   <w:abstractNum w:abstractNumId="2" w15:restartNumberingAfterBreak="0">
-    <w:nsid w:val="0A9F1ACB"/>
+    <w:nsid w:val="080F6276"/>
     <w:multiLevelType w:val="singleLevel"/>
     <w:tmpl w:val="04160001"/>
     <w:lvl w:ilvl="0">
@@ -26756,7 +26807,7 @@
     </w:lvl>
   </w:abstractNum>
   <w:abstractNum w:abstractNumId="3" w15:restartNumberingAfterBreak="0">
-    <w:nsid w:val="0CAD7742"/>
+    <w:nsid w:val="09104EED"/>
     <w:multiLevelType w:val="singleLevel"/>
     <w:tmpl w:val="04160001"/>
     <w:lvl w:ilvl="0">
@@ -26773,7 +26824,7 @@
     </w:lvl>
   </w:abstractNum>
   <w:abstractNum w:abstractNumId="4" w15:restartNumberingAfterBreak="0">
-    <w:nsid w:val="0D010E15"/>
+    <w:nsid w:val="0A337432"/>
     <w:multiLevelType w:val="singleLevel"/>
     <w:tmpl w:val="04160001"/>
     <w:lvl w:ilvl="0">
@@ -26790,7 +26841,7 @@
     </w:lvl>
   </w:abstractNum>
   <w:abstractNum w:abstractNumId="5" w15:restartNumberingAfterBreak="0">
-    <w:nsid w:val="101763F5"/>
+    <w:nsid w:val="11A631D1"/>
     <w:multiLevelType w:val="singleLevel"/>
     <w:tmpl w:val="04160001"/>
     <w:lvl w:ilvl="0">
@@ -26807,7 +26858,7 @@
     </w:lvl>
   </w:abstractNum>
   <w:abstractNum w:abstractNumId="6" w15:restartNumberingAfterBreak="0">
-    <w:nsid w:val="14E54488"/>
+    <w:nsid w:val="18383F7B"/>
     <w:multiLevelType w:val="singleLevel"/>
     <w:tmpl w:val="04160001"/>
     <w:lvl w:ilvl="0">
@@ -26824,7 +26875,7 @@
     </w:lvl>
   </w:abstractNum>
   <w:abstractNum w:abstractNumId="7" w15:restartNumberingAfterBreak="0">
-    <w:nsid w:val="173B63D2"/>
+    <w:nsid w:val="1A7F30AC"/>
     <w:multiLevelType w:val="singleLevel"/>
     <w:tmpl w:val="04160001"/>
     <w:lvl w:ilvl="0">
@@ -26841,7 +26892,7 @@
     </w:lvl>
   </w:abstractNum>
   <w:abstractNum w:abstractNumId="8" w15:restartNumberingAfterBreak="0">
-    <w:nsid w:val="17ED0876"/>
+    <w:nsid w:val="1F8A1E50"/>
     <w:multiLevelType w:val="singleLevel"/>
     <w:tmpl w:val="04160001"/>
     <w:lvl w:ilvl="0">
@@ -26858,7 +26909,7 @@
     </w:lvl>
   </w:abstractNum>
   <w:abstractNum w:abstractNumId="9" w15:restartNumberingAfterBreak="0">
-    <w:nsid w:val="1E22258F"/>
+    <w:nsid w:val="2A8C03E0"/>
     <w:multiLevelType w:val="singleLevel"/>
     <w:tmpl w:val="04160001"/>
     <w:lvl w:ilvl="0">
@@ -26875,7 +26926,7 @@
     </w:lvl>
   </w:abstractNum>
   <w:abstractNum w:abstractNumId="10" w15:restartNumberingAfterBreak="0">
-    <w:nsid w:val="1FFB17C1"/>
+    <w:nsid w:val="2AE12367"/>
     <w:multiLevelType w:val="singleLevel"/>
     <w:tmpl w:val="04160001"/>
     <w:lvl w:ilvl="0">
@@ -26892,7 +26943,7 @@
     </w:lvl>
   </w:abstractNum>
   <w:abstractNum w:abstractNumId="11" w15:restartNumberingAfterBreak="0">
-    <w:nsid w:val="21351ECB"/>
+    <w:nsid w:val="2F632D91"/>
     <w:multiLevelType w:val="singleLevel"/>
     <w:tmpl w:val="04160001"/>
     <w:lvl w:ilvl="0">
@@ -26909,7 +26960,7 @@
     </w:lvl>
   </w:abstractNum>
   <w:abstractNum w:abstractNumId="12" w15:restartNumberingAfterBreak="0">
-    <w:nsid w:val="23551EA3"/>
+    <w:nsid w:val="316111DB"/>
     <w:multiLevelType w:val="singleLevel"/>
     <w:tmpl w:val="04160001"/>
     <w:lvl w:ilvl="0">
@@ -26926,7 +26977,7 @@
     </w:lvl>
   </w:abstractNum>
   <w:abstractNum w:abstractNumId="13" w15:restartNumberingAfterBreak="0">
-    <w:nsid w:val="247A2190"/>
+    <w:nsid w:val="32AC3B18"/>
     <w:multiLevelType w:val="singleLevel"/>
     <w:tmpl w:val="04160001"/>
     <w:lvl w:ilvl="0">
@@ -26943,7 +26994,7 @@
     </w:lvl>
   </w:abstractNum>
   <w:abstractNum w:abstractNumId="14" w15:restartNumberingAfterBreak="0">
-    <w:nsid w:val="2BC73303"/>
+    <w:nsid w:val="3BF13B30"/>
     <w:multiLevelType w:val="singleLevel"/>
     <w:tmpl w:val="04160001"/>
     <w:lvl w:ilvl="0">
@@ -26960,7 +27011,7 @@
     </w:lvl>
   </w:abstractNum>
   <w:abstractNum w:abstractNumId="15" w15:restartNumberingAfterBreak="0">
-    <w:nsid w:val="33795AB5"/>
+    <w:nsid w:val="3CAA0C42"/>
     <w:multiLevelType w:val="singleLevel"/>
     <w:tmpl w:val="04160001"/>
     <w:lvl w:ilvl="0">
@@ -26977,7 +27028,7 @@
     </w:lvl>
   </w:abstractNum>
   <w:abstractNum w:abstractNumId="16" w15:restartNumberingAfterBreak="0">
-    <w:nsid w:val="362A1823"/>
+    <w:nsid w:val="3EBE4680"/>
     <w:multiLevelType w:val="singleLevel"/>
     <w:tmpl w:val="04160001"/>
     <w:lvl w:ilvl="0">
@@ -26994,7 +27045,7 @@
     </w:lvl>
   </w:abstractNum>
   <w:abstractNum w:abstractNumId="17" w15:restartNumberingAfterBreak="0">
-    <w:nsid w:val="3A54798D"/>
+    <w:nsid w:val="42FF6561"/>
     <w:multiLevelType w:val="singleLevel"/>
     <w:tmpl w:val="04160001"/>
     <w:lvl w:ilvl="0">
@@ -27011,7 +27062,7 @@
     </w:lvl>
   </w:abstractNum>
   <w:abstractNum w:abstractNumId="18" w15:restartNumberingAfterBreak="0">
-    <w:nsid w:val="3C4D0FE7"/>
+    <w:nsid w:val="4429197D"/>
     <w:multiLevelType w:val="singleLevel"/>
     <w:tmpl w:val="04160001"/>
     <w:lvl w:ilvl="0">
@@ -27028,7 +27079,7 @@
     </w:lvl>
   </w:abstractNum>
   <w:abstractNum w:abstractNumId="19" w15:restartNumberingAfterBreak="0">
-    <w:nsid w:val="3C6703F4"/>
+    <w:nsid w:val="465743E6"/>
     <w:multiLevelType w:val="singleLevel"/>
     <w:tmpl w:val="04160001"/>
     <w:lvl w:ilvl="0">
@@ -27045,7 +27096,7 @@
     </w:lvl>
   </w:abstractNum>
   <w:abstractNum w:abstractNumId="20" w15:restartNumberingAfterBreak="0">
-    <w:nsid w:val="3F2C2A24"/>
+    <w:nsid w:val="486F0FA3"/>
     <w:multiLevelType w:val="singleLevel"/>
     <w:tmpl w:val="04160001"/>
     <w:lvl w:ilvl="0">
@@ -27062,7 +27113,7 @@
     </w:lvl>
   </w:abstractNum>
   <w:abstractNum w:abstractNumId="21" w15:restartNumberingAfterBreak="0">
-    <w:nsid w:val="41F80DD9"/>
+    <w:nsid w:val="498E1CA2"/>
     <w:multiLevelType w:val="singleLevel"/>
     <w:tmpl w:val="04160001"/>
     <w:lvl w:ilvl="0">
@@ -27079,7 +27130,7 @@
     </w:lvl>
   </w:abstractNum>
   <w:abstractNum w:abstractNumId="22" w15:restartNumberingAfterBreak="0">
-    <w:nsid w:val="48C44A1C"/>
+    <w:nsid w:val="549E7A8F"/>
     <w:multiLevelType w:val="singleLevel"/>
     <w:tmpl w:val="04160001"/>
     <w:lvl w:ilvl="0">
@@ -27096,7 +27147,7 @@
     </w:lvl>
   </w:abstractNum>
   <w:abstractNum w:abstractNumId="23" w15:restartNumberingAfterBreak="0">
-    <w:nsid w:val="4D9F13A3"/>
+    <w:nsid w:val="56887292"/>
     <w:multiLevelType w:val="singleLevel"/>
     <w:tmpl w:val="04160001"/>
     <w:lvl w:ilvl="0">
@@ -27113,7 +27164,7 @@
     </w:lvl>
   </w:abstractNum>
   <w:abstractNum w:abstractNumId="24" w15:restartNumberingAfterBreak="0">
-    <w:nsid w:val="506A42FA"/>
+    <w:nsid w:val="56FA7640"/>
     <w:multiLevelType w:val="singleLevel"/>
     <w:tmpl w:val="04160001"/>
     <w:lvl w:ilvl="0">
@@ -27130,7 +27181,7 @@
     </w:lvl>
   </w:abstractNum>
   <w:abstractNum w:abstractNumId="25" w15:restartNumberingAfterBreak="0">
-    <w:nsid w:val="523C066C"/>
+    <w:nsid w:val="58AC7E4B"/>
     <w:multiLevelType w:val="singleLevel"/>
     <w:tmpl w:val="04160001"/>
     <w:lvl w:ilvl="0">
@@ -27147,7 +27198,7 @@
     </w:lvl>
   </w:abstractNum>
   <w:abstractNum w:abstractNumId="26" w15:restartNumberingAfterBreak="0">
-    <w:nsid w:val="6176497F"/>
+    <w:nsid w:val="5E4F5077"/>
     <w:multiLevelType w:val="singleLevel"/>
     <w:tmpl w:val="04160001"/>
     <w:lvl w:ilvl="0">
@@ -27164,7 +27215,7 @@
     </w:lvl>
   </w:abstractNum>
   <w:abstractNum w:abstractNumId="27" w15:restartNumberingAfterBreak="0">
-    <w:nsid w:val="618A33DA"/>
+    <w:nsid w:val="699E24E1"/>
     <w:multiLevelType w:val="singleLevel"/>
     <w:tmpl w:val="04160001"/>
     <w:lvl w:ilvl="0">
@@ -27181,7 +27232,7 @@
     </w:lvl>
   </w:abstractNum>
   <w:abstractNum w:abstractNumId="28" w15:restartNumberingAfterBreak="0">
-    <w:nsid w:val="633F28BB"/>
+    <w:nsid w:val="6A7D05C0"/>
     <w:multiLevelType w:val="singleLevel"/>
     <w:tmpl w:val="04160001"/>
     <w:lvl w:ilvl="0">
@@ -27198,7 +27249,7 @@
     </w:lvl>
   </w:abstractNum>
   <w:abstractNum w:abstractNumId="29" w15:restartNumberingAfterBreak="0">
-    <w:nsid w:val="65E1455C"/>
+    <w:nsid w:val="6A8F329A"/>
     <w:multiLevelType w:val="singleLevel"/>
     <w:tmpl w:val="04160001"/>
     <w:lvl w:ilvl="0">
@@ -27215,7 +27266,7 @@
     </w:lvl>
   </w:abstractNum>
   <w:abstractNum w:abstractNumId="30" w15:restartNumberingAfterBreak="0">
-    <w:nsid w:val="67A74DE8"/>
+    <w:nsid w:val="6AC14E0A"/>
     <w:multiLevelType w:val="singleLevel"/>
     <w:tmpl w:val="04160001"/>
     <w:lvl w:ilvl="0">
@@ -27232,7 +27283,7 @@
     </w:lvl>
   </w:abstractNum>
   <w:abstractNum w:abstractNumId="31" w15:restartNumberingAfterBreak="0">
-    <w:nsid w:val="680556D4"/>
+    <w:nsid w:val="7122024C"/>
     <w:multiLevelType w:val="singleLevel"/>
     <w:tmpl w:val="04160001"/>
     <w:lvl w:ilvl="0">
@@ -27249,7 +27300,7 @@
     </w:lvl>
   </w:abstractNum>
   <w:abstractNum w:abstractNumId="32" w15:restartNumberingAfterBreak="0">
-    <w:nsid w:val="69A93401"/>
+    <w:nsid w:val="718E2689"/>
     <w:multiLevelType w:val="singleLevel"/>
     <w:tmpl w:val="04160001"/>
     <w:lvl w:ilvl="0">
@@ -27266,7 +27317,7 @@
     </w:lvl>
   </w:abstractNum>
   <w:abstractNum w:abstractNumId="33" w15:restartNumberingAfterBreak="0">
-    <w:nsid w:val="6ED94B54"/>
+    <w:nsid w:val="72113C22"/>
     <w:multiLevelType w:val="singleLevel"/>
     <w:tmpl w:val="04160001"/>
     <w:lvl w:ilvl="0">
@@ -27283,7 +27334,7 @@
     </w:lvl>
   </w:abstractNum>
   <w:abstractNum w:abstractNumId="34" w15:restartNumberingAfterBreak="0">
-    <w:nsid w:val="70885598"/>
+    <w:nsid w:val="733C1196"/>
     <w:multiLevelType w:val="singleLevel"/>
     <w:tmpl w:val="04160001"/>
     <w:lvl w:ilvl="0">
@@ -27300,7 +27351,7 @@
     </w:lvl>
   </w:abstractNum>
   <w:abstractNum w:abstractNumId="35" w15:restartNumberingAfterBreak="0">
-    <w:nsid w:val="75917BD4"/>
+    <w:nsid w:val="762A71FB"/>
     <w:multiLevelType w:val="singleLevel"/>
     <w:tmpl w:val="04160001"/>
     <w:lvl w:ilvl="0">
@@ -27317,7 +27368,7 @@
     </w:lvl>
   </w:abstractNum>
   <w:abstractNum w:abstractNumId="36" w15:restartNumberingAfterBreak="0">
-    <w:nsid w:val="78A92F34"/>
+    <w:nsid w:val="76F72F30"/>
     <w:multiLevelType w:val="singleLevel"/>
     <w:tmpl w:val="04160001"/>
     <w:lvl w:ilvl="0">
@@ -27334,7 +27385,7 @@
     </w:lvl>
   </w:abstractNum>
   <w:abstractNum w:abstractNumId="37" w15:restartNumberingAfterBreak="0">
-    <w:nsid w:val="7C077A2D"/>
+    <w:nsid w:val="77873666"/>
     <w:multiLevelType w:val="singleLevel"/>
     <w:tmpl w:val="04160001"/>
     <w:lvl w:ilvl="0">
@@ -27351,7 +27402,7 @@
     </w:lvl>
   </w:abstractNum>
   <w:abstractNum w:abstractNumId="38" w15:restartNumberingAfterBreak="0">
-    <w:nsid w:val="7CAD52FA"/>
+    <w:nsid w:val="79CB2F4C"/>
     <w:multiLevelType w:val="singleLevel"/>
     <w:tmpl w:val="04160001"/>
     <w:lvl w:ilvl="0">
@@ -27368,7 +27419,7 @@
     </w:lvl>
   </w:abstractNum>
   <w:abstractNum w:abstractNumId="39" w15:restartNumberingAfterBreak="0">
-    <w:nsid w:val="7F7F7299"/>
+    <w:nsid w:val="7B734A13"/>
     <w:multiLevelType w:val="singleLevel"/>
     <w:tmpl w:val="04160001"/>
     <w:lvl w:ilvl="0">
@@ -27385,7 +27436,7 @@
     </w:lvl>
   </w:abstractNum>
   <w:abstractNum w:abstractNumId="40" w15:restartNumberingAfterBreak="0">
-    <w:nsid w:val="7F8275C0"/>
+    <w:nsid w:val="7ECE0191"/>
     <w:multiLevelType w:val="singleLevel"/>
     <w:tmpl w:val="04160001"/>
     <w:lvl w:ilvl="0">
@@ -27401,128 +27452,128 @@
       </w:rPr>
     </w:lvl>
   </w:abstractNum>
-  <w:num w:numId="1" w16cid:durableId="545917401">
+  <w:num w:numId="1" w16cid:durableId="1642492011">
+    <w:abstractNumId w:val="3"/>
+  </w:num>
+  <w:num w:numId="2" w16cid:durableId="746922348">
+    <w:abstractNumId w:val="26"/>
+  </w:num>
+  <w:num w:numId="3" w16cid:durableId="1662780355">
+    <w:abstractNumId w:val="35"/>
+  </w:num>
+  <w:num w:numId="4" w16cid:durableId="2058115699">
+    <w:abstractNumId w:val="13"/>
+  </w:num>
+  <w:num w:numId="5" w16cid:durableId="699277715">
+    <w:abstractNumId w:val="16"/>
+  </w:num>
+  <w:num w:numId="6" w16cid:durableId="1953783837">
+    <w:abstractNumId w:val="36"/>
+  </w:num>
+  <w:num w:numId="7" w16cid:durableId="2059936955">
+    <w:abstractNumId w:val="24"/>
+  </w:num>
+  <w:num w:numId="8" w16cid:durableId="1054503446">
+    <w:abstractNumId w:val="40"/>
+  </w:num>
+  <w:num w:numId="9" w16cid:durableId="1606041416">
+    <w:abstractNumId w:val="34"/>
+  </w:num>
+  <w:num w:numId="10" w16cid:durableId="611471735">
     <w:abstractNumId w:val="38"/>
   </w:num>
-  <w:num w:numId="2" w16cid:durableId="718093525">
+  <w:num w:numId="11" w16cid:durableId="1556702484">
+    <w:abstractNumId w:val="27"/>
+  </w:num>
+  <w:num w:numId="12" w16cid:durableId="832836251">
+    <w:abstractNumId w:val="30"/>
+  </w:num>
+  <w:num w:numId="13" w16cid:durableId="346641190">
+    <w:abstractNumId w:val="7"/>
+  </w:num>
+  <w:num w:numId="14" w16cid:durableId="1408918824">
+    <w:abstractNumId w:val="0"/>
+  </w:num>
+  <w:num w:numId="15" w16cid:durableId="1209075318">
+    <w:abstractNumId w:val="6"/>
+  </w:num>
+  <w:num w:numId="16" w16cid:durableId="1626497863">
+    <w:abstractNumId w:val="31"/>
+  </w:num>
+  <w:num w:numId="17" w16cid:durableId="109323280">
+    <w:abstractNumId w:val="18"/>
+  </w:num>
+  <w:num w:numId="18" w16cid:durableId="85000878">
+    <w:abstractNumId w:val="32"/>
+  </w:num>
+  <w:num w:numId="19" w16cid:durableId="780106916">
+    <w:abstractNumId w:val="1"/>
+  </w:num>
+  <w:num w:numId="20" w16cid:durableId="610212969">
+    <w:abstractNumId w:val="10"/>
+  </w:num>
+  <w:num w:numId="21" w16cid:durableId="1017121529">
+    <w:abstractNumId w:val="12"/>
+  </w:num>
+  <w:num w:numId="22" w16cid:durableId="277836723">
+    <w:abstractNumId w:val="25"/>
+  </w:num>
+  <w:num w:numId="23" w16cid:durableId="1855420436">
+    <w:abstractNumId w:val="28"/>
+  </w:num>
+  <w:num w:numId="24" w16cid:durableId="731470018">
+    <w:abstractNumId w:val="17"/>
+  </w:num>
+  <w:num w:numId="25" w16cid:durableId="1150436832">
     <w:abstractNumId w:val="33"/>
   </w:num>
-  <w:num w:numId="3" w16cid:durableId="527523053">
+  <w:num w:numId="26" w16cid:durableId="825318607">
+    <w:abstractNumId w:val="20"/>
+  </w:num>
+  <w:num w:numId="27" w16cid:durableId="252129267">
     <w:abstractNumId w:val="21"/>
   </w:num>
-  <w:num w:numId="4" w16cid:durableId="67387022">
+  <w:num w:numId="28" w16cid:durableId="607739264">
+    <w:abstractNumId w:val="11"/>
+  </w:num>
+  <w:num w:numId="29" w16cid:durableId="558789069">
+    <w:abstractNumId w:val="4"/>
+  </w:num>
+  <w:num w:numId="30" w16cid:durableId="1677657947">
+    <w:abstractNumId w:val="22"/>
+  </w:num>
+  <w:num w:numId="31" w16cid:durableId="1271356922">
     <w:abstractNumId w:val="2"/>
   </w:num>
-  <w:num w:numId="5" w16cid:durableId="1646809921">
+  <w:num w:numId="32" w16cid:durableId="1888297694">
+    <w:abstractNumId w:val="19"/>
+  </w:num>
+  <w:num w:numId="33" w16cid:durableId="1433010279">
+    <w:abstractNumId w:val="9"/>
+  </w:num>
+  <w:num w:numId="34" w16cid:durableId="1113403025">
     <w:abstractNumId w:val="14"/>
   </w:num>
-  <w:num w:numId="6" w16cid:durableId="2074767508">
-    <w:abstractNumId w:val="15"/>
+  <w:num w:numId="35" w16cid:durableId="1920676883">
+    <w:abstractNumId w:val="29"/>
   </w:num>
-  <w:num w:numId="7" w16cid:durableId="520630865">
-    <w:abstractNumId w:val="40"/>
+  <w:num w:numId="36" w16cid:durableId="1066685994">
+    <w:abstractNumId w:val="23"/>
   </w:num>
-  <w:num w:numId="8" w16cid:durableId="109714215">
-    <w:abstractNumId w:val="25"/>
-  </w:num>
-  <w:num w:numId="9" w16cid:durableId="1830097979">
-    <w:abstractNumId w:val="26"/>
-  </w:num>
-  <w:num w:numId="10" w16cid:durableId="44644993">
-    <w:abstractNumId w:val="9"/>
-  </w:num>
-  <w:num w:numId="11" w16cid:durableId="902329036">
-    <w:abstractNumId w:val="22"/>
-  </w:num>
-  <w:num w:numId="12" w16cid:durableId="719550357">
-    <w:abstractNumId w:val="30"/>
-  </w:num>
-  <w:num w:numId="13" w16cid:durableId="326443111">
-    <w:abstractNumId w:val="17"/>
-  </w:num>
-  <w:num w:numId="14" w16cid:durableId="1563516565">
-    <w:abstractNumId w:val="20"/>
-  </w:num>
-  <w:num w:numId="15" w16cid:durableId="1718821588">
-    <w:abstractNumId w:val="32"/>
-  </w:num>
-  <w:num w:numId="16" w16cid:durableId="204174180">
-    <w:abstractNumId w:val="6"/>
-  </w:num>
-  <w:num w:numId="17" w16cid:durableId="1248657834">
+  <w:num w:numId="37" w16cid:durableId="1525442540">
     <w:abstractNumId w:val="5"/>
   </w:num>
-  <w:num w:numId="18" w16cid:durableId="554313426">
-    <w:abstractNumId w:val="34"/>
-  </w:num>
-  <w:num w:numId="19" w16cid:durableId="1100105163">
-    <w:abstractNumId w:val="18"/>
-  </w:num>
-  <w:num w:numId="20" w16cid:durableId="1063067611">
-    <w:abstractNumId w:val="23"/>
-  </w:num>
-  <w:num w:numId="21" w16cid:durableId="1205874306">
-    <w:abstractNumId w:val="31"/>
-  </w:num>
-  <w:num w:numId="22" w16cid:durableId="2099859376">
-    <w:abstractNumId w:val="24"/>
-  </w:num>
-  <w:num w:numId="23" w16cid:durableId="2111897603">
-    <w:abstractNumId w:val="13"/>
-  </w:num>
-  <w:num w:numId="24" w16cid:durableId="1026832524">
-    <w:abstractNumId w:val="4"/>
-  </w:num>
-  <w:num w:numId="25" w16cid:durableId="436026668">
-    <w:abstractNumId w:val="35"/>
-  </w:num>
-  <w:num w:numId="26" w16cid:durableId="252013127">
-    <w:abstractNumId w:val="36"/>
-  </w:num>
-  <w:num w:numId="27" w16cid:durableId="1574311880">
+  <w:num w:numId="38" w16cid:durableId="2006935769">
     <w:abstractNumId w:val="8"/>
   </w:num>
-  <w:num w:numId="28" w16cid:durableId="1961111764">
-    <w:abstractNumId w:val="0"/>
+  <w:num w:numId="39" w16cid:durableId="73211775">
+    <w:abstractNumId w:val="39"/>
   </w:num>
-  <w:num w:numId="29" w16cid:durableId="1807119080">
-    <w:abstractNumId w:val="3"/>
-  </w:num>
-  <w:num w:numId="30" w16cid:durableId="27874570">
-    <w:abstractNumId w:val="12"/>
-  </w:num>
-  <w:num w:numId="31" w16cid:durableId="215509349">
-    <w:abstractNumId w:val="10"/>
-  </w:num>
-  <w:num w:numId="32" w16cid:durableId="261492970">
-    <w:abstractNumId w:val="7"/>
-  </w:num>
-  <w:num w:numId="33" w16cid:durableId="12614503">
+  <w:num w:numId="40" w16cid:durableId="1865900988">
     <w:abstractNumId w:val="37"/>
   </w:num>
-  <w:num w:numId="34" w16cid:durableId="183178189">
-    <w:abstractNumId w:val="28"/>
-  </w:num>
-  <w:num w:numId="35" w16cid:durableId="1435978683">
-    <w:abstractNumId w:val="1"/>
-  </w:num>
-  <w:num w:numId="36" w16cid:durableId="753939262">
-    <w:abstractNumId w:val="39"/>
-  </w:num>
-  <w:num w:numId="37" w16cid:durableId="1969894472">
-    <w:abstractNumId w:val="29"/>
-  </w:num>
-  <w:num w:numId="38" w16cid:durableId="1797676774">
-    <w:abstractNumId w:val="27"/>
-  </w:num>
-  <w:num w:numId="39" w16cid:durableId="1491942608">
-    <w:abstractNumId w:val="19"/>
-  </w:num>
-  <w:num w:numId="40" w16cid:durableId="786774407">
-    <w:abstractNumId w:val="16"/>
-  </w:num>
-  <w:num w:numId="41" w16cid:durableId="532159069">
-    <w:abstractNumId w:val="11"/>
+  <w:num w:numId="41" w16cid:durableId="1406876186">
+    <w:abstractNumId w:val="15"/>
   </w:num>
 </w:numbering>
 </file>
@@ -27935,7 +27986,7 @@
     <w:link w:val="Ttulo1Char"/>
     <w:uiPriority w:val="9"/>
     <w:qFormat/>
-    <w:rsid w:val="003769CF"/>
+    <w:rsid w:val="0092479A"/>
     <w:pPr>
       <w:keepNext/>
       <w:keepLines/>
@@ -27957,7 +28008,7 @@
     <w:uiPriority w:val="9"/>
     <w:unhideWhenUsed/>
     <w:qFormat/>
-    <w:rsid w:val="003769CF"/>
+    <w:rsid w:val="0092479A"/>
     <w:pPr>
       <w:keepNext/>
       <w:keepLines/>
@@ -27980,7 +28031,7 @@
     <w:semiHidden/>
     <w:unhideWhenUsed/>
     <w:qFormat/>
-    <w:rsid w:val="003769CF"/>
+    <w:rsid w:val="0092479A"/>
     <w:pPr>
       <w:keepNext/>
       <w:keepLines/>
@@ -28003,7 +28054,7 @@
     <w:semiHidden/>
     <w:unhideWhenUsed/>
     <w:qFormat/>
-    <w:rsid w:val="003769CF"/>
+    <w:rsid w:val="0092479A"/>
     <w:pPr>
       <w:keepNext/>
       <w:keepLines/>
@@ -28026,7 +28077,7 @@
     <w:semiHidden/>
     <w:unhideWhenUsed/>
     <w:qFormat/>
-    <w:rsid w:val="003769CF"/>
+    <w:rsid w:val="0092479A"/>
     <w:pPr>
       <w:keepNext/>
       <w:keepLines/>
@@ -28047,7 +28098,7 @@
     <w:semiHidden/>
     <w:unhideWhenUsed/>
     <w:qFormat/>
-    <w:rsid w:val="003769CF"/>
+    <w:rsid w:val="0092479A"/>
     <w:pPr>
       <w:keepNext/>
       <w:keepLines/>
@@ -28070,7 +28121,7 @@
     <w:semiHidden/>
     <w:unhideWhenUsed/>
     <w:qFormat/>
-    <w:rsid w:val="003769CF"/>
+    <w:rsid w:val="0092479A"/>
     <w:pPr>
       <w:keepNext/>
       <w:keepLines/>
@@ -28091,7 +28142,7 @@
     <w:semiHidden/>
     <w:unhideWhenUsed/>
     <w:qFormat/>
-    <w:rsid w:val="003769CF"/>
+    <w:rsid w:val="0092479A"/>
     <w:pPr>
       <w:keepNext/>
       <w:keepLines/>
@@ -28114,7 +28165,7 @@
     <w:semiHidden/>
     <w:unhideWhenUsed/>
     <w:qFormat/>
-    <w:rsid w:val="003769CF"/>
+    <w:rsid w:val="0092479A"/>
     <w:pPr>
       <w:keepNext/>
       <w:keepLines/>
@@ -28158,7 +28209,7 @@
     <w:basedOn w:val="Fontepargpadro"/>
     <w:link w:val="Ttulo1"/>
     <w:uiPriority w:val="9"/>
-    <w:rsid w:val="003769CF"/>
+    <w:rsid w:val="0092479A"/>
     <w:rPr>
       <w:rFonts w:asciiTheme="majorHAnsi" w:eastAsiaTheme="majorEastAsia" w:hAnsiTheme="majorHAnsi" w:cstheme="majorBidi"/>
       <w:color w:val="0F4761" w:themeColor="accent1" w:themeShade="BF"/>
@@ -28171,7 +28222,7 @@
     <w:basedOn w:val="Fontepargpadro"/>
     <w:link w:val="Ttulo2"/>
     <w:uiPriority w:val="9"/>
-    <w:rsid w:val="003769CF"/>
+    <w:rsid w:val="0092479A"/>
     <w:rPr>
       <w:rFonts w:asciiTheme="majorHAnsi" w:eastAsiaTheme="majorEastAsia" w:hAnsiTheme="majorHAnsi" w:cstheme="majorBidi"/>
       <w:color w:val="0F4761" w:themeColor="accent1" w:themeShade="BF"/>
@@ -28185,7 +28236,7 @@
     <w:link w:val="Ttulo3"/>
     <w:uiPriority w:val="9"/>
     <w:semiHidden/>
-    <w:rsid w:val="003769CF"/>
+    <w:rsid w:val="0092479A"/>
     <w:rPr>
       <w:rFonts w:eastAsiaTheme="majorEastAsia" w:cstheme="majorBidi"/>
       <w:color w:val="0F4761" w:themeColor="accent1" w:themeShade="BF"/>
@@ -28199,7 +28250,7 @@
     <w:link w:val="Ttulo4"/>
     <w:uiPriority w:val="9"/>
     <w:semiHidden/>
-    <w:rsid w:val="003769CF"/>
+    <w:rsid w:val="0092479A"/>
     <w:rPr>
       <w:rFonts w:eastAsiaTheme="majorEastAsia" w:cstheme="majorBidi"/>
       <w:i/>
@@ -28213,7 +28264,7 @@
     <w:link w:val="Ttulo5"/>
     <w:uiPriority w:val="9"/>
     <w:semiHidden/>
-    <w:rsid w:val="003769CF"/>
+    <w:rsid w:val="0092479A"/>
     <w:rPr>
       <w:rFonts w:eastAsiaTheme="majorEastAsia" w:cstheme="majorBidi"/>
       <w:color w:val="0F4761" w:themeColor="accent1" w:themeShade="BF"/>
@@ -28225,7 +28276,7 @@
     <w:link w:val="Ttulo6"/>
     <w:uiPriority w:val="9"/>
     <w:semiHidden/>
-    <w:rsid w:val="003769CF"/>
+    <w:rsid w:val="0092479A"/>
     <w:rPr>
       <w:rFonts w:eastAsiaTheme="majorEastAsia" w:cstheme="majorBidi"/>
       <w:i/>
@@ -28239,7 +28290,7 @@
     <w:link w:val="Ttulo7"/>
     <w:uiPriority w:val="9"/>
     <w:semiHidden/>
-    <w:rsid w:val="003769CF"/>
+    <w:rsid w:val="0092479A"/>
     <w:rPr>
       <w:rFonts w:eastAsiaTheme="majorEastAsia" w:cstheme="majorBidi"/>
       <w:color w:val="595959" w:themeColor="text1" w:themeTint="A6"/>
@@ -28251,7 +28302,7 @@
     <w:link w:val="Ttulo8"/>
     <w:uiPriority w:val="9"/>
     <w:semiHidden/>
-    <w:rsid w:val="003769CF"/>
+    <w:rsid w:val="0092479A"/>
     <w:rPr>
       <w:rFonts w:eastAsiaTheme="majorEastAsia" w:cstheme="majorBidi"/>
       <w:i/>
@@ -28265,7 +28316,7 @@
     <w:link w:val="Ttulo9"/>
     <w:uiPriority w:val="9"/>
     <w:semiHidden/>
-    <w:rsid w:val="003769CF"/>
+    <w:rsid w:val="0092479A"/>
     <w:rPr>
       <w:rFonts w:eastAsiaTheme="majorEastAsia" w:cstheme="majorBidi"/>
       <w:color w:val="272727" w:themeColor="text1" w:themeTint="D8"/>
@@ -28278,7 +28329,7 @@
     <w:link w:val="TtuloChar"/>
     <w:uiPriority w:val="10"/>
     <w:qFormat/>
-    <w:rsid w:val="003769CF"/>
+    <w:rsid w:val="0092479A"/>
     <w:pPr>
       <w:spacing w:after="80" w:line="240" w:lineRule="auto"/>
       <w:contextualSpacing/>
@@ -28296,7 +28347,7 @@
     <w:basedOn w:val="Fontepargpadro"/>
     <w:link w:val="Ttulo"/>
     <w:uiPriority w:val="10"/>
-    <w:rsid w:val="003769CF"/>
+    <w:rsid w:val="0092479A"/>
     <w:rPr>
       <w:rFonts w:asciiTheme="majorHAnsi" w:eastAsiaTheme="majorEastAsia" w:hAnsiTheme="majorHAnsi" w:cstheme="majorBidi"/>
       <w:spacing w:val="-10"/>
@@ -28312,7 +28363,7 @@
     <w:link w:val="SubttuloChar"/>
     <w:uiPriority w:val="11"/>
     <w:qFormat/>
-    <w:rsid w:val="003769CF"/>
+    <w:rsid w:val="0092479A"/>
     <w:pPr>
       <w:numPr>
         <w:ilvl w:val="1"/>
@@ -28331,7 +28382,7 @@
     <w:basedOn w:val="Fontepargpadro"/>
     <w:link w:val="Subttulo"/>
     <w:uiPriority w:val="11"/>
-    <w:rsid w:val="003769CF"/>
+    <w:rsid w:val="0092479A"/>
     <w:rPr>
       <w:rFonts w:eastAsiaTheme="majorEastAsia" w:cstheme="majorBidi"/>
       <w:color w:val="595959" w:themeColor="text1" w:themeTint="A6"/>
@@ -28347,7 +28398,7 @@
     <w:link w:val="CitaoChar"/>
     <w:uiPriority w:val="29"/>
     <w:qFormat/>
-    <w:rsid w:val="003769CF"/>
+    <w:rsid w:val="0092479A"/>
     <w:pPr>
       <w:spacing w:before="160"/>
       <w:jc w:val="center"/>
@@ -28363,7 +28414,7 @@
     <w:basedOn w:val="Fontepargpadro"/>
     <w:link w:val="Citao"/>
     <w:uiPriority w:val="29"/>
-    <w:rsid w:val="003769CF"/>
+    <w:rsid w:val="0092479A"/>
     <w:rPr>
       <w:i/>
       <w:iCs/>
@@ -28375,7 +28426,7 @@
     <w:basedOn w:val="Normal"/>
     <w:uiPriority w:val="34"/>
     <w:qFormat/>
-    <w:rsid w:val="003769CF"/>
+    <w:rsid w:val="0092479A"/>
     <w:pPr>
       <w:ind w:left="720"/>
       <w:contextualSpacing/>
@@ -28386,7 +28437,7 @@
     <w:basedOn w:val="Fontepargpadro"/>
     <w:uiPriority w:val="21"/>
     <w:qFormat/>
-    <w:rsid w:val="003769CF"/>
+    <w:rsid w:val="0092479A"/>
     <w:rPr>
       <w:i/>
       <w:iCs/>
@@ -28400,7 +28451,7 @@
     <w:link w:val="CitaoIntensaChar"/>
     <w:uiPriority w:val="30"/>
     <w:qFormat/>
-    <w:rsid w:val="003769CF"/>
+    <w:rsid w:val="0092479A"/>
     <w:pPr>
       <w:pBdr>
         <w:top w:val="single" w:sz="4" w:space="10" w:color="0F4761" w:themeColor="accent1" w:themeShade="BF"/>
@@ -28421,7 +28472,7 @@
     <w:basedOn w:val="Fontepargpadro"/>
     <w:link w:val="CitaoIntensa"/>
     <w:uiPriority w:val="30"/>
-    <w:rsid w:val="003769CF"/>
+    <w:rsid w:val="0092479A"/>
     <w:rPr>
       <w:i/>
       <w:iCs/>
@@ -28433,7 +28484,7 @@
     <w:basedOn w:val="Fontepargpadro"/>
     <w:uiPriority w:val="32"/>
     <w:qFormat/>
-    <w:rsid w:val="003769CF"/>
+    <w:rsid w:val="0092479A"/>
     <w:rPr>
       <w:b/>
       <w:bCs/>
@@ -28448,7 +28499,7 @@
     <w:link w:val="CabealhoChar"/>
     <w:uiPriority w:val="99"/>
     <w:unhideWhenUsed/>
-    <w:rsid w:val="003769CF"/>
+    <w:rsid w:val="0092479A"/>
     <w:pPr>
       <w:tabs>
         <w:tab w:val="center" w:pos="4252"/>
@@ -28462,7 +28513,7 @@
     <w:basedOn w:val="Fontepargpadro"/>
     <w:link w:val="Cabealho"/>
     <w:uiPriority w:val="99"/>
-    <w:rsid w:val="003769CF"/>
+    <w:rsid w:val="0092479A"/>
   </w:style>
   <w:style w:type="paragraph" w:styleId="Rodap">
     <w:name w:val="footer"/>
@@ -28470,7 +28521,7 @@
     <w:link w:val="RodapChar"/>
     <w:uiPriority w:val="99"/>
     <w:unhideWhenUsed/>
-    <w:rsid w:val="003769CF"/>
+    <w:rsid w:val="0092479A"/>
     <w:pPr>
       <w:tabs>
         <w:tab w:val="center" w:pos="4252"/>
@@ -28484,7 +28535,7 @@
     <w:basedOn w:val="Fontepargpadro"/>
     <w:link w:val="Rodap"/>
     <w:uiPriority w:val="99"/>
-    <w:rsid w:val="003769CF"/>
+    <w:rsid w:val="0092479A"/>
   </w:style>
   <w:style w:type="paragraph" w:styleId="Sumrio1">
     <w:name w:val="toc 1"/>
@@ -28493,7 +28544,7 @@
     <w:autoRedefine/>
     <w:uiPriority w:val="39"/>
     <w:unhideWhenUsed/>
-    <w:rsid w:val="003769CF"/>
+    <w:rsid w:val="0092479A"/>
     <w:pPr>
       <w:spacing w:after="100"/>
     </w:pPr>
@@ -28505,7 +28556,7 @@
     <w:autoRedefine/>
     <w:uiPriority w:val="39"/>
     <w:unhideWhenUsed/>
-    <w:rsid w:val="003769CF"/>
+    <w:rsid w:val="0092479A"/>
     <w:pPr>
       <w:spacing w:after="100"/>
       <w:ind w:left="240"/>

</xml_diff>

<commit_message>
Atualiza Manual de Uso (v2.89) com o upload de anexos da Viabilidade
Passo 4 (Planejamento e Desenvolvimento de Projeto) ganha uma nota sobre
o novo upload de arquivo na aba Viabilidade, no mesmo padrao ja usado pela
Solicitacao de Demanda (Passo 1) e pela SMP (Passo 7).

Co-Authored-By: Claude Sonnet 5 <noreply@anthropic.com>
</commit_message>
<xml_diff>
--- a/Manual de Uso - Ferramenta de Gestao de Projetos.docx
+++ b/Manual de Uso - Ferramenta de Gestao de Projetos.docx
@@ -129,7 +129,7 @@
           <w:color w:val="6A6A70"/>
           <w:sz w:val="22"/>
         </w:rPr>
-        <w:t>Versao 2.88 - 17 de setembro de 2026 (substitui a versao 2.87 de 17/09/2026)</w:t>
+        <w:t>Versao 2.89 - 17 de setembro de 2026 (substitui a versao 2.88 de 17/09/2026)</w:t>
       </w:r>
     </w:p>
     <w:p>
@@ -229,7 +229,7 @@
         <w:rPr>
           <w:noProof/>
         </w:rPr>
-        <w:instrText xml:space="preserve"> PAGEREF _Toc240546251 \h </w:instrText>
+        <w:instrText xml:space="preserve"> PAGEREF _Toc240550726 \h </w:instrText>
       </w:r>
       <w:r>
         <w:rPr>
@@ -290,7 +290,7 @@
         <w:rPr>
           <w:noProof/>
         </w:rPr>
-        <w:instrText xml:space="preserve"> PAGEREF _Toc240546252 \h </w:instrText>
+        <w:instrText xml:space="preserve"> PAGEREF _Toc240550727 \h </w:instrText>
       </w:r>
       <w:r>
         <w:rPr>
@@ -351,7 +351,7 @@
         <w:rPr>
           <w:noProof/>
         </w:rPr>
-        <w:instrText xml:space="preserve"> PAGEREF _Toc240546253 \h </w:instrText>
+        <w:instrText xml:space="preserve"> PAGEREF _Toc240550728 \h </w:instrText>
       </w:r>
       <w:r>
         <w:rPr>
@@ -412,7 +412,7 @@
         <w:rPr>
           <w:noProof/>
         </w:rPr>
-        <w:instrText xml:space="preserve"> PAGEREF _Toc240546254 \h </w:instrText>
+        <w:instrText xml:space="preserve"> PAGEREF _Toc240550729 \h </w:instrText>
       </w:r>
       <w:r>
         <w:rPr>
@@ -473,7 +473,7 @@
         <w:rPr>
           <w:noProof/>
         </w:rPr>
-        <w:instrText xml:space="preserve"> PAGEREF _Toc240546255 \h </w:instrText>
+        <w:instrText xml:space="preserve"> PAGEREF _Toc240550730 \h </w:instrText>
       </w:r>
       <w:r>
         <w:rPr>
@@ -534,7 +534,7 @@
         <w:rPr>
           <w:noProof/>
         </w:rPr>
-        <w:instrText xml:space="preserve"> PAGEREF _Toc240546256 \h </w:instrText>
+        <w:instrText xml:space="preserve"> PAGEREF _Toc240550731 \h </w:instrText>
       </w:r>
       <w:r>
         <w:rPr>
@@ -551,7 +551,7 @@
         <w:rPr>
           <w:noProof/>
         </w:rPr>
-        <w:t>26</w:t>
+        <w:t>27</w:t>
       </w:r>
       <w:r>
         <w:rPr>
@@ -595,7 +595,7 @@
         <w:rPr>
           <w:noProof/>
         </w:rPr>
-        <w:instrText xml:space="preserve"> PAGEREF _Toc240546257 \h </w:instrText>
+        <w:instrText xml:space="preserve"> PAGEREF _Toc240550732 \h </w:instrText>
       </w:r>
       <w:r>
         <w:rPr>
@@ -612,7 +612,7 @@
         <w:rPr>
           <w:noProof/>
         </w:rPr>
-        <w:t>26</w:t>
+        <w:t>27</w:t>
       </w:r>
       <w:r>
         <w:rPr>
@@ -656,7 +656,7 @@
         <w:rPr>
           <w:noProof/>
         </w:rPr>
-        <w:instrText xml:space="preserve"> PAGEREF _Toc240546258 \h </w:instrText>
+        <w:instrText xml:space="preserve"> PAGEREF _Toc240550733 \h </w:instrText>
       </w:r>
       <w:r>
         <w:rPr>
@@ -673,7 +673,7 @@
         <w:rPr>
           <w:noProof/>
         </w:rPr>
-        <w:t>26</w:t>
+        <w:t>27</w:t>
       </w:r>
       <w:r>
         <w:rPr>
@@ -717,7 +717,7 @@
         <w:rPr>
           <w:noProof/>
         </w:rPr>
-        <w:instrText xml:space="preserve"> PAGEREF _Toc240546259 \h </w:instrText>
+        <w:instrText xml:space="preserve"> PAGEREF _Toc240550734 \h </w:instrText>
       </w:r>
       <w:r>
         <w:rPr>
@@ -734,7 +734,7 @@
         <w:rPr>
           <w:noProof/>
         </w:rPr>
-        <w:t>26</w:t>
+        <w:t>27</w:t>
       </w:r>
       <w:r>
         <w:rPr>
@@ -778,7 +778,7 @@
         <w:rPr>
           <w:noProof/>
         </w:rPr>
-        <w:instrText xml:space="preserve"> PAGEREF _Toc240546260 \h </w:instrText>
+        <w:instrText xml:space="preserve"> PAGEREF _Toc240550735 \h </w:instrText>
       </w:r>
       <w:r>
         <w:rPr>
@@ -795,7 +795,7 @@
         <w:rPr>
           <w:noProof/>
         </w:rPr>
-        <w:t>27</w:t>
+        <w:t>28</w:t>
       </w:r>
       <w:r>
         <w:rPr>
@@ -839,7 +839,7 @@
         <w:rPr>
           <w:noProof/>
         </w:rPr>
-        <w:instrText xml:space="preserve"> PAGEREF _Toc240546261 \h </w:instrText>
+        <w:instrText xml:space="preserve"> PAGEREF _Toc240550736 \h </w:instrText>
       </w:r>
       <w:r>
         <w:rPr>
@@ -856,7 +856,7 @@
         <w:rPr>
           <w:noProof/>
         </w:rPr>
-        <w:t>28</w:t>
+        <w:t>29</w:t>
       </w:r>
       <w:r>
         <w:rPr>
@@ -900,7 +900,7 @@
         <w:rPr>
           <w:noProof/>
         </w:rPr>
-        <w:instrText xml:space="preserve"> PAGEREF _Toc240546262 \h </w:instrText>
+        <w:instrText xml:space="preserve"> PAGEREF _Toc240550737 \h </w:instrText>
       </w:r>
       <w:r>
         <w:rPr>
@@ -917,7 +917,7 @@
         <w:rPr>
           <w:noProof/>
         </w:rPr>
-        <w:t>30</w:t>
+        <w:t>31</w:t>
       </w:r>
       <w:r>
         <w:rPr>
@@ -961,7 +961,7 @@
         <w:rPr>
           <w:noProof/>
         </w:rPr>
-        <w:instrText xml:space="preserve"> PAGEREF _Toc240546263 \h </w:instrText>
+        <w:instrText xml:space="preserve"> PAGEREF _Toc240550738 \h </w:instrText>
       </w:r>
       <w:r>
         <w:rPr>
@@ -978,7 +978,7 @@
         <w:rPr>
           <w:noProof/>
         </w:rPr>
-        <w:t>31</w:t>
+        <w:t>32</w:t>
       </w:r>
       <w:r>
         <w:rPr>
@@ -1022,7 +1022,7 @@
         <w:rPr>
           <w:noProof/>
         </w:rPr>
-        <w:instrText xml:space="preserve"> PAGEREF _Toc240546264 \h </w:instrText>
+        <w:instrText xml:space="preserve"> PAGEREF _Toc240550739 \h </w:instrText>
       </w:r>
       <w:r>
         <w:rPr>
@@ -1039,7 +1039,7 @@
         <w:rPr>
           <w:noProof/>
         </w:rPr>
-        <w:t>32</w:t>
+        <w:t>33</w:t>
       </w:r>
       <w:r>
         <w:rPr>
@@ -1083,7 +1083,7 @@
         <w:rPr>
           <w:noProof/>
         </w:rPr>
-        <w:instrText xml:space="preserve"> PAGEREF _Toc240546265 \h </w:instrText>
+        <w:instrText xml:space="preserve"> PAGEREF _Toc240550740 \h </w:instrText>
       </w:r>
       <w:r>
         <w:rPr>
@@ -1100,7 +1100,7 @@
         <w:rPr>
           <w:noProof/>
         </w:rPr>
-        <w:t>32</w:t>
+        <w:t>33</w:t>
       </w:r>
       <w:r>
         <w:rPr>
@@ -1144,7 +1144,7 @@
         <w:rPr>
           <w:noProof/>
         </w:rPr>
-        <w:instrText xml:space="preserve"> PAGEREF _Toc240546266 \h </w:instrText>
+        <w:instrText xml:space="preserve"> PAGEREF _Toc240550741 \h </w:instrText>
       </w:r>
       <w:r>
         <w:rPr>
@@ -1161,7 +1161,7 @@
         <w:rPr>
           <w:noProof/>
         </w:rPr>
-        <w:t>33</w:t>
+        <w:t>34</w:t>
       </w:r>
       <w:r>
         <w:rPr>
@@ -1205,7 +1205,7 @@
         <w:rPr>
           <w:noProof/>
         </w:rPr>
-        <w:instrText xml:space="preserve"> PAGEREF _Toc240546267 \h </w:instrText>
+        <w:instrText xml:space="preserve"> PAGEREF _Toc240550742 \h </w:instrText>
       </w:r>
       <w:r>
         <w:rPr>
@@ -1222,7 +1222,7 @@
         <w:rPr>
           <w:noProof/>
         </w:rPr>
-        <w:t>34</w:t>
+        <w:t>35</w:t>
       </w:r>
       <w:r>
         <w:rPr>
@@ -1266,7 +1266,7 @@
         <w:rPr>
           <w:noProof/>
         </w:rPr>
-        <w:instrText xml:space="preserve"> PAGEREF _Toc240546268 \h </w:instrText>
+        <w:instrText xml:space="preserve"> PAGEREF _Toc240550743 \h </w:instrText>
       </w:r>
       <w:r>
         <w:rPr>
@@ -1283,7 +1283,7 @@
         <w:rPr>
           <w:noProof/>
         </w:rPr>
-        <w:t>34</w:t>
+        <w:t>35</w:t>
       </w:r>
       <w:r>
         <w:rPr>
@@ -1327,7 +1327,7 @@
         <w:rPr>
           <w:noProof/>
         </w:rPr>
-        <w:instrText xml:space="preserve"> PAGEREF _Toc240546269 \h </w:instrText>
+        <w:instrText xml:space="preserve"> PAGEREF _Toc240550744 \h </w:instrText>
       </w:r>
       <w:r>
         <w:rPr>
@@ -1344,7 +1344,7 @@
         <w:rPr>
           <w:noProof/>
         </w:rPr>
-        <w:t>36</w:t>
+        <w:t>37</w:t>
       </w:r>
       <w:r>
         <w:rPr>
@@ -1388,7 +1388,7 @@
         <w:rPr>
           <w:noProof/>
         </w:rPr>
-        <w:instrText xml:space="preserve"> PAGEREF _Toc240546270 \h </w:instrText>
+        <w:instrText xml:space="preserve"> PAGEREF _Toc240550745 \h </w:instrText>
       </w:r>
       <w:r>
         <w:rPr>
@@ -1405,7 +1405,7 @@
         <w:rPr>
           <w:noProof/>
         </w:rPr>
-        <w:t>37</w:t>
+        <w:t>38</w:t>
       </w:r>
       <w:r>
         <w:rPr>
@@ -1449,7 +1449,7 @@
         <w:rPr>
           <w:noProof/>
         </w:rPr>
-        <w:instrText xml:space="preserve"> PAGEREF _Toc240546271 \h </w:instrText>
+        <w:instrText xml:space="preserve"> PAGEREF _Toc240550746 \h </w:instrText>
       </w:r>
       <w:r>
         <w:rPr>
@@ -1466,7 +1466,7 @@
         <w:rPr>
           <w:noProof/>
         </w:rPr>
-        <w:t>38</w:t>
+        <w:t>39</w:t>
       </w:r>
       <w:r>
         <w:rPr>
@@ -1510,7 +1510,7 @@
         <w:rPr>
           <w:noProof/>
         </w:rPr>
-        <w:instrText xml:space="preserve"> PAGEREF _Toc240546272 \h </w:instrText>
+        <w:instrText xml:space="preserve"> PAGEREF _Toc240550747 \h </w:instrText>
       </w:r>
       <w:r>
         <w:rPr>
@@ -1527,7 +1527,7 @@
         <w:rPr>
           <w:noProof/>
         </w:rPr>
-        <w:t>39</w:t>
+        <w:t>40</w:t>
       </w:r>
       <w:r>
         <w:rPr>
@@ -1571,7 +1571,7 @@
         <w:rPr>
           <w:noProof/>
         </w:rPr>
-        <w:instrText xml:space="preserve"> PAGEREF _Toc240546273 \h </w:instrText>
+        <w:instrText xml:space="preserve"> PAGEREF _Toc240550748 \h </w:instrText>
       </w:r>
       <w:r>
         <w:rPr>
@@ -1588,7 +1588,7 @@
         <w:rPr>
           <w:noProof/>
         </w:rPr>
-        <w:t>40</w:t>
+        <w:t>41</w:t>
       </w:r>
       <w:r>
         <w:rPr>
@@ -1632,7 +1632,7 @@
         <w:rPr>
           <w:noProof/>
         </w:rPr>
-        <w:instrText xml:space="preserve"> PAGEREF _Toc240546274 \h </w:instrText>
+        <w:instrText xml:space="preserve"> PAGEREF _Toc240550749 \h </w:instrText>
       </w:r>
       <w:r>
         <w:rPr>
@@ -1649,7 +1649,7 @@
         <w:rPr>
           <w:noProof/>
         </w:rPr>
-        <w:t>40</w:t>
+        <w:t>41</w:t>
       </w:r>
       <w:r>
         <w:rPr>
@@ -1693,7 +1693,7 @@
         <w:rPr>
           <w:noProof/>
         </w:rPr>
-        <w:instrText xml:space="preserve"> PAGEREF _Toc240546275 \h </w:instrText>
+        <w:instrText xml:space="preserve"> PAGEREF _Toc240550750 \h </w:instrText>
       </w:r>
       <w:r>
         <w:rPr>
@@ -1710,7 +1710,7 @@
         <w:rPr>
           <w:noProof/>
         </w:rPr>
-        <w:t>43</w:t>
+        <w:t>44</w:t>
       </w:r>
       <w:r>
         <w:rPr>
@@ -1754,7 +1754,7 @@
         <w:rPr>
           <w:noProof/>
         </w:rPr>
-        <w:instrText xml:space="preserve"> PAGEREF _Toc240546276 \h </w:instrText>
+        <w:instrText xml:space="preserve"> PAGEREF _Toc240550751 \h </w:instrText>
       </w:r>
       <w:r>
         <w:rPr>
@@ -1771,7 +1771,7 @@
         <w:rPr>
           <w:noProof/>
         </w:rPr>
-        <w:t>45</w:t>
+        <w:t>46</w:t>
       </w:r>
       <w:r>
         <w:rPr>
@@ -1816,7 +1816,7 @@
         <w:rPr>
           <w:noProof/>
         </w:rPr>
-        <w:instrText xml:space="preserve"> PAGEREF _Toc240546277 \h </w:instrText>
+        <w:instrText xml:space="preserve"> PAGEREF _Toc240550752 \h </w:instrText>
       </w:r>
       <w:r>
         <w:rPr>
@@ -1833,7 +1833,7 @@
         <w:rPr>
           <w:noProof/>
         </w:rPr>
-        <w:t>50</w:t>
+        <w:t>51</w:t>
       </w:r>
       <w:r>
         <w:rPr>
@@ -1877,7 +1877,7 @@
         <w:rPr>
           <w:noProof/>
         </w:rPr>
-        <w:instrText xml:space="preserve"> PAGEREF _Toc240546278 \h </w:instrText>
+        <w:instrText xml:space="preserve"> PAGEREF _Toc240550753 \h </w:instrText>
       </w:r>
       <w:r>
         <w:rPr>
@@ -1894,7 +1894,7 @@
         <w:rPr>
           <w:noProof/>
         </w:rPr>
-        <w:t>55</w:t>
+        <w:t>56</w:t>
       </w:r>
       <w:r>
         <w:rPr>
@@ -1938,7 +1938,7 @@
         <w:rPr>
           <w:noProof/>
         </w:rPr>
-        <w:instrText xml:space="preserve"> PAGEREF _Toc240546279 \h </w:instrText>
+        <w:instrText xml:space="preserve"> PAGEREF _Toc240550754 \h </w:instrText>
       </w:r>
       <w:r>
         <w:rPr>
@@ -1955,7 +1955,7 @@
         <w:rPr>
           <w:noProof/>
         </w:rPr>
-        <w:t>58</w:t>
+        <w:t>59</w:t>
       </w:r>
       <w:r>
         <w:rPr>
@@ -1999,7 +1999,7 @@
         <w:rPr>
           <w:noProof/>
         </w:rPr>
-        <w:instrText xml:space="preserve"> PAGEREF _Toc240546280 \h </w:instrText>
+        <w:instrText xml:space="preserve"> PAGEREF _Toc240550755 \h </w:instrText>
       </w:r>
       <w:r>
         <w:rPr>
@@ -2016,7 +2016,7 @@
         <w:rPr>
           <w:noProof/>
         </w:rPr>
-        <w:t>60</w:t>
+        <w:t>61</w:t>
       </w:r>
       <w:r>
         <w:rPr>
@@ -2060,7 +2060,7 @@
         <w:rPr>
           <w:noProof/>
         </w:rPr>
-        <w:instrText xml:space="preserve"> PAGEREF _Toc240546281 \h </w:instrText>
+        <w:instrText xml:space="preserve"> PAGEREF _Toc240550756 \h </w:instrText>
       </w:r>
       <w:r>
         <w:rPr>
@@ -2077,7 +2077,7 @@
         <w:rPr>
           <w:noProof/>
         </w:rPr>
-        <w:t>62</w:t>
+        <w:t>63</w:t>
       </w:r>
       <w:r>
         <w:rPr>
@@ -2121,7 +2121,7 @@
         <w:rPr>
           <w:noProof/>
         </w:rPr>
-        <w:instrText xml:space="preserve"> PAGEREF _Toc240546282 \h </w:instrText>
+        <w:instrText xml:space="preserve"> PAGEREF _Toc240550757 \h </w:instrText>
       </w:r>
       <w:r>
         <w:rPr>
@@ -2138,7 +2138,7 @@
         <w:rPr>
           <w:noProof/>
         </w:rPr>
-        <w:t>65</w:t>
+        <w:t>66</w:t>
       </w:r>
       <w:r>
         <w:rPr>
@@ -2182,7 +2182,7 @@
         <w:rPr>
           <w:noProof/>
         </w:rPr>
-        <w:instrText xml:space="preserve"> PAGEREF _Toc240546283 \h </w:instrText>
+        <w:instrText xml:space="preserve"> PAGEREF _Toc240550758 \h </w:instrText>
       </w:r>
       <w:r>
         <w:rPr>
@@ -2199,7 +2199,7 @@
         <w:rPr>
           <w:noProof/>
         </w:rPr>
-        <w:t>67</w:t>
+        <w:t>68</w:t>
       </w:r>
       <w:r>
         <w:rPr>
@@ -2243,7 +2243,7 @@
         <w:rPr>
           <w:noProof/>
         </w:rPr>
-        <w:instrText xml:space="preserve"> PAGEREF _Toc240546284 \h </w:instrText>
+        <w:instrText xml:space="preserve"> PAGEREF _Toc240550759 \h </w:instrText>
       </w:r>
       <w:r>
         <w:rPr>
@@ -2260,7 +2260,7 @@
         <w:rPr>
           <w:noProof/>
         </w:rPr>
-        <w:t>69</w:t>
+        <w:t>70</w:t>
       </w:r>
       <w:r>
         <w:rPr>
@@ -2304,7 +2304,7 @@
         <w:rPr>
           <w:noProof/>
         </w:rPr>
-        <w:instrText xml:space="preserve"> PAGEREF _Toc240546285 \h </w:instrText>
+        <w:instrText xml:space="preserve"> PAGEREF _Toc240550760 \h </w:instrText>
       </w:r>
       <w:r>
         <w:rPr>
@@ -2321,7 +2321,7 @@
         <w:rPr>
           <w:noProof/>
         </w:rPr>
-        <w:t>69</w:t>
+        <w:t>70</w:t>
       </w:r>
       <w:r>
         <w:rPr>
@@ -2365,7 +2365,7 @@
         <w:rPr>
           <w:noProof/>
         </w:rPr>
-        <w:instrText xml:space="preserve"> PAGEREF _Toc240546286 \h </w:instrText>
+        <w:instrText xml:space="preserve"> PAGEREF _Toc240550761 \h </w:instrText>
       </w:r>
       <w:r>
         <w:rPr>
@@ -2382,7 +2382,7 @@
         <w:rPr>
           <w:noProof/>
         </w:rPr>
-        <w:t>76</w:t>
+        <w:t>77</w:t>
       </w:r>
       <w:r>
         <w:rPr>
@@ -2426,7 +2426,7 @@
         <w:rPr>
           <w:noProof/>
         </w:rPr>
-        <w:instrText xml:space="preserve"> PAGEREF _Toc240546287 \h </w:instrText>
+        <w:instrText xml:space="preserve"> PAGEREF _Toc240550762 \h </w:instrText>
       </w:r>
       <w:r>
         <w:rPr>
@@ -2443,7 +2443,7 @@
         <w:rPr>
           <w:noProof/>
         </w:rPr>
-        <w:t>82</w:t>
+        <w:t>83</w:t>
       </w:r>
       <w:r>
         <w:rPr>
@@ -2487,7 +2487,7 @@
         <w:rPr>
           <w:noProof/>
         </w:rPr>
-        <w:instrText xml:space="preserve"> PAGEREF _Toc240546288 \h </w:instrText>
+        <w:instrText xml:space="preserve"> PAGEREF _Toc240550763 \h </w:instrText>
       </w:r>
       <w:r>
         <w:rPr>
@@ -2504,7 +2504,7 @@
         <w:rPr>
           <w:noProof/>
         </w:rPr>
-        <w:t>82</w:t>
+        <w:t>83</w:t>
       </w:r>
       <w:r>
         <w:rPr>
@@ -2548,7 +2548,7 @@
         <w:rPr>
           <w:noProof/>
         </w:rPr>
-        <w:instrText xml:space="preserve"> PAGEREF _Toc240546289 \h </w:instrText>
+        <w:instrText xml:space="preserve"> PAGEREF _Toc240550764 \h </w:instrText>
       </w:r>
       <w:r>
         <w:rPr>
@@ -2565,7 +2565,7 @@
         <w:rPr>
           <w:noProof/>
         </w:rPr>
-        <w:t>83</w:t>
+        <w:t>84</w:t>
       </w:r>
       <w:r>
         <w:rPr>
@@ -2609,7 +2609,7 @@
         <w:rPr>
           <w:noProof/>
         </w:rPr>
-        <w:instrText xml:space="preserve"> PAGEREF _Toc240546290 \h </w:instrText>
+        <w:instrText xml:space="preserve"> PAGEREF _Toc240550765 \h </w:instrText>
       </w:r>
       <w:r>
         <w:rPr>
@@ -2626,7 +2626,7 @@
         <w:rPr>
           <w:noProof/>
         </w:rPr>
-        <w:t>83</w:t>
+        <w:t>84</w:t>
       </w:r>
       <w:r>
         <w:rPr>
@@ -2670,7 +2670,7 @@
         <w:rPr>
           <w:noProof/>
         </w:rPr>
-        <w:instrText xml:space="preserve"> PAGEREF _Toc240546291 \h </w:instrText>
+        <w:instrText xml:space="preserve"> PAGEREF _Toc240550766 \h </w:instrText>
       </w:r>
       <w:r>
         <w:rPr>
@@ -2687,7 +2687,7 @@
         <w:rPr>
           <w:noProof/>
         </w:rPr>
-        <w:t>86</w:t>
+        <w:t>87</w:t>
       </w:r>
       <w:r>
         <w:rPr>
@@ -2731,7 +2731,7 @@
         <w:rPr>
           <w:noProof/>
         </w:rPr>
-        <w:instrText xml:space="preserve"> PAGEREF _Toc240546292 \h </w:instrText>
+        <w:instrText xml:space="preserve"> PAGEREF _Toc240550767 \h </w:instrText>
       </w:r>
       <w:r>
         <w:rPr>
@@ -2748,7 +2748,7 @@
         <w:rPr>
           <w:noProof/>
         </w:rPr>
-        <w:t>86</w:t>
+        <w:t>87</w:t>
       </w:r>
       <w:r>
         <w:rPr>
@@ -2792,7 +2792,7 @@
         <w:rPr>
           <w:noProof/>
         </w:rPr>
-        <w:instrText xml:space="preserve"> PAGEREF _Toc240546293 \h </w:instrText>
+        <w:instrText xml:space="preserve"> PAGEREF _Toc240550768 \h </w:instrText>
       </w:r>
       <w:r>
         <w:rPr>
@@ -2809,7 +2809,7 @@
         <w:rPr>
           <w:noProof/>
         </w:rPr>
-        <w:t>88</w:t>
+        <w:t>89</w:t>
       </w:r>
       <w:r>
         <w:rPr>
@@ -2853,7 +2853,7 @@
         <w:rPr>
           <w:noProof/>
         </w:rPr>
-        <w:instrText xml:space="preserve"> PAGEREF _Toc240546294 \h </w:instrText>
+        <w:instrText xml:space="preserve"> PAGEREF _Toc240550769 \h </w:instrText>
       </w:r>
       <w:r>
         <w:rPr>
@@ -2870,7 +2870,7 @@
         <w:rPr>
           <w:noProof/>
         </w:rPr>
-        <w:t>89</w:t>
+        <w:t>90</w:t>
       </w:r>
       <w:r>
         <w:rPr>
@@ -2914,7 +2914,7 @@
         <w:rPr>
           <w:noProof/>
         </w:rPr>
-        <w:instrText xml:space="preserve"> PAGEREF _Toc240546295 \h </w:instrText>
+        <w:instrText xml:space="preserve"> PAGEREF _Toc240550770 \h </w:instrText>
       </w:r>
       <w:r>
         <w:rPr>
@@ -2931,7 +2931,7 @@
         <w:rPr>
           <w:noProof/>
         </w:rPr>
-        <w:t>91</w:t>
+        <w:t>92</w:t>
       </w:r>
       <w:r>
         <w:rPr>
@@ -2975,7 +2975,7 @@
         <w:rPr>
           <w:noProof/>
         </w:rPr>
-        <w:instrText xml:space="preserve"> PAGEREF _Toc240546296 \h </w:instrText>
+        <w:instrText xml:space="preserve"> PAGEREF _Toc240550771 \h </w:instrText>
       </w:r>
       <w:r>
         <w:rPr>
@@ -2992,7 +2992,7 @@
         <w:rPr>
           <w:noProof/>
         </w:rPr>
-        <w:t>94</w:t>
+        <w:t>95</w:t>
       </w:r>
       <w:r>
         <w:rPr>
@@ -3036,7 +3036,7 @@
         <w:rPr>
           <w:noProof/>
         </w:rPr>
-        <w:instrText xml:space="preserve"> PAGEREF _Toc240546297 \h </w:instrText>
+        <w:instrText xml:space="preserve"> PAGEREF _Toc240550772 \h </w:instrText>
       </w:r>
       <w:r>
         <w:rPr>
@@ -3053,7 +3053,7 @@
         <w:rPr>
           <w:noProof/>
         </w:rPr>
-        <w:t>97</w:t>
+        <w:t>98</w:t>
       </w:r>
       <w:r>
         <w:rPr>
@@ -3097,7 +3097,7 @@
         <w:rPr>
           <w:noProof/>
         </w:rPr>
-        <w:instrText xml:space="preserve"> PAGEREF _Toc240546298 \h </w:instrText>
+        <w:instrText xml:space="preserve"> PAGEREF _Toc240550773 \h </w:instrText>
       </w:r>
       <w:r>
         <w:rPr>
@@ -3114,7 +3114,7 @@
         <w:rPr>
           <w:noProof/>
         </w:rPr>
-        <w:t>98</w:t>
+        <w:t>99</w:t>
       </w:r>
       <w:r>
         <w:rPr>
@@ -3158,7 +3158,7 @@
         <w:rPr>
           <w:noProof/>
         </w:rPr>
-        <w:instrText xml:space="preserve"> PAGEREF _Toc240546299 \h </w:instrText>
+        <w:instrText xml:space="preserve"> PAGEREF _Toc240550774 \h </w:instrText>
       </w:r>
       <w:r>
         <w:rPr>
@@ -3175,7 +3175,7 @@
         <w:rPr>
           <w:noProof/>
         </w:rPr>
-        <w:t>99</w:t>
+        <w:t>100</w:t>
       </w:r>
       <w:r>
         <w:rPr>
@@ -3219,7 +3219,7 @@
         <w:rPr>
           <w:noProof/>
         </w:rPr>
-        <w:instrText xml:space="preserve"> PAGEREF _Toc240546300 \h </w:instrText>
+        <w:instrText xml:space="preserve"> PAGEREF _Toc240550775 \h </w:instrText>
       </w:r>
       <w:r>
         <w:rPr>
@@ -3236,7 +3236,7 @@
         <w:rPr>
           <w:noProof/>
         </w:rPr>
-        <w:t>99</w:t>
+        <w:t>100</w:t>
       </w:r>
       <w:r>
         <w:rPr>
@@ -3280,7 +3280,7 @@
         <w:rPr>
           <w:noProof/>
         </w:rPr>
-        <w:instrText xml:space="preserve"> PAGEREF _Toc240546301 \h </w:instrText>
+        <w:instrText xml:space="preserve"> PAGEREF _Toc240550776 \h </w:instrText>
       </w:r>
       <w:r>
         <w:rPr>
@@ -3297,7 +3297,7 @@
         <w:rPr>
           <w:noProof/>
         </w:rPr>
-        <w:t>102</w:t>
+        <w:t>103</w:t>
       </w:r>
       <w:r>
         <w:rPr>
@@ -3341,7 +3341,7 @@
         <w:rPr>
           <w:noProof/>
         </w:rPr>
-        <w:instrText xml:space="preserve"> PAGEREF _Toc240546302 \h </w:instrText>
+        <w:instrText xml:space="preserve"> PAGEREF _Toc240550777 \h </w:instrText>
       </w:r>
       <w:r>
         <w:rPr>
@@ -3358,7 +3358,7 @@
         <w:rPr>
           <w:noProof/>
         </w:rPr>
-        <w:t>105</w:t>
+        <w:t>106</w:t>
       </w:r>
       <w:r>
         <w:rPr>
@@ -3402,7 +3402,7 @@
         <w:rPr>
           <w:noProof/>
         </w:rPr>
-        <w:instrText xml:space="preserve"> PAGEREF _Toc240546303 \h </w:instrText>
+        <w:instrText xml:space="preserve"> PAGEREF _Toc240550778 \h </w:instrText>
       </w:r>
       <w:r>
         <w:rPr>
@@ -3419,7 +3419,7 @@
         <w:rPr>
           <w:noProof/>
         </w:rPr>
-        <w:t>105</w:t>
+        <w:t>106</w:t>
       </w:r>
       <w:r>
         <w:rPr>
@@ -3464,7 +3464,7 @@
         <w:rPr>
           <w:noProof/>
         </w:rPr>
-        <w:instrText xml:space="preserve"> PAGEREF _Toc240546304 \h </w:instrText>
+        <w:instrText xml:space="preserve"> PAGEREF _Toc240550779 \h </w:instrText>
       </w:r>
       <w:r>
         <w:rPr>
@@ -3481,7 +3481,7 @@
         <w:rPr>
           <w:noProof/>
         </w:rPr>
-        <w:t>107</w:t>
+        <w:t>108</w:t>
       </w:r>
       <w:r>
         <w:rPr>
@@ -3525,7 +3525,7 @@
         <w:rPr>
           <w:noProof/>
         </w:rPr>
-        <w:instrText xml:space="preserve"> PAGEREF _Toc240546305 \h </w:instrText>
+        <w:instrText xml:space="preserve"> PAGEREF _Toc240550780 \h </w:instrText>
       </w:r>
       <w:r>
         <w:rPr>
@@ -3542,7 +3542,7 @@
         <w:rPr>
           <w:noProof/>
         </w:rPr>
-        <w:t>110</w:t>
+        <w:t>111</w:t>
       </w:r>
       <w:r>
         <w:rPr>
@@ -3586,7 +3586,7 @@
         <w:rPr>
           <w:noProof/>
         </w:rPr>
-        <w:instrText xml:space="preserve"> PAGEREF _Toc240546306 \h </w:instrText>
+        <w:instrText xml:space="preserve"> PAGEREF _Toc240550781 \h </w:instrText>
       </w:r>
       <w:r>
         <w:rPr>
@@ -3603,7 +3603,7 @@
         <w:rPr>
           <w:noProof/>
         </w:rPr>
-        <w:t>111</w:t>
+        <w:t>112</w:t>
       </w:r>
       <w:r>
         <w:rPr>
@@ -3662,7 +3662,7 @@
           <w:sz w:val="34"/>
         </w:rPr>
       </w:pPr>
-      <w:bookmarkStart w:id="0" w:name="_Toc240546251"/>
+      <w:bookmarkStart w:id="0" w:name="_Toc240550726"/>
       <w:r>
         <w:rPr>
           <w:rFonts w:ascii="Montserrat" w:hAnsi="Montserrat"/>
@@ -3686,7 +3686,7 @@
           <w:sz w:val="27"/>
         </w:rPr>
       </w:pPr>
-      <w:bookmarkStart w:id="1" w:name="_Toc240546252"/>
+      <w:bookmarkStart w:id="1" w:name="_Toc240550727"/>
       <w:r>
         <w:rPr>
           <w:rFonts w:ascii="Montserrat" w:hAnsi="Montserrat"/>
@@ -5460,6 +5460,24 @@
           <w:color w:val="1A1A1A"/>
           <w:sz w:val="22"/>
         </w:rPr>
+        <w:t>Esta e a versao 2.89 do manual. Em relacao a versao 2.88 (17/09/2026), o campo Anexos da aba Viabilidade no Planejamento e Desenvolvimento de Projeto (Passo 4) deixou de ser so um texto livre e ganhou upload real de arquivo (.txt/.docx/.pdf, ate 15 MB), no mesmo padrao ja usado pela Solicitacao de Demanda (Passo 1) e pela SMP (Passo 7) - com lista de arquivos enviados, download e remocao. O texto livre antigo continua disponivel, renomeado para Links de documentos.</w:t>
+      </w:r>
+    </w:p>
+    <w:p>
+      <w:pPr>
+        <w:spacing w:line="280" w:lineRule="auto"/>
+        <w:rPr>
+          <w:rFonts w:ascii="Montserrat" w:hAnsi="Montserrat"/>
+          <w:color w:val="1A1A1A"/>
+          <w:sz w:val="22"/>
+        </w:rPr>
+      </w:pPr>
+      <w:r>
+        <w:rPr>
+          <w:rFonts w:ascii="Montserrat" w:hAnsi="Montserrat"/>
+          <w:color w:val="1A1A1A"/>
+          <w:sz w:val="22"/>
+        </w:rPr>
         <w:t>O manual nao substitui as Diretrizes para a Gestao de Projetos da UNIALFA (documento institucional que define o framework D01 a D07) nem o documento Regras de Acesso e Permissoes (que detalha cada regra de controle de acesso); ele e o guia operacional de como usar cada ferramenta na pratica.</w:t>
       </w:r>
     </w:p>
@@ -5474,7 +5492,7 @@
           <w:sz w:val="27"/>
         </w:rPr>
       </w:pPr>
-      <w:bookmarkStart w:id="2" w:name="_Toc240546253"/>
+      <w:bookmarkStart w:id="2" w:name="_Toc240550728"/>
       <w:r>
         <w:rPr>
           <w:rFonts w:ascii="Montserrat" w:hAnsi="Montserrat"/>
@@ -5525,6 +5543,7 @@
           <w:color w:val="1A1A1A"/>
           <w:sz w:val="22"/>
         </w:rPr>
+        <w:lastRenderedPageBreak/>
         <w:t>12 formularios de registro (codigo FORALF), cada um correspondendo a um artefato institucional - da Solicitacao de Demanda ao Relatorio de Entregas e Beneficios.</w:t>
       </w:r>
     </w:p>
@@ -5597,7 +5616,6 @@
           <w:color w:val="1A1A1A"/>
           <w:sz w:val="22"/>
         </w:rPr>
-        <w:lastRenderedPageBreak/>
         <w:t>1 Painel Executivo, tambem restrito a Admin, com a visao agregada de todo o sistema (secao 6.4).</w:t>
       </w:r>
     </w:p>
@@ -5670,17 +5688,18 @@
         <w:rPr>
           <w:noProof/>
         </w:rPr>
+        <w:lastRenderedPageBreak/>
         <w:drawing>
-          <wp:inline distT="0" distB="0" distL="0" distR="0" wp14:anchorId="33EE0D4A" wp14:editId="20ACB958">
+          <wp:inline distT="0" distB="0" distL="0" distR="0" wp14:anchorId="29C6EEFE" wp14:editId="3DC379EF">
             <wp:extent cx="5303520" cy="4792851"/>
             <wp:effectExtent l="19050" t="19050" r="11430" b="27305"/>
-            <wp:docPr id="446009559" name="Imagem 1"/>
+            <wp:docPr id="921685342" name="Imagem 1"/>
             <wp:cNvGraphicFramePr/>
             <a:graphic xmlns:a="http://schemas.openxmlformats.org/drawingml/2006/main">
               <a:graphicData uri="http://schemas.openxmlformats.org/drawingml/2006/picture">
                 <pic:pic xmlns:pic="http://schemas.openxmlformats.org/drawingml/2006/picture">
                   <pic:nvPicPr>
-                    <pic:cNvPr id="446009559" name=""/>
+                    <pic:cNvPr id="921685342" name=""/>
                     <pic:cNvPicPr/>
                   </pic:nvPicPr>
                   <pic:blipFill>
@@ -5748,7 +5767,7 @@
           <w:sz w:val="27"/>
         </w:rPr>
       </w:pPr>
-      <w:bookmarkStart w:id="3" w:name="_Toc240546254"/>
+      <w:bookmarkStart w:id="3" w:name="_Toc240550729"/>
       <w:r>
         <w:rPr>
           <w:rFonts w:ascii="Montserrat" w:hAnsi="Montserrat"/>
@@ -5756,7 +5775,6 @@
           <w:color w:val="B91D2E"/>
           <w:sz w:val="27"/>
         </w:rPr>
-        <w:lastRenderedPageBreak/>
         <w:t>1.3 Como acessar e fazer login</w:t>
       </w:r>
       <w:bookmarkEnd w:id="3"/>
@@ -5788,17 +5806,18 @@
         <w:rPr>
           <w:noProof/>
         </w:rPr>
+        <w:lastRenderedPageBreak/>
         <w:drawing>
-          <wp:inline distT="0" distB="0" distL="0" distR="0" wp14:anchorId="07812315" wp14:editId="43C296C4">
+          <wp:inline distT="0" distB="0" distL="0" distR="0" wp14:anchorId="474D5DA0" wp14:editId="24756D44">
             <wp:extent cx="4206240" cy="3801227"/>
             <wp:effectExtent l="19050" t="19050" r="22860" b="27940"/>
-            <wp:docPr id="1498070839" name="Imagem 2"/>
+            <wp:docPr id="1133787452" name="Imagem 2"/>
             <wp:cNvGraphicFramePr/>
             <a:graphic xmlns:a="http://schemas.openxmlformats.org/drawingml/2006/main">
               <a:graphicData uri="http://schemas.openxmlformats.org/drawingml/2006/picture">
                 <pic:pic xmlns:pic="http://schemas.openxmlformats.org/drawingml/2006/picture">
                   <pic:nvPicPr>
-                    <pic:cNvPr id="1498070839" name=""/>
+                    <pic:cNvPr id="1133787452" name=""/>
                     <pic:cNvPicPr/>
                   </pic:nvPicPr>
                   <pic:blipFill>
@@ -5971,7 +5990,7 @@
           <w:sz w:val="27"/>
         </w:rPr>
       </w:pPr>
-      <w:bookmarkStart w:id="4" w:name="_Toc240546255"/>
+      <w:bookmarkStart w:id="4" w:name="_Toc240550730"/>
       <w:r>
         <w:rPr>
           <w:rFonts w:ascii="Montserrat" w:hAnsi="Montserrat"/>
@@ -5979,7 +5998,6 @@
           <w:color w:val="B91D2E"/>
           <w:sz w:val="27"/>
         </w:rPr>
-        <w:lastRenderedPageBreak/>
         <w:t>1.4 Como a ferramenta se relaciona com as Diretrizes (D01-D07)</w:t>
       </w:r>
       <w:bookmarkEnd w:id="4"/>
@@ -6054,6 +6072,7 @@
                 <w:color w:val="FFFFFF"/>
                 <w:sz w:val="19"/>
               </w:rPr>
+              <w:lastRenderedPageBreak/>
               <w:t>Passo</w:t>
             </w:r>
           </w:p>
@@ -7210,7 +7229,7 @@
           <w:sz w:val="34"/>
         </w:rPr>
       </w:pPr>
-      <w:bookmarkStart w:id="5" w:name="_Toc240546256"/>
+      <w:bookmarkStart w:id="5" w:name="_Toc240550731"/>
       <w:r>
         <w:rPr>
           <w:rFonts w:ascii="Montserrat" w:hAnsi="Montserrat"/>
@@ -7234,7 +7253,7 @@
           <w:sz w:val="27"/>
         </w:rPr>
       </w:pPr>
-      <w:bookmarkStart w:id="6" w:name="_Toc240546257"/>
+      <w:bookmarkStart w:id="6" w:name="_Toc240550732"/>
       <w:r>
         <w:rPr>
           <w:rFonts w:ascii="Montserrat" w:hAnsi="Montserrat"/>
@@ -7275,7 +7294,7 @@
           <w:sz w:val="27"/>
         </w:rPr>
       </w:pPr>
-      <w:bookmarkStart w:id="7" w:name="_Toc240546258"/>
+      <w:bookmarkStart w:id="7" w:name="_Toc240550733"/>
       <w:r>
         <w:rPr>
           <w:rFonts w:ascii="Montserrat" w:hAnsi="Montserrat"/>
@@ -7394,7 +7413,7 @@
           <w:sz w:val="27"/>
         </w:rPr>
       </w:pPr>
-      <w:bookmarkStart w:id="8" w:name="_Toc240546259"/>
+      <w:bookmarkStart w:id="8" w:name="_Toc240550734"/>
       <w:r>
         <w:rPr>
           <w:rFonts w:ascii="Montserrat" w:hAnsi="Montserrat"/>
@@ -8007,7 +8026,7 @@
           <w:sz w:val="27"/>
         </w:rPr>
       </w:pPr>
-      <w:bookmarkStart w:id="9" w:name="_Toc240546260"/>
+      <w:bookmarkStart w:id="9" w:name="_Toc240550735"/>
       <w:r>
         <w:rPr>
           <w:rFonts w:ascii="Montserrat" w:hAnsi="Montserrat"/>
@@ -8096,16 +8115,16 @@
         </w:rPr>
         <w:lastRenderedPageBreak/>
         <w:drawing>
-          <wp:inline distT="0" distB="0" distL="0" distR="0" wp14:anchorId="27EDF7C8" wp14:editId="1A5CDD2D">
+          <wp:inline distT="0" distB="0" distL="0" distR="0" wp14:anchorId="565F42C1" wp14:editId="3DB71C3F">
             <wp:extent cx="4937760" cy="4462310"/>
             <wp:effectExtent l="19050" t="19050" r="15240" b="14605"/>
-            <wp:docPr id="1739795154" name="Imagem 3"/>
+            <wp:docPr id="1071952834" name="Imagem 3"/>
             <wp:cNvGraphicFramePr/>
             <a:graphic xmlns:a="http://schemas.openxmlformats.org/drawingml/2006/main">
               <a:graphicData uri="http://schemas.openxmlformats.org/drawingml/2006/picture">
                 <pic:pic xmlns:pic="http://schemas.openxmlformats.org/drawingml/2006/picture">
                   <pic:nvPicPr>
-                    <pic:cNvPr id="1739795154" name=""/>
+                    <pic:cNvPr id="1071952834" name=""/>
                     <pic:cNvPicPr/>
                   </pic:nvPicPr>
                   <pic:blipFill>
@@ -8173,7 +8192,7 @@
           <w:sz w:val="27"/>
         </w:rPr>
       </w:pPr>
-      <w:bookmarkStart w:id="10" w:name="_Toc240546261"/>
+      <w:bookmarkStart w:id="10" w:name="_Toc240550736"/>
       <w:r>
         <w:rPr>
           <w:rFonts w:ascii="Montserrat" w:hAnsi="Montserrat"/>
@@ -8214,16 +8233,16 @@
         </w:rPr>
         <w:lastRenderedPageBreak/>
         <w:drawing>
-          <wp:inline distT="0" distB="0" distL="0" distR="0" wp14:anchorId="70E2E7B0" wp14:editId="120FE7DF">
+          <wp:inline distT="0" distB="0" distL="0" distR="0" wp14:anchorId="76CDDBD7" wp14:editId="1A1C5FB3">
             <wp:extent cx="5120640" cy="4627581"/>
             <wp:effectExtent l="19050" t="19050" r="22860" b="20955"/>
-            <wp:docPr id="169452548" name="Imagem 4"/>
+            <wp:docPr id="1394990960" name="Imagem 4"/>
             <wp:cNvGraphicFramePr/>
             <a:graphic xmlns:a="http://schemas.openxmlformats.org/drawingml/2006/main">
               <a:graphicData uri="http://schemas.openxmlformats.org/drawingml/2006/picture">
                 <pic:pic xmlns:pic="http://schemas.openxmlformats.org/drawingml/2006/picture">
                   <pic:nvPicPr>
-                    <pic:cNvPr id="169452548" name=""/>
+                    <pic:cNvPr id="1394990960" name=""/>
                     <pic:cNvPicPr/>
                   </pic:nvPicPr>
                   <pic:blipFill>
@@ -8406,7 +8425,7 @@
           <w:sz w:val="27"/>
         </w:rPr>
       </w:pPr>
-      <w:bookmarkStart w:id="11" w:name="_Toc240546262"/>
+      <w:bookmarkStart w:id="11" w:name="_Toc240550737"/>
       <w:r>
         <w:rPr>
           <w:rFonts w:ascii="Montserrat" w:hAnsi="Montserrat"/>
@@ -8446,16 +8465,16 @@
           <w:noProof/>
         </w:rPr>
         <w:drawing>
-          <wp:inline distT="0" distB="0" distL="0" distR="0" wp14:anchorId="2F5344CD" wp14:editId="3D3C0CC4">
+          <wp:inline distT="0" distB="0" distL="0" distR="0" wp14:anchorId="21DF4BA2" wp14:editId="4058A9C3">
             <wp:extent cx="4206240" cy="3801227"/>
             <wp:effectExtent l="19050" t="19050" r="22860" b="27940"/>
-            <wp:docPr id="784193309" name="Imagem 5"/>
+            <wp:docPr id="1843955065" name="Imagem 5"/>
             <wp:cNvGraphicFramePr/>
             <a:graphic xmlns:a="http://schemas.openxmlformats.org/drawingml/2006/main">
               <a:graphicData uri="http://schemas.openxmlformats.org/drawingml/2006/picture">
                 <pic:pic xmlns:pic="http://schemas.openxmlformats.org/drawingml/2006/picture">
                   <pic:nvPicPr>
-                    <pic:cNvPr id="784193309" name=""/>
+                    <pic:cNvPr id="1843955065" name=""/>
                     <pic:cNvPicPr/>
                   </pic:nvPicPr>
                   <pic:blipFill>
@@ -8523,16 +8542,16 @@
         </w:rPr>
         <w:lastRenderedPageBreak/>
         <w:drawing>
-          <wp:inline distT="0" distB="0" distL="0" distR="0" wp14:anchorId="03B41FAC" wp14:editId="310F910A">
+          <wp:inline distT="0" distB="0" distL="0" distR="0" wp14:anchorId="0D6612FF" wp14:editId="478E7CDB">
             <wp:extent cx="4206240" cy="3801227"/>
             <wp:effectExtent l="19050" t="19050" r="22860" b="27940"/>
-            <wp:docPr id="1151458750" name="Imagem 6"/>
+            <wp:docPr id="156812751" name="Imagem 6"/>
             <wp:cNvGraphicFramePr/>
             <a:graphic xmlns:a="http://schemas.openxmlformats.org/drawingml/2006/main">
               <a:graphicData uri="http://schemas.openxmlformats.org/drawingml/2006/picture">
                 <pic:pic xmlns:pic="http://schemas.openxmlformats.org/drawingml/2006/picture">
                   <pic:nvPicPr>
-                    <pic:cNvPr id="1151458750" name=""/>
+                    <pic:cNvPr id="156812751" name=""/>
                     <pic:cNvPicPr/>
                   </pic:nvPicPr>
                   <pic:blipFill>
@@ -8648,7 +8667,7 @@
           <w:sz w:val="27"/>
         </w:rPr>
       </w:pPr>
-      <w:bookmarkStart w:id="12" w:name="_Toc240546263"/>
+      <w:bookmarkStart w:id="12" w:name="_Toc240550738"/>
       <w:r>
         <w:rPr>
           <w:rFonts w:ascii="Montserrat" w:hAnsi="Montserrat"/>
@@ -8716,7 +8735,7 @@
           <w:sz w:val="27"/>
         </w:rPr>
       </w:pPr>
-      <w:bookmarkStart w:id="13" w:name="_Toc240546264"/>
+      <w:bookmarkStart w:id="13" w:name="_Toc240550739"/>
       <w:r>
         <w:rPr>
           <w:rFonts w:ascii="Montserrat" w:hAnsi="Montserrat"/>
@@ -8943,7 +8962,7 @@
           <w:sz w:val="27"/>
         </w:rPr>
       </w:pPr>
-      <w:bookmarkStart w:id="14" w:name="_Toc240546265"/>
+      <w:bookmarkStart w:id="14" w:name="_Toc240550740"/>
       <w:r>
         <w:rPr>
           <w:rFonts w:ascii="Montserrat" w:hAnsi="Montserrat"/>
@@ -9102,7 +9121,7 @@
           <w:sz w:val="27"/>
         </w:rPr>
       </w:pPr>
-      <w:bookmarkStart w:id="15" w:name="_Toc240546266"/>
+      <w:bookmarkStart w:id="15" w:name="_Toc240550741"/>
       <w:r>
         <w:rPr>
           <w:rFonts w:ascii="Montserrat" w:hAnsi="Montserrat"/>
@@ -9294,7 +9313,7 @@
           <w:sz w:val="27"/>
         </w:rPr>
       </w:pPr>
-      <w:bookmarkStart w:id="16" w:name="_Toc240546267"/>
+      <w:bookmarkStart w:id="16" w:name="_Toc240550742"/>
       <w:r>
         <w:rPr>
           <w:rFonts w:ascii="Montserrat" w:hAnsi="Montserrat"/>
@@ -9422,7 +9441,7 @@
           <w:sz w:val="27"/>
         </w:rPr>
       </w:pPr>
-      <w:bookmarkStart w:id="17" w:name="_Toc240546268"/>
+      <w:bookmarkStart w:id="17" w:name="_Toc240550743"/>
       <w:r>
         <w:rPr>
           <w:rFonts w:ascii="Montserrat" w:hAnsi="Montserrat"/>
@@ -9752,7 +9771,7 @@
           <w:sz w:val="27"/>
         </w:rPr>
       </w:pPr>
-      <w:bookmarkStart w:id="18" w:name="_Toc240546269"/>
+      <w:bookmarkStart w:id="18" w:name="_Toc240550744"/>
       <w:r>
         <w:rPr>
           <w:rFonts w:ascii="Montserrat" w:hAnsi="Montserrat"/>
@@ -9889,7 +9908,7 @@
           <w:sz w:val="27"/>
         </w:rPr>
       </w:pPr>
-      <w:bookmarkStart w:id="19" w:name="_Toc240546270"/>
+      <w:bookmarkStart w:id="19" w:name="_Toc240550745"/>
       <w:r>
         <w:rPr>
           <w:rFonts w:ascii="Montserrat" w:hAnsi="Montserrat"/>
@@ -10168,7 +10187,7 @@
           <w:sz w:val="27"/>
         </w:rPr>
       </w:pPr>
-      <w:bookmarkStart w:id="20" w:name="_Toc240546271"/>
+      <w:bookmarkStart w:id="20" w:name="_Toc240550746"/>
       <w:r>
         <w:rPr>
           <w:rFonts w:ascii="Montserrat" w:hAnsi="Montserrat"/>
@@ -10345,7 +10364,7 @@
           <w:sz w:val="27"/>
         </w:rPr>
       </w:pPr>
-      <w:bookmarkStart w:id="21" w:name="_Toc240546272"/>
+      <w:bookmarkStart w:id="21" w:name="_Toc240550747"/>
       <w:r>
         <w:rPr>
           <w:rFonts w:ascii="Montserrat" w:hAnsi="Montserrat"/>
@@ -10459,7 +10478,7 @@
           <w:sz w:val="34"/>
         </w:rPr>
       </w:pPr>
-      <w:bookmarkStart w:id="22" w:name="_Toc240546273"/>
+      <w:bookmarkStart w:id="22" w:name="_Toc240550748"/>
       <w:r>
         <w:rPr>
           <w:rFonts w:ascii="Montserrat" w:hAnsi="Montserrat"/>
@@ -10501,7 +10520,7 @@
           <w:sz w:val="27"/>
         </w:rPr>
       </w:pPr>
-      <w:bookmarkStart w:id="23" w:name="_Toc240546274"/>
+      <w:bookmarkStart w:id="23" w:name="_Toc240550749"/>
       <w:r>
         <w:rPr>
           <w:rFonts w:ascii="Montserrat" w:hAnsi="Montserrat"/>
@@ -11581,16 +11600,16 @@
         </w:rPr>
         <w:lastRenderedPageBreak/>
         <w:drawing>
-          <wp:inline distT="0" distB="0" distL="0" distR="0" wp14:anchorId="11F49949" wp14:editId="031FF117">
+          <wp:inline distT="0" distB="0" distL="0" distR="0" wp14:anchorId="752AB603" wp14:editId="4BF53AFE">
             <wp:extent cx="5120640" cy="4627581"/>
             <wp:effectExtent l="19050" t="19050" r="22860" b="20955"/>
-            <wp:docPr id="1487795486" name="Imagem 7"/>
+            <wp:docPr id="683086822" name="Imagem 7"/>
             <wp:cNvGraphicFramePr/>
             <a:graphic xmlns:a="http://schemas.openxmlformats.org/drawingml/2006/main">
               <a:graphicData uri="http://schemas.openxmlformats.org/drawingml/2006/picture">
                 <pic:pic xmlns:pic="http://schemas.openxmlformats.org/drawingml/2006/picture">
                   <pic:nvPicPr>
-                    <pic:cNvPr id="1487795486" name=""/>
+                    <pic:cNvPr id="683086822" name=""/>
                     <pic:cNvPicPr/>
                   </pic:nvPicPr>
                   <pic:blipFill>
@@ -11658,16 +11677,16 @@
         </w:rPr>
         <w:lastRenderedPageBreak/>
         <w:drawing>
-          <wp:inline distT="0" distB="0" distL="0" distR="0" wp14:anchorId="4BAE089A" wp14:editId="7BF54E12">
+          <wp:inline distT="0" distB="0" distL="0" distR="0" wp14:anchorId="622B6E13" wp14:editId="00420CE0">
             <wp:extent cx="5120640" cy="4627581"/>
             <wp:effectExtent l="19050" t="19050" r="22860" b="20955"/>
-            <wp:docPr id="957772476" name="Imagem 8"/>
+            <wp:docPr id="578930897" name="Imagem 8"/>
             <wp:cNvGraphicFramePr/>
             <a:graphic xmlns:a="http://schemas.openxmlformats.org/drawingml/2006/main">
               <a:graphicData uri="http://schemas.openxmlformats.org/drawingml/2006/picture">
                 <pic:pic xmlns:pic="http://schemas.openxmlformats.org/drawingml/2006/picture">
                   <pic:nvPicPr>
-                    <pic:cNvPr id="957772476" name=""/>
+                    <pic:cNvPr id="578930897" name=""/>
                     <pic:cNvPicPr/>
                   </pic:nvPicPr>
                   <pic:blipFill>
@@ -11875,7 +11894,7 @@
           <w:sz w:val="27"/>
         </w:rPr>
       </w:pPr>
-      <w:bookmarkStart w:id="24" w:name="_Toc240546275"/>
+      <w:bookmarkStart w:id="24" w:name="_Toc240550750"/>
       <w:r>
         <w:rPr>
           <w:rFonts w:ascii="Montserrat" w:hAnsi="Montserrat"/>
@@ -12800,16 +12819,16 @@
           <w:noProof/>
         </w:rPr>
         <w:drawing>
-          <wp:inline distT="0" distB="0" distL="0" distR="0" wp14:anchorId="6621E75F" wp14:editId="3C92042D">
+          <wp:inline distT="0" distB="0" distL="0" distR="0" wp14:anchorId="40619B9D" wp14:editId="7828BC7A">
             <wp:extent cx="5120640" cy="4627581"/>
             <wp:effectExtent l="19050" t="19050" r="22860" b="20955"/>
-            <wp:docPr id="923923928" name="Imagem 9"/>
+            <wp:docPr id="1354884011" name="Imagem 9"/>
             <wp:cNvGraphicFramePr/>
             <a:graphic xmlns:a="http://schemas.openxmlformats.org/drawingml/2006/main">
               <a:graphicData uri="http://schemas.openxmlformats.org/drawingml/2006/picture">
                 <pic:pic xmlns:pic="http://schemas.openxmlformats.org/drawingml/2006/picture">
                   <pic:nvPicPr>
-                    <pic:cNvPr id="923923928" name=""/>
+                    <pic:cNvPr id="1354884011" name=""/>
                     <pic:cNvPicPr/>
                   </pic:nvPicPr>
                   <pic:blipFill>
@@ -12877,16 +12896,16 @@
         </w:rPr>
         <w:lastRenderedPageBreak/>
         <w:drawing>
-          <wp:inline distT="0" distB="0" distL="0" distR="0" wp14:anchorId="7717F93B" wp14:editId="29BB50B9">
+          <wp:inline distT="0" distB="0" distL="0" distR="0" wp14:anchorId="4A8A665C" wp14:editId="57426B1E">
             <wp:extent cx="5120640" cy="4627581"/>
             <wp:effectExtent l="19050" t="19050" r="22860" b="20955"/>
-            <wp:docPr id="580952051" name="Imagem 10"/>
+            <wp:docPr id="178398462" name="Imagem 10"/>
             <wp:cNvGraphicFramePr/>
             <a:graphic xmlns:a="http://schemas.openxmlformats.org/drawingml/2006/main">
               <a:graphicData uri="http://schemas.openxmlformats.org/drawingml/2006/picture">
                 <pic:pic xmlns:pic="http://schemas.openxmlformats.org/drawingml/2006/picture">
                   <pic:nvPicPr>
-                    <pic:cNvPr id="580952051" name=""/>
+                    <pic:cNvPr id="178398462" name=""/>
                     <pic:cNvPicPr/>
                   </pic:nvPicPr>
                   <pic:blipFill>
@@ -13020,7 +13039,7 @@
           <w:sz w:val="27"/>
         </w:rPr>
       </w:pPr>
-      <w:bookmarkStart w:id="25" w:name="_Toc240546276"/>
+      <w:bookmarkStart w:id="25" w:name="_Toc240550751"/>
       <w:r>
         <w:rPr>
           <w:rFonts w:ascii="Montserrat" w:hAnsi="Montserrat"/>
@@ -14105,16 +14124,16 @@
         </w:rPr>
         <w:lastRenderedPageBreak/>
         <w:drawing>
-          <wp:inline distT="0" distB="0" distL="0" distR="0" wp14:anchorId="64A77FF5" wp14:editId="26F6FECB">
+          <wp:inline distT="0" distB="0" distL="0" distR="0" wp14:anchorId="1A314E18" wp14:editId="3FC3F807">
             <wp:extent cx="5120640" cy="3338440"/>
             <wp:effectExtent l="19050" t="19050" r="22860" b="14605"/>
-            <wp:docPr id="1143300345" name="Imagem 11"/>
+            <wp:docPr id="2107588340" name="Imagem 11"/>
             <wp:cNvGraphicFramePr/>
             <a:graphic xmlns:a="http://schemas.openxmlformats.org/drawingml/2006/main">
               <a:graphicData uri="http://schemas.openxmlformats.org/drawingml/2006/picture">
                 <pic:pic xmlns:pic="http://schemas.openxmlformats.org/drawingml/2006/picture">
                   <pic:nvPicPr>
-                    <pic:cNvPr id="1143300345" name=""/>
+                    <pic:cNvPr id="2107588340" name=""/>
                     <pic:cNvPicPr/>
                   </pic:nvPicPr>
                   <pic:blipFill>
@@ -14182,16 +14201,16 @@
         </w:rPr>
         <w:lastRenderedPageBreak/>
         <w:drawing>
-          <wp:inline distT="0" distB="0" distL="0" distR="0" wp14:anchorId="02C891ED" wp14:editId="2FDDEBA1">
+          <wp:inline distT="0" distB="0" distL="0" distR="0" wp14:anchorId="5C8B8AAB" wp14:editId="45967530">
             <wp:extent cx="5120640" cy="4627581"/>
             <wp:effectExtent l="19050" t="19050" r="22860" b="20955"/>
-            <wp:docPr id="1593520326" name="Imagem 12"/>
+            <wp:docPr id="559107037" name="Imagem 12"/>
             <wp:cNvGraphicFramePr/>
             <a:graphic xmlns:a="http://schemas.openxmlformats.org/drawingml/2006/main">
               <a:graphicData uri="http://schemas.openxmlformats.org/drawingml/2006/picture">
                 <pic:pic xmlns:pic="http://schemas.openxmlformats.org/drawingml/2006/picture">
                   <pic:nvPicPr>
-                    <pic:cNvPr id="1593520326" name=""/>
+                    <pic:cNvPr id="559107037" name=""/>
                     <pic:cNvPicPr/>
                   </pic:nvPicPr>
                   <pic:blipFill>
@@ -14395,7 +14414,7 @@
           <w:sz w:val="27"/>
         </w:rPr>
       </w:pPr>
-      <w:bookmarkStart w:id="26" w:name="_Toc240546277"/>
+      <w:bookmarkStart w:id="26" w:name="_Toc240550752"/>
       <w:r>
         <w:rPr>
           <w:rFonts w:ascii="Montserrat" w:hAnsi="Montserrat"/>
@@ -14956,16 +14975,16 @@
           <w:noProof/>
         </w:rPr>
         <w:drawing>
-          <wp:inline distT="0" distB="0" distL="0" distR="0" wp14:anchorId="64C60128" wp14:editId="03A0C32E">
+          <wp:inline distT="0" distB="0" distL="0" distR="0" wp14:anchorId="6702D13D" wp14:editId="3133EE4A">
             <wp:extent cx="5120640" cy="4627581"/>
             <wp:effectExtent l="19050" t="19050" r="22860" b="20955"/>
-            <wp:docPr id="835895128" name="Imagem 13"/>
+            <wp:docPr id="1060313244" name="Imagem 13"/>
             <wp:cNvGraphicFramePr/>
             <a:graphic xmlns:a="http://schemas.openxmlformats.org/drawingml/2006/main">
               <a:graphicData uri="http://schemas.openxmlformats.org/drawingml/2006/picture">
                 <pic:pic xmlns:pic="http://schemas.openxmlformats.org/drawingml/2006/picture">
                   <pic:nvPicPr>
-                    <pic:cNvPr id="835895128" name=""/>
+                    <pic:cNvPr id="1060313244" name=""/>
                     <pic:cNvPicPr/>
                   </pic:nvPicPr>
                   <pic:blipFill>
@@ -15033,16 +15052,16 @@
         </w:rPr>
         <w:lastRenderedPageBreak/>
         <w:drawing>
-          <wp:inline distT="0" distB="0" distL="0" distR="0" wp14:anchorId="4BAF38B1" wp14:editId="0AF1ACEC">
+          <wp:inline distT="0" distB="0" distL="0" distR="0" wp14:anchorId="4A66E71D" wp14:editId="0875827B">
             <wp:extent cx="5120640" cy="4627581"/>
             <wp:effectExtent l="19050" t="19050" r="22860" b="20955"/>
-            <wp:docPr id="484676004" name="Imagem 14"/>
+            <wp:docPr id="1898925910" name="Imagem 14"/>
             <wp:cNvGraphicFramePr/>
             <a:graphic xmlns:a="http://schemas.openxmlformats.org/drawingml/2006/main">
               <a:graphicData uri="http://schemas.openxmlformats.org/drawingml/2006/picture">
                 <pic:pic xmlns:pic="http://schemas.openxmlformats.org/drawingml/2006/picture">
                   <pic:nvPicPr>
-                    <pic:cNvPr id="484676004" name=""/>
+                    <pic:cNvPr id="1898925910" name=""/>
                     <pic:cNvPicPr/>
                   </pic:nvPicPr>
                   <pic:blipFill>
@@ -15336,7 +15355,34 @@
           <w:color w:val="1A1A1A"/>
           <w:sz w:val="22"/>
         </w:rPr>
-        <w:t>Tarefas dentro de um marco: quando um marco precisar de mais detalhe, o botao + Tarefas (ultima coluna da tabela) abre uma lista simples logo abaixo da linha - nome da tarefa e uma caixa de concluida, sem data ou responsavel proprios (quem tem isso e o marco). O botao muda para Tarefas (2/3), por exemplo, mostrando quantas ja foram concluidas, e fica com contorno laranja enquanto houver alguma pendente. E totalmente opcional - um marco sem nenhuma tarefa continua funcionando normalmente. Ao lado do botao + Adicionar linha, um resumo mostra o percentual de tarefas concluidas somando todos os marcos do cronograma.</w:t>
+        <w:t>Anexos na Viabilidade (aba 2): o botao Anexar arquivo envia o arquivo direto para um repositorio proprio do sistema (ate 15 MB, .txt/.docx/.pdf) - mesmo recurso ja usado na Solicitacao de Demanda (Passo 1) e na SMP (Passo 7). Cada arquivo enviado aparece numa lista com opcoes Baixar e Remover, tanto no formulario quanto no painel de detalhes do dossie; na exportacao para Word, os arquivos aparecem listados por nome (o conteudo nao e embutido no documento gerado). O campo Links de documentos, logo abaixo, continua disponivel a parte, para links (Drive, SharePoint etc.) que nao sao um arquivo enviado.</w:t>
+      </w:r>
+    </w:p>
+    <w:p>
+      <w:pPr>
+        <w:spacing w:line="280" w:lineRule="auto"/>
+        <w:rPr>
+          <w:rFonts w:ascii="Montserrat" w:hAnsi="Montserrat"/>
+          <w:color w:val="1A1A1A"/>
+          <w:sz w:val="22"/>
+        </w:rPr>
+      </w:pPr>
+      <w:r>
+        <w:rPr>
+          <w:rFonts w:ascii="Montserrat" w:hAnsi="Montserrat"/>
+          <w:color w:val="1A1A1A"/>
+          <w:sz w:val="22"/>
+        </w:rPr>
+        <w:t xml:space="preserve">Tarefas dentro de um marco: quando um marco precisar de mais detalhe, o botao + Tarefas (ultima coluna da tabela) abre uma lista simples logo abaixo da linha - nome da tarefa e uma caixa de concluida, sem data ou responsavel proprios (quem tem isso e o marco). O botao muda para Tarefas (2/3), por exemplo, mostrando quantas ja foram concluidas, e fica com contorno laranja enquanto houver alguma pendente. E totalmente opcional - um marco sem nenhuma tarefa continua funcionando normalmente. Ao lado do botao + </w:t>
+      </w:r>
+      <w:r>
+        <w:rPr>
+          <w:rFonts w:ascii="Montserrat" w:hAnsi="Montserrat"/>
+          <w:color w:val="1A1A1A"/>
+          <w:sz w:val="22"/>
+        </w:rPr>
+        <w:lastRenderedPageBreak/>
+        <w:t>Adicionar linha, um resumo mostra o percentual de tarefas concluidas somando todos os marcos do cronograma.</w:t>
   